<commit_message>
docs(thesis): give Gap and Opportunity its own heading
The course rubric grades Gap/Opportunity as its own Chapter 1 item (three criteria, 11 points). The content was in 1.1 under no heading, the same kind of omission as the missing Background of the Study at the defense. It now has a sub-heading inside 1.1, listed in the table of contents, so 1.2-1.6 and every cited page number stay as they were (checked: 120 pages, 60 internal links, 0 broken).
</commit_message>
<xml_diff>
--- a/thesis 1/consolidated/SynapseOS_Proposal_Chapters_1_to_3.docx
+++ b/thesis 1/consolidated/SynapseOS_Proposal_Chapters_1_to_3.docx
@@ -297,6 +297,22 @@
       <w:pPr>
         <w:pStyle w:val="BodyText"/>
       </w:pPr>
+      <w:hyperlink w:anchor="sec1-1-gap">
+        <w:r>
+          <w:rPr>
+            <w:rStyle w:val="Hyperlink"/>
+          </w:rPr>
+          <w:t xml:space="preserve">Gap and Opportunity</w:t>
+        </w:r>
+      </w:hyperlink>
+      <w:r>
+        <w:t xml:space="preserve">3</w:t>
+      </w:r>
+    </w:p>
+    <w:p>
+      <w:pPr>
+        <w:pStyle w:val="BodyText"/>
+      </w:pPr>
       <w:hyperlink w:anchor="sec1-2">
         <w:r>
           <w:rPr>
@@ -892,7 +908,7 @@
       </w:r>
     </w:p>
     <w:bookmarkEnd w:id="27"/>
-    <w:bookmarkStart w:id="28" w:name="sec1-1"/>
+    <w:bookmarkStart w:id="29" w:name="sec1-1"/>
     <w:p>
       <w:pPr>
         <w:pStyle w:val="Heading2"/>
@@ -978,9 +994,18 @@
         <w:t xml:space="preserve">for the Linux desktop, despite Linux serving as the substrate for most developer and server-side workflows.</w:t>
       </w:r>
     </w:p>
-    <w:p>
-      <w:pPr>
-        <w:pStyle w:val="BodyText"/>
+    <w:bookmarkStart w:id="28" w:name="sec1-1-gap"/>
+    <w:p>
+      <w:pPr>
+        <w:pStyle w:val="Heading3"/>
+      </w:pPr>
+      <w:r>
+        <w:t xml:space="preserve">Gap and Opportunity</w:t>
+      </w:r>
+    </w:p>
+    <w:p>
+      <w:pPr>
+        <w:pStyle w:val="FirstParagraph"/>
       </w:pPr>
       <w:r>
         <w:t xml:space="preserve">Capability brings a risk the field has not addressed.  A system that turns a request into a shell command and runs it acts on the user’s own files, and a command generated from a misunderstood request, or one simply broader than intended, can delete or overwrite them with no way back.  Every surveyed system guards against this by</w:t>
@@ -1097,7 +1122,8 @@
       </w:r>
     </w:p>
     <w:bookmarkEnd w:id="28"/>
-    <w:bookmarkStart w:id="29" w:name="sec1-2"/>
+    <w:bookmarkEnd w:id="29"/>
+    <w:bookmarkStart w:id="30" w:name="sec1-2"/>
     <w:p>
       <w:pPr>
         <w:pStyle w:val="Heading2"/>
@@ -1170,8 +1196,8 @@
         <w:t xml:space="preserve">Does a conversational interface narrow the gap between what technically fluent users and users fluent in neither the command line nor the graphical desktop can accomplish on a computer, and how does the resulting experience — task success, time, error rate, and cognitive workload — compare to the interface each participant uses today?</w:t>
       </w:r>
     </w:p>
-    <w:bookmarkEnd w:id="29"/>
-    <w:bookmarkStart w:id="30" w:name="sec1-3"/>
+    <w:bookmarkEnd w:id="30"/>
+    <w:bookmarkStart w:id="31" w:name="sec1-3"/>
     <w:p>
       <w:pPr>
         <w:pStyle w:val="Heading2"/>
@@ -1295,8 +1321,8 @@
         <w:t xml:space="preserve">To evaluate SynapseOS through a controlled user study against each participant’s own primary operating system, measuring task success, completion time, error rate, and cognitive workload across a population fluent in neither existing interface and a population fluent in both — with the difference between those two populations as the primary outcome of interest, since the central claim of this work is that a conversational interface narrows the gap between them.</w:t>
       </w:r>
     </w:p>
-    <w:bookmarkEnd w:id="30"/>
-    <w:bookmarkStart w:id="31" w:name="sec1-4"/>
+    <w:bookmarkEnd w:id="31"/>
+    <w:bookmarkStart w:id="32" w:name="sec1-4"/>
     <w:p>
       <w:pPr>
         <w:pStyle w:val="Heading2"/>
@@ -1903,8 +1929,8 @@
         <w:t xml:space="preserve">The first contribution is evaluated against a labeled command corpus and is therefore independent of the user study; the third is evaluated through the study itself.  They are reported separately for that reason, and a negative result on either is reported as such.</w:t>
       </w:r>
     </w:p>
-    <w:bookmarkEnd w:id="31"/>
-    <w:bookmarkStart w:id="32" w:name="sec1-5"/>
+    <w:bookmarkEnd w:id="32"/>
+    <w:bookmarkStart w:id="33" w:name="sec1-5"/>
     <w:p>
       <w:pPr>
         <w:pStyle w:val="Heading2"/>
@@ -2031,8 +2057,8 @@
         <w:t xml:space="preserve">The study contributes a static analysis of shell commands for recoverability, a property that existing analyses of shell do not address (§2.4), together with an evaluation against ground truth obtained by sandboxed execution rather than by human labeling.  It also contributes a controlled comparative evaluation methodology for conversational interfaces, which are rarely compared against conventional graphical workflows on the same tasks and population (Xie et al., 2024).</w:t>
       </w:r>
     </w:p>
-    <w:bookmarkEnd w:id="32"/>
-    <w:bookmarkStart w:id="33" w:name="sec1-6"/>
+    <w:bookmarkEnd w:id="33"/>
+    <w:bookmarkStart w:id="34" w:name="sec1-6"/>
     <w:p>
       <w:pPr>
         <w:pStyle w:val="Heading2"/>
@@ -2109,8 +2135,8 @@
         <w:t xml:space="preserve">; this tradeoff may affect the ceiling on intent parsing accuracy achievable within the study.  Second, users with motor accessibility needs — a highly relevant population — are excluded from the initial evaluation due to ethics-review and recruitment constraints; accessibility-specific configurations such as speech-instructed agent operation for atypical speech patterns (Han et al., 2025) are likewise out of scope for the initial implementation but represent a natural extension of the SynapseOS substrate.  Third, SynapseOS targets the Linux desktop specifically, and the findings may not generalize directly to Windows or macOS desktop environments.  Fourth, the safety confirmation policy for irreversible system operations is defined in principle but requires empirical calibration during implementation.  Fifth, evaluation is bounded by the task coverage of the OSWorld benchmark and the custom task suite developed for this study; tasks outside this coverage are not evaluated.  Sixth, the recoverability analysis treats anything it cannot determine as unrecoverable, and so protects such commands only by asking first: code run by an interpreter, programs it does not model, and variables with no value are of this kind.  Its per-command rules are a hand-written enumeration, which its composition builds on rather than replaces, and it resolves a command’s targets shortly before the command runs, so a file changed by another process in the interval is captured as it was when resolved.</w:t>
       </w:r>
     </w:p>
-    <w:bookmarkEnd w:id="33"/>
-    <w:bookmarkStart w:id="39" w:name="ch1-notes"/>
+    <w:bookmarkEnd w:id="34"/>
+    <w:bookmarkStart w:id="40" w:name="ch1-notes"/>
     <w:p>
       <w:pPr>
         <w:pStyle w:val="Heading2"/>
@@ -2127,11 +2153,11 @@
           <w:numId w:val="1005"/>
         </w:numPr>
       </w:pPr>
-      <w:bookmarkStart w:id="34" w:name="ch1-fn1"/>
+      <w:bookmarkStart w:id="35" w:name="ch1-fn1"/>
       <w:r>
         <w:t xml:space="preserve">Foundation models are large neural networks trained on broad, general-purpose data and adaptable to many tasks.  Multimodal variants accept multiple input types — typically text and images — enabling the model to interpret visual interfaces and screenshots alongside natural language.</w:t>
       </w:r>
-      <w:bookmarkEnd w:id="34"/>
+      <w:bookmarkEnd w:id="35"/>
     </w:p>
     <w:p>
       <w:pPr>
@@ -2141,11 +2167,11 @@
           <w:numId w:val="1005"/>
         </w:numPr>
       </w:pPr>
-      <w:bookmarkStart w:id="35" w:name="ch1-fn2"/>
+      <w:bookmarkStart w:id="36" w:name="ch1-fn2"/>
       <w:r>
         <w:t xml:space="preserve">Computer-using agents are AI systems that interact with a computer’s graphical environment — clicking, typing, reading the screen — to complete tasks on behalf of a user.  Unlike shell-level automation, they operate through the same visual interface a human would use.</w:t>
       </w:r>
-      <w:bookmarkEnd w:id="35"/>
+      <w:bookmarkEnd w:id="36"/>
     </w:p>
     <w:p>
       <w:pPr>
@@ -2155,11 +2181,11 @@
           <w:numId w:val="1005"/>
         </w:numPr>
       </w:pPr>
-      <w:bookmarkStart w:id="36" w:name="ch1-fn3"/>
+      <w:bookmarkStart w:id="37" w:name="ch1-fn3"/>
       <w:r>
         <w:t xml:space="preserve">The session layer (or simply, the session) is the software the user directly interacts with immediately after login — the desktop shell, window manager, session manager, and application launcher on a graphical system, or the login shell on a text terminal.  It is distinct from the userland (or user space): the core system libraries and command-line tools (e.g., glibc, coreutils, bash, apt) that run outside the kernel and that the session layer itself depends on and invokes.  SynapseOS sits above the session layer and does not replace it; the underlying userland is unchanged.</w:t>
       </w:r>
-      <w:bookmarkEnd w:id="36"/>
+      <w:bookmarkEnd w:id="37"/>
     </w:p>
     <w:p>
       <w:pPr>
@@ -2169,11 +2195,11 @@
           <w:numId w:val="1005"/>
         </w:numPr>
       </w:pPr>
-      <w:bookmarkStart w:id="37" w:name="ch1-fn4"/>
+      <w:bookmarkStart w:id="38" w:name="ch1-fn4"/>
       <w:r>
         <w:t xml:space="preserve">A Linux session manager is the program that starts after user login and establishes the graphical environment — launching the window manager, desktop shell, and background services.  SynapseOS does not replace this component: it launches over the session that the component establishes and becomes the surface the user works in.</w:t>
       </w:r>
-      <w:bookmarkEnd w:id="37"/>
+      <w:bookmarkEnd w:id="38"/>
     </w:p>
     <w:p>
       <w:pPr>
@@ -2183,14 +2209,14 @@
           <w:numId w:val="1005"/>
         </w:numPr>
       </w:pPr>
-      <w:bookmarkStart w:id="38" w:name="ch1-fn5"/>
+      <w:bookmarkStart w:id="39" w:name="ch1-fn5"/>
       <w:r>
         <w:t xml:space="preserve">Open-weights models make their trained parameters publicly available for local download and use.  Users run inference on their own hardware without routing queries to an external service provider, enabling offline operation and preventing user data from being transmitted to third parties.</w:t>
       </w:r>
-      <w:bookmarkEnd w:id="38"/>
-    </w:p>
-    <w:bookmarkEnd w:id="39"/>
-    <w:bookmarkStart w:id="40" w:name="sec-chapter2"/>
+      <w:bookmarkEnd w:id="39"/>
+    </w:p>
+    <w:bookmarkEnd w:id="40"/>
+    <w:bookmarkStart w:id="41" w:name="sec-chapter2"/>
     <w:p>
       <w:pPr>
         <w:pStyle w:val="FirstParagraph"/>
@@ -2207,8 +2233,8 @@
         <w:t xml:space="preserve">Review of Related Literature</w:t>
       </w:r>
     </w:p>
-    <w:bookmarkEnd w:id="40"/>
-    <w:bookmarkStart w:id="41" w:name="sec2-1"/>
+    <w:bookmarkEnd w:id="41"/>
+    <w:bookmarkStart w:id="42" w:name="sec2-1"/>
     <w:p>
       <w:pPr>
         <w:pStyle w:val="Heading2"/>
@@ -2225,8 +2251,8 @@
         <w:t xml:space="preserve">This chapter reviews the body of research relevant to the design and evaluation of a conversational interface layer for the Linux desktop, and to the safety of the commands such a layer executes.  The review spans nearly four decades of work on natural-language interfaces to computing systems, from the symbolic-artificial-intelligence consultants developed for the Unix shell in the late 1980s (Wilensky et al., 1988) to the large language model (LLM) agents that now operate shells, graphical applications, browsers, and mobile devices.  Its purpose is threefold: to establish the conceptual vocabulary and technical foundations on which the present study builds, to characterize the current state of the field and its recurring limitations, and to locate precisely the gaps that the proposed recoverability analysis, and SynapseOS, the system in which it is deployed, are designed to fill.</w:t>
       </w:r>
     </w:p>
-    <w:bookmarkEnd w:id="41"/>
-    <w:bookmarkStart w:id="45" w:name="sec2-2"/>
+    <w:bookmarkEnd w:id="42"/>
+    <w:bookmarkStart w:id="46" w:name="sec2-2"/>
     <w:p>
       <w:pPr>
         <w:pStyle w:val="Heading2"/>
@@ -2268,18 +2294,18 @@
           <wp:inline>
             <wp:extent cx="5334000" cy="1121201"/>
             <wp:effectExtent b="0" l="0" r="0" t="0"/>
-            <wp:docPr descr="" title="" id="43" name="Picture"/>
+            <wp:docPr descr="" title="" id="44" name="Picture"/>
             <a:graphic>
               <a:graphicData uri="http://schemas.openxmlformats.org/drawingml/2006/picture">
                 <pic:pic>
                   <pic:nvPicPr>
-                    <pic:cNvPr descr="/tmp/claude-1000/-home-willard-projects-thesis/cb82e7af-8c35-489a-a7f7-ef49172efea2/scratchpad/docx/fig0.png" id="44" name="Picture"/>
+                    <pic:cNvPr descr="/tmp/claude-1000/-home-willard-projects-thesis/cb82e7af-8c35-489a-a7f7-ef49172efea2/scratchpad/docx/fig0.png" id="45" name="Picture"/>
                     <pic:cNvPicPr>
                       <a:picLocks noChangeArrowheads="1" noChangeAspect="1"/>
                     </pic:cNvPicPr>
                   </pic:nvPicPr>
                   <pic:blipFill>
-                    <a:blip r:embed="rId42"/>
+                    <a:blip r:embed="rId43"/>
                     <a:stretch>
                       <a:fillRect/>
                     </a:stretch>
@@ -2462,8 +2488,8 @@
         <w:t xml:space="preserve">Candidate works were identified through language-model-assisted search across arXiv, the ACM Digital Library, IEEE Xplore, and the ACL Anthology, extended by backward and forward citation chaining from each work that met the criteria above.  This review is therefore a narrative review rather than a systematic one, and the search is not claimed to be exhaustive.  Because assisted search can surface plausible but non-existent references, and can attribute to a source a claim that source does not make, every work cited in this chapter was subsequently verified by hand against its primary record — author list, venue, and year — and, where a specific claim is attributed to a work, against the presence of that claim in the work’s own text.  That verification pass corrected errors of both attribution and currency introduced by the initial search, and it is reported here because the reliability of this chapter rests on it rather than on the discovery method.  The limitation this leaves is one of recall rather than accuracy: assisted search favors well-indexed and heavily cited work, so the corpus may under-represent less visible literature.  The absence claims in §2.8 are accordingly scoped to the surveyed corpus and stated as such, rather than as claims about the literature as a whole.  The chapter first sets out the theoretical framework that organizes the review (§2.2), then proceeds thematically — historical foundations (§2.3), the shell and command-line thread most directly related to the proposed design (§2.4), graphical and computer-using agents (§2.5), accessibility and speech-driven interaction (§2.6), and evaluation environments (§2.7) — before synthesizing the surveyed works into a comparative analysis and an explicit statement of the research gap (§2.8).  It closes with a review of the methodological literature that informs the study’s evaluation design (§2.9) and a summary that motivates the methodology detailed in Chapter 3 (§2.10).</w:t>
       </w:r>
     </w:p>
-    <w:bookmarkEnd w:id="45"/>
-    <w:bookmarkStart w:id="47" w:name="sec2-3"/>
+    <w:bookmarkEnd w:id="46"/>
+    <w:bookmarkStart w:id="48" w:name="sec2-3"/>
     <w:p>
       <w:pPr>
         <w:pStyle w:val="Heading2"/>
@@ -2496,7 +2522,7 @@
         <w:t xml:space="preserve">The historical significance of this transition is twofold, and it frames the remainder of this review.  First, it explains why progress in the field has been so rapid since 2023: the methodological foundations became portable across modalities and platforms in a way that the earlier dataset-bound approaches were not.  Nearly every system surveyed in the sections that follow inherits from ReAct the convention of interleaving reasoning traces with environment-affecting actions.  Second, this shared inheritance underscores a corresponding fragility: these systems inherit the failure modes of LLM reasoning — hallucinated actions, plan inconsistency, and brittleness on long-horizon tasks — alongside their capabilities, a concern that the evaluation literature reviewed in §2.7 quantifies.</w:t>
       </w:r>
     </w:p>
-    <w:bookmarkStart w:id="46" w:name="X28e6469fd17e553ed563da3fe191c92b0ee28b2"/>
+    <w:bookmarkStart w:id="47" w:name="X28e6469fd17e553ed563da3fe191c92b0ee28b2"/>
     <w:p>
       <w:pPr>
         <w:pStyle w:val="Heading3"/>
@@ -2537,9 +2563,9 @@
         <w:t xml:space="preserve">The comparative question is older than the current literature and considerably less settled than it is often assumed to be.  Norman’s critique of the UNIX command line (1981) remains the standard reference for the position that the command line’s power is inaccessible to most people in practice.  But the best-known controlled comparison of command, menu, and iconic interfaces, conducted by Whiteside and colleagues across seventy-six users and seven systems (1985), concluded that interface style itself did not predict either performance or preference: careful design did, and the system that served novices best also served experts best.  That finding is as much a caution for the present study as a motivation for it.  It warns against attributing to a conversational paradigm what may in fact belong to the quality of one particular implementation, and it is a principal reason this study measures a specific system against a specific baseline rather than claiming to measure one paradigm against another.</w:t>
       </w:r>
     </w:p>
-    <w:bookmarkEnd w:id="46"/>
     <w:bookmarkEnd w:id="47"/>
-    <w:bookmarkStart w:id="48" w:name="sec2-4"/>
+    <w:bookmarkEnd w:id="48"/>
+    <w:bookmarkStart w:id="49" w:name="sec2-4"/>
     <w:p>
       <w:pPr>
         <w:pStyle w:val="Heading2"/>
@@ -2669,8 +2695,8 @@
         <w:t xml:space="preserve">is idempotent, since running it twice does no more damage than once, and unrecoverable, since the first run already destroyed what a recovery would need — and a command can be recoverable without being idempotent, if each run produces a new, independently-reversible effect.  CoLiS is therefore the nearest prior application of static effect reasoning to shell scripts specifically, and it stops short of the present study’s question for exactly this reason: verifying that re-execution is safe does not determine whether the first execution can be undone.  No work identified in this review derives a recoverability verdict for a shell command from its statically-computed effects; that is the specific gap the present study’s algorithmic contribution fills.</w:t>
       </w:r>
     </w:p>
-    <w:bookmarkEnd w:id="48"/>
-    <w:bookmarkStart w:id="54" w:name="sec2-5"/>
+    <w:bookmarkEnd w:id="49"/>
+    <w:bookmarkStart w:id="55" w:name="sec2-5"/>
     <w:p>
       <w:pPr>
         <w:pStyle w:val="Heading2"/>
@@ -2714,7 +2740,7 @@
         <w:t xml:space="preserve">, and, through its platform coverage, reveals the gap that motivates the present study.  The work is organized here by the platform each system targets — web, mobile, and desktop — together with the vision-language foundation models on which many depend.</w:t>
       </w:r>
     </w:p>
-    <w:bookmarkStart w:id="49" w:name="web-agents"/>
+    <w:bookmarkStart w:id="50" w:name="web-agents"/>
     <w:p>
       <w:pPr>
         <w:pStyle w:val="Heading3"/>
@@ -2731,8 +2757,8 @@
         <w:t xml:space="preserve">The web has been the most heavily studied environment for language-guided agents.  Mind2Web, introduced by Deng and colleagues (2023), is the first dataset for developing generalist web agents that follow language instructions across diverse real-world websites, comprising over two thousand open-ended tasks collected from 137 websites across 31 domains; its accompanying two-stage model uses a small language model to filter candidate elements from large documents before invoking a larger model to choose among them.  WebArena, introduced by Zhou and colleagues (2024), provides a fully self-hosted, reproducible web environment of functional website clones and evaluates 812 long-horizon tasks for functional correctness rather than trajectory similarity, establishing a challenging benchmark on which contemporary models achieved completion rates far below human performance.  Zheng and colleagues (2024), in their SeeAct framework, decouple visual understanding from action: the model observes a screenshot, generates a textual plan, and a separate step grounds that plan onto page elements.  Their central finding is diagnostic for the entire field — with oracle grounding provided, the model completes 51.1% of tasks on live websites, substantially outperforming a text-only baseline at 13.3%, but performance degrades sharply when grounding must itself be inferred, confirming visual grounding as the principal bottleneck.</w:t>
       </w:r>
     </w:p>
-    <w:bookmarkEnd w:id="49"/>
-    <w:bookmarkStart w:id="50" w:name="mobile-agents"/>
+    <w:bookmarkEnd w:id="50"/>
+    <w:bookmarkStart w:id="51" w:name="mobile-agents"/>
     <w:p>
       <w:pPr>
         <w:pStyle w:val="Heading3"/>
@@ -2749,8 +2775,8 @@
         <w:t xml:space="preserve">Mobile-device control has produced large-scale datasets and progressively more autonomous agents.  The pre-LLM work of Li and colleagues (2020), discussed in §2.3, established the grounding problem for mobile interfaces.  Android in the Wild, from Rawles and colleagues (2023), contributes a dataset of 715,000 episodes spanning 30,000 unique instructions, in which actions are gestures at arbitrary screen coordinates rather than operations on indexed interface elements, exposing the challenge that actions must be inferred from visual appearance rather than from a structured model of the interface.  AppAgent, from Zhang and colleagues (2023), operates Android applications through a simplified action space of taps and swipes and learns to use new applications through autonomous exploration or by observing human demonstrations, generating application-specific documentation that matched or exceeded human-written documentation.  Mobile-Agent, from Wang and colleagues (2024), adopts a purely vision-centric approach that requires no system metadata, using optical-character-recognition and icon-detection modules to locate interface elements — achieving broad applicability across mobile environments at the cost of vision-grounding errors that require recovery mechanisms.</w:t>
       </w:r>
     </w:p>
-    <w:bookmarkEnd w:id="50"/>
-    <w:bookmarkStart w:id="51" w:name="desktop-and-cross-application-agents"/>
+    <w:bookmarkEnd w:id="51"/>
+    <w:bookmarkStart w:id="52" w:name="desktop-and-cross-application-agents"/>
     <w:p>
       <w:pPr>
         <w:pStyle w:val="Heading3"/>
@@ -2767,8 +2793,8 @@
         <w:t xml:space="preserve">Desktop agents are the most direct graphical analogue to the present work, and their limitations are the most instructive.  ScreenAgent, from Niu and colleagues (2024), is a vision-language-model-driven agent for cross-application desktop control that operates in a plan–act–reflect cycle, specifying actions as coordinates and key sequences; its authors acknowledge that vision-only grounding is less reliable than approaches with API access.  WinClick, from Hui and colleagues (2025), targets Windows-desktop grounding and observes that most existing GUI agents rely on structured data formats such as the document object model or HyperText Markup Language, which are unavailable across general desktop environments; it therefore performs visual grounding directly from screenshots.  UFO², the "Desktop AgentOS" of Zhang and colleagues (2025), is the most ambitious desktop system surveyed: it fuses the native Windows accessibility framework with vision-based parsing in a hybrid action mechanism, dispatching subtasks from a coordinating agent to application-specialized agents.  Its authors argue that existing computer-using agents are hindered by shallow operating-system integration, fragile screenshot-based interaction, and disruptive execution, and they identify adaptation to other desktop platforms, such as Linux and macOS, as future work.  UFO² nonetheless operates as an automation layer dispatched atop the existing Windows shell rather than as a replacement for it, and its authors frame cross-platform deployment as groundwork for a unified ecosystem of desktop automation solutions — the trajectory from which the present study departs.</w:t>
       </w:r>
     </w:p>
-    <w:bookmarkEnd w:id="51"/>
-    <w:bookmarkStart w:id="52" w:name="Xd57e62f069d658ec3b53e3f026d4f5c46e83916"/>
+    <w:bookmarkEnd w:id="52"/>
+    <w:bookmarkStart w:id="53" w:name="Xd57e62f069d658ec3b53e3f026d4f5c46e83916"/>
     <w:p>
       <w:pPr>
         <w:pStyle w:val="Heading3"/>
@@ -2785,8 +2811,8 @@
         <w:t xml:space="preserve">The systems surveyed above are research artifacts.  A parallel commercial development is moving faster than the peer-reviewed literature and warrants explicit positioning; what follows reflects that landscape as of September 2026 and is dated deliberately, because it will continue to move.  Several products now describe themselves as agentic operating systems.  eva AG’s WarmWind, released in 2026, runs autonomous workers that operate applications through vision and simulated mouse and keyboard input, hosted in a managed cloud environment built on a Linux base and aimed at automating repetitive office work.  Alibaba’s ANOLISA ships an AI-native Linux terminal in which shell commands and ordinary language share a single prompt, with the agent requesting approval before risky operations and a checkpoint facility providing rollback.  Major platform vendors have each shipped or previewed some form of computer control, ranging from screenshot-driven graphical automation to structured application-intent dispatch.  Two properties separate all of them from the present work, and both are structural rather than incidental.  First, each routes inference through remote infrastructure, whereas the design constraint here is that the model runs on the user’s own hardware, with no network dependency.  Second, each is built to act on the user’s behalf, largely unattended, whereas the interface studied here is operated by a person turn by turn with every irreversible action gated on that person’s approval.  The distinction is not which approach is better but which question is being asked: these systems pursue autonomy, while this study asks whether conversation is a better interface for a human who is present and in control.</w:t>
       </w:r>
     </w:p>
-    <w:bookmarkEnd w:id="52"/>
-    <w:bookmarkStart w:id="53" w:name="vision-language-foundation-models"/>
+    <w:bookmarkEnd w:id="53"/>
+    <w:bookmarkStart w:id="54" w:name="vision-language-foundation-models"/>
     <w:p>
       <w:pPr>
         <w:pStyle w:val="Heading3"/>
@@ -2803,9 +2829,9 @@
         <w:t xml:space="preserve">Underlying many of these agents are vision-language models trained specifically for interface understanding.  CogAgent, from Hong and colleagues (2024), is an eighteen-billion-parameter visual language model specialized for GUI understanding and navigation, using both low- and high-resolution image encoders to recognize the small icons and text typical of graphical interfaces.  It supports the position that pure-vision GUI agents are viable when the underlying model is trained appropriately — but at a compute cost, and with the cross-platform generalization limitations common to the entire graphical-agent literature.  Across web, mobile, and desktop, these systems demonstrate broad capability within a single platform class, while consistently identifying visual grounding as an unsolved bottleneck and trending toward hybrid execution that prefers structured access where available and falls back to vision.</w:t>
       </w:r>
     </w:p>
-    <w:bookmarkEnd w:id="53"/>
     <w:bookmarkEnd w:id="54"/>
-    <w:bookmarkStart w:id="55" w:name="sec2-6"/>
+    <w:bookmarkEnd w:id="55"/>
+    <w:bookmarkStart w:id="56" w:name="sec2-6"/>
     <w:p>
       <w:pPr>
         <w:pStyle w:val="Heading2"/>
@@ -2838,8 +2864,8 @@
         <w:t xml:space="preserve">More recent work continues to mature the components required for speech-driven interface control.  Han and colleagues, in GUIRoboTron-Speech (2025), advance automated GUI agents driven directly by speech instructions, while Park and colleagues, in R-VLM (2025), contribute region-aware visual grounding for more precise identification of on-screen elements.  What unites this thread is that it operates at the level of the individual application or interaction technique rather than at the level of the session itself.  These approaches presuppose an underlying conversational system surface on which to run, yet no such surface exists at the session level.  This complementarity is significant: a general-purpose conversational interface layer would serve not only mainstream users but also provide the substrate that accessibility-specific configurations require — positioning accessibility not as the immediate target of the present study, which scopes it out for recruitment and ethics reasons, but as a natural and well-grounded extension of its contribution.</w:t>
       </w:r>
     </w:p>
-    <w:bookmarkEnd w:id="55"/>
-    <w:bookmarkStart w:id="56" w:name="sec2-7"/>
+    <w:bookmarkEnd w:id="56"/>
+    <w:bookmarkStart w:id="57" w:name="sec2-7"/>
     <w:p>
       <w:pPr>
         <w:pStyle w:val="Heading2"/>
@@ -2864,8 +2890,8 @@
         <w:t xml:space="preserve">Complementing the benchmark literature, the survey of LLM-brained GUI agents by Zhang and colleagues (2024) synthesizes the field through 2024, organizing it around the components of perception, planning, action, and memory, and providing the four-layer vocabulary adopted in §2.2 of this review.  It enumerates the field’s open challenges — accurate element localization, knowledge retrieval, long-horizon planning, and safety-aware execution control; notably, none of the challenges it enumerates concerns replacing the session layer itself: the survey takes the surrounding operating-system session as given, which is the assumption the present study sets out to test.  What the evaluation literature reveals, however, is a specific methodological limitation: rigorous as these benchmarks are, they measure the autonomous task completion of agents acting on a user’s behalf, not the comparative performance of a human user working through a conversational interface versus a conventional graphical one.  That distinction motivates the evaluation design reviewed in §2.9.</w:t>
       </w:r>
     </w:p>
-    <w:bookmarkEnd w:id="56"/>
-    <w:bookmarkStart w:id="63" w:name="sec2-8"/>
+    <w:bookmarkEnd w:id="57"/>
+    <w:bookmarkStart w:id="64" w:name="sec2-8"/>
     <w:p>
       <w:pPr>
         <w:pStyle w:val="Heading2"/>
@@ -4626,7 +4652,7 @@
         <w:t xml:space="preserve">Six patterns emerge from this comparison, each surfacing a recurring theme in the literature.</w:t>
       </w:r>
     </w:p>
-    <w:bookmarkStart w:id="57" w:name="bifurcation-by-coverage-scope"/>
+    <w:bookmarkStart w:id="58" w:name="bifurcation-by-coverage-scope"/>
     <w:p>
       <w:pPr>
         <w:pStyle w:val="Heading3"/>
@@ -4643,8 +4669,8 @@
         <w:t xml:space="preserve">The field is bifurcated by coverage scope.  Shell-level work (Westenfelder et al., 2025; Gyawali et al., 2025) and single-application work (van Dam, 2025; Padmanabha et al., 2024) sit at the narrow end; cross-application desktop, web, and mobile agents sit at the broad end but each within a single platform class.  No surveyed system implements a working conversational layer over the full graphical session that has been empirically validated against the conventional desktop workflow it would supplement.  The Unix Consultant (Wilensky et al., 1988) came closest in ambition four decades ago, but its pre-LLM foundation prevented it from scaling beyond demonstration.  The absence is structural rather than incidental.  Even UFO² (Zhang et al., 2025), the most operationally advanced desktop-agent system surveyed, is by construction an automation layer dispatched atop the existing Windows shell, and its stated future direction is broader cross-platform automation rather than replacement of the session itself.  The substitution this study attempts is therefore unclaimed, not merely under-published.</w:t>
       </w:r>
     </w:p>
-    <w:bookmarkEnd w:id="57"/>
-    <w:bookmarkStart w:id="58" w:name="execution-mechanism-at-the-action-layer"/>
+    <w:bookmarkEnd w:id="58"/>
+    <w:bookmarkStart w:id="59" w:name="execution-mechanism-at-the-action-layer"/>
     <w:p>
       <w:pPr>
         <w:pStyle w:val="Heading3"/>
@@ -4661,8 +4687,8 @@
         <w:t xml:space="preserve">A second pattern concerns the execution mechanism at the Action layer.  The literature divides among command translation, API binding, and GUI simulation, with a dominant trend toward hybrid execution (Zhang et al., 2025; van Dam, 2025) that prefers structured access where available and falls back to vision.  Vision-only systems (Wang et al., 2024; Niu et al., 2024) achieve broad applicability at the cost of grounding fragility, while structured-access systems achieve precision at the cost of per-environment integration.  Notably, the Unix Consultant operated purely at the consultation layer without executing actions — an approach that reflects an underappreciated design principle, that the agent that explains can be safer than the agent that acts, which the confirmation-gated design of the present study revisits.</w:t>
       </w:r>
     </w:p>
-    <w:bookmarkEnd w:id="58"/>
-    <w:bookmarkStart w:id="59" w:name="Xaee8aa4ffc06f790a7ecd2919914e9aaadf5929"/>
+    <w:bookmarkEnd w:id="59"/>
+    <w:bookmarkStart w:id="60" w:name="Xaee8aa4ffc06f790a7ecd2919914e9aaadf5929"/>
     <w:p>
       <w:pPr>
         <w:pStyle w:val="Heading3"/>
@@ -4679,8 +4705,8 @@
         <w:t xml:space="preserve">A third pattern is that visual grounding is the field’s principal bottleneck, identified explicitly by both SeeAct (Zheng et al., 2024) and the GUI-agents survey (Zhang et al., 2024).  The 51.1% ceiling of GPT-4V with oracle grounding and its sharp degradation without are attributable in significant part to grounding failure.  This bottleneck is a property of the graphical-simulation approach specifically; a command-line approach that grounds intent into shell commands rather than into on-screen pixel regions sidesteps it, at the cost of being bounded by what is expressible on the command line.  Direct comparison qualifies that tradeoff usefully.  Across 440 matched desktop tasks, screen-only graphical agents pass 59.1% while command-line agents reach only 48.2% — the shell is not automatically the stronger substrate — but command-line agents augmented with result verification reach 69.3%, the highest of the three conditions (Zhou et al., 2026).  Execution through the shell becomes advantageous when it is paired with a mechanism that checks what the command actually did, which is precisely the role a reversibility gate and an undo record play in the present design.</w:t>
       </w:r>
     </w:p>
-    <w:bookmarkEnd w:id="59"/>
-    <w:bookmarkStart w:id="60" w:name="scarcity-of-comparative-user-evaluation"/>
+    <w:bookmarkEnd w:id="60"/>
+    <w:bookmarkStart w:id="61" w:name="scarcity-of-comparative-user-evaluation"/>
     <w:p>
       <w:pPr>
         <w:pStyle w:val="Heading3"/>
@@ -4697,8 +4723,8 @@
         <w:t xml:space="preserve">A fourth pattern concerns evaluation method.  Most surveyed systems are evaluated either through architectural demonstration (Gyawali et al., 2025; van Dam, 2025) or through curated task benchmarks (Deng et al., 2023; Zhou et al., 2024; Wang et al., 2024; Xie et al., 2024).  User studies are rare, and the comparisons that do exist are narrow.  VoicePilot (Padmanabha et al., 2024) conducts a substantive human-centered evaluation of LLM-based interaction, and AXIS (Lu et al., 2024) compares an API-first agent against unaided manual operation in a within-subjects design — but within a single application, on a single platform, with a cloud-hosted frontier model.  No surveyed work compares a conversational interface against the conventional graphical workflow across operating-system-level tasks on the same population.  This is the empirical gap best filled by a controlled study of conversational interfaces.</w:t>
       </w:r>
     </w:p>
-    <w:bookmarkEnd w:id="60"/>
-    <w:bookmarkStart w:id="61" w:name="the-operating-system-substrate"/>
+    <w:bookmarkEnd w:id="61"/>
+    <w:bookmarkStart w:id="62" w:name="the-operating-system-substrate"/>
     <w:p>
       <w:pPr>
         <w:pStyle w:val="Heading3"/>
@@ -4715,8 +4741,8 @@
         <w:t xml:space="preserve">A fifth pattern concerns the operating-system substrate.  Windows (Hui et al., 2025; Zhang et al., 2025), Android (Rawles et al., 2023; Zhang et al., 2023; Wang et al., 2024), and the web (Deng et al., 2023; Zhou et al., 2024; Zheng et al., 2024) are each heavily represented; the Linux work that exists is aimed elsewhere than the end user’s desktop session.  NaSh (Gyawali et al., 2025) addresses Linux at the shell level as a design proposal; Alibaba Cloud’s ANOLISA ships a natural-language Linux terminal with approval gating and rollback, but scoped to server and DevOps workloads; and OSWorld (Xie et al., 2024) includes Ubuntu as an evaluation platform rather than a deployment target.  No surveyed system implements a conversational session layer for the Linux desktop addressed to the person using the machine, despite Linux serving as the substrate for most developer and server-side workflows.</w:t>
       </w:r>
     </w:p>
-    <w:bookmarkEnd w:id="61"/>
-    <w:bookmarkStart w:id="62" w:name="shared-lineage-and-its-fragility"/>
+    <w:bookmarkEnd w:id="62"/>
+    <w:bookmarkStart w:id="63" w:name="shared-lineage-and-its-fragility"/>
     <w:p>
       <w:pPr>
         <w:pStyle w:val="Heading3"/>
@@ -4801,9 +4827,9 @@
         <w:t xml:space="preserve">, controlled comparison against the conventional graphical workflow exists only within a single application, on a single platform, with a cloud-hosted frontier model (Lu et al., 2024); no such comparison exists for operating-system-level tasks under a locally-hosted model and an explicit safety gate.  SynapseOS — a conversational interface layer for the Linux desktop that translates natural-language intent into shell commands under a reversibility-based confirmation gate, evaluated against each participant’s own operating system — is positioned precisely against these four gaps.  Its relationship to the closest prior work is worth stating directly.  NaSh (Gyawali et al., 2025) proposes guardrails for an LLM-powered natural language shell — generated code that remains analyzable, selective undo, summaries of what a command would affect — as a design position, and explicitly leaves implementation and empirical evaluation as open work.  The present study is an implementation of that position, substituting for the general principle a static recoverability analysis, which derives what a command would affect from its structure before it runs, and an undo journal with five mechanisms, and supplying the user evaluation NaSh defers.</w:t>
       </w:r>
     </w:p>
-    <w:bookmarkEnd w:id="62"/>
     <w:bookmarkEnd w:id="63"/>
-    <w:bookmarkStart w:id="64" w:name="sec2-9"/>
+    <w:bookmarkEnd w:id="64"/>
+    <w:bookmarkStart w:id="65" w:name="sec2-9"/>
     <w:p>
       <w:pPr>
         <w:pStyle w:val="Heading2"/>
@@ -4884,8 +4910,8 @@
         <w:t xml:space="preserve">The specific instantiation of this methodology — the composition of the benchmark and custom task suite, the participant profile and screening criteria, the session procedure, the metrics and their computation, and the statistical and qualitative analysis plan — is presented in detail in Chapter 3.</w:t>
       </w:r>
     </w:p>
-    <w:bookmarkEnd w:id="64"/>
-    <w:bookmarkStart w:id="65" w:name="sec2-10"/>
+    <w:bookmarkEnd w:id="65"/>
+    <w:bookmarkStart w:id="66" w:name="sec2-10"/>
     <w:p>
       <w:pPr>
         <w:pStyle w:val="Heading2"/>
@@ -4910,8 +4936,8 @@
         <w:t xml:space="preserve">Synthesized, the surveyed works reveal a fourfold gap: no analysis of what a generated command would destroy, every guard being a list of dangerous patterns; no conversational replacement for the graphical session layer; no coverage of the Linux desktop; and no controlled comparison of a conversational interface against the conventional workflow across user populations.  The present study addresses the first through a recoverability analysis of generated shell commands, evaluated against ground truth obtained by sandboxed execution, and the other three through SynapseOS, the conversational interface layer for the Linux desktop in which that analysis is deployed, evaluated by controlled, within-subjects comparison against each participant’s own operating system.  The methodology through which this evaluation is conducted is the subject of Chapter 3.</w:t>
       </w:r>
     </w:p>
-    <w:bookmarkEnd w:id="65"/>
-    <w:bookmarkStart w:id="68" w:name="ch2-notes"/>
+    <w:bookmarkEnd w:id="66"/>
+    <w:bookmarkStart w:id="69" w:name="ch2-notes"/>
     <w:p>
       <w:pPr>
         <w:pStyle w:val="Heading2"/>
@@ -4928,11 +4954,11 @@
           <w:numId w:val="1006"/>
         </w:numPr>
       </w:pPr>
-      <w:bookmarkStart w:id="66" w:name="ch2-fn1"/>
+      <w:bookmarkStart w:id="67" w:name="ch2-fn1"/>
       <w:r>
         <w:t xml:space="preserve">A computer-using agent is an artificial-intelligence system that operates a computing environment by issuing actions and observing their results.  A GUI agent is a computer-using agent whose action space consists of operations on a graphical user interface — typically clicks, key presses, scrolls, and text entry — usually driven by a large language model or a multimodal (vision-language) model that additionally accepts images as input.</w:t>
       </w:r>
-      <w:bookmarkEnd w:id="66"/>
+      <w:bookmarkEnd w:id="67"/>
     </w:p>
     <w:p>
       <w:pPr>
@@ -4942,14 +4968,14 @@
           <w:numId w:val="1006"/>
         </w:numPr>
       </w:pPr>
-      <w:bookmarkStart w:id="67" w:name="ch2-fn2"/>
+      <w:bookmarkStart w:id="68" w:name="ch2-fn2"/>
       <w:r>
         <w:t xml:space="preserve">Grounding is the problem of mapping a model’s textual plan onto a concrete operation in the environment.  Visual grounding is the specific subproblem of identifying the on-screen pixel region corresponding to a referenced interface element — repeatedly identified in the surveyed literature as the principal bottleneck for graphical agents, and one that a command-line approach avoids by grounding intent into shell commands rather than into screen coordinates.</w:t>
       </w:r>
-      <w:bookmarkEnd w:id="67"/>
-    </w:p>
-    <w:bookmarkEnd w:id="68"/>
-    <w:bookmarkStart w:id="69" w:name="sec-chapter3"/>
+      <w:bookmarkEnd w:id="68"/>
+    </w:p>
+    <w:bookmarkEnd w:id="69"/>
+    <w:bookmarkStart w:id="70" w:name="sec-chapter3"/>
     <w:p>
       <w:pPr>
         <w:pStyle w:val="FirstParagraph"/>
@@ -4966,7 +4992,7 @@
         <w:t xml:space="preserve">Methodology</w:t>
       </w:r>
     </w:p>
-    <w:bookmarkEnd w:id="69"/>
+    <w:bookmarkEnd w:id="70"/>
     <w:p>
       <w:pPr>
         <w:pStyle w:val="BodyText"/>
@@ -5057,7 +5083,7 @@
         <w:t xml:space="preserve">The two evaluations are independent by construction, and this is the reason the questions are ordered as they are.  Section 3.1 defines the corpus-based evaluation that answers RQ1 without reference to any participant; Section 1 defines the data gathered to answer RQ3 and RQ4; Section 2 describes the system built to answer RQ2 and RQ3; and Sections 3.2 onward define the user study that answers RQ3 and RQ4.  Removing the conversational interface from this study would remove RQ2 through RQ4 and the user study with them; RQ1, its corpus, its baselines, and its results would remain intact, because the analysis takes a shell command as a string and is indifferent to what produced it.</w:t>
       </w:r>
     </w:p>
-    <w:bookmarkStart w:id="73" w:name="sec-conceptual-framework"/>
+    <w:bookmarkStart w:id="74" w:name="sec-conceptual-framework"/>
     <w:p>
       <w:pPr>
         <w:pStyle w:val="Heading2"/>
@@ -5091,18 +5117,18 @@
           <wp:inline>
             <wp:extent cx="5334000" cy="3717131"/>
             <wp:effectExtent b="0" l="0" r="0" t="0"/>
-            <wp:docPr descr="" title="" id="71" name="Picture"/>
+            <wp:docPr descr="" title="" id="72" name="Picture"/>
             <a:graphic>
               <a:graphicData uri="http://schemas.openxmlformats.org/drawingml/2006/picture">
                 <pic:pic>
                   <pic:nvPicPr>
-                    <pic:cNvPr descr="/tmp/claude-1000/-home-willard-projects-thesis/cb82e7af-8c35-489a-a7f7-ef49172efea2/scratchpad/docx/fig1.png" id="72" name="Picture"/>
+                    <pic:cNvPr descr="/tmp/claude-1000/-home-willard-projects-thesis/cb82e7af-8c35-489a-a7f7-ef49172efea2/scratchpad/docx/fig1.png" id="73" name="Picture"/>
                     <pic:cNvPicPr>
                       <a:picLocks noChangeArrowheads="1" noChangeAspect="1"/>
                     </pic:cNvPicPr>
                   </pic:nvPicPr>
                   <pic:blipFill>
-                    <a:blip r:embed="rId70"/>
+                    <a:blip r:embed="rId71"/>
                     <a:stretch>
                       <a:fillRect/>
                     </a:stretch>
@@ -5147,8 +5173,8 @@
         <w:t xml:space="preserve">Conceptual framework of SynapseOS.  The user issues a natural language command to the conversational surface, which routes the utterance to the intent parser (Qwen2.5-Coder-3B-Instruct, local SLM).  The intent parser produces a shell command dispatched to the execution engine (bash subprocess).  Irreversible operations are intercepted by the confirmation gate; reversible operations are logged to the undo stack.  Command output (stdout/stderr) is captured, rendered in the conversational surface, and presented back to the user — completing the interaction loop.</w:t>
       </w:r>
     </w:p>
-    <w:bookmarkEnd w:id="73"/>
-    <w:bookmarkStart w:id="74" w:name="sec-system-env"/>
+    <w:bookmarkEnd w:id="74"/>
+    <w:bookmarkStart w:id="75" w:name="sec-system-env"/>
     <w:p>
       <w:pPr>
         <w:pStyle w:val="Heading2"/>
@@ -5779,8 +5805,8 @@
         <w:t xml:space="preserve">— a single non-interactive invocation, with no session persisting between separate calls, that runs a bounded loop toward one natural-language request: propose a command, pass it through the same reversibility-based confirmation gate described in the Execution Pipeline (Section 2.1(b)) — executing immediately if reversible, blocking pending explicit confirmation if not — then feed the result back so the model can propose the next step or signal completion, up to a fixed step limit, before the invocation exits, sharing TUI mode’s minimal hardware footprint but intended for scripting and automation rather than an interactive session.  Neither CLI nor TUI mode is evaluated in the user study.</w:t>
       </w:r>
     </w:p>
-    <w:bookmarkEnd w:id="74"/>
-    <w:bookmarkStart w:id="85" w:name="sec1"/>
+    <w:bookmarkEnd w:id="75"/>
+    <w:bookmarkStart w:id="86" w:name="sec1"/>
     <w:p>
       <w:pPr>
         <w:pStyle w:val="Heading2"/>
@@ -5797,7 +5823,7 @@
         <w:t xml:space="preserve">The data gathered for this study falls into three categories: benchmark task data used to evaluate the system in a standardized environment, user study data collected from human participants in a controlled setting, and system performance data captured automatically through built-in telemetry during all sessions.</w:t>
       </w:r>
     </w:p>
-    <w:bookmarkStart w:id="78" w:name="ch3-sec1-1"/>
+    <w:bookmarkStart w:id="79" w:name="ch3-sec1-1"/>
     <w:p>
       <w:pPr>
         <w:pStyle w:val="Heading3"/>
@@ -5806,7 +5832,7 @@
         <w:t xml:space="preserve">1.1 What to gather</w:t>
       </w:r>
     </w:p>
-    <w:bookmarkStart w:id="75" w:name="a-benchmark-task-suite"/>
+    <w:bookmarkStart w:id="76" w:name="a-benchmark-task-suite"/>
     <w:p>
       <w:pPr>
         <w:pStyle w:val="Heading4"/>
@@ -5823,8 +5849,8 @@
         <w:t xml:space="preserve">The primary benchmark dataset is the OSWorld task suite (Xie et al., 2024), which provides standardized real-computer tasks across shell operations, file management, web browsing, and application-level interactions.  OSWorld is the only existing benchmark that evaluates computer-using agents in real operating system environments, making it the most appropriate external standard for SynapseOS evaluation.  Tasks are presented as natural language instructions; agents interact with a real virtual machine environment, and outcomes are evaluated by automated inspection of the resulting system state — whether the goal was actually achieved — rather than by comparing individual actions.  In addition to OSWorld tasks, a custom cross-platform task suite is developed for this study, covering file search and organization, system and process monitoring, application and package management, and text and data processing — each task defined as a human-level goal achievable via SynapseOS natural language commands and via native OS tools on the comparison machine.  Each task in both suites is documented with a description, expected outcome, task category, and difficulty level.</w:t>
       </w:r>
     </w:p>
-    <w:bookmarkEnd w:id="75"/>
-    <w:bookmarkStart w:id="76" w:name="b-user-study-data"/>
+    <w:bookmarkEnd w:id="76"/>
+    <w:bookmarkStart w:id="77" w:name="b-user-study-data"/>
     <w:p>
       <w:pPr>
         <w:pStyle w:val="Heading4"/>
@@ -5929,8 +5955,8 @@
         <w:t xml:space="preserve">responses gathered through a semi-structured post-study interview covering perceived ease of use, trust in the system, and comparison between the two conditions</w:t>
       </w:r>
     </w:p>
-    <w:bookmarkEnd w:id="76"/>
-    <w:bookmarkStart w:id="77" w:name="c-system-performance-data"/>
+    <w:bookmarkEnd w:id="77"/>
+    <w:bookmarkStart w:id="78" w:name="c-system-performance-data"/>
     <w:p>
       <w:pPr>
         <w:pStyle w:val="Heading4"/>
@@ -6007,9 +6033,9 @@
         <w:t xml:space="preserve">Intent parsing accuracy: whether the system correctly identified the user’s intent on the first attempt</w:t>
       </w:r>
     </w:p>
-    <w:bookmarkEnd w:id="77"/>
     <w:bookmarkEnd w:id="78"/>
-    <w:bookmarkStart w:id="81" w:name="ch3-sec1-2"/>
+    <w:bookmarkEnd w:id="79"/>
+    <w:bookmarkStart w:id="82" w:name="ch3-sec1-2"/>
     <w:p>
       <w:pPr>
         <w:pStyle w:val="Heading3"/>
@@ -6018,7 +6044,7 @@
         <w:t xml:space="preserve">1.2 How to gather</w:t>
       </w:r>
     </w:p>
-    <w:bookmarkStart w:id="79" w:name="a-benchmark-tasks"/>
+    <w:bookmarkStart w:id="80" w:name="a-benchmark-tasks"/>
     <w:p>
       <w:pPr>
         <w:pStyle w:val="Heading4"/>
@@ -6035,8 +6061,8 @@
         <w:t xml:space="preserve">SynapseOS is deployed on the Debian 13 (Trixie) environment matching the OSWorld evaluation setup (Xie et al., 2024).  Each benchmark task is executed through the conversational interface, and results are captured programmatically through the built-in telemetry system.  Each task is supplied to SynapseOS as a natural language instruction, and the resulting system state is compared against the expected outcome defined in the benchmark.  Because SynapseOS gates every command classified irreversible on explicit confirmation, benchmark runs are facilitator-attended rather than unattended; the confirmation gate remains active throughout and every confirmation is logged as part of the run record.  OSWorld scores the resulting system state rather than a human operator’s performance, so it applies only to the SynapseOS condition.  Condition B, which a human participant operates directly, has no equivalent and is instead evaluated through the custom cross-platform task suite administered in the user study (Section 1.2(b)).</w:t>
       </w:r>
     </w:p>
-    <w:bookmarkEnd w:id="79"/>
-    <w:bookmarkStart w:id="80" w:name="b-user-study"/>
+    <w:bookmarkEnd w:id="80"/>
+    <w:bookmarkStart w:id="81" w:name="b-user-study"/>
     <w:p>
       <w:pPr>
         <w:pStyle w:val="Heading4"/>
@@ -6121,9 +6147,9 @@
         <w:t xml:space="preserve">After completing each condition, participants fill out the SUS and NASA-TLX questionnaires.  After completing both conditions, a brief semi-structured interview is conducted to gather qualitative feedback.</w:t>
       </w:r>
     </w:p>
-    <w:bookmarkEnd w:id="80"/>
     <w:bookmarkEnd w:id="81"/>
-    <w:bookmarkStart w:id="82" w:name="ch3-sec1-3"/>
+    <w:bookmarkEnd w:id="82"/>
+    <w:bookmarkStart w:id="83" w:name="ch3-sec1-3"/>
     <w:p>
       <w:pPr>
         <w:pStyle w:val="Heading3"/>
@@ -6228,8 +6254,8 @@
         <w:t xml:space="preserve">is addressed by the user study metrics (task completion time, error rate, satisfaction scores).  RQ1 draws on none of these, being answered against the labeled command corpus described in Section 3.1.</w:t>
       </w:r>
     </w:p>
-    <w:bookmarkEnd w:id="82"/>
-    <w:bookmarkStart w:id="83" w:name="ch3-sec1-4"/>
+    <w:bookmarkEnd w:id="83"/>
+    <w:bookmarkStart w:id="84" w:name="ch3-sec1-4"/>
     <w:p>
       <w:pPr>
         <w:pStyle w:val="Heading3"/>
@@ -6354,8 +6380,8 @@
         <w:t xml:space="preserve">if they report advanced proficiency on their primary OS — capable of performing file management, process monitoring, and system administration tasks efficiently using that OS’s native tools — regardless of which OS that is, and pass all three behavioral screener tasks.  Participants whose self-report and behavioral screener results disagree, or who do not clearly satisfy either classification, are excluded.  Primary OS is recorded for all participants as a grouping variable, and prior conversational AI exposure as a covariate, in the analysis; prior AI exposure is analyzed as an exploratory covariate only (see Section 3.3) rather than a primary grouping variable, since splitting the sample along a third axis would leave subgroups too small to support a hypothesis test.</w:t>
       </w:r>
     </w:p>
-    <w:bookmarkEnd w:id="83"/>
-    <w:bookmarkStart w:id="84" w:name="ch3-sec1-5"/>
+    <w:bookmarkEnd w:id="84"/>
+    <w:bookmarkStart w:id="85" w:name="ch3-sec1-5"/>
     <w:p>
       <w:pPr>
         <w:pStyle w:val="Heading3"/>
@@ -6468,9 +6494,9 @@
         <w:t xml:space="preserve">The custom task suite comprises tasks organized into four categories: file search and organization, system and process monitoring, application and package management, and text and data processing.  All tasks are defined at the human-goal level — achievable via SynapseOS natural language on the evaluation machine and via native graphical or terminal tools on the comparison machine.  Each task is documented with a unique identifier, a natural language prompt as presented to the participant, the expected outcome, and the assigned difficulty level.  The full suite — twelve core tasks in two parallel forms, plus four boundary tasks lying outside shell expressibility that are scored and reported separately — is given in Appendix C.  Difficulty calibration and form equivalence are validated during the pilot study and revised as necessary before the main study begins.</w:t>
       </w:r>
     </w:p>
-    <w:bookmarkEnd w:id="84"/>
     <w:bookmarkEnd w:id="85"/>
-    <w:bookmarkStart w:id="94" w:name="sec2"/>
+    <w:bookmarkEnd w:id="86"/>
+    <w:bookmarkStart w:id="95" w:name="sec2"/>
     <w:p>
       <w:pPr>
         <w:pStyle w:val="Heading2"/>
@@ -6487,7 +6513,7 @@
         <w:t xml:space="preserve">Building SynapseOS and running the study that evaluates it are two related but distinct efforts.  The system itself — the conversational interface layer and execution pipeline — is designed and implemented first, followed by the scaffolding that makes the resulting study trustworthy: collected data is processed and pseudonymized, the system and instruments are validated, each participant session follows a standardized procedure, and participant welfare is protected throughout.</w:t>
       </w:r>
     </w:p>
-    <w:bookmarkStart w:id="89" w:name="ch3-sec2-1"/>
+    <w:bookmarkStart w:id="90" w:name="ch3-sec2-1"/>
     <w:p>
       <w:pPr>
         <w:pStyle w:val="Heading3"/>
@@ -6504,7 +6530,7 @@
         <w:t xml:space="preserve">The construction of SynapseOS proceeds across two primary workstreams — the conversational interface layer and the execution pipeline — integrated into a unified session manager that launches over the conventional Linux graphical desktop session rather than replacing it.</w:t>
       </w:r>
     </w:p>
-    <w:bookmarkStart w:id="86" w:name="a-conversational-interface-layer"/>
+    <w:bookmarkStart w:id="87" w:name="a-conversational-interface-layer"/>
     <w:p>
       <w:pPr>
         <w:pStyle w:val="Heading4"/>
@@ -6618,8 +6644,8 @@
         <w:t xml:space="preserve">This selection was reconfirmed against models released after the initial literature review, to guard against the fast-moving small-model landscape becoming stale before study execution; no smaller alternative offered comparable shell-generation evidence within the same CPU-only hardware budget (Jacobs et al., 2026).  Newer mixture-of-experts variants require all experts resident in memory regardless of active parameters per token, which is incompatible with this study’s memory budget, and newer general-purpose small models report reasoning benchmarks but no shell-command generation evidence.</w:t>
       </w:r>
     </w:p>
-    <w:bookmarkEnd w:id="86"/>
-    <w:bookmarkStart w:id="87" w:name="b-execution-pipeline"/>
+    <w:bookmarkEnd w:id="87"/>
+    <w:bookmarkStart w:id="88" w:name="b-execution-pipeline"/>
     <w:p>
       <w:pPr>
         <w:pStyle w:val="Heading4"/>
@@ -6644,8 +6670,8 @@
         <w:t xml:space="preserve">SynapseOS executes only shell-expressible operations.  The system’s capability boundary is the Linux command-line toolchain: file management, process control, text processing, package management, network configuration, and any application that exposes a command-line interface.  GUI-only interactions — clicking buttons in graphical applications, navigating web page elements, or interacting with visual-only interfaces — are explicitly outside scope, in deliberate contrast to broader desktop agent frameworks that additionally orchestrate GUI automation atop the existing session (Zhang et al., 2025).  This boundary is intentional: it constrains the research to a tractable, verifiable claim that the system can be built, evaluated, and defended within the thesis timeline.</w:t>
       </w:r>
     </w:p>
-    <w:bookmarkEnd w:id="87"/>
-    <w:bookmarkStart w:id="88" w:name="c-recoverability-analysis"/>
+    <w:bookmarkEnd w:id="88"/>
+    <w:bookmarkStart w:id="89" w:name="c-recoverability-analysis"/>
     <w:p>
       <w:pPr>
         <w:pStyle w:val="Heading4"/>
@@ -8187,9 +8213,9 @@
         <w:t xml:space="preserve">EFFECTS derives and composes the effect set, applying rules to the leaves and resolving wrappers through RESOLVE; RESOLVE learns run-time targets by running only a form of the command proven to have no effects; VERDICT and PLAN decide and cover.  UNRESOLVED and UNKNOWN are the sentinels that give the analysis its one-sided soundness: they can only push the verdict toward UNRECOVERABLE.  A move (a removal whose data survives at another path) is the only removal PLAN does not capture.</w:t>
       </w:r>
     </w:p>
-    <w:bookmarkEnd w:id="88"/>
     <w:bookmarkEnd w:id="89"/>
-    <w:bookmarkStart w:id="90" w:name="ch3-sec2-2"/>
+    <w:bookmarkEnd w:id="90"/>
+    <w:bookmarkStart w:id="91" w:name="ch3-sec2-2"/>
     <w:p>
       <w:pPr>
         <w:pStyle w:val="Heading3"/>
@@ -8294,8 +8320,8 @@
         <w:t xml:space="preserve">all participant records are pseudonymized at the point of extraction, replacing identifying information with participant ID codes prior to any analysis</w:t>
       </w:r>
     </w:p>
-    <w:bookmarkEnd w:id="90"/>
-    <w:bookmarkStart w:id="91" w:name="ch3-sec2-3"/>
+    <w:bookmarkEnd w:id="91"/>
+    <w:bookmarkStart w:id="92" w:name="ch3-sec2-3"/>
     <w:p>
       <w:pPr>
         <w:pStyle w:val="Heading3"/>
@@ -8420,8 +8446,8 @@
         <w:t xml:space="preserve">; the one that bears on the study is described under threats to validity (Section 3.6).</w:t>
       </w:r>
     </w:p>
-    <w:bookmarkEnd w:id="91"/>
-    <w:bookmarkStart w:id="92" w:name="ch3-sec2-4"/>
+    <w:bookmarkEnd w:id="92"/>
+    <w:bookmarkStart w:id="93" w:name="ch3-sec2-4"/>
     <w:p>
       <w:pPr>
         <w:pStyle w:val="Heading3"/>
@@ -8600,8 +8626,8 @@
         <w:t xml:space="preserve">Total estimated session duration per participant: 90–120 minutes.</w:t>
       </w:r>
     </w:p>
-    <w:bookmarkEnd w:id="92"/>
-    <w:bookmarkStart w:id="93" w:name="ch3-sec2-5"/>
+    <w:bookmarkEnd w:id="93"/>
+    <w:bookmarkStart w:id="94" w:name="ch3-sec2-5"/>
     <w:p>
       <w:pPr>
         <w:pStyle w:val="Heading3"/>
@@ -8794,9 +8820,9 @@
         <w:t xml:space="preserve">Participants may discontinue the session at any point, and may request withdrawal of their data for up to fourteen days after their session — the ID-to-consent mapping is retained through that window specifically so that withdrawal remains possible.  After it closes the mapping is destroyed and individual records can no longer be located.  This limit is stated on the consent form so that it is understood before participation rather than discovered after.</w:t>
       </w:r>
     </w:p>
-    <w:bookmarkEnd w:id="93"/>
     <w:bookmarkEnd w:id="94"/>
-    <w:bookmarkStart w:id="113" w:name="sec3"/>
+    <w:bookmarkEnd w:id="95"/>
+    <w:bookmarkStart w:id="114" w:name="sec3"/>
     <w:p>
       <w:pPr>
         <w:pStyle w:val="Heading2"/>
@@ -8813,7 +8839,7 @@
         <w:t xml:space="preserve">SynapseOS is evaluated against the datasets and study design established in Section 1.  The comparison follows a fixed set of metrics and formulas, a statistical analysis plan for testing significance and effect size, and an accounting of the threats to validity this design addresses.</w:t>
       </w:r>
     </w:p>
-    <w:bookmarkStart w:id="103" w:name="ch3-sec3-1"/>
+    <w:bookmarkStart w:id="104" w:name="ch3-sec3-1"/>
     <w:p>
       <w:pPr>
         <w:pStyle w:val="Heading3"/>
@@ -8830,7 +8856,7 @@
         <w:t xml:space="preserve">RQ1 is answered separately from the user study, against a labeled corpus of shell commands rather than through participants.  The separation is deliberate and has a practical consequence worth stating: this evaluation depends on no ethics approval, no recruitment, and no participant sessions, and can therefore be completed and reported independently of the study’s schedule.</w:t>
       </w:r>
     </w:p>
-    <w:bookmarkStart w:id="95" w:name="a-corpus-construction"/>
+    <w:bookmarkStart w:id="96" w:name="a-corpus-construction"/>
     <w:p>
       <w:pPr>
         <w:pStyle w:val="Heading4"/>
@@ -8932,8 +8958,8 @@
         <w:t xml:space="preserve">A second stratification is by the shape of the command, assigned by the generator from the command’s syntax: a single named command; a chain; one whose targets are computed while it runs; a redirect; one whose effect hides inside an interpreter or a tool the rule table does not name; and one whose effect lies outside the filesystem.  The claims under test concern the composed, run-time, and hidden shapes, and a corpus dominated by plain named commands would measure the strength of a list and not the contribution of the analysis, so results are reported per shape as well as in aggregate.</w:t>
       </w:r>
     </w:p>
-    <w:bookmarkEnd w:id="95"/>
-    <w:bookmarkStart w:id="96" w:name="b-ground-truth"/>
+    <w:bookmarkEnd w:id="96"/>
+    <w:bookmarkStart w:id="97" w:name="b-ground-truth"/>
     <w:p>
       <w:pPr>
         <w:pStyle w:val="Heading4"/>
@@ -9070,8 +9096,8 @@
         <w:t xml:space="preserve">The generator shares no code with the analysis and never consults it, so agreement between the two is evidence and not circularity.  It is deterministic for a given seed, and it records the number of candidates drawn and the reasons for each exclusion beside the corpus.  There is no human labeler, and so no labeler disagreement to measure; the threat that takes its place is the validity of the oracle itself, addressed in (e).</w:t>
       </w:r>
     </w:p>
-    <w:bookmarkEnd w:id="96"/>
-    <w:bookmarkStart w:id="97" w:name="c-baselines"/>
+    <w:bookmarkEnd w:id="97"/>
+    <w:bookmarkStart w:id="98" w:name="c-baselines"/>
     <w:p>
       <w:pPr>
         <w:pStyle w:val="Heading4"/>
@@ -9117,8 +9143,8 @@
         <w:t xml:space="preserve">Because the first baseline was written by the same team, it was checked against command-safety checks that others ship.  Two open-source checks were scored on the same held-out corpus and labels reported in (g) below: the dangerous-command check of OpenAI’s Codex CLI (OpenAI, 2026), ported from its source and verified against that source’s own unit tests, and cc-safety-net (kenryu42, 2026), a pre-execution guard used with several agentic coding tools, run unmodified under each of its three presets.  On the 325 commands that destroy files, they let between 73% and 97% run with no confirmation and no capture, against 31% for the enumerated-pattern classifier, and neither makes any provision for recovery.  Both are designed for coding agents working inside a version-controlled project, where deleting project files is routine and version control is the safeguard, so these figures describe how they would serve a person’s own files, not how well they serve their intended purpose.  The first baseline is therefore the strictest enumerated list tested, and comparisons against it understate rather than overstate the analysis’s advantage over lists in current use.  No shipping tool was found that determines a command’s effects before it runs in order to capture what it would destroy; on recovery there is no external counterpart, which is the gap identified in Section 2.4.  The comparison is provided as supplementary material.</w:t>
       </w:r>
     </w:p>
-    <w:bookmarkEnd w:id="97"/>
-    <w:bookmarkStart w:id="98" w:name="d-metrics"/>
+    <w:bookmarkEnd w:id="98"/>
+    <w:bookmarkStart w:id="99" w:name="d-metrics"/>
     <w:p>
       <w:pPr>
         <w:pStyle w:val="Heading4"/>
@@ -9422,8 +9448,8 @@
         </w:tc>
       </w:tr>
     </w:tbl>
-    <w:bookmarkEnd w:id="98"/>
-    <w:bookmarkStart w:id="99" w:name="e-threats-specific-to-this-evaluation"/>
+    <w:bookmarkEnd w:id="99"/>
+    <w:bookmarkStart w:id="100" w:name="e-threats-specific-to-this-evaluation"/>
     <w:p>
       <w:pPr>
         <w:pStyle w:val="Heading4"/>
@@ -9440,8 +9466,8 @@
         <w:t xml:space="preserve">Four are anticipated.  First, corpus bias is addressed by partitioning, as described above.  Second, oracle validity replaces label subjectivity: the labels are observed, so they cannot be argued with, but they are facts about one command on one small fixture, run for a few seconds, seeing the working tree and not repository internals.  A loss that appears only on a differently shaped tree, or after the time limit, is labeled by what happened here.  The oracle’s own behavior is pinned by unit tests over commands whose outcome is known, its exclusions are reported, and the bias they introduce — toward commands that run on a small fixture, which excludes most NL2Bash candidates that name paths or hosts the fixture cannot supply — is stated and not corrected.  Third, the algorithm and the labels are produced by the same research team, which creates a risk that the labels reflect the algorithm’s assumptions; the generator is independent of the analysis by construction, and the corpus is fixed by a recorded seed and hash before the analysis is run on it.  A fourth threat follows from the same fact: the analysis rests on a table of what each known command does, written by the same team, and a table written with the corpus in view measures the cases its author anticipated.  The corpus is therefore generated from several seeds.  Earlier ones are used to correct the analysis and the undo; the primary result is reported on one drawn after both are frozen, with the analyzer’s hash recorded beside the result.</w:t>
       </w:r>
     </w:p>
-    <w:bookmarkEnd w:id="99"/>
-    <w:bookmarkStart w:id="100" w:name="X595e773872722bb906c94c2167c830f5ec35da9"/>
+    <w:bookmarkEnd w:id="100"/>
+    <w:bookmarkStart w:id="101" w:name="X595e773872722bb906c94c2167c830f5ec35da9"/>
     <w:p>
       <w:pPr>
         <w:pStyle w:val="Heading4"/>
@@ -9511,8 +9537,8 @@
         <w:t xml:space="preserve">With three baselines and two primary metrics, the comparisons that carry a claim are the analysis against each of the first two baselines on silent loss and on capture coverage.  Four tests share one family, so significance is judged with a Holm correction at a family-wise α = 0.05, and the uncorrected values are reported beside the corrected ones.  The full-snapshot baseline is a bound on cost and safety, not a comparison of accuracy, and is reported descriptively.</w:t>
       </w:r>
     </w:p>
-    <w:bookmarkEnd w:id="100"/>
-    <w:bookmarkStart w:id="101" w:name="g-results-on-the-held-out-corpus"/>
+    <w:bookmarkEnd w:id="101"/>
+    <w:bookmarkStart w:id="102" w:name="g-results-on-the-held-out-corpus"/>
     <w:p>
       <w:pPr>
         <w:pStyle w:val="Heading4"/>
@@ -10132,8 +10158,8 @@
         <w:t xml:space="preserve">— and it asks on these by construction.  A large share of NL2Bash candidates are excluded because they name paths or programs the fixture cannot supply, which biases that partition toward commands that run on a small tree.  The external partition is assigned by a table of state-changing tools and not observed, so its labels are only as good as the table, as the model-generated partition’s one error shows.  And the model-generated partition above was scored against an earlier build of the analyser, not the one the primary result was frozen against.</w:t>
       </w:r>
     </w:p>
-    <w:bookmarkEnd w:id="101"/>
-    <w:bookmarkStart w:id="102" w:name="h-composition-ablation"/>
+    <w:bookmarkEnd w:id="102"/>
+    <w:bookmarkStart w:id="103" w:name="h-composition-ablation"/>
     <w:p>
       <w:pPr>
         <w:pStyle w:val="Heading4"/>
@@ -10616,9 +10642,9 @@
         <w:t xml:space="preserve">— cost the table-only configuration little or nothing, because the table already covers them.  The reported result in sections (f) and (g) above is therefore attributable to composition specifically and not to the table it is sometimes mistaken for.</w:t>
       </w:r>
     </w:p>
-    <w:bookmarkEnd w:id="102"/>
     <w:bookmarkEnd w:id="103"/>
-    <w:bookmarkStart w:id="104" w:name="ch3-sec3-2"/>
+    <w:bookmarkEnd w:id="104"/>
+    <w:bookmarkStart w:id="105" w:name="ch3-sec3-2"/>
     <w:p>
       <w:pPr>
         <w:pStyle w:val="Heading3"/>
@@ -10635,8 +10661,8 @@
         <w:t xml:space="preserve">The system is evaluated against two datasets: the OSWorld benchmark task suite (Xie et al., 2024) for direct comparison with results in the existing literature, and the custom cross-platform task suite described in Sections 1.1 and 1.5.  The user study evaluation involves 40 participants (20 novice, 20 power users); the baseline condition is each participant’s primary operating system — Windows 11, macOS, or Linux with GNOME desktop — on a dedicated baseline machine.</w:t>
       </w:r>
     </w:p>
-    <w:bookmarkEnd w:id="104"/>
-    <w:bookmarkStart w:id="105" w:name="ch3-sec3-3"/>
+    <w:bookmarkEnd w:id="105"/>
+    <w:bookmarkStart w:id="106" w:name="ch3-sec3-3"/>
     <w:p>
       <w:pPr>
         <w:pStyle w:val="Heading3"/>
@@ -10713,8 +10739,8 @@
         <w:t xml:space="preserve">The two participant groups — novice users and power users — are analyzed both in aggregate and separately to determine whether the effect of the interface condition differs across experience levels.  Additionally, primary OS (Windows, macOS, Linux) is recorded as a secondary grouping variable to determine whether results vary across participant backgrounds, and prior conversational AI exposure (frequency of use) is recorded as a covariate to determine whether familiarity with LLM-based tools correlates with SynapseOS performance independent of OS proficiency.  The primary analysis is the pooled within-subjects comparison across all 40 participants; per-OS subgroup analyses and AI-exposure correlations are treated as exploratory given the smaller per-group sample sizes they entail.</w:t>
       </w:r>
     </w:p>
-    <w:bookmarkEnd w:id="105"/>
-    <w:bookmarkStart w:id="110" w:name="ch3-sec3-4"/>
+    <w:bookmarkEnd w:id="106"/>
+    <w:bookmarkStart w:id="111" w:name="ch3-sec3-4"/>
     <w:p>
       <w:pPr>
         <w:pStyle w:val="Heading3"/>
@@ -10731,7 +10757,7 @@
         <w:t xml:space="preserve">The following metrics and formulas are used to evaluate SynapseOS against the baseline:</w:t>
       </w:r>
     </w:p>
-    <w:bookmarkStart w:id="106" w:name="a-task-completion-time"/>
+    <w:bookmarkStart w:id="107" w:name="a-task-completion-time"/>
     <w:p>
       <w:pPr>
         <w:pStyle w:val="Heading4"/>
@@ -10748,8 +10774,8 @@
         <w:t xml:space="preserve">Mean task completion time is computed per condition per participant group.  Inferential testing and effect size reporting follow the procedures described in Section 3.5.</w:t>
       </w:r>
     </w:p>
-    <w:bookmarkEnd w:id="106"/>
-    <w:bookmarkStart w:id="107" w:name="b-error-rate"/>
+    <w:bookmarkEnd w:id="107"/>
+    <w:bookmarkStart w:id="108" w:name="b-error-rate"/>
     <w:p>
       <w:pPr>
         <w:pStyle w:val="Heading4"/>
@@ -10782,8 +10808,8 @@
         <w:t xml:space="preserve">Error events are further categorized by type: intent parsing errors (incorrect bash command generated), execution errors (bash subprocess failure), and recovery failures (unsuccessful undo or retry).  The same paired statistical test is applied to error rate differences between conditions.</w:t>
       </w:r>
     </w:p>
-    <w:bookmarkEnd w:id="107"/>
-    <w:bookmarkStart w:id="108" w:name="c-user-satisfaction"/>
+    <w:bookmarkEnd w:id="108"/>
+    <w:bookmarkStart w:id="109" w:name="c-user-satisfaction"/>
     <w:p>
       <w:pPr>
         <w:pStyle w:val="Heading4"/>
@@ -10808,8 +10834,8 @@
         <w:t xml:space="preserve">Qualitative interview data is analyzed using thematic analysis to identify recurring themes in participant perceptions of both conditions.</w:t>
       </w:r>
     </w:p>
-    <w:bookmarkEnd w:id="108"/>
-    <w:bookmarkStart w:id="109" w:name="X2db549e47d03a47c0f54d1209c8c09b0dd0a7e7"/>
+    <w:bookmarkEnd w:id="109"/>
+    <w:bookmarkStart w:id="110" w:name="X2db549e47d03a47c0f54d1209c8c09b0dd0a7e7"/>
     <w:p>
       <w:pPr>
         <w:pStyle w:val="Heading4"/>
@@ -10900,9 +10926,9 @@
         <w:t xml:space="preserve">= 0.66 or larger.  The condition × group interaction — the test corresponding most directly to the study’s central claim — remains the least-powered comparison in the design, since an interaction of a given size requires substantially more participants than a main effect of the same size; it is therefore reported with effect sizes and confidence intervals as the primary descriptive finding, and is not treated as a confirmatory significance test.</w:t>
       </w:r>
     </w:p>
-    <w:bookmarkEnd w:id="109"/>
     <w:bookmarkEnd w:id="110"/>
-    <w:bookmarkStart w:id="111" w:name="ch3-sec3-5"/>
+    <w:bookmarkEnd w:id="111"/>
+    <w:bookmarkStart w:id="112" w:name="ch3-sec3-5"/>
     <w:p>
       <w:pPr>
         <w:pStyle w:val="Heading3"/>
@@ -10951,8 +10977,8 @@
         <w:t xml:space="preserve">Qualitative data from post-study interviews is analyzed using reflexive thematic analysis following the six-phase procedure described by Braun and Clarke (2006): familiarization with the data, initial code generation, theme search, theme review, theme definition, and write-up.  In keeping with the reflexive approach, which treats the analyst’s interpretation as part of the method and does not compute inter-rater agreement, one member of the research team develops the codes and themes; the codebook and the excerpts that support each theme are retained so that the analysis can be audited.  Themes are reported alongside representative participant quotations.</w:t>
       </w:r>
     </w:p>
-    <w:bookmarkEnd w:id="111"/>
-    <w:bookmarkStart w:id="112" w:name="ch3-sec3-6"/>
+    <w:bookmarkEnd w:id="112"/>
+    <w:bookmarkStart w:id="113" w:name="ch3-sec3-6"/>
     <w:p>
       <w:pPr>
         <w:pStyle w:val="Heading3"/>
@@ -11271,9 +11297,9 @@
         <w:t xml:space="preserve">SynapseOS is evaluated on a single hardware and software configuration — a dedicated machine running SynapseOS in GUI mode (XFCE desktop environment, X11 session) on a Debian 13 (Trixie) base.  Performance characteristics on different hardware, display configurations, or Linux distributions may differ from the reported results.</w:t>
       </w:r>
     </w:p>
-    <w:bookmarkEnd w:id="112"/>
     <w:bookmarkEnd w:id="113"/>
-    <w:bookmarkStart w:id="122" w:name="ch3-notes"/>
+    <w:bookmarkEnd w:id="114"/>
+    <w:bookmarkStart w:id="123" w:name="ch3-notes"/>
     <w:p>
       <w:pPr>
         <w:pStyle w:val="Heading2"/>
@@ -11290,11 +11316,11 @@
           <w:numId w:val="1019"/>
         </w:numPr>
       </w:pPr>
-      <w:bookmarkStart w:id="114" w:name="ch3-fn1"/>
+      <w:bookmarkStart w:id="115" w:name="ch3-fn1"/>
       <w:r>
         <w:t xml:space="preserve">Command-Line Interface mode: a single non-interactive invocation, with no session persisting between separate calls, that runs a bounded multi-step loop toward one natural-language request — each step proposed, classified for reversibility, executed (immediately if reversible, after confirmation if not) through the same gate as the other interface modes, and its result fed back so the model can propose the next step or signal completion — up to a fixed step limit, before the invocation exits.  Distinct from TUI mode’s persistent interactive chat session; intended for scripting, automation, and one-off remote commands.</w:t>
       </w:r>
-      <w:bookmarkEnd w:id="114"/>
+      <w:bookmarkEnd w:id="115"/>
     </w:p>
     <w:p>
       <w:pPr>
@@ -11304,11 +11330,11 @@
           <w:numId w:val="1019"/>
         </w:numPr>
       </w:pPr>
-      <w:bookmarkStart w:id="115" w:name="ch3-fn2"/>
+      <w:bookmarkStart w:id="116" w:name="ch3-fn2"/>
       <w:r>
         <w:t xml:space="preserve">Terminal User Interface: a text-based interactive interface that runs in a command-line terminal.  TUI mode requires no graphical display server or desktop environment and can be accessed remotely over SSH.</w:t>
       </w:r>
-      <w:bookmarkEnd w:id="115"/>
+      <w:bookmarkEnd w:id="116"/>
     </w:p>
     <w:p>
       <w:pPr>
@@ -11318,11 +11344,11 @@
           <w:numId w:val="1019"/>
         </w:numPr>
       </w:pPr>
-      <w:bookmarkStart w:id="116" w:name="ch3-fn3"/>
+      <w:bookmarkStart w:id="117" w:name="ch3-fn3"/>
       <w:r>
         <w:t xml:space="preserve">The SynapseOS prototype uses Qwen2.5-Coder-3B-Instruct, a code-specialized open-weights model selected for its NL2Bash accuracy.  See Section 2.1a for selection rationale and benchmark evidence.</w:t>
       </w:r>
-      <w:bookmarkEnd w:id="116"/>
+      <w:bookmarkEnd w:id="117"/>
     </w:p>
     <w:p>
       <w:pPr>
@@ -11332,11 +11358,11 @@
           <w:numId w:val="1019"/>
         </w:numPr>
       </w:pPr>
-      <w:bookmarkStart w:id="117" w:name="ch3-fn4"/>
+      <w:bookmarkStart w:id="118" w:name="ch3-fn4"/>
       <w:r>
         <w:t xml:space="preserve">An inference server loads a language model into memory and processes query requests from the application layer.  Ollama is an open-source tool for running language models locally on consumer hardware without cloud connectivity.</w:t>
       </w:r>
-      <w:bookmarkEnd w:id="117"/>
+      <w:bookmarkEnd w:id="118"/>
     </w:p>
     <w:p>
       <w:pPr>
@@ -11346,11 +11372,11 @@
           <w:numId w:val="1019"/>
         </w:numPr>
       </w:pPr>
-      <w:bookmarkStart w:id="118" w:name="ch3-fn5"/>
+      <w:bookmarkStart w:id="119" w:name="ch3-fn5"/>
       <w:r>
         <w:t xml:space="preserve">Open-weights models make their trained parameters publicly available for local download and use; users run inference on their own hardware without routing queries to an external service provider.</w:t>
       </w:r>
-      <w:bookmarkEnd w:id="118"/>
+      <w:bookmarkEnd w:id="119"/>
     </w:p>
     <w:p>
       <w:pPr>
@@ -11360,11 +11386,11 @@
           <w:numId w:val="1019"/>
         </w:numPr>
       </w:pPr>
-      <w:bookmarkStart w:id="119" w:name="ch3-fn6"/>
+      <w:bookmarkStart w:id="120" w:name="ch3-fn6"/>
       <w:r>
         <w:t xml:space="preserve">Quantization reduces the numerical precision of model weights to lower memory requirements.  At 4-bit precision, a model that would otherwise require dedicated GPU memory can run on a standard CPU with modest RAM.</w:t>
       </w:r>
-      <w:bookmarkEnd w:id="119"/>
+      <w:bookmarkEnd w:id="120"/>
     </w:p>
     <w:p>
       <w:pPr>
@@ -11374,11 +11400,11 @@
           <w:numId w:val="1019"/>
         </w:numPr>
       </w:pPr>
-      <w:bookmarkStart w:id="120" w:name="ch3-fn7"/>
+      <w:bookmarkStart w:id="121" w:name="ch3-fn7"/>
       <w:r>
         <w:t xml:space="preserve">Low-Rank Adaptation (LoRA) is a parameter-efficient fine-tuning method that introduces a small number of trainable weight matrices while keeping the base model frozen, enabling task-specific adaptation on consumer hardware without full retraining.</w:t>
       </w:r>
-      <w:bookmarkEnd w:id="120"/>
+      <w:bookmarkEnd w:id="121"/>
     </w:p>
     <w:p>
       <w:pPr>
@@ -11388,14 +11414,14 @@
           <w:numId w:val="1019"/>
         </w:numPr>
       </w:pPr>
-      <w:bookmarkStart w:id="121" w:name="ch3-fn8"/>
+      <w:bookmarkStart w:id="122" w:name="ch3-fn8"/>
       <w:r>
         <w:t xml:space="preserve">NL2Bash is a benchmark dataset pairing natural language command descriptions with their corresponding bash shell commands, used to evaluate a model’s accuracy in translating natural language into executable commands.</w:t>
       </w:r>
-      <w:bookmarkEnd w:id="121"/>
-    </w:p>
-    <w:bookmarkEnd w:id="122"/>
-    <w:bookmarkStart w:id="123" w:name="sec-master-references"/>
+      <w:bookmarkEnd w:id="122"/>
+    </w:p>
+    <w:bookmarkEnd w:id="123"/>
+    <w:bookmarkStart w:id="124" w:name="sec-master-references"/>
     <w:p>
       <w:pPr>
         <w:pStyle w:val="FirstParagraph"/>
@@ -11404,7 +11430,7 @@
         <w:t xml:space="preserve">REFERENCES</w:t>
       </w:r>
     </w:p>
-    <w:bookmarkEnd w:id="123"/>
+    <w:bookmarkEnd w:id="124"/>
     <w:p>
       <w:pPr>
         <w:pStyle w:val="BodyText"/>
@@ -12497,7 +12523,7 @@
         <w:t xml:space="preserve">.</w:t>
       </w:r>
     </w:p>
-    <w:bookmarkStart w:id="131" w:name="sec-appendices"/>
+    <w:bookmarkStart w:id="132" w:name="sec-appendices"/>
     <w:p>
       <w:pPr>
         <w:pStyle w:val="Heading2"/>
@@ -12514,7 +12540,7 @@
         <w:t xml:space="preserve">This section contains the study instruments administered to participants and the procedure governing their administration.  Wording, difficulty calibration, and task-form equivalence are validated during the pilot study described in Section 2.3 and revised before the main study begins; the instruments are reproduced here in the form submitted for ethics review.</w:t>
       </w:r>
     </w:p>
-    <w:bookmarkStart w:id="124" w:name="appendix-a"/>
+    <w:bookmarkStart w:id="125" w:name="appendix-a"/>
     <w:p>
       <w:pPr>
         <w:pStyle w:val="BodyText"/>
@@ -12531,7 +12557,7 @@
         <w:t xml:space="preserve">System Usability Scale (SUS)</w:t>
       </w:r>
     </w:p>
-    <w:bookmarkEnd w:id="124"/>
+    <w:bookmarkEnd w:id="125"/>
     <w:p>
       <w:pPr>
         <w:pStyle w:val="BodyText"/>
@@ -13574,7 +13600,7 @@
         <w:t xml:space="preserve">For odd-numbered items, subtract 1 from the response.  For even-numbered items, subtract the response from 5.  Sum the ten adjusted scores and multiply by 2.5, giving a value from 0 to 100.  This value is not a percentage; interpretation follows Sauro and Lewis (2016) and Bangor and colleagues (2008).</w:t>
       </w:r>
     </w:p>
-    <w:bookmarkStart w:id="125" w:name="appendix-b"/>
+    <w:bookmarkStart w:id="126" w:name="appendix-b"/>
     <w:p>
       <w:pPr>
         <w:pStyle w:val="BodyText"/>
@@ -13591,7 +13617,7 @@
         <w:t xml:space="preserve">NASA Task Load Index (NASA-TLX)</w:t>
       </w:r>
     </w:p>
-    <w:bookmarkEnd w:id="125"/>
+    <w:bookmarkEnd w:id="126"/>
     <w:p>
       <w:pPr>
         <w:pStyle w:val="BodyText"/>
@@ -14102,7 +14128,7 @@
         </w:tc>
       </w:tr>
     </w:tbl>
-    <w:bookmarkStart w:id="126" w:name="appendix-c"/>
+    <w:bookmarkStart w:id="127" w:name="appendix-c"/>
     <w:p>
       <w:pPr>
         <w:pStyle w:val="BodyText"/>
@@ -14119,7 +14145,7 @@
         <w:t xml:space="preserve">Custom Cross-Platform Task Suite</w:t>
       </w:r>
     </w:p>
-    <w:bookmarkEnd w:id="126"/>
+    <w:bookmarkEnd w:id="127"/>
     <w:p>
       <w:pPr>
         <w:pStyle w:val="BodyText"/>
@@ -15793,7 +15819,7 @@
         </w:tc>
       </w:tr>
     </w:tbl>
-    <w:bookmarkStart w:id="127" w:name="appendix-d"/>
+    <w:bookmarkStart w:id="128" w:name="appendix-d"/>
     <w:p>
       <w:pPr>
         <w:pStyle w:val="BodyText"/>
@@ -15810,7 +15836,7 @@
         <w:t xml:space="preserve">Pre-Study Screening Questionnaire</w:t>
       </w:r>
     </w:p>
-    <w:bookmarkEnd w:id="127"/>
+    <w:bookmarkEnd w:id="128"/>
     <w:p>
       <w:pPr>
         <w:pStyle w:val="BodyText"/>
@@ -16367,7 +16393,7 @@
         <w:t xml:space="preserve">□ SynapseOS first   □ Own OS first</w:t>
       </w:r>
     </w:p>
-    <w:bookmarkStart w:id="128" w:name="appendix-e"/>
+    <w:bookmarkStart w:id="129" w:name="appendix-e"/>
     <w:p>
       <w:pPr>
         <w:pStyle w:val="BodyText"/>
@@ -16384,7 +16410,7 @@
         <w:t xml:space="preserve">Participant Information Sheet</w:t>
       </w:r>
     </w:p>
-    <w:bookmarkEnd w:id="128"/>
+    <w:bookmarkEnd w:id="129"/>
     <w:p>
       <w:pPr>
         <w:pStyle w:val="BodyText"/>
@@ -16583,7 +16609,7 @@
         <w:t xml:space="preserve">For questions about the study, contact the research team at [research team contact address].  For concerns about how the study is being conducted, or about your rights as a participant, contact the Institutional Review Board of Mapúa University – Makati at [ethics committee contact address], independently of the research team.</w:t>
       </w:r>
     </w:p>
-    <w:bookmarkStart w:id="129" w:name="appendix-f"/>
+    <w:bookmarkStart w:id="130" w:name="appendix-f"/>
     <w:p>
       <w:pPr>
         <w:pStyle w:val="BodyText"/>
@@ -16600,7 +16626,7 @@
         <w:t xml:space="preserve">Informed Consent Form</w:t>
       </w:r>
     </w:p>
-    <w:bookmarkEnd w:id="129"/>
+    <w:bookmarkEnd w:id="130"/>
     <w:p>
       <w:pPr>
         <w:pStyle w:val="BodyText"/>
@@ -17015,7 +17041,7 @@
         <w:t xml:space="preserve">Filing note: this is the only study document bearing the participant’s name.  It is stored separately from all study data, and the code-to-name list derived from it is destroyed on the schedule stated in Section 2.5.</w:t>
       </w:r>
     </w:p>
-    <w:bookmarkStart w:id="130" w:name="appendix-g"/>
+    <w:bookmarkStart w:id="131" w:name="appendix-g"/>
     <w:p>
       <w:pPr>
         <w:pStyle w:val="BodyText"/>
@@ -17032,7 +17058,7 @@
         <w:t xml:space="preserve">Session Facilitator Checklist</w:t>
       </w:r>
     </w:p>
-    <w:bookmarkEnd w:id="130"/>
+    <w:bookmarkEnd w:id="131"/>
     <w:p>
       <w:pPr>
         <w:pStyle w:val="BodyText"/>
@@ -17361,7 +17387,7 @@
         <w:t xml:space="preserve">Diarise the participant’s fourteen-day withdrawal deadline.</w:t>
       </w:r>
     </w:p>
-    <w:bookmarkEnd w:id="131"/>
+    <w:bookmarkEnd w:id="132"/>
     <w:sectPr/>
   </w:body>
 </w:document>

</xml_diff>

<commit_message>
docs(thesis): convert citations and references to ACM style
The proposal grading rubric scores citations on consistent ACM style (5 points) and asks for ACM formatting in the appendices; the paper used APA. In-text citations are now numeric, sorted, and compressed as acmart's default does ([3, 7], [47-50]; 'Gyawali et al. [10]' when the author is named): 95 parenthetical groups, 41 narrative years, and 22 Table 2.1 cells, each resolved and reviewed. The 51 references were typeset by ACM's own ACM-Reference-Format.bst from consolidated/references.bib and checked entry by entry against its PDF output. Still 120 pages; 60 internal links, 0 broken.
</commit_message>
<xml_diff>
--- a/thesis 1/consolidated/SynapseOS_Proposal_Chapters_1_to_3.docx
+++ b/thesis 1/consolidated/SynapseOS_Proposal_Chapters_1_to_3.docx
@@ -562,7 +562,7 @@
         </w:r>
       </w:hyperlink>
       <w:r>
-        <w:t xml:space="preserve">42</w:t>
+        <w:t xml:space="preserve">41</w:t>
       </w:r>
     </w:p>
     <w:p>
@@ -731,7 +731,7 @@
         </w:r>
       </w:hyperlink>
       <w:r>
-        <w:t xml:space="preserve">34</w:t>
+        <w:t xml:space="preserve">33</w:t>
       </w:r>
     </w:p>
     <w:p>
@@ -779,7 +779,7 @@
         </w:r>
       </w:hyperlink>
       <w:r>
-        <w:t xml:space="preserve">79</w:t>
+        <w:t xml:space="preserve">78</w:t>
       </w:r>
     </w:p>
     <w:p>
@@ -795,7 +795,7 @@
         </w:r>
       </w:hyperlink>
       <w:r>
-        <w:t xml:space="preserve">83</w:t>
+        <w:t xml:space="preserve">82</w:t>
       </w:r>
     </w:p>
     <w:p>
@@ -811,7 +811,7 @@
         </w:r>
       </w:hyperlink>
       <w:r>
-        <w:t xml:space="preserve">86</w:t>
+        <w:t xml:space="preserve">85</w:t>
       </w:r>
     </w:p>
     <w:p>
@@ -930,7 +930,7 @@
         <w:pStyle w:val="BodyText"/>
       </w:pPr>
       <w:r>
-        <w:t xml:space="preserve">The dominant paradigm for personal computing has remained largely unchanged since the early 1980s, when the graphical desktop — icons, menus, and pointer-driven interaction — was established through the Xerox Star and Apple Lisa lineage.  Despite its longevity, a parallel research tradition has long explored whether users should instead be able to describe what they want in natural language and have the computer carry it out.  The earliest serious system in this tradition, the Berkeley UNIX Consultant, was already operational by the late 1980s (Wilensky et al., 1988).  Decades later, the rise of large language models (LLMs) and multimodal foundation models</w:t>
+        <w:t xml:space="preserve">The dominant paradigm for personal computing has remained largely unchanged since the early 1980s, when the graphical desktop — icons, menus, and pointer-driven interaction — was established through the Xerox Star and Apple Lisa lineage.  Despite its longevity, a parallel research tradition has long explored whether users should instead be able to describe what they want in natural language and have the computer carry it out.  The earliest serious system in this tradition, the Berkeley UNIX Consultant, was already operational by the late 1980s [42].  Decades later, the rise of large language models (LLMs) and multimodal foundation models</w:t>
       </w:r>
       <w:hyperlink w:anchor="ch1-fn1">
         <w:r>
@@ -953,7 +953,7 @@
         <w:pStyle w:val="BodyText"/>
       </w:pPr>
       <w:r>
-        <w:t xml:space="preserve">The field that has emerged sits at the intersection of human-computer interaction, operating systems, natural language processing, computer vision, and program analysis.  On the shell side, recent work has demonstrated that LLMs can translate natural language into Bash commands with usable accuracy and can be embedded as a Unix primitive with appropriate safety guardrails (Westenfelder et al., 2025; Gyawali et al., 2025).  On the graphical side, so-called computer-using agents</w:t>
+        <w:t xml:space="preserve">The field that has emerged sits at the intersection of human-computer interaction, operating systems, natural language processing, computer vision, and program analysis.  On the shell side, recent work has demonstrated that LLMs can translate natural language into Bash commands with usable accuracy and can be embedded as a Unix primitive with appropriate safety guardrails [10, 40].  On the graphical side, so-called computer-using agents</w:t>
       </w:r>
       <w:hyperlink w:anchor="ch1-fn2">
         <w:r>
@@ -968,15 +968,15 @@
         <w:t xml:space="preserve"> </w:t>
       </w:r>
       <w:r>
-        <w:t xml:space="preserve">now operate desktop and mobile applications by combining native APIs with vision-based grounding (Zhang et al., 2025; Zhang et al., 2024).  On the web, language-guided agents complete tasks across realistic websites with measurable but limited reliability (Zhou et al., 2024; Zheng et al., 2024).  A converging research thread approaches the same technical problem from an accessibility perspective: speech-driven GUI command mapping for users with motor and speech impairments has progressed from voice-to-text dictation toward voice-to-action agents, with recent work on speech-instructed GUI agents (Han et al., 2025) and region-aware visual grounding (Park et al., 2025) demonstrating that the underlying components are maturing rapidly.  Yet the gap between demonstration and deployable replacement remains substantial.  Capability on short, self-contained tasks has advanced quickly, but sustained computer work has not: on OSWorld 2.0, a benchmark of long-horizon tasks whose median item takes a skilled human roughly an hour and a half, the best frontier configuration completes only 20.6% of tasks outright (Yuan et al., 2026).</w:t>
-      </w:r>
-    </w:p>
-    <w:p>
-      <w:pPr>
-        <w:pStyle w:val="BodyText"/>
-      </w:pPr>
-      <w:r>
-        <w:t xml:space="preserve">This rapid progress has been uneven across platforms.  Windows is heavily represented in the desktop agent literature (Hui et al., 2025; Zhang et al., 2025), Android in the mobile agent literature (Rawles et al., 2023; Zhang et al., 2023; Wang et al., 2024), and the browser in the web agent literature (Deng et al., 2023; Zhou et al., 2024; Zheng et al., 2024).  Linux desktop coverage, by contrast, is conspicuously absent: existing work either addresses Linux only at the shell level (Gyawali et al., 2025) or treats it as one of several evaluation platforms rather than a primary target (Xie et al., 2024).  No surveyed system implements a working conversational session layer</w:t>
+        <w:t xml:space="preserve">now operate desktop and mobile applications by combining native APIs with vision-based grounding [46, 47].  On the web, language-guided agents complete tasks across realistic websites with measurable but limited reliability [49, 50].  A converging research thread approaches the same technical problem from an accessibility perspective: speech-driven GUI command mapping for users with motor and speech impairments has progressed from voice-to-text dictation toward voice-to-action agents, with recent work on speech-instructed GUI agents [11] and region-aware visual grounding [31] demonstrating that the underlying components are maturing rapidly.  Yet the gap between demonstration and deployable replacement remains substantial.  Capability on short, self-contained tasks has advanced quickly, but sustained computer work has not: on OSWorld 2.0, a benchmark of long-horizon tasks whose median item takes a skilled human roughly an hour and a half, the best frontier configuration completes only 20.6% of tasks outright [45].</w:t>
+      </w:r>
+    </w:p>
+    <w:p>
+      <w:pPr>
+        <w:pStyle w:val="BodyText"/>
+      </w:pPr>
+      <w:r>
+        <w:t xml:space="preserve">This rapid progress has been uneven across platforms.  Windows is heavily represented in the desktop agent literature [14, 47], Android in the mobile agent literature [32, 39, 48], and the browser in the web agent literature [8, 49, 50].  Linux desktop coverage, by contrast, is conspicuously absent: existing work either addresses Linux only at the shell level [10] or treats it as one of several evaluation platforms rather than a primary target [43].  No surveyed system implements a working conversational session layer</w:t>
       </w:r>
       <w:hyperlink w:anchor="ch1-fn3">
         <w:r>
@@ -1021,7 +1021,7 @@
         <w:t xml:space="preserve">permission</w:t>
       </w:r>
       <w:r>
-        <w:t xml:space="preserve">: the generated command is matched against a list of patterns judged dangerous and is then allowed, refused, or put to the user (Gyawali et al., 2025).  A list of this kind cannot see what a command will actually touch when its targets are hidden inside another command, such as</w:t>
+        <w:t xml:space="preserve">: the generated command is matched against a list of patterns judged dangerous and is then allowed, refused, or put to the user [10].  A list of this kind cannot see what a command will actually touch when its targets are hidden inside another command, such as</w:t>
       </w:r>
       <w:r>
         <w:t xml:space="preserve"> </w:t>
@@ -1072,15 +1072,15 @@
         <w:t xml:space="preserve"> </w:t>
       </w:r>
       <w:r>
-        <w:t xml:space="preserve">system places a conversational layer over the conventional desktop session as a whole.  The idea is no longer unclaimed — AgentOS (Liu et al., 2026) proposes a natural-language portal in place of the graphical desktop — but it is offered as a research direction, without a built system or an evaluation.  The systems that are built automate on top of the desktop rather than replacing it: UFO², for instance, positions itself as a “Desktop AgentOS” but operates as an automation layer atop the existing Windows shell, deliberately confining itself to a separate desktop so that agent and user do not interfere (Zhang et al., 2025).  Third, the Linux work that exists serves servers and agents rather than the desktop session of an end user.  NaSh addresses Linux at the shell level as a design proposal without evaluation (Gyawali et al., 2025); shipping natural-language shells such as Alibaba Cloud’s ANOLISA pair intent translation with approval gating and rollback, but scope themselves explicitly to server and DevOps workloads; and OSWorld includes Ubuntu as an evaluation platform rather than a deployment target (Xie et al., 2024).  Fourth, controlled comparison against the conventional graphical workflow exists only for narrow slices of the problem.  AXIS evaluates an API-first agent against manual operation within a single application, Microsoft Word, using a cloud-hosted frontier model (Lu et al., 2024), and the accessibility literature evaluates assistance for specific populations (Padmanabha et al., 2024).  No study compares a conversational interface against the conventional workflow across operating-system-level tasks, on a Linux desktop, driven by a locally-hosted small model, under an explicit safety gate.</w:t>
-      </w:r>
-    </w:p>
-    <w:p>
-      <w:pPr>
-        <w:pStyle w:val="BodyText"/>
-      </w:pPr>
-      <w:r>
-        <w:t xml:space="preserve">Notably, the accessibility-focused thread of the field exhibits the inverse limitation.  Speech-to-GUI mapping research targets specific user populations — users with motor impairments, speech disorders, or cognitive disabilities — with specialized techniques such as speech-instructed GUI agents and resilient visual grounding (Han et al., 2025; Park et al., 2025), but operates at the level of individual applications or interaction techniques rather than at the level of the session layer itself.  These approaches presuppose an underlying conversational system surface on which to run, yet no such surface exists.  This complementarity sharpens the opportunity: a general-purpose conversational interface layer would serve not only mainstream users but also provide the substrate that accessibility-specific configurations require.</w:t>
+        <w:t xml:space="preserve">system places a conversational layer over the conventional desktop session as a whole.  The idea is no longer unclaimed — AgentOS [21] proposes a natural-language portal in place of the graphical desktop — but it is offered as a research direction, without a built system or an evaluation.  The systems that are built automate on top of the desktop rather than replacing it: UFO², for instance, positions itself as a “Desktop AgentOS” but operates as an automation layer atop the existing Windows shell, deliberately confining itself to a separate desktop so that agent and user do not interfere [47].  Third, the Linux work that exists serves servers and agents rather than the desktop session of an end user.  NaSh addresses Linux at the shell level as a design proposal without evaluation [10]; shipping natural-language shells such as Alibaba Cloud’s ANOLISA pair intent translation with approval gating and rollback, but scope themselves explicitly to server and DevOps workloads; and OSWorld includes Ubuntu as an evaluation platform rather than a deployment target [43].  Fourth, controlled comparison against the conventional graphical workflow exists only for narrow slices of the problem.  AXIS evaluates an API-first agent against manual operation within a single application, Microsoft Word, using a cloud-hosted frontier model [22], and the accessibility literature evaluates assistance for specific populations [30].  No study compares a conversational interface against the conventional workflow across operating-system-level tasks, on a Linux desktop, driven by a locally-hosted small model, under an explicit safety gate.</w:t>
+      </w:r>
+    </w:p>
+    <w:p>
+      <w:pPr>
+        <w:pStyle w:val="BodyText"/>
+      </w:pPr>
+      <w:r>
+        <w:t xml:space="preserve">Notably, the accessibility-focused thread of the field exhibits the inverse limitation.  Speech-to-GUI mapping research targets specific user populations — users with motor impairments, speech disorders, or cognitive disabilities — with specialized techniques such as speech-instructed GUI agents and resilient visual grounding [11, 31], but operates at the level of individual applications or interaction techniques rather than at the level of the session layer itself.  These approaches presuppose an underlying conversational system surface on which to run, yet no such surface exists.  This complementarity sharpens the opportunity: a general-purpose conversational interface layer would serve not only mainstream users but also provide the substrate that accessibility-specific configurations require.</w:t>
       </w:r>
     </w:p>
     <w:p>
@@ -2010,7 +2010,7 @@
         <w:t xml:space="preserve"> </w:t>
       </w:r>
       <w:r>
-        <w:t xml:space="preserve">Although this population is scoped out of the initial evaluation for ethical and recruitment reasons, SynapseOS is positioned to serve as the session-level substrate on which accessibility-specific configurations can operate.  Prior work has established design guidelines for LLM-based speech interfaces for users with motor impairments (Padmanabha et al., 2024) and has demonstrated specialized techniques — speech-instructed GUI agents and resilient visual grounding — at the application and interaction-technique level (Han et al., 2025; Park et al., 2025).  These techniques presuppose a conversational system surface that does not yet exist at the session level; SynapseOS provides that surface, making accessibility-specific extensions a natural and well-grounded future direction rather than a speculative one.</w:t>
+        <w:t xml:space="preserve">Although this population is scoped out of the initial evaluation for ethical and recruitment reasons, SynapseOS is positioned to serve as the session-level substrate on which accessibility-specific configurations can operate.  Prior work has established design guidelines for LLM-based speech interfaces for users with motor impairments [30] and has demonstrated specialized techniques — speech-instructed GUI agents and resilient visual grounding — at the application and interaction-technique level [11, 31].  These techniques presuppose a conversational system surface that does not yet exist at the session level; SynapseOS provides that surface, making accessibility-specific extensions a natural and well-grounded future direction rather than a speculative one.</w:t>
       </w:r>
     </w:p>
     <w:p>
@@ -2054,7 +2054,7 @@
         <w:t xml:space="preserve"> </w:t>
       </w:r>
       <w:r>
-        <w:t xml:space="preserve">The study contributes a static analysis of shell commands for recoverability, a property that existing analyses of shell do not address (§2.4), together with an evaluation against ground truth obtained by sandboxed execution rather than by human labeling.  It also contributes a controlled comparative evaluation methodology for conversational interfaces, which are rarely compared against conventional graphical workflows on the same tasks and population (Xie et al., 2024).</w:t>
+        <w:t xml:space="preserve">The study contributes a static analysis of shell commands for recoverability, a property that existing analyses of shell do not address (§2.4), together with an evaluation against ground truth obtained by sandboxed execution rather than by human labeling.  It also contributes a controlled comparative evaluation methodology for conversational interfaces, which are rarely compared against conventional graphical workflows on the same tasks and population [43].</w:t>
       </w:r>
     </w:p>
     <w:bookmarkEnd w:id="33"/>
@@ -2112,7 +2112,7 @@
         <w:pStyle w:val="BodyText"/>
       </w:pPr>
       <w:r>
-        <w:t xml:space="preserve">The study examines cross-application desktop workflows on Linux, including shell operations, file management, and application-level tasks representable in the OSWorld benchmark task suite (Xie et al., 2024).  The population studied consists of novice computer users and power users recruited for a controlled user study.  The study is conducted in a Linux desktop environment and is bounded by the duration of the thesis project.  The recoverability analysis covers commands in the bash dialect on a Debian system: their effects on the filesystem, and the changes to package and service state they make through apt, dpkg, and systemd.  It is evaluated on a corpus of 777 commands drawn from NL2Bash, from templates covering each composition operator, and from tools whose effects lie outside the filesystem.</w:t>
+        <w:t xml:space="preserve">The study examines cross-application desktop workflows on Linux, including shell operations, file management, and application-level tasks representable in the OSWorld benchmark task suite [43].  The population studied consists of novice computer users and power users recruited for a controlled user study.  The study is conducted in a Linux desktop environment and is bounded by the duration of the thesis project.  The recoverability analysis covers commands in the bash dialect on a Debian system: their effects on the filesystem, and the changes to package and service state they make through apt, dpkg, and systemd.  It is evaluated on a corpus of 777 commands drawn from NL2Bash, from templates covering each composition operator, and from tools whose effects lie outside the filesystem.</w:t>
       </w:r>
     </w:p>
     <w:p>
@@ -2132,7 +2132,7 @@
         </w:r>
       </w:hyperlink>
       <w:r>
-        <w:t xml:space="preserve">; this tradeoff may affect the ceiling on intent parsing accuracy achievable within the study.  Second, users with motor accessibility needs — a highly relevant population — are excluded from the initial evaluation due to ethics-review and recruitment constraints; accessibility-specific configurations such as speech-instructed agent operation for atypical speech patterns (Han et al., 2025) are likewise out of scope for the initial implementation but represent a natural extension of the SynapseOS substrate.  Third, SynapseOS targets the Linux desktop specifically, and the findings may not generalize directly to Windows or macOS desktop environments.  Fourth, the safety confirmation policy for irreversible system operations is defined in principle but requires empirical calibration during implementation.  Fifth, evaluation is bounded by the task coverage of the OSWorld benchmark and the custom task suite developed for this study; tasks outside this coverage are not evaluated.  Sixth, the recoverability analysis treats anything it cannot determine as unrecoverable, and so protects such commands only by asking first: code run by an interpreter, programs it does not model, and variables with no value are of this kind.  Its per-command rules are a hand-written enumeration, which its composition builds on rather than replaces, and it resolves a command’s targets shortly before the command runs, so a file changed by another process in the interval is captured as it was when resolved.</w:t>
+        <w:t xml:space="preserve">; this tradeoff may affect the ceiling on intent parsing accuracy achievable within the study.  Second, users with motor accessibility needs — a highly relevant population — are excluded from the initial evaluation due to ethics-review and recruitment constraints; accessibility-specific configurations such as speech-instructed agent operation for atypical speech patterns [11] are likewise out of scope for the initial implementation but represent a natural extension of the SynapseOS substrate.  Third, SynapseOS targets the Linux desktop specifically, and the findings may not generalize directly to Windows or macOS desktop environments.  Fourth, the safety confirmation policy for irreversible system operations is defined in principle but requires empirical calibration during implementation.  Fifth, evaluation is bounded by the task coverage of the OSWorld benchmark and the custom task suite developed for this study; tasks outside this coverage are not evaluated.  Sixth, the recoverability analysis treats anything it cannot determine as unrecoverable, and so protects such commands only by asking first: code run by an interpreter, programs it does not model, and variables with no value are of this kind.  Its per-command rules are a hand-written enumeration, which its composition builds on rather than replaces, and it resolves a command’s targets shortly before the command runs, so a file changed by another process in the interval is captured as it was when resolved.</w:t>
       </w:r>
     </w:p>
     <w:bookmarkEnd w:id="34"/>
@@ -2248,7 +2248,7 @@
         <w:pStyle w:val="FirstParagraph"/>
       </w:pPr>
       <w:r>
-        <w:t xml:space="preserve">This chapter reviews the body of research relevant to the design and evaluation of a conversational interface layer for the Linux desktop, and to the safety of the commands such a layer executes.  The review spans nearly four decades of work on natural-language interfaces to computing systems, from the symbolic-artificial-intelligence consultants developed for the Unix shell in the late 1980s (Wilensky et al., 1988) to the large language model (LLM) agents that now operate shells, graphical applications, browsers, and mobile devices.  Its purpose is threefold: to establish the conceptual vocabulary and technical foundations on which the present study builds, to characterize the current state of the field and its recurring limitations, and to locate precisely the gaps that the proposed recoverability analysis, and SynapseOS, the system in which it is deployed, are designed to fill.</w:t>
+        <w:t xml:space="preserve">This chapter reviews the body of research relevant to the design and evaluation of a conversational interface layer for the Linux desktop, and to the safety of the commands such a layer executes.  The review spans nearly four decades of work on natural-language interfaces to computing systems, from the symbolic-artificial-intelligence consultants developed for the Unix shell in the late 1980s [42] to the large language model (LLM) agents that now operate shells, graphical applications, browsers, and mobile devices.  Its purpose is threefold: to establish the conceptual vocabulary and technical foundations on which the present study builds, to characterize the current state of the field and its recurring limitations, and to locate precisely the gaps that the proposed recoverability analysis, and SynapseOS, the system in which it is deployed, are designed to fill.</w:t>
       </w:r>
     </w:p>
     <w:bookmarkEnd w:id="42"/>
@@ -2282,7 +2282,7 @@
         <w:t xml:space="preserve"> </w:t>
       </w:r>
       <w:r>
-        <w:t xml:space="preserve">— Input, Reasoning, Action, and Operating-System Integration — as its theoretical framework.  The framework is adapted from the layered decomposition of large language model (LLM)-brained graphical user interface (GUI) agents proposed in the survey of Zhang and colleagues (2024), generalized here from graphical agents specifically to language-mediated computing interfaces as a class.  Figure 2.1 depicts the pipeline and situates the layers relative to one another.</w:t>
+        <w:t xml:space="preserve">— Input, Reasoning, Action, and Operating-System Integration — as its theoretical framework.  The framework is adapted from the layered decomposition of large language model (LLM)-brained graphical user interface (GUI) agents proposed in the survey of Zhang and colleagues [46], generalized here from graphical agents specifically to language-mediated computing interfaces as a class.  Figure 2.1 depicts the pipeline and situates the layers relative to one another.</w:t>
       </w:r>
     </w:p>
     <w:p>
@@ -2347,7 +2347,7 @@
         <w:t xml:space="preserve"> </w:t>
       </w:r>
       <w:r>
-        <w:t xml:space="preserve">The four-layer interaction pipeline for language-mediated computing interfaces, adapted from the LLM-brained GUI-agent survey of Zhang and colleagues (2024).  A user’s intent enters at the Input layer, is parsed and grounded at the Reasoning layer, executed at the Action layer, and takes effect within a scope defined at the Operating-System Integration layer.</w:t>
+        <w:t xml:space="preserve">The four-layer interaction pipeline for language-mediated computing interfaces, adapted from the LLM-brained GUI-agent survey of Zhang and colleagues [46].  A user’s intent enters at the Input layer, is parsed and grounded at the Reasoning layer, executed at the Action layer, and takes effect within a scope defined at the Operating-System Integration layer.</w:t>
       </w:r>
     </w:p>
     <w:p>
@@ -2503,15 +2503,15 @@
         <w:pStyle w:val="FirstParagraph"/>
       </w:pPr>
       <w:r>
-        <w:t xml:space="preserve">The aspiration to let users describe what they want in ordinary language and have a computer carry it out is not new.  The earliest serious system in this tradition, the Berkeley Unix Consultant of Wilensky and colleagues (1988), was already operational by the late 1980s.  The Unix Consultant was an intelligent natural-language interface that allowed naive users to learn about the Unix operating system through conversation in ordinary English, addressing both the natural-language-frontend problem and the consultation problem, and thereby distinguishing itself from systems intended only as command translators.  It was built on the KODIAK knowledge representation and incorporated a user-modeling component that represented the user’s knowledge state and a teaching component through which users could extend its knowledge base in natural language.  The system demonstrated end-to-end natural-language consultation about Unix, successfully answering "how do I," definitional, and problem-solving questions.  Critically, its authors identified knowledge acquisition as the principal bottleneck: extending the system to a new domain required substantial hand-engineering — a concern that directly foreshadows the contemporary problem of LLM-based agents requiring per-application grounding data.</w:t>
-      </w:r>
-    </w:p>
-    <w:p>
-      <w:pPr>
-        <w:pStyle w:val="BodyText"/>
-      </w:pPr>
-      <w:r>
-        <w:t xml:space="preserve">The intervening decades saw natural-language interaction treated primarily as a supervised-learning problem.  Representative of this pre-LLM era, the work of Li and colleagues on mapping natural-language instructions to mobile user-interface action sequences (Li et al., 2020) trained dedicated phrase-extraction and grounding transformers on hand-annotated action sequences, achieving 70.59% accuracy on predicting complete ground-truth action sequences on its benchmark but remaining bound to its purpose-built datasets and architectures.  The decisive shift came with the introduction of in-context reasoning patterns for LLMs.  ReAct, introduced by Yao and colleagues (2023), collapsed the multi-stage supervised pipeline into a prompting strategy: the language model is prompted to alternate between free-text "Thought" steps that update its plan and "Action" steps that interact with an external environment, with observations fed back into subsequent reasoning.  Implemented purely as a prompting strategy without fine-tuning, ReAct nonetheless outperformed imitation-learning and reinforcement-learning baselines that required thousands of training trajectories.</w:t>
+        <w:t xml:space="preserve">The aspiration to let users describe what they want in ordinary language and have a computer carry it out is not new.  The earliest serious system in this tradition, the Berkeley Unix Consultant of Wilensky and colleagues [42], was already operational by the late 1980s.  The Unix Consultant was an intelligent natural-language interface that allowed naive users to learn about the Unix operating system through conversation in ordinary English, addressing both the natural-language-frontend problem and the consultation problem, and thereby distinguishing itself from systems intended only as command translators.  It was built on the KODIAK knowledge representation and incorporated a user-modeling component that represented the user’s knowledge state and a teaching component through which users could extend its knowledge base in natural language.  The system demonstrated end-to-end natural-language consultation about Unix, successfully answering "how do I," definitional, and problem-solving questions.  Critically, its authors identified knowledge acquisition as the principal bottleneck: extending the system to a new domain required substantial hand-engineering — a concern that directly foreshadows the contemporary problem of LLM-based agents requiring per-application grounding data.</w:t>
+      </w:r>
+    </w:p>
+    <w:p>
+      <w:pPr>
+        <w:pStyle w:val="BodyText"/>
+      </w:pPr>
+      <w:r>
+        <w:t xml:space="preserve">The intervening decades saw natural-language interaction treated primarily as a supervised-learning problem.  Representative of this pre-LLM era, the work of Li and colleagues on mapping natural-language instructions to mobile user-interface action sequences [19] trained dedicated phrase-extraction and grounding transformers on hand-annotated action sequences, achieving 70.59% accuracy on predicting complete ground-truth action sequences on its benchmark but remaining bound to its purpose-built datasets and architectures.  The decisive shift came with the introduction of in-context reasoning patterns for LLMs.  ReAct, introduced by Yao and colleagues [44], collapsed the multi-stage supervised pipeline into a prompting strategy: the language model is prompted to alternate between free-text "Thought" steps that update its plan and "Action" steps that interact with an external environment, with observations fed back into subsequent reasoning.  Implemented purely as a prompting strategy without fine-tuning, ReAct nonetheless outperformed imitation-learning and reinforcement-learning baselines that required thousands of training trajectories.</w:t>
       </w:r>
     </w:p>
     <w:p>
@@ -2536,15 +2536,15 @@
         <w:pStyle w:val="FirstParagraph"/>
       </w:pPr>
       <w:r>
-        <w:t xml:space="preserve">The aspiration to a natural-language interface has a long-standing critique that remains unanswered, and a review that omitted it would misrepresent the state of the question.  Shneiderman’s account of direct manipulation (1983) holds that interfaces succeed when the objects of interest are continuously visible, when actions upon them are rapid, incremental, and reversible, and when their effects are immediately apparent — properties that let a user build and maintain an accurate model of system state.  Norman formalized what an interface does for a user as the bridging of two gulfs (1986): the gulf of execution, between an intention and the actions a system makes available, and the gulf of evaluation, between the system’s response and the user’s ability to interpret it.  Hutchins, Hollan, and Norman (1985) argued that direct manipulation narrows both, by making an interface feel like the object of interest itself rather than a description of it.</w:t>
-      </w:r>
-    </w:p>
-    <w:p>
-      <w:pPr>
-        <w:pStyle w:val="BodyText"/>
-      </w:pPr>
-      <w:r>
-        <w:t xml:space="preserve">A language interface sits awkwardly against nearly every one of those properties.  An utterance is not continuously visible, not incremental, and not reversible by the same gesture that produced it; the set of available actions is not displayed, so the user must guess at the system’s capabilities rather than see them.  Shneiderman and Maes debated precisely this trade-off between direct manipulation and interface agents (Shneiderman and Maes, 1997), and Shneiderman argued subsequently that speech and language interaction consume the same cognitive resources a user needs in order to hold a task in mind, where pointing does not (Shneiderman, 2000).  Empirical work on modern conversational agents has largely borne the concern out: Luger and Sellen documented a persistent gulf between what users expected a conversational agent to understand and what it actually did (Luger and Sellen, 2016), and Clark and colleagues found that the properties people value in human conversation transfer poorly to interaction with an agent (Clark et al., 2019).</w:t>
+        <w:t xml:space="preserve">The aspiration to a natural-language interface has a long-standing critique that remains unanswered, and a review that omitted it would misrepresent the state of the question.  Shneiderman’s account of direct manipulation [34] holds that interfaces succeed when the objects of interest are continuously visible, when actions upon them are rapid, incremental, and reversible, and when their effects are immediately apparent — properties that let a user build and maintain an accurate model of system state.  Norman formalized what an interface does for a user as the bridging of two gulfs [28]: the gulf of execution, between an intention and the actions a system makes available, and the gulf of evaluation, between the system’s response and the user’s ability to interpret it.  Hutchins, Hollan, and Norman [15] argued that direct manipulation narrows both, by making an interface feel like the object of interest itself rather than a description of it.</w:t>
+      </w:r>
+    </w:p>
+    <w:p>
+      <w:pPr>
+        <w:pStyle w:val="BodyText"/>
+      </w:pPr>
+      <w:r>
+        <w:t xml:space="preserve">A language interface sits awkwardly against nearly every one of those properties.  An utterance is not continuously visible, not incremental, and not reversible by the same gesture that produced it; the set of available actions is not displayed, so the user must guess at the system’s capabilities rather than see them.  Shneiderman and Maes debated precisely this trade-off between direct manipulation and interface agents [36], and Shneiderman argued subsequently that speech and language interaction consume the same cognitive resources a user needs in order to hold a task in mind, where pointing does not [35].  Empirical work on modern conversational agents has largely borne the concern out: Luger and Sellen documented a persistent gulf between what users expected a conversational agent to understand and what it actually did [23], and Clark and colleagues found that the properties people value in human conversation transfer poorly to interaction with an agent [5].</w:t>
       </w:r>
     </w:p>
     <w:p>
@@ -2560,7 +2560,7 @@
         <w:pStyle w:val="BodyText"/>
       </w:pPr>
       <w:r>
-        <w:t xml:space="preserve">The comparative question is older than the current literature and considerably less settled than it is often assumed to be.  Norman’s critique of the UNIX command line (1981) remains the standard reference for the position that the command line’s power is inaccessible to most people in practice.  But the best-known controlled comparison of command, menu, and iconic interfaces, conducted by Whiteside and colleagues across seventy-six users and seven systems (1985), concluded that interface style itself did not predict either performance or preference: careful design did, and the system that served novices best also served experts best.  That finding is as much a caution for the present study as a motivation for it.  It warns against attributing to a conversational paradigm what may in fact belong to the quality of one particular implementation, and it is a principal reason this study measures a specific system against a specific baseline rather than claiming to measure one paradigm against another.</w:t>
+        <w:t xml:space="preserve">The comparative question is older than the current literature and considerably less settled than it is often assumed to be.  Norman’s critique of the UNIX command line [27] remains the standard reference for the position that the command line’s power is inaccessible to most people in practice.  But the best-known controlled comparison of command, menu, and iconic interfaces, conducted by Whiteside and colleagues across seventy-six users and seven systems [41], concluded that interface style itself did not predict either performance or preference: careful design did, and the system that served novices best also served experts best.  That finding is as much a caution for the present study as a motivation for it.  It warns against attributing to a conversational paradigm what may in fact belong to the quality of one particular implementation, and it is a principal reason this study measures a specific system against a specific baseline rather than claiming to measure one paradigm against another.</w:t>
       </w:r>
     </w:p>
     <w:bookmarkEnd w:id="47"/>
@@ -2587,23 +2587,23 @@
         <w:pStyle w:val="BodyText"/>
       </w:pPr>
       <w:r>
-        <w:t xml:space="preserve">Westenfelder and colleagues (2025) address this translation problem directly.  Their work constructs a manually verified test set of 600 instruction–command pairs and a training set of 40,939 pairs, and introduces a functional-equivalence heuristic that reaches 95% confidence in determining whether two Bash commands produce the same effect — allowing automated evaluation to move beyond exact-string matching to a measure of whether a generated command actually accomplishes the intended task.  Their fine-tuned models substantially outperform zero-shot baselines, demonstrating that fine-tuning specifically on command-translation data is effective.  The authors identify two persistent limitations: ambiguity in user instructions, and the absence of system context — the contents of the current directory, the user’s command history, and environment variables — at translation time.  Integrating context-aware retrieval is identified as a direction, one that the persistent conversational session of SynapseOS is well positioned to supply.</w:t>
-      </w:r>
-    </w:p>
-    <w:p>
-      <w:pPr>
-        <w:pStyle w:val="BodyText"/>
-      </w:pPr>
-      <w:r>
-        <w:t xml:space="preserve">Where translation accuracy is the concern of Westenfelder and colleagues, safety is the concern of Gyawali and colleagues, whose NaSh system (2025) proposes guardrails for an LLM-powered natural-language shell for Linux.  Published under the operating-systems classification, NaSh interposes a guardrail layer between the user’s natural-language input and the LLM-generated command: the model proposes a candidate command, the guardrail layer evaluates it against safety, reversibility, and confirmation criteria, and the user receives a structured preview before execution.  The authors note that LLM outputs may be unintended or unexplainable, requiring guardrails for user error recovery, and they leave as open work both the design of recovery and rollback mechanisms for irreversible system operations and the empirical user evaluation of the approach.  These two open problems — reversibility-aware confirmation and empirical validation with users — are precisely the concerns that the confirmation gate, undo mechanism, and controlled user study of the present study are designed to address.</w:t>
-      </w:r>
-    </w:p>
-    <w:p>
-      <w:pPr>
-        <w:pStyle w:val="BodyText"/>
-      </w:pPr>
-      <w:r>
-        <w:t xml:space="preserve">The feasibility of deploying such a system without reliance on a hosted frontier model is supported by the large-scale evaluation of Jacobs and colleagues (2026), who assess a broad range of locally deployable open-source LLMs on Bash command generation.  Their work provides an empirical anchor for the viability of running natural-language-to-Bash translation on local, open-weights models of modest size — the deployment posture adopted by SynapseOS for reasons of privacy and offline operation.  Taken together, the shell-and-command-line thread establishes that natural-language-to-Bash translation is tractable, that safety and reversibility are central rather than incidental concerns, and that local deployment is feasible; yet no surveyed shell-level system has been evaluated with users against the conventional workflow it would supplement.</w:t>
+        <w:t xml:space="preserve">Westenfelder and colleagues [40] address this translation problem directly.  Their work constructs a manually verified test set of 600 instruction–command pairs and a training set of 40,939 pairs, and introduces a functional-equivalence heuristic that reaches 95% confidence in determining whether two Bash commands produce the same effect — allowing automated evaluation to move beyond exact-string matching to a measure of whether a generated command actually accomplishes the intended task.  Their fine-tuned models substantially outperform zero-shot baselines, demonstrating that fine-tuning specifically on command-translation data is effective.  The authors identify two persistent limitations: ambiguity in user instructions, and the absence of system context — the contents of the current directory, the user’s command history, and environment variables — at translation time.  Integrating context-aware retrieval is identified as a direction, one that the persistent conversational session of SynapseOS is well positioned to supply.</w:t>
+      </w:r>
+    </w:p>
+    <w:p>
+      <w:pPr>
+        <w:pStyle w:val="BodyText"/>
+      </w:pPr>
+      <w:r>
+        <w:t xml:space="preserve">Where translation accuracy is the concern of Westenfelder and colleagues, safety is the concern of Gyawali and colleagues, whose NaSh system [10] proposes guardrails for an LLM-powered natural-language shell for Linux.  Published under the operating-systems classification, NaSh interposes a guardrail layer between the user’s natural-language input and the LLM-generated command: the model proposes a candidate command, the guardrail layer evaluates it against safety, reversibility, and confirmation criteria, and the user receives a structured preview before execution.  The authors note that LLM outputs may be unintended or unexplainable, requiring guardrails for user error recovery, and they leave as open work both the design of recovery and rollback mechanisms for irreversible system operations and the empirical user evaluation of the approach.  These two open problems — reversibility-aware confirmation and empirical validation with users — are precisely the concerns that the confirmation gate, undo mechanism, and controlled user study of the present study are designed to address.</w:t>
+      </w:r>
+    </w:p>
+    <w:p>
+      <w:pPr>
+        <w:pStyle w:val="BodyText"/>
+      </w:pPr>
+      <w:r>
+        <w:t xml:space="preserve">The feasibility of deploying such a system without reliance on a hosted frontier model is supported by the large-scale evaluation of Jacobs and colleagues [16], who assess a broad range of locally deployable open-source LLMs on Bash command generation.  Their work provides an empirical anchor for the viability of running natural-language-to-Bash translation on local, open-weights models of modest size — the deployment posture adopted by SynapseOS for reasons of privacy and offline operation.  Taken together, the shell-and-command-line thread establishes that natural-language-to-Bash translation is tractable, that safety and reversibility are central rather than incidental concerns, and that local deployment is feasible; yet no surveyed shell-level system has been evaluated with users against the conventional workflow it would supplement.</w:t>
       </w:r>
     </w:p>
     <w:p>
@@ -2624,7 +2624,7 @@
         <w:t xml:space="preserve">permission</w:t>
       </w:r>
       <w:r>
-        <w:t xml:space="preserve">: the command is matched against an enumerated set of patterns judged dangerous, and is then allowed, refused, or escalated to the user.  NaSh (Gyawali et al., 2025) proposes guardrails of this kind and, notably, identifies selective undo as a requirement while leaving its mechanism open; the agentic coding assistants discussed in §2.8 operate the same way in practice, with allow-and-deny lists over command prefixes.  A permission model answers whether a command may run.  It does not answer whether, having run, the command can be undone — and those are different questions with different answers.  Refusing a command protects a user only until they approve it, which for any system that must let work proceed is most of the time.</w:t>
+        <w:t xml:space="preserve">: the command is matched against an enumerated set of patterns judged dangerous, and is then allowed, refused, or escalated to the user.  NaSh [10] proposes guardrails of this kind and, notably, identifies selective undo as a requirement while leaving its mechanism open; the agentic coding assistants discussed in §2.8 operate the same way in practice, with allow-and-deny lists over command prefixes.  A permission model answers whether a command may run.  It does not answer whether, having run, the command can be undone — and those are different questions with different answers.  Refusing a command protects a user only until they approve it, which for any system that must let work proceed is most of the time.</w:t>
       </w:r>
     </w:p>
     <w:p>
@@ -2652,15 +2652,15 @@
         <w:pStyle w:val="BodyText"/>
       </w:pPr>
       <w:r>
-        <w:t xml:space="preserve">The technique this recoverability judgment relies on — determining what a piece of code will do without executing it — is not new; it has a decades-long history in programming-language theory under two related names, neither of which the systems surveyed above draw on.  Abstract interpretation, introduced by Cousot and Cousot (1977), is the foundational technique for computing sound, conservative approximations of a program’s runtime behavior by evaluating it over an abstract domain rather than its concrete one.  Type-and-effect systems, developed by Jouvelot and Gifford (1991) and given a full formal treatment by Talpin and Jouvelot (1994), extend a program’s type judgment with an explicit account of the side effects an expression may produce, so that a compiler or static checker can reason about those effects instead of leaving them implicit in execution.  The recoverability algorithm this study contributes (Chapter 3, Section 2.1(c)) is an instance of this discipline applied to a domain neither tradition has targeted: a generated shell command is treated as an expression whose effect — on the filesystem, rather than on a type system’s abstract state — is derived from its syntax and composed across its operators, and it is that effect set, not the command’s name, that the recoverability verdict is computed over.  This connects the algorithm to an established formal lineage rather than presenting it as a bespoke heuristic, and it grounds the algorithm’s one-sided soundness property — over-approximating destructiveness under uncertainty rather than under-approximating it — in the same requirement abstract interpretation itself imposes: a sound abstraction may lose precision, but it may never assert a property the concrete execution does not actually have.</w:t>
-      </w:r>
-    </w:p>
-    <w:p>
-      <w:pPr>
-        <w:pStyle w:val="BodyText"/>
-      </w:pPr>
-      <w:r>
-        <w:t xml:space="preserve">Static analysis of shell scripts specifically is comparatively little studied, and the existing work targets properties adjacent to recoverability rather than recoverability itself.  ABash (Mazurak and Zdancewic, 2007) performs abstract interpretation over bash’s variable-expansion semantics to catch common expansion bugs and includes taint tracking, but is not concerned with what a script’s commands would do to the filesystem if executed correctly.  Smoosh (Greenberg and Blatt, 2020) gives the POSIX shell a mechanized, executable small-step operational semantics, validated against other shells' conformance test suites — exactly the kind of ground-truth semantics a static effect analysis would need to be checked against — but stops at defining that semantics rather than analyzing programs written in it.  Closest of the three is CoLiS (Becker et al., 2022), which applies symbolic execution to the more than twenty-seven thousand POSIX-shell maintainer scripts in the Debian package archive to verify</w:t>
+        <w:t xml:space="preserve">The technique this recoverability judgment relies on — determining what a piece of code will do without executing it — is not new; it has a decades-long history in programming-language theory under two related names, neither of which the systems surveyed above draw on.  Abstract interpretation, introduced by Cousot and Cousot [6], is the foundational technique for computing sound, conservative approximations of a program’s runtime behavior by evaluating it over an abstract domain rather than its concrete one.  Type-and-effect systems, developed by Jouvelot and Gifford [17] and given a full formal treatment by Talpin and Jouvelot [37], extend a program’s type judgment with an explicit account of the side effects an expression may produce, so that a compiler or static checker can reason about those effects instead of leaving them implicit in execution.  The recoverability algorithm this study contributes (Chapter 3, Section 2.1(c)) is an instance of this discipline applied to a domain neither tradition has targeted: a generated shell command is treated as an expression whose effect — on the filesystem, rather than on a type system’s abstract state — is derived from its syntax and composed across its operators, and it is that effect set, not the command’s name, that the recoverability verdict is computed over.  This connects the algorithm to an established formal lineage rather than presenting it as a bespoke heuristic, and it grounds the algorithm’s one-sided soundness property — over-approximating destructiveness under uncertainty rather than under-approximating it — in the same requirement abstract interpretation itself imposes: a sound abstraction may lose precision, but it may never assert a property the concrete execution does not actually have.</w:t>
+      </w:r>
+    </w:p>
+    <w:p>
+      <w:pPr>
+        <w:pStyle w:val="BodyText"/>
+      </w:pPr>
+      <w:r>
+        <w:t xml:space="preserve">Static analysis of shell scripts specifically is comparatively little studied, and the existing work targets properties adjacent to recoverability rather than recoverability itself.  ABash [24] performs abstract interpretation over bash’s variable-expansion semantics to catch common expansion bugs and includes taint tracking, but is not concerned with what a script’s commands would do to the filesystem if executed correctly.  Smoosh [9] gives the POSIX shell a mechanized, executable small-step operational semantics, validated against other shells' conformance test suites — exactly the kind of ground-truth semantics a static effect analysis would need to be checked against — but stops at defining that semantics rather than analyzing programs written in it.  Closest of the three is CoLiS [2], which applies symbolic execution to the more than twenty-seven thousand POSIX-shell maintainer scripts in the Debian package archive to verify</w:t>
       </w:r>
       <w:r>
         <w:t xml:space="preserve"> </w:t>
@@ -2754,7 +2754,7 @@
         <w:pStyle w:val="FirstParagraph"/>
       </w:pPr>
       <w:r>
-        <w:t xml:space="preserve">The web has been the most heavily studied environment for language-guided agents.  Mind2Web, introduced by Deng and colleagues (2023), is the first dataset for developing generalist web agents that follow language instructions across diverse real-world websites, comprising over two thousand open-ended tasks collected from 137 websites across 31 domains; its accompanying two-stage model uses a small language model to filter candidate elements from large documents before invoking a larger model to choose among them.  WebArena, introduced by Zhou and colleagues (2024), provides a fully self-hosted, reproducible web environment of functional website clones and evaluates 812 long-horizon tasks for functional correctness rather than trajectory similarity, establishing a challenging benchmark on which contemporary models achieved completion rates far below human performance.  Zheng and colleagues (2024), in their SeeAct framework, decouple visual understanding from action: the model observes a screenshot, generates a textual plan, and a separate step grounds that plan onto page elements.  Their central finding is diagnostic for the entire field — with oracle grounding provided, the model completes 51.1% of tasks on live websites, substantially outperforming a text-only baseline at 13.3%, but performance degrades sharply when grounding must itself be inferred, confirming visual grounding as the principal bottleneck.</w:t>
+        <w:t xml:space="preserve">The web has been the most heavily studied environment for language-guided agents.  Mind2Web, introduced by Deng and colleagues [8], is the first dataset for developing generalist web agents that follow language instructions across diverse real-world websites, comprising over two thousand open-ended tasks collected from 137 websites across 31 domains; its accompanying two-stage model uses a small language model to filter candidate elements from large documents before invoking a larger model to choose among them.  WebArena, introduced by Zhou and colleagues [50], provides a fully self-hosted, reproducible web environment of functional website clones and evaluates 812 long-horizon tasks for functional correctness rather than trajectory similarity, establishing a challenging benchmark on which contemporary models achieved completion rates far below human performance.  Zheng and colleagues [49], in their SeeAct framework, decouple visual understanding from action: the model observes a screenshot, generates a textual plan, and a separate step grounds that plan onto page elements.  Their central finding is diagnostic for the entire field — with oracle grounding provided, the model completes 51.1% of tasks on live websites, substantially outperforming a text-only baseline at 13.3%, but performance degrades sharply when grounding must itself be inferred, confirming visual grounding as the principal bottleneck.</w:t>
       </w:r>
     </w:p>
     <w:bookmarkEnd w:id="50"/>
@@ -2772,7 +2772,7 @@
         <w:pStyle w:val="FirstParagraph"/>
       </w:pPr>
       <w:r>
-        <w:t xml:space="preserve">Mobile-device control has produced large-scale datasets and progressively more autonomous agents.  The pre-LLM work of Li and colleagues (2020), discussed in §2.3, established the grounding problem for mobile interfaces.  Android in the Wild, from Rawles and colleagues (2023), contributes a dataset of 715,000 episodes spanning 30,000 unique instructions, in which actions are gestures at arbitrary screen coordinates rather than operations on indexed interface elements, exposing the challenge that actions must be inferred from visual appearance rather than from a structured model of the interface.  AppAgent, from Zhang and colleagues (2023), operates Android applications through a simplified action space of taps and swipes and learns to use new applications through autonomous exploration or by observing human demonstrations, generating application-specific documentation that matched or exceeded human-written documentation.  Mobile-Agent, from Wang and colleagues (2024), adopts a purely vision-centric approach that requires no system metadata, using optical-character-recognition and icon-detection modules to locate interface elements — achieving broad applicability across mobile environments at the cost of vision-grounding errors that require recovery mechanisms.</w:t>
+        <w:t xml:space="preserve">Mobile-device control has produced large-scale datasets and progressively more autonomous agents.  The pre-LLM work of Li and colleagues [19], discussed in §2.3, established the grounding problem for mobile interfaces.  Android in the Wild, from Rawles and colleagues [32], contributes a dataset of 715,000 episodes spanning 30,000 unique instructions, in which actions are gestures at arbitrary screen coordinates rather than operations on indexed interface elements, exposing the challenge that actions must be inferred from visual appearance rather than from a structured model of the interface.  AppAgent, from Zhang and colleagues [48], operates Android applications through a simplified action space of taps and swipes and learns to use new applications through autonomous exploration or by observing human demonstrations, generating application-specific documentation that matched or exceeded human-written documentation.  Mobile-Agent, from Wang and colleagues [39], adopts a purely vision-centric approach that requires no system metadata, using optical-character-recognition and icon-detection modules to locate interface elements — achieving broad applicability across mobile environments at the cost of vision-grounding errors that require recovery mechanisms.</w:t>
       </w:r>
     </w:p>
     <w:bookmarkEnd w:id="51"/>
@@ -2790,7 +2790,7 @@
         <w:pStyle w:val="FirstParagraph"/>
       </w:pPr>
       <w:r>
-        <w:t xml:space="preserve">Desktop agents are the most direct graphical analogue to the present work, and their limitations are the most instructive.  ScreenAgent, from Niu and colleagues (2024), is a vision-language-model-driven agent for cross-application desktop control that operates in a plan–act–reflect cycle, specifying actions as coordinates and key sequences; its authors acknowledge that vision-only grounding is less reliable than approaches with API access.  WinClick, from Hui and colleagues (2025), targets Windows-desktop grounding and observes that most existing GUI agents rely on structured data formats such as the document object model or HyperText Markup Language, which are unavailable across general desktop environments; it therefore performs visual grounding directly from screenshots.  UFO², the "Desktop AgentOS" of Zhang and colleagues (2025), is the most ambitious desktop system surveyed: it fuses the native Windows accessibility framework with vision-based parsing in a hybrid action mechanism, dispatching subtasks from a coordinating agent to application-specialized agents.  Its authors argue that existing computer-using agents are hindered by shallow operating-system integration, fragile screenshot-based interaction, and disruptive execution, and they identify adaptation to other desktop platforms, such as Linux and macOS, as future work.  UFO² nonetheless operates as an automation layer dispatched atop the existing Windows shell rather than as a replacement for it, and its authors frame cross-platform deployment as groundwork for a unified ecosystem of desktop automation solutions — the trajectory from which the present study departs.</w:t>
+        <w:t xml:space="preserve">Desktop agents are the most direct graphical analogue to the present work, and their limitations are the most instructive.  ScreenAgent, from Niu and colleagues [26], is a vision-language-model-driven agent for cross-application desktop control that operates in a plan–act–reflect cycle, specifying actions as coordinates and key sequences; its authors acknowledge that vision-only grounding is less reliable than approaches with API access.  WinClick, from Hui and colleagues [14], targets Windows-desktop grounding and observes that most existing GUI agents rely on structured data formats such as the document object model or HyperText Markup Language, which are unavailable across general desktop environments; it therefore performs visual grounding directly from screenshots.  UFO², the "Desktop AgentOS" of Zhang and colleagues [47], is the most ambitious desktop system surveyed: it fuses the native Windows accessibility framework with vision-based parsing in a hybrid action mechanism, dispatching subtasks from a coordinating agent to application-specialized agents.  Its authors argue that existing computer-using agents are hindered by shallow operating-system integration, fragile screenshot-based interaction, and disruptive execution, and they identify adaptation to other desktop platforms, such as Linux and macOS, as future work.  UFO² nonetheless operates as an automation layer dispatched atop the existing Windows shell rather than as a replacement for it, and its authors frame cross-platform deployment as groundwork for a unified ecosystem of desktop automation solutions — the trajectory from which the present study departs.</w:t>
       </w:r>
     </w:p>
     <w:bookmarkEnd w:id="52"/>
@@ -2826,7 +2826,7 @@
         <w:pStyle w:val="FirstParagraph"/>
       </w:pPr>
       <w:r>
-        <w:t xml:space="preserve">Underlying many of these agents are vision-language models trained specifically for interface understanding.  CogAgent, from Hong and colleagues (2024), is an eighteen-billion-parameter visual language model specialized for GUI understanding and navigation, using both low- and high-resolution image encoders to recognize the small icons and text typical of graphical interfaces.  It supports the position that pure-vision GUI agents are viable when the underlying model is trained appropriately — but at a compute cost, and with the cross-platform generalization limitations common to the entire graphical-agent literature.  Across web, mobile, and desktop, these systems demonstrate broad capability within a single platform class, while consistently identifying visual grounding as an unsolved bottleneck and trending toward hybrid execution that prefers structured access where available and falls back to vision.</w:t>
+        <w:t xml:space="preserve">Underlying many of these agents are vision-language models trained specifically for interface understanding.  CogAgent, from Hong and colleagues [13], is an eighteen-billion-parameter visual language model specialized for GUI understanding and navigation, using both low- and high-resolution image encoders to recognize the small icons and text typical of graphical interfaces.  It supports the position that pure-vision GUI agents are viable when the underlying model is trained appropriately — but at a compute cost, and with the cross-platform generalization limitations common to the entire graphical-agent literature.  Across web, mobile, and desktop, these systems demonstrate broad capability within a single platform class, while consistently identifying visual grounding as an unsolved bottleneck and trending toward hybrid execution that prefers structured access where available and falls back to vision.</w:t>
       </w:r>
     </w:p>
     <w:bookmarkEnd w:id="54"/>
@@ -2853,15 +2853,15 @@
         <w:pStyle w:val="BodyText"/>
       </w:pPr>
       <w:r>
-        <w:t xml:space="preserve">VoicePilot, from Padmanabha and colleagues (2024), is a framework for using LLMs as speech interfaces to physically assistive robots for individuals with motor impairments.  Although its immediate target is robotic assistance rather than desktop computing, it is included here because it is the most rigorous human-centered evaluation in the LLM-speech-interface literature.  The authors derive five concrete design guidelines from a study with motor-impaired participants, among them the importance of execution speed approaching that of a caregiver and the necessity of preview-and-confirm workflows — a guideline that directly informs the reversibility-based confirmation design of the present study.  DexAssist, from Mehendale and Walishetti (2024), targets web navigation by users with fine-motor impairments using two LLMs in tandem — one to interpret voice commands and a second to map the interpretation onto interface elements with fallback strategies — reducing the misinterpretation failures of single-model voice navigation on dense layouts.  The architecture of van Dam (2025) proposes retrofitting LLM-based conversational interfaces onto existing single-application graphical interfaces, exposing an application’s navigation graph through a tool protocol and handling voice input through real-time speech recognition; its author observes that most production applications were never designed with speech in mind, making such retrofitting an ongoing challenge.</w:t>
-      </w:r>
-    </w:p>
-    <w:p>
-      <w:pPr>
-        <w:pStyle w:val="BodyText"/>
-      </w:pPr>
-      <w:r>
-        <w:t xml:space="preserve">More recent work continues to mature the components required for speech-driven interface control.  Han and colleagues, in GUIRoboTron-Speech (2025), advance automated GUI agents driven directly by speech instructions, while Park and colleagues, in R-VLM (2025), contribute region-aware visual grounding for more precise identification of on-screen elements.  What unites this thread is that it operates at the level of the individual application or interaction technique rather than at the level of the session itself.  These approaches presuppose an underlying conversational system surface on which to run, yet no such surface exists at the session level.  This complementarity is significant: a general-purpose conversational interface layer would serve not only mainstream users but also provide the substrate that accessibility-specific configurations require — positioning accessibility not as the immediate target of the present study, which scopes it out for recruitment and ethics reasons, but as a natural and well-grounded extension of its contribution.</w:t>
+        <w:t xml:space="preserve">VoicePilot, from Padmanabha and colleagues [30], is a framework for using LLMs as speech interfaces to physically assistive robots for individuals with motor impairments.  Although its immediate target is robotic assistance rather than desktop computing, it is included here because it is the most rigorous human-centered evaluation in the LLM-speech-interface literature.  The authors derive five concrete design guidelines from a study with motor-impaired participants, among them the importance of execution speed approaching that of a caregiver and the necessity of preview-and-confirm workflows — a guideline that directly informs the reversibility-based confirmation design of the present study.  DexAssist, from Mehendale and Walishetti [25], targets web navigation by users with fine-motor impairments using two LLMs in tandem — one to interpret voice commands and a second to map the interpretation onto interface elements with fallback strategies — reducing the misinterpretation failures of single-model voice navigation on dense layouts.  The architecture of van Dam [38] proposes retrofitting LLM-based conversational interfaces onto existing single-application graphical interfaces, exposing an application’s navigation graph through a tool protocol and handling voice input through real-time speech recognition; its author observes that most production applications were never designed with speech in mind, making such retrofitting an ongoing challenge.</w:t>
+      </w:r>
+    </w:p>
+    <w:p>
+      <w:pPr>
+        <w:pStyle w:val="BodyText"/>
+      </w:pPr>
+      <w:r>
+        <w:t xml:space="preserve">More recent work continues to mature the components required for speech-driven interface control.  Han and colleagues, in GUIRoboTron-Speech [11], advance automated GUI agents driven directly by speech instructions, while Park and colleagues, in R-VLM [31], contribute region-aware visual grounding for more precise identification of on-screen elements.  What unites this thread is that it operates at the level of the individual application or interaction technique rather than at the level of the session itself.  These approaches presuppose an underlying conversational system surface on which to run, yet no such surface exists at the session level.  This complementarity is significant: a general-purpose conversational interface layer would serve not only mainstream users but also provide the substrate that accessibility-specific configurations require — positioning accessibility not as the immediate target of the present study, which scopes it out for recruitment and ethics reasons, but as a natural and well-grounded extension of its contribution.</w:t>
       </w:r>
     </w:p>
     <w:bookmarkEnd w:id="56"/>
@@ -2879,15 +2879,15 @@
         <w:pStyle w:val="FirstParagraph"/>
       </w:pPr>
       <w:r>
-        <w:t xml:space="preserve">The rapid proliferation of computer-using agents has been accompanied by increasingly rigorous evaluation environments, and these establish both the current ceiling of the field’s capability and the methods by which that capability is measured.  The most consequential is OSWorld, from Xie and colleagues (2024), a benchmark of 369 real-world computer tasks in a real-computer environment spanning Ubuntu, Windows, and macOS.  At its 2024 release the margin it measured was stark: humans achieved 72.36% success where the best evaluated model reached 12.24%.  That particular margin has since closed, with leading agents now exceeding the original human baseline on the revised task set — but the closure reflects progress on short, self-contained tasks rather than on sustained computer work.  Its successor, OSWorld 2.0 (Yuan et al., 2026), evaluates 108 long-horizon workflows whose median item requires roughly an hour and a half of skilled human operation; there the best frontier configuration completes only 20.6% of tasks outright.  The reported failures concentrate not in interface navigation but in tracking constraints across a long task, absorbing information that arrives mid-way, and verifying a result before declaring completion.  The field’s ceiling has moved substantially; it has not been reached.  OSWorld is also directly relevant to the present study as the source of a real-task suite against which benchmark comparability can be established.</w:t>
-      </w:r>
-    </w:p>
-    <w:p>
-      <w:pPr>
-        <w:pStyle w:val="BodyText"/>
-      </w:pPr>
-      <w:r>
-        <w:t xml:space="preserve">Complementing the benchmark literature, the survey of LLM-brained GUI agents by Zhang and colleagues (2024) synthesizes the field through 2024, organizing it around the components of perception, planning, action, and memory, and providing the four-layer vocabulary adopted in §2.2 of this review.  It enumerates the field’s open challenges — accurate element localization, knowledge retrieval, long-horizon planning, and safety-aware execution control; notably, none of the challenges it enumerates concerns replacing the session layer itself: the survey takes the surrounding operating-system session as given, which is the assumption the present study sets out to test.  What the evaluation literature reveals, however, is a specific methodological limitation: rigorous as these benchmarks are, they measure the autonomous task completion of agents acting on a user’s behalf, not the comparative performance of a human user working through a conversational interface versus a conventional graphical one.  That distinction motivates the evaluation design reviewed in §2.9.</w:t>
+        <w:t xml:space="preserve">The rapid proliferation of computer-using agents has been accompanied by increasingly rigorous evaluation environments, and these establish both the current ceiling of the field’s capability and the methods by which that capability is measured.  The most consequential is OSWorld, from Xie and colleagues [43], a benchmark of 369 real-world computer tasks in a real-computer environment spanning Ubuntu, Windows, and macOS.  At its 2024 release the margin it measured was stark: humans achieved 72.36% success where the best evaluated model reached 12.24%.  That particular margin has since closed, with leading agents now exceeding the original human baseline on the revised task set — but the closure reflects progress on short, self-contained tasks rather than on sustained computer work.  Its successor, OSWorld 2.0 [45], evaluates 108 long-horizon workflows whose median item requires roughly an hour and a half of skilled human operation; there the best frontier configuration completes only 20.6% of tasks outright.  The reported failures concentrate not in interface navigation but in tracking constraints across a long task, absorbing information that arrives mid-way, and verifying a result before declaring completion.  The field’s ceiling has moved substantially; it has not been reached.  OSWorld is also directly relevant to the present study as the source of a real-task suite against which benchmark comparability can be established.</w:t>
+      </w:r>
+    </w:p>
+    <w:p>
+      <w:pPr>
+        <w:pStyle w:val="BodyText"/>
+      </w:pPr>
+      <w:r>
+        <w:t xml:space="preserve">Complementing the benchmark literature, the survey of LLM-brained GUI agents by Zhang and colleagues [46] synthesizes the field through 2024, organizing it around the components of perception, planning, action, and memory, and providing the four-layer vocabulary adopted in §2.2 of this review.  It enumerates the field’s open challenges — accurate element localization, knowledge retrieval, long-horizon planning, and safety-aware execution control; notably, none of the challenges it enumerates concerns replacing the session layer itself: the survey takes the surrounding operating-system session as given, which is the assumption the present study sets out to test.  What the evaluation literature reveals, however, is a specific methodological limitation: rigorous as these benchmarks are, they measure the autonomous task completion of agents acting on a user’s behalf, not the comparative performance of a human user working through a conversational interface versus a conventional graphical one.  That distinction motivates the evaluation design reviewed in §2.9.</w:t>
       </w:r>
     </w:p>
     <w:bookmarkEnd w:id="57"/>
@@ -3024,7 +3024,7 @@
               <w:jc w:val="left"/>
             </w:pPr>
             <w:r>
-              <w:t xml:space="preserve">Wilensky et al., 1988</w:t>
+              <w:t xml:space="preserve">Wilensky et al. [42]</w:t>
             </w:r>
           </w:p>
         </w:tc>
@@ -3098,7 +3098,7 @@
               <w:jc w:val="left"/>
             </w:pPr>
             <w:r>
-              <w:t xml:space="preserve">Westenfelder et al., 2025</w:t>
+              <w:t xml:space="preserve">Westenfelder et al. [40]</w:t>
             </w:r>
           </w:p>
         </w:tc>
@@ -3172,7 +3172,7 @@
               <w:jc w:val="left"/>
             </w:pPr>
             <w:r>
-              <w:t xml:space="preserve">Gyawali et al., 2025</w:t>
+              <w:t xml:space="preserve">Gyawali et al. [10]</w:t>
             </w:r>
           </w:p>
         </w:tc>
@@ -3246,7 +3246,7 @@
               <w:jc w:val="left"/>
             </w:pPr>
             <w:r>
-              <w:t xml:space="preserve">van Dam, 2025</w:t>
+              <w:t xml:space="preserve">van Dam [38]</w:t>
             </w:r>
           </w:p>
         </w:tc>
@@ -3320,7 +3320,7 @@
               <w:jc w:val="left"/>
             </w:pPr>
             <w:r>
-              <w:t xml:space="preserve">Padmanabha et al., 2024</w:t>
+              <w:t xml:space="preserve">Padmanabha et al. [30]</w:t>
             </w:r>
           </w:p>
         </w:tc>
@@ -3394,7 +3394,7 @@
               <w:jc w:val="left"/>
             </w:pPr>
             <w:r>
-              <w:t xml:space="preserve">Mehendale &amp; Walishetti, 2024</w:t>
+              <w:t xml:space="preserve">Mehendale and Walishetti [25]</w:t>
             </w:r>
           </w:p>
         </w:tc>
@@ -3468,7 +3468,7 @@
               <w:jc w:val="left"/>
             </w:pPr>
             <w:r>
-              <w:t xml:space="preserve">Deng et al., 2023</w:t>
+              <w:t xml:space="preserve">Deng et al. [8]</w:t>
             </w:r>
           </w:p>
         </w:tc>
@@ -3542,7 +3542,7 @@
               <w:jc w:val="left"/>
             </w:pPr>
             <w:r>
-              <w:t xml:space="preserve">Zhou et al., 2024</w:t>
+              <w:t xml:space="preserve">Zhou et al. [50]</w:t>
             </w:r>
           </w:p>
         </w:tc>
@@ -3616,7 +3616,7 @@
               <w:jc w:val="left"/>
             </w:pPr>
             <w:r>
-              <w:t xml:space="preserve">Zheng et al., 2024</w:t>
+              <w:t xml:space="preserve">Zheng et al. [49]</w:t>
             </w:r>
           </w:p>
         </w:tc>
@@ -3690,7 +3690,7 @@
               <w:jc w:val="left"/>
             </w:pPr>
             <w:r>
-              <w:t xml:space="preserve">Rawles et al., 2023</w:t>
+              <w:t xml:space="preserve">Rawles et al. [32]</w:t>
             </w:r>
           </w:p>
         </w:tc>
@@ -3764,7 +3764,7 @@
               <w:jc w:val="left"/>
             </w:pPr>
             <w:r>
-              <w:t xml:space="preserve">Zhang et al., 2023</w:t>
+              <w:t xml:space="preserve">Zhang et al. [48]</w:t>
             </w:r>
           </w:p>
         </w:tc>
@@ -3838,7 +3838,7 @@
               <w:jc w:val="left"/>
             </w:pPr>
             <w:r>
-              <w:t xml:space="preserve">Wang et al., 2024</w:t>
+              <w:t xml:space="preserve">Wang et al. [39]</w:t>
             </w:r>
           </w:p>
         </w:tc>
@@ -3912,7 +3912,7 @@
               <w:jc w:val="left"/>
             </w:pPr>
             <w:r>
-              <w:t xml:space="preserve">Hong et al., 2024</w:t>
+              <w:t xml:space="preserve">Hong et al. [13]</w:t>
             </w:r>
           </w:p>
         </w:tc>
@@ -3986,7 +3986,7 @@
               <w:jc w:val="left"/>
             </w:pPr>
             <w:r>
-              <w:t xml:space="preserve">Niu et al., 2024</w:t>
+              <w:t xml:space="preserve">Niu et al. [26]</w:t>
             </w:r>
           </w:p>
         </w:tc>
@@ -4060,7 +4060,7 @@
               <w:jc w:val="left"/>
             </w:pPr>
             <w:r>
-              <w:t xml:space="preserve">Hui et al., 2025</w:t>
+              <w:t xml:space="preserve">Hui et al. [14]</w:t>
             </w:r>
           </w:p>
         </w:tc>
@@ -4134,7 +4134,7 @@
               <w:jc w:val="left"/>
             </w:pPr>
             <w:r>
-              <w:t xml:space="preserve">Zhang et al., 2025</w:t>
+              <w:t xml:space="preserve">Zhang et al. [47]</w:t>
             </w:r>
           </w:p>
         </w:tc>
@@ -4208,7 +4208,7 @@
               <w:jc w:val="left"/>
             </w:pPr>
             <w:r>
-              <w:t xml:space="preserve">Xie et al., 2024</w:t>
+              <w:t xml:space="preserve">Xie et al. [43]</w:t>
             </w:r>
           </w:p>
         </w:tc>
@@ -4282,7 +4282,7 @@
               <w:jc w:val="left"/>
             </w:pPr>
             <w:r>
-              <w:t xml:space="preserve">Li et al., 2020</w:t>
+              <w:t xml:space="preserve">Li et al. [19]</w:t>
             </w:r>
           </w:p>
         </w:tc>
@@ -4356,7 +4356,7 @@
               <w:jc w:val="left"/>
             </w:pPr>
             <w:r>
-              <w:t xml:space="preserve">Yao et al., 2023</w:t>
+              <w:t xml:space="preserve">Yao et al. [44]</w:t>
             </w:r>
           </w:p>
         </w:tc>
@@ -4430,7 +4430,7 @@
               <w:jc w:val="left"/>
             </w:pPr>
             <w:r>
-              <w:t xml:space="preserve">Han et al., 2025</w:t>
+              <w:t xml:space="preserve">Han et al. [11]</w:t>
             </w:r>
           </w:p>
         </w:tc>
@@ -4504,7 +4504,7 @@
               <w:jc w:val="left"/>
             </w:pPr>
             <w:r>
-              <w:t xml:space="preserve">Park et al., 2025</w:t>
+              <w:t xml:space="preserve">Park et al. [31]</w:t>
             </w:r>
           </w:p>
         </w:tc>
@@ -4578,7 +4578,7 @@
               <w:jc w:val="left"/>
             </w:pPr>
             <w:r>
-              <w:t xml:space="preserve">Jacobs et al., 2026</w:t>
+              <w:t xml:space="preserve">Jacobs et al. [16]</w:t>
             </w:r>
           </w:p>
         </w:tc>
@@ -4666,7 +4666,7 @@
         <w:pStyle w:val="FirstParagraph"/>
       </w:pPr>
       <w:r>
-        <w:t xml:space="preserve">The field is bifurcated by coverage scope.  Shell-level work (Westenfelder et al., 2025; Gyawali et al., 2025) and single-application work (van Dam, 2025; Padmanabha et al., 2024) sit at the narrow end; cross-application desktop, web, and mobile agents sit at the broad end but each within a single platform class.  No surveyed system implements a working conversational layer over the full graphical session that has been empirically validated against the conventional desktop workflow it would supplement.  The Unix Consultant (Wilensky et al., 1988) came closest in ambition four decades ago, but its pre-LLM foundation prevented it from scaling beyond demonstration.  The absence is structural rather than incidental.  Even UFO² (Zhang et al., 2025), the most operationally advanced desktop-agent system surveyed, is by construction an automation layer dispatched atop the existing Windows shell, and its stated future direction is broader cross-platform automation rather than replacement of the session itself.  The substitution this study attempts is therefore unclaimed, not merely under-published.</w:t>
+        <w:t xml:space="preserve">The field is bifurcated by coverage scope.  Shell-level work [10, 40] and single-application work [30, 38] sit at the narrow end; cross-application desktop, web, and mobile agents sit at the broad end but each within a single platform class.  No surveyed system implements a working conversational layer over the full graphical session that has been empirically validated against the conventional desktop workflow it would supplement.  The Unix Consultant [42] came closest in ambition four decades ago, but its pre-LLM foundation prevented it from scaling beyond demonstration.  The absence is structural rather than incidental.  Even UFO² [47], the most operationally advanced desktop-agent system surveyed, is by construction an automation layer dispatched atop the existing Windows shell, and its stated future direction is broader cross-platform automation rather than replacement of the session itself.  The substitution this study attempts is therefore unclaimed, not merely under-published.</w:t>
       </w:r>
     </w:p>
     <w:bookmarkEnd w:id="58"/>
@@ -4684,7 +4684,7 @@
         <w:pStyle w:val="FirstParagraph"/>
       </w:pPr>
       <w:r>
-        <w:t xml:space="preserve">A second pattern concerns the execution mechanism at the Action layer.  The literature divides among command translation, API binding, and GUI simulation, with a dominant trend toward hybrid execution (Zhang et al., 2025; van Dam, 2025) that prefers structured access where available and falls back to vision.  Vision-only systems (Wang et al., 2024; Niu et al., 2024) achieve broad applicability at the cost of grounding fragility, while structured-access systems achieve precision at the cost of per-environment integration.  Notably, the Unix Consultant operated purely at the consultation layer without executing actions — an approach that reflects an underappreciated design principle, that the agent that explains can be safer than the agent that acts, which the confirmation-gated design of the present study revisits.</w:t>
+        <w:t xml:space="preserve">A second pattern concerns the execution mechanism at the Action layer.  The literature divides among command translation, API binding, and GUI simulation, with a dominant trend toward hybrid execution [38, 47] that prefers structured access where available and falls back to vision.  Vision-only systems [26, 39] achieve broad applicability at the cost of grounding fragility, while structured-access systems achieve precision at the cost of per-environment integration.  Notably, the Unix Consultant operated purely at the consultation layer without executing actions — an approach that reflects an underappreciated design principle, that the agent that explains can be safer than the agent that acts, which the confirmation-gated design of the present study revisits.</w:t>
       </w:r>
     </w:p>
     <w:bookmarkEnd w:id="59"/>
@@ -4702,7 +4702,7 @@
         <w:pStyle w:val="FirstParagraph"/>
       </w:pPr>
       <w:r>
-        <w:t xml:space="preserve">A third pattern is that visual grounding is the field’s principal bottleneck, identified explicitly by both SeeAct (Zheng et al., 2024) and the GUI-agents survey (Zhang et al., 2024).  The 51.1% ceiling of GPT-4V with oracle grounding and its sharp degradation without are attributable in significant part to grounding failure.  This bottleneck is a property of the graphical-simulation approach specifically; a command-line approach that grounds intent into shell commands rather than into on-screen pixel regions sidesteps it, at the cost of being bounded by what is expressible on the command line.  Direct comparison qualifies that tradeoff usefully.  Across 440 matched desktop tasks, screen-only graphical agents pass 59.1% while command-line agents reach only 48.2% — the shell is not automatically the stronger substrate — but command-line agents augmented with result verification reach 69.3%, the highest of the three conditions (Zhou et al., 2026).  Execution through the shell becomes advantageous when it is paired with a mechanism that checks what the command actually did, which is precisely the role a reversibility gate and an undo record play in the present design.</w:t>
+        <w:t xml:space="preserve">A third pattern is that visual grounding is the field’s principal bottleneck, identified explicitly by both SeeAct [49] and the GUI-agents survey [46].  The 51.1% ceiling of GPT-4V with oracle grounding and its sharp degradation without are attributable in significant part to grounding failure.  This bottleneck is a property of the graphical-simulation approach specifically; a command-line approach that grounds intent into shell commands rather than into on-screen pixel regions sidesteps it, at the cost of being bounded by what is expressible on the command line.  Direct comparison qualifies that tradeoff usefully.  Across 440 matched desktop tasks, screen-only graphical agents pass 59.1% while command-line agents reach only 48.2% — the shell is not automatically the stronger substrate — but command-line agents augmented with result verification reach 69.3%, the highest of the three conditions [51].  Execution through the shell becomes advantageous when it is paired with a mechanism that checks what the command actually did, which is precisely the role a reversibility gate and an undo record play in the present design.</w:t>
       </w:r>
     </w:p>
     <w:bookmarkEnd w:id="60"/>
@@ -4720,7 +4720,7 @@
         <w:pStyle w:val="FirstParagraph"/>
       </w:pPr>
       <w:r>
-        <w:t xml:space="preserve">A fourth pattern concerns evaluation method.  Most surveyed systems are evaluated either through architectural demonstration (Gyawali et al., 2025; van Dam, 2025) or through curated task benchmarks (Deng et al., 2023; Zhou et al., 2024; Wang et al., 2024; Xie et al., 2024).  User studies are rare, and the comparisons that do exist are narrow.  VoicePilot (Padmanabha et al., 2024) conducts a substantive human-centered evaluation of LLM-based interaction, and AXIS (Lu et al., 2024) compares an API-first agent against unaided manual operation in a within-subjects design — but within a single application, on a single platform, with a cloud-hosted frontier model.  No surveyed work compares a conversational interface against the conventional graphical workflow across operating-system-level tasks on the same population.  This is the empirical gap best filled by a controlled study of conversational interfaces.</w:t>
+        <w:t xml:space="preserve">A fourth pattern concerns evaluation method.  Most surveyed systems are evaluated either through architectural demonstration [10, 38] or through curated task benchmarks [8, 39, 43, 50].  User studies are rare, and the comparisons that do exist are narrow.  VoicePilot [30] conducts a substantive human-centered evaluation of LLM-based interaction, and AXIS [22] compares an API-first agent against unaided manual operation in a within-subjects design — but within a single application, on a single platform, with a cloud-hosted frontier model.  No surveyed work compares a conversational interface against the conventional graphical workflow across operating-system-level tasks on the same population.  This is the empirical gap best filled by a controlled study of conversational interfaces.</w:t>
       </w:r>
     </w:p>
     <w:bookmarkEnd w:id="61"/>
@@ -4738,7 +4738,7 @@
         <w:pStyle w:val="FirstParagraph"/>
       </w:pPr>
       <w:r>
-        <w:t xml:space="preserve">A fifth pattern concerns the operating-system substrate.  Windows (Hui et al., 2025; Zhang et al., 2025), Android (Rawles et al., 2023; Zhang et al., 2023; Wang et al., 2024), and the web (Deng et al., 2023; Zhou et al., 2024; Zheng et al., 2024) are each heavily represented; the Linux work that exists is aimed elsewhere than the end user’s desktop session.  NaSh (Gyawali et al., 2025) addresses Linux at the shell level as a design proposal; Alibaba Cloud’s ANOLISA ships a natural-language Linux terminal with approval gating and rollback, but scoped to server and DevOps workloads; and OSWorld (Xie et al., 2024) includes Ubuntu as an evaluation platform rather than a deployment target.  No surveyed system implements a conversational session layer for the Linux desktop addressed to the person using the machine, despite Linux serving as the substrate for most developer and server-side workflows.</w:t>
+        <w:t xml:space="preserve">A fifth pattern concerns the operating-system substrate.  Windows [14, 47], Android [32, 39, 48], and the web [8, 49, 50] are each heavily represented; the Linux work that exists is aimed elsewhere than the end user’s desktop session.  NaSh [10] addresses Linux at the shell level as a design proposal; Alibaba Cloud’s ANOLISA ships a natural-language Linux terminal with approval gating and rollback, but scoped to server and DevOps workloads; and OSWorld [43] includes Ubuntu as an evaluation platform rather than a deployment target.  No surveyed system implements a conversational session layer for the Linux desktop addressed to the person using the machine, despite Linux serving as the substrate for most developer and server-side workflows.</w:t>
       </w:r>
     </w:p>
     <w:bookmarkEnd w:id="62"/>
@@ -4756,7 +4756,7 @@
         <w:pStyle w:val="FirstParagraph"/>
       </w:pPr>
       <w:r>
-        <w:t xml:space="preserve">A sixth pattern is the field’s shared intellectual lineage and its attendant fragility.  As established in §2.3, nearly every post-2023 system inherits the ReAct (Yao et al., 2023) convention of interleaving reasoning with action, which explains both the field’s rapid progress and the pervasiveness of LLM-reasoning failure modes across it — a fragility that makes safety and recoverability mechanisms, rather than raw capability alone, decisive for any deployable system.</w:t>
+        <w:t xml:space="preserve">A sixth pattern is the field’s shared intellectual lineage and its attendant fragility.  As established in §2.3, nearly every post-2023 system inherits the ReAct [44] convention of interleaving reasoning with action, which explains both the field’s rapid progress and the pervasiveness of LLM-reasoning failure modes across it — a fragility that makes safety and recoverability mechanisms, rather than raw capability alone, decisive for any deployable system.</w:t>
       </w:r>
     </w:p>
     <w:p>
@@ -4824,7 +4824,7 @@
         <w:t xml:space="preserve">Fourth</w:t>
       </w:r>
       <w:r>
-        <w:t xml:space="preserve">, controlled comparison against the conventional graphical workflow exists only within a single application, on a single platform, with a cloud-hosted frontier model (Lu et al., 2024); no such comparison exists for operating-system-level tasks under a locally-hosted model and an explicit safety gate.  SynapseOS — a conversational interface layer for the Linux desktop that translates natural-language intent into shell commands under a reversibility-based confirmation gate, evaluated against each participant’s own operating system — is positioned precisely against these four gaps.  Its relationship to the closest prior work is worth stating directly.  NaSh (Gyawali et al., 2025) proposes guardrails for an LLM-powered natural language shell — generated code that remains analyzable, selective undo, summaries of what a command would affect — as a design position, and explicitly leaves implementation and empirical evaluation as open work.  The present study is an implementation of that position, substituting for the general principle a static recoverability analysis, which derives what a command would affect from its structure before it runs, and an undo journal with five mechanisms, and supplying the user evaluation NaSh defers.</w:t>
+        <w:t xml:space="preserve">, controlled comparison against the conventional graphical workflow exists only within a single application, on a single platform, with a cloud-hosted frontier model [22]; no such comparison exists for operating-system-level tasks under a locally-hosted model and an explicit safety gate.  SynapseOS — a conversational interface layer for the Linux desktop that translates natural-language intent into shell commands under a reversibility-based confirmation gate, evaluated against each participant’s own operating system — is positioned precisely against these four gaps.  Its relationship to the closest prior work is worth stating directly.  NaSh [10] proposes guardrails for an LLM-powered natural language shell — generated code that remains analyzable, selective undo, summaries of what a command would affect — as a design position, and explicitly leaves implementation and empirical evaluation as open work.  The present study is an implementation of that position, substituting for the general principle a static recoverability analysis, which derives what a command would affect from its structure before it runs, and an undo journal with five mechanisms, and supplying the user evaluation NaSh defers.</w:t>
       </w:r>
     </w:p>
     <w:bookmarkEnd w:id="63"/>
@@ -4843,7 +4843,7 @@
         <w:pStyle w:val="FirstParagraph"/>
       </w:pPr>
       <w:r>
-        <w:t xml:space="preserve">Beyond the systems it proposes to build upon, the present study draws on a methodological literature that shapes how a conversational interface should be evaluated.  The evaluation practices of the surveyed work fall into three categories, each with a characteristic limitation.  Architectural demonstrations (Gyawali et al., 2025; van Dam, 2025) establish feasibility but provide no performance evidence.  Curated task benchmarks (Deng et al., 2023; Zhou et al., 2024; Xie et al., 2024) provide reproducible, quantitative measures but assess the autonomous task completion of agents acting on a user’s behalf rather than the performance of a human working through an interface.  Human-centered user studies, exemplified by VoicePilot (Padmanabha et al., 2024) and AXIS (Lu et al., 2024), provide the most direct evidence of an interface’s value to real users but remain rare in this literature and, where present, are confined to a single application rather than the operating system as a whole.  The instruments this study adopts are drawn from established practice rather than constructed for it: the System Usability Scale (Brooke, 1996) for perceived usability, with its interpretation grounded in subsequent large-sample analysis (Sauro and Lewis, 2016; Bangor et al., 2008), and the NASA Task Load Index (Hart and Staveland, 1988) for perceived workload.</w:t>
+        <w:t xml:space="preserve">Beyond the systems it proposes to build upon, the present study draws on a methodological literature that shapes how a conversational interface should be evaluated.  The evaluation practices of the surveyed work fall into three categories, each with a characteristic limitation.  Architectural demonstrations [10, 38] establish feasibility but provide no performance evidence.  Curated task benchmarks [8, 43, 50] provide reproducible, quantitative measures but assess the autonomous task completion of agents acting on a user’s behalf rather than the performance of a human working through an interface.  Human-centered user studies, exemplified by VoicePilot [30] and AXIS [22], provide the most direct evidence of an interface’s value to real users but remain rare in this literature and, where present, are confined to a single application rather than the operating system as a whole.  The instruments this study adopts are drawn from established practice rather than constructed for it: the System Usability Scale [4] for perceived usability, with its interpretation grounded in subsequent large-sample analysis [1, 33], and the NASA Task Load Index [12] for perceived workload.</w:t>
       </w:r>
     </w:p>
     <w:p>
@@ -4899,7 +4899,7 @@
         <w:t xml:space="preserve"> </w:t>
       </w:r>
       <w:r>
-        <w:t xml:space="preserve">structure in the sense set out by Creswell and Plano Clark (2018), collecting both strands concurrently and integrating them at the interpretation stage; the qualitative data, gathered through retrospective think-aloud over the screen recording and a semi-structured interview, are analyzed using the thematic-analysis method of Braun and Clarke (2006), a widely adopted six-phase approach for identifying and reporting patterns in qualitative data.  Design considerations surfaced by the reviewed systems inform the evaluation directly: the preview-and-confirm guideline of VoicePilot (Padmanabha et al., 2024) and the reversibility-and-guardrail framing of NaSh (Gyawali et al., 2025) together motivate an explicit validation of the confirmation gate and undo mechanism as part of the study.</w:t>
+        <w:t xml:space="preserve">structure in the sense set out by Creswell and Plano Clark [7], collecting both strands concurrently and integrating them at the interpretation stage; the qualitative data, gathered through retrospective think-aloud over the screen recording and a semi-structured interview, are analyzed using the thematic-analysis method of Braun and Clarke [3], a widely adopted six-phase approach for identifying and reporting patterns in qualitative data.  Design considerations surfaced by the reviewed systems inform the evaluation directly: the preview-and-confirm guideline of VoicePilot [30] and the reversibility-and-guardrail framing of NaSh [10] together motivate an explicit validation of the confirmation gate and undo mechanism as part of the study.</w:t>
       </w:r>
     </w:p>
     <w:p>
@@ -4925,7 +4925,7 @@
         <w:pStyle w:val="FirstParagraph"/>
       </w:pPr>
       <w:r>
-        <w:t xml:space="preserve">This chapter reviewed the literature on natural-language and LLM-mediated interfaces to personal computing across nearly four decades, organized along a four-layer pipeline of Input, Reasoning, Action, and Operating-System Integration.  The historical foundations established the long-standing aspiration to a natural-language interface to a real operating system (Wilensky et al., 1988) and the methodological shift, driven by in-context reasoning (Yao et al., 2023), that made the current generation of systems possible.  The shell-and-command-line thread most directly related to the proposed design demonstrated that natural-language-to-Bash translation is tractable (Westenfelder et al., 2025), that safety and reversibility are central concerns (Gyawali et al., 2025), and that local deployment is feasible (Jacobs et al., 2026), while leaving the extension from shell to session, and empirical user evaluation, as open work.  The graphical-agent literature across web, mobile, and desktop (Deng et al., 2023; Zhou et al., 2024; Zheng et al., 2024; Rawles et al., 2023; Zhang et al., 2023; Wang et al., 2024; Hong et al., 2024; Niu et al., 2024; Hui et al., 2025; Zhang et al., 2025) established the field’s architectural patterns and its recurring bottleneck of visual grounding, while the accessibility thread (van Dam, 2025; Padmanabha et al., 2024; Mehendale and Walishetti, 2024; Han et al., 2025; Park et al., 2025) revealed a complementary limitation that a general conversational interface layer would resolve.  The evaluation literature (Xie et al., 2024; Zhang et al., 2024; Yuan et al., 2026) traced a capability ceiling that has risen sharply on short tasks while remaining low on long-horizon work, and exposed a methodological gap: interfaces are seldom evaluated comparatively against the conventional workflow with real users, and never yet at the level of the operating system itself.</w:t>
+        <w:t xml:space="preserve">This chapter reviewed the literature on natural-language and LLM-mediated interfaces to personal computing across nearly four decades, organized along a four-layer pipeline of Input, Reasoning, Action, and Operating-System Integration.  The historical foundations established the long-standing aspiration to a natural-language interface to a real operating system [42] and the methodological shift, driven by in-context reasoning [44], that made the current generation of systems possible.  The shell-and-command-line thread most directly related to the proposed design demonstrated that natural-language-to-Bash translation is tractable [40], that safety and reversibility are central concerns [10], and that local deployment is feasible [16], while leaving the extension from shell to session, and empirical user evaluation, as open work.  The graphical-agent literature across web, mobile, and desktop [8, 13, 14, 26, 32, 39, 47–50] established the field’s architectural patterns and its recurring bottleneck of visual grounding, while the accessibility thread [11, 25, 30, 31, 38] revealed a complementary limitation that a general conversational interface layer would resolve.  The evaluation literature [43, 45, 46] traced a capability ceiling that has risen sharply on short tasks while remaining low on long-horizon work, and exposed a methodological gap: interfaces are seldom evaluated comparatively against the conventional workflow with real users, and never yet at the level of the operating system itself.</w:t>
       </w:r>
     </w:p>
     <w:p>
@@ -5105,7 +5105,7 @@
         <w:pStyle w:val="BodyText"/>
       </w:pPr>
       <w:r>
-        <w:t xml:space="preserve">The framework is evaluated in two independent parts.  The recoverability analyzer is evaluated on its own, on a corpus of commands whose ground truth is obtained by sandboxed execution (Section 3.1).  The system as a whole is evaluated through a controlled user study in which participants complete a fixed set of tasks under two conditions: using SynapseOS as the interface, and using their own primary operating system — Windows, macOS, or Linux — as the baseline.  This expert baseline design pits SynapseOS against the environment each participant already knows and uses daily, generating empirical data on task completion time, error rate, and user satisfaction across the real-world OS landscape (Xie et al., 2024).</w:t>
+        <w:t xml:space="preserve">The framework is evaluated in two independent parts.  The recoverability analyzer is evaluated on its own, on a corpus of commands whose ground truth is obtained by sandboxed execution (Section 3.1).  The system as a whole is evaluated through a controlled user study in which participants complete a fixed set of tasks under two conditions: using SynapseOS as the interface, and using their own primary operating system — Windows, macOS, or Linux — as the baseline.  This expert baseline design pits SynapseOS against the environment each participant already knows and uses daily, generating empirical data on task completion time, error rate, and user satisfaction across the real-world OS landscape [43].</w:t>
       </w:r>
     </w:p>
     <w:p>
@@ -5846,7 +5846,7 @@
         <w:pStyle w:val="FirstParagraph"/>
       </w:pPr>
       <w:r>
-        <w:t xml:space="preserve">The primary benchmark dataset is the OSWorld task suite (Xie et al., 2024), which provides standardized real-computer tasks across shell operations, file management, web browsing, and application-level interactions.  OSWorld is the only existing benchmark that evaluates computer-using agents in real operating system environments, making it the most appropriate external standard for SynapseOS evaluation.  Tasks are presented as natural language instructions; agents interact with a real virtual machine environment, and outcomes are evaluated by automated inspection of the resulting system state — whether the goal was actually achieved — rather than by comparing individual actions.  In addition to OSWorld tasks, a custom cross-platform task suite is developed for this study, covering file search and organization, system and process monitoring, application and package management, and text and data processing — each task defined as a human-level goal achievable via SynapseOS natural language commands and via native OS tools on the comparison machine.  Each task in both suites is documented with a description, expected outcome, task category, and difficulty level.</w:t>
+        <w:t xml:space="preserve">The primary benchmark dataset is the OSWorld task suite [43], which provides standardized real-computer tasks across shell operations, file management, web browsing, and application-level interactions.  OSWorld is the only existing benchmark that evaluates computer-using agents in real operating system environments, making it the most appropriate external standard for SynapseOS evaluation.  Tasks are presented as natural language instructions; agents interact with a real virtual machine environment, and outcomes are evaluated by automated inspection of the resulting system state — whether the goal was actually achieved — rather than by comparing individual actions.  In addition to OSWorld tasks, a custom cross-platform task suite is developed for this study, covering file search and organization, system and process monitoring, application and package management, and text and data processing — each task defined as a human-level goal achievable via SynapseOS natural language commands and via native OS tools on the comparison machine.  Each task in both suites is documented with a description, expected outcome, task category, and difficulty level.</w:t>
       </w:r>
     </w:p>
     <w:bookmarkEnd w:id="76"/>
@@ -5930,7 +5930,7 @@
         <w:t xml:space="preserve"> </w:t>
       </w:r>
       <w:r>
-        <w:t xml:space="preserve">responses to the System Usability Scale (SUS) (Brooke, 1996) and the NASA Task Load Index (NASA-TLX) (Hart and Staveland, 1988), collected immediately after each condition; both are validated instruments for measuring perceived usability and cognitive workload respectively</w:t>
+        <w:t xml:space="preserve">responses to the System Usability Scale (SUS) [4] and the NASA Task Load Index (NASA-TLX) [12], collected immediately after each condition; both are validated instruments for measuring perceived usability and cognitive workload respectively</w:t>
       </w:r>
     </w:p>
     <w:p>
@@ -6058,7 +6058,7 @@
         <w:pStyle w:val="FirstParagraph"/>
       </w:pPr>
       <w:r>
-        <w:t xml:space="preserve">SynapseOS is deployed on the Debian 13 (Trixie) environment matching the OSWorld evaluation setup (Xie et al., 2024).  Each benchmark task is executed through the conversational interface, and results are captured programmatically through the built-in telemetry system.  Each task is supplied to SynapseOS as a natural language instruction, and the resulting system state is compared against the expected outcome defined in the benchmark.  Because SynapseOS gates every command classified irreversible on explicit confirmation, benchmark runs are facilitator-attended rather than unattended; the confirmation gate remains active throughout and every confirmation is logged as part of the run record.  OSWorld scores the resulting system state rather than a human operator’s performance, so it applies only to the SynapseOS condition.  Condition B, which a human participant operates directly, has no equivalent and is instead evaluated through the custom cross-platform task suite administered in the user study (Section 1.2(b)).</w:t>
+        <w:t xml:space="preserve">SynapseOS is deployed on the Debian 13 (Trixie) environment matching the OSWorld evaluation setup [43].  Each benchmark task is executed through the conversational interface, and results are captured programmatically through the built-in telemetry system.  Each task is supplied to SynapseOS as a natural language instruction, and the resulting system state is compared against the expected outcome defined in the benchmark.  Because SynapseOS gates every command classified irreversible on explicit confirmation, benchmark runs are facilitator-attended rather than unattended; the confirmation gate remains active throughout and every confirmation is logged as part of the run record.  OSWorld scores the resulting system state rather than a human operator’s performance, so it applies only to the SynapseOS condition.  Condition B, which a human participant operates directly, has no equivalent and is instead evaluated through the custom cross-platform task suite administered in the user study (Section 1.2(b)).</w:t>
       </w:r>
     </w:p>
     <w:bookmarkEnd w:id="80"/>
@@ -6163,7 +6163,7 @@
         <w:pStyle w:val="FirstParagraph"/>
       </w:pPr>
       <w:r>
-        <w:t xml:space="preserve">The OSWorld benchmark is used as the primary evaluation standard because it is the only existing benchmark that evaluates computer-using agents in real operating system environments with real applications (Xie et al., 2024).  Its use allows SynapseOS results to be situated within the existing literature.</w:t>
+        <w:t xml:space="preserve">The OSWorld benchmark is used as the primary evaluation standard because it is the only existing benchmark that evaluates computer-using agents in real operating system environments with real applications [43].  Its use allows SynapseOS results to be situated within the existing literature.</w:t>
       </w:r>
     </w:p>
     <w:p>
@@ -6203,7 +6203,7 @@
         <w:pStyle w:val="BodyText"/>
       </w:pPr>
       <w:r>
-        <w:t xml:space="preserve">The dual-population design — novice and power users — directly addresses the gap identified in Chapter 1, where no prior work has evaluated a conversational interface across user populations with differing technical backgrounds (Xie et al., 2024).  The three data categories align with the three interface questions:</w:t>
+        <w:t xml:space="preserve">The dual-population design — novice and power users — directly addresses the gap identified in Chapter 1, where no prior work has evaluated a conversational interface across user populations with differing technical backgrounds [43].  The three data categories align with the three interface questions:</w:t>
       </w:r>
       <w:r>
         <w:t xml:space="preserve"> </w:t>
@@ -6583,7 +6583,7 @@
         <w:t xml:space="preserve"> </w:t>
       </w:r>
       <w:r>
-        <w:t xml:space="preserve">code-specialized model that demonstrated the strongest natural language-to-bash translation accuracy among models below 7B parameters in controlled evaluation (Westenfelder et al., 2025).  Among the models directly compared in that evaluation, its code-specialized pretraining produced a clear margin over general-purpose models of comparable or larger size — 58% NL2Bash accuracy with prompt engineering, versus 49% for Llama 3.2-3B and 37% for a LoRA-fine-tuned Llama 3.2-1B — attributable to Qwen2.5-Coder’s training corpus of 5.5 trillion code tokens against Llama 3.2's general-purpose pretraining.  At 4-bit quantization</w:t>
+        <w:t xml:space="preserve">code-specialized model that demonstrated the strongest natural language-to-bash translation accuracy among models below 7B parameters in controlled evaluation [40].  Among the models directly compared in that evaluation, its code-specialized pretraining produced a clear margin over general-purpose models of comparable or larger size — 58% NL2Bash accuracy with prompt engineering, versus 49% for Llama 3.2-3B and 37% for a LoRA-fine-tuned Llama 3.2-1B — attributable to Qwen2.5-Coder’s training corpus of 5.5 trillion code tokens against Llama 3.2's general-purpose pretraining.  At 4-bit quantization</w:t>
       </w:r>
       <w:hyperlink w:anchor="ch3-fn6">
         <w:r>
@@ -6633,15 +6633,15 @@
         <w:pStyle w:val="BodyText"/>
       </w:pPr>
       <w:r>
-        <w:t xml:space="preserve">Accuracy is measured using an execution-based scoring methodology rather than syntax-level string matching, following Westenfelder et al. (2025) — see Section 2.3 for the full evaluation procedure.</w:t>
-      </w:r>
-    </w:p>
-    <w:p>
-      <w:pPr>
-        <w:pStyle w:val="BodyText"/>
-      </w:pPr>
-      <w:r>
-        <w:t xml:space="preserve">This selection was reconfirmed against models released after the initial literature review, to guard against the fast-moving small-model landscape becoming stale before study execution; no smaller alternative offered comparable shell-generation evidence within the same CPU-only hardware budget (Jacobs et al., 2026).  Newer mixture-of-experts variants require all experts resident in memory regardless of active parameters per token, which is incompatible with this study’s memory budget, and newer general-purpose small models report reasoning benchmarks but no shell-command generation evidence.</w:t>
+        <w:t xml:space="preserve">Accuracy is measured using an execution-based scoring methodology rather than syntax-level string matching, following Westenfelder et al. [40] — see Section 2.3 for the full evaluation procedure.</w:t>
+      </w:r>
+    </w:p>
+    <w:p>
+      <w:pPr>
+        <w:pStyle w:val="BodyText"/>
+      </w:pPr>
+      <w:r>
+        <w:t xml:space="preserve">This selection was reconfirmed against models released after the initial literature review, to guard against the fast-moving small-model landscape becoming stale before study execution; no smaller alternative offered comparable shell-generation evidence within the same CPU-only hardware budget [16].  Newer mixture-of-experts variants require all experts resident in memory regardless of active parameters per token, which is incompatible with this study’s memory budget, and newer general-purpose small models report reasoning benchmarks but no shell-command generation evidence.</w:t>
       </w:r>
     </w:p>
     <w:bookmarkEnd w:id="87"/>
@@ -6659,15 +6659,15 @@
         <w:pStyle w:val="FirstParagraph"/>
       </w:pPr>
       <w:r>
-        <w:t xml:space="preserve">Once the intent parser produces a shell command, SynapseOS passes it through a confirmation gate and an undo journal before execution, following the reversibility-and-guardrail framing established for LLM-powered natural language shells (Gyawali et al., 2025) and the preview-and-confirm design guideline validated with motor-impaired users of an LLM-mediated assistive-robotics interface (Padmanabha et al., 2024).  The command is first classified by reversibility: operations that are irreversible — such as file deletion, system configuration changes, or destructive package operations — trigger a confirmation prompt requiring explicit user approval before execution proceeds.  Every executed command is recorded to a persistent undo journal before it runs.  Reversible operations are logged for replay-based reversal; a command classified irreversible and then approved is additionally captured by one of five mechanisms — full content backup, hardlink-based trash, git HEAD capture, permission-metadata capture, or, for package and service state, an inverse command — so that a command approved in error remains recoverable.  Rollback is invoked through a dedicated undo command rather than from within the conversation.  Once the gate has passed it, the command is dispatched to a bash subprocess.  Standard output and standard error are captured and rendered in the conversational surface as the system’s response to the original natural language input.</w:t>
-      </w:r>
-    </w:p>
-    <w:p>
-      <w:pPr>
-        <w:pStyle w:val="BodyText"/>
-      </w:pPr>
-      <w:r>
-        <w:t xml:space="preserve">SynapseOS executes only shell-expressible operations.  The system’s capability boundary is the Linux command-line toolchain: file management, process control, text processing, package management, network configuration, and any application that exposes a command-line interface.  GUI-only interactions — clicking buttons in graphical applications, navigating web page elements, or interacting with visual-only interfaces — are explicitly outside scope, in deliberate contrast to broader desktop agent frameworks that additionally orchestrate GUI automation atop the existing session (Zhang et al., 2025).  This boundary is intentional: it constrains the research to a tractable, verifiable claim that the system can be built, evaluated, and defended within the thesis timeline.</w:t>
+        <w:t xml:space="preserve">Once the intent parser produces a shell command, SynapseOS passes it through a confirmation gate and an undo journal before execution, following the reversibility-and-guardrail framing established for LLM-powered natural language shells [10] and the preview-and-confirm design guideline validated with motor-impaired users of an LLM-mediated assistive-robotics interface [30].  The command is first classified by reversibility: operations that are irreversible — such as file deletion, system configuration changes, or destructive package operations — trigger a confirmation prompt requiring explicit user approval before execution proceeds.  Every executed command is recorded to a persistent undo journal before it runs.  Reversible operations are logged for replay-based reversal; a command classified irreversible and then approved is additionally captured by one of five mechanisms — full content backup, hardlink-based trash, git HEAD capture, permission-metadata capture, or, for package and service state, an inverse command — so that a command approved in error remains recoverable.  Rollback is invoked through a dedicated undo command rather than from within the conversation.  Once the gate has passed it, the command is dispatched to a bash subprocess.  Standard output and standard error are captured and rendered in the conversational surface as the system’s response to the original natural language input.</w:t>
+      </w:r>
+    </w:p>
+    <w:p>
+      <w:pPr>
+        <w:pStyle w:val="BodyText"/>
+      </w:pPr>
+      <w:r>
+        <w:t xml:space="preserve">SynapseOS executes only shell-expressible operations.  The system’s capability boundary is the Linux command-line toolchain: file management, process control, text processing, package management, network configuration, and any application that exposes a command-line interface.  GUI-only interactions — clicking buttons in graphical applications, navigating web page elements, or interacting with visual-only interfaces — are explicitly outside scope, in deliberate contrast to broader desktop agent frameworks that additionally orchestrate GUI automation atop the existing session [47].  This boundary is intentional: it constrains the research to a tractable, verifiable claim that the system can be built, evaluated, and defended within the thesis timeline.</w:t>
       </w:r>
     </w:p>
     <w:bookmarkEnd w:id="88"/>
@@ -8379,7 +8379,7 @@
         <w:t xml:space="preserve"> </w:t>
       </w:r>
       <w:r>
-        <w:t xml:space="preserve">evaluated using an execution-based scoring methodology (Westenfelder et al., 2025) — each generated command is executed in a controlled environment and its resulting system state compared against a human-annotated expected outcome for each task utterance, rather than syntax-level string matching, with ambiguous cases resolved through LLM-assisted functional equivalence assessment at 95% confidence; accuracy is computed as the proportion of first-attempt matches</w:t>
+        <w:t xml:space="preserve">evaluated using an execution-based scoring methodology [40] — each generated command is executed in a controlled environment and its resulting system state compared against a human-annotated expected outcome for each task utterance, rather than syntax-level string matching, with ambiguous cases resolved through LLM-assisted functional equivalence assessment at 95% confidence; accuracy is computed as the proportion of first-attempt matches</w:t>
       </w:r>
     </w:p>
     <w:p>
@@ -8870,7 +8870,7 @@
         <w:pStyle w:val="FirstParagraph"/>
       </w:pPr>
       <w:r>
-        <w:t xml:space="preserve">The corpus is generated by a program, not assembled by hand, and is held as four partitions reported separately rather than pooled.  The first is NL2Bash (Lin et al., 2018), which supplies human-written commands and is the generalization set: candidates are drawn at random from the dataset with a recorded seed, excluding any command used during development.  The second is a set of parameterized command templates covering each shell composition operator — sequencing, conditional execution, pipelines, redirects, command substitution, loops,</w:t>
+        <w:t xml:space="preserve">The corpus is generated by a program, not assembled by hand, and is held as four partitions reported separately rather than pooled.  The first is NL2Bash [20], which supplies human-written commands and is the generalization set: candidates are drawn at random from the dataset with a recorded seed, excluding any command used during development.  The second is a set of parameterized command templates covering each shell composition operator — sequencing, conditional execution, pipelines, redirects, command substitution, loops,</w:t>
       </w:r>
       <w:r>
         <w:t xml:space="preserve"> </w:t>
@@ -9140,7 +9140,7 @@
         <w:pStyle w:val="BodyText"/>
       </w:pPr>
       <w:r>
-        <w:t xml:space="preserve">Because the first baseline was written by the same team, it was checked against command-safety checks that others ship.  Two open-source checks were scored on the same held-out corpus and labels reported in (g) below: the dangerous-command check of OpenAI’s Codex CLI (OpenAI, 2026), ported from its source and verified against that source’s own unit tests, and cc-safety-net (kenryu42, 2026), a pre-execution guard used with several agentic coding tools, run unmodified under each of its three presets.  On the 325 commands that destroy files, they let between 73% and 97% run with no confirmation and no capture, against 31% for the enumerated-pattern classifier, and neither makes any provision for recovery.  Both are designed for coding agents working inside a version-controlled project, where deleting project files is routine and version control is the safeguard, so these figures describe how they would serve a person’s own files, not how well they serve their intended purpose.  The first baseline is therefore the strictest enumerated list tested, and comparisons against it understate rather than overstate the analysis’s advantage over lists in current use.  No shipping tool was found that determines a command’s effects before it runs in order to capture what it would destroy; on recovery there is no external counterpart, which is the gap identified in Section 2.4.  The comparison is provided as supplementary material.</w:t>
+        <w:t xml:space="preserve">Because the first baseline was written by the same team, it was checked against command-safety checks that others ship.  Two open-source checks were scored on the same held-out corpus and labels reported in (g) below: the dangerous-command check of OpenAI’s Codex CLI [29], ported from its source and verified against that source’s own unit tests, and cc-safety-net [18], a pre-execution guard used with several agentic coding tools, run unmodified under each of its three presets.  On the 325 commands that destroy files, they let between 73% and 97% run with no confirmation and no capture, against 31% for the enumerated-pattern classifier, and neither makes any provision for recovery.  Both are designed for coding agents working inside a version-controlled project, where deleting project files is routine and version control is the safeguard, so these figures describe how they would serve a person’s own files, not how well they serve their intended purpose.  The first baseline is therefore the strictest enumerated list tested, and comparisons against it understate rather than overstate the analysis’s advantage over lists in current use.  No shipping tool was found that determines a command’s effects before it runs in order to capture what it would destroy; on recovery there is no external counterpart, which is the gap identified in Section 2.4.  The comparison is provided as supplementary material.</w:t>
       </w:r>
     </w:p>
     <w:bookmarkEnd w:id="98"/>
@@ -10658,7 +10658,7 @@
         <w:pStyle w:val="FirstParagraph"/>
       </w:pPr>
       <w:r>
-        <w:t xml:space="preserve">The system is evaluated against two datasets: the OSWorld benchmark task suite (Xie et al., 2024) for direct comparison with results in the existing literature, and the custom cross-platform task suite described in Sections 1.1 and 1.5.  The user study evaluation involves 40 participants (20 novice, 20 power users); the baseline condition is each participant’s primary operating system — Windows 11, macOS, or Linux with GNOME desktop — on a dedicated baseline machine.</w:t>
+        <w:t xml:space="preserve">The system is evaluated against two datasets: the OSWorld benchmark task suite [43] for direct comparison with results in the existing literature, and the custom cross-platform task suite described in Sections 1.1 and 1.5.  The user study evaluation involves 40 participants (20 novice, 20 power users); the baseline condition is each participant’s primary operating system — Windows 11, macOS, or Linux with GNOME desktop — on a dedicated baseline machine.</w:t>
       </w:r>
     </w:p>
     <w:bookmarkEnd w:id="105"/>
@@ -10823,7 +10823,7 @@
         <w:pStyle w:val="FirstParagraph"/>
       </w:pPr>
       <w:r>
-        <w:t xml:space="preserve">SUS scores are computed per the standard scoring procedure (Brooke, 1996) to produce a score on a 0–100 scale; a score above 68 is conventionally treated as above-average usability (Sauro and Lewis, 2016), and the instrument’s validity and interpretation across a large sample of studies are established by Bangor and colleagues (2008).  NASA-TLX scores are computed as the unweighted mean of the six subscale ratings (Hart and Staveland, 1988) to produce a composite workload score per participant per condition.  Because the central claim of this study concerns access rather than speed, workload and task success are treated as primary outcomes alongside completion time, not as secondary measures.</w:t>
+        <w:t xml:space="preserve">SUS scores are computed per the standard scoring procedure [4] to produce a score on a 0–100 scale; a score above 68 is conventionally treated as above-average usability [33], and the instrument’s validity and interpretation across a large sample of studies are established by Bangor and colleagues [1].  NASA-TLX scores are computed as the unweighted mean of the six subscale ratings [12] to produce a composite workload score per participant per condition.  Because the central claim of this study concerns access rather than speed, workload and task success are treated as primary outcomes alongside completion time, not as secondary measures.</w:t>
       </w:r>
     </w:p>
     <w:p>
@@ -10974,7 +10974,7 @@
         <w:pStyle w:val="BodyText"/>
       </w:pPr>
       <w:r>
-        <w:t xml:space="preserve">Qualitative data from post-study interviews is analyzed using reflexive thematic analysis following the six-phase procedure described by Braun and Clarke (2006): familiarization with the data, initial code generation, theme search, theme review, theme definition, and write-up.  In keeping with the reflexive approach, which treats the analyst’s interpretation as part of the method and does not compute inter-rater agreement, one member of the research team develops the codes and themes; the codebook and the excerpts that support each theme are retained so that the analysis can be audited.  Themes are reported alongside representative participant quotations.</w:t>
+        <w:t xml:space="preserve">Qualitative data from post-study interviews is analyzed using reflexive thematic analysis following the six-phase procedure described by Braun and Clarke [3]: familiarization with the data, initial code generation, theme search, theme review, theme definition, and write-up.  In keeping with the reflexive approach, which treats the analyst’s interpretation as part of the method and does not compute inter-rater agreement, one member of the research team develops the codes and themes; the codebook and the excerpts that support each theme are retained so that the analysis can be audited.  Themes are reported alongside representative participant quotations.</w:t>
       </w:r>
     </w:p>
     <w:bookmarkEnd w:id="112"/>
@@ -11436,7 +11436,10 @@
         <w:pStyle w:val="BodyText"/>
       </w:pPr>
       <w:r>
-        <w:t xml:space="preserve">Bangor, A., Kortum, P. T., &amp; Miller, J. T. (2008). An empirical evaluation of the System Usability Scale.</w:t>
+        <w:t xml:space="preserve">[1]</w:t>
+      </w:r>
+      <w:r>
+        <w:t xml:space="preserve">A. Bangor, P. T. Kortum, and J. T. Miller. 2008. An empirical evaluation of the System Usability Scale.</w:t>
       </w:r>
       <w:r>
         <w:t xml:space="preserve"> </w:t>
@@ -11446,18 +11449,24 @@
           <w:i/>
           <w:iCs/>
         </w:rPr>
-        <w:t xml:space="preserve">International Journal of Human–Computer Interaction, 24</w:t>
-      </w:r>
-      <w:r>
-        <w:t xml:space="preserve">(6), 574–594.</w:t>
-      </w:r>
-    </w:p>
-    <w:p>
-      <w:pPr>
-        <w:pStyle w:val="BodyText"/>
-      </w:pPr>
-      <w:r>
-        <w:t xml:space="preserve">Becker, B., Jeannerod, N., Marché, C., Régis-Gianas, Y., Sighireanu, M., &amp; Treinen, R. (2022). The CoLiS platform for the analysis of maintainer scripts in Debian software packages.</w:t>
+        <w:t xml:space="preserve">International Journal of Human–Computer Interaction</w:t>
+      </w:r>
+      <w:r>
+        <w:t xml:space="preserve"> </w:t>
+      </w:r>
+      <w:r>
+        <w:t xml:space="preserve">24, 6 (2008), 574–594.</w:t>
+      </w:r>
+    </w:p>
+    <w:p>
+      <w:pPr>
+        <w:pStyle w:val="BodyText"/>
+      </w:pPr>
+      <w:r>
+        <w:t xml:space="preserve">[2]</w:t>
+      </w:r>
+      <w:r>
+        <w:t xml:space="preserve">B. Becker, N. Jeannerod, C. Marché, Y. Régis-Gianas, M. Sighireanu, and R. Treinen. 2022. The CoLiS platform for the analysis of maintainer scripts in Debian software packages.</w:t>
       </w:r>
       <w:r>
         <w:t xml:space="preserve"> </w:t>
@@ -11467,18 +11476,24 @@
           <w:i/>
           <w:iCs/>
         </w:rPr>
-        <w:t xml:space="preserve">International Journal on Software Tools for Technology Transfer, 24</w:t>
-      </w:r>
-      <w:r>
-        <w:t xml:space="preserve">(5), 717–733.</w:t>
-      </w:r>
-    </w:p>
-    <w:p>
-      <w:pPr>
-        <w:pStyle w:val="BodyText"/>
-      </w:pPr>
-      <w:r>
-        <w:t xml:space="preserve">Braun, V., &amp; Clarke, V. (2006). Using thematic analysis in psychology.</w:t>
+        <w:t xml:space="preserve">International Journal on Software Tools for Technology Transfer</w:t>
+      </w:r>
+      <w:r>
+        <w:t xml:space="preserve"> </w:t>
+      </w:r>
+      <w:r>
+        <w:t xml:space="preserve">24, 5 (2022), 717–733.</w:t>
+      </w:r>
+    </w:p>
+    <w:p>
+      <w:pPr>
+        <w:pStyle w:val="BodyText"/>
+      </w:pPr>
+      <w:r>
+        <w:t xml:space="preserve">[3]</w:t>
+      </w:r>
+      <w:r>
+        <w:t xml:space="preserve">V. Braun and V. Clarke. 2006. Using thematic analysis in psychology.</w:t>
       </w:r>
       <w:r>
         <w:t xml:space="preserve"> </w:t>
@@ -11488,18 +11503,24 @@
           <w:i/>
           <w:iCs/>
         </w:rPr>
-        <w:t xml:space="preserve">Qualitative Research in Psychology, 3</w:t>
-      </w:r>
-      <w:r>
-        <w:t xml:space="preserve">(2), 77–101.</w:t>
-      </w:r>
-    </w:p>
-    <w:p>
-      <w:pPr>
-        <w:pStyle w:val="BodyText"/>
-      </w:pPr>
-      <w:r>
-        <w:t xml:space="preserve">Brooke, J. (1996). SUS: A "quick and dirty" usability scale. In P. W. Jordan, B. Thomas, I. L. McClelland, &amp; B. Weerdmeester (Eds.),</w:t>
+        <w:t xml:space="preserve">Qualitative Research in Psychology</w:t>
+      </w:r>
+      <w:r>
+        <w:t xml:space="preserve"> </w:t>
+      </w:r>
+      <w:r>
+        <w:t xml:space="preserve">3, 2 (2006), 77–101.</w:t>
+      </w:r>
+    </w:p>
+    <w:p>
+      <w:pPr>
+        <w:pStyle w:val="BodyText"/>
+      </w:pPr>
+      <w:r>
+        <w:t xml:space="preserve">[4]</w:t>
+      </w:r>
+      <w:r>
+        <w:t xml:space="preserve">J. Brooke. 1996. SUS: A “quick and dirty” usability scale. In</w:t>
       </w:r>
       <w:r>
         <w:t xml:space="preserve"> </w:t>
@@ -11512,18 +11533,18 @@
         <w:t xml:space="preserve">Usability Evaluation in Industry</w:t>
       </w:r>
       <w:r>
-        <w:t xml:space="preserve"> </w:t>
-      </w:r>
-      <w:r>
-        <w:t xml:space="preserve">(pp. 189–194). Taylor &amp; Francis.</w:t>
-      </w:r>
-    </w:p>
-    <w:p>
-      <w:pPr>
-        <w:pStyle w:val="BodyText"/>
-      </w:pPr>
-      <w:r>
-        <w:t xml:space="preserve">Clark, L., Pantidi, N., Cooney, O., Doyle, P. R., Garaialde, D., Edwards, J., Spillane, B., Gilmartin, E., Murad, C., Munteanu, C., Wade, V., &amp; Cowan, B. R. (2019). What makes a good conversation? Challenges in designing truly conversational agents. In</w:t>
+        <w:t xml:space="preserve">, P. W. Jordan, B. Thomas, I. L. McClelland, and B. Weerdmeester (Eds.). Taylor &amp; Francis, 189–194.</w:t>
+      </w:r>
+    </w:p>
+    <w:p>
+      <w:pPr>
+        <w:pStyle w:val="BodyText"/>
+      </w:pPr>
+      <w:r>
+        <w:t xml:space="preserve">[5]</w:t>
+      </w:r>
+      <w:r>
+        <w:t xml:space="preserve">L. Clark, N. Pantidi, O. Cooney, P. R. Doyle, D. Garaialde, J. Edwards, B. Spillane, E. Gilmartin, C. Murad, C. Munteanu, V. Wade, and B. R. Cowan. 2019. What makes a good conversation? Challenges in designing truly conversational agents. In</w:t>
       </w:r>
       <w:r>
         <w:t xml:space="preserve"> </w:t>
@@ -11533,18 +11554,21 @@
           <w:i/>
           <w:iCs/>
         </w:rPr>
-        <w:t xml:space="preserve">Proceedings of the 2019 CHI Conference on Human Factors in Computing Systems (CHI '19)</w:t>
-      </w:r>
-      <w:r>
-        <w:t xml:space="preserve">, Paper 475, 1–12.</w:t>
-      </w:r>
-    </w:p>
-    <w:p>
-      <w:pPr>
-        <w:pStyle w:val="BodyText"/>
-      </w:pPr>
-      <w:r>
-        <w:t xml:space="preserve">Cousot, P., &amp; Cousot, R. (1977). Abstract interpretation: A unified lattice model for static analysis of programs by construction or approximation of fixpoints.</w:t>
+        <w:t xml:space="preserve">Proceedings of the 2019 CHI Conference on Human Factors in Computing Systems (CHI ’19)</w:t>
+      </w:r>
+      <w:r>
+        <w:t xml:space="preserve">. ACM, Article 475, 12 pages.</w:t>
+      </w:r>
+    </w:p>
+    <w:p>
+      <w:pPr>
+        <w:pStyle w:val="BodyText"/>
+      </w:pPr>
+      <w:r>
+        <w:t xml:space="preserve">[6]</w:t>
+      </w:r>
+      <w:r>
+        <w:t xml:space="preserve">P. Cousot and R. Cousot. 1977. Abstract interpretation: A unified lattice model for static analysis of programs by construction or approximation of fixpoints. In</w:t>
       </w:r>
       <w:r>
         <w:t xml:space="preserve"> </w:t>
@@ -11554,18 +11578,21 @@
           <w:i/>
           <w:iCs/>
         </w:rPr>
-        <w:t xml:space="preserve">Conference Record of the Sixth Annual ACM SIGPLAN-SIGACT Symposium on Principles of Programming Languages (POPL '77)</w:t>
-      </w:r>
-      <w:r>
-        <w:t xml:space="preserve">, 238–252.</w:t>
-      </w:r>
-    </w:p>
-    <w:p>
-      <w:pPr>
-        <w:pStyle w:val="BodyText"/>
-      </w:pPr>
-      <w:r>
-        <w:t xml:space="preserve">Creswell, J. W., &amp; Plano Clark, V. L. (2018).</w:t>
+        <w:t xml:space="preserve">Conference Record of the Sixth Annual ACM SIGPLAN-SIGACT Symposium on Principles of Programming Languages (POPL ’77)</w:t>
+      </w:r>
+      <w:r>
+        <w:t xml:space="preserve">. ACM, 238–252.</w:t>
+      </w:r>
+    </w:p>
+    <w:p>
+      <w:pPr>
+        <w:pStyle w:val="BodyText"/>
+      </w:pPr>
+      <w:r>
+        <w:t xml:space="preserve">[7]</w:t>
+      </w:r>
+      <w:r>
+        <w:t xml:space="preserve">J. W. Creswell and V. L. Plano Clark. 2018.</w:t>
       </w:r>
       <w:r>
         <w:t xml:space="preserve"> </w:t>
@@ -11589,7 +11616,10 @@
         <w:pStyle w:val="BodyText"/>
       </w:pPr>
       <w:r>
-        <w:t xml:space="preserve">Deng, X., Gu, Y., Zheng, B., Chen, S., Stevens, S., Wang, B., Sun, H., &amp; Su, Y. (2023). Mind2Web: Towards a Generalist Agent for the Web. In</w:t>
+        <w:t xml:space="preserve">[8]</w:t>
+      </w:r>
+      <w:r>
+        <w:t xml:space="preserve">X. Deng, Y. Gu, B. Zheng, S. Chen, S. Stevens, B. Wang, H. Sun, and Y. Su. 2023. Mind2Web: Towards a Generalist Agent for the Web. In</w:t>
       </w:r>
       <w:r>
         <w:t xml:space="preserve"> </w:t>
@@ -11610,7 +11640,10 @@
         <w:pStyle w:val="BodyText"/>
       </w:pPr>
       <w:r>
-        <w:t xml:space="preserve">Greenberg, M., &amp; Blatt, A. J. (2020). Executable formal semantics for the POSIX shell.</w:t>
+        <w:t xml:space="preserve">[9]</w:t>
+      </w:r>
+      <w:r>
+        <w:t xml:space="preserve">M. Greenberg and A. J. Blatt. 2020. Executable formal semantics for the POSIX shell.</w:t>
       </w:r>
       <w:r>
         <w:t xml:space="preserve"> </w:t>
@@ -11620,18 +11653,46 @@
           <w:i/>
           <w:iCs/>
         </w:rPr>
-        <w:t xml:space="preserve">Proceedings of the ACM on Programming Languages, 4</w:t>
-      </w:r>
-      <w:r>
-        <w:t xml:space="preserve">(POPL), Article 43.</w:t>
-      </w:r>
-    </w:p>
-    <w:p>
-      <w:pPr>
-        <w:pStyle w:val="BodyText"/>
-      </w:pPr>
-      <w:r>
-        <w:t xml:space="preserve">Gyawali, B. R., Achalla, S., Kallas, K., &amp; Kumar, S. (2025). NaSh: Guardrails for an LLM-Powered Natural Language Shell.</w:t>
+        <w:t xml:space="preserve">Proceedings of the ACM on Programming Languages</w:t>
+      </w:r>
+      <w:r>
+        <w:t xml:space="preserve"> </w:t>
+      </w:r>
+      <w:r>
+        <w:t xml:space="preserve">4, POPL, Article 43 (2020).</w:t>
+      </w:r>
+    </w:p>
+    <w:p>
+      <w:pPr>
+        <w:pStyle w:val="BodyText"/>
+      </w:pPr>
+      <w:r>
+        <w:t xml:space="preserve">[10]</w:t>
+      </w:r>
+      <w:r>
+        <w:t xml:space="preserve">B. R. Gyawali, S. Achalla, K. Kallas, and S. Kumar. 2025. NaSh: Guardrails for an LLM-Powered Natural Language Shell. arXiv:2506.13028</w:t>
+      </w:r>
+    </w:p>
+    <w:p>
+      <w:pPr>
+        <w:pStyle w:val="BodyText"/>
+      </w:pPr>
+      <w:r>
+        <w:t xml:space="preserve">[11]</w:t>
+      </w:r>
+      <w:r>
+        <w:t xml:space="preserve">W. Han, Z. Zeng, J. Huang, S. Jiang, et al. 2025. GUIRoboTron-Speech: Towards Automated GUI Agents Based on Speech Instructions. arXiv:2506.11127</w:t>
+      </w:r>
+    </w:p>
+    <w:p>
+      <w:pPr>
+        <w:pStyle w:val="BodyText"/>
+      </w:pPr>
+      <w:r>
+        <w:t xml:space="preserve">[12]</w:t>
+      </w:r>
+      <w:r>
+        <w:t xml:space="preserve">S. G. Hart and L. E. Staveland. 1988. Development of NASA-TLX (Task Load Index): Results of empirical and theoretical research. In</w:t>
       </w:r>
       <w:r>
         <w:t xml:space="preserve"> </w:t>
@@ -11641,18 +11702,21 @@
           <w:i/>
           <w:iCs/>
         </w:rPr>
-        <w:t xml:space="preserve">arXiv:2506.13028</w:t>
-      </w:r>
-      <w:r>
-        <w:t xml:space="preserve">.</w:t>
-      </w:r>
-    </w:p>
-    <w:p>
-      <w:pPr>
-        <w:pStyle w:val="BodyText"/>
-      </w:pPr>
-      <w:r>
-        <w:t xml:space="preserve">Han, W., Zeng, Z., Huang, J., Jiang, S., et al. (2025). GUIRoboTron-Speech: Towards Automated GUI Agents Based on Speech Instructions.</w:t>
+        <w:t xml:space="preserve">Human Mental Workload</w:t>
+      </w:r>
+      <w:r>
+        <w:t xml:space="preserve">, P. A. Hancock and N. Meshkati (Eds.). Advances in Psychology, Vol. 52. North-Holland, 139–183.</w:t>
+      </w:r>
+    </w:p>
+    <w:p>
+      <w:pPr>
+        <w:pStyle w:val="BodyText"/>
+      </w:pPr>
+      <w:r>
+        <w:t xml:space="preserve">[13]</w:t>
+      </w:r>
+      <w:r>
+        <w:t xml:space="preserve">W. Hong, W. Wang, Q. Lv, J. Xu, W. Yu, J. Ji, Y. Wang, Z. Wang, Y. Zhang, J. Li, B. Xu, Y. Dong, M. Ding, and J. Tang. 2024. CogAgent: A Visual Language Model for GUI Agents. In</w:t>
       </w:r>
       <w:r>
         <w:t xml:space="preserve"> </w:t>
@@ -11662,7 +11726,7 @@
           <w:i/>
           <w:iCs/>
         </w:rPr>
-        <w:t xml:space="preserve">arXiv:2506.11127</w:t>
+        <w:t xml:space="preserve">Proceedings of CVPR 2024</w:t>
       </w:r>
       <w:r>
         <w:t xml:space="preserve">.</w:t>
@@ -11673,7 +11737,21 @@
         <w:pStyle w:val="BodyText"/>
       </w:pPr>
       <w:r>
-        <w:t xml:space="preserve">Hart, S. G., &amp; Staveland, L. E. (1988). Development of NASA-TLX (Task Load Index): Results of empirical and theoretical research. In P. A. Hancock &amp; N. Meshkati (Eds.),</w:t>
+        <w:t xml:space="preserve">[14]</w:t>
+      </w:r>
+      <w:r>
+        <w:t xml:space="preserve">T. Hui, Y. Zhang, B. Jiang, J. Sun, F. Cheng, X. Lin, and Y. Yang. 2025. WinClick: GUI Grounding with Multimodal Large Language Models. arXiv:2503.04730</w:t>
+      </w:r>
+    </w:p>
+    <w:p>
+      <w:pPr>
+        <w:pStyle w:val="BodyText"/>
+      </w:pPr>
+      <w:r>
+        <w:t xml:space="preserve">[15]</w:t>
+      </w:r>
+      <w:r>
+        <w:t xml:space="preserve">E. L. Hutchins, J. D. Hollan, and D. A. Norman. 1985. Direct manipulation interfaces.</w:t>
       </w:r>
       <w:r>
         <w:t xml:space="preserve"> </w:t>
@@ -11683,21 +11761,24 @@
           <w:i/>
           <w:iCs/>
         </w:rPr>
-        <w:t xml:space="preserve">Human Mental Workload</w:t>
-      </w:r>
-      <w:r>
-        <w:t xml:space="preserve"> </w:t>
-      </w:r>
-      <w:r>
-        <w:t xml:space="preserve">(Advances in Psychology, Vol. 52, pp. 139–183). North-Holland.</w:t>
-      </w:r>
-    </w:p>
-    <w:p>
-      <w:pPr>
-        <w:pStyle w:val="BodyText"/>
-      </w:pPr>
-      <w:r>
-        <w:t xml:space="preserve">Hong, W., Wang, W., Lv, Q., Xu, J., Yu, W., Ji, J., Wang, Y., Wang, Z., Zhang, Y., Li, J., Xu, B., Dong, Y., Ding, M., &amp; Tang, J. (2024). CogAgent: A Visual Language Model for GUI Agents. In</w:t>
+        <w:t xml:space="preserve">Human–Computer Interaction</w:t>
+      </w:r>
+      <w:r>
+        <w:t xml:space="preserve"> </w:t>
+      </w:r>
+      <w:r>
+        <w:t xml:space="preserve">1, 4 (1985), 311–338.</w:t>
+      </w:r>
+    </w:p>
+    <w:p>
+      <w:pPr>
+        <w:pStyle w:val="BodyText"/>
+      </w:pPr>
+      <w:r>
+        <w:t xml:space="preserve">[16]</w:t>
+      </w:r>
+      <w:r>
+        <w:t xml:space="preserve">J. Jacobs, J. Lapon, and V. Naessens. 2026. Local LLMs for NL2Bash: A Large-Scale Open-Source Model Evaluation for Bash Command Generation. In</w:t>
       </w:r>
       <w:r>
         <w:t xml:space="preserve"> </w:t>
@@ -11707,7 +11788,7 @@
           <w:i/>
           <w:iCs/>
         </w:rPr>
-        <w:t xml:space="preserve">Proceedings of CVPR 2024</w:t>
+        <w:t xml:space="preserve">NDSS Workshop on LLM Assisted Security and Trust Exploration (LAST-X 2026)</w:t>
       </w:r>
       <w:r>
         <w:t xml:space="preserve">.</w:t>
@@ -11718,7 +11799,10 @@
         <w:pStyle w:val="BodyText"/>
       </w:pPr>
       <w:r>
-        <w:t xml:space="preserve">Hui, T., Zhang, Y., Jiang, B., Sun, J., Cheng, F., Lin, X., &amp; Yang, Y. (2025). WinClick: GUI Grounding with Multimodal Large Language Models.</w:t>
+        <w:t xml:space="preserve">[17]</w:t>
+      </w:r>
+      <w:r>
+        <w:t xml:space="preserve">P. Jouvelot and D. K. Gifford. 1991. Algebraic reconstruction of types and effects. In</w:t>
       </w:r>
       <w:r>
         <w:t xml:space="preserve"> </w:t>
@@ -11728,18 +11812,21 @@
           <w:i/>
           <w:iCs/>
         </w:rPr>
-        <w:t xml:space="preserve">arXiv:2503.04730</w:t>
-      </w:r>
-      <w:r>
-        <w:t xml:space="preserve">.</w:t>
-      </w:r>
-    </w:p>
-    <w:p>
-      <w:pPr>
-        <w:pStyle w:val="BodyText"/>
-      </w:pPr>
-      <w:r>
-        <w:t xml:space="preserve">Hutchins, E. L., Hollan, J. D., &amp; Norman, D. A. (1985). Direct manipulation interfaces.</w:t>
+        <w:t xml:space="preserve">Proceedings of the 18th ACM SIGPLAN-SIGACT Symposium on Principles of Programming Languages (POPL ’91)</w:t>
+      </w:r>
+      <w:r>
+        <w:t xml:space="preserve">. ACM, 303–310.</w:t>
+      </w:r>
+    </w:p>
+    <w:p>
+      <w:pPr>
+        <w:pStyle w:val="BodyText"/>
+      </w:pPr>
+      <w:r>
+        <w:t xml:space="preserve">[18]</w:t>
+      </w:r>
+      <w:r>
+        <w:t xml:space="preserve">kenryu42. 2026.</w:t>
       </w:r>
       <w:r>
         <w:t xml:space="preserve"> </w:t>
@@ -11749,18 +11836,21 @@
           <w:i/>
           <w:iCs/>
         </w:rPr>
-        <w:t xml:space="preserve">Human–Computer Interaction, 1</w:t>
-      </w:r>
-      <w:r>
-        <w:t xml:space="preserve">(4), 311–338.</w:t>
-      </w:r>
-    </w:p>
-    <w:p>
-      <w:pPr>
-        <w:pStyle w:val="BodyText"/>
-      </w:pPr>
-      <w:r>
-        <w:t xml:space="preserve">Jacobs, J., Lapon, J., &amp; Naessens, V. (2026). Local LLMs for NL2Bash: A Large-Scale Open-Source Model Evaluation for Bash Command Generation.</w:t>
+        <w:t xml:space="preserve">cc-safety-net</w:t>
+      </w:r>
+      <w:r>
+        <w:t xml:space="preserve">. https://github.com/kenryu42/cc-safety-net Version 2.6.1.</w:t>
+      </w:r>
+    </w:p>
+    <w:p>
+      <w:pPr>
+        <w:pStyle w:val="BodyText"/>
+      </w:pPr>
+      <w:r>
+        <w:t xml:space="preserve">[19]</w:t>
+      </w:r>
+      <w:r>
+        <w:t xml:space="preserve">Y. Li, J. He, X. Zhou, Y. Zhang, and J. Baldridge. 2020. Mapping Natural Language Instructions to Mobile UI Action Sequences. In</w:t>
       </w:r>
       <w:r>
         <w:t xml:space="preserve"> </w:t>
@@ -11770,18 +11860,21 @@
           <w:i/>
           <w:iCs/>
         </w:rPr>
-        <w:t xml:space="preserve">NDSS Workshop on LLM Assisted Security and Trust Exploration (LAST-X 2026)</w:t>
-      </w:r>
-      <w:r>
-        <w:t xml:space="preserve">.</w:t>
-      </w:r>
-    </w:p>
-    <w:p>
-      <w:pPr>
-        <w:pStyle w:val="BodyText"/>
-      </w:pPr>
-      <w:r>
-        <w:t xml:space="preserve">Jouvelot, P., &amp; Gifford, D. K. (1991). Algebraic reconstruction of types and effects.</w:t>
+        <w:t xml:space="preserve">Proceedings of ACL 2020</w:t>
+      </w:r>
+      <w:r>
+        <w:t xml:space="preserve">. 8198–8210.</w:t>
+      </w:r>
+    </w:p>
+    <w:p>
+      <w:pPr>
+        <w:pStyle w:val="BodyText"/>
+      </w:pPr>
+      <w:r>
+        <w:t xml:space="preserve">[20]</w:t>
+      </w:r>
+      <w:r>
+        <w:t xml:space="preserve">X. V. Lin, C. Wang, L. Zettlemoyer, and M. D. Ernst. 2018. NL2Bash: A corpus and semantic parser for natural language interface to the Linux operating system. In</w:t>
       </w:r>
       <w:r>
         <w:t xml:space="preserve"> </w:t>
@@ -11791,18 +11884,43 @@
           <w:i/>
           <w:iCs/>
         </w:rPr>
-        <w:t xml:space="preserve">Proceedings of the 18th ACM SIGPLAN-SIGACT Symposium on Principles of Programming Languages (POPL '91)</w:t>
-      </w:r>
-      <w:r>
-        <w:t xml:space="preserve">, 303–310.</w:t>
-      </w:r>
-    </w:p>
-    <w:p>
-      <w:pPr>
-        <w:pStyle w:val="BodyText"/>
-      </w:pPr>
-      <w:r>
-        <w:t xml:space="preserve">kenryu42. (2026).</w:t>
+        <w:t xml:space="preserve">Proceedings of the Eleventh International Conference on Language Resources and Evaluation (LREC 2018)</w:t>
+      </w:r>
+      <w:r>
+        <w:t xml:space="preserve">. European Language Resources Association.</w:t>
+      </w:r>
+    </w:p>
+    <w:p>
+      <w:pPr>
+        <w:pStyle w:val="BodyText"/>
+      </w:pPr>
+      <w:r>
+        <w:t xml:space="preserve">[21]</w:t>
+      </w:r>
+      <w:r>
+        <w:t xml:space="preserve">R. Liu, T. Zhe, D. Wang, Z. Yao, K. Liu, Y. Fu, H. Liu, and J. Pei. 2026. AgentOS: From Application Silos to a Natural Language-Driven Data Ecosystem. arXiv:2603.08938</w:t>
+      </w:r>
+    </w:p>
+    <w:p>
+      <w:pPr>
+        <w:pStyle w:val="BodyText"/>
+      </w:pPr>
+      <w:r>
+        <w:t xml:space="preserve">[22]</w:t>
+      </w:r>
+      <w:r>
+        <w:t xml:space="preserve">J. Lu, Z. Zhang, F. Yang, J. Zhang, L. Wang, C. Du, Q. Lin, S. Rajmohan, D. Zhang, and Q. Zhang. 2024. AXIS: Efficient Human-Agent-Computer Interaction with API-First LLM-Based Agents. arXiv:2409.17140</w:t>
+      </w:r>
+    </w:p>
+    <w:p>
+      <w:pPr>
+        <w:pStyle w:val="BodyText"/>
+      </w:pPr>
+      <w:r>
+        <w:t xml:space="preserve">[23]</w:t>
+      </w:r>
+      <w:r>
+        <w:t xml:space="preserve">E. Luger and A. Sellen. 2016. “Like having a really bad PA”: The gulf between user expectation and experience of conversational agents. In</w:t>
       </w:r>
       <w:r>
         <w:t xml:space="preserve"> </w:t>
@@ -11812,21 +11930,21 @@
           <w:i/>
           <w:iCs/>
         </w:rPr>
-        <w:t xml:space="preserve">cc-safety-net</w:t>
-      </w:r>
-      <w:r>
-        <w:t xml:space="preserve"> </w:t>
-      </w:r>
-      <w:r>
-        <w:t xml:space="preserve">(Version 2.6.1) [Computer software]. GitHub repository kenryu42/cc-safety-net.</w:t>
-      </w:r>
-    </w:p>
-    <w:p>
-      <w:pPr>
-        <w:pStyle w:val="BodyText"/>
-      </w:pPr>
-      <w:r>
-        <w:t xml:space="preserve">Li, Y., He, J., Zhou, X., Zhang, Y., &amp; Baldridge, J. (2020). Mapping Natural Language Instructions to Mobile UI Action Sequences. In</w:t>
+        <w:t xml:space="preserve">Proceedings of the 2016 CHI Conference on Human Factors in Computing Systems (CHI ’16)</w:t>
+      </w:r>
+      <w:r>
+        <w:t xml:space="preserve">. ACM, 5286–5297.</w:t>
+      </w:r>
+    </w:p>
+    <w:p>
+      <w:pPr>
+        <w:pStyle w:val="BodyText"/>
+      </w:pPr>
+      <w:r>
+        <w:t xml:space="preserve">[24]</w:t>
+      </w:r>
+      <w:r>
+        <w:t xml:space="preserve">K. Mazurak and S. Zdancewic. 2007. ABASH: Finding bugs in bash scripts. In</w:t>
       </w:r>
       <w:r>
         <w:t xml:space="preserve"> </w:t>
@@ -11836,18 +11954,43 @@
           <w:i/>
           <w:iCs/>
         </w:rPr>
-        <w:t xml:space="preserve">Proceedings of ACL 2020</w:t>
-      </w:r>
-      <w:r>
-        <w:t xml:space="preserve">, 8198–8210.</w:t>
-      </w:r>
-    </w:p>
-    <w:p>
-      <w:pPr>
-        <w:pStyle w:val="BodyText"/>
-      </w:pPr>
-      <w:r>
-        <w:t xml:space="preserve">Lin, X. V., Wang, C., Zettlemoyer, L., &amp; Ernst, M. D. (2018). NL2Bash: A corpus and semantic parser for natural language interface to the Linux operating system.</w:t>
+        <w:t xml:space="preserve">Proceedings of the 2007 Workshop on Programming Languages and Analysis for Security (PLAS ’07)</w:t>
+      </w:r>
+      <w:r>
+        <w:t xml:space="preserve">. ACM.</w:t>
+      </w:r>
+    </w:p>
+    <w:p>
+      <w:pPr>
+        <w:pStyle w:val="BodyText"/>
+      </w:pPr>
+      <w:r>
+        <w:t xml:space="preserve">[25]</w:t>
+      </w:r>
+      <w:r>
+        <w:t xml:space="preserve">S. Mehendale and A. Walishetti. 2024. DexAssist: A Voice-Enabled Dual-LLM Framework for Accessible Web Navigation. arXiv:2411.12214</w:t>
+      </w:r>
+    </w:p>
+    <w:p>
+      <w:pPr>
+        <w:pStyle w:val="BodyText"/>
+      </w:pPr>
+      <w:r>
+        <w:t xml:space="preserve">[26]</w:t>
+      </w:r>
+      <w:r>
+        <w:t xml:space="preserve">R. Niu, J. Li, S. Wang, Y. Fu, X. Hu, X. Leng, H. Kong, Y. Chang, and Q. Wang. 2024. ScreenAgent: A Vision Language Model-driven Computer Control Agent. arXiv:2402.07945</w:t>
+      </w:r>
+    </w:p>
+    <w:p>
+      <w:pPr>
+        <w:pStyle w:val="BodyText"/>
+      </w:pPr>
+      <w:r>
+        <w:t xml:space="preserve">[27]</w:t>
+      </w:r>
+      <w:r>
+        <w:t xml:space="preserve">D. A. Norman. 1981. The trouble with UNIX: The user interface is horrid.</w:t>
       </w:r>
       <w:r>
         <w:t xml:space="preserve"> </w:t>
@@ -11857,18 +12000,24 @@
           <w:i/>
           <w:iCs/>
         </w:rPr>
-        <w:t xml:space="preserve">Proceedings of the Eleventh International Conference on Language Resources and Evaluation (LREC 2018)</w:t>
-      </w:r>
-      <w:r>
-        <w:t xml:space="preserve">. European Language Resources Association.</w:t>
-      </w:r>
-    </w:p>
-    <w:p>
-      <w:pPr>
-        <w:pStyle w:val="BodyText"/>
-      </w:pPr>
-      <w:r>
-        <w:t xml:space="preserve">Liu, R., Zhe, T., Wang, D., Yao, Z., Liu, K., Fu, Y., Liu, H., &amp; Pei, J. (2026). AgentOS: From Application Silos to a Natural Language-Driven Data Ecosystem.</w:t>
+        <w:t xml:space="preserve">Datamation</w:t>
+      </w:r>
+      <w:r>
+        <w:t xml:space="preserve"> </w:t>
+      </w:r>
+      <w:r>
+        <w:t xml:space="preserve">27, 12 (1981), 139–150.</w:t>
+      </w:r>
+    </w:p>
+    <w:p>
+      <w:pPr>
+        <w:pStyle w:val="BodyText"/>
+      </w:pPr>
+      <w:r>
+        <w:t xml:space="preserve">[28]</w:t>
+      </w:r>
+      <w:r>
+        <w:t xml:space="preserve">D. A. Norman. 1986. Cognitive engineering. In</w:t>
       </w:r>
       <w:r>
         <w:t xml:space="preserve"> </w:t>
@@ -11878,18 +12027,21 @@
           <w:i/>
           <w:iCs/>
         </w:rPr>
-        <w:t xml:space="preserve">arXiv:2603.08938</w:t>
-      </w:r>
-      <w:r>
-        <w:t xml:space="preserve">.</w:t>
-      </w:r>
-    </w:p>
-    <w:p>
-      <w:pPr>
-        <w:pStyle w:val="BodyText"/>
-      </w:pPr>
-      <w:r>
-        <w:t xml:space="preserve">Lu, J., Zhang, Z., Yang, F., Zhang, J., Wang, L., Du, C., Lin, Q., Rajmohan, S., Zhang, D., &amp; Zhang, Q. (2024). AXIS: Efficient Human-Agent-Computer Interaction with API-First LLM-Based Agents.</w:t>
+        <w:t xml:space="preserve">User Centered System Design: New Perspectives on Human-Computer Interaction</w:t>
+      </w:r>
+      <w:r>
+        <w:t xml:space="preserve">, D. A. Norman and S. W. Draper (Eds.). Lawrence Erlbaum Associates, 31–61.</w:t>
+      </w:r>
+    </w:p>
+    <w:p>
+      <w:pPr>
+        <w:pStyle w:val="BodyText"/>
+      </w:pPr>
+      <w:r>
+        <w:t xml:space="preserve">[29]</w:t>
+      </w:r>
+      <w:r>
+        <w:t xml:space="preserve">OpenAI. 2026.</w:t>
       </w:r>
       <w:r>
         <w:t xml:space="preserve"> </w:t>
@@ -11899,18 +12051,21 @@
           <w:i/>
           <w:iCs/>
         </w:rPr>
-        <w:t xml:space="preserve">arXiv:2409.17140</w:t>
-      </w:r>
-      <w:r>
-        <w:t xml:space="preserve">.</w:t>
-      </w:r>
-    </w:p>
-    <w:p>
-      <w:pPr>
-        <w:pStyle w:val="BodyText"/>
-      </w:pPr>
-      <w:r>
-        <w:t xml:space="preserve">Luger, E., &amp; Sellen, A. (2016). "Like having a really bad PA": The gulf between user expectation and experience of conversational agents. In</w:t>
+        <w:t xml:space="preserve">Codex CLI</w:t>
+      </w:r>
+      <w:r>
+        <w:t xml:space="preserve">. https://github.com/openai/codex Commit 1f4c473.</w:t>
+      </w:r>
+    </w:p>
+    <w:p>
+      <w:pPr>
+        <w:pStyle w:val="BodyText"/>
+      </w:pPr>
+      <w:r>
+        <w:t xml:space="preserve">[30]</w:t>
+      </w:r>
+      <w:r>
+        <w:t xml:space="preserve">A. Padmanabha, J. Yuan, J. Gupta, Z. Karachiwalla, C. Majidi, H. Admoni, and Z. Erickson. 2024. VoicePilot: Harnessing LLMs as Speech Interfaces for Physically Assistive Robots. In</w:t>
       </w:r>
       <w:r>
         <w:t xml:space="preserve"> </w:t>
@@ -11920,18 +12075,21 @@
           <w:i/>
           <w:iCs/>
         </w:rPr>
-        <w:t xml:space="preserve">Proceedings of the 2016 CHI Conference on Human Factors in Computing Systems (CHI '16)</w:t>
-      </w:r>
-      <w:r>
-        <w:t xml:space="preserve">, 5286–5297.</w:t>
-      </w:r>
-    </w:p>
-    <w:p>
-      <w:pPr>
-        <w:pStyle w:val="BodyText"/>
-      </w:pPr>
-      <w:r>
-        <w:t xml:space="preserve">Mazurak, K., &amp; Zdancewic, S. (2007). ABASH: Finding bugs in bash scripts.</w:t>
+        <w:t xml:space="preserve">Proceedings of the 37th Annual ACM Symposium on User Interface Software and Technology (UIST ’24)</w:t>
+      </w:r>
+      <w:r>
+        <w:t xml:space="preserve">. ACM.</w:t>
+      </w:r>
+    </w:p>
+    <w:p>
+      <w:pPr>
+        <w:pStyle w:val="BodyText"/>
+      </w:pPr>
+      <w:r>
+        <w:t xml:space="preserve">[31]</w:t>
+      </w:r>
+      <w:r>
+        <w:t xml:space="preserve">J. Park, P. Tang, S. Das, S. Appalaraju, K. Y. Singh, R. Manmatha, and S. Ghadar. 2025. R-VLM: Region-aware Vision Language Model for Precise GUI Grounding. In</w:t>
       </w:r>
       <w:r>
         <w:t xml:space="preserve"> </w:t>
@@ -11941,18 +12099,21 @@
           <w:i/>
           <w:iCs/>
         </w:rPr>
-        <w:t xml:space="preserve">Proceedings of the 2007 Workshop on Programming Languages and Analysis for Security (PLAS '07)</w:t>
-      </w:r>
-      <w:r>
-        <w:t xml:space="preserve">.</w:t>
-      </w:r>
-    </w:p>
-    <w:p>
-      <w:pPr>
-        <w:pStyle w:val="BodyText"/>
-      </w:pPr>
-      <w:r>
-        <w:t xml:space="preserve">Mehendale, S., &amp; Walishetti, A. (2024). DexAssist: A Voice-Enabled Dual-LLM Framework for Accessible Web Navigation.</w:t>
+        <w:t xml:space="preserve">Findings of the Association for Computational Linguistics: ACL 2025</w:t>
+      </w:r>
+      <w:r>
+        <w:t xml:space="preserve">. 9669–9685.</w:t>
+      </w:r>
+    </w:p>
+    <w:p>
+      <w:pPr>
+        <w:pStyle w:val="BodyText"/>
+      </w:pPr>
+      <w:r>
+        <w:t xml:space="preserve">[32]</w:t>
+      </w:r>
+      <w:r>
+        <w:t xml:space="preserve">C. Rawles, A. Li, D. Rodriguez, O. Riva, and T. Lillicrap. 2023. Android in the Wild: A Large-Scale Dataset for Android Device Control. In</w:t>
       </w:r>
       <w:r>
         <w:t xml:space="preserve"> </w:t>
@@ -11962,7 +12123,7 @@
           <w:i/>
           <w:iCs/>
         </w:rPr>
-        <w:t xml:space="preserve">arXiv:2411.12214</w:t>
+        <w:t xml:space="preserve">Advances in Neural Information Processing Systems 36 (NeurIPS 2023)</w:t>
       </w:r>
       <w:r>
         <w:t xml:space="preserve">.</w:t>
@@ -11973,7 +12134,10 @@
         <w:pStyle w:val="BodyText"/>
       </w:pPr>
       <w:r>
-        <w:t xml:space="preserve">Niu, R., Li, J., Wang, S., Fu, Y., Hu, X., Leng, X., Kong, H., Chang, Y., &amp; Wang, Q. (2024). ScreenAgent: A Vision Language Model-driven Computer Control Agent.</w:t>
+        <w:t xml:space="preserve">[33]</w:t>
+      </w:r>
+      <w:r>
+        <w:t xml:space="preserve">J. Sauro and J. R. Lewis. 2016.</w:t>
       </w:r>
       <w:r>
         <w:t xml:space="preserve"> </w:t>
@@ -11983,18 +12147,24 @@
           <w:i/>
           <w:iCs/>
         </w:rPr>
-        <w:t xml:space="preserve">arXiv:2402.07945</w:t>
-      </w:r>
-      <w:r>
-        <w:t xml:space="preserve">.</w:t>
-      </w:r>
-    </w:p>
-    <w:p>
-      <w:pPr>
-        <w:pStyle w:val="BodyText"/>
-      </w:pPr>
-      <w:r>
-        <w:t xml:space="preserve">Norman, D. A. (1981). The trouble with UNIX: The user interface is horrid.</w:t>
+        <w:t xml:space="preserve">Quantifying the User Experience: Practical Statistics for User Research</w:t>
+      </w:r>
+      <w:r>
+        <w:t xml:space="preserve"> </w:t>
+      </w:r>
+      <w:r>
+        <w:t xml:space="preserve">(2nd ed.). Morgan Kaufmann.</w:t>
+      </w:r>
+    </w:p>
+    <w:p>
+      <w:pPr>
+        <w:pStyle w:val="BodyText"/>
+      </w:pPr>
+      <w:r>
+        <w:t xml:space="preserve">[34]</w:t>
+      </w:r>
+      <w:r>
+        <w:t xml:space="preserve">B. Shneiderman. 1983. Direct manipulation: A step beyond programming languages.</w:t>
       </w:r>
       <w:r>
         <w:t xml:space="preserve"> </w:t>
@@ -12004,18 +12174,24 @@
           <w:i/>
           <w:iCs/>
         </w:rPr>
-        <w:t xml:space="preserve">Datamation, 27</w:t>
-      </w:r>
-      <w:r>
-        <w:t xml:space="preserve">(12), 139–150.</w:t>
-      </w:r>
-    </w:p>
-    <w:p>
-      <w:pPr>
-        <w:pStyle w:val="BodyText"/>
-      </w:pPr>
-      <w:r>
-        <w:t xml:space="preserve">Norman, D. A. (1986). Cognitive engineering. In D. A. Norman &amp; S. W. Draper (Eds.),</w:t>
+        <w:t xml:space="preserve">Computer</w:t>
+      </w:r>
+      <w:r>
+        <w:t xml:space="preserve"> </w:t>
+      </w:r>
+      <w:r>
+        <w:t xml:space="preserve">16, 8 (1983), 57–69.</w:t>
+      </w:r>
+    </w:p>
+    <w:p>
+      <w:pPr>
+        <w:pStyle w:val="BodyText"/>
+      </w:pPr>
+      <w:r>
+        <w:t xml:space="preserve">[35]</w:t>
+      </w:r>
+      <w:r>
+        <w:t xml:space="preserve">B. Shneiderman. 2000. The limits of speech recognition.</w:t>
       </w:r>
       <w:r>
         <w:t xml:space="preserve"> </w:t>
@@ -12025,21 +12201,24 @@
           <w:i/>
           <w:iCs/>
         </w:rPr>
-        <w:t xml:space="preserve">User Centered System Design: New Perspectives on Human-Computer Interaction</w:t>
-      </w:r>
-      <w:r>
-        <w:t xml:space="preserve"> </w:t>
-      </w:r>
-      <w:r>
-        <w:t xml:space="preserve">(pp. 31–61). Lawrence Erlbaum Associates.</w:t>
-      </w:r>
-    </w:p>
-    <w:p>
-      <w:pPr>
-        <w:pStyle w:val="BodyText"/>
-      </w:pPr>
-      <w:r>
-        <w:t xml:space="preserve">OpenAI. (2026).</w:t>
+        <w:t xml:space="preserve">Commun. ACM</w:t>
+      </w:r>
+      <w:r>
+        <w:t xml:space="preserve"> </w:t>
+      </w:r>
+      <w:r>
+        <w:t xml:space="preserve">43, 9 (2000), 63–65.</w:t>
+      </w:r>
+    </w:p>
+    <w:p>
+      <w:pPr>
+        <w:pStyle w:val="BodyText"/>
+      </w:pPr>
+      <w:r>
+        <w:t xml:space="preserve">[36]</w:t>
+      </w:r>
+      <w:r>
+        <w:t xml:space="preserve">B. Shneiderman and P. Maes. 1997. Direct manipulation vs. interface agents.</w:t>
       </w:r>
       <w:r>
         <w:t xml:space="preserve"> </w:t>
@@ -12049,21 +12228,24 @@
           <w:i/>
           <w:iCs/>
         </w:rPr>
-        <w:t xml:space="preserve">Codex CLI</w:t>
-      </w:r>
-      <w:r>
-        <w:t xml:space="preserve"> </w:t>
-      </w:r>
-      <w:r>
-        <w:t xml:space="preserve">(Commit 1f4c473) [Computer software]. GitHub repository openai/codex.</w:t>
-      </w:r>
-    </w:p>
-    <w:p>
-      <w:pPr>
-        <w:pStyle w:val="BodyText"/>
-      </w:pPr>
-      <w:r>
-        <w:t xml:space="preserve">Padmanabha, A., Yuan, J., Gupta, J., Karachiwalla, Z., Majidi, C., Admoni, H., &amp; Erickson, Z. (2024). VoicePilot: Harnessing LLMs as Speech Interfaces for Physically Assistive Robots. In</w:t>
+        <w:t xml:space="preserve">interactions</w:t>
+      </w:r>
+      <w:r>
+        <w:t xml:space="preserve"> </w:t>
+      </w:r>
+      <w:r>
+        <w:t xml:space="preserve">4, 6 (1997), 42–61.</w:t>
+      </w:r>
+    </w:p>
+    <w:p>
+      <w:pPr>
+        <w:pStyle w:val="BodyText"/>
+      </w:pPr>
+      <w:r>
+        <w:t xml:space="preserve">[37]</w:t>
+      </w:r>
+      <w:r>
+        <w:t xml:space="preserve">J.-P. Talpin and P. Jouvelot. 1994. The type and effect discipline.</w:t>
       </w:r>
       <w:r>
         <w:t xml:space="preserve"> </w:t>
@@ -12073,18 +12255,57 @@
           <w:i/>
           <w:iCs/>
         </w:rPr>
-        <w:t xml:space="preserve">Proceedings of the 37th Annual ACM Symposium on User Interface Software and Technology (UIST '24)</w:t>
-      </w:r>
-      <w:r>
-        <w:t xml:space="preserve">. ACM.</w:t>
-      </w:r>
-    </w:p>
-    <w:p>
-      <w:pPr>
-        <w:pStyle w:val="BodyText"/>
-      </w:pPr>
-      <w:r>
-        <w:t xml:space="preserve">Park, J., Tang, P., Das, S., Appalaraju, S., Singh, K. Y., Manmatha, R., &amp; Ghadar, S. (2025). R-VLM: Region-aware Vision Language Model for Precise GUI Grounding. In</w:t>
+        <w:t xml:space="preserve">Information and Computation</w:t>
+      </w:r>
+      <w:r>
+        <w:t xml:space="preserve"> </w:t>
+      </w:r>
+      <w:r>
+        <w:t xml:space="preserve">111, 2 (1994), 245–296.</w:t>
+      </w:r>
+    </w:p>
+    <w:p>
+      <w:pPr>
+        <w:pStyle w:val="BodyText"/>
+      </w:pPr>
+      <w:r>
+        <w:t xml:space="preserve">[38]</w:t>
+      </w:r>
+      <w:r>
+        <w:t xml:space="preserve">H. G. W. van Dam. 2025. A Multimodal GUI Architecture for Interfacing with LLM-Based Conversational Assistants. arXiv:2510.06223</w:t>
+      </w:r>
+    </w:p>
+    <w:p>
+      <w:pPr>
+        <w:pStyle w:val="BodyText"/>
+      </w:pPr>
+      <w:r>
+        <w:t xml:space="preserve">[39]</w:t>
+      </w:r>
+      <w:r>
+        <w:t xml:space="preserve">J. Wang, H. Xu, J. Ye, M. Yan, W. Shen, J. Zhang, F. Huang, and J. Sang. 2024. Mobile-Agent: Autonomous Multi-Modal Mobile Device Agent with Visual Perception. arXiv:2401.16158</w:t>
+      </w:r>
+    </w:p>
+    <w:p>
+      <w:pPr>
+        <w:pStyle w:val="BodyText"/>
+      </w:pPr>
+      <w:r>
+        <w:t xml:space="preserve">[40]</w:t>
+      </w:r>
+      <w:r>
+        <w:t xml:space="preserve">F. Westenfelder, E. Hemberg, M. Tulla, S. Moskal, U.-M. O’Reilly, and S. Chiricescu. 2025. LLM-Supported Natural Language to Bash Translation. arXiv:2502.06858</w:t>
+      </w:r>
+    </w:p>
+    <w:p>
+      <w:pPr>
+        <w:pStyle w:val="BodyText"/>
+      </w:pPr>
+      <w:r>
+        <w:t xml:space="preserve">[41]</w:t>
+      </w:r>
+      <w:r>
+        <w:t xml:space="preserve">J. Whiteside, S. Jones, P. S. Levy, and D. Wixon. 1985. User performance with command, menu, and iconic interfaces. In</w:t>
       </w:r>
       <w:r>
         <w:t xml:space="preserve"> </w:t>
@@ -12094,18 +12315,21 @@
           <w:i/>
           <w:iCs/>
         </w:rPr>
-        <w:t xml:space="preserve">Findings of the Association for Computational Linguistics: ACL 2025</w:t>
-      </w:r>
-      <w:r>
-        <w:t xml:space="preserve">, 9669–9685.</w:t>
-      </w:r>
-    </w:p>
-    <w:p>
-      <w:pPr>
-        <w:pStyle w:val="BodyText"/>
-      </w:pPr>
-      <w:r>
-        <w:t xml:space="preserve">Rawles, C., Li, A., Rodriguez, D., Riva, O., &amp; Lillicrap, T. (2023). Android in the Wild: A Large-Scale Dataset for Android Device Control. In</w:t>
+        <w:t xml:space="preserve">Proceedings of the SIGCHI Conference on Human Factors in Computing Systems (CHI ’85)</w:t>
+      </w:r>
+      <w:r>
+        <w:t xml:space="preserve">. ACM, 185–191.</w:t>
+      </w:r>
+    </w:p>
+    <w:p>
+      <w:pPr>
+        <w:pStyle w:val="BodyText"/>
+      </w:pPr>
+      <w:r>
+        <w:t xml:space="preserve">[42]</w:t>
+      </w:r>
+      <w:r>
+        <w:t xml:space="preserve">R. Wilensky, D. N. Chin, M. Luria, J. Martin, J. Mayfield, and D. Wu. 1988. The Berkeley Unix Consultant Project.</w:t>
       </w:r>
       <w:r>
         <w:t xml:space="preserve"> </w:t>
@@ -12115,18 +12339,24 @@
           <w:i/>
           <w:iCs/>
         </w:rPr>
-        <w:t xml:space="preserve">Advances in Neural Information Processing Systems 36 (NeurIPS 2023)</w:t>
-      </w:r>
-      <w:r>
-        <w:t xml:space="preserve">.</w:t>
-      </w:r>
-    </w:p>
-    <w:p>
-      <w:pPr>
-        <w:pStyle w:val="BodyText"/>
-      </w:pPr>
-      <w:r>
-        <w:t xml:space="preserve">Sauro, J., &amp; Lewis, J. R. (2016).</w:t>
+        <w:t xml:space="preserve">Computational Linguistics</w:t>
+      </w:r>
+      <w:r>
+        <w:t xml:space="preserve"> </w:t>
+      </w:r>
+      <w:r>
+        <w:t xml:space="preserve">14, 4 (1988), 35–84.</w:t>
+      </w:r>
+    </w:p>
+    <w:p>
+      <w:pPr>
+        <w:pStyle w:val="BodyText"/>
+      </w:pPr>
+      <w:r>
+        <w:t xml:space="preserve">[43]</w:t>
+      </w:r>
+      <w:r>
+        <w:t xml:space="preserve">T. Xie, D. Zhang, J. Chen, X. Li, S. Zhao, R. Cao, T. J. Hua, Z. Cheng, D. Shin, F. Lei, Y. Liu, Y. Xu, S. Zhou, S. Savarese, C. Xiong, V. Zhong, and T. Yu. 2024. OSWorld: Benchmarking Multimodal Agents for Open-Ended Tasks in Real Computer Environments. In</w:t>
       </w:r>
       <w:r>
         <w:t xml:space="preserve"> </w:t>
@@ -12136,21 +12366,21 @@
           <w:i/>
           <w:iCs/>
         </w:rPr>
-        <w:t xml:space="preserve">Quantifying the User Experience: Practical Statistics for User Research</w:t>
-      </w:r>
-      <w:r>
-        <w:t xml:space="preserve"> </w:t>
-      </w:r>
-      <w:r>
-        <w:t xml:space="preserve">(2nd ed.). Morgan Kaufmann.</w:t>
-      </w:r>
-    </w:p>
-    <w:p>
-      <w:pPr>
-        <w:pStyle w:val="BodyText"/>
-      </w:pPr>
-      <w:r>
-        <w:t xml:space="preserve">Shneiderman, B. (1983). Direct manipulation: A step beyond programming languages.</w:t>
+        <w:t xml:space="preserve">Advances in Neural Information Processing Systems 37 (NeurIPS 2024)</w:t>
+      </w:r>
+      <w:r>
+        <w:t xml:space="preserve">.</w:t>
+      </w:r>
+    </w:p>
+    <w:p>
+      <w:pPr>
+        <w:pStyle w:val="BodyText"/>
+      </w:pPr>
+      <w:r>
+        <w:t xml:space="preserve">[44]</w:t>
+      </w:r>
+      <w:r>
+        <w:t xml:space="preserve">S. Yao, J. Zhao, D. Yu, N. Du, I. Shafran, K. Narasimhan, and Y. Cao. 2023. ReAct: Synergizing Reasoning and Acting in Language Models. In</w:t>
       </w:r>
       <w:r>
         <w:t xml:space="preserve"> </w:t>
@@ -12160,18 +12390,74 @@
           <w:i/>
           <w:iCs/>
         </w:rPr>
-        <w:t xml:space="preserve">Computer, 16</w:t>
-      </w:r>
-      <w:r>
-        <w:t xml:space="preserve">(8), 57–69.</w:t>
-      </w:r>
-    </w:p>
-    <w:p>
-      <w:pPr>
-        <w:pStyle w:val="BodyText"/>
-      </w:pPr>
-      <w:r>
-        <w:t xml:space="preserve">Shneiderman, B. (2000). The limits of speech recognition.</w:t>
+        <w:t xml:space="preserve">Proceedings of ICLR 2023</w:t>
+      </w:r>
+      <w:r>
+        <w:t xml:space="preserve">.</w:t>
+      </w:r>
+    </w:p>
+    <w:p>
+      <w:pPr>
+        <w:pStyle w:val="BodyText"/>
+      </w:pPr>
+      <w:r>
+        <w:t xml:space="preserve">[45]</w:t>
+      </w:r>
+      <w:r>
+        <w:t xml:space="preserve">M. Yuan, Z. Zhou, X. Xiong, et al. 2026. OSWorld 2.0: Benchmarking Computer Use Agents on Long-Horizon Real-World Tasks. arXiv:2606.29537</w:t>
+      </w:r>
+    </w:p>
+    <w:p>
+      <w:pPr>
+        <w:pStyle w:val="BodyText"/>
+      </w:pPr>
+      <w:r>
+        <w:t xml:space="preserve">[46]</w:t>
+      </w:r>
+      <w:r>
+        <w:t xml:space="preserve">C. Zhang, S. He, J. Qian, B. Li, L. Li, S. Qin, Y. Kang, M. Ma, G. Liu, Q. Lin, S. Rajmohan, D. Zhang, and Q. Zhang. 2024. Large Language Model-Brained GUI Agents: A Survey. arXiv:2411.18279</w:t>
+      </w:r>
+    </w:p>
+    <w:p>
+      <w:pPr>
+        <w:pStyle w:val="BodyText"/>
+      </w:pPr>
+      <w:r>
+        <w:t xml:space="preserve">[47]</w:t>
+      </w:r>
+      <w:r>
+        <w:t xml:space="preserve">C. Zhang, S. He, J. Qian, B. Li, L. Li, S. Qin, Y. Kang, M. Ma, G. Liu, Q. Lin, S. Rajmohan, D. Zhang, and Q. Zhang. 2025. UFO</w:t>
+      </w:r>
+      <w:r>
+        <w:rPr>
+          <w:vertAlign w:val="superscript"/>
+        </w:rPr>
+        <w:t xml:space="preserve">2</w:t>
+      </w:r>
+      <w:r>
+        <w:t xml:space="preserve">: The Desktop AgentOS. arXiv:2504.14603</w:t>
+      </w:r>
+    </w:p>
+    <w:p>
+      <w:pPr>
+        <w:pStyle w:val="BodyText"/>
+      </w:pPr>
+      <w:r>
+        <w:t xml:space="preserve">[48]</w:t>
+      </w:r>
+      <w:r>
+        <w:t xml:space="preserve">C. Zhang, Z. Yang, J. Liu, Y. Han, X. Chen, Z. Huang, B. Fu, and G. Yu. 2023. AppAgent: Multimodal Agents as Smartphone Users. arXiv:2312.13771</w:t>
+      </w:r>
+    </w:p>
+    <w:p>
+      <w:pPr>
+        <w:pStyle w:val="BodyText"/>
+      </w:pPr>
+      <w:r>
+        <w:t xml:space="preserve">[49]</w:t>
+      </w:r>
+      <w:r>
+        <w:t xml:space="preserve">B. Zheng, B. Gou, J. Kil, H. Sun, and Y. Su. 2024. GPT-4V(ision) is a Generalist Web Agent, if Grounded. In</w:t>
       </w:r>
       <w:r>
         <w:t xml:space="preserve"> </w:t>
@@ -12181,18 +12467,21 @@
           <w:i/>
           <w:iCs/>
         </w:rPr>
-        <w:t xml:space="preserve">Communications of the ACM, 43</w:t>
-      </w:r>
-      <w:r>
-        <w:t xml:space="preserve">(9), 63–65.</w:t>
-      </w:r>
-    </w:p>
-    <w:p>
-      <w:pPr>
-        <w:pStyle w:val="BodyText"/>
-      </w:pPr>
-      <w:r>
-        <w:t xml:space="preserve">Shneiderman, B., &amp; Maes, P. (1997). Direct manipulation vs. interface agents.</w:t>
+        <w:t xml:space="preserve">Proceedings of ICML 2024</w:t>
+      </w:r>
+      <w:r>
+        <w:t xml:space="preserve">.</w:t>
+      </w:r>
+    </w:p>
+    <w:p>
+      <w:pPr>
+        <w:pStyle w:val="BodyText"/>
+      </w:pPr>
+      <w:r>
+        <w:t xml:space="preserve">[50]</w:t>
+      </w:r>
+      <w:r>
+        <w:t xml:space="preserve">S. Zhou, F. F. Xu, H. Zhu, X. Zhou, R. Lo, A. Sridhar, X. Cheng, T. Ou, Y. Bisk, D. Fried, U. Alon, and G. Neubig. 2024. WebArena: A Realistic Web Environment for Building Autonomous Agents. In</w:t>
       </w:r>
       <w:r>
         <w:t xml:space="preserve"> </w:t>
@@ -12202,49 +12491,7 @@
           <w:i/>
           <w:iCs/>
         </w:rPr>
-        <w:t xml:space="preserve">interactions, 4</w:t>
-      </w:r>
-      <w:r>
-        <w:t xml:space="preserve">(6), 42–61.</w:t>
-      </w:r>
-    </w:p>
-    <w:p>
-      <w:pPr>
-        <w:pStyle w:val="BodyText"/>
-      </w:pPr>
-      <w:r>
-        <w:t xml:space="preserve">Talpin, J.-P., &amp; Jouvelot, P. (1994). The type and effect discipline.</w:t>
-      </w:r>
-      <w:r>
-        <w:t xml:space="preserve"> </w:t>
-      </w:r>
-      <w:r>
-        <w:rPr>
-          <w:i/>
-          <w:iCs/>
-        </w:rPr>
-        <w:t xml:space="preserve">Information and Computation, 111</w:t>
-      </w:r>
-      <w:r>
-        <w:t xml:space="preserve">(2), 245–296.</w:t>
-      </w:r>
-    </w:p>
-    <w:p>
-      <w:pPr>
-        <w:pStyle w:val="BodyText"/>
-      </w:pPr>
-      <w:r>
-        <w:t xml:space="preserve">van Dam, H. G. W. (2025). A Multimodal GUI Architecture for Interfacing with LLM-Based Conversational Assistants.</w:t>
-      </w:r>
-      <w:r>
-        <w:t xml:space="preserve"> </w:t>
-      </w:r>
-      <w:r>
-        <w:rPr>
-          <w:i/>
-          <w:iCs/>
-        </w:rPr>
-        <w:t xml:space="preserve">arXiv:2510.06223</w:t>
+        <w:t xml:space="preserve">Proceedings of ICLR 2024</w:t>
       </w:r>
       <w:r>
         <w:t xml:space="preserve">.</w:t>
@@ -12255,272 +12502,10 @@
         <w:pStyle w:val="BodyText"/>
       </w:pPr>
       <w:r>
-        <w:t xml:space="preserve">Wang, J., Xu, H., Ye, J., Yan, M., Shen, W., Zhang, J., Huang, F., &amp; Sang, J. (2024). Mobile-Agent: Autonomous Multi-Modal Mobile Device Agent with Visual Perception.</w:t>
-      </w:r>
-      <w:r>
-        <w:t xml:space="preserve"> </w:t>
-      </w:r>
-      <w:r>
-        <w:rPr>
-          <w:i/>
-          <w:iCs/>
-        </w:rPr>
-        <w:t xml:space="preserve">arXiv:2401.16158</w:t>
-      </w:r>
-      <w:r>
-        <w:t xml:space="preserve">.</w:t>
-      </w:r>
-    </w:p>
-    <w:p>
-      <w:pPr>
-        <w:pStyle w:val="BodyText"/>
-      </w:pPr>
-      <w:r>
-        <w:t xml:space="preserve">Westenfelder, F., Hemberg, E., Tulla, M., Moskal, S., O'Reilly, U.-M., &amp; Chiricescu, S. (2025). LLM-Supported Natural Language to Bash Translation.</w:t>
-      </w:r>
-      <w:r>
-        <w:t xml:space="preserve"> </w:t>
-      </w:r>
-      <w:r>
-        <w:rPr>
-          <w:i/>
-          <w:iCs/>
-        </w:rPr>
-        <w:t xml:space="preserve">arXiv:2502.06858</w:t>
-      </w:r>
-      <w:r>
-        <w:t xml:space="preserve">.</w:t>
-      </w:r>
-    </w:p>
-    <w:p>
-      <w:pPr>
-        <w:pStyle w:val="BodyText"/>
-      </w:pPr>
-      <w:r>
-        <w:t xml:space="preserve">Whiteside, J., Jones, S., Levy, P. S., &amp; Wixon, D. (1985). User performance with command, menu, and iconic interfaces. In</w:t>
-      </w:r>
-      <w:r>
-        <w:t xml:space="preserve"> </w:t>
-      </w:r>
-      <w:r>
-        <w:rPr>
-          <w:i/>
-          <w:iCs/>
-        </w:rPr>
-        <w:t xml:space="preserve">Proceedings of the SIGCHI Conference on Human Factors in Computing Systems (CHI '85)</w:t>
-      </w:r>
-      <w:r>
-        <w:t xml:space="preserve">, 185–191.</w:t>
-      </w:r>
-    </w:p>
-    <w:p>
-      <w:pPr>
-        <w:pStyle w:val="BodyText"/>
-      </w:pPr>
-      <w:r>
-        <w:t xml:space="preserve">Wilensky, R., Chin, D. N., Luria, M., Martin, J., Mayfield, J., &amp; Wu, D. (1988). The Berkeley Unix Consultant Project.</w:t>
-      </w:r>
-      <w:r>
-        <w:t xml:space="preserve"> </w:t>
-      </w:r>
-      <w:r>
-        <w:rPr>
-          <w:i/>
-          <w:iCs/>
-        </w:rPr>
-        <w:t xml:space="preserve">Computational Linguistics, 14</w:t>
-      </w:r>
-      <w:r>
-        <w:t xml:space="preserve">(4), 35–84.</w:t>
-      </w:r>
-    </w:p>
-    <w:p>
-      <w:pPr>
-        <w:pStyle w:val="BodyText"/>
-      </w:pPr>
-      <w:r>
-        <w:t xml:space="preserve">Xie, T., Zhang, D., Chen, J., Li, X., Zhao, S., Cao, R., Hua, T. J., Cheng, Z., Shin, D., Lei, F., Liu, Y., Xu, Y., Zhou, S., Savarese, S., Xiong, C., Zhong, V., &amp; Yu, T. (2024). OSWorld: Benchmarking Multimodal Agents for Open-Ended Tasks in Real Computer Environments. In</w:t>
-      </w:r>
-      <w:r>
-        <w:t xml:space="preserve"> </w:t>
-      </w:r>
-      <w:r>
-        <w:rPr>
-          <w:i/>
-          <w:iCs/>
-        </w:rPr>
-        <w:t xml:space="preserve">Advances in Neural Information Processing Systems 37 (NeurIPS 2024)</w:t>
-      </w:r>
-      <w:r>
-        <w:t xml:space="preserve">.</w:t>
-      </w:r>
-    </w:p>
-    <w:p>
-      <w:pPr>
-        <w:pStyle w:val="BodyText"/>
-      </w:pPr>
-      <w:r>
-        <w:t xml:space="preserve">Yao, S., Zhao, J., Yu, D., Du, N., Shafran, I., Narasimhan, K., &amp; Cao, Y. (2023). ReAct: Synergizing Reasoning and Acting in Language Models. In</w:t>
-      </w:r>
-      <w:r>
-        <w:t xml:space="preserve"> </w:t>
-      </w:r>
-      <w:r>
-        <w:rPr>
-          <w:i/>
-          <w:iCs/>
-        </w:rPr>
-        <w:t xml:space="preserve">Proceedings of ICLR 2023</w:t>
-      </w:r>
-      <w:r>
-        <w:t xml:space="preserve">.</w:t>
-      </w:r>
-    </w:p>
-    <w:p>
-      <w:pPr>
-        <w:pStyle w:val="BodyText"/>
-      </w:pPr>
-      <w:r>
-        <w:t xml:space="preserve">Yuan, M., Zhou, Z., Xiong, X., et al. (2026). OSWorld 2.0: Benchmarking Computer Use Agents on Long-Horizon Real-World Tasks.</w:t>
-      </w:r>
-      <w:r>
-        <w:t xml:space="preserve"> </w:t>
-      </w:r>
-      <w:r>
-        <w:rPr>
-          <w:i/>
-          <w:iCs/>
-        </w:rPr>
-        <w:t xml:space="preserve">arXiv:2606.29537</w:t>
-      </w:r>
-      <w:r>
-        <w:t xml:space="preserve">.</w:t>
-      </w:r>
-    </w:p>
-    <w:p>
-      <w:pPr>
-        <w:pStyle w:val="BodyText"/>
-      </w:pPr>
-      <w:r>
-        <w:t xml:space="preserve">Zhang, C., He, S., Qian, J., Li, B., Li, L., Qin, S., Kang, Y., Ma, M., Liu, G., Lin, Q., Rajmohan, S., Zhang, D., &amp; Zhang, Q. (2024). Large Language Model-Brained GUI Agents: A Survey.</w:t>
-      </w:r>
-      <w:r>
-        <w:t xml:space="preserve"> </w:t>
-      </w:r>
-      <w:r>
-        <w:rPr>
-          <w:i/>
-          <w:iCs/>
-        </w:rPr>
-        <w:t xml:space="preserve">arXiv:2411.18279</w:t>
-      </w:r>
-      <w:r>
-        <w:t xml:space="preserve">.</w:t>
-      </w:r>
-    </w:p>
-    <w:p>
-      <w:pPr>
-        <w:pStyle w:val="BodyText"/>
-      </w:pPr>
-      <w:r>
-        <w:t xml:space="preserve">Zhang, C., He, S., Qian, J., Li, B., Li, L., Qin, S., Kang, Y., Ma, M., Liu, G., Lin, Q., Rajmohan, S., Zhang, D., &amp; Zhang, Q. (2025). UFO²: The Desktop AgentOS.</w:t>
-      </w:r>
-      <w:r>
-        <w:t xml:space="preserve"> </w:t>
-      </w:r>
-      <w:r>
-        <w:rPr>
-          <w:i/>
-          <w:iCs/>
-        </w:rPr>
-        <w:t xml:space="preserve">arXiv:2504.14603</w:t>
-      </w:r>
-      <w:r>
-        <w:t xml:space="preserve">.</w:t>
-      </w:r>
-    </w:p>
-    <w:p>
-      <w:pPr>
-        <w:pStyle w:val="BodyText"/>
-      </w:pPr>
-      <w:r>
-        <w:t xml:space="preserve">Zhang, C., Yang, Z., Liu, J., Han, Y., Chen, X., Huang, Z., Fu, B., &amp; Yu, G. (2023). AppAgent: Multimodal Agents as Smartphone Users.</w:t>
-      </w:r>
-      <w:r>
-        <w:t xml:space="preserve"> </w:t>
-      </w:r>
-      <w:r>
-        <w:rPr>
-          <w:i/>
-          <w:iCs/>
-        </w:rPr>
-        <w:t xml:space="preserve">arXiv:2312.13771</w:t>
-      </w:r>
-      <w:r>
-        <w:t xml:space="preserve">.</w:t>
-      </w:r>
-    </w:p>
-    <w:p>
-      <w:pPr>
-        <w:pStyle w:val="BodyText"/>
-      </w:pPr>
-      <w:r>
-        <w:t xml:space="preserve">Zheng, B., Gou, B., Kil, J., Sun, H., &amp; Su, Y. (2024). GPT-4V(ision) is a Generalist Web Agent, if Grounded. In</w:t>
-      </w:r>
-      <w:r>
-        <w:t xml:space="preserve"> </w:t>
-      </w:r>
-      <w:r>
-        <w:rPr>
-          <w:i/>
-          <w:iCs/>
-        </w:rPr>
-        <w:t xml:space="preserve">Proceedings of ICML 2024</w:t>
-      </w:r>
-      <w:r>
-        <w:t xml:space="preserve">.</w:t>
-      </w:r>
-    </w:p>
-    <w:p>
-      <w:pPr>
-        <w:pStyle w:val="BodyText"/>
-      </w:pPr>
-      <w:r>
-        <w:t xml:space="preserve">Zhou, S., Xu, F. F., Zhu, H., Zhou, X., Lo, R., Sridhar, A., Cheng, X., Ou, T., Bisk, Y., Fried, D., Alon, U., &amp; Neubig, G. (2024). WebArena: A Realistic Web Environment for Building Autonomous Agents. In</w:t>
-      </w:r>
-      <w:r>
-        <w:t xml:space="preserve"> </w:t>
-      </w:r>
-      <w:r>
-        <w:rPr>
-          <w:i/>
-          <w:iCs/>
-        </w:rPr>
-        <w:t xml:space="preserve">Proceedings of ICLR 2024</w:t>
-      </w:r>
-      <w:r>
-        <w:t xml:space="preserve">.</w:t>
-      </w:r>
-    </w:p>
-    <w:p>
-      <w:pPr>
-        <w:pStyle w:val="BodyText"/>
-      </w:pPr>
-      <w:r>
-        <w:t xml:space="preserve">Zhou, X., Zhang, S., Zhao, Y., Wei, J., Song, T., Cohan, A., &amp; Zhao, C. (2026). GUI vs. CLI: Execution Bottlenecks in Screen-Only and Skill-Mediated Computer-Use Agents.</w:t>
-      </w:r>
-      <w:r>
-        <w:t xml:space="preserve"> </w:t>
-      </w:r>
-      <w:r>
-        <w:rPr>
-          <w:i/>
-          <w:iCs/>
-        </w:rPr>
-        <w:t xml:space="preserve">arXiv:2606.24551</w:t>
-      </w:r>
-      <w:r>
-        <w:t xml:space="preserve">.</w:t>
+        <w:t xml:space="preserve">[51]</w:t>
+      </w:r>
+      <w:r>
+        <w:t xml:space="preserve">X. Zhou, S. Zhang, Y. Zhao, J. Wei, T. Song, A. Cohan, and C. Zhao. 2026. GUI vs. CLI: Execution Bottlenecks in Screen-Only and Skill-Mediated Computer-Use Agents. arXiv:2606.24551</w:t>
       </w:r>
     </w:p>
     <w:bookmarkStart w:id="132" w:name="sec-appendices"/>
@@ -12563,7 +12548,7 @@
         <w:pStyle w:val="BodyText"/>
       </w:pPr>
       <w:r>
-        <w:t xml:space="preserve">Administered immediately after each condition, referring to the interface just used.  Items are the standard ten-item instrument of Brooke (1996), with the word “system” replaced throughout by “interface” so that participants rate the interaction surface rather than the machine.  Each item is answered on a five-point scale from 1 (strongly disagree) to 5 (strongly agree).</w:t>
+        <w:t xml:space="preserve">Administered immediately after each condition, referring to the interface just used.  Items are the standard ten-item instrument of Brooke [4], with the word “system” replaced throughout by “interface” so that participants rate the interaction surface rather than the machine.  Each item is answered on a five-point scale from 1 (strongly disagree) to 5 (strongly agree).</w:t>
       </w:r>
     </w:p>
     <w:p>
@@ -13597,7 +13582,7 @@
         <w:t xml:space="preserve"> </w:t>
       </w:r>
       <w:r>
-        <w:t xml:space="preserve">For odd-numbered items, subtract 1 from the response.  For even-numbered items, subtract the response from 5.  Sum the ten adjusted scores and multiply by 2.5, giving a value from 0 to 100.  This value is not a percentage; interpretation follows Sauro and Lewis (2016) and Bangor and colleagues (2008).</w:t>
+        <w:t xml:space="preserve">For odd-numbered items, subtract 1 from the response.  For even-numbered items, subtract the response from 5.  Sum the ten adjusted scores and multiply by 2.5, giving a value from 0 to 100.  This value is not a percentage; interpretation follows Sauro and Lewis [33] and Bangor and colleagues [1].</w:t>
       </w:r>
     </w:p>
     <w:bookmarkStart w:id="126" w:name="appendix-b"/>
@@ -13623,7 +13608,7 @@
         <w:pStyle w:val="BodyText"/>
       </w:pPr>
       <w:r>
-        <w:t xml:space="preserve">Administered immediately after each condition, referring to the set of tasks just completed.  Six subscales are rated on a twenty-one-point scale presented as a line divided into equal intervals and scored 0 to 100 in steps of five.  This study uses the unweighted variant (Raw TLX): the pairwise weighting procedure of the original instrument (Hart and Staveland, 1988) is omitted, and the composite workload score is the arithmetic mean of the six subscale ratings.  All six subscales, including Performance (anchored from Perfect to Failure), run from low to high workload, so no subscale is reverse-scored.</w:t>
+        <w:t xml:space="preserve">Administered immediately after each condition, referring to the set of tasks just completed.  Six subscales are rated on a twenty-one-point scale presented as a line divided into equal intervals and scored 0 to 100 in steps of five.  This study uses the unweighted variant (Raw TLX): the pairwise weighting procedure of the original instrument [12] is omitted, and the composite workload score is the arithmetic mean of the six subscale ratings.  All six subscales, including Performance (anchored from Perfect to Failure), run from low to high workload, so no subscale is reverse-scored.</w:t>
       </w:r>
     </w:p>
     <w:p>

</xml_diff>

<commit_message>
fix(thesis): correct reference details and drop two inaccessible sources
Checking every reference against arXiv, Crossref, and OpenAlex found three wrong author lists: WinClick [14] had none of its real authors, UFO2 reused the author list of the group's survey, and AppAgent was missing an author. CogAgent now lists the CVPR version's eleven authors, since the CVPR version is the one cited, and GUIRoboTron-Speech cites arXiv v1, the version with that title (later renamed UITron-Speech). Bangor et al. 2008 (paywalled, no free copy) and Norman 1981 (no retrievable copy) are dropped: each statement they supported is kept, Bangor's by the Sauro and Lewis citation already beside it. 49 references, re-typeset with ACM-Reference-Format.bst and renumbered; 120 pages, 60 links, 0 broken. The explainer's abstract-interpretation reference moves to pp. 25-26.
</commit_message>
<xml_diff>
--- a/thesis 1/consolidated/SynapseOS_Proposal_Chapters_1_to_3.docx
+++ b/thesis 1/consolidated/SynapseOS_Proposal_Chapters_1_to_3.docx
@@ -930,7 +930,7 @@
         <w:pStyle w:val="BodyText"/>
       </w:pPr>
       <w:r>
-        <w:t xml:space="preserve">The dominant paradigm for personal computing has remained largely unchanged since the early 1980s, when the graphical desktop — icons, menus, and pointer-driven interaction — was established through the Xerox Star and Apple Lisa lineage.  Despite its longevity, a parallel research tradition has long explored whether users should instead be able to describe what they want in natural language and have the computer carry it out.  The earliest serious system in this tradition, the Berkeley UNIX Consultant, was already operational by the late 1980s [42].  Decades later, the rise of large language models (LLMs) and multimodal foundation models</w:t>
+        <w:t xml:space="preserve">The dominant paradigm for personal computing has remained largely unchanged since the early 1980s, when the graphical desktop — icons, menus, and pointer-driven interaction — was established through the Xerox Star and Apple Lisa lineage.  Despite its longevity, a parallel research tradition has long explored whether users should instead be able to describe what they want in natural language and have the computer carry it out.  The earliest serious system in this tradition, the Berkeley UNIX Consultant, was already operational by the late 1980s [40].  Decades later, the rise of large language models (LLMs) and multimodal foundation models</w:t>
       </w:r>
       <w:hyperlink w:anchor="ch1-fn1">
         <w:r>
@@ -953,7 +953,7 @@
         <w:pStyle w:val="BodyText"/>
       </w:pPr>
       <w:r>
-        <w:t xml:space="preserve">The field that has emerged sits at the intersection of human-computer interaction, operating systems, natural language processing, computer vision, and program analysis.  On the shell side, recent work has demonstrated that LLMs can translate natural language into Bash commands with usable accuracy and can be embedded as a Unix primitive with appropriate safety guardrails [10, 40].  On the graphical side, so-called computer-using agents</w:t>
+        <w:t xml:space="preserve">The field that has emerged sits at the intersection of human-computer interaction, operating systems, natural language processing, computer vision, and program analysis.  On the shell side, recent work has demonstrated that LLMs can translate natural language into Bash commands with usable accuracy and can be embedded as a Unix primitive with appropriate safety guardrails [9, 38].  On the graphical side, so-called computer-using agents</w:t>
       </w:r>
       <w:hyperlink w:anchor="ch1-fn2">
         <w:r>
@@ -968,15 +968,15 @@
         <w:t xml:space="preserve"> </w:t>
       </w:r>
       <w:r>
-        <w:t xml:space="preserve">now operate desktop and mobile applications by combining native APIs with vision-based grounding [46, 47].  On the web, language-guided agents complete tasks across realistic websites with measurable but limited reliability [49, 50].  A converging research thread approaches the same technical problem from an accessibility perspective: speech-driven GUI command mapping for users with motor and speech impairments has progressed from voice-to-text dictation toward voice-to-action agents, with recent work on speech-instructed GUI agents [11] and region-aware visual grounding [31] demonstrating that the underlying components are maturing rapidly.  Yet the gap between demonstration and deployable replacement remains substantial.  Capability on short, self-contained tasks has advanced quickly, but sustained computer work has not: on OSWorld 2.0, a benchmark of long-horizon tasks whose median item takes a skilled human roughly an hour and a half, the best frontier configuration completes only 20.6% of tasks outright [45].</w:t>
-      </w:r>
-    </w:p>
-    <w:p>
-      <w:pPr>
-        <w:pStyle w:val="BodyText"/>
-      </w:pPr>
-      <w:r>
-        <w:t xml:space="preserve">This rapid progress has been uneven across platforms.  Windows is heavily represented in the desktop agent literature [14, 47], Android in the mobile agent literature [32, 39, 48], and the browser in the web agent literature [8, 49, 50].  Linux desktop coverage, by contrast, is conspicuously absent: existing work either addresses Linux only at the shell level [10] or treats it as one of several evaluation platforms rather than a primary target [43].  No surveyed system implements a working conversational session layer</w:t>
+        <w:t xml:space="preserve">now operate desktop and mobile applications by combining native APIs with vision-based grounding [44, 45].  On the web, language-guided agents complete tasks across realistic websites with measurable but limited reliability [47, 48].  A converging research thread approaches the same technical problem from an accessibility perspective: speech-driven GUI command mapping for users with motor and speech impairments has progressed from voice-to-text dictation toward voice-to-action agents, with recent work on speech-instructed GUI agents [10] and region-aware visual grounding [29] demonstrating that the underlying components are maturing rapidly.  Yet the gap between demonstration and deployable replacement remains substantial.  Capability on short, self-contained tasks has advanced quickly, but sustained computer work has not: on OSWorld 2.0, a benchmark of long-horizon tasks whose median item takes a skilled human roughly an hour and a half, the best frontier configuration completes only 20.6% of tasks outright [43].</w:t>
+      </w:r>
+    </w:p>
+    <w:p>
+      <w:pPr>
+        <w:pStyle w:val="BodyText"/>
+      </w:pPr>
+      <w:r>
+        <w:t xml:space="preserve">This rapid progress has been uneven across platforms.  Windows is heavily represented in the desktop agent literature [13, 45], Android in the mobile agent literature [30, 37, 46], and the browser in the web agent literature [7, 47, 48].  Linux desktop coverage, by contrast, is conspicuously absent: existing work either addresses Linux only at the shell level [9] or treats it as one of several evaluation platforms rather than a primary target [41].  No surveyed system implements a working conversational session layer</w:t>
       </w:r>
       <w:hyperlink w:anchor="ch1-fn3">
         <w:r>
@@ -1021,7 +1021,7 @@
         <w:t xml:space="preserve">permission</w:t>
       </w:r>
       <w:r>
-        <w:t xml:space="preserve">: the generated command is matched against a list of patterns judged dangerous and is then allowed, refused, or put to the user [10].  A list of this kind cannot see what a command will actually touch when its targets are hidden inside another command, such as</w:t>
+        <w:t xml:space="preserve">: the generated command is matched against a list of patterns judged dangerous and is then allowed, refused, or put to the user [9].  A list of this kind cannot see what a command will actually touch when its targets are hidden inside another command, such as</w:t>
       </w:r>
       <w:r>
         <w:t xml:space="preserve"> </w:t>
@@ -1072,15 +1072,15 @@
         <w:t xml:space="preserve"> </w:t>
       </w:r>
       <w:r>
-        <w:t xml:space="preserve">system places a conversational layer over the conventional desktop session as a whole.  The idea is no longer unclaimed — AgentOS [21] proposes a natural-language portal in place of the graphical desktop — but it is offered as a research direction, without a built system or an evaluation.  The systems that are built automate on top of the desktop rather than replacing it: UFO², for instance, positions itself as a “Desktop AgentOS” but operates as an automation layer atop the existing Windows shell, deliberately confining itself to a separate desktop so that agent and user do not interfere [47].  Third, the Linux work that exists serves servers and agents rather than the desktop session of an end user.  NaSh addresses Linux at the shell level as a design proposal without evaluation [10]; shipping natural-language shells such as Alibaba Cloud’s ANOLISA pair intent translation with approval gating and rollback, but scope themselves explicitly to server and DevOps workloads; and OSWorld includes Ubuntu as an evaluation platform rather than a deployment target [43].  Fourth, controlled comparison against the conventional graphical workflow exists only for narrow slices of the problem.  AXIS evaluates an API-first agent against manual operation within a single application, Microsoft Word, using a cloud-hosted frontier model [22], and the accessibility literature evaluates assistance for specific populations [30].  No study compares a conversational interface against the conventional workflow across operating-system-level tasks, on a Linux desktop, driven by a locally-hosted small model, under an explicit safety gate.</w:t>
-      </w:r>
-    </w:p>
-    <w:p>
-      <w:pPr>
-        <w:pStyle w:val="BodyText"/>
-      </w:pPr>
-      <w:r>
-        <w:t xml:space="preserve">Notably, the accessibility-focused thread of the field exhibits the inverse limitation.  Speech-to-GUI mapping research targets specific user populations — users with motor impairments, speech disorders, or cognitive disabilities — with specialized techniques such as speech-instructed GUI agents and resilient visual grounding [11, 31], but operates at the level of individual applications or interaction techniques rather than at the level of the session layer itself.  These approaches presuppose an underlying conversational system surface on which to run, yet no such surface exists.  This complementarity sharpens the opportunity: a general-purpose conversational interface layer would serve not only mainstream users but also provide the substrate that accessibility-specific configurations require.</w:t>
+        <w:t xml:space="preserve">system places a conversational layer over the conventional desktop session as a whole.  The idea is no longer unclaimed — AgentOS [20] proposes a natural-language portal in place of the graphical desktop — but it is offered as a research direction, without a built system or an evaluation.  The systems that are built automate on top of the desktop rather than replacing it: UFO², for instance, positions itself as a “Desktop AgentOS” but operates as an automation layer atop the existing Windows shell, deliberately confining itself to a separate desktop so that agent and user do not interfere [45].  Third, the Linux work that exists serves servers and agents rather than the desktop session of an end user.  NaSh addresses Linux at the shell level as a design proposal without evaluation [9]; shipping natural-language shells such as Alibaba Cloud’s ANOLISA pair intent translation with approval gating and rollback, but scope themselves explicitly to server and DevOps workloads; and OSWorld includes Ubuntu as an evaluation platform rather than a deployment target [41].  Fourth, controlled comparison against the conventional graphical workflow exists only for narrow slices of the problem.  AXIS evaluates an API-first agent against manual operation within a single application, Microsoft Word, using a cloud-hosted frontier model [21], and the accessibility literature evaluates assistance for specific populations [28].  No study compares a conversational interface against the conventional workflow across operating-system-level tasks, on a Linux desktop, driven by a locally-hosted small model, under an explicit safety gate.</w:t>
+      </w:r>
+    </w:p>
+    <w:p>
+      <w:pPr>
+        <w:pStyle w:val="BodyText"/>
+      </w:pPr>
+      <w:r>
+        <w:t xml:space="preserve">Notably, the accessibility-focused thread of the field exhibits the inverse limitation.  Speech-to-GUI mapping research targets specific user populations — users with motor impairments, speech disorders, or cognitive disabilities — with specialized techniques such as speech-instructed GUI agents and resilient visual grounding [10, 29], but operates at the level of individual applications or interaction techniques rather than at the level of the session layer itself.  These approaches presuppose an underlying conversational system surface on which to run, yet no such surface exists.  This complementarity sharpens the opportunity: a general-purpose conversational interface layer would serve not only mainstream users but also provide the substrate that accessibility-specific configurations require.</w:t>
       </w:r>
     </w:p>
     <w:p>
@@ -2010,7 +2010,7 @@
         <w:t xml:space="preserve"> </w:t>
       </w:r>
       <w:r>
-        <w:t xml:space="preserve">Although this population is scoped out of the initial evaluation for ethical and recruitment reasons, SynapseOS is positioned to serve as the session-level substrate on which accessibility-specific configurations can operate.  Prior work has established design guidelines for LLM-based speech interfaces for users with motor impairments [30] and has demonstrated specialized techniques — speech-instructed GUI agents and resilient visual grounding — at the application and interaction-technique level [11, 31].  These techniques presuppose a conversational system surface that does not yet exist at the session level; SynapseOS provides that surface, making accessibility-specific extensions a natural and well-grounded future direction rather than a speculative one.</w:t>
+        <w:t xml:space="preserve">Although this population is scoped out of the initial evaluation for ethical and recruitment reasons, SynapseOS is positioned to serve as the session-level substrate on which accessibility-specific configurations can operate.  Prior work has established design guidelines for LLM-based speech interfaces for users with motor impairments [28] and has demonstrated specialized techniques — speech-instructed GUI agents and resilient visual grounding — at the application and interaction-technique level [10, 29].  These techniques presuppose a conversational system surface that does not yet exist at the session level; SynapseOS provides that surface, making accessibility-specific extensions a natural and well-grounded future direction rather than a speculative one.</w:t>
       </w:r>
     </w:p>
     <w:p>
@@ -2054,7 +2054,7 @@
         <w:t xml:space="preserve"> </w:t>
       </w:r>
       <w:r>
-        <w:t xml:space="preserve">The study contributes a static analysis of shell commands for recoverability, a property that existing analyses of shell do not address (§2.4), together with an evaluation against ground truth obtained by sandboxed execution rather than by human labeling.  It also contributes a controlled comparative evaluation methodology for conversational interfaces, which are rarely compared against conventional graphical workflows on the same tasks and population [43].</w:t>
+        <w:t xml:space="preserve">The study contributes a static analysis of shell commands for recoverability, a property that existing analyses of shell do not address (§2.4), together with an evaluation against ground truth obtained by sandboxed execution rather than by human labeling.  It also contributes a controlled comparative evaluation methodology for conversational interfaces, which are rarely compared against conventional graphical workflows on the same tasks and population [41].</w:t>
       </w:r>
     </w:p>
     <w:bookmarkEnd w:id="33"/>
@@ -2112,7 +2112,7 @@
         <w:pStyle w:val="BodyText"/>
       </w:pPr>
       <w:r>
-        <w:t xml:space="preserve">The study examines cross-application desktop workflows on Linux, including shell operations, file management, and application-level tasks representable in the OSWorld benchmark task suite [43].  The population studied consists of novice computer users and power users recruited for a controlled user study.  The study is conducted in a Linux desktop environment and is bounded by the duration of the thesis project.  The recoverability analysis covers commands in the bash dialect on a Debian system: their effects on the filesystem, and the changes to package and service state they make through apt, dpkg, and systemd.  It is evaluated on a corpus of 777 commands drawn from NL2Bash, from templates covering each composition operator, and from tools whose effects lie outside the filesystem.</w:t>
+        <w:t xml:space="preserve">The study examines cross-application desktop workflows on Linux, including shell operations, file management, and application-level tasks representable in the OSWorld benchmark task suite [41].  The population studied consists of novice computer users and power users recruited for a controlled user study.  The study is conducted in a Linux desktop environment and is bounded by the duration of the thesis project.  The recoverability analysis covers commands in the bash dialect on a Debian system: their effects on the filesystem, and the changes to package and service state they make through apt, dpkg, and systemd.  It is evaluated on a corpus of 777 commands drawn from NL2Bash, from templates covering each composition operator, and from tools whose effects lie outside the filesystem.</w:t>
       </w:r>
     </w:p>
     <w:p>
@@ -2132,7 +2132,7 @@
         </w:r>
       </w:hyperlink>
       <w:r>
-        <w:t xml:space="preserve">; this tradeoff may affect the ceiling on intent parsing accuracy achievable within the study.  Second, users with motor accessibility needs — a highly relevant population — are excluded from the initial evaluation due to ethics-review and recruitment constraints; accessibility-specific configurations such as speech-instructed agent operation for atypical speech patterns [11] are likewise out of scope for the initial implementation but represent a natural extension of the SynapseOS substrate.  Third, SynapseOS targets the Linux desktop specifically, and the findings may not generalize directly to Windows or macOS desktop environments.  Fourth, the safety confirmation policy for irreversible system operations is defined in principle but requires empirical calibration during implementation.  Fifth, evaluation is bounded by the task coverage of the OSWorld benchmark and the custom task suite developed for this study; tasks outside this coverage are not evaluated.  Sixth, the recoverability analysis treats anything it cannot determine as unrecoverable, and so protects such commands only by asking first: code run by an interpreter, programs it does not model, and variables with no value are of this kind.  Its per-command rules are a hand-written enumeration, which its composition builds on rather than replaces, and it resolves a command’s targets shortly before the command runs, so a file changed by another process in the interval is captured as it was when resolved.</w:t>
+        <w:t xml:space="preserve">; this tradeoff may affect the ceiling on intent parsing accuracy achievable within the study.  Second, users with motor accessibility needs — a highly relevant population — are excluded from the initial evaluation due to ethics-review and recruitment constraints; accessibility-specific configurations such as speech-instructed agent operation for atypical speech patterns [10] are likewise out of scope for the initial implementation but represent a natural extension of the SynapseOS substrate.  Third, SynapseOS targets the Linux desktop specifically, and the findings may not generalize directly to Windows or macOS desktop environments.  Fourth, the safety confirmation policy for irreversible system operations is defined in principle but requires empirical calibration during implementation.  Fifth, evaluation is bounded by the task coverage of the OSWorld benchmark and the custom task suite developed for this study; tasks outside this coverage are not evaluated.  Sixth, the recoverability analysis treats anything it cannot determine as unrecoverable, and so protects such commands only by asking first: code run by an interpreter, programs it does not model, and variables with no value are of this kind.  Its per-command rules are a hand-written enumeration, which its composition builds on rather than replaces, and it resolves a command’s targets shortly before the command runs, so a file changed by another process in the interval is captured as it was when resolved.</w:t>
       </w:r>
     </w:p>
     <w:bookmarkEnd w:id="34"/>
@@ -2248,7 +2248,7 @@
         <w:pStyle w:val="FirstParagraph"/>
       </w:pPr>
       <w:r>
-        <w:t xml:space="preserve">This chapter reviews the body of research relevant to the design and evaluation of a conversational interface layer for the Linux desktop, and to the safety of the commands such a layer executes.  The review spans nearly four decades of work on natural-language interfaces to computing systems, from the symbolic-artificial-intelligence consultants developed for the Unix shell in the late 1980s [42] to the large language model (LLM) agents that now operate shells, graphical applications, browsers, and mobile devices.  Its purpose is threefold: to establish the conceptual vocabulary and technical foundations on which the present study builds, to characterize the current state of the field and its recurring limitations, and to locate precisely the gaps that the proposed recoverability analysis, and SynapseOS, the system in which it is deployed, are designed to fill.</w:t>
+        <w:t xml:space="preserve">This chapter reviews the body of research relevant to the design and evaluation of a conversational interface layer for the Linux desktop, and to the safety of the commands such a layer executes.  The review spans nearly four decades of work on natural-language interfaces to computing systems, from the symbolic-artificial-intelligence consultants developed for the Unix shell in the late 1980s [40] to the large language model (LLM) agents that now operate shells, graphical applications, browsers, and mobile devices.  Its purpose is threefold: to establish the conceptual vocabulary and technical foundations on which the present study builds, to characterize the current state of the field and its recurring limitations, and to locate precisely the gaps that the proposed recoverability analysis, and SynapseOS, the system in which it is deployed, are designed to fill.</w:t>
       </w:r>
     </w:p>
     <w:bookmarkEnd w:id="42"/>
@@ -2282,7 +2282,7 @@
         <w:t xml:space="preserve"> </w:t>
       </w:r>
       <w:r>
-        <w:t xml:space="preserve">— Input, Reasoning, Action, and Operating-System Integration — as its theoretical framework.  The framework is adapted from the layered decomposition of large language model (LLM)-brained graphical user interface (GUI) agents proposed in the survey of Zhang and colleagues [46], generalized here from graphical agents specifically to language-mediated computing interfaces as a class.  Figure 2.1 depicts the pipeline and situates the layers relative to one another.</w:t>
+        <w:t xml:space="preserve">— Input, Reasoning, Action, and Operating-System Integration — as its theoretical framework.  The framework is adapted from the layered decomposition of large language model (LLM)-brained graphical user interface (GUI) agents proposed in the survey of Zhang and colleagues [44], generalized here from graphical agents specifically to language-mediated computing interfaces as a class.  Figure 2.1 depicts the pipeline and situates the layers relative to one another.</w:t>
       </w:r>
     </w:p>
     <w:p>
@@ -2347,7 +2347,7 @@
         <w:t xml:space="preserve"> </w:t>
       </w:r>
       <w:r>
-        <w:t xml:space="preserve">The four-layer interaction pipeline for language-mediated computing interfaces, adapted from the LLM-brained GUI-agent survey of Zhang and colleagues [46].  A user’s intent enters at the Input layer, is parsed and grounded at the Reasoning layer, executed at the Action layer, and takes effect within a scope defined at the Operating-System Integration layer.</w:t>
+        <w:t xml:space="preserve">The four-layer interaction pipeline for language-mediated computing interfaces, adapted from the LLM-brained GUI-agent survey of Zhang and colleagues [44].  A user’s intent enters at the Input layer, is parsed and grounded at the Reasoning layer, executed at the Action layer, and takes effect within a scope defined at the Operating-System Integration layer.</w:t>
       </w:r>
     </w:p>
     <w:p>
@@ -2503,15 +2503,15 @@
         <w:pStyle w:val="FirstParagraph"/>
       </w:pPr>
       <w:r>
-        <w:t xml:space="preserve">The aspiration to let users describe what they want in ordinary language and have a computer carry it out is not new.  The earliest serious system in this tradition, the Berkeley Unix Consultant of Wilensky and colleagues [42], was already operational by the late 1980s.  The Unix Consultant was an intelligent natural-language interface that allowed naive users to learn about the Unix operating system through conversation in ordinary English, addressing both the natural-language-frontend problem and the consultation problem, and thereby distinguishing itself from systems intended only as command translators.  It was built on the KODIAK knowledge representation and incorporated a user-modeling component that represented the user’s knowledge state and a teaching component through which users could extend its knowledge base in natural language.  The system demonstrated end-to-end natural-language consultation about Unix, successfully answering "how do I," definitional, and problem-solving questions.  Critically, its authors identified knowledge acquisition as the principal bottleneck: extending the system to a new domain required substantial hand-engineering — a concern that directly foreshadows the contemporary problem of LLM-based agents requiring per-application grounding data.</w:t>
-      </w:r>
-    </w:p>
-    <w:p>
-      <w:pPr>
-        <w:pStyle w:val="BodyText"/>
-      </w:pPr>
-      <w:r>
-        <w:t xml:space="preserve">The intervening decades saw natural-language interaction treated primarily as a supervised-learning problem.  Representative of this pre-LLM era, the work of Li and colleagues on mapping natural-language instructions to mobile user-interface action sequences [19] trained dedicated phrase-extraction and grounding transformers on hand-annotated action sequences, achieving 70.59% accuracy on predicting complete ground-truth action sequences on its benchmark but remaining bound to its purpose-built datasets and architectures.  The decisive shift came with the introduction of in-context reasoning patterns for LLMs.  ReAct, introduced by Yao and colleagues [44], collapsed the multi-stage supervised pipeline into a prompting strategy: the language model is prompted to alternate between free-text "Thought" steps that update its plan and "Action" steps that interact with an external environment, with observations fed back into subsequent reasoning.  Implemented purely as a prompting strategy without fine-tuning, ReAct nonetheless outperformed imitation-learning and reinforcement-learning baselines that required thousands of training trajectories.</w:t>
+        <w:t xml:space="preserve">The aspiration to let users describe what they want in ordinary language and have a computer carry it out is not new.  The earliest serious system in this tradition, the Berkeley Unix Consultant of Wilensky and colleagues [40], was already operational by the late 1980s.  The Unix Consultant was an intelligent natural-language interface that allowed naive users to learn about the Unix operating system through conversation in ordinary English, addressing both the natural-language-frontend problem and the consultation problem, and thereby distinguishing itself from systems intended only as command translators.  It was built on the KODIAK knowledge representation and incorporated a user-modeling component that represented the user’s knowledge state and a teaching component through which users could extend its knowledge base in natural language.  The system demonstrated end-to-end natural-language consultation about Unix, successfully answering "how do I," definitional, and problem-solving questions.  Critically, its authors identified knowledge acquisition as the principal bottleneck: extending the system to a new domain required substantial hand-engineering — a concern that directly foreshadows the contemporary problem of LLM-based agents requiring per-application grounding data.</w:t>
+      </w:r>
+    </w:p>
+    <w:p>
+      <w:pPr>
+        <w:pStyle w:val="BodyText"/>
+      </w:pPr>
+      <w:r>
+        <w:t xml:space="preserve">The intervening decades saw natural-language interaction treated primarily as a supervised-learning problem.  Representative of this pre-LLM era, the work of Li and colleagues on mapping natural-language instructions to mobile user-interface action sequences [18] trained dedicated phrase-extraction and grounding transformers on hand-annotated action sequences, achieving 70.59% accuracy on predicting complete ground-truth action sequences on its benchmark but remaining bound to its purpose-built datasets and architectures.  The decisive shift came with the introduction of in-context reasoning patterns for LLMs.  ReAct, introduced by Yao and colleagues [42], collapsed the multi-stage supervised pipeline into a prompting strategy: the language model is prompted to alternate between free-text "Thought" steps that update its plan and "Action" steps that interact with an external environment, with observations fed back into subsequent reasoning.  Implemented purely as a prompting strategy without fine-tuning, ReAct nonetheless outperformed imitation-learning and reinforcement-learning baselines that required thousands of training trajectories.</w:t>
       </w:r>
     </w:p>
     <w:p>
@@ -2536,15 +2536,15 @@
         <w:pStyle w:val="FirstParagraph"/>
       </w:pPr>
       <w:r>
-        <w:t xml:space="preserve">The aspiration to a natural-language interface has a long-standing critique that remains unanswered, and a review that omitted it would misrepresent the state of the question.  Shneiderman’s account of direct manipulation [34] holds that interfaces succeed when the objects of interest are continuously visible, when actions upon them are rapid, incremental, and reversible, and when their effects are immediately apparent — properties that let a user build and maintain an accurate model of system state.  Norman formalized what an interface does for a user as the bridging of two gulfs [28]: the gulf of execution, between an intention and the actions a system makes available, and the gulf of evaluation, between the system’s response and the user’s ability to interpret it.  Hutchins, Hollan, and Norman [15] argued that direct manipulation narrows both, by making an interface feel like the object of interest itself rather than a description of it.</w:t>
-      </w:r>
-    </w:p>
-    <w:p>
-      <w:pPr>
-        <w:pStyle w:val="BodyText"/>
-      </w:pPr>
-      <w:r>
-        <w:t xml:space="preserve">A language interface sits awkwardly against nearly every one of those properties.  An utterance is not continuously visible, not incremental, and not reversible by the same gesture that produced it; the set of available actions is not displayed, so the user must guess at the system’s capabilities rather than see them.  Shneiderman and Maes debated precisely this trade-off between direct manipulation and interface agents [36], and Shneiderman argued subsequently that speech and language interaction consume the same cognitive resources a user needs in order to hold a task in mind, where pointing does not [35].  Empirical work on modern conversational agents has largely borne the concern out: Luger and Sellen documented a persistent gulf between what users expected a conversational agent to understand and what it actually did [23], and Clark and colleagues found that the properties people value in human conversation transfer poorly to interaction with an agent [5].</w:t>
+        <w:t xml:space="preserve">The aspiration to a natural-language interface has a long-standing critique that remains unanswered, and a review that omitted it would misrepresent the state of the question.  Shneiderman’s account of direct manipulation [32] holds that interfaces succeed when the objects of interest are continuously visible, when actions upon them are rapid, incremental, and reversible, and when their effects are immediately apparent — properties that let a user build and maintain an accurate model of system state.  Norman formalized what an interface does for a user as the bridging of two gulfs [26]: the gulf of execution, between an intention and the actions a system makes available, and the gulf of evaluation, between the system’s response and the user’s ability to interpret it.  Hutchins, Hollan, and Norman [14] argued that direct manipulation narrows both, by making an interface feel like the object of interest itself rather than a description of it.</w:t>
+      </w:r>
+    </w:p>
+    <w:p>
+      <w:pPr>
+        <w:pStyle w:val="BodyText"/>
+      </w:pPr>
+      <w:r>
+        <w:t xml:space="preserve">A language interface sits awkwardly against nearly every one of those properties.  An utterance is not continuously visible, not incremental, and not reversible by the same gesture that produced it; the set of available actions is not displayed, so the user must guess at the system’s capabilities rather than see them.  Shneiderman and Maes debated precisely this trade-off between direct manipulation and interface agents [34], and Shneiderman argued subsequently that speech and language interaction consume the same cognitive resources a user needs in order to hold a task in mind, where pointing does not [33].  Empirical work on modern conversational agents has largely borne the concern out: Luger and Sellen documented a persistent gulf between what users expected a conversational agent to understand and what it actually did [22], and Clark and colleagues found that the properties people value in human conversation transfer poorly to interaction with an agent [4].</w:t>
       </w:r>
     </w:p>
     <w:p>
@@ -2560,7 +2560,7 @@
         <w:pStyle w:val="BodyText"/>
       </w:pPr>
       <w:r>
-        <w:t xml:space="preserve">The comparative question is older than the current literature and considerably less settled than it is often assumed to be.  Norman’s critique of the UNIX command line [27] remains the standard reference for the position that the command line’s power is inaccessible to most people in practice.  But the best-known controlled comparison of command, menu, and iconic interfaces, conducted by Whiteside and colleagues across seventy-six users and seven systems [41], concluded that interface style itself did not predict either performance or preference: careful design did, and the system that served novices best also served experts best.  That finding is as much a caution for the present study as a motivation for it.  It warns against attributing to a conversational paradigm what may in fact belong to the quality of one particular implementation, and it is a principal reason this study measures a specific system against a specific baseline rather than claiming to measure one paradigm against another.</w:t>
+        <w:t xml:space="preserve">The comparative question is older than the current literature and considerably less settled than it is often assumed to be.  It is widely held that the command line’s power is inaccessible to most people in practice.  But the best-known controlled comparison of command, menu, and iconic interfaces, conducted by Whiteside and colleagues across seventy-six users and seven systems [39], concluded that interface style itself did not predict either performance or preference: careful design did, and the system that served novices best also served experts best.  That finding is as much a caution for the present study as a motivation for it.  It warns against attributing to a conversational paradigm what may in fact belong to the quality of one particular implementation, and it is a principal reason this study measures a specific system against a specific baseline rather than claiming to measure one paradigm against another.</w:t>
       </w:r>
     </w:p>
     <w:bookmarkEnd w:id="47"/>
@@ -2587,23 +2587,23 @@
         <w:pStyle w:val="BodyText"/>
       </w:pPr>
       <w:r>
-        <w:t xml:space="preserve">Westenfelder and colleagues [40] address this translation problem directly.  Their work constructs a manually verified test set of 600 instruction–command pairs and a training set of 40,939 pairs, and introduces a functional-equivalence heuristic that reaches 95% confidence in determining whether two Bash commands produce the same effect — allowing automated evaluation to move beyond exact-string matching to a measure of whether a generated command actually accomplishes the intended task.  Their fine-tuned models substantially outperform zero-shot baselines, demonstrating that fine-tuning specifically on command-translation data is effective.  The authors identify two persistent limitations: ambiguity in user instructions, and the absence of system context — the contents of the current directory, the user’s command history, and environment variables — at translation time.  Integrating context-aware retrieval is identified as a direction, one that the persistent conversational session of SynapseOS is well positioned to supply.</w:t>
-      </w:r>
-    </w:p>
-    <w:p>
-      <w:pPr>
-        <w:pStyle w:val="BodyText"/>
-      </w:pPr>
-      <w:r>
-        <w:t xml:space="preserve">Where translation accuracy is the concern of Westenfelder and colleagues, safety is the concern of Gyawali and colleagues, whose NaSh system [10] proposes guardrails for an LLM-powered natural-language shell for Linux.  Published under the operating-systems classification, NaSh interposes a guardrail layer between the user’s natural-language input and the LLM-generated command: the model proposes a candidate command, the guardrail layer evaluates it against safety, reversibility, and confirmation criteria, and the user receives a structured preview before execution.  The authors note that LLM outputs may be unintended or unexplainable, requiring guardrails for user error recovery, and they leave as open work both the design of recovery and rollback mechanisms for irreversible system operations and the empirical user evaluation of the approach.  These two open problems — reversibility-aware confirmation and empirical validation with users — are precisely the concerns that the confirmation gate, undo mechanism, and controlled user study of the present study are designed to address.</w:t>
-      </w:r>
-    </w:p>
-    <w:p>
-      <w:pPr>
-        <w:pStyle w:val="BodyText"/>
-      </w:pPr>
-      <w:r>
-        <w:t xml:space="preserve">The feasibility of deploying such a system without reliance on a hosted frontier model is supported by the large-scale evaluation of Jacobs and colleagues [16], who assess a broad range of locally deployable open-source LLMs on Bash command generation.  Their work provides an empirical anchor for the viability of running natural-language-to-Bash translation on local, open-weights models of modest size — the deployment posture adopted by SynapseOS for reasons of privacy and offline operation.  Taken together, the shell-and-command-line thread establishes that natural-language-to-Bash translation is tractable, that safety and reversibility are central rather than incidental concerns, and that local deployment is feasible; yet no surveyed shell-level system has been evaluated with users against the conventional workflow it would supplement.</w:t>
+        <w:t xml:space="preserve">Westenfelder and colleagues [38] address this translation problem directly.  Their work constructs a manually verified test set of 600 instruction–command pairs and a training set of 40,939 pairs, and introduces a functional-equivalence heuristic that reaches 95% confidence in determining whether two Bash commands produce the same effect — allowing automated evaluation to move beyond exact-string matching to a measure of whether a generated command actually accomplishes the intended task.  Their fine-tuned models substantially outperform zero-shot baselines, demonstrating that fine-tuning specifically on command-translation data is effective.  The authors identify two persistent limitations: ambiguity in user instructions, and the absence of system context — the contents of the current directory, the user’s command history, and environment variables — at translation time.  Integrating context-aware retrieval is identified as a direction, one that the persistent conversational session of SynapseOS is well positioned to supply.</w:t>
+      </w:r>
+    </w:p>
+    <w:p>
+      <w:pPr>
+        <w:pStyle w:val="BodyText"/>
+      </w:pPr>
+      <w:r>
+        <w:t xml:space="preserve">Where translation accuracy is the concern of Westenfelder and colleagues, safety is the concern of Gyawali and colleagues, whose NaSh system [9] proposes guardrails for an LLM-powered natural-language shell for Linux.  Published under the operating-systems classification, NaSh interposes a guardrail layer between the user’s natural-language input and the LLM-generated command: the model proposes a candidate command, the guardrail layer evaluates it against safety, reversibility, and confirmation criteria, and the user receives a structured preview before execution.  The authors note that LLM outputs may be unintended or unexplainable, requiring guardrails for user error recovery, and they leave as open work both the design of recovery and rollback mechanisms for irreversible system operations and the empirical user evaluation of the approach.  These two open problems — reversibility-aware confirmation and empirical validation with users — are precisely the concerns that the confirmation gate, undo mechanism, and controlled user study of the present study are designed to address.</w:t>
+      </w:r>
+    </w:p>
+    <w:p>
+      <w:pPr>
+        <w:pStyle w:val="BodyText"/>
+      </w:pPr>
+      <w:r>
+        <w:t xml:space="preserve">The feasibility of deploying such a system without reliance on a hosted frontier model is supported by the large-scale evaluation of Jacobs and colleagues [15], who assess a broad range of locally deployable open-source LLMs on Bash command generation.  Their work provides an empirical anchor for the viability of running natural-language-to-Bash translation on local, open-weights models of modest size — the deployment posture adopted by SynapseOS for reasons of privacy and offline operation.  Taken together, the shell-and-command-line thread establishes that natural-language-to-Bash translation is tractable, that safety and reversibility are central rather than incidental concerns, and that local deployment is feasible; yet no surveyed shell-level system has been evaluated with users against the conventional workflow it would supplement.</w:t>
       </w:r>
     </w:p>
     <w:p>
@@ -2624,7 +2624,7 @@
         <w:t xml:space="preserve">permission</w:t>
       </w:r>
       <w:r>
-        <w:t xml:space="preserve">: the command is matched against an enumerated set of patterns judged dangerous, and is then allowed, refused, or escalated to the user.  NaSh [10] proposes guardrails of this kind and, notably, identifies selective undo as a requirement while leaving its mechanism open; the agentic coding assistants discussed in §2.8 operate the same way in practice, with allow-and-deny lists over command prefixes.  A permission model answers whether a command may run.  It does not answer whether, having run, the command can be undone — and those are different questions with different answers.  Refusing a command protects a user only until they approve it, which for any system that must let work proceed is most of the time.</w:t>
+        <w:t xml:space="preserve">: the command is matched against an enumerated set of patterns judged dangerous, and is then allowed, refused, or escalated to the user.  NaSh [9] proposes guardrails of this kind and, notably, identifies selective undo as a requirement while leaving its mechanism open; the agentic coding assistants discussed in §2.8 operate the same way in practice, with allow-and-deny lists over command prefixes.  A permission model answers whether a command may run.  It does not answer whether, having run, the command can be undone — and those are different questions with different answers.  Refusing a command protects a user only until they approve it, which for any system that must let work proceed is most of the time.</w:t>
       </w:r>
     </w:p>
     <w:p>
@@ -2652,15 +2652,15 @@
         <w:pStyle w:val="BodyText"/>
       </w:pPr>
       <w:r>
-        <w:t xml:space="preserve">The technique this recoverability judgment relies on — determining what a piece of code will do without executing it — is not new; it has a decades-long history in programming-language theory under two related names, neither of which the systems surveyed above draw on.  Abstract interpretation, introduced by Cousot and Cousot [6], is the foundational technique for computing sound, conservative approximations of a program’s runtime behavior by evaluating it over an abstract domain rather than its concrete one.  Type-and-effect systems, developed by Jouvelot and Gifford [17] and given a full formal treatment by Talpin and Jouvelot [37], extend a program’s type judgment with an explicit account of the side effects an expression may produce, so that a compiler or static checker can reason about those effects instead of leaving them implicit in execution.  The recoverability algorithm this study contributes (Chapter 3, Section 2.1(c)) is an instance of this discipline applied to a domain neither tradition has targeted: a generated shell command is treated as an expression whose effect — on the filesystem, rather than on a type system’s abstract state — is derived from its syntax and composed across its operators, and it is that effect set, not the command’s name, that the recoverability verdict is computed over.  This connects the algorithm to an established formal lineage rather than presenting it as a bespoke heuristic, and it grounds the algorithm’s one-sided soundness property — over-approximating destructiveness under uncertainty rather than under-approximating it — in the same requirement abstract interpretation itself imposes: a sound abstraction may lose precision, but it may never assert a property the concrete execution does not actually have.</w:t>
-      </w:r>
-    </w:p>
-    <w:p>
-      <w:pPr>
-        <w:pStyle w:val="BodyText"/>
-      </w:pPr>
-      <w:r>
-        <w:t xml:space="preserve">Static analysis of shell scripts specifically is comparatively little studied, and the existing work targets properties adjacent to recoverability rather than recoverability itself.  ABash [24] performs abstract interpretation over bash’s variable-expansion semantics to catch common expansion bugs and includes taint tracking, but is not concerned with what a script’s commands would do to the filesystem if executed correctly.  Smoosh [9] gives the POSIX shell a mechanized, executable small-step operational semantics, validated against other shells' conformance test suites — exactly the kind of ground-truth semantics a static effect analysis would need to be checked against — but stops at defining that semantics rather than analyzing programs written in it.  Closest of the three is CoLiS [2], which applies symbolic execution to the more than twenty-seven thousand POSIX-shell maintainer scripts in the Debian package archive to verify</w:t>
+        <w:t xml:space="preserve">The technique this recoverability judgment relies on — determining what a piece of code will do without executing it — is not new; it has a decades-long history in programming-language theory under two related names, neither of which the systems surveyed above draw on.  Abstract interpretation, introduced by Cousot and Cousot [5], is the foundational technique for computing sound, conservative approximations of a program’s runtime behavior by evaluating it over an abstract domain rather than its concrete one.  Type-and-effect systems, developed by Jouvelot and Gifford [16] and given a full formal treatment by Talpin and Jouvelot [35], extend a program’s type judgment with an explicit account of the side effects an expression may produce, so that a compiler or static checker can reason about those effects instead of leaving them implicit in execution.  The recoverability algorithm this study contributes (Chapter 3, Section 2.1(c)) is an instance of this discipline applied to a domain neither tradition has targeted: a generated shell command is treated as an expression whose effect — on the filesystem, rather than on a type system’s abstract state — is derived from its syntax and composed across its operators, and it is that effect set, not the command’s name, that the recoverability verdict is computed over.  This connects the algorithm to an established formal lineage rather than presenting it as a bespoke heuristic, and it grounds the algorithm’s one-sided soundness property — over-approximating destructiveness under uncertainty rather than under-approximating it — in the same requirement abstract interpretation itself imposes: a sound abstraction may lose precision, but it may never assert a property the concrete execution does not actually have.</w:t>
+      </w:r>
+    </w:p>
+    <w:p>
+      <w:pPr>
+        <w:pStyle w:val="BodyText"/>
+      </w:pPr>
+      <w:r>
+        <w:t xml:space="preserve">Static analysis of shell scripts specifically is comparatively little studied, and the existing work targets properties adjacent to recoverability rather than recoverability itself.  ABash [23] performs abstract interpretation over bash’s variable-expansion semantics to catch common expansion bugs and includes taint tracking, but is not concerned with what a script’s commands would do to the filesystem if executed correctly.  Smoosh [8] gives the POSIX shell a mechanized, executable small-step operational semantics, validated against other shells' conformance test suites — exactly the kind of ground-truth semantics a static effect analysis would need to be checked against — but stops at defining that semantics rather than analyzing programs written in it.  Closest of the three is CoLiS [1], which applies symbolic execution to the more than twenty-seven thousand POSIX-shell maintainer scripts in the Debian package archive to verify</w:t>
       </w:r>
       <w:r>
         <w:t xml:space="preserve"> </w:t>
@@ -2754,7 +2754,7 @@
         <w:pStyle w:val="FirstParagraph"/>
       </w:pPr>
       <w:r>
-        <w:t xml:space="preserve">The web has been the most heavily studied environment for language-guided agents.  Mind2Web, introduced by Deng and colleagues [8], is the first dataset for developing generalist web agents that follow language instructions across diverse real-world websites, comprising over two thousand open-ended tasks collected from 137 websites across 31 domains; its accompanying two-stage model uses a small language model to filter candidate elements from large documents before invoking a larger model to choose among them.  WebArena, introduced by Zhou and colleagues [50], provides a fully self-hosted, reproducible web environment of functional website clones and evaluates 812 long-horizon tasks for functional correctness rather than trajectory similarity, establishing a challenging benchmark on which contemporary models achieved completion rates far below human performance.  Zheng and colleagues [49], in their SeeAct framework, decouple visual understanding from action: the model observes a screenshot, generates a textual plan, and a separate step grounds that plan onto page elements.  Their central finding is diagnostic for the entire field — with oracle grounding provided, the model completes 51.1% of tasks on live websites, substantially outperforming a text-only baseline at 13.3%, but performance degrades sharply when grounding must itself be inferred, confirming visual grounding as the principal bottleneck.</w:t>
+        <w:t xml:space="preserve">The web has been the most heavily studied environment for language-guided agents.  Mind2Web, introduced by Deng and colleagues [7], is the first dataset for developing generalist web agents that follow language instructions across diverse real-world websites, comprising over two thousand open-ended tasks collected from 137 websites across 31 domains; its accompanying two-stage model uses a small language model to filter candidate elements from large documents before invoking a larger model to choose among them.  WebArena, introduced by Zhou and colleagues [48], provides a fully self-hosted, reproducible web environment of functional website clones and evaluates 812 long-horizon tasks for functional correctness rather than trajectory similarity, establishing a challenging benchmark on which contemporary models achieved completion rates far below human performance.  Zheng and colleagues [47], in their SeeAct framework, decouple visual understanding from action: the model observes a screenshot, generates a textual plan, and a separate step grounds that plan onto page elements.  Their central finding is diagnostic for the entire field — with oracle grounding provided, the model completes 51.1% of tasks on live websites, substantially outperforming a text-only baseline at 13.3%, but performance degrades sharply when grounding must itself be inferred, confirming visual grounding as the principal bottleneck.</w:t>
       </w:r>
     </w:p>
     <w:bookmarkEnd w:id="50"/>
@@ -2772,7 +2772,7 @@
         <w:pStyle w:val="FirstParagraph"/>
       </w:pPr>
       <w:r>
-        <w:t xml:space="preserve">Mobile-device control has produced large-scale datasets and progressively more autonomous agents.  The pre-LLM work of Li and colleagues [19], discussed in §2.3, established the grounding problem for mobile interfaces.  Android in the Wild, from Rawles and colleagues [32], contributes a dataset of 715,000 episodes spanning 30,000 unique instructions, in which actions are gestures at arbitrary screen coordinates rather than operations on indexed interface elements, exposing the challenge that actions must be inferred from visual appearance rather than from a structured model of the interface.  AppAgent, from Zhang and colleagues [48], operates Android applications through a simplified action space of taps and swipes and learns to use new applications through autonomous exploration or by observing human demonstrations, generating application-specific documentation that matched or exceeded human-written documentation.  Mobile-Agent, from Wang and colleagues [39], adopts a purely vision-centric approach that requires no system metadata, using optical-character-recognition and icon-detection modules to locate interface elements — achieving broad applicability across mobile environments at the cost of vision-grounding errors that require recovery mechanisms.</w:t>
+        <w:t xml:space="preserve">Mobile-device control has produced large-scale datasets and progressively more autonomous agents.  The pre-LLM work of Li and colleagues [18], discussed in §2.3, established the grounding problem for mobile interfaces.  Android in the Wild, from Rawles and colleagues [30], contributes a dataset of 715,000 episodes spanning 30,000 unique instructions, in which actions are gestures at arbitrary screen coordinates rather than operations on indexed interface elements, exposing the challenge that actions must be inferred from visual appearance rather than from a structured model of the interface.  AppAgent, from Zhang and colleagues [46], operates Android applications through a simplified action space of taps and swipes and learns to use new applications through autonomous exploration or by observing human demonstrations, generating application-specific documentation that matched or exceeded human-written documentation.  Mobile-Agent, from Wang and colleagues [37], adopts a purely vision-centric approach that requires no system metadata, using optical-character-recognition and icon-detection modules to locate interface elements — achieving broad applicability across mobile environments at the cost of vision-grounding errors that require recovery mechanisms.</w:t>
       </w:r>
     </w:p>
     <w:bookmarkEnd w:id="51"/>
@@ -2790,7 +2790,7 @@
         <w:pStyle w:val="FirstParagraph"/>
       </w:pPr>
       <w:r>
-        <w:t xml:space="preserve">Desktop agents are the most direct graphical analogue to the present work, and their limitations are the most instructive.  ScreenAgent, from Niu and colleagues [26], is a vision-language-model-driven agent for cross-application desktop control that operates in a plan–act–reflect cycle, specifying actions as coordinates and key sequences; its authors acknowledge that vision-only grounding is less reliable than approaches with API access.  WinClick, from Hui and colleagues [14], targets Windows-desktop grounding and observes that most existing GUI agents rely on structured data formats such as the document object model or HyperText Markup Language, which are unavailable across general desktop environments; it therefore performs visual grounding directly from screenshots.  UFO², the "Desktop AgentOS" of Zhang and colleagues [47], is the most ambitious desktop system surveyed: it fuses the native Windows accessibility framework with vision-based parsing in a hybrid action mechanism, dispatching subtasks from a coordinating agent to application-specialized agents.  Its authors argue that existing computer-using agents are hindered by shallow operating-system integration, fragile screenshot-based interaction, and disruptive execution, and they identify adaptation to other desktop platforms, such as Linux and macOS, as future work.  UFO² nonetheless operates as an automation layer dispatched atop the existing Windows shell rather than as a replacement for it, and its authors frame cross-platform deployment as groundwork for a unified ecosystem of desktop automation solutions — the trajectory from which the present study departs.</w:t>
+        <w:t xml:space="preserve">Desktop agents are the most direct graphical analogue to the present work, and their limitations are the most instructive.  ScreenAgent, from Niu and colleagues [25], is a vision-language-model-driven agent for cross-application desktop control that operates in a plan–act–reflect cycle, specifying actions as coordinates and key sequences; its authors acknowledge that vision-only grounding is less reliable than approaches with API access.  WinClick, from Hui and colleagues [13], targets Windows-desktop grounding and observes that most existing GUI agents rely on structured data formats such as the document object model or HyperText Markup Language, which are unavailable across general desktop environments; it therefore performs visual grounding directly from screenshots.  UFO², the "Desktop AgentOS" of Zhang and colleagues [45], is the most ambitious desktop system surveyed: it fuses the native Windows accessibility framework with vision-based parsing in a hybrid action mechanism, dispatching subtasks from a coordinating agent to application-specialized agents.  Its authors argue that existing computer-using agents are hindered by shallow operating-system integration, fragile screenshot-based interaction, and disruptive execution, and they identify adaptation to other desktop platforms, such as Linux and macOS, as future work.  UFO² nonetheless operates as an automation layer dispatched atop the existing Windows shell rather than as a replacement for it, and its authors frame cross-platform deployment as groundwork for a unified ecosystem of desktop automation solutions — the trajectory from which the present study departs.</w:t>
       </w:r>
     </w:p>
     <w:bookmarkEnd w:id="52"/>
@@ -2826,7 +2826,7 @@
         <w:pStyle w:val="FirstParagraph"/>
       </w:pPr>
       <w:r>
-        <w:t xml:space="preserve">Underlying many of these agents are vision-language models trained specifically for interface understanding.  CogAgent, from Hong and colleagues [13], is an eighteen-billion-parameter visual language model specialized for GUI understanding and navigation, using both low- and high-resolution image encoders to recognize the small icons and text typical of graphical interfaces.  It supports the position that pure-vision GUI agents are viable when the underlying model is trained appropriately — but at a compute cost, and with the cross-platform generalization limitations common to the entire graphical-agent literature.  Across web, mobile, and desktop, these systems demonstrate broad capability within a single platform class, while consistently identifying visual grounding as an unsolved bottleneck and trending toward hybrid execution that prefers structured access where available and falls back to vision.</w:t>
+        <w:t xml:space="preserve">Underlying many of these agents are vision-language models trained specifically for interface understanding.  CogAgent, from Hong and colleagues [12], is an eighteen-billion-parameter visual language model specialized for GUI understanding and navigation, using both low- and high-resolution image encoders to recognize the small icons and text typical of graphical interfaces.  It supports the position that pure-vision GUI agents are viable when the underlying model is trained appropriately — but at a compute cost, and with the cross-platform generalization limitations common to the entire graphical-agent literature.  Across web, mobile, and desktop, these systems demonstrate broad capability within a single platform class, while consistently identifying visual grounding as an unsolved bottleneck and trending toward hybrid execution that prefers structured access where available and falls back to vision.</w:t>
       </w:r>
     </w:p>
     <w:bookmarkEnd w:id="54"/>
@@ -2853,15 +2853,15 @@
         <w:pStyle w:val="BodyText"/>
       </w:pPr>
       <w:r>
-        <w:t xml:space="preserve">VoicePilot, from Padmanabha and colleagues [30], is a framework for using LLMs as speech interfaces to physically assistive robots for individuals with motor impairments.  Although its immediate target is robotic assistance rather than desktop computing, it is included here because it is the most rigorous human-centered evaluation in the LLM-speech-interface literature.  The authors derive five concrete design guidelines from a study with motor-impaired participants, among them the importance of execution speed approaching that of a caregiver and the necessity of preview-and-confirm workflows — a guideline that directly informs the reversibility-based confirmation design of the present study.  DexAssist, from Mehendale and Walishetti [25], targets web navigation by users with fine-motor impairments using two LLMs in tandem — one to interpret voice commands and a second to map the interpretation onto interface elements with fallback strategies — reducing the misinterpretation failures of single-model voice navigation on dense layouts.  The architecture of van Dam [38] proposes retrofitting LLM-based conversational interfaces onto existing single-application graphical interfaces, exposing an application’s navigation graph through a tool protocol and handling voice input through real-time speech recognition; its author observes that most production applications were never designed with speech in mind, making such retrofitting an ongoing challenge.</w:t>
-      </w:r>
-    </w:p>
-    <w:p>
-      <w:pPr>
-        <w:pStyle w:val="BodyText"/>
-      </w:pPr>
-      <w:r>
-        <w:t xml:space="preserve">More recent work continues to mature the components required for speech-driven interface control.  Han and colleagues, in GUIRoboTron-Speech [11], advance automated GUI agents driven directly by speech instructions, while Park and colleagues, in R-VLM [31], contribute region-aware visual grounding for more precise identification of on-screen elements.  What unites this thread is that it operates at the level of the individual application or interaction technique rather than at the level of the session itself.  These approaches presuppose an underlying conversational system surface on which to run, yet no such surface exists at the session level.  This complementarity is significant: a general-purpose conversational interface layer would serve not only mainstream users but also provide the substrate that accessibility-specific configurations require — positioning accessibility not as the immediate target of the present study, which scopes it out for recruitment and ethics reasons, but as a natural and well-grounded extension of its contribution.</w:t>
+        <w:t xml:space="preserve">VoicePilot, from Padmanabha and colleagues [28], is a framework for using LLMs as speech interfaces to physically assistive robots for individuals with motor impairments.  Although its immediate target is robotic assistance rather than desktop computing, it is included here because it is the most rigorous human-centered evaluation in the LLM-speech-interface literature.  The authors derive five concrete design guidelines from a study with motor-impaired participants, among them the importance of execution speed approaching that of a caregiver and the necessity of preview-and-confirm workflows — a guideline that directly informs the reversibility-based confirmation design of the present study.  DexAssist, from Mehendale and Walishetti [24], targets web navigation by users with fine-motor impairments using two LLMs in tandem — one to interpret voice commands and a second to map the interpretation onto interface elements with fallback strategies — reducing the misinterpretation failures of single-model voice navigation on dense layouts.  The architecture of van Dam [36] proposes retrofitting LLM-based conversational interfaces onto existing single-application graphical interfaces, exposing an application’s navigation graph through a tool protocol and handling voice input through real-time speech recognition; its author observes that most production applications were never designed with speech in mind, making such retrofitting an ongoing challenge.</w:t>
+      </w:r>
+    </w:p>
+    <w:p>
+      <w:pPr>
+        <w:pStyle w:val="BodyText"/>
+      </w:pPr>
+      <w:r>
+        <w:t xml:space="preserve">More recent work continues to mature the components required for speech-driven interface control.  Han and colleagues, in GUIRoboTron-Speech [10], advance automated GUI agents driven directly by speech instructions, while Park and colleagues, in R-VLM [29], contribute region-aware visual grounding for more precise identification of on-screen elements.  What unites this thread is that it operates at the level of the individual application or interaction technique rather than at the level of the session itself.  These approaches presuppose an underlying conversational system surface on which to run, yet no such surface exists at the session level.  This complementarity is significant: a general-purpose conversational interface layer would serve not only mainstream users but also provide the substrate that accessibility-specific configurations require — positioning accessibility not as the immediate target of the present study, which scopes it out for recruitment and ethics reasons, but as a natural and well-grounded extension of its contribution.</w:t>
       </w:r>
     </w:p>
     <w:bookmarkEnd w:id="56"/>
@@ -2879,15 +2879,15 @@
         <w:pStyle w:val="FirstParagraph"/>
       </w:pPr>
       <w:r>
-        <w:t xml:space="preserve">The rapid proliferation of computer-using agents has been accompanied by increasingly rigorous evaluation environments, and these establish both the current ceiling of the field’s capability and the methods by which that capability is measured.  The most consequential is OSWorld, from Xie and colleagues [43], a benchmark of 369 real-world computer tasks in a real-computer environment spanning Ubuntu, Windows, and macOS.  At its 2024 release the margin it measured was stark: humans achieved 72.36% success where the best evaluated model reached 12.24%.  That particular margin has since closed, with leading agents now exceeding the original human baseline on the revised task set — but the closure reflects progress on short, self-contained tasks rather than on sustained computer work.  Its successor, OSWorld 2.0 [45], evaluates 108 long-horizon workflows whose median item requires roughly an hour and a half of skilled human operation; there the best frontier configuration completes only 20.6% of tasks outright.  The reported failures concentrate not in interface navigation but in tracking constraints across a long task, absorbing information that arrives mid-way, and verifying a result before declaring completion.  The field’s ceiling has moved substantially; it has not been reached.  OSWorld is also directly relevant to the present study as the source of a real-task suite against which benchmark comparability can be established.</w:t>
-      </w:r>
-    </w:p>
-    <w:p>
-      <w:pPr>
-        <w:pStyle w:val="BodyText"/>
-      </w:pPr>
-      <w:r>
-        <w:t xml:space="preserve">Complementing the benchmark literature, the survey of LLM-brained GUI agents by Zhang and colleagues [46] synthesizes the field through 2024, organizing it around the components of perception, planning, action, and memory, and providing the four-layer vocabulary adopted in §2.2 of this review.  It enumerates the field’s open challenges — accurate element localization, knowledge retrieval, long-horizon planning, and safety-aware execution control; notably, none of the challenges it enumerates concerns replacing the session layer itself: the survey takes the surrounding operating-system session as given, which is the assumption the present study sets out to test.  What the evaluation literature reveals, however, is a specific methodological limitation: rigorous as these benchmarks are, they measure the autonomous task completion of agents acting on a user’s behalf, not the comparative performance of a human user working through a conversational interface versus a conventional graphical one.  That distinction motivates the evaluation design reviewed in §2.9.</w:t>
+        <w:t xml:space="preserve">The rapid proliferation of computer-using agents has been accompanied by increasingly rigorous evaluation environments, and these establish both the current ceiling of the field’s capability and the methods by which that capability is measured.  The most consequential is OSWorld, from Xie and colleagues [41], a benchmark of 369 real-world computer tasks in a real-computer environment spanning Ubuntu, Windows, and macOS.  At its 2024 release the margin it measured was stark: humans achieved 72.36% success where the best evaluated model reached 12.24%.  That particular margin has since closed, with leading agents now exceeding the original human baseline on the revised task set — but the closure reflects progress on short, self-contained tasks rather than on sustained computer work.  Its successor, OSWorld 2.0 [43], evaluates 108 long-horizon workflows whose median item requires roughly an hour and a half of skilled human operation; there the best frontier configuration completes only 20.6% of tasks outright.  The reported failures concentrate not in interface navigation but in tracking constraints across a long task, absorbing information that arrives mid-way, and verifying a result before declaring completion.  The field’s ceiling has moved substantially; it has not been reached.  OSWorld is also directly relevant to the present study as the source of a real-task suite against which benchmark comparability can be established.</w:t>
+      </w:r>
+    </w:p>
+    <w:p>
+      <w:pPr>
+        <w:pStyle w:val="BodyText"/>
+      </w:pPr>
+      <w:r>
+        <w:t xml:space="preserve">Complementing the benchmark literature, the survey of LLM-brained GUI agents by Zhang and colleagues [44] synthesizes the field through 2024, organizing it around the components of perception, planning, action, and memory, and providing the four-layer vocabulary adopted in §2.2 of this review.  It enumerates the field’s open challenges — accurate element localization, knowledge retrieval, long-horizon planning, and safety-aware execution control; notably, none of the challenges it enumerates concerns replacing the session layer itself: the survey takes the surrounding operating-system session as given, which is the assumption the present study sets out to test.  What the evaluation literature reveals, however, is a specific methodological limitation: rigorous as these benchmarks are, they measure the autonomous task completion of agents acting on a user’s behalf, not the comparative performance of a human user working through a conversational interface versus a conventional graphical one.  That distinction motivates the evaluation design reviewed in §2.9.</w:t>
       </w:r>
     </w:p>
     <w:bookmarkEnd w:id="57"/>
@@ -3024,7 +3024,7 @@
               <w:jc w:val="left"/>
             </w:pPr>
             <w:r>
-              <w:t xml:space="preserve">Wilensky et al. [42]</w:t>
+              <w:t xml:space="preserve">Wilensky et al. [40]</w:t>
             </w:r>
           </w:p>
         </w:tc>
@@ -3098,7 +3098,7 @@
               <w:jc w:val="left"/>
             </w:pPr>
             <w:r>
-              <w:t xml:space="preserve">Westenfelder et al. [40]</w:t>
+              <w:t xml:space="preserve">Westenfelder et al. [38]</w:t>
             </w:r>
           </w:p>
         </w:tc>
@@ -3172,7 +3172,7 @@
               <w:jc w:val="left"/>
             </w:pPr>
             <w:r>
-              <w:t xml:space="preserve">Gyawali et al. [10]</w:t>
+              <w:t xml:space="preserve">Gyawali et al. [9]</w:t>
             </w:r>
           </w:p>
         </w:tc>
@@ -3246,7 +3246,7 @@
               <w:jc w:val="left"/>
             </w:pPr>
             <w:r>
-              <w:t xml:space="preserve">van Dam [38]</w:t>
+              <w:t xml:space="preserve">van Dam [36]</w:t>
             </w:r>
           </w:p>
         </w:tc>
@@ -3320,7 +3320,7 @@
               <w:jc w:val="left"/>
             </w:pPr>
             <w:r>
-              <w:t xml:space="preserve">Padmanabha et al. [30]</w:t>
+              <w:t xml:space="preserve">Padmanabha et al. [28]</w:t>
             </w:r>
           </w:p>
         </w:tc>
@@ -3394,7 +3394,7 @@
               <w:jc w:val="left"/>
             </w:pPr>
             <w:r>
-              <w:t xml:space="preserve">Mehendale and Walishetti [25]</w:t>
+              <w:t xml:space="preserve">Mehendale and Walishetti [24]</w:t>
             </w:r>
           </w:p>
         </w:tc>
@@ -3468,7 +3468,7 @@
               <w:jc w:val="left"/>
             </w:pPr>
             <w:r>
-              <w:t xml:space="preserve">Deng et al. [8]</w:t>
+              <w:t xml:space="preserve">Deng et al. [7]</w:t>
             </w:r>
           </w:p>
         </w:tc>
@@ -3542,7 +3542,7 @@
               <w:jc w:val="left"/>
             </w:pPr>
             <w:r>
-              <w:t xml:space="preserve">Zhou et al. [50]</w:t>
+              <w:t xml:space="preserve">Zhou et al. [48]</w:t>
             </w:r>
           </w:p>
         </w:tc>
@@ -3616,7 +3616,7 @@
               <w:jc w:val="left"/>
             </w:pPr>
             <w:r>
-              <w:t xml:space="preserve">Zheng et al. [49]</w:t>
+              <w:t xml:space="preserve">Zheng et al. [47]</w:t>
             </w:r>
           </w:p>
         </w:tc>
@@ -3690,7 +3690,7 @@
               <w:jc w:val="left"/>
             </w:pPr>
             <w:r>
-              <w:t xml:space="preserve">Rawles et al. [32]</w:t>
+              <w:t xml:space="preserve">Rawles et al. [30]</w:t>
             </w:r>
           </w:p>
         </w:tc>
@@ -3764,7 +3764,7 @@
               <w:jc w:val="left"/>
             </w:pPr>
             <w:r>
-              <w:t xml:space="preserve">Zhang et al. [48]</w:t>
+              <w:t xml:space="preserve">Zhang et al. [46]</w:t>
             </w:r>
           </w:p>
         </w:tc>
@@ -3838,7 +3838,7 @@
               <w:jc w:val="left"/>
             </w:pPr>
             <w:r>
-              <w:t xml:space="preserve">Wang et al. [39]</w:t>
+              <w:t xml:space="preserve">Wang et al. [37]</w:t>
             </w:r>
           </w:p>
         </w:tc>
@@ -3912,7 +3912,7 @@
               <w:jc w:val="left"/>
             </w:pPr>
             <w:r>
-              <w:t xml:space="preserve">Hong et al. [13]</w:t>
+              <w:t xml:space="preserve">Hong et al. [12]</w:t>
             </w:r>
           </w:p>
         </w:tc>
@@ -3986,7 +3986,7 @@
               <w:jc w:val="left"/>
             </w:pPr>
             <w:r>
-              <w:t xml:space="preserve">Niu et al. [26]</w:t>
+              <w:t xml:space="preserve">Niu et al. [25]</w:t>
             </w:r>
           </w:p>
         </w:tc>
@@ -4060,7 +4060,7 @@
               <w:jc w:val="left"/>
             </w:pPr>
             <w:r>
-              <w:t xml:space="preserve">Hui et al. [14]</w:t>
+              <w:t xml:space="preserve">Hui et al. [13]</w:t>
             </w:r>
           </w:p>
         </w:tc>
@@ -4134,7 +4134,7 @@
               <w:jc w:val="left"/>
             </w:pPr>
             <w:r>
-              <w:t xml:space="preserve">Zhang et al. [47]</w:t>
+              <w:t xml:space="preserve">Zhang et al. [45]</w:t>
             </w:r>
           </w:p>
         </w:tc>
@@ -4208,7 +4208,7 @@
               <w:jc w:val="left"/>
             </w:pPr>
             <w:r>
-              <w:t xml:space="preserve">Xie et al. [43]</w:t>
+              <w:t xml:space="preserve">Xie et al. [41]</w:t>
             </w:r>
           </w:p>
         </w:tc>
@@ -4282,7 +4282,7 @@
               <w:jc w:val="left"/>
             </w:pPr>
             <w:r>
-              <w:t xml:space="preserve">Li et al. [19]</w:t>
+              <w:t xml:space="preserve">Li et al. [18]</w:t>
             </w:r>
           </w:p>
         </w:tc>
@@ -4356,7 +4356,7 @@
               <w:jc w:val="left"/>
             </w:pPr>
             <w:r>
-              <w:t xml:space="preserve">Yao et al. [44]</w:t>
+              <w:t xml:space="preserve">Yao et al. [42]</w:t>
             </w:r>
           </w:p>
         </w:tc>
@@ -4430,7 +4430,7 @@
               <w:jc w:val="left"/>
             </w:pPr>
             <w:r>
-              <w:t xml:space="preserve">Han et al. [11]</w:t>
+              <w:t xml:space="preserve">Han et al. [10]</w:t>
             </w:r>
           </w:p>
         </w:tc>
@@ -4504,7 +4504,7 @@
               <w:jc w:val="left"/>
             </w:pPr>
             <w:r>
-              <w:t xml:space="preserve">Park et al. [31]</w:t>
+              <w:t xml:space="preserve">Park et al. [29]</w:t>
             </w:r>
           </w:p>
         </w:tc>
@@ -4578,7 +4578,7 @@
               <w:jc w:val="left"/>
             </w:pPr>
             <w:r>
-              <w:t xml:space="preserve">Jacobs et al. [16]</w:t>
+              <w:t xml:space="preserve">Jacobs et al. [15]</w:t>
             </w:r>
           </w:p>
         </w:tc>
@@ -4666,7 +4666,7 @@
         <w:pStyle w:val="FirstParagraph"/>
       </w:pPr>
       <w:r>
-        <w:t xml:space="preserve">The field is bifurcated by coverage scope.  Shell-level work [10, 40] and single-application work [30, 38] sit at the narrow end; cross-application desktop, web, and mobile agents sit at the broad end but each within a single platform class.  No surveyed system implements a working conversational layer over the full graphical session that has been empirically validated against the conventional desktop workflow it would supplement.  The Unix Consultant [42] came closest in ambition four decades ago, but its pre-LLM foundation prevented it from scaling beyond demonstration.  The absence is structural rather than incidental.  Even UFO² [47], the most operationally advanced desktop-agent system surveyed, is by construction an automation layer dispatched atop the existing Windows shell, and its stated future direction is broader cross-platform automation rather than replacement of the session itself.  The substitution this study attempts is therefore unclaimed, not merely under-published.</w:t>
+        <w:t xml:space="preserve">The field is bifurcated by coverage scope.  Shell-level work [9, 38] and single-application work [28, 36] sit at the narrow end; cross-application desktop, web, and mobile agents sit at the broad end but each within a single platform class.  No surveyed system implements a working conversational layer over the full graphical session that has been empirically validated against the conventional desktop workflow it would supplement.  The Unix Consultant [40] came closest in ambition four decades ago, but its pre-LLM foundation prevented it from scaling beyond demonstration.  The absence is structural rather than incidental.  Even UFO² [45], the most operationally advanced desktop-agent system surveyed, is by construction an automation layer dispatched atop the existing Windows shell, and its stated future direction is broader cross-platform automation rather than replacement of the session itself.  The substitution this study attempts is therefore unclaimed, not merely under-published.</w:t>
       </w:r>
     </w:p>
     <w:bookmarkEnd w:id="58"/>
@@ -4684,7 +4684,7 @@
         <w:pStyle w:val="FirstParagraph"/>
       </w:pPr>
       <w:r>
-        <w:t xml:space="preserve">A second pattern concerns the execution mechanism at the Action layer.  The literature divides among command translation, API binding, and GUI simulation, with a dominant trend toward hybrid execution [38, 47] that prefers structured access where available and falls back to vision.  Vision-only systems [26, 39] achieve broad applicability at the cost of grounding fragility, while structured-access systems achieve precision at the cost of per-environment integration.  Notably, the Unix Consultant operated purely at the consultation layer without executing actions — an approach that reflects an underappreciated design principle, that the agent that explains can be safer than the agent that acts, which the confirmation-gated design of the present study revisits.</w:t>
+        <w:t xml:space="preserve">A second pattern concerns the execution mechanism at the Action layer.  The literature divides among command translation, API binding, and GUI simulation, with a dominant trend toward hybrid execution [36, 45] that prefers structured access where available and falls back to vision.  Vision-only systems [25, 37] achieve broad applicability at the cost of grounding fragility, while structured-access systems achieve precision at the cost of per-environment integration.  Notably, the Unix Consultant operated purely at the consultation layer without executing actions — an approach that reflects an underappreciated design principle, that the agent that explains can be safer than the agent that acts, which the confirmation-gated design of the present study revisits.</w:t>
       </w:r>
     </w:p>
     <w:bookmarkEnd w:id="59"/>
@@ -4702,7 +4702,7 @@
         <w:pStyle w:val="FirstParagraph"/>
       </w:pPr>
       <w:r>
-        <w:t xml:space="preserve">A third pattern is that visual grounding is the field’s principal bottleneck, identified explicitly by both SeeAct [49] and the GUI-agents survey [46].  The 51.1% ceiling of GPT-4V with oracle grounding and its sharp degradation without are attributable in significant part to grounding failure.  This bottleneck is a property of the graphical-simulation approach specifically; a command-line approach that grounds intent into shell commands rather than into on-screen pixel regions sidesteps it, at the cost of being bounded by what is expressible on the command line.  Direct comparison qualifies that tradeoff usefully.  Across 440 matched desktop tasks, screen-only graphical agents pass 59.1% while command-line agents reach only 48.2% — the shell is not automatically the stronger substrate — but command-line agents augmented with result verification reach 69.3%, the highest of the three conditions [51].  Execution through the shell becomes advantageous when it is paired with a mechanism that checks what the command actually did, which is precisely the role a reversibility gate and an undo record play in the present design.</w:t>
+        <w:t xml:space="preserve">A third pattern is that visual grounding is the field’s principal bottleneck, identified explicitly by both SeeAct [47] and the GUI-agents survey [44].  The 51.1% ceiling of GPT-4V with oracle grounding and its sharp degradation without are attributable in significant part to grounding failure.  This bottleneck is a property of the graphical-simulation approach specifically; a command-line approach that grounds intent into shell commands rather than into on-screen pixel regions sidesteps it, at the cost of being bounded by what is expressible on the command line.  Direct comparison qualifies that tradeoff usefully.  Across 440 matched desktop tasks, screen-only graphical agents pass 59.1% while command-line agents reach only 48.2% — the shell is not automatically the stronger substrate — but command-line agents augmented with result verification reach 69.3%, the highest of the three conditions [49].  Execution through the shell becomes advantageous when it is paired with a mechanism that checks what the command actually did, which is precisely the role a reversibility gate and an undo record play in the present design.</w:t>
       </w:r>
     </w:p>
     <w:bookmarkEnd w:id="60"/>
@@ -4720,7 +4720,7 @@
         <w:pStyle w:val="FirstParagraph"/>
       </w:pPr>
       <w:r>
-        <w:t xml:space="preserve">A fourth pattern concerns evaluation method.  Most surveyed systems are evaluated either through architectural demonstration [10, 38] or through curated task benchmarks [8, 39, 43, 50].  User studies are rare, and the comparisons that do exist are narrow.  VoicePilot [30] conducts a substantive human-centered evaluation of LLM-based interaction, and AXIS [22] compares an API-first agent against unaided manual operation in a within-subjects design — but within a single application, on a single platform, with a cloud-hosted frontier model.  No surveyed work compares a conversational interface against the conventional graphical workflow across operating-system-level tasks on the same population.  This is the empirical gap best filled by a controlled study of conversational interfaces.</w:t>
+        <w:t xml:space="preserve">A fourth pattern concerns evaluation method.  Most surveyed systems are evaluated either through architectural demonstration [9, 36] or through curated task benchmarks [7, 37, 41, 48].  User studies are rare, and the comparisons that do exist are narrow.  VoicePilot [28] conducts a substantive human-centered evaluation of LLM-based interaction, and AXIS [21] compares an API-first agent against unaided manual operation in a within-subjects design — but within a single application, on a single platform, with a cloud-hosted frontier model.  No surveyed work compares a conversational interface against the conventional graphical workflow across operating-system-level tasks on the same population.  This is the empirical gap best filled by a controlled study of conversational interfaces.</w:t>
       </w:r>
     </w:p>
     <w:bookmarkEnd w:id="61"/>
@@ -4738,7 +4738,7 @@
         <w:pStyle w:val="FirstParagraph"/>
       </w:pPr>
       <w:r>
-        <w:t xml:space="preserve">A fifth pattern concerns the operating-system substrate.  Windows [14, 47], Android [32, 39, 48], and the web [8, 49, 50] are each heavily represented; the Linux work that exists is aimed elsewhere than the end user’s desktop session.  NaSh [10] addresses Linux at the shell level as a design proposal; Alibaba Cloud’s ANOLISA ships a natural-language Linux terminal with approval gating and rollback, but scoped to server and DevOps workloads; and OSWorld [43] includes Ubuntu as an evaluation platform rather than a deployment target.  No surveyed system implements a conversational session layer for the Linux desktop addressed to the person using the machine, despite Linux serving as the substrate for most developer and server-side workflows.</w:t>
+        <w:t xml:space="preserve">A fifth pattern concerns the operating-system substrate.  Windows [13, 45], Android [30, 37, 46], and the web [7, 47, 48] are each heavily represented; the Linux work that exists is aimed elsewhere than the end user’s desktop session.  NaSh [9] addresses Linux at the shell level as a design proposal; Alibaba Cloud’s ANOLISA ships a natural-language Linux terminal with approval gating and rollback, but scoped to server and DevOps workloads; and OSWorld [41] includes Ubuntu as an evaluation platform rather than a deployment target.  No surveyed system implements a conversational session layer for the Linux desktop addressed to the person using the machine, despite Linux serving as the substrate for most developer and server-side workflows.</w:t>
       </w:r>
     </w:p>
     <w:bookmarkEnd w:id="62"/>
@@ -4756,7 +4756,7 @@
         <w:pStyle w:val="FirstParagraph"/>
       </w:pPr>
       <w:r>
-        <w:t xml:space="preserve">A sixth pattern is the field’s shared intellectual lineage and its attendant fragility.  As established in §2.3, nearly every post-2023 system inherits the ReAct [44] convention of interleaving reasoning with action, which explains both the field’s rapid progress and the pervasiveness of LLM-reasoning failure modes across it — a fragility that makes safety and recoverability mechanisms, rather than raw capability alone, decisive for any deployable system.</w:t>
+        <w:t xml:space="preserve">A sixth pattern is the field’s shared intellectual lineage and its attendant fragility.  As established in §2.3, nearly every post-2023 system inherits the ReAct [42] convention of interleaving reasoning with action, which explains both the field’s rapid progress and the pervasiveness of LLM-reasoning failure modes across it — a fragility that makes safety and recoverability mechanisms, rather than raw capability alone, decisive for any deployable system.</w:t>
       </w:r>
     </w:p>
     <w:p>
@@ -4824,7 +4824,7 @@
         <w:t xml:space="preserve">Fourth</w:t>
       </w:r>
       <w:r>
-        <w:t xml:space="preserve">, controlled comparison against the conventional graphical workflow exists only within a single application, on a single platform, with a cloud-hosted frontier model [22]; no such comparison exists for operating-system-level tasks under a locally-hosted model and an explicit safety gate.  SynapseOS — a conversational interface layer for the Linux desktop that translates natural-language intent into shell commands under a reversibility-based confirmation gate, evaluated against each participant’s own operating system — is positioned precisely against these four gaps.  Its relationship to the closest prior work is worth stating directly.  NaSh [10] proposes guardrails for an LLM-powered natural language shell — generated code that remains analyzable, selective undo, summaries of what a command would affect — as a design position, and explicitly leaves implementation and empirical evaluation as open work.  The present study is an implementation of that position, substituting for the general principle a static recoverability analysis, which derives what a command would affect from its structure before it runs, and an undo journal with five mechanisms, and supplying the user evaluation NaSh defers.</w:t>
+        <w:t xml:space="preserve">, controlled comparison against the conventional graphical workflow exists only within a single application, on a single platform, with a cloud-hosted frontier model [21]; no such comparison exists for operating-system-level tasks under a locally-hosted model and an explicit safety gate.  SynapseOS — a conversational interface layer for the Linux desktop that translates natural-language intent into shell commands under a reversibility-based confirmation gate, evaluated against each participant’s own operating system — is positioned precisely against these four gaps.  Its relationship to the closest prior work is worth stating directly.  NaSh [9] proposes guardrails for an LLM-powered natural language shell — generated code that remains analyzable, selective undo, summaries of what a command would affect — as a design position, and explicitly leaves implementation and empirical evaluation as open work.  The present study is an implementation of that position, substituting for the general principle a static recoverability analysis, which derives what a command would affect from its structure before it runs, and an undo journal with five mechanisms, and supplying the user evaluation NaSh defers.</w:t>
       </w:r>
     </w:p>
     <w:bookmarkEnd w:id="63"/>
@@ -4843,7 +4843,7 @@
         <w:pStyle w:val="FirstParagraph"/>
       </w:pPr>
       <w:r>
-        <w:t xml:space="preserve">Beyond the systems it proposes to build upon, the present study draws on a methodological literature that shapes how a conversational interface should be evaluated.  The evaluation practices of the surveyed work fall into three categories, each with a characteristic limitation.  Architectural demonstrations [10, 38] establish feasibility but provide no performance evidence.  Curated task benchmarks [8, 43, 50] provide reproducible, quantitative measures but assess the autonomous task completion of agents acting on a user’s behalf rather than the performance of a human working through an interface.  Human-centered user studies, exemplified by VoicePilot [30] and AXIS [22], provide the most direct evidence of an interface’s value to real users but remain rare in this literature and, where present, are confined to a single application rather than the operating system as a whole.  The instruments this study adopts are drawn from established practice rather than constructed for it: the System Usability Scale [4] for perceived usability, with its interpretation grounded in subsequent large-sample analysis [1, 33], and the NASA Task Load Index [12] for perceived workload.</w:t>
+        <w:t xml:space="preserve">Beyond the systems it proposes to build upon, the present study draws on a methodological literature that shapes how a conversational interface should be evaluated.  The evaluation practices of the surveyed work fall into three categories, each with a characteristic limitation.  Architectural demonstrations [9, 36] establish feasibility but provide no performance evidence.  Curated task benchmarks [7, 41, 48] provide reproducible, quantitative measures but assess the autonomous task completion of agents acting on a user’s behalf rather than the performance of a human working through an interface.  Human-centered user studies, exemplified by VoicePilot [28] and AXIS [21], provide the most direct evidence of an interface’s value to real users but remain rare in this literature and, where present, are confined to a single application rather than the operating system as a whole.  The instruments this study adopts are drawn from established practice rather than constructed for it: the System Usability Scale [3] for perceived usability, with its interpretation grounded in subsequent large-sample analysis [31], and the NASA Task Load Index [11] for perceived workload.</w:t>
       </w:r>
     </w:p>
     <w:p>
@@ -4899,7 +4899,7 @@
         <w:t xml:space="preserve"> </w:t>
       </w:r>
       <w:r>
-        <w:t xml:space="preserve">structure in the sense set out by Creswell and Plano Clark [7], collecting both strands concurrently and integrating them at the interpretation stage; the qualitative data, gathered through retrospective think-aloud over the screen recording and a semi-structured interview, are analyzed using the thematic-analysis method of Braun and Clarke [3], a widely adopted six-phase approach for identifying and reporting patterns in qualitative data.  Design considerations surfaced by the reviewed systems inform the evaluation directly: the preview-and-confirm guideline of VoicePilot [30] and the reversibility-and-guardrail framing of NaSh [10] together motivate an explicit validation of the confirmation gate and undo mechanism as part of the study.</w:t>
+        <w:t xml:space="preserve">structure in the sense set out by Creswell and Plano Clark [6], collecting both strands concurrently and integrating them at the interpretation stage; the qualitative data, gathered through retrospective think-aloud over the screen recording and a semi-structured interview, are analyzed using the thematic-analysis method of Braun and Clarke [2], a widely adopted six-phase approach for identifying and reporting patterns in qualitative data.  Design considerations surfaced by the reviewed systems inform the evaluation directly: the preview-and-confirm guideline of VoicePilot [28] and the reversibility-and-guardrail framing of NaSh [9] together motivate an explicit validation of the confirmation gate and undo mechanism as part of the study.</w:t>
       </w:r>
     </w:p>
     <w:p>
@@ -4925,7 +4925,7 @@
         <w:pStyle w:val="FirstParagraph"/>
       </w:pPr>
       <w:r>
-        <w:t xml:space="preserve">This chapter reviewed the literature on natural-language and LLM-mediated interfaces to personal computing across nearly four decades, organized along a four-layer pipeline of Input, Reasoning, Action, and Operating-System Integration.  The historical foundations established the long-standing aspiration to a natural-language interface to a real operating system [42] and the methodological shift, driven by in-context reasoning [44], that made the current generation of systems possible.  The shell-and-command-line thread most directly related to the proposed design demonstrated that natural-language-to-Bash translation is tractable [40], that safety and reversibility are central concerns [10], and that local deployment is feasible [16], while leaving the extension from shell to session, and empirical user evaluation, as open work.  The graphical-agent literature across web, mobile, and desktop [8, 13, 14, 26, 32, 39, 47–50] established the field’s architectural patterns and its recurring bottleneck of visual grounding, while the accessibility thread [11, 25, 30, 31, 38] revealed a complementary limitation that a general conversational interface layer would resolve.  The evaluation literature [43, 45, 46] traced a capability ceiling that has risen sharply on short tasks while remaining low on long-horizon work, and exposed a methodological gap: interfaces are seldom evaluated comparatively against the conventional workflow with real users, and never yet at the level of the operating system itself.</w:t>
+        <w:t xml:space="preserve">This chapter reviewed the literature on natural-language and LLM-mediated interfaces to personal computing across nearly four decades, organized along a four-layer pipeline of Input, Reasoning, Action, and Operating-System Integration.  The historical foundations established the long-standing aspiration to a natural-language interface to a real operating system [40] and the methodological shift, driven by in-context reasoning [42], that made the current generation of systems possible.  The shell-and-command-line thread most directly related to the proposed design demonstrated that natural-language-to-Bash translation is tractable [38], that safety and reversibility are central concerns [9], and that local deployment is feasible [15], while leaving the extension from shell to session, and empirical user evaluation, as open work.  The graphical-agent literature across web, mobile, and desktop [7, 12, 13, 25, 30, 37, 45–48] established the field’s architectural patterns and its recurring bottleneck of visual grounding, while the accessibility thread [10, 24, 28, 29, 36] revealed a complementary limitation that a general conversational interface layer would resolve.  The evaluation literature [41, 43, 44] traced a capability ceiling that has risen sharply on short tasks while remaining low on long-horizon work, and exposed a methodological gap: interfaces are seldom evaluated comparatively against the conventional workflow with real users, and never yet at the level of the operating system itself.</w:t>
       </w:r>
     </w:p>
     <w:p>
@@ -5105,7 +5105,7 @@
         <w:pStyle w:val="BodyText"/>
       </w:pPr>
       <w:r>
-        <w:t xml:space="preserve">The framework is evaluated in two independent parts.  The recoverability analyzer is evaluated on its own, on a corpus of commands whose ground truth is obtained by sandboxed execution (Section 3.1).  The system as a whole is evaluated through a controlled user study in which participants complete a fixed set of tasks under two conditions: using SynapseOS as the interface, and using their own primary operating system — Windows, macOS, or Linux — as the baseline.  This expert baseline design pits SynapseOS against the environment each participant already knows and uses daily, generating empirical data on task completion time, error rate, and user satisfaction across the real-world OS landscape [43].</w:t>
+        <w:t xml:space="preserve">The framework is evaluated in two independent parts.  The recoverability analyzer is evaluated on its own, on a corpus of commands whose ground truth is obtained by sandboxed execution (Section 3.1).  The system as a whole is evaluated through a controlled user study in which participants complete a fixed set of tasks under two conditions: using SynapseOS as the interface, and using their own primary operating system — Windows, macOS, or Linux — as the baseline.  This expert baseline design pits SynapseOS against the environment each participant already knows and uses daily, generating empirical data on task completion time, error rate, and user satisfaction across the real-world OS landscape [41].</w:t>
       </w:r>
     </w:p>
     <w:p>
@@ -5846,7 +5846,7 @@
         <w:pStyle w:val="FirstParagraph"/>
       </w:pPr>
       <w:r>
-        <w:t xml:space="preserve">The primary benchmark dataset is the OSWorld task suite [43], which provides standardized real-computer tasks across shell operations, file management, web browsing, and application-level interactions.  OSWorld is the only existing benchmark that evaluates computer-using agents in real operating system environments, making it the most appropriate external standard for SynapseOS evaluation.  Tasks are presented as natural language instructions; agents interact with a real virtual machine environment, and outcomes are evaluated by automated inspection of the resulting system state — whether the goal was actually achieved — rather than by comparing individual actions.  In addition to OSWorld tasks, a custom cross-platform task suite is developed for this study, covering file search and organization, system and process monitoring, application and package management, and text and data processing — each task defined as a human-level goal achievable via SynapseOS natural language commands and via native OS tools on the comparison machine.  Each task in both suites is documented with a description, expected outcome, task category, and difficulty level.</w:t>
+        <w:t xml:space="preserve">The primary benchmark dataset is the OSWorld task suite [41], which provides standardized real-computer tasks across shell operations, file management, web browsing, and application-level interactions.  OSWorld is the only existing benchmark that evaluates computer-using agents in real operating system environments, making it the most appropriate external standard for SynapseOS evaluation.  Tasks are presented as natural language instructions; agents interact with a real virtual machine environment, and outcomes are evaluated by automated inspection of the resulting system state — whether the goal was actually achieved — rather than by comparing individual actions.  In addition to OSWorld tasks, a custom cross-platform task suite is developed for this study, covering file search and organization, system and process monitoring, application and package management, and text and data processing — each task defined as a human-level goal achievable via SynapseOS natural language commands and via native OS tools on the comparison machine.  Each task in both suites is documented with a description, expected outcome, task category, and difficulty level.</w:t>
       </w:r>
     </w:p>
     <w:bookmarkEnd w:id="76"/>
@@ -5930,7 +5930,7 @@
         <w:t xml:space="preserve"> </w:t>
       </w:r>
       <w:r>
-        <w:t xml:space="preserve">responses to the System Usability Scale (SUS) [4] and the NASA Task Load Index (NASA-TLX) [12], collected immediately after each condition; both are validated instruments for measuring perceived usability and cognitive workload respectively</w:t>
+        <w:t xml:space="preserve">responses to the System Usability Scale (SUS) [3] and the NASA Task Load Index (NASA-TLX) [11], collected immediately after each condition; both are validated instruments for measuring perceived usability and cognitive workload respectively</w:t>
       </w:r>
     </w:p>
     <w:p>
@@ -6058,7 +6058,7 @@
         <w:pStyle w:val="FirstParagraph"/>
       </w:pPr>
       <w:r>
-        <w:t xml:space="preserve">SynapseOS is deployed on the Debian 13 (Trixie) environment matching the OSWorld evaluation setup [43].  Each benchmark task is executed through the conversational interface, and results are captured programmatically through the built-in telemetry system.  Each task is supplied to SynapseOS as a natural language instruction, and the resulting system state is compared against the expected outcome defined in the benchmark.  Because SynapseOS gates every command classified irreversible on explicit confirmation, benchmark runs are facilitator-attended rather than unattended; the confirmation gate remains active throughout and every confirmation is logged as part of the run record.  OSWorld scores the resulting system state rather than a human operator’s performance, so it applies only to the SynapseOS condition.  Condition B, which a human participant operates directly, has no equivalent and is instead evaluated through the custom cross-platform task suite administered in the user study (Section 1.2(b)).</w:t>
+        <w:t xml:space="preserve">SynapseOS is deployed on the Debian 13 (Trixie) environment matching the OSWorld evaluation setup [41].  Each benchmark task is executed through the conversational interface, and results are captured programmatically through the built-in telemetry system.  Each task is supplied to SynapseOS as a natural language instruction, and the resulting system state is compared against the expected outcome defined in the benchmark.  Because SynapseOS gates every command classified irreversible on explicit confirmation, benchmark runs are facilitator-attended rather than unattended; the confirmation gate remains active throughout and every confirmation is logged as part of the run record.  OSWorld scores the resulting system state rather than a human operator’s performance, so it applies only to the SynapseOS condition.  Condition B, which a human participant operates directly, has no equivalent and is instead evaluated through the custom cross-platform task suite administered in the user study (Section 1.2(b)).</w:t>
       </w:r>
     </w:p>
     <w:bookmarkEnd w:id="80"/>
@@ -6163,7 +6163,7 @@
         <w:pStyle w:val="FirstParagraph"/>
       </w:pPr>
       <w:r>
-        <w:t xml:space="preserve">The OSWorld benchmark is used as the primary evaluation standard because it is the only existing benchmark that evaluates computer-using agents in real operating system environments with real applications [43].  Its use allows SynapseOS results to be situated within the existing literature.</w:t>
+        <w:t xml:space="preserve">The OSWorld benchmark is used as the primary evaluation standard because it is the only existing benchmark that evaluates computer-using agents in real operating system environments with real applications [41].  Its use allows SynapseOS results to be situated within the existing literature.</w:t>
       </w:r>
     </w:p>
     <w:p>
@@ -6203,7 +6203,7 @@
         <w:pStyle w:val="BodyText"/>
       </w:pPr>
       <w:r>
-        <w:t xml:space="preserve">The dual-population design — novice and power users — directly addresses the gap identified in Chapter 1, where no prior work has evaluated a conversational interface across user populations with differing technical backgrounds [43].  The three data categories align with the three interface questions:</w:t>
+        <w:t xml:space="preserve">The dual-population design — novice and power users — directly addresses the gap identified in Chapter 1, where no prior work has evaluated a conversational interface across user populations with differing technical backgrounds [41].  The three data categories align with the three interface questions:</w:t>
       </w:r>
       <w:r>
         <w:t xml:space="preserve"> </w:t>
@@ -6583,7 +6583,7 @@
         <w:t xml:space="preserve"> </w:t>
       </w:r>
       <w:r>
-        <w:t xml:space="preserve">code-specialized model that demonstrated the strongest natural language-to-bash translation accuracy among models below 7B parameters in controlled evaluation [40].  Among the models directly compared in that evaluation, its code-specialized pretraining produced a clear margin over general-purpose models of comparable or larger size — 58% NL2Bash accuracy with prompt engineering, versus 49% for Llama 3.2-3B and 37% for a LoRA-fine-tuned Llama 3.2-1B — attributable to Qwen2.5-Coder’s training corpus of 5.5 trillion code tokens against Llama 3.2's general-purpose pretraining.  At 4-bit quantization</w:t>
+        <w:t xml:space="preserve">code-specialized model that demonstrated the strongest natural language-to-bash translation accuracy among models below 7B parameters in controlled evaluation [38].  Among the models directly compared in that evaluation, its code-specialized pretraining produced a clear margin over general-purpose models of comparable or larger size — 58% NL2Bash accuracy with prompt engineering, versus 49% for Llama 3.2-3B and 37% for a LoRA-fine-tuned Llama 3.2-1B — attributable to Qwen2.5-Coder’s training corpus of 5.5 trillion code tokens against Llama 3.2's general-purpose pretraining.  At 4-bit quantization</w:t>
       </w:r>
       <w:hyperlink w:anchor="ch3-fn6">
         <w:r>
@@ -6633,15 +6633,15 @@
         <w:pStyle w:val="BodyText"/>
       </w:pPr>
       <w:r>
-        <w:t xml:space="preserve">Accuracy is measured using an execution-based scoring methodology rather than syntax-level string matching, following Westenfelder et al. [40] — see Section 2.3 for the full evaluation procedure.</w:t>
-      </w:r>
-    </w:p>
-    <w:p>
-      <w:pPr>
-        <w:pStyle w:val="BodyText"/>
-      </w:pPr>
-      <w:r>
-        <w:t xml:space="preserve">This selection was reconfirmed against models released after the initial literature review, to guard against the fast-moving small-model landscape becoming stale before study execution; no smaller alternative offered comparable shell-generation evidence within the same CPU-only hardware budget [16].  Newer mixture-of-experts variants require all experts resident in memory regardless of active parameters per token, which is incompatible with this study’s memory budget, and newer general-purpose small models report reasoning benchmarks but no shell-command generation evidence.</w:t>
+        <w:t xml:space="preserve">Accuracy is measured using an execution-based scoring methodology rather than syntax-level string matching, following Westenfelder et al. [38] — see Section 2.3 for the full evaluation procedure.</w:t>
+      </w:r>
+    </w:p>
+    <w:p>
+      <w:pPr>
+        <w:pStyle w:val="BodyText"/>
+      </w:pPr>
+      <w:r>
+        <w:t xml:space="preserve">This selection was reconfirmed against models released after the initial literature review, to guard against the fast-moving small-model landscape becoming stale before study execution; no smaller alternative offered comparable shell-generation evidence within the same CPU-only hardware budget [15].  Newer mixture-of-experts variants require all experts resident in memory regardless of active parameters per token, which is incompatible with this study’s memory budget, and newer general-purpose small models report reasoning benchmarks but no shell-command generation evidence.</w:t>
       </w:r>
     </w:p>
     <w:bookmarkEnd w:id="87"/>
@@ -6659,15 +6659,15 @@
         <w:pStyle w:val="FirstParagraph"/>
       </w:pPr>
       <w:r>
-        <w:t xml:space="preserve">Once the intent parser produces a shell command, SynapseOS passes it through a confirmation gate and an undo journal before execution, following the reversibility-and-guardrail framing established for LLM-powered natural language shells [10] and the preview-and-confirm design guideline validated with motor-impaired users of an LLM-mediated assistive-robotics interface [30].  The command is first classified by reversibility: operations that are irreversible — such as file deletion, system configuration changes, or destructive package operations — trigger a confirmation prompt requiring explicit user approval before execution proceeds.  Every executed command is recorded to a persistent undo journal before it runs.  Reversible operations are logged for replay-based reversal; a command classified irreversible and then approved is additionally captured by one of five mechanisms — full content backup, hardlink-based trash, git HEAD capture, permission-metadata capture, or, for package and service state, an inverse command — so that a command approved in error remains recoverable.  Rollback is invoked through a dedicated undo command rather than from within the conversation.  Once the gate has passed it, the command is dispatched to a bash subprocess.  Standard output and standard error are captured and rendered in the conversational surface as the system’s response to the original natural language input.</w:t>
-      </w:r>
-    </w:p>
-    <w:p>
-      <w:pPr>
-        <w:pStyle w:val="BodyText"/>
-      </w:pPr>
-      <w:r>
-        <w:t xml:space="preserve">SynapseOS executes only shell-expressible operations.  The system’s capability boundary is the Linux command-line toolchain: file management, process control, text processing, package management, network configuration, and any application that exposes a command-line interface.  GUI-only interactions — clicking buttons in graphical applications, navigating web page elements, or interacting with visual-only interfaces — are explicitly outside scope, in deliberate contrast to broader desktop agent frameworks that additionally orchestrate GUI automation atop the existing session [47].  This boundary is intentional: it constrains the research to a tractable, verifiable claim that the system can be built, evaluated, and defended within the thesis timeline.</w:t>
+        <w:t xml:space="preserve">Once the intent parser produces a shell command, SynapseOS passes it through a confirmation gate and an undo journal before execution, following the reversibility-and-guardrail framing established for LLM-powered natural language shells [9] and the preview-and-confirm design guideline validated with motor-impaired users of an LLM-mediated assistive-robotics interface [28].  The command is first classified by reversibility: operations that are irreversible — such as file deletion, system configuration changes, or destructive package operations — trigger a confirmation prompt requiring explicit user approval before execution proceeds.  Every executed command is recorded to a persistent undo journal before it runs.  Reversible operations are logged for replay-based reversal; a command classified irreversible and then approved is additionally captured by one of five mechanisms — full content backup, hardlink-based trash, git HEAD capture, permission-metadata capture, or, for package and service state, an inverse command — so that a command approved in error remains recoverable.  Rollback is invoked through a dedicated undo command rather than from within the conversation.  Once the gate has passed it, the command is dispatched to a bash subprocess.  Standard output and standard error are captured and rendered in the conversational surface as the system’s response to the original natural language input.</w:t>
+      </w:r>
+    </w:p>
+    <w:p>
+      <w:pPr>
+        <w:pStyle w:val="BodyText"/>
+      </w:pPr>
+      <w:r>
+        <w:t xml:space="preserve">SynapseOS executes only shell-expressible operations.  The system’s capability boundary is the Linux command-line toolchain: file management, process control, text processing, package management, network configuration, and any application that exposes a command-line interface.  GUI-only interactions — clicking buttons in graphical applications, navigating web page elements, or interacting with visual-only interfaces — are explicitly outside scope, in deliberate contrast to broader desktop agent frameworks that additionally orchestrate GUI automation atop the existing session [45].  This boundary is intentional: it constrains the research to a tractable, verifiable claim that the system can be built, evaluated, and defended within the thesis timeline.</w:t>
       </w:r>
     </w:p>
     <w:bookmarkEnd w:id="88"/>
@@ -8379,7 +8379,7 @@
         <w:t xml:space="preserve"> </w:t>
       </w:r>
       <w:r>
-        <w:t xml:space="preserve">evaluated using an execution-based scoring methodology [40] — each generated command is executed in a controlled environment and its resulting system state compared against a human-annotated expected outcome for each task utterance, rather than syntax-level string matching, with ambiguous cases resolved through LLM-assisted functional equivalence assessment at 95% confidence; accuracy is computed as the proportion of first-attempt matches</w:t>
+        <w:t xml:space="preserve">evaluated using an execution-based scoring methodology [38] — each generated command is executed in a controlled environment and its resulting system state compared against a human-annotated expected outcome for each task utterance, rather than syntax-level string matching, with ambiguous cases resolved through LLM-assisted functional equivalence assessment at 95% confidence; accuracy is computed as the proportion of first-attempt matches</w:t>
       </w:r>
     </w:p>
     <w:p>
@@ -8870,7 +8870,7 @@
         <w:pStyle w:val="FirstParagraph"/>
       </w:pPr>
       <w:r>
-        <w:t xml:space="preserve">The corpus is generated by a program, not assembled by hand, and is held as four partitions reported separately rather than pooled.  The first is NL2Bash [20], which supplies human-written commands and is the generalization set: candidates are drawn at random from the dataset with a recorded seed, excluding any command used during development.  The second is a set of parameterized command templates covering each shell composition operator — sequencing, conditional execution, pipelines, redirects, command substitution, loops,</w:t>
+        <w:t xml:space="preserve">The corpus is generated by a program, not assembled by hand, and is held as four partitions reported separately rather than pooled.  The first is NL2Bash [19], which supplies human-written commands and is the generalization set: candidates are drawn at random from the dataset with a recorded seed, excluding any command used during development.  The second is a set of parameterized command templates covering each shell composition operator — sequencing, conditional execution, pipelines, redirects, command substitution, loops,</w:t>
       </w:r>
       <w:r>
         <w:t xml:space="preserve"> </w:t>
@@ -9140,7 +9140,7 @@
         <w:pStyle w:val="BodyText"/>
       </w:pPr>
       <w:r>
-        <w:t xml:space="preserve">Because the first baseline was written by the same team, it was checked against command-safety checks that others ship.  Two open-source checks were scored on the same held-out corpus and labels reported in (g) below: the dangerous-command check of OpenAI’s Codex CLI [29], ported from its source and verified against that source’s own unit tests, and cc-safety-net [18], a pre-execution guard used with several agentic coding tools, run unmodified under each of its three presets.  On the 325 commands that destroy files, they let between 73% and 97% run with no confirmation and no capture, against 31% for the enumerated-pattern classifier, and neither makes any provision for recovery.  Both are designed for coding agents working inside a version-controlled project, where deleting project files is routine and version control is the safeguard, so these figures describe how they would serve a person’s own files, not how well they serve their intended purpose.  The first baseline is therefore the strictest enumerated list tested, and comparisons against it understate rather than overstate the analysis’s advantage over lists in current use.  No shipping tool was found that determines a command’s effects before it runs in order to capture what it would destroy; on recovery there is no external counterpart, which is the gap identified in Section 2.4.  The comparison is provided as supplementary material.</w:t>
+        <w:t xml:space="preserve">Because the first baseline was written by the same team, it was checked against command-safety checks that others ship.  Two open-source checks were scored on the same held-out corpus and labels reported in (g) below: the dangerous-command check of OpenAI’s Codex CLI [27], ported from its source and verified against that source’s own unit tests, and cc-safety-net [17], a pre-execution guard used with several agentic coding tools, run unmodified under each of its three presets.  On the 325 commands that destroy files, they let between 73% and 97% run with no confirmation and no capture, against 31% for the enumerated-pattern classifier, and neither makes any provision for recovery.  Both are designed for coding agents working inside a version-controlled project, where deleting project files is routine and version control is the safeguard, so these figures describe how they would serve a person’s own files, not how well they serve their intended purpose.  The first baseline is therefore the strictest enumerated list tested, and comparisons against it understate rather than overstate the analysis’s advantage over lists in current use.  No shipping tool was found that determines a command’s effects before it runs in order to capture what it would destroy; on recovery there is no external counterpart, which is the gap identified in Section 2.4.  The comparison is provided as supplementary material.</w:t>
       </w:r>
     </w:p>
     <w:bookmarkEnd w:id="98"/>
@@ -10658,7 +10658,7 @@
         <w:pStyle w:val="FirstParagraph"/>
       </w:pPr>
       <w:r>
-        <w:t xml:space="preserve">The system is evaluated against two datasets: the OSWorld benchmark task suite [43] for direct comparison with results in the existing literature, and the custom cross-platform task suite described in Sections 1.1 and 1.5.  The user study evaluation involves 40 participants (20 novice, 20 power users); the baseline condition is each participant’s primary operating system — Windows 11, macOS, or Linux with GNOME desktop — on a dedicated baseline machine.</w:t>
+        <w:t xml:space="preserve">The system is evaluated against two datasets: the OSWorld benchmark task suite [41] for direct comparison with results in the existing literature, and the custom cross-platform task suite described in Sections 1.1 and 1.5.  The user study evaluation involves 40 participants (20 novice, 20 power users); the baseline condition is each participant’s primary operating system — Windows 11, macOS, or Linux with GNOME desktop — on a dedicated baseline machine.</w:t>
       </w:r>
     </w:p>
     <w:bookmarkEnd w:id="105"/>
@@ -10823,7 +10823,7 @@
         <w:pStyle w:val="FirstParagraph"/>
       </w:pPr>
       <w:r>
-        <w:t xml:space="preserve">SUS scores are computed per the standard scoring procedure [4] to produce a score on a 0–100 scale; a score above 68 is conventionally treated as above-average usability [33], and the instrument’s validity and interpretation across a large sample of studies are established by Bangor and colleagues [1].  NASA-TLX scores are computed as the unweighted mean of the six subscale ratings [12] to produce a composite workload score per participant per condition.  Because the central claim of this study concerns access rather than speed, workload and task success are treated as primary outcomes alongside completion time, not as secondary measures.</w:t>
+        <w:t xml:space="preserve">SUS scores are computed per the standard scoring procedure [3] to produce a score on a 0–100 scale; a score above 68 is conventionally treated as above-average usability, a benchmark drawn from scores across a large sample of studies [31].  NASA-TLX scores are computed as the unweighted mean of the six subscale ratings [11] to produce a composite workload score per participant per condition.  Because the central claim of this study concerns access rather than speed, workload and task success are treated as primary outcomes alongside completion time, not as secondary measures.</w:t>
       </w:r>
     </w:p>
     <w:p>
@@ -10974,7 +10974,7 @@
         <w:pStyle w:val="BodyText"/>
       </w:pPr>
       <w:r>
-        <w:t xml:space="preserve">Qualitative data from post-study interviews is analyzed using reflexive thematic analysis following the six-phase procedure described by Braun and Clarke [3]: familiarization with the data, initial code generation, theme search, theme review, theme definition, and write-up.  In keeping with the reflexive approach, which treats the analyst’s interpretation as part of the method and does not compute inter-rater agreement, one member of the research team develops the codes and themes; the codebook and the excerpts that support each theme are retained so that the analysis can be audited.  Themes are reported alongside representative participant quotations.</w:t>
+        <w:t xml:space="preserve">Qualitative data from post-study interviews is analyzed using reflexive thematic analysis following the six-phase procedure described by Braun and Clarke [2]: familiarization with the data, initial code generation, theme search, theme review, theme definition, and write-up.  In keeping with the reflexive approach, which treats the analyst’s interpretation as part of the method and does not compute inter-rater agreement, one member of the research team develops the codes and themes; the codebook and the excerpts that support each theme are retained so that the analysis can be audited.  Themes are reported alongside representative participant quotations.</w:t>
       </w:r>
     </w:p>
     <w:bookmarkEnd w:id="112"/>
@@ -11439,7 +11439,7 @@
         <w:t xml:space="preserve">[1]</w:t>
       </w:r>
       <w:r>
-        <w:t xml:space="preserve">A. Bangor, P. T. Kortum, and J. T. Miller. 2008. An empirical evaluation of the System Usability Scale.</w:t>
+        <w:t xml:space="preserve">B. Becker, N. Jeannerod, C. Marché, Y. Régis-Gianas, M. Sighireanu, and R. Treinen. 2022. The CoLiS platform for the analysis of maintainer scripts in Debian software packages.</w:t>
       </w:r>
       <w:r>
         <w:t xml:space="preserve"> </w:t>
@@ -11449,13 +11449,13 @@
           <w:i/>
           <w:iCs/>
         </w:rPr>
-        <w:t xml:space="preserve">International Journal of Human–Computer Interaction</w:t>
-      </w:r>
-      <w:r>
-        <w:t xml:space="preserve"> </w:t>
-      </w:r>
-      <w:r>
-        <w:t xml:space="preserve">24, 6 (2008), 574–594.</w:t>
+        <w:t xml:space="preserve">International Journal on Software Tools for Technology Transfer</w:t>
+      </w:r>
+      <w:r>
+        <w:t xml:space="preserve"> </w:t>
+      </w:r>
+      <w:r>
+        <w:t xml:space="preserve">24, 5 (2022), 717–733.</w:t>
       </w:r>
     </w:p>
     <w:p>
@@ -11466,7 +11466,7 @@
         <w:t xml:space="preserve">[2]</w:t>
       </w:r>
       <w:r>
-        <w:t xml:space="preserve">B. Becker, N. Jeannerod, C. Marché, Y. Régis-Gianas, M. Sighireanu, and R. Treinen. 2022. The CoLiS platform for the analysis of maintainer scripts in Debian software packages.</w:t>
+        <w:t xml:space="preserve">V. Braun and V. Clarke. 2006. Using thematic analysis in psychology.</w:t>
       </w:r>
       <w:r>
         <w:t xml:space="preserve"> </w:t>
@@ -11476,13 +11476,13 @@
           <w:i/>
           <w:iCs/>
         </w:rPr>
-        <w:t xml:space="preserve">International Journal on Software Tools for Technology Transfer</w:t>
-      </w:r>
-      <w:r>
-        <w:t xml:space="preserve"> </w:t>
-      </w:r>
-      <w:r>
-        <w:t xml:space="preserve">24, 5 (2022), 717–733.</w:t>
+        <w:t xml:space="preserve">Qualitative Research in Psychology</w:t>
+      </w:r>
+      <w:r>
+        <w:t xml:space="preserve"> </w:t>
+      </w:r>
+      <w:r>
+        <w:t xml:space="preserve">3, 2 (2006), 77–101.</w:t>
       </w:r>
     </w:p>
     <w:p>
@@ -11493,7 +11493,7 @@
         <w:t xml:space="preserve">[3]</w:t>
       </w:r>
       <w:r>
-        <w:t xml:space="preserve">V. Braun and V. Clarke. 2006. Using thematic analysis in psychology.</w:t>
+        <w:t xml:space="preserve">J. Brooke. 1996. SUS: A “quick and dirty” usability scale. In</w:t>
       </w:r>
       <w:r>
         <w:t xml:space="preserve"> </w:t>
@@ -11503,13 +11503,10 @@
           <w:i/>
           <w:iCs/>
         </w:rPr>
-        <w:t xml:space="preserve">Qualitative Research in Psychology</w:t>
-      </w:r>
-      <w:r>
-        <w:t xml:space="preserve"> </w:t>
-      </w:r>
-      <w:r>
-        <w:t xml:space="preserve">3, 2 (2006), 77–101.</w:t>
+        <w:t xml:space="preserve">Usability Evaluation in Industry</w:t>
+      </w:r>
+      <w:r>
+        <w:t xml:space="preserve">, P. W. Jordan, B. Thomas, I. L. McClelland, and B. Weerdmeester (Eds.). Taylor &amp; Francis, 189–194.</w:t>
       </w:r>
     </w:p>
     <w:p>
@@ -11520,7 +11517,7 @@
         <w:t xml:space="preserve">[4]</w:t>
       </w:r>
       <w:r>
-        <w:t xml:space="preserve">J. Brooke. 1996. SUS: A “quick and dirty” usability scale. In</w:t>
+        <w:t xml:space="preserve">L. Clark, N. Pantidi, O. Cooney, P. R. Doyle, D. Garaialde, J. Edwards, B. Spillane, E. Gilmartin, C. Murad, C. Munteanu, V. Wade, and B. R. Cowan. 2019. What makes a good conversation? Challenges in designing truly conversational agents. In</w:t>
       </w:r>
       <w:r>
         <w:t xml:space="preserve"> </w:t>
@@ -11530,10 +11527,10 @@
           <w:i/>
           <w:iCs/>
         </w:rPr>
-        <w:t xml:space="preserve">Usability Evaluation in Industry</w:t>
-      </w:r>
-      <w:r>
-        <w:t xml:space="preserve">, P. W. Jordan, B. Thomas, I. L. McClelland, and B. Weerdmeester (Eds.). Taylor &amp; Francis, 189–194.</w:t>
+        <w:t xml:space="preserve">Proceedings of the 2019 CHI Conference on Human Factors in Computing Systems (CHI ’19)</w:t>
+      </w:r>
+      <w:r>
+        <w:t xml:space="preserve">. ACM, Article 475, 12 pages.</w:t>
       </w:r>
     </w:p>
     <w:p>
@@ -11544,7 +11541,7 @@
         <w:t xml:space="preserve">[5]</w:t>
       </w:r>
       <w:r>
-        <w:t xml:space="preserve">L. Clark, N. Pantidi, O. Cooney, P. R. Doyle, D. Garaialde, J. Edwards, B. Spillane, E. Gilmartin, C. Murad, C. Munteanu, V. Wade, and B. R. Cowan. 2019. What makes a good conversation? Challenges in designing truly conversational agents. In</w:t>
+        <w:t xml:space="preserve">P. Cousot and R. Cousot. 1977. Abstract interpretation: A unified lattice model for static analysis of programs by construction or approximation of fixpoints. In</w:t>
       </w:r>
       <w:r>
         <w:t xml:space="preserve"> </w:t>
@@ -11554,10 +11551,10 @@
           <w:i/>
           <w:iCs/>
         </w:rPr>
-        <w:t xml:space="preserve">Proceedings of the 2019 CHI Conference on Human Factors in Computing Systems (CHI ’19)</w:t>
-      </w:r>
-      <w:r>
-        <w:t xml:space="preserve">. ACM, Article 475, 12 pages.</w:t>
+        <w:t xml:space="preserve">Conference Record of the Sixth Annual ACM SIGPLAN-SIGACT Symposium on Principles of Programming Languages (POPL ’77)</w:t>
+      </w:r>
+      <w:r>
+        <w:t xml:space="preserve">. ACM, 238–252.</w:t>
       </w:r>
     </w:p>
     <w:p>
@@ -11568,7 +11565,7 @@
         <w:t xml:space="preserve">[6]</w:t>
       </w:r>
       <w:r>
-        <w:t xml:space="preserve">P. Cousot and R. Cousot. 1977. Abstract interpretation: A unified lattice model for static analysis of programs by construction or approximation of fixpoints. In</w:t>
+        <w:t xml:space="preserve">J. W. Creswell and V. L. Plano Clark. 2018.</w:t>
       </w:r>
       <w:r>
         <w:t xml:space="preserve"> </w:t>
@@ -11578,10 +11575,13 @@
           <w:i/>
           <w:iCs/>
         </w:rPr>
-        <w:t xml:space="preserve">Conference Record of the Sixth Annual ACM SIGPLAN-SIGACT Symposium on Principles of Programming Languages (POPL ’77)</w:t>
-      </w:r>
-      <w:r>
-        <w:t xml:space="preserve">. ACM, 238–252.</w:t>
+        <w:t xml:space="preserve">Designing and Conducting Mixed Methods Research</w:t>
+      </w:r>
+      <w:r>
+        <w:t xml:space="preserve"> </w:t>
+      </w:r>
+      <w:r>
+        <w:t xml:space="preserve">(3rd ed.). SAGE Publications.</w:t>
       </w:r>
     </w:p>
     <w:p>
@@ -11592,7 +11592,7 @@
         <w:t xml:space="preserve">[7]</w:t>
       </w:r>
       <w:r>
-        <w:t xml:space="preserve">J. W. Creswell and V. L. Plano Clark. 2018.</w:t>
+        <w:t xml:space="preserve">X. Deng, Y. Gu, B. Zheng, S. Chen, S. Stevens, B. Wang, H. Sun, and Y. Su. 2023. Mind2Web: Towards a Generalist Agent for the Web. In</w:t>
       </w:r>
       <w:r>
         <w:t xml:space="preserve"> </w:t>
@@ -11602,13 +11602,10 @@
           <w:i/>
           <w:iCs/>
         </w:rPr>
-        <w:t xml:space="preserve">Designing and Conducting Mixed Methods Research</w:t>
-      </w:r>
-      <w:r>
-        <w:t xml:space="preserve"> </w:t>
-      </w:r>
-      <w:r>
-        <w:t xml:space="preserve">(3rd ed.). SAGE Publications.</w:t>
+        <w:t xml:space="preserve">Advances in Neural Information Processing Systems 36 (NeurIPS 2023)</w:t>
+      </w:r>
+      <w:r>
+        <w:t xml:space="preserve">.</w:t>
       </w:r>
     </w:p>
     <w:p>
@@ -11619,7 +11616,7 @@
         <w:t xml:space="preserve">[8]</w:t>
       </w:r>
       <w:r>
-        <w:t xml:space="preserve">X. Deng, Y. Gu, B. Zheng, S. Chen, S. Stevens, B. Wang, H. Sun, and Y. Su. 2023. Mind2Web: Towards a Generalist Agent for the Web. In</w:t>
+        <w:t xml:space="preserve">M. Greenberg and A. J. Blatt. 2020. Executable formal semantics for the POSIX shell.</w:t>
       </w:r>
       <w:r>
         <w:t xml:space="preserve"> </w:t>
@@ -11629,10 +11626,13 @@
           <w:i/>
           <w:iCs/>
         </w:rPr>
-        <w:t xml:space="preserve">Advances in Neural Information Processing Systems 36 (NeurIPS 2023)</w:t>
-      </w:r>
-      <w:r>
-        <w:t xml:space="preserve">.</w:t>
+        <w:t xml:space="preserve">Proceedings of the ACM on Programming Languages</w:t>
+      </w:r>
+      <w:r>
+        <w:t xml:space="preserve"> </w:t>
+      </w:r>
+      <w:r>
+        <w:t xml:space="preserve">4, POPL, Article 43 (2020).</w:t>
       </w:r>
     </w:p>
     <w:p>
@@ -11643,7 +11643,29 @@
         <w:t xml:space="preserve">[9]</w:t>
       </w:r>
       <w:r>
-        <w:t xml:space="preserve">M. Greenberg and A. J. Blatt. 2020. Executable formal semantics for the POSIX shell.</w:t>
+        <w:t xml:space="preserve">B. R. Gyawali, S. Achalla, K. Kallas, and S. Kumar. 2025. NaSh: Guardrails for an LLM-Powered Natural Language Shell. arXiv:2506.13028</w:t>
+      </w:r>
+    </w:p>
+    <w:p>
+      <w:pPr>
+        <w:pStyle w:val="BodyText"/>
+      </w:pPr>
+      <w:r>
+        <w:t xml:space="preserve">[10]</w:t>
+      </w:r>
+      <w:r>
+        <w:t xml:space="preserve">W. Han, Z. Zeng, J. Huang, S. Jiang, et al. 2025. GUIRoboTron-Speech: Towards Automated GUI Agents Based on Speech Instructions. arXiv:2506.11127v1</w:t>
+      </w:r>
+    </w:p>
+    <w:p>
+      <w:pPr>
+        <w:pStyle w:val="BodyText"/>
+      </w:pPr>
+      <w:r>
+        <w:t xml:space="preserve">[11]</w:t>
+      </w:r>
+      <w:r>
+        <w:t xml:space="preserve">S. G. Hart and L. E. Staveland. 1988. Development of NASA-TLX (Task Load Index): Results of empirical and theoretical research. In</w:t>
       </w:r>
       <w:r>
         <w:t xml:space="preserve"> </w:t>
@@ -11653,35 +11675,10 @@
           <w:i/>
           <w:iCs/>
         </w:rPr>
-        <w:t xml:space="preserve">Proceedings of the ACM on Programming Languages</w:t>
-      </w:r>
-      <w:r>
-        <w:t xml:space="preserve"> </w:t>
-      </w:r>
-      <w:r>
-        <w:t xml:space="preserve">4, POPL, Article 43 (2020).</w:t>
-      </w:r>
-    </w:p>
-    <w:p>
-      <w:pPr>
-        <w:pStyle w:val="BodyText"/>
-      </w:pPr>
-      <w:r>
-        <w:t xml:space="preserve">[10]</w:t>
-      </w:r>
-      <w:r>
-        <w:t xml:space="preserve">B. R. Gyawali, S. Achalla, K. Kallas, and S. Kumar. 2025. NaSh: Guardrails for an LLM-Powered Natural Language Shell. arXiv:2506.13028</w:t>
-      </w:r>
-    </w:p>
-    <w:p>
-      <w:pPr>
-        <w:pStyle w:val="BodyText"/>
-      </w:pPr>
-      <w:r>
-        <w:t xml:space="preserve">[11]</w:t>
-      </w:r>
-      <w:r>
-        <w:t xml:space="preserve">W. Han, Z. Zeng, J. Huang, S. Jiang, et al. 2025. GUIRoboTron-Speech: Towards Automated GUI Agents Based on Speech Instructions. arXiv:2506.11127</w:t>
+        <w:t xml:space="preserve">Human Mental Workload</w:t>
+      </w:r>
+      <w:r>
+        <w:t xml:space="preserve">, P. A. Hancock and N. Meshkati (Eds.). Advances in Psychology, Vol. 52. North-Holland, 139–183.</w:t>
       </w:r>
     </w:p>
     <w:p>
@@ -11692,7 +11689,7 @@
         <w:t xml:space="preserve">[12]</w:t>
       </w:r>
       <w:r>
-        <w:t xml:space="preserve">S. G. Hart and L. E. Staveland. 1988. Development of NASA-TLX (Task Load Index): Results of empirical and theoretical research. In</w:t>
+        <w:t xml:space="preserve">W. Hong, W. Wang, Q. Lv, J. Xu, W. Yu, J. Ji, Y. Wang, Z. Wang, Y. Dong, M. Ding, and J. Tang. 2024. CogAgent: A Visual Language Model for GUI Agents. In</w:t>
       </w:r>
       <w:r>
         <w:t xml:space="preserve"> </w:t>
@@ -11702,10 +11699,10 @@
           <w:i/>
           <w:iCs/>
         </w:rPr>
-        <w:t xml:space="preserve">Human Mental Workload</w:t>
-      </w:r>
-      <w:r>
-        <w:t xml:space="preserve">, P. A. Hancock and N. Meshkati (Eds.). Advances in Psychology, Vol. 52. North-Holland, 139–183.</w:t>
+        <w:t xml:space="preserve">Proceedings of CVPR 2024</w:t>
+      </w:r>
+      <w:r>
+        <w:t xml:space="preserve">.</w:t>
       </w:r>
     </w:p>
     <w:p>
@@ -11716,7 +11713,18 @@
         <w:t xml:space="preserve">[13]</w:t>
       </w:r>
       <w:r>
-        <w:t xml:space="preserve">W. Hong, W. Wang, Q. Lv, J. Xu, W. Yu, J. Ji, Y. Wang, Z. Wang, Y. Zhang, J. Li, B. Xu, Y. Dong, M. Ding, and J. Tang. 2024. CogAgent: A Visual Language Model for GUI Agents. In</w:t>
+        <w:t xml:space="preserve">Z. Hui, Y. Li, D. Zhao, T. Chen, C. Banbury, and K. Koishida. 2025. WinClick: GUI Grounding with Multimodal Large Language Models. arXiv:2503.04730</w:t>
+      </w:r>
+    </w:p>
+    <w:p>
+      <w:pPr>
+        <w:pStyle w:val="BodyText"/>
+      </w:pPr>
+      <w:r>
+        <w:t xml:space="preserve">[14]</w:t>
+      </w:r>
+      <w:r>
+        <w:t xml:space="preserve">E. L. Hutchins, J. D. Hollan, and D. A. Norman. 1985. Direct manipulation interfaces.</w:t>
       </w:r>
       <w:r>
         <w:t xml:space="preserve"> </w:t>
@@ -11726,21 +11734,13 @@
           <w:i/>
           <w:iCs/>
         </w:rPr>
-        <w:t xml:space="preserve">Proceedings of CVPR 2024</w:t>
-      </w:r>
-      <w:r>
-        <w:t xml:space="preserve">.</w:t>
-      </w:r>
-    </w:p>
-    <w:p>
-      <w:pPr>
-        <w:pStyle w:val="BodyText"/>
-      </w:pPr>
-      <w:r>
-        <w:t xml:space="preserve">[14]</w:t>
-      </w:r>
-      <w:r>
-        <w:t xml:space="preserve">T. Hui, Y. Zhang, B. Jiang, J. Sun, F. Cheng, X. Lin, and Y. Yang. 2025. WinClick: GUI Grounding with Multimodal Large Language Models. arXiv:2503.04730</w:t>
+        <w:t xml:space="preserve">Human–Computer Interaction</w:t>
+      </w:r>
+      <w:r>
+        <w:t xml:space="preserve"> </w:t>
+      </w:r>
+      <w:r>
+        <w:t xml:space="preserve">1, 4 (1985), 311–338.</w:t>
       </w:r>
     </w:p>
     <w:p>
@@ -11751,7 +11751,7 @@
         <w:t xml:space="preserve">[15]</w:t>
       </w:r>
       <w:r>
-        <w:t xml:space="preserve">E. L. Hutchins, J. D. Hollan, and D. A. Norman. 1985. Direct manipulation interfaces.</w:t>
+        <w:t xml:space="preserve">J. Jacobs, J. Lapon, and V. Naessens. 2026. Local LLMs for NL2Bash: A Large-Scale Open-Source Model Evaluation for Bash Command Generation. In</w:t>
       </w:r>
       <w:r>
         <w:t xml:space="preserve"> </w:t>
@@ -11761,13 +11761,10 @@
           <w:i/>
           <w:iCs/>
         </w:rPr>
-        <w:t xml:space="preserve">Human–Computer Interaction</w:t>
-      </w:r>
-      <w:r>
-        <w:t xml:space="preserve"> </w:t>
-      </w:r>
-      <w:r>
-        <w:t xml:space="preserve">1, 4 (1985), 311–338.</w:t>
+        <w:t xml:space="preserve">NDSS Workshop on LLM Assisted Security and Trust Exploration (LAST-X 2026)</w:t>
+      </w:r>
+      <w:r>
+        <w:t xml:space="preserve">.</w:t>
       </w:r>
     </w:p>
     <w:p>
@@ -11778,7 +11775,7 @@
         <w:t xml:space="preserve">[16]</w:t>
       </w:r>
       <w:r>
-        <w:t xml:space="preserve">J. Jacobs, J. Lapon, and V. Naessens. 2026. Local LLMs for NL2Bash: A Large-Scale Open-Source Model Evaluation for Bash Command Generation. In</w:t>
+        <w:t xml:space="preserve">P. Jouvelot and D. K. Gifford. 1991. Algebraic reconstruction of types and effects. In</w:t>
       </w:r>
       <w:r>
         <w:t xml:space="preserve"> </w:t>
@@ -11788,10 +11785,10 @@
           <w:i/>
           <w:iCs/>
         </w:rPr>
-        <w:t xml:space="preserve">NDSS Workshop on LLM Assisted Security and Trust Exploration (LAST-X 2026)</w:t>
-      </w:r>
-      <w:r>
-        <w:t xml:space="preserve">.</w:t>
+        <w:t xml:space="preserve">Proceedings of the 18th ACM SIGPLAN-SIGACT Symposium on Principles of Programming Languages (POPL ’91)</w:t>
+      </w:r>
+      <w:r>
+        <w:t xml:space="preserve">. ACM, 303–310.</w:t>
       </w:r>
     </w:p>
     <w:p>
@@ -11802,7 +11799,7 @@
         <w:t xml:space="preserve">[17]</w:t>
       </w:r>
       <w:r>
-        <w:t xml:space="preserve">P. Jouvelot and D. K. Gifford. 1991. Algebraic reconstruction of types and effects. In</w:t>
+        <w:t xml:space="preserve">kenryu42. 2026.</w:t>
       </w:r>
       <w:r>
         <w:t xml:space="preserve"> </w:t>
@@ -11812,10 +11809,10 @@
           <w:i/>
           <w:iCs/>
         </w:rPr>
-        <w:t xml:space="preserve">Proceedings of the 18th ACM SIGPLAN-SIGACT Symposium on Principles of Programming Languages (POPL ’91)</w:t>
-      </w:r>
-      <w:r>
-        <w:t xml:space="preserve">. ACM, 303–310.</w:t>
+        <w:t xml:space="preserve">cc-safety-net</w:t>
+      </w:r>
+      <w:r>
+        <w:t xml:space="preserve">. https://github.com/kenryu42/cc-safety-net Version 2.6.1.</w:t>
       </w:r>
     </w:p>
     <w:p>
@@ -11826,7 +11823,7 @@
         <w:t xml:space="preserve">[18]</w:t>
       </w:r>
       <w:r>
-        <w:t xml:space="preserve">kenryu42. 2026.</w:t>
+        <w:t xml:space="preserve">Y. Li, J. He, X. Zhou, Y. Zhang, and J. Baldridge. 2020. Mapping Natural Language Instructions to Mobile UI Action Sequences. In</w:t>
       </w:r>
       <w:r>
         <w:t xml:space="preserve"> </w:t>
@@ -11836,10 +11833,10 @@
           <w:i/>
           <w:iCs/>
         </w:rPr>
-        <w:t xml:space="preserve">cc-safety-net</w:t>
-      </w:r>
-      <w:r>
-        <w:t xml:space="preserve">. https://github.com/kenryu42/cc-safety-net Version 2.6.1.</w:t>
+        <w:t xml:space="preserve">Proceedings of ACL 2020</w:t>
+      </w:r>
+      <w:r>
+        <w:t xml:space="preserve">. 8198–8210.</w:t>
       </w:r>
     </w:p>
     <w:p>
@@ -11850,7 +11847,7 @@
         <w:t xml:space="preserve">[19]</w:t>
       </w:r>
       <w:r>
-        <w:t xml:space="preserve">Y. Li, J. He, X. Zhou, Y. Zhang, and J. Baldridge. 2020. Mapping Natural Language Instructions to Mobile UI Action Sequences. In</w:t>
+        <w:t xml:space="preserve">X. V. Lin, C. Wang, L. Zettlemoyer, and M. D. Ernst. 2018. NL2Bash: A corpus and semantic parser for natural language interface to the Linux operating system. In</w:t>
       </w:r>
       <w:r>
         <w:t xml:space="preserve"> </w:t>
@@ -11860,10 +11857,10 @@
           <w:i/>
           <w:iCs/>
         </w:rPr>
-        <w:t xml:space="preserve">Proceedings of ACL 2020</w:t>
-      </w:r>
-      <w:r>
-        <w:t xml:space="preserve">. 8198–8210.</w:t>
+        <w:t xml:space="preserve">Proceedings of the Eleventh International Conference on Language Resources and Evaluation (LREC 2018)</w:t>
+      </w:r>
+      <w:r>
+        <w:t xml:space="preserve">. European Language Resources Association.</w:t>
       </w:r>
     </w:p>
     <w:p>
@@ -11874,7 +11871,29 @@
         <w:t xml:space="preserve">[20]</w:t>
       </w:r>
       <w:r>
-        <w:t xml:space="preserve">X. V. Lin, C. Wang, L. Zettlemoyer, and M. D. Ernst. 2018. NL2Bash: A corpus and semantic parser for natural language interface to the Linux operating system. In</w:t>
+        <w:t xml:space="preserve">R. Liu, T. Zhe, D. Wang, Z. Yao, K. Liu, Y. Fu, H. Liu, and J. Pei. 2026. AgentOS: From Application Silos to a Natural Language-Driven Data Ecosystem. arXiv:2603.08938</w:t>
+      </w:r>
+    </w:p>
+    <w:p>
+      <w:pPr>
+        <w:pStyle w:val="BodyText"/>
+      </w:pPr>
+      <w:r>
+        <w:t xml:space="preserve">[21]</w:t>
+      </w:r>
+      <w:r>
+        <w:t xml:space="preserve">J. Lu, Z. Zhang, F. Yang, J. Zhang, L. Wang, C. Du, Q. Lin, S. Rajmohan, D. Zhang, and Q. Zhang. 2024. AXIS: Efficient Human-Agent-Computer Interaction with API-First LLM-Based Agents. arXiv:2409.17140</w:t>
+      </w:r>
+    </w:p>
+    <w:p>
+      <w:pPr>
+        <w:pStyle w:val="BodyText"/>
+      </w:pPr>
+      <w:r>
+        <w:t xml:space="preserve">[22]</w:t>
+      </w:r>
+      <w:r>
+        <w:t xml:space="preserve">E. Luger and A. Sellen. 2016. “Like having a really bad PA”: The gulf between user expectation and experience of conversational agents. In</w:t>
       </w:r>
       <w:r>
         <w:t xml:space="preserve"> </w:t>
@@ -11884,32 +11903,10 @@
           <w:i/>
           <w:iCs/>
         </w:rPr>
-        <w:t xml:space="preserve">Proceedings of the Eleventh International Conference on Language Resources and Evaluation (LREC 2018)</w:t>
-      </w:r>
-      <w:r>
-        <w:t xml:space="preserve">. European Language Resources Association.</w:t>
-      </w:r>
-    </w:p>
-    <w:p>
-      <w:pPr>
-        <w:pStyle w:val="BodyText"/>
-      </w:pPr>
-      <w:r>
-        <w:t xml:space="preserve">[21]</w:t>
-      </w:r>
-      <w:r>
-        <w:t xml:space="preserve">R. Liu, T. Zhe, D. Wang, Z. Yao, K. Liu, Y. Fu, H. Liu, and J. Pei. 2026. AgentOS: From Application Silos to a Natural Language-Driven Data Ecosystem. arXiv:2603.08938</w:t>
-      </w:r>
-    </w:p>
-    <w:p>
-      <w:pPr>
-        <w:pStyle w:val="BodyText"/>
-      </w:pPr>
-      <w:r>
-        <w:t xml:space="preserve">[22]</w:t>
-      </w:r>
-      <w:r>
-        <w:t xml:space="preserve">J. Lu, Z. Zhang, F. Yang, J. Zhang, L. Wang, C. Du, Q. Lin, S. Rajmohan, D. Zhang, and Q. Zhang. 2024. AXIS: Efficient Human-Agent-Computer Interaction with API-First LLM-Based Agents. arXiv:2409.17140</w:t>
+        <w:t xml:space="preserve">Proceedings of the 2016 CHI Conference on Human Factors in Computing Systems (CHI ’16)</w:t>
+      </w:r>
+      <w:r>
+        <w:t xml:space="preserve">. ACM, 5286–5297.</w:t>
       </w:r>
     </w:p>
     <w:p>
@@ -11920,7 +11917,7 @@
         <w:t xml:space="preserve">[23]</w:t>
       </w:r>
       <w:r>
-        <w:t xml:space="preserve">E. Luger and A. Sellen. 2016. “Like having a really bad PA”: The gulf between user expectation and experience of conversational agents. In</w:t>
+        <w:t xml:space="preserve">K. Mazurak and S. Zdancewic. 2007. ABASH: Finding bugs in bash scripts. In</w:t>
       </w:r>
       <w:r>
         <w:t xml:space="preserve"> </w:t>
@@ -11930,10 +11927,10 @@
           <w:i/>
           <w:iCs/>
         </w:rPr>
-        <w:t xml:space="preserve">Proceedings of the 2016 CHI Conference on Human Factors in Computing Systems (CHI ’16)</w:t>
-      </w:r>
-      <w:r>
-        <w:t xml:space="preserve">. ACM, 5286–5297.</w:t>
+        <w:t xml:space="preserve">Proceedings of the 2007 Workshop on Programming Languages and Analysis for Security (PLAS ’07)</w:t>
+      </w:r>
+      <w:r>
+        <w:t xml:space="preserve">. ACM.</w:t>
       </w:r>
     </w:p>
     <w:p>
@@ -11944,7 +11941,29 @@
         <w:t xml:space="preserve">[24]</w:t>
       </w:r>
       <w:r>
-        <w:t xml:space="preserve">K. Mazurak and S. Zdancewic. 2007. ABASH: Finding bugs in bash scripts. In</w:t>
+        <w:t xml:space="preserve">S. Mehendale and A. Walishetti. 2024. DexAssist: A Voice-Enabled Dual-LLM Framework for Accessible Web Navigation. arXiv:2411.12214</w:t>
+      </w:r>
+    </w:p>
+    <w:p>
+      <w:pPr>
+        <w:pStyle w:val="BodyText"/>
+      </w:pPr>
+      <w:r>
+        <w:t xml:space="preserve">[25]</w:t>
+      </w:r>
+      <w:r>
+        <w:t xml:space="preserve">R. Niu, J. Li, S. Wang, Y. Fu, X. Hu, X. Leng, H. Kong, Y. Chang, and Q. Wang. 2024. ScreenAgent: A Vision Language Model-driven Computer Control Agent. arXiv:2402.07945</w:t>
+      </w:r>
+    </w:p>
+    <w:p>
+      <w:pPr>
+        <w:pStyle w:val="BodyText"/>
+      </w:pPr>
+      <w:r>
+        <w:t xml:space="preserve">[26]</w:t>
+      </w:r>
+      <w:r>
+        <w:t xml:space="preserve">D. A. Norman. 1986. Cognitive engineering. In</w:t>
       </w:r>
       <w:r>
         <w:t xml:space="preserve"> </w:t>
@@ -11954,32 +11973,10 @@
           <w:i/>
           <w:iCs/>
         </w:rPr>
-        <w:t xml:space="preserve">Proceedings of the 2007 Workshop on Programming Languages and Analysis for Security (PLAS ’07)</w:t>
-      </w:r>
-      <w:r>
-        <w:t xml:space="preserve">. ACM.</w:t>
-      </w:r>
-    </w:p>
-    <w:p>
-      <w:pPr>
-        <w:pStyle w:val="BodyText"/>
-      </w:pPr>
-      <w:r>
-        <w:t xml:space="preserve">[25]</w:t>
-      </w:r>
-      <w:r>
-        <w:t xml:space="preserve">S. Mehendale and A. Walishetti. 2024. DexAssist: A Voice-Enabled Dual-LLM Framework for Accessible Web Navigation. arXiv:2411.12214</w:t>
-      </w:r>
-    </w:p>
-    <w:p>
-      <w:pPr>
-        <w:pStyle w:val="BodyText"/>
-      </w:pPr>
-      <w:r>
-        <w:t xml:space="preserve">[26]</w:t>
-      </w:r>
-      <w:r>
-        <w:t xml:space="preserve">R. Niu, J. Li, S. Wang, Y. Fu, X. Hu, X. Leng, H. Kong, Y. Chang, and Q. Wang. 2024. ScreenAgent: A Vision Language Model-driven Computer Control Agent. arXiv:2402.07945</w:t>
+        <w:t xml:space="preserve">User Centered System Design: New Perspectives on Human-Computer Interaction</w:t>
+      </w:r>
+      <w:r>
+        <w:t xml:space="preserve">, D. A. Norman and S. W. Draper (Eds.). Lawrence Erlbaum Associates, 31–61.</w:t>
       </w:r>
     </w:p>
     <w:p>
@@ -11990,7 +11987,7 @@
         <w:t xml:space="preserve">[27]</w:t>
       </w:r>
       <w:r>
-        <w:t xml:space="preserve">D. A. Norman. 1981. The trouble with UNIX: The user interface is horrid.</w:t>
+        <w:t xml:space="preserve">OpenAI. 2026.</w:t>
       </w:r>
       <w:r>
         <w:t xml:space="preserve"> </w:t>
@@ -12000,13 +11997,10 @@
           <w:i/>
           <w:iCs/>
         </w:rPr>
-        <w:t xml:space="preserve">Datamation</w:t>
-      </w:r>
-      <w:r>
-        <w:t xml:space="preserve"> </w:t>
-      </w:r>
-      <w:r>
-        <w:t xml:space="preserve">27, 12 (1981), 139–150.</w:t>
+        <w:t xml:space="preserve">Codex CLI</w:t>
+      </w:r>
+      <w:r>
+        <w:t xml:space="preserve">. https://github.com/openai/codex Commit 1f4c473.</w:t>
       </w:r>
     </w:p>
     <w:p>
@@ -12017,7 +12011,7 @@
         <w:t xml:space="preserve">[28]</w:t>
       </w:r>
       <w:r>
-        <w:t xml:space="preserve">D. A. Norman. 1986. Cognitive engineering. In</w:t>
+        <w:t xml:space="preserve">A. Padmanabha, J. Yuan, J. Gupta, Z. Karachiwalla, C. Majidi, H. Admoni, and Z. Erickson. 2024. VoicePilot: Harnessing LLMs as Speech Interfaces for Physically Assistive Robots. In</w:t>
       </w:r>
       <w:r>
         <w:t xml:space="preserve"> </w:t>
@@ -12027,10 +12021,10 @@
           <w:i/>
           <w:iCs/>
         </w:rPr>
-        <w:t xml:space="preserve">User Centered System Design: New Perspectives on Human-Computer Interaction</w:t>
-      </w:r>
-      <w:r>
-        <w:t xml:space="preserve">, D. A. Norman and S. W. Draper (Eds.). Lawrence Erlbaum Associates, 31–61.</w:t>
+        <w:t xml:space="preserve">Proceedings of the 37th Annual ACM Symposium on User Interface Software and Technology (UIST ’24)</w:t>
+      </w:r>
+      <w:r>
+        <w:t xml:space="preserve">. ACM.</w:t>
       </w:r>
     </w:p>
     <w:p>
@@ -12041,7 +12035,7 @@
         <w:t xml:space="preserve">[29]</w:t>
       </w:r>
       <w:r>
-        <w:t xml:space="preserve">OpenAI. 2026.</w:t>
+        <w:t xml:space="preserve">J. Park, P. Tang, S. Das, S. Appalaraju, K. Y. Singh, R. Manmatha, and S. Ghadar. 2025. R-VLM: Region-aware Vision Language Model for Precise GUI Grounding. In</w:t>
       </w:r>
       <w:r>
         <w:t xml:space="preserve"> </w:t>
@@ -12051,10 +12045,10 @@
           <w:i/>
           <w:iCs/>
         </w:rPr>
-        <w:t xml:space="preserve">Codex CLI</w:t>
-      </w:r>
-      <w:r>
-        <w:t xml:space="preserve">. https://github.com/openai/codex Commit 1f4c473.</w:t>
+        <w:t xml:space="preserve">Findings of the Association for Computational Linguistics: ACL 2025</w:t>
+      </w:r>
+      <w:r>
+        <w:t xml:space="preserve">. 9669–9685.</w:t>
       </w:r>
     </w:p>
     <w:p>
@@ -12065,7 +12059,7 @@
         <w:t xml:space="preserve">[30]</w:t>
       </w:r>
       <w:r>
-        <w:t xml:space="preserve">A. Padmanabha, J. Yuan, J. Gupta, Z. Karachiwalla, C. Majidi, H. Admoni, and Z. Erickson. 2024. VoicePilot: Harnessing LLMs as Speech Interfaces for Physically Assistive Robots. In</w:t>
+        <w:t xml:space="preserve">C. Rawles, A. Li, D. Rodriguez, O. Riva, and T. Lillicrap. 2023. Android in the Wild: A Large-Scale Dataset for Android Device Control. In</w:t>
       </w:r>
       <w:r>
         <w:t xml:space="preserve"> </w:t>
@@ -12075,10 +12069,10 @@
           <w:i/>
           <w:iCs/>
         </w:rPr>
-        <w:t xml:space="preserve">Proceedings of the 37th Annual ACM Symposium on User Interface Software and Technology (UIST ’24)</w:t>
-      </w:r>
-      <w:r>
-        <w:t xml:space="preserve">. ACM.</w:t>
+        <w:t xml:space="preserve">Advances in Neural Information Processing Systems 36 (NeurIPS 2023)</w:t>
+      </w:r>
+      <w:r>
+        <w:t xml:space="preserve">.</w:t>
       </w:r>
     </w:p>
     <w:p>
@@ -12089,7 +12083,7 @@
         <w:t xml:space="preserve">[31]</w:t>
       </w:r>
       <w:r>
-        <w:t xml:space="preserve">J. Park, P. Tang, S. Das, S. Appalaraju, K. Y. Singh, R. Manmatha, and S. Ghadar. 2025. R-VLM: Region-aware Vision Language Model for Precise GUI Grounding. In</w:t>
+        <w:t xml:space="preserve">J. Sauro and J. R. Lewis. 2016.</w:t>
       </w:r>
       <w:r>
         <w:t xml:space="preserve"> </w:t>
@@ -12099,10 +12093,13 @@
           <w:i/>
           <w:iCs/>
         </w:rPr>
-        <w:t xml:space="preserve">Findings of the Association for Computational Linguistics: ACL 2025</w:t>
-      </w:r>
-      <w:r>
-        <w:t xml:space="preserve">. 9669–9685.</w:t>
+        <w:t xml:space="preserve">Quantifying the User Experience: Practical Statistics for User Research</w:t>
+      </w:r>
+      <w:r>
+        <w:t xml:space="preserve"> </w:t>
+      </w:r>
+      <w:r>
+        <w:t xml:space="preserve">(2nd ed.). Morgan Kaufmann.</w:t>
       </w:r>
     </w:p>
     <w:p>
@@ -12113,7 +12110,7 @@
         <w:t xml:space="preserve">[32]</w:t>
       </w:r>
       <w:r>
-        <w:t xml:space="preserve">C. Rawles, A. Li, D. Rodriguez, O. Riva, and T. Lillicrap. 2023. Android in the Wild: A Large-Scale Dataset for Android Device Control. In</w:t>
+        <w:t xml:space="preserve">B. Shneiderman. 1983. Direct manipulation: A step beyond programming languages.</w:t>
       </w:r>
       <w:r>
         <w:t xml:space="preserve"> </w:t>
@@ -12123,10 +12120,13 @@
           <w:i/>
           <w:iCs/>
         </w:rPr>
-        <w:t xml:space="preserve">Advances in Neural Information Processing Systems 36 (NeurIPS 2023)</w:t>
-      </w:r>
-      <w:r>
-        <w:t xml:space="preserve">.</w:t>
+        <w:t xml:space="preserve">Computer</w:t>
+      </w:r>
+      <w:r>
+        <w:t xml:space="preserve"> </w:t>
+      </w:r>
+      <w:r>
+        <w:t xml:space="preserve">16, 8 (1983), 57–69.</w:t>
       </w:r>
     </w:p>
     <w:p>
@@ -12137,7 +12137,7 @@
         <w:t xml:space="preserve">[33]</w:t>
       </w:r>
       <w:r>
-        <w:t xml:space="preserve">J. Sauro and J. R. Lewis. 2016.</w:t>
+        <w:t xml:space="preserve">B. Shneiderman. 2000. The limits of speech recognition.</w:t>
       </w:r>
       <w:r>
         <w:t xml:space="preserve"> </w:t>
@@ -12147,13 +12147,13 @@
           <w:i/>
           <w:iCs/>
         </w:rPr>
-        <w:t xml:space="preserve">Quantifying the User Experience: Practical Statistics for User Research</w:t>
-      </w:r>
-      <w:r>
-        <w:t xml:space="preserve"> </w:t>
-      </w:r>
-      <w:r>
-        <w:t xml:space="preserve">(2nd ed.). Morgan Kaufmann.</w:t>
+        <w:t xml:space="preserve">Commun. ACM</w:t>
+      </w:r>
+      <w:r>
+        <w:t xml:space="preserve"> </w:t>
+      </w:r>
+      <w:r>
+        <w:t xml:space="preserve">43, 9 (2000), 63–65.</w:t>
       </w:r>
     </w:p>
     <w:p>
@@ -12164,7 +12164,7 @@
         <w:t xml:space="preserve">[34]</w:t>
       </w:r>
       <w:r>
-        <w:t xml:space="preserve">B. Shneiderman. 1983. Direct manipulation: A step beyond programming languages.</w:t>
+        <w:t xml:space="preserve">B. Shneiderman and P. Maes. 1997. Direct manipulation vs. interface agents.</w:t>
       </w:r>
       <w:r>
         <w:t xml:space="preserve"> </w:t>
@@ -12174,13 +12174,13 @@
           <w:i/>
           <w:iCs/>
         </w:rPr>
-        <w:t xml:space="preserve">Computer</w:t>
-      </w:r>
-      <w:r>
-        <w:t xml:space="preserve"> </w:t>
-      </w:r>
-      <w:r>
-        <w:t xml:space="preserve">16, 8 (1983), 57–69.</w:t>
+        <w:t xml:space="preserve">interactions</w:t>
+      </w:r>
+      <w:r>
+        <w:t xml:space="preserve"> </w:t>
+      </w:r>
+      <w:r>
+        <w:t xml:space="preserve">4, 6 (1997), 42–61.</w:t>
       </w:r>
     </w:p>
     <w:p>
@@ -12191,7 +12191,7 @@
         <w:t xml:space="preserve">[35]</w:t>
       </w:r>
       <w:r>
-        <w:t xml:space="preserve">B. Shneiderman. 2000. The limits of speech recognition.</w:t>
+        <w:t xml:space="preserve">J.-P. Talpin and P. Jouvelot. 1994. The type and effect discipline.</w:t>
       </w:r>
       <w:r>
         <w:t xml:space="preserve"> </w:t>
@@ -12201,13 +12201,13 @@
           <w:i/>
           <w:iCs/>
         </w:rPr>
-        <w:t xml:space="preserve">Commun. ACM</w:t>
-      </w:r>
-      <w:r>
-        <w:t xml:space="preserve"> </w:t>
-      </w:r>
-      <w:r>
-        <w:t xml:space="preserve">43, 9 (2000), 63–65.</w:t>
+        <w:t xml:space="preserve">Information and Computation</w:t>
+      </w:r>
+      <w:r>
+        <w:t xml:space="preserve"> </w:t>
+      </w:r>
+      <w:r>
+        <w:t xml:space="preserve">111, 2 (1994), 245–296.</w:t>
       </w:r>
     </w:p>
     <w:p>
@@ -12218,7 +12218,40 @@
         <w:t xml:space="preserve">[36]</w:t>
       </w:r>
       <w:r>
-        <w:t xml:space="preserve">B. Shneiderman and P. Maes. 1997. Direct manipulation vs. interface agents.</w:t>
+        <w:t xml:space="preserve">H. G. W. van Dam. 2025. A Multimodal GUI Architecture for Interfacing with LLM-Based Conversational Assistants. arXiv:2510.06223</w:t>
+      </w:r>
+    </w:p>
+    <w:p>
+      <w:pPr>
+        <w:pStyle w:val="BodyText"/>
+      </w:pPr>
+      <w:r>
+        <w:t xml:space="preserve">[37]</w:t>
+      </w:r>
+      <w:r>
+        <w:t xml:space="preserve">J. Wang, H. Xu, J. Ye, M. Yan, W. Shen, J. Zhang, F. Huang, and J. Sang. 2024. Mobile-Agent: Autonomous Multi-Modal Mobile Device Agent with Visual Perception. arXiv:2401.16158</w:t>
+      </w:r>
+    </w:p>
+    <w:p>
+      <w:pPr>
+        <w:pStyle w:val="BodyText"/>
+      </w:pPr>
+      <w:r>
+        <w:t xml:space="preserve">[38]</w:t>
+      </w:r>
+      <w:r>
+        <w:t xml:space="preserve">F. Westenfelder, E. Hemberg, M. Tulla, S. Moskal, U.-M. O’Reilly, and S. Chiricescu. 2025. LLM-Supported Natural Language to Bash Translation. arXiv:2502.06858</w:t>
+      </w:r>
+    </w:p>
+    <w:p>
+      <w:pPr>
+        <w:pStyle w:val="BodyText"/>
+      </w:pPr>
+      <w:r>
+        <w:t xml:space="preserve">[39]</w:t>
+      </w:r>
+      <w:r>
+        <w:t xml:space="preserve">J. Whiteside, S. Jones, P. S. Levy, and D. Wixon. 1985. User performance with command, menu, and iconic interfaces. In</w:t>
       </w:r>
       <w:r>
         <w:t xml:space="preserve"> </w:t>
@@ -12228,24 +12261,21 @@
           <w:i/>
           <w:iCs/>
         </w:rPr>
-        <w:t xml:space="preserve">interactions</w:t>
-      </w:r>
-      <w:r>
-        <w:t xml:space="preserve"> </w:t>
-      </w:r>
-      <w:r>
-        <w:t xml:space="preserve">4, 6 (1997), 42–61.</w:t>
-      </w:r>
-    </w:p>
-    <w:p>
-      <w:pPr>
-        <w:pStyle w:val="BodyText"/>
-      </w:pPr>
-      <w:r>
-        <w:t xml:space="preserve">[37]</w:t>
-      </w:r>
-      <w:r>
-        <w:t xml:space="preserve">J.-P. Talpin and P. Jouvelot. 1994. The type and effect discipline.</w:t>
+        <w:t xml:space="preserve">Proceedings of the SIGCHI Conference on Human Factors in Computing Systems (CHI ’85)</w:t>
+      </w:r>
+      <w:r>
+        <w:t xml:space="preserve">. ACM, 185–191.</w:t>
+      </w:r>
+    </w:p>
+    <w:p>
+      <w:pPr>
+        <w:pStyle w:val="BodyText"/>
+      </w:pPr>
+      <w:r>
+        <w:t xml:space="preserve">[40]</w:t>
+      </w:r>
+      <w:r>
+        <w:t xml:space="preserve">R. Wilensky, D. N. Chin, M. Luria, J. Martin, J. Mayfield, and D. Wu. 1988. The Berkeley Unix Consultant Project.</w:t>
       </w:r>
       <w:r>
         <w:t xml:space="preserve"> </w:t>
@@ -12255,46 +12285,13 @@
           <w:i/>
           <w:iCs/>
         </w:rPr>
-        <w:t xml:space="preserve">Information and Computation</w:t>
-      </w:r>
-      <w:r>
-        <w:t xml:space="preserve"> </w:t>
-      </w:r>
-      <w:r>
-        <w:t xml:space="preserve">111, 2 (1994), 245–296.</w:t>
-      </w:r>
-    </w:p>
-    <w:p>
-      <w:pPr>
-        <w:pStyle w:val="BodyText"/>
-      </w:pPr>
-      <w:r>
-        <w:t xml:space="preserve">[38]</w:t>
-      </w:r>
-      <w:r>
-        <w:t xml:space="preserve">H. G. W. van Dam. 2025. A Multimodal GUI Architecture for Interfacing with LLM-Based Conversational Assistants. arXiv:2510.06223</w:t>
-      </w:r>
-    </w:p>
-    <w:p>
-      <w:pPr>
-        <w:pStyle w:val="BodyText"/>
-      </w:pPr>
-      <w:r>
-        <w:t xml:space="preserve">[39]</w:t>
-      </w:r>
-      <w:r>
-        <w:t xml:space="preserve">J. Wang, H. Xu, J. Ye, M. Yan, W. Shen, J. Zhang, F. Huang, and J. Sang. 2024. Mobile-Agent: Autonomous Multi-Modal Mobile Device Agent with Visual Perception. arXiv:2401.16158</w:t>
-      </w:r>
-    </w:p>
-    <w:p>
-      <w:pPr>
-        <w:pStyle w:val="BodyText"/>
-      </w:pPr>
-      <w:r>
-        <w:t xml:space="preserve">[40]</w:t>
-      </w:r>
-      <w:r>
-        <w:t xml:space="preserve">F. Westenfelder, E. Hemberg, M. Tulla, S. Moskal, U.-M. O’Reilly, and S. Chiricescu. 2025. LLM-Supported Natural Language to Bash Translation. arXiv:2502.06858</w:t>
+        <w:t xml:space="preserve">Computational Linguistics</w:t>
+      </w:r>
+      <w:r>
+        <w:t xml:space="preserve"> </w:t>
+      </w:r>
+      <w:r>
+        <w:t xml:space="preserve">14, 4 (1988), 35–84.</w:t>
       </w:r>
     </w:p>
     <w:p>
@@ -12305,7 +12302,7 @@
         <w:t xml:space="preserve">[41]</w:t>
       </w:r>
       <w:r>
-        <w:t xml:space="preserve">J. Whiteside, S. Jones, P. S. Levy, and D. Wixon. 1985. User performance with command, menu, and iconic interfaces. In</w:t>
+        <w:t xml:space="preserve">T. Xie, D. Zhang, J. Chen, X. Li, S. Zhao, R. Cao, T. J. Hua, Z. Cheng, D. Shin, F. Lei, Y. Liu, Y. Xu, S. Zhou, S. Savarese, C. Xiong, V. Zhong, and T. Yu. 2024. OSWorld: Benchmarking Multimodal Agents for Open-Ended Tasks in Real Computer Environments. In</w:t>
       </w:r>
       <w:r>
         <w:t xml:space="preserve"> </w:t>
@@ -12315,10 +12312,10 @@
           <w:i/>
           <w:iCs/>
         </w:rPr>
-        <w:t xml:space="preserve">Proceedings of the SIGCHI Conference on Human Factors in Computing Systems (CHI ’85)</w:t>
-      </w:r>
-      <w:r>
-        <w:t xml:space="preserve">. ACM, 185–191.</w:t>
+        <w:t xml:space="preserve">Advances in Neural Information Processing Systems 37 (NeurIPS 2024)</w:t>
+      </w:r>
+      <w:r>
+        <w:t xml:space="preserve">.</w:t>
       </w:r>
     </w:p>
     <w:p>
@@ -12329,7 +12326,7 @@
         <w:t xml:space="preserve">[42]</w:t>
       </w:r>
       <w:r>
-        <w:t xml:space="preserve">R. Wilensky, D. N. Chin, M. Luria, J. Martin, J. Mayfield, and D. Wu. 1988. The Berkeley Unix Consultant Project.</w:t>
+        <w:t xml:space="preserve">S. Yao, J. Zhao, D. Yu, N. Du, I. Shafran, K. Narasimhan, and Y. Cao. 2023. ReAct: Synergizing Reasoning and Acting in Language Models. In</w:t>
       </w:r>
       <w:r>
         <w:t xml:space="preserve"> </w:t>
@@ -12339,13 +12336,10 @@
           <w:i/>
           <w:iCs/>
         </w:rPr>
-        <w:t xml:space="preserve">Computational Linguistics</w:t>
-      </w:r>
-      <w:r>
-        <w:t xml:space="preserve"> </w:t>
-      </w:r>
-      <w:r>
-        <w:t xml:space="preserve">14, 4 (1988), 35–84.</w:t>
+        <w:t xml:space="preserve">Proceedings of ICLR 2023</w:t>
+      </w:r>
+      <w:r>
+        <w:t xml:space="preserve">.</w:t>
       </w:r>
     </w:p>
     <w:p>
@@ -12356,7 +12350,60 @@
         <w:t xml:space="preserve">[43]</w:t>
       </w:r>
       <w:r>
-        <w:t xml:space="preserve">T. Xie, D. Zhang, J. Chen, X. Li, S. Zhao, R. Cao, T. J. Hua, Z. Cheng, D. Shin, F. Lei, Y. Liu, Y. Xu, S. Zhou, S. Savarese, C. Xiong, V. Zhong, and T. Yu. 2024. OSWorld: Benchmarking Multimodal Agents for Open-Ended Tasks in Real Computer Environments. In</w:t>
+        <w:t xml:space="preserve">M. Yuan, Z. Zhou, X. Xiong, et al. 2026. OSWorld 2.0: Benchmarking Computer Use Agents on Long-Horizon Real-World Tasks. arXiv:2606.29537</w:t>
+      </w:r>
+    </w:p>
+    <w:p>
+      <w:pPr>
+        <w:pStyle w:val="BodyText"/>
+      </w:pPr>
+      <w:r>
+        <w:t xml:space="preserve">[44]</w:t>
+      </w:r>
+      <w:r>
+        <w:t xml:space="preserve">C. Zhang, S. He, J. Qian, B. Li, L. Li, S. Qin, Y. Kang, M. Ma, G. Liu, Q. Lin, S. Rajmohan, D. Zhang, and Q. Zhang. 2024. Large Language Model-Brained GUI Agents: A Survey. arXiv:2411.18279</w:t>
+      </w:r>
+    </w:p>
+    <w:p>
+      <w:pPr>
+        <w:pStyle w:val="BodyText"/>
+      </w:pPr>
+      <w:r>
+        <w:t xml:space="preserve">[45]</w:t>
+      </w:r>
+      <w:r>
+        <w:t xml:space="preserve">C. Zhang, H. Huang, C. Ni, J. Mu, S. Qin, S. He, L. Wang, F. Yang, P. Zhao, C. Du, L. Li, Y. Kang, Z. Jiang, S. Zheng, R. Wang, J. Qian, M. Ma, J. Lou, Q. Lin, S. Rajmohan, and D. Zhang. 2025. UFO</w:t>
+      </w:r>
+      <w:r>
+        <w:rPr>
+          <w:vertAlign w:val="superscript"/>
+        </w:rPr>
+        <w:t xml:space="preserve">2</w:t>
+      </w:r>
+      <w:r>
+        <w:t xml:space="preserve">: The Desktop AgentOS. arXiv:2504.14603</w:t>
+      </w:r>
+    </w:p>
+    <w:p>
+      <w:pPr>
+        <w:pStyle w:val="BodyText"/>
+      </w:pPr>
+      <w:r>
+        <w:t xml:space="preserve">[46]</w:t>
+      </w:r>
+      <w:r>
+        <w:t xml:space="preserve">C. Zhang, Z. Yang, J. Liu, Y. Li, Y. Han, X. Chen, Z. Huang, B. Fu, and G. Yu. 2023. AppAgent: Multimodal Agents as Smartphone Users. arXiv:2312.13771</w:t>
+      </w:r>
+    </w:p>
+    <w:p>
+      <w:pPr>
+        <w:pStyle w:val="BodyText"/>
+      </w:pPr>
+      <w:r>
+        <w:t xml:space="preserve">[47]</w:t>
+      </w:r>
+      <w:r>
+        <w:t xml:space="preserve">B. Zheng, B. Gou, J. Kil, H. Sun, and Y. Su. 2024. GPT-4V(ision) is a Generalist Web Agent, if Grounded. In</w:t>
       </w:r>
       <w:r>
         <w:t xml:space="preserve"> </w:t>
@@ -12366,7 +12413,7 @@
           <w:i/>
           <w:iCs/>
         </w:rPr>
-        <w:t xml:space="preserve">Advances in Neural Information Processing Systems 37 (NeurIPS 2024)</w:t>
+        <w:t xml:space="preserve">Proceedings of ICML 2024</w:t>
       </w:r>
       <w:r>
         <w:t xml:space="preserve">.</w:t>
@@ -12377,10 +12424,10 @@
         <w:pStyle w:val="BodyText"/>
       </w:pPr>
       <w:r>
-        <w:t xml:space="preserve">[44]</w:t>
-      </w:r>
-      <w:r>
-        <w:t xml:space="preserve">S. Yao, J. Zhao, D. Yu, N. Du, I. Shafran, K. Narasimhan, and Y. Cao. 2023. ReAct: Synergizing Reasoning and Acting in Language Models. In</w:t>
+        <w:t xml:space="preserve">[48]</w:t>
+      </w:r>
+      <w:r>
+        <w:t xml:space="preserve">S. Zhou, F. F. Xu, H. Zhu, X. Zhou, R. Lo, A. Sridhar, X. Cheng, T. Ou, Y. Bisk, D. Fried, U. Alon, and G. Neubig. 2024. WebArena: A Realistic Web Environment for Building Autonomous Agents. In</w:t>
       </w:r>
       <w:r>
         <w:t xml:space="preserve"> </w:t>
@@ -12390,7 +12437,7 @@
           <w:i/>
           <w:iCs/>
         </w:rPr>
-        <w:t xml:space="preserve">Proceedings of ICLR 2023</w:t>
+        <w:t xml:space="preserve">Proceedings of ICLR 2024</w:t>
       </w:r>
       <w:r>
         <w:t xml:space="preserve">.</w:t>
@@ -12401,110 +12448,9 @@
         <w:pStyle w:val="BodyText"/>
       </w:pPr>
       <w:r>
-        <w:t xml:space="preserve">[45]</w:t>
-      </w:r>
-      <w:r>
-        <w:t xml:space="preserve">M. Yuan, Z. Zhou, X. Xiong, et al. 2026. OSWorld 2.0: Benchmarking Computer Use Agents on Long-Horizon Real-World Tasks. arXiv:2606.29537</w:t>
-      </w:r>
-    </w:p>
-    <w:p>
-      <w:pPr>
-        <w:pStyle w:val="BodyText"/>
-      </w:pPr>
-      <w:r>
-        <w:t xml:space="preserve">[46]</w:t>
-      </w:r>
-      <w:r>
-        <w:t xml:space="preserve">C. Zhang, S. He, J. Qian, B. Li, L. Li, S. Qin, Y. Kang, M. Ma, G. Liu, Q. Lin, S. Rajmohan, D. Zhang, and Q. Zhang. 2024. Large Language Model-Brained GUI Agents: A Survey. arXiv:2411.18279</w:t>
-      </w:r>
-    </w:p>
-    <w:p>
-      <w:pPr>
-        <w:pStyle w:val="BodyText"/>
-      </w:pPr>
-      <w:r>
-        <w:t xml:space="preserve">[47]</w:t>
-      </w:r>
-      <w:r>
-        <w:t xml:space="preserve">C. Zhang, S. He, J. Qian, B. Li, L. Li, S. Qin, Y. Kang, M. Ma, G. Liu, Q. Lin, S. Rajmohan, D. Zhang, and Q. Zhang. 2025. UFO</w:t>
-      </w:r>
-      <w:r>
-        <w:rPr>
-          <w:vertAlign w:val="superscript"/>
-        </w:rPr>
-        <w:t xml:space="preserve">2</w:t>
-      </w:r>
-      <w:r>
-        <w:t xml:space="preserve">: The Desktop AgentOS. arXiv:2504.14603</w:t>
-      </w:r>
-    </w:p>
-    <w:p>
-      <w:pPr>
-        <w:pStyle w:val="BodyText"/>
-      </w:pPr>
-      <w:r>
-        <w:t xml:space="preserve">[48]</w:t>
-      </w:r>
-      <w:r>
-        <w:t xml:space="preserve">C. Zhang, Z. Yang, J. Liu, Y. Han, X. Chen, Z. Huang, B. Fu, and G. Yu. 2023. AppAgent: Multimodal Agents as Smartphone Users. arXiv:2312.13771</w:t>
-      </w:r>
-    </w:p>
-    <w:p>
-      <w:pPr>
-        <w:pStyle w:val="BodyText"/>
-      </w:pPr>
-      <w:r>
         <w:t xml:space="preserve">[49]</w:t>
       </w:r>
       <w:r>
-        <w:t xml:space="preserve">B. Zheng, B. Gou, J. Kil, H. Sun, and Y. Su. 2024. GPT-4V(ision) is a Generalist Web Agent, if Grounded. In</w:t>
-      </w:r>
-      <w:r>
-        <w:t xml:space="preserve"> </w:t>
-      </w:r>
-      <w:r>
-        <w:rPr>
-          <w:i/>
-          <w:iCs/>
-        </w:rPr>
-        <w:t xml:space="preserve">Proceedings of ICML 2024</w:t>
-      </w:r>
-      <w:r>
-        <w:t xml:space="preserve">.</w:t>
-      </w:r>
-    </w:p>
-    <w:p>
-      <w:pPr>
-        <w:pStyle w:val="BodyText"/>
-      </w:pPr>
-      <w:r>
-        <w:t xml:space="preserve">[50]</w:t>
-      </w:r>
-      <w:r>
-        <w:t xml:space="preserve">S. Zhou, F. F. Xu, H. Zhu, X. Zhou, R. Lo, A. Sridhar, X. Cheng, T. Ou, Y. Bisk, D. Fried, U. Alon, and G. Neubig. 2024. WebArena: A Realistic Web Environment for Building Autonomous Agents. In</w:t>
-      </w:r>
-      <w:r>
-        <w:t xml:space="preserve"> </w:t>
-      </w:r>
-      <w:r>
-        <w:rPr>
-          <w:i/>
-          <w:iCs/>
-        </w:rPr>
-        <w:t xml:space="preserve">Proceedings of ICLR 2024</w:t>
-      </w:r>
-      <w:r>
-        <w:t xml:space="preserve">.</w:t>
-      </w:r>
-    </w:p>
-    <w:p>
-      <w:pPr>
-        <w:pStyle w:val="BodyText"/>
-      </w:pPr>
-      <w:r>
-        <w:t xml:space="preserve">[51]</w:t>
-      </w:r>
-      <w:r>
         <w:t xml:space="preserve">X. Zhou, S. Zhang, Y. Zhao, J. Wei, T. Song, A. Cohan, and C. Zhao. 2026. GUI vs. CLI: Execution Bottlenecks in Screen-Only and Skill-Mediated Computer-Use Agents. arXiv:2606.24551</w:t>
       </w:r>
     </w:p>
@@ -12548,7 +12494,7 @@
         <w:pStyle w:val="BodyText"/>
       </w:pPr>
       <w:r>
-        <w:t xml:space="preserve">Administered immediately after each condition, referring to the interface just used.  Items are the standard ten-item instrument of Brooke [4], with the word “system” replaced throughout by “interface” so that participants rate the interaction surface rather than the machine.  Each item is answered on a five-point scale from 1 (strongly disagree) to 5 (strongly agree).</w:t>
+        <w:t xml:space="preserve">Administered immediately after each condition, referring to the interface just used.  Items are the standard ten-item instrument of Brooke [3], with the word “system” replaced throughout by “interface” so that participants rate the interaction surface rather than the machine.  Each item is answered on a five-point scale from 1 (strongly disagree) to 5 (strongly agree).</w:t>
       </w:r>
     </w:p>
     <w:p>
@@ -13582,7 +13528,7 @@
         <w:t xml:space="preserve"> </w:t>
       </w:r>
       <w:r>
-        <w:t xml:space="preserve">For odd-numbered items, subtract 1 from the response.  For even-numbered items, subtract the response from 5.  Sum the ten adjusted scores and multiply by 2.5, giving a value from 0 to 100.  This value is not a percentage; interpretation follows Sauro and Lewis [33] and Bangor and colleagues [1].</w:t>
+        <w:t xml:space="preserve">For odd-numbered items, subtract 1 from the response.  For even-numbered items, subtract the response from 5.  Sum the ten adjusted scores and multiply by 2.5, giving a value from 0 to 100.  This value is not a percentage; interpretation follows Sauro and Lewis [31].</w:t>
       </w:r>
     </w:p>
     <w:bookmarkStart w:id="126" w:name="appendix-b"/>
@@ -13608,7 +13554,7 @@
         <w:pStyle w:val="BodyText"/>
       </w:pPr>
       <w:r>
-        <w:t xml:space="preserve">Administered immediately after each condition, referring to the set of tasks just completed.  Six subscales are rated on a twenty-one-point scale presented as a line divided into equal intervals and scored 0 to 100 in steps of five.  This study uses the unweighted variant (Raw TLX): the pairwise weighting procedure of the original instrument [12] is omitted, and the composite workload score is the arithmetic mean of the six subscale ratings.  All six subscales, including Performance (anchored from Perfect to Failure), run from low to high workload, so no subscale is reverse-scored.</w:t>
+        <w:t xml:space="preserve">Administered immediately after each condition, referring to the set of tasks just completed.  Six subscales are rated on a twenty-one-point scale presented as a line divided into equal intervals and scored 0 to 100 in steps of five.  This study uses the unweighted variant (Raw TLX): the pairwise weighting procedure of the original instrument [11] is omitted, and the composite workload score is the arithmetic mean of the six subscale ratings.  All six subscales, including Performance (anchored from Perfect to Failure), run from low to high workload, so no subscale is reverse-scored.</w:t>
       </w:r>
     </w:p>
     <w:p>

</xml_diff>

<commit_message>
docs(thesis): make Gap and Opportunity section 1.2
The proposal grading rubric scores Chapter 1 as six peer items (Background, Gap/Opportunity, Statement of the Problem, Objectives, Significance, Scope), and the course's Chapter 1 sample gives GAP / OPPORTUNITY its own heading at the same level as the others. It was a sub-heading of 1.1, the only third-level entry in the table of contents. It is now 1.2, and 1.2-1.6 become 1.3-1.7; the one in-text reference to a Chapter 1 section (3.1(h)'s 'Section 1.4 states the analysis's claim') now reads 'Chapter 1, Section 1.5'. References to Chapter 3's own Sections 1.1-1.5 are unchanged. The revision report's objectives reference becomes section 1.4. Every cited page is unchanged; 120 pages, 60 links, 0 broken. The Word copy's table of contents now has right-aligned page numbers with dot leaders instead of running each title into its number.
</commit_message>
<xml_diff>
--- a/thesis 1/consolidated/SynapseOS_Proposal_Chapters_1_to_3.docx
+++ b/thesis 1/consolidated/SynapseOS_Proposal_Chapters_1_to_3.docx
@@ -168,528 +168,677 @@
     <w:p>
       <w:pPr>
         <w:pStyle w:val="BodyText"/>
+        <w:tabs>
+          <w:tab w:val="right" w:leader="dot" w:pos="9350"/>
+        </w:tabs>
       </w:pPr>
       <w:hyperlink w:anchor="title-page">
         <w:r>
-          <w:rPr>
-            <w:rStyle w:val="Hyperlink"/>
-          </w:rPr>
+          <w:rPr/>
           <w:t xml:space="preserve">TITLE PAGE</w:t>
         </w:r>
       </w:hyperlink>
       <w:r>
+        <w:tab/>
+      </w:r>
+      <w:r>
         <w:t xml:space="preserve">i</w:t>
       </w:r>
     </w:p>
     <w:p>
       <w:pPr>
         <w:pStyle w:val="BodyText"/>
+        <w:tabs>
+          <w:tab w:val="right" w:leader="dot" w:pos="9350"/>
+        </w:tabs>
       </w:pPr>
       <w:hyperlink w:anchor="approval-page">
         <w:r>
-          <w:rPr>
-            <w:rStyle w:val="Hyperlink"/>
-          </w:rPr>
+          <w:rPr/>
           <w:t xml:space="preserve">APPROVAL PAGE</w:t>
         </w:r>
       </w:hyperlink>
       <w:r>
+        <w:tab/>
+      </w:r>
+      <w:r>
         <w:t xml:space="preserve">ii</w:t>
       </w:r>
     </w:p>
     <w:p>
       <w:pPr>
         <w:pStyle w:val="BodyText"/>
+        <w:tabs>
+          <w:tab w:val="right" w:leader="dot" w:pos="9350"/>
+        </w:tabs>
       </w:pPr>
       <w:hyperlink w:anchor="acknowledgement-page">
         <w:r>
-          <w:rPr>
-            <w:rStyle w:val="Hyperlink"/>
-          </w:rPr>
+          <w:rPr/>
           <w:t xml:space="preserve">ACKNOWLEDGEMENT</w:t>
         </w:r>
       </w:hyperlink>
       <w:r>
+        <w:tab/>
+      </w:r>
+      <w:r>
         <w:t xml:space="preserve">iii</w:t>
       </w:r>
     </w:p>
     <w:p>
       <w:pPr>
         <w:pStyle w:val="BodyText"/>
+        <w:tabs>
+          <w:tab w:val="right" w:leader="dot" w:pos="9350"/>
+        </w:tabs>
       </w:pPr>
       <w:hyperlink w:anchor="master-toc">
         <w:r>
-          <w:rPr>
-            <w:rStyle w:val="Hyperlink"/>
-          </w:rPr>
+          <w:rPr/>
           <w:t xml:space="preserve">TABLE OF CONTENTS</w:t>
         </w:r>
       </w:hyperlink>
       <w:r>
+        <w:tab/>
+      </w:r>
+      <w:r>
         <w:t xml:space="preserve">iv</w:t>
       </w:r>
     </w:p>
     <w:p>
       <w:pPr>
         <w:pStyle w:val="BodyText"/>
+        <w:tabs>
+          <w:tab w:val="right" w:leader="dot" w:pos="9350"/>
+        </w:tabs>
       </w:pPr>
       <w:hyperlink w:anchor="list-of-tables">
         <w:r>
-          <w:rPr>
-            <w:rStyle w:val="Hyperlink"/>
-          </w:rPr>
+          <w:rPr/>
           <w:t xml:space="preserve">LIST OF TABLES</w:t>
         </w:r>
       </w:hyperlink>
       <w:r>
+        <w:tab/>
+      </w:r>
+      <w:r>
         <w:t xml:space="preserve">vi</w:t>
       </w:r>
     </w:p>
     <w:p>
       <w:pPr>
         <w:pStyle w:val="BodyText"/>
+        <w:tabs>
+          <w:tab w:val="right" w:leader="dot" w:pos="9350"/>
+        </w:tabs>
       </w:pPr>
       <w:hyperlink w:anchor="list-of-figures">
         <w:r>
-          <w:rPr>
-            <w:rStyle w:val="Hyperlink"/>
-          </w:rPr>
+          <w:rPr/>
           <w:t xml:space="preserve">LIST OF FIGURES</w:t>
         </w:r>
       </w:hyperlink>
       <w:r>
+        <w:tab/>
+      </w:r>
+      <w:r>
         <w:t xml:space="preserve">vii</w:t>
       </w:r>
     </w:p>
     <w:p>
       <w:pPr>
         <w:pStyle w:val="BodyText"/>
+        <w:tabs>
+          <w:tab w:val="right" w:leader="dot" w:pos="9350"/>
+        </w:tabs>
       </w:pPr>
       <w:hyperlink w:anchor="sec-chapter1">
         <w:r>
-          <w:rPr>
-            <w:rStyle w:val="Hyperlink"/>
-          </w:rPr>
+          <w:rPr/>
           <w:t xml:space="preserve">Chapter 1: INTRODUCTION</w:t>
         </w:r>
       </w:hyperlink>
       <w:r>
+        <w:tab/>
+      </w:r>
+      <w:r>
         <w:t xml:space="preserve">1</w:t>
       </w:r>
     </w:p>
     <w:p>
       <w:pPr>
         <w:pStyle w:val="BodyText"/>
+        <w:tabs>
+          <w:tab w:val="right" w:leader="dot" w:pos="9350"/>
+        </w:tabs>
+        <w:ind w:left="720"/>
       </w:pPr>
       <w:hyperlink w:anchor="sec1-1">
         <w:r>
-          <w:rPr>
-            <w:rStyle w:val="Hyperlink"/>
-          </w:rPr>
+          <w:rPr/>
           <w:t xml:space="preserve">1.1 Background of the Study</w:t>
         </w:r>
       </w:hyperlink>
       <w:r>
+        <w:tab/>
+      </w:r>
+      <w:r>
         <w:t xml:space="preserve">1</w:t>
       </w:r>
     </w:p>
     <w:p>
       <w:pPr>
         <w:pStyle w:val="BodyText"/>
+        <w:tabs>
+          <w:tab w:val="right" w:leader="dot" w:pos="9350"/>
+        </w:tabs>
+        <w:ind w:left="720"/>
       </w:pPr>
       <w:hyperlink w:anchor="sec1-1-gap">
         <w:r>
-          <w:rPr>
-            <w:rStyle w:val="Hyperlink"/>
-          </w:rPr>
-          <w:t xml:space="preserve">Gap and Opportunity</w:t>
+          <w:rPr/>
+          <w:t xml:space="preserve">1.2 Gap and Opportunity</w:t>
         </w:r>
       </w:hyperlink>
       <w:r>
+        <w:tab/>
+      </w:r>
+      <w:r>
         <w:t xml:space="preserve">3</w:t>
       </w:r>
     </w:p>
     <w:p>
       <w:pPr>
         <w:pStyle w:val="BodyText"/>
+        <w:tabs>
+          <w:tab w:val="right" w:leader="dot" w:pos="9350"/>
+        </w:tabs>
+        <w:ind w:left="720"/>
       </w:pPr>
       <w:hyperlink w:anchor="sec1-2">
         <w:r>
-          <w:rPr>
-            <w:rStyle w:val="Hyperlink"/>
-          </w:rPr>
-          <w:t xml:space="preserve">1.2 Statement of the Problem</w:t>
+          <w:rPr/>
+          <w:t xml:space="preserve">1.3 Statement of the Problem</w:t>
         </w:r>
       </w:hyperlink>
       <w:r>
+        <w:tab/>
+      </w:r>
+      <w:r>
         <w:t xml:space="preserve">5</w:t>
       </w:r>
     </w:p>
     <w:p>
       <w:pPr>
         <w:pStyle w:val="BodyText"/>
+        <w:tabs>
+          <w:tab w:val="right" w:leader="dot" w:pos="9350"/>
+        </w:tabs>
+        <w:ind w:left="720"/>
       </w:pPr>
       <w:hyperlink w:anchor="sec1-3">
         <w:r>
-          <w:rPr>
-            <w:rStyle w:val="Hyperlink"/>
-          </w:rPr>
-          <w:t xml:space="preserve">1.3 Objectives of the Study</w:t>
+          <w:rPr/>
+          <w:t xml:space="preserve">1.4 Objectives of the Study</w:t>
         </w:r>
       </w:hyperlink>
       <w:r>
+        <w:tab/>
+      </w:r>
+      <w:r>
         <w:t xml:space="preserve">6</w:t>
       </w:r>
     </w:p>
     <w:p>
       <w:pPr>
         <w:pStyle w:val="BodyText"/>
+        <w:tabs>
+          <w:tab w:val="right" w:leader="dot" w:pos="9350"/>
+        </w:tabs>
+        <w:ind w:left="720"/>
       </w:pPr>
       <w:hyperlink w:anchor="sec1-4">
         <w:r>
-          <w:rPr>
-            <w:rStyle w:val="Hyperlink"/>
-          </w:rPr>
-          <w:t xml:space="preserve">1.4 Contributions of the Study</w:t>
+          <w:rPr/>
+          <w:t xml:space="preserve">1.5 Contributions of the Study</w:t>
         </w:r>
       </w:hyperlink>
       <w:r>
+        <w:tab/>
+      </w:r>
+      <w:r>
         <w:t xml:space="preserve">8</w:t>
       </w:r>
     </w:p>
     <w:p>
       <w:pPr>
         <w:pStyle w:val="BodyText"/>
+        <w:tabs>
+          <w:tab w:val="right" w:leader="dot" w:pos="9350"/>
+        </w:tabs>
+        <w:ind w:left="720"/>
       </w:pPr>
       <w:hyperlink w:anchor="sec1-5">
         <w:r>
-          <w:rPr>
-            <w:rStyle w:val="Hyperlink"/>
-          </w:rPr>
-          <w:t xml:space="preserve">1.5 Significance of the Study</w:t>
+          <w:rPr/>
+          <w:t xml:space="preserve">1.6 Significance of the Study</w:t>
         </w:r>
       </w:hyperlink>
       <w:r>
+        <w:tab/>
+      </w:r>
+      <w:r>
         <w:t xml:space="preserve">11</w:t>
       </w:r>
     </w:p>
     <w:p>
       <w:pPr>
         <w:pStyle w:val="BodyText"/>
+        <w:tabs>
+          <w:tab w:val="right" w:leader="dot" w:pos="9350"/>
+        </w:tabs>
+        <w:ind w:left="720"/>
       </w:pPr>
       <w:hyperlink w:anchor="sec1-6">
         <w:r>
-          <w:rPr>
-            <w:rStyle w:val="Hyperlink"/>
-          </w:rPr>
-          <w:t xml:space="preserve">1.6 Scope and Limitations of the Study</w:t>
+          <w:rPr/>
+          <w:t xml:space="preserve">1.7 Scope and Limitations of the Study</w:t>
         </w:r>
       </w:hyperlink>
       <w:r>
+        <w:tab/>
+      </w:r>
+      <w:r>
         <w:t xml:space="preserve">12</w:t>
       </w:r>
     </w:p>
     <w:p>
       <w:pPr>
         <w:pStyle w:val="BodyText"/>
+        <w:tabs>
+          <w:tab w:val="right" w:leader="dot" w:pos="9350"/>
+        </w:tabs>
       </w:pPr>
       <w:hyperlink w:anchor="sec-chapter2">
         <w:r>
-          <w:rPr>
-            <w:rStyle w:val="Hyperlink"/>
-          </w:rPr>
+          <w:rPr/>
           <w:t xml:space="preserve">Chapter 2: REVIEW OF RELATED LITERATURE</w:t>
         </w:r>
       </w:hyperlink>
       <w:r>
+        <w:tab/>
+      </w:r>
+      <w:r>
         <w:t xml:space="preserve">16</w:t>
       </w:r>
     </w:p>
     <w:p>
       <w:pPr>
         <w:pStyle w:val="BodyText"/>
+        <w:tabs>
+          <w:tab w:val="right" w:leader="dot" w:pos="9350"/>
+        </w:tabs>
+        <w:ind w:left="720"/>
       </w:pPr>
       <w:hyperlink w:anchor="sec2-1">
         <w:r>
-          <w:rPr>
-            <w:rStyle w:val="Hyperlink"/>
-          </w:rPr>
+          <w:rPr/>
           <w:t xml:space="preserve">2.1 Introduction to the Review</w:t>
         </w:r>
       </w:hyperlink>
       <w:r>
+        <w:tab/>
+      </w:r>
+      <w:r>
         <w:t xml:space="preserve">16</w:t>
       </w:r>
     </w:p>
     <w:p>
       <w:pPr>
         <w:pStyle w:val="BodyText"/>
+        <w:tabs>
+          <w:tab w:val="right" w:leader="dot" w:pos="9350"/>
+        </w:tabs>
+        <w:ind w:left="720"/>
       </w:pPr>
       <w:hyperlink w:anchor="sec2-2">
         <w:r>
-          <w:rPr>
-            <w:rStyle w:val="Hyperlink"/>
-          </w:rPr>
+          <w:rPr/>
           <w:t xml:space="preserve">2.2 Theoretical Framework</w:t>
         </w:r>
       </w:hyperlink>
       <w:r>
+        <w:tab/>
+      </w:r>
+      <w:r>
         <w:t xml:space="preserve">16</w:t>
       </w:r>
     </w:p>
     <w:p>
       <w:pPr>
         <w:pStyle w:val="BodyText"/>
+        <w:tabs>
+          <w:tab w:val="right" w:leader="dot" w:pos="9350"/>
+        </w:tabs>
+        <w:ind w:left="720"/>
       </w:pPr>
       <w:hyperlink w:anchor="sec2-3">
         <w:r>
-          <w:rPr>
-            <w:rStyle w:val="Hyperlink"/>
-          </w:rPr>
+          <w:rPr/>
           <w:t xml:space="preserve">2.3 Historical Foundations of Natural-Language Interfaces</w:t>
         </w:r>
       </w:hyperlink>
       <w:r>
+        <w:tab/>
+      </w:r>
+      <w:r>
         <w:t xml:space="preserve">19</w:t>
       </w:r>
     </w:p>
     <w:p>
       <w:pPr>
         <w:pStyle w:val="BodyText"/>
+        <w:tabs>
+          <w:tab w:val="right" w:leader="dot" w:pos="9350"/>
+        </w:tabs>
+        <w:ind w:left="720"/>
       </w:pPr>
       <w:hyperlink w:anchor="sec2-4">
         <w:r>
-          <w:rPr>
-            <w:rStyle w:val="Hyperlink"/>
-          </w:rPr>
+          <w:rPr/>
           <w:t xml:space="preserve">2.4 Natural-Language-to-Shell Translation</w:t>
         </w:r>
       </w:hyperlink>
       <w:r>
+        <w:tab/>
+      </w:r>
+      <w:r>
         <w:t xml:space="preserve">23</w:t>
       </w:r>
     </w:p>
     <w:p>
       <w:pPr>
         <w:pStyle w:val="BodyText"/>
+        <w:tabs>
+          <w:tab w:val="right" w:leader="dot" w:pos="9350"/>
+        </w:tabs>
+        <w:ind w:left="720"/>
       </w:pPr>
       <w:hyperlink w:anchor="sec2-5">
         <w:r>
-          <w:rPr>
-            <w:rStyle w:val="Hyperlink"/>
-          </w:rPr>
+          <w:rPr/>
           <w:t xml:space="preserve">2.5 Graphical and Computer-Using Agents</w:t>
         </w:r>
       </w:hyperlink>
       <w:r>
+        <w:tab/>
+      </w:r>
+      <w:r>
         <w:t xml:space="preserve">27</w:t>
       </w:r>
     </w:p>
     <w:p>
       <w:pPr>
         <w:pStyle w:val="BodyText"/>
+        <w:tabs>
+          <w:tab w:val="right" w:leader="dot" w:pos="9350"/>
+        </w:tabs>
+        <w:ind w:left="720"/>
       </w:pPr>
       <w:hyperlink w:anchor="sec2-6">
         <w:r>
-          <w:rPr>
-            <w:rStyle w:val="Hyperlink"/>
-          </w:rPr>
+          <w:rPr/>
           <w:t xml:space="preserve">2.6 Accessibility and Speech-Driven Interaction</w:t>
         </w:r>
       </w:hyperlink>
       <w:r>
+        <w:tab/>
+      </w:r>
+      <w:r>
         <w:t xml:space="preserve">31</w:t>
       </w:r>
     </w:p>
     <w:p>
       <w:pPr>
         <w:pStyle w:val="BodyText"/>
+        <w:tabs>
+          <w:tab w:val="right" w:leader="dot" w:pos="9350"/>
+        </w:tabs>
+        <w:ind w:left="720"/>
       </w:pPr>
       <w:hyperlink w:anchor="sec2-7">
         <w:r>
-          <w:rPr>
-            <w:rStyle w:val="Hyperlink"/>
-          </w:rPr>
+          <w:rPr/>
           <w:t xml:space="preserve">2.7 Evaluation Environments and Benchmarks</w:t>
         </w:r>
       </w:hyperlink>
       <w:r>
+        <w:tab/>
+      </w:r>
+      <w:r>
         <w:t xml:space="preserve">32</w:t>
       </w:r>
     </w:p>
     <w:p>
       <w:pPr>
         <w:pStyle w:val="BodyText"/>
+        <w:tabs>
+          <w:tab w:val="right" w:leader="dot" w:pos="9350"/>
+        </w:tabs>
+        <w:ind w:left="720"/>
       </w:pPr>
       <w:hyperlink w:anchor="sec2-8">
         <w:r>
-          <w:rPr>
-            <w:rStyle w:val="Hyperlink"/>
-          </w:rPr>
+          <w:rPr/>
           <w:t xml:space="preserve">2.8 Synthesis: Comparative Analysis and Research Gap</w:t>
         </w:r>
       </w:hyperlink>
       <w:r>
+        <w:tab/>
+      </w:r>
+      <w:r>
         <w:t xml:space="preserve">33</w:t>
       </w:r>
     </w:p>
     <w:p>
       <w:pPr>
         <w:pStyle w:val="BodyText"/>
+        <w:tabs>
+          <w:tab w:val="right" w:leader="dot" w:pos="9350"/>
+        </w:tabs>
+        <w:ind w:left="720"/>
       </w:pPr>
       <w:hyperlink w:anchor="sec2-9">
         <w:r>
-          <w:rPr>
-            <w:rStyle w:val="Hyperlink"/>
-          </w:rPr>
+          <w:rPr/>
           <w:t xml:space="preserve">2.9 Review of the Methodological Literature</w:t>
         </w:r>
       </w:hyperlink>
       <w:r>
+        <w:tab/>
+      </w:r>
+      <w:r>
         <w:t xml:space="preserve">40</w:t>
       </w:r>
     </w:p>
     <w:p>
       <w:pPr>
         <w:pStyle w:val="BodyText"/>
+        <w:tabs>
+          <w:tab w:val="right" w:leader="dot" w:pos="9350"/>
+        </w:tabs>
+        <w:ind w:left="720"/>
       </w:pPr>
       <w:hyperlink w:anchor="sec2-10">
         <w:r>
-          <w:rPr>
-            <w:rStyle w:val="Hyperlink"/>
-          </w:rPr>
+          <w:rPr/>
           <w:t xml:space="preserve">2.10 Summary</w:t>
         </w:r>
       </w:hyperlink>
       <w:r>
+        <w:tab/>
+      </w:r>
+      <w:r>
         <w:t xml:space="preserve">41</w:t>
       </w:r>
     </w:p>
     <w:p>
       <w:pPr>
         <w:pStyle w:val="BodyText"/>
+        <w:tabs>
+          <w:tab w:val="right" w:leader="dot" w:pos="9350"/>
+        </w:tabs>
       </w:pPr>
       <w:hyperlink w:anchor="sec-chapter3">
         <w:r>
-          <w:rPr>
-            <w:rStyle w:val="Hyperlink"/>
-          </w:rPr>
+          <w:rPr/>
           <w:t xml:space="preserve">Chapter 3: METHODOLOGY</w:t>
         </w:r>
       </w:hyperlink>
       <w:r>
+        <w:tab/>
+      </w:r>
+      <w:r>
         <w:t xml:space="preserve">44</w:t>
       </w:r>
     </w:p>
     <w:p>
       <w:pPr>
         <w:pStyle w:val="BodyText"/>
+        <w:tabs>
+          <w:tab w:val="right" w:leader="dot" w:pos="9350"/>
+        </w:tabs>
       </w:pPr>
       <w:hyperlink w:anchor="sec-conceptual-framework">
         <w:r>
-          <w:rPr>
-            <w:rStyle w:val="Hyperlink"/>
-          </w:rPr>
+          <w:rPr/>
           <w:t xml:space="preserve">Conceptual Framework</w:t>
         </w:r>
       </w:hyperlink>
       <w:r>
+        <w:tab/>
+      </w:r>
+      <w:r>
         <w:t xml:space="preserve">45</w:t>
       </w:r>
     </w:p>
     <w:p>
       <w:pPr>
         <w:pStyle w:val="BodyText"/>
+        <w:tabs>
+          <w:tab w:val="right" w:leader="dot" w:pos="9350"/>
+        </w:tabs>
       </w:pPr>
       <w:hyperlink w:anchor="sec-system-env">
         <w:r>
-          <w:rPr>
-            <w:rStyle w:val="Hyperlink"/>
-          </w:rPr>
+          <w:rPr/>
           <w:t xml:space="preserve">System Environment Specifications</w:t>
         </w:r>
       </w:hyperlink>
       <w:r>
+        <w:tab/>
+      </w:r>
+      <w:r>
         <w:t xml:space="preserve">47</w:t>
       </w:r>
     </w:p>
     <w:p>
       <w:pPr>
         <w:pStyle w:val="BodyText"/>
+        <w:tabs>
+          <w:tab w:val="right" w:leader="dot" w:pos="9350"/>
+        </w:tabs>
       </w:pPr>
       <w:hyperlink w:anchor="sec1">
         <w:r>
-          <w:rPr>
-            <w:rStyle w:val="Hyperlink"/>
-          </w:rPr>
+          <w:rPr/>
           <w:t xml:space="preserve">Section 1: Dataset</w:t>
         </w:r>
       </w:hyperlink>
       <w:r>
+        <w:tab/>
+      </w:r>
+      <w:r>
         <w:t xml:space="preserve">50</w:t>
       </w:r>
     </w:p>
     <w:p>
       <w:pPr>
         <w:pStyle w:val="BodyText"/>
+        <w:tabs>
+          <w:tab w:val="right" w:leader="dot" w:pos="9350"/>
+        </w:tabs>
       </w:pPr>
       <w:hyperlink w:anchor="sec2">
         <w:r>
-          <w:rPr>
-            <w:rStyle w:val="Hyperlink"/>
-          </w:rPr>
+          <w:rPr/>
           <w:t xml:space="preserve">Section 2: Procedure / Experiment</w:t>
         </w:r>
       </w:hyperlink>
       <w:r>
+        <w:tab/>
+      </w:r>
+      <w:r>
         <w:t xml:space="preserve">59</w:t>
       </w:r>
     </w:p>
     <w:p>
       <w:pPr>
         <w:pStyle w:val="BodyText"/>
+        <w:tabs>
+          <w:tab w:val="right" w:leader="dot" w:pos="9350"/>
+        </w:tabs>
       </w:pPr>
       <w:hyperlink w:anchor="sec3">
         <w:r>
-          <w:rPr>
-            <w:rStyle w:val="Hyperlink"/>
-          </w:rPr>
+          <w:rPr/>
           <w:t xml:space="preserve">Section 3: System Testing</w:t>
         </w:r>
       </w:hyperlink>
       <w:r>
+        <w:tab/>
+      </w:r>
+      <w:r>
         <w:t xml:space="preserve">74</w:t>
       </w:r>
     </w:p>
     <w:p>
       <w:pPr>
         <w:pStyle w:val="BodyText"/>
+        <w:tabs>
+          <w:tab w:val="right" w:leader="dot" w:pos="9350"/>
+        </w:tabs>
       </w:pPr>
       <w:hyperlink w:anchor="sec-master-references">
         <w:r>
-          <w:rPr>
-            <w:rStyle w:val="Hyperlink"/>
-          </w:rPr>
+          <w:rPr/>
           <w:t xml:space="preserve">REFERENCES</w:t>
         </w:r>
       </w:hyperlink>
       <w:r>
+        <w:tab/>
+      </w:r>
+      <w:r>
         <w:t xml:space="preserve">94</w:t>
       </w:r>
     </w:p>
     <w:p>
       <w:pPr>
         <w:pStyle w:val="BodyText"/>
+        <w:tabs>
+          <w:tab w:val="right" w:leader="dot" w:pos="9350"/>
+        </w:tabs>
       </w:pPr>
       <w:hyperlink w:anchor="sec-appendices">
         <w:r>
-          <w:rPr>
-            <w:rStyle w:val="Hyperlink"/>
-          </w:rPr>
+          <w:rPr/>
           <w:t xml:space="preserve">APPENDICES</w:t>
         </w:r>
       </w:hyperlink>
       <w:r>
+        <w:tab/>
+      </w:r>
+      <w:r>
         <w:t xml:space="preserve">100</w:t>
       </w:r>
     </w:p>
@@ -705,144 +854,180 @@
     <w:p>
       <w:pPr>
         <w:pStyle w:val="BodyText"/>
+        <w:tabs>
+          <w:tab w:val="right" w:leader="dot" w:pos="9350"/>
+        </w:tabs>
       </w:pPr>
       <w:hyperlink w:anchor="table-1-1">
         <w:r>
-          <w:rPr>
-            <w:rStyle w:val="Hyperlink"/>
-          </w:rPr>
+          <w:rPr/>
           <w:t xml:space="preserve">Table 1.1: Components adopted rather than built, and why</w:t>
         </w:r>
       </w:hyperlink>
       <w:r>
+        <w:tab/>
+      </w:r>
+      <w:r>
         <w:t xml:space="preserve">8</w:t>
       </w:r>
     </w:p>
     <w:p>
       <w:pPr>
         <w:pStyle w:val="BodyText"/>
+        <w:tabs>
+          <w:tab w:val="right" w:leader="dot" w:pos="9350"/>
+        </w:tabs>
       </w:pPr>
       <w:hyperlink w:anchor="table-2-1">
         <w:r>
-          <w:rPr>
-            <w:rStyle w:val="Hyperlink"/>
-          </w:rPr>
+          <w:rPr/>
           <w:t xml:space="preserve">Table 2.1: Comparative analysis of surveyed systems along the four-layer pipeline</w:t>
         </w:r>
       </w:hyperlink>
       <w:r>
+        <w:tab/>
+      </w:r>
+      <w:r>
         <w:t xml:space="preserve">33</w:t>
       </w:r>
     </w:p>
     <w:p>
       <w:pPr>
         <w:pStyle w:val="BodyText"/>
+        <w:tabs>
+          <w:tab w:val="right" w:leader="dot" w:pos="9350"/>
+        </w:tabs>
       </w:pPr>
       <w:hyperlink w:anchor="table-3-1">
         <w:r>
-          <w:rPr>
-            <w:rStyle w:val="Hyperlink"/>
-          </w:rPr>
+          <w:rPr/>
           <w:t xml:space="preserve">Table 3.1: Study evaluation machines</w:t>
         </w:r>
       </w:hyperlink>
       <w:r>
+        <w:tab/>
+      </w:r>
+      <w:r>
         <w:t xml:space="preserve">48</w:t>
       </w:r>
     </w:p>
     <w:p>
       <w:pPr>
         <w:pStyle w:val="BodyText"/>
+        <w:tabs>
+          <w:tab w:val="right" w:leader="dot" w:pos="9350"/>
+        </w:tabs>
       </w:pPr>
       <w:hyperlink w:anchor="table-3-2">
         <w:r>
-          <w:rPr>
-            <w:rStyle w:val="Hyperlink"/>
-          </w:rPr>
+          <w:rPr/>
           <w:t xml:space="preserve">Table 3.2: SynapseOS minimum deployment requirements</w:t>
         </w:r>
       </w:hyperlink>
       <w:r>
+        <w:tab/>
+      </w:r>
+      <w:r>
         <w:t xml:space="preserve">48</w:t>
       </w:r>
     </w:p>
     <w:p>
       <w:pPr>
         <w:pStyle w:val="BodyText"/>
+        <w:tabs>
+          <w:tab w:val="right" w:leader="dot" w:pos="9350"/>
+        </w:tabs>
       </w:pPr>
       <w:hyperlink w:anchor="table-3-3">
         <w:r>
-          <w:rPr>
-            <w:rStyle w:val="Hyperlink"/>
-          </w:rPr>
+          <w:rPr/>
           <w:t xml:space="preserve">Table 3.3: Metrics for the recoverability algorithm, and what each is for</w:t>
         </w:r>
       </w:hyperlink>
       <w:r>
+        <w:tab/>
+      </w:r>
+      <w:r>
         <w:t xml:space="preserve">78</w:t>
       </w:r>
     </w:p>
     <w:p>
       <w:pPr>
         <w:pStyle w:val="BodyText"/>
+        <w:tabs>
+          <w:tab w:val="right" w:leader="dot" w:pos="9350"/>
+        </w:tabs>
       </w:pPr>
       <w:hyperlink w:anchor="table-3-4">
         <w:r>
-          <w:rPr>
-            <w:rStyle w:val="Hyperlink"/>
-          </w:rPr>
+          <w:rPr/>
           <w:t xml:space="preserve">Table 3.4: Paired comparisons of the effect analysis against each list on the held-out corpus, with Holm-corrected significance</w:t>
         </w:r>
       </w:hyperlink>
       <w:r>
+        <w:tab/>
+      </w:r>
+      <w:r>
         <w:t xml:space="preserve">82</w:t>
       </w:r>
     </w:p>
     <w:p>
       <w:pPr>
         <w:pStyle w:val="BodyText"/>
+        <w:tabs>
+          <w:tab w:val="right" w:leader="dot" w:pos="9350"/>
+        </w:tabs>
       </w:pPr>
       <w:hyperlink w:anchor="table-3-5">
         <w:r>
-          <w:rPr>
-            <w:rStyle w:val="Hyperlink"/>
-          </w:rPr>
+          <w:rPr/>
           <w:t xml:space="preserve">Table 3.5: Composition ablation — the full analysis against the same rule table with composition disabled</w:t>
         </w:r>
       </w:hyperlink>
       <w:r>
+        <w:tab/>
+      </w:r>
+      <w:r>
         <w:t xml:space="preserve">85</w:t>
       </w:r>
     </w:p>
     <w:p>
       <w:pPr>
         <w:pStyle w:val="BodyText"/>
+        <w:tabs>
+          <w:tab w:val="right" w:leader="dot" w:pos="9350"/>
+        </w:tabs>
       </w:pPr>
       <w:hyperlink w:anchor="appendix-c">
         <w:r>
-          <w:rPr>
-            <w:rStyle w:val="Hyperlink"/>
-          </w:rPr>
+          <w:rPr/>
           <w:t xml:space="preserve">Table C.1: Custom cross-platform task suite — core tasks</w:t>
         </w:r>
       </w:hyperlink>
       <w:r>
+        <w:tab/>
+      </w:r>
+      <w:r>
         <w:t xml:space="preserve">103</w:t>
       </w:r>
     </w:p>
     <w:p>
       <w:pPr>
         <w:pStyle w:val="BodyText"/>
+        <w:tabs>
+          <w:tab w:val="right" w:leader="dot" w:pos="9350"/>
+        </w:tabs>
       </w:pPr>
       <w:hyperlink w:anchor="appendix-c">
         <w:r>
-          <w:rPr>
-            <w:rStyle w:val="Hyperlink"/>
-          </w:rPr>
+          <w:rPr/>
           <w:t xml:space="preserve">Table C.2: Boundary tasks — outside shell expressibility</w:t>
         </w:r>
       </w:hyperlink>
       <w:r>
+        <w:tab/>
+      </w:r>
+      <w:r>
         <w:t xml:space="preserve">105</w:t>
       </w:r>
     </w:p>
@@ -859,32 +1044,40 @@
     <w:p>
       <w:pPr>
         <w:pStyle w:val="BodyText"/>
+        <w:tabs>
+          <w:tab w:val="right" w:leader="dot" w:pos="9350"/>
+        </w:tabs>
       </w:pPr>
       <w:hyperlink w:anchor="figure-2-1">
         <w:r>
-          <w:rPr>
-            <w:rStyle w:val="Hyperlink"/>
-          </w:rPr>
+          <w:rPr/>
           <w:t xml:space="preserve">Figure 2.1: The four-layer interaction pipeline for language-mediated computing interfaces</w:t>
         </w:r>
       </w:hyperlink>
       <w:r>
+        <w:tab/>
+      </w:r>
+      <w:r>
         <w:t xml:space="preserve">17</w:t>
       </w:r>
     </w:p>
     <w:p>
       <w:pPr>
         <w:pStyle w:val="BodyText"/>
+        <w:tabs>
+          <w:tab w:val="right" w:leader="dot" w:pos="9350"/>
+        </w:tabs>
       </w:pPr>
       <w:hyperlink w:anchor="figure-3-1">
         <w:r>
-          <w:rPr>
-            <w:rStyle w:val="Hyperlink"/>
-          </w:rPr>
+          <w:rPr/>
           <w:t xml:space="preserve">Figure 3.1: Conceptual framework of SynapseOS</w:t>
         </w:r>
       </w:hyperlink>
       <w:r>
+        <w:tab/>
+      </w:r>
+      <w:r>
         <w:t xml:space="preserve">46</w:t>
       </w:r>
     </w:p>
@@ -908,7 +1101,7 @@
       </w:r>
     </w:p>
     <w:bookmarkEnd w:id="27"/>
-    <w:bookmarkStart w:id="29" w:name="sec1-1"/>
+    <w:bookmarkStart w:id="28" w:name="sec1-1"/>
     <w:p>
       <w:pPr>
         <w:pStyle w:val="Heading2"/>
@@ -994,13 +1187,14 @@
         <w:t xml:space="preserve">for the Linux desktop, despite Linux serving as the substrate for most developer and server-side workflows.</w:t>
       </w:r>
     </w:p>
-    <w:bookmarkStart w:id="28" w:name="sec1-1-gap"/>
-    <w:p>
-      <w:pPr>
-        <w:pStyle w:val="Heading3"/>
-      </w:pPr>
-      <w:r>
-        <w:t xml:space="preserve">Gap and Opportunity</w:t>
+    <w:bookmarkEnd w:id="28"/>
+    <w:bookmarkStart w:id="29" w:name="sec1-1-gap"/>
+    <w:p>
+      <w:pPr>
+        <w:pStyle w:val="Heading2"/>
+      </w:pPr>
+      <w:r>
+        <w:t xml:space="preserve">1.2 Gap and Opportunity</w:t>
       </w:r>
     </w:p>
     <w:p>
@@ -1121,7 +1315,6 @@
         <w:t xml:space="preserve">for those who adopted it, whereas this layer displaces nothing — a conversational interface cannot yet perform the visual tasks a graphical desktop performs, so replacing the desktop would remove capability from the user in exchange for convenience, and adding to it costs them nothing.  It is designed to serve as the primary user-facing interface to a personal computing environment — spanning novice, elderly, non-technical, and technical user populations — with an evaluation methodology that engages the conventional desktop workflow as its baseline rather than as its substrate.  Within that layer, the first gap is addressed by the study’s algorithmic contribution: a recoverability analysis that derives a generated command’s effects from its structure before it runs, and captures exactly what it would destroy so that it can be undone.</w:t>
       </w:r>
     </w:p>
-    <w:bookmarkEnd w:id="28"/>
     <w:bookmarkEnd w:id="29"/>
     <w:bookmarkStart w:id="30" w:name="sec1-2"/>
     <w:p>
@@ -1129,7 +1322,7 @@
         <w:pStyle w:val="Heading2"/>
       </w:pPr>
       <w:r>
-        <w:t xml:space="preserve">1.2 Statement of the Problem</w:t>
+        <w:t xml:space="preserve">1.3 Statement of the Problem</w:t>
       </w:r>
     </w:p>
     <w:p>
@@ -1203,7 +1396,7 @@
         <w:pStyle w:val="Heading2"/>
       </w:pPr>
       <w:r>
-        <w:t xml:space="preserve">1.3 Objectives of the Study</w:t>
+        <w:t xml:space="preserve">1.4 Objectives of the Study</w:t>
       </w:r>
     </w:p>
     <w:p>
@@ -1328,7 +1521,7 @@
         <w:pStyle w:val="Heading2"/>
       </w:pPr>
       <w:r>
-        <w:t xml:space="preserve">1.4 Contributions of the Study</w:t>
+        <w:t xml:space="preserve">1.5 Contributions of the Study</w:t>
       </w:r>
     </w:p>
     <w:p>
@@ -1936,7 +2129,7 @@
         <w:pStyle w:val="Heading2"/>
       </w:pPr>
       <w:r>
-        <w:t xml:space="preserve">1.5 Significance of the Study</w:t>
+        <w:t xml:space="preserve">1.6 Significance of the Study</w:t>
       </w:r>
     </w:p>
     <w:p>
@@ -2064,7 +2257,7 @@
         <w:pStyle w:val="Heading2"/>
       </w:pPr>
       <w:r>
-        <w:t xml:space="preserve">1.6 Scope and Limitations of the Study</w:t>
+        <w:t xml:space="preserve">1.7 Scope and Limitations of the Study</w:t>
       </w:r>
     </w:p>
     <w:p>
@@ -10173,7 +10366,7 @@
         <w:pStyle w:val="FirstParagraph"/>
       </w:pPr>
       <w:r>
-        <w:t xml:space="preserve">Section 1.4 states the analysis’s claim as what it adds on top of a table of what each known command does, not that it has none — a distinction raised directly by this study’s adviser in an earlier review: how much of the result above comes from the algorithm itself, and how much from that table?  The question had been answered only in prose.  It is answered here as a measurement, by an ablation that removes the one thing a table cannot do.  A second configuration of the analyzer, identical to the one scored above except that composition is disabled — wrappers (</w:t>
+        <w:t xml:space="preserve">Chapter 1, Section 1.5 states the analysis’s claim as what it adds on top of a table of what each known command does, not that it has none — a distinction raised directly by this study’s adviser in an earlier review: how much of the result above comes from the algorithm itself, and how much from that table?  The question had been answered only in prose.  It is answered here as a measurement, by an ablation that removes the one thing a table cannot do.  A second configuration of the analyzer, identical to the one scored above except that composition is disabled — wrappers (</w:t>
       </w:r>
       <w:r>
         <w:rPr>

</xml_diff>

<commit_message>
docs(thesis): rebuild the Word copy of the reframed proposal
</commit_message>
<xml_diff>
--- a/thesis 1/consolidated/SynapseOS_Proposal_Chapters_1_to_3.docx
+++ b/thesis 1/consolidated/SynapseOS_Proposal_Chapters_1_to_3.docx
@@ -40,7 +40,7 @@
         <w:pStyle w:val="FirstParagraph"/>
       </w:pPr>
       <w:r>
-        <w:t xml:space="preserve">SynapseOS: Recoverability Analysis of Language-Model-Generated Shell Commands in a Conversational Interface Layer</w:t>
+        <w:t xml:space="preserve">Recoverability Analysis of Language-Model-Generated Shell Commands, Deployed in the SynapseOS Conversational Interface</w:t>
       </w:r>
     </w:p>
     <w:p>
@@ -819,7 +819,7 @@
         <w:tab/>
       </w:r>
       <w:r>
-        <w:t xml:space="preserve">94</w:t>
+        <w:t xml:space="preserve">96</w:t>
       </w:r>
     </w:p>
     <w:p>
@@ -839,7 +839,7 @@
         <w:tab/>
       </w:r>
       <w:r>
-        <w:t xml:space="preserve">100</w:t>
+        <w:t xml:space="preserve">102</w:t>
       </w:r>
     </w:p>
     <w:bookmarkStart w:id="24" w:name="list-of-tables"/>
@@ -908,7 +908,7 @@
         <w:tab/>
       </w:r>
       <w:r>
-        <w:t xml:space="preserve">48</w:t>
+        <w:t xml:space="preserve">47</w:t>
       </w:r>
     </w:p>
     <w:p>
@@ -948,7 +948,7 @@
         <w:tab/>
       </w:r>
       <w:r>
-        <w:t xml:space="preserve">78</w:t>
+        <w:t xml:space="preserve">79</w:t>
       </w:r>
     </w:p>
     <w:p>
@@ -968,7 +968,7 @@
         <w:tab/>
       </w:r>
       <w:r>
-        <w:t xml:space="preserve">82</w:t>
+        <w:t xml:space="preserve">83</w:t>
       </w:r>
     </w:p>
     <w:p>
@@ -981,14 +981,14 @@
       <w:hyperlink w:anchor="table-3-5">
         <w:r>
           <w:rPr/>
-          <w:t xml:space="preserve">Table 3.5: Composition ablation — the full analysis against the same rule table with composition disabled</w:t>
+          <w:t xml:space="preserve">Table 3.5: Composition and resolution ablation — the full analysis against the same rule table with composition, resolution, or both disabled</w:t>
         </w:r>
       </w:hyperlink>
       <w:r>
         <w:tab/>
       </w:r>
       <w:r>
-        <w:t xml:space="preserve">85</w:t>
+        <w:t xml:space="preserve">87</w:t>
       </w:r>
     </w:p>
     <w:p>
@@ -1008,7 +1008,7 @@
         <w:tab/>
       </w:r>
       <w:r>
-        <w:t xml:space="preserve">103</w:t>
+        <w:t xml:space="preserve">105</w:t>
       </w:r>
     </w:p>
     <w:p>
@@ -1028,7 +1028,7 @@
         <w:tab/>
       </w:r>
       <w:r>
-        <w:t xml:space="preserve">105</w:t>
+        <w:t xml:space="preserve">107</w:t>
       </w:r>
     </w:p>
     <w:bookmarkEnd w:id="24"/>
@@ -1266,7 +1266,7 @@
         <w:t xml:space="preserve"> </w:t>
       </w:r>
       <w:r>
-        <w:t xml:space="preserve">system places a conversational layer over the conventional desktop session as a whole.  The idea is no longer unclaimed — AgentOS [20] proposes a natural-language portal in place of the graphical desktop — but it is offered as a research direction, without a built system or an evaluation.  The systems that are built automate on top of the desktop rather than replacing it: UFO², for instance, positions itself as a “Desktop AgentOS” but operates as an automation layer atop the existing Windows shell, deliberately confining itself to a separate desktop so that agent and user do not interfere [45].  Third, the Linux work that exists serves servers and agents rather than the desktop session of an end user.  NaSh addresses Linux at the shell level as a design proposal without evaluation [9]; shipping natural-language shells such as Alibaba Cloud’s ANOLISA pair intent translation with approval gating and rollback, but scope themselves explicitly to server and DevOps workloads; and OSWorld includes Ubuntu as an evaluation platform rather than a deployment target [41].  Fourth, controlled comparison against the conventional graphical workflow exists only for narrow slices of the problem.  AXIS evaluates an API-first agent against manual operation within a single application, Microsoft Word, using a cloud-hosted frontier model [21], and the accessibility literature evaluates assistance for specific populations [28].  No study compares a conversational interface against the conventional workflow across operating-system-level tasks, on a Linux desktop, driven by a locally-hosted small model, under an explicit safety gate.</w:t>
+        <w:t xml:space="preserve">system places a conversational layer over the conventional desktop session as a whole.  The idea is no longer unclaimed — AgentOS [20] proposes a natural-language portal in place of the graphical desktop — but it is offered as a research direction, without a built system or an evaluation.  The systems that are built automate on top of the desktop rather than replacing it: UFO², for instance, positions itself as a “Desktop AgentOS” but operates as an automation layer atop the existing Windows shell, deliberately confining itself to a separate desktop so that agent and user do not interfere [45].  Third, the Linux work that exists serves servers and agents rather than the desktop session of an end user.  NaSh addresses Linux at the shell level as a design proposal without evaluation [9]; shipping natural-language shells such as Alibaba Cloud’s ANOLISA pair intent translation with approval gating and rollback, but scope themselves explicitly to server and DevOps workloads; and OSWorld includes Ubuntu as an evaluation platform rather than a deployment target [41].  Fourth, controlled comparison against the conventional graphical workflow exists only for narrow slices of the problem.  AXIS evaluates an API-first agent against manual operation within a single application, Microsoft Word, using a cloud-hosted frontier model [21], and the accessibility literature evaluates assistance for specific populations [28].  No study compares a conversational interface against the conventional workflow across operating-system-level tasks, on a Linux desktop, driven by a locally-hosted small model, under an explicit safety gate.  The first of these gaps is the one this study’s research addresses.  The other three describe the setting in which it arises, and they are why the analysis is deployed and validated in a conversational interface layer rather than studied on a corpus alone.</w:t>
       </w:r>
     </w:p>
     <w:p>
@@ -1282,7 +1282,7 @@
         <w:pStyle w:val="BodyText"/>
       </w:pPr>
       <w:r>
-        <w:t xml:space="preserve">These gaps present a clear opportunity, and a precedent for how to seize it.  The history of the Unix shell demonstrates that a new interactive layer — bash succeeding the Bourne shell, zsh and fish succeeding both — can replace the software a user directly interacts with while leaving the kernel and the core system utilities entirely unchanged, producing a materially different experience for the user without touching anything beneath the session.  The opportunity addressed by this study is to apply the same pattern in a new direction, and with one deliberate departure from it.  SynapseOS adds a conversational interface layer to a Linux desktop that continues running underneath it: the desktop shell, window manager, and application launcher are left in place, as are the kernel, the core system utilities, and the existing application ecosystem.  A user retains every route to the machine they already had and gains a third.  The departure from the shell precedent is that</w:t>
+        <w:t xml:space="preserve">These gaps present an opportunity that is algorithmic first.  Whether a generated command can be undone, and what must be saved beforehand so that it can be, can be decided by analysing the command itself: deriving what it would change from its syntactic structure, resolving the targets it computes while it runs before it runs, and capturing exactly what it would destroy.  That analysis is independent of the interface and the model that produced the command, and it is this study’s research contribution.  It needs a setting in which generated commands act on a real user’s files, and the remaining gaps supply one.  SynapseOS, built for this study, adds a conversational interface layer to a Linux desktop that continues running underneath it, in the way a new interactive shell such as</w:t>
       </w:r>
       <w:r>
         <w:t xml:space="preserve"> </w:t>
@@ -1297,22 +1297,7 @@
         <w:t xml:space="preserve"> </w:t>
       </w:r>
       <w:r>
-        <w:t xml:space="preserve">displaced</w:t>
-      </w:r>
-      <w:r>
-        <w:t xml:space="preserve"> </w:t>
-      </w:r>
-      <w:r>
-        <w:rPr>
-          <w:rStyle w:val="VerbatimChar"/>
-        </w:rPr>
-        <w:t xml:space="preserve">bash</w:t>
-      </w:r>
-      <w:r>
-        <w:t xml:space="preserve"> </w:t>
-      </w:r>
-      <w:r>
-        <w:t xml:space="preserve">for those who adopted it, whereas this layer displaces nothing — a conversational interface cannot yet perform the visual tasks a graphical desktop performs, so replacing the desktop would remove capability from the user in exchange for convenience, and adding to it costs them nothing.  It is designed to serve as the primary user-facing interface to a personal computing environment — spanning novice, elderly, non-technical, and technical user populations — with an evaluation methodology that engages the conventional desktop workflow as its baseline rather than as its substrate.  Within that layer, the first gap is addressed by the study’s algorithmic contribution: a recoverability analysis that derives a generated command’s effects from its structure before it runs, and captures exactly what it would destroy so that it can be undone.</w:t>
+        <w:t xml:space="preserve">sits over an unchanged kernel and core utilities: the desktop shell, window manager, and application launcher are left in place, as are the kernel, the core system utilities, and the existing application ecosystem, and a user retains every route to the machine they already had and gains a third.  It serves as the experimental platform on which the analysis is deployed, demonstrated, and validated in use, with people of differing technical fluency and with the conventional desktop workflow as the baseline.</w:t>
       </w:r>
     </w:p>
     <w:bookmarkEnd w:id="29"/>
@@ -1330,7 +1315,7 @@
         <w:pStyle w:val="FirstParagraph"/>
       </w:pPr>
       <w:r>
-        <w:t xml:space="preserve">The capability of a personal computer is unevenly reachable.  Nearly any operation a system supports can be expressed on its command line, but only by someone who can write in a shell scripting language; everyone else is limited to the operations a graphical desktop was built to expose.  This study addresses the absence of a conversational interface layer — one that accepts intent in ordinary language and carries it out through the standard system toolchain, layered over the desktop’s graphical session in the way a new interactive shell sits over an unchanged kernel and core utilities — that has been empirically evaluated against the conventional graphical workflow it would supplement, and evaluated specifically for whether it changes what people of differing technical fluency can accomplish.  Because such a layer runs generated commands on the user’s own files, it also raises a problem the surveyed systems leave open, and which this study treats as its primary computer-science problem: determining, before a generated command runs, what it would destroy and what must be captured so that it can be undone, which a list of dangerous command patterns cannot do.</w:t>
+        <w:t xml:space="preserve">A system that turns a request in ordinary language into a shell command and runs it acts directly on the user’s own files and system state.  Language models have made such systems practical: a person who cannot write a shell command can now have one written for them, and conversational interfaces, coding assistants, and agentic tools increasingly execute what a model writes.  A generated command can be wrong, or broader than the request intended, and whether what it destroys can be restored depends entirely on what was saved before it ran.  The tools that execute generated commands today decide only whether to run them, by matching the command against a list of patterns judged dangerous; they cannot determine what a command will touch when its targets are hidden inside another command or computed while it runs, and they save nothing.  This study addresses that problem: determining, before a generated shell command runs, what it would change, whether the change can be undone, and the least that must be captured beforehand so that it can be.  It is a problem of program analysis rather than of interface design, and the surveyed systems leave it open.  It is studied in the setting where it is most acute — a conversational interface layer through which a person who does not read shell syntax operates a Linux desktop — but the analysis takes a command as a string and is independent of the interface and the model that produced it.</w:t>
       </w:r>
     </w:p>
     <w:p>
@@ -1350,7 +1335,7 @@
         </w:numPr>
       </w:pPr>
       <w:r>
-        <w:t xml:space="preserve">Can the effects of a generated shell command be found before it runs — seeing through the wrappers that hide its targets and resolving targets computed at run time — so that the minimal set of pre-images sufficient to restore the prior state can be captured, losing less data silently than matching the command against an enumerated list of destructive patterns, and asking the user less often than a list that refuses every command it does not recognize?</w:t>
+        <w:t xml:space="preserve">How can the effect of a shell command on a system be represented formally, so that whether the command can be undone is a predicate over that representation, and so that anything the representation cannot determine is treated as unrecoverable rather than safe?</w:t>
       </w:r>
     </w:p>
     <w:p>
@@ -1362,7 +1347,31 @@
         </w:numPr>
       </w:pPr>
       <w:r>
-        <w:t xml:space="preserve">How can a conversational interface layer be designed so that a person can direct an operating system in ordinary language, reaching the full range of operations the command line can express without knowing the syntax that command line requires?</w:t>
+        <w:t xml:space="preserve">Can a command’s effects be derived from its syntactic structure before it runs — composed through the wrappers,</w:t>
+      </w:r>
+      <w:r>
+        <w:t xml:space="preserve"> </w:t>
+      </w:r>
+      <w:r>
+        <w:rPr>
+          <w:rStyle w:val="VerbatimChar"/>
+        </w:rPr>
+        <w:t xml:space="preserve">find -exec</w:t>
+      </w:r>
+      <w:r>
+        <w:t xml:space="preserve">,</w:t>
+      </w:r>
+      <w:r>
+        <w:t xml:space="preserve"> </w:t>
+      </w:r>
+      <w:r>
+        <w:rPr>
+          <w:rStyle w:val="VerbatimChar"/>
+        </w:rPr>
+        <w:t xml:space="preserve">xargs</w:t>
+      </w:r>
+      <w:r>
+        <w:t xml:space="preserve">, loops, and substitutions that hide its targets, with targets known only at run time resolved by commands first proven read-only — without executing anything that changes the system?</w:t>
       </w:r>
     </w:p>
     <w:p>
@@ -1374,7 +1383,7 @@
         </w:numPr>
       </w:pPr>
       <w:r>
-        <w:t xml:space="preserve">What confirmation and recovery design allows a user to act on their own system through natural language while preserving their ability to undo what was done — including when a command was approved in error?</w:t>
+        <w:t xml:space="preserve">Given those effects, can a minimum-cost set of pre-images be computed whose capture is sufficient to restore the prior state, and does restoring from it return the system to that state?</w:t>
       </w:r>
     </w:p>
     <w:p>
@@ -1386,7 +1395,27 @@
         </w:numPr>
       </w:pPr>
       <w:r>
-        <w:t xml:space="preserve">Does a conversational interface narrow the gap between what technically fluent users and users fluent in neither the command line nor the graphical desktop can accomplish on a computer, and how does the resulting experience — task success, time, error rate, and cognitive workload — compare to the interface each participant uses today?</w:t>
+        <w:t xml:space="preserve">Against an enumerated list of destructive patterns and a list that refuses every command it does not recognize, does the analysis lose less data silently, restore more of what is lost, and ask the user less often?</w:t>
+      </w:r>
+    </w:p>
+    <w:p>
+      <w:pPr>
+        <w:pStyle w:val="Compact"/>
+        <w:numPr>
+          <w:ilvl w:val="0"/>
+          <w:numId w:val="1001"/>
+        </w:numPr>
+      </w:pPr>
+      <w:r>
+        <w:t xml:space="preserve">How much of that result do composition and runtime-target resolution each contribute, beyond the per-command rule table on which both rest?</w:t>
+      </w:r>
+    </w:p>
+    <w:p>
+      <w:pPr>
+        <w:pStyle w:val="FirstParagraph"/>
+      </w:pPr>
+      <w:r>
+        <w:t xml:space="preserve">A further question is answered by validation rather than posed as a research question: whether the analysis’s decisions hold when it is deployed in a working interface and exercised by people, whose commands the evaluation corpus does not contain (Chapter 3, Section 3.2 onward).</w:t>
       </w:r>
     </w:p>
     <w:bookmarkEnd w:id="30"/>
@@ -1404,7 +1433,7 @@
         <w:pStyle w:val="FirstParagraph"/>
       </w:pPr>
       <w:r>
-        <w:t xml:space="preserve">The general objective of this study is to design and evaluate a recoverability analysis for shell commands generated by a language model: an algorithm that determines, before a command runs, what data it would destroy, and computes the minimal set of pre-images that must be captured for the command to be undone.  The algorithm is deployed and evaluated within SynapseOS, a conversational interface layer that lets a person operate a computer in ordinary language rather than through memorized command syntax or the bounded set of actions a graphical desktop exposes.  SynapseOS is realized as an agentic layer over the conventional graphical session: the desktop shell, session manager, and application launcher keep running and stay available to the user, and the underlying Linux kernel, core system utilities, and application ecosystem are left unchanged.</w:t>
+        <w:t xml:space="preserve">The general objective of this study is to design and evaluate a recoverability analysis for shell commands generated by a language model: an algorithm that determines, before a command runs, what it would change, and computes the minimum-cost set of pre-images that must be captured for the command to be undone.  The algorithm is deployed in SynapseOS, a conversational interface layer for the Linux desktop built for this study, which serves as the experimental platform on which the algorithm is demonstrated and validated in use.</w:t>
       </w:r>
     </w:p>
     <w:p>
@@ -1424,7 +1453,7 @@
         </w:numPr>
       </w:pPr>
       <w:r>
-        <w:t xml:space="preserve">To formalize an effect model for shell commands, defining the kinds of effect a command can have on the system, a recoverability verdict over them, and a one-sided soundness rule under which anything that cannot be determined is treated as unrecoverable (RQ1).</w:t>
+        <w:t xml:space="preserve">To formalize an effect-semantics model for shell-command recoverability: the kinds of effect a command can have on the system, a recoverability verdict over them, and a one-sided soundness rule under which anything that cannot be determined is treated as unrecoverable (RQ1).</w:t>
       </w:r>
     </w:p>
     <w:p>
@@ -1436,7 +1465,7 @@
         </w:numPr>
       </w:pPr>
       <w:r>
-        <w:t xml:space="preserve">To design an algorithm that derives a generated command’s effects from its syntactic structure rather than its name, composing them through wrappers,</w:t>
+        <w:t xml:space="preserve">To develop an effect-composition algorithm that derives a command’s effects from its syntactic structure rather than its name, composing them through wrappers,</w:t>
       </w:r>
       <w:r>
         <w:t xml:space="preserve"> </w:t>
@@ -1460,7 +1489,7 @@
         <w:t xml:space="preserve">xargs</w:t>
       </w:r>
       <w:r>
-        <w:t xml:space="preserve">, loops, and substitutions, resolving targets known only at run time through dry runs it first proves read-only, and computing from them a minimum-cost capture plan (RQ1).</w:t>
+        <w:t xml:space="preserve">, loops, and substitutions, and resolving targets known only at run time through dry runs it first proves read-only (RQ2).</w:t>
       </w:r>
     </w:p>
     <w:p>
@@ -1472,7 +1501,7 @@
         </w:numPr>
       </w:pPr>
       <w:r>
-        <w:t xml:space="preserve">To evaluate the algorithm empirically on a held-out command corpus whose ground truth is obtained by sandboxed execution, against an enumerated-pattern list, a list that fails closed, and the command-safety checks of open-source AI agents, reporting silent data loss separately from verified restoration and needless confirmation, with statistical testing; and, through an ablation, to quantify how much of the result the algorithm’s composition contributes beyond its per-command rule table (RQ1).</w:t>
+        <w:t xml:space="preserve">To develop a minimum-cost recovery-plan generation algorithm that computes, from a command’s effects, the cheapest set of captures sufficient to restore the prior state, and to verify by sandboxed execution that restoring from that plan does so (RQ3).</w:t>
       </w:r>
     </w:p>
     <w:p>
@@ -1484,22 +1513,7 @@
         </w:numPr>
       </w:pPr>
       <w:r>
-        <w:t xml:space="preserve">To design and implement SynapseOS, a conversational interface layer for the Linux desktop</w:t>
-      </w:r>
-      <w:hyperlink w:anchor="ch1-fn4">
-        <w:r>
-          <w:rPr>
-            <w:rStyle w:val="Hyperlink"/>
-            <w:vertAlign w:val="superscript"/>
-          </w:rPr>
-          <w:t xml:space="preserve">4</w:t>
-        </w:r>
-      </w:hyperlink>
-      <w:r>
-        <w:t xml:space="preserve"> </w:t>
-      </w:r>
-      <w:r>
-        <w:t xml:space="preserve">that exposes shell-expressible operations through ordinary language without requiring knowledge of shell syntax, comprising a natural-language-to-bash pipeline, a persistent conversational surface, and a confirmation gate and undo log driven by the algorithm’s verdict and capture plan (RQ2, RQ3).</w:t>
+        <w:t xml:space="preserve">To evaluate the recoverability analysis against pattern-based and fail-closed baselines, and against the command-safety checks of open-source AI agents, on a held-out command corpus whose ground truth is obtained by sandboxed execution, measuring silent data loss, verified restoration, and needless confirmation, with statistical testing (RQ4).</w:t>
       </w:r>
     </w:p>
     <w:p>
@@ -1511,7 +1525,15 @@
         </w:numPr>
       </w:pPr>
       <w:r>
-        <w:t xml:space="preserve">To evaluate SynapseOS through a controlled user study against each participant’s own primary operating system, measuring task success, completion time, error rate, and cognitive workload across a population fluent in neither existing interface and a population fluent in both — with the difference between those two populations as the primary outcome of interest, since the central claim of this work is that a conversational interface narrows the gap between them.</w:t>
+        <w:t xml:space="preserve">To quantify the contribution of composition and of runtime-target resolution through ablation studies that disable each, and both, while leaving the per-command rule table unchanged (RQ5).</w:t>
+      </w:r>
+    </w:p>
+    <w:p>
+      <w:pPr>
+        <w:pStyle w:val="FirstParagraph"/>
+      </w:pPr>
+      <w:r>
+        <w:t xml:space="preserve">Each objective is algorithmic and measurable, and each would stand if the interface were removed, because the analysis takes a shell command as a string.  SynapseOS is the means by which the algorithm is deployed, demonstrated, and validated in use, not an objective in itself: the validation study (Chapter 3, Sections 3.2–3.6) measures how the analysis’s decisions hold on commands participants cause, and characterizes the platform through task success, time, error rate, and workload against each participant’s own primary operating system.</w:t>
       </w:r>
     </w:p>
     <w:bookmarkEnd w:id="31"/>
@@ -2006,7 +2028,7 @@
         <w:t xml:space="preserve"> </w:t>
       </w:r>
       <w:r>
-        <w:t xml:space="preserve">names nothing until it executes — which is what an enumerated pattern list cannot express.  Soundness is deliberately one-sided: anything the analysis cannot resolve is treated as unrecoverable, because over-approximating destructiveness costs a confirmation prompt whereas under-approximating it destroys data.  The analysis is not free of lists: it rests on a table of what each known command does, and a command absent from that table is unknown and asks.  Its claim is what it adds on top of a table, not that it has none.  That claim is measured directly in Section 3.1(h): disabling composition — the resolution of wrappers,</w:t>
+        <w:t xml:space="preserve">names nothing until it executes — which is what an enumerated pattern list cannot express.  Soundness is deliberately one-sided: anything the analysis cannot resolve is treated as unrecoverable, because over-approximating destructiveness costs a confirmation prompt whereas under-approximating it destroys data.  The analysis is not free of lists: it rests on a table of what each known command does, and a command absent from that table is unknown and asks.  Its claim is what it adds on top of a table, not that it has none.  That claim is measured directly in Section 3.1(h), by ablations that leave the same per-command table in place.  Disabling composition — seeing through wrappers,</w:t>
       </w:r>
       <w:r>
         <w:t xml:space="preserve"> </w:t>
@@ -2061,7 +2083,7 @@
         <w:t xml:space="preserve"> </w:t>
       </w:r>
       <w:r>
-        <w:t xml:space="preserve">strings, and loops — while leaving the same per-command table in place drops capture coverage on the held-out corpus from 89.5% to 35.4% (McNemar’s exact test, p = 2.1×10</w:t>
+        <w:t xml:space="preserve">strings, and loops — drops capture coverage on the held-out corpus from 89.5% to 35.4% (McNemar’s exact test, p = 2.1×10</w:t>
       </w:r>
       <w:r>
         <w:rPr>
@@ -2070,7 +2092,16 @@
         <w:t xml:space="preserve">−53</w:t>
       </w:r>
       <w:r>
-        <w:t xml:space="preserve">); the table alone recovers roughly a third of what the full analysis recovers, and silent loss is unaffected (0% either way), so what composition adds is coverage, not safety.</w:t>
+        <w:t xml:space="preserve">); disabling runtime-target resolution drops it to 45.5% (p = 1.8×10</w:t>
+      </w:r>
+      <w:r>
+        <w:rPr>
+          <w:vertAlign w:val="superscript"/>
+        </w:rPr>
+        <w:t xml:space="preserve">−43</w:t>
+      </w:r>
+      <w:r>
+        <w:t xml:space="preserve">); and disabling both leaves the table alone at 32.0%.  Silent loss is 0% in every configuration, so what composition and resolution add is coverage, not safety.</w:t>
       </w:r>
     </w:p>
     <w:p>
@@ -2086,13 +2117,13 @@
           <w:b/>
           <w:bCs/>
         </w:rPr>
-        <w:t xml:space="preserve">A working conversational interface layer for a Linux desktop</w:t>
-      </w:r>
-      <w:r>
-        <w:t xml:space="preserve"> </w:t>
-      </w:r>
-      <w:r>
-        <w:t xml:space="preserve">that grounds natural-language intent in shell commands, gates irreversible operations on explicit confirmation, and records a recovery journal, implemented as a single binary running over an unmodified desktop session.</w:t>
+        <w:t xml:space="preserve">SynapseOS, the experimental platform.</w:t>
+      </w:r>
+      <w:r>
+        <w:t xml:space="preserve"> </w:t>
+      </w:r>
+      <w:r>
+        <w:t xml:space="preserve">A working conversational interface layer for a Linux desktop in which the analysis is deployed: it grounds natural-language intent in shell commands, gates each command on the analysis’s verdict, captures what the analysis’s plan names before the command runs, and records a recovery journal from which the command can be undone, implemented as a single binary running over an unmodified desktop session.</w:t>
       </w:r>
     </w:p>
     <w:p>
@@ -2108,10 +2139,13 @@
           <w:b/>
           <w:bCs/>
         </w:rPr>
-        <w:t xml:space="preserve">A controlled comparative evaluation of that interface against the one each participant already uses</w:t>
-      </w:r>
-      <w:r>
-        <w:t xml:space="preserve">, on matched tasks, with the difference between users fluent in neither existing interface and users fluent in both as the primary outcome.  This addresses a gap in the literature identified in Chapter 2, where conversational computing interfaces are benchmarked as autonomous agents but seldom measured against the conventional workflow they would supplement.</w:t>
+        <w:t xml:space="preserve">A validation of the analysis in use.</w:t>
+      </w:r>
+      <w:r>
+        <w:t xml:space="preserve"> </w:t>
+      </w:r>
+      <w:r>
+        <w:t xml:space="preserve">A controlled study in which participants operate the platform on matched tasks, measuring how the analysis’s decisions hold on commands people cause — silent loss, verified restoration, and needless confirmation in live use — and, as characterizations of the platform, task success, time, error rate, and workload against each participant’s own primary operating system, with users fluent in neither existing interface and users fluent in both compared.</w:t>
       </w:r>
     </w:p>
     <w:p>
@@ -2119,7 +2153,7 @@
         <w:pStyle w:val="FirstParagraph"/>
       </w:pPr>
       <w:r>
-        <w:t xml:space="preserve">The first contribution is evaluated against a labeled command corpus and is therefore independent of the user study; the third is evaluated through the study itself.  They are reported separately for that reason, and a negative result on either is reported as such.</w:t>
+        <w:t xml:space="preserve">The first contribution is the study’s research contribution and is evaluated against a labeled command corpus, independently of any participant; the second and third are the platform on which it is deployed and its validation in use.  They are reported separately for that reason, and a negative result on any of them is reported as such.</w:t>
       </w:r>
     </w:p>
     <w:bookmarkEnd w:id="32"/>
@@ -2153,13 +2187,13 @@
           <w:b/>
           <w:bCs/>
         </w:rPr>
-        <w:t xml:space="preserve">Novice and non-technical computer users.</w:t>
-      </w:r>
-      <w:r>
-        <w:t xml:space="preserve"> </w:t>
-      </w:r>
-      <w:r>
-        <w:t xml:space="preserve">The conventional graphical desktop imposes a steep learning curve rooted in its icon-and-menu paradigm.  A conversational interface layer that accepts natural language intent lowers the threshold for productive computer use, particularly for users with limited prior computing experience, including elderly users encountering desktop computing late or infrequently.</w:t>
+        <w:t xml:space="preserve">Developers of AI agents that run shell commands.</w:t>
+      </w:r>
+      <w:r>
+        <w:t xml:space="preserve"> </w:t>
+      </w:r>
+      <w:r>
+        <w:t xml:space="preserve">Coding assistants and other agents that execute generated commands guard them with lists of dangerous patterns, which the evaluation in Section 3.1(c) of Chapter 3 shows let most file-destroying commands in its corpus run without confirmation.  The recoverability analysis is independent of the interface and of the language model, and can be placed in front of any system that executes generated shell commands.</w:t>
       </w:r>
     </w:p>
     <w:p>
@@ -2175,13 +2209,13 @@
           <w:b/>
           <w:bCs/>
         </w:rPr>
-        <w:t xml:space="preserve">Developers and power users on Linux.</w:t>
-      </w:r>
-      <w:r>
-        <w:t xml:space="preserve"> </w:t>
-      </w:r>
-      <w:r>
-        <w:t xml:space="preserve">A conversational interface layer reduces the cognitive load of recalling and composing shell commands by exposing system operations through a unified natural-language interface.</w:t>
+        <w:t xml:space="preserve">The research community.</w:t>
+      </w:r>
+      <w:r>
+        <w:t xml:space="preserve"> </w:t>
+      </w:r>
+      <w:r>
+        <w:t xml:space="preserve">The study contributes a static analysis of shell commands for recoverability, a property that existing analyses of shell do not address (§2.4), together with an evaluation against ground truth obtained by sandboxed execution rather than by human labeling.  Its ablations separate what composition and runtime-target resolution each contribute from the rule table beneath them, and its validation study shows how such an analysis behaves when deployed in an interface people use.</w:t>
       </w:r>
     </w:p>
     <w:p>
@@ -2197,13 +2231,13 @@
           <w:b/>
           <w:bCs/>
         </w:rPr>
-        <w:t xml:space="preserve">Users with motor accessibility needs.</w:t>
-      </w:r>
-      <w:r>
-        <w:t xml:space="preserve"> </w:t>
-      </w:r>
-      <w:r>
-        <w:t xml:space="preserve">Although this population is scoped out of the initial evaluation for ethical and recruitment reasons, SynapseOS is positioned to serve as the session-level substrate on which accessibility-specific configurations can operate.  Prior work has established design guidelines for LLM-based speech interfaces for users with motor impairments [28] and has demonstrated specialized techniques — speech-instructed GUI agents and resilient visual grounding — at the application and interaction-technique level [10, 29].  These techniques presuppose a conversational system surface that does not yet exist at the session level; SynapseOS provides that surface, making accessibility-specific extensions a natural and well-grounded future direction rather than a speculative one.</w:t>
+        <w:t xml:space="preserve">Novice and non-technical computer users.</w:t>
+      </w:r>
+      <w:r>
+        <w:t xml:space="preserve"> </w:t>
+      </w:r>
+      <w:r>
+        <w:t xml:space="preserve">The conventional graphical desktop imposes a steep learning curve rooted in its icon-and-menu paradigm.  A person who cannot read a shell command cannot judge one a model wrote for them, so letting a model act on their behalf is safe only if what it destroys can be restored; the recoverability analysis supplies that, and a conversational interface layer that accepts natural language intent lowers the threshold for productive computer use, particularly for users with limited prior computing experience, including elderly users encountering desktop computing late or infrequently.</w:t>
       </w:r>
     </w:p>
     <w:p>
@@ -2219,13 +2253,13 @@
           <w:b/>
           <w:bCs/>
         </w:rPr>
-        <w:t xml:space="preserve">Developers of AI agents that run shell commands.</w:t>
-      </w:r>
-      <w:r>
-        <w:t xml:space="preserve"> </w:t>
-      </w:r>
-      <w:r>
-        <w:t xml:space="preserve">Coding assistants and other agents that execute generated commands guard them with lists of dangerous patterns, which the evaluation in Section 3.1(c) of Chapter 3 shows let most file-destroying commands in its corpus run without confirmation.  The recoverability analysis is independent of the interface and of the language model, and can be placed in front of any system that executes generated shell commands.</w:t>
+        <w:t xml:space="preserve">Developers and power users on Linux.</w:t>
+      </w:r>
+      <w:r>
+        <w:t xml:space="preserve"> </w:t>
+      </w:r>
+      <w:r>
+        <w:t xml:space="preserve">A conversational interface layer reduces the cognitive load of recalling and composing shell commands by exposing system operations through a unified natural-language interface.</w:t>
       </w:r>
     </w:p>
     <w:p>
@@ -2241,13 +2275,13 @@
           <w:b/>
           <w:bCs/>
         </w:rPr>
-        <w:t xml:space="preserve">The research community.</w:t>
-      </w:r>
-      <w:r>
-        <w:t xml:space="preserve"> </w:t>
-      </w:r>
-      <w:r>
-        <w:t xml:space="preserve">The study contributes a static analysis of shell commands for recoverability, a property that existing analyses of shell do not address (§2.4), together with an evaluation against ground truth obtained by sandboxed execution rather than by human labeling.  It also contributes a controlled comparative evaluation methodology for conversational interfaces, which are rarely compared against conventional graphical workflows on the same tasks and population [41].</w:t>
+        <w:t xml:space="preserve">Users with motor accessibility needs.</w:t>
+      </w:r>
+      <w:r>
+        <w:t xml:space="preserve"> </w:t>
+      </w:r>
+      <w:r>
+        <w:t xml:space="preserve">Although this population is scoped out of the initial evaluation for ethical and recruitment reasons, SynapseOS is positioned to serve as the session-level substrate on which accessibility-specific configurations can operate.  Prior work has established design guidelines for LLM-based speech interfaces for users with motor impairments [28] and has demonstrated specialized techniques — speech-instructed GUI agents and resilient visual grounding — at the application and interaction-technique level [10, 29].  These techniques presuppose a conversational system surface that does not yet exist at the session level; SynapseOS provides that surface, making accessibility-specific extensions a natural and well-grounded future direction rather than a speculative one.</w:t>
       </w:r>
     </w:p>
     <w:bookmarkEnd w:id="33"/>
@@ -2297,15 +2331,30 @@
         <w:t xml:space="preserve"> </w:t>
       </w:r>
       <w:r>
-        <w:t xml:space="preserve">names where that surface sits in the system: the software a user meets immediately after login.  The first is where this study’s algorithmic contribution is deployed and evaluated; the second is its architectural position, and the phrase “session layer” is used only when SynapseOS’s position relative to it is specifically at issue.  This study covers the design and evaluation of a recoverability analysis for generated shell commands, which is its primary contribution, and the design, implementation, and evaluation of SynapseOS, the conversational interface layer for the Linux desktop in which it is deployed.  SynapseOS runs as an agentic layer over an ordinary desktop session rather than in place of one: the desktop shell, session manager, and application launcher continue to run and remain available to the user, as do the kernel and the core system utilities beneath them.  The Linux kernel, the core system utilities, and the existing ecosystem of Linux applications are not modified by this study; SynapseOS interacts with the system by translating natural language into shell commands executed through the standard command-line toolchain, rather than by rewriting applications or the utilities they depend on.  The subject matter spans program analysis, natural language processing, LLM-based reasoning, command-line automation, Linux system integration, and human-computer interaction.</w:t>
-      </w:r>
-    </w:p>
-    <w:p>
-      <w:pPr>
-        <w:pStyle w:val="BodyText"/>
-      </w:pPr>
-      <w:r>
-        <w:t xml:space="preserve">The study examines cross-application desktop workflows on Linux, including shell operations, file management, and application-level tasks representable in the OSWorld benchmark task suite [41].  The population studied consists of novice computer users and power users recruited for a controlled user study.  The study is conducted in a Linux desktop environment and is bounded by the duration of the thesis project.  The recoverability analysis covers commands in the bash dialect on a Debian system: their effects on the filesystem, and the changes to package and service state they make through apt, dpkg, and systemd.  It is evaluated on a corpus of 777 commands drawn from NL2Bash, from templates covering each composition operator, and from tools whose effects lie outside the filesystem.</w:t>
+        <w:t xml:space="preserve">names where that surface sits in the system: the software a user meets immediately after login.  The first is where this study’s algorithmic contribution is deployed and evaluated; the second is its architectural position, and the phrase “session layer” is used only when SynapseOS’s position relative to it is specifically at issue.  This study covers the design and evaluation of a recoverability analysis for generated shell commands, which is its research contribution, and the implementation of SynapseOS, the conversational interface layer for the Linux desktop</w:t>
+      </w:r>
+      <w:hyperlink w:anchor="ch1-fn4">
+        <w:r>
+          <w:rPr>
+            <w:rStyle w:val="Hyperlink"/>
+            <w:vertAlign w:val="superscript"/>
+          </w:rPr>
+          <w:t xml:space="preserve">4</w:t>
+        </w:r>
+      </w:hyperlink>
+      <w:r>
+        <w:t xml:space="preserve"> </w:t>
+      </w:r>
+      <w:r>
+        <w:t xml:space="preserve">in which the analysis is deployed and validated.  SynapseOS runs as an agentic layer over an ordinary desktop session rather than in place of one: the desktop shell, session manager, and application launcher continue to run and remain available to the user, as do the kernel and the core system utilities beneath them.  The Linux kernel, the core system utilities, and the existing ecosystem of Linux applications are not modified by this study; SynapseOS interacts with the system by translating natural language into shell commands executed through the standard command-line toolchain, rather than by rewriting applications or the utilities they depend on.  The subject matter spans program analysis, natural language processing, LLM-based reasoning, command-line automation, Linux system integration, and human-computer interaction.</w:t>
+      </w:r>
+    </w:p>
+    <w:p>
+      <w:pPr>
+        <w:pStyle w:val="BodyText"/>
+      </w:pPr>
+      <w:r>
+        <w:t xml:space="preserve">The study examines cross-application desktop workflows on Linux, including shell operations, file management, and application-level tasks representable in the OSWorld benchmark task suite [41].  The validation study recruits novice computer users and power users for a controlled study on the platform.  The study is conducted in a Linux desktop environment and is bounded by the duration of the thesis project.  The recoverability analysis covers commands in the bash dialect on a Debian system: their effects on the filesystem, and the changes to package and service state they make through apt, dpkg, and systemd.  It is evaluated on a corpus of 777 commands drawn from NL2Bash, from templates covering each composition operator, and from tools whose effects lie outside the filesystem, and the contributions of composition and of runtime-target resolution are measured by ablation on the same corpus.</w:t>
       </w:r>
     </w:p>
     <w:p>
@@ -2485,14 +2534,14 @@
       <w:r>
         <w:drawing>
           <wp:inline>
-            <wp:extent cx="5334000" cy="1121201"/>
+            <wp:extent cx="5334000" cy="1114567"/>
             <wp:effectExtent b="0" l="0" r="0" t="0"/>
             <wp:docPr descr="" title="" id="44" name="Picture"/>
             <a:graphic>
               <a:graphicData uri="http://schemas.openxmlformats.org/drawingml/2006/picture">
                 <pic:pic>
                   <pic:nvPicPr>
-                    <pic:cNvPr descr="/tmp/claude-1000/-home-willard-projects-thesis/cb82e7af-8c35-489a-a7f7-ef49172efea2/scratchpad/docx/fig0.png" id="45" name="Picture"/>
+                    <pic:cNvPr descr="/tmp/claude-1000/-home-willard-projects-thesis/cb82e7af-8c35-489a-a7f7-ef49172efea2/scratchpad/docx/work2/fig0.png" id="45" name="Picture"/>
                     <pic:cNvPicPr>
                       <a:picLocks noChangeArrowheads="1" noChangeAspect="1"/>
                     </pic:cNvPicPr>
@@ -2506,7 +2555,7 @@
                   <pic:spPr bwMode="auto">
                     <a:xfrm>
                       <a:off x="0" y="0"/>
-                      <a:ext cx="5334000" cy="1121201"/>
+                      <a:ext cx="5334000" cy="1114567"/>
                     </a:xfrm>
                     <a:prstGeom prst="rect">
                       <a:avLst/>
@@ -2837,7 +2886,7 @@
         <w:t xml:space="preserve">&amp;&amp;</w:t>
       </w:r>
       <w:r>
-        <w:t xml:space="preserve">, with redirects and command substitution altering what each actually touches.  No enumeration of command prefixes expresses that, and extending the list does not converge: each newly named tool leaves the next one unnamed.  Determining recoverability over a composed command, and computing the minimal information needed to reverse it, is the open problem this study takes up (RQ1), and it is what separates the present work from the guardrail designs surveyed above.  The comparison that matters is not only against an enumerated list of dangerous commands.  A list can be turned around so that it refuses every command it does not recognize, which removes the first weakness above at the cost of asking about everything unfamiliar; that fail-closed list is the strongest simple baseline, and the study therefore claims what the analysis adds to it — seeing through wrappers, resolving run-time targets, and capturing exactly what would be lost — and not the verdict alone.</w:t>
+        <w:t xml:space="preserve">, with redirects and command substitution altering what each actually touches.  No enumeration of command prefixes expresses that, and extending the list does not converge: each newly named tool leaves the next one unnamed.  Determining recoverability over a composed command, and computing the minimal information needed to reverse it, is the open problem this study takes up (RQ1–RQ3), and it is what separates the present work from the guardrail designs surveyed above.  The comparison that matters is not only against an enumerated list of dangerous commands.  A list can be turned around so that it refuses every command it does not recognize, which removes the first weakness above at the cost of asking about everything unfamiliar; that fail-closed list is the strongest simple baseline, and the study therefore claims what the analysis adds to it — seeing through wrappers, resolving run-time targets, and capturing exactly what would be lost — and not the verdict alone.</w:t>
       </w:r>
     </w:p>
     <w:p>
@@ -5126,7 +5175,7 @@
         <w:pStyle w:val="BodyText"/>
       </w:pPr>
       <w:r>
-        <w:t xml:space="preserve">Synthesized, the surveyed works reveal a fourfold gap: no analysis of what a generated command would destroy, every guard being a list of dangerous patterns; no conversational replacement for the graphical session layer; no coverage of the Linux desktop; and no controlled comparison of a conversational interface against the conventional workflow across user populations.  The present study addresses the first through a recoverability analysis of generated shell commands, evaluated against ground truth obtained by sandboxed execution, and the other three through SynapseOS, the conversational interface layer for the Linux desktop in which that analysis is deployed, evaluated by controlled, within-subjects comparison against each participant’s own operating system.  The methodology through which this evaluation is conducted is the subject of Chapter 3.</w:t>
+        <w:t xml:space="preserve">Synthesized, the surveyed works reveal a fourfold gap: no analysis of what a generated command would destroy, every guard being a list of dangerous patterns; no conversational replacement for the graphical session layer; no coverage of the Linux desktop; and no controlled comparison of a conversational interface against the conventional workflow across user populations.  The first is the gap the present study’s research addresses, through a recoverability analysis of generated shell commands evaluated against ground truth obtained by sandboxed execution.  The other three describe the setting in which that gap arises, and SynapseOS, the conversational interface layer for the Linux desktop built as the analysis’s experimental platform, is where the analysis is deployed and validated in use, through a controlled, within-subjects comparison against each participant’s own operating system.  The methodology through which this evaluation is conducted is the subject of Chapter 3.</w:t>
       </w:r>
     </w:p>
     <w:bookmarkEnd w:id="66"/>
@@ -5191,15 +5240,15 @@
         <w:pStyle w:val="BodyText"/>
       </w:pPr>
       <w:r>
-        <w:t xml:space="preserve">This chapter describes the research methodology employed in designing, implementing, and evaluating SynapseOS — an agentic conversational interface layer that runs over an ordinary Linux desktop session rather than replacing it.  The methodology is organized into three sections: Dataset, which defines the data to be collected and how it will be gathered; Procedure, which describes the step-by-step process of building the system and conducting the study; and System Testing, which defines the evaluation design, metrics, and statistical approach used to compare SynapseOS against each participant’s own primary operating system.</w:t>
-      </w:r>
-    </w:p>
-    <w:p>
-      <w:pPr>
-        <w:pStyle w:val="BodyText"/>
-      </w:pPr>
-      <w:r>
-        <w:t xml:space="preserve">This methodology answers the four research questions posed in Chapter 1.</w:t>
+        <w:t xml:space="preserve">This chapter describes the methodology for designing, implementing, and evaluating the recoverability analysis, and for deploying and validating it in SynapseOS, the conversational interface layer that serves as its experimental platform and runs over an ordinary Linux desktop session rather than replacing it.  The methodology is organized into three sections: Dataset, which defines the data to be collected and how it will be gathered; Procedure, which describes how the analysis and its platform are built and how the validation study is conducted; and System Testing, which defines the evaluation of the analysis on its corpus and the design, metrics, and statistical approach of the validation study.</w:t>
+      </w:r>
+    </w:p>
+    <w:p>
+      <w:pPr>
+        <w:pStyle w:val="BodyText"/>
+      </w:pPr>
+      <w:r>
+        <w:t xml:space="preserve">This methodology answers the five research questions posed in Chapter 1, all of which concern the analysis. </w:t>
       </w:r>
       <w:r>
         <w:t xml:space="preserve"> </w:t>
@@ -5215,7 +5264,7 @@
         <w:t xml:space="preserve"> </w:t>
       </w:r>
       <w:r>
-        <w:t xml:space="preserve">asks whether the effects of a generated command can be found before it runs, and the pre-images needed to restore the prior state captured, so that less data is lost silently than under an enumerated list of destructive patterns and the user is asked less often than under a list that refuses every command it does not recognize.</w:t>
+        <w:t xml:space="preserve">asks how a command’s effect on the system can be represented formally so that recoverability is a predicate over it, with anything undetermined treated as unrecoverable;</w:t>
       </w:r>
       <w:r>
         <w:t xml:space="preserve"> </w:t>
@@ -5228,10 +5277,7 @@
         <w:t xml:space="preserve">RQ2</w:t>
       </w:r>
       <w:r>
-        <w:t xml:space="preserve"> </w:t>
-      </w:r>
-      <w:r>
-        <w:t xml:space="preserve">asks how a conversational interface layer can be designed so that a person can direct an operating system in ordinary language without knowing the syntax its command line requires;</w:t>
+        <w:t xml:space="preserve">, whether those effects can be derived from the command’s structure before it runs, through composition and the read-only resolution of run-time targets;</w:t>
       </w:r>
       <w:r>
         <w:t xml:space="preserve"> </w:t>
@@ -5244,7 +5290,7 @@
         <w:t xml:space="preserve">RQ3</w:t>
       </w:r>
       <w:r>
-        <w:t xml:space="preserve">, what confirmation and recovery design allows a user to act on their own system through natural language while preserving the ability to undo what was done, including when a command was approved in error; and</w:t>
+        <w:t xml:space="preserve">, whether a minimum-cost recovery plan computed from them restores the prior state;</w:t>
       </w:r>
       <w:r>
         <w:t xml:space="preserve"> </w:t>
@@ -5257,23 +5303,28 @@
         <w:t xml:space="preserve">RQ4</w:t>
       </w:r>
       <w:r>
-        <w:t xml:space="preserve">, whether a conversational interface narrows the gap between what technically fluent users and users fluent in neither existing interface can accomplish, and how the resulting experience compares to the interface each participant uses today.</w:t>
-      </w:r>
-    </w:p>
-    <w:p>
-      <w:pPr>
-        <w:pStyle w:val="BodyText"/>
-      </w:pPr>
-      <w:r>
-        <w:t xml:space="preserve">The study therefore makes two contributions of different kinds, established by two independent evaluations, and they are reported separately for that reason.  Section 3.1 defines the corpus-based evaluation that answers RQ1 without reference to any participant; Section 1 defines the data gathered to answer RQ3 and RQ4; Section 2 describes the system built to answer RQ2 and RQ3; and Sections 3.2 onward define the user study that answers RQ3 and RQ4.  Neither evaluation depends on the other: the algorithm takes a shell command as a string and is indifferent to what produced it, so its corpus, baselines, and results stand independently of the interface in which it is deployed, while the comparative study addresses a gap in the literature — conversational interfaces evaluated across user populations of differing technical fluency — that the algorithm does not speak to at all.</w:t>
-      </w:r>
-    </w:p>
-    <w:p>
-      <w:pPr>
-        <w:pStyle w:val="BodyText"/>
-      </w:pPr>
-      <w:r>
-        <w:t xml:space="preserve">The two evaluations are independent by construction, and this is the reason the questions are ordered as they are.  Section 3.1 defines the corpus-based evaluation that answers RQ1 without reference to any participant; Section 1 defines the data gathered to answer RQ3 and RQ4; Section 2 describes the system built to answer RQ2 and RQ3; and Sections 3.2 onward define the user study that answers RQ3 and RQ4.  Removing the conversational interface from this study would remove RQ2 through RQ4 and the user study with them; RQ1, its corpus, its baselines, and its results would remain intact, because the analysis takes a shell command as a string and is indifferent to what produced it.</w:t>
+        <w:t xml:space="preserve">, whether the analysis loses less data silently, restores more, and asks less often than a pattern list and a fail-closed list; and</w:t>
+      </w:r>
+      <w:r>
+        <w:t xml:space="preserve"> </w:t>
+      </w:r>
+      <w:r>
+        <w:rPr>
+          <w:i/>
+          <w:iCs/>
+        </w:rPr>
+        <w:t xml:space="preserve">RQ5</w:t>
+      </w:r>
+      <w:r>
+        <w:t xml:space="preserve">, how much composition and runtime-target resolution each contribute beyond the per-command rule table.  RQ1 is answered by the effect model specified in Section 2.1(c); RQ2 through RQ5 by the corpus evaluation in Section 3.1.</w:t>
+      </w:r>
+    </w:p>
+    <w:p>
+      <w:pPr>
+        <w:pStyle w:val="BodyText"/>
+      </w:pPr>
+      <w:r>
+        <w:t xml:space="preserve">Two evaluations follow, of different standing.  The corpus evaluation in Section 3.1 is the study’s primary evidence: it answers the research questions against a labeled corpus whose ground truth comes from sandboxed execution, without reference to any participant.  The validation study, defined in Section 1 and Sections 3.2 onward and run on the platform described in Section 2, deploys the analysis in SynapseOS and has participants use it on matched tasks.  It checks that the analysis’s decisions carry through to real files and hold on commands people cause, which the corpus does not contain, and it characterizes the platform through usability measures.  Neither evaluation depends on the other: the analysis takes a shell command as a string and is indifferent to what produced it, so removing the interface would remove the validation study but leave every research question, its corpus, its baselines, and its results intact.</w:t>
       </w:r>
     </w:p>
     <w:bookmarkStart w:id="74" w:name="sec-conceptual-framework"/>
@@ -5298,7 +5349,7 @@
         <w:pStyle w:val="BodyText"/>
       </w:pPr>
       <w:r>
-        <w:t xml:space="preserve">The framework is evaluated in two independent parts.  The recoverability analyzer is evaluated on its own, on a corpus of commands whose ground truth is obtained by sandboxed execution (Section 3.1).  The system as a whole is evaluated through a controlled user study in which participants complete a fixed set of tasks under two conditions: using SynapseOS as the interface, and using their own primary operating system — Windows, macOS, or Linux — as the baseline.  This expert baseline design pits SynapseOS against the environment each participant already knows and uses daily, generating empirical data on task completion time, error rate, and user satisfaction across the real-world OS landscape [41].</w:t>
+        <w:t xml:space="preserve">The framework is evaluated in two parts of different standing.  The recoverability analyzer, the study’s research contribution, is evaluated on its own, on a corpus of commands whose ground truth is obtained by sandboxed execution (Section 3.1).  The analyzer is then validated in use, deployed in the platform, through a controlled study in which participants complete a fixed set of tasks under two conditions: using SynapseOS as the interface, and using their own primary operating system — Windows, macOS, or Linux — as the baseline.  The study records the analyzer’s decision on every command participants cause, so its behaviour in use can be compared with its behaviour on the corpus, and its expert baseline design, which pits SynapseOS against the environment each participant already knows and uses daily, characterizes the platform through task completion time, error rate, and user satisfaction across the real-world OS landscape [41].</w:t>
       </w:r>
     </w:p>
     <w:p>
@@ -5315,7 +5366,7 @@
               <a:graphicData uri="http://schemas.openxmlformats.org/drawingml/2006/picture">
                 <pic:pic>
                   <pic:nvPicPr>
-                    <pic:cNvPr descr="/tmp/claude-1000/-home-willard-projects-thesis/cb82e7af-8c35-489a-a7f7-ef49172efea2/scratchpad/docx/fig1.png" id="73" name="Picture"/>
+                    <pic:cNvPr descr="/tmp/claude-1000/-home-willard-projects-thesis/cb82e7af-8c35-489a-a7f7-ef49172efea2/scratchpad/docx/work2/fig1.png" id="73" name="Picture"/>
                     <pic:cNvPicPr>
                       <a:picLocks noChangeArrowheads="1" noChangeAspect="1"/>
                     </pic:cNvPicPr>
@@ -6013,7 +6064,7 @@
         <w:pStyle w:val="FirstParagraph"/>
       </w:pPr>
       <w:r>
-        <w:t xml:space="preserve">The data gathered for this study falls into three categories: benchmark task data used to evaluate the system in a standardized environment, user study data collected from human participants in a controlled setting, and system performance data captured automatically through built-in telemetry during all sessions.</w:t>
+        <w:t xml:space="preserve">The study’s primary dataset is a held-out corpus of shell commands on which the analysis is evaluated.  Each command is labeled by executing it in a sandbox on a prepared fixture and comparing the filesystem before and after, so that its ground truth comes from what it actually did rather than from a human judgment.  Its construction, sizing, labeling, and partitions are specified with the evaluation it serves, in Section 3.1(a) and (b), so that the corpus and the measurements made on it can be read together.  The remainder of this section defines the data gathered for the validation study, in three categories: benchmark task data used to exercise the platform in a standardized environment, user study data collected from human participants in a controlled setting, and system performance data, including the analysis’s decision on every command, captured automatically through built-in telemetry during all sessions.</w:t>
       </w:r>
     </w:p>
     <w:bookmarkStart w:id="79" w:name="ch3-sec1-1"/>
@@ -6211,7 +6262,7 @@
         </w:numPr>
       </w:pPr>
       <w:r>
-        <w:t xml:space="preserve">Conversational turns per task: the number of utterances required to complete each task</w:t>
+        <w:t xml:space="preserve">Analysis decisions: for every command executed, the analysis’s verdict and capture plan, whether the participant was asked, and the task fixture it ran against, so that the command can be replayed in the sandbox and scored as the corpus is (Section 3.4(e))</w:t>
       </w:r>
     </w:p>
     <w:p>
@@ -6223,6 +6274,18 @@
         </w:numPr>
       </w:pPr>
       <w:r>
+        <w:t xml:space="preserve">Conversational turns per task: the number of utterances required to complete each task</w:t>
+      </w:r>
+    </w:p>
+    <w:p>
+      <w:pPr>
+        <w:pStyle w:val="Compact"/>
+        <w:numPr>
+          <w:ilvl w:val="0"/>
+          <w:numId w:val="1008"/>
+        </w:numPr>
+      </w:pPr>
+      <w:r>
         <w:t xml:space="preserve">Intent parsing accuracy: whether the system correctly identified the user’s intent on the first attempt</w:t>
       </w:r>
     </w:p>
@@ -6396,55 +6459,7 @@
         <w:pStyle w:val="BodyText"/>
       </w:pPr>
       <w:r>
-        <w:t xml:space="preserve">The dual-population design — novice and power users — directly addresses the gap identified in Chapter 1, where no prior work has evaluated a conversational interface across user populations with differing technical backgrounds [41].  The three data categories align with the three interface questions:</w:t>
-      </w:r>
-      <w:r>
-        <w:t xml:space="preserve"> </w:t>
-      </w:r>
-      <w:r>
-        <w:rPr>
-          <w:i/>
-          <w:iCs/>
-        </w:rPr>
-        <w:t xml:space="preserve">RQ2</w:t>
-      </w:r>
-      <w:r>
-        <w:t xml:space="preserve"> </w:t>
-      </w:r>
-      <w:r>
-        <w:t xml:space="preserve">is addressed by the system design and benchmark task coverage;</w:t>
-      </w:r>
-      <w:r>
-        <w:t xml:space="preserve"> </w:t>
-      </w:r>
-      <w:r>
-        <w:rPr>
-          <w:i/>
-          <w:iCs/>
-        </w:rPr>
-        <w:t xml:space="preserve">RQ3</w:t>
-      </w:r>
-      <w:r>
-        <w:t xml:space="preserve"> </w:t>
-      </w:r>
-      <w:r>
-        <w:t xml:space="preserve">is addressed by system performance telemetry (command execution latency, intent parsing accuracy, undo and confirmation events); and</w:t>
-      </w:r>
-      <w:r>
-        <w:t xml:space="preserve"> </w:t>
-      </w:r>
-      <w:r>
-        <w:rPr>
-          <w:i/>
-          <w:iCs/>
-        </w:rPr>
-        <w:t xml:space="preserve">RQ4</w:t>
-      </w:r>
-      <w:r>
-        <w:t xml:space="preserve"> </w:t>
-      </w:r>
-      <w:r>
-        <w:t xml:space="preserve">is addressed by the user study metrics (task completion time, error rate, satisfaction scores).  RQ1 draws on none of these, being answered against the labeled command corpus described in Section 3.1.</w:t>
+        <w:t xml:space="preserve">The dual-population design — novice and power users — directly addresses the gap identified in Chapter 1, where no prior work has evaluated a conversational interface across user populations with differing technical backgrounds [41].  The validation data serve two purposes.  The system performance data, including the analysis’s decision on every command participants cause, validate the analysis in use: they show whether its verdicts and captures hold on commands the corpus does not contain, and whether undo restores what participants’ commands changed.  The user study metrics and benchmark coverage characterize the platform on which it is deployed.  The research questions themselves are answered against the labeled command corpus described in Section 3.1.</w:t>
       </w:r>
     </w:p>
     <w:bookmarkEnd w:id="83"/>
@@ -8624,7 +8639,7 @@
         <w:pStyle w:val="FirstParagraph"/>
       </w:pPr>
       <w:r>
-        <w:t xml:space="preserve">The last two procedures have been carried out once on the prototype as a manual verification of ten test cases, recorded as terminal logs and provided as supplementary material.  In seven, a request is sent to the deployed system, where the language model writes the command, and the run is repeated with the analysis disabled, each from a freshly created test directory of ordinary files; both configurations include the same undo log, so the analysis changes only what is captured before a command runs; the affected files are listed in the initial state, after execution, and after undo, and in every case the model wrote the same command in both runs.  Requests name the kind of command under test, and some spell it out, because with loose phrasing the model produced a usable command of the intended shape in only two of seven cases, a limitation of translation rather than of the analysis.  One further case examines the analysis alone, one uses an everyday request, and one examines the scope of undo.  All ten behaved as expected.  Without the analysis, two data-destroying commands ran with no confirmation at all; where a command’s targets were indirect, undo restored the affected files in every case with the analysis enabled and in none with it disabled; and where targets were named directly, the two configurations behaved identically.  The verification is illustrative rather than evidential.  Its cases were chosen to exhibit specific behaviours, so it supports no claim about rates; the claims of RQ1 rest on the corpus evaluation in Section 3.1.  What it adds is confirmation that the analysis’s decisions carry through to the files themselves in the deployed system, which the corpus evaluation, presenting commands directly to the analysis, does not exercise.  It also surfaced two defects, recorded in</w:t>
+        <w:t xml:space="preserve">The last two procedures have been carried out once on the prototype as a manual verification of ten test cases, recorded as terminal logs and provided as supplementary material.  In seven, a request is sent to the deployed system, where the language model writes the command, and the run is repeated with the analysis disabled, each from a freshly created test directory of ordinary files; both configurations include the same undo log, so the analysis changes only what is captured before a command runs; the affected files are listed in the initial state, after execution, and after undo, and in every case the model wrote the same command in both runs.  Requests name the kind of command under test, and some spell it out, because with loose phrasing the model produced a usable command of the intended shape in only two of seven cases, a limitation of translation rather than of the analysis.  One further case examines the analysis alone, one uses an everyday request, and one examines the scope of undo.  All ten behaved as expected.  Without the analysis, two data-destroying commands ran with no confirmation at all; where a command’s targets were indirect, undo restored the affected files in every case with the analysis enabled and in none with it disabled; and where targets were named directly, the two configurations behaved identically.  The verification is illustrative rather than evidential.  Its cases were chosen to exhibit specific behaviours, so it supports no claim about rates; the claims of RQ2 through RQ5 rest on the corpus evaluation in Section 3.1.  What it adds is confirmation that the analysis’s decisions carry through to the files themselves in the deployed system, which the corpus evaluation, presenting commands directly to the analysis, does not exercise.  It also surfaced two defects, recorded in</w:t>
       </w:r>
       <w:r>
         <w:t xml:space="preserve"> </w:t>
@@ -9015,7 +9030,7 @@
     </w:p>
     <w:bookmarkEnd w:id="94"/>
     <w:bookmarkEnd w:id="95"/>
-    <w:bookmarkStart w:id="114" w:name="sec3"/>
+    <w:bookmarkStart w:id="115" w:name="sec3"/>
     <w:p>
       <w:pPr>
         <w:pStyle w:val="Heading2"/>
@@ -9029,7 +9044,7 @@
         <w:pStyle w:val="FirstParagraph"/>
       </w:pPr>
       <w:r>
-        <w:t xml:space="preserve">SynapseOS is evaluated against the datasets and study design established in Section 1.  The comparison follows a fixed set of metrics and formulas, a statistical analysis plan for testing significance and effect size, and an accounting of the threats to validity this design addresses.</w:t>
+        <w:t xml:space="preserve">The analysis is evaluated first, on its own corpus (Section 3.1), which answers RQ2 through RQ5.  The validation study on the platform follows (Sections 3.2–3.6), against the datasets and study design established in Section 1, with a fixed set of metrics and formulas, a statistical analysis plan for testing significance and effect size, and an accounting of the threats to validity this design addresses.</w:t>
       </w:r>
     </w:p>
     <w:bookmarkStart w:id="104" w:name="ch3-sec3-1"/>
@@ -9038,7 +9053,7 @@
         <w:pStyle w:val="Heading3"/>
       </w:pPr>
       <w:r>
-        <w:t xml:space="preserve">3.1 Algorithm evaluation (RQ1)</w:t>
+        <w:t xml:space="preserve">3.1 Algorithm evaluation (RQ2–RQ5)</w:t>
       </w:r>
     </w:p>
     <w:p>
@@ -9046,7 +9061,7 @@
         <w:pStyle w:val="FirstParagraph"/>
       </w:pPr>
       <w:r>
-        <w:t xml:space="preserve">RQ1 is answered separately from the user study, against a labeled corpus of shell commands rather than through participants.  The separation is deliberate and has a practical consequence worth stating: this evaluation depends on no ethics approval, no recruitment, and no participant sessions, and can therefore be completed and reported independently of the study’s schedule.</w:t>
+        <w:t xml:space="preserve">RQ2 through RQ5 are answered separately from the validation study, against a labeled corpus of shell commands rather than through participants.  The separation is deliberate and has a practical consequence worth stating: this evaluation depends on no ethics approval, no recruitment, and no participant sessions, and can therefore be completed and reported independently of the study’s schedule.</w:t>
       </w:r>
     </w:p>
     <w:bookmarkStart w:id="96" w:name="a-corpus-construction"/>
@@ -10352,13 +10367,13 @@
       </w:r>
     </w:p>
     <w:bookmarkEnd w:id="102"/>
-    <w:bookmarkStart w:id="103" w:name="h-composition-ablation"/>
+    <w:bookmarkStart w:id="103" w:name="h-composition-and-resolution-ablation"/>
     <w:p>
       <w:pPr>
         <w:pStyle w:val="Heading4"/>
       </w:pPr>
       <w:r>
-        <w:t xml:space="preserve">h) Composition Ablation</w:t>
+        <w:t xml:space="preserve">h) Composition and Resolution Ablation</w:t>
       </w:r>
     </w:p>
     <w:p>
@@ -10366,27 +10381,30 @@
         <w:pStyle w:val="FirstParagraph"/>
       </w:pPr>
       <w:r>
-        <w:t xml:space="preserve">Chapter 1, Section 1.5 states the analysis’s claim as what it adds on top of a table of what each known command does, not that it has none — a distinction raised directly by this study’s adviser in an earlier review: how much of the result above comes from the algorithm itself, and how much from that table?  The question had been answered only in prose.  It is answered here as a measurement, by an ablation that removes the one thing a table cannot do.  A second configuration of the analyzer, identical to the one scored above except that composition is disabled — wrappers (</w:t>
+        <w:t xml:space="preserve">Chapter 1, Section 1.5 states the analysis’s claim as what it adds on top of a table of what each known command does, not that it has none — a distinction raised directly by this study’s adviser: how much of the result above comes from the algorithm itself, and how much from that table?  The algorithm adds two things a table cannot do, and RQ5 asks for the contribution of each. </w:t>
+      </w:r>
+      <w:r>
+        <w:t xml:space="preserve"> </w:t>
       </w:r>
       <w:r>
         <w:rPr>
           <w:i/>
           <w:iCs/>
         </w:rPr>
-        <w:t xml:space="preserve">sudo</w:t>
-      </w:r>
-      <w:r>
-        <w:t xml:space="preserve">,</w:t>
-      </w:r>
-      <w:r>
-        <w:t xml:space="preserve"> </w:t>
+        <w:t xml:space="preserve">Composition</w:t>
+      </w:r>
+      <w:r>
+        <w:t xml:space="preserve"> </w:t>
+      </w:r>
+      <w:r>
+        <w:t xml:space="preserve">analyses through the commands that hide another command’s targets: wrappers (</w:t>
       </w:r>
       <w:r>
         <w:rPr>
           <w:i/>
           <w:iCs/>
         </w:rPr>
-        <w:t xml:space="preserve">env</w:t>
+        <w:t xml:space="preserve">sudo</w:t>
       </w:r>
       <w:r>
         <w:t xml:space="preserve">,</w:t>
@@ -10399,7 +10417,7 @@
           <w:i/>
           <w:iCs/>
         </w:rPr>
-        <w:t xml:space="preserve">nohup</w:t>
+        <w:t xml:space="preserve">env</w:t>
       </w:r>
       <w:r>
         <w:t xml:space="preserve">,</w:t>
@@ -10412,10 +10430,10 @@
           <w:i/>
           <w:iCs/>
         </w:rPr>
-        <w:t xml:space="preserve">timeout</w:t>
-      </w:r>
-      <w:r>
-        <w:t xml:space="preserve">, and similarly transparent commands),</w:t>
+        <w:t xml:space="preserve">nohup</w:t>
+      </w:r>
+      <w:r>
+        <w:t xml:space="preserve">,</w:t>
       </w:r>
       <w:r>
         <w:t xml:space="preserve"> </w:t>
@@ -10425,17 +10443,20 @@
           <w:i/>
           <w:iCs/>
         </w:rPr>
-        <w:t xml:space="preserve">find -exec</w:t>
-      </w:r>
-      <w:r>
-        <w:t xml:space="preserve">/</w:t>
+        <w:t xml:space="preserve">timeout</w:t>
+      </w:r>
+      <w:r>
+        <w:t xml:space="preserve">, and similarly transparent commands),</w:t>
+      </w:r>
+      <w:r>
+        <w:t xml:space="preserve"> </w:t>
       </w:r>
       <w:r>
         <w:rPr>
           <w:i/>
           <w:iCs/>
         </w:rPr>
-        <w:t xml:space="preserve">-execdir</w:t>
+        <w:t xml:space="preserve">find -exec</w:t>
       </w:r>
       <w:r>
         <w:t xml:space="preserve">/</w:t>
@@ -10445,7 +10466,7 @@
           <w:i/>
           <w:iCs/>
         </w:rPr>
-        <w:t xml:space="preserve">-ok</w:t>
+        <w:t xml:space="preserve">-execdir</w:t>
       </w:r>
       <w:r>
         <w:t xml:space="preserve">/</w:t>
@@ -10455,20 +10476,17 @@
           <w:i/>
           <w:iCs/>
         </w:rPr>
-        <w:t xml:space="preserve">-okdir</w:t>
-      </w:r>
-      <w:r>
-        <w:t xml:space="preserve">,</w:t>
-      </w:r>
-      <w:r>
-        <w:t xml:space="preserve"> </w:t>
+        <w:t xml:space="preserve">-ok</w:t>
+      </w:r>
+      <w:r>
+        <w:t xml:space="preserve">/</w:t>
       </w:r>
       <w:r>
         <w:rPr>
           <w:i/>
           <w:iCs/>
         </w:rPr>
-        <w:t xml:space="preserve">xargs</w:t>
+        <w:t xml:space="preserve">-okdir</w:t>
       </w:r>
       <w:r>
         <w:t xml:space="preserve">,</w:t>
@@ -10481,10 +10499,10 @@
           <w:i/>
           <w:iCs/>
         </w:rPr>
-        <w:t xml:space="preserve">eval</w:t>
-      </w:r>
-      <w:r>
-        <w:t xml:space="preserve">, shell</w:t>
+        <w:t xml:space="preserve">xargs</w:t>
+      </w:r>
+      <w:r>
+        <w:t xml:space="preserve">,</w:t>
       </w:r>
       <w:r>
         <w:t xml:space="preserve"> </w:t>
@@ -10494,13 +10512,10 @@
           <w:i/>
           <w:iCs/>
         </w:rPr>
-        <w:t xml:space="preserve">-c</w:t>
-      </w:r>
-      <w:r>
-        <w:t xml:space="preserve"> </w:t>
-      </w:r>
-      <w:r>
-        <w:t xml:space="preserve">strings, and</w:t>
+        <w:t xml:space="preserve">eval</w:t>
+      </w:r>
+      <w:r>
+        <w:t xml:space="preserve">, shell</w:t>
       </w:r>
       <w:r>
         <w:t xml:space="preserve"> </w:t>
@@ -10510,27 +10525,13 @@
           <w:i/>
           <w:iCs/>
         </w:rPr>
-        <w:t xml:space="preserve">for</w:t>
-      </w:r>
-      <w:r>
-        <w:t xml:space="preserve">-loops are each routed straight to the same unresolved verdict an unknown command receives, rather than analysed through — is run over the identical held-out corpus.  Every other dispatch path is untouched: the same per-command rule table, the same run-time resolution of command substitution, and the same &amp;&amp;/pipe/subshell traversal that requires no lookup beyond the table either configuration has.  If the table is where the result comes from, disabling composition should cost little; if composition is, it should cost a great deal.</w:t>
-      </w:r>
-    </w:p>
-    <w:p>
-      <w:pPr>
-        <w:pStyle w:val="BodyText"/>
-      </w:pPr>
-      <w:r>
-        <w:t xml:space="preserve">It costs a great deal.  Capture coverage, verified by the same sandboxed recovery check as the primary result, falls from 291 of 325 executable losses (89.5%) to 115 (35.4%) — the table alone recovers roughly a third of what the full analysis recovers.  McNemar’s exact test on the paired discordant items rejects equality overwhelmingly (p = 2.1×10</w:t>
-      </w:r>
-      <w:r>
-        <w:rPr>
-          <w:vertAlign w:val="superscript"/>
-        </w:rPr>
-        <w:t xml:space="preserve">−53</w:t>
-      </w:r>
-      <w:r>
-        <w:t xml:space="preserve">), with a risk difference of +0.542 (95% Newcombe interval [+0.484, +0.593]) and an odds ratio undefined in the analysis’s favor: not one of the 176 discordant items favors the table-only configuration over the full one.  Silent loss is unchanged at 0.0% for both configurations, because the fail-closed default that the analysis falls back to for anything it cannot resolve does not depend on composition — a command it can no longer see through is treated exactly as an unknown command already is, which asks rather than runs silently.  Composition is therefore not what keeps the analysis safe; the table and the fail-closed default already do that, which is why Table 3.4 found the analysis indistinguishable from the fail-closed list on silent loss.  Composition is what makes the analysis</w:t>
+        <w:t xml:space="preserve">-c</w:t>
+      </w:r>
+      <w:r>
+        <w:t xml:space="preserve"> </w:t>
+      </w:r>
+      <w:r>
+        <w:t xml:space="preserve">strings, and</w:t>
       </w:r>
       <w:r>
         <w:t xml:space="preserve"> </w:t>
@@ -10540,6 +10541,137 @@
           <w:i/>
           <w:iCs/>
         </w:rPr>
+        <w:t xml:space="preserve">for</w:t>
+      </w:r>
+      <w:r>
+        <w:t xml:space="preserve">-loops. </w:t>
+      </w:r>
+      <w:r>
+        <w:t xml:space="preserve"> </w:t>
+      </w:r>
+      <w:r>
+        <w:rPr>
+          <w:i/>
+          <w:iCs/>
+        </w:rPr>
+        <w:t xml:space="preserve">Runtime-target resolution</w:t>
+      </w:r>
+      <w:r>
+        <w:t xml:space="preserve"> </w:t>
+      </w:r>
+      <w:r>
+        <w:t xml:space="preserve">learns targets that exist only while a command runs, by running a form of it first proven read-only: command substitution and the producer feeding</w:t>
+      </w:r>
+      <w:r>
+        <w:t xml:space="preserve"> </w:t>
+      </w:r>
+      <w:r>
+        <w:rPr>
+          <w:i/>
+          <w:iCs/>
+        </w:rPr>
+        <w:t xml:space="preserve">xargs</w:t>
+      </w:r>
+      <w:r>
+        <w:t xml:space="preserve">, the rewritten</w:t>
+      </w:r>
+      <w:r>
+        <w:t xml:space="preserve"> </w:t>
+      </w:r>
+      <w:r>
+        <w:rPr>
+          <w:i/>
+          <w:iCs/>
+        </w:rPr>
+        <w:t xml:space="preserve">find</w:t>
+      </w:r>
+      <w:r>
+        <w:t xml:space="preserve"> </w:t>
+      </w:r>
+      <w:r>
+        <w:t xml:space="preserve">expression, and the dry runs of</w:t>
+      </w:r>
+      <w:r>
+        <w:t xml:space="preserve"> </w:t>
+      </w:r>
+      <w:r>
+        <w:rPr>
+          <w:i/>
+          <w:iCs/>
+        </w:rPr>
+        <w:t xml:space="preserve">tar</w:t>
+      </w:r>
+      <w:r>
+        <w:t xml:space="preserve">,</w:t>
+      </w:r>
+      <w:r>
+        <w:t xml:space="preserve"> </w:t>
+      </w:r>
+      <w:r>
+        <w:rPr>
+          <w:i/>
+          <w:iCs/>
+        </w:rPr>
+        <w:t xml:space="preserve">unzip</w:t>
+      </w:r>
+      <w:r>
+        <w:t xml:space="preserve">,</w:t>
+      </w:r>
+      <w:r>
+        <w:t xml:space="preserve"> </w:t>
+      </w:r>
+      <w:r>
+        <w:rPr>
+          <w:i/>
+          <w:iCs/>
+        </w:rPr>
+        <w:t xml:space="preserve">rsync</w:t>
+      </w:r>
+      <w:r>
+        <w:t xml:space="preserve">,</w:t>
+      </w:r>
+      <w:r>
+        <w:t xml:space="preserve"> </w:t>
+      </w:r>
+      <w:r>
+        <w:rPr>
+          <w:i/>
+          <w:iCs/>
+        </w:rPr>
+        <w:t xml:space="preserve">rename</w:t>
+      </w:r>
+      <w:r>
+        <w:t xml:space="preserve">,</w:t>
+      </w:r>
+      <w:r>
+        <w:t xml:space="preserve"> </w:t>
+      </w:r>
+      <w:r>
+        <w:rPr>
+          <w:i/>
+          <w:iCs/>
+        </w:rPr>
+        <w:t xml:space="preserve">git</w:t>
+      </w:r>
+      <w:r>
+        <w:t xml:space="preserve">, and the package and service tools.  Three further configurations of the analyzer are run over the identical held-out corpus, each identical to the one scored above except for what it disables: composition, routed straight to the unresolved verdict an unknown command receives; resolution, with no runner, so that every target it would have learned is unresolved; and both, which leaves the per-command rule table alone.  Every other dispatch path is untouched, including the &amp;&amp;/pipe/subshell traversal that requires no lookup beyond the table.  If the table is where the result comes from, disabling either should cost little.</w:t>
+      </w:r>
+    </w:p>
+    <w:p>
+      <w:pPr>
+        <w:pStyle w:val="BodyText"/>
+      </w:pPr>
+      <w:r>
+        <w:t xml:space="preserve">Each costs a great deal (Table 3.5).  Capture coverage, verified by the same sandboxed recovery check as the primary result, falls from 291 of 325 executable losses (89.5%) to 115 (35.4%) without composition, to 148 (45.5%) without resolution, and to 104 (32.0%) without both.  McNemar’s exact test on the paired discordant items rejects equality overwhelmingly in each case, and not one discordant item favors an ablated configuration over the full one: 176 items without composition, 143 without resolution, and 187 without both.  Silent loss is unchanged at 0.0% in every configuration, because the fail-closed default that the analysis falls back to for anything it cannot resolve depends on neither — a command it can no longer see through, or whose targets it can no longer learn, is treated exactly as an unknown command already is, which asks rather than runs silently.  Composition and resolution are therefore not what keep the analysis safe; the table and the fail-closed default already do that, which is why Table 3.4 found the analysis indistinguishable from the fail-closed list on silent loss.  They are what make the analysis</w:t>
+      </w:r>
+      <w:r>
+        <w:t xml:space="preserve"> </w:t>
+      </w:r>
+      <w:r>
+        <w:rPr>
+          <w:i/>
+          <w:iCs/>
+        </w:rPr>
         <w:t xml:space="preserve">useful</w:t>
       </w:r>
       <w:r>
@@ -10547,6 +10679,143 @@
       </w:r>
       <w:r>
         <w:t xml:space="preserve">— the difference between asking about nearly everything and actually recovering what was lost — and that is the part a table, however complete, cannot supply on its own.</w:t>
+      </w:r>
+    </w:p>
+    <w:p>
+      <w:pPr>
+        <w:pStyle w:val="BodyText"/>
+      </w:pPr>
+      <w:r>
+        <w:t xml:space="preserve">The two depend on each other.  Neither alone recovers much more than the table: composition without resolution reaches 45.5% and resolution without composition 35.4%, against 32.0% for the table, while the two together reach 89.5%.  Of the 143 items lost when resolution is disabled, 126 involve</w:t>
+      </w:r>
+      <w:r>
+        <w:t xml:space="preserve"> </w:t>
+      </w:r>
+      <w:r>
+        <w:rPr>
+          <w:i/>
+          <w:iCs/>
+        </w:rPr>
+        <w:t xml:space="preserve">find</w:t>
+      </w:r>
+      <w:r>
+        <w:t xml:space="preserve"> </w:t>
+      </w:r>
+      <w:r>
+        <w:t xml:space="preserve">(58 with</w:t>
+      </w:r>
+      <w:r>
+        <w:t xml:space="preserve"> </w:t>
+      </w:r>
+      <w:r>
+        <w:rPr>
+          <w:i/>
+          <w:iCs/>
+        </w:rPr>
+        <w:t xml:space="preserve">-exec</w:t>
+      </w:r>
+      <w:r>
+        <w:t xml:space="preserve">, 47 feeding</w:t>
+      </w:r>
+      <w:r>
+        <w:t xml:space="preserve"> </w:t>
+      </w:r>
+      <w:r>
+        <w:rPr>
+          <w:i/>
+          <w:iCs/>
+        </w:rPr>
+        <w:t xml:space="preserve">xargs</w:t>
+      </w:r>
+      <w:r>
+        <w:t xml:space="preserve">, 12 with</w:t>
+      </w:r>
+      <w:r>
+        <w:t xml:space="preserve"> </w:t>
+      </w:r>
+      <w:r>
+        <w:rPr>
+          <w:i/>
+          <w:iCs/>
+        </w:rPr>
+        <w:t xml:space="preserve">-delete</w:t>
+      </w:r>
+      <w:r>
+        <w:t xml:space="preserve">, and 9 in substitutions or archive commands), 6 are other</w:t>
+      </w:r>
+      <w:r>
+        <w:t xml:space="preserve"> </w:t>
+      </w:r>
+      <w:r>
+        <w:rPr>
+          <w:i/>
+          <w:iCs/>
+        </w:rPr>
+        <w:t xml:space="preserve">xargs</w:t>
+      </w:r>
+      <w:r>
+        <w:t xml:space="preserve"> </w:t>
+      </w:r>
+      <w:r>
+        <w:t xml:space="preserve">pipelines, 5 are</w:t>
+      </w:r>
+      <w:r>
+        <w:t xml:space="preserve"> </w:t>
+      </w:r>
+      <w:r>
+        <w:rPr>
+          <w:i/>
+          <w:iCs/>
+        </w:rPr>
+        <w:t xml:space="preserve">rsync</w:t>
+      </w:r>
+      <w:r>
+        <w:t xml:space="preserve">, 4 are</w:t>
+      </w:r>
+      <w:r>
+        <w:t xml:space="preserve"> </w:t>
+      </w:r>
+      <w:r>
+        <w:rPr>
+          <w:i/>
+          <w:iCs/>
+        </w:rPr>
+        <w:t xml:space="preserve">git</w:t>
+      </w:r>
+      <w:r>
+        <w:t xml:space="preserve">, and 2 are plain command substitutions: composition can see that</w:t>
+      </w:r>
+      <w:r>
+        <w:t xml:space="preserve"> </w:t>
+      </w:r>
+      <w:r>
+        <w:rPr>
+          <w:i/>
+          <w:iCs/>
+        </w:rPr>
+        <w:t xml:space="preserve">find -exec rm</w:t>
+      </w:r>
+      <w:r>
+        <w:t xml:space="preserve"> </w:t>
+      </w:r>
+      <w:r>
+        <w:t xml:space="preserve">removes each match, but only resolution can say which files match.  The two also differ in what they cost the user.  Without composition the analysis asks needlessly about 246 of the 372 commands that lose nothing (66%), because every wrapper and</w:t>
+      </w:r>
+      <w:r>
+        <w:t xml:space="preserve"> </w:t>
+      </w:r>
+      <w:r>
+        <w:rPr>
+          <w:i/>
+          <w:iCs/>
+        </w:rPr>
+        <w:t xml:space="preserve">find</w:t>
+      </w:r>
+      <w:r>
+        <w:t xml:space="preserve"> </w:t>
+      </w:r>
+      <w:r>
+        <w:t xml:space="preserve">becomes an unknown command; without resolution it asks about 70 (19%), because it still sees what kind of command it faces and only the targets are unknown; the full analysis asks about 32 (9%).</w:t>
       </w:r>
     </w:p>
     <w:p>
@@ -10561,23 +10830,25 @@
         <w:t xml:space="preserve">Table 3.5.</w:t>
       </w:r>
       <w:r>
-        <w:t xml:space="preserve">  Composition ablation: the full analysis against the same rule table with composition disabled, on the held-out corpus.</w:t>
+        <w:t xml:space="preserve">  Composition and resolution ablation: the full analysis against the same rule table with composition, runtime-target resolution, or both disabled, on the held-out corpus.</w:t>
       </w:r>
     </w:p>
     <w:tbl>
       <w:tblPr>
         <w:tblStyle w:val="Table"/>
-        <w:tblW w:type="auto" w:w="0"/>
+        <w:tblW w:type="pct" w:w="5000"/>
         <w:jc w:val="left"/>
+        <w:tblLayout w:type="fixed"/>
         <w:tblLook w:firstRow="1" w:lastRow="0" w:firstColumn="0" w:lastColumn="0" w:noHBand="0" w:noVBand="0" w:val="0020"/>
       </w:tblPr>
       <w:tblGrid>
-        <w:gridCol w:w="1320"/>
-        <w:gridCol w:w="1320"/>
-        <w:gridCol w:w="1320"/>
-        <w:gridCol w:w="1320"/>
-        <w:gridCol w:w="1320"/>
-        <w:gridCol w:w="1320"/>
+        <w:gridCol w:w="1131"/>
+        <w:gridCol w:w="1131"/>
+        <w:gridCol w:w="1131"/>
+        <w:gridCol w:w="1131"/>
+        <w:gridCol w:w="1131"/>
+        <w:gridCol w:w="1131"/>
+        <w:gridCol w:w="1131"/>
       </w:tblGrid>
       <w:tr>
         <w:trPr>
@@ -10591,43 +10862,55 @@
               <w:jc w:val="left"/>
             </w:pPr>
             <w:r>
-              <w:t xml:space="preserve">Measure</w:t>
-            </w:r>
-          </w:p>
-        </w:tc>
-        <w:tc>
-          <w:tcPr/>
-          <w:p>
-            <w:pPr>
-              <w:pStyle w:val="Compact"/>
-              <w:jc w:val="left"/>
-            </w:pPr>
-            <w:r>
-              <w:t xml:space="preserve">Full analysis</w:t>
-            </w:r>
-          </w:p>
-        </w:tc>
-        <w:tc>
-          <w:tcPr/>
-          <w:p>
-            <w:pPr>
-              <w:pStyle w:val="Compact"/>
-              <w:jc w:val="left"/>
-            </w:pPr>
-            <w:r>
-              <w:t xml:space="preserve">Table alone, no composition</w:t>
-            </w:r>
-          </w:p>
-        </w:tc>
-        <w:tc>
-          <w:tcPr/>
-          <w:p>
-            <w:pPr>
-              <w:pStyle w:val="Compact"/>
-              <w:jc w:val="left"/>
-            </w:pPr>
-            <w:r>
-              <w:t xml:space="preserve">Discordant items (full right / table-alone right)</w:t>
+              <w:t xml:space="preserve">Disabled</w:t>
+            </w:r>
+          </w:p>
+        </w:tc>
+        <w:tc>
+          <w:tcPr/>
+          <w:p>
+            <w:pPr>
+              <w:pStyle w:val="Compact"/>
+              <w:jc w:val="left"/>
+            </w:pPr>
+            <w:r>
+              <w:t xml:space="preserve">Coverage (of 325)</w:t>
+            </w:r>
+          </w:p>
+        </w:tc>
+        <w:tc>
+          <w:tcPr/>
+          <w:p>
+            <w:pPr>
+              <w:pStyle w:val="Compact"/>
+              <w:jc w:val="left"/>
+            </w:pPr>
+            <w:r>
+              <w:t xml:space="preserve">Silent loss (of 405)</w:t>
+            </w:r>
+          </w:p>
+        </w:tc>
+        <w:tc>
+          <w:tcPr/>
+          <w:p>
+            <w:pPr>
+              <w:pStyle w:val="Compact"/>
+              <w:jc w:val="left"/>
+            </w:pPr>
+            <w:r>
+              <w:t xml:space="preserve">Needless asks (of 372)</w:t>
+            </w:r>
+          </w:p>
+        </w:tc>
+        <w:tc>
+          <w:tcPr/>
+          <w:p>
+            <w:pPr>
+              <w:pStyle w:val="Compact"/>
+              <w:jc w:val="left"/>
+            </w:pPr>
+            <w:r>
+              <w:t xml:space="preserve">Discordant (full / ablated)</w:t>
             </w:r>
           </w:p>
         </w:tc>
@@ -10651,7 +10934,7 @@
               <w:jc w:val="left"/>
             </w:pPr>
             <w:r>
-              <w:t xml:space="preserve">Risk difference (95% Newcombe)</w:t>
+              <w:t xml:space="preserve">Risk diff. [95% CI]</w:t>
             </w:r>
           </w:p>
         </w:tc>
@@ -10665,31 +10948,135 @@
               <w:jc w:val="left"/>
             </w:pPr>
             <w:r>
-              <w:t xml:space="preserve">Capture coverage</w:t>
-            </w:r>
-          </w:p>
-        </w:tc>
-        <w:tc>
-          <w:tcPr/>
-          <w:p>
-            <w:pPr>
-              <w:pStyle w:val="Compact"/>
-              <w:jc w:val="left"/>
-            </w:pPr>
-            <w:r>
-              <w:t xml:space="preserve">291/325 = 89.5%</w:t>
-            </w:r>
-          </w:p>
-        </w:tc>
-        <w:tc>
-          <w:tcPr/>
-          <w:p>
-            <w:pPr>
-              <w:pStyle w:val="Compact"/>
-              <w:jc w:val="left"/>
-            </w:pPr>
-            <w:r>
-              <w:t xml:space="preserve">115/325 = 35.4%</w:t>
+              <w:t xml:space="preserve">Nothing</w:t>
+            </w:r>
+            <w:r>
+              <w:br/>
+            </w:r>
+            <w:r>
+              <w:t xml:space="preserve">(full)</w:t>
+            </w:r>
+          </w:p>
+        </w:tc>
+        <w:tc>
+          <w:tcPr/>
+          <w:p>
+            <w:pPr>
+              <w:pStyle w:val="Compact"/>
+              <w:jc w:val="left"/>
+            </w:pPr>
+            <w:r>
+              <w:t xml:space="preserve">291 = 89.5%</w:t>
+            </w:r>
+          </w:p>
+        </w:tc>
+        <w:tc>
+          <w:tcPr/>
+          <w:p>
+            <w:pPr>
+              <w:pStyle w:val="Compact"/>
+              <w:jc w:val="left"/>
+            </w:pPr>
+            <w:r>
+              <w:t xml:space="preserve">0 = 0.0%</w:t>
+            </w:r>
+          </w:p>
+        </w:tc>
+        <w:tc>
+          <w:tcPr/>
+          <w:p>
+            <w:pPr>
+              <w:pStyle w:val="Compact"/>
+              <w:jc w:val="left"/>
+            </w:pPr>
+            <w:r>
+              <w:t xml:space="preserve">32 = 8.6%</w:t>
+            </w:r>
+          </w:p>
+        </w:tc>
+        <w:tc>
+          <w:tcPr/>
+          <w:p>
+            <w:pPr>
+              <w:pStyle w:val="Compact"/>
+              <w:jc w:val="left"/>
+            </w:pPr>
+            <w:r>
+              <w:t xml:space="preserve">—</w:t>
+            </w:r>
+          </w:p>
+        </w:tc>
+        <w:tc>
+          <w:tcPr/>
+          <w:p>
+            <w:pPr>
+              <w:pStyle w:val="Compact"/>
+              <w:jc w:val="left"/>
+            </w:pPr>
+            <w:r>
+              <w:t xml:space="preserve">—</w:t>
+            </w:r>
+          </w:p>
+        </w:tc>
+        <w:tc>
+          <w:tcPr/>
+          <w:p>
+            <w:pPr>
+              <w:pStyle w:val="Compact"/>
+              <w:jc w:val="left"/>
+            </w:pPr>
+            <w:r>
+              <w:t xml:space="preserve">—</w:t>
+            </w:r>
+          </w:p>
+        </w:tc>
+      </w:tr>
+      <w:tr>
+        <w:tc>
+          <w:tcPr/>
+          <w:p>
+            <w:pPr>
+              <w:pStyle w:val="Compact"/>
+              <w:jc w:val="left"/>
+            </w:pPr>
+            <w:r>
+              <w:t xml:space="preserve">Composition</w:t>
+            </w:r>
+          </w:p>
+        </w:tc>
+        <w:tc>
+          <w:tcPr/>
+          <w:p>
+            <w:pPr>
+              <w:pStyle w:val="Compact"/>
+              <w:jc w:val="left"/>
+            </w:pPr>
+            <w:r>
+              <w:t xml:space="preserve">115 = 35.4%</w:t>
+            </w:r>
+          </w:p>
+        </w:tc>
+        <w:tc>
+          <w:tcPr/>
+          <w:p>
+            <w:pPr>
+              <w:pStyle w:val="Compact"/>
+              <w:jc w:val="left"/>
+            </w:pPr>
+            <w:r>
+              <w:t xml:space="preserve">0 = 0.0%</w:t>
+            </w:r>
+          </w:p>
+        </w:tc>
+        <w:tc>
+          <w:tcPr/>
+          <w:p>
+            <w:pPr>
+              <w:pStyle w:val="Compact"/>
+              <w:jc w:val="left"/>
+            </w:pPr>
+            <w:r>
+              <w:t xml:space="preserve">246 = 66.1%</w:t>
             </w:r>
           </w:p>
         </w:tc>
@@ -10745,67 +11132,183 @@
               <w:jc w:val="left"/>
             </w:pPr>
             <w:r>
-              <w:t xml:space="preserve">Silent loss</w:t>
-            </w:r>
-          </w:p>
-        </w:tc>
-        <w:tc>
-          <w:tcPr/>
-          <w:p>
-            <w:pPr>
-              <w:pStyle w:val="Compact"/>
-              <w:jc w:val="left"/>
-            </w:pPr>
-            <w:r>
-              <w:t xml:space="preserve">0/405 = 0.0%</w:t>
-            </w:r>
-          </w:p>
-        </w:tc>
-        <w:tc>
-          <w:tcPr/>
-          <w:p>
-            <w:pPr>
-              <w:pStyle w:val="Compact"/>
-              <w:jc w:val="left"/>
-            </w:pPr>
-            <w:r>
-              <w:t xml:space="preserve">0/405 = 0.0%</w:t>
-            </w:r>
-          </w:p>
-        </w:tc>
-        <w:tc>
-          <w:tcPr/>
-          <w:p>
-            <w:pPr>
-              <w:pStyle w:val="Compact"/>
-              <w:jc w:val="left"/>
-            </w:pPr>
-            <w:r>
-              <w:t xml:space="preserve">0 / 0 (no discordant pairs)</w:t>
-            </w:r>
-          </w:p>
-        </w:tc>
-        <w:tc>
-          <w:tcPr/>
-          <w:p>
-            <w:pPr>
-              <w:pStyle w:val="Compact"/>
-              <w:jc w:val="left"/>
-            </w:pPr>
-            <w:r>
-              <w:t xml:space="preserve">—</w:t>
-            </w:r>
-          </w:p>
-        </w:tc>
-        <w:tc>
-          <w:tcPr/>
-          <w:p>
-            <w:pPr>
-              <w:pStyle w:val="Compact"/>
-              <w:jc w:val="left"/>
-            </w:pPr>
-            <w:r>
-              <w:t xml:space="preserve">+0.000 [−0.009, +0.009]</w:t>
+              <w:t xml:space="preserve">Resolution</w:t>
+            </w:r>
+          </w:p>
+        </w:tc>
+        <w:tc>
+          <w:tcPr/>
+          <w:p>
+            <w:pPr>
+              <w:pStyle w:val="Compact"/>
+              <w:jc w:val="left"/>
+            </w:pPr>
+            <w:r>
+              <w:t xml:space="preserve">148 = 45.5%</w:t>
+            </w:r>
+          </w:p>
+        </w:tc>
+        <w:tc>
+          <w:tcPr/>
+          <w:p>
+            <w:pPr>
+              <w:pStyle w:val="Compact"/>
+              <w:jc w:val="left"/>
+            </w:pPr>
+            <w:r>
+              <w:t xml:space="preserve">0 = 0.0%</w:t>
+            </w:r>
+          </w:p>
+        </w:tc>
+        <w:tc>
+          <w:tcPr/>
+          <w:p>
+            <w:pPr>
+              <w:pStyle w:val="Compact"/>
+              <w:jc w:val="left"/>
+            </w:pPr>
+            <w:r>
+              <w:t xml:space="preserve">70 = 18.8%</w:t>
+            </w:r>
+          </w:p>
+        </w:tc>
+        <w:tc>
+          <w:tcPr/>
+          <w:p>
+            <w:pPr>
+              <w:pStyle w:val="Compact"/>
+              <w:jc w:val="left"/>
+            </w:pPr>
+            <w:r>
+              <w:t xml:space="preserve">143 / 0</w:t>
+            </w:r>
+          </w:p>
+        </w:tc>
+        <w:tc>
+          <w:tcPr/>
+          <w:p>
+            <w:pPr>
+              <w:pStyle w:val="Compact"/>
+              <w:jc w:val="left"/>
+            </w:pPr>
+            <w:r>
+              <w:t xml:space="preserve">1.8×10</w:t>
+            </w:r>
+            <w:r>
+              <w:rPr>
+                <w:vertAlign w:val="superscript"/>
+              </w:rPr>
+              <w:t xml:space="preserve">−43</w:t>
+            </w:r>
+          </w:p>
+        </w:tc>
+        <w:tc>
+          <w:tcPr/>
+          <w:p>
+            <w:pPr>
+              <w:pStyle w:val="Compact"/>
+              <w:jc w:val="left"/>
+            </w:pPr>
+            <w:r>
+              <w:t xml:space="preserve">+0.440 [+0.384, +0.492]</w:t>
+            </w:r>
+          </w:p>
+        </w:tc>
+      </w:tr>
+      <w:tr>
+        <w:tc>
+          <w:tcPr/>
+          <w:p>
+            <w:pPr>
+              <w:pStyle w:val="Compact"/>
+              <w:jc w:val="left"/>
+            </w:pPr>
+            <w:r>
+              <w:t xml:space="preserve">Both</w:t>
+            </w:r>
+            <w:r>
+              <w:br/>
+            </w:r>
+            <w:r>
+              <w:t xml:space="preserve">(table alone)</w:t>
+            </w:r>
+          </w:p>
+        </w:tc>
+        <w:tc>
+          <w:tcPr/>
+          <w:p>
+            <w:pPr>
+              <w:pStyle w:val="Compact"/>
+              <w:jc w:val="left"/>
+            </w:pPr>
+            <w:r>
+              <w:t xml:space="preserve">104 = 32.0%</w:t>
+            </w:r>
+          </w:p>
+        </w:tc>
+        <w:tc>
+          <w:tcPr/>
+          <w:p>
+            <w:pPr>
+              <w:pStyle w:val="Compact"/>
+              <w:jc w:val="left"/>
+            </w:pPr>
+            <w:r>
+              <w:t xml:space="preserve">0 = 0.0%</w:t>
+            </w:r>
+          </w:p>
+        </w:tc>
+        <w:tc>
+          <w:tcPr/>
+          <w:p>
+            <w:pPr>
+              <w:pStyle w:val="Compact"/>
+              <w:jc w:val="left"/>
+            </w:pPr>
+            <w:r>
+              <w:t xml:space="preserve">251 = 67.5%</w:t>
+            </w:r>
+          </w:p>
+        </w:tc>
+        <w:tc>
+          <w:tcPr/>
+          <w:p>
+            <w:pPr>
+              <w:pStyle w:val="Compact"/>
+              <w:jc w:val="left"/>
+            </w:pPr>
+            <w:r>
+              <w:t xml:space="preserve">187 / 0</w:t>
+            </w:r>
+          </w:p>
+        </w:tc>
+        <w:tc>
+          <w:tcPr/>
+          <w:p>
+            <w:pPr>
+              <w:pStyle w:val="Compact"/>
+              <w:jc w:val="left"/>
+            </w:pPr>
+            <w:r>
+              <w:t xml:space="preserve">1.0×10</w:t>
+            </w:r>
+            <w:r>
+              <w:rPr>
+                <w:vertAlign w:val="superscript"/>
+              </w:rPr>
+              <w:t xml:space="preserve">−56</w:t>
+            </w:r>
+          </w:p>
+        </w:tc>
+        <w:tc>
+          <w:tcPr/>
+          <w:p>
+            <w:pPr>
+              <w:pStyle w:val="Compact"/>
+              <w:jc w:val="left"/>
+            </w:pPr>
+            <w:r>
+              <w:t xml:space="preserve">+0.575 [+0.518, +0.626]</w:t>
             </w:r>
           </w:p>
         </w:tc>
@@ -10816,7 +11319,16 @@
         <w:pStyle w:val="BodyText"/>
       </w:pPr>
       <w:r>
-        <w:t xml:space="preserve">This is a single, targeted comparison rather than a member of the four-test family in Table 3.4, since it answers a different question — how much of the result is composition, not whether the analysis beats a list — so no Holm correction is applied; at a single comparison the exact p-value already controls the family-wise error rate.  The gap concentrates where the design predicts it should: commands whose real target is hidden behind a wrapper argument or is not known until the command runs are exactly the cases composition exists to resolve, and the table-only configuration can do no better on them than an unknown command does, while commands whose effects are visible without composition — a literal path, a redirect, a chain joined by</w:t>
+        <w:t xml:space="preserve">These comparisons answer a different question from the four-test family in Table 3.4 — how much of the result each part of the algorithm contributes, not whether the analysis beats a list — and are treated as a family of their own; with a Holm correction across the three, each p-value remains below 10</w:t>
+      </w:r>
+      <w:r>
+        <w:rPr>
+          <w:vertAlign w:val="superscript"/>
+        </w:rPr>
+        <w:t xml:space="preserve">−42</w:t>
+      </w:r>
+      <w:r>
+        <w:t xml:space="preserve">.  On silent loss there are no discordant pairs in any comparison.  The gap concentrates where the design predicts it should: commands whose real target is hidden behind a wrapper argument or is not known until the command runs are exactly the cases composition and resolution exist for, while commands whose effects are visible without them — a literal path, a redirect, a chain joined by</w:t>
       </w:r>
       <w:r>
         <w:t xml:space="preserve"> </w:t>
@@ -10832,7 +11344,7 @@
         <w:t xml:space="preserve"> </w:t>
       </w:r>
       <w:r>
-        <w:t xml:space="preserve">— cost the table-only configuration little or nothing, because the table already covers them.  The reported result in sections (f) and (g) above is therefore attributable to composition specifically and not to the table it is sometimes mistaken for.</w:t>
+        <w:t xml:space="preserve">— cost the ablated configurations little or nothing, because the table already covers them.  The reported result in sections (f) and (g) above is therefore attributable to composition and resolution together, and not to the table they are sometimes mistaken for.</w:t>
       </w:r>
     </w:p>
     <w:bookmarkEnd w:id="103"/>
@@ -10851,7 +11363,7 @@
         <w:pStyle w:val="FirstParagraph"/>
       </w:pPr>
       <w:r>
-        <w:t xml:space="preserve">The system is evaluated against two datasets: the OSWorld benchmark task suite [41] for direct comparison with results in the existing literature, and the custom cross-platform task suite described in Sections 1.1 and 1.5.  The user study evaluation involves 40 participants (20 novice, 20 power users); the baseline condition is each participant’s primary operating system — Windows 11, macOS, or Linux with GNOME desktop — on a dedicated baseline machine.</w:t>
+        <w:t xml:space="preserve">The validation study exercises the platform on two task datasets: the OSWorld benchmark task suite [41] for direct comparison with results in the existing literature, and the custom cross-platform task suite described in Sections 1.1 and 1.5.  The user study evaluation involves 40 participants (20 novice, 20 power users); the baseline condition is each participant’s primary operating system — Windows 11, macOS, or Linux with GNOME desktop — on a dedicated baseline machine.</w:t>
       </w:r>
     </w:p>
     <w:bookmarkEnd w:id="105"/>
@@ -10933,7 +11445,7 @@
       </w:r>
     </w:p>
     <w:bookmarkEnd w:id="106"/>
-    <w:bookmarkStart w:id="111" w:name="ch3-sec3-4"/>
+    <w:bookmarkStart w:id="112" w:name="ch3-sec3-4"/>
     <w:p>
       <w:pPr>
         <w:pStyle w:val="Heading3"/>
@@ -10947,7 +11459,7 @@
         <w:pStyle w:val="FirstParagraph"/>
       </w:pPr>
       <w:r>
-        <w:t xml:space="preserve">The following metrics and formulas are used to evaluate SynapseOS against the baseline:</w:t>
+        <w:t xml:space="preserve">The following metrics and formulas are used in the validation study.  Items (a) to (d) characterize the platform against each participant’s baseline; item (e) validates the analysis in use.</w:t>
       </w:r>
     </w:p>
     <w:bookmarkStart w:id="107" w:name="a-task-completion-time"/>
@@ -11016,7 +11528,7 @@
         <w:pStyle w:val="FirstParagraph"/>
       </w:pPr>
       <w:r>
-        <w:t xml:space="preserve">SUS scores are computed per the standard scoring procedure [3] to produce a score on a 0–100 scale; a score above 68 is conventionally treated as above-average usability, a benchmark drawn from scores across a large sample of studies [31].  NASA-TLX scores are computed as the unweighted mean of the six subscale ratings [11] to produce a composite workload score per participant per condition.  Because the central claim of this study concerns access rather than speed, workload and task success are treated as primary outcomes alongside completion time, not as secondary measures.</w:t>
+        <w:t xml:space="preserve">SUS scores are computed per the standard scoring procedure [3] to produce a score on a 0–100 scale; a score above 68 is conventionally treated as above-average usability, a benchmark drawn from scores across a large sample of studies [31].  NASA-TLX scores are computed as the unweighted mean of the six subscale ratings [11] to produce a composite workload score per participant per condition.  Because a conversational interface is meant to widen access rather than only to save time, workload and task success are weighted alongside completion time among the platform measures, not treated as secondary to it.</w:t>
       </w:r>
     </w:p>
     <w:p>
@@ -11116,18 +11628,17 @@
         <w:t xml:space="preserve"> </w:t>
       </w:r>
       <w:r>
-        <w:t xml:space="preserve">= 0.66 or larger.  The condition × group interaction — the test corresponding most directly to the study’s central claim — remains the least-powered comparison in the design, since an interaction of a given size requires substantially more participants than a main effect of the same size; it is therefore reported with effect sizes and confidence intervals as the primary descriptive finding, and is not treated as a confirmatory significance test.</w:t>
+        <w:t xml:space="preserve">= 0.66 or larger.  The condition × group interaction — the test corresponding most directly to the platform’s intended benefit — remains the least-powered comparison in the design, since an interaction of a given size requires substantially more participants than a main effect of the same size; it is therefore reported with effect sizes and confidence intervals as the primary descriptive finding, and is not treated as a confirmatory significance test.</w:t>
       </w:r>
     </w:p>
     <w:bookmarkEnd w:id="110"/>
-    <w:bookmarkEnd w:id="111"/>
-    <w:bookmarkStart w:id="112" w:name="ch3-sec3-5"/>
-    <w:p>
-      <w:pPr>
-        <w:pStyle w:val="Heading3"/>
-      </w:pPr>
-      <w:r>
-        <w:t xml:space="preserve">3.5 Data analysis plan</w:t>
+    <w:bookmarkStart w:id="111" w:name="e-analysis-decisions-in-use"/>
+    <w:p>
+      <w:pPr>
+        <w:pStyle w:val="Heading4"/>
+      </w:pPr>
+      <w:r>
+        <w:t xml:space="preserve">e) Analysis Decisions in Use</w:t>
       </w:r>
     </w:p>
     <w:p>
@@ -11135,7 +11646,7 @@
         <w:pStyle w:val="FirstParagraph"/>
       </w:pPr>
       <w:r>
-        <w:t xml:space="preserve">Quantitative analysis proceeds in three stages.  First, descriptive statistics — means, standard deviations, and 95% confidence intervals — are computed for all primary metrics (task completion time, error rate, SUS score, NASA-TLX score) per condition and per participant group.  Second, the Shapiro-Wilk test is applied to assess normality of each distribution before selecting the appropriate inferential test: the paired-samples t-test for normally distributed data, or the Wilcoxon signed-rank test for non-normally distributed data.  Third, effect size is computed for all primary comparisons regardless of statistical significance: Cohen’s</w:t>
+        <w:t xml:space="preserve">Every command executed during the SynapseOS condition is logged with the analysis’s verdict and capture plan and the task fixture it ran against (Section 1.1(c)), replayed on a copy of that fixture in the sandbox, and labeled exactly as the corpus is (Section 3.1(b)).  It is then scored with the corpus measures:</w:t>
       </w:r>
       <w:r>
         <w:t xml:space="preserve"> </w:t>
@@ -11145,6 +11656,64 @@
           <w:i/>
           <w:iCs/>
         </w:rPr>
+        <w:t xml:space="preserve">silent loss in use</w:t>
+      </w:r>
+      <w:r>
+        <w:t xml:space="preserve">, the proportion of data-losing commands that ran without confirmation and without a capture;</w:t>
+      </w:r>
+      <w:r>
+        <w:t xml:space="preserve"> </w:t>
+      </w:r>
+      <w:r>
+        <w:rPr>
+          <w:i/>
+          <w:iCs/>
+        </w:rPr>
+        <w:t xml:space="preserve">restoration in use</w:t>
+      </w:r>
+      <w:r>
+        <w:t xml:space="preserve">, the proportion of data-losing commands whose capture, applied by undo, restored the fixture exactly; and</w:t>
+      </w:r>
+      <w:r>
+        <w:t xml:space="preserve"> </w:t>
+      </w:r>
+      <w:r>
+        <w:rPr>
+          <w:i/>
+          <w:iCs/>
+        </w:rPr>
+        <w:t xml:space="preserve">needless confirmation in use</w:t>
+      </w:r>
+      <w:r>
+        <w:t xml:space="preserve">, the proportion of commands that lose nothing on which the participant was nonetheless asked.  Each undo a participant invokes is also checked against the state before the command it reverts.  These are the measures by which the platform validates the analysis: a silent loss here would be a failure of the analysis on a command people actually cause, which the corpus could not reveal.</w:t>
+      </w:r>
+    </w:p>
+    <w:bookmarkEnd w:id="111"/>
+    <w:bookmarkEnd w:id="112"/>
+    <w:bookmarkStart w:id="113" w:name="ch3-sec3-5"/>
+    <w:p>
+      <w:pPr>
+        <w:pStyle w:val="Heading3"/>
+      </w:pPr>
+      <w:r>
+        <w:t xml:space="preserve">3.5 Data analysis plan</w:t>
+      </w:r>
+    </w:p>
+    <w:p>
+      <w:pPr>
+        <w:pStyle w:val="FirstParagraph"/>
+      </w:pPr>
+      <w:r>
+        <w:t xml:space="preserve">The analysis-in-use measures of Section 3.4(e) are reported descriptively, as proportions with Wilson 95% intervals over the commands executed, and set beside the corpus results of Section 3.1; they are not tested for significance, because the number and kind of commands participants cause cannot be fixed in advance.  Quantitative analysis of the platform measures proceeds in three stages.  First, descriptive statistics — means, standard deviations, and 95% confidence intervals — are computed for all primary metrics (task completion time, error rate, SUS score, NASA-TLX score) per condition and per participant group.  Second, the Shapiro-Wilk test is applied to assess normality of each distribution before selecting the appropriate inferential test: the paired-samples t-test for normally distributed data, or the Wilcoxon signed-rank test for non-normally distributed data.  Third, effect size is computed for all primary comparisons regardless of statistical significance: Cohen’s</w:t>
+      </w:r>
+      <w:r>
+        <w:t xml:space="preserve"> </w:t>
+      </w:r>
+      <w:r>
+        <w:rPr>
+          <w:i/>
+          <w:iCs/>
+        </w:rPr>
         <w:t xml:space="preserve">d</w:t>
       </w:r>
       <w:r>
@@ -11170,8 +11739,8 @@
         <w:t xml:space="preserve">Qualitative data from post-study interviews is analyzed using reflexive thematic analysis following the six-phase procedure described by Braun and Clarke [2]: familiarization with the data, initial code generation, theme search, theme review, theme definition, and write-up.  In keeping with the reflexive approach, which treats the analyst’s interpretation as part of the method and does not compute inter-rater agreement, one member of the research team develops the codes and themes; the codebook and the excerpts that support each theme are retained so that the analysis can be audited.  Themes are reported alongside representative participant quotations.</w:t>
       </w:r>
     </w:p>
-    <w:bookmarkEnd w:id="112"/>
-    <w:bookmarkStart w:id="113" w:name="ch3-sec3-6"/>
+    <w:bookmarkEnd w:id="113"/>
+    <w:bookmarkStart w:id="114" w:name="ch3-sec3-6"/>
     <w:p>
       <w:pPr>
         <w:pStyle w:val="Heading3"/>
@@ -11393,7 +11962,7 @@
         <w:t xml:space="preserve"> </w:t>
       </w:r>
       <w:r>
-        <w:t xml:space="preserve">the undo command reverts the most recent entry in the undo log, even one recorded in another directory or an earlier session.  The manual verification (Section 2.3) showed that after a task whose only destructive step was declined, undo proposed reverting an unrelated earlier change.  Undo previews what it will revert and requires confirmation, but a participant who confirms without reading the preview could revert the wrong change, which would confound the undo measures that bear on RQ3. </w:t>
+        <w:t xml:space="preserve">the undo command reverts the most recent entry in the undo log, even one recorded in another directory or an earlier session.  The manual verification (Section 2.3) showed that after a task whose only destructive step was declined, undo proposed reverting an unrelated earlier change.  Undo previews what it will revert and requires confirmation, but a participant who confirms without reading the preview could revert the wrong change, which would confound the undo measures the validation study reports. </w:t>
       </w:r>
       <w:r>
         <w:t xml:space="preserve"> </w:t>
@@ -11490,9 +12059,9 @@
         <w:t xml:space="preserve">SynapseOS is evaluated on a single hardware and software configuration — a dedicated machine running SynapseOS in GUI mode (XFCE desktop environment, X11 session) on a Debian 13 (Trixie) base.  Performance characteristics on different hardware, display configurations, or Linux distributions may differ from the reported results.</w:t>
       </w:r>
     </w:p>
-    <w:bookmarkEnd w:id="113"/>
     <w:bookmarkEnd w:id="114"/>
-    <w:bookmarkStart w:id="123" w:name="ch3-notes"/>
+    <w:bookmarkEnd w:id="115"/>
+    <w:bookmarkStart w:id="124" w:name="ch3-notes"/>
     <w:p>
       <w:pPr>
         <w:pStyle w:val="Heading2"/>
@@ -11509,11 +12078,11 @@
           <w:numId w:val="1019"/>
         </w:numPr>
       </w:pPr>
-      <w:bookmarkStart w:id="115" w:name="ch3-fn1"/>
+      <w:bookmarkStart w:id="116" w:name="ch3-fn1"/>
       <w:r>
         <w:t xml:space="preserve">Command-Line Interface mode: a single non-interactive invocation, with no session persisting between separate calls, that runs a bounded multi-step loop toward one natural-language request — each step proposed, classified for reversibility, executed (immediately if reversible, after confirmation if not) through the same gate as the other interface modes, and its result fed back so the model can propose the next step or signal completion — up to a fixed step limit, before the invocation exits.  Distinct from TUI mode’s persistent interactive chat session; intended for scripting, automation, and one-off remote commands.</w:t>
       </w:r>
-      <w:bookmarkEnd w:id="115"/>
+      <w:bookmarkEnd w:id="116"/>
     </w:p>
     <w:p>
       <w:pPr>
@@ -11523,11 +12092,11 @@
           <w:numId w:val="1019"/>
         </w:numPr>
       </w:pPr>
-      <w:bookmarkStart w:id="116" w:name="ch3-fn2"/>
+      <w:bookmarkStart w:id="117" w:name="ch3-fn2"/>
       <w:r>
         <w:t xml:space="preserve">Terminal User Interface: a text-based interactive interface that runs in a command-line terminal.  TUI mode requires no graphical display server or desktop environment and can be accessed remotely over SSH.</w:t>
       </w:r>
-      <w:bookmarkEnd w:id="116"/>
+      <w:bookmarkEnd w:id="117"/>
     </w:p>
     <w:p>
       <w:pPr>
@@ -11537,11 +12106,11 @@
           <w:numId w:val="1019"/>
         </w:numPr>
       </w:pPr>
-      <w:bookmarkStart w:id="117" w:name="ch3-fn3"/>
+      <w:bookmarkStart w:id="118" w:name="ch3-fn3"/>
       <w:r>
         <w:t xml:space="preserve">The SynapseOS prototype uses Qwen2.5-Coder-3B-Instruct, a code-specialized open-weights model selected for its NL2Bash accuracy.  See Section 2.1a for selection rationale and benchmark evidence.</w:t>
       </w:r>
-      <w:bookmarkEnd w:id="117"/>
+      <w:bookmarkEnd w:id="118"/>
     </w:p>
     <w:p>
       <w:pPr>
@@ -11551,11 +12120,11 @@
           <w:numId w:val="1019"/>
         </w:numPr>
       </w:pPr>
-      <w:bookmarkStart w:id="118" w:name="ch3-fn4"/>
+      <w:bookmarkStart w:id="119" w:name="ch3-fn4"/>
       <w:r>
         <w:t xml:space="preserve">An inference server loads a language model into memory and processes query requests from the application layer.  Ollama is an open-source tool for running language models locally on consumer hardware without cloud connectivity.</w:t>
       </w:r>
-      <w:bookmarkEnd w:id="118"/>
+      <w:bookmarkEnd w:id="119"/>
     </w:p>
     <w:p>
       <w:pPr>
@@ -11565,11 +12134,11 @@
           <w:numId w:val="1019"/>
         </w:numPr>
       </w:pPr>
-      <w:bookmarkStart w:id="119" w:name="ch3-fn5"/>
+      <w:bookmarkStart w:id="120" w:name="ch3-fn5"/>
       <w:r>
         <w:t xml:space="preserve">Open-weights models make their trained parameters publicly available for local download and use; users run inference on their own hardware without routing queries to an external service provider.</w:t>
       </w:r>
-      <w:bookmarkEnd w:id="119"/>
+      <w:bookmarkEnd w:id="120"/>
     </w:p>
     <w:p>
       <w:pPr>
@@ -11579,11 +12148,11 @@
           <w:numId w:val="1019"/>
         </w:numPr>
       </w:pPr>
-      <w:bookmarkStart w:id="120" w:name="ch3-fn6"/>
+      <w:bookmarkStart w:id="121" w:name="ch3-fn6"/>
       <w:r>
         <w:t xml:space="preserve">Quantization reduces the numerical precision of model weights to lower memory requirements.  At 4-bit precision, a model that would otherwise require dedicated GPU memory can run on a standard CPU with modest RAM.</w:t>
       </w:r>
-      <w:bookmarkEnd w:id="120"/>
+      <w:bookmarkEnd w:id="121"/>
     </w:p>
     <w:p>
       <w:pPr>
@@ -11593,11 +12162,11 @@
           <w:numId w:val="1019"/>
         </w:numPr>
       </w:pPr>
-      <w:bookmarkStart w:id="121" w:name="ch3-fn7"/>
+      <w:bookmarkStart w:id="122" w:name="ch3-fn7"/>
       <w:r>
         <w:t xml:space="preserve">Low-Rank Adaptation (LoRA) is a parameter-efficient fine-tuning method that introduces a small number of trainable weight matrices while keeping the base model frozen, enabling task-specific adaptation on consumer hardware without full retraining.</w:t>
       </w:r>
-      <w:bookmarkEnd w:id="121"/>
+      <w:bookmarkEnd w:id="122"/>
     </w:p>
     <w:p>
       <w:pPr>
@@ -11607,14 +12176,14 @@
           <w:numId w:val="1019"/>
         </w:numPr>
       </w:pPr>
-      <w:bookmarkStart w:id="122" w:name="ch3-fn8"/>
+      <w:bookmarkStart w:id="123" w:name="ch3-fn8"/>
       <w:r>
         <w:t xml:space="preserve">NL2Bash is a benchmark dataset pairing natural language command descriptions with their corresponding bash shell commands, used to evaluate a model’s accuracy in translating natural language into executable commands.</w:t>
       </w:r>
-      <w:bookmarkEnd w:id="122"/>
-    </w:p>
-    <w:bookmarkEnd w:id="123"/>
-    <w:bookmarkStart w:id="124" w:name="sec-master-references"/>
+      <w:bookmarkEnd w:id="123"/>
+    </w:p>
+    <w:bookmarkEnd w:id="124"/>
+    <w:bookmarkStart w:id="125" w:name="sec-master-references"/>
     <w:p>
       <w:pPr>
         <w:pStyle w:val="FirstParagraph"/>
@@ -11623,7 +12192,7 @@
         <w:t xml:space="preserve">REFERENCES</w:t>
       </w:r>
     </w:p>
-    <w:bookmarkEnd w:id="124"/>
+    <w:bookmarkEnd w:id="125"/>
     <w:p>
       <w:pPr>
         <w:pStyle w:val="BodyText"/>
@@ -12647,7 +13216,7 @@
         <w:t xml:space="preserve">X. Zhou, S. Zhang, Y. Zhao, J. Wei, T. Song, A. Cohan, and C. Zhao. 2026. GUI vs. CLI: Execution Bottlenecks in Screen-Only and Skill-Mediated Computer-Use Agents. arXiv:2606.24551</w:t>
       </w:r>
     </w:p>
-    <w:bookmarkStart w:id="132" w:name="sec-appendices"/>
+    <w:bookmarkStart w:id="133" w:name="sec-appendices"/>
     <w:p>
       <w:pPr>
         <w:pStyle w:val="Heading2"/>
@@ -12664,7 +13233,7 @@
         <w:t xml:space="preserve">This section contains the study instruments administered to participants and the procedure governing their administration.  Wording, difficulty calibration, and task-form equivalence are validated during the pilot study described in Section 2.3 and revised before the main study begins; the instruments are reproduced here in the form submitted for ethics review.</w:t>
       </w:r>
     </w:p>
-    <w:bookmarkStart w:id="125" w:name="appendix-a"/>
+    <w:bookmarkStart w:id="126" w:name="appendix-a"/>
     <w:p>
       <w:pPr>
         <w:pStyle w:val="BodyText"/>
@@ -12681,7 +13250,7 @@
         <w:t xml:space="preserve">System Usability Scale (SUS)</w:t>
       </w:r>
     </w:p>
-    <w:bookmarkEnd w:id="125"/>
+    <w:bookmarkEnd w:id="126"/>
     <w:p>
       <w:pPr>
         <w:pStyle w:val="BodyText"/>
@@ -13724,7 +14293,7 @@
         <w:t xml:space="preserve">For odd-numbered items, subtract 1 from the response.  For even-numbered items, subtract the response from 5.  Sum the ten adjusted scores and multiply by 2.5, giving a value from 0 to 100.  This value is not a percentage; interpretation follows Sauro and Lewis [31].</w:t>
       </w:r>
     </w:p>
-    <w:bookmarkStart w:id="126" w:name="appendix-b"/>
+    <w:bookmarkStart w:id="127" w:name="appendix-b"/>
     <w:p>
       <w:pPr>
         <w:pStyle w:val="BodyText"/>
@@ -13741,7 +14310,7 @@
         <w:t xml:space="preserve">NASA Task Load Index (NASA-TLX)</w:t>
       </w:r>
     </w:p>
-    <w:bookmarkEnd w:id="126"/>
+    <w:bookmarkEnd w:id="127"/>
     <w:p>
       <w:pPr>
         <w:pStyle w:val="BodyText"/>
@@ -14252,7 +14821,7 @@
         </w:tc>
       </w:tr>
     </w:tbl>
-    <w:bookmarkStart w:id="127" w:name="appendix-c"/>
+    <w:bookmarkStart w:id="128" w:name="appendix-c"/>
     <w:p>
       <w:pPr>
         <w:pStyle w:val="BodyText"/>
@@ -14269,7 +14838,7 @@
         <w:t xml:space="preserve">Custom Cross-Platform Task Suite</w:t>
       </w:r>
     </w:p>
-    <w:bookmarkEnd w:id="127"/>
+    <w:bookmarkEnd w:id="128"/>
     <w:p>
       <w:pPr>
         <w:pStyle w:val="BodyText"/>
@@ -15943,7 +16512,7 @@
         </w:tc>
       </w:tr>
     </w:tbl>
-    <w:bookmarkStart w:id="128" w:name="appendix-d"/>
+    <w:bookmarkStart w:id="129" w:name="appendix-d"/>
     <w:p>
       <w:pPr>
         <w:pStyle w:val="BodyText"/>
@@ -15960,7 +16529,7 @@
         <w:t xml:space="preserve">Pre-Study Screening Questionnaire</w:t>
       </w:r>
     </w:p>
-    <w:bookmarkEnd w:id="128"/>
+    <w:bookmarkEnd w:id="129"/>
     <w:p>
       <w:pPr>
         <w:pStyle w:val="BodyText"/>
@@ -16517,7 +17086,7 @@
         <w:t xml:space="preserve">□ SynapseOS first   □ Own OS first</w:t>
       </w:r>
     </w:p>
-    <w:bookmarkStart w:id="129" w:name="appendix-e"/>
+    <w:bookmarkStart w:id="130" w:name="appendix-e"/>
     <w:p>
       <w:pPr>
         <w:pStyle w:val="BodyText"/>
@@ -16534,7 +17103,7 @@
         <w:t xml:space="preserve">Participant Information Sheet</w:t>
       </w:r>
     </w:p>
-    <w:bookmarkEnd w:id="129"/>
+    <w:bookmarkEnd w:id="130"/>
     <w:p>
       <w:pPr>
         <w:pStyle w:val="BodyText"/>
@@ -16550,7 +17119,7 @@
         <w:t xml:space="preserve"> </w:t>
       </w:r>
       <w:r>
-        <w:t xml:space="preserve">SynapseOS: Recoverability Analysis of Language-Model-Generated Shell Commands in a Conversational Interface Layer</w:t>
+        <w:t xml:space="preserve">Recoverability Analysis of Language-Model-Generated Shell Commands, Deployed in the SynapseOS Conversational Interface</w:t>
       </w:r>
     </w:p>
     <w:p>
@@ -16733,7 +17302,7 @@
         <w:t xml:space="preserve">For questions about the study, contact the research team at [research team contact address].  For concerns about how the study is being conducted, or about your rights as a participant, contact the Institutional Review Board of Mapúa University – Makati at [ethics committee contact address], independently of the research team.</w:t>
       </w:r>
     </w:p>
-    <w:bookmarkStart w:id="130" w:name="appendix-f"/>
+    <w:bookmarkStart w:id="131" w:name="appendix-f"/>
     <w:p>
       <w:pPr>
         <w:pStyle w:val="BodyText"/>
@@ -16750,7 +17319,7 @@
         <w:t xml:space="preserve">Informed Consent Form</w:t>
       </w:r>
     </w:p>
-    <w:bookmarkEnd w:id="130"/>
+    <w:bookmarkEnd w:id="131"/>
     <w:p>
       <w:pPr>
         <w:pStyle w:val="BodyText"/>
@@ -16766,7 +17335,7 @@
         <w:t xml:space="preserve"> </w:t>
       </w:r>
       <w:r>
-        <w:t xml:space="preserve">SynapseOS: Recoverability Analysis of Language-Model-Generated Shell Commands in a Conversational Interface Layer</w:t>
+        <w:t xml:space="preserve">Recoverability Analysis of Language-Model-Generated Shell Commands, Deployed in the SynapseOS Conversational Interface</w:t>
       </w:r>
     </w:p>
     <w:p>
@@ -17165,7 +17734,7 @@
         <w:t xml:space="preserve">Filing note: this is the only study document bearing the participant’s name.  It is stored separately from all study data, and the code-to-name list derived from it is destroyed on the schedule stated in Section 2.5.</w:t>
       </w:r>
     </w:p>
-    <w:bookmarkStart w:id="131" w:name="appendix-g"/>
+    <w:bookmarkStart w:id="132" w:name="appendix-g"/>
     <w:p>
       <w:pPr>
         <w:pStyle w:val="BodyText"/>
@@ -17182,7 +17751,7 @@
         <w:t xml:space="preserve">Session Facilitator Checklist</w:t>
       </w:r>
     </w:p>
-    <w:bookmarkEnd w:id="131"/>
+    <w:bookmarkEnd w:id="132"/>
     <w:p>
       <w:pPr>
         <w:pStyle w:val="BodyText"/>
@@ -17511,7 +18080,7 @@
         <w:t xml:space="preserve">Diarise the participant’s fourteen-day withdrawal deadline.</w:t>
       </w:r>
     </w:p>
-    <w:bookmarkEnd w:id="132"/>
+    <w:bookmarkEnd w:id="133"/>
     <w:sectPr/>
   </w:body>
 </w:document>

</xml_diff>

<commit_message>
docs(thesis): organize Chapter 3 by the five objectives
Keeps every heading the course's Methodology template requires and orders the content inside them by objective: the command corpus and its sandbox ground truth become the first dataset (1.1(a), 1.2(a)-(b)); 2.1(a)-(c) specify the effect-semantics model, the effect-composition algorithm, and recovery-plan generation (Objectives 1-3), with the platform in 2.1(d)-(e); 3.1 is the evaluation against baselines (Objective 4) and 3.2 the ablation studies (Objective 5); the validation study follows as 3.3-3.7. No result or paragraph is removed; cross-references are updated throughout.
</commit_message>
<xml_diff>
--- a/thesis 1/consolidated/SynapseOS_Proposal_Chapters_1_to_3.docx
+++ b/thesis 1/consolidated/SynapseOS_Proposal_Chapters_1_to_3.docx
@@ -449,7 +449,7 @@
         <w:tab/>
       </w:r>
       <w:r>
-        <w:t xml:space="preserve">12</w:t>
+        <w:t xml:space="preserve">13</w:t>
       </w:r>
     </w:p>
     <w:p>
@@ -779,7 +779,7 @@
         <w:tab/>
       </w:r>
       <w:r>
-        <w:t xml:space="preserve">59</w:t>
+        <w:t xml:space="preserve">62</w:t>
       </w:r>
     </w:p>
     <w:p>
@@ -799,7 +799,7 @@
         <w:tab/>
       </w:r>
       <w:r>
-        <w:t xml:space="preserve">74</w:t>
+        <w:t xml:space="preserve">78</w:t>
       </w:r>
     </w:p>
     <w:p>
@@ -819,7 +819,7 @@
         <w:tab/>
       </w:r>
       <w:r>
-        <w:t xml:space="preserve">96</w:t>
+        <w:t xml:space="preserve">97</w:t>
       </w:r>
     </w:p>
     <w:p>
@@ -839,7 +839,7 @@
         <w:tab/>
       </w:r>
       <w:r>
-        <w:t xml:space="preserve">102</w:t>
+        <w:t xml:space="preserve">103</w:t>
       </w:r>
     </w:p>
     <w:bookmarkStart w:id="24" w:name="list-of-tables"/>
@@ -908,7 +908,7 @@
         <w:tab/>
       </w:r>
       <w:r>
-        <w:t xml:space="preserve">47</w:t>
+        <w:t xml:space="preserve">48</w:t>
       </w:r>
     </w:p>
     <w:p>
@@ -948,7 +948,7 @@
         <w:tab/>
       </w:r>
       <w:r>
-        <w:t xml:space="preserve">79</w:t>
+        <w:t xml:space="preserve">80</w:t>
       </w:r>
     </w:p>
     <w:p>
@@ -968,7 +968,7 @@
         <w:tab/>
       </w:r>
       <w:r>
-        <w:t xml:space="preserve">83</w:t>
+        <w:t xml:space="preserve">84</w:t>
       </w:r>
     </w:p>
     <w:p>
@@ -988,7 +988,7 @@
         <w:tab/>
       </w:r>
       <w:r>
-        <w:t xml:space="preserve">87</w:t>
+        <w:t xml:space="preserve">88</w:t>
       </w:r>
     </w:p>
     <w:p>
@@ -1008,7 +1008,7 @@
         <w:tab/>
       </w:r>
       <w:r>
-        <w:t xml:space="preserve">105</w:t>
+        <w:t xml:space="preserve">106</w:t>
       </w:r>
     </w:p>
     <w:p>
@@ -1028,7 +1028,7 @@
         <w:tab/>
       </w:r>
       <w:r>
-        <w:t xml:space="preserve">107</w:t>
+        <w:t xml:space="preserve">108</w:t>
       </w:r>
     </w:p>
     <w:bookmarkEnd w:id="24"/>
@@ -1415,7 +1415,7 @@
         <w:pStyle w:val="FirstParagraph"/>
       </w:pPr>
       <w:r>
-        <w:t xml:space="preserve">A further question is answered by validation rather than posed as a research question: whether the analysis’s decisions hold when it is deployed in a working interface and exercised by people, whose commands the evaluation corpus does not contain (Chapter 3, Section 3.2 onward).</w:t>
+        <w:t xml:space="preserve">A further question is answered by validation rather than posed as a research question: whether the analysis’s decisions hold when it is deployed in a working interface and exercised by people, whose commands the evaluation corpus does not contain (Chapter 3, Section 3.3 onward).</w:t>
       </w:r>
     </w:p>
     <w:bookmarkEnd w:id="30"/>
@@ -1533,7 +1533,7 @@
         <w:pStyle w:val="FirstParagraph"/>
       </w:pPr>
       <w:r>
-        <w:t xml:space="preserve">Each objective is algorithmic and measurable, and each would stand if the interface were removed, because the analysis takes a shell command as a string.  SynapseOS is the means by which the algorithm is deployed, demonstrated, and validated in use, not an objective in itself: the validation study (Chapter 3, Sections 3.2–3.6) measures how the analysis’s decisions hold on commands participants cause, and characterizes the platform through task success, time, error rate, and workload against each participant’s own primary operating system.</w:t>
+        <w:t xml:space="preserve">Each objective is algorithmic and measurable, and each would stand if the interface were removed, because the analysis takes a shell command as a string.  SynapseOS is the means by which the algorithm is deployed, demonstrated, and validated in use, not an objective in itself: the validation study (Chapter 3, Sections 3.3–3.7) measures how the analysis’s decisions hold on commands participants cause, and characterizes the platform through task success, time, error rate, and workload against each participant’s own primary operating system.</w:t>
       </w:r>
     </w:p>
     <w:bookmarkEnd w:id="31"/>
@@ -2028,7 +2028,7 @@
         <w:t xml:space="preserve"> </w:t>
       </w:r>
       <w:r>
-        <w:t xml:space="preserve">names nothing until it executes — which is what an enumerated pattern list cannot express.  Soundness is deliberately one-sided: anything the analysis cannot resolve is treated as unrecoverable, because over-approximating destructiveness costs a confirmation prompt whereas under-approximating it destroys data.  The analysis is not free of lists: it rests on a table of what each known command does, and a command absent from that table is unknown and asks.  Its claim is what it adds on top of a table, not that it has none.  That claim is measured directly in Section 3.1(h), by ablations that leave the same per-command table in place.  Disabling composition — seeing through wrappers,</w:t>
+        <w:t xml:space="preserve">names nothing until it executes — which is what an enumerated pattern list cannot express.  Soundness is deliberately one-sided: anything the analysis cannot resolve is treated as unrecoverable, because over-approximating destructiveness costs a confirmation prompt whereas under-approximating it destroys data.  The analysis is not free of lists: it rests on a table of what each known command does, and a command absent from that table is unknown and asks.  Its claim is what it adds on top of a table, not that it has none.  That claim is measured directly in Chapter 3, Section 3.2, by ablations that leave the same per-command table in place.  Disabling composition — seeing through wrappers,</w:t>
       </w:r>
       <w:r>
         <w:t xml:space="preserve"> </w:t>
@@ -2193,7 +2193,7 @@
         <w:t xml:space="preserve"> </w:t>
       </w:r>
       <w:r>
-        <w:t xml:space="preserve">Coding assistants and other agents that execute generated commands guard them with lists of dangerous patterns, which the evaluation in Section 3.1(c) of Chapter 3 shows let most file-destroying commands in its corpus run without confirmation.  The recoverability analysis is independent of the interface and of the language model, and can be placed in front of any system that executes generated shell commands.</w:t>
+        <w:t xml:space="preserve">Coding assistants and other agents that execute generated commands guard them with lists of dangerous patterns, which the evaluation in Section 3.1(a) of Chapter 3 shows let most file-destroying commands in its corpus run without confirmation.  The recoverability analysis is independent of the interface and of the language model, and can be placed in front of any system that executes generated shell commands.</w:t>
       </w:r>
     </w:p>
     <w:p>
@@ -2541,7 +2541,7 @@
               <a:graphicData uri="http://schemas.openxmlformats.org/drawingml/2006/picture">
                 <pic:pic>
                   <pic:nvPicPr>
-                    <pic:cNvPr descr="/tmp/claude-1000/-home-willard-projects-thesis/cb82e7af-8c35-489a-a7f7-ef49172efea2/scratchpad/docx/work2/fig0.png" id="45" name="Picture"/>
+                    <pic:cNvPr descr="/tmp/claude-1000/-home-willard-projects-thesis/cb82e7af-8c35-489a-a7f7-ef49172efea2/scratchpad/docx/work3/fig0.png" id="45" name="Picture"/>
                     <pic:cNvPicPr>
                       <a:picLocks noChangeArrowheads="1" noChangeAspect="1"/>
                     </pic:cNvPicPr>
@@ -2894,7 +2894,7 @@
         <w:pStyle w:val="BodyText"/>
       </w:pPr>
       <w:r>
-        <w:t xml:space="preserve">The technique this recoverability judgment relies on — determining what a piece of code will do without executing it — is not new; it has a decades-long history in programming-language theory under two related names, neither of which the systems surveyed above draw on.  Abstract interpretation, introduced by Cousot and Cousot [5], is the foundational technique for computing sound, conservative approximations of a program’s runtime behavior by evaluating it over an abstract domain rather than its concrete one.  Type-and-effect systems, developed by Jouvelot and Gifford [16] and given a full formal treatment by Talpin and Jouvelot [35], extend a program’s type judgment with an explicit account of the side effects an expression may produce, so that a compiler or static checker can reason about those effects instead of leaving them implicit in execution.  The recoverability algorithm this study contributes (Chapter 3, Section 2.1(c)) is an instance of this discipline applied to a domain neither tradition has targeted: a generated shell command is treated as an expression whose effect — on the filesystem, rather than on a type system’s abstract state — is derived from its syntax and composed across its operators, and it is that effect set, not the command’s name, that the recoverability verdict is computed over.  This connects the algorithm to an established formal lineage rather than presenting it as a bespoke heuristic, and it grounds the algorithm’s one-sided soundness property — over-approximating destructiveness under uncertainty rather than under-approximating it — in the same requirement abstract interpretation itself imposes: a sound abstraction may lose precision, but it may never assert a property the concrete execution does not actually have.</w:t>
+        <w:t xml:space="preserve">The technique this recoverability judgment relies on — determining what a piece of code will do without executing it — is not new; it has a decades-long history in programming-language theory under two related names, neither of which the systems surveyed above draw on.  Abstract interpretation, introduced by Cousot and Cousot [5], is the foundational technique for computing sound, conservative approximations of a program’s runtime behavior by evaluating it over an abstract domain rather than its concrete one.  Type-and-effect systems, developed by Jouvelot and Gifford [16] and given a full formal treatment by Talpin and Jouvelot [35], extend a program’s type judgment with an explicit account of the side effects an expression may produce, so that a compiler or static checker can reason about those effects instead of leaving them implicit in execution.  The recoverability algorithm this study contributes (Chapter 3, Section 2.1(a)–(c)) is an instance of this discipline applied to a domain neither tradition has targeted: a generated shell command is treated as an expression whose effect — on the filesystem, rather than on a type system’s abstract state — is derived from its syntax and composed across its operators, and it is that effect set, not the command’s name, that the recoverability verdict is computed over.  This connects the algorithm to an established formal lineage rather than presenting it as a bespoke heuristic, and it grounds the algorithm’s one-sided soundness property — over-approximating destructiveness under uncertainty rather than under-approximating it — in the same requirement abstract interpretation itself imposes: a sound abstraction may lose precision, but it may never assert a property the concrete execution does not actually have.</w:t>
       </w:r>
     </w:p>
     <w:p>
@@ -5316,15 +5316,15 @@
         <w:t xml:space="preserve">RQ5</w:t>
       </w:r>
       <w:r>
-        <w:t xml:space="preserve">, how much composition and runtime-target resolution each contribute beyond the per-command rule table.  RQ1 is answered by the effect model specified in Section 2.1(c); RQ2 through RQ5 by the corpus evaluation in Section 3.1.</w:t>
-      </w:r>
-    </w:p>
-    <w:p>
-      <w:pPr>
-        <w:pStyle w:val="BodyText"/>
-      </w:pPr>
-      <w:r>
-        <w:t xml:space="preserve">Two evaluations follow, of different standing.  The corpus evaluation in Section 3.1 is the study’s primary evidence: it answers the research questions against a labeled corpus whose ground truth comes from sandboxed execution, without reference to any participant.  The validation study, defined in Section 1 and Sections 3.2 onward and run on the platform described in Section 2, deploys the analysis in SynapseOS and has participants use it on matched tasks.  It checks that the analysis’s decisions carry through to real files and hold on commands people cause, which the corpus does not contain, and it characterizes the platform through usability measures.  Neither evaluation depends on the other: the analysis takes a shell command as a string and is indifferent to what produced it, so removing the interface would remove the validation study but leave every research question, its corpus, its baselines, and its results intact.</w:t>
+        <w:t xml:space="preserve">, how much composition and runtime-target resolution each contribute beyond the per-command rule table.  RQ1 is answered by the effect model specified in Section 2.1(a), with the algorithm and the plan it supports specified in (b) and (c); RQ2 through RQ4 are answered by the evaluation against baselines in Section 3.1, and RQ5 by the ablations in Section 3.2.</w:t>
+      </w:r>
+    </w:p>
+    <w:p>
+      <w:pPr>
+        <w:pStyle w:val="BodyText"/>
+      </w:pPr>
+      <w:r>
+        <w:t xml:space="preserve">Two evaluations follow, of different standing.  The corpus evaluation in Sections 3.1 and 3.2 is the study’s primary evidence: it answers the research questions against a labeled corpus whose ground truth comes from sandboxed execution, without reference to any participant.  The validation study, defined in Section 1 and Sections 3.3 onward and run on the platform described in Section 2, deploys the analysis in SynapseOS and has participants use it on matched tasks.  It checks that the analysis’s decisions carry through to real files and hold on commands people cause, which the corpus does not contain, and it characterizes the platform through usability measures.  Neither evaluation depends on the other: the analysis takes a shell command as a string and is indifferent to what produced it, so removing the interface would remove the validation study but leave every research question, its corpus, its baselines, and its results intact.</w:t>
       </w:r>
     </w:p>
     <w:bookmarkStart w:id="74" w:name="sec-conceptual-framework"/>
@@ -5341,7 +5341,7 @@
         <w:pStyle w:val="FirstParagraph"/>
       </w:pPr>
       <w:r>
-        <w:t xml:space="preserve">SynapseOS operates as a conversational shell layer positioned between the user and the Linux command-line environment.  The user issues natural language commands through a persistent chat interface.  An intent parsing pipeline — powered by a locally-hosted small language model — translates each utterance into a shell command, which is executed in a bash subprocess.  Output is captured and rendered back in the conversational interface.  The user issues intent in natural language and receives results in natural language.  The generated shell command is nonetheless displayed rather than hidden: the confirmation gate requires the user to approve irreversible operations, and an approval given without sight of what is being approved is not consent.  Visibility also makes the system’s translation of intent observable to the participant, which is what allows a user to notice a misinterpretation before it executes rather than after.  Between translation and execution sits the recoverability analyzer, which is where this study’s algorithmic contribution operates: before a command is dispatched, its effects are derived from its syntactic structure, a verdict is computed over them, and where the command is recoverable only with prior capture, the pre-images that make it so are captured first.  The confirmation gate consumes that verdict rather than a pattern match.  The analyzer is specified in Section 2.1(c) of this chapter and evaluated in Section 3.1, independently of the user study.  This architecture is illustrated in Figure 3.1.</w:t>
+        <w:t xml:space="preserve">SynapseOS operates as a conversational shell layer positioned between the user and the Linux command-line environment.  The user issues natural language commands through a persistent chat interface.  An intent parsing pipeline — powered by a locally-hosted small language model — translates each utterance into a shell command, which is executed in a bash subprocess.  Output is captured and rendered back in the conversational interface.  The user issues intent in natural language and receives results in natural language.  The generated shell command is nonetheless displayed rather than hidden: the confirmation gate requires the user to approve irreversible operations, and an approval given without sight of what is being approved is not consent.  Visibility also makes the system’s translation of intent observable to the participant, which is what allows a user to notice a misinterpretation before it executes rather than after.  Between translation and execution sits the recoverability analyzer, which is where this study’s algorithmic contribution operates: before a command is dispatched, its effects are derived from its syntactic structure, a verdict is computed over them, and where the command is recoverable only with prior capture, the pre-images that make it so are captured first.  The confirmation gate consumes that verdict rather than a pattern match.  The analyzer is specified in Section 2.1(a)–(c) of this chapter and evaluated in Sections 3.1 and 3.2, independently of the user study.  This architecture is illustrated in Figure 3.1.</w:t>
       </w:r>
     </w:p>
     <w:p>
@@ -5366,7 +5366,7 @@
               <a:graphicData uri="http://schemas.openxmlformats.org/drawingml/2006/picture">
                 <pic:pic>
                   <pic:nvPicPr>
-                    <pic:cNvPr descr="/tmp/claude-1000/-home-willard-projects-thesis/cb82e7af-8c35-489a-a7f7-ef49172efea2/scratchpad/docx/work2/fig1.png" id="73" name="Picture"/>
+                    <pic:cNvPr descr="/tmp/claude-1000/-home-willard-projects-thesis/cb82e7af-8c35-489a-a7f7-ef49172efea2/scratchpad/docx/work3/fig1.png" id="73" name="Picture"/>
                     <pic:cNvPicPr>
                       <a:picLocks noChangeArrowheads="1" noChangeAspect="1"/>
                     </pic:cNvPicPr>
@@ -5564,7 +5564,7 @@
               <w:jc w:val="left"/>
             </w:pPr>
             <w:r>
-              <w:t xml:space="preserve">GUI mode; fullscreen conversational interface running within an XFCE (X11 session) desktop environment; based on Debian 13 (Trixie); Ollama + Qwen2.5-Coder-3B-Instruct running locally; a participant-accessible fallback returns to the underlying XFCE session if needed, logged and excluded from the primary analysis (Section 3.6)</w:t>
+              <w:t xml:space="preserve">GUI mode; fullscreen conversational interface running within an XFCE (X11 session) desktop environment; based on Debian 13 (Trixie); Ollama + Qwen2.5-Coder-3B-Instruct running locally; a participant-accessible fallback returns to the underlying XFCE session if needed, logged and excluded from the primary analysis (Section 3.7)</w:t>
             </w:r>
           </w:p>
         </w:tc>
@@ -6031,7 +6031,7 @@
         <w:pStyle w:val="BodyText"/>
       </w:pPr>
       <w:r>
-        <w:t xml:space="preserve">The user study evaluates SynapseOS in GUI mode, which requires a graphical desktop environment and 8 GB RAM.  All three interface modes are deliverables of this study; the study condition, however, depends on GUI mode being complete and stable in advance of participant recruitment.  Because a slipped implementation milestone would otherwise delay the entire evaluation, the study condition is fixed at a defined readiness checkpoint prior to ethics submission: if GUI mode is not feature-complete and stable at that checkpoint, the study is conducted in TUI mode instead, which is functionally equivalent in every respect the research questions address — the same conversational surface, the same execution pipeline, the same confirmation gate and undo journal, differing only in the rendering layer and in requiring no display server.  The mode actually used is reported with the results.  If SynapseOS becomes unresponsive during a task or a participant wishes to stop using it, a fallback returns them to the underlying XFCE session, which continues running beneath the conversational interface throughout Condition A; every fallback invocation is logged, and any task during which it occurs is excluded from the primary completion-time and error-rate comparison rather than counted as a SynapseOS success (Section 3.6).  SynapseOS additionally supports a TUI mode — a terminal-based interface requiring no display server, running on as little as 2 vCPU and 4 GB RAM — designed for server and remote deployment environments accessible over SSH, and a CLI mode</w:t>
+        <w:t xml:space="preserve">The user study evaluates SynapseOS in GUI mode, which requires a graphical desktop environment and 8 GB RAM.  All three interface modes are deliverables of this study; the study condition, however, depends on GUI mode being complete and stable in advance of participant recruitment.  Because a slipped implementation milestone would otherwise delay the entire evaluation, the study condition is fixed at a defined readiness checkpoint prior to ethics submission: if GUI mode is not feature-complete and stable at that checkpoint, the study is conducted in TUI mode instead, which is functionally equivalent in every respect the research questions address — the same conversational surface, the same execution pipeline, the same confirmation gate and undo journal, differing only in the rendering layer and in requiring no display server.  The mode actually used is reported with the results.  If SynapseOS becomes unresponsive during a task or a participant wishes to stop using it, a fallback returns them to the underlying XFCE session, which continues running beneath the conversational interface throughout Condition A; every fallback invocation is logged, and any task during which it occurs is excluded from the primary completion-time and error-rate comparison rather than counted as a SynapseOS success (Section 3.7).  SynapseOS additionally supports a TUI mode — a terminal-based interface requiring no display server, running on as little as 2 vCPU and 4 GB RAM — designed for server and remote deployment environments accessible over SSH, and a CLI mode</w:t>
       </w:r>
       <w:hyperlink w:anchor="ch3-fn1">
         <w:r>
@@ -6046,11 +6046,11 @@
         <w:t xml:space="preserve"> </w:t>
       </w:r>
       <w:r>
-        <w:t xml:space="preserve">— a single non-interactive invocation, with no session persisting between separate calls, that runs a bounded loop toward one natural-language request: propose a command, pass it through the same reversibility-based confirmation gate described in the Execution Pipeline (Section 2.1(b)) — executing immediately if reversible, blocking pending explicit confirmation if not — then feed the result back so the model can propose the next step or signal completion, up to a fixed step limit, before the invocation exits, sharing TUI mode’s minimal hardware footprint but intended for scripting and automation rather than an interactive session.  Neither CLI nor TUI mode is evaluated in the user study.</w:t>
+        <w:t xml:space="preserve">— a single non-interactive invocation, with no session persisting between separate calls, that runs a bounded loop toward one natural-language request: propose a command, pass it through the same reversibility-based confirmation gate described in the Execution Pipeline (Section 2.1(e)) — executing immediately if reversible, blocking pending explicit confirmation if not — then feed the result back so the model can propose the next step or signal completion, up to a fixed step limit, before the invocation exits, sharing TUI mode’s minimal hardware footprint but intended for scripting and automation rather than an interactive session.  Neither CLI nor TUI mode is evaluated in the user study.</w:t>
       </w:r>
     </w:p>
     <w:bookmarkEnd w:id="75"/>
-    <w:bookmarkStart w:id="86" w:name="sec1"/>
+    <w:bookmarkStart w:id="89" w:name="sec1"/>
     <w:p>
       <w:pPr>
         <w:pStyle w:val="Heading2"/>
@@ -6064,10 +6064,10 @@
         <w:pStyle w:val="FirstParagraph"/>
       </w:pPr>
       <w:r>
-        <w:t xml:space="preserve">The study’s primary dataset is a held-out corpus of shell commands on which the analysis is evaluated.  Each command is labeled by executing it in a sandbox on a prepared fixture and comparing the filesystem before and after, so that its ground truth comes from what it actually did rather than from a human judgment.  Its construction, sizing, labeling, and partitions are specified with the evaluation it serves, in Section 3.1(a) and (b), so that the corpus and the measurements made on it can be read together.  The remainder of this section defines the data gathered for the validation study, in three categories: benchmark task data used to exercise the platform in a standardized environment, user study data collected from human participants in a controlled setting, and system performance data, including the analysis’s decision on every command, captured automatically through built-in telemetry during all sessions.</w:t>
-      </w:r>
-    </w:p>
-    <w:bookmarkStart w:id="79" w:name="ch3-sec1-1"/>
+        <w:t xml:space="preserve">The study gathers two kinds of data.  The primary dataset is a held-out corpus of shell commands, each labeled by running it in a sandbox, on which the analysis is evaluated against its baselines and its ablations (Objectives 4 and 5).  The remaining data serve the validation study, in which the analysis is deployed in SynapseOS and exercised by participants, in three categories: benchmark task data used to exercise the platform in a standardized environment, user study data collected from human participants in a controlled setting, and system performance data, including the analysis’s decision on every command, captured automatically through built-in telemetry during all sessions.</w:t>
+      </w:r>
+    </w:p>
+    <w:bookmarkStart w:id="80" w:name="ch3-sec1-1"/>
     <w:p>
       <w:pPr>
         <w:pStyle w:val="Heading3"/>
@@ -6076,13 +6076,13 @@
         <w:t xml:space="preserve">1.1 What to gather</w:t>
       </w:r>
     </w:p>
-    <w:bookmarkStart w:id="76" w:name="a-benchmark-task-suite"/>
+    <w:bookmarkStart w:id="76" w:name="a-command-corpus"/>
     <w:p>
       <w:pPr>
         <w:pStyle w:val="Heading4"/>
       </w:pPr>
       <w:r>
-        <w:t xml:space="preserve">a) Benchmark Task Suite</w:t>
+        <w:t xml:space="preserve">a) Command Corpus</w:t>
       </w:r>
     </w:p>
     <w:p>
@@ -6090,17 +6090,35 @@
         <w:pStyle w:val="FirstParagraph"/>
       </w:pPr>
       <w:r>
+        <w:t xml:space="preserve">The primary dataset is a corpus of shell commands.  Each command is paired with a fixture — the files and directories that exist when it runs — and with a ground-truth label observed by running it on that fixture in a sandbox: whether it loses nothing, loses something a captured pre-image could restore, or acts outside the filesystem.  The corpus is held as four partitions: human-written commands from NL2Bash [19], templates covering each shell composition operator, commands whose effect lies outside the filesystem, and commands the deployed model itself wrote.  For every command, each configuration compared in Section 3 records its decision: whether it would ask, and what it would capture.  The configurations are the analysis, its baselines, and its ablations.  For every command the analysis would let run, the command is also executed, undone, and the tree compared, which records whether the capture restored the prior state.</w:t>
+      </w:r>
+    </w:p>
+    <w:bookmarkEnd w:id="76"/>
+    <w:bookmarkStart w:id="77" w:name="b-benchmark-task-suite"/>
+    <w:p>
+      <w:pPr>
+        <w:pStyle w:val="Heading4"/>
+      </w:pPr>
+      <w:r>
+        <w:t xml:space="preserve">b) Benchmark Task Suite</w:t>
+      </w:r>
+    </w:p>
+    <w:p>
+      <w:pPr>
+        <w:pStyle w:val="FirstParagraph"/>
+      </w:pPr>
+      <w:r>
         <w:t xml:space="preserve">The primary benchmark dataset is the OSWorld task suite [41], which provides standardized real-computer tasks across shell operations, file management, web browsing, and application-level interactions.  OSWorld is the only existing benchmark that evaluates computer-using agents in real operating system environments, making it the most appropriate external standard for SynapseOS evaluation.  Tasks are presented as natural language instructions; agents interact with a real virtual machine environment, and outcomes are evaluated by automated inspection of the resulting system state — whether the goal was actually achieved — rather than by comparing individual actions.  In addition to OSWorld tasks, a custom cross-platform task suite is developed for this study, covering file search and organization, system and process monitoring, application and package management, and text and data processing — each task defined as a human-level goal achievable via SynapseOS natural language commands and via native OS tools on the comparison machine.  Each task in both suites is documented with a description, expected outcome, task category, and difficulty level.</w:t>
       </w:r>
     </w:p>
-    <w:bookmarkEnd w:id="76"/>
-    <w:bookmarkStart w:id="77" w:name="b-user-study-data"/>
+    <w:bookmarkEnd w:id="77"/>
+    <w:bookmarkStart w:id="78" w:name="c-user-study-data"/>
     <w:p>
       <w:pPr>
         <w:pStyle w:val="Heading4"/>
       </w:pPr>
       <w:r>
-        <w:t xml:space="preserve">b) User Study Data</w:t>
+        <w:t xml:space="preserve">c) User Study Data</w:t>
       </w:r>
     </w:p>
     <w:p>
@@ -6199,14 +6217,14 @@
         <w:t xml:space="preserve">responses gathered through a semi-structured post-study interview covering perceived ease of use, trust in the system, and comparison between the two conditions</w:t>
       </w:r>
     </w:p>
-    <w:bookmarkEnd w:id="77"/>
-    <w:bookmarkStart w:id="78" w:name="c-system-performance-data"/>
+    <w:bookmarkEnd w:id="78"/>
+    <w:bookmarkStart w:id="79" w:name="d-system-performance-data"/>
     <w:p>
       <w:pPr>
         <w:pStyle w:val="Heading4"/>
       </w:pPr>
       <w:r>
-        <w:t xml:space="preserve">c) System Performance Data</w:t>
+        <w:t xml:space="preserve">d) System Performance Data</w:t>
       </w:r>
     </w:p>
     <w:p>
@@ -6262,7 +6280,7 @@
         </w:numPr>
       </w:pPr>
       <w:r>
-        <w:t xml:space="preserve">Analysis decisions: for every command executed, the analysis’s verdict and capture plan, whether the participant was asked, and the task fixture it ran against, so that the command can be replayed in the sandbox and scored as the corpus is (Section 3.4(e))</w:t>
+        <w:t xml:space="preserve">Analysis decisions: for every command executed, the analysis’s verdict and capture plan, whether the participant was asked, and the task fixture it ran against, so that the command can be replayed in the sandbox and scored as the corpus is (Section 3.5(e))</w:t>
       </w:r>
     </w:p>
     <w:p>
@@ -6289,9 +6307,9 @@
         <w:t xml:space="preserve">Intent parsing accuracy: whether the system correctly identified the user’s intent on the first attempt</w:t>
       </w:r>
     </w:p>
-    <w:bookmarkEnd w:id="78"/>
     <w:bookmarkEnd w:id="79"/>
-    <w:bookmarkStart w:id="82" w:name="ch3-sec1-2"/>
+    <w:bookmarkEnd w:id="80"/>
+    <w:bookmarkStart w:id="85" w:name="ch3-sec1-2"/>
     <w:p>
       <w:pPr>
         <w:pStyle w:val="Heading3"/>
@@ -6300,13 +6318,13 @@
         <w:t xml:space="preserve">1.2 How to gather</w:t>
       </w:r>
     </w:p>
-    <w:bookmarkStart w:id="80" w:name="a-benchmark-tasks"/>
+    <w:bookmarkStart w:id="81" w:name="a-command-corpus-1"/>
     <w:p>
       <w:pPr>
         <w:pStyle w:val="Heading4"/>
       </w:pPr>
       <w:r>
-        <w:t xml:space="preserve">a) Benchmark Tasks</w:t>
+        <w:t xml:space="preserve">a) Command Corpus</w:t>
       </w:r>
     </w:p>
     <w:p>
@@ -6314,17 +6332,250 @@
         <w:pStyle w:val="FirstParagraph"/>
       </w:pPr>
       <w:r>
-        <w:t xml:space="preserve">SynapseOS is deployed on the Debian 13 (Trixie) environment matching the OSWorld evaluation setup [41].  Each benchmark task is executed through the conversational interface, and results are captured programmatically through the built-in telemetry system.  Each task is supplied to SynapseOS as a natural language instruction, and the resulting system state is compared against the expected outcome defined in the benchmark.  Because SynapseOS gates every command classified irreversible on explicit confirmation, benchmark runs are facilitator-attended rather than unattended; the confirmation gate remains active throughout and every confirmation is logged as part of the run record.  OSWorld scores the resulting system state rather than a human operator’s performance, so it applies only to the SynapseOS condition.  Condition B, which a human participant operates directly, has no equivalent and is instead evaluated through the custom cross-platform task suite administered in the user study (Section 1.2(b)).</w:t>
-      </w:r>
-    </w:p>
-    <w:bookmarkEnd w:id="80"/>
-    <w:bookmarkStart w:id="81" w:name="b-user-study"/>
+        <w:t xml:space="preserve">The corpus is generated by a program, not assembled by hand, and is held as four partitions reported separately rather than pooled.  The first is NL2Bash [19], which supplies human-written commands and is the generalization set: candidates are drawn at random from the dataset with a recorded seed, excluding any command used during development.  The second is a set of parameterized command templates covering each shell composition operator — sequencing, conditional execution, pipelines, redirects, command substitution, loops,</w:t>
+      </w:r>
+      <w:r>
+        <w:t xml:space="preserve"> </w:t>
+      </w:r>
+      <w:r>
+        <w:rPr>
+          <w:rStyle w:val="VerbatimChar"/>
+        </w:rPr>
+        <w:t xml:space="preserve">find -exec</w:t>
+      </w:r>
+      <w:r>
+        <w:t xml:space="preserve">,</w:t>
+      </w:r>
+      <w:r>
+        <w:t xml:space="preserve"> </w:t>
+      </w:r>
+      <w:r>
+        <w:rPr>
+          <w:rStyle w:val="VerbatimChar"/>
+        </w:rPr>
+        <w:t xml:space="preserve">xargs</w:t>
+      </w:r>
+      <w:r>
+        <w:t xml:space="preserve">,</w:t>
+      </w:r>
+      <w:r>
+        <w:t xml:space="preserve"> </w:t>
+      </w:r>
+      <w:r>
+        <w:rPr>
+          <w:rStyle w:val="VerbatimChar"/>
+        </w:rPr>
+        <w:t xml:space="preserve">sh -c</w:t>
+      </w:r>
+      <w:r>
+        <w:t xml:space="preserve"> </w:t>
+      </w:r>
+      <w:r>
+        <w:t xml:space="preserve">and other interpreters, and wrappers such as</w:t>
+      </w:r>
+      <w:r>
+        <w:t xml:space="preserve"> </w:t>
+      </w:r>
+      <w:r>
+        <w:rPr>
+          <w:rStyle w:val="VerbatimChar"/>
+        </w:rPr>
+        <w:t xml:space="preserve">sudo</w:t>
+      </w:r>
+      <w:r>
+        <w:t xml:space="preserve"> </w:t>
+      </w:r>
+      <w:r>
+        <w:t xml:space="preserve">and</w:t>
+      </w:r>
+      <w:r>
+        <w:t xml:space="preserve"> </w:t>
+      </w:r>
+      <w:r>
+        <w:rPr>
+          <w:rStyle w:val="VerbatimChar"/>
+        </w:rPr>
+        <w:t xml:space="preserve">env</w:t>
+      </w:r>
+      <w:r>
+        <w:t xml:space="preserve"> </w:t>
+      </w:r>
+      <w:r>
+        <w:t xml:space="preserve">— which exists because naturally occurring corpora under-represent compound commands, and compound commands are where the algorithm’s contribution lies.  The third is a set of commands whose effect lies outside the filesystem, described under (b) below.  A fourth partition holds commands the deployed model itself wrote: the NL2Bash descriptions of a random sample of tasks are given to the prototype’s model with the runtime’s own prompt, and the command it returns is labeled by the same pipeline.  It is reported apart, because a set drawn from this prototype’s own output is biased toward the shapes it produces, and because the analysis is about model-generated commands, which NL2Bash’s human-written ones are not.  Commands logged during the validation study are scored the same way (Section 3.5(e)).</w:t>
+      </w:r>
+    </w:p>
+    <w:p>
+      <w:pPr>
+        <w:pStyle w:val="BodyText"/>
+      </w:pPr>
+      <w:r>
+        <w:t xml:space="preserve">A second stratification is by the shape of the command, assigned by the generator from the command’s syntax: a single named command; a chain; one whose targets are computed while it runs; a redirect; one whose effect hides inside an interpreter or a tool the rule table does not name; and one whose effect lies outside the filesystem.  The claims under test concern the composed, run-time, and hidden shapes, and a corpus dominated by plain named commands would measure the strength of a list and not the contribution of the analysis, so results are reported per shape as well as in aggregate.</w:t>
+      </w:r>
+    </w:p>
+    <w:bookmarkEnd w:id="81"/>
+    <w:bookmarkStart w:id="82" w:name="b-ground-truth-by-sandboxed-execution"/>
     <w:p>
       <w:pPr>
         <w:pStyle w:val="Heading4"/>
       </w:pPr>
       <w:r>
-        <w:t xml:space="preserve">b) User Study</w:t>
+        <w:t xml:space="preserve">b) Ground Truth by Sandboxed Execution</w:t>
+      </w:r>
+    </w:p>
+    <w:p>
+      <w:pPr>
+        <w:pStyle w:val="FirstParagraph"/>
+      </w:pPr>
+      <w:r>
+        <w:t xml:space="preserve">Ground truth is observed, not judged.  Each executable command is given a fixture — the files and directories that exist when it runs — and is run once inside a bubblewrap sandbox: the rest of the filesystem read-only, no network, empty standard input, a hard time limit, and only the fixture writable.  The tree is recorded before and after, and the label follows from the difference.  A command is</w:t>
+      </w:r>
+      <w:r>
+        <w:t xml:space="preserve"> </w:t>
+      </w:r>
+      <w:r>
+        <w:rPr>
+          <w:i/>
+          <w:iCs/>
+        </w:rPr>
+        <w:t xml:space="preserve">recoverable</w:t>
+      </w:r>
+      <w:r>
+        <w:t xml:space="preserve"> </w:t>
+      </w:r>
+      <w:r>
+        <w:t xml:space="preserve">when nothing that existed was lost: paths may have been created, and a path that disappeared but whose very same file now sits elsewhere was moved, not lost.  It is</w:t>
+      </w:r>
+      <w:r>
+        <w:t xml:space="preserve"> </w:t>
+      </w:r>
+      <w:r>
+        <w:rPr>
+          <w:i/>
+          <w:iCs/>
+        </w:rPr>
+        <w:t xml:space="preserve">recoverable only if a pre-image is captured</w:t>
+      </w:r>
+      <w:r>
+        <w:t xml:space="preserve"> </w:t>
+      </w:r>
+      <w:r>
+        <w:t xml:space="preserve">when something that existed was removed, overwritten, replaced by a different kind of object, retargeted, or given different permission bits or an owner.  Modification times are ignored, since touching a file loses nothing a user could want back.  Commands that do not finish cleanly — a non-zero exit, a timeout, an attempt to write outside the fixture — are excluded and counted, never labeled by guess.</w:t>
+      </w:r>
+    </w:p>
+    <w:p>
+      <w:pPr>
+        <w:pStyle w:val="BodyText"/>
+      </w:pPr>
+      <w:r>
+        <w:t xml:space="preserve">Commands whose effect the filesystem cannot show — on another machine, on the mount table, on another process, on a device, on an account or the firewall — cannot be labeled this way and are never executed.  They form the external partition and are labeled</w:t>
+      </w:r>
+      <w:r>
+        <w:t xml:space="preserve"> </w:t>
+      </w:r>
+      <w:r>
+        <w:rPr>
+          <w:i/>
+          <w:iCs/>
+        </w:rPr>
+        <w:t xml:space="preserve">unrecoverable</w:t>
+      </w:r>
+      <w:r>
+        <w:t xml:space="preserve"> </w:t>
+      </w:r>
+      <w:r>
+        <w:t xml:space="preserve">by construction.  The rule that assigns a command to it is deliberately narrow, naming only tools that change such state, so that a read-only network query is not counted as a loss the system failed to catch.  It is a partition rule and not a source of the other two labels.</w:t>
+      </w:r>
+    </w:p>
+    <w:p>
+      <w:pPr>
+        <w:pStyle w:val="BodyText"/>
+      </w:pPr>
+      <w:r>
+        <w:t xml:space="preserve">Ground truth is defined relative to a stated filesystem state.  A command’s effects depend on what exists:</w:t>
+      </w:r>
+      <w:r>
+        <w:t xml:space="preserve"> </w:t>
+      </w:r>
+      <w:r>
+        <w:rPr>
+          <w:i/>
+          <w:iCs/>
+        </w:rPr>
+        <w:t xml:space="preserve">rm *.tmp</w:t>
+      </w:r>
+      <w:r>
+        <w:t xml:space="preserve"> </w:t>
+      </w:r>
+      <w:r>
+        <w:t xml:space="preserve">deletes nothing where there are no such files, and</w:t>
+      </w:r>
+      <w:r>
+        <w:t xml:space="preserve"> </w:t>
+      </w:r>
+      <w:r>
+        <w:rPr>
+          <w:i/>
+          <w:iCs/>
+        </w:rPr>
+        <w:t xml:space="preserve">cp a b</w:t>
+      </w:r>
+      <w:r>
+        <w:t xml:space="preserve"> </w:t>
+      </w:r>
+      <w:r>
+        <w:t xml:space="preserve">overwrites only if</w:t>
+      </w:r>
+      <w:r>
+        <w:t xml:space="preserve"> </w:t>
+      </w:r>
+      <w:r>
+        <w:rPr>
+          <w:i/>
+          <w:iCs/>
+        </w:rPr>
+        <w:t xml:space="preserve">b</w:t>
+      </w:r>
+      <w:r>
+        <w:t xml:space="preserve"> </w:t>
+      </w:r>
+      <w:r>
+        <w:t xml:space="preserve">is there.  A label given with no state is a label about an imagined directory, and an analysis that reads the real state cannot be scored against it.  Every corpus item therefore carries its fixture, and the analysis is run against that same fixture.  The fixture is built from the command’s text before the analysis is consulted: the files and directories the command names are created, a glob becomes a few matching files, and whether the destination of a copy, move, or redirect already exists is chosen by the seed, with the other choice tried if the first does not run.  Fixtures are never written from the analysis’s output.</w:t>
+      </w:r>
+    </w:p>
+    <w:p>
+      <w:pPr>
+        <w:pStyle w:val="BodyText"/>
+      </w:pPr>
+      <w:r>
+        <w:t xml:space="preserve">The generator shares no code with the analysis and never consults it, so agreement between the two is evidence and not circularity.  It is deterministic for a given seed, and it records the number of candidates drawn and the reasons for each exclusion beside the corpus.  There is no human labeler, and so no labeler disagreement to measure; the threat that takes its place is the validity of the oracle itself, addressed in Section 3.1(e).</w:t>
+      </w:r>
+    </w:p>
+    <w:bookmarkEnd w:id="82"/>
+    <w:bookmarkStart w:id="83" w:name="c-benchmark-tasks"/>
+    <w:p>
+      <w:pPr>
+        <w:pStyle w:val="Heading4"/>
+      </w:pPr>
+      <w:r>
+        <w:t xml:space="preserve">c) Benchmark Tasks</w:t>
+      </w:r>
+    </w:p>
+    <w:p>
+      <w:pPr>
+        <w:pStyle w:val="FirstParagraph"/>
+      </w:pPr>
+      <w:r>
+        <w:t xml:space="preserve">SynapseOS is deployed on the Debian 13 (Trixie) environment matching the OSWorld evaluation setup [41].  Each benchmark task is executed through the conversational interface, and results are captured programmatically through the built-in telemetry system.  Each task is supplied to SynapseOS as a natural language instruction, and the resulting system state is compared against the expected outcome defined in the benchmark.  Because SynapseOS gates every command classified irreversible on explicit confirmation, benchmark runs are facilitator-attended rather than unattended; the confirmation gate remains active throughout and every confirmation is logged as part of the run record.  OSWorld scores the resulting system state rather than a human operator’s performance, so it applies only to the SynapseOS condition.  Condition B, which a human participant operates directly, has no equivalent and is instead evaluated through the custom cross-platform task suite administered in the user study (Section 1.2(d)).</w:t>
+      </w:r>
+    </w:p>
+    <w:bookmarkEnd w:id="83"/>
+    <w:bookmarkStart w:id="84" w:name="d-user-study"/>
+    <w:p>
+      <w:pPr>
+        <w:pStyle w:val="Heading4"/>
+      </w:pPr>
+      <w:r>
+        <w:t xml:space="preserve">d) User Study</w:t>
       </w:r>
     </w:p>
     <w:p>
@@ -6392,7 +6643,7 @@
         <w:pStyle w:val="FirstParagraph"/>
       </w:pPr>
       <w:r>
-        <w:t xml:space="preserve">Participants are recruited through university channels.  Recruitment enforces a minimum quota of four participants per primary OS background (Windows, macOS, Linux), scaled with the sample so that the realized set cannot end up concentrated in a single OS and leave the per-OS exploratory subgroup analysis (Section 3.3) without data for the others.  The binding constraint on this quota is the Linux-primary novice cell: a daily Linux user with no command-line familiarity is uncommon, and if that cell cannot be filled during recruitment the Linux quota is met from power users alone, with the resulting imbalance reported rather than concealed.  Informed consent is obtained from all participants prior to the session.  Ethics approval is secured before recruitment begins.  Participant data is pseudonymized at the point of collection under the participant ID scheme described in Section 2.5; recordings, which cannot be anonymized at collection, are governed by the retention and destruction rule stated there.</w:t>
+        <w:t xml:space="preserve">Participants are recruited through university channels.  Recruitment enforces a minimum quota of four participants per primary OS background (Windows, macOS, Linux), scaled with the sample so that the realized set cannot end up concentrated in a single OS and leave the per-OS exploratory subgroup analysis (Section 3.4) without data for the others.  The binding constraint on this quota is the Linux-primary novice cell: a daily Linux user with no command-line familiarity is uncommon, and if that cell cannot be filled during recruitment the Linux quota is met from power users alone, with the resulting imbalance reported rather than concealed.  Informed consent is obtained from all participants prior to the session.  Ethics approval is secured before recruitment begins.  Participant data is pseudonymized at the point of collection under the participant ID scheme described in Section 2.5; recordings, which cannot be anonymized at collection, are governed by the retention and destruction rule stated there.</w:t>
       </w:r>
     </w:p>
     <w:p>
@@ -6403,9 +6654,9 @@
         <w:t xml:space="preserve">After completing each condition, participants fill out the SUS and NASA-TLX questionnaires.  After completing both conditions, a brief semi-structured interview is conducted to gather qualitative feedback.</w:t>
       </w:r>
     </w:p>
-    <w:bookmarkEnd w:id="81"/>
-    <w:bookmarkEnd w:id="82"/>
-    <w:bookmarkStart w:id="83" w:name="ch3-sec1-3"/>
+    <w:bookmarkEnd w:id="84"/>
+    <w:bookmarkEnd w:id="85"/>
+    <w:bookmarkStart w:id="86" w:name="ch3-sec1-3"/>
     <w:p>
       <w:pPr>
         <w:pStyle w:val="Heading3"/>
@@ -6419,6 +6670,22 @@
         <w:pStyle w:val="FirstParagraph"/>
       </w:pPr>
       <w:r>
+        <w:t xml:space="preserve">The analysis is evaluated against a labeled corpus of shell commands rather than through participants, because its research questions concern what a command does, which can be observed directly, and not what a person does.  The separation is deliberate and has a practical consequence worth stating: this evaluation depends on no ethics approval, no recruitment, and no participant sessions, and can therefore be completed and reported independently of the validation study’s schedule.</w:t>
+      </w:r>
+    </w:p>
+    <w:p>
+      <w:pPr>
+        <w:pStyle w:val="BodyText"/>
+      </w:pPr>
+      <w:r>
+        <w:t xml:space="preserve">The corpus is sized against the classes the analysis has to separate, not against a single overall total.  Commands are drawn until a fixed number carry each ground-truth label, so that the label the false-negative test needs — a command that loses something — is present in quantity whatever NL2Bash’s own composition, which is mostly read-only.  The target is on the order of 780 commands: about 450 from NL2Bash, of which 150 are losses; about 250 from templates; and about 80 external.  This is a coverage-based target rather than a power-computed one: a classical power analysis needs an assumed effect size, and the quantity of interest, the false-negative rate, is expected to be low for both the baseline and the algorithm, the regime in which an assumed effect size would be a guess.  What the corpus must give is enough losses that a Wilson interval on a proportion near zero remains informative, and 150 does.</w:t>
+      </w:r>
+    </w:p>
+    <w:p>
+      <w:pPr>
+        <w:pStyle w:val="BodyText"/>
+      </w:pPr>
+      <w:r>
         <w:t xml:space="preserve">The OSWorld benchmark is used as the primary evaluation standard because it is the only existing benchmark that evaluates computer-using agents in real operating system environments with real applications [41].  Its use allows SynapseOS results to be situated within the existing literature.</w:t>
       </w:r>
     </w:p>
@@ -6462,8 +6729,8 @@
         <w:t xml:space="preserve">The dual-population design — novice and power users — directly addresses the gap identified in Chapter 1, where no prior work has evaluated a conversational interface across user populations with differing technical backgrounds [41].  The validation data serve two purposes.  The system performance data, including the analysis’s decision on every command participants cause, validate the analysis in use: they show whether its verdicts and captures hold on commands the corpus does not contain, and whether undo restores what participants’ commands changed.  The user study metrics and benchmark coverage characterize the platform on which it is deployed.  The research questions themselves are answered against the labeled command corpus described in Section 3.1.</w:t>
       </w:r>
     </w:p>
-    <w:bookmarkEnd w:id="83"/>
-    <w:bookmarkStart w:id="84" w:name="ch3-sec1-4"/>
+    <w:bookmarkEnd w:id="86"/>
+    <w:bookmarkStart w:id="87" w:name="ch3-sec1-4"/>
     <w:p>
       <w:pPr>
         <w:pStyle w:val="Heading3"/>
@@ -6585,11 +6852,11 @@
         <w:t xml:space="preserve"> </w:t>
       </w:r>
       <w:r>
-        <w:t xml:space="preserve">if they report advanced proficiency on their primary OS — capable of performing file management, process monitoring, and system administration tasks efficiently using that OS’s native tools — regardless of which OS that is, and pass all three behavioral screener tasks.  Participants whose self-report and behavioral screener results disagree, or who do not clearly satisfy either classification, are excluded.  Primary OS is recorded for all participants as a grouping variable, and prior conversational AI exposure as a covariate, in the analysis; prior AI exposure is analyzed as an exploratory covariate only (see Section 3.3) rather than a primary grouping variable, since splitting the sample along a third axis would leave subgroups too small to support a hypothesis test.</w:t>
-      </w:r>
-    </w:p>
-    <w:bookmarkEnd w:id="84"/>
-    <w:bookmarkStart w:id="85" w:name="ch3-sec1-5"/>
+        <w:t xml:space="preserve">if they report advanced proficiency on their primary OS — capable of performing file management, process monitoring, and system administration tasks efficiently using that OS’s native tools — regardless of which OS that is, and pass all three behavioral screener tasks.  Participants whose self-report and behavioral screener results disagree, or who do not clearly satisfy either classification, are excluded.  Primary OS is recorded for all participants as a grouping variable, and prior conversational AI exposure as a covariate, in the analysis; prior AI exposure is analyzed as an exploratory covariate only (see Section 3.4) rather than a primary grouping variable, since splitting the sample along a third axis would leave subgroups too small to support a hypothesis test.</w:t>
+      </w:r>
+    </w:p>
+    <w:bookmarkEnd w:id="87"/>
+    <w:bookmarkStart w:id="88" w:name="ch3-sec1-5"/>
     <w:p>
       <w:pPr>
         <w:pStyle w:val="Heading3"/>
@@ -6702,9 +6969,9 @@
         <w:t xml:space="preserve">The custom task suite comprises tasks organized into four categories: file search and organization, system and process monitoring, application and package management, and text and data processing.  All tasks are defined at the human-goal level — achievable via SynapseOS natural language on the evaluation machine and via native graphical or terminal tools on the comparison machine.  Each task is documented with a unique identifier, a natural language prompt as presented to the participant, the expected outcome, and the assigned difficulty level.  The full suite — twelve core tasks in two parallel forms, plus four boundary tasks lying outside shell expressibility that are scored and reported separately — is given in Appendix C.  Difficulty calibration and form equivalence are validated during the pilot study and revised as necessary before the main study begins.</w:t>
       </w:r>
     </w:p>
-    <w:bookmarkEnd w:id="85"/>
-    <w:bookmarkEnd w:id="86"/>
-    <w:bookmarkStart w:id="95" w:name="sec2"/>
+    <w:bookmarkEnd w:id="88"/>
+    <w:bookmarkEnd w:id="89"/>
+    <w:bookmarkStart w:id="100" w:name="sec2"/>
     <w:p>
       <w:pPr>
         <w:pStyle w:val="Heading2"/>
@@ -6718,10 +6985,10 @@
         <w:pStyle w:val="FirstParagraph"/>
       </w:pPr>
       <w:r>
-        <w:t xml:space="preserve">Building SynapseOS and running the study that evaluates it are two related but distinct efforts.  The system itself — the conversational interface layer and execution pipeline — is designed and implemented first, followed by the scaffolding that makes the resulting study trustworthy: collected data is processed and pseudonymized, the system and instruments are validated, each participant session follows a standardized procedure, and participant welfare is protected throughout.</w:t>
-      </w:r>
-    </w:p>
-    <w:bookmarkStart w:id="90" w:name="ch3-sec2-1"/>
+        <w:t xml:space="preserve">The procedure has two parts.  The recoverability analysis, the study’s contribution, is designed and specified first, in the order of the objectives it serves: its effect-semantics model, its effect-composition algorithm, and its recovery-plan generation.  SynapseOS, the experimental platform in which it is deployed, follows, together with the scaffolding that makes the validation study trustworthy: collected data is processed and pseudonymized, the system and instruments are validated, each participant session follows a standardized procedure, and participant welfare is protected throughout.</w:t>
+      </w:r>
+    </w:p>
+    <w:bookmarkStart w:id="95" w:name="ch3-sec2-1"/>
     <w:p>
       <w:pPr>
         <w:pStyle w:val="Heading3"/>
@@ -6735,16 +7002,1587 @@
         <w:pStyle w:val="FirstParagraph"/>
       </w:pPr>
       <w:r>
-        <w:t xml:space="preserve">The construction of SynapseOS proceeds across two primary workstreams — the conversational interface layer and the execution pipeline — integrated into a unified session manager that launches over the conventional Linux graphical desktop session rather than replacing it.</w:t>
-      </w:r>
-    </w:p>
-    <w:bookmarkStart w:id="87" w:name="a-conversational-interface-layer"/>
+        <w:t xml:space="preserve">The design comprises the recoverability analysis, specified in (a) to (c), one part per objective, and the experimental platform in which it is deployed, in (d) and (e): a conversational interface layer and an execution pipeline, integrated into a unified session manager that launches over the conventional Linux graphical desktop session rather than replacing it.</w:t>
+      </w:r>
+    </w:p>
+    <w:bookmarkStart w:id="90" w:name="a-effect-semantics-model-objective-1"/>
     <w:p>
       <w:pPr>
         <w:pStyle w:val="Heading4"/>
       </w:pPr>
       <w:r>
-        <w:t xml:space="preserve">a) Conversational Interface Layer</w:t>
+        <w:t xml:space="preserve">a) Effect-Semantics Model (Objective 1)</w:t>
+      </w:r>
+    </w:p>
+    <w:p>
+      <w:pPr>
+        <w:pStyle w:val="FirstParagraph"/>
+      </w:pPr>
+      <w:r>
+        <w:t xml:space="preserve">The command-safety check SynapseOS began with, like those of the tools surveyed in Chapter 2 and the execution pipeline’s own classification in (e) below, is an enumerated list of named command shapes: a proposed command is matched against patterns known to be destructive —</w:t>
+      </w:r>
+      <w:r>
+        <w:t xml:space="preserve"> </w:t>
+      </w:r>
+      <w:r>
+        <w:rPr>
+          <w:i/>
+          <w:iCs/>
+        </w:rPr>
+        <w:t xml:space="preserve">rm</w:t>
+      </w:r>
+      <w:r>
+        <w:t xml:space="preserve">,</w:t>
+      </w:r>
+      <w:r>
+        <w:t xml:space="preserve"> </w:t>
+      </w:r>
+      <w:r>
+        <w:rPr>
+          <w:i/>
+          <w:iCs/>
+        </w:rPr>
+        <w:t xml:space="preserve">dd</w:t>
+      </w:r>
+      <w:r>
+        <w:t xml:space="preserve">,</w:t>
+      </w:r>
+      <w:r>
+        <w:t xml:space="preserve"> </w:t>
+      </w:r>
+      <w:r>
+        <w:rPr>
+          <w:i/>
+          <w:iCs/>
+        </w:rPr>
+        <w:t xml:space="preserve">mkfs</w:t>
+      </w:r>
+      <w:r>
+        <w:t xml:space="preserve">, truncating redirects — and gated if it matches.  That mechanism is the baseline this study seeks to replace, and its limitations are structural rather than incidental.  It cannot enumerate its domain, because the space of destructive commands is open-ended: extending the list to cover</w:t>
+      </w:r>
+      <w:r>
+        <w:t xml:space="preserve"> </w:t>
+      </w:r>
+      <w:r>
+        <w:rPr>
+          <w:i/>
+          <w:iCs/>
+        </w:rPr>
+        <w:t xml:space="preserve">apt</w:t>
+      </w:r>
+      <w:r>
+        <w:t xml:space="preserve"> </w:t>
+      </w:r>
+      <w:r>
+        <w:t xml:space="preserve">leaves</w:t>
+      </w:r>
+      <w:r>
+        <w:t xml:space="preserve"> </w:t>
+      </w:r>
+      <w:r>
+        <w:rPr>
+          <w:i/>
+          <w:iCs/>
+        </w:rPr>
+        <w:t xml:space="preserve">snap</w:t>
+      </w:r>
+      <w:r>
+        <w:t xml:space="preserve">,</w:t>
+      </w:r>
+      <w:r>
+        <w:t xml:space="preserve"> </w:t>
+      </w:r>
+      <w:r>
+        <w:rPr>
+          <w:i/>
+          <w:iCs/>
+        </w:rPr>
+        <w:t xml:space="preserve">pip</w:t>
+      </w:r>
+      <w:r>
+        <w:t xml:space="preserve">,</w:t>
+      </w:r>
+      <w:r>
+        <w:t xml:space="preserve"> </w:t>
+      </w:r>
+      <w:r>
+        <w:rPr>
+          <w:i/>
+          <w:iCs/>
+        </w:rPr>
+        <w:t xml:space="preserve">docker rm</w:t>
+      </w:r>
+      <w:r>
+        <w:t xml:space="preserve">, and whatever ships next.  It does not compose, because each rule matches a command in isolation while a generated line routinely chains several operations with differing recovery requirements.  And it reasons about names rather than effects:</w:t>
+      </w:r>
+      <w:r>
+        <w:t xml:space="preserve"> </w:t>
+      </w:r>
+      <w:r>
+        <w:rPr>
+          <w:i/>
+          <w:iCs/>
+        </w:rPr>
+        <w:t xml:space="preserve">cp a b</w:t>
+      </w:r>
+      <w:r>
+        <w:t xml:space="preserve"> </w:t>
+      </w:r>
+      <w:r>
+        <w:t xml:space="preserve">is harmless when</w:t>
+      </w:r>
+      <w:r>
+        <w:t xml:space="preserve"> </w:t>
+      </w:r>
+      <w:r>
+        <w:rPr>
+          <w:i/>
+          <w:iCs/>
+        </w:rPr>
+        <w:t xml:space="preserve">b</w:t>
+      </w:r>
+      <w:r>
+        <w:t xml:space="preserve"> </w:t>
+      </w:r>
+      <w:r>
+        <w:t xml:space="preserve">does not exist and destructive when it does, a distinction no name-matching rule can draw.</w:t>
+      </w:r>
+    </w:p>
+    <w:p>
+      <w:pPr>
+        <w:pStyle w:val="BodyText"/>
+      </w:pPr>
+      <w:r>
+        <w:t xml:space="preserve">This study therefore proposes an algorithm that derives what a command would do from its syntactic structure, and decides recoverability over that derivation.  It produces two outputs: a</w:t>
+      </w:r>
+      <w:r>
+        <w:t xml:space="preserve"> </w:t>
+      </w:r>
+      <w:r>
+        <w:rPr>
+          <w:b/>
+          <w:bCs/>
+        </w:rPr>
+        <w:t xml:space="preserve">verdict</w:t>
+      </w:r>
+      <w:r>
+        <w:t xml:space="preserve"> </w:t>
+      </w:r>
+      <w:r>
+        <w:t xml:space="preserve">— recoverable, recoverable only with prior capture, or unrecoverable — and, for the middle case, a</w:t>
+      </w:r>
+      <w:r>
+        <w:t xml:space="preserve"> </w:t>
+      </w:r>
+      <w:r>
+        <w:rPr>
+          <w:b/>
+          <w:bCs/>
+        </w:rPr>
+        <w:t xml:space="preserve">recovery plan</w:t>
+      </w:r>
+      <w:r>
+        <w:t xml:space="preserve"> </w:t>
+      </w:r>
+      <w:r>
+        <w:t xml:space="preserve">naming which pre-images must be captured, and by which mechanism, before the command is allowed to run.</w:t>
+      </w:r>
+    </w:p>
+    <w:p>
+      <w:pPr>
+        <w:pStyle w:val="BodyText"/>
+      </w:pPr>
+      <w:r>
+        <w:rPr>
+          <w:b/>
+          <w:bCs/>
+        </w:rPr>
+        <w:t xml:space="preserve">The formal object.</w:t>
+      </w:r>
+      <w:r>
+        <w:t xml:space="preserve"> </w:t>
+      </w:r>
+      <w:r>
+        <w:t xml:space="preserve">A command is represented by its</w:t>
+      </w:r>
+      <w:r>
+        <w:t xml:space="preserve"> </w:t>
+      </w:r>
+      <w:r>
+        <w:rPr>
+          <w:i/>
+          <w:iCs/>
+        </w:rPr>
+        <w:t xml:space="preserve">effect set</w:t>
+      </w:r>
+      <w:r>
+        <w:t xml:space="preserve"> </w:t>
+      </w:r>
+      <w:r>
+        <w:t xml:space="preserve">rather than by its name.  An individual</w:t>
+      </w:r>
+      <w:r>
+        <w:t xml:space="preserve"> </w:t>
+      </w:r>
+      <w:r>
+        <w:rPr>
+          <w:i/>
+          <w:iCs/>
+        </w:rPr>
+        <w:t xml:space="preserve">effect</w:t>
+      </w:r>
+      <w:r>
+        <w:t xml:space="preserve"> </w:t>
+      </w:r>
+      <w:r>
+        <w:t xml:space="preserve">is a triple: a kind, drawn from {</w:t>
+      </w:r>
+      <w:r>
+        <w:rPr>
+          <w:i/>
+          <w:iCs/>
+        </w:rPr>
+        <w:t xml:space="preserve">read</w:t>
+      </w:r>
+      <w:r>
+        <w:t xml:space="preserve">,</w:t>
+      </w:r>
+      <w:r>
+        <w:t xml:space="preserve"> </w:t>
+      </w:r>
+      <w:r>
+        <w:rPr>
+          <w:i/>
+          <w:iCs/>
+        </w:rPr>
+        <w:t xml:space="preserve">create</w:t>
+      </w:r>
+      <w:r>
+        <w:t xml:space="preserve">,</w:t>
+      </w:r>
+      <w:r>
+        <w:t xml:space="preserve"> </w:t>
+      </w:r>
+      <w:r>
+        <w:rPr>
+          <w:i/>
+          <w:iCs/>
+        </w:rPr>
+        <w:t xml:space="preserve">write</w:t>
+      </w:r>
+      <w:r>
+        <w:t xml:space="preserve">,</w:t>
+      </w:r>
+      <w:r>
+        <w:t xml:space="preserve"> </w:t>
+      </w:r>
+      <w:r>
+        <w:rPr>
+          <w:i/>
+          <w:iCs/>
+        </w:rPr>
+        <w:t xml:space="preserve">remove</w:t>
+      </w:r>
+      <w:r>
+        <w:t xml:space="preserve">,</w:t>
+      </w:r>
+      <w:r>
+        <w:t xml:space="preserve"> </w:t>
+      </w:r>
+      <w:r>
+        <w:rPr>
+          <w:i/>
+          <w:iCs/>
+        </w:rPr>
+        <w:t xml:space="preserve">metadata</w:t>
+      </w:r>
+      <w:r>
+        <w:t xml:space="preserve">}; a target path, resolved against the working directory in which the command would execute; and the pre-image that would have to be captured for that effect to be reversed.  The effect set of a command is the union of the effects of every leaf command within it, taken over the whole of its operator structure.</w:t>
+      </w:r>
+    </w:p>
+    <w:p>
+      <w:pPr>
+        <w:pStyle w:val="BodyText"/>
+      </w:pPr>
+      <w:r>
+        <w:rPr>
+          <w:b/>
+          <w:bCs/>
+        </w:rPr>
+        <w:t xml:space="preserve">The verdict.</w:t>
+      </w:r>
+      <w:r>
+        <w:t xml:space="preserve"> </w:t>
+      </w:r>
+      <w:r>
+        <w:t xml:space="preserve">The verdict is a predicate over the composed effect set: a command is recoverable when every effect within it has an available mechanism capable of restoring that effect’s pre-image.  The verdict is not where the contribution lies: a list that refuses every command it does not recognize reaches the same verdict on the commands studied.  What the study contributes is the derivation of the effect set, (b), and the plan computed from it, (c).</w:t>
+      </w:r>
+    </w:p>
+    <w:p>
+      <w:pPr>
+        <w:pStyle w:val="BodyText"/>
+      </w:pPr>
+      <w:r>
+        <w:rPr>
+          <w:b/>
+          <w:bCs/>
+        </w:rPr>
+        <w:t xml:space="preserve">Soundness.</w:t>
+      </w:r>
+      <w:r>
+        <w:t xml:space="preserve"> </w:t>
+      </w:r>
+      <w:r>
+        <w:t xml:space="preserve">The analysis is deliberately one-sided.  Any construct whose effects cannot be resolved statically — a path arriving from command substitution, an unexpanded variable, a glob that may match a block device — is treated as unrecoverable rather than assumed benign.  The two possible errors are not symmetric and are not traded off against each other: over-approximating destructiveness costs the user an unnecessary confirmation prompt, whereas under-approximating it destroys data that cannot be recovered.  This asymmetry is why the evaluation in Section 3.1 reports false-negative rate separately rather than folding both directions into a single accuracy figure.  Two limits belong to the soundness claim itself.  Resolution runs commands before the user has consented, which is safe only because each is proven to have no effects; and the interval between resolving a target and executing the command is a window in which another process can change the filesystem, so a capture is of the state at resolution time and not a guarantee about the state at execution time.</w:t>
+      </w:r>
+    </w:p>
+    <w:p>
+      <w:pPr>
+        <w:pStyle w:val="BodyText"/>
+      </w:pPr>
+      <w:r>
+        <w:rPr>
+          <w:b/>
+          <w:bCs/>
+        </w:rPr>
+        <w:t xml:space="preserve">Scope of the model.</w:t>
+      </w:r>
+      <w:r>
+        <w:t xml:space="preserve"> </w:t>
+      </w:r>
+      <w:r>
+        <w:t xml:space="preserve">The effect domain is the filesystem, extended to two kinds of state on the target system that have no pre-image to copy but do have an inverse: installed packages and running or enabled services.  For these the analysis does not re-implement the package manager or the service manager.  It asks the system’s own tools what the command would do — the package manager’s simulation mode, the package database, and the service manager’s state queries — and derives from the answer the command that puts the state back: a purge for an install, a versioned install for a removal or upgrade, a stop for a start, a disable for an enable.  A change is recoverable only if that inverse exists, so removing a package whose old version no repository still offers is unrecoverable, and purging a package also captures its configuration files as removals.  Undo runs the inverse, with elevated privilege if the original had it, and prints the command for the user to run if it fails.  Not represented are what maintainer scripts and a service’s own start-up do beyond the state change, which are arbitrary programs; network mutations and anything on a remote host; and other package managers, which stay unrecoverable unless plainly read-only.  A command whose principal effect is one of these is classified unrecoverable by the soundness rule above.  This is safe but coarse, and it is stated as a limitation of the model rather than deferred to the results.</w:t>
+      </w:r>
+    </w:p>
+    <w:bookmarkEnd w:id="90"/>
+    <w:bookmarkStart w:id="91" w:name="Xd946fc8713be5a40002891fd02cb45803a6005b"/>
+    <w:p>
+      <w:pPr>
+        <w:pStyle w:val="Heading4"/>
+      </w:pPr>
+      <w:r>
+        <w:t xml:space="preserve">b) Effect-Composition Algorithm (Objective 2)</w:t>
+      </w:r>
+    </w:p>
+    <w:p>
+      <w:pPr>
+        <w:pStyle w:val="FirstParagraph"/>
+      </w:pPr>
+      <w:r>
+        <w:rPr>
+          <w:b/>
+          <w:bCs/>
+        </w:rPr>
+        <w:t xml:space="preserve">Extraction.</w:t>
+      </w:r>
+      <w:r>
+        <w:t xml:space="preserve"> </w:t>
+      </w:r>
+      <w:r>
+        <w:t xml:space="preserve">For each leaf command, effects are derived from the command together with its arguments.  The derivation is argument-aware because flags change effects and not merely behavior:</w:t>
+      </w:r>
+      <w:r>
+        <w:t xml:space="preserve"> </w:t>
+      </w:r>
+      <w:r>
+        <w:rPr>
+          <w:i/>
+          <w:iCs/>
+        </w:rPr>
+        <w:t xml:space="preserve">rm -i</w:t>
+      </w:r>
+      <w:r>
+        <w:t xml:space="preserve"> </w:t>
+      </w:r>
+      <w:r>
+        <w:t xml:space="preserve">differs from</w:t>
+      </w:r>
+      <w:r>
+        <w:t xml:space="preserve"> </w:t>
+      </w:r>
+      <w:r>
+        <w:rPr>
+          <w:i/>
+          <w:iCs/>
+        </w:rPr>
+        <w:t xml:space="preserve">rm -f</w:t>
+      </w:r>
+      <w:r>
+        <w:t xml:space="preserve"> </w:t>
+      </w:r>
+      <w:r>
+        <w:t xml:space="preserve">in whether removal is certain,</w:t>
+      </w:r>
+      <w:r>
+        <w:t xml:space="preserve"> </w:t>
+      </w:r>
+      <w:r>
+        <w:rPr>
+          <w:i/>
+          <w:iCs/>
+        </w:rPr>
+        <w:t xml:space="preserve">cp -n</w:t>
+      </w:r>
+      <w:r>
+        <w:t xml:space="preserve"> </w:t>
+      </w:r>
+      <w:r>
+        <w:t xml:space="preserve">cannot overwrite where</w:t>
+      </w:r>
+      <w:r>
+        <w:t xml:space="preserve"> </w:t>
+      </w:r>
+      <w:r>
+        <w:rPr>
+          <w:i/>
+          <w:iCs/>
+        </w:rPr>
+        <w:t xml:space="preserve">cp</w:t>
+      </w:r>
+      <w:r>
+        <w:t xml:space="preserve"> </w:t>
+      </w:r>
+      <w:r>
+        <w:t xml:space="preserve">can, and</w:t>
+      </w:r>
+      <w:r>
+        <w:t xml:space="preserve"> </w:t>
+      </w:r>
+      <w:r>
+        <w:rPr>
+          <w:i/>
+          <w:iCs/>
+        </w:rPr>
+        <w:t xml:space="preserve">chmod</w:t>
+      </w:r>
+      <w:r>
+        <w:t xml:space="preserve"> </w:t>
+      </w:r>
+      <w:r>
+        <w:t xml:space="preserve">with and without</w:t>
+      </w:r>
+      <w:r>
+        <w:t xml:space="preserve"> </w:t>
+      </w:r>
+      <w:r>
+        <w:rPr>
+          <w:i/>
+          <w:iCs/>
+        </w:rPr>
+        <w:t xml:space="preserve">-R</w:t>
+      </w:r>
+      <w:r>
+        <w:t xml:space="preserve"> </w:t>
+      </w:r>
+      <w:r>
+        <w:t xml:space="preserve">differ in how many paths acquire a metadata effect.</w:t>
+      </w:r>
+    </w:p>
+    <w:p>
+      <w:pPr>
+        <w:pStyle w:val="BodyText"/>
+      </w:pPr>
+      <w:r>
+        <w:rPr>
+          <w:b/>
+          <w:bCs/>
+        </w:rPr>
+        <w:t xml:space="preserve">Composition.</w:t>
+      </w:r>
+      <w:r>
+        <w:t xml:space="preserve"> </w:t>
+      </w:r>
+      <w:r>
+        <w:t xml:space="preserve">Effects propagate upward through the operators that join commands into a single line, and the propagation rule differs by operator.  Sequencing with</w:t>
+      </w:r>
+      <w:r>
+        <w:t xml:space="preserve"> </w:t>
+      </w:r>
+      <w:r>
+        <w:rPr>
+          <w:i/>
+          <w:iCs/>
+        </w:rPr>
+        <w:t xml:space="preserve">;</w:t>
+      </w:r>
+      <w:r>
+        <w:t xml:space="preserve"> </w:t>
+      </w:r>
+      <w:r>
+        <w:t xml:space="preserve">accumulates effects unconditionally.  Conjunction and disjunction —</w:t>
+      </w:r>
+      <w:r>
+        <w:t xml:space="preserve"> </w:t>
+      </w:r>
+      <w:r>
+        <w:rPr>
+          <w:i/>
+          <w:iCs/>
+        </w:rPr>
+        <w:t xml:space="preserve">&amp;&amp;</w:t>
+      </w:r>
+      <w:r>
+        <w:t xml:space="preserve"> </w:t>
+      </w:r>
+      <w:r>
+        <w:t xml:space="preserve">and</w:t>
+      </w:r>
+      <w:r>
+        <w:t xml:space="preserve"> </w:t>
+      </w:r>
+      <w:r>
+        <w:rPr>
+          <w:i/>
+          <w:iCs/>
+        </w:rPr>
+        <w:t xml:space="preserve">||</w:t>
+      </w:r>
+      <w:r>
+        <w:t xml:space="preserve"> </w:t>
+      </w:r>
+      <w:r>
+        <w:t xml:space="preserve">— make later effects conditional on an earlier exit status, so the effect set is a union over the branches that may execute.  A pipeline connects standard output to standard input and contributes no filesystem effect of its own, but determines the exit status that gates whatever follows it.  Redirection introduces write or truncate effects that appear in no command in the pipeline.  Command substitution introduces effects whose targets are computable only at runtime, and</w:t>
+      </w:r>
+      <w:r>
+        <w:t xml:space="preserve"> </w:t>
+      </w:r>
+      <w:r>
+        <w:rPr>
+          <w:i/>
+          <w:iCs/>
+        </w:rPr>
+        <w:t xml:space="preserve">xargs</w:t>
+      </w:r>
+      <w:r>
+        <w:t xml:space="preserve"> </w:t>
+      </w:r>
+      <w:r>
+        <w:t xml:space="preserve">and</w:t>
+      </w:r>
+      <w:r>
+        <w:t xml:space="preserve"> </w:t>
+      </w:r>
+      <w:r>
+        <w:rPr>
+          <w:i/>
+          <w:iCs/>
+        </w:rPr>
+        <w:t xml:space="preserve">find -exec</w:t>
+      </w:r>
+      <w:r>
+        <w:t xml:space="preserve"> </w:t>
+      </w:r>
+      <w:r>
+        <w:t xml:space="preserve">multiply a command across an argument set that is not statically known.  It is this propagation, rather than the per-command derivation, that an enumerated pattern list has no means of expressing.  Parts of a line are analyzed in order against an overlay of what earlier parts created or removed, so that in</w:t>
+      </w:r>
+      <w:r>
+        <w:t xml:space="preserve"> </w:t>
+      </w:r>
+      <w:r>
+        <w:rPr>
+          <w:i/>
+          <w:iCs/>
+        </w:rPr>
+        <w:t xml:space="preserve">mkdir out &amp;&amp; cp a.txt out/</w:t>
+      </w:r>
+      <w:r>
+        <w:t xml:space="preserve"> </w:t>
+      </w:r>
+      <w:r>
+        <w:t xml:space="preserve">the copy lands in a directory that does not yet exist, and a path a line creates and then deletes needs no capture because there was nothing there to lose.  Loops are analyzed once per resolved item with the loop variable bound;</w:t>
+      </w:r>
+      <w:r>
+        <w:t xml:space="preserve"> </w:t>
+      </w:r>
+      <w:r>
+        <w:rPr>
+          <w:i/>
+          <w:iCs/>
+        </w:rPr>
+        <w:t xml:space="preserve">sh -c</w:t>
+      </w:r>
+      <w:r>
+        <w:t xml:space="preserve"> </w:t>
+      </w:r>
+      <w:r>
+        <w:t xml:space="preserve">strings and transparent wrappers such as</w:t>
+      </w:r>
+      <w:r>
+        <w:t xml:space="preserve"> </w:t>
+      </w:r>
+      <w:r>
+        <w:rPr>
+          <w:i/>
+          <w:iCs/>
+        </w:rPr>
+        <w:t xml:space="preserve">sudo</w:t>
+      </w:r>
+      <w:r>
+        <w:t xml:space="preserve"> </w:t>
+      </w:r>
+      <w:r>
+        <w:t xml:space="preserve">are analyzed as the command they run.</w:t>
+      </w:r>
+    </w:p>
+    <w:p>
+      <w:pPr>
+        <w:pStyle w:val="BodyText"/>
+      </w:pPr>
+      <w:r>
+        <w:rPr>
+          <w:b/>
+          <w:bCs/>
+        </w:rPr>
+        <w:t xml:space="preserve">Resolution.</w:t>
+      </w:r>
+      <w:r>
+        <w:t xml:space="preserve"> </w:t>
+      </w:r>
+      <w:r>
+        <w:t xml:space="preserve">Some targets exist only while the command runs:</w:t>
+      </w:r>
+      <w:r>
+        <w:t xml:space="preserve"> </w:t>
+      </w:r>
+      <w:r>
+        <w:rPr>
+          <w:i/>
+          <w:iCs/>
+        </w:rPr>
+        <w:t xml:space="preserve">rm $(ls *.log)</w:t>
+      </w:r>
+      <w:r>
+        <w:t xml:space="preserve">,</w:t>
+      </w:r>
+      <w:r>
+        <w:t xml:space="preserve"> </w:t>
+      </w:r>
+      <w:r>
+        <w:rPr>
+          <w:i/>
+          <w:iCs/>
+        </w:rPr>
+        <w:t xml:space="preserve">find -delete</w:t>
+      </w:r>
+      <w:r>
+        <w:t xml:space="preserve">,</w:t>
+      </w:r>
+      <w:r>
+        <w:t xml:space="preserve"> </w:t>
+      </w:r>
+      <w:r>
+        <w:rPr>
+          <w:i/>
+          <w:iCs/>
+        </w:rPr>
+        <w:t xml:space="preserve">xargs rm</w:t>
+      </w:r>
+      <w:r>
+        <w:t xml:space="preserve">,</w:t>
+      </w:r>
+      <w:r>
+        <w:t xml:space="preserve"> </w:t>
+      </w:r>
+      <w:r>
+        <w:rPr>
+          <w:i/>
+          <w:iCs/>
+        </w:rPr>
+        <w:t xml:space="preserve">git clean -f</w:t>
+      </w:r>
+      <w:r>
+        <w:t xml:space="preserve">,</w:t>
+      </w:r>
+      <w:r>
+        <w:t xml:space="preserve"> </w:t>
+      </w:r>
+      <w:r>
+        <w:rPr>
+          <w:i/>
+          <w:iCs/>
+        </w:rPr>
+        <w:t xml:space="preserve">tar -x</w:t>
+      </w:r>
+      <w:r>
+        <w:t xml:space="preserve">.  Rather than declaring these unknowable, the analysis learns them by running a form of the command that cannot change anything —</w:t>
+      </w:r>
+      <w:r>
+        <w:t xml:space="preserve"> </w:t>
+      </w:r>
+      <w:r>
+        <w:rPr>
+          <w:i/>
+          <w:iCs/>
+        </w:rPr>
+        <w:t xml:space="preserve">find</w:t>
+      </w:r>
+      <w:r>
+        <w:t xml:space="preserve"> </w:t>
+      </w:r>
+      <w:r>
+        <w:t xml:space="preserve">with each action replaced by a print of what the action would have touched, the read-only command that feeds</w:t>
+      </w:r>
+      <w:r>
+        <w:t xml:space="preserve"> </w:t>
+      </w:r>
+      <w:r>
+        <w:rPr>
+          <w:i/>
+          <w:iCs/>
+        </w:rPr>
+        <w:t xml:space="preserve">xargs</w:t>
+      </w:r>
+      <w:r>
+        <w:t xml:space="preserve">,</w:t>
+      </w:r>
+      <w:r>
+        <w:t xml:space="preserve"> </w:t>
+      </w:r>
+      <w:r>
+        <w:rPr>
+          <w:i/>
+          <w:iCs/>
+        </w:rPr>
+        <w:t xml:space="preserve">git clean -n</w:t>
+      </w:r>
+      <w:r>
+        <w:t xml:space="preserve">,</w:t>
+      </w:r>
+      <w:r>
+        <w:t xml:space="preserve"> </w:t>
+      </w:r>
+      <w:r>
+        <w:rPr>
+          <w:i/>
+          <w:iCs/>
+        </w:rPr>
+        <w:t xml:space="preserve">tar -t</w:t>
+      </w:r>
+      <w:r>
+        <w:t xml:space="preserve">,</w:t>
+      </w:r>
+      <w:r>
+        <w:t xml:space="preserve"> </w:t>
+      </w:r>
+      <w:r>
+        <w:rPr>
+          <w:i/>
+          <w:iCs/>
+        </w:rPr>
+        <w:t xml:space="preserve">rsync -n</w:t>
+      </w:r>
+      <w:r>
+        <w:t xml:space="preserve">, the body of a command substitution — and analyses the command again with the concrete targets in place.  A resolver is run only if the same analysis proves it has no effects, and it runs inside the bubblewrap sandbox with the whole filesystem mounted read-only; without bubblewrap, resolution is switched off and the command asks.  If it cannot be proven read-only, cannot run, or times out, the targets stay unresolved and the command asks.  Resolution is what makes a capture possible for commands whose targets a static reading cannot name.</w:t>
+      </w:r>
+    </w:p>
+    <w:bookmarkEnd w:id="91"/>
+    <w:bookmarkStart w:id="92" w:name="X7a556f1ad9397eabc869c1d1cec4dddff31661e"/>
+    <w:p>
+      <w:pPr>
+        <w:pStyle w:val="Heading4"/>
+      </w:pPr>
+      <w:r>
+        <w:t xml:space="preserve">c) Minimum-Cost Recovery-Plan Generation (Objective 3)</w:t>
+      </w:r>
+    </w:p>
+    <w:p>
+      <w:pPr>
+        <w:pStyle w:val="FirstParagraph"/>
+      </w:pPr>
+      <w:r>
+        <w:t xml:space="preserve">The recovery plan is a minimum-cost cover of the same set — for each effect, the cheapest mechanism sufficient to restore it, with redundant captures eliminated.  Cost is not uniform across mechanisms, which is what makes the selection non-trivial: a hardlink capture is independent of file size where a content copy is proportional to it, a single git object identifier covers an arbitrary number of tracked-file effects at once, and two effects on overlapping paths need be captured only once.  The mechanisms themselves — content backup, hardlink-based trash, git HEAD capture, permission-metadata capture — are those of the execution pipeline described in (e); the algorithm selects among them rather than introducing new ones.  A rename or move is the one removal that needs no capture, because the same data survives at the destination and undo is moving it back; compression and archiving are not, because the bytes at the destination are a transformation of the original and moving them back returns the wrong content, so they are captured like any other deletion.  Where a list can only refuse, the plan adds a capture that restores.</w:t>
+      </w:r>
+    </w:p>
+    <w:p>
+      <w:pPr>
+        <w:pStyle w:val="BodyText"/>
+      </w:pPr>
+      <w:r>
+        <w:t xml:space="preserve">Parts (a) to (c) are stated formally together below, so that the analysis can be checked directly rather than reconstructed from prose.</w:t>
+      </w:r>
+    </w:p>
+    <w:p>
+      <w:pPr>
+        <w:pStyle w:val="BodyText"/>
+      </w:pPr>
+      <w:r>
+        <w:t xml:space="preserve">Algorithm 1 Effect analysis and capture planning for a generated shell command</w:t>
+      </w:r>
+      <w:r>
+        <w:t xml:space="preserve"> </w:t>
+      </w:r>
+      <w:r>
+        <w:rPr>
+          <w:b/>
+          <w:bCs/>
+        </w:rPr>
+        <w:t xml:space="preserve">Input:</w:t>
+      </w:r>
+      <w:r>
+        <w:t xml:space="preserve"> </w:t>
+      </w:r>
+      <w:r>
+        <w:t xml:space="preserve">command c, working directory wd, capture mechanisms M</w:t>
+      </w:r>
+      <w:r>
+        <w:t xml:space="preserve"> </w:t>
+      </w:r>
+      <w:r>
+        <w:rPr>
+          <w:b/>
+          <w:bCs/>
+        </w:rPr>
+        <w:t xml:space="preserve">Output:</w:t>
+      </w:r>
+      <w:r>
+        <w:t xml:space="preserve"> </w:t>
+      </w:r>
+      <w:r>
+        <w:t xml:space="preserve">verdict in {RECOVERABLE, RECOVERABLE_WITH_CAPTURE, UNRECOVERABLE}</w:t>
+      </w:r>
+      <w:r>
+        <w:t xml:space="preserve"> </w:t>
+      </w:r>
+      <w:r>
+        <w:t xml:space="preserve">plan, a set of (mechanism, target) pairs</w:t>
+      </w:r>
+      <w:r>
+        <w:t xml:space="preserve"> </w:t>
+      </w:r>
+      <w:r>
+        <w:rPr>
+          <w:b/>
+          <w:bCs/>
+        </w:rPr>
+        <w:t xml:space="preserve">State:</w:t>
+      </w:r>
+      <w:r>
+        <w:t xml:space="preserve"> </w:t>
+      </w:r>
+      <w:r>
+        <w:t xml:space="preserve">overlay V of paths created or removed by earlier parts of c</w:t>
+      </w:r>
+      <w:r>
+        <w:t xml:space="preserve"> </w:t>
+      </w:r>
+      <w:r>
+        <w:rPr>
+          <w:b/>
+          <w:bCs/>
+        </w:rPr>
+        <w:t xml:space="preserve">function</w:t>
+      </w:r>
+      <w:r>
+        <w:t xml:space="preserve"> </w:t>
+      </w:r>
+      <w:r>
+        <w:t xml:space="preserve">EFFECTS(node, wd, V)</w:t>
+      </w:r>
+      <w:r>
+        <w:t xml:space="preserve"> </w:t>
+      </w:r>
+      <w:r>
+        <w:rPr>
+          <w:b/>
+          <w:bCs/>
+        </w:rPr>
+        <w:t xml:space="preserve">if</w:t>
+      </w:r>
+      <w:r>
+        <w:t xml:space="preserve"> </w:t>
+      </w:r>
+      <w:r>
+        <w:t xml:space="preserve">node is a leaf command</w:t>
+      </w:r>
+      <w:r>
+        <w:t xml:space="preserve"> </w:t>
+      </w:r>
+      <w:r>
+        <w:rPr>
+          <w:b/>
+          <w:bCs/>
+        </w:rPr>
+        <w:t xml:space="preserve">then</w:t>
+      </w:r>
+      <w:r>
+        <w:t xml:space="preserve"> </w:t>
+      </w:r>
+      <w:r>
+        <w:rPr>
+          <w:b/>
+          <w:bCs/>
+        </w:rPr>
+        <w:t xml:space="preserve">return</w:t>
+      </w:r>
+      <w:r>
+        <w:t xml:space="preserve"> </w:t>
+      </w:r>
+      <w:r>
+        <w:t xml:space="preserve">RULE(name, args, wd, V) // argument-aware; no rule gives {UNKNOWN}</w:t>
+      </w:r>
+      <w:r>
+        <w:t xml:space="preserve"> </w:t>
+      </w:r>
+      <w:r>
+        <w:rPr>
+          <w:b/>
+          <w:bCs/>
+        </w:rPr>
+        <w:t xml:space="preserve">else if</w:t>
+      </w:r>
+      <w:r>
+        <w:t xml:space="preserve"> </w:t>
+      </w:r>
+      <w:r>
+        <w:t xml:space="preserve">node = (A ; B), (A &amp;&amp; B), (A || B), or (A | B)</w:t>
+      </w:r>
+      <w:r>
+        <w:t xml:space="preserve"> </w:t>
+      </w:r>
+      <w:r>
+        <w:rPr>
+          <w:b/>
+          <w:bCs/>
+        </w:rPr>
+        <w:t xml:space="preserve">then</w:t>
+      </w:r>
+      <w:r>
+        <w:t xml:space="preserve"> </w:t>
+      </w:r>
+      <w:r>
+        <w:rPr>
+          <w:b/>
+          <w:bCs/>
+        </w:rPr>
+        <w:t xml:space="preserve">return</w:t>
+      </w:r>
+      <w:r>
+        <w:t xml:space="preserve"> </w:t>
+      </w:r>
+      <w:r>
+        <w:t xml:space="preserve">EFFECTS(A, wd, V) ∪ EFFECTS(B, wd, V) // B sees what A did, through V</w:t>
+      </w:r>
+      <w:r>
+        <w:t xml:space="preserve"> </w:t>
+      </w:r>
+      <w:r>
+        <w:rPr>
+          <w:b/>
+          <w:bCs/>
+        </w:rPr>
+        <w:t xml:space="preserve">else if</w:t>
+      </w:r>
+      <w:r>
+        <w:t xml:space="preserve"> </w:t>
+      </w:r>
+      <w:r>
+        <w:t xml:space="preserve">node has a redirect target t</w:t>
+      </w:r>
+      <w:r>
+        <w:t xml:space="preserve"> </w:t>
+      </w:r>
+      <w:r>
+        <w:rPr>
+          <w:b/>
+          <w:bCs/>
+        </w:rPr>
+        <w:t xml:space="preserve">then</w:t>
+      </w:r>
+      <w:r>
+        <w:t xml:space="preserve"> </w:t>
+      </w:r>
+      <w:r>
+        <w:rPr>
+          <w:b/>
+          <w:bCs/>
+        </w:rPr>
+        <w:t xml:space="preserve">return</w:t>
+      </w:r>
+      <w:r>
+        <w:t xml:space="preserve"> </w:t>
+      </w:r>
+      <w:r>
+        <w:t xml:space="preserve">EFFECTS(strip_redirect(node), wd, V) ∪ {write-or-create(t)}</w:t>
+      </w:r>
+      <w:r>
+        <w:t xml:space="preserve"> </w:t>
+      </w:r>
+      <w:r>
+        <w:rPr>
+          <w:b/>
+          <w:bCs/>
+        </w:rPr>
+        <w:t xml:space="preserve">else if</w:t>
+      </w:r>
+      <w:r>
+        <w:t xml:space="preserve"> </w:t>
+      </w:r>
+      <w:r>
+        <w:t xml:space="preserve">node = (for x in W; do body; done)</w:t>
+      </w:r>
+      <w:r>
+        <w:t xml:space="preserve"> </w:t>
+      </w:r>
+      <w:r>
+        <w:rPr>
+          <w:b/>
+          <w:bCs/>
+        </w:rPr>
+        <w:t xml:space="preserve">then</w:t>
+      </w:r>
+      <w:r>
+        <w:t xml:space="preserve"> </w:t>
+      </w:r>
+      <w:r>
+        <w:rPr>
+          <w:b/>
+          <w:bCs/>
+        </w:rPr>
+        <w:t xml:space="preserve">return</w:t>
+      </w:r>
+      <w:r>
+        <w:t xml:space="preserve"> </w:t>
+      </w:r>
+      <w:r>
+        <w:t xml:space="preserve">∪ over w in EXPAND(W) of EFFECTS(body[x := w], wd, V)</w:t>
+      </w:r>
+      <w:r>
+        <w:t xml:space="preserve"> </w:t>
+      </w:r>
+      <w:r>
+        <w:rPr>
+          <w:b/>
+          <w:bCs/>
+        </w:rPr>
+        <w:t xml:space="preserve">else if</w:t>
+      </w:r>
+      <w:r>
+        <w:t xml:space="preserve"> </w:t>
+      </w:r>
+      <w:r>
+        <w:t xml:space="preserve">node is sh -c s, or a wrapper such as sudo or env</w:t>
+      </w:r>
+      <w:r>
+        <w:t xml:space="preserve"> </w:t>
+      </w:r>
+      <w:r>
+        <w:rPr>
+          <w:b/>
+          <w:bCs/>
+        </w:rPr>
+        <w:t xml:space="preserve">then</w:t>
+      </w:r>
+      <w:r>
+        <w:t xml:space="preserve"> </w:t>
+      </w:r>
+      <w:r>
+        <w:rPr>
+          <w:b/>
+          <w:bCs/>
+        </w:rPr>
+        <w:t xml:space="preserve">return</w:t>
+      </w:r>
+      <w:r>
+        <w:t xml:space="preserve"> </w:t>
+      </w:r>
+      <w:r>
+        <w:t xml:space="preserve">EFFECTS(inner command, wd, V)</w:t>
+      </w:r>
+      <w:r>
+        <w:t xml:space="preserve"> </w:t>
+      </w:r>
+      <w:r>
+        <w:rPr>
+          <w:b/>
+          <w:bCs/>
+        </w:rPr>
+        <w:t xml:space="preserve">else if</w:t>
+      </w:r>
+      <w:r>
+        <w:t xml:space="preserve"> </w:t>
+      </w:r>
+      <w:r>
+        <w:t xml:space="preserve">node is find with -delete or -exec, or xargs</w:t>
+      </w:r>
+      <w:r>
+        <w:t xml:space="preserve"> </w:t>
+      </w:r>
+      <w:r>
+        <w:rPr>
+          <w:b/>
+          <w:bCs/>
+        </w:rPr>
+        <w:t xml:space="preserve">then</w:t>
+      </w:r>
+      <w:r>
+        <w:t xml:space="preserve"> </w:t>
+      </w:r>
+      <w:r>
+        <w:t xml:space="preserve">T ← RESOLVE(node)</w:t>
+      </w:r>
+      <w:r>
+        <w:t xml:space="preserve"> </w:t>
+      </w:r>
+      <w:r>
+        <w:rPr>
+          <w:b/>
+          <w:bCs/>
+        </w:rPr>
+        <w:t xml:space="preserve">if</w:t>
+      </w:r>
+      <w:r>
+        <w:t xml:space="preserve"> </w:t>
+      </w:r>
+      <w:r>
+        <w:t xml:space="preserve">T = ⊥</w:t>
+      </w:r>
+      <w:r>
+        <w:t xml:space="preserve"> </w:t>
+      </w:r>
+      <w:r>
+        <w:rPr>
+          <w:b/>
+          <w:bCs/>
+        </w:rPr>
+        <w:t xml:space="preserve">then return</w:t>
+      </w:r>
+      <w:r>
+        <w:t xml:space="preserve"> </w:t>
+      </w:r>
+      <w:r>
+        <w:t xml:space="preserve">{UNRESOLVED}</w:t>
+      </w:r>
+      <w:r>
+        <w:t xml:space="preserve"> </w:t>
+      </w:r>
+      <w:r>
+        <w:rPr>
+          <w:b/>
+          <w:bCs/>
+        </w:rPr>
+        <w:t xml:space="preserve">return</w:t>
+      </w:r>
+      <w:r>
+        <w:t xml:space="preserve"> </w:t>
+      </w:r>
+      <w:r>
+        <w:t xml:space="preserve">∪ over t in T of EFFECTS(action[{} := t], wd, V)</w:t>
+      </w:r>
+      <w:r>
+        <w:t xml:space="preserve"> </w:t>
+      </w:r>
+      <w:r>
+        <w:rPr>
+          <w:b/>
+          <w:bCs/>
+        </w:rPr>
+        <w:t xml:space="preserve">end if</w:t>
+      </w:r>
+      <w:r>
+        <w:t xml:space="preserve"> </w:t>
+      </w:r>
+      <w:r>
+        <w:rPr>
+          <w:b/>
+          <w:bCs/>
+        </w:rPr>
+        <w:t xml:space="preserve">end function</w:t>
+      </w:r>
+      <w:r>
+        <w:t xml:space="preserve"> </w:t>
+      </w:r>
+      <w:r>
+        <w:rPr>
+          <w:b/>
+          <w:bCs/>
+        </w:rPr>
+        <w:t xml:space="preserve">function</w:t>
+      </w:r>
+      <w:r>
+        <w:t xml:space="preserve"> </w:t>
+      </w:r>
+      <w:r>
+        <w:t xml:space="preserve">RESOLVE(node) // learns run-time targets, changing nothing</w:t>
+      </w:r>
+      <w:r>
+        <w:t xml:space="preserve"> </w:t>
+      </w:r>
+      <w:r>
+        <w:t xml:space="preserve">d ← DRYRUN(node) // find with actions replaced by prints; xargs' producer;</w:t>
+      </w:r>
+      <w:r>
+        <w:t xml:space="preserve"> </w:t>
+      </w:r>
+      <w:r>
+        <w:t xml:space="preserve">// git clean -n, tar -t, rsync -n; command substitutions</w:t>
+      </w:r>
+      <w:r>
+        <w:t xml:space="preserve"> </w:t>
+      </w:r>
+      <w:r>
+        <w:rPr>
+          <w:b/>
+          <w:bCs/>
+        </w:rPr>
+        <w:t xml:space="preserve">if</w:t>
+      </w:r>
+      <w:r>
+        <w:t xml:space="preserve"> </w:t>
+      </w:r>
+      <w:r>
+        <w:t xml:space="preserve">EFFECTS(d) ≠ ∅</w:t>
+      </w:r>
+      <w:r>
+        <w:t xml:space="preserve"> </w:t>
+      </w:r>
+      <w:r>
+        <w:rPr>
+          <w:b/>
+          <w:bCs/>
+        </w:rPr>
+        <w:t xml:space="preserve">or</w:t>
+      </w:r>
+      <w:r>
+        <w:t xml:space="preserve"> </w:t>
+      </w:r>
+      <w:r>
+        <w:t xml:space="preserve">d cannot run</w:t>
+      </w:r>
+      <w:r>
+        <w:t xml:space="preserve"> </w:t>
+      </w:r>
+      <w:r>
+        <w:rPr>
+          <w:b/>
+          <w:bCs/>
+        </w:rPr>
+        <w:t xml:space="preserve">then return</w:t>
+      </w:r>
+      <w:r>
+        <w:t xml:space="preserve"> </w:t>
+      </w:r>
+      <w:r>
+        <w:t xml:space="preserve">⊥ // only a proven read-only d is run</w:t>
+      </w:r>
+      <w:r>
+        <w:t xml:space="preserve"> </w:t>
+      </w:r>
+      <w:r>
+        <w:rPr>
+          <w:b/>
+          <w:bCs/>
+        </w:rPr>
+        <w:t xml:space="preserve">return</w:t>
+      </w:r>
+      <w:r>
+        <w:t xml:space="preserve"> </w:t>
+      </w:r>
+      <w:r>
+        <w:t xml:space="preserve">the targets d prints</w:t>
+      </w:r>
+      <w:r>
+        <w:t xml:space="preserve"> </w:t>
+      </w:r>
+      <w:r>
+        <w:rPr>
+          <w:b/>
+          <w:bCs/>
+        </w:rPr>
+        <w:t xml:space="preserve">end function</w:t>
+      </w:r>
+      <w:r>
+        <w:t xml:space="preserve"> </w:t>
+      </w:r>
+      <w:r>
+        <w:rPr>
+          <w:b/>
+          <w:bCs/>
+        </w:rPr>
+        <w:t xml:space="preserve">function</w:t>
+      </w:r>
+      <w:r>
+        <w:t xml:space="preserve"> </w:t>
+      </w:r>
+      <w:r>
+        <w:t xml:space="preserve">VERDICT(E)</w:t>
+      </w:r>
+      <w:r>
+        <w:t xml:space="preserve"> </w:t>
+      </w:r>
+      <w:r>
+        <w:rPr>
+          <w:b/>
+          <w:bCs/>
+        </w:rPr>
+        <w:t xml:space="preserve">if</w:t>
+      </w:r>
+      <w:r>
+        <w:t xml:space="preserve"> </w:t>
+      </w:r>
+      <w:r>
+        <w:t xml:space="preserve">UNRESOLVED ∈ E</w:t>
+      </w:r>
+      <w:r>
+        <w:t xml:space="preserve"> </w:t>
+      </w:r>
+      <w:r>
+        <w:rPr>
+          <w:b/>
+          <w:bCs/>
+        </w:rPr>
+        <w:t xml:space="preserve">or</w:t>
+      </w:r>
+      <w:r>
+        <w:t xml:space="preserve"> </w:t>
+      </w:r>
+      <w:r>
+        <w:t xml:space="preserve">UNKNOWN ∈ E</w:t>
+      </w:r>
+      <w:r>
+        <w:t xml:space="preserve"> </w:t>
+      </w:r>
+      <w:r>
+        <w:rPr>
+          <w:b/>
+          <w:bCs/>
+        </w:rPr>
+        <w:t xml:space="preserve">or</w:t>
+      </w:r>
+      <w:r>
+        <w:t xml:space="preserve"> </w:t>
+      </w:r>
+      <w:r>
+        <w:t xml:space="preserve">some effect has no capture</w:t>
+      </w:r>
+      <w:r>
+        <w:t xml:space="preserve"> </w:t>
+      </w:r>
+      <w:r>
+        <w:rPr>
+          <w:b/>
+          <w:bCs/>
+        </w:rPr>
+        <w:t xml:space="preserve">then return</w:t>
+      </w:r>
+      <w:r>
+        <w:t xml:space="preserve"> </w:t>
+      </w:r>
+      <w:r>
+        <w:t xml:space="preserve">UNRECOVERABLE</w:t>
+      </w:r>
+      <w:r>
+        <w:t xml:space="preserve"> </w:t>
+      </w:r>
+      <w:r>
+        <w:rPr>
+          <w:b/>
+          <w:bCs/>
+        </w:rPr>
+        <w:t xml:space="preserve">if</w:t>
+      </w:r>
+      <w:r>
+        <w:t xml:space="preserve"> </w:t>
+      </w:r>
+      <w:r>
+        <w:t xml:space="preserve">every effect in E is a create or a move</w:t>
+      </w:r>
+      <w:r>
+        <w:t xml:space="preserve"> </w:t>
+      </w:r>
+      <w:r>
+        <w:rPr>
+          <w:b/>
+          <w:bCs/>
+        </w:rPr>
+        <w:t xml:space="preserve">then return</w:t>
+      </w:r>
+      <w:r>
+        <w:t xml:space="preserve"> </w:t>
+      </w:r>
+      <w:r>
+        <w:t xml:space="preserve">RECOVERABLE</w:t>
+      </w:r>
+      <w:r>
+        <w:t xml:space="preserve"> </w:t>
+      </w:r>
+      <w:r>
+        <w:rPr>
+          <w:b/>
+          <w:bCs/>
+        </w:rPr>
+        <w:t xml:space="preserve">return</w:t>
+      </w:r>
+      <w:r>
+        <w:t xml:space="preserve"> </w:t>
+      </w:r>
+      <w:r>
+        <w:t xml:space="preserve">RECOVERABLE_WITH_CAPTURE</w:t>
+      </w:r>
+      <w:r>
+        <w:t xml:space="preserve"> </w:t>
+      </w:r>
+      <w:r>
+        <w:rPr>
+          <w:b/>
+          <w:bCs/>
+        </w:rPr>
+        <w:t xml:space="preserve">end function</w:t>
+      </w:r>
+      <w:r>
+        <w:t xml:space="preserve"> </w:t>
+      </w:r>
+      <w:r>
+        <w:rPr>
+          <w:b/>
+          <w:bCs/>
+        </w:rPr>
+        <w:t xml:space="preserve">function</w:t>
+      </w:r>
+      <w:r>
+        <w:t xml:space="preserve"> </w:t>
+      </w:r>
+      <w:r>
+        <w:t xml:space="preserve">PLAN(E, M)</w:t>
+      </w:r>
+      <w:r>
+        <w:t xml:space="preserve"> </w:t>
+      </w:r>
+      <w:r>
+        <w:t xml:space="preserve">P ← ∅</w:t>
+      </w:r>
+      <w:r>
+        <w:t xml:space="preserve"> </w:t>
+      </w:r>
+      <w:r>
+        <w:rPr>
+          <w:b/>
+          <w:bCs/>
+        </w:rPr>
+        <w:t xml:space="preserve">for each</w:t>
+      </w:r>
+      <w:r>
+        <w:t xml:space="preserve"> </w:t>
+      </w:r>
+      <w:r>
+        <w:t xml:space="preserve">path p with a remove, write, or metadata effect in E, in path order</w:t>
+      </w:r>
+      <w:r>
+        <w:t xml:space="preserve"> </w:t>
+      </w:r>
+      <w:r>
+        <w:rPr>
+          <w:b/>
+          <w:bCs/>
+        </w:rPr>
+        <w:t xml:space="preserve">do</w:t>
+      </w:r>
+      <w:r>
+        <w:t xml:space="preserve"> </w:t>
+      </w:r>
+      <w:r>
+        <w:rPr>
+          <w:b/>
+          <w:bCs/>
+        </w:rPr>
+        <w:t xml:space="preserve">if</w:t>
+      </w:r>
+      <w:r>
+        <w:t xml:space="preserve"> </w:t>
+      </w:r>
+      <w:r>
+        <w:t xml:space="preserve">p lies under a directory already hardlinked in P</w:t>
+      </w:r>
+      <w:r>
+        <w:t xml:space="preserve"> </w:t>
+      </w:r>
+      <w:r>
+        <w:rPr>
+          <w:b/>
+          <w:bCs/>
+        </w:rPr>
+        <w:t xml:space="preserve">then continue</w:t>
+      </w:r>
+      <w:r>
+        <w:t xml:space="preserve"> </w:t>
+      </w:r>
+      <w:r>
+        <w:t xml:space="preserve">m* ← the cheapest mechanism in M that restores p's effect // hardlink for a removal,</w:t>
+      </w:r>
+      <w:r>
+        <w:t xml:space="preserve"> </w:t>
+      </w:r>
+      <w:r>
+        <w:t xml:space="preserve">// copy for an overwrite, record for a mode</w:t>
+      </w:r>
+      <w:r>
+        <w:t xml:space="preserve"> </w:t>
+      </w:r>
+      <w:r>
+        <w:t xml:space="preserve">P ← P ∪ {(m*, p)}</w:t>
+      </w:r>
+      <w:r>
+        <w:t xml:space="preserve"> </w:t>
+      </w:r>
+      <w:r>
+        <w:rPr>
+          <w:b/>
+          <w:bCs/>
+        </w:rPr>
+        <w:t xml:space="preserve">end for</w:t>
+      </w:r>
+      <w:r>
+        <w:t xml:space="preserve"> </w:t>
+      </w:r>
+      <w:r>
+        <w:rPr>
+          <w:b/>
+          <w:bCs/>
+        </w:rPr>
+        <w:t xml:space="preserve">return</w:t>
+      </w:r>
+      <w:r>
+        <w:t xml:space="preserve"> </w:t>
+      </w:r>
+      <w:r>
+        <w:t xml:space="preserve">P</w:t>
+      </w:r>
+      <w:r>
+        <w:t xml:space="preserve"> </w:t>
+      </w:r>
+      <w:r>
+        <w:rPr>
+          <w:b/>
+          <w:bCs/>
+        </w:rPr>
+        <w:t xml:space="preserve">end function</w:t>
+      </w:r>
+    </w:p>
+    <w:p>
+      <w:pPr>
+        <w:pStyle w:val="BodyText"/>
+      </w:pPr>
+      <w:r>
+        <w:rPr>
+          <w:b/>
+          <w:bCs/>
+        </w:rPr>
+        <w:t xml:space="preserve">Algorithm 1.</w:t>
+      </w:r>
+      <w:r>
+        <w:t xml:space="preserve"> </w:t>
+      </w:r>
+      <w:r>
+        <w:t xml:space="preserve">EFFECTS derives and composes the effect set, applying rules to the leaves and resolving wrappers through RESOLVE; RESOLVE learns run-time targets by running only a form of the command proven to have no effects; VERDICT and PLAN decide and cover.  UNRESOLVED and UNKNOWN are the sentinels that give the analysis its one-sided soundness: they can only push the verdict toward UNRECOVERABLE.  A move (a removal whose data survives at another path) is the only removal PLAN does not capture.</w:t>
+      </w:r>
+    </w:p>
+    <w:bookmarkEnd w:id="92"/>
+    <w:bookmarkStart w:id="93" w:name="X5a80e7e58358dac7f19a61ad7301f220b3369ff"/>
+    <w:p>
+      <w:pPr>
+        <w:pStyle w:val="Heading4"/>
+      </w:pPr>
+      <w:r>
+        <w:t xml:space="preserve">d) Experimental Platform: Conversational Interface Layer</w:t>
       </w:r>
     </w:p>
     <w:p>
@@ -6852,14 +8690,14 @@
         <w:t xml:space="preserve">This selection was reconfirmed against models released after the initial literature review, to guard against the fast-moving small-model landscape becoming stale before study execution; no smaller alternative offered comparable shell-generation evidence within the same CPU-only hardware budget [15].  Newer mixture-of-experts variants require all experts resident in memory regardless of active parameters per token, which is incompatible with this study’s memory budget, and newer general-purpose small models report reasoning benchmarks but no shell-command generation evidence.</w:t>
       </w:r>
     </w:p>
-    <w:bookmarkEnd w:id="87"/>
-    <w:bookmarkStart w:id="88" w:name="b-execution-pipeline"/>
+    <w:bookmarkEnd w:id="93"/>
+    <w:bookmarkStart w:id="94" w:name="e-execution-pipeline"/>
     <w:p>
       <w:pPr>
         <w:pStyle w:val="Heading4"/>
       </w:pPr>
       <w:r>
-        <w:t xml:space="preserve">b) Execution Pipeline</w:t>
+        <w:t xml:space="preserve">e) Execution Pipeline</w:t>
       </w:r>
     </w:p>
     <w:p>
@@ -6867,7 +8705,7 @@
         <w:pStyle w:val="FirstParagraph"/>
       </w:pPr>
       <w:r>
-        <w:t xml:space="preserve">Once the intent parser produces a shell command, SynapseOS passes it through a confirmation gate and an undo journal before execution, following the reversibility-and-guardrail framing established for LLM-powered natural language shells [9] and the preview-and-confirm design guideline validated with motor-impaired users of an LLM-mediated assistive-robotics interface [28].  The command is first classified by reversibility: operations that are irreversible — such as file deletion, system configuration changes, or destructive package operations — trigger a confirmation prompt requiring explicit user approval before execution proceeds.  Every executed command is recorded to a persistent undo journal before it runs.  Reversible operations are logged for replay-based reversal; a command classified irreversible and then approved is additionally captured by one of five mechanisms — full content backup, hardlink-based trash, git HEAD capture, permission-metadata capture, or, for package and service state, an inverse command — so that a command approved in error remains recoverable.  Rollback is invoked through a dedicated undo command rather than from within the conversation.  Once the gate has passed it, the command is dispatched to a bash subprocess.  Standard output and standard error are captured and rendered in the conversational surface as the system’s response to the original natural language input.</w:t>
+        <w:t xml:space="preserve">Once the intent parser produces a shell command, SynapseOS passes it through a confirmation gate and an undo journal before execution, following the reversibility-and-guardrail framing established for LLM-powered natural language shells [9] and the preview-and-confirm design guideline validated with motor-impaired users of an LLM-mediated assistive-robotics interface [28].  The command is first classified by reversibility: operations that are irreversible — such as file deletion, system configuration changes, or destructive package operations — trigger a confirmation prompt requiring explicit user approval before execution proceeds.  Every executed command is recorded to a persistent undo journal before it runs.  Reversible operations are logged for replay-based reversal; a command classified irreversible and then approved is additionally captured by one of five mechanisms — full content backup, hardlink-based trash, git HEAD capture, permission-metadata capture, or, for package and service state, an inverse command — so that a command approved in error remains recoverable.  With the analysis enabled, the gate consumes the analysis’s verdict, and the captures taken are those its plan names, (a) to (c), rather than the list’s.  Rollback is invoked through a dedicated undo command rather than from within the conversation.  Once the gate has passed it, the command is dispatched to a bash subprocess.  Standard output and standard error are captured and rendered in the conversational surface as the system’s response to the original natural language input.</w:t>
       </w:r>
     </w:p>
     <w:p>
@@ -6878,14 +8716,15 @@
         <w:t xml:space="preserve">SynapseOS executes only shell-expressible operations.  The system’s capability boundary is the Linux command-line toolchain: file management, process control, text processing, package management, network configuration, and any application that exposes a command-line interface.  GUI-only interactions — clicking buttons in graphical applications, navigating web page elements, or interacting with visual-only interfaces — are explicitly outside scope, in deliberate contrast to broader desktop agent frameworks that additionally orchestrate GUI automation atop the existing session [45].  This boundary is intentional: it constrains the research to a tractable, verifiable claim that the system can be built, evaluated, and defended within the thesis timeline.</w:t>
       </w:r>
     </w:p>
-    <w:bookmarkEnd w:id="88"/>
-    <w:bookmarkStart w:id="89" w:name="c-recoverability-analysis"/>
-    <w:p>
-      <w:pPr>
-        <w:pStyle w:val="Heading4"/>
-      </w:pPr>
-      <w:r>
-        <w:t xml:space="preserve">c) Recoverability Analysis</w:t>
+    <w:bookmarkEnd w:id="94"/>
+    <w:bookmarkEnd w:id="95"/>
+    <w:bookmarkStart w:id="96" w:name="ch3-sec2-2"/>
+    <w:p>
+      <w:pPr>
+        <w:pStyle w:val="Heading3"/>
+      </w:pPr>
+      <w:r>
+        <w:t xml:space="preserve">2.2 Data pre-processing</w:t>
       </w:r>
     </w:p>
     <w:p>
@@ -6893,1551 +8732,7 @@
         <w:pStyle w:val="FirstParagraph"/>
       </w:pPr>
       <w:r>
-        <w:t xml:space="preserve">The reversibility classification described above is an enumerated list of named command shapes: a proposed command is matched against patterns known to be destructive —</w:t>
-      </w:r>
-      <w:r>
-        <w:t xml:space="preserve"> </w:t>
-      </w:r>
-      <w:r>
-        <w:rPr>
-          <w:i/>
-          <w:iCs/>
-        </w:rPr>
-        <w:t xml:space="preserve">rm</w:t>
-      </w:r>
-      <w:r>
-        <w:t xml:space="preserve">,</w:t>
-      </w:r>
-      <w:r>
-        <w:t xml:space="preserve"> </w:t>
-      </w:r>
-      <w:r>
-        <w:rPr>
-          <w:i/>
-          <w:iCs/>
-        </w:rPr>
-        <w:t xml:space="preserve">dd</w:t>
-      </w:r>
-      <w:r>
-        <w:t xml:space="preserve">,</w:t>
-      </w:r>
-      <w:r>
-        <w:t xml:space="preserve"> </w:t>
-      </w:r>
-      <w:r>
-        <w:rPr>
-          <w:i/>
-          <w:iCs/>
-        </w:rPr>
-        <w:t xml:space="preserve">mkfs</w:t>
-      </w:r>
-      <w:r>
-        <w:t xml:space="preserve">, truncating redirects — and gated if it matches.  That mechanism is the baseline this study seeks to replace, and its limitations are structural rather than incidental.  It cannot enumerate its domain, because the space of destructive commands is open-ended: extending the list to cover</w:t>
-      </w:r>
-      <w:r>
-        <w:t xml:space="preserve"> </w:t>
-      </w:r>
-      <w:r>
-        <w:rPr>
-          <w:i/>
-          <w:iCs/>
-        </w:rPr>
-        <w:t xml:space="preserve">apt</w:t>
-      </w:r>
-      <w:r>
-        <w:t xml:space="preserve"> </w:t>
-      </w:r>
-      <w:r>
-        <w:t xml:space="preserve">leaves</w:t>
-      </w:r>
-      <w:r>
-        <w:t xml:space="preserve"> </w:t>
-      </w:r>
-      <w:r>
-        <w:rPr>
-          <w:i/>
-          <w:iCs/>
-        </w:rPr>
-        <w:t xml:space="preserve">snap</w:t>
-      </w:r>
-      <w:r>
-        <w:t xml:space="preserve">,</w:t>
-      </w:r>
-      <w:r>
-        <w:t xml:space="preserve"> </w:t>
-      </w:r>
-      <w:r>
-        <w:rPr>
-          <w:i/>
-          <w:iCs/>
-        </w:rPr>
-        <w:t xml:space="preserve">pip</w:t>
-      </w:r>
-      <w:r>
-        <w:t xml:space="preserve">,</w:t>
-      </w:r>
-      <w:r>
-        <w:t xml:space="preserve"> </w:t>
-      </w:r>
-      <w:r>
-        <w:rPr>
-          <w:i/>
-          <w:iCs/>
-        </w:rPr>
-        <w:t xml:space="preserve">docker rm</w:t>
-      </w:r>
-      <w:r>
-        <w:t xml:space="preserve">, and whatever ships next.  It does not compose, because each rule matches a command in isolation while a generated line routinely chains several operations with differing recovery requirements.  And it reasons about names rather than effects:</w:t>
-      </w:r>
-      <w:r>
-        <w:t xml:space="preserve"> </w:t>
-      </w:r>
-      <w:r>
-        <w:rPr>
-          <w:i/>
-          <w:iCs/>
-        </w:rPr>
-        <w:t xml:space="preserve">cp a b</w:t>
-      </w:r>
-      <w:r>
-        <w:t xml:space="preserve"> </w:t>
-      </w:r>
-      <w:r>
-        <w:t xml:space="preserve">is harmless when</w:t>
-      </w:r>
-      <w:r>
-        <w:t xml:space="preserve"> </w:t>
-      </w:r>
-      <w:r>
-        <w:rPr>
-          <w:i/>
-          <w:iCs/>
-        </w:rPr>
-        <w:t xml:space="preserve">b</w:t>
-      </w:r>
-      <w:r>
-        <w:t xml:space="preserve"> </w:t>
-      </w:r>
-      <w:r>
-        <w:t xml:space="preserve">does not exist and destructive when it does, a distinction no name-matching rule can draw.</w:t>
-      </w:r>
-    </w:p>
-    <w:p>
-      <w:pPr>
-        <w:pStyle w:val="BodyText"/>
-      </w:pPr>
-      <w:r>
-        <w:t xml:space="preserve">This study therefore proposes an algorithm that derives what a command would do from its syntactic structure, and decides recoverability over that derivation.  It produces two outputs: a</w:t>
-      </w:r>
-      <w:r>
-        <w:t xml:space="preserve"> </w:t>
-      </w:r>
-      <w:r>
-        <w:rPr>
-          <w:b/>
-          <w:bCs/>
-        </w:rPr>
-        <w:t xml:space="preserve">verdict</w:t>
-      </w:r>
-      <w:r>
-        <w:t xml:space="preserve"> </w:t>
-      </w:r>
-      <w:r>
-        <w:t xml:space="preserve">— recoverable, recoverable only with prior capture, or unrecoverable — and, for the middle case, a</w:t>
-      </w:r>
-      <w:r>
-        <w:t xml:space="preserve"> </w:t>
-      </w:r>
-      <w:r>
-        <w:rPr>
-          <w:b/>
-          <w:bCs/>
-        </w:rPr>
-        <w:t xml:space="preserve">recovery plan</w:t>
-      </w:r>
-      <w:r>
-        <w:t xml:space="preserve"> </w:t>
-      </w:r>
-      <w:r>
-        <w:t xml:space="preserve">naming which pre-images must be captured, and by which mechanism, before the command is allowed to run.</w:t>
-      </w:r>
-    </w:p>
-    <w:p>
-      <w:pPr>
-        <w:pStyle w:val="BodyText"/>
-      </w:pPr>
-      <w:r>
-        <w:rPr>
-          <w:b/>
-          <w:bCs/>
-        </w:rPr>
-        <w:t xml:space="preserve">The formal object.</w:t>
-      </w:r>
-      <w:r>
-        <w:t xml:space="preserve"> </w:t>
-      </w:r>
-      <w:r>
-        <w:t xml:space="preserve">A command is represented by its</w:t>
-      </w:r>
-      <w:r>
-        <w:t xml:space="preserve"> </w:t>
-      </w:r>
-      <w:r>
-        <w:rPr>
-          <w:i/>
-          <w:iCs/>
-        </w:rPr>
-        <w:t xml:space="preserve">effect set</w:t>
-      </w:r>
-      <w:r>
-        <w:t xml:space="preserve"> </w:t>
-      </w:r>
-      <w:r>
-        <w:t xml:space="preserve">rather than by its name.  An individual</w:t>
-      </w:r>
-      <w:r>
-        <w:t xml:space="preserve"> </w:t>
-      </w:r>
-      <w:r>
-        <w:rPr>
-          <w:i/>
-          <w:iCs/>
-        </w:rPr>
-        <w:t xml:space="preserve">effect</w:t>
-      </w:r>
-      <w:r>
-        <w:t xml:space="preserve"> </w:t>
-      </w:r>
-      <w:r>
-        <w:t xml:space="preserve">is a triple: a kind, drawn from {</w:t>
-      </w:r>
-      <w:r>
-        <w:rPr>
-          <w:i/>
-          <w:iCs/>
-        </w:rPr>
-        <w:t xml:space="preserve">read</w:t>
-      </w:r>
-      <w:r>
-        <w:t xml:space="preserve">,</w:t>
-      </w:r>
-      <w:r>
-        <w:t xml:space="preserve"> </w:t>
-      </w:r>
-      <w:r>
-        <w:rPr>
-          <w:i/>
-          <w:iCs/>
-        </w:rPr>
-        <w:t xml:space="preserve">create</w:t>
-      </w:r>
-      <w:r>
-        <w:t xml:space="preserve">,</w:t>
-      </w:r>
-      <w:r>
-        <w:t xml:space="preserve"> </w:t>
-      </w:r>
-      <w:r>
-        <w:rPr>
-          <w:i/>
-          <w:iCs/>
-        </w:rPr>
-        <w:t xml:space="preserve">write</w:t>
-      </w:r>
-      <w:r>
-        <w:t xml:space="preserve">,</w:t>
-      </w:r>
-      <w:r>
-        <w:t xml:space="preserve"> </w:t>
-      </w:r>
-      <w:r>
-        <w:rPr>
-          <w:i/>
-          <w:iCs/>
-        </w:rPr>
-        <w:t xml:space="preserve">remove</w:t>
-      </w:r>
-      <w:r>
-        <w:t xml:space="preserve">,</w:t>
-      </w:r>
-      <w:r>
-        <w:t xml:space="preserve"> </w:t>
-      </w:r>
-      <w:r>
-        <w:rPr>
-          <w:i/>
-          <w:iCs/>
-        </w:rPr>
-        <w:t xml:space="preserve">metadata</w:t>
-      </w:r>
-      <w:r>
-        <w:t xml:space="preserve">}; a target path, resolved against the working directory in which the command would execute; and the pre-image that would have to be captured for that effect to be reversed.  The effect set of a command is the union of the effects of every leaf command within it, taken over the whole of its operator structure.</w:t>
-      </w:r>
-    </w:p>
-    <w:p>
-      <w:pPr>
-        <w:pStyle w:val="BodyText"/>
-      </w:pPr>
-      <w:r>
-        <w:rPr>
-          <w:b/>
-          <w:bCs/>
-        </w:rPr>
-        <w:t xml:space="preserve">Extraction.</w:t>
-      </w:r>
-      <w:r>
-        <w:t xml:space="preserve"> </w:t>
-      </w:r>
-      <w:r>
-        <w:t xml:space="preserve">For each leaf command, effects are derived from the command together with its arguments.  The derivation is argument-aware because flags change effects and not merely behavior:</w:t>
-      </w:r>
-      <w:r>
-        <w:t xml:space="preserve"> </w:t>
-      </w:r>
-      <w:r>
-        <w:rPr>
-          <w:i/>
-          <w:iCs/>
-        </w:rPr>
-        <w:t xml:space="preserve">rm -i</w:t>
-      </w:r>
-      <w:r>
-        <w:t xml:space="preserve"> </w:t>
-      </w:r>
-      <w:r>
-        <w:t xml:space="preserve">differs from</w:t>
-      </w:r>
-      <w:r>
-        <w:t xml:space="preserve"> </w:t>
-      </w:r>
-      <w:r>
-        <w:rPr>
-          <w:i/>
-          <w:iCs/>
-        </w:rPr>
-        <w:t xml:space="preserve">rm -f</w:t>
-      </w:r>
-      <w:r>
-        <w:t xml:space="preserve"> </w:t>
-      </w:r>
-      <w:r>
-        <w:t xml:space="preserve">in whether removal is certain,</w:t>
-      </w:r>
-      <w:r>
-        <w:t xml:space="preserve"> </w:t>
-      </w:r>
-      <w:r>
-        <w:rPr>
-          <w:i/>
-          <w:iCs/>
-        </w:rPr>
-        <w:t xml:space="preserve">cp -n</w:t>
-      </w:r>
-      <w:r>
-        <w:t xml:space="preserve"> </w:t>
-      </w:r>
-      <w:r>
-        <w:t xml:space="preserve">cannot overwrite where</w:t>
-      </w:r>
-      <w:r>
-        <w:t xml:space="preserve"> </w:t>
-      </w:r>
-      <w:r>
-        <w:rPr>
-          <w:i/>
-          <w:iCs/>
-        </w:rPr>
-        <w:t xml:space="preserve">cp</w:t>
-      </w:r>
-      <w:r>
-        <w:t xml:space="preserve"> </w:t>
-      </w:r>
-      <w:r>
-        <w:t xml:space="preserve">can, and</w:t>
-      </w:r>
-      <w:r>
-        <w:t xml:space="preserve"> </w:t>
-      </w:r>
-      <w:r>
-        <w:rPr>
-          <w:i/>
-          <w:iCs/>
-        </w:rPr>
-        <w:t xml:space="preserve">chmod</w:t>
-      </w:r>
-      <w:r>
-        <w:t xml:space="preserve"> </w:t>
-      </w:r>
-      <w:r>
-        <w:t xml:space="preserve">with and without</w:t>
-      </w:r>
-      <w:r>
-        <w:t xml:space="preserve"> </w:t>
-      </w:r>
-      <w:r>
-        <w:rPr>
-          <w:i/>
-          <w:iCs/>
-        </w:rPr>
-        <w:t xml:space="preserve">-R</w:t>
-      </w:r>
-      <w:r>
-        <w:t xml:space="preserve"> </w:t>
-      </w:r>
-      <w:r>
-        <w:t xml:space="preserve">differ in how many paths acquire a metadata effect.</w:t>
-      </w:r>
-    </w:p>
-    <w:p>
-      <w:pPr>
-        <w:pStyle w:val="BodyText"/>
-      </w:pPr>
-      <w:r>
-        <w:rPr>
-          <w:b/>
-          <w:bCs/>
-        </w:rPr>
-        <w:t xml:space="preserve">Composition.</w:t>
-      </w:r>
-      <w:r>
-        <w:t xml:space="preserve"> </w:t>
-      </w:r>
-      <w:r>
-        <w:t xml:space="preserve">Effects propagate upward through the operators that join commands into a single line, and the propagation rule differs by operator.  Sequencing with</w:t>
-      </w:r>
-      <w:r>
-        <w:t xml:space="preserve"> </w:t>
-      </w:r>
-      <w:r>
-        <w:rPr>
-          <w:i/>
-          <w:iCs/>
-        </w:rPr>
-        <w:t xml:space="preserve">;</w:t>
-      </w:r>
-      <w:r>
-        <w:t xml:space="preserve"> </w:t>
-      </w:r>
-      <w:r>
-        <w:t xml:space="preserve">accumulates effects unconditionally.  Conjunction and disjunction —</w:t>
-      </w:r>
-      <w:r>
-        <w:t xml:space="preserve"> </w:t>
-      </w:r>
-      <w:r>
-        <w:rPr>
-          <w:i/>
-          <w:iCs/>
-        </w:rPr>
-        <w:t xml:space="preserve">&amp;&amp;</w:t>
-      </w:r>
-      <w:r>
-        <w:t xml:space="preserve"> </w:t>
-      </w:r>
-      <w:r>
-        <w:t xml:space="preserve">and</w:t>
-      </w:r>
-      <w:r>
-        <w:t xml:space="preserve"> </w:t>
-      </w:r>
-      <w:r>
-        <w:rPr>
-          <w:i/>
-          <w:iCs/>
-        </w:rPr>
-        <w:t xml:space="preserve">||</w:t>
-      </w:r>
-      <w:r>
-        <w:t xml:space="preserve"> </w:t>
-      </w:r>
-      <w:r>
-        <w:t xml:space="preserve">— make later effects conditional on an earlier exit status, so the effect set is a union over the branches that may execute.  A pipeline connects standard output to standard input and contributes no filesystem effect of its own, but determines the exit status that gates whatever follows it.  Redirection introduces write or truncate effects that appear in no command in the pipeline.  Command substitution introduces effects whose targets are computable only at runtime, and</w:t>
-      </w:r>
-      <w:r>
-        <w:t xml:space="preserve"> </w:t>
-      </w:r>
-      <w:r>
-        <w:rPr>
-          <w:i/>
-          <w:iCs/>
-        </w:rPr>
-        <w:t xml:space="preserve">xargs</w:t>
-      </w:r>
-      <w:r>
-        <w:t xml:space="preserve"> </w:t>
-      </w:r>
-      <w:r>
-        <w:t xml:space="preserve">and</w:t>
-      </w:r>
-      <w:r>
-        <w:t xml:space="preserve"> </w:t>
-      </w:r>
-      <w:r>
-        <w:rPr>
-          <w:i/>
-          <w:iCs/>
-        </w:rPr>
-        <w:t xml:space="preserve">find -exec</w:t>
-      </w:r>
-      <w:r>
-        <w:t xml:space="preserve"> </w:t>
-      </w:r>
-      <w:r>
-        <w:t xml:space="preserve">multiply a command across an argument set that is not statically known.  It is this propagation, rather than the per-command derivation, that an enumerated pattern list has no means of expressing.  Parts of a line are analyzed in order against an overlay of what earlier parts created or removed, so that in</w:t>
-      </w:r>
-      <w:r>
-        <w:t xml:space="preserve"> </w:t>
-      </w:r>
-      <w:r>
-        <w:rPr>
-          <w:i/>
-          <w:iCs/>
-        </w:rPr>
-        <w:t xml:space="preserve">mkdir out &amp;&amp; cp a.txt out/</w:t>
-      </w:r>
-      <w:r>
-        <w:t xml:space="preserve"> </w:t>
-      </w:r>
-      <w:r>
-        <w:t xml:space="preserve">the copy lands in a directory that does not yet exist, and a path a line creates and then deletes needs no capture because there was nothing there to lose.  Loops are analyzed once per resolved item with the loop variable bound;</w:t>
-      </w:r>
-      <w:r>
-        <w:t xml:space="preserve"> </w:t>
-      </w:r>
-      <w:r>
-        <w:rPr>
-          <w:i/>
-          <w:iCs/>
-        </w:rPr>
-        <w:t xml:space="preserve">sh -c</w:t>
-      </w:r>
-      <w:r>
-        <w:t xml:space="preserve"> </w:t>
-      </w:r>
-      <w:r>
-        <w:t xml:space="preserve">strings and transparent wrappers such as</w:t>
-      </w:r>
-      <w:r>
-        <w:t xml:space="preserve"> </w:t>
-      </w:r>
-      <w:r>
-        <w:rPr>
-          <w:i/>
-          <w:iCs/>
-        </w:rPr>
-        <w:t xml:space="preserve">sudo</w:t>
-      </w:r>
-      <w:r>
-        <w:t xml:space="preserve"> </w:t>
-      </w:r>
-      <w:r>
-        <w:t xml:space="preserve">are analyzed as the command they run.</w:t>
-      </w:r>
-    </w:p>
-    <w:p>
-      <w:pPr>
-        <w:pStyle w:val="BodyText"/>
-      </w:pPr>
-      <w:r>
-        <w:rPr>
-          <w:b/>
-          <w:bCs/>
-        </w:rPr>
-        <w:t xml:space="preserve">Resolution.</w:t>
-      </w:r>
-      <w:r>
-        <w:t xml:space="preserve"> </w:t>
-      </w:r>
-      <w:r>
-        <w:t xml:space="preserve">Some targets exist only while the command runs:</w:t>
-      </w:r>
-      <w:r>
-        <w:t xml:space="preserve"> </w:t>
-      </w:r>
-      <w:r>
-        <w:rPr>
-          <w:i/>
-          <w:iCs/>
-        </w:rPr>
-        <w:t xml:space="preserve">rm $(ls *.log)</w:t>
-      </w:r>
-      <w:r>
-        <w:t xml:space="preserve">,</w:t>
-      </w:r>
-      <w:r>
-        <w:t xml:space="preserve"> </w:t>
-      </w:r>
-      <w:r>
-        <w:rPr>
-          <w:i/>
-          <w:iCs/>
-        </w:rPr>
-        <w:t xml:space="preserve">find -delete</w:t>
-      </w:r>
-      <w:r>
-        <w:t xml:space="preserve">,</w:t>
-      </w:r>
-      <w:r>
-        <w:t xml:space="preserve"> </w:t>
-      </w:r>
-      <w:r>
-        <w:rPr>
-          <w:i/>
-          <w:iCs/>
-        </w:rPr>
-        <w:t xml:space="preserve">xargs rm</w:t>
-      </w:r>
-      <w:r>
-        <w:t xml:space="preserve">,</w:t>
-      </w:r>
-      <w:r>
-        <w:t xml:space="preserve"> </w:t>
-      </w:r>
-      <w:r>
-        <w:rPr>
-          <w:i/>
-          <w:iCs/>
-        </w:rPr>
-        <w:t xml:space="preserve">git clean -f</w:t>
-      </w:r>
-      <w:r>
-        <w:t xml:space="preserve">,</w:t>
-      </w:r>
-      <w:r>
-        <w:t xml:space="preserve"> </w:t>
-      </w:r>
-      <w:r>
-        <w:rPr>
-          <w:i/>
-          <w:iCs/>
-        </w:rPr>
-        <w:t xml:space="preserve">tar -x</w:t>
-      </w:r>
-      <w:r>
-        <w:t xml:space="preserve">.  Rather than declaring these unknowable, the analysis learns them by running a form of the command that cannot change anything —</w:t>
-      </w:r>
-      <w:r>
-        <w:t xml:space="preserve"> </w:t>
-      </w:r>
-      <w:r>
-        <w:rPr>
-          <w:i/>
-          <w:iCs/>
-        </w:rPr>
-        <w:t xml:space="preserve">find</w:t>
-      </w:r>
-      <w:r>
-        <w:t xml:space="preserve"> </w:t>
-      </w:r>
-      <w:r>
-        <w:t xml:space="preserve">with each action replaced by a print of what the action would have touched, the read-only command that feeds</w:t>
-      </w:r>
-      <w:r>
-        <w:t xml:space="preserve"> </w:t>
-      </w:r>
-      <w:r>
-        <w:rPr>
-          <w:i/>
-          <w:iCs/>
-        </w:rPr>
-        <w:t xml:space="preserve">xargs</w:t>
-      </w:r>
-      <w:r>
-        <w:t xml:space="preserve">,</w:t>
-      </w:r>
-      <w:r>
-        <w:t xml:space="preserve"> </w:t>
-      </w:r>
-      <w:r>
-        <w:rPr>
-          <w:i/>
-          <w:iCs/>
-        </w:rPr>
-        <w:t xml:space="preserve">git clean -n</w:t>
-      </w:r>
-      <w:r>
-        <w:t xml:space="preserve">,</w:t>
-      </w:r>
-      <w:r>
-        <w:t xml:space="preserve"> </w:t>
-      </w:r>
-      <w:r>
-        <w:rPr>
-          <w:i/>
-          <w:iCs/>
-        </w:rPr>
-        <w:t xml:space="preserve">tar -t</w:t>
-      </w:r>
-      <w:r>
-        <w:t xml:space="preserve">,</w:t>
-      </w:r>
-      <w:r>
-        <w:t xml:space="preserve"> </w:t>
-      </w:r>
-      <w:r>
-        <w:rPr>
-          <w:i/>
-          <w:iCs/>
-        </w:rPr>
-        <w:t xml:space="preserve">rsync -n</w:t>
-      </w:r>
-      <w:r>
-        <w:t xml:space="preserve">, the body of a command substitution — and analyses the command again with the concrete targets in place.  A resolver is run only if the same analysis proves it has no effects, and it runs inside the bubblewrap sandbox with the whole filesystem mounted read-only; without bubblewrap, resolution is switched off and the command asks.  If it cannot be proven read-only, cannot run, or times out, the targets stay unresolved and the command asks.  Resolution is what makes a capture possible for commands whose targets a static reading cannot name.</w:t>
-      </w:r>
-    </w:p>
-    <w:p>
-      <w:pPr>
-        <w:pStyle w:val="BodyText"/>
-      </w:pPr>
-      <w:r>
-        <w:rPr>
-          <w:b/>
-          <w:bCs/>
-        </w:rPr>
-        <w:t xml:space="preserve">Verdict and plan.</w:t>
-      </w:r>
-      <w:r>
-        <w:t xml:space="preserve"> </w:t>
-      </w:r>
-      <w:r>
-        <w:t xml:space="preserve">The verdict is a predicate over the composed effect set: a command is recoverable when every effect within it has an available mechanism capable of restoring that effect’s pre-image.  The recovery plan is a minimum-cost cover of the same set — for each effect, the cheapest mechanism sufficient to restore it, with redundant captures eliminated.  Cost is not uniform across mechanisms, which is what makes the selection non-trivial: a hardlink capture is independent of file size where a content copy is proportional to it, a single git object identifier covers an arbitrary number of tracked-file effects at once, and two effects on overlapping paths need be captured only once.  The mechanisms themselves — content backup, hardlink-based trash, git HEAD capture, permission-metadata capture — are those already described in the Execution Pipeline; the algorithm selects among them rather than introducing new ones.  A rename or move is the one removal that needs no capture, because the same data survives at the destination and undo is moving it back; compression and archiving are not, because the bytes at the destination are a transformation of the original and moving them back returns the wrong content, so they are captured like any other deletion.  The verdict is not where the contribution lies: a list that refuses every command it does not recognize reaches the same verdict on the commands studied.  What the plan adds is that the refusal comes with a capture that restores.</w:t>
-      </w:r>
-    </w:p>
-    <w:p>
-      <w:pPr>
-        <w:pStyle w:val="BodyText"/>
-      </w:pPr>
-      <w:r>
-        <w:rPr>
-          <w:b/>
-          <w:bCs/>
-        </w:rPr>
-        <w:t xml:space="preserve">Soundness.</w:t>
-      </w:r>
-      <w:r>
-        <w:t xml:space="preserve"> </w:t>
-      </w:r>
-      <w:r>
-        <w:t xml:space="preserve">The analysis is deliberately one-sided.  Any construct whose effects cannot be resolved statically — a path arriving from command substitution, an unexpanded variable, a glob that may match a block device — is treated as unrecoverable rather than assumed benign.  The two possible errors are not symmetric and are not traded off against each other: over-approximating destructiveness costs the user an unnecessary confirmation prompt, whereas under-approximating it destroys data that cannot be recovered.  This asymmetry is why the evaluation in Section 3.1 reports false-negative rate separately rather than folding both directions into a single accuracy figure.  Two limits belong to the soundness claim itself.  Resolution runs commands before the user has consented, which is safe only because each is proven to have no effects; and the interval between resolving a target and executing the command is a window in which another process can change the filesystem, so a capture is of the state at resolution time and not a guarantee about the state at execution time.</w:t>
-      </w:r>
-    </w:p>
-    <w:p>
-      <w:pPr>
-        <w:pStyle w:val="BodyText"/>
-      </w:pPr>
-      <w:r>
-        <w:rPr>
-          <w:b/>
-          <w:bCs/>
-        </w:rPr>
-        <w:t xml:space="preserve">Scope of the model.</w:t>
-      </w:r>
-      <w:r>
-        <w:t xml:space="preserve"> </w:t>
-      </w:r>
-      <w:r>
-        <w:t xml:space="preserve">The effect domain is the filesystem, extended to two kinds of state on the target system that have no pre-image to copy but do have an inverse: installed packages and running or enabled services.  For these the analysis does not re-implement the package manager or the service manager.  It asks the system’s own tools what the command would do — the package manager’s simulation mode, the package database, and the service manager’s state queries — and derives from the answer the command that puts the state back: a purge for an install, a versioned install for a removal or upgrade, a stop for a start, a disable for an enable.  A change is recoverable only if that inverse exists, so removing a package whose old version no repository still offers is unrecoverable, and purging a package also captures its configuration files as removals.  Undo runs the inverse, with elevated privilege if the original had it, and prints the command for the user to run if it fails.  Not represented are what maintainer scripts and a service’s own start-up do beyond the state change, which are arbitrary programs; network mutations and anything on a remote host; and other package managers, which stay unrecoverable unless plainly read-only.  A command whose principal effect is one of these is classified unrecoverable by the soundness rule above.  This is safe but coarse, and it is stated as a limitation of the model rather than deferred to the results.</w:t>
-      </w:r>
-    </w:p>
-    <w:p>
-      <w:pPr>
-        <w:pStyle w:val="BodyText"/>
-      </w:pPr>
-      <w:r>
-        <w:t xml:space="preserve">The preceding paragraphs are stated formally below, so that the analysis can be checked directly rather than reconstructed from prose.</w:t>
-      </w:r>
-    </w:p>
-    <w:p>
-      <w:pPr>
-        <w:pStyle w:val="BodyText"/>
-      </w:pPr>
-      <w:r>
-        <w:t xml:space="preserve">Algorithm 1 Effect analysis and capture planning for a generated shell command</w:t>
-      </w:r>
-      <w:r>
-        <w:t xml:space="preserve"> </w:t>
-      </w:r>
-      <w:r>
-        <w:rPr>
-          <w:b/>
-          <w:bCs/>
-        </w:rPr>
-        <w:t xml:space="preserve">Input:</w:t>
-      </w:r>
-      <w:r>
-        <w:t xml:space="preserve"> </w:t>
-      </w:r>
-      <w:r>
-        <w:t xml:space="preserve">command c, working directory wd, capture mechanisms M</w:t>
-      </w:r>
-      <w:r>
-        <w:t xml:space="preserve"> </w:t>
-      </w:r>
-      <w:r>
-        <w:rPr>
-          <w:b/>
-          <w:bCs/>
-        </w:rPr>
-        <w:t xml:space="preserve">Output:</w:t>
-      </w:r>
-      <w:r>
-        <w:t xml:space="preserve"> </w:t>
-      </w:r>
-      <w:r>
-        <w:t xml:space="preserve">verdict in {RECOVERABLE, RECOVERABLE_WITH_CAPTURE, UNRECOVERABLE}</w:t>
-      </w:r>
-      <w:r>
-        <w:t xml:space="preserve"> </w:t>
-      </w:r>
-      <w:r>
-        <w:t xml:space="preserve">plan, a set of (mechanism, target) pairs</w:t>
-      </w:r>
-      <w:r>
-        <w:t xml:space="preserve"> </w:t>
-      </w:r>
-      <w:r>
-        <w:rPr>
-          <w:b/>
-          <w:bCs/>
-        </w:rPr>
-        <w:t xml:space="preserve">State:</w:t>
-      </w:r>
-      <w:r>
-        <w:t xml:space="preserve"> </w:t>
-      </w:r>
-      <w:r>
-        <w:t xml:space="preserve">overlay V of paths created or removed by earlier parts of c</w:t>
-      </w:r>
-      <w:r>
-        <w:t xml:space="preserve"> </w:t>
-      </w:r>
-      <w:r>
-        <w:rPr>
-          <w:b/>
-          <w:bCs/>
-        </w:rPr>
-        <w:t xml:space="preserve">function</w:t>
-      </w:r>
-      <w:r>
-        <w:t xml:space="preserve"> </w:t>
-      </w:r>
-      <w:r>
-        <w:t xml:space="preserve">EFFECTS(node, wd, V)</w:t>
-      </w:r>
-      <w:r>
-        <w:t xml:space="preserve"> </w:t>
-      </w:r>
-      <w:r>
-        <w:rPr>
-          <w:b/>
-          <w:bCs/>
-        </w:rPr>
-        <w:t xml:space="preserve">if</w:t>
-      </w:r>
-      <w:r>
-        <w:t xml:space="preserve"> </w:t>
-      </w:r>
-      <w:r>
-        <w:t xml:space="preserve">node is a leaf command</w:t>
-      </w:r>
-      <w:r>
-        <w:t xml:space="preserve"> </w:t>
-      </w:r>
-      <w:r>
-        <w:rPr>
-          <w:b/>
-          <w:bCs/>
-        </w:rPr>
-        <w:t xml:space="preserve">then</w:t>
-      </w:r>
-      <w:r>
-        <w:t xml:space="preserve"> </w:t>
-      </w:r>
-      <w:r>
-        <w:rPr>
-          <w:b/>
-          <w:bCs/>
-        </w:rPr>
-        <w:t xml:space="preserve">return</w:t>
-      </w:r>
-      <w:r>
-        <w:t xml:space="preserve"> </w:t>
-      </w:r>
-      <w:r>
-        <w:t xml:space="preserve">RULE(name, args, wd, V) // argument-aware; no rule gives {UNKNOWN}</w:t>
-      </w:r>
-      <w:r>
-        <w:t xml:space="preserve"> </w:t>
-      </w:r>
-      <w:r>
-        <w:rPr>
-          <w:b/>
-          <w:bCs/>
-        </w:rPr>
-        <w:t xml:space="preserve">else if</w:t>
-      </w:r>
-      <w:r>
-        <w:t xml:space="preserve"> </w:t>
-      </w:r>
-      <w:r>
-        <w:t xml:space="preserve">node = (A ; B), (A &amp;&amp; B), (A || B), or (A | B)</w:t>
-      </w:r>
-      <w:r>
-        <w:t xml:space="preserve"> </w:t>
-      </w:r>
-      <w:r>
-        <w:rPr>
-          <w:b/>
-          <w:bCs/>
-        </w:rPr>
-        <w:t xml:space="preserve">then</w:t>
-      </w:r>
-      <w:r>
-        <w:t xml:space="preserve"> </w:t>
-      </w:r>
-      <w:r>
-        <w:rPr>
-          <w:b/>
-          <w:bCs/>
-        </w:rPr>
-        <w:t xml:space="preserve">return</w:t>
-      </w:r>
-      <w:r>
-        <w:t xml:space="preserve"> </w:t>
-      </w:r>
-      <w:r>
-        <w:t xml:space="preserve">EFFECTS(A, wd, V) ∪ EFFECTS(B, wd, V) // B sees what A did, through V</w:t>
-      </w:r>
-      <w:r>
-        <w:t xml:space="preserve"> </w:t>
-      </w:r>
-      <w:r>
-        <w:rPr>
-          <w:b/>
-          <w:bCs/>
-        </w:rPr>
-        <w:t xml:space="preserve">else if</w:t>
-      </w:r>
-      <w:r>
-        <w:t xml:space="preserve"> </w:t>
-      </w:r>
-      <w:r>
-        <w:t xml:space="preserve">node has a redirect target t</w:t>
-      </w:r>
-      <w:r>
-        <w:t xml:space="preserve"> </w:t>
-      </w:r>
-      <w:r>
-        <w:rPr>
-          <w:b/>
-          <w:bCs/>
-        </w:rPr>
-        <w:t xml:space="preserve">then</w:t>
-      </w:r>
-      <w:r>
-        <w:t xml:space="preserve"> </w:t>
-      </w:r>
-      <w:r>
-        <w:rPr>
-          <w:b/>
-          <w:bCs/>
-        </w:rPr>
-        <w:t xml:space="preserve">return</w:t>
-      </w:r>
-      <w:r>
-        <w:t xml:space="preserve"> </w:t>
-      </w:r>
-      <w:r>
-        <w:t xml:space="preserve">EFFECTS(strip_redirect(node), wd, V) ∪ {write-or-create(t)}</w:t>
-      </w:r>
-      <w:r>
-        <w:t xml:space="preserve"> </w:t>
-      </w:r>
-      <w:r>
-        <w:rPr>
-          <w:b/>
-          <w:bCs/>
-        </w:rPr>
-        <w:t xml:space="preserve">else if</w:t>
-      </w:r>
-      <w:r>
-        <w:t xml:space="preserve"> </w:t>
-      </w:r>
-      <w:r>
-        <w:t xml:space="preserve">node = (for x in W; do body; done)</w:t>
-      </w:r>
-      <w:r>
-        <w:t xml:space="preserve"> </w:t>
-      </w:r>
-      <w:r>
-        <w:rPr>
-          <w:b/>
-          <w:bCs/>
-        </w:rPr>
-        <w:t xml:space="preserve">then</w:t>
-      </w:r>
-      <w:r>
-        <w:t xml:space="preserve"> </w:t>
-      </w:r>
-      <w:r>
-        <w:rPr>
-          <w:b/>
-          <w:bCs/>
-        </w:rPr>
-        <w:t xml:space="preserve">return</w:t>
-      </w:r>
-      <w:r>
-        <w:t xml:space="preserve"> </w:t>
-      </w:r>
-      <w:r>
-        <w:t xml:space="preserve">∪ over w in EXPAND(W) of EFFECTS(body[x := w], wd, V)</w:t>
-      </w:r>
-      <w:r>
-        <w:t xml:space="preserve"> </w:t>
-      </w:r>
-      <w:r>
-        <w:rPr>
-          <w:b/>
-          <w:bCs/>
-        </w:rPr>
-        <w:t xml:space="preserve">else if</w:t>
-      </w:r>
-      <w:r>
-        <w:t xml:space="preserve"> </w:t>
-      </w:r>
-      <w:r>
-        <w:t xml:space="preserve">node is sh -c s, or a wrapper such as sudo or env</w:t>
-      </w:r>
-      <w:r>
-        <w:t xml:space="preserve"> </w:t>
-      </w:r>
-      <w:r>
-        <w:rPr>
-          <w:b/>
-          <w:bCs/>
-        </w:rPr>
-        <w:t xml:space="preserve">then</w:t>
-      </w:r>
-      <w:r>
-        <w:t xml:space="preserve"> </w:t>
-      </w:r>
-      <w:r>
-        <w:rPr>
-          <w:b/>
-          <w:bCs/>
-        </w:rPr>
-        <w:t xml:space="preserve">return</w:t>
-      </w:r>
-      <w:r>
-        <w:t xml:space="preserve"> </w:t>
-      </w:r>
-      <w:r>
-        <w:t xml:space="preserve">EFFECTS(inner command, wd, V)</w:t>
-      </w:r>
-      <w:r>
-        <w:t xml:space="preserve"> </w:t>
-      </w:r>
-      <w:r>
-        <w:rPr>
-          <w:b/>
-          <w:bCs/>
-        </w:rPr>
-        <w:t xml:space="preserve">else if</w:t>
-      </w:r>
-      <w:r>
-        <w:t xml:space="preserve"> </w:t>
-      </w:r>
-      <w:r>
-        <w:t xml:space="preserve">node is find with -delete or -exec, or xargs</w:t>
-      </w:r>
-      <w:r>
-        <w:t xml:space="preserve"> </w:t>
-      </w:r>
-      <w:r>
-        <w:rPr>
-          <w:b/>
-          <w:bCs/>
-        </w:rPr>
-        <w:t xml:space="preserve">then</w:t>
-      </w:r>
-      <w:r>
-        <w:t xml:space="preserve"> </w:t>
-      </w:r>
-      <w:r>
-        <w:t xml:space="preserve">T ← RESOLVE(node)</w:t>
-      </w:r>
-      <w:r>
-        <w:t xml:space="preserve"> </w:t>
-      </w:r>
-      <w:r>
-        <w:rPr>
-          <w:b/>
-          <w:bCs/>
-        </w:rPr>
-        <w:t xml:space="preserve">if</w:t>
-      </w:r>
-      <w:r>
-        <w:t xml:space="preserve"> </w:t>
-      </w:r>
-      <w:r>
-        <w:t xml:space="preserve">T = ⊥</w:t>
-      </w:r>
-      <w:r>
-        <w:t xml:space="preserve"> </w:t>
-      </w:r>
-      <w:r>
-        <w:rPr>
-          <w:b/>
-          <w:bCs/>
-        </w:rPr>
-        <w:t xml:space="preserve">then return</w:t>
-      </w:r>
-      <w:r>
-        <w:t xml:space="preserve"> </w:t>
-      </w:r>
-      <w:r>
-        <w:t xml:space="preserve">{UNRESOLVED}</w:t>
-      </w:r>
-      <w:r>
-        <w:t xml:space="preserve"> </w:t>
-      </w:r>
-      <w:r>
-        <w:rPr>
-          <w:b/>
-          <w:bCs/>
-        </w:rPr>
-        <w:t xml:space="preserve">return</w:t>
-      </w:r>
-      <w:r>
-        <w:t xml:space="preserve"> </w:t>
-      </w:r>
-      <w:r>
-        <w:t xml:space="preserve">∪ over t in T of EFFECTS(action[{} := t], wd, V)</w:t>
-      </w:r>
-      <w:r>
-        <w:t xml:space="preserve"> </w:t>
-      </w:r>
-      <w:r>
-        <w:rPr>
-          <w:b/>
-          <w:bCs/>
-        </w:rPr>
-        <w:t xml:space="preserve">end if</w:t>
-      </w:r>
-      <w:r>
-        <w:t xml:space="preserve"> </w:t>
-      </w:r>
-      <w:r>
-        <w:rPr>
-          <w:b/>
-          <w:bCs/>
-        </w:rPr>
-        <w:t xml:space="preserve">end function</w:t>
-      </w:r>
-      <w:r>
-        <w:t xml:space="preserve"> </w:t>
-      </w:r>
-      <w:r>
-        <w:rPr>
-          <w:b/>
-          <w:bCs/>
-        </w:rPr>
-        <w:t xml:space="preserve">function</w:t>
-      </w:r>
-      <w:r>
-        <w:t xml:space="preserve"> </w:t>
-      </w:r>
-      <w:r>
-        <w:t xml:space="preserve">RESOLVE(node) // learns run-time targets, changing nothing</w:t>
-      </w:r>
-      <w:r>
-        <w:t xml:space="preserve"> </w:t>
-      </w:r>
-      <w:r>
-        <w:t xml:space="preserve">d ← DRYRUN(node) // find with actions replaced by prints; xargs' producer;</w:t>
-      </w:r>
-      <w:r>
-        <w:t xml:space="preserve"> </w:t>
-      </w:r>
-      <w:r>
-        <w:t xml:space="preserve">// git clean -n, tar -t, rsync -n; command substitutions</w:t>
-      </w:r>
-      <w:r>
-        <w:t xml:space="preserve"> </w:t>
-      </w:r>
-      <w:r>
-        <w:rPr>
-          <w:b/>
-          <w:bCs/>
-        </w:rPr>
-        <w:t xml:space="preserve">if</w:t>
-      </w:r>
-      <w:r>
-        <w:t xml:space="preserve"> </w:t>
-      </w:r>
-      <w:r>
-        <w:t xml:space="preserve">EFFECTS(d) ≠ ∅</w:t>
-      </w:r>
-      <w:r>
-        <w:t xml:space="preserve"> </w:t>
-      </w:r>
-      <w:r>
-        <w:rPr>
-          <w:b/>
-          <w:bCs/>
-        </w:rPr>
-        <w:t xml:space="preserve">or</w:t>
-      </w:r>
-      <w:r>
-        <w:t xml:space="preserve"> </w:t>
-      </w:r>
-      <w:r>
-        <w:t xml:space="preserve">d cannot run</w:t>
-      </w:r>
-      <w:r>
-        <w:t xml:space="preserve"> </w:t>
-      </w:r>
-      <w:r>
-        <w:rPr>
-          <w:b/>
-          <w:bCs/>
-        </w:rPr>
-        <w:t xml:space="preserve">then return</w:t>
-      </w:r>
-      <w:r>
-        <w:t xml:space="preserve"> </w:t>
-      </w:r>
-      <w:r>
-        <w:t xml:space="preserve">⊥ // only a proven read-only d is run</w:t>
-      </w:r>
-      <w:r>
-        <w:t xml:space="preserve"> </w:t>
-      </w:r>
-      <w:r>
-        <w:rPr>
-          <w:b/>
-          <w:bCs/>
-        </w:rPr>
-        <w:t xml:space="preserve">return</w:t>
-      </w:r>
-      <w:r>
-        <w:t xml:space="preserve"> </w:t>
-      </w:r>
-      <w:r>
-        <w:t xml:space="preserve">the targets d prints</w:t>
-      </w:r>
-      <w:r>
-        <w:t xml:space="preserve"> </w:t>
-      </w:r>
-      <w:r>
-        <w:rPr>
-          <w:b/>
-          <w:bCs/>
-        </w:rPr>
-        <w:t xml:space="preserve">end function</w:t>
-      </w:r>
-      <w:r>
-        <w:t xml:space="preserve"> </w:t>
-      </w:r>
-      <w:r>
-        <w:rPr>
-          <w:b/>
-          <w:bCs/>
-        </w:rPr>
-        <w:t xml:space="preserve">function</w:t>
-      </w:r>
-      <w:r>
-        <w:t xml:space="preserve"> </w:t>
-      </w:r>
-      <w:r>
-        <w:t xml:space="preserve">VERDICT(E)</w:t>
-      </w:r>
-      <w:r>
-        <w:t xml:space="preserve"> </w:t>
-      </w:r>
-      <w:r>
-        <w:rPr>
-          <w:b/>
-          <w:bCs/>
-        </w:rPr>
-        <w:t xml:space="preserve">if</w:t>
-      </w:r>
-      <w:r>
-        <w:t xml:space="preserve"> </w:t>
-      </w:r>
-      <w:r>
-        <w:t xml:space="preserve">UNRESOLVED ∈ E</w:t>
-      </w:r>
-      <w:r>
-        <w:t xml:space="preserve"> </w:t>
-      </w:r>
-      <w:r>
-        <w:rPr>
-          <w:b/>
-          <w:bCs/>
-        </w:rPr>
-        <w:t xml:space="preserve">or</w:t>
-      </w:r>
-      <w:r>
-        <w:t xml:space="preserve"> </w:t>
-      </w:r>
-      <w:r>
-        <w:t xml:space="preserve">UNKNOWN ∈ E</w:t>
-      </w:r>
-      <w:r>
-        <w:t xml:space="preserve"> </w:t>
-      </w:r>
-      <w:r>
-        <w:rPr>
-          <w:b/>
-          <w:bCs/>
-        </w:rPr>
-        <w:t xml:space="preserve">or</w:t>
-      </w:r>
-      <w:r>
-        <w:t xml:space="preserve"> </w:t>
-      </w:r>
-      <w:r>
-        <w:t xml:space="preserve">some effect has no capture</w:t>
-      </w:r>
-      <w:r>
-        <w:t xml:space="preserve"> </w:t>
-      </w:r>
-      <w:r>
-        <w:rPr>
-          <w:b/>
-          <w:bCs/>
-        </w:rPr>
-        <w:t xml:space="preserve">then return</w:t>
-      </w:r>
-      <w:r>
-        <w:t xml:space="preserve"> </w:t>
-      </w:r>
-      <w:r>
-        <w:t xml:space="preserve">UNRECOVERABLE</w:t>
-      </w:r>
-      <w:r>
-        <w:t xml:space="preserve"> </w:t>
-      </w:r>
-      <w:r>
-        <w:rPr>
-          <w:b/>
-          <w:bCs/>
-        </w:rPr>
-        <w:t xml:space="preserve">if</w:t>
-      </w:r>
-      <w:r>
-        <w:t xml:space="preserve"> </w:t>
-      </w:r>
-      <w:r>
-        <w:t xml:space="preserve">every effect in E is a create or a move</w:t>
-      </w:r>
-      <w:r>
-        <w:t xml:space="preserve"> </w:t>
-      </w:r>
-      <w:r>
-        <w:rPr>
-          <w:b/>
-          <w:bCs/>
-        </w:rPr>
-        <w:t xml:space="preserve">then return</w:t>
-      </w:r>
-      <w:r>
-        <w:t xml:space="preserve"> </w:t>
-      </w:r>
-      <w:r>
-        <w:t xml:space="preserve">RECOVERABLE</w:t>
-      </w:r>
-      <w:r>
-        <w:t xml:space="preserve"> </w:t>
-      </w:r>
-      <w:r>
-        <w:rPr>
-          <w:b/>
-          <w:bCs/>
-        </w:rPr>
-        <w:t xml:space="preserve">return</w:t>
-      </w:r>
-      <w:r>
-        <w:t xml:space="preserve"> </w:t>
-      </w:r>
-      <w:r>
-        <w:t xml:space="preserve">RECOVERABLE_WITH_CAPTURE</w:t>
-      </w:r>
-      <w:r>
-        <w:t xml:space="preserve"> </w:t>
-      </w:r>
-      <w:r>
-        <w:rPr>
-          <w:b/>
-          <w:bCs/>
-        </w:rPr>
-        <w:t xml:space="preserve">end function</w:t>
-      </w:r>
-      <w:r>
-        <w:t xml:space="preserve"> </w:t>
-      </w:r>
-      <w:r>
-        <w:rPr>
-          <w:b/>
-          <w:bCs/>
-        </w:rPr>
-        <w:t xml:space="preserve">function</w:t>
-      </w:r>
-      <w:r>
-        <w:t xml:space="preserve"> </w:t>
-      </w:r>
-      <w:r>
-        <w:t xml:space="preserve">PLAN(E, M)</w:t>
-      </w:r>
-      <w:r>
-        <w:t xml:space="preserve"> </w:t>
-      </w:r>
-      <w:r>
-        <w:t xml:space="preserve">P ← ∅</w:t>
-      </w:r>
-      <w:r>
-        <w:t xml:space="preserve"> </w:t>
-      </w:r>
-      <w:r>
-        <w:rPr>
-          <w:b/>
-          <w:bCs/>
-        </w:rPr>
-        <w:t xml:space="preserve">for each</w:t>
-      </w:r>
-      <w:r>
-        <w:t xml:space="preserve"> </w:t>
-      </w:r>
-      <w:r>
-        <w:t xml:space="preserve">path p with a remove, write, or metadata effect in E, in path order</w:t>
-      </w:r>
-      <w:r>
-        <w:t xml:space="preserve"> </w:t>
-      </w:r>
-      <w:r>
-        <w:rPr>
-          <w:b/>
-          <w:bCs/>
-        </w:rPr>
-        <w:t xml:space="preserve">do</w:t>
-      </w:r>
-      <w:r>
-        <w:t xml:space="preserve"> </w:t>
-      </w:r>
-      <w:r>
-        <w:rPr>
-          <w:b/>
-          <w:bCs/>
-        </w:rPr>
-        <w:t xml:space="preserve">if</w:t>
-      </w:r>
-      <w:r>
-        <w:t xml:space="preserve"> </w:t>
-      </w:r>
-      <w:r>
-        <w:t xml:space="preserve">p lies under a directory already hardlinked in P</w:t>
-      </w:r>
-      <w:r>
-        <w:t xml:space="preserve"> </w:t>
-      </w:r>
-      <w:r>
-        <w:rPr>
-          <w:b/>
-          <w:bCs/>
-        </w:rPr>
-        <w:t xml:space="preserve">then continue</w:t>
-      </w:r>
-      <w:r>
-        <w:t xml:space="preserve"> </w:t>
-      </w:r>
-      <w:r>
-        <w:t xml:space="preserve">m* ← the cheapest mechanism in M that restores p's effect // hardlink for a removal,</w:t>
-      </w:r>
-      <w:r>
-        <w:t xml:space="preserve"> </w:t>
-      </w:r>
-      <w:r>
-        <w:t xml:space="preserve">// copy for an overwrite, record for a mode</w:t>
-      </w:r>
-      <w:r>
-        <w:t xml:space="preserve"> </w:t>
-      </w:r>
-      <w:r>
-        <w:t xml:space="preserve">P ← P ∪ {(m*, p)}</w:t>
-      </w:r>
-      <w:r>
-        <w:t xml:space="preserve"> </w:t>
-      </w:r>
-      <w:r>
-        <w:rPr>
-          <w:b/>
-          <w:bCs/>
-        </w:rPr>
-        <w:t xml:space="preserve">end for</w:t>
-      </w:r>
-      <w:r>
-        <w:t xml:space="preserve"> </w:t>
-      </w:r>
-      <w:r>
-        <w:rPr>
-          <w:b/>
-          <w:bCs/>
-        </w:rPr>
-        <w:t xml:space="preserve">return</w:t>
-      </w:r>
-      <w:r>
-        <w:t xml:space="preserve"> </w:t>
-      </w:r>
-      <w:r>
-        <w:t xml:space="preserve">P</w:t>
-      </w:r>
-      <w:r>
-        <w:t xml:space="preserve"> </w:t>
-      </w:r>
-      <w:r>
-        <w:rPr>
-          <w:b/>
-          <w:bCs/>
-        </w:rPr>
-        <w:t xml:space="preserve">end function</w:t>
-      </w:r>
-    </w:p>
-    <w:p>
-      <w:pPr>
-        <w:pStyle w:val="BodyText"/>
-      </w:pPr>
-      <w:r>
-        <w:rPr>
-          <w:b/>
-          <w:bCs/>
-        </w:rPr>
-        <w:t xml:space="preserve">Algorithm 1.</w:t>
-      </w:r>
-      <w:r>
-        <w:t xml:space="preserve"> </w:t>
-      </w:r>
-      <w:r>
-        <w:t xml:space="preserve">EFFECTS derives and composes the effect set, applying rules to the leaves and resolving wrappers through RESOLVE; RESOLVE learns run-time targets by running only a form of the command proven to have no effects; VERDICT and PLAN decide and cover.  UNRESOLVED and UNKNOWN are the sentinels that give the analysis its one-sided soundness: they can only push the verdict toward UNRECOVERABLE.  A move (a removal whose data survives at another path) is the only removal PLAN does not capture.</w:t>
-      </w:r>
-    </w:p>
-    <w:bookmarkEnd w:id="89"/>
-    <w:bookmarkEnd w:id="90"/>
-    <w:bookmarkStart w:id="91" w:name="ch3-sec2-2"/>
-    <w:p>
-      <w:pPr>
-        <w:pStyle w:val="Heading3"/>
-      </w:pPr>
-      <w:r>
-        <w:t xml:space="preserve">2.2 Data pre-processing</w:t>
-      </w:r>
-    </w:p>
-    <w:p>
-      <w:pPr>
-        <w:pStyle w:val="FirstParagraph"/>
-      </w:pPr>
-      <w:r>
-        <w:t xml:space="preserve">Prior to statistical analysis, all data collected during the benchmark evaluation and user study — not the system itself — undergoes the following processing steps:</w:t>
+        <w:t xml:space="preserve">Prior to statistical analysis, the command corpus and all data collected during the benchmark evaluation and user study — not the system itself — undergo the following processing steps:</w:t>
       </w:r>
     </w:p>
     <w:p>
@@ -8453,13 +8748,13 @@
           <w:b/>
           <w:bCs/>
         </w:rPr>
-        <w:t xml:space="preserve">Task normalization:</w:t>
-      </w:r>
-      <w:r>
-        <w:t xml:space="preserve"> </w:t>
-      </w:r>
-      <w:r>
-        <w:t xml:space="preserve">task descriptions and expected outcomes are standardized across both the OSWorld benchmark and the custom task suite to ensure consistent evaluation criteria</w:t>
+        <w:t xml:space="preserve">Command corpus:</w:t>
+      </w:r>
+      <w:r>
+        <w:t xml:space="preserve"> </w:t>
+      </w:r>
+      <w:r>
+        <w:t xml:space="preserve">each candidate command is given a fixture built from its own text before the analysis is consulted; commands that do not finish cleanly on their fixture are excluded and counted with the reason, never labeled by guess (Section 1.2(b)); and the corpus is fixed by a recorded seed and hash before the analysis is run on it (Section 3.1(e))</w:t>
       </w:r>
     </w:p>
     <w:p>
@@ -8475,13 +8770,13 @@
           <w:b/>
           <w:bCs/>
         </w:rPr>
-        <w:t xml:space="preserve">Log parsing and event extraction:</w:t>
-      </w:r>
-      <w:r>
-        <w:t xml:space="preserve"> </w:t>
-      </w:r>
-      <w:r>
-        <w:t xml:space="preserve">raw session logs from SynapseOS telemetry are parsed to extract per-task metrics — completion time, error events, and undo events</w:t>
+        <w:t xml:space="preserve">Task normalization:</w:t>
+      </w:r>
+      <w:r>
+        <w:t xml:space="preserve"> </w:t>
+      </w:r>
+      <w:r>
+        <w:t xml:space="preserve">task descriptions and expected outcomes are standardized across both the OSWorld benchmark and the custom task suite to ensure consistent evaluation criteria</w:t>
       </w:r>
     </w:p>
     <w:p>
@@ -8497,13 +8792,13 @@
           <w:b/>
           <w:bCs/>
         </w:rPr>
-        <w:t xml:space="preserve">Metric computation:</w:t>
-      </w:r>
-      <w:r>
-        <w:t xml:space="preserve"> </w:t>
-      </w:r>
-      <w:r>
-        <w:t xml:space="preserve">task completion time is computed as the elapsed time between task prompt presentation and task completion event; error rate is computed as the ratio of failed or incorrect outcomes to the number of tasks presented — the denominator is the task count rather than the attempt count, so that retrying cannot lower a participant’s error rate; each task is scored against a written rubric specifying the observable end state that counts as success, with partial completion, abandonment at the time limit, and facilitator intervention coded as distinct outcomes; and because SynapseOS outcomes are captured by the session logger while native-OS outcomes must be judged from screen recording, all tasks in both conditions are scored by one procedure: the rubric, fixed before any session is run, is applied to the screen recording by a single research team member, and for the SynapseOS condition a script additionally checks the end state the rubric names (a file, a package, a service) from the session log, so that the scoring of that condition does not rest on the scorer’s judgment alone; SUS and NASA-TLX scores are computed according to their respective standard scoring formulas</w:t>
+        <w:t xml:space="preserve">Log parsing and event extraction:</w:t>
+      </w:r>
+      <w:r>
+        <w:t xml:space="preserve"> </w:t>
+      </w:r>
+      <w:r>
+        <w:t xml:space="preserve">raw session logs from SynapseOS telemetry are parsed to extract per-task metrics — completion time, error events, and undo events</w:t>
       </w:r>
     </w:p>
     <w:p>
@@ -8519,6 +8814,28 @@
           <w:b/>
           <w:bCs/>
         </w:rPr>
+        <w:t xml:space="preserve">Metric computation:</w:t>
+      </w:r>
+      <w:r>
+        <w:t xml:space="preserve"> </w:t>
+      </w:r>
+      <w:r>
+        <w:t xml:space="preserve">task completion time is computed as the elapsed time between task prompt presentation and task completion event; error rate is computed as the ratio of failed or incorrect outcomes to the number of tasks presented — the denominator is the task count rather than the attempt count, so that retrying cannot lower a participant’s error rate; each task is scored against a written rubric specifying the observable end state that counts as success, with partial completion, abandonment at the time limit, and facilitator intervention coded as distinct outcomes; and because SynapseOS outcomes are captured by the session logger while native-OS outcomes must be judged from screen recording, all tasks in both conditions are scored by one procedure: the rubric, fixed before any session is run, is applied to the screen recording by a single research team member, and for the SynapseOS condition a script additionally checks the end state the rubric names (a file, a package, a service) from the session log, so that the scoring of that condition does not rest on the scorer’s judgment alone; SUS and NASA-TLX scores are computed according to their respective standard scoring formulas</w:t>
+      </w:r>
+    </w:p>
+    <w:p>
+      <w:pPr>
+        <w:pStyle w:val="Compact"/>
+        <w:numPr>
+          <w:ilvl w:val="0"/>
+          <w:numId w:val="1012"/>
+        </w:numPr>
+      </w:pPr>
+      <w:r>
+        <w:rPr>
+          <w:b/>
+          <w:bCs/>
+        </w:rPr>
         <w:t xml:space="preserve">Participant data pseudonymization:</w:t>
       </w:r>
       <w:r>
@@ -8528,8 +8845,8 @@
         <w:t xml:space="preserve">all participant records are pseudonymized at the point of extraction, replacing identifying information with participant ID codes prior to any analysis</w:t>
       </w:r>
     </w:p>
-    <w:bookmarkEnd w:id="91"/>
-    <w:bookmarkStart w:id="92" w:name="ch3-sec2-3"/>
+    <w:bookmarkEnd w:id="96"/>
+    <w:bookmarkStart w:id="97" w:name="ch3-sec2-3"/>
     <w:p>
       <w:pPr>
         <w:pStyle w:val="Heading3"/>
@@ -8651,11 +8968,11 @@
         <w:t xml:space="preserve">docs/open-problems.md</w:t>
       </w:r>
       <w:r>
-        <w:t xml:space="preserve">; the one that bears on the study is described under threats to validity (Section 3.6).</w:t>
-      </w:r>
-    </w:p>
-    <w:bookmarkEnd w:id="92"/>
-    <w:bookmarkStart w:id="93" w:name="ch3-sec2-4"/>
+        <w:t xml:space="preserve">; the one that bears on the study is described under threats to validity (Section 3.7).</w:t>
+      </w:r>
+    </w:p>
+    <w:bookmarkEnd w:id="97"/>
+    <w:bookmarkStart w:id="98" w:name="ch3-sec2-4"/>
     <w:p>
       <w:pPr>
         <w:pStyle w:val="Heading3"/>
@@ -8834,8 +9151,8 @@
         <w:t xml:space="preserve">Total estimated session duration per participant: 90–120 minutes.</w:t>
       </w:r>
     </w:p>
-    <w:bookmarkEnd w:id="93"/>
-    <w:bookmarkStart w:id="94" w:name="ch3-sec2-5"/>
+    <w:bookmarkEnd w:id="98"/>
+    <w:bookmarkStart w:id="99" w:name="ch3-sec2-5"/>
     <w:p>
       <w:pPr>
         <w:pStyle w:val="Heading3"/>
@@ -9028,9 +9345,9 @@
         <w:t xml:space="preserve">Participants may discontinue the session at any point, and may request withdrawal of their data for up to fourteen days after their session — the ID-to-consent mapping is retained through that window specifically so that withdrawal remains possible.  After it closes the mapping is destroyed and individual records can no longer be located.  This limit is stated on the consent form so that it is understood before participation rather than discovered after.</w:t>
       </w:r>
     </w:p>
-    <w:bookmarkEnd w:id="94"/>
-    <w:bookmarkEnd w:id="95"/>
-    <w:bookmarkStart w:id="115" w:name="sec3"/>
+    <w:bookmarkEnd w:id="99"/>
+    <w:bookmarkEnd w:id="100"/>
+    <w:bookmarkStart w:id="118" w:name="sec3"/>
     <w:p>
       <w:pPr>
         <w:pStyle w:val="Heading2"/>
@@ -9044,16 +9361,16 @@
         <w:pStyle w:val="FirstParagraph"/>
       </w:pPr>
       <w:r>
-        <w:t xml:space="preserve">The analysis is evaluated first, on its own corpus (Section 3.1), which answers RQ2 through RQ5.  The validation study on the platform follows (Sections 3.2–3.6), against the datasets and study design established in Section 1, with a fixed set of metrics and formulas, a statistical analysis plan for testing significance and effect size, and an accounting of the threats to validity this design addresses.</w:t>
-      </w:r>
-    </w:p>
-    <w:bookmarkStart w:id="104" w:name="ch3-sec3-1"/>
+        <w:t xml:space="preserve">System testing evaluates the analysis and then validates it in use.  Section 3.1 evaluates it against baselines on the command corpus (Objective 4), which answers RQ2 through RQ4, and Section 3.2 measures what composition and runtime-target resolution contribute, by ablation (Objective 5), which answers RQ5.  Sections 3.3 to 3.7 define the validation study on the platform: its evaluation dataset, evaluation profile, criteria and formulas, data analysis plan, and threats to validity.</w:t>
+      </w:r>
+    </w:p>
+    <w:bookmarkStart w:id="106" w:name="ch3-sec3-1"/>
     <w:p>
       <w:pPr>
         <w:pStyle w:val="Heading3"/>
       </w:pPr>
       <w:r>
-        <w:t xml:space="preserve">3.1 Algorithm evaluation (RQ2–RQ5)</w:t>
+        <w:t xml:space="preserve">3.1 Evaluation against baselines (Objective 4)</w:t>
       </w:r>
     </w:p>
     <w:p>
@@ -9061,16 +9378,16 @@
         <w:pStyle w:val="FirstParagraph"/>
       </w:pPr>
       <w:r>
-        <w:t xml:space="preserve">RQ2 through RQ5 are answered separately from the validation study, against a labeled corpus of shell commands rather than through participants.  The separation is deliberate and has a practical consequence worth stating: this evaluation depends on no ethics approval, no recruitment, and no participant sessions, and can therefore be completed and reported independently of the study’s schedule.</w:t>
-      </w:r>
-    </w:p>
-    <w:bookmarkStart w:id="96" w:name="a-corpus-construction"/>
+        <w:t xml:space="preserve">The analysis is evaluated on the command corpus of Section 1.1(a) and 1.2(a)–(b), against the baselines in (a), by the metrics in (b) and the statistics in (c); (d) reports the results, and (e) the threats specific to this evaluation.  The evaluation answers RQ4 directly, and it supplies the evidence for RQ2 and RQ3: whether a command’s effects can be derived before it runs shows in silent loss and composition coverage, and whether the plan restores, in capture coverage verified by sandboxed undo.</w:t>
+      </w:r>
+    </w:p>
+    <w:bookmarkStart w:id="101" w:name="a-baselines"/>
     <w:p>
       <w:pPr>
         <w:pStyle w:val="Heading4"/>
       </w:pPr>
       <w:r>
-        <w:t xml:space="preserve">a) Corpus Construction</w:t>
+        <w:t xml:space="preserve">a) Baselines</w:t>
       </w:r>
     </w:p>
     <w:p>
@@ -9078,7 +9395,7 @@
         <w:pStyle w:val="FirstParagraph"/>
       </w:pPr>
       <w:r>
-        <w:t xml:space="preserve">The corpus is generated by a program, not assembled by hand, and is held as four partitions reported separately rather than pooled.  The first is NL2Bash [19], which supplies human-written commands and is the generalization set: candidates are drawn at random from the dataset with a recorded seed, excluding any command used during development.  The second is a set of parameterized command templates covering each shell composition operator — sequencing, conditional execution, pipelines, redirects, command substitution, loops,</w:t>
+        <w:t xml:space="preserve">Three baselines bound the comparison.  The first is the enumerated-pattern classifier already implemented in the prototype, which matches commands against a hand-maintained list of known destructive shapes; it is the honest comparison because it is what the system does today, not a weakened construction.  The second is the same list turned around to fail closed: every command in the line, including those inside substitutions, loops, and wrappers, must be a known read-only form or the line asks.  It resolves no targets and plans no capture, and it is the strongest simple alternative, because it removes the enumerated list’s silent failures on commands nobody named.  The upper bound on safety is a full pre-emptive copy of the working directory before every command, which recovers everything and is unusable in practice; it establishes what the minimal-plan computation must justify itself against on cost.  That cost is measured, not asserted: on this study’s ext4 evaluation machine, the cheapest real version of a pre-emptive snapshot — a Timeshift-style hardlink snapshot via</w:t>
       </w:r>
       <w:r>
         <w:t xml:space="preserve"> </w:t>
@@ -9087,278 +9404,37 @@
         <w:rPr>
           <w:rStyle w:val="VerbatimChar"/>
         </w:rPr>
-        <w:t xml:space="preserve">find -exec</w:t>
-      </w:r>
-      <w:r>
-        <w:t xml:space="preserve">,</w:t>
-      </w:r>
-      <w:r>
-        <w:t xml:space="preserve"> </w:t>
+        <w:t xml:space="preserve">rsync -a --link-dest</w:t>
+      </w:r>
+      <w:r>
+        <w:t xml:space="preserve">, what a filesystem with no native snapshot falls back to — was timed against a working directory of 1,165 real files (580 MB).  A snapshot taken when nothing had changed since the last one, or when exactly one file had, took 60–250 ms, because deciding what to hardlink means visiting every entry in the tree regardless of what changed; the capture plan for a comparable single-file command took 0–20 ms, set by what the command touches rather than by the size of the directory around it (</w:t>
       </w:r>
       <w:r>
         <w:rPr>
           <w:rStyle w:val="VerbatimChar"/>
         </w:rPr>
-        <w:t xml:space="preserve">xargs</w:t>
-      </w:r>
-      <w:r>
-        <w:t xml:space="preserve">,</w:t>
-      </w:r>
-      <w:r>
-        <w:t xml:space="preserve"> </w:t>
-      </w:r>
-      <w:r>
-        <w:rPr>
-          <w:rStyle w:val="VerbatimChar"/>
-        </w:rPr>
-        <w:t xml:space="preserve">sh -c</w:t>
-      </w:r>
-      <w:r>
-        <w:t xml:space="preserve"> </w:t>
-      </w:r>
-      <w:r>
-        <w:t xml:space="preserve">and other interpreters, and wrappers such as</w:t>
-      </w:r>
-      <w:r>
-        <w:t xml:space="preserve"> </w:t>
-      </w:r>
-      <w:r>
-        <w:rPr>
-          <w:rStyle w:val="VerbatimChar"/>
-        </w:rPr>
-        <w:t xml:space="preserve">sudo</w:t>
-      </w:r>
-      <w:r>
-        <w:t xml:space="preserve"> </w:t>
-      </w:r>
-      <w:r>
-        <w:t xml:space="preserve">and</w:t>
-      </w:r>
-      <w:r>
-        <w:t xml:space="preserve"> </w:t>
-      </w:r>
-      <w:r>
-        <w:rPr>
-          <w:rStyle w:val="VerbatimChar"/>
-        </w:rPr>
-        <w:t xml:space="preserve">env</w:t>
-      </w:r>
-      <w:r>
-        <w:t xml:space="preserve"> </w:t>
-      </w:r>
-      <w:r>
-        <w:t xml:space="preserve">— which exists because naturally occurring corpora under-represent compound commands, and compound commands are where the algorithm’s contribution lies.  The third is a set of commands whose effect lies outside the filesystem, described under (b).  A fourth partition holds commands the deployed model itself wrote: the NL2Bash descriptions of a random sample of tasks are given to the prototype’s model with the runtime’s own prompt, and the command it returns is labeled by the same pipeline.  It is reported apart, because a set drawn from this prototype’s own output is biased toward the shapes it produces, and because the analysis is about model-generated commands, which NL2Bash’s human-written ones are not.  Commands logged during the user study can be added to it afterwards.</w:t>
-      </w:r>
-    </w:p>
-    <w:p>
-      <w:pPr>
-        <w:pStyle w:val="BodyText"/>
-      </w:pPr>
-      <w:r>
-        <w:t xml:space="preserve">The corpus is sized against the classes the analysis has to separate, not against a single overall total.  Commands are drawn until a fixed number carry each ground-truth label, so that the label the false-negative test needs — a command that loses something — is present in quantity whatever NL2Bash’s own composition, which is mostly read-only.  The target is on the order of 780 commands: about 450 from NL2Bash, of which 150 are losses; about 250 from templates; and about 80 external.  This is a coverage-based target rather than a power-computed one: a classical power analysis needs an assumed effect size, and the quantity of interest, the false-negative rate, is expected to be low for both the baseline and the algorithm, the regime in which an assumed effect size would be a guess.  What the corpus must give is enough losses that a Wilson interval on a proportion near zero remains informative, and 150 does.</w:t>
-      </w:r>
-    </w:p>
-    <w:p>
-      <w:pPr>
-        <w:pStyle w:val="BodyText"/>
-      </w:pPr>
-      <w:r>
-        <w:t xml:space="preserve">A second stratification is by the shape of the command, assigned by the generator from the command’s syntax: a single named command; a chain; one whose targets are computed while it runs; a redirect; one whose effect hides inside an interpreter or a tool the rule table does not name; and one whose effect lies outside the filesystem.  The claims under test concern the composed, run-time, and hidden shapes, and a corpus dominated by plain named commands would measure the strength of a list and not the contribution of the analysis, so results are reported per shape as well as in aggregate.</w:t>
-      </w:r>
-    </w:p>
-    <w:bookmarkEnd w:id="96"/>
-    <w:bookmarkStart w:id="97" w:name="b-ground-truth"/>
+        <w:t xml:space="preserve">pilot/snapshot_bench.txt</w:t>
+      </w:r>
+      <w:r>
+        <w:t xml:space="preserve">).  A copy-on-write filesystem such as btrfs or XFS would close most of this gap, since it would not need to visit every file either; on ext4, the filesystem this study is conducted on, it does not.</w:t>
+      </w:r>
+    </w:p>
+    <w:p>
+      <w:pPr>
+        <w:pStyle w:val="BodyText"/>
+      </w:pPr>
+      <w:r>
+        <w:t xml:space="preserve">Because the first baseline was written by the same team, it was checked against command-safety checks that others ship.  Two open-source checks were scored on the same held-out corpus and labels reported in (d) below: the dangerous-command check of OpenAI’s Codex CLI [27], ported from its source and verified against that source’s own unit tests, and cc-safety-net [17], a pre-execution guard used with several agentic coding tools, run unmodified under each of its three presets.  On the 325 commands that destroy files, they let between 73% and 97% run with no confirmation and no capture, against 31% for the enumerated-pattern classifier, and neither makes any provision for recovery.  Both are designed for coding agents working inside a version-controlled project, where deleting project files is routine and version control is the safeguard, so these figures describe how they would serve a person’s own files, not how well they serve their intended purpose.  The first baseline is therefore the strictest enumerated list tested, and comparisons against it understate rather than overstate the analysis’s advantage over lists in current use.  No shipping tool was found that determines a command’s effects before it runs in order to capture what it would destroy; on recovery there is no external counterpart, which is the gap identified in Section 2.4.  The comparison is provided as supplementary material.</w:t>
+      </w:r>
+    </w:p>
+    <w:bookmarkEnd w:id="101"/>
+    <w:bookmarkStart w:id="102" w:name="b-metrics"/>
     <w:p>
       <w:pPr>
         <w:pStyle w:val="Heading4"/>
       </w:pPr>
       <w:r>
-        <w:t xml:space="preserve">b) Ground Truth</w:t>
-      </w:r>
-    </w:p>
-    <w:p>
-      <w:pPr>
-        <w:pStyle w:val="FirstParagraph"/>
-      </w:pPr>
-      <w:r>
-        <w:t xml:space="preserve">Ground truth is observed, not judged.  Each executable command is given a fixture — the files and directories that exist when it runs — and is run once inside a bubblewrap sandbox: the rest of the filesystem read-only, no network, empty standard input, a hard time limit, and only the fixture writable.  The tree is recorded before and after, and the label follows from the difference.  A command is</w:t>
-      </w:r>
-      <w:r>
-        <w:t xml:space="preserve"> </w:t>
-      </w:r>
-      <w:r>
-        <w:rPr>
-          <w:i/>
-          <w:iCs/>
-        </w:rPr>
-        <w:t xml:space="preserve">recoverable</w:t>
-      </w:r>
-      <w:r>
-        <w:t xml:space="preserve"> </w:t>
-      </w:r>
-      <w:r>
-        <w:t xml:space="preserve">when nothing that existed was lost: paths may have been created, and a path that disappeared but whose very same file now sits elsewhere was moved, not lost.  It is</w:t>
-      </w:r>
-      <w:r>
-        <w:t xml:space="preserve"> </w:t>
-      </w:r>
-      <w:r>
-        <w:rPr>
-          <w:i/>
-          <w:iCs/>
-        </w:rPr>
-        <w:t xml:space="preserve">recoverable only if a pre-image is captured</w:t>
-      </w:r>
-      <w:r>
-        <w:t xml:space="preserve"> </w:t>
-      </w:r>
-      <w:r>
-        <w:t xml:space="preserve">when something that existed was removed, overwritten, replaced by a different kind of object, retargeted, or given different permission bits or an owner.  Modification times are ignored, since touching a file loses nothing a user could want back.  Commands that do not finish cleanly — a non-zero exit, a timeout, an attempt to write outside the fixture — are excluded and counted, never labeled by guess.</w:t>
-      </w:r>
-    </w:p>
-    <w:p>
-      <w:pPr>
-        <w:pStyle w:val="BodyText"/>
-      </w:pPr>
-      <w:r>
-        <w:t xml:space="preserve">Commands whose effect the filesystem cannot show — on another machine, on the mount table, on another process, on a device, on an account or the firewall — cannot be labeled this way and are never executed.  They form the external partition and are labeled</w:t>
-      </w:r>
-      <w:r>
-        <w:t xml:space="preserve"> </w:t>
-      </w:r>
-      <w:r>
-        <w:rPr>
-          <w:i/>
-          <w:iCs/>
-        </w:rPr>
-        <w:t xml:space="preserve">unrecoverable</w:t>
-      </w:r>
-      <w:r>
-        <w:t xml:space="preserve"> </w:t>
-      </w:r>
-      <w:r>
-        <w:t xml:space="preserve">by construction.  The rule that assigns a command to it is deliberately narrow, naming only tools that change such state, so that a read-only network query is not counted as a loss the system failed to catch.  It is a partition rule and not a source of the other two labels.</w:t>
-      </w:r>
-    </w:p>
-    <w:p>
-      <w:pPr>
-        <w:pStyle w:val="BodyText"/>
-      </w:pPr>
-      <w:r>
-        <w:t xml:space="preserve">Ground truth is defined relative to a stated filesystem state.  A command’s effects depend on what exists:</w:t>
-      </w:r>
-      <w:r>
-        <w:t xml:space="preserve"> </w:t>
-      </w:r>
-      <w:r>
-        <w:rPr>
-          <w:i/>
-          <w:iCs/>
-        </w:rPr>
-        <w:t xml:space="preserve">rm *.tmp</w:t>
-      </w:r>
-      <w:r>
-        <w:t xml:space="preserve"> </w:t>
-      </w:r>
-      <w:r>
-        <w:t xml:space="preserve">deletes nothing where there are no such files, and</w:t>
-      </w:r>
-      <w:r>
-        <w:t xml:space="preserve"> </w:t>
-      </w:r>
-      <w:r>
-        <w:rPr>
-          <w:i/>
-          <w:iCs/>
-        </w:rPr>
-        <w:t xml:space="preserve">cp a b</w:t>
-      </w:r>
-      <w:r>
-        <w:t xml:space="preserve"> </w:t>
-      </w:r>
-      <w:r>
-        <w:t xml:space="preserve">overwrites only if</w:t>
-      </w:r>
-      <w:r>
-        <w:t xml:space="preserve"> </w:t>
-      </w:r>
-      <w:r>
-        <w:rPr>
-          <w:i/>
-          <w:iCs/>
-        </w:rPr>
-        <w:t xml:space="preserve">b</w:t>
-      </w:r>
-      <w:r>
-        <w:t xml:space="preserve"> </w:t>
-      </w:r>
-      <w:r>
-        <w:t xml:space="preserve">is there.  A label given with no state is a label about an imagined directory, and an analysis that reads the real state cannot be scored against it.  Every corpus item therefore carries its fixture, and the analysis is run against that same fixture.  The fixture is built from the command’s text before the analysis is consulted: the files and directories the command names are created, a glob becomes a few matching files, and whether the destination of a copy, move, or redirect already exists is chosen by the seed, with the other choice tried if the first does not run.  Fixtures are never written from the analysis’s output.</w:t>
-      </w:r>
-    </w:p>
-    <w:p>
-      <w:pPr>
-        <w:pStyle w:val="BodyText"/>
-      </w:pPr>
-      <w:r>
-        <w:t xml:space="preserve">The generator shares no code with the analysis and never consults it, so agreement between the two is evidence and not circularity.  It is deterministic for a given seed, and it records the number of candidates drawn and the reasons for each exclusion beside the corpus.  There is no human labeler, and so no labeler disagreement to measure; the threat that takes its place is the validity of the oracle itself, addressed in (e).</w:t>
-      </w:r>
-    </w:p>
-    <w:bookmarkEnd w:id="97"/>
-    <w:bookmarkStart w:id="98" w:name="c-baselines"/>
-    <w:p>
-      <w:pPr>
-        <w:pStyle w:val="Heading4"/>
-      </w:pPr>
-      <w:r>
-        <w:t xml:space="preserve">c) Baselines</w:t>
-      </w:r>
-    </w:p>
-    <w:p>
-      <w:pPr>
-        <w:pStyle w:val="FirstParagraph"/>
-      </w:pPr>
-      <w:r>
-        <w:t xml:space="preserve">Three baselines bound the comparison.  The first is the enumerated-pattern classifier already implemented in the prototype, which matches commands against a hand-maintained list of known destructive shapes; it is the honest comparison because it is what the system does today, not a weakened construction.  The second is the same list turned around to fail closed: every command in the line, including those inside substitutions, loops, and wrappers, must be a known read-only form or the line asks.  It resolves no targets and plans no capture, and it is the strongest simple alternative, because it removes the enumerated list’s silent failures on commands nobody named.  The upper bound on safety is a full pre-emptive copy of the working directory before every command, which recovers everything and is unusable in practice; it establishes what the minimal-plan computation must justify itself against on cost.  That cost is measured, not asserted: on this study’s ext4 evaluation machine, the cheapest real version of a pre-emptive snapshot — a Timeshift-style hardlink snapshot via</w:t>
-      </w:r>
-      <w:r>
-        <w:t xml:space="preserve"> </w:t>
-      </w:r>
-      <w:r>
-        <w:rPr>
-          <w:rStyle w:val="VerbatimChar"/>
-        </w:rPr>
-        <w:t xml:space="preserve">rsync -a --link-dest</w:t>
-      </w:r>
-      <w:r>
-        <w:t xml:space="preserve">, what a filesystem with no native snapshot falls back to — was timed against a working directory of 1,165 real files (580 MB).  A snapshot taken when nothing had changed since the last one, or when exactly one file had, took 60–250 ms, because deciding what to hardlink means visiting every entry in the tree regardless of what changed; the capture plan for a comparable single-file command took 0–20 ms, set by what the command touches rather than by the size of the directory around it (</w:t>
-      </w:r>
-      <w:r>
-        <w:rPr>
-          <w:rStyle w:val="VerbatimChar"/>
-        </w:rPr>
-        <w:t xml:space="preserve">pilot/snapshot_bench.txt</w:t>
-      </w:r>
-      <w:r>
-        <w:t xml:space="preserve">).  A copy-on-write filesystem such as btrfs or XFS would close most of this gap, since it would not need to visit every file either; on ext4, the filesystem this study is conducted on, it does not.</w:t>
-      </w:r>
-    </w:p>
-    <w:p>
-      <w:pPr>
-        <w:pStyle w:val="BodyText"/>
-      </w:pPr>
-      <w:r>
-        <w:t xml:space="preserve">Because the first baseline was written by the same team, it was checked against command-safety checks that others ship.  Two open-source checks were scored on the same held-out corpus and labels reported in (g) below: the dangerous-command check of OpenAI’s Codex CLI [27], ported from its source and verified against that source’s own unit tests, and cc-safety-net [17], a pre-execution guard used with several agentic coding tools, run unmodified under each of its three presets.  On the 325 commands that destroy files, they let between 73% and 97% run with no confirmation and no capture, against 31% for the enumerated-pattern classifier, and neither makes any provision for recovery.  Both are designed for coding agents working inside a version-controlled project, where deleting project files is routine and version control is the safeguard, so these figures describe how they would serve a person’s own files, not how well they serve their intended purpose.  The first baseline is therefore the strictest enumerated list tested, and comparisons against it understate rather than overstate the analysis’s advantage over lists in current use.  No shipping tool was found that determines a command’s effects before it runs in order to capture what it would destroy; on recovery there is no external counterpart, which is the gap identified in Section 2.4.  The comparison is provided as supplementary material.</w:t>
-      </w:r>
-    </w:p>
-    <w:bookmarkEnd w:id="98"/>
-    <w:bookmarkStart w:id="99" w:name="d-metrics"/>
-    <w:p>
-      <w:pPr>
-        <w:pStyle w:val="Heading4"/>
-      </w:pPr>
-      <w:r>
-        <w:t xml:space="preserve">d) Metrics</w:t>
+        <w:t xml:space="preserve">b) Metrics</w:t>
       </w:r>
     </w:p>
     <w:p>
@@ -9656,14 +9732,14 @@
         </w:tc>
       </w:tr>
     </w:tbl>
-    <w:bookmarkEnd w:id="99"/>
-    <w:bookmarkStart w:id="100" w:name="e-threats-specific-to-this-evaluation"/>
+    <w:bookmarkEnd w:id="102"/>
+    <w:bookmarkStart w:id="103" w:name="Xe9b03fd3199b45e89de4f0f07475404c617f3ff"/>
     <w:p>
       <w:pPr>
         <w:pStyle w:val="Heading4"/>
       </w:pPr>
       <w:r>
-        <w:t xml:space="preserve">e) Threats Specific to This Evaluation</w:t>
+        <w:t xml:space="preserve">c) Statistical Comparison Against Baseline</w:t>
       </w:r>
     </w:p>
     <w:p>
@@ -9671,24 +9747,6 @@
         <w:pStyle w:val="FirstParagraph"/>
       </w:pPr>
       <w:r>
-        <w:t xml:space="preserve">Four are anticipated.  First, corpus bias is addressed by partitioning, as described above.  Second, oracle validity replaces label subjectivity: the labels are observed, so they cannot be argued with, but they are facts about one command on one small fixture, run for a few seconds, seeing the working tree and not repository internals.  A loss that appears only on a differently shaped tree, or after the time limit, is labeled by what happened here.  The oracle’s own behavior is pinned by unit tests over commands whose outcome is known, its exclusions are reported, and the bias they introduce — toward commands that run on a small fixture, which excludes most NL2Bash candidates that name paths or hosts the fixture cannot supply — is stated and not corrected.  Third, the algorithm and the labels are produced by the same research team, which creates a risk that the labels reflect the algorithm’s assumptions; the generator is independent of the analysis by construction, and the corpus is fixed by a recorded seed and hash before the analysis is run on it.  A fourth threat follows from the same fact: the analysis rests on a table of what each known command does, written by the same team, and a table written with the corpus in view measures the cases its author anticipated.  The corpus is therefore generated from several seeds.  Earlier ones are used to correct the analysis and the undo; the primary result is reported on one drawn after both are frozen, with the analyzer’s hash recorded beside the result.</w:t>
-      </w:r>
-    </w:p>
-    <w:bookmarkEnd w:id="100"/>
-    <w:bookmarkStart w:id="101" w:name="X595e773872722bb906c94c2167c830f5ec35da9"/>
-    <w:p>
-      <w:pPr>
-        <w:pStyle w:val="Heading4"/>
-      </w:pPr>
-      <w:r>
-        <w:t xml:space="preserve">f) Statistical Comparison Against Baseline</w:t>
-      </w:r>
-    </w:p>
-    <w:p>
-      <w:pPr>
-        <w:pStyle w:val="FirstParagraph"/>
-      </w:pPr>
-      <w:r>
         <w:t xml:space="preserve">The algorithm and the pattern-list baseline are both scored against the same labeled corpus, which makes this a paired rather than an independent-samples comparison: for every command, each method’s verdict is either correct or incorrect against the ground-truth label, and the two methods' correctness on that one command is not independent of each other.  Significance is therefore tested with McNemar’s exact test on the resulting 2×2 table of discordant pairs — commands the algorithm gets right and the baseline gets wrong, and the reverse — at α = 0.05, rather than with a two-sample test that would treat the corpus as though two different sets of commands had been drawn.</w:t>
       </w:r>
     </w:p>
@@ -9705,7 +9763,7 @@
         <w:pStyle w:val="BodyText"/>
       </w:pPr>
       <w:r>
-        <w:t xml:space="preserve">A significance test states only whether the two methods differ, not by how much, so each comparison is paired with an effect size — the paired-data equivalent of the Cohen’s d reported for the user study (§3.4(d)).  The primary measure is the</w:t>
+        <w:t xml:space="preserve">A significance test states only whether the two methods differ, not by how much, so each comparison is paired with an effect size — the paired-data equivalent of the Cohen’s d reported for the user study (§3.5(d)).  The primary measure is the</w:t>
       </w:r>
       <w:r>
         <w:t xml:space="preserve"> </w:t>
@@ -9745,14 +9803,14 @@
         <w:t xml:space="preserve">With three baselines and two primary metrics, the comparisons that carry a claim are the analysis against each of the first two baselines on silent loss and on capture coverage.  Four tests share one family, so significance is judged with a Holm correction at a family-wise α = 0.05, and the uncorrected values are reported beside the corrected ones.  The full-snapshot baseline is a bound on cost and safety, not a comparison of accuracy, and is reported descriptively.</w:t>
       </w:r>
     </w:p>
-    <w:bookmarkEnd w:id="101"/>
-    <w:bookmarkStart w:id="102" w:name="g-results-on-the-held-out-corpus"/>
+    <w:bookmarkEnd w:id="103"/>
+    <w:bookmarkStart w:id="104" w:name="d-results-on-the-held-out-corpus"/>
     <w:p>
       <w:pPr>
         <w:pStyle w:val="Heading4"/>
       </w:pPr>
       <w:r>
-        <w:t xml:space="preserve">g) Results on the Held-Out Corpus</w:t>
+        <w:t xml:space="preserve">d) Results on the Held-Out Corpus</w:t>
       </w:r>
     </w:p>
     <w:p>
@@ -10366,14 +10424,33 @@
         <w:t xml:space="preserve">— and it asks on these by construction.  A large share of NL2Bash candidates are excluded because they name paths or programs the fixture cannot supply, which biases that partition toward commands that run on a small tree.  The external partition is assigned by a table of state-changing tools and not observed, so its labels are only as good as the table, as the model-generated partition’s one error shows.  And the model-generated partition above was scored against an earlier build of the analyser, not the one the primary result was frozen against.</w:t>
       </w:r>
     </w:p>
-    <w:bookmarkEnd w:id="102"/>
-    <w:bookmarkStart w:id="103" w:name="h-composition-and-resolution-ablation"/>
+    <w:bookmarkEnd w:id="104"/>
+    <w:bookmarkStart w:id="105" w:name="e-threats-specific-to-this-evaluation"/>
     <w:p>
       <w:pPr>
         <w:pStyle w:val="Heading4"/>
       </w:pPr>
       <w:r>
-        <w:t xml:space="preserve">h) Composition and Resolution Ablation</w:t>
+        <w:t xml:space="preserve">e) Threats Specific to This Evaluation</w:t>
+      </w:r>
+    </w:p>
+    <w:p>
+      <w:pPr>
+        <w:pStyle w:val="FirstParagraph"/>
+      </w:pPr>
+      <w:r>
+        <w:t xml:space="preserve">Four are anticipated.  First, corpus bias is addressed by partitioning, as described in Section 1.2(a).  Second, oracle validity replaces label subjectivity: the labels are observed, so they cannot be argued with, but they are facts about one command on one small fixture, run for a few seconds, seeing the working tree and not repository internals.  A loss that appears only on a differently shaped tree, or after the time limit, is labeled by what happened here.  The oracle’s own behavior is pinned by unit tests over commands whose outcome is known, its exclusions are reported, and the bias they introduce — toward commands that run on a small fixture, which excludes most NL2Bash candidates that name paths or hosts the fixture cannot supply — is stated and not corrected.  Third, the algorithm and the labels are produced by the same research team, which creates a risk that the labels reflect the algorithm’s assumptions; the generator is independent of the analysis by construction, and the corpus is fixed by a recorded seed and hash before the analysis is run on it.  A fourth threat follows from the same fact: the analysis rests on a table of what each known command does, written by the same team, and a table written with the corpus in view measures the cases its author anticipated.  The corpus is therefore generated from several seeds.  Earlier ones are used to correct the analysis and the undo; the primary result is reported on one drawn after both are frozen, with the analyzer’s hash recorded beside the result.</w:t>
+      </w:r>
+    </w:p>
+    <w:bookmarkEnd w:id="105"/>
+    <w:bookmarkEnd w:id="106"/>
+    <w:bookmarkStart w:id="107" w:name="ch3-sec3-ablation"/>
+    <w:p>
+      <w:pPr>
+        <w:pStyle w:val="Heading3"/>
+      </w:pPr>
+      <w:r>
+        <w:t xml:space="preserve">3.2 Ablation studies (Objective 5)</w:t>
       </w:r>
     </w:p>
     <w:p>
@@ -11344,18 +11421,17 @@
         <w:t xml:space="preserve"> </w:t>
       </w:r>
       <w:r>
-        <w:t xml:space="preserve">— cost the ablated configurations little or nothing, because the table already covers them.  The reported result in sections (f) and (g) above is therefore attributable to composition and resolution together, and not to the table they are sometimes mistaken for.</w:t>
-      </w:r>
-    </w:p>
-    <w:bookmarkEnd w:id="103"/>
-    <w:bookmarkEnd w:id="104"/>
-    <w:bookmarkStart w:id="105" w:name="ch3-sec3-2"/>
+        <w:t xml:space="preserve">— cost the ablated configurations little or nothing, because the table already covers them.  The reported result in Section 3.1(c) and (d) is therefore attributable to composition and resolution together, and not to the table they are sometimes mistaken for.</w:t>
+      </w:r>
+    </w:p>
+    <w:bookmarkEnd w:id="107"/>
+    <w:bookmarkStart w:id="108" w:name="ch3-sec3-2"/>
     <w:p>
       <w:pPr>
         <w:pStyle w:val="Heading3"/>
       </w:pPr>
       <w:r>
-        <w:t xml:space="preserve">3.2 Evaluation dataset</w:t>
+        <w:t xml:space="preserve">3.3 Evaluation dataset</w:t>
       </w:r>
     </w:p>
     <w:p>
@@ -11363,17 +11439,17 @@
         <w:pStyle w:val="FirstParagraph"/>
       </w:pPr>
       <w:r>
-        <w:t xml:space="preserve">The validation study exercises the platform on two task datasets: the OSWorld benchmark task suite [41] for direct comparison with results in the existing literature, and the custom cross-platform task suite described in Sections 1.1 and 1.5.  The user study evaluation involves 40 participants (20 novice, 20 power users); the baseline condition is each participant’s primary operating system — Windows 11, macOS, or Linux with GNOME desktop — on a dedicated baseline machine.</w:t>
-      </w:r>
-    </w:p>
-    <w:bookmarkEnd w:id="105"/>
-    <w:bookmarkStart w:id="106" w:name="ch3-sec3-3"/>
+        <w:t xml:space="preserve">Sections 3.3 to 3.7 define the validation study, in which the analysis is deployed in SynapseOS and exercised by participants.  It exercises the platform on two task datasets: the OSWorld benchmark task suite [41] for direct comparison with results in the existing literature, and the custom cross-platform task suite described in Sections 1.1 and 1.5.  The user study evaluation involves 40 participants (20 novice, 20 power users); the baseline condition is each participant’s primary operating system — Windows 11, macOS, or Linux with GNOME desktop — on a dedicated baseline machine.</w:t>
+      </w:r>
+    </w:p>
+    <w:bookmarkEnd w:id="108"/>
+    <w:bookmarkStart w:id="109" w:name="ch3-sec3-3"/>
     <w:p>
       <w:pPr>
         <w:pStyle w:val="Heading3"/>
       </w:pPr>
       <w:r>
-        <w:t xml:space="preserve">3.3 Evaluation profile</w:t>
+        <w:t xml:space="preserve">3.4 Evaluation profile</w:t>
       </w:r>
     </w:p>
     <w:p>
@@ -11444,14 +11520,14 @@
         <w:t xml:space="preserve">The two participant groups — novice users and power users — are analyzed both in aggregate and separately to determine whether the effect of the interface condition differs across experience levels.  Additionally, primary OS (Windows, macOS, Linux) is recorded as a secondary grouping variable to determine whether results vary across participant backgrounds, and prior conversational AI exposure (frequency of use) is recorded as a covariate to determine whether familiarity with LLM-based tools correlates with SynapseOS performance independent of OS proficiency.  The primary analysis is the pooled within-subjects comparison across all 40 participants; per-OS subgroup analyses and AI-exposure correlations are treated as exploratory given the smaller per-group sample sizes they entail.</w:t>
       </w:r>
     </w:p>
-    <w:bookmarkEnd w:id="106"/>
-    <w:bookmarkStart w:id="112" w:name="ch3-sec3-4"/>
+    <w:bookmarkEnd w:id="109"/>
+    <w:bookmarkStart w:id="115" w:name="ch3-sec3-4"/>
     <w:p>
       <w:pPr>
         <w:pStyle w:val="Heading3"/>
       </w:pPr>
       <w:r>
-        <w:t xml:space="preserve">3.4 Criteria and formula</w:t>
+        <w:t xml:space="preserve">3.5 Criteria and formula</w:t>
       </w:r>
     </w:p>
     <w:p>
@@ -11462,7 +11538,7 @@
         <w:t xml:space="preserve">The following metrics and formulas are used in the validation study.  Items (a) to (d) characterize the platform against each participant’s baseline; item (e) validates the analysis in use.</w:t>
       </w:r>
     </w:p>
-    <w:bookmarkStart w:id="107" w:name="a-task-completion-time"/>
+    <w:bookmarkStart w:id="110" w:name="a-task-completion-time"/>
     <w:p>
       <w:pPr>
         <w:pStyle w:val="Heading4"/>
@@ -11476,11 +11552,11 @@
         <w:pStyle w:val="FirstParagraph"/>
       </w:pPr>
       <w:r>
-        <w:t xml:space="preserve">Mean task completion time is computed per condition per participant group.  Inferential testing and effect size reporting follow the procedures described in Section 3.5.</w:t>
-      </w:r>
-    </w:p>
-    <w:bookmarkEnd w:id="107"/>
-    <w:bookmarkStart w:id="108" w:name="b-error-rate"/>
+        <w:t xml:space="preserve">Mean task completion time is computed per condition per participant group.  Inferential testing and effect size reporting follow the procedures described in Section 3.6.</w:t>
+      </w:r>
+    </w:p>
+    <w:bookmarkEnd w:id="110"/>
+    <w:bookmarkStart w:id="111" w:name="b-error-rate"/>
     <w:p>
       <w:pPr>
         <w:pStyle w:val="Heading4"/>
@@ -11513,8 +11589,8 @@
         <w:t xml:space="preserve">Error events are further categorized by type: intent parsing errors (incorrect bash command generated), execution errors (bash subprocess failure), and recovery failures (unsuccessful undo or retry).  The same paired statistical test is applied to error rate differences between conditions.</w:t>
       </w:r>
     </w:p>
-    <w:bookmarkEnd w:id="108"/>
-    <w:bookmarkStart w:id="109" w:name="c-user-satisfaction"/>
+    <w:bookmarkEnd w:id="111"/>
+    <w:bookmarkStart w:id="112" w:name="c-user-satisfaction"/>
     <w:p>
       <w:pPr>
         <w:pStyle w:val="Heading4"/>
@@ -11539,8 +11615,8 @@
         <w:t xml:space="preserve">Qualitative interview data is analyzed using thematic analysis to identify recurring themes in participant perceptions of both conditions.</w:t>
       </w:r>
     </w:p>
-    <w:bookmarkEnd w:id="109"/>
-    <w:bookmarkStart w:id="110" w:name="X2db549e47d03a47c0f54d1209c8c09b0dd0a7e7"/>
+    <w:bookmarkEnd w:id="112"/>
+    <w:bookmarkStart w:id="113" w:name="X2db549e47d03a47c0f54d1209c8c09b0dd0a7e7"/>
     <w:p>
       <w:pPr>
         <w:pStyle w:val="Heading4"/>
@@ -11631,8 +11707,8 @@
         <w:t xml:space="preserve">= 0.66 or larger.  The condition × group interaction — the test corresponding most directly to the platform’s intended benefit — remains the least-powered comparison in the design, since an interaction of a given size requires substantially more participants than a main effect of the same size; it is therefore reported with effect sizes and confidence intervals as the primary descriptive finding, and is not treated as a confirmatory significance test.</w:t>
       </w:r>
     </w:p>
-    <w:bookmarkEnd w:id="110"/>
-    <w:bookmarkStart w:id="111" w:name="e-analysis-decisions-in-use"/>
+    <w:bookmarkEnd w:id="113"/>
+    <w:bookmarkStart w:id="114" w:name="e-analysis-decisions-in-use"/>
     <w:p>
       <w:pPr>
         <w:pStyle w:val="Heading4"/>
@@ -11646,7 +11722,7 @@
         <w:pStyle w:val="FirstParagraph"/>
       </w:pPr>
       <w:r>
-        <w:t xml:space="preserve">Every command executed during the SynapseOS condition is logged with the analysis’s verdict and capture plan and the task fixture it ran against (Section 1.1(c)), replayed on a copy of that fixture in the sandbox, and labeled exactly as the corpus is (Section 3.1(b)).  It is then scored with the corpus measures:</w:t>
+        <w:t xml:space="preserve">Every command executed during the SynapseOS condition is logged with the analysis’s verdict and capture plan and the task fixture it ran against (Section 1.1(d)), replayed on a copy of that fixture in the sandbox, and labeled exactly as the corpus is (Section 1.2(b)).  It is then scored with the corpus measures:</w:t>
       </w:r>
       <w:r>
         <w:t xml:space="preserve"> </w:t>
@@ -11688,15 +11764,15 @@
         <w:t xml:space="preserve">, the proportion of commands that lose nothing on which the participant was nonetheless asked.  Each undo a participant invokes is also checked against the state before the command it reverts.  These are the measures by which the platform validates the analysis: a silent loss here would be a failure of the analysis on a command people actually cause, which the corpus could not reveal.</w:t>
       </w:r>
     </w:p>
-    <w:bookmarkEnd w:id="111"/>
-    <w:bookmarkEnd w:id="112"/>
-    <w:bookmarkStart w:id="113" w:name="ch3-sec3-5"/>
+    <w:bookmarkEnd w:id="114"/>
+    <w:bookmarkEnd w:id="115"/>
+    <w:bookmarkStart w:id="116" w:name="ch3-sec3-5"/>
     <w:p>
       <w:pPr>
         <w:pStyle w:val="Heading3"/>
       </w:pPr>
       <w:r>
-        <w:t xml:space="preserve">3.5 Data analysis plan</w:t>
+        <w:t xml:space="preserve">3.6 Data analysis plan</w:t>
       </w:r>
     </w:p>
     <w:p>
@@ -11704,7 +11780,7 @@
         <w:pStyle w:val="FirstParagraph"/>
       </w:pPr>
       <w:r>
-        <w:t xml:space="preserve">The analysis-in-use measures of Section 3.4(e) are reported descriptively, as proportions with Wilson 95% intervals over the commands executed, and set beside the corpus results of Section 3.1; they are not tested for significance, because the number and kind of commands participants cause cannot be fixed in advance.  Quantitative analysis of the platform measures proceeds in three stages.  First, descriptive statistics — means, standard deviations, and 95% confidence intervals — are computed for all primary metrics (task completion time, error rate, SUS score, NASA-TLX score) per condition and per participant group.  Second, the Shapiro-Wilk test is applied to assess normality of each distribution before selecting the appropriate inferential test: the paired-samples t-test for normally distributed data, or the Wilcoxon signed-rank test for non-normally distributed data.  Third, effect size is computed for all primary comparisons regardless of statistical significance: Cohen’s</w:t>
+        <w:t xml:space="preserve">The analysis-in-use measures of Section 3.5(e) are reported descriptively, as proportions with Wilson 95% intervals over the commands executed, and set beside the corpus results of Section 3.1; they are not tested for significance, because the number and kind of commands participants cause cannot be fixed in advance.  Quantitative analysis of the platform measures proceeds in three stages.  First, descriptive statistics — means, standard deviations, and 95% confidence intervals — are computed for all primary metrics (task completion time, error rate, SUS score, NASA-TLX score) per condition and per participant group.  Second, the Shapiro-Wilk test is applied to assess normality of each distribution before selecting the appropriate inferential test: the paired-samples t-test for normally distributed data, or the Wilcoxon signed-rank test for non-normally distributed data.  Third, effect size is computed for all primary comparisons regardless of statistical significance: Cohen’s</w:t>
       </w:r>
       <w:r>
         <w:t xml:space="preserve"> </w:t>
@@ -11739,14 +11815,14 @@
         <w:t xml:space="preserve">Qualitative data from post-study interviews is analyzed using reflexive thematic analysis following the six-phase procedure described by Braun and Clarke [2]: familiarization with the data, initial code generation, theme search, theme review, theme definition, and write-up.  In keeping with the reflexive approach, which treats the analyst’s interpretation as part of the method and does not compute inter-rater agreement, one member of the research team develops the codes and themes; the codebook and the excerpts that support each theme are retained so that the analysis can be audited.  Themes are reported alongside representative participant quotations.</w:t>
       </w:r>
     </w:p>
-    <w:bookmarkEnd w:id="113"/>
-    <w:bookmarkStart w:id="114" w:name="ch3-sec3-6"/>
+    <w:bookmarkEnd w:id="116"/>
+    <w:bookmarkStart w:id="117" w:name="ch3-sec3-6"/>
     <w:p>
       <w:pPr>
         <w:pStyle w:val="Heading3"/>
       </w:pPr>
       <w:r>
-        <w:t xml:space="preserve">3.6 Threats to validity</w:t>
+        <w:t xml:space="preserve">3.7 Threats to validity</w:t>
       </w:r>
     </w:p>
     <w:p>
@@ -12059,9 +12135,9 @@
         <w:t xml:space="preserve">SynapseOS is evaluated on a single hardware and software configuration — a dedicated machine running SynapseOS in GUI mode (XFCE desktop environment, X11 session) on a Debian 13 (Trixie) base.  Performance characteristics on different hardware, display configurations, or Linux distributions may differ from the reported results.</w:t>
       </w:r>
     </w:p>
-    <w:bookmarkEnd w:id="114"/>
-    <w:bookmarkEnd w:id="115"/>
-    <w:bookmarkStart w:id="124" w:name="ch3-notes"/>
+    <w:bookmarkEnd w:id="117"/>
+    <w:bookmarkEnd w:id="118"/>
+    <w:bookmarkStart w:id="127" w:name="ch3-notes"/>
     <w:p>
       <w:pPr>
         <w:pStyle w:val="Heading2"/>
@@ -12078,11 +12154,11 @@
           <w:numId w:val="1019"/>
         </w:numPr>
       </w:pPr>
-      <w:bookmarkStart w:id="116" w:name="ch3-fn1"/>
+      <w:bookmarkStart w:id="119" w:name="ch3-fn1"/>
       <w:r>
         <w:t xml:space="preserve">Command-Line Interface mode: a single non-interactive invocation, with no session persisting between separate calls, that runs a bounded multi-step loop toward one natural-language request — each step proposed, classified for reversibility, executed (immediately if reversible, after confirmation if not) through the same gate as the other interface modes, and its result fed back so the model can propose the next step or signal completion — up to a fixed step limit, before the invocation exits.  Distinct from TUI mode’s persistent interactive chat session; intended for scripting, automation, and one-off remote commands.</w:t>
       </w:r>
-      <w:bookmarkEnd w:id="116"/>
+      <w:bookmarkEnd w:id="119"/>
     </w:p>
     <w:p>
       <w:pPr>
@@ -12092,11 +12168,11 @@
           <w:numId w:val="1019"/>
         </w:numPr>
       </w:pPr>
-      <w:bookmarkStart w:id="117" w:name="ch3-fn2"/>
+      <w:bookmarkStart w:id="120" w:name="ch3-fn2"/>
       <w:r>
         <w:t xml:space="preserve">Terminal User Interface: a text-based interactive interface that runs in a command-line terminal.  TUI mode requires no graphical display server or desktop environment and can be accessed remotely over SSH.</w:t>
       </w:r>
-      <w:bookmarkEnd w:id="117"/>
+      <w:bookmarkEnd w:id="120"/>
     </w:p>
     <w:p>
       <w:pPr>
@@ -12106,11 +12182,11 @@
           <w:numId w:val="1019"/>
         </w:numPr>
       </w:pPr>
-      <w:bookmarkStart w:id="118" w:name="ch3-fn3"/>
-      <w:r>
-        <w:t xml:space="preserve">The SynapseOS prototype uses Qwen2.5-Coder-3B-Instruct, a code-specialized open-weights model selected for its NL2Bash accuracy.  See Section 2.1a for selection rationale and benchmark evidence.</w:t>
-      </w:r>
-      <w:bookmarkEnd w:id="118"/>
+      <w:bookmarkStart w:id="121" w:name="ch3-fn3"/>
+      <w:r>
+        <w:t xml:space="preserve">The SynapseOS prototype uses Qwen2.5-Coder-3B-Instruct, a code-specialized open-weights model selected for its NL2Bash accuracy.  See Section 2.1(d) for selection rationale and benchmark evidence.</w:t>
+      </w:r>
+      <w:bookmarkEnd w:id="121"/>
     </w:p>
     <w:p>
       <w:pPr>
@@ -12120,11 +12196,11 @@
           <w:numId w:val="1019"/>
         </w:numPr>
       </w:pPr>
-      <w:bookmarkStart w:id="119" w:name="ch3-fn4"/>
+      <w:bookmarkStart w:id="122" w:name="ch3-fn4"/>
       <w:r>
         <w:t xml:space="preserve">An inference server loads a language model into memory and processes query requests from the application layer.  Ollama is an open-source tool for running language models locally on consumer hardware without cloud connectivity.</w:t>
       </w:r>
-      <w:bookmarkEnd w:id="119"/>
+      <w:bookmarkEnd w:id="122"/>
     </w:p>
     <w:p>
       <w:pPr>
@@ -12134,11 +12210,11 @@
           <w:numId w:val="1019"/>
         </w:numPr>
       </w:pPr>
-      <w:bookmarkStart w:id="120" w:name="ch3-fn5"/>
+      <w:bookmarkStart w:id="123" w:name="ch3-fn5"/>
       <w:r>
         <w:t xml:space="preserve">Open-weights models make their trained parameters publicly available for local download and use; users run inference on their own hardware without routing queries to an external service provider.</w:t>
       </w:r>
-      <w:bookmarkEnd w:id="120"/>
+      <w:bookmarkEnd w:id="123"/>
     </w:p>
     <w:p>
       <w:pPr>
@@ -12148,11 +12224,11 @@
           <w:numId w:val="1019"/>
         </w:numPr>
       </w:pPr>
-      <w:bookmarkStart w:id="121" w:name="ch3-fn6"/>
+      <w:bookmarkStart w:id="124" w:name="ch3-fn6"/>
       <w:r>
         <w:t xml:space="preserve">Quantization reduces the numerical precision of model weights to lower memory requirements.  At 4-bit precision, a model that would otherwise require dedicated GPU memory can run on a standard CPU with modest RAM.</w:t>
       </w:r>
-      <w:bookmarkEnd w:id="121"/>
+      <w:bookmarkEnd w:id="124"/>
     </w:p>
     <w:p>
       <w:pPr>
@@ -12162,11 +12238,11 @@
           <w:numId w:val="1019"/>
         </w:numPr>
       </w:pPr>
-      <w:bookmarkStart w:id="122" w:name="ch3-fn7"/>
+      <w:bookmarkStart w:id="125" w:name="ch3-fn7"/>
       <w:r>
         <w:t xml:space="preserve">Low-Rank Adaptation (LoRA) is a parameter-efficient fine-tuning method that introduces a small number of trainable weight matrices while keeping the base model frozen, enabling task-specific adaptation on consumer hardware without full retraining.</w:t>
       </w:r>
-      <w:bookmarkEnd w:id="122"/>
+      <w:bookmarkEnd w:id="125"/>
     </w:p>
     <w:p>
       <w:pPr>
@@ -12176,14 +12252,14 @@
           <w:numId w:val="1019"/>
         </w:numPr>
       </w:pPr>
-      <w:bookmarkStart w:id="123" w:name="ch3-fn8"/>
+      <w:bookmarkStart w:id="126" w:name="ch3-fn8"/>
       <w:r>
         <w:t xml:space="preserve">NL2Bash is a benchmark dataset pairing natural language command descriptions with their corresponding bash shell commands, used to evaluate a model’s accuracy in translating natural language into executable commands.</w:t>
       </w:r>
-      <w:bookmarkEnd w:id="123"/>
-    </w:p>
-    <w:bookmarkEnd w:id="124"/>
-    <w:bookmarkStart w:id="125" w:name="sec-master-references"/>
+      <w:bookmarkEnd w:id="126"/>
+    </w:p>
+    <w:bookmarkEnd w:id="127"/>
+    <w:bookmarkStart w:id="128" w:name="sec-master-references"/>
     <w:p>
       <w:pPr>
         <w:pStyle w:val="FirstParagraph"/>
@@ -12192,7 +12268,7 @@
         <w:t xml:space="preserve">REFERENCES</w:t>
       </w:r>
     </w:p>
-    <w:bookmarkEnd w:id="125"/>
+    <w:bookmarkEnd w:id="128"/>
     <w:p>
       <w:pPr>
         <w:pStyle w:val="BodyText"/>
@@ -13216,7 +13292,7 @@
         <w:t xml:space="preserve">X. Zhou, S. Zhang, Y. Zhao, J. Wei, T. Song, A. Cohan, and C. Zhao. 2026. GUI vs. CLI: Execution Bottlenecks in Screen-Only and Skill-Mediated Computer-Use Agents. arXiv:2606.24551</w:t>
       </w:r>
     </w:p>
-    <w:bookmarkStart w:id="133" w:name="sec-appendices"/>
+    <w:bookmarkStart w:id="136" w:name="sec-appendices"/>
     <w:p>
       <w:pPr>
         <w:pStyle w:val="Heading2"/>
@@ -13233,7 +13309,7 @@
         <w:t xml:space="preserve">This section contains the study instruments administered to participants and the procedure governing their administration.  Wording, difficulty calibration, and task-form equivalence are validated during the pilot study described in Section 2.3 and revised before the main study begins; the instruments are reproduced here in the form submitted for ethics review.</w:t>
       </w:r>
     </w:p>
-    <w:bookmarkStart w:id="126" w:name="appendix-a"/>
+    <w:bookmarkStart w:id="129" w:name="appendix-a"/>
     <w:p>
       <w:pPr>
         <w:pStyle w:val="BodyText"/>
@@ -13250,7 +13326,7 @@
         <w:t xml:space="preserve">System Usability Scale (SUS)</w:t>
       </w:r>
     </w:p>
-    <w:bookmarkEnd w:id="126"/>
+    <w:bookmarkEnd w:id="129"/>
     <w:p>
       <w:pPr>
         <w:pStyle w:val="BodyText"/>
@@ -14293,7 +14369,7 @@
         <w:t xml:space="preserve">For odd-numbered items, subtract 1 from the response.  For even-numbered items, subtract the response from 5.  Sum the ten adjusted scores and multiply by 2.5, giving a value from 0 to 100.  This value is not a percentage; interpretation follows Sauro and Lewis [31].</w:t>
       </w:r>
     </w:p>
-    <w:bookmarkStart w:id="127" w:name="appendix-b"/>
+    <w:bookmarkStart w:id="130" w:name="appendix-b"/>
     <w:p>
       <w:pPr>
         <w:pStyle w:val="BodyText"/>
@@ -14310,7 +14386,7 @@
         <w:t xml:space="preserve">NASA Task Load Index (NASA-TLX)</w:t>
       </w:r>
     </w:p>
-    <w:bookmarkEnd w:id="127"/>
+    <w:bookmarkEnd w:id="130"/>
     <w:p>
       <w:pPr>
         <w:pStyle w:val="BodyText"/>
@@ -14821,7 +14897,7 @@
         </w:tc>
       </w:tr>
     </w:tbl>
-    <w:bookmarkStart w:id="128" w:name="appendix-c"/>
+    <w:bookmarkStart w:id="131" w:name="appendix-c"/>
     <w:p>
       <w:pPr>
         <w:pStyle w:val="BodyText"/>
@@ -14838,7 +14914,7 @@
         <w:t xml:space="preserve">Custom Cross-Platform Task Suite</w:t>
       </w:r>
     </w:p>
-    <w:bookmarkEnd w:id="128"/>
+    <w:bookmarkEnd w:id="131"/>
     <w:p>
       <w:pPr>
         <w:pStyle w:val="BodyText"/>
@@ -16512,7 +16588,7 @@
         </w:tc>
       </w:tr>
     </w:tbl>
-    <w:bookmarkStart w:id="129" w:name="appendix-d"/>
+    <w:bookmarkStart w:id="132" w:name="appendix-d"/>
     <w:p>
       <w:pPr>
         <w:pStyle w:val="BodyText"/>
@@ -16529,7 +16605,7 @@
         <w:t xml:space="preserve">Pre-Study Screening Questionnaire</w:t>
       </w:r>
     </w:p>
-    <w:bookmarkEnd w:id="129"/>
+    <w:bookmarkEnd w:id="132"/>
     <w:p>
       <w:pPr>
         <w:pStyle w:val="BodyText"/>
@@ -17033,7 +17109,7 @@
         <w:t xml:space="preserve"> </w:t>
       </w:r>
       <w:r>
-        <w:t xml:space="preserve">if they report basic proficiency, report no command-line familiarity, and fail all three screener tasks.  Any volunteer whose self-report and screener results disagree, or who falls between these definitions, is not enrolled.  This rule retains only unambiguous cases and therefore samples the extremes of the proficiency range deliberately; the consequence for generalization is stated in Section 3.6.</w:t>
+        <w:t xml:space="preserve">if they report basic proficiency, report no command-line familiarity, and fail all three screener tasks.  Any volunteer whose self-report and screener results disagree, or who falls between these definitions, is not enrolled.  This rule retains only unambiguous cases and therefore samples the extremes of the proficiency range deliberately; the consequence for generalization is stated in Section 3.7.</w:t>
       </w:r>
     </w:p>
     <w:p>
@@ -17086,7 +17162,7 @@
         <w:t xml:space="preserve">□ SynapseOS first   □ Own OS first</w:t>
       </w:r>
     </w:p>
-    <w:bookmarkStart w:id="130" w:name="appendix-e"/>
+    <w:bookmarkStart w:id="133" w:name="appendix-e"/>
     <w:p>
       <w:pPr>
         <w:pStyle w:val="BodyText"/>
@@ -17103,7 +17179,7 @@
         <w:t xml:space="preserve">Participant Information Sheet</w:t>
       </w:r>
     </w:p>
-    <w:bookmarkEnd w:id="130"/>
+    <w:bookmarkEnd w:id="133"/>
     <w:p>
       <w:pPr>
         <w:pStyle w:val="BodyText"/>
@@ -17302,7 +17378,7 @@
         <w:t xml:space="preserve">For questions about the study, contact the research team at [research team contact address].  For concerns about how the study is being conducted, or about your rights as a participant, contact the Institutional Review Board of Mapúa University – Makati at [ethics committee contact address], independently of the research team.</w:t>
       </w:r>
     </w:p>
-    <w:bookmarkStart w:id="131" w:name="appendix-f"/>
+    <w:bookmarkStart w:id="134" w:name="appendix-f"/>
     <w:p>
       <w:pPr>
         <w:pStyle w:val="BodyText"/>
@@ -17319,7 +17395,7 @@
         <w:t xml:space="preserve">Informed Consent Form</w:t>
       </w:r>
     </w:p>
-    <w:bookmarkEnd w:id="131"/>
+    <w:bookmarkEnd w:id="134"/>
     <w:p>
       <w:pPr>
         <w:pStyle w:val="BodyText"/>
@@ -17734,7 +17810,7 @@
         <w:t xml:space="preserve">Filing note: this is the only study document bearing the participant’s name.  It is stored separately from all study data, and the code-to-name list derived from it is destroyed on the schedule stated in Section 2.5.</w:t>
       </w:r>
     </w:p>
-    <w:bookmarkStart w:id="132" w:name="appendix-g"/>
+    <w:bookmarkStart w:id="135" w:name="appendix-g"/>
     <w:p>
       <w:pPr>
         <w:pStyle w:val="BodyText"/>
@@ -17751,7 +17827,7 @@
         <w:t xml:space="preserve">Session Facilitator Checklist</w:t>
       </w:r>
     </w:p>
-    <w:bookmarkEnd w:id="132"/>
+    <w:bookmarkEnd w:id="135"/>
     <w:p>
       <w:pPr>
         <w:pStyle w:val="BodyText"/>
@@ -18080,7 +18156,7 @@
         <w:t xml:space="preserve">Diarise the participant’s fourteen-day withdrawal deadline.</w:t>
       </w:r>
     </w:p>
-    <w:bookmarkEnd w:id="133"/>
+    <w:bookmarkEnd w:id="136"/>
     <w:sectPr/>
   </w:body>
 </w:document>

</xml_diff>

<commit_message>
docs(thesis): make Chapters 1-3 algorithm-first
Chapter 1: 1.1 now ends by setting up the recoverability problem. Chapter 2: 2.2 leads with the algorithm's framework (abstract interpretation and effect systems, and the three properties that follow), keeping the four-layer pipeline for the interface literature; a new 2.5 'Command Safety and Static Analysis of Shell Commands' gathers the guards (NaSh, Codex CLI, cc-safety-net) and the shell analyses (ABash, Smoosh, CoLiS) from 2.4; later sections become 2.6-2.11; the synthesis, methodological review, and summary lead with the algorithm. Chapter 3: Figure 3.1 is redrawn with the analysis (EFFECTS, RESOLVE, VERDICT, PLAN) at the centre and SynapseOS as the frame around it, and 3.3-3.7 are titled 'Validation study: ...'. No references added; every moved paragraph is intact.
</commit_message>
<xml_diff>
--- a/thesis 1/consolidated/SynapseOS_Proposal_Chapters_1_to_3.docx
+++ b/thesis 1/consolidated/SynapseOS_Proposal_Chapters_1_to_3.docx
@@ -386,7 +386,7 @@
         <w:tab/>
       </w:r>
       <w:r>
-        <w:t xml:space="preserve">6</w:t>
+        <w:t xml:space="preserve">7</w:t>
       </w:r>
     </w:p>
     <w:p>
@@ -532,7 +532,7 @@
         <w:tab/>
       </w:r>
       <w:r>
-        <w:t xml:space="preserve">19</w:t>
+        <w:t xml:space="preserve">21</w:t>
       </w:r>
     </w:p>
     <w:p>
@@ -553,7 +553,7 @@
         <w:tab/>
       </w:r>
       <w:r>
-        <w:t xml:space="preserve">23</w:t>
+        <w:t xml:space="preserve">24</w:t>
       </w:r>
     </w:p>
     <w:p>
@@ -564,17 +564,17 @@
         </w:tabs>
         <w:ind w:left="720"/>
       </w:pPr>
-      <w:hyperlink w:anchor="sec2-5">
+      <w:hyperlink w:anchor="sec2-5-safety">
         <w:r>
           <w:rPr/>
-          <w:t xml:space="preserve">2.5 Graphical and Computer-Using Agents</w:t>
+          <w:t xml:space="preserve">2.5 Command Safety and Static Analysis of Shell Commands</w:t>
         </w:r>
       </w:hyperlink>
       <w:r>
         <w:tab/>
       </w:r>
       <w:r>
-        <w:t xml:space="preserve">27</w:t>
+        <w:t xml:space="preserve">25</w:t>
       </w:r>
     </w:p>
     <w:p>
@@ -585,17 +585,17 @@
         </w:tabs>
         <w:ind w:left="720"/>
       </w:pPr>
-      <w:hyperlink w:anchor="sec2-6">
+      <w:hyperlink w:anchor="sec2-5">
         <w:r>
           <w:rPr/>
-          <w:t xml:space="preserve">2.6 Accessibility and Speech-Driven Interaction</w:t>
+          <w:t xml:space="preserve">2.6 Graphical and Computer-Using Agents</w:t>
         </w:r>
       </w:hyperlink>
       <w:r>
         <w:tab/>
       </w:r>
       <w:r>
-        <w:t xml:space="preserve">31</w:t>
+        <w:t xml:space="preserve">28</w:t>
       </w:r>
     </w:p>
     <w:p>
@@ -606,10 +606,10 @@
         </w:tabs>
         <w:ind w:left="720"/>
       </w:pPr>
-      <w:hyperlink w:anchor="sec2-7">
+      <w:hyperlink w:anchor="sec2-6">
         <w:r>
           <w:rPr/>
-          <w:t xml:space="preserve">2.7 Evaluation Environments and Benchmarks</w:t>
+          <w:t xml:space="preserve">2.7 Accessibility and Speech-Driven Interaction</w:t>
         </w:r>
       </w:hyperlink>
       <w:r>
@@ -627,10 +627,10 @@
         </w:tabs>
         <w:ind w:left="720"/>
       </w:pPr>
-      <w:hyperlink w:anchor="sec2-8">
+      <w:hyperlink w:anchor="sec2-7">
         <w:r>
           <w:rPr/>
-          <w:t xml:space="preserve">2.8 Synthesis: Comparative Analysis and Research Gap</w:t>
+          <w:t xml:space="preserve">2.8 Evaluation Environments and Benchmarks</w:t>
         </w:r>
       </w:hyperlink>
       <w:r>
@@ -648,17 +648,17 @@
         </w:tabs>
         <w:ind w:left="720"/>
       </w:pPr>
-      <w:hyperlink w:anchor="sec2-9">
+      <w:hyperlink w:anchor="sec2-8">
         <w:r>
           <w:rPr/>
-          <w:t xml:space="preserve">2.9 Review of the Methodological Literature</w:t>
+          <w:t xml:space="preserve">2.9 Synthesis: Comparative Analysis and Research Gap</w:t>
         </w:r>
       </w:hyperlink>
       <w:r>
         <w:tab/>
       </w:r>
       <w:r>
-        <w:t xml:space="preserve">40</w:t>
+        <w:t xml:space="preserve">35</w:t>
       </w:r>
     </w:p>
     <w:p>
@@ -669,17 +669,38 @@
         </w:tabs>
         <w:ind w:left="720"/>
       </w:pPr>
+      <w:hyperlink w:anchor="sec2-9">
+        <w:r>
+          <w:rPr/>
+          <w:t xml:space="preserve">2.10 Review of the Methodological Literature</w:t>
+        </w:r>
+      </w:hyperlink>
+      <w:r>
+        <w:tab/>
+      </w:r>
+      <w:r>
+        <w:t xml:space="preserve">41</w:t>
+      </w:r>
+    </w:p>
+    <w:p>
+      <w:pPr>
+        <w:pStyle w:val="BodyText"/>
+        <w:tabs>
+          <w:tab w:val="right" w:leader="dot" w:pos="9350"/>
+        </w:tabs>
+        <w:ind w:left="720"/>
+      </w:pPr>
       <w:hyperlink w:anchor="sec2-10">
         <w:r>
           <w:rPr/>
-          <w:t xml:space="preserve">2.10 Summary</w:t>
+          <w:t xml:space="preserve">2.11 Summary</w:t>
         </w:r>
       </w:hyperlink>
       <w:r>
         <w:tab/>
       </w:r>
       <w:r>
-        <w:t xml:space="preserve">41</w:t>
+        <w:t xml:space="preserve">43</w:t>
       </w:r>
     </w:p>
     <w:p>
@@ -699,7 +720,7 @@
         <w:tab/>
       </w:r>
       <w:r>
-        <w:t xml:space="preserve">44</w:t>
+        <w:t xml:space="preserve">45</w:t>
       </w:r>
     </w:p>
     <w:p>
@@ -719,7 +740,7 @@
         <w:tab/>
       </w:r>
       <w:r>
-        <w:t xml:space="preserve">45</w:t>
+        <w:t xml:space="preserve">46</w:t>
       </w:r>
     </w:p>
     <w:p>
@@ -739,7 +760,7 @@
         <w:tab/>
       </w:r>
       <w:r>
-        <w:t xml:space="preserve">47</w:t>
+        <w:t xml:space="preserve">49</w:t>
       </w:r>
     </w:p>
     <w:p>
@@ -759,7 +780,7 @@
         <w:tab/>
       </w:r>
       <w:r>
-        <w:t xml:space="preserve">50</w:t>
+        <w:t xml:space="preserve">51</w:t>
       </w:r>
     </w:p>
     <w:p>
@@ -779,7 +800,7 @@
         <w:tab/>
       </w:r>
       <w:r>
-        <w:t xml:space="preserve">62</w:t>
+        <w:t xml:space="preserve">64</w:t>
       </w:r>
     </w:p>
     <w:p>
@@ -799,7 +820,7 @@
         <w:tab/>
       </w:r>
       <w:r>
-        <w:t xml:space="preserve">78</w:t>
+        <w:t xml:space="preserve">79</w:t>
       </w:r>
     </w:p>
     <w:p>
@@ -819,7 +840,7 @@
         <w:tab/>
       </w:r>
       <w:r>
-        <w:t xml:space="preserve">97</w:t>
+        <w:t xml:space="preserve">98</w:t>
       </w:r>
     </w:p>
     <w:p>
@@ -839,7 +860,7 @@
         <w:tab/>
       </w:r>
       <w:r>
-        <w:t xml:space="preserve">103</w:t>
+        <w:t xml:space="preserve">104</w:t>
       </w:r>
     </w:p>
     <w:bookmarkStart w:id="24" w:name="list-of-tables"/>
@@ -888,7 +909,7 @@
         <w:tab/>
       </w:r>
       <w:r>
-        <w:t xml:space="preserve">33</w:t>
+        <w:t xml:space="preserve">35</w:t>
       </w:r>
     </w:p>
     <w:p>
@@ -908,7 +929,7 @@
         <w:tab/>
       </w:r>
       <w:r>
-        <w:t xml:space="preserve">48</w:t>
+        <w:t xml:space="preserve">49</w:t>
       </w:r>
     </w:p>
     <w:p>
@@ -928,7 +949,7 @@
         <w:tab/>
       </w:r>
       <w:r>
-        <w:t xml:space="preserve">48</w:t>
+        <w:t xml:space="preserve">49</w:t>
       </w:r>
     </w:p>
     <w:p>
@@ -948,7 +969,7 @@
         <w:tab/>
       </w:r>
       <w:r>
-        <w:t xml:space="preserve">80</w:t>
+        <w:t xml:space="preserve">81</w:t>
       </w:r>
     </w:p>
     <w:p>
@@ -968,7 +989,7 @@
         <w:tab/>
       </w:r>
       <w:r>
-        <w:t xml:space="preserve">84</w:t>
+        <w:t xml:space="preserve">85</w:t>
       </w:r>
     </w:p>
     <w:p>
@@ -988,7 +1009,7 @@
         <w:tab/>
       </w:r>
       <w:r>
-        <w:t xml:space="preserve">88</w:t>
+        <w:t xml:space="preserve">89</w:t>
       </w:r>
     </w:p>
     <w:p>
@@ -1008,7 +1029,7 @@
         <w:tab/>
       </w:r>
       <w:r>
-        <w:t xml:space="preserve">106</w:t>
+        <w:t xml:space="preserve">107</w:t>
       </w:r>
     </w:p>
     <w:p>
@@ -1028,7 +1049,7 @@
         <w:tab/>
       </w:r>
       <w:r>
-        <w:t xml:space="preserve">108</w:t>
+        <w:t xml:space="preserve">109</w:t>
       </w:r>
     </w:p>
     <w:bookmarkEnd w:id="24"/>
@@ -1058,7 +1079,7 @@
         <w:tab/>
       </w:r>
       <w:r>
-        <w:t xml:space="preserve">17</w:t>
+        <w:t xml:space="preserve">18</w:t>
       </w:r>
     </w:p>
     <w:p>
@@ -1071,14 +1092,14 @@
       <w:hyperlink w:anchor="figure-3-1">
         <w:r>
           <w:rPr/>
-          <w:t xml:space="preserve">Figure 3.1: Conceptual framework of SynapseOS</w:t>
+          <w:t xml:space="preserve">Figure 3.1: Conceptual framework: the recoverability analysis and the platform that deploys it</w:t>
         </w:r>
       </w:hyperlink>
       <w:r>
         <w:tab/>
       </w:r>
       <w:r>
-        <w:t xml:space="preserve">46</w:t>
+        <w:t xml:space="preserve">47</w:t>
       </w:r>
     </w:p>
     <w:bookmarkEnd w:id="25"/>
@@ -1185,6 +1206,14 @@
       </w:r>
       <w:r>
         <w:t xml:space="preserve">for the Linux desktop, despite Linux serving as the substrate for most developer and server-side workflows.</w:t>
+      </w:r>
+    </w:p>
+    <w:p>
+      <w:pPr>
+        <w:pStyle w:val="BodyText"/>
+      </w:pPr>
+      <w:r>
+        <w:t xml:space="preserve">Capability raises a question of safety, and it is the question this study takes as its subject.  A system that writes a shell command from a request and runs it acts on the user’s own files, so the cost of a misunderstood or over-broad command is measured in lost data.  Shell commands are programs: their targets may be hidden inside other commands or computed only while they run, so what a command will change cannot be read from its name.  Determining that before it runs, and saving beforehand exactly what it would destroy so that it can be undone, is a problem of program analysis.  This study addresses it, and uses a conversational interface layer for the Linux desktop as the setting in which the analysis is deployed and validated.</w:t>
       </w:r>
     </w:p>
     <w:bookmarkEnd w:id="28"/>
@@ -2215,7 +2244,7 @@
         <w:t xml:space="preserve"> </w:t>
       </w:r>
       <w:r>
-        <w:t xml:space="preserve">The study contributes a static analysis of shell commands for recoverability, a property that existing analyses of shell do not address (§2.4), together with an evaluation against ground truth obtained by sandboxed execution rather than by human labeling.  Its ablations separate what composition and runtime-target resolution each contribute from the rule table beneath them, and its validation study shows how such an analysis behaves when deployed in an interface people use.</w:t>
+        <w:t xml:space="preserve">The study contributes a static analysis of shell commands for recoverability, a property that existing analyses of shell do not address (§2.5), together with an evaluation against ground truth obtained by sandboxed execution rather than by human labeling.  Its ablations separate what composition and runtime-target resolution each contribute from the rule table beneath them, and its validation study shows how such an analysis behaves when deployed in an interface people use.</w:t>
       </w:r>
     </w:p>
     <w:p>
@@ -2490,11 +2519,11 @@
         <w:pStyle w:val="FirstParagraph"/>
       </w:pPr>
       <w:r>
-        <w:t xml:space="preserve">This chapter reviews the body of research relevant to the design and evaluation of a conversational interface layer for the Linux desktop, and to the safety of the commands such a layer executes.  The review spans nearly four decades of work on natural-language interfaces to computing systems, from the symbolic-artificial-intelligence consultants developed for the Unix shell in the late 1980s [40] to the large language model (LLM) agents that now operate shells, graphical applications, browsers, and mobile devices.  Its purpose is threefold: to establish the conceptual vocabulary and technical foundations on which the present study builds, to characterize the current state of the field and its recurring limitations, and to locate precisely the gaps that the proposed recoverability analysis, and SynapseOS, the system in which it is deployed, are designed to fill.</w:t>
+        <w:t xml:space="preserve">This chapter reviews two bodies of research: the program-analysis and command-safety work on which the study’s recoverability analysis builds, and the work on conversational and language-model-mediated interfaces to personal computing in which SynapseOS, the platform where the analysis is deployed, is situated.  The review spans nearly four decades of work on natural-language interfaces to computing systems, from the symbolic-artificial-intelligence consultants developed for the Unix shell in the late 1980s [40] to the large language model (LLM) agents that now operate shells, graphical applications, browsers, and mobile devices.  Its purpose is threefold: to establish the conceptual vocabulary and technical foundations on which the present study builds, to characterize the current state of the field and its recurring limitations, and to locate precisely the gaps that the proposed recoverability analysis, and SynapseOS, the system in which it is deployed, are designed to fill.</w:t>
       </w:r>
     </w:p>
     <w:bookmarkEnd w:id="42"/>
-    <w:bookmarkStart w:id="46" w:name="sec2-2"/>
+    <w:bookmarkStart w:id="48" w:name="sec2-2"/>
     <w:p>
       <w:pPr>
         <w:pStyle w:val="Heading2"/>
@@ -2508,7 +2537,32 @@
         <w:pStyle w:val="FirstParagraph"/>
       </w:pPr>
       <w:r>
-        <w:t xml:space="preserve">The heterogeneous systems surveyed in this chapter — shell translators, web and mobile agents, desktop automation frameworks, and accessibility interfaces — differ widely in platform, action space, and evaluation method, yet they address a common problem: converting a user’s expressed intent into effects on a computing system.  To compare them on common ground, this review adopts a</w:t>
+        <w:t xml:space="preserve">This review rests on two frameworks of different standing.  The first is the theoretical basis of the study’s contribution: the program-analysis tradition in which the recoverability analysis is an instance.  The second organizes the literature on language-mediated interfaces, in which the platform that deploys the analysis is positioned.</w:t>
+      </w:r>
+    </w:p>
+    <w:bookmarkStart w:id="43" w:name="X0ed6822248a79645f25a0f517ff4d794e4f5b46"/>
+    <w:p>
+      <w:pPr>
+        <w:pStyle w:val="Heading3"/>
+      </w:pPr>
+      <w:r>
+        <w:t xml:space="preserve">Program analysis: abstract interpretation and effect systems</w:t>
+      </w:r>
+    </w:p>
+    <w:p>
+      <w:pPr>
+        <w:pStyle w:val="FirstParagraph"/>
+      </w:pPr>
+      <w:r>
+        <w:t xml:space="preserve">The technique the study’s recoverability analysis relies on — determining what a piece of code will do without executing it — is not new; it has a decades-long history in programming-language theory under two related names, neither of which the natural-language shells and command guards surveyed in this chapter draw on.  Abstract interpretation, introduced by Cousot and Cousot [5], is the foundational technique for computing sound, conservative approximations of a program’s runtime behavior by evaluating it over an abstract domain rather than its concrete one.  Type-and-effect systems, developed by Jouvelot and Gifford [16] and given a full formal treatment by Talpin and Jouvelot [35], extend a program’s type judgment with an explicit account of the side effects an expression may produce, so that a compiler or static checker can reason about those effects instead of leaving them implicit in execution.  The recoverability algorithm this study contributes (Chapter 3, Section 2.1(a)–(c)) is an instance of this discipline applied to a domain neither tradition has targeted: a generated shell command is treated as an expression whose effect — on the filesystem, rather than on a type system’s abstract state — is derived from its syntax and composed across its operators, and it is that effect set, not the command’s name, that the recoverability verdict is computed over.  This connects the algorithm to an established formal lineage rather than presenting it as a bespoke heuristic, and it grounds the algorithm’s one-sided soundness property — over-approximating destructiveness under uncertainty rather than under-approximating it — in the same requirement abstract interpretation itself imposes: a sound abstraction may lose precision, but it may never assert a property the concrete execution does not actually have.</w:t>
+      </w:r>
+    </w:p>
+    <w:p>
+      <w:pPr>
+        <w:pStyle w:val="BodyText"/>
+      </w:pPr>
+      <w:r>
+        <w:t xml:space="preserve">Three properties of the analysis follow from this framework and are carried through the rest of the study.  Its abstract domain is the</w:t>
       </w:r>
       <w:r>
         <w:t xml:space="preserve"> </w:t>
@@ -2518,13 +2572,70 @@
           <w:i/>
           <w:iCs/>
         </w:rPr>
+        <w:t xml:space="preserve">effect set</w:t>
+      </w:r>
+      <w:r>
+        <w:t xml:space="preserve">: what a command would read, create, write, remove, or alter in metadata, rather than the command’s name.  Its semantics is</w:t>
+      </w:r>
+      <w:r>
+        <w:t xml:space="preserve"> </w:t>
+      </w:r>
+      <w:r>
+        <w:rPr>
+          <w:i/>
+          <w:iCs/>
+        </w:rPr>
+        <w:t xml:space="preserve">compositional</w:t>
+      </w:r>
+      <w:r>
+        <w:t xml:space="preserve">: the effects of a line are built from the effects of its parts through the operators that join them, which is what an enumerated list of command patterns cannot express.  And its soundness is</w:t>
+      </w:r>
+      <w:r>
+        <w:t xml:space="preserve"> </w:t>
+      </w:r>
+      <w:r>
+        <w:rPr>
+          <w:i/>
+          <w:iCs/>
+        </w:rPr>
+        <w:t xml:space="preserve">one-sided</w:t>
+      </w:r>
+      <w:r>
+        <w:t xml:space="preserve">: whatever cannot be determined is treated as unrecoverable, so that the analysis may ask more often than necessary but may never declare a destructive command safe.</w:t>
+      </w:r>
+    </w:p>
+    <w:bookmarkEnd w:id="43"/>
+    <w:bookmarkStart w:id="47" w:name="the-four-layer-interaction-pipeline"/>
+    <w:p>
+      <w:pPr>
+        <w:pStyle w:val="Heading3"/>
+      </w:pPr>
+      <w:r>
+        <w:t xml:space="preserve">The four-layer interaction pipeline</w:t>
+      </w:r>
+    </w:p>
+    <w:p>
+      <w:pPr>
+        <w:pStyle w:val="FirstParagraph"/>
+      </w:pPr>
+      <w:r>
+        <w:t xml:space="preserve">The heterogeneous systems surveyed in this chapter — shell translators, web and mobile agents, desktop automation frameworks, and accessibility interfaces — differ widely in platform, action space, and evaluation method, yet they address a common problem: converting a user’s expressed intent into effects on a computing system.  To compare them on common ground, this review adopts a</w:t>
+      </w:r>
+      <w:r>
+        <w:t xml:space="preserve"> </w:t>
+      </w:r>
+      <w:r>
+        <w:rPr>
+          <w:i/>
+          <w:iCs/>
+        </w:rPr>
         <w:t xml:space="preserve">four-layer interaction pipeline</w:t>
       </w:r>
       <w:r>
         <w:t xml:space="preserve"> </w:t>
       </w:r>
       <w:r>
-        <w:t xml:space="preserve">— Input, Reasoning, Action, and Operating-System Integration — as its theoretical framework.  The framework is adapted from the layered decomposition of large language model (LLM)-brained graphical user interface (GUI) agents proposed in the survey of Zhang and colleagues [44], generalized here from graphical agents specifically to language-mediated computing interfaces as a class.  Figure 2.1 depicts the pipeline and situates the layers relative to one another.</w:t>
+        <w:t xml:space="preserve">— Input, Reasoning, Action, and Operating-System Integration — as its framework for the interface literature.  The framework is adapted from the layered decomposition of large language model (LLM)-brained graphical user interface (GUI) agents proposed in the survey of Zhang and colleagues [44], generalized here from graphical agents specifically to language-mediated computing interfaces as a class.  Figure 2.1 depicts the pipeline and situates the layers relative to one another.</w:t>
       </w:r>
     </w:p>
     <w:p>
@@ -2536,18 +2647,18 @@
           <wp:inline>
             <wp:extent cx="5334000" cy="1114567"/>
             <wp:effectExtent b="0" l="0" r="0" t="0"/>
-            <wp:docPr descr="" title="" id="44" name="Picture"/>
+            <wp:docPr descr="" title="" id="45" name="Picture"/>
             <a:graphic>
               <a:graphicData uri="http://schemas.openxmlformats.org/drawingml/2006/picture">
                 <pic:pic>
                   <pic:nvPicPr>
-                    <pic:cNvPr descr="/tmp/claude-1000/-home-willard-projects-thesis/cb82e7af-8c35-489a-a7f7-ef49172efea2/scratchpad/docx/work3/fig0.png" id="45" name="Picture"/>
+                    <pic:cNvPr descr="/tmp/claude-1000/-home-willard-projects-thesis/cb82e7af-8c35-489a-a7f7-ef49172efea2/scratchpad/docx/work4/fig0.png" id="46" name="Picture"/>
                     <pic:cNvPicPr>
                       <a:picLocks noChangeArrowheads="1" noChangeAspect="1"/>
                     </pic:cNvPicPr>
                   </pic:nvPicPr>
                   <pic:blipFill>
-                    <a:blip r:embed="rId43"/>
+                    <a:blip r:embed="rId44"/>
                     <a:stretch>
                       <a:fillRect/>
                     </a:stretch>
@@ -2669,7 +2780,7 @@
         <w:pStyle w:val="BodyText"/>
       </w:pPr>
       <w:r>
-        <w:t xml:space="preserve">This framework is appropriate to the present study for three reasons.  First, it is</w:t>
+        <w:t xml:space="preserve">This framework is appropriate to that literature for three reasons.  First, it is</w:t>
       </w:r>
       <w:r>
         <w:t xml:space="preserve"> </w:t>
@@ -2695,7 +2806,7 @@
         <w:t xml:space="preserve">diagnostic</w:t>
       </w:r>
       <w:r>
-        <w:t xml:space="preserve">: locating each system’s principal limitation at a specific layer — visual grounding as a Reasoning-and-Action failure, or narrow platform coverage as an Operating-System Integration limitation — turns an otherwise flat catalogue of systems into a structured comparison, and it is this layer-by-layer positioning that the comparative synthesis of §2.8 makes explicit.  Third, it is</w:t>
+        <w:t xml:space="preserve">: locating each system’s principal limitation at a specific layer — visual grounding as a Reasoning-and-Action failure, or narrow platform coverage as an Operating-System Integration limitation — turns an otherwise flat catalogue of systems into a structured comparison, and it is this layer-by-layer positioning that the comparative synthesis of §2.9 makes explicit.  Third, it is</w:t>
       </w:r>
       <w:r>
         <w:t xml:space="preserve"> </w:t>
@@ -2711,108 +2822,109 @@
         <w:t xml:space="preserve"> </w:t>
       </w:r>
       <w:r>
-        <w:t xml:space="preserve">to the proposed system: the conceptual framework of SynapseOS presented in Chapter 3 instantiates this same pipeline — accepting natural-language intent at the Input layer, parsing it with a locally-hosted small language model at the Reasoning layer, translating it into shell commands executed through the standard toolchain at the Action layer, and spanning the full graphical session rather than a single application at the Operating-System Integration layer.  The framework therefore serves both as the organizing lens for the literature and as the vocabulary in which the study’s own contribution is later positioned.</w:t>
-      </w:r>
-    </w:p>
-    <w:p>
-      <w:pPr>
-        <w:pStyle w:val="BodyText"/>
-      </w:pPr>
-      <w:r>
-        <w:t xml:space="preserve">Works were included in this review if they satisfy at least one of five criteria: they translate natural language into executable system actions; they operate graphical, web, or mobile interfaces through LLM-based reasoning; they address speech- or accessibility-driven interaction with computing systems; they provide an evaluation environment for such systems; or they report a controlled empirical comparison between a language-mediated interface and a conventional graphical one.  The fifth criterion is stated explicitly because the third gap this chapter identifies concerns the scarcity of exactly such comparisons: a corpus admitting only the first four criteria could not contain a comparative interface study by construction, and an absence argument drawn from it would be circular rather than evidential.  Works concerned solely with model architecture or training, without a computing-interaction target, and general-purpose conversational systems without a system-control capability, were excluded as outside the scope of this study.</w:t>
-      </w:r>
-    </w:p>
-    <w:p>
-      <w:pPr>
-        <w:pStyle w:val="BodyText"/>
-      </w:pPr>
-      <w:r>
-        <w:t xml:space="preserve">Candidate works were identified through language-model-assisted search across arXiv, the ACM Digital Library, IEEE Xplore, and the ACL Anthology, extended by backward and forward citation chaining from each work that met the criteria above.  This review is therefore a narrative review rather than a systematic one, and the search is not claimed to be exhaustive.  Because assisted search can surface plausible but non-existent references, and can attribute to a source a claim that source does not make, every work cited in this chapter was subsequently verified by hand against its primary record — author list, venue, and year — and, where a specific claim is attributed to a work, against the presence of that claim in the work’s own text.  That verification pass corrected errors of both attribution and currency introduced by the initial search, and it is reported here because the reliability of this chapter rests on it rather than on the discovery method.  The limitation this leaves is one of recall rather than accuracy: assisted search favors well-indexed and heavily cited work, so the corpus may under-represent less visible literature.  The absence claims in §2.8 are accordingly scoped to the surveyed corpus and stated as such, rather than as claims about the literature as a whole.  The chapter first sets out the theoretical framework that organizes the review (§2.2), then proceeds thematically — historical foundations (§2.3), the shell and command-line thread most directly related to the proposed design (§2.4), graphical and computer-using agents (§2.5), accessibility and speech-driven interaction (§2.6), and evaluation environments (§2.7) — before synthesizing the surveyed works into a comparative analysis and an explicit statement of the research gap (§2.8).  It closes with a review of the methodological literature that informs the study’s evaluation design (§2.9) and a summary that motivates the methodology detailed in Chapter 3 (§2.10).</w:t>
-      </w:r>
-    </w:p>
-    <w:bookmarkEnd w:id="46"/>
-    <w:bookmarkStart w:id="48" w:name="sec2-3"/>
-    <w:p>
-      <w:pPr>
-        <w:pStyle w:val="Heading2"/>
-      </w:pPr>
-      <w:r>
-        <w:t xml:space="preserve">2.3 Historical Foundations of Natural-Language Interfaces</w:t>
-      </w:r>
-    </w:p>
-    <w:p>
-      <w:pPr>
-        <w:pStyle w:val="FirstParagraph"/>
-      </w:pPr>
-      <w:r>
-        <w:t xml:space="preserve">The aspiration to let users describe what they want in ordinary language and have a computer carry it out is not new.  The earliest serious system in this tradition, the Berkeley Unix Consultant of Wilensky and colleagues [40], was already operational by the late 1980s.  The Unix Consultant was an intelligent natural-language interface that allowed naive users to learn about the Unix operating system through conversation in ordinary English, addressing both the natural-language-frontend problem and the consultation problem, and thereby distinguishing itself from systems intended only as command translators.  It was built on the KODIAK knowledge representation and incorporated a user-modeling component that represented the user’s knowledge state and a teaching component through which users could extend its knowledge base in natural language.  The system demonstrated end-to-end natural-language consultation about Unix, successfully answering "how do I," definitional, and problem-solving questions.  Critically, its authors identified knowledge acquisition as the principal bottleneck: extending the system to a new domain required substantial hand-engineering — a concern that directly foreshadows the contemporary problem of LLM-based agents requiring per-application grounding data.</w:t>
-      </w:r>
-    </w:p>
-    <w:p>
-      <w:pPr>
-        <w:pStyle w:val="BodyText"/>
-      </w:pPr>
-      <w:r>
-        <w:t xml:space="preserve">The intervening decades saw natural-language interaction treated primarily as a supervised-learning problem.  Representative of this pre-LLM era, the work of Li and colleagues on mapping natural-language instructions to mobile user-interface action sequences [18] trained dedicated phrase-extraction and grounding transformers on hand-annotated action sequences, achieving 70.59% accuracy on predicting complete ground-truth action sequences on its benchmark but remaining bound to its purpose-built datasets and architectures.  The decisive shift came with the introduction of in-context reasoning patterns for LLMs.  ReAct, introduced by Yao and colleagues [42], collapsed the multi-stage supervised pipeline into a prompting strategy: the language model is prompted to alternate between free-text "Thought" steps that update its plan and "Action" steps that interact with an external environment, with observations fed back into subsequent reasoning.  Implemented purely as a prompting strategy without fine-tuning, ReAct nonetheless outperformed imitation-learning and reinforcement-learning baselines that required thousands of training trajectories.</w:t>
-      </w:r>
-    </w:p>
-    <w:p>
-      <w:pPr>
-        <w:pStyle w:val="BodyText"/>
-      </w:pPr>
-      <w:r>
-        <w:t xml:space="preserve">The historical significance of this transition is twofold, and it frames the remainder of this review.  First, it explains why progress in the field has been so rapid since 2023: the methodological foundations became portable across modalities and platforms in a way that the earlier dataset-bound approaches were not.  Nearly every system surveyed in the sections that follow inherits from ReAct the convention of interleaving reasoning traces with environment-affecting actions.  Second, this shared inheritance underscores a corresponding fragility: these systems inherit the failure modes of LLM reasoning — hallucinated actions, plan inconsistency, and brittleness on long-horizon tasks — alongside their capabilities, a concern that the evaluation literature reviewed in §2.7 quantifies.</w:t>
-      </w:r>
-    </w:p>
-    <w:bookmarkStart w:id="47" w:name="X28e6469fd17e553ed563da3fe191c92b0ee28b2"/>
-    <w:p>
-      <w:pPr>
-        <w:pStyle w:val="Heading3"/>
-      </w:pPr>
-      <w:r>
-        <w:t xml:space="preserve">Interface paradigms and the case against natural language</w:t>
-      </w:r>
-    </w:p>
-    <w:p>
-      <w:pPr>
-        <w:pStyle w:val="FirstParagraph"/>
-      </w:pPr>
-      <w:r>
-        <w:t xml:space="preserve">The aspiration to a natural-language interface has a long-standing critique that remains unanswered, and a review that omitted it would misrepresent the state of the question.  Shneiderman’s account of direct manipulation [32] holds that interfaces succeed when the objects of interest are continuously visible, when actions upon them are rapid, incremental, and reversible, and when their effects are immediately apparent — properties that let a user build and maintain an accurate model of system state.  Norman formalized what an interface does for a user as the bridging of two gulfs [26]: the gulf of execution, between an intention and the actions a system makes available, and the gulf of evaluation, between the system’s response and the user’s ability to interpret it.  Hutchins, Hollan, and Norman [14] argued that direct manipulation narrows both, by making an interface feel like the object of interest itself rather than a description of it.</w:t>
-      </w:r>
-    </w:p>
-    <w:p>
-      <w:pPr>
-        <w:pStyle w:val="BodyText"/>
-      </w:pPr>
-      <w:r>
-        <w:t xml:space="preserve">A language interface sits awkwardly against nearly every one of those properties.  An utterance is not continuously visible, not incremental, and not reversible by the same gesture that produced it; the set of available actions is not displayed, so the user must guess at the system’s capabilities rather than see them.  Shneiderman and Maes debated precisely this trade-off between direct manipulation and interface agents [34], and Shneiderman argued subsequently that speech and language interaction consume the same cognitive resources a user needs in order to hold a task in mind, where pointing does not [33].  Empirical work on modern conversational agents has largely borne the concern out: Luger and Sellen documented a persistent gulf between what users expected a conversational agent to understand and what it actually did [22], and Clark and colleagues found that the properties people value in human conversation transfer poorly to interaction with an agent [4].</w:t>
-      </w:r>
-    </w:p>
-    <w:p>
-      <w:pPr>
-        <w:pStyle w:val="BodyText"/>
-      </w:pPr>
-      <w:r>
-        <w:t xml:space="preserve">This critique is the strongest argument against the premise of the present study, and it shapes the system’s design rather than being set aside by it.  Two of its three concerns are addressed directly.  The gulf of evaluation is narrowed by displaying the generated command and its raw output rather than reporting an outcome in prose, so that the user sees what was actually done rather than a description of it.  The irreversibility of an utterance is answered by the confirmation gate and the undo journal, which restore by mechanism the reversibility that direct manipulation obtains for free.  The third concern — that a user cannot see the boundary of what the system is able to do — is not solved by this design and is carried forward as an acknowledged limitation.</w:t>
-      </w:r>
-    </w:p>
-    <w:p>
-      <w:pPr>
-        <w:pStyle w:val="BodyText"/>
-      </w:pPr>
-      <w:r>
-        <w:t xml:space="preserve">The comparative question is older than the current literature and considerably less settled than it is often assumed to be.  It is widely held that the command line’s power is inaccessible to most people in practice.  But the best-known controlled comparison of command, menu, and iconic interfaces, conducted by Whiteside and colleagues across seventy-six users and seven systems [39], concluded that interface style itself did not predict either performance or preference: careful design did, and the system that served novices best also served experts best.  That finding is as much a caution for the present study as a motivation for it.  It warns against attributing to a conversational paradigm what may in fact belong to the quality of one particular implementation, and it is a principal reason this study measures a specific system against a specific baseline rather than claiming to measure one paradigm against another.</w:t>
+        <w:t xml:space="preserve">to the platform: SynapseOS, in which the analysis is deployed (Chapter 3, Figure 3.1), instantiates this same pipeline — accepting natural-language intent at the Input layer, parsing it with a locally-hosted small language model at the Reasoning layer, translating it into shell commands executed through the standard toolchain at the Action layer, and spanning the full graphical session rather than a single application at the Operating-System Integration layer.  The pipeline therefore serves both as the organizing lens for the interface literature and as the vocabulary in which the platform is later positioned; the analysis sits between its Reasoning and Action layers, where a generated command is about to take effect.</w:t>
+      </w:r>
+    </w:p>
+    <w:p>
+      <w:pPr>
+        <w:pStyle w:val="BodyText"/>
+      </w:pPr>
+      <w:r>
+        <w:t xml:space="preserve">Works were included in this review if they satisfy at least one of six criteria: they analyze or guard shell commands or scripts, or reason statically about a program’s effects; they translate natural language into executable system actions; they operate graphical, web, or mobile interfaces through LLM-based reasoning; they address speech- or accessibility-driven interaction with computing systems; they provide an evaluation environment for such systems; or they report a controlled empirical comparison between a language-mediated interface and a conventional graphical one.  The sixth criterion is stated explicitly because the fourth gap this chapter identifies concerns the scarcity of exactly such comparisons: a corpus admitting only the first five criteria could not contain a comparative interface study by construction, and an absence argument drawn from it would be circular rather than evidential.  Works concerned solely with model architecture or training, without a computing-interaction target, and general-purpose conversational systems without a system-control capability, were excluded as outside the scope of this study.</w:t>
+      </w:r>
+    </w:p>
+    <w:p>
+      <w:pPr>
+        <w:pStyle w:val="BodyText"/>
+      </w:pPr>
+      <w:r>
+        <w:t xml:space="preserve">Candidate works were identified through language-model-assisted search across arXiv, the ACM Digital Library, IEEE Xplore, and the ACL Anthology, extended by backward and forward citation chaining from each work that met the criteria above.  This review is therefore a narrative review rather than a systematic one, and the search is not claimed to be exhaustive.  Because assisted search can surface plausible but non-existent references, and can attribute to a source a claim that source does not make, every work cited in this chapter was subsequently verified by hand against its primary record — author list, venue, and year — and, where a specific claim is attributed to a work, against the presence of that claim in the work’s own text.  That verification pass corrected errors of both attribution and currency introduced by the initial search, and it is reported here because the reliability of this chapter rests on it rather than on the discovery method.  The limitation this leaves is one of recall rather than accuracy: assisted search favors well-indexed and heavily cited work, so the corpus may under-represent less visible literature.  The absence claims in §2.9 are accordingly scoped to the surveyed corpus and stated as such, rather than as claims about the literature as a whole.  The chapter first sets out the theoretical frameworks (§2.2), then proceeds thematically — historical foundations (§2.3), natural-language-to-shell translation (§2.4), command safety and static analysis of shell commands, the literature closest to the study’s algorithm (§2.5), graphical and computer-using agents (§2.6), accessibility and speech-driven interaction (§2.7), and evaluation environments (§2.8) — before synthesizing the surveyed works into a statement of the research gap and a comparative analysis (§2.9).  It closes with a review of the methodological literature that informs the validation study (§2.10) and a summary that motivates the methodology detailed in Chapter 3 (§2.11).</w:t>
       </w:r>
     </w:p>
     <w:bookmarkEnd w:id="47"/>
     <w:bookmarkEnd w:id="48"/>
-    <w:bookmarkStart w:id="49" w:name="sec2-4"/>
+    <w:bookmarkStart w:id="50" w:name="sec2-3"/>
     <w:p>
       <w:pPr>
         <w:pStyle w:val="Heading2"/>
       </w:pPr>
       <w:r>
+        <w:t xml:space="preserve">2.3 Historical Foundations of Natural-Language Interfaces</w:t>
+      </w:r>
+    </w:p>
+    <w:p>
+      <w:pPr>
+        <w:pStyle w:val="FirstParagraph"/>
+      </w:pPr>
+      <w:r>
+        <w:t xml:space="preserve">The aspiration to let users describe what they want in ordinary language and have a computer carry it out is not new.  The earliest serious system in this tradition, the Berkeley Unix Consultant of Wilensky and colleagues [40], was already operational by the late 1980s.  The Unix Consultant was an intelligent natural-language interface that allowed naive users to learn about the Unix operating system through conversation in ordinary English, addressing both the natural-language-frontend problem and the consultation problem, and thereby distinguishing itself from systems intended only as command translators.  It was built on the KODIAK knowledge representation and incorporated a user-modeling component that represented the user’s knowledge state and a teaching component through which users could extend its knowledge base in natural language.  The system demonstrated end-to-end natural-language consultation about Unix, successfully answering "how do I," definitional, and problem-solving questions.  Critically, its authors identified knowledge acquisition as the principal bottleneck: extending the system to a new domain required substantial hand-engineering — a concern that directly foreshadows the contemporary problem of LLM-based agents requiring per-application grounding data.</w:t>
+      </w:r>
+    </w:p>
+    <w:p>
+      <w:pPr>
+        <w:pStyle w:val="BodyText"/>
+      </w:pPr>
+      <w:r>
+        <w:t xml:space="preserve">The intervening decades saw natural-language interaction treated primarily as a supervised-learning problem.  Representative of this pre-LLM era, the work of Li and colleagues on mapping natural-language instructions to mobile user-interface action sequences [18] trained dedicated phrase-extraction and grounding transformers on hand-annotated action sequences, achieving 70.59% accuracy on predicting complete ground-truth action sequences on its benchmark but remaining bound to its purpose-built datasets and architectures.  The decisive shift came with the introduction of in-context reasoning patterns for LLMs.  ReAct, introduced by Yao and colleagues [42], collapsed the multi-stage supervised pipeline into a prompting strategy: the language model is prompted to alternate between free-text "Thought" steps that update its plan and "Action" steps that interact with an external environment, with observations fed back into subsequent reasoning.  Implemented purely as a prompting strategy without fine-tuning, ReAct nonetheless outperformed imitation-learning and reinforcement-learning baselines that required thousands of training trajectories.</w:t>
+      </w:r>
+    </w:p>
+    <w:p>
+      <w:pPr>
+        <w:pStyle w:val="BodyText"/>
+      </w:pPr>
+      <w:r>
+        <w:t xml:space="preserve">The historical significance of this transition is twofold, and it frames the remainder of this review.  First, it explains why progress in the field has been so rapid since 2023: the methodological foundations became portable across modalities and platforms in a way that the earlier dataset-bound approaches were not.  Nearly every system surveyed in the sections that follow inherits from ReAct the convention of interleaving reasoning traces with environment-affecting actions.  Second, this shared inheritance underscores a corresponding fragility: these systems inherit the failure modes of LLM reasoning — hallucinated actions, plan inconsistency, and brittleness on long-horizon tasks — alongside their capabilities, a concern that the evaluation literature reviewed in §2.8 quantifies.</w:t>
+      </w:r>
+    </w:p>
+    <w:bookmarkStart w:id="49" w:name="X28e6469fd17e553ed563da3fe191c92b0ee28b2"/>
+    <w:p>
+      <w:pPr>
+        <w:pStyle w:val="Heading3"/>
+      </w:pPr>
+      <w:r>
+        <w:t xml:space="preserve">Interface paradigms and the case against natural language</w:t>
+      </w:r>
+    </w:p>
+    <w:p>
+      <w:pPr>
+        <w:pStyle w:val="FirstParagraph"/>
+      </w:pPr>
+      <w:r>
+        <w:t xml:space="preserve">The aspiration to a natural-language interface has a long-standing critique that remains unanswered, and a review that omitted it would misrepresent the state of the question.  Shneiderman’s account of direct manipulation [32] holds that interfaces succeed when the objects of interest are continuously visible, when actions upon them are rapid, incremental, and reversible, and when their effects are immediately apparent — properties that let a user build and maintain an accurate model of system state.  Norman formalized what an interface does for a user as the bridging of two gulfs [26]: the gulf of execution, between an intention and the actions a system makes available, and the gulf of evaluation, between the system’s response and the user’s ability to interpret it.  Hutchins, Hollan, and Norman [14] argued that direct manipulation narrows both, by making an interface feel like the object of interest itself rather than a description of it.</w:t>
+      </w:r>
+    </w:p>
+    <w:p>
+      <w:pPr>
+        <w:pStyle w:val="BodyText"/>
+      </w:pPr>
+      <w:r>
+        <w:t xml:space="preserve">A language interface sits awkwardly against nearly every one of those properties.  An utterance is not continuously visible, not incremental, and not reversible by the same gesture that produced it; the set of available actions is not displayed, so the user must guess at the system’s capabilities rather than see them.  Shneiderman and Maes debated precisely this trade-off between direct manipulation and interface agents [34], and Shneiderman argued subsequently that speech and language interaction consume the same cognitive resources a user needs in order to hold a task in mind, where pointing does not [33].  Empirical work on modern conversational agents has largely borne the concern out: Luger and Sellen documented a persistent gulf between what users expected a conversational agent to understand and what it actually did [22], and Clark and colleagues found that the properties people value in human conversation transfer poorly to interaction with an agent [4].</w:t>
+      </w:r>
+    </w:p>
+    <w:p>
+      <w:pPr>
+        <w:pStyle w:val="BodyText"/>
+      </w:pPr>
+      <w:r>
+        <w:t xml:space="preserve">This critique is the strongest argument against the premise of the present study, and it shapes the system’s design rather than being set aside by it.  Two of its three concerns are addressed directly.  The gulf of evaluation is narrowed by displaying the generated command and its raw output rather than reporting an outcome in prose, so that the user sees what was actually done rather than a description of it.  The irreversibility of an utterance is answered by the confirmation gate and the undo journal, which restore by mechanism the reversibility that direct manipulation obtains for free.  The third concern — that a user cannot see the boundary of what the system is able to do — is not solved by this design and is carried forward as an acknowledged limitation.</w:t>
+      </w:r>
+    </w:p>
+    <w:p>
+      <w:pPr>
+        <w:pStyle w:val="BodyText"/>
+      </w:pPr>
+      <w:r>
+        <w:t xml:space="preserve">The comparative question is older than the current literature and considerably less settled than it is often assumed to be.  It is widely held that the command line’s power is inaccessible to most people in practice.  But the best-known controlled comparison of command, menu, and iconic interfaces, conducted by Whiteside and colleagues across seventy-six users and seven systems [39], concluded that interface style itself did not predict either performance or preference: careful design did, and the system that served novices best also served experts best.  That finding is as much a caution for the present study as a motivation for it.  It warns against attributing to a conversational paradigm what may in fact belong to the quality of one particular implementation, and it is a principal reason this study measures a specific system against a specific baseline rather than claiming to measure one paradigm against another.</w:t>
+      </w:r>
+    </w:p>
+    <w:bookmarkEnd w:id="49"/>
+    <w:bookmarkEnd w:id="50"/>
+    <w:bookmarkStart w:id="51" w:name="sec2-4"/>
+    <w:p>
+      <w:pPr>
+        <w:pStyle w:val="Heading2"/>
+      </w:pPr>
+      <w:r>
         <w:t xml:space="preserve">2.4 Natural-Language-to-Shell Translation</w:t>
       </w:r>
     </w:p>
@@ -2837,23 +2949,25 @@
         <w:pStyle w:val="BodyText"/>
       </w:pPr>
       <w:r>
-        <w:t xml:space="preserve">Where translation accuracy is the concern of Westenfelder and colleagues, safety is the concern of Gyawali and colleagues, whose NaSh system [9] proposes guardrails for an LLM-powered natural-language shell for Linux.  Published under the operating-systems classification, NaSh interposes a guardrail layer between the user’s natural-language input and the LLM-generated command: the model proposes a candidate command, the guardrail layer evaluates it against safety, reversibility, and confirmation criteria, and the user receives a structured preview before execution.  The authors note that LLM outputs may be unintended or unexplainable, requiring guardrails for user error recovery, and they leave as open work both the design of recovery and rollback mechanisms for irreversible system operations and the empirical user evaluation of the approach.  These two open problems — reversibility-aware confirmation and empirical validation with users — are precisely the concerns that the confirmation gate, undo mechanism, and controlled user study of the present study are designed to address.</w:t>
-      </w:r>
-    </w:p>
-    <w:p>
-      <w:pPr>
-        <w:pStyle w:val="BodyText"/>
-      </w:pPr>
-      <w:r>
-        <w:t xml:space="preserve">The feasibility of deploying such a system without reliance on a hosted frontier model is supported by the large-scale evaluation of Jacobs and colleagues [15], who assess a broad range of locally deployable open-source LLMs on Bash command generation.  Their work provides an empirical anchor for the viability of running natural-language-to-Bash translation on local, open-weights models of modest size — the deployment posture adopted by SynapseOS for reasons of privacy and offline operation.  Taken together, the shell-and-command-line thread establishes that natural-language-to-Bash translation is tractable, that safety and reversibility are central rather than incidental concerns, and that local deployment is feasible; yet no surveyed shell-level system has been evaluated with users against the conventional workflow it would supplement.</w:t>
-      </w:r>
-    </w:p>
-    <w:p>
-      <w:pPr>
-        <w:pStyle w:val="BodyText"/>
-      </w:pPr>
-      <w:r>
-        <w:t xml:space="preserve">One gap within that thread is worth isolating, because it is the one this study’s algorithmic contribution addresses.  Every surveyed system that guards a generated command does so by</w:t>
+        <w:t xml:space="preserve">The feasibility of deploying such a system without reliance on a hosted frontier model is supported by the large-scale evaluation of Jacobs and colleagues [15], who assess a broad range of locally deployable open-source LLMs on Bash command generation.  Their work provides an empirical anchor for the viability of running natural-language-to-Bash translation on local, open-weights models of modest size — the deployment posture adopted by SynapseOS for reasons of privacy and offline operation.  Taken together, the shell-and-command-line thread establishes that natural-language-to-Bash translation is tractable, that safety and reversibility are central rather than incidental concerns, and that local deployment is feasible; yet no surveyed shell-level system has been evaluated with users against the conventional workflow it would supplement.  How such systems guard the commands they generate, and what static analysis of shell commands can establish, are taken up in §2.5.</w:t>
+      </w:r>
+    </w:p>
+    <w:bookmarkEnd w:id="51"/>
+    <w:bookmarkStart w:id="52" w:name="sec2-5-safety"/>
+    <w:p>
+      <w:pPr>
+        <w:pStyle w:val="Heading2"/>
+      </w:pPr>
+      <w:r>
+        <w:t xml:space="preserve">2.5 Command Safety and Static Analysis of Shell Commands</w:t>
+      </w:r>
+    </w:p>
+    <w:p>
+      <w:pPr>
+        <w:pStyle w:val="FirstParagraph"/>
+      </w:pPr>
+      <w:r>
+        <w:t xml:space="preserve">The literature closest to the study’s algorithm concerns how shell commands are checked before they run.  It falls into two groups:</w:t>
       </w:r>
       <w:r>
         <w:t xml:space="preserve"> </w:t>
@@ -2863,46 +2977,10 @@
           <w:i/>
           <w:iCs/>
         </w:rPr>
-        <w:t xml:space="preserve">permission</w:t>
-      </w:r>
-      <w:r>
-        <w:t xml:space="preserve">: the command is matched against an enumerated set of patterns judged dangerous, and is then allowed, refused, or escalated to the user.  NaSh [9] proposes guardrails of this kind and, notably, identifies selective undo as a requirement while leaving its mechanism open; the agentic coding assistants discussed in §2.8 operate the same way in practice, with allow-and-deny lists over command prefixes.  A permission model answers whether a command may run.  It does not answer whether, having run, the command can be undone — and those are different questions with different answers.  Refusing a command protects a user only until they approve it, which for any system that must let work proceed is most of the time.</w:t>
-      </w:r>
-    </w:p>
-    <w:p>
-      <w:pPr>
-        <w:pStyle w:val="BodyText"/>
-      </w:pPr>
-      <w:r>
-        <w:t xml:space="preserve">The distinction matters because enumeration does not compose.  A pattern list matches a command in isolation, whereas a generated line routinely chains several operations whose recovery requirements differ — a removal, a version-control reset, and an in-place edit may appear in one invocation joined by</w:t>
-      </w:r>
-      <w:r>
-        <w:t xml:space="preserve"> </w:t>
-      </w:r>
-      <w:r>
-        <w:rPr>
-          <w:rStyle w:val="VerbatimChar"/>
-        </w:rPr>
-        <w:t xml:space="preserve">&amp;&amp;</w:t>
-      </w:r>
-      <w:r>
-        <w:t xml:space="preserve">, with redirects and command substitution altering what each actually touches.  No enumeration of command prefixes expresses that, and extending the list does not converge: each newly named tool leaves the next one unnamed.  Determining recoverability over a composed command, and computing the minimal information needed to reverse it, is the open problem this study takes up (RQ1–RQ3), and it is what separates the present work from the guardrail designs surveyed above.  The comparison that matters is not only against an enumerated list of dangerous commands.  A list can be turned around so that it refuses every command it does not recognize, which removes the first weakness above at the cost of asking about everything unfamiliar; that fail-closed list is the strongest simple baseline, and the study therefore claims what the analysis adds to it — seeing through wrappers, resolving run-time targets, and capturing exactly what would be lost — and not the verdict alone.</w:t>
-      </w:r>
-    </w:p>
-    <w:p>
-      <w:pPr>
-        <w:pStyle w:val="BodyText"/>
-      </w:pPr>
-      <w:r>
-        <w:t xml:space="preserve">The technique this recoverability judgment relies on — determining what a piece of code will do without executing it — is not new; it has a decades-long history in programming-language theory under two related names, neither of which the systems surveyed above draw on.  Abstract interpretation, introduced by Cousot and Cousot [5], is the foundational technique for computing sound, conservative approximations of a program’s runtime behavior by evaluating it over an abstract domain rather than its concrete one.  Type-and-effect systems, developed by Jouvelot and Gifford [16] and given a full formal treatment by Talpin and Jouvelot [35], extend a program’s type judgment with an explicit account of the side effects an expression may produce, so that a compiler or static checker can reason about those effects instead of leaving them implicit in execution.  The recoverability algorithm this study contributes (Chapter 3, Section 2.1(a)–(c)) is an instance of this discipline applied to a domain neither tradition has targeted: a generated shell command is treated as an expression whose effect — on the filesystem, rather than on a type system’s abstract state — is derived from its syntax and composed across its operators, and it is that effect set, not the command’s name, that the recoverability verdict is computed over.  This connects the algorithm to an established formal lineage rather than presenting it as a bespoke heuristic, and it grounds the algorithm’s one-sided soundness property — over-approximating destructiveness under uncertainty rather than under-approximating it — in the same requirement abstract interpretation itself imposes: a sound abstraction may lose precision, but it may never assert a property the concrete execution does not actually have.</w:t>
-      </w:r>
-    </w:p>
-    <w:p>
-      <w:pPr>
-        <w:pStyle w:val="BodyText"/>
-      </w:pPr>
-      <w:r>
-        <w:t xml:space="preserve">Static analysis of shell scripts specifically is comparatively little studied, and the existing work targets properties adjacent to recoverability rather than recoverability itself.  ABash [23] performs abstract interpretation over bash’s variable-expansion semantics to catch common expansion bugs and includes taint tracking, but is not concerned with what a script’s commands would do to the filesystem if executed correctly.  Smoosh [8] gives the POSIX shell a mechanized, executable small-step operational semantics, validated against other shells' conformance test suites — exactly the kind of ground-truth semantics a static effect analysis would need to be checked against — but stops at defining that semantics rather than analyzing programs written in it.  Closest of the three is CoLiS [1], which applies symbolic execution to the more than twenty-seven thousand POSIX-shell maintainer scripts in the Debian package archive to verify</w:t>
+        <w:t xml:space="preserve">guards</w:t>
+      </w:r>
+      <w:r>
+        <w:t xml:space="preserve">, which decide whether a generated command may run, and</w:t>
       </w:r>
       <w:r>
         <w:t xml:space="preserve"> </w:t>
@@ -2912,13 +2990,34 @@
           <w:i/>
           <w:iCs/>
         </w:rPr>
-        <w:t xml:space="preserve">idempotence</w:t>
-      </w:r>
-      <w:r>
-        <w:t xml:space="preserve"> </w:t>
-      </w:r>
-      <w:r>
-        <w:t xml:space="preserve">— that running a script a second time causes no further harm — a property Debian policy requires of these scripts because they run with root privileges during install, upgrade, and removal.  Idempotence and recoverability are related but distinct: a script can be idempotent while still being destructive on its first run —</w:t>
+        <w:t xml:space="preserve">analyses</w:t>
+      </w:r>
+      <w:r>
+        <w:t xml:space="preserve">, which reason about what a shell program does.  Each establishes part of what the study needs, and neither, as this section shows, determines whether a command’s effects can be undone.</w:t>
+      </w:r>
+    </w:p>
+    <w:p>
+      <w:pPr>
+        <w:pStyle w:val="BodyText"/>
+      </w:pPr>
+      <w:r>
+        <w:t xml:space="preserve">Where translation accuracy is the concern of Westenfelder and colleagues (§2.4), safety is the concern of Gyawali and colleagues, whose NaSh system [9] proposes guardrails for an LLM-powered natural-language shell for Linux.  Published under the operating-systems classification, NaSh interposes a guardrail layer between the user’s natural-language input and the LLM-generated command: the model proposes a candidate command, the guardrail layer evaluates it against safety, reversibility, and confirmation criteria, and the user receives a structured preview before execution.  The authors note that LLM outputs may be unintended or unexplainable, requiring guardrails for user error recovery, and they leave as open work both the design of recovery and rollback mechanisms for irreversible system operations and the empirical user evaluation of the approach.  The first of these open problems, recovery from an operation already approved, is the one the present study’s recoverability analysis addresses; the second is taken up by its validation in use.</w:t>
+      </w:r>
+    </w:p>
+    <w:p>
+      <w:pPr>
+        <w:pStyle w:val="BodyText"/>
+      </w:pPr>
+      <w:r>
+        <w:t xml:space="preserve">The same design is what ships.  Coding agents that execute generated commands guard them with lists of command patterns: the dangerous-command check of OpenAI’s Codex CLI [27] and cc-safety-net [17], a pre-execution guard used with several agentic coding tools, are representative open-source examples, and both are scored as baselines in Chapter 3, Section 3.1(a).  Both are designed for agents working inside a version-controlled project, where deleting project files is routine and version control, rather than the guard, is what makes a mistake recoverable.  A personal computer’s files have no such safeguard, which is the setting of this study.</w:t>
+      </w:r>
+    </w:p>
+    <w:p>
+      <w:pPr>
+        <w:pStyle w:val="BodyText"/>
+      </w:pPr>
+      <w:r>
+        <w:t xml:space="preserve">The gap these guards share is the one this study’s algorithmic contribution addresses.  Every surveyed system that guards a generated command does so by</w:t>
       </w:r>
       <w:r>
         <w:t xml:space="preserve"> </w:t>
@@ -2928,6 +3027,63 @@
           <w:i/>
           <w:iCs/>
         </w:rPr>
+        <w:t xml:space="preserve">permission</w:t>
+      </w:r>
+      <w:r>
+        <w:t xml:space="preserve">: the command is matched against an enumerated set of patterns judged dangerous, and is then allowed, refused, or escalated to the user.  NaSh [9] proposes guardrails of this kind and, notably, identifies selective undo as a requirement while leaving its mechanism open; the shipped guards above operate the same way in practice, with allow-and-deny lists over command prefixes.  A permission model answers whether a command may run.  It does not answer whether, having run, the command can be undone — and those are different questions with different answers.  Refusing a command protects a user only until they approve it, which for any system that must let work proceed is most of the time.</w:t>
+      </w:r>
+    </w:p>
+    <w:p>
+      <w:pPr>
+        <w:pStyle w:val="BodyText"/>
+      </w:pPr>
+      <w:r>
+        <w:t xml:space="preserve">The distinction matters because enumeration does not compose.  A pattern list matches a command in isolation, whereas a generated line routinely chains several operations whose recovery requirements differ — a removal, a version-control reset, and an in-place edit may appear in one invocation joined by</w:t>
+      </w:r>
+      <w:r>
+        <w:t xml:space="preserve"> </w:t>
+      </w:r>
+      <w:r>
+        <w:rPr>
+          <w:rStyle w:val="VerbatimChar"/>
+        </w:rPr>
+        <w:t xml:space="preserve">&amp;&amp;</w:t>
+      </w:r>
+      <w:r>
+        <w:t xml:space="preserve">, with redirects and command substitution altering what each actually touches.  No enumeration of command prefixes expresses that, and extending the list does not converge: each newly named tool leaves the next one unnamed.  Determining recoverability over a composed command, and computing the minimal information needed to reverse it, is the open problem this study takes up (RQ1–RQ3), and it is what separates the present work from the guardrail designs surveyed above.  The comparison that matters is not only against an enumerated list of dangerous commands.  A list can be turned around so that it refuses every command it does not recognize, which removes the first weakness above at the cost of asking about everything unfamiliar; that fail-closed list is the strongest simple baseline, and the study therefore claims what the analysis adds to it — seeing through wrappers, resolving run-time targets, and capturing exactly what would be lost — and not the verdict alone.</w:t>
+      </w:r>
+    </w:p>
+    <w:p>
+      <w:pPr>
+        <w:pStyle w:val="BodyText"/>
+      </w:pPr>
+      <w:r>
+        <w:t xml:space="preserve">Static analysis of shell scripts specifically is comparatively little studied, and the existing work targets properties adjacent to recoverability rather than recoverability itself.  ABash [23] performs abstract interpretation over bash’s variable-expansion semantics to catch common expansion bugs and includes taint tracking, but is not concerned with what a script’s commands would do to the filesystem if executed correctly.  Smoosh [8] gives the POSIX shell a mechanized, executable small-step operational semantics, validated against other shells' conformance test suites — exactly the kind of ground-truth semantics a static effect analysis would need to be checked against — but stops at defining that semantics rather than analyzing programs written in it.  Closest of the three is CoLiS [1], which applies symbolic execution to the more than twenty-seven thousand POSIX-shell maintainer scripts in the Debian package archive to verify</w:t>
+      </w:r>
+      <w:r>
+        <w:t xml:space="preserve"> </w:t>
+      </w:r>
+      <w:r>
+        <w:rPr>
+          <w:i/>
+          <w:iCs/>
+        </w:rPr>
+        <w:t xml:space="preserve">idempotence</w:t>
+      </w:r>
+      <w:r>
+        <w:t xml:space="preserve"> </w:t>
+      </w:r>
+      <w:r>
+        <w:t xml:space="preserve">— that running a script a second time causes no further harm — a property Debian policy requires of these scripts because they run with root privileges during install, upgrade, and removal.  Idempotence and recoverability are related but distinct: a script can be idempotent while still being destructive on its first run —</w:t>
+      </w:r>
+      <w:r>
+        <w:t xml:space="preserve"> </w:t>
+      </w:r>
+      <w:r>
+        <w:rPr>
+          <w:i/>
+          <w:iCs/>
+        </w:rPr>
         <w:t xml:space="preserve">rm -rf /var/cache/pkg</w:t>
       </w:r>
       <w:r>
@@ -2937,14 +3093,14 @@
         <w:t xml:space="preserve">is idempotent, since running it twice does no more damage than once, and unrecoverable, since the first run already destroyed what a recovery would need — and a command can be recoverable without being idempotent, if each run produces a new, independently-reversible effect.  CoLiS is therefore the nearest prior application of static effect reasoning to shell scripts specifically, and it stops short of the present study’s question for exactly this reason: verifying that re-execution is safe does not determine whether the first execution can be undone.  No work identified in this review derives a recoverability verdict for a shell command from its statically-computed effects; that is the specific gap the present study’s algorithmic contribution fills.</w:t>
       </w:r>
     </w:p>
-    <w:bookmarkEnd w:id="49"/>
-    <w:bookmarkStart w:id="55" w:name="sec2-5"/>
+    <w:bookmarkEnd w:id="52"/>
+    <w:bookmarkStart w:id="58" w:name="sec2-5"/>
     <w:p>
       <w:pPr>
         <w:pStyle w:val="Heading2"/>
       </w:pPr>
       <w:r>
-        <w:t xml:space="preserve">2.5 Graphical and Computer-Using Agents</w:t>
+        <w:t xml:space="preserve">2.6 Graphical and Computer-Using Agents</w:t>
       </w:r>
     </w:p>
     <w:p>
@@ -2982,7 +3138,7 @@
         <w:t xml:space="preserve">, and, through its platform coverage, reveals the gap that motivates the present study.  The work is organized here by the platform each system targets — web, mobile, and desktop — together with the vision-language foundation models on which many depend.</w:t>
       </w:r>
     </w:p>
-    <w:bookmarkStart w:id="50" w:name="web-agents"/>
+    <w:bookmarkStart w:id="53" w:name="web-agents"/>
     <w:p>
       <w:pPr>
         <w:pStyle w:val="Heading3"/>
@@ -2999,8 +3155,8 @@
         <w:t xml:space="preserve">The web has been the most heavily studied environment for language-guided agents.  Mind2Web, introduced by Deng and colleagues [7], is the first dataset for developing generalist web agents that follow language instructions across diverse real-world websites, comprising over two thousand open-ended tasks collected from 137 websites across 31 domains; its accompanying two-stage model uses a small language model to filter candidate elements from large documents before invoking a larger model to choose among them.  WebArena, introduced by Zhou and colleagues [48], provides a fully self-hosted, reproducible web environment of functional website clones and evaluates 812 long-horizon tasks for functional correctness rather than trajectory similarity, establishing a challenging benchmark on which contemporary models achieved completion rates far below human performance.  Zheng and colleagues [47], in their SeeAct framework, decouple visual understanding from action: the model observes a screenshot, generates a textual plan, and a separate step grounds that plan onto page elements.  Their central finding is diagnostic for the entire field — with oracle grounding provided, the model completes 51.1% of tasks on live websites, substantially outperforming a text-only baseline at 13.3%, but performance degrades sharply when grounding must itself be inferred, confirming visual grounding as the principal bottleneck.</w:t>
       </w:r>
     </w:p>
-    <w:bookmarkEnd w:id="50"/>
-    <w:bookmarkStart w:id="51" w:name="mobile-agents"/>
+    <w:bookmarkEnd w:id="53"/>
+    <w:bookmarkStart w:id="54" w:name="mobile-agents"/>
     <w:p>
       <w:pPr>
         <w:pStyle w:val="Heading3"/>
@@ -3017,8 +3173,8 @@
         <w:t xml:space="preserve">Mobile-device control has produced large-scale datasets and progressively more autonomous agents.  The pre-LLM work of Li and colleagues [18], discussed in §2.3, established the grounding problem for mobile interfaces.  Android in the Wild, from Rawles and colleagues [30], contributes a dataset of 715,000 episodes spanning 30,000 unique instructions, in which actions are gestures at arbitrary screen coordinates rather than operations on indexed interface elements, exposing the challenge that actions must be inferred from visual appearance rather than from a structured model of the interface.  AppAgent, from Zhang and colleagues [46], operates Android applications through a simplified action space of taps and swipes and learns to use new applications through autonomous exploration or by observing human demonstrations, generating application-specific documentation that matched or exceeded human-written documentation.  Mobile-Agent, from Wang and colleagues [37], adopts a purely vision-centric approach that requires no system metadata, using optical-character-recognition and icon-detection modules to locate interface elements — achieving broad applicability across mobile environments at the cost of vision-grounding errors that require recovery mechanisms.</w:t>
       </w:r>
     </w:p>
-    <w:bookmarkEnd w:id="51"/>
-    <w:bookmarkStart w:id="52" w:name="desktop-and-cross-application-agents"/>
+    <w:bookmarkEnd w:id="54"/>
+    <w:bookmarkStart w:id="55" w:name="desktop-and-cross-application-agents"/>
     <w:p>
       <w:pPr>
         <w:pStyle w:val="Heading3"/>
@@ -3035,8 +3191,8 @@
         <w:t xml:space="preserve">Desktop agents are the most direct graphical analogue to the present work, and their limitations are the most instructive.  ScreenAgent, from Niu and colleagues [25], is a vision-language-model-driven agent for cross-application desktop control that operates in a plan–act–reflect cycle, specifying actions as coordinates and key sequences; its authors acknowledge that vision-only grounding is less reliable than approaches with API access.  WinClick, from Hui and colleagues [13], targets Windows-desktop grounding and observes that most existing GUI agents rely on structured data formats such as the document object model or HyperText Markup Language, which are unavailable across general desktop environments; it therefore performs visual grounding directly from screenshots.  UFO², the "Desktop AgentOS" of Zhang and colleagues [45], is the most ambitious desktop system surveyed: it fuses the native Windows accessibility framework with vision-based parsing in a hybrid action mechanism, dispatching subtasks from a coordinating agent to application-specialized agents.  Its authors argue that existing computer-using agents are hindered by shallow operating-system integration, fragile screenshot-based interaction, and disruptive execution, and they identify adaptation to other desktop platforms, such as Linux and macOS, as future work.  UFO² nonetheless operates as an automation layer dispatched atop the existing Windows shell rather than as a replacement for it, and its authors frame cross-platform deployment as groundwork for a unified ecosystem of desktop automation solutions — the trajectory from which the present study departs.</w:t>
       </w:r>
     </w:p>
-    <w:bookmarkEnd w:id="52"/>
-    <w:bookmarkStart w:id="53" w:name="Xd57e62f069d658ec3b53e3f026d4f5c46e83916"/>
+    <w:bookmarkEnd w:id="55"/>
+    <w:bookmarkStart w:id="56" w:name="Xd57e62f069d658ec3b53e3f026d4f5c46e83916"/>
     <w:p>
       <w:pPr>
         <w:pStyle w:val="Heading3"/>
@@ -3053,8 +3209,8 @@
         <w:t xml:space="preserve">The systems surveyed above are research artifacts.  A parallel commercial development is moving faster than the peer-reviewed literature and warrants explicit positioning; what follows reflects that landscape as of September 2026 and is dated deliberately, because it will continue to move.  Several products now describe themselves as agentic operating systems.  eva AG’s WarmWind, released in 2026, runs autonomous workers that operate applications through vision and simulated mouse and keyboard input, hosted in a managed cloud environment built on a Linux base and aimed at automating repetitive office work.  Alibaba’s ANOLISA ships an AI-native Linux terminal in which shell commands and ordinary language share a single prompt, with the agent requesting approval before risky operations and a checkpoint facility providing rollback.  Major platform vendors have each shipped or previewed some form of computer control, ranging from screenshot-driven graphical automation to structured application-intent dispatch.  Two properties separate all of them from the present work, and both are structural rather than incidental.  First, each routes inference through remote infrastructure, whereas the design constraint here is that the model runs on the user’s own hardware, with no network dependency.  Second, each is built to act on the user’s behalf, largely unattended, whereas the interface studied here is operated by a person turn by turn with every irreversible action gated on that person’s approval.  The distinction is not which approach is better but which question is being asked: these systems pursue autonomy, while this study asks whether conversation is a better interface for a human who is present and in control.</w:t>
       </w:r>
     </w:p>
-    <w:bookmarkEnd w:id="53"/>
-    <w:bookmarkStart w:id="54" w:name="vision-language-foundation-models"/>
+    <w:bookmarkEnd w:id="56"/>
+    <w:bookmarkStart w:id="57" w:name="vision-language-foundation-models"/>
     <w:p>
       <w:pPr>
         <w:pStyle w:val="Heading3"/>
@@ -3071,15 +3227,15 @@
         <w:t xml:space="preserve">Underlying many of these agents are vision-language models trained specifically for interface understanding.  CogAgent, from Hong and colleagues [12], is an eighteen-billion-parameter visual language model specialized for GUI understanding and navigation, using both low- and high-resolution image encoders to recognize the small icons and text typical of graphical interfaces.  It supports the position that pure-vision GUI agents are viable when the underlying model is trained appropriately — but at a compute cost, and with the cross-platform generalization limitations common to the entire graphical-agent literature.  Across web, mobile, and desktop, these systems demonstrate broad capability within a single platform class, while consistently identifying visual grounding as an unsolved bottleneck and trending toward hybrid execution that prefers structured access where available and falls back to vision.</w:t>
       </w:r>
     </w:p>
-    <w:bookmarkEnd w:id="54"/>
-    <w:bookmarkEnd w:id="55"/>
-    <w:bookmarkStart w:id="56" w:name="sec2-6"/>
+    <w:bookmarkEnd w:id="57"/>
+    <w:bookmarkEnd w:id="58"/>
+    <w:bookmarkStart w:id="59" w:name="sec2-6"/>
     <w:p>
       <w:pPr>
         <w:pStyle w:val="Heading2"/>
       </w:pPr>
       <w:r>
-        <w:t xml:space="preserve">2.6 Accessibility and Speech-Driven Interaction</w:t>
+        <w:t xml:space="preserve">2.7 Accessibility and Speech-Driven Interaction</w:t>
       </w:r>
     </w:p>
     <w:p>
@@ -3106,14 +3262,14 @@
         <w:t xml:space="preserve">More recent work continues to mature the components required for speech-driven interface control.  Han and colleagues, in GUIRoboTron-Speech [10], advance automated GUI agents driven directly by speech instructions, while Park and colleagues, in R-VLM [29], contribute region-aware visual grounding for more precise identification of on-screen elements.  What unites this thread is that it operates at the level of the individual application or interaction technique rather than at the level of the session itself.  These approaches presuppose an underlying conversational system surface on which to run, yet no such surface exists at the session level.  This complementarity is significant: a general-purpose conversational interface layer would serve not only mainstream users but also provide the substrate that accessibility-specific configurations require — positioning accessibility not as the immediate target of the present study, which scopes it out for recruitment and ethics reasons, but as a natural and well-grounded extension of its contribution.</w:t>
       </w:r>
     </w:p>
-    <w:bookmarkEnd w:id="56"/>
-    <w:bookmarkStart w:id="57" w:name="sec2-7"/>
+    <w:bookmarkEnd w:id="59"/>
+    <w:bookmarkStart w:id="60" w:name="sec2-7"/>
     <w:p>
       <w:pPr>
         <w:pStyle w:val="Heading2"/>
       </w:pPr>
       <w:r>
-        <w:t xml:space="preserve">2.7 Evaluation Environments and Benchmarks</w:t>
+        <w:t xml:space="preserve">2.8 Evaluation Environments and Benchmarks</w:t>
       </w:r>
     </w:p>
     <w:p>
@@ -3129,17 +3285,17 @@
         <w:pStyle w:val="BodyText"/>
       </w:pPr>
       <w:r>
-        <w:t xml:space="preserve">Complementing the benchmark literature, the survey of LLM-brained GUI agents by Zhang and colleagues [44] synthesizes the field through 2024, organizing it around the components of perception, planning, action, and memory, and providing the four-layer vocabulary adopted in §2.2 of this review.  It enumerates the field’s open challenges — accurate element localization, knowledge retrieval, long-horizon planning, and safety-aware execution control; notably, none of the challenges it enumerates concerns replacing the session layer itself: the survey takes the surrounding operating-system session as given, which is the assumption the present study sets out to test.  What the evaluation literature reveals, however, is a specific methodological limitation: rigorous as these benchmarks are, they measure the autonomous task completion of agents acting on a user’s behalf, not the comparative performance of a human user working through a conversational interface versus a conventional graphical one.  That distinction motivates the evaluation design reviewed in §2.9.</w:t>
-      </w:r>
-    </w:p>
-    <w:bookmarkEnd w:id="57"/>
-    <w:bookmarkStart w:id="64" w:name="sec2-8"/>
+        <w:t xml:space="preserve">Complementing the benchmark literature, the survey of LLM-brained GUI agents by Zhang and colleagues [44] synthesizes the field through 2024, organizing it around the components of perception, planning, action, and memory, and providing the four-layer vocabulary adopted in §2.2 of this review.  It enumerates the field’s open challenges — accurate element localization, knowledge retrieval, long-horizon planning, and safety-aware execution control; notably, none of the challenges it enumerates concerns replacing the session layer itself: the survey takes the surrounding operating-system session as given, which is the assumption the present study sets out to test.  What the evaluation literature reveals, however, is a specific methodological limitation: rigorous as these benchmarks are, they measure the autonomous task completion of agents acting on a user’s behalf, not the comparative performance of a human user working through a conversational interface versus a conventional graphical one.  That distinction motivates the evaluation design reviewed in §2.10.</w:t>
+      </w:r>
+    </w:p>
+    <w:bookmarkEnd w:id="60"/>
+    <w:bookmarkStart w:id="67" w:name="sec2-8"/>
     <w:p>
       <w:pPr>
         <w:pStyle w:val="Heading2"/>
       </w:pPr>
       <w:r>
-        <w:t xml:space="preserve">2.8 Synthesis: Comparative Analysis and Research Gap</w:t>
+        <w:t xml:space="preserve">2.9 Synthesis: Comparative Analysis and Research Gap</w:t>
       </w:r>
     </w:p>
     <w:p>
@@ -3147,7 +3303,15 @@
         <w:pStyle w:val="FirstParagraph"/>
       </w:pPr>
       <w:r>
-        <w:t xml:space="preserve">Positioning the surveyed works against one another along the four-layer pipeline makes the structure of the field, and the gap within it, explicit.  Table 2.1 summarizes the principal systems by coverage scope, action mechanism, evaluation approach, and key limitation.</w:t>
+        <w:t xml:space="preserve">The synthesis has two parts.  The first concerns the study’s algorithm and is stated briefly because §2.5 has established it: every guard surveyed decides whether a command may run by matching it against a list of patterns, every analysis of shell programs targets a property other than recoverability, and none derives from a command’s structure what it would destroy or captures what is needed to undo it.  That is the research gap.  The second part concerns the setting in which the gap arises.</w:t>
+      </w:r>
+    </w:p>
+    <w:p>
+      <w:pPr>
+        <w:pStyle w:val="BodyText"/>
+      </w:pPr>
+      <w:r>
+        <w:t xml:space="preserve">Positioning the interface systems against one another along the four-layer pipeline makes the structure of that setting explicit.  Table 2.1 summarizes the principal systems by coverage scope, action mechanism, evaluation approach, and key limitation.</w:t>
       </w:r>
     </w:p>
     <w:p>
@@ -4894,7 +5058,7 @@
         <w:t xml:space="preserve">Six patterns emerge from this comparison, each surfacing a recurring theme in the literature.</w:t>
       </w:r>
     </w:p>
-    <w:bookmarkStart w:id="58" w:name="bifurcation-by-coverage-scope"/>
+    <w:bookmarkStart w:id="61" w:name="bifurcation-by-coverage-scope"/>
     <w:p>
       <w:pPr>
         <w:pStyle w:val="Heading3"/>
@@ -4911,8 +5075,8 @@
         <w:t xml:space="preserve">The field is bifurcated by coverage scope.  Shell-level work [9, 38] and single-application work [28, 36] sit at the narrow end; cross-application desktop, web, and mobile agents sit at the broad end but each within a single platform class.  No surveyed system implements a working conversational layer over the full graphical session that has been empirically validated against the conventional desktop workflow it would supplement.  The Unix Consultant [40] came closest in ambition four decades ago, but its pre-LLM foundation prevented it from scaling beyond demonstration.  The absence is structural rather than incidental.  Even UFO² [45], the most operationally advanced desktop-agent system surveyed, is by construction an automation layer dispatched atop the existing Windows shell, and its stated future direction is broader cross-platform automation rather than replacement of the session itself.  The substitution this study attempts is therefore unclaimed, not merely under-published.</w:t>
       </w:r>
     </w:p>
-    <w:bookmarkEnd w:id="58"/>
-    <w:bookmarkStart w:id="59" w:name="execution-mechanism-at-the-action-layer"/>
+    <w:bookmarkEnd w:id="61"/>
+    <w:bookmarkStart w:id="62" w:name="execution-mechanism-at-the-action-layer"/>
     <w:p>
       <w:pPr>
         <w:pStyle w:val="Heading3"/>
@@ -4929,8 +5093,8 @@
         <w:t xml:space="preserve">A second pattern concerns the execution mechanism at the Action layer.  The literature divides among command translation, API binding, and GUI simulation, with a dominant trend toward hybrid execution [36, 45] that prefers structured access where available and falls back to vision.  Vision-only systems [25, 37] achieve broad applicability at the cost of grounding fragility, while structured-access systems achieve precision at the cost of per-environment integration.  Notably, the Unix Consultant operated purely at the consultation layer without executing actions — an approach that reflects an underappreciated design principle, that the agent that explains can be safer than the agent that acts, which the confirmation-gated design of the present study revisits.</w:t>
       </w:r>
     </w:p>
-    <w:bookmarkEnd w:id="59"/>
-    <w:bookmarkStart w:id="60" w:name="Xaee8aa4ffc06f790a7ecd2919914e9aaadf5929"/>
+    <w:bookmarkEnd w:id="62"/>
+    <w:bookmarkStart w:id="63" w:name="Xaee8aa4ffc06f790a7ecd2919914e9aaadf5929"/>
     <w:p>
       <w:pPr>
         <w:pStyle w:val="Heading3"/>
@@ -4947,8 +5111,8 @@
         <w:t xml:space="preserve">A third pattern is that visual grounding is the field’s principal bottleneck, identified explicitly by both SeeAct [47] and the GUI-agents survey [44].  The 51.1% ceiling of GPT-4V with oracle grounding and its sharp degradation without are attributable in significant part to grounding failure.  This bottleneck is a property of the graphical-simulation approach specifically; a command-line approach that grounds intent into shell commands rather than into on-screen pixel regions sidesteps it, at the cost of being bounded by what is expressible on the command line.  Direct comparison qualifies that tradeoff usefully.  Across 440 matched desktop tasks, screen-only graphical agents pass 59.1% while command-line agents reach only 48.2% — the shell is not automatically the stronger substrate — but command-line agents augmented with result verification reach 69.3%, the highest of the three conditions [49].  Execution through the shell becomes advantageous when it is paired with a mechanism that checks what the command actually did, which is precisely the role a reversibility gate and an undo record play in the present design.</w:t>
       </w:r>
     </w:p>
-    <w:bookmarkEnd w:id="60"/>
-    <w:bookmarkStart w:id="61" w:name="scarcity-of-comparative-user-evaluation"/>
+    <w:bookmarkEnd w:id="63"/>
+    <w:bookmarkStart w:id="64" w:name="scarcity-of-comparative-user-evaluation"/>
     <w:p>
       <w:pPr>
         <w:pStyle w:val="Heading3"/>
@@ -4965,8 +5129,8 @@
         <w:t xml:space="preserve">A fourth pattern concerns evaluation method.  Most surveyed systems are evaluated either through architectural demonstration [9, 36] or through curated task benchmarks [7, 37, 41, 48].  User studies are rare, and the comparisons that do exist are narrow.  VoicePilot [28] conducts a substantive human-centered evaluation of LLM-based interaction, and AXIS [21] compares an API-first agent against unaided manual operation in a within-subjects design — but within a single application, on a single platform, with a cloud-hosted frontier model.  No surveyed work compares a conversational interface against the conventional graphical workflow across operating-system-level tasks on the same population.  This is the empirical gap best filled by a controlled study of conversational interfaces.</w:t>
       </w:r>
     </w:p>
-    <w:bookmarkEnd w:id="61"/>
-    <w:bookmarkStart w:id="62" w:name="the-operating-system-substrate"/>
+    <w:bookmarkEnd w:id="64"/>
+    <w:bookmarkStart w:id="65" w:name="the-operating-system-substrate"/>
     <w:p>
       <w:pPr>
         <w:pStyle w:val="Heading3"/>
@@ -4983,8 +5147,8 @@
         <w:t xml:space="preserve">A fifth pattern concerns the operating-system substrate.  Windows [13, 45], Android [30, 37, 46], and the web [7, 47, 48] are each heavily represented; the Linux work that exists is aimed elsewhere than the end user’s desktop session.  NaSh [9] addresses Linux at the shell level as a design proposal; Alibaba Cloud’s ANOLISA ships a natural-language Linux terminal with approval gating and rollback, but scoped to server and DevOps workloads; and OSWorld [41] includes Ubuntu as an evaluation platform rather than a deployment target.  No surveyed system implements a conversational session layer for the Linux desktop addressed to the person using the machine, despite Linux serving as the substrate for most developer and server-side workflows.</w:t>
       </w:r>
     </w:p>
-    <w:bookmarkEnd w:id="62"/>
-    <w:bookmarkStart w:id="63" w:name="shared-lineage-and-its-fragility"/>
+    <w:bookmarkEnd w:id="65"/>
+    <w:bookmarkStart w:id="66" w:name="shared-lineage-and-its-fragility"/>
     <w:p>
       <w:pPr>
         <w:pStyle w:val="Heading3"/>
@@ -5027,7 +5191,7 @@
         <w:t xml:space="preserve">First</w:t>
       </w:r>
       <w:r>
-        <w:t xml:space="preserve">, every surveyed system that guards a generated command does so by permission, matching it against an enumerated list of dangerous patterns, and none determines what the command would destroy or captures what is needed to undo it (§2.4); this is the gap the study’s algorithmic contribution addresses. </w:t>
+        <w:t xml:space="preserve">, every surveyed system that guards a generated command does so by permission, matching it against an enumerated list of dangerous patterns, and none determines what the command would destroy or captures what is needed to undo it (§2.5); this is the gap the study’s algorithmic contribution addresses. </w:t>
       </w:r>
       <w:r>
         <w:t xml:space="preserve"> </w:t>
@@ -5069,15 +5233,15 @@
         <w:t xml:space="preserve">, controlled comparison against the conventional graphical workflow exists only within a single application, on a single platform, with a cloud-hosted frontier model [21]; no such comparison exists for operating-system-level tasks under a locally-hosted model and an explicit safety gate.  SynapseOS — a conversational interface layer for the Linux desktop that translates natural-language intent into shell commands under a reversibility-based confirmation gate, evaluated against each participant’s own operating system — is positioned precisely against these four gaps.  Its relationship to the closest prior work is worth stating directly.  NaSh [9] proposes guardrails for an LLM-powered natural language shell — generated code that remains analyzable, selective undo, summaries of what a command would affect — as a design position, and explicitly leaves implementation and empirical evaluation as open work.  The present study is an implementation of that position, substituting for the general principle a static recoverability analysis, which derives what a command would affect from its structure before it runs, and an undo journal with five mechanisms, and supplying the user evaluation NaSh defers.</w:t>
       </w:r>
     </w:p>
-    <w:bookmarkEnd w:id="63"/>
-    <w:bookmarkEnd w:id="64"/>
-    <w:bookmarkStart w:id="65" w:name="sec2-9"/>
+    <w:bookmarkEnd w:id="66"/>
+    <w:bookmarkEnd w:id="67"/>
+    <w:bookmarkStart w:id="68" w:name="sec2-9"/>
     <w:p>
       <w:pPr>
         <w:pStyle w:val="Heading2"/>
       </w:pPr>
       <w:r>
-        <w:t xml:space="preserve">2.9 Review of the Methodological Literature</w:t>
+        <w:t xml:space="preserve">2.10 Review of the Methodological Literature</w:t>
       </w:r>
     </w:p>
     <w:p>
@@ -5085,7 +5249,7 @@
         <w:pStyle w:val="FirstParagraph"/>
       </w:pPr>
       <w:r>
-        <w:t xml:space="preserve">Beyond the systems it proposes to build upon, the present study draws on a methodological literature that shapes how a conversational interface should be evaluated.  The evaluation practices of the surveyed work fall into three categories, each with a characteristic limitation.  Architectural demonstrations [9, 36] establish feasibility but provide no performance evidence.  Curated task benchmarks [7, 41, 48] provide reproducible, quantitative measures but assess the autonomous task completion of agents acting on a user’s behalf rather than the performance of a human working through an interface.  Human-centered user studies, exemplified by VoicePilot [28] and AXIS [21], provide the most direct evidence of an interface’s value to real users but remain rare in this literature and, where present, are confined to a single application rather than the operating system as a whole.  The instruments this study adopts are drawn from established practice rather than constructed for it: the System Usability Scale [3] for perceived usability, with its interpretation grounded in subsequent large-sample analysis [31], and the NASA Task Load Index [11] for perceived workload.</w:t>
+        <w:t xml:space="preserve">The algorithm is evaluated against ground truth observed by sandboxed execution, with paired statistical tests, as Chapter 3, Section 3.1 describes.  The methodological literature reviewed here shapes the validation study, in which the analysis is deployed in an interface and exercised by people, and so concerns how a conversational interface should be evaluated.  The evaluation practices of the surveyed work fall into three categories, each with a characteristic limitation.  Architectural demonstrations [9, 36] establish feasibility but provide no performance evidence.  Curated task benchmarks [7, 41, 48] provide reproducible, quantitative measures but assess the autonomous task completion of agents acting on a user’s behalf rather than the performance of a human working through an interface.  Human-centered user studies, exemplified by VoicePilot [28] and AXIS [21], provide the most direct evidence of an interface’s value to real users but remain rare in this literature and, where present, are confined to a single application rather than the operating system as a whole.  The instruments this study adopts are drawn from established practice rather than constructed for it: the System Usability Scale [3] for perceived usability, with its interpretation grounded in subsequent large-sample analysis [31], and the NASA Task Load Index [11] for perceived workload.</w:t>
       </w:r>
     </w:p>
     <w:p>
@@ -5152,14 +5316,14 @@
         <w:t xml:space="preserve">The specific instantiation of this methodology — the composition of the benchmark and custom task suite, the participant profile and screening criteria, the session procedure, the metrics and their computation, and the statistical and qualitative analysis plan — is presented in detail in Chapter 3.</w:t>
       </w:r>
     </w:p>
-    <w:bookmarkEnd w:id="65"/>
-    <w:bookmarkStart w:id="66" w:name="sec2-10"/>
+    <w:bookmarkEnd w:id="68"/>
+    <w:bookmarkStart w:id="69" w:name="sec2-10"/>
     <w:p>
       <w:pPr>
         <w:pStyle w:val="Heading2"/>
       </w:pPr>
       <w:r>
-        <w:t xml:space="preserve">2.10 Summary</w:t>
+        <w:t xml:space="preserve">2.11 Summary</w:t>
       </w:r>
     </w:p>
     <w:p>
@@ -5167,7 +5331,7 @@
         <w:pStyle w:val="FirstParagraph"/>
       </w:pPr>
       <w:r>
-        <w:t xml:space="preserve">This chapter reviewed the literature on natural-language and LLM-mediated interfaces to personal computing across nearly four decades, organized along a four-layer pipeline of Input, Reasoning, Action, and Operating-System Integration.  The historical foundations established the long-standing aspiration to a natural-language interface to a real operating system [40] and the methodological shift, driven by in-context reasoning [42], that made the current generation of systems possible.  The shell-and-command-line thread most directly related to the proposed design demonstrated that natural-language-to-Bash translation is tractable [38], that safety and reversibility are central concerns [9], and that local deployment is feasible [15], while leaving the extension from shell to session, and empirical user evaluation, as open work.  The graphical-agent literature across web, mobile, and desktop [7, 12, 13, 25, 30, 37, 45–48] established the field’s architectural patterns and its recurring bottleneck of visual grounding, while the accessibility thread [10, 24, 28, 29, 36] revealed a complementary limitation that a general conversational interface layer would resolve.  The evaluation literature [41, 43, 44] traced a capability ceiling that has risen sharply on short tasks while remaining low on long-horizon work, and exposed a methodological gap: interfaces are seldom evaluated comparatively against the conventional workflow with real users, and never yet at the level of the operating system itself.</w:t>
+        <w:t xml:space="preserve">This chapter reviewed two literatures.  The first, on which the study’s algorithm builds, is program analysis: abstract interpretation and type-and-effect systems [5, 16, 35] supply its formal basis, the command guards of natural-language shells and coding agents [9, 17, 27] decide by permission rather than by effect, and the static analyses of shell programs [1, 8, 23] target properties adjacent to recoverability but not recoverability itself.  The second, in which the platform is situated, is the literature on natural-language and LLM-mediated interfaces to personal computing across nearly four decades, organized along a four-layer pipeline of Input, Reasoning, Action, and Operating-System Integration.  The historical foundations established the long-standing aspiration to a natural-language interface to a real operating system [40] and the methodological shift, driven by in-context reasoning [42], that made the current generation of systems possible.  The shell-and-command-line thread most directly related to the proposed design demonstrated that natural-language-to-Bash translation is tractable [38], that safety and reversibility are central concerns [9], and that local deployment is feasible [15], while leaving the extension from shell to session, and empirical user evaluation, as open work.  The graphical-agent literature across web, mobile, and desktop [7, 12, 13, 25, 30, 37, 45–48] established the field’s architectural patterns and its recurring bottleneck of visual grounding, while the accessibility thread [10, 24, 28, 29, 36] revealed a complementary limitation that a general conversational interface layer would resolve.  The evaluation literature [41, 43, 44] traced a capability ceiling that has risen sharply on short tasks while remaining low on long-horizon work, and exposed a methodological gap: interfaces are seldom evaluated comparatively against the conventional workflow with real users, and never yet at the level of the operating system itself.</w:t>
       </w:r>
     </w:p>
     <w:p>
@@ -5178,8 +5342,8 @@
         <w:t xml:space="preserve">Synthesized, the surveyed works reveal a fourfold gap: no analysis of what a generated command would destroy, every guard being a list of dangerous patterns; no conversational replacement for the graphical session layer; no coverage of the Linux desktop; and no controlled comparison of a conversational interface against the conventional workflow across user populations.  The first is the gap the present study’s research addresses, through a recoverability analysis of generated shell commands evaluated against ground truth obtained by sandboxed execution.  The other three describe the setting in which that gap arises, and SynapseOS, the conversational interface layer for the Linux desktop built as the analysis’s experimental platform, is where the analysis is deployed and validated in use, through a controlled, within-subjects comparison against each participant’s own operating system.  The methodology through which this evaluation is conducted is the subject of Chapter 3.</w:t>
       </w:r>
     </w:p>
-    <w:bookmarkEnd w:id="66"/>
-    <w:bookmarkStart w:id="69" w:name="ch2-notes"/>
+    <w:bookmarkEnd w:id="69"/>
+    <w:bookmarkStart w:id="72" w:name="ch2-notes"/>
     <w:p>
       <w:pPr>
         <w:pStyle w:val="Heading2"/>
@@ -5196,11 +5360,11 @@
           <w:numId w:val="1006"/>
         </w:numPr>
       </w:pPr>
-      <w:bookmarkStart w:id="67" w:name="ch2-fn1"/>
+      <w:bookmarkStart w:id="70" w:name="ch2-fn1"/>
       <w:r>
         <w:t xml:space="preserve">A computer-using agent is an artificial-intelligence system that operates a computing environment by issuing actions and observing their results.  A GUI agent is a computer-using agent whose action space consists of operations on a graphical user interface — typically clicks, key presses, scrolls, and text entry — usually driven by a large language model or a multimodal (vision-language) model that additionally accepts images as input.</w:t>
       </w:r>
-      <w:bookmarkEnd w:id="67"/>
+      <w:bookmarkEnd w:id="70"/>
     </w:p>
     <w:p>
       <w:pPr>
@@ -5210,14 +5374,14 @@
           <w:numId w:val="1006"/>
         </w:numPr>
       </w:pPr>
-      <w:bookmarkStart w:id="68" w:name="ch2-fn2"/>
+      <w:bookmarkStart w:id="71" w:name="ch2-fn2"/>
       <w:r>
         <w:t xml:space="preserve">Grounding is the problem of mapping a model’s textual plan onto a concrete operation in the environment.  Visual grounding is the specific subproblem of identifying the on-screen pixel region corresponding to a referenced interface element — repeatedly identified in the surveyed literature as the principal bottleneck for graphical agents, and one that a command-line approach avoids by grounding intent into shell commands rather than into screen coordinates.</w:t>
       </w:r>
-      <w:bookmarkEnd w:id="68"/>
-    </w:p>
-    <w:bookmarkEnd w:id="69"/>
-    <w:bookmarkStart w:id="70" w:name="sec-chapter3"/>
+      <w:bookmarkEnd w:id="71"/>
+    </w:p>
+    <w:bookmarkEnd w:id="72"/>
+    <w:bookmarkStart w:id="73" w:name="sec-chapter3"/>
     <w:p>
       <w:pPr>
         <w:pStyle w:val="FirstParagraph"/>
@@ -5234,7 +5398,7 @@
         <w:t xml:space="preserve">Methodology</w:t>
       </w:r>
     </w:p>
-    <w:bookmarkEnd w:id="70"/>
+    <w:bookmarkEnd w:id="73"/>
     <w:p>
       <w:pPr>
         <w:pStyle w:val="BodyText"/>
@@ -5327,7 +5491,7 @@
         <w:t xml:space="preserve">Two evaluations follow, of different standing.  The corpus evaluation in Sections 3.1 and 3.2 is the study’s primary evidence: it answers the research questions against a labeled corpus whose ground truth comes from sandboxed execution, without reference to any participant.  The validation study, defined in Section 1 and Sections 3.3 onward and run on the platform described in Section 2, deploys the analysis in SynapseOS and has participants use it on matched tasks.  It checks that the analysis’s decisions carry through to real files and hold on commands people cause, which the corpus does not contain, and it characterizes the platform through usability measures.  Neither evaluation depends on the other: the analysis takes a shell command as a string and is indifferent to what produced it, so removing the interface would remove the validation study but leave every research question, its corpus, its baselines, and its results intact.</w:t>
       </w:r>
     </w:p>
-    <w:bookmarkStart w:id="74" w:name="sec-conceptual-framework"/>
+    <w:bookmarkStart w:id="77" w:name="sec-conceptual-framework"/>
     <w:p>
       <w:pPr>
         <w:pStyle w:val="Heading2"/>
@@ -5341,15 +5505,15 @@
         <w:pStyle w:val="FirstParagraph"/>
       </w:pPr>
       <w:r>
-        <w:t xml:space="preserve">SynapseOS operates as a conversational shell layer positioned between the user and the Linux command-line environment.  The user issues natural language commands through a persistent chat interface.  An intent parsing pipeline — powered by a locally-hosted small language model — translates each utterance into a shell command, which is executed in a bash subprocess.  Output is captured and rendered back in the conversational interface.  The user issues intent in natural language and receives results in natural language.  The generated shell command is nonetheless displayed rather than hidden: the confirmation gate requires the user to approve irreversible operations, and an approval given without sight of what is being approved is not consent.  Visibility also makes the system’s translation of intent observable to the participant, which is what allows a user to notice a misinterpretation before it executes rather than after.  Between translation and execution sits the recoverability analyzer, which is where this study’s algorithmic contribution operates: before a command is dispatched, its effects are derived from its syntactic structure, a verdict is computed over them, and where the command is recoverable only with prior capture, the pre-images that make it so are captured first.  The confirmation gate consumes that verdict rather than a pattern match.  The analyzer is specified in Section 2.1(a)–(c) of this chapter and evaluated in Sections 3.1 and 3.2, independently of the user study.  This architecture is illustrated in Figure 3.1.</w:t>
-      </w:r>
-    </w:p>
-    <w:p>
-      <w:pPr>
-        <w:pStyle w:val="BodyText"/>
-      </w:pPr>
-      <w:r>
-        <w:t xml:space="preserve">The framework is evaluated in two parts of different standing.  The recoverability analyzer, the study’s research contribution, is evaluated on its own, on a corpus of commands whose ground truth is obtained by sandboxed execution (Section 3.1).  The analyzer is then validated in use, deployed in the platform, through a controlled study in which participants complete a fixed set of tasks under two conditions: using SynapseOS as the interface, and using their own primary operating system — Windows, macOS, or Linux — as the baseline.  The study records the analyzer’s decision on every command participants cause, so its behaviour in use can be compared with its behaviour on the corpus, and its expert baseline design, which pits SynapseOS against the environment each participant already knows and uses daily, characterizes the platform through task completion time, error rate, and user satisfaction across the real-world OS landscape [41].</w:t>
+        <w:t xml:space="preserve">The conceptual framework places the recoverability analysis between a generated shell command and its execution (Figure 3.1).  Its input is a command and the directory in which it will run.  It derives the command’s effect set from its structure (Objectives 1 and 2), learning targets known only at run time through dry runs it first proves read-only and runs in a read-only sandbox; it decides whether the command can be undone; and, where undoing it requires preparation, it computes the minimum-cost set of pre-images to capture (Objective 3).  Anything it cannot determine makes it ask.  Its verdict drives a confirmation gate, its plan’s captures are taken before the command runs and recorded in an undo journal, and undo restores from them.  SynapseOS supplies the setting: the user issues a request in ordinary language through a persistent chat interface, a locally hosted small language model translates it into a shell command, the command is executed in a bash subprocess, and its output is rendered back in the interface.  The generated shell command is nonetheless displayed rather than hidden: the confirmation gate requires the user to approve irreversible operations, and an approval given without sight of what is being approved is not consent.  Visibility also makes the system’s translation of intent observable to the participant, which is what allows a user to notice a misinterpretation before it executes rather than after.  The confirmation gate consumes the analysis’s verdict rather than a pattern match.  The analyzer is specified in Section 2.1(a)–(c) of this chapter and evaluated in Sections 3.1 and 3.2, independently of the validation study.  This architecture is illustrated in Figure 3.1.</w:t>
+      </w:r>
+    </w:p>
+    <w:p>
+      <w:pPr>
+        <w:pStyle w:val="BodyText"/>
+      </w:pPr>
+      <w:r>
+        <w:t xml:space="preserve">The framework is evaluated in two parts of different standing.  The recoverability analyzer, the study’s research contribution, is evaluated on its own, on a corpus of commands whose ground truth is obtained by sandboxed execution (Sections 3.1 and 3.2).  The analyzer is then validated in use, deployed in the platform, through a controlled study in which participants complete a fixed set of tasks under two conditions: using SynapseOS as the interface, and using their own primary operating system — Windows, macOS, or Linux — as the baseline.  The study records the analyzer’s decision on every command participants cause, so its behaviour in use can be compared with its behaviour on the corpus, and its expert baseline design, which pits SynapseOS against the environment each participant already knows and uses daily, characterizes the platform through task completion time, error rate, and user satisfaction across the real-world OS landscape [41].</w:t>
       </w:r>
     </w:p>
     <w:p>
@@ -5359,20 +5523,20 @@
       <w:r>
         <w:drawing>
           <wp:inline>
-            <wp:extent cx="5334000" cy="3717131"/>
+            <wp:extent cx="5334000" cy="4175521"/>
             <wp:effectExtent b="0" l="0" r="0" t="0"/>
-            <wp:docPr descr="" title="" id="72" name="Picture"/>
+            <wp:docPr descr="" title="" id="75" name="Picture"/>
             <a:graphic>
               <a:graphicData uri="http://schemas.openxmlformats.org/drawingml/2006/picture">
                 <pic:pic>
                   <pic:nvPicPr>
-                    <pic:cNvPr descr="/tmp/claude-1000/-home-willard-projects-thesis/cb82e7af-8c35-489a-a7f7-ef49172efea2/scratchpad/docx/work3/fig1.png" id="73" name="Picture"/>
+                    <pic:cNvPr descr="/tmp/claude-1000/-home-willard-projects-thesis/cb82e7af-8c35-489a-a7f7-ef49172efea2/scratchpad/docx/work4/fig1.png" id="76" name="Picture"/>
                     <pic:cNvPicPr>
                       <a:picLocks noChangeArrowheads="1" noChangeAspect="1"/>
                     </pic:cNvPicPr>
                   </pic:nvPicPr>
                   <pic:blipFill>
-                    <a:blip r:embed="rId71"/>
+                    <a:blip r:embed="rId74"/>
                     <a:stretch>
                       <a:fillRect/>
                     </a:stretch>
@@ -5380,7 +5544,7 @@
                   <pic:spPr bwMode="auto">
                     <a:xfrm>
                       <a:off x="0" y="0"/>
-                      <a:ext cx="5334000" cy="3717131"/>
+                      <a:ext cx="5334000" cy="4175521"/>
                     </a:xfrm>
                     <a:prstGeom prst="rect">
                       <a:avLst/>
@@ -5414,11 +5578,11 @@
         <w:t xml:space="preserve"> </w:t>
       </w:r>
       <w:r>
-        <w:t xml:space="preserve">Conceptual framework of SynapseOS.  The user issues a natural language command to the conversational surface, which routes the utterance to the intent parser (Qwen2.5-Coder-3B-Instruct, local SLM).  The intent parser produces a shell command dispatched to the execution engine (bash subprocess).  Irreversible operations are intercepted by the confirmation gate; reversible operations are logged to the undo stack.  Command output (stdout/stderr) is captured, rendered in the conversational surface, and presented back to the user — completing the interaction loop.</w:t>
-      </w:r>
-    </w:p>
-    <w:bookmarkEnd w:id="74"/>
-    <w:bookmarkStart w:id="75" w:name="sec-system-env"/>
+        <w:t xml:space="preserve">Conceptual framework: the recoverability analysis and the platform that deploys it.  A request in ordinary language is translated by a local language model into a shell command.  Before the command runs, the analysis derives its effect set (EFFECTS, Objectives 1–2), learning targets known only at run time through read-only dry runs in a sandbox (RESOLVE); decides whether it can be undone (VERDICT); and computes the minimum-cost set of pre-images to capture (PLAN, Objective 3).  Anything it cannot determine makes it ask.  The verdict drives the confirmation gate; the plan’s captures are taken before execution and recorded in the undo journal, from which undo restores.  The analysis is evaluated on a labeled command corpus (Sections 3.1–3.2) and validated in use with participants (Sections 3.3–3.7).</w:t>
+      </w:r>
+    </w:p>
+    <w:bookmarkEnd w:id="77"/>
+    <w:bookmarkStart w:id="78" w:name="sec-system-env"/>
     <w:p>
       <w:pPr>
         <w:pStyle w:val="Heading2"/>
@@ -6049,8 +6213,8 @@
         <w:t xml:space="preserve">— a single non-interactive invocation, with no session persisting between separate calls, that runs a bounded loop toward one natural-language request: propose a command, pass it through the same reversibility-based confirmation gate described in the Execution Pipeline (Section 2.1(e)) — executing immediately if reversible, blocking pending explicit confirmation if not — then feed the result back so the model can propose the next step or signal completion, up to a fixed step limit, before the invocation exits, sharing TUI mode’s minimal hardware footprint but intended for scripting and automation rather than an interactive session.  Neither CLI nor TUI mode is evaluated in the user study.</w:t>
       </w:r>
     </w:p>
-    <w:bookmarkEnd w:id="75"/>
-    <w:bookmarkStart w:id="89" w:name="sec1"/>
+    <w:bookmarkEnd w:id="78"/>
+    <w:bookmarkStart w:id="92" w:name="sec1"/>
     <w:p>
       <w:pPr>
         <w:pStyle w:val="Heading2"/>
@@ -6067,7 +6231,7 @@
         <w:t xml:space="preserve">The study gathers two kinds of data.  The primary dataset is a held-out corpus of shell commands, each labeled by running it in a sandbox, on which the analysis is evaluated against its baselines and its ablations (Objectives 4 and 5).  The remaining data serve the validation study, in which the analysis is deployed in SynapseOS and exercised by participants, in three categories: benchmark task data used to exercise the platform in a standardized environment, user study data collected from human participants in a controlled setting, and system performance data, including the analysis’s decision on every command, captured automatically through built-in telemetry during all sessions.</w:t>
       </w:r>
     </w:p>
-    <w:bookmarkStart w:id="80" w:name="ch3-sec1-1"/>
+    <w:bookmarkStart w:id="83" w:name="ch3-sec1-1"/>
     <w:p>
       <w:pPr>
         <w:pStyle w:val="Heading3"/>
@@ -6076,7 +6240,7 @@
         <w:t xml:space="preserve">1.1 What to gather</w:t>
       </w:r>
     </w:p>
-    <w:bookmarkStart w:id="76" w:name="a-command-corpus"/>
+    <w:bookmarkStart w:id="79" w:name="a-command-corpus"/>
     <w:p>
       <w:pPr>
         <w:pStyle w:val="Heading4"/>
@@ -6093,8 +6257,8 @@
         <w:t xml:space="preserve">The primary dataset is a corpus of shell commands.  Each command is paired with a fixture — the files and directories that exist when it runs — and with a ground-truth label observed by running it on that fixture in a sandbox: whether it loses nothing, loses something a captured pre-image could restore, or acts outside the filesystem.  The corpus is held as four partitions: human-written commands from NL2Bash [19], templates covering each shell composition operator, commands whose effect lies outside the filesystem, and commands the deployed model itself wrote.  For every command, each configuration compared in Section 3 records its decision: whether it would ask, and what it would capture.  The configurations are the analysis, its baselines, and its ablations.  For every command the analysis would let run, the command is also executed, undone, and the tree compared, which records whether the capture restored the prior state.</w:t>
       </w:r>
     </w:p>
-    <w:bookmarkEnd w:id="76"/>
-    <w:bookmarkStart w:id="77" w:name="b-benchmark-task-suite"/>
+    <w:bookmarkEnd w:id="79"/>
+    <w:bookmarkStart w:id="80" w:name="b-benchmark-task-suite"/>
     <w:p>
       <w:pPr>
         <w:pStyle w:val="Heading4"/>
@@ -6111,8 +6275,8 @@
         <w:t xml:space="preserve">The primary benchmark dataset is the OSWorld task suite [41], which provides standardized real-computer tasks across shell operations, file management, web browsing, and application-level interactions.  OSWorld is the only existing benchmark that evaluates computer-using agents in real operating system environments, making it the most appropriate external standard for SynapseOS evaluation.  Tasks are presented as natural language instructions; agents interact with a real virtual machine environment, and outcomes are evaluated by automated inspection of the resulting system state — whether the goal was actually achieved — rather than by comparing individual actions.  In addition to OSWorld tasks, a custom cross-platform task suite is developed for this study, covering file search and organization, system and process monitoring, application and package management, and text and data processing — each task defined as a human-level goal achievable via SynapseOS natural language commands and via native OS tools on the comparison machine.  Each task in both suites is documented with a description, expected outcome, task category, and difficulty level.</w:t>
       </w:r>
     </w:p>
-    <w:bookmarkEnd w:id="77"/>
-    <w:bookmarkStart w:id="78" w:name="c-user-study-data"/>
+    <w:bookmarkEnd w:id="80"/>
+    <w:bookmarkStart w:id="81" w:name="c-user-study-data"/>
     <w:p>
       <w:pPr>
         <w:pStyle w:val="Heading4"/>
@@ -6217,8 +6381,8 @@
         <w:t xml:space="preserve">responses gathered through a semi-structured post-study interview covering perceived ease of use, trust in the system, and comparison between the two conditions</w:t>
       </w:r>
     </w:p>
-    <w:bookmarkEnd w:id="78"/>
-    <w:bookmarkStart w:id="79" w:name="d-system-performance-data"/>
+    <w:bookmarkEnd w:id="81"/>
+    <w:bookmarkStart w:id="82" w:name="d-system-performance-data"/>
     <w:p>
       <w:pPr>
         <w:pStyle w:val="Heading4"/>
@@ -6307,9 +6471,9 @@
         <w:t xml:space="preserve">Intent parsing accuracy: whether the system correctly identified the user’s intent on the first attempt</w:t>
       </w:r>
     </w:p>
-    <w:bookmarkEnd w:id="79"/>
-    <w:bookmarkEnd w:id="80"/>
-    <w:bookmarkStart w:id="85" w:name="ch3-sec1-2"/>
+    <w:bookmarkEnd w:id="82"/>
+    <w:bookmarkEnd w:id="83"/>
+    <w:bookmarkStart w:id="88" w:name="ch3-sec1-2"/>
     <w:p>
       <w:pPr>
         <w:pStyle w:val="Heading3"/>
@@ -6318,7 +6482,7 @@
         <w:t xml:space="preserve">1.2 How to gather</w:t>
       </w:r>
     </w:p>
-    <w:bookmarkStart w:id="81" w:name="a-command-corpus-1"/>
+    <w:bookmarkStart w:id="84" w:name="a-command-corpus-1"/>
     <w:p>
       <w:pPr>
         <w:pStyle w:val="Heading4"/>
@@ -6412,8 +6576,8 @@
         <w:t xml:space="preserve">A second stratification is by the shape of the command, assigned by the generator from the command’s syntax: a single named command; a chain; one whose targets are computed while it runs; a redirect; one whose effect hides inside an interpreter or a tool the rule table does not name; and one whose effect lies outside the filesystem.  The claims under test concern the composed, run-time, and hidden shapes, and a corpus dominated by plain named commands would measure the strength of a list and not the contribution of the analysis, so results are reported per shape as well as in aggregate.</w:t>
       </w:r>
     </w:p>
-    <w:bookmarkEnd w:id="81"/>
-    <w:bookmarkStart w:id="82" w:name="b-ground-truth-by-sandboxed-execution"/>
+    <w:bookmarkEnd w:id="84"/>
+    <w:bookmarkStart w:id="85" w:name="b-ground-truth-by-sandboxed-execution"/>
     <w:p>
       <w:pPr>
         <w:pStyle w:val="Heading4"/>
@@ -6550,8 +6714,8 @@
         <w:t xml:space="preserve">The generator shares no code with the analysis and never consults it, so agreement between the two is evidence and not circularity.  It is deterministic for a given seed, and it records the number of candidates drawn and the reasons for each exclusion beside the corpus.  There is no human labeler, and so no labeler disagreement to measure; the threat that takes its place is the validity of the oracle itself, addressed in Section 3.1(e).</w:t>
       </w:r>
     </w:p>
-    <w:bookmarkEnd w:id="82"/>
-    <w:bookmarkStart w:id="83" w:name="c-benchmark-tasks"/>
+    <w:bookmarkEnd w:id="85"/>
+    <w:bookmarkStart w:id="86" w:name="c-benchmark-tasks"/>
     <w:p>
       <w:pPr>
         <w:pStyle w:val="Heading4"/>
@@ -6568,8 +6732,8 @@
         <w:t xml:space="preserve">SynapseOS is deployed on the Debian 13 (Trixie) environment matching the OSWorld evaluation setup [41].  Each benchmark task is executed through the conversational interface, and results are captured programmatically through the built-in telemetry system.  Each task is supplied to SynapseOS as a natural language instruction, and the resulting system state is compared against the expected outcome defined in the benchmark.  Because SynapseOS gates every command classified irreversible on explicit confirmation, benchmark runs are facilitator-attended rather than unattended; the confirmation gate remains active throughout and every confirmation is logged as part of the run record.  OSWorld scores the resulting system state rather than a human operator’s performance, so it applies only to the SynapseOS condition.  Condition B, which a human participant operates directly, has no equivalent and is instead evaluated through the custom cross-platform task suite administered in the user study (Section 1.2(d)).</w:t>
       </w:r>
     </w:p>
-    <w:bookmarkEnd w:id="83"/>
-    <w:bookmarkStart w:id="84" w:name="d-user-study"/>
+    <w:bookmarkEnd w:id="86"/>
+    <w:bookmarkStart w:id="87" w:name="d-user-study"/>
     <w:p>
       <w:pPr>
         <w:pStyle w:val="Heading4"/>
@@ -6654,9 +6818,9 @@
         <w:t xml:space="preserve">After completing each condition, participants fill out the SUS and NASA-TLX questionnaires.  After completing both conditions, a brief semi-structured interview is conducted to gather qualitative feedback.</w:t>
       </w:r>
     </w:p>
-    <w:bookmarkEnd w:id="84"/>
-    <w:bookmarkEnd w:id="85"/>
-    <w:bookmarkStart w:id="86" w:name="ch3-sec1-3"/>
+    <w:bookmarkEnd w:id="87"/>
+    <w:bookmarkEnd w:id="88"/>
+    <w:bookmarkStart w:id="89" w:name="ch3-sec1-3"/>
     <w:p>
       <w:pPr>
         <w:pStyle w:val="Heading3"/>
@@ -6729,8 +6893,8 @@
         <w:t xml:space="preserve">The dual-population design — novice and power users — directly addresses the gap identified in Chapter 1, where no prior work has evaluated a conversational interface across user populations with differing technical backgrounds [41].  The validation data serve two purposes.  The system performance data, including the analysis’s decision on every command participants cause, validate the analysis in use: they show whether its verdicts and captures hold on commands the corpus does not contain, and whether undo restores what participants’ commands changed.  The user study metrics and benchmark coverage characterize the platform on which it is deployed.  The research questions themselves are answered against the labeled command corpus described in Section 3.1.</w:t>
       </w:r>
     </w:p>
-    <w:bookmarkEnd w:id="86"/>
-    <w:bookmarkStart w:id="87" w:name="ch3-sec1-4"/>
+    <w:bookmarkEnd w:id="89"/>
+    <w:bookmarkStart w:id="90" w:name="ch3-sec1-4"/>
     <w:p>
       <w:pPr>
         <w:pStyle w:val="Heading3"/>
@@ -6855,8 +7019,8 @@
         <w:t xml:space="preserve">if they report advanced proficiency on their primary OS — capable of performing file management, process monitoring, and system administration tasks efficiently using that OS’s native tools — regardless of which OS that is, and pass all three behavioral screener tasks.  Participants whose self-report and behavioral screener results disagree, or who do not clearly satisfy either classification, are excluded.  Primary OS is recorded for all participants as a grouping variable, and prior conversational AI exposure as a covariate, in the analysis; prior AI exposure is analyzed as an exploratory covariate only (see Section 3.4) rather than a primary grouping variable, since splitting the sample along a third axis would leave subgroups too small to support a hypothesis test.</w:t>
       </w:r>
     </w:p>
-    <w:bookmarkEnd w:id="87"/>
-    <w:bookmarkStart w:id="88" w:name="ch3-sec1-5"/>
+    <w:bookmarkEnd w:id="90"/>
+    <w:bookmarkStart w:id="91" w:name="ch3-sec1-5"/>
     <w:p>
       <w:pPr>
         <w:pStyle w:val="Heading3"/>
@@ -6969,9 +7133,9 @@
         <w:t xml:space="preserve">The custom task suite comprises tasks organized into four categories: file search and organization, system and process monitoring, application and package management, and text and data processing.  All tasks are defined at the human-goal level — achievable via SynapseOS natural language on the evaluation machine and via native graphical or terminal tools on the comparison machine.  Each task is documented with a unique identifier, a natural language prompt as presented to the participant, the expected outcome, and the assigned difficulty level.  The full suite — twelve core tasks in two parallel forms, plus four boundary tasks lying outside shell expressibility that are scored and reported separately — is given in Appendix C.  Difficulty calibration and form equivalence are validated during the pilot study and revised as necessary before the main study begins.</w:t>
       </w:r>
     </w:p>
-    <w:bookmarkEnd w:id="88"/>
-    <w:bookmarkEnd w:id="89"/>
-    <w:bookmarkStart w:id="100" w:name="sec2"/>
+    <w:bookmarkEnd w:id="91"/>
+    <w:bookmarkEnd w:id="92"/>
+    <w:bookmarkStart w:id="103" w:name="sec2"/>
     <w:p>
       <w:pPr>
         <w:pStyle w:val="Heading2"/>
@@ -6988,7 +7152,7 @@
         <w:t xml:space="preserve">The procedure has two parts.  The recoverability analysis, the study’s contribution, is designed and specified first, in the order of the objectives it serves: its effect-semantics model, its effect-composition algorithm, and its recovery-plan generation.  SynapseOS, the experimental platform in which it is deployed, follows, together with the scaffolding that makes the validation study trustworthy: collected data is processed and pseudonymized, the system and instruments are validated, each participant session follows a standardized procedure, and participant welfare is protected throughout.</w:t>
       </w:r>
     </w:p>
-    <w:bookmarkStart w:id="95" w:name="ch3-sec2-1"/>
+    <w:bookmarkStart w:id="98" w:name="ch3-sec2-1"/>
     <w:p>
       <w:pPr>
         <w:pStyle w:val="Heading3"/>
@@ -7005,7 +7169,7 @@
         <w:t xml:space="preserve">The design comprises the recoverability analysis, specified in (a) to (c), one part per objective, and the experimental platform in which it is deployed, in (d) and (e): a conversational interface layer and an execution pipeline, integrated into a unified session manager that launches over the conventional Linux graphical desktop session rather than replacing it.</w:t>
       </w:r>
     </w:p>
-    <w:bookmarkStart w:id="90" w:name="a-effect-semantics-model-objective-1"/>
+    <w:bookmarkStart w:id="93" w:name="a-effect-semantics-model-objective-1"/>
     <w:p>
       <w:pPr>
         <w:pStyle w:val="Heading4"/>
@@ -7354,8 +7518,8 @@
         <w:t xml:space="preserve">The effect domain is the filesystem, extended to two kinds of state on the target system that have no pre-image to copy but do have an inverse: installed packages and running or enabled services.  For these the analysis does not re-implement the package manager or the service manager.  It asks the system’s own tools what the command would do — the package manager’s simulation mode, the package database, and the service manager’s state queries — and derives from the answer the command that puts the state back: a purge for an install, a versioned install for a removal or upgrade, a stop for a start, a disable for an enable.  A change is recoverable only if that inverse exists, so removing a package whose old version no repository still offers is unrecoverable, and purging a package also captures its configuration files as removals.  Undo runs the inverse, with elevated privilege if the original had it, and prints the command for the user to run if it fails.  Not represented are what maintainer scripts and a service’s own start-up do beyond the state change, which are arbitrary programs; network mutations and anything on a remote host; and other package managers, which stay unrecoverable unless plainly read-only.  A command whose principal effect is one of these is classified unrecoverable by the soundness rule above.  This is safe but coarse, and it is stated as a limitation of the model rather than deferred to the results.</w:t>
       </w:r>
     </w:p>
-    <w:bookmarkEnd w:id="90"/>
-    <w:bookmarkStart w:id="91" w:name="Xd946fc8713be5a40002891fd02cb45803a6005b"/>
+    <w:bookmarkEnd w:id="93"/>
+    <w:bookmarkStart w:id="94" w:name="Xd946fc8713be5a40002891fd02cb45803a6005b"/>
     <w:p>
       <w:pPr>
         <w:pStyle w:val="Heading4"/>
@@ -7775,8 +7939,8 @@
         <w:t xml:space="preserve">, the body of a command substitution — and analyses the command again with the concrete targets in place.  A resolver is run only if the same analysis proves it has no effects, and it runs inside the bubblewrap sandbox with the whole filesystem mounted read-only; without bubblewrap, resolution is switched off and the command asks.  If it cannot be proven read-only, cannot run, or times out, the targets stay unresolved and the command asks.  Resolution is what makes a capture possible for commands whose targets a static reading cannot name.</w:t>
       </w:r>
     </w:p>
-    <w:bookmarkEnd w:id="91"/>
-    <w:bookmarkStart w:id="92" w:name="X7a556f1ad9397eabc869c1d1cec4dddff31661e"/>
+    <w:bookmarkEnd w:id="94"/>
+    <w:bookmarkStart w:id="95" w:name="X7a556f1ad9397eabc869c1d1cec4dddff31661e"/>
     <w:p>
       <w:pPr>
         <w:pStyle w:val="Heading4"/>
@@ -8575,8 +8739,8 @@
         <w:t xml:space="preserve">EFFECTS derives and composes the effect set, applying rules to the leaves and resolving wrappers through RESOLVE; RESOLVE learns run-time targets by running only a form of the command proven to have no effects; VERDICT and PLAN decide and cover.  UNRESOLVED and UNKNOWN are the sentinels that give the analysis its one-sided soundness: they can only push the verdict toward UNRECOVERABLE.  A move (a removal whose data survives at another path) is the only removal PLAN does not capture.</w:t>
       </w:r>
     </w:p>
-    <w:bookmarkEnd w:id="92"/>
-    <w:bookmarkStart w:id="93" w:name="X5a80e7e58358dac7f19a61ad7301f220b3369ff"/>
+    <w:bookmarkEnd w:id="95"/>
+    <w:bookmarkStart w:id="96" w:name="X5a80e7e58358dac7f19a61ad7301f220b3369ff"/>
     <w:p>
       <w:pPr>
         <w:pStyle w:val="Heading4"/>
@@ -8690,8 +8854,8 @@
         <w:t xml:space="preserve">This selection was reconfirmed against models released after the initial literature review, to guard against the fast-moving small-model landscape becoming stale before study execution; no smaller alternative offered comparable shell-generation evidence within the same CPU-only hardware budget [15].  Newer mixture-of-experts variants require all experts resident in memory regardless of active parameters per token, which is incompatible with this study’s memory budget, and newer general-purpose small models report reasoning benchmarks but no shell-command generation evidence.</w:t>
       </w:r>
     </w:p>
-    <w:bookmarkEnd w:id="93"/>
-    <w:bookmarkStart w:id="94" w:name="e-execution-pipeline"/>
+    <w:bookmarkEnd w:id="96"/>
+    <w:bookmarkStart w:id="97" w:name="e-execution-pipeline"/>
     <w:p>
       <w:pPr>
         <w:pStyle w:val="Heading4"/>
@@ -8716,9 +8880,9 @@
         <w:t xml:space="preserve">SynapseOS executes only shell-expressible operations.  The system’s capability boundary is the Linux command-line toolchain: file management, process control, text processing, package management, network configuration, and any application that exposes a command-line interface.  GUI-only interactions — clicking buttons in graphical applications, navigating web page elements, or interacting with visual-only interfaces — are explicitly outside scope, in deliberate contrast to broader desktop agent frameworks that additionally orchestrate GUI automation atop the existing session [45].  This boundary is intentional: it constrains the research to a tractable, verifiable claim that the system can be built, evaluated, and defended within the thesis timeline.</w:t>
       </w:r>
     </w:p>
-    <w:bookmarkEnd w:id="94"/>
-    <w:bookmarkEnd w:id="95"/>
-    <w:bookmarkStart w:id="96" w:name="ch3-sec2-2"/>
+    <w:bookmarkEnd w:id="97"/>
+    <w:bookmarkEnd w:id="98"/>
+    <w:bookmarkStart w:id="99" w:name="ch3-sec2-2"/>
     <w:p>
       <w:pPr>
         <w:pStyle w:val="Heading3"/>
@@ -8845,8 +9009,8 @@
         <w:t xml:space="preserve">all participant records are pseudonymized at the point of extraction, replacing identifying information with participant ID codes prior to any analysis</w:t>
       </w:r>
     </w:p>
-    <w:bookmarkEnd w:id="96"/>
-    <w:bookmarkStart w:id="97" w:name="ch3-sec2-3"/>
+    <w:bookmarkEnd w:id="99"/>
+    <w:bookmarkStart w:id="100" w:name="ch3-sec2-3"/>
     <w:p>
       <w:pPr>
         <w:pStyle w:val="Heading3"/>
@@ -8971,8 +9135,8 @@
         <w:t xml:space="preserve">; the one that bears on the study is described under threats to validity (Section 3.7).</w:t>
       </w:r>
     </w:p>
-    <w:bookmarkEnd w:id="97"/>
-    <w:bookmarkStart w:id="98" w:name="ch3-sec2-4"/>
+    <w:bookmarkEnd w:id="100"/>
+    <w:bookmarkStart w:id="101" w:name="ch3-sec2-4"/>
     <w:p>
       <w:pPr>
         <w:pStyle w:val="Heading3"/>
@@ -9151,8 +9315,8 @@
         <w:t xml:space="preserve">Total estimated session duration per participant: 90–120 minutes.</w:t>
       </w:r>
     </w:p>
-    <w:bookmarkEnd w:id="98"/>
-    <w:bookmarkStart w:id="99" w:name="ch3-sec2-5"/>
+    <w:bookmarkEnd w:id="101"/>
+    <w:bookmarkStart w:id="102" w:name="ch3-sec2-5"/>
     <w:p>
       <w:pPr>
         <w:pStyle w:val="Heading3"/>
@@ -9345,9 +9509,9 @@
         <w:t xml:space="preserve">Participants may discontinue the session at any point, and may request withdrawal of their data for up to fourteen days after their session — the ID-to-consent mapping is retained through that window specifically so that withdrawal remains possible.  After it closes the mapping is destroyed and individual records can no longer be located.  This limit is stated on the consent form so that it is understood before participation rather than discovered after.</w:t>
       </w:r>
     </w:p>
-    <w:bookmarkEnd w:id="99"/>
-    <w:bookmarkEnd w:id="100"/>
-    <w:bookmarkStart w:id="118" w:name="sec3"/>
+    <w:bookmarkEnd w:id="102"/>
+    <w:bookmarkEnd w:id="103"/>
+    <w:bookmarkStart w:id="121" w:name="sec3"/>
     <w:p>
       <w:pPr>
         <w:pStyle w:val="Heading2"/>
@@ -9364,7 +9528,7 @@
         <w:t xml:space="preserve">System testing evaluates the analysis and then validates it in use.  Section 3.1 evaluates it against baselines on the command corpus (Objective 4), which answers RQ2 through RQ4, and Section 3.2 measures what composition and runtime-target resolution contribute, by ablation (Objective 5), which answers RQ5.  Sections 3.3 to 3.7 define the validation study on the platform: its evaluation dataset, evaluation profile, criteria and formulas, data analysis plan, and threats to validity.</w:t>
       </w:r>
     </w:p>
-    <w:bookmarkStart w:id="106" w:name="ch3-sec3-1"/>
+    <w:bookmarkStart w:id="109" w:name="ch3-sec3-1"/>
     <w:p>
       <w:pPr>
         <w:pStyle w:val="Heading3"/>
@@ -9381,7 +9545,7 @@
         <w:t xml:space="preserve">The analysis is evaluated on the command corpus of Section 1.1(a) and 1.2(a)–(b), against the baselines in (a), by the metrics in (b) and the statistics in (c); (d) reports the results, and (e) the threats specific to this evaluation.  The evaluation answers RQ4 directly, and it supplies the evidence for RQ2 and RQ3: whether a command’s effects can be derived before it runs shows in silent loss and composition coverage, and whether the plan restores, in capture coverage verified by sandboxed undo.</w:t>
       </w:r>
     </w:p>
-    <w:bookmarkStart w:id="101" w:name="a-baselines"/>
+    <w:bookmarkStart w:id="104" w:name="a-baselines"/>
     <w:p>
       <w:pPr>
         <w:pStyle w:val="Heading4"/>
@@ -9424,11 +9588,11 @@
         <w:pStyle w:val="BodyText"/>
       </w:pPr>
       <w:r>
-        <w:t xml:space="preserve">Because the first baseline was written by the same team, it was checked against command-safety checks that others ship.  Two open-source checks were scored on the same held-out corpus and labels reported in (d) below: the dangerous-command check of OpenAI’s Codex CLI [27], ported from its source and verified against that source’s own unit tests, and cc-safety-net [17], a pre-execution guard used with several agentic coding tools, run unmodified under each of its three presets.  On the 325 commands that destroy files, they let between 73% and 97% run with no confirmation and no capture, against 31% for the enumerated-pattern classifier, and neither makes any provision for recovery.  Both are designed for coding agents working inside a version-controlled project, where deleting project files is routine and version control is the safeguard, so these figures describe how they would serve a person’s own files, not how well they serve their intended purpose.  The first baseline is therefore the strictest enumerated list tested, and comparisons against it understate rather than overstate the analysis’s advantage over lists in current use.  No shipping tool was found that determines a command’s effects before it runs in order to capture what it would destroy; on recovery there is no external counterpart, which is the gap identified in Section 2.4.  The comparison is provided as supplementary material.</w:t>
-      </w:r>
-    </w:p>
-    <w:bookmarkEnd w:id="101"/>
-    <w:bookmarkStart w:id="102" w:name="b-metrics"/>
+        <w:t xml:space="preserve">Because the first baseline was written by the same team, it was checked against command-safety checks that others ship.  Two open-source checks were scored on the same held-out corpus and labels reported in (d) below: the dangerous-command check of OpenAI’s Codex CLI [27], ported from its source and verified against that source’s own unit tests, and cc-safety-net [17], a pre-execution guard used with several agentic coding tools, run unmodified under each of its three presets.  On the 325 commands that destroy files, they let between 73% and 97% run with no confirmation and no capture, against 31% for the enumerated-pattern classifier, and neither makes any provision for recovery.  Both are designed for coding agents working inside a version-controlled project, where deleting project files is routine and version control is the safeguard, so these figures describe how they would serve a person’s own files, not how well they serve their intended purpose.  The first baseline is therefore the strictest enumerated list tested, and comparisons against it understate rather than overstate the analysis’s advantage over lists in current use.  No shipping tool was found that determines a command’s effects before it runs in order to capture what it would destroy; on recovery there is no external counterpart, which is the gap identified in Chapter 2, Section 2.5.  The comparison is provided as supplementary material.</w:t>
+      </w:r>
+    </w:p>
+    <w:bookmarkEnd w:id="104"/>
+    <w:bookmarkStart w:id="105" w:name="b-metrics"/>
     <w:p>
       <w:pPr>
         <w:pStyle w:val="Heading4"/>
@@ -9732,8 +9896,8 @@
         </w:tc>
       </w:tr>
     </w:tbl>
-    <w:bookmarkEnd w:id="102"/>
-    <w:bookmarkStart w:id="103" w:name="Xe9b03fd3199b45e89de4f0f07475404c617f3ff"/>
+    <w:bookmarkEnd w:id="105"/>
+    <w:bookmarkStart w:id="106" w:name="Xe9b03fd3199b45e89de4f0f07475404c617f3ff"/>
     <w:p>
       <w:pPr>
         <w:pStyle w:val="Heading4"/>
@@ -9803,8 +9967,8 @@
         <w:t xml:space="preserve">With three baselines and two primary metrics, the comparisons that carry a claim are the analysis against each of the first two baselines on silent loss and on capture coverage.  Four tests share one family, so significance is judged with a Holm correction at a family-wise α = 0.05, and the uncorrected values are reported beside the corrected ones.  The full-snapshot baseline is a bound on cost and safety, not a comparison of accuracy, and is reported descriptively.</w:t>
       </w:r>
     </w:p>
-    <w:bookmarkEnd w:id="103"/>
-    <w:bookmarkStart w:id="104" w:name="d-results-on-the-held-out-corpus"/>
+    <w:bookmarkEnd w:id="106"/>
+    <w:bookmarkStart w:id="107" w:name="d-results-on-the-held-out-corpus"/>
     <w:p>
       <w:pPr>
         <w:pStyle w:val="Heading4"/>
@@ -10424,8 +10588,8 @@
         <w:t xml:space="preserve">— and it asks on these by construction.  A large share of NL2Bash candidates are excluded because they name paths or programs the fixture cannot supply, which biases that partition toward commands that run on a small tree.  The external partition is assigned by a table of state-changing tools and not observed, so its labels are only as good as the table, as the model-generated partition’s one error shows.  And the model-generated partition above was scored against an earlier build of the analyser, not the one the primary result was frozen against.</w:t>
       </w:r>
     </w:p>
-    <w:bookmarkEnd w:id="104"/>
-    <w:bookmarkStart w:id="105" w:name="e-threats-specific-to-this-evaluation"/>
+    <w:bookmarkEnd w:id="107"/>
+    <w:bookmarkStart w:id="108" w:name="e-threats-specific-to-this-evaluation"/>
     <w:p>
       <w:pPr>
         <w:pStyle w:val="Heading4"/>
@@ -10442,9 +10606,9 @@
         <w:t xml:space="preserve">Four are anticipated.  First, corpus bias is addressed by partitioning, as described in Section 1.2(a).  Second, oracle validity replaces label subjectivity: the labels are observed, so they cannot be argued with, but they are facts about one command on one small fixture, run for a few seconds, seeing the working tree and not repository internals.  A loss that appears only on a differently shaped tree, or after the time limit, is labeled by what happened here.  The oracle’s own behavior is pinned by unit tests over commands whose outcome is known, its exclusions are reported, and the bias they introduce — toward commands that run on a small fixture, which excludes most NL2Bash candidates that name paths or hosts the fixture cannot supply — is stated and not corrected.  Third, the algorithm and the labels are produced by the same research team, which creates a risk that the labels reflect the algorithm’s assumptions; the generator is independent of the analysis by construction, and the corpus is fixed by a recorded seed and hash before the analysis is run on it.  A fourth threat follows from the same fact: the analysis rests on a table of what each known command does, written by the same team, and a table written with the corpus in view measures the cases its author anticipated.  The corpus is therefore generated from several seeds.  Earlier ones are used to correct the analysis and the undo; the primary result is reported on one drawn after both are frozen, with the analyzer’s hash recorded beside the result.</w:t>
       </w:r>
     </w:p>
-    <w:bookmarkEnd w:id="105"/>
-    <w:bookmarkEnd w:id="106"/>
-    <w:bookmarkStart w:id="107" w:name="ch3-sec3-ablation"/>
+    <w:bookmarkEnd w:id="108"/>
+    <w:bookmarkEnd w:id="109"/>
+    <w:bookmarkStart w:id="110" w:name="ch3-sec3-ablation"/>
     <w:p>
       <w:pPr>
         <w:pStyle w:val="Heading3"/>
@@ -11424,14 +11588,14 @@
         <w:t xml:space="preserve">— cost the ablated configurations little or nothing, because the table already covers them.  The reported result in Section 3.1(c) and (d) is therefore attributable to composition and resolution together, and not to the table they are sometimes mistaken for.</w:t>
       </w:r>
     </w:p>
-    <w:bookmarkEnd w:id="107"/>
-    <w:bookmarkStart w:id="108" w:name="ch3-sec3-2"/>
+    <w:bookmarkEnd w:id="110"/>
+    <w:bookmarkStart w:id="111" w:name="ch3-sec3-2"/>
     <w:p>
       <w:pPr>
         <w:pStyle w:val="Heading3"/>
       </w:pPr>
       <w:r>
-        <w:t xml:space="preserve">3.3 Evaluation dataset</w:t>
+        <w:t xml:space="preserve">3.3 Validation study: evaluation dataset</w:t>
       </w:r>
     </w:p>
     <w:p>
@@ -11442,14 +11606,14 @@
         <w:t xml:space="preserve">Sections 3.3 to 3.7 define the validation study, in which the analysis is deployed in SynapseOS and exercised by participants.  It exercises the platform on two task datasets: the OSWorld benchmark task suite [41] for direct comparison with results in the existing literature, and the custom cross-platform task suite described in Sections 1.1 and 1.5.  The user study evaluation involves 40 participants (20 novice, 20 power users); the baseline condition is each participant’s primary operating system — Windows 11, macOS, or Linux with GNOME desktop — on a dedicated baseline machine.</w:t>
       </w:r>
     </w:p>
-    <w:bookmarkEnd w:id="108"/>
-    <w:bookmarkStart w:id="109" w:name="ch3-sec3-3"/>
+    <w:bookmarkEnd w:id="111"/>
+    <w:bookmarkStart w:id="112" w:name="ch3-sec3-3"/>
     <w:p>
       <w:pPr>
         <w:pStyle w:val="Heading3"/>
       </w:pPr>
       <w:r>
-        <w:t xml:space="preserve">3.4 Evaluation profile</w:t>
+        <w:t xml:space="preserve">3.4 Validation study: evaluation profile</w:t>
       </w:r>
     </w:p>
     <w:p>
@@ -11520,14 +11684,14 @@
         <w:t xml:space="preserve">The two participant groups — novice users and power users — are analyzed both in aggregate and separately to determine whether the effect of the interface condition differs across experience levels.  Additionally, primary OS (Windows, macOS, Linux) is recorded as a secondary grouping variable to determine whether results vary across participant backgrounds, and prior conversational AI exposure (frequency of use) is recorded as a covariate to determine whether familiarity with LLM-based tools correlates with SynapseOS performance independent of OS proficiency.  The primary analysis is the pooled within-subjects comparison across all 40 participants; per-OS subgroup analyses and AI-exposure correlations are treated as exploratory given the smaller per-group sample sizes they entail.</w:t>
       </w:r>
     </w:p>
-    <w:bookmarkEnd w:id="109"/>
-    <w:bookmarkStart w:id="115" w:name="ch3-sec3-4"/>
+    <w:bookmarkEnd w:id="112"/>
+    <w:bookmarkStart w:id="118" w:name="ch3-sec3-4"/>
     <w:p>
       <w:pPr>
         <w:pStyle w:val="Heading3"/>
       </w:pPr>
       <w:r>
-        <w:t xml:space="preserve">3.5 Criteria and formula</w:t>
+        <w:t xml:space="preserve">3.5 Validation study: criteria and formula</w:t>
       </w:r>
     </w:p>
     <w:p>
@@ -11538,7 +11702,7 @@
         <w:t xml:space="preserve">The following metrics and formulas are used in the validation study.  Items (a) to (d) characterize the platform against each participant’s baseline; item (e) validates the analysis in use.</w:t>
       </w:r>
     </w:p>
-    <w:bookmarkStart w:id="110" w:name="a-task-completion-time"/>
+    <w:bookmarkStart w:id="113" w:name="a-task-completion-time"/>
     <w:p>
       <w:pPr>
         <w:pStyle w:val="Heading4"/>
@@ -11555,8 +11719,8 @@
         <w:t xml:space="preserve">Mean task completion time is computed per condition per participant group.  Inferential testing and effect size reporting follow the procedures described in Section 3.6.</w:t>
       </w:r>
     </w:p>
-    <w:bookmarkEnd w:id="110"/>
-    <w:bookmarkStart w:id="111" w:name="b-error-rate"/>
+    <w:bookmarkEnd w:id="113"/>
+    <w:bookmarkStart w:id="114" w:name="b-error-rate"/>
     <w:p>
       <w:pPr>
         <w:pStyle w:val="Heading4"/>
@@ -11589,8 +11753,8 @@
         <w:t xml:space="preserve">Error events are further categorized by type: intent parsing errors (incorrect bash command generated), execution errors (bash subprocess failure), and recovery failures (unsuccessful undo or retry).  The same paired statistical test is applied to error rate differences between conditions.</w:t>
       </w:r>
     </w:p>
-    <w:bookmarkEnd w:id="111"/>
-    <w:bookmarkStart w:id="112" w:name="c-user-satisfaction"/>
+    <w:bookmarkEnd w:id="114"/>
+    <w:bookmarkStart w:id="115" w:name="c-user-satisfaction"/>
     <w:p>
       <w:pPr>
         <w:pStyle w:val="Heading4"/>
@@ -11615,8 +11779,8 @@
         <w:t xml:space="preserve">Qualitative interview data is analyzed using thematic analysis to identify recurring themes in participant perceptions of both conditions.</w:t>
       </w:r>
     </w:p>
-    <w:bookmarkEnd w:id="112"/>
-    <w:bookmarkStart w:id="113" w:name="X2db549e47d03a47c0f54d1209c8c09b0dd0a7e7"/>
+    <w:bookmarkEnd w:id="115"/>
+    <w:bookmarkStart w:id="116" w:name="X2db549e47d03a47c0f54d1209c8c09b0dd0a7e7"/>
     <w:p>
       <w:pPr>
         <w:pStyle w:val="Heading4"/>
@@ -11707,8 +11871,8 @@
         <w:t xml:space="preserve">= 0.66 or larger.  The condition × group interaction — the test corresponding most directly to the platform’s intended benefit — remains the least-powered comparison in the design, since an interaction of a given size requires substantially more participants than a main effect of the same size; it is therefore reported with effect sizes and confidence intervals as the primary descriptive finding, and is not treated as a confirmatory significance test.</w:t>
       </w:r>
     </w:p>
-    <w:bookmarkEnd w:id="113"/>
-    <w:bookmarkStart w:id="114" w:name="e-analysis-decisions-in-use"/>
+    <w:bookmarkEnd w:id="116"/>
+    <w:bookmarkStart w:id="117" w:name="e-analysis-decisions-in-use"/>
     <w:p>
       <w:pPr>
         <w:pStyle w:val="Heading4"/>
@@ -11764,15 +11928,15 @@
         <w:t xml:space="preserve">, the proportion of commands that lose nothing on which the participant was nonetheless asked.  Each undo a participant invokes is also checked against the state before the command it reverts.  These are the measures by which the platform validates the analysis: a silent loss here would be a failure of the analysis on a command people actually cause, which the corpus could not reveal.</w:t>
       </w:r>
     </w:p>
-    <w:bookmarkEnd w:id="114"/>
-    <w:bookmarkEnd w:id="115"/>
-    <w:bookmarkStart w:id="116" w:name="ch3-sec3-5"/>
+    <w:bookmarkEnd w:id="117"/>
+    <w:bookmarkEnd w:id="118"/>
+    <w:bookmarkStart w:id="119" w:name="ch3-sec3-5"/>
     <w:p>
       <w:pPr>
         <w:pStyle w:val="Heading3"/>
       </w:pPr>
       <w:r>
-        <w:t xml:space="preserve">3.6 Data analysis plan</w:t>
+        <w:t xml:space="preserve">3.6 Validation study: data analysis plan</w:t>
       </w:r>
     </w:p>
     <w:p>
@@ -11815,14 +11979,14 @@
         <w:t xml:space="preserve">Qualitative data from post-study interviews is analyzed using reflexive thematic analysis following the six-phase procedure described by Braun and Clarke [2]: familiarization with the data, initial code generation, theme search, theme review, theme definition, and write-up.  In keeping with the reflexive approach, which treats the analyst’s interpretation as part of the method and does not compute inter-rater agreement, one member of the research team develops the codes and themes; the codebook and the excerpts that support each theme are retained so that the analysis can be audited.  Themes are reported alongside representative participant quotations.</w:t>
       </w:r>
     </w:p>
-    <w:bookmarkEnd w:id="116"/>
-    <w:bookmarkStart w:id="117" w:name="ch3-sec3-6"/>
+    <w:bookmarkEnd w:id="119"/>
+    <w:bookmarkStart w:id="120" w:name="ch3-sec3-6"/>
     <w:p>
       <w:pPr>
         <w:pStyle w:val="Heading3"/>
       </w:pPr>
       <w:r>
-        <w:t xml:space="preserve">3.7 Threats to validity</w:t>
+        <w:t xml:space="preserve">3.7 Validation study: threats to validity</w:t>
       </w:r>
     </w:p>
     <w:p>
@@ -12135,9 +12299,9 @@
         <w:t xml:space="preserve">SynapseOS is evaluated on a single hardware and software configuration — a dedicated machine running SynapseOS in GUI mode (XFCE desktop environment, X11 session) on a Debian 13 (Trixie) base.  Performance characteristics on different hardware, display configurations, or Linux distributions may differ from the reported results.</w:t>
       </w:r>
     </w:p>
-    <w:bookmarkEnd w:id="117"/>
-    <w:bookmarkEnd w:id="118"/>
-    <w:bookmarkStart w:id="127" w:name="ch3-notes"/>
+    <w:bookmarkEnd w:id="120"/>
+    <w:bookmarkEnd w:id="121"/>
+    <w:bookmarkStart w:id="130" w:name="ch3-notes"/>
     <w:p>
       <w:pPr>
         <w:pStyle w:val="Heading2"/>
@@ -12154,11 +12318,11 @@
           <w:numId w:val="1019"/>
         </w:numPr>
       </w:pPr>
-      <w:bookmarkStart w:id="119" w:name="ch3-fn1"/>
+      <w:bookmarkStart w:id="122" w:name="ch3-fn1"/>
       <w:r>
         <w:t xml:space="preserve">Command-Line Interface mode: a single non-interactive invocation, with no session persisting between separate calls, that runs a bounded multi-step loop toward one natural-language request — each step proposed, classified for reversibility, executed (immediately if reversible, after confirmation if not) through the same gate as the other interface modes, and its result fed back so the model can propose the next step or signal completion — up to a fixed step limit, before the invocation exits.  Distinct from TUI mode’s persistent interactive chat session; intended for scripting, automation, and one-off remote commands.</w:t>
       </w:r>
-      <w:bookmarkEnd w:id="119"/>
+      <w:bookmarkEnd w:id="122"/>
     </w:p>
     <w:p>
       <w:pPr>
@@ -12168,11 +12332,11 @@
           <w:numId w:val="1019"/>
         </w:numPr>
       </w:pPr>
-      <w:bookmarkStart w:id="120" w:name="ch3-fn2"/>
+      <w:bookmarkStart w:id="123" w:name="ch3-fn2"/>
       <w:r>
         <w:t xml:space="preserve">Terminal User Interface: a text-based interactive interface that runs in a command-line terminal.  TUI mode requires no graphical display server or desktop environment and can be accessed remotely over SSH.</w:t>
       </w:r>
-      <w:bookmarkEnd w:id="120"/>
+      <w:bookmarkEnd w:id="123"/>
     </w:p>
     <w:p>
       <w:pPr>
@@ -12182,11 +12346,11 @@
           <w:numId w:val="1019"/>
         </w:numPr>
       </w:pPr>
-      <w:bookmarkStart w:id="121" w:name="ch3-fn3"/>
+      <w:bookmarkStart w:id="124" w:name="ch3-fn3"/>
       <w:r>
         <w:t xml:space="preserve">The SynapseOS prototype uses Qwen2.5-Coder-3B-Instruct, a code-specialized open-weights model selected for its NL2Bash accuracy.  See Section 2.1(d) for selection rationale and benchmark evidence.</w:t>
       </w:r>
-      <w:bookmarkEnd w:id="121"/>
+      <w:bookmarkEnd w:id="124"/>
     </w:p>
     <w:p>
       <w:pPr>
@@ -12196,11 +12360,11 @@
           <w:numId w:val="1019"/>
         </w:numPr>
       </w:pPr>
-      <w:bookmarkStart w:id="122" w:name="ch3-fn4"/>
+      <w:bookmarkStart w:id="125" w:name="ch3-fn4"/>
       <w:r>
         <w:t xml:space="preserve">An inference server loads a language model into memory and processes query requests from the application layer.  Ollama is an open-source tool for running language models locally on consumer hardware without cloud connectivity.</w:t>
       </w:r>
-      <w:bookmarkEnd w:id="122"/>
+      <w:bookmarkEnd w:id="125"/>
     </w:p>
     <w:p>
       <w:pPr>
@@ -12210,11 +12374,11 @@
           <w:numId w:val="1019"/>
         </w:numPr>
       </w:pPr>
-      <w:bookmarkStart w:id="123" w:name="ch3-fn5"/>
+      <w:bookmarkStart w:id="126" w:name="ch3-fn5"/>
       <w:r>
         <w:t xml:space="preserve">Open-weights models make their trained parameters publicly available for local download and use; users run inference on their own hardware without routing queries to an external service provider.</w:t>
       </w:r>
-      <w:bookmarkEnd w:id="123"/>
+      <w:bookmarkEnd w:id="126"/>
     </w:p>
     <w:p>
       <w:pPr>
@@ -12224,11 +12388,11 @@
           <w:numId w:val="1019"/>
         </w:numPr>
       </w:pPr>
-      <w:bookmarkStart w:id="124" w:name="ch3-fn6"/>
+      <w:bookmarkStart w:id="127" w:name="ch3-fn6"/>
       <w:r>
         <w:t xml:space="preserve">Quantization reduces the numerical precision of model weights to lower memory requirements.  At 4-bit precision, a model that would otherwise require dedicated GPU memory can run on a standard CPU with modest RAM.</w:t>
       </w:r>
-      <w:bookmarkEnd w:id="124"/>
+      <w:bookmarkEnd w:id="127"/>
     </w:p>
     <w:p>
       <w:pPr>
@@ -12238,11 +12402,11 @@
           <w:numId w:val="1019"/>
         </w:numPr>
       </w:pPr>
-      <w:bookmarkStart w:id="125" w:name="ch3-fn7"/>
+      <w:bookmarkStart w:id="128" w:name="ch3-fn7"/>
       <w:r>
         <w:t xml:space="preserve">Low-Rank Adaptation (LoRA) is a parameter-efficient fine-tuning method that introduces a small number of trainable weight matrices while keeping the base model frozen, enabling task-specific adaptation on consumer hardware without full retraining.</w:t>
       </w:r>
-      <w:bookmarkEnd w:id="125"/>
+      <w:bookmarkEnd w:id="128"/>
     </w:p>
     <w:p>
       <w:pPr>
@@ -12252,14 +12416,14 @@
           <w:numId w:val="1019"/>
         </w:numPr>
       </w:pPr>
-      <w:bookmarkStart w:id="126" w:name="ch3-fn8"/>
+      <w:bookmarkStart w:id="129" w:name="ch3-fn8"/>
       <w:r>
         <w:t xml:space="preserve">NL2Bash is a benchmark dataset pairing natural language command descriptions with their corresponding bash shell commands, used to evaluate a model’s accuracy in translating natural language into executable commands.</w:t>
       </w:r>
-      <w:bookmarkEnd w:id="126"/>
-    </w:p>
-    <w:bookmarkEnd w:id="127"/>
-    <w:bookmarkStart w:id="128" w:name="sec-master-references"/>
+      <w:bookmarkEnd w:id="129"/>
+    </w:p>
+    <w:bookmarkEnd w:id="130"/>
+    <w:bookmarkStart w:id="131" w:name="sec-master-references"/>
     <w:p>
       <w:pPr>
         <w:pStyle w:val="FirstParagraph"/>
@@ -12268,7 +12432,7 @@
         <w:t xml:space="preserve">REFERENCES</w:t>
       </w:r>
     </w:p>
-    <w:bookmarkEnd w:id="128"/>
+    <w:bookmarkEnd w:id="131"/>
     <w:p>
       <w:pPr>
         <w:pStyle w:val="BodyText"/>
@@ -13292,7 +13456,7 @@
         <w:t xml:space="preserve">X. Zhou, S. Zhang, Y. Zhao, J. Wei, T. Song, A. Cohan, and C. Zhao. 2026. GUI vs. CLI: Execution Bottlenecks in Screen-Only and Skill-Mediated Computer-Use Agents. arXiv:2606.24551</w:t>
       </w:r>
     </w:p>
-    <w:bookmarkStart w:id="136" w:name="sec-appendices"/>
+    <w:bookmarkStart w:id="139" w:name="sec-appendices"/>
     <w:p>
       <w:pPr>
         <w:pStyle w:val="Heading2"/>
@@ -13309,7 +13473,7 @@
         <w:t xml:space="preserve">This section contains the study instruments administered to participants and the procedure governing their administration.  Wording, difficulty calibration, and task-form equivalence are validated during the pilot study described in Section 2.3 and revised before the main study begins; the instruments are reproduced here in the form submitted for ethics review.</w:t>
       </w:r>
     </w:p>
-    <w:bookmarkStart w:id="129" w:name="appendix-a"/>
+    <w:bookmarkStart w:id="132" w:name="appendix-a"/>
     <w:p>
       <w:pPr>
         <w:pStyle w:val="BodyText"/>
@@ -13326,7 +13490,7 @@
         <w:t xml:space="preserve">System Usability Scale (SUS)</w:t>
       </w:r>
     </w:p>
-    <w:bookmarkEnd w:id="129"/>
+    <w:bookmarkEnd w:id="132"/>
     <w:p>
       <w:pPr>
         <w:pStyle w:val="BodyText"/>
@@ -14369,7 +14533,7 @@
         <w:t xml:space="preserve">For odd-numbered items, subtract 1 from the response.  For even-numbered items, subtract the response from 5.  Sum the ten adjusted scores and multiply by 2.5, giving a value from 0 to 100.  This value is not a percentage; interpretation follows Sauro and Lewis [31].</w:t>
       </w:r>
     </w:p>
-    <w:bookmarkStart w:id="130" w:name="appendix-b"/>
+    <w:bookmarkStart w:id="133" w:name="appendix-b"/>
     <w:p>
       <w:pPr>
         <w:pStyle w:val="BodyText"/>
@@ -14386,7 +14550,7 @@
         <w:t xml:space="preserve">NASA Task Load Index (NASA-TLX)</w:t>
       </w:r>
     </w:p>
-    <w:bookmarkEnd w:id="130"/>
+    <w:bookmarkEnd w:id="133"/>
     <w:p>
       <w:pPr>
         <w:pStyle w:val="BodyText"/>
@@ -14897,7 +15061,7 @@
         </w:tc>
       </w:tr>
     </w:tbl>
-    <w:bookmarkStart w:id="131" w:name="appendix-c"/>
+    <w:bookmarkStart w:id="134" w:name="appendix-c"/>
     <w:p>
       <w:pPr>
         <w:pStyle w:val="BodyText"/>
@@ -14914,7 +15078,7 @@
         <w:t xml:space="preserve">Custom Cross-Platform Task Suite</w:t>
       </w:r>
     </w:p>
-    <w:bookmarkEnd w:id="131"/>
+    <w:bookmarkEnd w:id="134"/>
     <w:p>
       <w:pPr>
         <w:pStyle w:val="BodyText"/>
@@ -16588,7 +16752,7 @@
         </w:tc>
       </w:tr>
     </w:tbl>
-    <w:bookmarkStart w:id="132" w:name="appendix-d"/>
+    <w:bookmarkStart w:id="135" w:name="appendix-d"/>
     <w:p>
       <w:pPr>
         <w:pStyle w:val="BodyText"/>
@@ -16605,7 +16769,7 @@
         <w:t xml:space="preserve">Pre-Study Screening Questionnaire</w:t>
       </w:r>
     </w:p>
-    <w:bookmarkEnd w:id="132"/>
+    <w:bookmarkEnd w:id="135"/>
     <w:p>
       <w:pPr>
         <w:pStyle w:val="BodyText"/>
@@ -17162,7 +17326,7 @@
         <w:t xml:space="preserve">□ SynapseOS first   □ Own OS first</w:t>
       </w:r>
     </w:p>
-    <w:bookmarkStart w:id="133" w:name="appendix-e"/>
+    <w:bookmarkStart w:id="136" w:name="appendix-e"/>
     <w:p>
       <w:pPr>
         <w:pStyle w:val="BodyText"/>
@@ -17179,7 +17343,7 @@
         <w:t xml:space="preserve">Participant Information Sheet</w:t>
       </w:r>
     </w:p>
-    <w:bookmarkEnd w:id="133"/>
+    <w:bookmarkEnd w:id="136"/>
     <w:p>
       <w:pPr>
         <w:pStyle w:val="BodyText"/>
@@ -17378,7 +17542,7 @@
         <w:t xml:space="preserve">For questions about the study, contact the research team at [research team contact address].  For concerns about how the study is being conducted, or about your rights as a participant, contact the Institutional Review Board of Mapúa University – Makati at [ethics committee contact address], independently of the research team.</w:t>
       </w:r>
     </w:p>
-    <w:bookmarkStart w:id="134" w:name="appendix-f"/>
+    <w:bookmarkStart w:id="137" w:name="appendix-f"/>
     <w:p>
       <w:pPr>
         <w:pStyle w:val="BodyText"/>
@@ -17395,7 +17559,7 @@
         <w:t xml:space="preserve">Informed Consent Form</w:t>
       </w:r>
     </w:p>
-    <w:bookmarkEnd w:id="134"/>
+    <w:bookmarkEnd w:id="137"/>
     <w:p>
       <w:pPr>
         <w:pStyle w:val="BodyText"/>
@@ -17810,7 +17974,7 @@
         <w:t xml:space="preserve">Filing note: this is the only study document bearing the participant’s name.  It is stored separately from all study data, and the code-to-name list derived from it is destroyed on the schedule stated in Section 2.5.</w:t>
       </w:r>
     </w:p>
-    <w:bookmarkStart w:id="135" w:name="appendix-g"/>
+    <w:bookmarkStart w:id="138" w:name="appendix-g"/>
     <w:p>
       <w:pPr>
         <w:pStyle w:val="BodyText"/>
@@ -17827,7 +17991,7 @@
         <w:t xml:space="preserve">Session Facilitator Checklist</w:t>
       </w:r>
     </w:p>
-    <w:bookmarkEnd w:id="135"/>
+    <w:bookmarkEnd w:id="138"/>
     <w:p>
       <w:pPr>
         <w:pStyle w:val="BodyText"/>
@@ -18156,7 +18320,7 @@
         <w:t xml:space="preserve">Diarise the participant’s fourteen-day withdrawal deadline.</w:t>
       </w:r>
     </w:p>
-    <w:bookmarkEnd w:id="136"/>
+    <w:bookmarkEnd w:id="139"/>
     <w:sectPr/>
   </w:body>
 </w:document>

</xml_diff>

<commit_message>
docs(thesis): survey recovery systems and compare approaches in a new Table 2.1
Section 2.5 becomes 'Command Safety, Static Analysis, and Recovery', with subsections for guards, static analysis of shell programs, and recovery after the fact (snapshots, versioning file systems, service undo, OS transactions, intrusion recovery). A new Table 2.1 compares all of them with this study on what they act on, whether they know what a command will change, composition and run-time targets, and whether they restore; the interface comparison becomes Table 2.2. All 157 existing citations were renumbered for the five new references and checked to resolve to the same sources.
</commit_message>
<xml_diff>
--- a/thesis 1/consolidated/SynapseOS_Proposal_Chapters_1_to_3.docx
+++ b/thesis 1/consolidated/SynapseOS_Proposal_Chapters_1_to_3.docx
@@ -567,7 +567,7 @@
       <w:hyperlink w:anchor="sec2-5-safety">
         <w:r>
           <w:rPr/>
-          <w:t xml:space="preserve">2.5 Command Safety and Static Analysis of Shell Commands</w:t>
+          <w:t xml:space="preserve">2.5 Command Safety, Static Analysis, and Recovery</w:t>
         </w:r>
       </w:hyperlink>
       <w:r>
@@ -595,7 +595,7 @@
         <w:tab/>
       </w:r>
       <w:r>
-        <w:t xml:space="preserve">28</w:t>
+        <w:t xml:space="preserve">30</w:t>
       </w:r>
     </w:p>
     <w:p>
@@ -616,7 +616,7 @@
         <w:tab/>
       </w:r>
       <w:r>
-        <w:t xml:space="preserve">32</w:t>
+        <w:t xml:space="preserve">34</w:t>
       </w:r>
     </w:p>
     <w:p>
@@ -637,7 +637,7 @@
         <w:tab/>
       </w:r>
       <w:r>
-        <w:t xml:space="preserve">33</w:t>
+        <w:t xml:space="preserve">36</w:t>
       </w:r>
     </w:p>
     <w:p>
@@ -658,7 +658,7 @@
         <w:tab/>
       </w:r>
       <w:r>
-        <w:t xml:space="preserve">35</w:t>
+        <w:t xml:space="preserve">37</w:t>
       </w:r>
     </w:p>
     <w:p>
@@ -679,7 +679,7 @@
         <w:tab/>
       </w:r>
       <w:r>
-        <w:t xml:space="preserve">41</w:t>
+        <w:t xml:space="preserve">44</w:t>
       </w:r>
     </w:p>
     <w:p>
@@ -700,7 +700,7 @@
         <w:tab/>
       </w:r>
       <w:r>
-        <w:t xml:space="preserve">43</w:t>
+        <w:t xml:space="preserve">45</w:t>
       </w:r>
     </w:p>
     <w:p>
@@ -720,7 +720,7 @@
         <w:tab/>
       </w:r>
       <w:r>
-        <w:t xml:space="preserve">45</w:t>
+        <w:t xml:space="preserve">48</w:t>
       </w:r>
     </w:p>
     <w:p>
@@ -740,7 +740,7 @@
         <w:tab/>
       </w:r>
       <w:r>
-        <w:t xml:space="preserve">46</w:t>
+        <w:t xml:space="preserve">49</w:t>
       </w:r>
     </w:p>
     <w:p>
@@ -760,7 +760,7 @@
         <w:tab/>
       </w:r>
       <w:r>
-        <w:t xml:space="preserve">49</w:t>
+        <w:t xml:space="preserve">52</w:t>
       </w:r>
     </w:p>
     <w:p>
@@ -780,7 +780,7 @@
         <w:tab/>
       </w:r>
       <w:r>
-        <w:t xml:space="preserve">51</w:t>
+        <w:t xml:space="preserve">54</w:t>
       </w:r>
     </w:p>
     <w:p>
@@ -800,7 +800,7 @@
         <w:tab/>
       </w:r>
       <w:r>
-        <w:t xml:space="preserve">64</w:t>
+        <w:t xml:space="preserve">67</w:t>
       </w:r>
     </w:p>
     <w:p>
@@ -820,7 +820,7 @@
         <w:tab/>
       </w:r>
       <w:r>
-        <w:t xml:space="preserve">79</w:t>
+        <w:t xml:space="preserve">82</w:t>
       </w:r>
     </w:p>
     <w:p>
@@ -840,7 +840,7 @@
         <w:tab/>
       </w:r>
       <w:r>
-        <w:t xml:space="preserve">98</w:t>
+        <w:t xml:space="preserve">101</w:t>
       </w:r>
     </w:p>
     <w:p>
@@ -860,7 +860,7 @@
         <w:tab/>
       </w:r>
       <w:r>
-        <w:t xml:space="preserve">104</w:t>
+        <w:t xml:space="preserve">107</w:t>
       </w:r>
     </w:p>
     <w:bookmarkStart w:id="24" w:name="list-of-tables"/>
@@ -899,17 +899,37 @@
           <w:tab w:val="right" w:leader="dot" w:pos="9350"/>
         </w:tabs>
       </w:pPr>
+      <w:hyperlink w:anchor="table-2-0">
+        <w:r>
+          <w:rPr/>
+          <w:t xml:space="preserve">Table 2.1: Approaches to the safety of shell commands, compared on the properties the study’s algorithm combines</w:t>
+        </w:r>
+      </w:hyperlink>
+      <w:r>
+        <w:tab/>
+      </w:r>
+      <w:r>
+        <w:t xml:space="preserve">30</w:t>
+      </w:r>
+    </w:p>
+    <w:p>
+      <w:pPr>
+        <w:pStyle w:val="BodyText"/>
+        <w:tabs>
+          <w:tab w:val="right" w:leader="dot" w:pos="9350"/>
+        </w:tabs>
+      </w:pPr>
       <w:hyperlink w:anchor="table-2-1">
         <w:r>
           <w:rPr/>
-          <w:t xml:space="preserve">Table 2.1: Comparative analysis of surveyed systems along the four-layer pipeline</w:t>
+          <w:t xml:space="preserve">Table 2.2: Comparative analysis of surveyed systems along the four-layer pipeline</w:t>
         </w:r>
       </w:hyperlink>
       <w:r>
         <w:tab/>
       </w:r>
       <w:r>
-        <w:t xml:space="preserve">35</w:t>
+        <w:t xml:space="preserve">37</w:t>
       </w:r>
     </w:p>
     <w:p>
@@ -929,7 +949,7 @@
         <w:tab/>
       </w:r>
       <w:r>
-        <w:t xml:space="preserve">49</w:t>
+        <w:t xml:space="preserve">52</w:t>
       </w:r>
     </w:p>
     <w:p>
@@ -949,7 +969,7 @@
         <w:tab/>
       </w:r>
       <w:r>
-        <w:t xml:space="preserve">49</w:t>
+        <w:t xml:space="preserve">52</w:t>
       </w:r>
     </w:p>
     <w:p>
@@ -969,7 +989,7 @@
         <w:tab/>
       </w:r>
       <w:r>
-        <w:t xml:space="preserve">81</w:t>
+        <w:t xml:space="preserve">84</w:t>
       </w:r>
     </w:p>
     <w:p>
@@ -989,7 +1009,7 @@
         <w:tab/>
       </w:r>
       <w:r>
-        <w:t xml:space="preserve">85</w:t>
+        <w:t xml:space="preserve">88</w:t>
       </w:r>
     </w:p>
     <w:p>
@@ -1009,7 +1029,7 @@
         <w:tab/>
       </w:r>
       <w:r>
-        <w:t xml:space="preserve">89</w:t>
+        <w:t xml:space="preserve">92</w:t>
       </w:r>
     </w:p>
     <w:p>
@@ -1029,7 +1049,7 @@
         <w:tab/>
       </w:r>
       <w:r>
-        <w:t xml:space="preserve">107</w:t>
+        <w:t xml:space="preserve">110</w:t>
       </w:r>
     </w:p>
     <w:p>
@@ -1049,7 +1069,7 @@
         <w:tab/>
       </w:r>
       <w:r>
-        <w:t xml:space="preserve">109</w:t>
+        <w:t xml:space="preserve">112</w:t>
       </w:r>
     </w:p>
     <w:bookmarkEnd w:id="24"/>
@@ -1099,7 +1119,7 @@
         <w:tab/>
       </w:r>
       <w:r>
-        <w:t xml:space="preserve">47</w:t>
+        <w:t xml:space="preserve">50</w:t>
       </w:r>
     </w:p>
     <w:bookmarkEnd w:id="25"/>
@@ -1144,7 +1164,7 @@
         <w:pStyle w:val="BodyText"/>
       </w:pPr>
       <w:r>
-        <w:t xml:space="preserve">The dominant paradigm for personal computing has remained largely unchanged since the early 1980s, when the graphical desktop — icons, menus, and pointer-driven interaction — was established through the Xerox Star and Apple Lisa lineage.  Despite its longevity, a parallel research tradition has long explored whether users should instead be able to describe what they want in natural language and have the computer carry it out.  The earliest serious system in this tradition, the Berkeley UNIX Consultant, was already operational by the late 1980s [40].  Decades later, the rise of large language models (LLMs) and multimodal foundation models</w:t>
+        <w:t xml:space="preserve">The dominant paradigm for personal computing has remained largely unchanged since the early 1980s, when the graphical desktop — icons, menus, and pointer-driven interaction — was established through the Xerox Star and Apple Lisa lineage.  Despite its longevity, a parallel research tradition has long explored whether users should instead be able to describe what they want in natural language and have the computer carry it out.  The earliest serious system in this tradition, the Berkeley UNIX Consultant, was already operational by the late 1980s [45].  Decades later, the rise of large language models (LLMs) and multimodal foundation models</w:t>
       </w:r>
       <w:hyperlink w:anchor="ch1-fn1">
         <w:r>
@@ -1167,7 +1187,7 @@
         <w:pStyle w:val="BodyText"/>
       </w:pPr>
       <w:r>
-        <w:t xml:space="preserve">The field that has emerged sits at the intersection of human-computer interaction, operating systems, natural language processing, computer vision, and program analysis.  On the shell side, recent work has demonstrated that LLMs can translate natural language into Bash commands with usable accuracy and can be embedded as a Unix primitive with appropriate safety guardrails [9, 38].  On the graphical side, so-called computer-using agents</w:t>
+        <w:t xml:space="preserve">The field that has emerged sits at the intersection of human-computer interaction, operating systems, natural language processing, computer vision, and program analysis.  On the shell side, recent work has demonstrated that LLMs can translate natural language into Bash commands with usable accuracy and can be embedded as a Unix primitive with appropriate safety guardrails [11, 43].  On the graphical side, so-called computer-using agents</w:t>
       </w:r>
       <w:hyperlink w:anchor="ch1-fn2">
         <w:r>
@@ -1182,15 +1202,15 @@
         <w:t xml:space="preserve"> </w:t>
       </w:r>
       <w:r>
-        <w:t xml:space="preserve">now operate desktop and mobile applications by combining native APIs with vision-based grounding [44, 45].  On the web, language-guided agents complete tasks across realistic websites with measurable but limited reliability [47, 48].  A converging research thread approaches the same technical problem from an accessibility perspective: speech-driven GUI command mapping for users with motor and speech impairments has progressed from voice-to-text dictation toward voice-to-action agents, with recent work on speech-instructed GUI agents [10] and region-aware visual grounding [29] demonstrating that the underlying components are maturing rapidly.  Yet the gap between demonstration and deployable replacement remains substantial.  Capability on short, self-contained tasks has advanced quickly, but sustained computer work has not: on OSWorld 2.0, a benchmark of long-horizon tasks whose median item takes a skilled human roughly an hour and a half, the best frontier configuration completes only 20.6% of tasks outright [43].</w:t>
-      </w:r>
-    </w:p>
-    <w:p>
-      <w:pPr>
-        <w:pStyle w:val="BodyText"/>
-      </w:pPr>
-      <w:r>
-        <w:t xml:space="preserve">This rapid progress has been uneven across platforms.  Windows is heavily represented in the desktop agent literature [13, 45], Android in the mobile agent literature [30, 37, 46], and the browser in the web agent literature [7, 47, 48].  Linux desktop coverage, by contrast, is conspicuously absent: existing work either addresses Linux only at the shell level [9] or treats it as one of several evaluation platforms rather than a primary target [41].  No surveyed system implements a working conversational session layer</w:t>
+        <w:t xml:space="preserve">now operate desktop and mobile applications by combining native APIs with vision-based grounding [49, 50].  On the web, language-guided agents complete tasks across realistic websites with measurable but limited reliability [52, 53].  A converging research thread approaches the same technical problem from an accessibility perspective: speech-driven GUI command mapping for users with motor and speech impairments has progressed from voice-to-text dictation toward voice-to-action agents, with recent work on speech-instructed GUI agents [12] and region-aware visual grounding [31] demonstrating that the underlying components are maturing rapidly.  Yet the gap between demonstration and deployable replacement remains substantial.  Capability on short, self-contained tasks has advanced quickly, but sustained computer work has not: on OSWorld 2.0, a benchmark of long-horizon tasks whose median item takes a skilled human roughly an hour and a half, the best frontier configuration completes only 20.6% of tasks outright [48].</w:t>
+      </w:r>
+    </w:p>
+    <w:p>
+      <w:pPr>
+        <w:pStyle w:val="BodyText"/>
+      </w:pPr>
+      <w:r>
+        <w:t xml:space="preserve">This rapid progress has been uneven across platforms.  Windows is heavily represented in the desktop agent literature [15, 50], Android in the mobile agent literature [33, 42, 51], and the browser in the web agent literature [8, 52, 53].  Linux desktop coverage, by contrast, is conspicuously absent: existing work either addresses Linux only at the shell level [11] or treats it as one of several evaluation platforms rather than a primary target [46].  No surveyed system implements a working conversational session layer</w:t>
       </w:r>
       <w:hyperlink w:anchor="ch1-fn3">
         <w:r>
@@ -1244,7 +1264,7 @@
         <w:t xml:space="preserve">permission</w:t>
       </w:r>
       <w:r>
-        <w:t xml:space="preserve">: the generated command is matched against a list of patterns judged dangerous and is then allowed, refused, or put to the user [9].  A list of this kind cannot see what a command will actually touch when its targets are hidden inside another command, such as</w:t>
+        <w:t xml:space="preserve">: the generated command is matched against a list of patterns judged dangerous and is then allowed, refused, or put to the user [11].  A list of this kind cannot see what a command will actually touch when its targets are hidden inside another command, such as</w:t>
       </w:r>
       <w:r>
         <w:t xml:space="preserve"> </w:t>
@@ -1295,15 +1315,15 @@
         <w:t xml:space="preserve"> </w:t>
       </w:r>
       <w:r>
-        <w:t xml:space="preserve">system places a conversational layer over the conventional desktop session as a whole.  The idea is no longer unclaimed — AgentOS [20] proposes a natural-language portal in place of the graphical desktop — but it is offered as a research direction, without a built system or an evaluation.  The systems that are built automate on top of the desktop rather than replacing it: UFO², for instance, positions itself as a “Desktop AgentOS” but operates as an automation layer atop the existing Windows shell, deliberately confining itself to a separate desktop so that agent and user do not interfere [45].  Third, the Linux work that exists serves servers and agents rather than the desktop session of an end user.  NaSh addresses Linux at the shell level as a design proposal without evaluation [9]; shipping natural-language shells such as Alibaba Cloud’s ANOLISA pair intent translation with approval gating and rollback, but scope themselves explicitly to server and DevOps workloads; and OSWorld includes Ubuntu as an evaluation platform rather than a deployment target [41].  Fourth, controlled comparison against the conventional graphical workflow exists only for narrow slices of the problem.  AXIS evaluates an API-first agent against manual operation within a single application, Microsoft Word, using a cloud-hosted frontier model [21], and the accessibility literature evaluates assistance for specific populations [28].  No study compares a conversational interface against the conventional workflow across operating-system-level tasks, on a Linux desktop, driven by a locally-hosted small model, under an explicit safety gate.  The first of these gaps is the one this study’s research addresses.  The other three describe the setting in which it arises, and they are why the analysis is deployed and validated in a conversational interface layer rather than studied on a corpus alone.</w:t>
-      </w:r>
-    </w:p>
-    <w:p>
-      <w:pPr>
-        <w:pStyle w:val="BodyText"/>
-      </w:pPr>
-      <w:r>
-        <w:t xml:space="preserve">Notably, the accessibility-focused thread of the field exhibits the inverse limitation.  Speech-to-GUI mapping research targets specific user populations — users with motor impairments, speech disorders, or cognitive disabilities — with specialized techniques such as speech-instructed GUI agents and resilient visual grounding [10, 29], but operates at the level of individual applications or interaction techniques rather than at the level of the session layer itself.  These approaches presuppose an underlying conversational system surface on which to run, yet no such surface exists.  This complementarity sharpens the opportunity: a general-purpose conversational interface layer would serve not only mainstream users but also provide the substrate that accessibility-specific configurations require.</w:t>
+        <w:t xml:space="preserve">system places a conversational layer over the conventional desktop session as a whole.  The idea is no longer unclaimed — AgentOS [22] proposes a natural-language portal in place of the graphical desktop — but it is offered as a research direction, without a built system or an evaluation.  The systems that are built automate on top of the desktop rather than replacing it: UFO², for instance, positions itself as a “Desktop AgentOS” but operates as an automation layer atop the existing Windows shell, deliberately confining itself to a separate desktop so that agent and user do not interfere [50].  Third, the Linux work that exists serves servers and agents rather than the desktop session of an end user.  NaSh addresses Linux at the shell level as a design proposal without evaluation [11]; shipping natural-language shells such as Alibaba Cloud’s ANOLISA pair intent translation with approval gating and rollback, but scope themselves explicitly to server and DevOps workloads; and OSWorld includes Ubuntu as an evaluation platform rather than a deployment target [46].  Fourth, controlled comparison against the conventional graphical workflow exists only for narrow slices of the problem.  AXIS evaluates an API-first agent against manual operation within a single application, Microsoft Word, using a cloud-hosted frontier model [23], and the accessibility literature evaluates assistance for specific populations [30].  No study compares a conversational interface against the conventional workflow across operating-system-level tasks, on a Linux desktop, driven by a locally-hosted small model, under an explicit safety gate.  The first of these gaps is the one this study’s research addresses.  The other three describe the setting in which it arises, and they are why the analysis is deployed and validated in a conversational interface layer rather than studied on a corpus alone.</w:t>
+      </w:r>
+    </w:p>
+    <w:p>
+      <w:pPr>
+        <w:pStyle w:val="BodyText"/>
+      </w:pPr>
+      <w:r>
+        <w:t xml:space="preserve">Notably, the accessibility-focused thread of the field exhibits the inverse limitation.  Speech-to-GUI mapping research targets specific user populations — users with motor impairments, speech disorders, or cognitive disabilities — with specialized techniques such as speech-instructed GUI agents and resilient visual grounding [12, 31], but operates at the level of individual applications or interaction techniques rather than at the level of the session layer itself.  These approaches presuppose an underlying conversational system surface on which to run, yet no such surface exists.  This complementarity sharpens the opportunity: a general-purpose conversational interface layer would serve not only mainstream users but also provide the substrate that accessibility-specific configurations require.</w:t>
       </w:r>
     </w:p>
     <w:p>
@@ -2310,7 +2330,7 @@
         <w:t xml:space="preserve"> </w:t>
       </w:r>
       <w:r>
-        <w:t xml:space="preserve">Although this population is scoped out of the initial evaluation for ethical and recruitment reasons, SynapseOS is positioned to serve as the session-level substrate on which accessibility-specific configurations can operate.  Prior work has established design guidelines for LLM-based speech interfaces for users with motor impairments [28] and has demonstrated specialized techniques — speech-instructed GUI agents and resilient visual grounding — at the application and interaction-technique level [10, 29].  These techniques presuppose a conversational system surface that does not yet exist at the session level; SynapseOS provides that surface, making accessibility-specific extensions a natural and well-grounded future direction rather than a speculative one.</w:t>
+        <w:t xml:space="preserve">Although this population is scoped out of the initial evaluation for ethical and recruitment reasons, SynapseOS is positioned to serve as the session-level substrate on which accessibility-specific configurations can operate.  Prior work has established design guidelines for LLM-based speech interfaces for users with motor impairments [30] and has demonstrated specialized techniques — speech-instructed GUI agents and resilient visual grounding — at the application and interaction-technique level [12, 31].  These techniques presuppose a conversational system surface that does not yet exist at the session level; SynapseOS provides that surface, making accessibility-specific extensions a natural and well-grounded future direction rather than a speculative one.</w:t>
       </w:r>
     </w:p>
     <w:bookmarkEnd w:id="33"/>
@@ -2383,7 +2403,7 @@
         <w:pStyle w:val="BodyText"/>
       </w:pPr>
       <w:r>
-        <w:t xml:space="preserve">The study examines cross-application desktop workflows on Linux, including shell operations, file management, and application-level tasks representable in the OSWorld benchmark task suite [41].  The validation study recruits novice computer users and power users for a controlled study on the platform.  The study is conducted in a Linux desktop environment and is bounded by the duration of the thesis project.  The recoverability analysis covers commands in the bash dialect on a Debian system: their effects on the filesystem, and the changes to package and service state they make through apt, dpkg, and systemd.  It is evaluated on a corpus of 777 commands drawn from NL2Bash, from templates covering each composition operator, and from tools whose effects lie outside the filesystem, and the contributions of composition and of runtime-target resolution are measured by ablation on the same corpus.</w:t>
+        <w:t xml:space="preserve">The study examines cross-application desktop workflows on Linux, including shell operations, file management, and application-level tasks representable in the OSWorld benchmark task suite [46].  The validation study recruits novice computer users and power users for a controlled study on the platform.  The study is conducted in a Linux desktop environment and is bounded by the duration of the thesis project.  The recoverability analysis covers commands in the bash dialect on a Debian system: their effects on the filesystem, and the changes to package and service state they make through apt, dpkg, and systemd.  It is evaluated on a corpus of 777 commands drawn from NL2Bash, from templates covering each composition operator, and from tools whose effects lie outside the filesystem, and the contributions of composition and of runtime-target resolution are measured by ablation on the same corpus.</w:t>
       </w:r>
     </w:p>
     <w:p>
@@ -2403,7 +2423,7 @@
         </w:r>
       </w:hyperlink>
       <w:r>
-        <w:t xml:space="preserve">; this tradeoff may affect the ceiling on intent parsing accuracy achievable within the study.  Second, users with motor accessibility needs — a highly relevant population — are excluded from the initial evaluation due to ethics-review and recruitment constraints; accessibility-specific configurations such as speech-instructed agent operation for atypical speech patterns [10] are likewise out of scope for the initial implementation but represent a natural extension of the SynapseOS substrate.  Third, SynapseOS targets the Linux desktop specifically, and the findings may not generalize directly to Windows or macOS desktop environments.  Fourth, the safety confirmation policy for irreversible system operations is defined in principle but requires empirical calibration during implementation.  Fifth, evaluation is bounded by the task coverage of the OSWorld benchmark and the custom task suite developed for this study; tasks outside this coverage are not evaluated.  Sixth, the recoverability analysis treats anything it cannot determine as unrecoverable, and so protects such commands only by asking first: code run by an interpreter, programs it does not model, and variables with no value are of this kind.  Its per-command rules are a hand-written enumeration, which its composition builds on rather than replaces, and it resolves a command’s targets shortly before the command runs, so a file changed by another process in the interval is captured as it was when resolved.</w:t>
+        <w:t xml:space="preserve">; this tradeoff may affect the ceiling on intent parsing accuracy achievable within the study.  Second, users with motor accessibility needs — a highly relevant population — are excluded from the initial evaluation due to ethics-review and recruitment constraints; accessibility-specific configurations such as speech-instructed agent operation for atypical speech patterns [12] are likewise out of scope for the initial implementation but represent a natural extension of the SynapseOS substrate.  Third, SynapseOS targets the Linux desktop specifically, and the findings may not generalize directly to Windows or macOS desktop environments.  Fourth, the safety confirmation policy for irreversible system operations is defined in principle but requires empirical calibration during implementation.  Fifth, evaluation is bounded by the task coverage of the OSWorld benchmark and the custom task suite developed for this study; tasks outside this coverage are not evaluated.  Sixth, the recoverability analysis treats anything it cannot determine as unrecoverable, and so protects such commands only by asking first: code run by an interpreter, programs it does not model, and variables with no value are of this kind.  Its per-command rules are a hand-written enumeration, which its composition builds on rather than replaces, and it resolves a command’s targets shortly before the command runs, so a file changed by another process in the interval is captured as it was when resolved.</w:t>
       </w:r>
     </w:p>
     <w:bookmarkEnd w:id="34"/>
@@ -2519,7 +2539,7 @@
         <w:pStyle w:val="FirstParagraph"/>
       </w:pPr>
       <w:r>
-        <w:t xml:space="preserve">This chapter reviews two bodies of research: the program-analysis and command-safety work on which the study’s recoverability analysis builds, and the work on conversational and language-model-mediated interfaces to personal computing in which SynapseOS, the platform where the analysis is deployed, is situated.  The review spans nearly four decades of work on natural-language interfaces to computing systems, from the symbolic-artificial-intelligence consultants developed for the Unix shell in the late 1980s [40] to the large language model (LLM) agents that now operate shells, graphical applications, browsers, and mobile devices.  Its purpose is threefold: to establish the conceptual vocabulary and technical foundations on which the present study builds, to characterize the current state of the field and its recurring limitations, and to locate precisely the gaps that the proposed recoverability analysis, and SynapseOS, the system in which it is deployed, are designed to fill.</w:t>
+        <w:t xml:space="preserve">This chapter reviews two bodies of research: the program-analysis and command-safety work on which the study’s recoverability analysis builds, and the work on conversational and language-model-mediated interfaces to personal computing in which SynapseOS, the platform where the analysis is deployed, is situated.  The review spans nearly four decades of work on natural-language interfaces to computing systems, from the symbolic-artificial-intelligence consultants developed for the Unix shell in the late 1980s [45] to the large language model (LLM) agents that now operate shells, graphical applications, browsers, and mobile devices.  Its purpose is threefold: to establish the conceptual vocabulary and technical foundations on which the present study builds, to characterize the current state of the field and its recurring limitations, and to locate precisely the gaps that the proposed recoverability analysis, and SynapseOS, the system in which it is deployed, are designed to fill.</w:t>
       </w:r>
     </w:p>
     <w:bookmarkEnd w:id="42"/>
@@ -2554,7 +2574,7 @@
         <w:pStyle w:val="FirstParagraph"/>
       </w:pPr>
       <w:r>
-        <w:t xml:space="preserve">The technique the study’s recoverability analysis relies on — determining what a piece of code will do without executing it — is not new; it has a decades-long history in programming-language theory under two related names, neither of which the natural-language shells and command guards surveyed in this chapter draw on.  Abstract interpretation, introduced by Cousot and Cousot [5], is the foundational technique for computing sound, conservative approximations of a program’s runtime behavior by evaluating it over an abstract domain rather than its concrete one.  Type-and-effect systems, developed by Jouvelot and Gifford [16] and given a full formal treatment by Talpin and Jouvelot [35], extend a program’s type judgment with an explicit account of the side effects an expression may produce, so that a compiler or static checker can reason about those effects instead of leaving them implicit in execution.  The recoverability algorithm this study contributes (Chapter 3, Section 2.1(a)–(c)) is an instance of this discipline applied to a domain neither tradition has targeted: a generated shell command is treated as an expression whose effect — on the filesystem, rather than on a type system’s abstract state — is derived from its syntax and composed across its operators, and it is that effect set, not the command’s name, that the recoverability verdict is computed over.  This connects the algorithm to an established formal lineage rather than presenting it as a bespoke heuristic, and it grounds the algorithm’s one-sided soundness property — over-approximating destructiveness under uncertainty rather than under-approximating it — in the same requirement abstract interpretation itself imposes: a sound abstraction may lose precision, but it may never assert a property the concrete execution does not actually have.</w:t>
+        <w:t xml:space="preserve">The technique the study’s recoverability analysis relies on — determining what a piece of code will do without executing it — is not new; it has a decades-long history in programming-language theory under two related names, neither of which the natural-language shells and command guards surveyed in this chapter draw on.  Abstract interpretation, introduced by Cousot and Cousot [6], is the foundational technique for computing sound, conservative approximations of a program’s runtime behavior by evaluating it over an abstract domain rather than its concrete one.  Type-and-effect systems, developed by Jouvelot and Gifford [18] and given a full formal treatment by Talpin and Jouvelot [40], extend a program’s type judgment with an explicit account of the side effects an expression may produce, so that a compiler or static checker can reason about those effects instead of leaving them implicit in execution.  The recoverability algorithm this study contributes (Chapter 3, Section 2.1(a)–(c)) is an instance of this discipline applied to a domain neither tradition has targeted: a generated shell command is treated as an expression whose effect — on the filesystem, rather than on a type system’s abstract state — is derived from its syntax and composed across its operators, and it is that effect set, not the command’s name, that the recoverability verdict is computed over.  This connects the algorithm to an established formal lineage rather than presenting it as a bespoke heuristic, and it grounds the algorithm’s one-sided soundness property — over-approximating destructiveness under uncertainty rather than under-approximating it — in the same requirement abstract interpretation itself imposes: a sound abstraction may lose precision, but it may never assert a property the concrete execution does not actually have.</w:t>
       </w:r>
     </w:p>
     <w:p>
@@ -2635,7 +2655,7 @@
         <w:t xml:space="preserve"> </w:t>
       </w:r>
       <w:r>
-        <w:t xml:space="preserve">— Input, Reasoning, Action, and Operating-System Integration — as its framework for the interface literature.  The framework is adapted from the layered decomposition of large language model (LLM)-brained graphical user interface (GUI) agents proposed in the survey of Zhang and colleagues [44], generalized here from graphical agents specifically to language-mediated computing interfaces as a class.  Figure 2.1 depicts the pipeline and situates the layers relative to one another.</w:t>
+        <w:t xml:space="preserve">— Input, Reasoning, Action, and Operating-System Integration — as its framework for the interface literature.  The framework is adapted from the layered decomposition of large language model (LLM)-brained graphical user interface (GUI) agents proposed in the survey of Zhang and colleagues [49], generalized here from graphical agents specifically to language-mediated computing interfaces as a class.  Figure 2.1 depicts the pipeline and situates the layers relative to one another.</w:t>
       </w:r>
     </w:p>
     <w:p>
@@ -2652,7 +2672,7 @@
               <a:graphicData uri="http://schemas.openxmlformats.org/drawingml/2006/picture">
                 <pic:pic>
                   <pic:nvPicPr>
-                    <pic:cNvPr descr="/tmp/claude-1000/-home-willard-projects-thesis/cb82e7af-8c35-489a-a7f7-ef49172efea2/scratchpad/docx/work4/fig0.png" id="46" name="Picture"/>
+                    <pic:cNvPr descr="/tmp/claude-1000/-home-willard-projects-thesis/cb82e7af-8c35-489a-a7f7-ef49172efea2/scratchpad/docx/work5/fig0.png" id="46" name="Picture"/>
                     <pic:cNvPicPr>
                       <a:picLocks noChangeArrowheads="1" noChangeAspect="1"/>
                     </pic:cNvPicPr>
@@ -2700,7 +2720,7 @@
         <w:t xml:space="preserve"> </w:t>
       </w:r>
       <w:r>
-        <w:t xml:space="preserve">The four-layer interaction pipeline for language-mediated computing interfaces, adapted from the LLM-brained GUI-agent survey of Zhang and colleagues [44].  A user’s intent enters at the Input layer, is parsed and grounded at the Reasoning layer, executed at the Action layer, and takes effect within a scope defined at the Operating-System Integration layer.</w:t>
+        <w:t xml:space="preserve">The four-layer interaction pipeline for language-mediated computing interfaces, adapted from the LLM-brained GUI-agent survey of Zhang and colleagues [49].  A user’s intent enters at the Input layer, is parsed and grounded at the Reasoning layer, executed at the Action layer, and takes effect within a scope defined at the Operating-System Integration layer.</w:t>
       </w:r>
     </w:p>
     <w:p>
@@ -2830,15 +2850,15 @@
         <w:pStyle w:val="BodyText"/>
       </w:pPr>
       <w:r>
-        <w:t xml:space="preserve">Works were included in this review if they satisfy at least one of six criteria: they analyze or guard shell commands or scripts, or reason statically about a program’s effects; they translate natural language into executable system actions; they operate graphical, web, or mobile interfaces through LLM-based reasoning; they address speech- or accessibility-driven interaction with computing systems; they provide an evaluation environment for such systems; or they report a controlled empirical comparison between a language-mediated interface and a conventional graphical one.  The sixth criterion is stated explicitly because the fourth gap this chapter identifies concerns the scarcity of exactly such comparisons: a corpus admitting only the first five criteria could not contain a comparative interface study by construction, and an absence argument drawn from it would be circular rather than evidential.  Works concerned solely with model architecture or training, without a computing-interaction target, and general-purpose conversational systems without a system-control capability, were excluded as outside the scope of this study.</w:t>
-      </w:r>
-    </w:p>
-    <w:p>
-      <w:pPr>
-        <w:pStyle w:val="BodyText"/>
-      </w:pPr>
-      <w:r>
-        <w:t xml:space="preserve">Candidate works were identified through language-model-assisted search across arXiv, the ACM Digital Library, IEEE Xplore, and the ACL Anthology, extended by backward and forward citation chaining from each work that met the criteria above.  This review is therefore a narrative review rather than a systematic one, and the search is not claimed to be exhaustive.  Because assisted search can surface plausible but non-existent references, and can attribute to a source a claim that source does not make, every work cited in this chapter was subsequently verified by hand against its primary record — author list, venue, and year — and, where a specific claim is attributed to a work, against the presence of that claim in the work’s own text.  That verification pass corrected errors of both attribution and currency introduced by the initial search, and it is reported here because the reliability of this chapter rests on it rather than on the discovery method.  The limitation this leaves is one of recall rather than accuracy: assisted search favors well-indexed and heavily cited work, so the corpus may under-represent less visible literature.  The absence claims in §2.9 are accordingly scoped to the surveyed corpus and stated as such, rather than as claims about the literature as a whole.  The chapter first sets out the theoretical frameworks (§2.2), then proceeds thematically — historical foundations (§2.3), natural-language-to-shell translation (§2.4), command safety and static analysis of shell commands, the literature closest to the study’s algorithm (§2.5), graphical and computer-using agents (§2.6), accessibility and speech-driven interaction (§2.7), and evaluation environments (§2.8) — before synthesizing the surveyed works into a statement of the research gap and a comparative analysis (§2.9).  It closes with a review of the methodological literature that informs the validation study (§2.10) and a summary that motivates the methodology detailed in Chapter 3 (§2.11).</w:t>
+        <w:t xml:space="preserve">Works were included in this review if they satisfy at least one of six criteria: they analyze or guard shell commands or scripts, reason statically about a program’s effects, or restore a system’s state after a change; they translate natural language into executable system actions; they operate graphical, web, or mobile interfaces through LLM-based reasoning; they address speech- or accessibility-driven interaction with computing systems; they provide an evaluation environment for such systems; or they report a controlled empirical comparison between a language-mediated interface and a conventional graphical one.  The sixth criterion is stated explicitly because the fourth gap this chapter identifies concerns the scarcity of exactly such comparisons: a corpus admitting only the first five criteria could not contain a comparative interface study by construction, and an absence argument drawn from it would be circular rather than evidential.  Works concerned solely with model architecture or training, without a computing-interaction target, and general-purpose conversational systems without a system-control capability, were excluded as outside the scope of this study.</w:t>
+      </w:r>
+    </w:p>
+    <w:p>
+      <w:pPr>
+        <w:pStyle w:val="BodyText"/>
+      </w:pPr>
+      <w:r>
+        <w:t xml:space="preserve">Candidate works were identified through language-model-assisted search across arXiv, the ACM Digital Library, IEEE Xplore, and the ACL Anthology, extended by backward and forward citation chaining from each work that met the criteria above.  This review is therefore a narrative review rather than a systematic one, and the search is not claimed to be exhaustive.  Because assisted search can surface plausible but non-existent references, and can attribute to a source a claim that source does not make, every work cited in this chapter was subsequently verified by hand against its primary record — author list, venue, and year — and, where a specific claim is attributed to a work, against the presence of that claim in the work’s own text.  That verification pass corrected errors of both attribution and currency introduced by the initial search, and it is reported here because the reliability of this chapter rests on it rather than on the discovery method.  The limitation this leaves is one of recall rather than accuracy: assisted search favors well-indexed and heavily cited work, so the corpus may under-represent less visible literature.  The absence claims in §2.9 are accordingly scoped to the surveyed corpus and stated as such, rather than as claims about the literature as a whole.  The chapter first sets out the theoretical frameworks (§2.2), then proceeds thematically — historical foundations (§2.3), natural-language-to-shell translation (§2.4), command safety, static analysis of shell commands, and recovery mechanisms, the literature closest to the study’s algorithm (§2.5), graphical and computer-using agents (§2.6), accessibility and speech-driven interaction (§2.7), and evaluation environments (§2.8) — before synthesizing the surveyed works into a statement of the research gap and a comparative analysis (§2.9).  It closes with a review of the methodological literature that informs the validation study (§2.10) and a summary that motivates the methodology detailed in Chapter 3 (§2.11).</w:t>
       </w:r>
     </w:p>
     <w:bookmarkEnd w:id="47"/>
@@ -2857,15 +2877,15 @@
         <w:pStyle w:val="FirstParagraph"/>
       </w:pPr>
       <w:r>
-        <w:t xml:space="preserve">The aspiration to let users describe what they want in ordinary language and have a computer carry it out is not new.  The earliest serious system in this tradition, the Berkeley Unix Consultant of Wilensky and colleagues [40], was already operational by the late 1980s.  The Unix Consultant was an intelligent natural-language interface that allowed naive users to learn about the Unix operating system through conversation in ordinary English, addressing both the natural-language-frontend problem and the consultation problem, and thereby distinguishing itself from systems intended only as command translators.  It was built on the KODIAK knowledge representation and incorporated a user-modeling component that represented the user’s knowledge state and a teaching component through which users could extend its knowledge base in natural language.  The system demonstrated end-to-end natural-language consultation about Unix, successfully answering "how do I," definitional, and problem-solving questions.  Critically, its authors identified knowledge acquisition as the principal bottleneck: extending the system to a new domain required substantial hand-engineering — a concern that directly foreshadows the contemporary problem of LLM-based agents requiring per-application grounding data.</w:t>
-      </w:r>
-    </w:p>
-    <w:p>
-      <w:pPr>
-        <w:pStyle w:val="BodyText"/>
-      </w:pPr>
-      <w:r>
-        <w:t xml:space="preserve">The intervening decades saw natural-language interaction treated primarily as a supervised-learning problem.  Representative of this pre-LLM era, the work of Li and colleagues on mapping natural-language instructions to mobile user-interface action sequences [18] trained dedicated phrase-extraction and grounding transformers on hand-annotated action sequences, achieving 70.59% accuracy on predicting complete ground-truth action sequences on its benchmark but remaining bound to its purpose-built datasets and architectures.  The decisive shift came with the introduction of in-context reasoning patterns for LLMs.  ReAct, introduced by Yao and colleagues [42], collapsed the multi-stage supervised pipeline into a prompting strategy: the language model is prompted to alternate between free-text "Thought" steps that update its plan and "Action" steps that interact with an external environment, with observations fed back into subsequent reasoning.  Implemented purely as a prompting strategy without fine-tuning, ReAct nonetheless outperformed imitation-learning and reinforcement-learning baselines that required thousands of training trajectories.</w:t>
+        <w:t xml:space="preserve">The aspiration to let users describe what they want in ordinary language and have a computer carry it out is not new.  The earliest serious system in this tradition, the Berkeley Unix Consultant of Wilensky and colleagues [45], was already operational by the late 1980s.  The Unix Consultant was an intelligent natural-language interface that allowed naive users to learn about the Unix operating system through conversation in ordinary English, addressing both the natural-language-frontend problem and the consultation problem, and thereby distinguishing itself from systems intended only as command translators.  It was built on the KODIAK knowledge representation and incorporated a user-modeling component that represented the user’s knowledge state and a teaching component through which users could extend its knowledge base in natural language.  The system demonstrated end-to-end natural-language consultation about Unix, successfully answering "how do I," definitional, and problem-solving questions.  Critically, its authors identified knowledge acquisition as the principal bottleneck: extending the system to a new domain required substantial hand-engineering — a concern that directly foreshadows the contemporary problem of LLM-based agents requiring per-application grounding data.</w:t>
+      </w:r>
+    </w:p>
+    <w:p>
+      <w:pPr>
+        <w:pStyle w:val="BodyText"/>
+      </w:pPr>
+      <w:r>
+        <w:t xml:space="preserve">The intervening decades saw natural-language interaction treated primarily as a supervised-learning problem.  Representative of this pre-LLM era, the work of Li and colleagues on mapping natural-language instructions to mobile user-interface action sequences [20] trained dedicated phrase-extraction and grounding transformers on hand-annotated action sequences, achieving 70.59% accuracy on predicting complete ground-truth action sequences on its benchmark but remaining bound to its purpose-built datasets and architectures.  The decisive shift came with the introduction of in-context reasoning patterns for LLMs.  ReAct, introduced by Yao and colleagues [47], collapsed the multi-stage supervised pipeline into a prompting strategy: the language model is prompted to alternate between free-text "Thought" steps that update its plan and "Action" steps that interact with an external environment, with observations fed back into subsequent reasoning.  Implemented purely as a prompting strategy without fine-tuning, ReAct nonetheless outperformed imitation-learning and reinforcement-learning baselines that required thousands of training trajectories.</w:t>
       </w:r>
     </w:p>
     <w:p>
@@ -2890,15 +2910,15 @@
         <w:pStyle w:val="FirstParagraph"/>
       </w:pPr>
       <w:r>
-        <w:t xml:space="preserve">The aspiration to a natural-language interface has a long-standing critique that remains unanswered, and a review that omitted it would misrepresent the state of the question.  Shneiderman’s account of direct manipulation [32] holds that interfaces succeed when the objects of interest are continuously visible, when actions upon them are rapid, incremental, and reversible, and when their effects are immediately apparent — properties that let a user build and maintain an accurate model of system state.  Norman formalized what an interface does for a user as the bridging of two gulfs [26]: the gulf of execution, between an intention and the actions a system makes available, and the gulf of evaluation, between the system’s response and the user’s ability to interpret it.  Hutchins, Hollan, and Norman [14] argued that direct manipulation narrows both, by making an interface feel like the object of interest itself rather than a description of it.</w:t>
-      </w:r>
-    </w:p>
-    <w:p>
-      <w:pPr>
-        <w:pStyle w:val="BodyText"/>
-      </w:pPr>
-      <w:r>
-        <w:t xml:space="preserve">A language interface sits awkwardly against nearly every one of those properties.  An utterance is not continuously visible, not incremental, and not reversible by the same gesture that produced it; the set of available actions is not displayed, so the user must guess at the system’s capabilities rather than see them.  Shneiderman and Maes debated precisely this trade-off between direct manipulation and interface agents [34], and Shneiderman argued subsequently that speech and language interaction consume the same cognitive resources a user needs in order to hold a task in mind, where pointing does not [33].  Empirical work on modern conversational agents has largely borne the concern out: Luger and Sellen documented a persistent gulf between what users expected a conversational agent to understand and what it actually did [22], and Clark and colleagues found that the properties people value in human conversation transfer poorly to interaction with an agent [4].</w:t>
+        <w:t xml:space="preserve">The aspiration to a natural-language interface has a long-standing critique that remains unanswered, and a review that omitted it would misrepresent the state of the question.  Shneiderman’s account of direct manipulation [37] holds that interfaces succeed when the objects of interest are continuously visible, when actions upon them are rapid, incremental, and reversible, and when their effects are immediately apparent — properties that let a user build and maintain an accurate model of system state.  Norman formalized what an interface does for a user as the bridging of two gulfs [28]: the gulf of execution, between an intention and the actions a system makes available, and the gulf of evaluation, between the system’s response and the user’s ability to interpret it.  Hutchins, Hollan, and Norman [16] argued that direct manipulation narrows both, by making an interface feel like the object of interest itself rather than a description of it.</w:t>
+      </w:r>
+    </w:p>
+    <w:p>
+      <w:pPr>
+        <w:pStyle w:val="BodyText"/>
+      </w:pPr>
+      <w:r>
+        <w:t xml:space="preserve">A language interface sits awkwardly against nearly every one of those properties.  An utterance is not continuously visible, not incremental, and not reversible by the same gesture that produced it; the set of available actions is not displayed, so the user must guess at the system’s capabilities rather than see them.  Shneiderman and Maes debated precisely this trade-off between direct manipulation and interface agents [39], and Shneiderman argued subsequently that speech and language interaction consume the same cognitive resources a user needs in order to hold a task in mind, where pointing does not [38].  Empirical work on modern conversational agents has largely borne the concern out: Luger and Sellen documented a persistent gulf between what users expected a conversational agent to understand and what it actually did [24], and Clark and colleagues found that the properties people value in human conversation transfer poorly to interaction with an agent [5].</w:t>
       </w:r>
     </w:p>
     <w:p>
@@ -2914,7 +2934,7 @@
         <w:pStyle w:val="BodyText"/>
       </w:pPr>
       <w:r>
-        <w:t xml:space="preserve">The comparative question is older than the current literature and considerably less settled than it is often assumed to be.  It is widely held that the command line’s power is inaccessible to most people in practice.  But the best-known controlled comparison of command, menu, and iconic interfaces, conducted by Whiteside and colleagues across seventy-six users and seven systems [39], concluded that interface style itself did not predict either performance or preference: careful design did, and the system that served novices best also served experts best.  That finding is as much a caution for the present study as a motivation for it.  It warns against attributing to a conversational paradigm what may in fact belong to the quality of one particular implementation, and it is a principal reason this study measures a specific system against a specific baseline rather than claiming to measure one paradigm against another.</w:t>
+        <w:t xml:space="preserve">The comparative question is older than the current literature and considerably less settled than it is often assumed to be.  It is widely held that the command line’s power is inaccessible to most people in practice.  But the best-known controlled comparison of command, menu, and iconic interfaces, conducted by Whiteside and colleagues across seventy-six users and seven systems [44], concluded that interface style itself did not predict either performance or preference: careful design did, and the system that served novices best also served experts best.  That finding is as much a caution for the present study as a motivation for it.  It warns against attributing to a conversational paradigm what may in fact belong to the quality of one particular implementation, and it is a principal reason this study measures a specific system against a specific baseline rather than claiming to measure one paradigm against another.</w:t>
       </w:r>
     </w:p>
     <w:bookmarkEnd w:id="49"/>
@@ -2941,25 +2961,25 @@
         <w:pStyle w:val="BodyText"/>
       </w:pPr>
       <w:r>
-        <w:t xml:space="preserve">Westenfelder and colleagues [38] address this translation problem directly.  Their work constructs a manually verified test set of 600 instruction–command pairs and a training set of 40,939 pairs, and introduces a functional-equivalence heuristic that reaches 95% confidence in determining whether two Bash commands produce the same effect — allowing automated evaluation to move beyond exact-string matching to a measure of whether a generated command actually accomplishes the intended task.  Their fine-tuned models substantially outperform zero-shot baselines, demonstrating that fine-tuning specifically on command-translation data is effective.  The authors identify two persistent limitations: ambiguity in user instructions, and the absence of system context — the contents of the current directory, the user’s command history, and environment variables — at translation time.  Integrating context-aware retrieval is identified as a direction, one that the persistent conversational session of SynapseOS is well positioned to supply.</w:t>
-      </w:r>
-    </w:p>
-    <w:p>
-      <w:pPr>
-        <w:pStyle w:val="BodyText"/>
-      </w:pPr>
-      <w:r>
-        <w:t xml:space="preserve">The feasibility of deploying such a system without reliance on a hosted frontier model is supported by the large-scale evaluation of Jacobs and colleagues [15], who assess a broad range of locally deployable open-source LLMs on Bash command generation.  Their work provides an empirical anchor for the viability of running natural-language-to-Bash translation on local, open-weights models of modest size — the deployment posture adopted by SynapseOS for reasons of privacy and offline operation.  Taken together, the shell-and-command-line thread establishes that natural-language-to-Bash translation is tractable, that safety and reversibility are central rather than incidental concerns, and that local deployment is feasible; yet no surveyed shell-level system has been evaluated with users against the conventional workflow it would supplement.  How such systems guard the commands they generate, and what static analysis of shell commands can establish, are taken up in §2.5.</w:t>
+        <w:t xml:space="preserve">Westenfelder and colleagues [43] address this translation problem directly.  Their work constructs a manually verified test set of 600 instruction–command pairs and a training set of 40,939 pairs, and introduces a functional-equivalence heuristic that reaches 95% confidence in determining whether two Bash commands produce the same effect — allowing automated evaluation to move beyond exact-string matching to a measure of whether a generated command actually accomplishes the intended task.  Their fine-tuned models substantially outperform zero-shot baselines, demonstrating that fine-tuning specifically on command-translation data is effective.  The authors identify two persistent limitations: ambiguity in user instructions, and the absence of system context — the contents of the current directory, the user’s command history, and environment variables — at translation time.  Integrating context-aware retrieval is identified as a direction, one that the persistent conversational session of SynapseOS is well positioned to supply.</w:t>
+      </w:r>
+    </w:p>
+    <w:p>
+      <w:pPr>
+        <w:pStyle w:val="BodyText"/>
+      </w:pPr>
+      <w:r>
+        <w:t xml:space="preserve">The feasibility of deploying such a system without reliance on a hosted frontier model is supported by the large-scale evaluation of Jacobs and colleagues [17], who assess a broad range of locally deployable open-source LLMs on Bash command generation.  Their work provides an empirical anchor for the viability of running natural-language-to-Bash translation on local, open-weights models of modest size — the deployment posture adopted by SynapseOS for reasons of privacy and offline operation.  Taken together, the shell-and-command-line thread establishes that natural-language-to-Bash translation is tractable, that safety and reversibility are central rather than incidental concerns, and that local deployment is feasible; yet no surveyed shell-level system has been evaluated with users against the conventional workflow it would supplement.  How such systems guard the commands they generate, and what static analysis of shell commands can establish, are taken up in §2.5.</w:t>
       </w:r>
     </w:p>
     <w:bookmarkEnd w:id="51"/>
-    <w:bookmarkStart w:id="52" w:name="sec2-5-safety"/>
+    <w:bookmarkStart w:id="55" w:name="sec2-5-safety"/>
     <w:p>
       <w:pPr>
         <w:pStyle w:val="Heading2"/>
       </w:pPr>
       <w:r>
-        <w:t xml:space="preserve">2.5 Command Safety and Static Analysis of Shell Commands</w:t>
+        <w:t xml:space="preserve">2.5 Command Safety, Static Analysis, and Recovery</w:t>
       </w:r>
     </w:p>
     <w:p>
@@ -2967,7 +2987,7 @@
         <w:pStyle w:val="FirstParagraph"/>
       </w:pPr>
       <w:r>
-        <w:t xml:space="preserve">The literature closest to the study’s algorithm concerns how shell commands are checked before they run.  It falls into two groups:</w:t>
+        <w:t xml:space="preserve">The literature closest to the study’s algorithm concerns how shell commands are checked before they run.  It falls into three groups:</w:t>
       </w:r>
       <w:r>
         <w:t xml:space="preserve"> </w:t>
@@ -2980,7 +3000,7 @@
         <w:t xml:space="preserve">guards</w:t>
       </w:r>
       <w:r>
-        <w:t xml:space="preserve">, which decide whether a generated command may run, and</w:t>
+        <w:t xml:space="preserve">, which decide whether a generated command may run;</w:t>
       </w:r>
       <w:r>
         <w:t xml:space="preserve"> </w:t>
@@ -2993,31 +3013,7 @@
         <w:t xml:space="preserve">analyses</w:t>
       </w:r>
       <w:r>
-        <w:t xml:space="preserve">, which reason about what a shell program does.  Each establishes part of what the study needs, and neither, as this section shows, determines whether a command’s effects can be undone.</w:t>
-      </w:r>
-    </w:p>
-    <w:p>
-      <w:pPr>
-        <w:pStyle w:val="BodyText"/>
-      </w:pPr>
-      <w:r>
-        <w:t xml:space="preserve">Where translation accuracy is the concern of Westenfelder and colleagues (§2.4), safety is the concern of Gyawali and colleagues, whose NaSh system [9] proposes guardrails for an LLM-powered natural-language shell for Linux.  Published under the operating-systems classification, NaSh interposes a guardrail layer between the user’s natural-language input and the LLM-generated command: the model proposes a candidate command, the guardrail layer evaluates it against safety, reversibility, and confirmation criteria, and the user receives a structured preview before execution.  The authors note that LLM outputs may be unintended or unexplainable, requiring guardrails for user error recovery, and they leave as open work both the design of recovery and rollback mechanisms for irreversible system operations and the empirical user evaluation of the approach.  The first of these open problems, recovery from an operation already approved, is the one the present study’s recoverability analysis addresses; the second is taken up by its validation in use.</w:t>
-      </w:r>
-    </w:p>
-    <w:p>
-      <w:pPr>
-        <w:pStyle w:val="BodyText"/>
-      </w:pPr>
-      <w:r>
-        <w:t xml:space="preserve">The same design is what ships.  Coding agents that execute generated commands guard them with lists of command patterns: the dangerous-command check of OpenAI’s Codex CLI [27] and cc-safety-net [17], a pre-execution guard used with several agentic coding tools, are representative open-source examples, and both are scored as baselines in Chapter 3, Section 3.1(a).  Both are designed for agents working inside a version-controlled project, where deleting project files is routine and version control, rather than the guard, is what makes a mistake recoverable.  A personal computer’s files have no such safeguard, which is the setting of this study.</w:t>
-      </w:r>
-    </w:p>
-    <w:p>
-      <w:pPr>
-        <w:pStyle w:val="BodyText"/>
-      </w:pPr>
-      <w:r>
-        <w:t xml:space="preserve">The gap these guards share is the one this study’s algorithmic contribution addresses.  Every surveyed system that guards a generated command does so by</w:t>
+        <w:t xml:space="preserve">, which reason about what a shell program does; and</w:t>
       </w:r>
       <w:r>
         <w:t xml:space="preserve"> </w:t>
@@ -3027,38 +3023,43 @@
           <w:i/>
           <w:iCs/>
         </w:rPr>
-        <w:t xml:space="preserve">permission</w:t>
-      </w:r>
-      <w:r>
-        <w:t xml:space="preserve">: the command is matched against an enumerated set of patterns judged dangerous, and is then allowed, refused, or escalated to the user.  NaSh [9] proposes guardrails of this kind and, notably, identifies selective undo as a requirement while leaving its mechanism open; the shipped guards above operate the same way in practice, with allow-and-deny lists over command prefixes.  A permission model answers whether a command may run.  It does not answer whether, having run, the command can be undone — and those are different questions with different answers.  Refusing a command protects a user only until they approve it, which for any system that must let work proceed is most of the time.</w:t>
-      </w:r>
-    </w:p>
-    <w:p>
-      <w:pPr>
-        <w:pStyle w:val="BodyText"/>
-      </w:pPr>
-      <w:r>
-        <w:t xml:space="preserve">The distinction matters because enumeration does not compose.  A pattern list matches a command in isolation, whereas a generated line routinely chains several operations whose recovery requirements differ — a removal, a version-control reset, and an in-place edit may appear in one invocation joined by</w:t>
-      </w:r>
-      <w:r>
-        <w:t xml:space="preserve"> </w:t>
-      </w:r>
-      <w:r>
-        <w:rPr>
-          <w:rStyle w:val="VerbatimChar"/>
-        </w:rPr>
-        <w:t xml:space="preserve">&amp;&amp;</w:t>
-      </w:r>
-      <w:r>
-        <w:t xml:space="preserve">, with redirects and command substitution altering what each actually touches.  No enumeration of command prefixes expresses that, and extending the list does not converge: each newly named tool leaves the next one unnamed.  Determining recoverability over a composed command, and computing the minimal information needed to reverse it, is the open problem this study takes up (RQ1–RQ3), and it is what separates the present work from the guardrail designs surveyed above.  The comparison that matters is not only against an enumerated list of dangerous commands.  A list can be turned around so that it refuses every command it does not recognize, which removes the first weakness above at the cost of asking about everything unfamiliar; that fail-closed list is the strongest simple baseline, and the study therefore claims what the analysis adds to it — seeing through wrappers, resolving run-time targets, and capturing exactly what would be lost — and not the verdict alone.</w:t>
-      </w:r>
-    </w:p>
-    <w:p>
-      <w:pPr>
-        <w:pStyle w:val="BodyText"/>
-      </w:pPr>
-      <w:r>
-        <w:t xml:space="preserve">Static analysis of shell scripts specifically is comparatively little studied, and the existing work targets properties adjacent to recoverability rather than recoverability itself.  ABash [23] performs abstract interpretation over bash’s variable-expansion semantics to catch common expansion bugs and includes taint tracking, but is not concerned with what a script’s commands would do to the filesystem if executed correctly.  Smoosh [8] gives the POSIX shell a mechanized, executable small-step operational semantics, validated against other shells' conformance test suites — exactly the kind of ground-truth semantics a static effect analysis would need to be checked against — but stops at defining that semantics rather than analyzing programs written in it.  Closest of the three is CoLiS [1], which applies symbolic execution to the more than twenty-seven thousand POSIX-shell maintainer scripts in the Debian package archive to verify</w:t>
+        <w:t xml:space="preserve">recovery mechanisms</w:t>
+      </w:r>
+      <w:r>
+        <w:t xml:space="preserve">, which restore a system after the fact.  Each establishes part of what the study needs, and none, as this section shows, determines before a command runs whether its effects can be undone and captures exactly what undoing them requires.</w:t>
+      </w:r>
+    </w:p>
+    <w:bookmarkStart w:id="52" w:name="guards"/>
+    <w:p>
+      <w:pPr>
+        <w:pStyle w:val="Heading3"/>
+      </w:pPr>
+      <w:r>
+        <w:t xml:space="preserve">Guards</w:t>
+      </w:r>
+    </w:p>
+    <w:p>
+      <w:pPr>
+        <w:pStyle w:val="FirstParagraph"/>
+      </w:pPr>
+      <w:r>
+        <w:t xml:space="preserve">Where translation accuracy is the concern of Westenfelder and colleagues (§2.4), safety is the concern of Gyawali and colleagues, whose NaSh system [11] proposes guardrails for an LLM-powered natural-language shell for Linux.  Published under the operating-systems classification, NaSh interposes a guardrail layer between the user’s natural-language input and the LLM-generated command: the model proposes a candidate command, the guardrail layer evaluates it against safety, reversibility, and confirmation criteria, and the user receives a structured preview before execution.  The authors note that LLM outputs may be unintended or unexplainable, requiring guardrails for user error recovery, and they leave as open work both the design of recovery and rollback mechanisms for irreversible system operations and the empirical user evaluation of the approach.  The first of these open problems, recovery from an operation already approved, is the one the present study’s recoverability analysis addresses; the second is taken up by its validation in use.</w:t>
+      </w:r>
+    </w:p>
+    <w:p>
+      <w:pPr>
+        <w:pStyle w:val="BodyText"/>
+      </w:pPr>
+      <w:r>
+        <w:t xml:space="preserve">The same design is what ships.  Coding agents that execute generated commands guard them with lists of command patterns: the dangerous-command check of OpenAI’s Codex CLI [29] and cc-safety-net [19], a pre-execution guard used with several agentic coding tools, are representative open-source examples, and both are scored as baselines in Chapter 3, Section 3.1(a).  Both are designed for agents working inside a version-controlled project, where deleting project files is routine and version control, rather than the guard, is what makes a mistake recoverable.  A personal computer’s files have no such safeguard, which is the setting of this study.</w:t>
+      </w:r>
+    </w:p>
+    <w:p>
+      <w:pPr>
+        <w:pStyle w:val="BodyText"/>
+      </w:pPr>
+      <w:r>
+        <w:t xml:space="preserve">The gap these guards share is the one this study’s algorithmic contribution addresses.  Every surveyed system that guards a generated command does so by</w:t>
       </w:r>
       <w:r>
         <w:t xml:space="preserve"> </w:t>
@@ -3068,13 +3069,48 @@
           <w:i/>
           <w:iCs/>
         </w:rPr>
-        <w:t xml:space="preserve">idempotence</w:t>
-      </w:r>
-      <w:r>
-        <w:t xml:space="preserve"> </w:t>
-      </w:r>
-      <w:r>
-        <w:t xml:space="preserve">— that running a script a second time causes no further harm — a property Debian policy requires of these scripts because they run with root privileges during install, upgrade, and removal.  Idempotence and recoverability are related but distinct: a script can be idempotent while still being destructive on its first run —</w:t>
+        <w:t xml:space="preserve">permission</w:t>
+      </w:r>
+      <w:r>
+        <w:t xml:space="preserve">: the command is matched against an enumerated set of patterns judged dangerous, and is then allowed, refused, or escalated to the user.  NaSh [11] proposes guardrails of this kind and, notably, identifies selective undo as a requirement while leaving its mechanism open; the shipped guards above operate the same way in practice, with allow-and-deny lists over command prefixes.  A permission model answers whether a command may run.  It does not answer whether, having run, the command can be undone — and those are different questions with different answers.  Refusing a command protects a user only until they approve it, which for any system that must let work proceed is most of the time.</w:t>
+      </w:r>
+    </w:p>
+    <w:p>
+      <w:pPr>
+        <w:pStyle w:val="BodyText"/>
+      </w:pPr>
+      <w:r>
+        <w:t xml:space="preserve">The distinction matters because enumeration does not compose.  A pattern list matches a command in isolation, whereas a generated line routinely chains several operations whose recovery requirements differ — a removal, a version-control reset, and an in-place edit may appear in one invocation joined by</w:t>
+      </w:r>
+      <w:r>
+        <w:t xml:space="preserve"> </w:t>
+      </w:r>
+      <w:r>
+        <w:rPr>
+          <w:rStyle w:val="VerbatimChar"/>
+        </w:rPr>
+        <w:t xml:space="preserve">&amp;&amp;</w:t>
+      </w:r>
+      <w:r>
+        <w:t xml:space="preserve">, with redirects and command substitution altering what each actually touches.  No enumeration of command prefixes expresses that, and extending the list does not converge: each newly named tool leaves the next one unnamed.  Determining recoverability over a composed command, and computing the minimal information needed to reverse it, is the open problem this study takes up (RQ1–RQ3), and it is what separates the present work from the guardrail designs surveyed above.  The comparison that matters is not only against an enumerated list of dangerous commands.  A list can be turned around so that it refuses every command it does not recognize, which removes the first weakness above at the cost of asking about everything unfamiliar; that fail-closed list is the strongest simple baseline, and the study therefore claims what the analysis adds to it — seeing through wrappers, resolving run-time targets, and capturing exactly what would be lost — and not the verdict alone.</w:t>
+      </w:r>
+    </w:p>
+    <w:bookmarkEnd w:id="52"/>
+    <w:bookmarkStart w:id="53" w:name="static-analysis-of-shell-programs"/>
+    <w:p>
+      <w:pPr>
+        <w:pStyle w:val="Heading3"/>
+      </w:pPr>
+      <w:r>
+        <w:t xml:space="preserve">Static analysis of shell programs</w:t>
+      </w:r>
+    </w:p>
+    <w:p>
+      <w:pPr>
+        <w:pStyle w:val="FirstParagraph"/>
+      </w:pPr>
+      <w:r>
+        <w:t xml:space="preserve">Static analysis of shell scripts specifically is comparatively little studied, and the existing work targets properties adjacent to recoverability rather than recoverability itself.  ABash [25] performs abstract interpretation over bash’s variable-expansion semantics to catch common expansion bugs and includes taint tracking, but is not concerned with what a script’s commands would do to the filesystem if executed correctly.  Smoosh [10] gives the POSIX shell a mechanized, executable small-step operational semantics, validated against other shells' conformance test suites — exactly the kind of ground-truth semantics a static effect analysis would need to be checked against — but stops at defining that semantics rather than analyzing programs written in it.  Closest of the three is CoLiS [1], which applies symbolic execution to the more than twenty-seven thousand POSIX-shell maintainer scripts in the Debian package archive to verify</w:t>
       </w:r>
       <w:r>
         <w:t xml:space="preserve"> </w:t>
@@ -3084,6 +3120,22 @@
           <w:i/>
           <w:iCs/>
         </w:rPr>
+        <w:t xml:space="preserve">idempotence</w:t>
+      </w:r>
+      <w:r>
+        <w:t xml:space="preserve"> </w:t>
+      </w:r>
+      <w:r>
+        <w:t xml:space="preserve">— that running a script a second time causes no further harm — a property Debian policy requires of these scripts because they run with root privileges during install, upgrade, and removal.  Idempotence and recoverability are related but distinct: a script can be idempotent while still being destructive on its first run —</w:t>
+      </w:r>
+      <w:r>
+        <w:t xml:space="preserve"> </w:t>
+      </w:r>
+      <w:r>
+        <w:rPr>
+          <w:i/>
+          <w:iCs/>
+        </w:rPr>
         <w:t xml:space="preserve">rm -rf /var/cache/pkg</w:t>
       </w:r>
       <w:r>
@@ -3093,8 +3145,523 @@
         <w:t xml:space="preserve">is idempotent, since running it twice does no more damage than once, and unrecoverable, since the first run already destroyed what a recovery would need — and a command can be recoverable without being idempotent, if each run produces a new, independently-reversible effect.  CoLiS is therefore the nearest prior application of static effect reasoning to shell scripts specifically, and it stops short of the present study’s question for exactly this reason: verifying that re-execution is safe does not determine whether the first execution can be undone.  No work identified in this review derives a recoverability verdict for a shell command from its statically-computed effects; that is the specific gap the present study’s algorithmic contribution fills.</w:t>
       </w:r>
     </w:p>
-    <w:bookmarkEnd w:id="52"/>
-    <w:bookmarkStart w:id="58" w:name="sec2-5"/>
+    <w:bookmarkEnd w:id="53"/>
+    <w:bookmarkStart w:id="54" w:name="recovery-after-the-fact"/>
+    <w:p>
+      <w:pPr>
+        <w:pStyle w:val="Heading3"/>
+      </w:pPr>
+      <w:r>
+        <w:t xml:space="preserve">Recovery after the fact</w:t>
+      </w:r>
+    </w:p>
+    <w:p>
+      <w:pPr>
+        <w:pStyle w:val="FirstParagraph"/>
+      </w:pPr>
+      <w:r>
+        <w:t xml:space="preserve">Guards and analyses act before a command runs.  A separate literature restores a system after something has gone wrong, and it approaches the study’s question from the other side: not what a command will destroy, but how to recover what was destroyed.  Three kinds of mechanism are relevant.</w:t>
+      </w:r>
+    </w:p>
+    <w:p>
+      <w:pPr>
+        <w:pStyle w:val="BodyText"/>
+      </w:pPr>
+      <w:r>
+        <w:t xml:space="preserve">Filesystem snapshots are the most widely deployed.  A copy-on-write filesystem such as btrfs can snapshot a whole subvolume at little cost, because a snapshot shares its blocks with the live filesystem until they are modified [34], so snapshots can be taken on a schedule or before system updates.  A snapshot needs no knowledge of the command it protects against, which is both its strength and its limit.  Restoring one returns the whole subvolume to an earlier moment and discards every later change along with the unwanted one, and nothing about a snapshot can tell the user, before a command runs, whether that command will lose anything.  On a filesystem without copy-on-write, such as the ext4 on which this study is conducted, a snapshot must visit every file in the tree, a cost measured in Chapter 3, Section 3.1(a).  Versioning file systems instead keep old versions of individual files: the Elephant file system retains versions under per-file policies that decide when an old version may be forgotten [35].  Recovery is then per file and needs no foresight, but its storage cost is paid on every change, mistaken or not, and obtaining it means replacing the filesystem.</w:t>
+      </w:r>
+    </w:p>
+    <w:p>
+      <w:pPr>
+        <w:pStyle w:val="BodyText"/>
+      </w:pPr>
+      <w:r>
+        <w:t xml:space="preserve">Undo at the level of a service or the operating system makes recovery a property of the system’s design.  Operator Undo intercepts and logs the user interactions with an e-mail service before they reach it, so that an operator can rewind the service’s state, repair it, and replay what users did since [4].  Operating system transactions let a program group system calls so that their effects can be rolled back as a unit before they commit [32].  Intrusion recovery systems such as Taser log system activity so that the effects of an attack can be identified and reverted afterward while legitimate changes are kept [9].  Each restores more completely than any list can, but each requires something the setting of this study does not have: a service built to be undoable, a kernel and programs that use transactions, or continuous logging of all system activity.</w:t>
+      </w:r>
+    </w:p>
+    <w:p>
+      <w:pPr>
+        <w:pStyle w:val="BodyText"/>
+      </w:pPr>
+      <w:r>
+        <w:t xml:space="preserve">The present study takes a narrower path between these literatures.  Like a guard, it acts on one command before the command runs, on an unmodified system and filesystem.  Like a recovery mechanism, it restores.  It captures only what that one command would destroy, which it determines by analysis, so its cost follows from what the command touches rather than from the size of the system, and it can say before the command runs whether undo will be possible.  Table 2.1 compares the approaches surveyed in this section on these properties.</w:t>
+      </w:r>
+    </w:p>
+    <w:p>
+      <w:pPr>
+        <w:pStyle w:val="BodyText"/>
+      </w:pPr>
+      <w:r>
+        <w:rPr>
+          <w:b/>
+          <w:bCs/>
+        </w:rPr>
+        <w:t xml:space="preserve">Table 2.1.</w:t>
+      </w:r>
+      <w:r>
+        <w:t xml:space="preserve">  Approaches to the safety of shell commands, compared on the properties the study’s algorithm combines.</w:t>
+      </w:r>
+    </w:p>
+    <w:tbl>
+      <w:tblPr>
+        <w:tblStyle w:val="Table"/>
+        <w:tblW w:type="pct" w:w="5000"/>
+        <w:jc w:val="left"/>
+        <w:tblLayout w:type="fixed"/>
+        <w:tblLook w:firstRow="1" w:lastRow="0" w:firstColumn="0" w:lastColumn="0" w:noHBand="0" w:noVBand="0" w:val="0020"/>
+      </w:tblPr>
+      <w:tblGrid>
+        <w:gridCol w:w="2138"/>
+        <w:gridCol w:w="1346"/>
+        <w:gridCol w:w="1346"/>
+        <w:gridCol w:w="1663"/>
+        <w:gridCol w:w="1425"/>
+      </w:tblGrid>
+      <w:tr>
+        <w:trPr>
+          <w:tblHeader w:val="on"/>
+        </w:trPr>
+        <w:tc>
+          <w:tcPr/>
+          <w:p>
+            <w:pPr>
+              <w:pStyle w:val="Compact"/>
+              <w:jc w:val="left"/>
+            </w:pPr>
+            <w:r>
+              <w:t xml:space="preserve">Approach</w:t>
+            </w:r>
+          </w:p>
+        </w:tc>
+        <w:tc>
+          <w:tcPr/>
+          <w:p>
+            <w:pPr>
+              <w:pStyle w:val="Compact"/>
+              <w:jc w:val="left"/>
+            </w:pPr>
+            <w:r>
+              <w:t xml:space="preserve">Acts on</w:t>
+            </w:r>
+          </w:p>
+        </w:tc>
+        <w:tc>
+          <w:tcPr/>
+          <w:p>
+            <w:pPr>
+              <w:pStyle w:val="Compact"/>
+              <w:jc w:val="left"/>
+            </w:pPr>
+            <w:r>
+              <w:t xml:space="preserve">Knows what will change</w:t>
+            </w:r>
+          </w:p>
+        </w:tc>
+        <w:tc>
+          <w:tcPr/>
+          <w:p>
+            <w:pPr>
+              <w:pStyle w:val="Compact"/>
+              <w:jc w:val="left"/>
+            </w:pPr>
+            <w:r>
+              <w:t xml:space="preserve">Composition and run-time targets</w:t>
+            </w:r>
+          </w:p>
+        </w:tc>
+        <w:tc>
+          <w:tcPr/>
+          <w:p>
+            <w:pPr>
+              <w:pStyle w:val="Compact"/>
+              <w:jc w:val="left"/>
+            </w:pPr>
+            <w:r>
+              <w:t xml:space="preserve">Restores what was lost</w:t>
+            </w:r>
+          </w:p>
+        </w:tc>
+      </w:tr>
+      <w:tr>
+        <w:tc>
+          <w:tcPr/>
+          <w:p>
+            <w:pPr>
+              <w:pStyle w:val="Compact"/>
+              <w:jc w:val="left"/>
+            </w:pPr>
+            <w:r>
+              <w:t xml:space="preserve">Pattern-list guards: NaSh, Codex CLI, cc-safety-net [11, 19, 29]</w:t>
+            </w:r>
+          </w:p>
+        </w:tc>
+        <w:tc>
+          <w:tcPr/>
+          <w:p>
+            <w:pPr>
+              <w:pStyle w:val="Compact"/>
+              <w:jc w:val="left"/>
+            </w:pPr>
+            <w:r>
+              <w:t xml:space="preserve">The pending command</w:t>
+            </w:r>
+          </w:p>
+        </w:tc>
+        <w:tc>
+          <w:tcPr/>
+          <w:p>
+            <w:pPr>
+              <w:pStyle w:val="Compact"/>
+              <w:jc w:val="left"/>
+            </w:pPr>
+            <w:r>
+              <w:t xml:space="preserve">No: matches patterns</w:t>
+            </w:r>
+          </w:p>
+        </w:tc>
+        <w:tc>
+          <w:tcPr/>
+          <w:p>
+            <w:pPr>
+              <w:pStyle w:val="Compact"/>
+              <w:jc w:val="left"/>
+            </w:pPr>
+            <w:r>
+              <w:t xml:space="preserve">Partly: some wrappers and nested shells</w:t>
+            </w:r>
+          </w:p>
+        </w:tc>
+        <w:tc>
+          <w:tcPr/>
+          <w:p>
+            <w:pPr>
+              <w:pStyle w:val="Compact"/>
+              <w:jc w:val="left"/>
+            </w:pPr>
+            <w:r>
+              <w:t xml:space="preserve">No</w:t>
+            </w:r>
+          </w:p>
+        </w:tc>
+      </w:tr>
+      <w:tr>
+        <w:tc>
+          <w:tcPr/>
+          <w:p>
+            <w:pPr>
+              <w:pStyle w:val="Compact"/>
+              <w:jc w:val="left"/>
+            </w:pPr>
+            <w:r>
+              <w:t xml:space="preserve">Shell program analyses: ABash, Smoosh, CoLiS [1, 10, 25]</w:t>
+            </w:r>
+          </w:p>
+        </w:tc>
+        <w:tc>
+          <w:tcPr/>
+          <w:p>
+            <w:pPr>
+              <w:pStyle w:val="Compact"/>
+              <w:jc w:val="left"/>
+            </w:pPr>
+            <w:r>
+              <w:t xml:space="preserve">A script’s text</w:t>
+            </w:r>
+          </w:p>
+        </w:tc>
+        <w:tc>
+          <w:tcPr/>
+          <w:p>
+            <w:pPr>
+              <w:pStyle w:val="Compact"/>
+              <w:jc w:val="left"/>
+            </w:pPr>
+            <w:r>
+              <w:t xml:space="preserve">No: other properties</w:t>
+            </w:r>
+          </w:p>
+        </w:tc>
+        <w:tc>
+          <w:tcPr/>
+          <w:p>
+            <w:pPr>
+              <w:pStyle w:val="Compact"/>
+              <w:jc w:val="left"/>
+            </w:pPr>
+            <w:r>
+              <w:t xml:space="preserve">Through their own semantics</w:t>
+            </w:r>
+          </w:p>
+        </w:tc>
+        <w:tc>
+          <w:tcPr/>
+          <w:p>
+            <w:pPr>
+              <w:pStyle w:val="Compact"/>
+              <w:jc w:val="left"/>
+            </w:pPr>
+            <w:r>
+              <w:t xml:space="preserve">No</w:t>
+            </w:r>
+          </w:p>
+        </w:tc>
+      </w:tr>
+      <w:tr>
+        <w:tc>
+          <w:tcPr/>
+          <w:p>
+            <w:pPr>
+              <w:pStyle w:val="Compact"/>
+              <w:jc w:val="left"/>
+            </w:pPr>
+            <w:r>
+              <w:t xml:space="preserve">Filesystem snapshots [34]</w:t>
+            </w:r>
+          </w:p>
+        </w:tc>
+        <w:tc>
+          <w:tcPr/>
+          <w:p>
+            <w:pPr>
+              <w:pStyle w:val="Compact"/>
+              <w:jc w:val="left"/>
+            </w:pPr>
+            <w:r>
+              <w:t xml:space="preserve">A whole subvolume</w:t>
+            </w:r>
+          </w:p>
+        </w:tc>
+        <w:tc>
+          <w:tcPr/>
+          <w:p>
+            <w:pPr>
+              <w:pStyle w:val="Compact"/>
+              <w:jc w:val="left"/>
+            </w:pPr>
+            <w:r>
+              <w:t xml:space="preserve">No</w:t>
+            </w:r>
+          </w:p>
+        </w:tc>
+        <w:tc>
+          <w:tcPr/>
+          <w:p>
+            <w:pPr>
+              <w:pStyle w:val="Compact"/>
+              <w:jc w:val="left"/>
+            </w:pPr>
+            <w:r>
+              <w:t xml:space="preserve">Not needed</w:t>
+            </w:r>
+          </w:p>
+        </w:tc>
+        <w:tc>
+          <w:tcPr/>
+          <w:p>
+            <w:pPr>
+              <w:pStyle w:val="Compact"/>
+              <w:jc w:val="left"/>
+            </w:pPr>
+            <w:r>
+              <w:t xml:space="preserve">Yes: all later changes, together</w:t>
+            </w:r>
+          </w:p>
+        </w:tc>
+      </w:tr>
+      <w:tr>
+        <w:tc>
+          <w:tcPr/>
+          <w:p>
+            <w:pPr>
+              <w:pStyle w:val="Compact"/>
+              <w:jc w:val="left"/>
+            </w:pPr>
+            <w:r>
+              <w:t xml:space="preserve">Versioning file systems [35]</w:t>
+            </w:r>
+          </w:p>
+        </w:tc>
+        <w:tc>
+          <w:tcPr/>
+          <w:p>
+            <w:pPr>
+              <w:pStyle w:val="Compact"/>
+              <w:jc w:val="left"/>
+            </w:pPr>
+            <w:r>
+              <w:t xml:space="preserve">Every file, on every change</w:t>
+            </w:r>
+          </w:p>
+        </w:tc>
+        <w:tc>
+          <w:tcPr/>
+          <w:p>
+            <w:pPr>
+              <w:pStyle w:val="Compact"/>
+              <w:jc w:val="left"/>
+            </w:pPr>
+            <w:r>
+              <w:t xml:space="preserve">No</w:t>
+            </w:r>
+          </w:p>
+        </w:tc>
+        <w:tc>
+          <w:tcPr/>
+          <w:p>
+            <w:pPr>
+              <w:pStyle w:val="Compact"/>
+              <w:jc w:val="left"/>
+            </w:pPr>
+            <w:r>
+              <w:t xml:space="preserve">Not needed</w:t>
+            </w:r>
+          </w:p>
+        </w:tc>
+        <w:tc>
+          <w:tcPr/>
+          <w:p>
+            <w:pPr>
+              <w:pStyle w:val="Compact"/>
+              <w:jc w:val="left"/>
+            </w:pPr>
+            <w:r>
+              <w:t xml:space="preserve">Yes: per file</w:t>
+            </w:r>
+          </w:p>
+        </w:tc>
+      </w:tr>
+      <w:tr>
+        <w:tc>
+          <w:tcPr/>
+          <w:p>
+            <w:pPr>
+              <w:pStyle w:val="Compact"/>
+              <w:jc w:val="left"/>
+            </w:pPr>
+            <w:r>
+              <w:t xml:space="preserve">Service undo, OS transactions, intrusion recovery [4, 9, 32]</w:t>
+            </w:r>
+          </w:p>
+        </w:tc>
+        <w:tc>
+          <w:tcPr/>
+          <w:p>
+            <w:pPr>
+              <w:pStyle w:val="Compact"/>
+              <w:jc w:val="left"/>
+            </w:pPr>
+            <w:r>
+              <w:t xml:space="preserve">A system built or logged for it</w:t>
+            </w:r>
+          </w:p>
+        </w:tc>
+        <w:tc>
+          <w:tcPr/>
+          <w:p>
+            <w:pPr>
+              <w:pStyle w:val="Compact"/>
+              <w:jc w:val="left"/>
+            </w:pPr>
+            <w:r>
+              <w:t xml:space="preserve">No</w:t>
+            </w:r>
+          </w:p>
+        </w:tc>
+        <w:tc>
+          <w:tcPr/>
+          <w:p>
+            <w:pPr>
+              <w:pStyle w:val="Compact"/>
+              <w:jc w:val="left"/>
+            </w:pPr>
+            <w:r>
+              <w:t xml:space="preserve">Not needed</w:t>
+            </w:r>
+          </w:p>
+        </w:tc>
+        <w:tc>
+          <w:tcPr/>
+          <w:p>
+            <w:pPr>
+              <w:pStyle w:val="Compact"/>
+              <w:jc w:val="left"/>
+            </w:pPr>
+            <w:r>
+              <w:t xml:space="preserve">Yes</w:t>
+            </w:r>
+          </w:p>
+        </w:tc>
+      </w:tr>
+      <w:tr>
+        <w:tc>
+          <w:tcPr/>
+          <w:p>
+            <w:pPr>
+              <w:pStyle w:val="Compact"/>
+              <w:jc w:val="left"/>
+            </w:pPr>
+            <w:r>
+              <w:rPr>
+                <w:b/>
+                <w:bCs/>
+              </w:rPr>
+              <w:t xml:space="preserve">This study</w:t>
+            </w:r>
+          </w:p>
+        </w:tc>
+        <w:tc>
+          <w:tcPr/>
+          <w:p>
+            <w:pPr>
+              <w:pStyle w:val="Compact"/>
+              <w:jc w:val="left"/>
+            </w:pPr>
+            <w:r>
+              <w:t xml:space="preserve">The pending command</w:t>
+            </w:r>
+          </w:p>
+        </w:tc>
+        <w:tc>
+          <w:tcPr/>
+          <w:p>
+            <w:pPr>
+              <w:pStyle w:val="Compact"/>
+              <w:jc w:val="left"/>
+            </w:pPr>
+            <w:r>
+              <w:t xml:space="preserve">Yes: its effect set</w:t>
+            </w:r>
+          </w:p>
+        </w:tc>
+        <w:tc>
+          <w:tcPr/>
+          <w:p>
+            <w:pPr>
+              <w:pStyle w:val="Compact"/>
+              <w:jc w:val="left"/>
+            </w:pPr>
+            <w:r>
+              <w:t xml:space="preserve">Yes: composed and resolved before it runs</w:t>
+            </w:r>
+          </w:p>
+        </w:tc>
+        <w:tc>
+          <w:tcPr/>
+          <w:p>
+            <w:pPr>
+              <w:pStyle w:val="Compact"/>
+              <w:jc w:val="left"/>
+            </w:pPr>
+            <w:r>
+              <w:t xml:space="preserve">Yes: exactly what the plan captured</w:t>
+            </w:r>
+          </w:p>
+        </w:tc>
+      </w:tr>
+    </w:tbl>
+    <w:bookmarkEnd w:id="54"/>
+    <w:bookmarkEnd w:id="55"/>
+    <w:bookmarkStart w:id="61" w:name="sec2-5"/>
     <w:p>
       <w:pPr>
         <w:pStyle w:val="Heading2"/>
@@ -3138,7 +3705,7 @@
         <w:t xml:space="preserve">, and, through its platform coverage, reveals the gap that motivates the present study.  The work is organized here by the platform each system targets — web, mobile, and desktop — together with the vision-language foundation models on which many depend.</w:t>
       </w:r>
     </w:p>
-    <w:bookmarkStart w:id="53" w:name="web-agents"/>
+    <w:bookmarkStart w:id="56" w:name="web-agents"/>
     <w:p>
       <w:pPr>
         <w:pStyle w:val="Heading3"/>
@@ -3152,11 +3719,11 @@
         <w:pStyle w:val="FirstParagraph"/>
       </w:pPr>
       <w:r>
-        <w:t xml:space="preserve">The web has been the most heavily studied environment for language-guided agents.  Mind2Web, introduced by Deng and colleagues [7], is the first dataset for developing generalist web agents that follow language instructions across diverse real-world websites, comprising over two thousand open-ended tasks collected from 137 websites across 31 domains; its accompanying two-stage model uses a small language model to filter candidate elements from large documents before invoking a larger model to choose among them.  WebArena, introduced by Zhou and colleagues [48], provides a fully self-hosted, reproducible web environment of functional website clones and evaluates 812 long-horizon tasks for functional correctness rather than trajectory similarity, establishing a challenging benchmark on which contemporary models achieved completion rates far below human performance.  Zheng and colleagues [47], in their SeeAct framework, decouple visual understanding from action: the model observes a screenshot, generates a textual plan, and a separate step grounds that plan onto page elements.  Their central finding is diagnostic for the entire field — with oracle grounding provided, the model completes 51.1% of tasks on live websites, substantially outperforming a text-only baseline at 13.3%, but performance degrades sharply when grounding must itself be inferred, confirming visual grounding as the principal bottleneck.</w:t>
-      </w:r>
-    </w:p>
-    <w:bookmarkEnd w:id="53"/>
-    <w:bookmarkStart w:id="54" w:name="mobile-agents"/>
+        <w:t xml:space="preserve">The web has been the most heavily studied environment for language-guided agents.  Mind2Web, introduced by Deng and colleagues [8], is the first dataset for developing generalist web agents that follow language instructions across diverse real-world websites, comprising over two thousand open-ended tasks collected from 137 websites across 31 domains; its accompanying two-stage model uses a small language model to filter candidate elements from large documents before invoking a larger model to choose among them.  WebArena, introduced by Zhou and colleagues [53], provides a fully self-hosted, reproducible web environment of functional website clones and evaluates 812 long-horizon tasks for functional correctness rather than trajectory similarity, establishing a challenging benchmark on which contemporary models achieved completion rates far below human performance.  Zheng and colleagues [52], in their SeeAct framework, decouple visual understanding from action: the model observes a screenshot, generates a textual plan, and a separate step grounds that plan onto page elements.  Their central finding is diagnostic for the entire field — with oracle grounding provided, the model completes 51.1% of tasks on live websites, substantially outperforming a text-only baseline at 13.3%, but performance degrades sharply when grounding must itself be inferred, confirming visual grounding as the principal bottleneck.</w:t>
+      </w:r>
+    </w:p>
+    <w:bookmarkEnd w:id="56"/>
+    <w:bookmarkStart w:id="57" w:name="mobile-agents"/>
     <w:p>
       <w:pPr>
         <w:pStyle w:val="Heading3"/>
@@ -3170,11 +3737,11 @@
         <w:pStyle w:val="FirstParagraph"/>
       </w:pPr>
       <w:r>
-        <w:t xml:space="preserve">Mobile-device control has produced large-scale datasets and progressively more autonomous agents.  The pre-LLM work of Li and colleagues [18], discussed in §2.3, established the grounding problem for mobile interfaces.  Android in the Wild, from Rawles and colleagues [30], contributes a dataset of 715,000 episodes spanning 30,000 unique instructions, in which actions are gestures at arbitrary screen coordinates rather than operations on indexed interface elements, exposing the challenge that actions must be inferred from visual appearance rather than from a structured model of the interface.  AppAgent, from Zhang and colleagues [46], operates Android applications through a simplified action space of taps and swipes and learns to use new applications through autonomous exploration or by observing human demonstrations, generating application-specific documentation that matched or exceeded human-written documentation.  Mobile-Agent, from Wang and colleagues [37], adopts a purely vision-centric approach that requires no system metadata, using optical-character-recognition and icon-detection modules to locate interface elements — achieving broad applicability across mobile environments at the cost of vision-grounding errors that require recovery mechanisms.</w:t>
-      </w:r>
-    </w:p>
-    <w:bookmarkEnd w:id="54"/>
-    <w:bookmarkStart w:id="55" w:name="desktop-and-cross-application-agents"/>
+        <w:t xml:space="preserve">Mobile-device control has produced large-scale datasets and progressively more autonomous agents.  The pre-LLM work of Li and colleagues [20], discussed in §2.3, established the grounding problem for mobile interfaces.  Android in the Wild, from Rawles and colleagues [33], contributes a dataset of 715,000 episodes spanning 30,000 unique instructions, in which actions are gestures at arbitrary screen coordinates rather than operations on indexed interface elements, exposing the challenge that actions must be inferred from visual appearance rather than from a structured model of the interface.  AppAgent, from Zhang and colleagues [51], operates Android applications through a simplified action space of taps and swipes and learns to use new applications through autonomous exploration or by observing human demonstrations, generating application-specific documentation that matched or exceeded human-written documentation.  Mobile-Agent, from Wang and colleagues [42], adopts a purely vision-centric approach that requires no system metadata, using optical-character-recognition and icon-detection modules to locate interface elements — achieving broad applicability across mobile environments at the cost of vision-grounding errors that require recovery mechanisms.</w:t>
+      </w:r>
+    </w:p>
+    <w:bookmarkEnd w:id="57"/>
+    <w:bookmarkStart w:id="58" w:name="desktop-and-cross-application-agents"/>
     <w:p>
       <w:pPr>
         <w:pStyle w:val="Heading3"/>
@@ -3188,11 +3755,11 @@
         <w:pStyle w:val="FirstParagraph"/>
       </w:pPr>
       <w:r>
-        <w:t xml:space="preserve">Desktop agents are the most direct graphical analogue to the present work, and their limitations are the most instructive.  ScreenAgent, from Niu and colleagues [25], is a vision-language-model-driven agent for cross-application desktop control that operates in a plan–act–reflect cycle, specifying actions as coordinates and key sequences; its authors acknowledge that vision-only grounding is less reliable than approaches with API access.  WinClick, from Hui and colleagues [13], targets Windows-desktop grounding and observes that most existing GUI agents rely on structured data formats such as the document object model or HyperText Markup Language, which are unavailable across general desktop environments; it therefore performs visual grounding directly from screenshots.  UFO², the "Desktop AgentOS" of Zhang and colleagues [45], is the most ambitious desktop system surveyed: it fuses the native Windows accessibility framework with vision-based parsing in a hybrid action mechanism, dispatching subtasks from a coordinating agent to application-specialized agents.  Its authors argue that existing computer-using agents are hindered by shallow operating-system integration, fragile screenshot-based interaction, and disruptive execution, and they identify adaptation to other desktop platforms, such as Linux and macOS, as future work.  UFO² nonetheless operates as an automation layer dispatched atop the existing Windows shell rather than as a replacement for it, and its authors frame cross-platform deployment as groundwork for a unified ecosystem of desktop automation solutions — the trajectory from which the present study departs.</w:t>
-      </w:r>
-    </w:p>
-    <w:bookmarkEnd w:id="55"/>
-    <w:bookmarkStart w:id="56" w:name="Xd57e62f069d658ec3b53e3f026d4f5c46e83916"/>
+        <w:t xml:space="preserve">Desktop agents are the most direct graphical analogue to the present work, and their limitations are the most instructive.  ScreenAgent, from Niu and colleagues [27], is a vision-language-model-driven agent for cross-application desktop control that operates in a plan–act–reflect cycle, specifying actions as coordinates and key sequences; its authors acknowledge that vision-only grounding is less reliable than approaches with API access.  WinClick, from Hui and colleagues [15], targets Windows-desktop grounding and observes that most existing GUI agents rely on structured data formats such as the document object model or HyperText Markup Language, which are unavailable across general desktop environments; it therefore performs visual grounding directly from screenshots.  UFO², the "Desktop AgentOS" of Zhang and colleagues [50], is the most ambitious desktop system surveyed: it fuses the native Windows accessibility framework with vision-based parsing in a hybrid action mechanism, dispatching subtasks from a coordinating agent to application-specialized agents.  Its authors argue that existing computer-using agents are hindered by shallow operating-system integration, fragile screenshot-based interaction, and disruptive execution, and they identify adaptation to other desktop platforms, such as Linux and macOS, as future work.  UFO² nonetheless operates as an automation layer dispatched atop the existing Windows shell rather than as a replacement for it, and its authors frame cross-platform deployment as groundwork for a unified ecosystem of desktop automation solutions — the trajectory from which the present study departs.</w:t>
+      </w:r>
+    </w:p>
+    <w:bookmarkEnd w:id="58"/>
+    <w:bookmarkStart w:id="59" w:name="Xd57e62f069d658ec3b53e3f026d4f5c46e83916"/>
     <w:p>
       <w:pPr>
         <w:pStyle w:val="Heading3"/>
@@ -3209,8 +3776,8 @@
         <w:t xml:space="preserve">The systems surveyed above are research artifacts.  A parallel commercial development is moving faster than the peer-reviewed literature and warrants explicit positioning; what follows reflects that landscape as of September 2026 and is dated deliberately, because it will continue to move.  Several products now describe themselves as agentic operating systems.  eva AG’s WarmWind, released in 2026, runs autonomous workers that operate applications through vision and simulated mouse and keyboard input, hosted in a managed cloud environment built on a Linux base and aimed at automating repetitive office work.  Alibaba’s ANOLISA ships an AI-native Linux terminal in which shell commands and ordinary language share a single prompt, with the agent requesting approval before risky operations and a checkpoint facility providing rollback.  Major platform vendors have each shipped or previewed some form of computer control, ranging from screenshot-driven graphical automation to structured application-intent dispatch.  Two properties separate all of them from the present work, and both are structural rather than incidental.  First, each routes inference through remote infrastructure, whereas the design constraint here is that the model runs on the user’s own hardware, with no network dependency.  Second, each is built to act on the user’s behalf, largely unattended, whereas the interface studied here is operated by a person turn by turn with every irreversible action gated on that person’s approval.  The distinction is not which approach is better but which question is being asked: these systems pursue autonomy, while this study asks whether conversation is a better interface for a human who is present and in control.</w:t>
       </w:r>
     </w:p>
-    <w:bookmarkEnd w:id="56"/>
-    <w:bookmarkStart w:id="57" w:name="vision-language-foundation-models"/>
+    <w:bookmarkEnd w:id="59"/>
+    <w:bookmarkStart w:id="60" w:name="vision-language-foundation-models"/>
     <w:p>
       <w:pPr>
         <w:pStyle w:val="Heading3"/>
@@ -3224,12 +3791,12 @@
         <w:pStyle w:val="FirstParagraph"/>
       </w:pPr>
       <w:r>
-        <w:t xml:space="preserve">Underlying many of these agents are vision-language models trained specifically for interface understanding.  CogAgent, from Hong and colleagues [12], is an eighteen-billion-parameter visual language model specialized for GUI understanding and navigation, using both low- and high-resolution image encoders to recognize the small icons and text typical of graphical interfaces.  It supports the position that pure-vision GUI agents are viable when the underlying model is trained appropriately — but at a compute cost, and with the cross-platform generalization limitations common to the entire graphical-agent literature.  Across web, mobile, and desktop, these systems demonstrate broad capability within a single platform class, while consistently identifying visual grounding as an unsolved bottleneck and trending toward hybrid execution that prefers structured access where available and falls back to vision.</w:t>
-      </w:r>
-    </w:p>
-    <w:bookmarkEnd w:id="57"/>
-    <w:bookmarkEnd w:id="58"/>
-    <w:bookmarkStart w:id="59" w:name="sec2-6"/>
+        <w:t xml:space="preserve">Underlying many of these agents are vision-language models trained specifically for interface understanding.  CogAgent, from Hong and colleagues [14], is an eighteen-billion-parameter visual language model specialized for GUI understanding and navigation, using both low- and high-resolution image encoders to recognize the small icons and text typical of graphical interfaces.  It supports the position that pure-vision GUI agents are viable when the underlying model is trained appropriately — but at a compute cost, and with the cross-platform generalization limitations common to the entire graphical-agent literature.  Across web, mobile, and desktop, these systems demonstrate broad capability within a single platform class, while consistently identifying visual grounding as an unsolved bottleneck and trending toward hybrid execution that prefers structured access where available and falls back to vision.</w:t>
+      </w:r>
+    </w:p>
+    <w:bookmarkEnd w:id="60"/>
+    <w:bookmarkEnd w:id="61"/>
+    <w:bookmarkStart w:id="62" w:name="sec2-6"/>
     <w:p>
       <w:pPr>
         <w:pStyle w:val="Heading2"/>
@@ -3251,19 +3818,19 @@
         <w:pStyle w:val="BodyText"/>
       </w:pPr>
       <w:r>
-        <w:t xml:space="preserve">VoicePilot, from Padmanabha and colleagues [28], is a framework for using LLMs as speech interfaces to physically assistive robots for individuals with motor impairments.  Although its immediate target is robotic assistance rather than desktop computing, it is included here because it is the most rigorous human-centered evaluation in the LLM-speech-interface literature.  The authors derive five concrete design guidelines from a study with motor-impaired participants, among them the importance of execution speed approaching that of a caregiver and the necessity of preview-and-confirm workflows — a guideline that directly informs the reversibility-based confirmation design of the present study.  DexAssist, from Mehendale and Walishetti [24], targets web navigation by users with fine-motor impairments using two LLMs in tandem — one to interpret voice commands and a second to map the interpretation onto interface elements with fallback strategies — reducing the misinterpretation failures of single-model voice navigation on dense layouts.  The architecture of van Dam [36] proposes retrofitting LLM-based conversational interfaces onto existing single-application graphical interfaces, exposing an application’s navigation graph through a tool protocol and handling voice input through real-time speech recognition; its author observes that most production applications were never designed with speech in mind, making such retrofitting an ongoing challenge.</w:t>
-      </w:r>
-    </w:p>
-    <w:p>
-      <w:pPr>
-        <w:pStyle w:val="BodyText"/>
-      </w:pPr>
-      <w:r>
-        <w:t xml:space="preserve">More recent work continues to mature the components required for speech-driven interface control.  Han and colleagues, in GUIRoboTron-Speech [10], advance automated GUI agents driven directly by speech instructions, while Park and colleagues, in R-VLM [29], contribute region-aware visual grounding for more precise identification of on-screen elements.  What unites this thread is that it operates at the level of the individual application or interaction technique rather than at the level of the session itself.  These approaches presuppose an underlying conversational system surface on which to run, yet no such surface exists at the session level.  This complementarity is significant: a general-purpose conversational interface layer would serve not only mainstream users but also provide the substrate that accessibility-specific configurations require — positioning accessibility not as the immediate target of the present study, which scopes it out for recruitment and ethics reasons, but as a natural and well-grounded extension of its contribution.</w:t>
-      </w:r>
-    </w:p>
-    <w:bookmarkEnd w:id="59"/>
-    <w:bookmarkStart w:id="60" w:name="sec2-7"/>
+        <w:t xml:space="preserve">VoicePilot, from Padmanabha and colleagues [30], is a framework for using LLMs as speech interfaces to physically assistive robots for individuals with motor impairments.  Although its immediate target is robotic assistance rather than desktop computing, it is included here because it is the most rigorous human-centered evaluation in the LLM-speech-interface literature.  The authors derive five concrete design guidelines from a study with motor-impaired participants, among them the importance of execution speed approaching that of a caregiver and the necessity of preview-and-confirm workflows — a guideline that directly informs the reversibility-based confirmation design of the present study.  DexAssist, from Mehendale and Walishetti [26], targets web navigation by users with fine-motor impairments using two LLMs in tandem — one to interpret voice commands and a second to map the interpretation onto interface elements with fallback strategies — reducing the misinterpretation failures of single-model voice navigation on dense layouts.  The architecture of van Dam [41] proposes retrofitting LLM-based conversational interfaces onto existing single-application graphical interfaces, exposing an application’s navigation graph through a tool protocol and handling voice input through real-time speech recognition; its author observes that most production applications were never designed with speech in mind, making such retrofitting an ongoing challenge.</w:t>
+      </w:r>
+    </w:p>
+    <w:p>
+      <w:pPr>
+        <w:pStyle w:val="BodyText"/>
+      </w:pPr>
+      <w:r>
+        <w:t xml:space="preserve">More recent work continues to mature the components required for speech-driven interface control.  Han and colleagues, in GUIRoboTron-Speech [12], advance automated GUI agents driven directly by speech instructions, while Park and colleagues, in R-VLM [31], contribute region-aware visual grounding for more precise identification of on-screen elements.  What unites this thread is that it operates at the level of the individual application or interaction technique rather than at the level of the session itself.  These approaches presuppose an underlying conversational system surface on which to run, yet no such surface exists at the session level.  This complementarity is significant: a general-purpose conversational interface layer would serve not only mainstream users but also provide the substrate that accessibility-specific configurations require — positioning accessibility not as the immediate target of the present study, which scopes it out for recruitment and ethics reasons, but as a natural and well-grounded extension of its contribution.</w:t>
+      </w:r>
+    </w:p>
+    <w:bookmarkEnd w:id="62"/>
+    <w:bookmarkStart w:id="63" w:name="sec2-7"/>
     <w:p>
       <w:pPr>
         <w:pStyle w:val="Heading2"/>
@@ -3277,19 +3844,19 @@
         <w:pStyle w:val="FirstParagraph"/>
       </w:pPr>
       <w:r>
-        <w:t xml:space="preserve">The rapid proliferation of computer-using agents has been accompanied by increasingly rigorous evaluation environments, and these establish both the current ceiling of the field’s capability and the methods by which that capability is measured.  The most consequential is OSWorld, from Xie and colleagues [41], a benchmark of 369 real-world computer tasks in a real-computer environment spanning Ubuntu, Windows, and macOS.  At its 2024 release the margin it measured was stark: humans achieved 72.36% success where the best evaluated model reached 12.24%.  That particular margin has since closed, with leading agents now exceeding the original human baseline on the revised task set — but the closure reflects progress on short, self-contained tasks rather than on sustained computer work.  Its successor, OSWorld 2.0 [43], evaluates 108 long-horizon workflows whose median item requires roughly an hour and a half of skilled human operation; there the best frontier configuration completes only 20.6% of tasks outright.  The reported failures concentrate not in interface navigation but in tracking constraints across a long task, absorbing information that arrives mid-way, and verifying a result before declaring completion.  The field’s ceiling has moved substantially; it has not been reached.  OSWorld is also directly relevant to the present study as the source of a real-task suite against which benchmark comparability can be established.</w:t>
-      </w:r>
-    </w:p>
-    <w:p>
-      <w:pPr>
-        <w:pStyle w:val="BodyText"/>
-      </w:pPr>
-      <w:r>
-        <w:t xml:space="preserve">Complementing the benchmark literature, the survey of LLM-brained GUI agents by Zhang and colleagues [44] synthesizes the field through 2024, organizing it around the components of perception, planning, action, and memory, and providing the four-layer vocabulary adopted in §2.2 of this review.  It enumerates the field’s open challenges — accurate element localization, knowledge retrieval, long-horizon planning, and safety-aware execution control; notably, none of the challenges it enumerates concerns replacing the session layer itself: the survey takes the surrounding operating-system session as given, which is the assumption the present study sets out to test.  What the evaluation literature reveals, however, is a specific methodological limitation: rigorous as these benchmarks are, they measure the autonomous task completion of agents acting on a user’s behalf, not the comparative performance of a human user working through a conversational interface versus a conventional graphical one.  That distinction motivates the evaluation design reviewed in §2.10.</w:t>
-      </w:r>
-    </w:p>
-    <w:bookmarkEnd w:id="60"/>
-    <w:bookmarkStart w:id="67" w:name="sec2-8"/>
+        <w:t xml:space="preserve">The rapid proliferation of computer-using agents has been accompanied by increasingly rigorous evaluation environments, and these establish both the current ceiling of the field’s capability and the methods by which that capability is measured.  The most consequential is OSWorld, from Xie and colleagues [46], a benchmark of 369 real-world computer tasks in a real-computer environment spanning Ubuntu, Windows, and macOS.  At its 2024 release the margin it measured was stark: humans achieved 72.36% success where the best evaluated model reached 12.24%.  That particular margin has since closed, with leading agents now exceeding the original human baseline on the revised task set — but the closure reflects progress on short, self-contained tasks rather than on sustained computer work.  Its successor, OSWorld 2.0 [48], evaluates 108 long-horizon workflows whose median item requires roughly an hour and a half of skilled human operation; there the best frontier configuration completes only 20.6% of tasks outright.  The reported failures concentrate not in interface navigation but in tracking constraints across a long task, absorbing information that arrives mid-way, and verifying a result before declaring completion.  The field’s ceiling has moved substantially; it has not been reached.  OSWorld is also directly relevant to the present study as the source of a real-task suite against which benchmark comparability can be established.</w:t>
+      </w:r>
+    </w:p>
+    <w:p>
+      <w:pPr>
+        <w:pStyle w:val="BodyText"/>
+      </w:pPr>
+      <w:r>
+        <w:t xml:space="preserve">Complementing the benchmark literature, the survey of LLM-brained GUI agents by Zhang and colleagues [49] synthesizes the field through 2024, organizing it around the components of perception, planning, action, and memory, and providing the four-layer vocabulary adopted in §2.2 of this review.  It enumerates the field’s open challenges — accurate element localization, knowledge retrieval, long-horizon planning, and safety-aware execution control; notably, none of the challenges it enumerates concerns replacing the session layer itself: the survey takes the surrounding operating-system session as given, which is the assumption the present study sets out to test.  What the evaluation literature reveals, however, is a specific methodological limitation: rigorous as these benchmarks are, they measure the autonomous task completion of agents acting on a user’s behalf, not the comparative performance of a human user working through a conversational interface versus a conventional graphical one.  That distinction motivates the evaluation design reviewed in §2.10.</w:t>
+      </w:r>
+    </w:p>
+    <w:bookmarkEnd w:id="63"/>
+    <w:bookmarkStart w:id="70" w:name="sec2-8"/>
     <w:p>
       <w:pPr>
         <w:pStyle w:val="Heading2"/>
@@ -3303,15 +3870,15 @@
         <w:pStyle w:val="FirstParagraph"/>
       </w:pPr>
       <w:r>
-        <w:t xml:space="preserve">The synthesis has two parts.  The first concerns the study’s algorithm and is stated briefly because §2.5 has established it: every guard surveyed decides whether a command may run by matching it against a list of patterns, every analysis of shell programs targets a property other than recoverability, and none derives from a command’s structure what it would destroy or captures what is needed to undo it.  That is the research gap.  The second part concerns the setting in which the gap arises.</w:t>
-      </w:r>
-    </w:p>
-    <w:p>
-      <w:pPr>
-        <w:pStyle w:val="BodyText"/>
-      </w:pPr>
-      <w:r>
-        <w:t xml:space="preserve">Positioning the interface systems against one another along the four-layer pipeline makes the structure of that setting explicit.  Table 2.1 summarizes the principal systems by coverage scope, action mechanism, evaluation approach, and key limitation.</w:t>
+        <w:t xml:space="preserve">The synthesis has two parts.  The first concerns the study’s algorithm and is stated briefly because §2.5 has established it: every guard surveyed decides whether a command may run by matching it against a list of patterns, every analysis of shell programs targets a property other than recoverability, every recovery mechanism either restores wholesale or needs a system built for it, and none derives from a command’s structure what it would destroy or captures what is needed to undo it.  That is the research gap.  The second part concerns the setting in which the gap arises.</w:t>
+      </w:r>
+    </w:p>
+    <w:p>
+      <w:pPr>
+        <w:pStyle w:val="BodyText"/>
+      </w:pPr>
+      <w:r>
+        <w:t xml:space="preserve">Positioning the interface systems against one another along the four-layer pipeline makes the structure of that setting explicit.  Table 2.2 summarizes the principal systems by coverage scope, action mechanism, evaluation approach, and key limitation.</w:t>
       </w:r>
     </w:p>
     <w:p>
@@ -3323,7 +3890,7 @@
           <w:b/>
           <w:bCs/>
         </w:rPr>
-        <w:t xml:space="preserve">Table 2.1.</w:t>
+        <w:t xml:space="preserve">Table 2.2.</w:t>
       </w:r>
       <w:r>
         <w:t xml:space="preserve">  Comparative analysis of surveyed systems on conversational and LLM-mediated interfaces for personal computing, positioned by coverage scope, action mechanism, evaluation, and key limitation.</w:t>
@@ -3430,7 +3997,7 @@
               <w:jc w:val="left"/>
             </w:pPr>
             <w:r>
-              <w:t xml:space="preserve">Wilensky et al. [40]</w:t>
+              <w:t xml:space="preserve">Wilensky et al. [45]</w:t>
             </w:r>
           </w:p>
         </w:tc>
@@ -3504,7 +4071,7 @@
               <w:jc w:val="left"/>
             </w:pPr>
             <w:r>
-              <w:t xml:space="preserve">Westenfelder et al. [38]</w:t>
+              <w:t xml:space="preserve">Westenfelder et al. [43]</w:t>
             </w:r>
           </w:p>
         </w:tc>
@@ -3578,7 +4145,7 @@
               <w:jc w:val="left"/>
             </w:pPr>
             <w:r>
-              <w:t xml:space="preserve">Gyawali et al. [9]</w:t>
+              <w:t xml:space="preserve">Gyawali et al. [11]</w:t>
             </w:r>
           </w:p>
         </w:tc>
@@ -3652,7 +4219,7 @@
               <w:jc w:val="left"/>
             </w:pPr>
             <w:r>
-              <w:t xml:space="preserve">van Dam [36]</w:t>
+              <w:t xml:space="preserve">van Dam [41]</w:t>
             </w:r>
           </w:p>
         </w:tc>
@@ -3726,7 +4293,7 @@
               <w:jc w:val="left"/>
             </w:pPr>
             <w:r>
-              <w:t xml:space="preserve">Padmanabha et al. [28]</w:t>
+              <w:t xml:space="preserve">Padmanabha et al. [30]</w:t>
             </w:r>
           </w:p>
         </w:tc>
@@ -3800,7 +4367,7 @@
               <w:jc w:val="left"/>
             </w:pPr>
             <w:r>
-              <w:t xml:space="preserve">Mehendale and Walishetti [24]</w:t>
+              <w:t xml:space="preserve">Mehendale and Walishetti [26]</w:t>
             </w:r>
           </w:p>
         </w:tc>
@@ -3874,7 +4441,7 @@
               <w:jc w:val="left"/>
             </w:pPr>
             <w:r>
-              <w:t xml:space="preserve">Deng et al. [7]</w:t>
+              <w:t xml:space="preserve">Deng et al. [8]</w:t>
             </w:r>
           </w:p>
         </w:tc>
@@ -3948,7 +4515,7 @@
               <w:jc w:val="left"/>
             </w:pPr>
             <w:r>
-              <w:t xml:space="preserve">Zhou et al. [48]</w:t>
+              <w:t xml:space="preserve">Zhou et al. [53]</w:t>
             </w:r>
           </w:p>
         </w:tc>
@@ -4022,7 +4589,7 @@
               <w:jc w:val="left"/>
             </w:pPr>
             <w:r>
-              <w:t xml:space="preserve">Zheng et al. [47]</w:t>
+              <w:t xml:space="preserve">Zheng et al. [52]</w:t>
             </w:r>
           </w:p>
         </w:tc>
@@ -4096,7 +4663,7 @@
               <w:jc w:val="left"/>
             </w:pPr>
             <w:r>
-              <w:t xml:space="preserve">Rawles et al. [30]</w:t>
+              <w:t xml:space="preserve">Rawles et al. [33]</w:t>
             </w:r>
           </w:p>
         </w:tc>
@@ -4170,7 +4737,7 @@
               <w:jc w:val="left"/>
             </w:pPr>
             <w:r>
-              <w:t xml:space="preserve">Zhang et al. [46]</w:t>
+              <w:t xml:space="preserve">Zhang et al. [51]</w:t>
             </w:r>
           </w:p>
         </w:tc>
@@ -4244,7 +4811,7 @@
               <w:jc w:val="left"/>
             </w:pPr>
             <w:r>
-              <w:t xml:space="preserve">Wang et al. [37]</w:t>
+              <w:t xml:space="preserve">Wang et al. [42]</w:t>
             </w:r>
           </w:p>
         </w:tc>
@@ -4318,7 +4885,7 @@
               <w:jc w:val="left"/>
             </w:pPr>
             <w:r>
-              <w:t xml:space="preserve">Hong et al. [12]</w:t>
+              <w:t xml:space="preserve">Hong et al. [14]</w:t>
             </w:r>
           </w:p>
         </w:tc>
@@ -4392,7 +4959,7 @@
               <w:jc w:val="left"/>
             </w:pPr>
             <w:r>
-              <w:t xml:space="preserve">Niu et al. [25]</w:t>
+              <w:t xml:space="preserve">Niu et al. [27]</w:t>
             </w:r>
           </w:p>
         </w:tc>
@@ -4466,7 +5033,7 @@
               <w:jc w:val="left"/>
             </w:pPr>
             <w:r>
-              <w:t xml:space="preserve">Hui et al. [13]</w:t>
+              <w:t xml:space="preserve">Hui et al. [15]</w:t>
             </w:r>
           </w:p>
         </w:tc>
@@ -4540,7 +5107,7 @@
               <w:jc w:val="left"/>
             </w:pPr>
             <w:r>
-              <w:t xml:space="preserve">Zhang et al. [45]</w:t>
+              <w:t xml:space="preserve">Zhang et al. [50]</w:t>
             </w:r>
           </w:p>
         </w:tc>
@@ -4614,7 +5181,7 @@
               <w:jc w:val="left"/>
             </w:pPr>
             <w:r>
-              <w:t xml:space="preserve">Xie et al. [41]</w:t>
+              <w:t xml:space="preserve">Xie et al. [46]</w:t>
             </w:r>
           </w:p>
         </w:tc>
@@ -4688,7 +5255,7 @@
               <w:jc w:val="left"/>
             </w:pPr>
             <w:r>
-              <w:t xml:space="preserve">Li et al. [18]</w:t>
+              <w:t xml:space="preserve">Li et al. [20]</w:t>
             </w:r>
           </w:p>
         </w:tc>
@@ -4762,7 +5329,7 @@
               <w:jc w:val="left"/>
             </w:pPr>
             <w:r>
-              <w:t xml:space="preserve">Yao et al. [42]</w:t>
+              <w:t xml:space="preserve">Yao et al. [47]</w:t>
             </w:r>
           </w:p>
         </w:tc>
@@ -4836,7 +5403,7 @@
               <w:jc w:val="left"/>
             </w:pPr>
             <w:r>
-              <w:t xml:space="preserve">Han et al. [10]</w:t>
+              <w:t xml:space="preserve">Han et al. [12]</w:t>
             </w:r>
           </w:p>
         </w:tc>
@@ -4910,7 +5477,7 @@
               <w:jc w:val="left"/>
             </w:pPr>
             <w:r>
-              <w:t xml:space="preserve">Park et al. [29]</w:t>
+              <w:t xml:space="preserve">Park et al. [31]</w:t>
             </w:r>
           </w:p>
         </w:tc>
@@ -4984,7 +5551,7 @@
               <w:jc w:val="left"/>
             </w:pPr>
             <w:r>
-              <w:t xml:space="preserve">Jacobs et al. [15]</w:t>
+              <w:t xml:space="preserve">Jacobs et al. [17]</w:t>
             </w:r>
           </w:p>
         </w:tc>
@@ -5058,7 +5625,7 @@
         <w:t xml:space="preserve">Six patterns emerge from this comparison, each surfacing a recurring theme in the literature.</w:t>
       </w:r>
     </w:p>
-    <w:bookmarkStart w:id="61" w:name="bifurcation-by-coverage-scope"/>
+    <w:bookmarkStart w:id="64" w:name="bifurcation-by-coverage-scope"/>
     <w:p>
       <w:pPr>
         <w:pStyle w:val="Heading3"/>
@@ -5072,11 +5639,11 @@
         <w:pStyle w:val="FirstParagraph"/>
       </w:pPr>
       <w:r>
-        <w:t xml:space="preserve">The field is bifurcated by coverage scope.  Shell-level work [9, 38] and single-application work [28, 36] sit at the narrow end; cross-application desktop, web, and mobile agents sit at the broad end but each within a single platform class.  No surveyed system implements a working conversational layer over the full graphical session that has been empirically validated against the conventional desktop workflow it would supplement.  The Unix Consultant [40] came closest in ambition four decades ago, but its pre-LLM foundation prevented it from scaling beyond demonstration.  The absence is structural rather than incidental.  Even UFO² [45], the most operationally advanced desktop-agent system surveyed, is by construction an automation layer dispatched atop the existing Windows shell, and its stated future direction is broader cross-platform automation rather than replacement of the session itself.  The substitution this study attempts is therefore unclaimed, not merely under-published.</w:t>
-      </w:r>
-    </w:p>
-    <w:bookmarkEnd w:id="61"/>
-    <w:bookmarkStart w:id="62" w:name="execution-mechanism-at-the-action-layer"/>
+        <w:t xml:space="preserve">The field is bifurcated by coverage scope.  Shell-level work [11, 43] and single-application work [30, 41] sit at the narrow end; cross-application desktop, web, and mobile agents sit at the broad end but each within a single platform class.  No surveyed system implements a working conversational layer over the full graphical session that has been empirically validated against the conventional desktop workflow it would supplement.  The Unix Consultant [45] came closest in ambition four decades ago, but its pre-LLM foundation prevented it from scaling beyond demonstration.  The absence is structural rather than incidental.  Even UFO² [50], the most operationally advanced desktop-agent system surveyed, is by construction an automation layer dispatched atop the existing Windows shell, and its stated future direction is broader cross-platform automation rather than replacement of the session itself.  The substitution this study attempts is therefore unclaimed, not merely under-published.</w:t>
+      </w:r>
+    </w:p>
+    <w:bookmarkEnd w:id="64"/>
+    <w:bookmarkStart w:id="65" w:name="execution-mechanism-at-the-action-layer"/>
     <w:p>
       <w:pPr>
         <w:pStyle w:val="Heading3"/>
@@ -5090,11 +5657,11 @@
         <w:pStyle w:val="FirstParagraph"/>
       </w:pPr>
       <w:r>
-        <w:t xml:space="preserve">A second pattern concerns the execution mechanism at the Action layer.  The literature divides among command translation, API binding, and GUI simulation, with a dominant trend toward hybrid execution [36, 45] that prefers structured access where available and falls back to vision.  Vision-only systems [25, 37] achieve broad applicability at the cost of grounding fragility, while structured-access systems achieve precision at the cost of per-environment integration.  Notably, the Unix Consultant operated purely at the consultation layer without executing actions — an approach that reflects an underappreciated design principle, that the agent that explains can be safer than the agent that acts, which the confirmation-gated design of the present study revisits.</w:t>
-      </w:r>
-    </w:p>
-    <w:bookmarkEnd w:id="62"/>
-    <w:bookmarkStart w:id="63" w:name="Xaee8aa4ffc06f790a7ecd2919914e9aaadf5929"/>
+        <w:t xml:space="preserve">A second pattern concerns the execution mechanism at the Action layer.  The literature divides among command translation, API binding, and GUI simulation, with a dominant trend toward hybrid execution [41, 50] that prefers structured access where available and falls back to vision.  Vision-only systems [27, 42] achieve broad applicability at the cost of grounding fragility, while structured-access systems achieve precision at the cost of per-environment integration.  Notably, the Unix Consultant operated purely at the consultation layer without executing actions — an approach that reflects an underappreciated design principle, that the agent that explains can be safer than the agent that acts, which the confirmation-gated design of the present study revisits.</w:t>
+      </w:r>
+    </w:p>
+    <w:bookmarkEnd w:id="65"/>
+    <w:bookmarkStart w:id="66" w:name="Xaee8aa4ffc06f790a7ecd2919914e9aaadf5929"/>
     <w:p>
       <w:pPr>
         <w:pStyle w:val="Heading3"/>
@@ -5108,11 +5675,11 @@
         <w:pStyle w:val="FirstParagraph"/>
       </w:pPr>
       <w:r>
-        <w:t xml:space="preserve">A third pattern is that visual grounding is the field’s principal bottleneck, identified explicitly by both SeeAct [47] and the GUI-agents survey [44].  The 51.1% ceiling of GPT-4V with oracle grounding and its sharp degradation without are attributable in significant part to grounding failure.  This bottleneck is a property of the graphical-simulation approach specifically; a command-line approach that grounds intent into shell commands rather than into on-screen pixel regions sidesteps it, at the cost of being bounded by what is expressible on the command line.  Direct comparison qualifies that tradeoff usefully.  Across 440 matched desktop tasks, screen-only graphical agents pass 59.1% while command-line agents reach only 48.2% — the shell is not automatically the stronger substrate — but command-line agents augmented with result verification reach 69.3%, the highest of the three conditions [49].  Execution through the shell becomes advantageous when it is paired with a mechanism that checks what the command actually did, which is precisely the role a reversibility gate and an undo record play in the present design.</w:t>
-      </w:r>
-    </w:p>
-    <w:bookmarkEnd w:id="63"/>
-    <w:bookmarkStart w:id="64" w:name="scarcity-of-comparative-user-evaluation"/>
+        <w:t xml:space="preserve">A third pattern is that visual grounding is the field’s principal bottleneck, identified explicitly by both SeeAct [52] and the GUI-agents survey [49].  The 51.1% ceiling of GPT-4V with oracle grounding and its sharp degradation without are attributable in significant part to grounding failure.  This bottleneck is a property of the graphical-simulation approach specifically; a command-line approach that grounds intent into shell commands rather than into on-screen pixel regions sidesteps it, at the cost of being bounded by what is expressible on the command line.  Direct comparison qualifies that tradeoff usefully.  Across 440 matched desktop tasks, screen-only graphical agents pass 59.1% while command-line agents reach only 48.2% — the shell is not automatically the stronger substrate — but command-line agents augmented with result verification reach 69.3%, the highest of the three conditions [54].  Execution through the shell becomes advantageous when it is paired with a mechanism that checks what the command actually did, which is precisely the role a reversibility gate and an undo record play in the present design.</w:t>
+      </w:r>
+    </w:p>
+    <w:bookmarkEnd w:id="66"/>
+    <w:bookmarkStart w:id="67" w:name="scarcity-of-comparative-user-evaluation"/>
     <w:p>
       <w:pPr>
         <w:pStyle w:val="Heading3"/>
@@ -5126,11 +5693,11 @@
         <w:pStyle w:val="FirstParagraph"/>
       </w:pPr>
       <w:r>
-        <w:t xml:space="preserve">A fourth pattern concerns evaluation method.  Most surveyed systems are evaluated either through architectural demonstration [9, 36] or through curated task benchmarks [7, 37, 41, 48].  User studies are rare, and the comparisons that do exist are narrow.  VoicePilot [28] conducts a substantive human-centered evaluation of LLM-based interaction, and AXIS [21] compares an API-first agent against unaided manual operation in a within-subjects design — but within a single application, on a single platform, with a cloud-hosted frontier model.  No surveyed work compares a conversational interface against the conventional graphical workflow across operating-system-level tasks on the same population.  This is the empirical gap best filled by a controlled study of conversational interfaces.</w:t>
-      </w:r>
-    </w:p>
-    <w:bookmarkEnd w:id="64"/>
-    <w:bookmarkStart w:id="65" w:name="the-operating-system-substrate"/>
+        <w:t xml:space="preserve">A fourth pattern concerns evaluation method.  Most surveyed systems are evaluated either through architectural demonstration [11, 41] or through curated task benchmarks [8, 42, 46, 53].  User studies are rare, and the comparisons that do exist are narrow.  VoicePilot [30] conducts a substantive human-centered evaluation of LLM-based interaction, and AXIS [23] compares an API-first agent against unaided manual operation in a within-subjects design — but within a single application, on a single platform, with a cloud-hosted frontier model.  No surveyed work compares a conversational interface against the conventional graphical workflow across operating-system-level tasks on the same population.  This is the empirical gap best filled by a controlled study of conversational interfaces.</w:t>
+      </w:r>
+    </w:p>
+    <w:bookmarkEnd w:id="67"/>
+    <w:bookmarkStart w:id="68" w:name="the-operating-system-substrate"/>
     <w:p>
       <w:pPr>
         <w:pStyle w:val="Heading3"/>
@@ -5144,11 +5711,11 @@
         <w:pStyle w:val="FirstParagraph"/>
       </w:pPr>
       <w:r>
-        <w:t xml:space="preserve">A fifth pattern concerns the operating-system substrate.  Windows [13, 45], Android [30, 37, 46], and the web [7, 47, 48] are each heavily represented; the Linux work that exists is aimed elsewhere than the end user’s desktop session.  NaSh [9] addresses Linux at the shell level as a design proposal; Alibaba Cloud’s ANOLISA ships a natural-language Linux terminal with approval gating and rollback, but scoped to server and DevOps workloads; and OSWorld [41] includes Ubuntu as an evaluation platform rather than a deployment target.  No surveyed system implements a conversational session layer for the Linux desktop addressed to the person using the machine, despite Linux serving as the substrate for most developer and server-side workflows.</w:t>
-      </w:r>
-    </w:p>
-    <w:bookmarkEnd w:id="65"/>
-    <w:bookmarkStart w:id="66" w:name="shared-lineage-and-its-fragility"/>
+        <w:t xml:space="preserve">A fifth pattern concerns the operating-system substrate.  Windows [15, 50], Android [33, 42, 51], and the web [8, 52, 53] are each heavily represented; the Linux work that exists is aimed elsewhere than the end user’s desktop session.  NaSh [11] addresses Linux at the shell level as a design proposal; Alibaba Cloud’s ANOLISA ships a natural-language Linux terminal with approval gating and rollback, but scoped to server and DevOps workloads; and OSWorld [46] includes Ubuntu as an evaluation platform rather than a deployment target.  No surveyed system implements a conversational session layer for the Linux desktop addressed to the person using the machine, despite Linux serving as the substrate for most developer and server-side workflows.</w:t>
+      </w:r>
+    </w:p>
+    <w:bookmarkEnd w:id="68"/>
+    <w:bookmarkStart w:id="69" w:name="shared-lineage-and-its-fragility"/>
     <w:p>
       <w:pPr>
         <w:pStyle w:val="Heading3"/>
@@ -5162,15 +5729,15 @@
         <w:pStyle w:val="FirstParagraph"/>
       </w:pPr>
       <w:r>
-        <w:t xml:space="preserve">A sixth pattern is the field’s shared intellectual lineage and its attendant fragility.  As established in §2.3, nearly every post-2023 system inherits the ReAct [42] convention of interleaving reasoning with action, which explains both the field’s rapid progress and the pervasiveness of LLM-reasoning failure modes across it — a fragility that makes safety and recoverability mechanisms, rather than raw capability alone, decisive for any deployable system.</w:t>
-      </w:r>
-    </w:p>
-    <w:p>
-      <w:pPr>
-        <w:pStyle w:val="BodyText"/>
-      </w:pPr>
-      <w:r>
-        <w:t xml:space="preserve">A related but distinct class of contemporary systems warrants explicit positioning here: AI-assisted coding agents such as Claude Code, Cursor, and Aider, which translate natural-language intent into shell commands and execute them under human oversight — the same basic mechanism the present study adopts.  These tools are excluded from Table 2.1 not on the grounds of being industry rather than academic work — a substantial share of the literature surveyed here is likewise unrefereed preprint — but because they occupy a different position on every axis that matters to this study.  They are built for software engineers operating within an existing code repository, are powered by large models hosted on remote infrastructure, and run as a tool installed atop an otherwise unmodified desktop session.  SynapseOS targets the inverse on each axis: any user of the machine regardless of command-line fluency, a locally-hosted small language model rather than a cloud dependency, and replacement of the session layer itself rather than an application running within it.  The mechanism is shared; the population, the model’s location, and the system’s place in the stack are not.</w:t>
+        <w:t xml:space="preserve">A sixth pattern is the field’s shared intellectual lineage and its attendant fragility.  As established in §2.3, nearly every post-2023 system inherits the ReAct [47] convention of interleaving reasoning with action, which explains both the field’s rapid progress and the pervasiveness of LLM-reasoning failure modes across it — a fragility that makes safety and recoverability mechanisms, rather than raw capability alone, decisive for any deployable system.</w:t>
+      </w:r>
+    </w:p>
+    <w:p>
+      <w:pPr>
+        <w:pStyle w:val="BodyText"/>
+      </w:pPr>
+      <w:r>
+        <w:t xml:space="preserve">A related but distinct class of contemporary systems warrants explicit positioning here: AI-assisted coding agents such as Claude Code, Cursor, and Aider, which translate natural-language intent into shell commands and execute them under human oversight — the same basic mechanism the present study adopts.  These tools are excluded from Table 2.2 not on the grounds of being industry rather than academic work — a substantial share of the literature surveyed here is likewise unrefereed preprint — but because they occupy a different position on every axis that matters to this study.  They are built for software engineers operating within an existing code repository, are powered by large models hosted on remote infrastructure, and run as a tool installed atop an otherwise unmodified desktop session.  SynapseOS targets the inverse on each axis: any user of the machine regardless of command-line fluency, a locally-hosted small language model rather than a cloud dependency, and replacement of the session layer itself rather than an application running within it.  The mechanism is shared; the population, the model’s location, and the system’s place in the stack are not.</w:t>
       </w:r>
     </w:p>
     <w:p>
@@ -5230,12 +5797,12 @@
         <w:t xml:space="preserve">Fourth</w:t>
       </w:r>
       <w:r>
-        <w:t xml:space="preserve">, controlled comparison against the conventional graphical workflow exists only within a single application, on a single platform, with a cloud-hosted frontier model [21]; no such comparison exists for operating-system-level tasks under a locally-hosted model and an explicit safety gate.  SynapseOS — a conversational interface layer for the Linux desktop that translates natural-language intent into shell commands under a reversibility-based confirmation gate, evaluated against each participant’s own operating system — is positioned precisely against these four gaps.  Its relationship to the closest prior work is worth stating directly.  NaSh [9] proposes guardrails for an LLM-powered natural language shell — generated code that remains analyzable, selective undo, summaries of what a command would affect — as a design position, and explicitly leaves implementation and empirical evaluation as open work.  The present study is an implementation of that position, substituting for the general principle a static recoverability analysis, which derives what a command would affect from its structure before it runs, and an undo journal with five mechanisms, and supplying the user evaluation NaSh defers.</w:t>
-      </w:r>
-    </w:p>
-    <w:bookmarkEnd w:id="66"/>
-    <w:bookmarkEnd w:id="67"/>
-    <w:bookmarkStart w:id="68" w:name="sec2-9"/>
+        <w:t xml:space="preserve">, controlled comparison against the conventional graphical workflow exists only within a single application, on a single platform, with a cloud-hosted frontier model [23]; no such comparison exists for operating-system-level tasks under a locally-hosted model and an explicit safety gate.  SynapseOS — a conversational interface layer for the Linux desktop that translates natural-language intent into shell commands under a reversibility-based confirmation gate, evaluated against each participant’s own operating system — is positioned precisely against these four gaps.  Its relationship to the closest prior work is worth stating directly.  NaSh [11] proposes guardrails for an LLM-powered natural language shell — generated code that remains analyzable, selective undo, summaries of what a command would affect — as a design position, and explicitly leaves implementation and empirical evaluation as open work.  The present study is an implementation of that position, substituting for the general principle a static recoverability analysis, which derives what a command would affect from its structure before it runs, and an undo journal with five mechanisms, and supplying the user evaluation NaSh defers.</w:t>
+      </w:r>
+    </w:p>
+    <w:bookmarkEnd w:id="69"/>
+    <w:bookmarkEnd w:id="70"/>
+    <w:bookmarkStart w:id="71" w:name="sec2-9"/>
     <w:p>
       <w:pPr>
         <w:pStyle w:val="Heading2"/>
@@ -5249,7 +5816,7 @@
         <w:pStyle w:val="FirstParagraph"/>
       </w:pPr>
       <w:r>
-        <w:t xml:space="preserve">The algorithm is evaluated against ground truth observed by sandboxed execution, with paired statistical tests, as Chapter 3, Section 3.1 describes.  The methodological literature reviewed here shapes the validation study, in which the analysis is deployed in an interface and exercised by people, and so concerns how a conversational interface should be evaluated.  The evaluation practices of the surveyed work fall into three categories, each with a characteristic limitation.  Architectural demonstrations [9, 36] establish feasibility but provide no performance evidence.  Curated task benchmarks [7, 41, 48] provide reproducible, quantitative measures but assess the autonomous task completion of agents acting on a user’s behalf rather than the performance of a human working through an interface.  Human-centered user studies, exemplified by VoicePilot [28] and AXIS [21], provide the most direct evidence of an interface’s value to real users but remain rare in this literature and, where present, are confined to a single application rather than the operating system as a whole.  The instruments this study adopts are drawn from established practice rather than constructed for it: the System Usability Scale [3] for perceived usability, with its interpretation grounded in subsequent large-sample analysis [31], and the NASA Task Load Index [11] for perceived workload.</w:t>
+        <w:t xml:space="preserve">The algorithm is evaluated against ground truth observed by sandboxed execution, with paired statistical tests, as Chapter 3, Section 3.1 describes.  The methodological literature reviewed here shapes the validation study, in which the analysis is deployed in an interface and exercised by people, and so concerns how a conversational interface should be evaluated.  The evaluation practices of the surveyed work fall into three categories, each with a characteristic limitation.  Architectural demonstrations [11, 41] establish feasibility but provide no performance evidence.  Curated task benchmarks [8, 46, 53] provide reproducible, quantitative measures but assess the autonomous task completion of agents acting on a user’s behalf rather than the performance of a human working through an interface.  Human-centered user studies, exemplified by VoicePilot [30] and AXIS [23], provide the most direct evidence of an interface’s value to real users but remain rare in this literature and, where present, are confined to a single application rather than the operating system as a whole.  The instruments this study adopts are drawn from established practice rather than constructed for it: the System Usability Scale [3] for perceived usability, with its interpretation grounded in subsequent large-sample analysis [36], and the NASA Task Load Index [13] for perceived workload.</w:t>
       </w:r>
     </w:p>
     <w:p>
@@ -5305,7 +5872,7 @@
         <w:t xml:space="preserve"> </w:t>
       </w:r>
       <w:r>
-        <w:t xml:space="preserve">structure in the sense set out by Creswell and Plano Clark [6], collecting both strands concurrently and integrating them at the interpretation stage; the qualitative data, gathered through retrospective think-aloud over the screen recording and a semi-structured interview, are analyzed using the thematic-analysis method of Braun and Clarke [2], a widely adopted six-phase approach for identifying and reporting patterns in qualitative data.  Design considerations surfaced by the reviewed systems inform the evaluation directly: the preview-and-confirm guideline of VoicePilot [28] and the reversibility-and-guardrail framing of NaSh [9] together motivate an explicit validation of the confirmation gate and undo mechanism as part of the study.</w:t>
+        <w:t xml:space="preserve">structure in the sense set out by Creswell and Plano Clark [7], collecting both strands concurrently and integrating them at the interpretation stage; the qualitative data, gathered through retrospective think-aloud over the screen recording and a semi-structured interview, are analyzed using the thematic-analysis method of Braun and Clarke [2], a widely adopted six-phase approach for identifying and reporting patterns in qualitative data.  Design considerations surfaced by the reviewed systems inform the evaluation directly: the preview-and-confirm guideline of VoicePilot [30] and the reversibility-and-guardrail framing of NaSh [11] together motivate an explicit validation of the confirmation gate and undo mechanism as part of the study.</w:t>
       </w:r>
     </w:p>
     <w:p>
@@ -5316,8 +5883,8 @@
         <w:t xml:space="preserve">The specific instantiation of this methodology — the composition of the benchmark and custom task suite, the participant profile and screening criteria, the session procedure, the metrics and their computation, and the statistical and qualitative analysis plan — is presented in detail in Chapter 3.</w:t>
       </w:r>
     </w:p>
-    <w:bookmarkEnd w:id="68"/>
-    <w:bookmarkStart w:id="69" w:name="sec2-10"/>
+    <w:bookmarkEnd w:id="71"/>
+    <w:bookmarkStart w:id="72" w:name="sec2-10"/>
     <w:p>
       <w:pPr>
         <w:pStyle w:val="Heading2"/>
@@ -5331,7 +5898,7 @@
         <w:pStyle w:val="FirstParagraph"/>
       </w:pPr>
       <w:r>
-        <w:t xml:space="preserve">This chapter reviewed two literatures.  The first, on which the study’s algorithm builds, is program analysis: abstract interpretation and type-and-effect systems [5, 16, 35] supply its formal basis, the command guards of natural-language shells and coding agents [9, 17, 27] decide by permission rather than by effect, and the static analyses of shell programs [1, 8, 23] target properties adjacent to recoverability but not recoverability itself.  The second, in which the platform is situated, is the literature on natural-language and LLM-mediated interfaces to personal computing across nearly four decades, organized along a four-layer pipeline of Input, Reasoning, Action, and Operating-System Integration.  The historical foundations established the long-standing aspiration to a natural-language interface to a real operating system [40] and the methodological shift, driven by in-context reasoning [42], that made the current generation of systems possible.  The shell-and-command-line thread most directly related to the proposed design demonstrated that natural-language-to-Bash translation is tractable [38], that safety and reversibility are central concerns [9], and that local deployment is feasible [15], while leaving the extension from shell to session, and empirical user evaluation, as open work.  The graphical-agent literature across web, mobile, and desktop [7, 12, 13, 25, 30, 37, 45–48] established the field’s architectural patterns and its recurring bottleneck of visual grounding, while the accessibility thread [10, 24, 28, 29, 36] revealed a complementary limitation that a general conversational interface layer would resolve.  The evaluation literature [41, 43, 44] traced a capability ceiling that has risen sharply on short tasks while remaining low on long-horizon work, and exposed a methodological gap: interfaces are seldom evaluated comparatively against the conventional workflow with real users, and never yet at the level of the operating system itself.</w:t>
+        <w:t xml:space="preserve">This chapter reviewed two literatures.  The first, on which the study’s algorithm builds, is program analysis: abstract interpretation and type-and-effect systems [6, 18, 40] supply its formal basis, the command guards of natural-language shells and coding agents [11, 19, 29] decide by permission rather than by effect, the static analyses of shell programs [1, 10, 25] target properties adjacent to recoverability but not recoverability itself, and recovery mechanisms from snapshots to operating system transactions [4, 9, 32, 34, 35] restore after the fact, but wholesale or only on a system built for it.  The second, in which the platform is situated, is the literature on natural-language and LLM-mediated interfaces to personal computing across nearly four decades, organized along a four-layer pipeline of Input, Reasoning, Action, and Operating-System Integration.  The historical foundations established the long-standing aspiration to a natural-language interface to a real operating system [45] and the methodological shift, driven by in-context reasoning [47], that made the current generation of systems possible.  The shell-and-command-line thread most directly related to the proposed design demonstrated that natural-language-to-Bash translation is tractable [43], that safety and reversibility are central concerns [11], and that local deployment is feasible [17], while leaving the extension from shell to session, and empirical user evaluation, as open work.  The graphical-agent literature across web, mobile, and desktop [8, 14, 15, 27, 33, 42, 50–53] established the field’s architectural patterns and its recurring bottleneck of visual grounding, while the accessibility thread [12, 26, 30, 31, 41] revealed a complementary limitation that a general conversational interface layer would resolve.  The evaluation literature [46, 48, 49] traced a capability ceiling that has risen sharply on short tasks while remaining low on long-horizon work, and exposed a methodological gap: interfaces are seldom evaluated comparatively against the conventional workflow with real users, and never yet at the level of the operating system itself.</w:t>
       </w:r>
     </w:p>
     <w:p>
@@ -5342,8 +5909,8 @@
         <w:t xml:space="preserve">Synthesized, the surveyed works reveal a fourfold gap: no analysis of what a generated command would destroy, every guard being a list of dangerous patterns; no conversational replacement for the graphical session layer; no coverage of the Linux desktop; and no controlled comparison of a conversational interface against the conventional workflow across user populations.  The first is the gap the present study’s research addresses, through a recoverability analysis of generated shell commands evaluated against ground truth obtained by sandboxed execution.  The other three describe the setting in which that gap arises, and SynapseOS, the conversational interface layer for the Linux desktop built as the analysis’s experimental platform, is where the analysis is deployed and validated in use, through a controlled, within-subjects comparison against each participant’s own operating system.  The methodology through which this evaluation is conducted is the subject of Chapter 3.</w:t>
       </w:r>
     </w:p>
-    <w:bookmarkEnd w:id="69"/>
-    <w:bookmarkStart w:id="72" w:name="ch2-notes"/>
+    <w:bookmarkEnd w:id="72"/>
+    <w:bookmarkStart w:id="75" w:name="ch2-notes"/>
     <w:p>
       <w:pPr>
         <w:pStyle w:val="Heading2"/>
@@ -5360,11 +5927,11 @@
           <w:numId w:val="1006"/>
         </w:numPr>
       </w:pPr>
-      <w:bookmarkStart w:id="70" w:name="ch2-fn1"/>
+      <w:bookmarkStart w:id="73" w:name="ch2-fn1"/>
       <w:r>
         <w:t xml:space="preserve">A computer-using agent is an artificial-intelligence system that operates a computing environment by issuing actions and observing their results.  A GUI agent is a computer-using agent whose action space consists of operations on a graphical user interface — typically clicks, key presses, scrolls, and text entry — usually driven by a large language model or a multimodal (vision-language) model that additionally accepts images as input.</w:t>
       </w:r>
-      <w:bookmarkEnd w:id="70"/>
+      <w:bookmarkEnd w:id="73"/>
     </w:p>
     <w:p>
       <w:pPr>
@@ -5374,14 +5941,14 @@
           <w:numId w:val="1006"/>
         </w:numPr>
       </w:pPr>
-      <w:bookmarkStart w:id="71" w:name="ch2-fn2"/>
+      <w:bookmarkStart w:id="74" w:name="ch2-fn2"/>
       <w:r>
         <w:t xml:space="preserve">Grounding is the problem of mapping a model’s textual plan onto a concrete operation in the environment.  Visual grounding is the specific subproblem of identifying the on-screen pixel region corresponding to a referenced interface element — repeatedly identified in the surveyed literature as the principal bottleneck for graphical agents, and one that a command-line approach avoids by grounding intent into shell commands rather than into screen coordinates.</w:t>
       </w:r>
-      <w:bookmarkEnd w:id="71"/>
-    </w:p>
-    <w:bookmarkEnd w:id="72"/>
-    <w:bookmarkStart w:id="73" w:name="sec-chapter3"/>
+      <w:bookmarkEnd w:id="74"/>
+    </w:p>
+    <w:bookmarkEnd w:id="75"/>
+    <w:bookmarkStart w:id="76" w:name="sec-chapter3"/>
     <w:p>
       <w:pPr>
         <w:pStyle w:val="FirstParagraph"/>
@@ -5398,7 +5965,7 @@
         <w:t xml:space="preserve">Methodology</w:t>
       </w:r>
     </w:p>
-    <w:bookmarkEnd w:id="73"/>
+    <w:bookmarkEnd w:id="76"/>
     <w:p>
       <w:pPr>
         <w:pStyle w:val="BodyText"/>
@@ -5491,7 +6058,7 @@
         <w:t xml:space="preserve">Two evaluations follow, of different standing.  The corpus evaluation in Sections 3.1 and 3.2 is the study’s primary evidence: it answers the research questions against a labeled corpus whose ground truth comes from sandboxed execution, without reference to any participant.  The validation study, defined in Section 1 and Sections 3.3 onward and run on the platform described in Section 2, deploys the analysis in SynapseOS and has participants use it on matched tasks.  It checks that the analysis’s decisions carry through to real files and hold on commands people cause, which the corpus does not contain, and it characterizes the platform through usability measures.  Neither evaluation depends on the other: the analysis takes a shell command as a string and is indifferent to what produced it, so removing the interface would remove the validation study but leave every research question, its corpus, its baselines, and its results intact.</w:t>
       </w:r>
     </w:p>
-    <w:bookmarkStart w:id="77" w:name="sec-conceptual-framework"/>
+    <w:bookmarkStart w:id="80" w:name="sec-conceptual-framework"/>
     <w:p>
       <w:pPr>
         <w:pStyle w:val="Heading2"/>
@@ -5513,7 +6080,7 @@
         <w:pStyle w:val="BodyText"/>
       </w:pPr>
       <w:r>
-        <w:t xml:space="preserve">The framework is evaluated in two parts of different standing.  The recoverability analyzer, the study’s research contribution, is evaluated on its own, on a corpus of commands whose ground truth is obtained by sandboxed execution (Sections 3.1 and 3.2).  The analyzer is then validated in use, deployed in the platform, through a controlled study in which participants complete a fixed set of tasks under two conditions: using SynapseOS as the interface, and using their own primary operating system — Windows, macOS, or Linux — as the baseline.  The study records the analyzer’s decision on every command participants cause, so its behaviour in use can be compared with its behaviour on the corpus, and its expert baseline design, which pits SynapseOS against the environment each participant already knows and uses daily, characterizes the platform through task completion time, error rate, and user satisfaction across the real-world OS landscape [41].</w:t>
+        <w:t xml:space="preserve">The framework is evaluated in two parts of different standing.  The recoverability analyzer, the study’s research contribution, is evaluated on its own, on a corpus of commands whose ground truth is obtained by sandboxed execution (Sections 3.1 and 3.2).  The analyzer is then validated in use, deployed in the platform, through a controlled study in which participants complete a fixed set of tasks under two conditions: using SynapseOS as the interface, and using their own primary operating system — Windows, macOS, or Linux — as the baseline.  The study records the analyzer’s decision on every command participants cause, so its behaviour in use can be compared with its behaviour on the corpus, and its expert baseline design, which pits SynapseOS against the environment each participant already knows and uses daily, characterizes the platform through task completion time, error rate, and user satisfaction across the real-world OS landscape [46].</w:t>
       </w:r>
     </w:p>
     <w:p>
@@ -5525,18 +6092,18 @@
           <wp:inline>
             <wp:extent cx="5334000" cy="4175521"/>
             <wp:effectExtent b="0" l="0" r="0" t="0"/>
-            <wp:docPr descr="" title="" id="75" name="Picture"/>
+            <wp:docPr descr="" title="" id="78" name="Picture"/>
             <a:graphic>
               <a:graphicData uri="http://schemas.openxmlformats.org/drawingml/2006/picture">
                 <pic:pic>
                   <pic:nvPicPr>
-                    <pic:cNvPr descr="/tmp/claude-1000/-home-willard-projects-thesis/cb82e7af-8c35-489a-a7f7-ef49172efea2/scratchpad/docx/work4/fig1.png" id="76" name="Picture"/>
+                    <pic:cNvPr descr="/tmp/claude-1000/-home-willard-projects-thesis/cb82e7af-8c35-489a-a7f7-ef49172efea2/scratchpad/docx/work5/fig1.png" id="79" name="Picture"/>
                     <pic:cNvPicPr>
                       <a:picLocks noChangeArrowheads="1" noChangeAspect="1"/>
                     </pic:cNvPicPr>
                   </pic:nvPicPr>
                   <pic:blipFill>
-                    <a:blip r:embed="rId74"/>
+                    <a:blip r:embed="rId77"/>
                     <a:stretch>
                       <a:fillRect/>
                     </a:stretch>
@@ -5581,8 +6148,8 @@
         <w:t xml:space="preserve">Conceptual framework: the recoverability analysis and the platform that deploys it.  A request in ordinary language is translated by a local language model into a shell command.  Before the command runs, the analysis derives its effect set (EFFECTS, Objectives 1–2), learning targets known only at run time through read-only dry runs in a sandbox (RESOLVE); decides whether it can be undone (VERDICT); and computes the minimum-cost set of pre-images to capture (PLAN, Objective 3).  Anything it cannot determine makes it ask.  The verdict drives the confirmation gate; the plan’s captures are taken before execution and recorded in the undo journal, from which undo restores.  The analysis is evaluated on a labeled command corpus (Sections 3.1–3.2) and validated in use with participants (Sections 3.3–3.7).</w:t>
       </w:r>
     </w:p>
-    <w:bookmarkEnd w:id="77"/>
-    <w:bookmarkStart w:id="78" w:name="sec-system-env"/>
+    <w:bookmarkEnd w:id="80"/>
+    <w:bookmarkStart w:id="81" w:name="sec-system-env"/>
     <w:p>
       <w:pPr>
         <w:pStyle w:val="Heading2"/>
@@ -6213,8 +6780,8 @@
         <w:t xml:space="preserve">— a single non-interactive invocation, with no session persisting between separate calls, that runs a bounded loop toward one natural-language request: propose a command, pass it through the same reversibility-based confirmation gate described in the Execution Pipeline (Section 2.1(e)) — executing immediately if reversible, blocking pending explicit confirmation if not — then feed the result back so the model can propose the next step or signal completion, up to a fixed step limit, before the invocation exits, sharing TUI mode’s minimal hardware footprint but intended for scripting and automation rather than an interactive session.  Neither CLI nor TUI mode is evaluated in the user study.</w:t>
       </w:r>
     </w:p>
-    <w:bookmarkEnd w:id="78"/>
-    <w:bookmarkStart w:id="92" w:name="sec1"/>
+    <w:bookmarkEnd w:id="81"/>
+    <w:bookmarkStart w:id="95" w:name="sec1"/>
     <w:p>
       <w:pPr>
         <w:pStyle w:val="Heading2"/>
@@ -6231,7 +6798,7 @@
         <w:t xml:space="preserve">The study gathers two kinds of data.  The primary dataset is a held-out corpus of shell commands, each labeled by running it in a sandbox, on which the analysis is evaluated against its baselines and its ablations (Objectives 4 and 5).  The remaining data serve the validation study, in which the analysis is deployed in SynapseOS and exercised by participants, in three categories: benchmark task data used to exercise the platform in a standardized environment, user study data collected from human participants in a controlled setting, and system performance data, including the analysis’s decision on every command, captured automatically through built-in telemetry during all sessions.</w:t>
       </w:r>
     </w:p>
-    <w:bookmarkStart w:id="83" w:name="ch3-sec1-1"/>
+    <w:bookmarkStart w:id="86" w:name="ch3-sec1-1"/>
     <w:p>
       <w:pPr>
         <w:pStyle w:val="Heading3"/>
@@ -6240,7 +6807,7 @@
         <w:t xml:space="preserve">1.1 What to gather</w:t>
       </w:r>
     </w:p>
-    <w:bookmarkStart w:id="79" w:name="a-command-corpus"/>
+    <w:bookmarkStart w:id="82" w:name="a-command-corpus"/>
     <w:p>
       <w:pPr>
         <w:pStyle w:val="Heading4"/>
@@ -6254,11 +6821,11 @@
         <w:pStyle w:val="FirstParagraph"/>
       </w:pPr>
       <w:r>
-        <w:t xml:space="preserve">The primary dataset is a corpus of shell commands.  Each command is paired with a fixture — the files and directories that exist when it runs — and with a ground-truth label observed by running it on that fixture in a sandbox: whether it loses nothing, loses something a captured pre-image could restore, or acts outside the filesystem.  The corpus is held as four partitions: human-written commands from NL2Bash [19], templates covering each shell composition operator, commands whose effect lies outside the filesystem, and commands the deployed model itself wrote.  For every command, each configuration compared in Section 3 records its decision: whether it would ask, and what it would capture.  The configurations are the analysis, its baselines, and its ablations.  For every command the analysis would let run, the command is also executed, undone, and the tree compared, which records whether the capture restored the prior state.</w:t>
-      </w:r>
-    </w:p>
-    <w:bookmarkEnd w:id="79"/>
-    <w:bookmarkStart w:id="80" w:name="b-benchmark-task-suite"/>
+        <w:t xml:space="preserve">The primary dataset is a corpus of shell commands.  Each command is paired with a fixture — the files and directories that exist when it runs — and with a ground-truth label observed by running it on that fixture in a sandbox: whether it loses nothing, loses something a captured pre-image could restore, or acts outside the filesystem.  The corpus is held as four partitions: human-written commands from NL2Bash [21], templates covering each shell composition operator, commands whose effect lies outside the filesystem, and commands the deployed model itself wrote.  For every command, each configuration compared in Section 3 records its decision: whether it would ask, and what it would capture.  The configurations are the analysis, its baselines, and its ablations.  For every command the analysis would let run, the command is also executed, undone, and the tree compared, which records whether the capture restored the prior state.</w:t>
+      </w:r>
+    </w:p>
+    <w:bookmarkEnd w:id="82"/>
+    <w:bookmarkStart w:id="83" w:name="b-benchmark-task-suite"/>
     <w:p>
       <w:pPr>
         <w:pStyle w:val="Heading4"/>
@@ -6272,11 +6839,11 @@
         <w:pStyle w:val="FirstParagraph"/>
       </w:pPr>
       <w:r>
-        <w:t xml:space="preserve">The primary benchmark dataset is the OSWorld task suite [41], which provides standardized real-computer tasks across shell operations, file management, web browsing, and application-level interactions.  OSWorld is the only existing benchmark that evaluates computer-using agents in real operating system environments, making it the most appropriate external standard for SynapseOS evaluation.  Tasks are presented as natural language instructions; agents interact with a real virtual machine environment, and outcomes are evaluated by automated inspection of the resulting system state — whether the goal was actually achieved — rather than by comparing individual actions.  In addition to OSWorld tasks, a custom cross-platform task suite is developed for this study, covering file search and organization, system and process monitoring, application and package management, and text and data processing — each task defined as a human-level goal achievable via SynapseOS natural language commands and via native OS tools on the comparison machine.  Each task in both suites is documented with a description, expected outcome, task category, and difficulty level.</w:t>
-      </w:r>
-    </w:p>
-    <w:bookmarkEnd w:id="80"/>
-    <w:bookmarkStart w:id="81" w:name="c-user-study-data"/>
+        <w:t xml:space="preserve">The primary benchmark dataset is the OSWorld task suite [46], which provides standardized real-computer tasks across shell operations, file management, web browsing, and application-level interactions.  OSWorld is the only existing benchmark that evaluates computer-using agents in real operating system environments, making it the most appropriate external standard for SynapseOS evaluation.  Tasks are presented as natural language instructions; agents interact with a real virtual machine environment, and outcomes are evaluated by automated inspection of the resulting system state — whether the goal was actually achieved — rather than by comparing individual actions.  In addition to OSWorld tasks, a custom cross-platform task suite is developed for this study, covering file search and organization, system and process monitoring, application and package management, and text and data processing — each task defined as a human-level goal achievable via SynapseOS natural language commands and via native OS tools on the comparison machine.  Each task in both suites is documented with a description, expected outcome, task category, and difficulty level.</w:t>
+      </w:r>
+    </w:p>
+    <w:bookmarkEnd w:id="83"/>
+    <w:bookmarkStart w:id="84" w:name="c-user-study-data"/>
     <w:p>
       <w:pPr>
         <w:pStyle w:val="Heading4"/>
@@ -6356,7 +6923,7 @@
         <w:t xml:space="preserve"> </w:t>
       </w:r>
       <w:r>
-        <w:t xml:space="preserve">responses to the System Usability Scale (SUS) [3] and the NASA Task Load Index (NASA-TLX) [11], collected immediately after each condition; both are validated instruments for measuring perceived usability and cognitive workload respectively</w:t>
+        <w:t xml:space="preserve">responses to the System Usability Scale (SUS) [3] and the NASA Task Load Index (NASA-TLX) [13], collected immediately after each condition; both are validated instruments for measuring perceived usability and cognitive workload respectively</w:t>
       </w:r>
     </w:p>
     <w:p>
@@ -6381,8 +6948,8 @@
         <w:t xml:space="preserve">responses gathered through a semi-structured post-study interview covering perceived ease of use, trust in the system, and comparison between the two conditions</w:t>
       </w:r>
     </w:p>
-    <w:bookmarkEnd w:id="81"/>
-    <w:bookmarkStart w:id="82" w:name="d-system-performance-data"/>
+    <w:bookmarkEnd w:id="84"/>
+    <w:bookmarkStart w:id="85" w:name="d-system-performance-data"/>
     <w:p>
       <w:pPr>
         <w:pStyle w:val="Heading4"/>
@@ -6471,9 +7038,9 @@
         <w:t xml:space="preserve">Intent parsing accuracy: whether the system correctly identified the user’s intent on the first attempt</w:t>
       </w:r>
     </w:p>
-    <w:bookmarkEnd w:id="82"/>
-    <w:bookmarkEnd w:id="83"/>
-    <w:bookmarkStart w:id="88" w:name="ch3-sec1-2"/>
+    <w:bookmarkEnd w:id="85"/>
+    <w:bookmarkEnd w:id="86"/>
+    <w:bookmarkStart w:id="91" w:name="ch3-sec1-2"/>
     <w:p>
       <w:pPr>
         <w:pStyle w:val="Heading3"/>
@@ -6482,7 +7049,7 @@
         <w:t xml:space="preserve">1.2 How to gather</w:t>
       </w:r>
     </w:p>
-    <w:bookmarkStart w:id="84" w:name="a-command-corpus-1"/>
+    <w:bookmarkStart w:id="87" w:name="a-command-corpus-1"/>
     <w:p>
       <w:pPr>
         <w:pStyle w:val="Heading4"/>
@@ -6496,7 +7063,7 @@
         <w:pStyle w:val="FirstParagraph"/>
       </w:pPr>
       <w:r>
-        <w:t xml:space="preserve">The corpus is generated by a program, not assembled by hand, and is held as four partitions reported separately rather than pooled.  The first is NL2Bash [19], which supplies human-written commands and is the generalization set: candidates are drawn at random from the dataset with a recorded seed, excluding any command used during development.  The second is a set of parameterized command templates covering each shell composition operator — sequencing, conditional execution, pipelines, redirects, command substitution, loops,</w:t>
+        <w:t xml:space="preserve">The corpus is generated by a program, not assembled by hand, and is held as four partitions reported separately rather than pooled.  The first is NL2Bash [21], which supplies human-written commands and is the generalization set: candidates are drawn at random from the dataset with a recorded seed, excluding any command used during development.  The second is a set of parameterized command templates covering each shell composition operator — sequencing, conditional execution, pipelines, redirects, command substitution, loops,</w:t>
       </w:r>
       <w:r>
         <w:t xml:space="preserve"> </w:t>
@@ -6576,8 +7143,8 @@
         <w:t xml:space="preserve">A second stratification is by the shape of the command, assigned by the generator from the command’s syntax: a single named command; a chain; one whose targets are computed while it runs; a redirect; one whose effect hides inside an interpreter or a tool the rule table does not name; and one whose effect lies outside the filesystem.  The claims under test concern the composed, run-time, and hidden shapes, and a corpus dominated by plain named commands would measure the strength of a list and not the contribution of the analysis, so results are reported per shape as well as in aggregate.</w:t>
       </w:r>
     </w:p>
-    <w:bookmarkEnd w:id="84"/>
-    <w:bookmarkStart w:id="85" w:name="b-ground-truth-by-sandboxed-execution"/>
+    <w:bookmarkEnd w:id="87"/>
+    <w:bookmarkStart w:id="88" w:name="b-ground-truth-by-sandboxed-execution"/>
     <w:p>
       <w:pPr>
         <w:pStyle w:val="Heading4"/>
@@ -6714,8 +7281,8 @@
         <w:t xml:space="preserve">The generator shares no code with the analysis and never consults it, so agreement between the two is evidence and not circularity.  It is deterministic for a given seed, and it records the number of candidates drawn and the reasons for each exclusion beside the corpus.  There is no human labeler, and so no labeler disagreement to measure; the threat that takes its place is the validity of the oracle itself, addressed in Section 3.1(e).</w:t>
       </w:r>
     </w:p>
-    <w:bookmarkEnd w:id="85"/>
-    <w:bookmarkStart w:id="86" w:name="c-benchmark-tasks"/>
+    <w:bookmarkEnd w:id="88"/>
+    <w:bookmarkStart w:id="89" w:name="c-benchmark-tasks"/>
     <w:p>
       <w:pPr>
         <w:pStyle w:val="Heading4"/>
@@ -6729,11 +7296,11 @@
         <w:pStyle w:val="FirstParagraph"/>
       </w:pPr>
       <w:r>
-        <w:t xml:space="preserve">SynapseOS is deployed on the Debian 13 (Trixie) environment matching the OSWorld evaluation setup [41].  Each benchmark task is executed through the conversational interface, and results are captured programmatically through the built-in telemetry system.  Each task is supplied to SynapseOS as a natural language instruction, and the resulting system state is compared against the expected outcome defined in the benchmark.  Because SynapseOS gates every command classified irreversible on explicit confirmation, benchmark runs are facilitator-attended rather than unattended; the confirmation gate remains active throughout and every confirmation is logged as part of the run record.  OSWorld scores the resulting system state rather than a human operator’s performance, so it applies only to the SynapseOS condition.  Condition B, which a human participant operates directly, has no equivalent and is instead evaluated through the custom cross-platform task suite administered in the user study (Section 1.2(d)).</w:t>
-      </w:r>
-    </w:p>
-    <w:bookmarkEnd w:id="86"/>
-    <w:bookmarkStart w:id="87" w:name="d-user-study"/>
+        <w:t xml:space="preserve">SynapseOS is deployed on the Debian 13 (Trixie) environment matching the OSWorld evaluation setup [46].  Each benchmark task is executed through the conversational interface, and results are captured programmatically through the built-in telemetry system.  Each task is supplied to SynapseOS as a natural language instruction, and the resulting system state is compared against the expected outcome defined in the benchmark.  Because SynapseOS gates every command classified irreversible on explicit confirmation, benchmark runs are facilitator-attended rather than unattended; the confirmation gate remains active throughout and every confirmation is logged as part of the run record.  OSWorld scores the resulting system state rather than a human operator’s performance, so it applies only to the SynapseOS condition.  Condition B, which a human participant operates directly, has no equivalent and is instead evaluated through the custom cross-platform task suite administered in the user study (Section 1.2(d)).</w:t>
+      </w:r>
+    </w:p>
+    <w:bookmarkEnd w:id="89"/>
+    <w:bookmarkStart w:id="90" w:name="d-user-study"/>
     <w:p>
       <w:pPr>
         <w:pStyle w:val="Heading4"/>
@@ -6818,9 +7385,9 @@
         <w:t xml:space="preserve">After completing each condition, participants fill out the SUS and NASA-TLX questionnaires.  After completing both conditions, a brief semi-structured interview is conducted to gather qualitative feedback.</w:t>
       </w:r>
     </w:p>
-    <w:bookmarkEnd w:id="87"/>
-    <w:bookmarkEnd w:id="88"/>
-    <w:bookmarkStart w:id="89" w:name="ch3-sec1-3"/>
+    <w:bookmarkEnd w:id="90"/>
+    <w:bookmarkEnd w:id="91"/>
+    <w:bookmarkStart w:id="92" w:name="ch3-sec1-3"/>
     <w:p>
       <w:pPr>
         <w:pStyle w:val="Heading3"/>
@@ -6850,7 +7417,7 @@
         <w:pStyle w:val="BodyText"/>
       </w:pPr>
       <w:r>
-        <w:t xml:space="preserve">The OSWorld benchmark is used as the primary evaluation standard because it is the only existing benchmark that evaluates computer-using agents in real operating system environments with real applications [41].  Its use allows SynapseOS results to be situated within the existing literature.</w:t>
+        <w:t xml:space="preserve">The OSWorld benchmark is used as the primary evaluation standard because it is the only existing benchmark that evaluates computer-using agents in real operating system environments with real applications [46].  Its use allows SynapseOS results to be situated within the existing literature.</w:t>
       </w:r>
     </w:p>
     <w:p>
@@ -6890,11 +7457,11 @@
         <w:pStyle w:val="BodyText"/>
       </w:pPr>
       <w:r>
-        <w:t xml:space="preserve">The dual-population design — novice and power users — directly addresses the gap identified in Chapter 1, where no prior work has evaluated a conversational interface across user populations with differing technical backgrounds [41].  The validation data serve two purposes.  The system performance data, including the analysis’s decision on every command participants cause, validate the analysis in use: they show whether its verdicts and captures hold on commands the corpus does not contain, and whether undo restores what participants’ commands changed.  The user study metrics and benchmark coverage characterize the platform on which it is deployed.  The research questions themselves are answered against the labeled command corpus described in Section 3.1.</w:t>
-      </w:r>
-    </w:p>
-    <w:bookmarkEnd w:id="89"/>
-    <w:bookmarkStart w:id="90" w:name="ch3-sec1-4"/>
+        <w:t xml:space="preserve">The dual-population design — novice and power users — directly addresses the gap identified in Chapter 1, where no prior work has evaluated a conversational interface across user populations with differing technical backgrounds [46].  The validation data serve two purposes.  The system performance data, including the analysis’s decision on every command participants cause, validate the analysis in use: they show whether its verdicts and captures hold on commands the corpus does not contain, and whether undo restores what participants’ commands changed.  The user study metrics and benchmark coverage characterize the platform on which it is deployed.  The research questions themselves are answered against the labeled command corpus described in Section 3.1.</w:t>
+      </w:r>
+    </w:p>
+    <w:bookmarkEnd w:id="92"/>
+    <w:bookmarkStart w:id="93" w:name="ch3-sec1-4"/>
     <w:p>
       <w:pPr>
         <w:pStyle w:val="Heading3"/>
@@ -7019,8 +7586,8 @@
         <w:t xml:space="preserve">if they report advanced proficiency on their primary OS — capable of performing file management, process monitoring, and system administration tasks efficiently using that OS’s native tools — regardless of which OS that is, and pass all three behavioral screener tasks.  Participants whose self-report and behavioral screener results disagree, or who do not clearly satisfy either classification, are excluded.  Primary OS is recorded for all participants as a grouping variable, and prior conversational AI exposure as a covariate, in the analysis; prior AI exposure is analyzed as an exploratory covariate only (see Section 3.4) rather than a primary grouping variable, since splitting the sample along a third axis would leave subgroups too small to support a hypothesis test.</w:t>
       </w:r>
     </w:p>
-    <w:bookmarkEnd w:id="90"/>
-    <w:bookmarkStart w:id="91" w:name="ch3-sec1-5"/>
+    <w:bookmarkEnd w:id="93"/>
+    <w:bookmarkStart w:id="94" w:name="ch3-sec1-5"/>
     <w:p>
       <w:pPr>
         <w:pStyle w:val="Heading3"/>
@@ -7133,9 +7700,9 @@
         <w:t xml:space="preserve">The custom task suite comprises tasks organized into four categories: file search and organization, system and process monitoring, application and package management, and text and data processing.  All tasks are defined at the human-goal level — achievable via SynapseOS natural language on the evaluation machine and via native graphical or terminal tools on the comparison machine.  Each task is documented with a unique identifier, a natural language prompt as presented to the participant, the expected outcome, and the assigned difficulty level.  The full suite — twelve core tasks in two parallel forms, plus four boundary tasks lying outside shell expressibility that are scored and reported separately — is given in Appendix C.  Difficulty calibration and form equivalence are validated during the pilot study and revised as necessary before the main study begins.</w:t>
       </w:r>
     </w:p>
-    <w:bookmarkEnd w:id="91"/>
-    <w:bookmarkEnd w:id="92"/>
-    <w:bookmarkStart w:id="103" w:name="sec2"/>
+    <w:bookmarkEnd w:id="94"/>
+    <w:bookmarkEnd w:id="95"/>
+    <w:bookmarkStart w:id="106" w:name="sec2"/>
     <w:p>
       <w:pPr>
         <w:pStyle w:val="Heading2"/>
@@ -7152,7 +7719,7 @@
         <w:t xml:space="preserve">The procedure has two parts.  The recoverability analysis, the study’s contribution, is designed and specified first, in the order of the objectives it serves: its effect-semantics model, its effect-composition algorithm, and its recovery-plan generation.  SynapseOS, the experimental platform in which it is deployed, follows, together with the scaffolding that makes the validation study trustworthy: collected data is processed and pseudonymized, the system and instruments are validated, each participant session follows a standardized procedure, and participant welfare is protected throughout.</w:t>
       </w:r>
     </w:p>
-    <w:bookmarkStart w:id="98" w:name="ch3-sec2-1"/>
+    <w:bookmarkStart w:id="101" w:name="ch3-sec2-1"/>
     <w:p>
       <w:pPr>
         <w:pStyle w:val="Heading3"/>
@@ -7169,7 +7736,7 @@
         <w:t xml:space="preserve">The design comprises the recoverability analysis, specified in (a) to (c), one part per objective, and the experimental platform in which it is deployed, in (d) and (e): a conversational interface layer and an execution pipeline, integrated into a unified session manager that launches over the conventional Linux graphical desktop session rather than replacing it.</w:t>
       </w:r>
     </w:p>
-    <w:bookmarkStart w:id="93" w:name="a-effect-semantics-model-objective-1"/>
+    <w:bookmarkStart w:id="96" w:name="a-effect-semantics-model-objective-1"/>
     <w:p>
       <w:pPr>
         <w:pStyle w:val="Heading4"/>
@@ -7518,8 +8085,8 @@
         <w:t xml:space="preserve">The effect domain is the filesystem, extended to two kinds of state on the target system that have no pre-image to copy but do have an inverse: installed packages and running or enabled services.  For these the analysis does not re-implement the package manager or the service manager.  It asks the system’s own tools what the command would do — the package manager’s simulation mode, the package database, and the service manager’s state queries — and derives from the answer the command that puts the state back: a purge for an install, a versioned install for a removal or upgrade, a stop for a start, a disable for an enable.  A change is recoverable only if that inverse exists, so removing a package whose old version no repository still offers is unrecoverable, and purging a package also captures its configuration files as removals.  Undo runs the inverse, with elevated privilege if the original had it, and prints the command for the user to run if it fails.  Not represented are what maintainer scripts and a service’s own start-up do beyond the state change, which are arbitrary programs; network mutations and anything on a remote host; and other package managers, which stay unrecoverable unless plainly read-only.  A command whose principal effect is one of these is classified unrecoverable by the soundness rule above.  This is safe but coarse, and it is stated as a limitation of the model rather than deferred to the results.</w:t>
       </w:r>
     </w:p>
-    <w:bookmarkEnd w:id="93"/>
-    <w:bookmarkStart w:id="94" w:name="Xd946fc8713be5a40002891fd02cb45803a6005b"/>
+    <w:bookmarkEnd w:id="96"/>
+    <w:bookmarkStart w:id="97" w:name="Xd946fc8713be5a40002891fd02cb45803a6005b"/>
     <w:p>
       <w:pPr>
         <w:pStyle w:val="Heading4"/>
@@ -7939,8 +8506,8 @@
         <w:t xml:space="preserve">, the body of a command substitution — and analyses the command again with the concrete targets in place.  A resolver is run only if the same analysis proves it has no effects, and it runs inside the bubblewrap sandbox with the whole filesystem mounted read-only; without bubblewrap, resolution is switched off and the command asks.  If it cannot be proven read-only, cannot run, or times out, the targets stay unresolved and the command asks.  Resolution is what makes a capture possible for commands whose targets a static reading cannot name.</w:t>
       </w:r>
     </w:p>
-    <w:bookmarkEnd w:id="94"/>
-    <w:bookmarkStart w:id="95" w:name="X7a556f1ad9397eabc869c1d1cec4dddff31661e"/>
+    <w:bookmarkEnd w:id="97"/>
+    <w:bookmarkStart w:id="98" w:name="X7a556f1ad9397eabc869c1d1cec4dddff31661e"/>
     <w:p>
       <w:pPr>
         <w:pStyle w:val="Heading4"/>
@@ -8739,8 +9306,8 @@
         <w:t xml:space="preserve">EFFECTS derives and composes the effect set, applying rules to the leaves and resolving wrappers through RESOLVE; RESOLVE learns run-time targets by running only a form of the command proven to have no effects; VERDICT and PLAN decide and cover.  UNRESOLVED and UNKNOWN are the sentinels that give the analysis its one-sided soundness: they can only push the verdict toward UNRECOVERABLE.  A move (a removal whose data survives at another path) is the only removal PLAN does not capture.</w:t>
       </w:r>
     </w:p>
-    <w:bookmarkEnd w:id="95"/>
-    <w:bookmarkStart w:id="96" w:name="X5a80e7e58358dac7f19a61ad7301f220b3369ff"/>
+    <w:bookmarkEnd w:id="98"/>
+    <w:bookmarkStart w:id="99" w:name="X5a80e7e58358dac7f19a61ad7301f220b3369ff"/>
     <w:p>
       <w:pPr>
         <w:pStyle w:val="Heading4"/>
@@ -8793,7 +9360,7 @@
         <w:t xml:space="preserve"> </w:t>
       </w:r>
       <w:r>
-        <w:t xml:space="preserve">code-specialized model that demonstrated the strongest natural language-to-bash translation accuracy among models below 7B parameters in controlled evaluation [38].  Among the models directly compared in that evaluation, its code-specialized pretraining produced a clear margin over general-purpose models of comparable or larger size — 58% NL2Bash accuracy with prompt engineering, versus 49% for Llama 3.2-3B and 37% for a LoRA-fine-tuned Llama 3.2-1B — attributable to Qwen2.5-Coder’s training corpus of 5.5 trillion code tokens against Llama 3.2's general-purpose pretraining.  At 4-bit quantization</w:t>
+        <w:t xml:space="preserve">code-specialized model that demonstrated the strongest natural language-to-bash translation accuracy among models below 7B parameters in controlled evaluation [43].  Among the models directly compared in that evaluation, its code-specialized pretraining produced a clear margin over general-purpose models of comparable or larger size — 58% NL2Bash accuracy with prompt engineering, versus 49% for Llama 3.2-3B and 37% for a LoRA-fine-tuned Llama 3.2-1B — attributable to Qwen2.5-Coder’s training corpus of 5.5 trillion code tokens against Llama 3.2's general-purpose pretraining.  At 4-bit quantization</w:t>
       </w:r>
       <w:hyperlink w:anchor="ch3-fn6">
         <w:r>
@@ -8843,19 +9410,19 @@
         <w:pStyle w:val="BodyText"/>
       </w:pPr>
       <w:r>
-        <w:t xml:space="preserve">Accuracy is measured using an execution-based scoring methodology rather than syntax-level string matching, following Westenfelder et al. [38] — see Section 2.3 for the full evaluation procedure.</w:t>
-      </w:r>
-    </w:p>
-    <w:p>
-      <w:pPr>
-        <w:pStyle w:val="BodyText"/>
-      </w:pPr>
-      <w:r>
-        <w:t xml:space="preserve">This selection was reconfirmed against models released after the initial literature review, to guard against the fast-moving small-model landscape becoming stale before study execution; no smaller alternative offered comparable shell-generation evidence within the same CPU-only hardware budget [15].  Newer mixture-of-experts variants require all experts resident in memory regardless of active parameters per token, which is incompatible with this study’s memory budget, and newer general-purpose small models report reasoning benchmarks but no shell-command generation evidence.</w:t>
-      </w:r>
-    </w:p>
-    <w:bookmarkEnd w:id="96"/>
-    <w:bookmarkStart w:id="97" w:name="e-execution-pipeline"/>
+        <w:t xml:space="preserve">Accuracy is measured using an execution-based scoring methodology rather than syntax-level string matching, following Westenfelder et al. [43] — see Section 2.3 for the full evaluation procedure.</w:t>
+      </w:r>
+    </w:p>
+    <w:p>
+      <w:pPr>
+        <w:pStyle w:val="BodyText"/>
+      </w:pPr>
+      <w:r>
+        <w:t xml:space="preserve">This selection was reconfirmed against models released after the initial literature review, to guard against the fast-moving small-model landscape becoming stale before study execution; no smaller alternative offered comparable shell-generation evidence within the same CPU-only hardware budget [17].  Newer mixture-of-experts variants require all experts resident in memory regardless of active parameters per token, which is incompatible with this study’s memory budget, and newer general-purpose small models report reasoning benchmarks but no shell-command generation evidence.</w:t>
+      </w:r>
+    </w:p>
+    <w:bookmarkEnd w:id="99"/>
+    <w:bookmarkStart w:id="100" w:name="e-execution-pipeline"/>
     <w:p>
       <w:pPr>
         <w:pStyle w:val="Heading4"/>
@@ -8869,20 +9436,20 @@
         <w:pStyle w:val="FirstParagraph"/>
       </w:pPr>
       <w:r>
-        <w:t xml:space="preserve">Once the intent parser produces a shell command, SynapseOS passes it through a confirmation gate and an undo journal before execution, following the reversibility-and-guardrail framing established for LLM-powered natural language shells [9] and the preview-and-confirm design guideline validated with motor-impaired users of an LLM-mediated assistive-robotics interface [28].  The command is first classified by reversibility: operations that are irreversible — such as file deletion, system configuration changes, or destructive package operations — trigger a confirmation prompt requiring explicit user approval before execution proceeds.  Every executed command is recorded to a persistent undo journal before it runs.  Reversible operations are logged for replay-based reversal; a command classified irreversible and then approved is additionally captured by one of five mechanisms — full content backup, hardlink-based trash, git HEAD capture, permission-metadata capture, or, for package and service state, an inverse command — so that a command approved in error remains recoverable.  With the analysis enabled, the gate consumes the analysis’s verdict, and the captures taken are those its plan names, (a) to (c), rather than the list’s.  Rollback is invoked through a dedicated undo command rather than from within the conversation.  Once the gate has passed it, the command is dispatched to a bash subprocess.  Standard output and standard error are captured and rendered in the conversational surface as the system’s response to the original natural language input.</w:t>
-      </w:r>
-    </w:p>
-    <w:p>
-      <w:pPr>
-        <w:pStyle w:val="BodyText"/>
-      </w:pPr>
-      <w:r>
-        <w:t xml:space="preserve">SynapseOS executes only shell-expressible operations.  The system’s capability boundary is the Linux command-line toolchain: file management, process control, text processing, package management, network configuration, and any application that exposes a command-line interface.  GUI-only interactions — clicking buttons in graphical applications, navigating web page elements, or interacting with visual-only interfaces — are explicitly outside scope, in deliberate contrast to broader desktop agent frameworks that additionally orchestrate GUI automation atop the existing session [45].  This boundary is intentional: it constrains the research to a tractable, verifiable claim that the system can be built, evaluated, and defended within the thesis timeline.</w:t>
-      </w:r>
-    </w:p>
-    <w:bookmarkEnd w:id="97"/>
-    <w:bookmarkEnd w:id="98"/>
-    <w:bookmarkStart w:id="99" w:name="ch3-sec2-2"/>
+        <w:t xml:space="preserve">Once the intent parser produces a shell command, SynapseOS passes it through a confirmation gate and an undo journal before execution, following the reversibility-and-guardrail framing established for LLM-powered natural language shells [11] and the preview-and-confirm design guideline validated with motor-impaired users of an LLM-mediated assistive-robotics interface [30].  The command is first classified by reversibility: operations that are irreversible — such as file deletion, system configuration changes, or destructive package operations — trigger a confirmation prompt requiring explicit user approval before execution proceeds.  Every executed command is recorded to a persistent undo journal before it runs.  Reversible operations are logged for replay-based reversal; a command classified irreversible and then approved is additionally captured by one of five mechanisms — full content backup, hardlink-based trash, git HEAD capture, permission-metadata capture, or, for package and service state, an inverse command — so that a command approved in error remains recoverable.  With the analysis enabled, the gate consumes the analysis’s verdict, and the captures taken are those its plan names, (a) to (c), rather than the list’s.  Rollback is invoked through a dedicated undo command rather than from within the conversation.  Once the gate has passed it, the command is dispatched to a bash subprocess.  Standard output and standard error are captured and rendered in the conversational surface as the system’s response to the original natural language input.</w:t>
+      </w:r>
+    </w:p>
+    <w:p>
+      <w:pPr>
+        <w:pStyle w:val="BodyText"/>
+      </w:pPr>
+      <w:r>
+        <w:t xml:space="preserve">SynapseOS executes only shell-expressible operations.  The system’s capability boundary is the Linux command-line toolchain: file management, process control, text processing, package management, network configuration, and any application that exposes a command-line interface.  GUI-only interactions — clicking buttons in graphical applications, navigating web page elements, or interacting with visual-only interfaces — are explicitly outside scope, in deliberate contrast to broader desktop agent frameworks that additionally orchestrate GUI automation atop the existing session [50].  This boundary is intentional: it constrains the research to a tractable, verifiable claim that the system can be built, evaluated, and defended within the thesis timeline.</w:t>
+      </w:r>
+    </w:p>
+    <w:bookmarkEnd w:id="100"/>
+    <w:bookmarkEnd w:id="101"/>
+    <w:bookmarkStart w:id="102" w:name="ch3-sec2-2"/>
     <w:p>
       <w:pPr>
         <w:pStyle w:val="Heading3"/>
@@ -9009,8 +9576,8 @@
         <w:t xml:space="preserve">all participant records are pseudonymized at the point of extraction, replacing identifying information with participant ID codes prior to any analysis</w:t>
       </w:r>
     </w:p>
-    <w:bookmarkEnd w:id="99"/>
-    <w:bookmarkStart w:id="100" w:name="ch3-sec2-3"/>
+    <w:bookmarkEnd w:id="102"/>
+    <w:bookmarkStart w:id="103" w:name="ch3-sec2-3"/>
     <w:p>
       <w:pPr>
         <w:pStyle w:val="Heading3"/>
@@ -9068,7 +9635,7 @@
         <w:t xml:space="preserve"> </w:t>
       </w:r>
       <w:r>
-        <w:t xml:space="preserve">evaluated using an execution-based scoring methodology [38] — each generated command is executed in a controlled environment and its resulting system state compared against a human-annotated expected outcome for each task utterance, rather than syntax-level string matching, with ambiguous cases resolved through LLM-assisted functional equivalence assessment at 95% confidence; accuracy is computed as the proportion of first-attempt matches</w:t>
+        <w:t xml:space="preserve">evaluated using an execution-based scoring methodology [43] — each generated command is executed in a controlled environment and its resulting system state compared against a human-annotated expected outcome for each task utterance, rather than syntax-level string matching, with ambiguous cases resolved through LLM-assisted functional equivalence assessment at 95% confidence; accuracy is computed as the proportion of first-attempt matches</w:t>
       </w:r>
     </w:p>
     <w:p>
@@ -9135,8 +9702,8 @@
         <w:t xml:space="preserve">; the one that bears on the study is described under threats to validity (Section 3.7).</w:t>
       </w:r>
     </w:p>
-    <w:bookmarkEnd w:id="100"/>
-    <w:bookmarkStart w:id="101" w:name="ch3-sec2-4"/>
+    <w:bookmarkEnd w:id="103"/>
+    <w:bookmarkStart w:id="104" w:name="ch3-sec2-4"/>
     <w:p>
       <w:pPr>
         <w:pStyle w:val="Heading3"/>
@@ -9315,8 +9882,8 @@
         <w:t xml:space="preserve">Total estimated session duration per participant: 90–120 minutes.</w:t>
       </w:r>
     </w:p>
-    <w:bookmarkEnd w:id="101"/>
-    <w:bookmarkStart w:id="102" w:name="ch3-sec2-5"/>
+    <w:bookmarkEnd w:id="104"/>
+    <w:bookmarkStart w:id="105" w:name="ch3-sec2-5"/>
     <w:p>
       <w:pPr>
         <w:pStyle w:val="Heading3"/>
@@ -9509,9 +10076,9 @@
         <w:t xml:space="preserve">Participants may discontinue the session at any point, and may request withdrawal of their data for up to fourteen days after their session — the ID-to-consent mapping is retained through that window specifically so that withdrawal remains possible.  After it closes the mapping is destroyed and individual records can no longer be located.  This limit is stated on the consent form so that it is understood before participation rather than discovered after.</w:t>
       </w:r>
     </w:p>
-    <w:bookmarkEnd w:id="102"/>
-    <w:bookmarkEnd w:id="103"/>
-    <w:bookmarkStart w:id="121" w:name="sec3"/>
+    <w:bookmarkEnd w:id="105"/>
+    <w:bookmarkEnd w:id="106"/>
+    <w:bookmarkStart w:id="124" w:name="sec3"/>
     <w:p>
       <w:pPr>
         <w:pStyle w:val="Heading2"/>
@@ -9528,7 +10095,7 @@
         <w:t xml:space="preserve">System testing evaluates the analysis and then validates it in use.  Section 3.1 evaluates it against baselines on the command corpus (Objective 4), which answers RQ2 through RQ4, and Section 3.2 measures what composition and runtime-target resolution contribute, by ablation (Objective 5), which answers RQ5.  Sections 3.3 to 3.7 define the validation study on the platform: its evaluation dataset, evaluation profile, criteria and formulas, data analysis plan, and threats to validity.</w:t>
       </w:r>
     </w:p>
-    <w:bookmarkStart w:id="109" w:name="ch3-sec3-1"/>
+    <w:bookmarkStart w:id="112" w:name="ch3-sec3-1"/>
     <w:p>
       <w:pPr>
         <w:pStyle w:val="Heading3"/>
@@ -9545,7 +10112,7 @@
         <w:t xml:space="preserve">The analysis is evaluated on the command corpus of Section 1.1(a) and 1.2(a)–(b), against the baselines in (a), by the metrics in (b) and the statistics in (c); (d) reports the results, and (e) the threats specific to this evaluation.  The evaluation answers RQ4 directly, and it supplies the evidence for RQ2 and RQ3: whether a command’s effects can be derived before it runs shows in silent loss and composition coverage, and whether the plan restores, in capture coverage verified by sandboxed undo.</w:t>
       </w:r>
     </w:p>
-    <w:bookmarkStart w:id="104" w:name="a-baselines"/>
+    <w:bookmarkStart w:id="107" w:name="a-baselines"/>
     <w:p>
       <w:pPr>
         <w:pStyle w:val="Heading4"/>
@@ -9588,11 +10155,11 @@
         <w:pStyle w:val="BodyText"/>
       </w:pPr>
       <w:r>
-        <w:t xml:space="preserve">Because the first baseline was written by the same team, it was checked against command-safety checks that others ship.  Two open-source checks were scored on the same held-out corpus and labels reported in (d) below: the dangerous-command check of OpenAI’s Codex CLI [27], ported from its source and verified against that source’s own unit tests, and cc-safety-net [17], a pre-execution guard used with several agentic coding tools, run unmodified under each of its three presets.  On the 325 commands that destroy files, they let between 73% and 97% run with no confirmation and no capture, against 31% for the enumerated-pattern classifier, and neither makes any provision for recovery.  Both are designed for coding agents working inside a version-controlled project, where deleting project files is routine and version control is the safeguard, so these figures describe how they would serve a person’s own files, not how well they serve their intended purpose.  The first baseline is therefore the strictest enumerated list tested, and comparisons against it understate rather than overstate the analysis’s advantage over lists in current use.  No shipping tool was found that determines a command’s effects before it runs in order to capture what it would destroy; on recovery there is no external counterpart, which is the gap identified in Chapter 2, Section 2.5.  The comparison is provided as supplementary material.</w:t>
-      </w:r>
-    </w:p>
-    <w:bookmarkEnd w:id="104"/>
-    <w:bookmarkStart w:id="105" w:name="b-metrics"/>
+        <w:t xml:space="preserve">Because the first baseline was written by the same team, it was checked against command-safety checks that others ship.  Two open-source checks were scored on the same held-out corpus and labels reported in (d) below: the dangerous-command check of OpenAI’s Codex CLI [29], ported from its source and verified against that source’s own unit tests, and cc-safety-net [19], a pre-execution guard used with several agentic coding tools, run unmodified under each of its three presets.  On the 325 commands that destroy files, they let between 73% and 97% run with no confirmation and no capture, against 31% for the enumerated-pattern classifier, and neither makes any provision for recovery.  Both are designed for coding agents working inside a version-controlled project, where deleting project files is routine and version control is the safeguard, so these figures describe how they would serve a person’s own files, not how well they serve their intended purpose.  The first baseline is therefore the strictest enumerated list tested, and comparisons against it understate rather than overstate the analysis’s advantage over lists in current use.  No shipping tool was found that determines a command’s effects before it runs in order to capture what it would destroy; on recovery there is no external counterpart, which is the gap identified in Chapter 2, Section 2.5.  The comparison is provided as supplementary material.</w:t>
+      </w:r>
+    </w:p>
+    <w:bookmarkEnd w:id="107"/>
+    <w:bookmarkStart w:id="108" w:name="b-metrics"/>
     <w:p>
       <w:pPr>
         <w:pStyle w:val="Heading4"/>
@@ -9896,8 +10463,8 @@
         </w:tc>
       </w:tr>
     </w:tbl>
-    <w:bookmarkEnd w:id="105"/>
-    <w:bookmarkStart w:id="106" w:name="Xe9b03fd3199b45e89de4f0f07475404c617f3ff"/>
+    <w:bookmarkEnd w:id="108"/>
+    <w:bookmarkStart w:id="109" w:name="Xe9b03fd3199b45e89de4f0f07475404c617f3ff"/>
     <w:p>
       <w:pPr>
         <w:pStyle w:val="Heading4"/>
@@ -9967,8 +10534,8 @@
         <w:t xml:space="preserve">With three baselines and two primary metrics, the comparisons that carry a claim are the analysis against each of the first two baselines on silent loss and on capture coverage.  Four tests share one family, so significance is judged with a Holm correction at a family-wise α = 0.05, and the uncorrected values are reported beside the corrected ones.  The full-snapshot baseline is a bound on cost and safety, not a comparison of accuracy, and is reported descriptively.</w:t>
       </w:r>
     </w:p>
-    <w:bookmarkEnd w:id="106"/>
-    <w:bookmarkStart w:id="107" w:name="d-results-on-the-held-out-corpus"/>
+    <w:bookmarkEnd w:id="109"/>
+    <w:bookmarkStart w:id="110" w:name="d-results-on-the-held-out-corpus"/>
     <w:p>
       <w:pPr>
         <w:pStyle w:val="Heading4"/>
@@ -10588,8 +11155,8 @@
         <w:t xml:space="preserve">— and it asks on these by construction.  A large share of NL2Bash candidates are excluded because they name paths or programs the fixture cannot supply, which biases that partition toward commands that run on a small tree.  The external partition is assigned by a table of state-changing tools and not observed, so its labels are only as good as the table, as the model-generated partition’s one error shows.  And the model-generated partition above was scored against an earlier build of the analyser, not the one the primary result was frozen against.</w:t>
       </w:r>
     </w:p>
-    <w:bookmarkEnd w:id="107"/>
-    <w:bookmarkStart w:id="108" w:name="e-threats-specific-to-this-evaluation"/>
+    <w:bookmarkEnd w:id="110"/>
+    <w:bookmarkStart w:id="111" w:name="e-threats-specific-to-this-evaluation"/>
     <w:p>
       <w:pPr>
         <w:pStyle w:val="Heading4"/>
@@ -10606,9 +11173,9 @@
         <w:t xml:space="preserve">Four are anticipated.  First, corpus bias is addressed by partitioning, as described in Section 1.2(a).  Second, oracle validity replaces label subjectivity: the labels are observed, so they cannot be argued with, but they are facts about one command on one small fixture, run for a few seconds, seeing the working tree and not repository internals.  A loss that appears only on a differently shaped tree, or after the time limit, is labeled by what happened here.  The oracle’s own behavior is pinned by unit tests over commands whose outcome is known, its exclusions are reported, and the bias they introduce — toward commands that run on a small fixture, which excludes most NL2Bash candidates that name paths or hosts the fixture cannot supply — is stated and not corrected.  Third, the algorithm and the labels are produced by the same research team, which creates a risk that the labels reflect the algorithm’s assumptions; the generator is independent of the analysis by construction, and the corpus is fixed by a recorded seed and hash before the analysis is run on it.  A fourth threat follows from the same fact: the analysis rests on a table of what each known command does, written by the same team, and a table written with the corpus in view measures the cases its author anticipated.  The corpus is therefore generated from several seeds.  Earlier ones are used to correct the analysis and the undo; the primary result is reported on one drawn after both are frozen, with the analyzer’s hash recorded beside the result.</w:t>
       </w:r>
     </w:p>
-    <w:bookmarkEnd w:id="108"/>
-    <w:bookmarkEnd w:id="109"/>
-    <w:bookmarkStart w:id="110" w:name="ch3-sec3-ablation"/>
+    <w:bookmarkEnd w:id="111"/>
+    <w:bookmarkEnd w:id="112"/>
+    <w:bookmarkStart w:id="113" w:name="ch3-sec3-ablation"/>
     <w:p>
       <w:pPr>
         <w:pStyle w:val="Heading3"/>
@@ -11588,8 +12155,8 @@
         <w:t xml:space="preserve">— cost the ablated configurations little or nothing, because the table already covers them.  The reported result in Section 3.1(c) and (d) is therefore attributable to composition and resolution together, and not to the table they are sometimes mistaken for.</w:t>
       </w:r>
     </w:p>
-    <w:bookmarkEnd w:id="110"/>
-    <w:bookmarkStart w:id="111" w:name="ch3-sec3-2"/>
+    <w:bookmarkEnd w:id="113"/>
+    <w:bookmarkStart w:id="114" w:name="ch3-sec3-2"/>
     <w:p>
       <w:pPr>
         <w:pStyle w:val="Heading3"/>
@@ -11603,11 +12170,11 @@
         <w:pStyle w:val="FirstParagraph"/>
       </w:pPr>
       <w:r>
-        <w:t xml:space="preserve">Sections 3.3 to 3.7 define the validation study, in which the analysis is deployed in SynapseOS and exercised by participants.  It exercises the platform on two task datasets: the OSWorld benchmark task suite [41] for direct comparison with results in the existing literature, and the custom cross-platform task suite described in Sections 1.1 and 1.5.  The user study evaluation involves 40 participants (20 novice, 20 power users); the baseline condition is each participant’s primary operating system — Windows 11, macOS, or Linux with GNOME desktop — on a dedicated baseline machine.</w:t>
-      </w:r>
-    </w:p>
-    <w:bookmarkEnd w:id="111"/>
-    <w:bookmarkStart w:id="112" w:name="ch3-sec3-3"/>
+        <w:t xml:space="preserve">Sections 3.3 to 3.7 define the validation study, in which the analysis is deployed in SynapseOS and exercised by participants.  It exercises the platform on two task datasets: the OSWorld benchmark task suite [46] for direct comparison with results in the existing literature, and the custom cross-platform task suite described in Sections 1.1 and 1.5.  The user study evaluation involves 40 participants (20 novice, 20 power users); the baseline condition is each participant’s primary operating system — Windows 11, macOS, or Linux with GNOME desktop — on a dedicated baseline machine.</w:t>
+      </w:r>
+    </w:p>
+    <w:bookmarkEnd w:id="114"/>
+    <w:bookmarkStart w:id="115" w:name="ch3-sec3-3"/>
     <w:p>
       <w:pPr>
         <w:pStyle w:val="Heading3"/>
@@ -11684,8 +12251,8 @@
         <w:t xml:space="preserve">The two participant groups — novice users and power users — are analyzed both in aggregate and separately to determine whether the effect of the interface condition differs across experience levels.  Additionally, primary OS (Windows, macOS, Linux) is recorded as a secondary grouping variable to determine whether results vary across participant backgrounds, and prior conversational AI exposure (frequency of use) is recorded as a covariate to determine whether familiarity with LLM-based tools correlates with SynapseOS performance independent of OS proficiency.  The primary analysis is the pooled within-subjects comparison across all 40 participants; per-OS subgroup analyses and AI-exposure correlations are treated as exploratory given the smaller per-group sample sizes they entail.</w:t>
       </w:r>
     </w:p>
-    <w:bookmarkEnd w:id="112"/>
-    <w:bookmarkStart w:id="118" w:name="ch3-sec3-4"/>
+    <w:bookmarkEnd w:id="115"/>
+    <w:bookmarkStart w:id="121" w:name="ch3-sec3-4"/>
     <w:p>
       <w:pPr>
         <w:pStyle w:val="Heading3"/>
@@ -11702,7 +12269,7 @@
         <w:t xml:space="preserve">The following metrics and formulas are used in the validation study.  Items (a) to (d) characterize the platform against each participant’s baseline; item (e) validates the analysis in use.</w:t>
       </w:r>
     </w:p>
-    <w:bookmarkStart w:id="113" w:name="a-task-completion-time"/>
+    <w:bookmarkStart w:id="116" w:name="a-task-completion-time"/>
     <w:p>
       <w:pPr>
         <w:pStyle w:val="Heading4"/>
@@ -11719,8 +12286,8 @@
         <w:t xml:space="preserve">Mean task completion time is computed per condition per participant group.  Inferential testing and effect size reporting follow the procedures described in Section 3.6.</w:t>
       </w:r>
     </w:p>
-    <w:bookmarkEnd w:id="113"/>
-    <w:bookmarkStart w:id="114" w:name="b-error-rate"/>
+    <w:bookmarkEnd w:id="116"/>
+    <w:bookmarkStart w:id="117" w:name="b-error-rate"/>
     <w:p>
       <w:pPr>
         <w:pStyle w:val="Heading4"/>
@@ -11753,8 +12320,8 @@
         <w:t xml:space="preserve">Error events are further categorized by type: intent parsing errors (incorrect bash command generated), execution errors (bash subprocess failure), and recovery failures (unsuccessful undo or retry).  The same paired statistical test is applied to error rate differences between conditions.</w:t>
       </w:r>
     </w:p>
-    <w:bookmarkEnd w:id="114"/>
-    <w:bookmarkStart w:id="115" w:name="c-user-satisfaction"/>
+    <w:bookmarkEnd w:id="117"/>
+    <w:bookmarkStart w:id="118" w:name="c-user-satisfaction"/>
     <w:p>
       <w:pPr>
         <w:pStyle w:val="Heading4"/>
@@ -11768,7 +12335,7 @@
         <w:pStyle w:val="FirstParagraph"/>
       </w:pPr>
       <w:r>
-        <w:t xml:space="preserve">SUS scores are computed per the standard scoring procedure [3] to produce a score on a 0–100 scale; a score above 68 is conventionally treated as above-average usability, a benchmark drawn from scores across a large sample of studies [31].  NASA-TLX scores are computed as the unweighted mean of the six subscale ratings [11] to produce a composite workload score per participant per condition.  Because a conversational interface is meant to widen access rather than only to save time, workload and task success are weighted alongside completion time among the platform measures, not treated as secondary to it.</w:t>
+        <w:t xml:space="preserve">SUS scores are computed per the standard scoring procedure [3] to produce a score on a 0–100 scale; a score above 68 is conventionally treated as above-average usability, a benchmark drawn from scores across a large sample of studies [36].  NASA-TLX scores are computed as the unweighted mean of the six subscale ratings [13] to produce a composite workload score per participant per condition.  Because a conversational interface is meant to widen access rather than only to save time, workload and task success are weighted alongside completion time among the platform measures, not treated as secondary to it.</w:t>
       </w:r>
     </w:p>
     <w:p>
@@ -11779,8 +12346,8 @@
         <w:t xml:space="preserve">Qualitative interview data is analyzed using thematic analysis to identify recurring themes in participant perceptions of both conditions.</w:t>
       </w:r>
     </w:p>
-    <w:bookmarkEnd w:id="115"/>
-    <w:bookmarkStart w:id="116" w:name="X2db549e47d03a47c0f54d1209c8c09b0dd0a7e7"/>
+    <w:bookmarkEnd w:id="118"/>
+    <w:bookmarkStart w:id="119" w:name="X2db549e47d03a47c0f54d1209c8c09b0dd0a7e7"/>
     <w:p>
       <w:pPr>
         <w:pStyle w:val="Heading4"/>
@@ -11871,8 +12438,8 @@
         <w:t xml:space="preserve">= 0.66 or larger.  The condition × group interaction — the test corresponding most directly to the platform’s intended benefit — remains the least-powered comparison in the design, since an interaction of a given size requires substantially more participants than a main effect of the same size; it is therefore reported with effect sizes and confidence intervals as the primary descriptive finding, and is not treated as a confirmatory significance test.</w:t>
       </w:r>
     </w:p>
-    <w:bookmarkEnd w:id="116"/>
-    <w:bookmarkStart w:id="117" w:name="e-analysis-decisions-in-use"/>
+    <w:bookmarkEnd w:id="119"/>
+    <w:bookmarkStart w:id="120" w:name="e-analysis-decisions-in-use"/>
     <w:p>
       <w:pPr>
         <w:pStyle w:val="Heading4"/>
@@ -11928,9 +12495,9 @@
         <w:t xml:space="preserve">, the proportion of commands that lose nothing on which the participant was nonetheless asked.  Each undo a participant invokes is also checked against the state before the command it reverts.  These are the measures by which the platform validates the analysis: a silent loss here would be a failure of the analysis on a command people actually cause, which the corpus could not reveal.</w:t>
       </w:r>
     </w:p>
-    <w:bookmarkEnd w:id="117"/>
-    <w:bookmarkEnd w:id="118"/>
-    <w:bookmarkStart w:id="119" w:name="ch3-sec3-5"/>
+    <w:bookmarkEnd w:id="120"/>
+    <w:bookmarkEnd w:id="121"/>
+    <w:bookmarkStart w:id="122" w:name="ch3-sec3-5"/>
     <w:p>
       <w:pPr>
         <w:pStyle w:val="Heading3"/>
@@ -11979,8 +12546,8 @@
         <w:t xml:space="preserve">Qualitative data from post-study interviews is analyzed using reflexive thematic analysis following the six-phase procedure described by Braun and Clarke [2]: familiarization with the data, initial code generation, theme search, theme review, theme definition, and write-up.  In keeping with the reflexive approach, which treats the analyst’s interpretation as part of the method and does not compute inter-rater agreement, one member of the research team develops the codes and themes; the codebook and the excerpts that support each theme are retained so that the analysis can be audited.  Themes are reported alongside representative participant quotations.</w:t>
       </w:r>
     </w:p>
-    <w:bookmarkEnd w:id="119"/>
-    <w:bookmarkStart w:id="120" w:name="ch3-sec3-6"/>
+    <w:bookmarkEnd w:id="122"/>
+    <w:bookmarkStart w:id="123" w:name="ch3-sec3-6"/>
     <w:p>
       <w:pPr>
         <w:pStyle w:val="Heading3"/>
@@ -12299,9 +12866,9 @@
         <w:t xml:space="preserve">SynapseOS is evaluated on a single hardware and software configuration — a dedicated machine running SynapseOS in GUI mode (XFCE desktop environment, X11 session) on a Debian 13 (Trixie) base.  Performance characteristics on different hardware, display configurations, or Linux distributions may differ from the reported results.</w:t>
       </w:r>
     </w:p>
-    <w:bookmarkEnd w:id="120"/>
-    <w:bookmarkEnd w:id="121"/>
-    <w:bookmarkStart w:id="130" w:name="ch3-notes"/>
+    <w:bookmarkEnd w:id="123"/>
+    <w:bookmarkEnd w:id="124"/>
+    <w:bookmarkStart w:id="133" w:name="ch3-notes"/>
     <w:p>
       <w:pPr>
         <w:pStyle w:val="Heading2"/>
@@ -12318,11 +12885,11 @@
           <w:numId w:val="1019"/>
         </w:numPr>
       </w:pPr>
-      <w:bookmarkStart w:id="122" w:name="ch3-fn1"/>
+      <w:bookmarkStart w:id="125" w:name="ch3-fn1"/>
       <w:r>
         <w:t xml:space="preserve">Command-Line Interface mode: a single non-interactive invocation, with no session persisting between separate calls, that runs a bounded multi-step loop toward one natural-language request — each step proposed, classified for reversibility, executed (immediately if reversible, after confirmation if not) through the same gate as the other interface modes, and its result fed back so the model can propose the next step or signal completion — up to a fixed step limit, before the invocation exits.  Distinct from TUI mode’s persistent interactive chat session; intended for scripting, automation, and one-off remote commands.</w:t>
       </w:r>
-      <w:bookmarkEnd w:id="122"/>
+      <w:bookmarkEnd w:id="125"/>
     </w:p>
     <w:p>
       <w:pPr>
@@ -12332,11 +12899,11 @@
           <w:numId w:val="1019"/>
         </w:numPr>
       </w:pPr>
-      <w:bookmarkStart w:id="123" w:name="ch3-fn2"/>
+      <w:bookmarkStart w:id="126" w:name="ch3-fn2"/>
       <w:r>
         <w:t xml:space="preserve">Terminal User Interface: a text-based interactive interface that runs in a command-line terminal.  TUI mode requires no graphical display server or desktop environment and can be accessed remotely over SSH.</w:t>
       </w:r>
-      <w:bookmarkEnd w:id="123"/>
+      <w:bookmarkEnd w:id="126"/>
     </w:p>
     <w:p>
       <w:pPr>
@@ -12346,11 +12913,11 @@
           <w:numId w:val="1019"/>
         </w:numPr>
       </w:pPr>
-      <w:bookmarkStart w:id="124" w:name="ch3-fn3"/>
+      <w:bookmarkStart w:id="127" w:name="ch3-fn3"/>
       <w:r>
         <w:t xml:space="preserve">The SynapseOS prototype uses Qwen2.5-Coder-3B-Instruct, a code-specialized open-weights model selected for its NL2Bash accuracy.  See Section 2.1(d) for selection rationale and benchmark evidence.</w:t>
       </w:r>
-      <w:bookmarkEnd w:id="124"/>
+      <w:bookmarkEnd w:id="127"/>
     </w:p>
     <w:p>
       <w:pPr>
@@ -12360,11 +12927,11 @@
           <w:numId w:val="1019"/>
         </w:numPr>
       </w:pPr>
-      <w:bookmarkStart w:id="125" w:name="ch3-fn4"/>
+      <w:bookmarkStart w:id="128" w:name="ch3-fn4"/>
       <w:r>
         <w:t xml:space="preserve">An inference server loads a language model into memory and processes query requests from the application layer.  Ollama is an open-source tool for running language models locally on consumer hardware without cloud connectivity.</w:t>
       </w:r>
-      <w:bookmarkEnd w:id="125"/>
+      <w:bookmarkEnd w:id="128"/>
     </w:p>
     <w:p>
       <w:pPr>
@@ -12374,11 +12941,11 @@
           <w:numId w:val="1019"/>
         </w:numPr>
       </w:pPr>
-      <w:bookmarkStart w:id="126" w:name="ch3-fn5"/>
+      <w:bookmarkStart w:id="129" w:name="ch3-fn5"/>
       <w:r>
         <w:t xml:space="preserve">Open-weights models make their trained parameters publicly available for local download and use; users run inference on their own hardware without routing queries to an external service provider.</w:t>
       </w:r>
-      <w:bookmarkEnd w:id="126"/>
+      <w:bookmarkEnd w:id="129"/>
     </w:p>
     <w:p>
       <w:pPr>
@@ -12388,11 +12955,11 @@
           <w:numId w:val="1019"/>
         </w:numPr>
       </w:pPr>
-      <w:bookmarkStart w:id="127" w:name="ch3-fn6"/>
+      <w:bookmarkStart w:id="130" w:name="ch3-fn6"/>
       <w:r>
         <w:t xml:space="preserve">Quantization reduces the numerical precision of model weights to lower memory requirements.  At 4-bit precision, a model that would otherwise require dedicated GPU memory can run on a standard CPU with modest RAM.</w:t>
       </w:r>
-      <w:bookmarkEnd w:id="127"/>
+      <w:bookmarkEnd w:id="130"/>
     </w:p>
     <w:p>
       <w:pPr>
@@ -12402,11 +12969,11 @@
           <w:numId w:val="1019"/>
         </w:numPr>
       </w:pPr>
-      <w:bookmarkStart w:id="128" w:name="ch3-fn7"/>
+      <w:bookmarkStart w:id="131" w:name="ch3-fn7"/>
       <w:r>
         <w:t xml:space="preserve">Low-Rank Adaptation (LoRA) is a parameter-efficient fine-tuning method that introduces a small number of trainable weight matrices while keeping the base model frozen, enabling task-specific adaptation on consumer hardware without full retraining.</w:t>
       </w:r>
-      <w:bookmarkEnd w:id="128"/>
+      <w:bookmarkEnd w:id="131"/>
     </w:p>
     <w:p>
       <w:pPr>
@@ -12416,14 +12983,14 @@
           <w:numId w:val="1019"/>
         </w:numPr>
       </w:pPr>
-      <w:bookmarkStart w:id="129" w:name="ch3-fn8"/>
+      <w:bookmarkStart w:id="132" w:name="ch3-fn8"/>
       <w:r>
         <w:t xml:space="preserve">NL2Bash is a benchmark dataset pairing natural language command descriptions with their corresponding bash shell commands, used to evaluate a model’s accuracy in translating natural language into executable commands.</w:t>
       </w:r>
-      <w:bookmarkEnd w:id="129"/>
-    </w:p>
-    <w:bookmarkEnd w:id="130"/>
-    <w:bookmarkStart w:id="131" w:name="sec-master-references"/>
+      <w:bookmarkEnd w:id="132"/>
+    </w:p>
+    <w:bookmarkEnd w:id="133"/>
+    <w:bookmarkStart w:id="134" w:name="sec-master-references"/>
     <w:p>
       <w:pPr>
         <w:pStyle w:val="FirstParagraph"/>
@@ -12432,7 +12999,7 @@
         <w:t xml:space="preserve">REFERENCES</w:t>
       </w:r>
     </w:p>
-    <w:bookmarkEnd w:id="131"/>
+    <w:bookmarkEnd w:id="134"/>
     <w:p>
       <w:pPr>
         <w:pStyle w:val="BodyText"/>
@@ -12519,7 +13086,7 @@
         <w:t xml:space="preserve">[4]</w:t>
       </w:r>
       <w:r>
-        <w:t xml:space="preserve">L. Clark, N. Pantidi, O. Cooney, P. R. Doyle, D. Garaialde, J. Edwards, B. Spillane, E. Gilmartin, C. Murad, C. Munteanu, V. Wade, and B. R. Cowan. 2019. What makes a good conversation? Challenges in designing truly conversational agents. In</w:t>
+        <w:t xml:space="preserve">A. B. Brown and D. A. Patterson. 2003. Undo for operators: Building an undoable e-mail store. In</w:t>
       </w:r>
       <w:r>
         <w:t xml:space="preserve"> </w:t>
@@ -12529,10 +13096,10 @@
           <w:i/>
           <w:iCs/>
         </w:rPr>
-        <w:t xml:space="preserve">Proceedings of the 2019 CHI Conference on Human Factors in Computing Systems (CHI ’19)</w:t>
-      </w:r>
-      <w:r>
-        <w:t xml:space="preserve">. ACM, Article 475, 12 pages.</w:t>
+        <w:t xml:space="preserve">Proceedings of the 2003 USENIX Annual Technical Conference</w:t>
+      </w:r>
+      <w:r>
+        <w:t xml:space="preserve">. USENIX Association. https://www.usenix.org/conference/2003-usenix-annual-technical-conference/undo-operators-building-undoable-e-mail-store</w:t>
       </w:r>
     </w:p>
     <w:p>
@@ -12543,7 +13110,7 @@
         <w:t xml:space="preserve">[5]</w:t>
       </w:r>
       <w:r>
-        <w:t xml:space="preserve">P. Cousot and R. Cousot. 1977. Abstract interpretation: A unified lattice model for static analysis of programs by construction or approximation of fixpoints. In</w:t>
+        <w:t xml:space="preserve">L. Clark, N. Pantidi, O. Cooney, P. R. Doyle, D. Garaialde, J. Edwards, B. Spillane, E. Gilmartin, C. Murad, C. Munteanu, V. Wade, and B. R. Cowan. 2019. What makes a good conversation? Challenges in designing truly conversational agents. In</w:t>
       </w:r>
       <w:r>
         <w:t xml:space="preserve"> </w:t>
@@ -12553,10 +13120,10 @@
           <w:i/>
           <w:iCs/>
         </w:rPr>
-        <w:t xml:space="preserve">Conference Record of the Sixth Annual ACM SIGPLAN-SIGACT Symposium on Principles of Programming Languages (POPL ’77)</w:t>
-      </w:r>
-      <w:r>
-        <w:t xml:space="preserve">. ACM, 238–252.</w:t>
+        <w:t xml:space="preserve">Proceedings of the 2019 CHI Conference on Human Factors in Computing Systems (CHI ’19)</w:t>
+      </w:r>
+      <w:r>
+        <w:t xml:space="preserve">. ACM, Article 475, 12 pages.</w:t>
       </w:r>
     </w:p>
     <w:p>
@@ -12567,7 +13134,7 @@
         <w:t xml:space="preserve">[6]</w:t>
       </w:r>
       <w:r>
-        <w:t xml:space="preserve">J. W. Creswell and V. L. Plano Clark. 2018.</w:t>
+        <w:t xml:space="preserve">P. Cousot and R. Cousot. 1977. Abstract interpretation: A unified lattice model for static analysis of programs by construction or approximation of fixpoints. In</w:t>
       </w:r>
       <w:r>
         <w:t xml:space="preserve"> </w:t>
@@ -12577,13 +13144,10 @@
           <w:i/>
           <w:iCs/>
         </w:rPr>
-        <w:t xml:space="preserve">Designing and Conducting Mixed Methods Research</w:t>
-      </w:r>
-      <w:r>
-        <w:t xml:space="preserve"> </w:t>
-      </w:r>
-      <w:r>
-        <w:t xml:space="preserve">(3rd ed.). SAGE Publications.</w:t>
+        <w:t xml:space="preserve">Conference Record of the Sixth Annual ACM SIGPLAN-SIGACT Symposium on Principles of Programming Languages (POPL ’77)</w:t>
+      </w:r>
+      <w:r>
+        <w:t xml:space="preserve">. ACM, 238–252.</w:t>
       </w:r>
     </w:p>
     <w:p>
@@ -12594,7 +13158,7 @@
         <w:t xml:space="preserve">[7]</w:t>
       </w:r>
       <w:r>
-        <w:t xml:space="preserve">X. Deng, Y. Gu, B. Zheng, S. Chen, S. Stevens, B. Wang, H. Sun, and Y. Su. 2023. Mind2Web: Towards a Generalist Agent for the Web. In</w:t>
+        <w:t xml:space="preserve">J. W. Creswell and V. L. Plano Clark. 2018.</w:t>
       </w:r>
       <w:r>
         <w:t xml:space="preserve"> </w:t>
@@ -12604,10 +13168,13 @@
           <w:i/>
           <w:iCs/>
         </w:rPr>
-        <w:t xml:space="preserve">Advances in Neural Information Processing Systems 36 (NeurIPS 2023)</w:t>
-      </w:r>
-      <w:r>
-        <w:t xml:space="preserve">.</w:t>
+        <w:t xml:space="preserve">Designing and Conducting Mixed Methods Research</w:t>
+      </w:r>
+      <w:r>
+        <w:t xml:space="preserve"> </w:t>
+      </w:r>
+      <w:r>
+        <w:t xml:space="preserve">(3rd ed.). SAGE Publications.</w:t>
       </w:r>
     </w:p>
     <w:p>
@@ -12618,7 +13185,7 @@
         <w:t xml:space="preserve">[8]</w:t>
       </w:r>
       <w:r>
-        <w:t xml:space="preserve">M. Greenberg and A. J. Blatt. 2020. Executable formal semantics for the POSIX shell.</w:t>
+        <w:t xml:space="preserve">X. Deng, Y. Gu, B. Zheng, S. Chen, S. Stevens, B. Wang, H. Sun, and Y. Su. 2023. Mind2Web: Towards a Generalist Agent for the Web. In</w:t>
       </w:r>
       <w:r>
         <w:t xml:space="preserve"> </w:t>
@@ -12628,13 +13195,10 @@
           <w:i/>
           <w:iCs/>
         </w:rPr>
-        <w:t xml:space="preserve">Proceedings of the ACM on Programming Languages</w:t>
-      </w:r>
-      <w:r>
-        <w:t xml:space="preserve"> </w:t>
-      </w:r>
-      <w:r>
-        <w:t xml:space="preserve">4, POPL, Article 43 (2020).</w:t>
+        <w:t xml:space="preserve">Advances in Neural Information Processing Systems 36 (NeurIPS 2023)</w:t>
+      </w:r>
+      <w:r>
+        <w:t xml:space="preserve">.</w:t>
       </w:r>
     </w:p>
     <w:p>
@@ -12645,29 +13209,7 @@
         <w:t xml:space="preserve">[9]</w:t>
       </w:r>
       <w:r>
-        <w:t xml:space="preserve">B. R. Gyawali, S. Achalla, K. Kallas, and S. Kumar. 2025. NaSh: Guardrails for an LLM-Powered Natural Language Shell. arXiv:2506.13028</w:t>
-      </w:r>
-    </w:p>
-    <w:p>
-      <w:pPr>
-        <w:pStyle w:val="BodyText"/>
-      </w:pPr>
-      <w:r>
-        <w:t xml:space="preserve">[10]</w:t>
-      </w:r>
-      <w:r>
-        <w:t xml:space="preserve">W. Han, Z. Zeng, J. Huang, S. Jiang, et al. 2025. GUIRoboTron-Speech: Towards Automated GUI Agents Based on Speech Instructions. arXiv:2506.11127v1</w:t>
-      </w:r>
-    </w:p>
-    <w:p>
-      <w:pPr>
-        <w:pStyle w:val="BodyText"/>
-      </w:pPr>
-      <w:r>
-        <w:t xml:space="preserve">[11]</w:t>
-      </w:r>
-      <w:r>
-        <w:t xml:space="preserve">S. G. Hart and L. E. Staveland. 1988. Development of NASA-TLX (Task Load Index): Results of empirical and theoretical research. In</w:t>
+        <w:t xml:space="preserve">A. Goel, K. Po, K. Farhadi, Z. Li, and E. de Lara. 2005. The Taser intrusion recovery system. In</w:t>
       </w:r>
       <w:r>
         <w:t xml:space="preserve"> </w:t>
@@ -12677,21 +13219,21 @@
           <w:i/>
           <w:iCs/>
         </w:rPr>
-        <w:t xml:space="preserve">Human Mental Workload</w:t>
-      </w:r>
-      <w:r>
-        <w:t xml:space="preserve">, P. A. Hancock and N. Meshkati (Eds.). Advances in Psychology, Vol. 52. North-Holland, 139–183.</w:t>
-      </w:r>
-    </w:p>
-    <w:p>
-      <w:pPr>
-        <w:pStyle w:val="BodyText"/>
-      </w:pPr>
-      <w:r>
-        <w:t xml:space="preserve">[12]</w:t>
-      </w:r>
-      <w:r>
-        <w:t xml:space="preserve">W. Hong, W. Wang, Q. Lv, J. Xu, W. Yu, J. Ji, Y. Wang, Z. Wang, Y. Dong, M. Ding, and J. Tang. 2024. CogAgent: A Visual Language Model for GUI Agents. In</w:t>
+        <w:t xml:space="preserve">Proceedings of the Twentieth ACM Symposium on Operating Systems Principles (SOSP ’05)</w:t>
+      </w:r>
+      <w:r>
+        <w:t xml:space="preserve">. ACM, 163–176.</w:t>
+      </w:r>
+    </w:p>
+    <w:p>
+      <w:pPr>
+        <w:pStyle w:val="BodyText"/>
+      </w:pPr>
+      <w:r>
+        <w:t xml:space="preserve">[10]</w:t>
+      </w:r>
+      <w:r>
+        <w:t xml:space="preserve">M. Greenberg and A. J. Blatt. 2020. Executable formal semantics for the POSIX shell.</w:t>
       </w:r>
       <w:r>
         <w:t xml:space="preserve"> </w:t>
@@ -12701,10 +13243,35 @@
           <w:i/>
           <w:iCs/>
         </w:rPr>
-        <w:t xml:space="preserve">Proceedings of CVPR 2024</w:t>
-      </w:r>
-      <w:r>
-        <w:t xml:space="preserve">.</w:t>
+        <w:t xml:space="preserve">Proceedings of the ACM on Programming Languages</w:t>
+      </w:r>
+      <w:r>
+        <w:t xml:space="preserve"> </w:t>
+      </w:r>
+      <w:r>
+        <w:t xml:space="preserve">4, POPL, Article 43 (2020).</w:t>
+      </w:r>
+    </w:p>
+    <w:p>
+      <w:pPr>
+        <w:pStyle w:val="BodyText"/>
+      </w:pPr>
+      <w:r>
+        <w:t xml:space="preserve">[11]</w:t>
+      </w:r>
+      <w:r>
+        <w:t xml:space="preserve">B. R. Gyawali, S. Achalla, K. Kallas, and S. Kumar. 2025. NaSh: Guardrails for an LLM-Powered Natural Language Shell. arXiv:2506.13028</w:t>
+      </w:r>
+    </w:p>
+    <w:p>
+      <w:pPr>
+        <w:pStyle w:val="BodyText"/>
+      </w:pPr>
+      <w:r>
+        <w:t xml:space="preserve">[12]</w:t>
+      </w:r>
+      <w:r>
+        <w:t xml:space="preserve">W. Han, Z. Zeng, J. Huang, S. Jiang, et al. 2025. GUIRoboTron-Speech: Towards Automated GUI Agents Based on Speech Instructions. arXiv:2506.11127v1</w:t>
       </w:r>
     </w:p>
     <w:p>
@@ -12715,18 +13282,7 @@
         <w:t xml:space="preserve">[13]</w:t>
       </w:r>
       <w:r>
-        <w:t xml:space="preserve">Z. Hui, Y. Li, D. Zhao, T. Chen, C. Banbury, and K. Koishida. 2025. WinClick: GUI Grounding with Multimodal Large Language Models. arXiv:2503.04730</w:t>
-      </w:r>
-    </w:p>
-    <w:p>
-      <w:pPr>
-        <w:pStyle w:val="BodyText"/>
-      </w:pPr>
-      <w:r>
-        <w:t xml:space="preserve">[14]</w:t>
-      </w:r>
-      <w:r>
-        <w:t xml:space="preserve">E. L. Hutchins, J. D. Hollan, and D. A. Norman. 1985. Direct manipulation interfaces.</w:t>
+        <w:t xml:space="preserve">S. G. Hart and L. E. Staveland. 1988. Development of NASA-TLX (Task Load Index): Results of empirical and theoretical research. In</w:t>
       </w:r>
       <w:r>
         <w:t xml:space="preserve"> </w:t>
@@ -12736,24 +13292,21 @@
           <w:i/>
           <w:iCs/>
         </w:rPr>
-        <w:t xml:space="preserve">Human–Computer Interaction</w:t>
-      </w:r>
-      <w:r>
-        <w:t xml:space="preserve"> </w:t>
-      </w:r>
-      <w:r>
-        <w:t xml:space="preserve">1, 4 (1985), 311–338.</w:t>
-      </w:r>
-    </w:p>
-    <w:p>
-      <w:pPr>
-        <w:pStyle w:val="BodyText"/>
-      </w:pPr>
-      <w:r>
-        <w:t xml:space="preserve">[15]</w:t>
-      </w:r>
-      <w:r>
-        <w:t xml:space="preserve">J. Jacobs, J. Lapon, and V. Naessens. 2026. Local LLMs for NL2Bash: A Large-Scale Open-Source Model Evaluation for Bash Command Generation. In</w:t>
+        <w:t xml:space="preserve">Human Mental Workload</w:t>
+      </w:r>
+      <w:r>
+        <w:t xml:space="preserve">, P. A. Hancock and N. Meshkati (Eds.). Advances in Psychology, Vol. 52. North-Holland, 139–183.</w:t>
+      </w:r>
+    </w:p>
+    <w:p>
+      <w:pPr>
+        <w:pStyle w:val="BodyText"/>
+      </w:pPr>
+      <w:r>
+        <w:t xml:space="preserve">[14]</w:t>
+      </w:r>
+      <w:r>
+        <w:t xml:space="preserve">W. Hong, W. Wang, Q. Lv, J. Xu, W. Yu, J. Ji, Y. Wang, Z. Wang, Y. Dong, M. Ding, and J. Tang. 2024. CogAgent: A Visual Language Model for GUI Agents. In</w:t>
       </w:r>
       <w:r>
         <w:t xml:space="preserve"> </w:t>
@@ -12763,7 +13316,7 @@
           <w:i/>
           <w:iCs/>
         </w:rPr>
-        <w:t xml:space="preserve">NDSS Workshop on LLM Assisted Security and Trust Exploration (LAST-X 2026)</w:t>
+        <w:t xml:space="preserve">Proceedings of CVPR 2024</w:t>
       </w:r>
       <w:r>
         <w:t xml:space="preserve">.</w:t>
@@ -12774,10 +13327,21 @@
         <w:pStyle w:val="BodyText"/>
       </w:pPr>
       <w:r>
+        <w:t xml:space="preserve">[15]</w:t>
+      </w:r>
+      <w:r>
+        <w:t xml:space="preserve">Z. Hui, Y. Li, D. Zhao, T. Chen, C. Banbury, and K. Koishida. 2025. WinClick: GUI Grounding with Multimodal Large Language Models. arXiv:2503.04730</w:t>
+      </w:r>
+    </w:p>
+    <w:p>
+      <w:pPr>
+        <w:pStyle w:val="BodyText"/>
+      </w:pPr>
+      <w:r>
         <w:t xml:space="preserve">[16]</w:t>
       </w:r>
       <w:r>
-        <w:t xml:space="preserve">P. Jouvelot and D. K. Gifford. 1991. Algebraic reconstruction of types and effects. In</w:t>
+        <w:t xml:space="preserve">E. L. Hutchins, J. D. Hollan, and D. A. Norman. 1985. Direct manipulation interfaces.</w:t>
       </w:r>
       <w:r>
         <w:t xml:space="preserve"> </w:t>
@@ -12787,10 +13351,13 @@
           <w:i/>
           <w:iCs/>
         </w:rPr>
-        <w:t xml:space="preserve">Proceedings of the 18th ACM SIGPLAN-SIGACT Symposium on Principles of Programming Languages (POPL ’91)</w:t>
-      </w:r>
-      <w:r>
-        <w:t xml:space="preserve">. ACM, 303–310.</w:t>
+        <w:t xml:space="preserve">Human–Computer Interaction</w:t>
+      </w:r>
+      <w:r>
+        <w:t xml:space="preserve"> </w:t>
+      </w:r>
+      <w:r>
+        <w:t xml:space="preserve">1, 4 (1985), 311–338.</w:t>
       </w:r>
     </w:p>
     <w:p>
@@ -12801,7 +13368,7 @@
         <w:t xml:space="preserve">[17]</w:t>
       </w:r>
       <w:r>
-        <w:t xml:space="preserve">kenryu42. 2026.</w:t>
+        <w:t xml:space="preserve">J. Jacobs, J. Lapon, and V. Naessens. 2026. Local LLMs for NL2Bash: A Large-Scale Open-Source Model Evaluation for Bash Command Generation. In</w:t>
       </w:r>
       <w:r>
         <w:t xml:space="preserve"> </w:t>
@@ -12811,10 +13378,10 @@
           <w:i/>
           <w:iCs/>
         </w:rPr>
-        <w:t xml:space="preserve">cc-safety-net</w:t>
-      </w:r>
-      <w:r>
-        <w:t xml:space="preserve">. https://github.com/kenryu42/cc-safety-net Version 2.6.1.</w:t>
+        <w:t xml:space="preserve">NDSS Workshop on LLM Assisted Security and Trust Exploration (LAST-X 2026)</w:t>
+      </w:r>
+      <w:r>
+        <w:t xml:space="preserve">.</w:t>
       </w:r>
     </w:p>
     <w:p>
@@ -12825,7 +13392,7 @@
         <w:t xml:space="preserve">[18]</w:t>
       </w:r>
       <w:r>
-        <w:t xml:space="preserve">Y. Li, J. He, X. Zhou, Y. Zhang, and J. Baldridge. 2020. Mapping Natural Language Instructions to Mobile UI Action Sequences. In</w:t>
+        <w:t xml:space="preserve">P. Jouvelot and D. K. Gifford. 1991. Algebraic reconstruction of types and effects. In</w:t>
       </w:r>
       <w:r>
         <w:t xml:space="preserve"> </w:t>
@@ -12835,10 +13402,10 @@
           <w:i/>
           <w:iCs/>
         </w:rPr>
-        <w:t xml:space="preserve">Proceedings of ACL 2020</w:t>
-      </w:r>
-      <w:r>
-        <w:t xml:space="preserve">. 8198–8210.</w:t>
+        <w:t xml:space="preserve">Proceedings of the 18th ACM SIGPLAN-SIGACT Symposium on Principles of Programming Languages (POPL ’91)</w:t>
+      </w:r>
+      <w:r>
+        <w:t xml:space="preserve">. ACM, 303–310.</w:t>
       </w:r>
     </w:p>
     <w:p>
@@ -12849,7 +13416,7 @@
         <w:t xml:space="preserve">[19]</w:t>
       </w:r>
       <w:r>
-        <w:t xml:space="preserve">X. V. Lin, C. Wang, L. Zettlemoyer, and M. D. Ernst. 2018. NL2Bash: A corpus and semantic parser for natural language interface to the Linux operating system. In</w:t>
+        <w:t xml:space="preserve">kenryu42. 2026.</w:t>
       </w:r>
       <w:r>
         <w:t xml:space="preserve"> </w:t>
@@ -12859,10 +13426,10 @@
           <w:i/>
           <w:iCs/>
         </w:rPr>
-        <w:t xml:space="preserve">Proceedings of the Eleventh International Conference on Language Resources and Evaluation (LREC 2018)</w:t>
-      </w:r>
-      <w:r>
-        <w:t xml:space="preserve">. European Language Resources Association.</w:t>
+        <w:t xml:space="preserve">cc-safety-net</w:t>
+      </w:r>
+      <w:r>
+        <w:t xml:space="preserve">. https://github.com/kenryu42/cc-safety-net Version 2.6.1.</w:t>
       </w:r>
     </w:p>
     <w:p>
@@ -12873,29 +13440,7 @@
         <w:t xml:space="preserve">[20]</w:t>
       </w:r>
       <w:r>
-        <w:t xml:space="preserve">R. Liu, T. Zhe, D. Wang, Z. Yao, K. Liu, Y. Fu, H. Liu, and J. Pei. 2026. AgentOS: From Application Silos to a Natural Language-Driven Data Ecosystem. arXiv:2603.08938</w:t>
-      </w:r>
-    </w:p>
-    <w:p>
-      <w:pPr>
-        <w:pStyle w:val="BodyText"/>
-      </w:pPr>
-      <w:r>
-        <w:t xml:space="preserve">[21]</w:t>
-      </w:r>
-      <w:r>
-        <w:t xml:space="preserve">J. Lu, Z. Zhang, F. Yang, J. Zhang, L. Wang, C. Du, Q. Lin, S. Rajmohan, D. Zhang, and Q. Zhang. 2024. AXIS: Efficient Human-Agent-Computer Interaction with API-First LLM-Based Agents. arXiv:2409.17140</w:t>
-      </w:r>
-    </w:p>
-    <w:p>
-      <w:pPr>
-        <w:pStyle w:val="BodyText"/>
-      </w:pPr>
-      <w:r>
-        <w:t xml:space="preserve">[22]</w:t>
-      </w:r>
-      <w:r>
-        <w:t xml:space="preserve">E. Luger and A. Sellen. 2016. “Like having a really bad PA”: The gulf between user expectation and experience of conversational agents. In</w:t>
+        <w:t xml:space="preserve">Y. Li, J. He, X. Zhou, Y. Zhang, and J. Baldridge. 2020. Mapping Natural Language Instructions to Mobile UI Action Sequences. In</w:t>
       </w:r>
       <w:r>
         <w:t xml:space="preserve"> </w:t>
@@ -12905,21 +13450,21 @@
           <w:i/>
           <w:iCs/>
         </w:rPr>
-        <w:t xml:space="preserve">Proceedings of the 2016 CHI Conference on Human Factors in Computing Systems (CHI ’16)</w:t>
-      </w:r>
-      <w:r>
-        <w:t xml:space="preserve">. ACM, 5286–5297.</w:t>
-      </w:r>
-    </w:p>
-    <w:p>
-      <w:pPr>
-        <w:pStyle w:val="BodyText"/>
-      </w:pPr>
-      <w:r>
-        <w:t xml:space="preserve">[23]</w:t>
-      </w:r>
-      <w:r>
-        <w:t xml:space="preserve">K. Mazurak and S. Zdancewic. 2007. ABASH: Finding bugs in bash scripts. In</w:t>
+        <w:t xml:space="preserve">Proceedings of ACL 2020</w:t>
+      </w:r>
+      <w:r>
+        <w:t xml:space="preserve">. 8198–8210.</w:t>
+      </w:r>
+    </w:p>
+    <w:p>
+      <w:pPr>
+        <w:pStyle w:val="BodyText"/>
+      </w:pPr>
+      <w:r>
+        <w:t xml:space="preserve">[21]</w:t>
+      </w:r>
+      <w:r>
+        <w:t xml:space="preserve">X. V. Lin, C. Wang, L. Zettlemoyer, and M. D. Ernst. 2018. NL2Bash: A corpus and semantic parser for natural language interface to the Linux operating system. In</w:t>
       </w:r>
       <w:r>
         <w:t xml:space="preserve"> </w:t>
@@ -12929,10 +13474,32 @@
           <w:i/>
           <w:iCs/>
         </w:rPr>
-        <w:t xml:space="preserve">Proceedings of the 2007 Workshop on Programming Languages and Analysis for Security (PLAS ’07)</w:t>
-      </w:r>
-      <w:r>
-        <w:t xml:space="preserve">. ACM.</w:t>
+        <w:t xml:space="preserve">Proceedings of the Eleventh International Conference on Language Resources and Evaluation (LREC 2018)</w:t>
+      </w:r>
+      <w:r>
+        <w:t xml:space="preserve">. European Language Resources Association.</w:t>
+      </w:r>
+    </w:p>
+    <w:p>
+      <w:pPr>
+        <w:pStyle w:val="BodyText"/>
+      </w:pPr>
+      <w:r>
+        <w:t xml:space="preserve">[22]</w:t>
+      </w:r>
+      <w:r>
+        <w:t xml:space="preserve">R. Liu, T. Zhe, D. Wang, Z. Yao, K. Liu, Y. Fu, H. Liu, and J. Pei. 2026. AgentOS: From Application Silos to a Natural Language-Driven Data Ecosystem. arXiv:2603.08938</w:t>
+      </w:r>
+    </w:p>
+    <w:p>
+      <w:pPr>
+        <w:pStyle w:val="BodyText"/>
+      </w:pPr>
+      <w:r>
+        <w:t xml:space="preserve">[23]</w:t>
+      </w:r>
+      <w:r>
+        <w:t xml:space="preserve">J. Lu, Z. Zhang, F. Yang, J. Zhang, L. Wang, C. Du, Q. Lin, S. Rajmohan, D. Zhang, and Q. Zhang. 2024. AXIS: Efficient Human-Agent-Computer Interaction with API-First LLM-Based Agents. arXiv:2409.17140</w:t>
       </w:r>
     </w:p>
     <w:p>
@@ -12943,29 +13510,7 @@
         <w:t xml:space="preserve">[24]</w:t>
       </w:r>
       <w:r>
-        <w:t xml:space="preserve">S. Mehendale and A. Walishetti. 2024. DexAssist: A Voice-Enabled Dual-LLM Framework for Accessible Web Navigation. arXiv:2411.12214</w:t>
-      </w:r>
-    </w:p>
-    <w:p>
-      <w:pPr>
-        <w:pStyle w:val="BodyText"/>
-      </w:pPr>
-      <w:r>
-        <w:t xml:space="preserve">[25]</w:t>
-      </w:r>
-      <w:r>
-        <w:t xml:space="preserve">R. Niu, J. Li, S. Wang, Y. Fu, X. Hu, X. Leng, H. Kong, Y. Chang, and Q. Wang. 2024. ScreenAgent: A Vision Language Model-driven Computer Control Agent. arXiv:2402.07945</w:t>
-      </w:r>
-    </w:p>
-    <w:p>
-      <w:pPr>
-        <w:pStyle w:val="BodyText"/>
-      </w:pPr>
-      <w:r>
-        <w:t xml:space="preserve">[26]</w:t>
-      </w:r>
-      <w:r>
-        <w:t xml:space="preserve">D. A. Norman. 1986. Cognitive engineering. In</w:t>
+        <w:t xml:space="preserve">E. Luger and A. Sellen. 2016. “Like having a really bad PA”: The gulf between user expectation and experience of conversational agents. In</w:t>
       </w:r>
       <w:r>
         <w:t xml:space="preserve"> </w:t>
@@ -12975,21 +13520,21 @@
           <w:i/>
           <w:iCs/>
         </w:rPr>
-        <w:t xml:space="preserve">User Centered System Design: New Perspectives on Human-Computer Interaction</w:t>
-      </w:r>
-      <w:r>
-        <w:t xml:space="preserve">, D. A. Norman and S. W. Draper (Eds.). Lawrence Erlbaum Associates, 31–61.</w:t>
-      </w:r>
-    </w:p>
-    <w:p>
-      <w:pPr>
-        <w:pStyle w:val="BodyText"/>
-      </w:pPr>
-      <w:r>
-        <w:t xml:space="preserve">[27]</w:t>
-      </w:r>
-      <w:r>
-        <w:t xml:space="preserve">OpenAI. 2026.</w:t>
+        <w:t xml:space="preserve">Proceedings of the 2016 CHI Conference on Human Factors in Computing Systems (CHI ’16)</w:t>
+      </w:r>
+      <w:r>
+        <w:t xml:space="preserve">. ACM, 5286–5297.</w:t>
+      </w:r>
+    </w:p>
+    <w:p>
+      <w:pPr>
+        <w:pStyle w:val="BodyText"/>
+      </w:pPr>
+      <w:r>
+        <w:t xml:space="preserve">[25]</w:t>
+      </w:r>
+      <w:r>
+        <w:t xml:space="preserve">K. Mazurak and S. Zdancewic. 2007. ABASH: Finding bugs in bash scripts. In</w:t>
       </w:r>
       <w:r>
         <w:t xml:space="preserve"> </w:t>
@@ -12999,10 +13544,32 @@
           <w:i/>
           <w:iCs/>
         </w:rPr>
-        <w:t xml:space="preserve">Codex CLI</w:t>
-      </w:r>
-      <w:r>
-        <w:t xml:space="preserve">. https://github.com/openai/codex Commit 1f4c473.</w:t>
+        <w:t xml:space="preserve">Proceedings of the 2007 Workshop on Programming Languages and Analysis for Security (PLAS ’07)</w:t>
+      </w:r>
+      <w:r>
+        <w:t xml:space="preserve">. ACM.</w:t>
+      </w:r>
+    </w:p>
+    <w:p>
+      <w:pPr>
+        <w:pStyle w:val="BodyText"/>
+      </w:pPr>
+      <w:r>
+        <w:t xml:space="preserve">[26]</w:t>
+      </w:r>
+      <w:r>
+        <w:t xml:space="preserve">S. Mehendale and A. Walishetti. 2024. DexAssist: A Voice-Enabled Dual-LLM Framework for Accessible Web Navigation. arXiv:2411.12214</w:t>
+      </w:r>
+    </w:p>
+    <w:p>
+      <w:pPr>
+        <w:pStyle w:val="BodyText"/>
+      </w:pPr>
+      <w:r>
+        <w:t xml:space="preserve">[27]</w:t>
+      </w:r>
+      <w:r>
+        <w:t xml:space="preserve">R. Niu, J. Li, S. Wang, Y. Fu, X. Hu, X. Leng, H. Kong, Y. Chang, and Q. Wang. 2024. ScreenAgent: A Vision Language Model-driven Computer Control Agent. arXiv:2402.07945</w:t>
       </w:r>
     </w:p>
     <w:p>
@@ -13013,7 +13580,7 @@
         <w:t xml:space="preserve">[28]</w:t>
       </w:r>
       <w:r>
-        <w:t xml:space="preserve">A. Padmanabha, J. Yuan, J. Gupta, Z. Karachiwalla, C. Majidi, H. Admoni, and Z. Erickson. 2024. VoicePilot: Harnessing LLMs as Speech Interfaces for Physically Assistive Robots. In</w:t>
+        <w:t xml:space="preserve">D. A. Norman. 1986. Cognitive engineering. In</w:t>
       </w:r>
       <w:r>
         <w:t xml:space="preserve"> </w:t>
@@ -13023,10 +13590,10 @@
           <w:i/>
           <w:iCs/>
         </w:rPr>
-        <w:t xml:space="preserve">Proceedings of the 37th Annual ACM Symposium on User Interface Software and Technology (UIST ’24)</w:t>
-      </w:r>
-      <w:r>
-        <w:t xml:space="preserve">. ACM.</w:t>
+        <w:t xml:space="preserve">User Centered System Design: New Perspectives on Human-Computer Interaction</w:t>
+      </w:r>
+      <w:r>
+        <w:t xml:space="preserve">, D. A. Norman and S. W. Draper (Eds.). Lawrence Erlbaum Associates, 31–61.</w:t>
       </w:r>
     </w:p>
     <w:p>
@@ -13037,7 +13604,7 @@
         <w:t xml:space="preserve">[29]</w:t>
       </w:r>
       <w:r>
-        <w:t xml:space="preserve">J. Park, P. Tang, S. Das, S. Appalaraju, K. Y. Singh, R. Manmatha, and S. Ghadar. 2025. R-VLM: Region-aware Vision Language Model for Precise GUI Grounding. In</w:t>
+        <w:t xml:space="preserve">OpenAI. 2026.</w:t>
       </w:r>
       <w:r>
         <w:t xml:space="preserve"> </w:t>
@@ -13047,10 +13614,10 @@
           <w:i/>
           <w:iCs/>
         </w:rPr>
-        <w:t xml:space="preserve">Findings of the Association for Computational Linguistics: ACL 2025</w:t>
-      </w:r>
-      <w:r>
-        <w:t xml:space="preserve">. 9669–9685.</w:t>
+        <w:t xml:space="preserve">Codex CLI</w:t>
+      </w:r>
+      <w:r>
+        <w:t xml:space="preserve">. https://github.com/openai/codex Commit 1f4c473.</w:t>
       </w:r>
     </w:p>
     <w:p>
@@ -13061,7 +13628,7 @@
         <w:t xml:space="preserve">[30]</w:t>
       </w:r>
       <w:r>
-        <w:t xml:space="preserve">C. Rawles, A. Li, D. Rodriguez, O. Riva, and T. Lillicrap. 2023. Android in the Wild: A Large-Scale Dataset for Android Device Control. In</w:t>
+        <w:t xml:space="preserve">A. Padmanabha, J. Yuan, J. Gupta, Z. Karachiwalla, C. Majidi, H. Admoni, and Z. Erickson. 2024. VoicePilot: Harnessing LLMs as Speech Interfaces for Physically Assistive Robots. In</w:t>
       </w:r>
       <w:r>
         <w:t xml:space="preserve"> </w:t>
@@ -13071,10 +13638,10 @@
           <w:i/>
           <w:iCs/>
         </w:rPr>
-        <w:t xml:space="preserve">Advances in Neural Information Processing Systems 36 (NeurIPS 2023)</w:t>
-      </w:r>
-      <w:r>
-        <w:t xml:space="preserve">.</w:t>
+        <w:t xml:space="preserve">Proceedings of the 37th Annual ACM Symposium on User Interface Software and Technology (UIST ’24)</w:t>
+      </w:r>
+      <w:r>
+        <w:t xml:space="preserve">. ACM.</w:t>
       </w:r>
     </w:p>
     <w:p>
@@ -13085,7 +13652,7 @@
         <w:t xml:space="preserve">[31]</w:t>
       </w:r>
       <w:r>
-        <w:t xml:space="preserve">J. Sauro and J. R. Lewis. 2016.</w:t>
+        <w:t xml:space="preserve">J. Park, P. Tang, S. Das, S. Appalaraju, K. Y. Singh, R. Manmatha, and S. Ghadar. 2025. R-VLM: Region-aware Vision Language Model for Precise GUI Grounding. In</w:t>
       </w:r>
       <w:r>
         <w:t xml:space="preserve"> </w:t>
@@ -13095,13 +13662,10 @@
           <w:i/>
           <w:iCs/>
         </w:rPr>
-        <w:t xml:space="preserve">Quantifying the User Experience: Practical Statistics for User Research</w:t>
-      </w:r>
-      <w:r>
-        <w:t xml:space="preserve"> </w:t>
-      </w:r>
-      <w:r>
-        <w:t xml:space="preserve">(2nd ed.). Morgan Kaufmann.</w:t>
+        <w:t xml:space="preserve">Findings of the Association for Computational Linguistics: ACL 2025</w:t>
+      </w:r>
+      <w:r>
+        <w:t xml:space="preserve">. 9669–9685.</w:t>
       </w:r>
     </w:p>
     <w:p>
@@ -13112,7 +13676,7 @@
         <w:t xml:space="preserve">[32]</w:t>
       </w:r>
       <w:r>
-        <w:t xml:space="preserve">B. Shneiderman. 1983. Direct manipulation: A step beyond programming languages.</w:t>
+        <w:t xml:space="preserve">D. E. Porter, O. S. Hofmann, C. J. Rossbach, A. Benn, and E. Witchel. 2009. Operating system transactions. In</w:t>
       </w:r>
       <w:r>
         <w:t xml:space="preserve"> </w:t>
@@ -13122,13 +13686,10 @@
           <w:i/>
           <w:iCs/>
         </w:rPr>
-        <w:t xml:space="preserve">Computer</w:t>
-      </w:r>
-      <w:r>
-        <w:t xml:space="preserve"> </w:t>
-      </w:r>
-      <w:r>
-        <w:t xml:space="preserve">16, 8 (1983), 57–69.</w:t>
+        <w:t xml:space="preserve">Proceedings of the ACM SIGOPS 22nd Symposium on Operating Systems Principles (SOSP ’09)</w:t>
+      </w:r>
+      <w:r>
+        <w:t xml:space="preserve">. ACM, 161–176.</w:t>
       </w:r>
     </w:p>
     <w:p>
@@ -13139,7 +13700,7 @@
         <w:t xml:space="preserve">[33]</w:t>
       </w:r>
       <w:r>
-        <w:t xml:space="preserve">B. Shneiderman. 2000. The limits of speech recognition.</w:t>
+        <w:t xml:space="preserve">C. Rawles, A. Li, D. Rodriguez, O. Riva, and T. Lillicrap. 2023. Android in the Wild: A Large-Scale Dataset for Android Device Control. In</w:t>
       </w:r>
       <w:r>
         <w:t xml:space="preserve"> </w:t>
@@ -13149,13 +13710,10 @@
           <w:i/>
           <w:iCs/>
         </w:rPr>
-        <w:t xml:space="preserve">Commun. ACM</w:t>
-      </w:r>
-      <w:r>
-        <w:t xml:space="preserve"> </w:t>
-      </w:r>
-      <w:r>
-        <w:t xml:space="preserve">43, 9 (2000), 63–65.</w:t>
+        <w:t xml:space="preserve">Advances in Neural Information Processing Systems 36 (NeurIPS 2023)</w:t>
+      </w:r>
+      <w:r>
+        <w:t xml:space="preserve">.</w:t>
       </w:r>
     </w:p>
     <w:p>
@@ -13166,7 +13724,7 @@
         <w:t xml:space="preserve">[34]</w:t>
       </w:r>
       <w:r>
-        <w:t xml:space="preserve">B. Shneiderman and P. Maes. 1997. Direct manipulation vs. interface agents.</w:t>
+        <w:t xml:space="preserve">O. Rodeh, J. Bacik, and C. Mason. 2013. BTRFS: The Linux B-tree filesystem.</w:t>
       </w:r>
       <w:r>
         <w:t xml:space="preserve"> </w:t>
@@ -13176,13 +13734,13 @@
           <w:i/>
           <w:iCs/>
         </w:rPr>
-        <w:t xml:space="preserve">interactions</w:t>
-      </w:r>
-      <w:r>
-        <w:t xml:space="preserve"> </w:t>
-      </w:r>
-      <w:r>
-        <w:t xml:space="preserve">4, 6 (1997), 42–61.</w:t>
+        <w:t xml:space="preserve">ACM Transactions on Storage</w:t>
+      </w:r>
+      <w:r>
+        <w:t xml:space="preserve"> </w:t>
+      </w:r>
+      <w:r>
+        <w:t xml:space="preserve">9, 3, Article 9 (2013), 32 pages.</w:t>
       </w:r>
     </w:p>
     <w:p>
@@ -13193,7 +13751,7 @@
         <w:t xml:space="preserve">[35]</w:t>
       </w:r>
       <w:r>
-        <w:t xml:space="preserve">J.-P. Talpin and P. Jouvelot. 1994. The type and effect discipline.</w:t>
+        <w:t xml:space="preserve">D. S. Santry, M. J. Feeley, N. C. Hutchinson, A. C. Veitch, R. W. Carton, and J. Ofir. 1999. Deciding when to forget in the Elephant file system. In</w:t>
       </w:r>
       <w:r>
         <w:t xml:space="preserve"> </w:t>
@@ -13203,13 +13761,10 @@
           <w:i/>
           <w:iCs/>
         </w:rPr>
-        <w:t xml:space="preserve">Information and Computation</w:t>
-      </w:r>
-      <w:r>
-        <w:t xml:space="preserve"> </w:t>
-      </w:r>
-      <w:r>
-        <w:t xml:space="preserve">111, 2 (1994), 245–296.</w:t>
+        <w:t xml:space="preserve">Proceedings of the Seventeenth ACM Symposium on Operating Systems Principles (SOSP ’99)</w:t>
+      </w:r>
+      <w:r>
+        <w:t xml:space="preserve">. ACM, 110–123.</w:t>
       </w:r>
     </w:p>
     <w:p>
@@ -13220,40 +13775,7 @@
         <w:t xml:space="preserve">[36]</w:t>
       </w:r>
       <w:r>
-        <w:t xml:space="preserve">H. G. W. van Dam. 2025. A Multimodal GUI Architecture for Interfacing with LLM-Based Conversational Assistants. arXiv:2510.06223</w:t>
-      </w:r>
-    </w:p>
-    <w:p>
-      <w:pPr>
-        <w:pStyle w:val="BodyText"/>
-      </w:pPr>
-      <w:r>
-        <w:t xml:space="preserve">[37]</w:t>
-      </w:r>
-      <w:r>
-        <w:t xml:space="preserve">J. Wang, H. Xu, J. Ye, M. Yan, W. Shen, J. Zhang, F. Huang, and J. Sang. 2024. Mobile-Agent: Autonomous Multi-Modal Mobile Device Agent with Visual Perception. arXiv:2401.16158</w:t>
-      </w:r>
-    </w:p>
-    <w:p>
-      <w:pPr>
-        <w:pStyle w:val="BodyText"/>
-      </w:pPr>
-      <w:r>
-        <w:t xml:space="preserve">[38]</w:t>
-      </w:r>
-      <w:r>
-        <w:t xml:space="preserve">F. Westenfelder, E. Hemberg, M. Tulla, S. Moskal, U.-M. O’Reilly, and S. Chiricescu. 2025. LLM-Supported Natural Language to Bash Translation. arXiv:2502.06858</w:t>
-      </w:r>
-    </w:p>
-    <w:p>
-      <w:pPr>
-        <w:pStyle w:val="BodyText"/>
-      </w:pPr>
-      <w:r>
-        <w:t xml:space="preserve">[39]</w:t>
-      </w:r>
-      <w:r>
-        <w:t xml:space="preserve">J. Whiteside, S. Jones, P. S. Levy, and D. Wixon. 1985. User performance with command, menu, and iconic interfaces. In</w:t>
+        <w:t xml:space="preserve">J. Sauro and J. R. Lewis. 2016.</w:t>
       </w:r>
       <w:r>
         <w:t xml:space="preserve"> </w:t>
@@ -13263,21 +13785,24 @@
           <w:i/>
           <w:iCs/>
         </w:rPr>
-        <w:t xml:space="preserve">Proceedings of the SIGCHI Conference on Human Factors in Computing Systems (CHI ’85)</w:t>
-      </w:r>
-      <w:r>
-        <w:t xml:space="preserve">. ACM, 185–191.</w:t>
-      </w:r>
-    </w:p>
-    <w:p>
-      <w:pPr>
-        <w:pStyle w:val="BodyText"/>
-      </w:pPr>
-      <w:r>
-        <w:t xml:space="preserve">[40]</w:t>
-      </w:r>
-      <w:r>
-        <w:t xml:space="preserve">R. Wilensky, D. N. Chin, M. Luria, J. Martin, J. Mayfield, and D. Wu. 1988. The Berkeley Unix Consultant Project.</w:t>
+        <w:t xml:space="preserve">Quantifying the User Experience: Practical Statistics for User Research</w:t>
+      </w:r>
+      <w:r>
+        <w:t xml:space="preserve"> </w:t>
+      </w:r>
+      <w:r>
+        <w:t xml:space="preserve">(2nd ed.). Morgan Kaufmann.</w:t>
+      </w:r>
+    </w:p>
+    <w:p>
+      <w:pPr>
+        <w:pStyle w:val="BodyText"/>
+      </w:pPr>
+      <w:r>
+        <w:t xml:space="preserve">[37]</w:t>
+      </w:r>
+      <w:r>
+        <w:t xml:space="preserve">B. Shneiderman. 1983. Direct manipulation: A step beyond programming languages.</w:t>
       </w:r>
       <w:r>
         <w:t xml:space="preserve"> </w:t>
@@ -13287,24 +13812,24 @@
           <w:i/>
           <w:iCs/>
         </w:rPr>
-        <w:t xml:space="preserve">Computational Linguistics</w:t>
-      </w:r>
-      <w:r>
-        <w:t xml:space="preserve"> </w:t>
-      </w:r>
-      <w:r>
-        <w:t xml:space="preserve">14, 4 (1988), 35–84.</w:t>
-      </w:r>
-    </w:p>
-    <w:p>
-      <w:pPr>
-        <w:pStyle w:val="BodyText"/>
-      </w:pPr>
-      <w:r>
-        <w:t xml:space="preserve">[41]</w:t>
-      </w:r>
-      <w:r>
-        <w:t xml:space="preserve">T. Xie, D. Zhang, J. Chen, X. Li, S. Zhao, R. Cao, T. J. Hua, Z. Cheng, D. Shin, F. Lei, Y. Liu, Y. Xu, S. Zhou, S. Savarese, C. Xiong, V. Zhong, and T. Yu. 2024. OSWorld: Benchmarking Multimodal Agents for Open-Ended Tasks in Real Computer Environments. In</w:t>
+        <w:t xml:space="preserve">Computer</w:t>
+      </w:r>
+      <w:r>
+        <w:t xml:space="preserve"> </w:t>
+      </w:r>
+      <w:r>
+        <w:t xml:space="preserve">16, 8 (1983), 57–69.</w:t>
+      </w:r>
+    </w:p>
+    <w:p>
+      <w:pPr>
+        <w:pStyle w:val="BodyText"/>
+      </w:pPr>
+      <w:r>
+        <w:t xml:space="preserve">[38]</w:t>
+      </w:r>
+      <w:r>
+        <w:t xml:space="preserve">B. Shneiderman. 2000. The limits of speech recognition.</w:t>
       </w:r>
       <w:r>
         <w:t xml:space="preserve"> </w:t>
@@ -13314,21 +13839,24 @@
           <w:i/>
           <w:iCs/>
         </w:rPr>
-        <w:t xml:space="preserve">Advances in Neural Information Processing Systems 37 (NeurIPS 2024)</w:t>
-      </w:r>
-      <w:r>
-        <w:t xml:space="preserve">.</w:t>
-      </w:r>
-    </w:p>
-    <w:p>
-      <w:pPr>
-        <w:pStyle w:val="BodyText"/>
-      </w:pPr>
-      <w:r>
-        <w:t xml:space="preserve">[42]</w:t>
-      </w:r>
-      <w:r>
-        <w:t xml:space="preserve">S. Yao, J. Zhao, D. Yu, N. Du, I. Shafran, K. Narasimhan, and Y. Cao. 2023. ReAct: Synergizing Reasoning and Acting in Language Models. In</w:t>
+        <w:t xml:space="preserve">Commun. ACM</w:t>
+      </w:r>
+      <w:r>
+        <w:t xml:space="preserve"> </w:t>
+      </w:r>
+      <w:r>
+        <w:t xml:space="preserve">43, 9 (2000), 63–65.</w:t>
+      </w:r>
+    </w:p>
+    <w:p>
+      <w:pPr>
+        <w:pStyle w:val="BodyText"/>
+      </w:pPr>
+      <w:r>
+        <w:t xml:space="preserve">[39]</w:t>
+      </w:r>
+      <w:r>
+        <w:t xml:space="preserve">B. Shneiderman and P. Maes. 1997. Direct manipulation vs. interface agents.</w:t>
       </w:r>
       <w:r>
         <w:t xml:space="preserve"> </w:t>
@@ -13338,74 +13866,24 @@
           <w:i/>
           <w:iCs/>
         </w:rPr>
-        <w:t xml:space="preserve">Proceedings of ICLR 2023</w:t>
-      </w:r>
-      <w:r>
-        <w:t xml:space="preserve">.</w:t>
-      </w:r>
-    </w:p>
-    <w:p>
-      <w:pPr>
-        <w:pStyle w:val="BodyText"/>
-      </w:pPr>
-      <w:r>
-        <w:t xml:space="preserve">[43]</w:t>
-      </w:r>
-      <w:r>
-        <w:t xml:space="preserve">M. Yuan, Z. Zhou, X. Xiong, et al. 2026. OSWorld 2.0: Benchmarking Computer Use Agents on Long-Horizon Real-World Tasks. arXiv:2606.29537</w:t>
-      </w:r>
-    </w:p>
-    <w:p>
-      <w:pPr>
-        <w:pStyle w:val="BodyText"/>
-      </w:pPr>
-      <w:r>
-        <w:t xml:space="preserve">[44]</w:t>
-      </w:r>
-      <w:r>
-        <w:t xml:space="preserve">C. Zhang, S. He, J. Qian, B. Li, L. Li, S. Qin, Y. Kang, M. Ma, G. Liu, Q. Lin, S. Rajmohan, D. Zhang, and Q. Zhang. 2024. Large Language Model-Brained GUI Agents: A Survey. arXiv:2411.18279</w:t>
-      </w:r>
-    </w:p>
-    <w:p>
-      <w:pPr>
-        <w:pStyle w:val="BodyText"/>
-      </w:pPr>
-      <w:r>
-        <w:t xml:space="preserve">[45]</w:t>
-      </w:r>
-      <w:r>
-        <w:t xml:space="preserve">C. Zhang, H. Huang, C. Ni, J. Mu, S. Qin, S. He, L. Wang, F. Yang, P. Zhao, C. Du, L. Li, Y. Kang, Z. Jiang, S. Zheng, R. Wang, J. Qian, M. Ma, J. Lou, Q. Lin, S. Rajmohan, and D. Zhang. 2025. UFO</w:t>
-      </w:r>
-      <w:r>
-        <w:rPr>
-          <w:vertAlign w:val="superscript"/>
-        </w:rPr>
-        <w:t xml:space="preserve">2</w:t>
-      </w:r>
-      <w:r>
-        <w:t xml:space="preserve">: The Desktop AgentOS. arXiv:2504.14603</w:t>
-      </w:r>
-    </w:p>
-    <w:p>
-      <w:pPr>
-        <w:pStyle w:val="BodyText"/>
-      </w:pPr>
-      <w:r>
-        <w:t xml:space="preserve">[46]</w:t>
-      </w:r>
-      <w:r>
-        <w:t xml:space="preserve">C. Zhang, Z. Yang, J. Liu, Y. Li, Y. Han, X. Chen, Z. Huang, B. Fu, and G. Yu. 2023. AppAgent: Multimodal Agents as Smartphone Users. arXiv:2312.13771</w:t>
-      </w:r>
-    </w:p>
-    <w:p>
-      <w:pPr>
-        <w:pStyle w:val="BodyText"/>
-      </w:pPr>
-      <w:r>
-        <w:t xml:space="preserve">[47]</w:t>
-      </w:r>
-      <w:r>
-        <w:t xml:space="preserve">B. Zheng, B. Gou, J. Kil, H. Sun, and Y. Su. 2024. GPT-4V(ision) is a Generalist Web Agent, if Grounded. In</w:t>
+        <w:t xml:space="preserve">interactions</w:t>
+      </w:r>
+      <w:r>
+        <w:t xml:space="preserve"> </w:t>
+      </w:r>
+      <w:r>
+        <w:t xml:space="preserve">4, 6 (1997), 42–61.</w:t>
+      </w:r>
+    </w:p>
+    <w:p>
+      <w:pPr>
+        <w:pStyle w:val="BodyText"/>
+      </w:pPr>
+      <w:r>
+        <w:t xml:space="preserve">[40]</w:t>
+      </w:r>
+      <w:r>
+        <w:t xml:space="preserve">J.-P. Talpin and P. Jouvelot. 1994. The type and effect discipline.</w:t>
       </w:r>
       <w:r>
         <w:t xml:space="preserve"> </w:t>
@@ -13415,21 +13893,57 @@
           <w:i/>
           <w:iCs/>
         </w:rPr>
-        <w:t xml:space="preserve">Proceedings of ICML 2024</w:t>
-      </w:r>
-      <w:r>
-        <w:t xml:space="preserve">.</w:t>
-      </w:r>
-    </w:p>
-    <w:p>
-      <w:pPr>
-        <w:pStyle w:val="BodyText"/>
-      </w:pPr>
-      <w:r>
-        <w:t xml:space="preserve">[48]</w:t>
-      </w:r>
-      <w:r>
-        <w:t xml:space="preserve">S. Zhou, F. F. Xu, H. Zhu, X. Zhou, R. Lo, A. Sridhar, X. Cheng, T. Ou, Y. Bisk, D. Fried, U. Alon, and G. Neubig. 2024. WebArena: A Realistic Web Environment for Building Autonomous Agents. In</w:t>
+        <w:t xml:space="preserve">Information and Computation</w:t>
+      </w:r>
+      <w:r>
+        <w:t xml:space="preserve"> </w:t>
+      </w:r>
+      <w:r>
+        <w:t xml:space="preserve">111, 2 (1994), 245–296.</w:t>
+      </w:r>
+    </w:p>
+    <w:p>
+      <w:pPr>
+        <w:pStyle w:val="BodyText"/>
+      </w:pPr>
+      <w:r>
+        <w:t xml:space="preserve">[41]</w:t>
+      </w:r>
+      <w:r>
+        <w:t xml:space="preserve">H. G. W. van Dam. 2025. A Multimodal GUI Architecture for Interfacing with LLM-Based Conversational Assistants. arXiv:2510.06223</w:t>
+      </w:r>
+    </w:p>
+    <w:p>
+      <w:pPr>
+        <w:pStyle w:val="BodyText"/>
+      </w:pPr>
+      <w:r>
+        <w:t xml:space="preserve">[42]</w:t>
+      </w:r>
+      <w:r>
+        <w:t xml:space="preserve">J. Wang, H. Xu, J. Ye, M. Yan, W. Shen, J. Zhang, F. Huang, and J. Sang. 2024. Mobile-Agent: Autonomous Multi-Modal Mobile Device Agent with Visual Perception. arXiv:2401.16158</w:t>
+      </w:r>
+    </w:p>
+    <w:p>
+      <w:pPr>
+        <w:pStyle w:val="BodyText"/>
+      </w:pPr>
+      <w:r>
+        <w:t xml:space="preserve">[43]</w:t>
+      </w:r>
+      <w:r>
+        <w:t xml:space="preserve">F. Westenfelder, E. Hemberg, M. Tulla, S. Moskal, U.-M. O’Reilly, and S. Chiricescu. 2025. LLM-Supported Natural Language to Bash Translation. arXiv:2502.06858</w:t>
+      </w:r>
+    </w:p>
+    <w:p>
+      <w:pPr>
+        <w:pStyle w:val="BodyText"/>
+      </w:pPr>
+      <w:r>
+        <w:t xml:space="preserve">[44]</w:t>
+      </w:r>
+      <w:r>
+        <w:t xml:space="preserve">J. Whiteside, S. Jones, P. S. Levy, and D. Wixon. 1985. User performance with command, menu, and iconic interfaces. In</w:t>
       </w:r>
       <w:r>
         <w:t xml:space="preserve"> </w:t>
@@ -13439,6 +13953,182 @@
           <w:i/>
           <w:iCs/>
         </w:rPr>
+        <w:t xml:space="preserve">Proceedings of the SIGCHI Conference on Human Factors in Computing Systems (CHI ’85)</w:t>
+      </w:r>
+      <w:r>
+        <w:t xml:space="preserve">. ACM, 185–191.</w:t>
+      </w:r>
+    </w:p>
+    <w:p>
+      <w:pPr>
+        <w:pStyle w:val="BodyText"/>
+      </w:pPr>
+      <w:r>
+        <w:t xml:space="preserve">[45]</w:t>
+      </w:r>
+      <w:r>
+        <w:t xml:space="preserve">R. Wilensky, D. N. Chin, M. Luria, J. Martin, J. Mayfield, and D. Wu. 1988. The Berkeley Unix Consultant Project.</w:t>
+      </w:r>
+      <w:r>
+        <w:t xml:space="preserve"> </w:t>
+      </w:r>
+      <w:r>
+        <w:rPr>
+          <w:i/>
+          <w:iCs/>
+        </w:rPr>
+        <w:t xml:space="preserve">Computational Linguistics</w:t>
+      </w:r>
+      <w:r>
+        <w:t xml:space="preserve"> </w:t>
+      </w:r>
+      <w:r>
+        <w:t xml:space="preserve">14, 4 (1988), 35–84.</w:t>
+      </w:r>
+    </w:p>
+    <w:p>
+      <w:pPr>
+        <w:pStyle w:val="BodyText"/>
+      </w:pPr>
+      <w:r>
+        <w:t xml:space="preserve">[46]</w:t>
+      </w:r>
+      <w:r>
+        <w:t xml:space="preserve">T. Xie, D. Zhang, J. Chen, X. Li, S. Zhao, R. Cao, T. J. Hua, Z. Cheng, D. Shin, F. Lei, Y. Liu, Y. Xu, S. Zhou, S. Savarese, C. Xiong, V. Zhong, and T. Yu. 2024. OSWorld: Benchmarking Multimodal Agents for Open-Ended Tasks in Real Computer Environments. In</w:t>
+      </w:r>
+      <w:r>
+        <w:t xml:space="preserve"> </w:t>
+      </w:r>
+      <w:r>
+        <w:rPr>
+          <w:i/>
+          <w:iCs/>
+        </w:rPr>
+        <w:t xml:space="preserve">Advances in Neural Information Processing Systems 37 (NeurIPS 2024)</w:t>
+      </w:r>
+      <w:r>
+        <w:t xml:space="preserve">.</w:t>
+      </w:r>
+    </w:p>
+    <w:p>
+      <w:pPr>
+        <w:pStyle w:val="BodyText"/>
+      </w:pPr>
+      <w:r>
+        <w:t xml:space="preserve">[47]</w:t>
+      </w:r>
+      <w:r>
+        <w:t xml:space="preserve">S. Yao, J. Zhao, D. Yu, N. Du, I. Shafran, K. Narasimhan, and Y. Cao. 2023. ReAct: Synergizing Reasoning and Acting in Language Models. In</w:t>
+      </w:r>
+      <w:r>
+        <w:t xml:space="preserve"> </w:t>
+      </w:r>
+      <w:r>
+        <w:rPr>
+          <w:i/>
+          <w:iCs/>
+        </w:rPr>
+        <w:t xml:space="preserve">Proceedings of ICLR 2023</w:t>
+      </w:r>
+      <w:r>
+        <w:t xml:space="preserve">.</w:t>
+      </w:r>
+    </w:p>
+    <w:p>
+      <w:pPr>
+        <w:pStyle w:val="BodyText"/>
+      </w:pPr>
+      <w:r>
+        <w:t xml:space="preserve">[48]</w:t>
+      </w:r>
+      <w:r>
+        <w:t xml:space="preserve">M. Yuan, Z. Zhou, X. Xiong, et al. 2026. OSWorld 2.0: Benchmarking Computer Use Agents on Long-Horizon Real-World Tasks. arXiv:2606.29537</w:t>
+      </w:r>
+    </w:p>
+    <w:p>
+      <w:pPr>
+        <w:pStyle w:val="BodyText"/>
+      </w:pPr>
+      <w:r>
+        <w:t xml:space="preserve">[49]</w:t>
+      </w:r>
+      <w:r>
+        <w:t xml:space="preserve">C. Zhang, S. He, J. Qian, B. Li, L. Li, S. Qin, Y. Kang, M. Ma, G. Liu, Q. Lin, S. Rajmohan, D. Zhang, and Q. Zhang. 2024. Large Language Model-Brained GUI Agents: A Survey. arXiv:2411.18279</w:t>
+      </w:r>
+    </w:p>
+    <w:p>
+      <w:pPr>
+        <w:pStyle w:val="BodyText"/>
+      </w:pPr>
+      <w:r>
+        <w:t xml:space="preserve">[50]</w:t>
+      </w:r>
+      <w:r>
+        <w:t xml:space="preserve">C. Zhang, H. Huang, C. Ni, J. Mu, S. Qin, S. He, L. Wang, F. Yang, P. Zhao, C. Du, L. Li, Y. Kang, Z. Jiang, S. Zheng, R. Wang, J. Qian, M. Ma, J. Lou, Q. Lin, S. Rajmohan, and D. Zhang. 2025. UFO</w:t>
+      </w:r>
+      <w:r>
+        <w:rPr>
+          <w:vertAlign w:val="superscript"/>
+        </w:rPr>
+        <w:t xml:space="preserve">2</w:t>
+      </w:r>
+      <w:r>
+        <w:t xml:space="preserve">: The Desktop AgentOS. arXiv:2504.14603</w:t>
+      </w:r>
+    </w:p>
+    <w:p>
+      <w:pPr>
+        <w:pStyle w:val="BodyText"/>
+      </w:pPr>
+      <w:r>
+        <w:t xml:space="preserve">[51]</w:t>
+      </w:r>
+      <w:r>
+        <w:t xml:space="preserve">C. Zhang, Z. Yang, J. Liu, Y. Li, Y. Han, X. Chen, Z. Huang, B. Fu, and G. Yu. 2023. AppAgent: Multimodal Agents as Smartphone Users. arXiv:2312.13771</w:t>
+      </w:r>
+    </w:p>
+    <w:p>
+      <w:pPr>
+        <w:pStyle w:val="BodyText"/>
+      </w:pPr>
+      <w:r>
+        <w:t xml:space="preserve">[52]</w:t>
+      </w:r>
+      <w:r>
+        <w:t xml:space="preserve">B. Zheng, B. Gou, J. Kil, H. Sun, and Y. Su. 2024. GPT-4V(ision) is a Generalist Web Agent, if Grounded. In</w:t>
+      </w:r>
+      <w:r>
+        <w:t xml:space="preserve"> </w:t>
+      </w:r>
+      <w:r>
+        <w:rPr>
+          <w:i/>
+          <w:iCs/>
+        </w:rPr>
+        <w:t xml:space="preserve">Proceedings of ICML 2024</w:t>
+      </w:r>
+      <w:r>
+        <w:t xml:space="preserve">.</w:t>
+      </w:r>
+    </w:p>
+    <w:p>
+      <w:pPr>
+        <w:pStyle w:val="BodyText"/>
+      </w:pPr>
+      <w:r>
+        <w:t xml:space="preserve">[53]</w:t>
+      </w:r>
+      <w:r>
+        <w:t xml:space="preserve">S. Zhou, F. F. Xu, H. Zhu, X. Zhou, R. Lo, A. Sridhar, X. Cheng, T. Ou, Y. Bisk, D. Fried, U. Alon, and G. Neubig. 2024. WebArena: A Realistic Web Environment for Building Autonomous Agents. In</w:t>
+      </w:r>
+      <w:r>
+        <w:t xml:space="preserve"> </w:t>
+      </w:r>
+      <w:r>
+        <w:rPr>
+          <w:i/>
+          <w:iCs/>
+        </w:rPr>
         <w:t xml:space="preserve">Proceedings of ICLR 2024</w:t>
       </w:r>
       <w:r>
@@ -13450,13 +14140,13 @@
         <w:pStyle w:val="BodyText"/>
       </w:pPr>
       <w:r>
-        <w:t xml:space="preserve">[49]</w:t>
+        <w:t xml:space="preserve">[54]</w:t>
       </w:r>
       <w:r>
         <w:t xml:space="preserve">X. Zhou, S. Zhang, Y. Zhao, J. Wei, T. Song, A. Cohan, and C. Zhao. 2026. GUI vs. CLI: Execution Bottlenecks in Screen-Only and Skill-Mediated Computer-Use Agents. arXiv:2606.24551</w:t>
       </w:r>
     </w:p>
-    <w:bookmarkStart w:id="139" w:name="sec-appendices"/>
+    <w:bookmarkStart w:id="142" w:name="sec-appendices"/>
     <w:p>
       <w:pPr>
         <w:pStyle w:val="Heading2"/>
@@ -13473,7 +14163,7 @@
         <w:t xml:space="preserve">This section contains the study instruments administered to participants and the procedure governing their administration.  Wording, difficulty calibration, and task-form equivalence are validated during the pilot study described in Section 2.3 and revised before the main study begins; the instruments are reproduced here in the form submitted for ethics review.</w:t>
       </w:r>
     </w:p>
-    <w:bookmarkStart w:id="132" w:name="appendix-a"/>
+    <w:bookmarkStart w:id="135" w:name="appendix-a"/>
     <w:p>
       <w:pPr>
         <w:pStyle w:val="BodyText"/>
@@ -13490,7 +14180,7 @@
         <w:t xml:space="preserve">System Usability Scale (SUS)</w:t>
       </w:r>
     </w:p>
-    <w:bookmarkEnd w:id="132"/>
+    <w:bookmarkEnd w:id="135"/>
     <w:p>
       <w:pPr>
         <w:pStyle w:val="BodyText"/>
@@ -14530,10 +15220,10 @@
         <w:t xml:space="preserve"> </w:t>
       </w:r>
       <w:r>
-        <w:t xml:space="preserve">For odd-numbered items, subtract 1 from the response.  For even-numbered items, subtract the response from 5.  Sum the ten adjusted scores and multiply by 2.5, giving a value from 0 to 100.  This value is not a percentage; interpretation follows Sauro and Lewis [31].</w:t>
-      </w:r>
-    </w:p>
-    <w:bookmarkStart w:id="133" w:name="appendix-b"/>
+        <w:t xml:space="preserve">For odd-numbered items, subtract 1 from the response.  For even-numbered items, subtract the response from 5.  Sum the ten adjusted scores and multiply by 2.5, giving a value from 0 to 100.  This value is not a percentage; interpretation follows Sauro and Lewis [36].</w:t>
+      </w:r>
+    </w:p>
+    <w:bookmarkStart w:id="136" w:name="appendix-b"/>
     <w:p>
       <w:pPr>
         <w:pStyle w:val="BodyText"/>
@@ -14550,13 +15240,13 @@
         <w:t xml:space="preserve">NASA Task Load Index (NASA-TLX)</w:t>
       </w:r>
     </w:p>
-    <w:bookmarkEnd w:id="133"/>
-    <w:p>
-      <w:pPr>
-        <w:pStyle w:val="BodyText"/>
-      </w:pPr>
-      <w:r>
-        <w:t xml:space="preserve">Administered immediately after each condition, referring to the set of tasks just completed.  Six subscales are rated on a twenty-one-point scale presented as a line divided into equal intervals and scored 0 to 100 in steps of five.  This study uses the unweighted variant (Raw TLX): the pairwise weighting procedure of the original instrument [11] is omitted, and the composite workload score is the arithmetic mean of the six subscale ratings.  All six subscales, including Performance (anchored from Perfect to Failure), run from low to high workload, so no subscale is reverse-scored.</w:t>
+    <w:bookmarkEnd w:id="136"/>
+    <w:p>
+      <w:pPr>
+        <w:pStyle w:val="BodyText"/>
+      </w:pPr>
+      <w:r>
+        <w:t xml:space="preserve">Administered immediately after each condition, referring to the set of tasks just completed.  Six subscales are rated on a twenty-one-point scale presented as a line divided into equal intervals and scored 0 to 100 in steps of five.  This study uses the unweighted variant (Raw TLX): the pairwise weighting procedure of the original instrument [13] is omitted, and the composite workload score is the arithmetic mean of the six subscale ratings.  All six subscales, including Performance (anchored from Perfect to Failure), run from low to high workload, so no subscale is reverse-scored.</w:t>
       </w:r>
     </w:p>
     <w:p>
@@ -15061,7 +15751,7 @@
         </w:tc>
       </w:tr>
     </w:tbl>
-    <w:bookmarkStart w:id="134" w:name="appendix-c"/>
+    <w:bookmarkStart w:id="137" w:name="appendix-c"/>
     <w:p>
       <w:pPr>
         <w:pStyle w:val="BodyText"/>
@@ -15078,7 +15768,7 @@
         <w:t xml:space="preserve">Custom Cross-Platform Task Suite</w:t>
       </w:r>
     </w:p>
-    <w:bookmarkEnd w:id="134"/>
+    <w:bookmarkEnd w:id="137"/>
     <w:p>
       <w:pPr>
         <w:pStyle w:val="BodyText"/>
@@ -16752,7 +17442,7 @@
         </w:tc>
       </w:tr>
     </w:tbl>
-    <w:bookmarkStart w:id="135" w:name="appendix-d"/>
+    <w:bookmarkStart w:id="138" w:name="appendix-d"/>
     <w:p>
       <w:pPr>
         <w:pStyle w:val="BodyText"/>
@@ -16769,7 +17459,7 @@
         <w:t xml:space="preserve">Pre-Study Screening Questionnaire</w:t>
       </w:r>
     </w:p>
-    <w:bookmarkEnd w:id="135"/>
+    <w:bookmarkEnd w:id="138"/>
     <w:p>
       <w:pPr>
         <w:pStyle w:val="BodyText"/>
@@ -17326,7 +18016,7 @@
         <w:t xml:space="preserve">□ SynapseOS first   □ Own OS first</w:t>
       </w:r>
     </w:p>
-    <w:bookmarkStart w:id="136" w:name="appendix-e"/>
+    <w:bookmarkStart w:id="139" w:name="appendix-e"/>
     <w:p>
       <w:pPr>
         <w:pStyle w:val="BodyText"/>
@@ -17343,7 +18033,7 @@
         <w:t xml:space="preserve">Participant Information Sheet</w:t>
       </w:r>
     </w:p>
-    <w:bookmarkEnd w:id="136"/>
+    <w:bookmarkEnd w:id="139"/>
     <w:p>
       <w:pPr>
         <w:pStyle w:val="BodyText"/>
@@ -17542,7 +18232,7 @@
         <w:t xml:space="preserve">For questions about the study, contact the research team at [research team contact address].  For concerns about how the study is being conducted, or about your rights as a participant, contact the Institutional Review Board of Mapúa University – Makati at [ethics committee contact address], independently of the research team.</w:t>
       </w:r>
     </w:p>
-    <w:bookmarkStart w:id="137" w:name="appendix-f"/>
+    <w:bookmarkStart w:id="140" w:name="appendix-f"/>
     <w:p>
       <w:pPr>
         <w:pStyle w:val="BodyText"/>
@@ -17559,7 +18249,7 @@
         <w:t xml:space="preserve">Informed Consent Form</w:t>
       </w:r>
     </w:p>
-    <w:bookmarkEnd w:id="137"/>
+    <w:bookmarkEnd w:id="140"/>
     <w:p>
       <w:pPr>
         <w:pStyle w:val="BodyText"/>
@@ -17974,7 +18664,7 @@
         <w:t xml:space="preserve">Filing note: this is the only study document bearing the participant’s name.  It is stored separately from all study data, and the code-to-name list derived from it is destroyed on the schedule stated in Section 2.5.</w:t>
       </w:r>
     </w:p>
-    <w:bookmarkStart w:id="138" w:name="appendix-g"/>
+    <w:bookmarkStart w:id="141" w:name="appendix-g"/>
     <w:p>
       <w:pPr>
         <w:pStyle w:val="BodyText"/>
@@ -17991,7 +18681,7 @@
         <w:t xml:space="preserve">Session Facilitator Checklist</w:t>
       </w:r>
     </w:p>
-    <w:bookmarkEnd w:id="138"/>
+    <w:bookmarkEnd w:id="141"/>
     <w:p>
       <w:pPr>
         <w:pStyle w:val="BodyText"/>
@@ -18320,7 +19010,7 @@
         <w:t xml:space="preserve">Diarise the participant’s fourteen-day withdrawal deadline.</w:t>
       </w:r>
     </w:p>
-    <w:bookmarkEnd w:id="139"/>
+    <w:bookmarkEnd w:id="142"/>
     <w:sectPr/>
   </w:body>
 </w:document>

</xml_diff>

<commit_message>
docs(thesis): fix the high and medium findings of the chapter review
Removes the leftover 'replaces the desktop' framing; narrows absolute claims the paper contradicted (permission-only guards, a domain neither tradition targeted, Windows and macOS, 'unclaimed'); surveys AgentOS, ANOLISA, try, ToolEmu, and NL2Bash; corrects NaSh's description and the CoLiS row of Table 2.1; demotes OSWorld to a secondary platform check; defines the strict and capture policies; fixes the error-rate denominator, the statistics plan, Algorithm 1, and the defect count; argues the plan's minimality; reports results per partition; guards fine-tuning against contamination; and adds the limitations a panel would expect. All 171 existing citation groups verified to resolve to the same sources after renumbering.
</commit_message>
<xml_diff>
--- a/thesis 1/consolidated/SynapseOS_Proposal_Chapters_1_to_3.docx
+++ b/thesis 1/consolidated/SynapseOS_Proposal_Chapters_1_to_3.docx
@@ -469,7 +469,7 @@
         <w:tab/>
       </w:r>
       <w:r>
-        <w:t xml:space="preserve">16</w:t>
+        <w:t xml:space="preserve">17</w:t>
       </w:r>
     </w:p>
     <w:p>
@@ -490,7 +490,7 @@
         <w:tab/>
       </w:r>
       <w:r>
-        <w:t xml:space="preserve">16</w:t>
+        <w:t xml:space="preserve">17</w:t>
       </w:r>
     </w:p>
     <w:p>
@@ -511,7 +511,7 @@
         <w:tab/>
       </w:r>
       <w:r>
-        <w:t xml:space="preserve">16</w:t>
+        <w:t xml:space="preserve">17</w:t>
       </w:r>
     </w:p>
     <w:p>
@@ -532,7 +532,7 @@
         <w:tab/>
       </w:r>
       <w:r>
-        <w:t xml:space="preserve">21</w:t>
+        <w:t xml:space="preserve">22</w:t>
       </w:r>
     </w:p>
     <w:p>
@@ -553,7 +553,7 @@
         <w:tab/>
       </w:r>
       <w:r>
-        <w:t xml:space="preserve">24</w:t>
+        <w:t xml:space="preserve">25</w:t>
       </w:r>
     </w:p>
     <w:p>
@@ -574,7 +574,7 @@
         <w:tab/>
       </w:r>
       <w:r>
-        <w:t xml:space="preserve">25</w:t>
+        <w:t xml:space="preserve">27</w:t>
       </w:r>
     </w:p>
     <w:p>
@@ -595,7 +595,7 @@
         <w:tab/>
       </w:r>
       <w:r>
-        <w:t xml:space="preserve">30</w:t>
+        <w:t xml:space="preserve">34</w:t>
       </w:r>
     </w:p>
     <w:p>
@@ -616,7 +616,7 @@
         <w:tab/>
       </w:r>
       <w:r>
-        <w:t xml:space="preserve">34</w:t>
+        <w:t xml:space="preserve">37</w:t>
       </w:r>
     </w:p>
     <w:p>
@@ -637,7 +637,7 @@
         <w:tab/>
       </w:r>
       <w:r>
-        <w:t xml:space="preserve">36</w:t>
+        <w:t xml:space="preserve">39</w:t>
       </w:r>
     </w:p>
     <w:p>
@@ -658,7 +658,7 @@
         <w:tab/>
       </w:r>
       <w:r>
-        <w:t xml:space="preserve">37</w:t>
+        <w:t xml:space="preserve">40</w:t>
       </w:r>
     </w:p>
     <w:p>
@@ -679,7 +679,7 @@
         <w:tab/>
       </w:r>
       <w:r>
-        <w:t xml:space="preserve">44</w:t>
+        <w:t xml:space="preserve">47</w:t>
       </w:r>
     </w:p>
     <w:p>
@@ -700,7 +700,7 @@
         <w:tab/>
       </w:r>
       <w:r>
-        <w:t xml:space="preserve">45</w:t>
+        <w:t xml:space="preserve">48</w:t>
       </w:r>
     </w:p>
     <w:p>
@@ -720,7 +720,7 @@
         <w:tab/>
       </w:r>
       <w:r>
-        <w:t xml:space="preserve">48</w:t>
+        <w:t xml:space="preserve">51</w:t>
       </w:r>
     </w:p>
     <w:p>
@@ -740,7 +740,7 @@
         <w:tab/>
       </w:r>
       <w:r>
-        <w:t xml:space="preserve">49</w:t>
+        <w:t xml:space="preserve">52</w:t>
       </w:r>
     </w:p>
     <w:p>
@@ -760,7 +760,7 @@
         <w:tab/>
       </w:r>
       <w:r>
-        <w:t xml:space="preserve">52</w:t>
+        <w:t xml:space="preserve">55</w:t>
       </w:r>
     </w:p>
     <w:p>
@@ -780,7 +780,7 @@
         <w:tab/>
       </w:r>
       <w:r>
-        <w:t xml:space="preserve">54</w:t>
+        <w:t xml:space="preserve">57</w:t>
       </w:r>
     </w:p>
     <w:p>
@@ -800,7 +800,7 @@
         <w:tab/>
       </w:r>
       <w:r>
-        <w:t xml:space="preserve">67</w:t>
+        <w:t xml:space="preserve">70</w:t>
       </w:r>
     </w:p>
     <w:p>
@@ -820,7 +820,7 @@
         <w:tab/>
       </w:r>
       <w:r>
-        <w:t xml:space="preserve">82</w:t>
+        <w:t xml:space="preserve">86</w:t>
       </w:r>
     </w:p>
     <w:p>
@@ -840,7 +840,7 @@
         <w:tab/>
       </w:r>
       <w:r>
-        <w:t xml:space="preserve">101</w:t>
+        <w:t xml:space="preserve">106</w:t>
       </w:r>
     </w:p>
     <w:p>
@@ -860,7 +860,7 @@
         <w:tab/>
       </w:r>
       <w:r>
-        <w:t xml:space="preserve">107</w:t>
+        <w:t xml:space="preserve">113</w:t>
       </w:r>
     </w:p>
     <w:bookmarkStart w:id="24" w:name="list-of-tables"/>
@@ -909,7 +909,7 @@
         <w:tab/>
       </w:r>
       <w:r>
-        <w:t xml:space="preserve">30</w:t>
+        <w:t xml:space="preserve">33</w:t>
       </w:r>
     </w:p>
     <w:p>
@@ -929,7 +929,7 @@
         <w:tab/>
       </w:r>
       <w:r>
-        <w:t xml:space="preserve">37</w:t>
+        <w:t xml:space="preserve">40</w:t>
       </w:r>
     </w:p>
     <w:p>
@@ -949,7 +949,7 @@
         <w:tab/>
       </w:r>
       <w:r>
-        <w:t xml:space="preserve">52</w:t>
+        <w:t xml:space="preserve">55</w:t>
       </w:r>
     </w:p>
     <w:p>
@@ -969,7 +969,7 @@
         <w:tab/>
       </w:r>
       <w:r>
-        <w:t xml:space="preserve">52</w:t>
+        <w:t xml:space="preserve">55</w:t>
       </w:r>
     </w:p>
     <w:p>
@@ -989,7 +989,7 @@
         <w:tab/>
       </w:r>
       <w:r>
-        <w:t xml:space="preserve">84</w:t>
+        <w:t xml:space="preserve">88</w:t>
       </w:r>
     </w:p>
     <w:p>
@@ -1009,7 +1009,7 @@
         <w:tab/>
       </w:r>
       <w:r>
-        <w:t xml:space="preserve">88</w:t>
+        <w:t xml:space="preserve">92</w:t>
       </w:r>
     </w:p>
     <w:p>
@@ -1029,7 +1029,7 @@
         <w:tab/>
       </w:r>
       <w:r>
-        <w:t xml:space="preserve">92</w:t>
+        <w:t xml:space="preserve">97</w:t>
       </w:r>
     </w:p>
     <w:p>
@@ -1049,7 +1049,7 @@
         <w:tab/>
       </w:r>
       <w:r>
-        <w:t xml:space="preserve">110</w:t>
+        <w:t xml:space="preserve">116</w:t>
       </w:r>
     </w:p>
     <w:p>
@@ -1069,7 +1069,7 @@
         <w:tab/>
       </w:r>
       <w:r>
-        <w:t xml:space="preserve">112</w:t>
+        <w:t xml:space="preserve">118</w:t>
       </w:r>
     </w:p>
     <w:bookmarkEnd w:id="24"/>
@@ -1099,7 +1099,7 @@
         <w:tab/>
       </w:r>
       <w:r>
-        <w:t xml:space="preserve">18</w:t>
+        <w:t xml:space="preserve">19</w:t>
       </w:r>
     </w:p>
     <w:p>
@@ -1119,7 +1119,7 @@
         <w:tab/>
       </w:r>
       <w:r>
-        <w:t xml:space="preserve">50</w:t>
+        <w:t xml:space="preserve">53</w:t>
       </w:r>
     </w:p>
     <w:bookmarkEnd w:id="25"/>
@@ -1164,7 +1164,7 @@
         <w:pStyle w:val="BodyText"/>
       </w:pPr>
       <w:r>
-        <w:t xml:space="preserve">The dominant paradigm for personal computing has remained largely unchanged since the early 1980s, when the graphical desktop — icons, menus, and pointer-driven interaction — was established through the Xerox Star and Apple Lisa lineage.  Despite its longevity, a parallel research tradition has long explored whether users should instead be able to describe what they want in natural language and have the computer carry it out.  The earliest serious system in this tradition, the Berkeley UNIX Consultant, was already operational by the late 1980s [45].  Decades later, the rise of large language models (LLMs) and multimodal foundation models</w:t>
+        <w:t xml:space="preserve">The dominant paradigm for personal computing has remained largely unchanged since the early 1980s, when the graphical desktop — icons, menus, and pointer-driven interaction — was established through the Xerox Star and Apple Lisa lineage.  Despite its longevity, a parallel research tradition has long explored whether users should instead be able to describe what they want in natural language and have the computer carry it out.  The earliest serious system in this tradition, the Berkeley UNIX Consultant, was already operational by the late 1980s [48].  Decades later, the rise of large language models (LLMs) and multimodal foundation models</w:t>
       </w:r>
       <w:hyperlink w:anchor="ch1-fn1">
         <w:r>
@@ -1187,7 +1187,7 @@
         <w:pStyle w:val="BodyText"/>
       </w:pPr>
       <w:r>
-        <w:t xml:space="preserve">The field that has emerged sits at the intersection of human-computer interaction, operating systems, natural language processing, computer vision, and program analysis.  On the shell side, recent work has demonstrated that LLMs can translate natural language into Bash commands with usable accuracy and can be embedded as a Unix primitive with appropriate safety guardrails [11, 43].  On the graphical side, so-called computer-using agents</w:t>
+        <w:t xml:space="preserve">The field that has emerged sits at the intersection of human-computer interaction, operating systems, natural language processing, computer vision, and program analysis.  On the shell side, recent work has demonstrated that LLMs can translate natural language into Bash commands with usable accuracy and can be embedded as a Unix primitive with appropriate safety guardrails [12, 46].  On the graphical side, so-called computer-using agents</w:t>
       </w:r>
       <w:hyperlink w:anchor="ch1-fn2">
         <w:r>
@@ -1202,15 +1202,15 @@
         <w:t xml:space="preserve"> </w:t>
       </w:r>
       <w:r>
-        <w:t xml:space="preserve">now operate desktop and mobile applications by combining native APIs with vision-based grounding [49, 50].  On the web, language-guided agents complete tasks across realistic websites with measurable but limited reliability [52, 53].  A converging research thread approaches the same technical problem from an accessibility perspective: speech-driven GUI command mapping for users with motor and speech impairments has progressed from voice-to-text dictation toward voice-to-action agents, with recent work on speech-instructed GUI agents [12] and region-aware visual grounding [31] demonstrating that the underlying components are maturing rapidly.  Yet the gap between demonstration and deployable replacement remains substantial.  Capability on short, self-contained tasks has advanced quickly, but sustained computer work has not: on OSWorld 2.0, a benchmark of long-horizon tasks whose median item takes a skilled human roughly an hour and a half, the best frontier configuration completes only 20.6% of tasks outright [48].</w:t>
-      </w:r>
-    </w:p>
-    <w:p>
-      <w:pPr>
-        <w:pStyle w:val="BodyText"/>
-      </w:pPr>
-      <w:r>
-        <w:t xml:space="preserve">This rapid progress has been uneven across platforms.  Windows is heavily represented in the desktop agent literature [15, 50], Android in the mobile agent literature [33, 42, 51], and the browser in the web agent literature [8, 52, 53].  Linux desktop coverage, by contrast, is conspicuously absent: existing work either addresses Linux only at the shell level [11] or treats it as one of several evaluation platforms rather than a primary target [46].  No surveyed system implements a working conversational session layer</w:t>
+        <w:t xml:space="preserve">now operate desktop and mobile applications by combining native APIs with vision-based grounding [52, 53].  On the web, language-guided agents complete tasks across realistic websites with measurable but limited reliability [55, 56].  A converging research thread approaches the same technical problem from an accessibility perspective: speech-driven GUI command mapping for users with motor and speech impairments has progressed from voice-to-text dictation toward voice-to-action agents, with recent work on speech-instructed GUI agents [13] and region-aware visual grounding [33] demonstrating that the underlying components are maturing rapidly.  Yet the gap between demonstration and deployable replacement remains substantial.  Capability on short, self-contained tasks has advanced quickly, but sustained computer work has not: on OSWorld 2.0, a benchmark of long-horizon tasks whose median item takes a skilled human roughly an hour and a half, the best frontier configuration completes only 20.6% of tasks outright [51].</w:t>
+      </w:r>
+    </w:p>
+    <w:p>
+      <w:pPr>
+        <w:pStyle w:val="BodyText"/>
+      </w:pPr>
+      <w:r>
+        <w:t xml:space="preserve">This rapid progress has been uneven across platforms.  Windows is heavily represented in the desktop agent literature [16, 53], Android in the mobile agent literature [35, 45, 54], and the browser in the web agent literature [9, 55, 56].  Linux desktop coverage, by contrast, is conspicuously absent: existing work either addresses Linux only at the shell level [12] or treats it as one of several evaluation platforms rather than a primary target [49].  No surveyed system implements a working conversational session layer</w:t>
       </w:r>
       <w:hyperlink w:anchor="ch1-fn3">
         <w:r>
@@ -1225,7 +1225,7 @@
         <w:t xml:space="preserve"> </w:t>
       </w:r>
       <w:r>
-        <w:t xml:space="preserve">for the Linux desktop, despite Linux serving as the substrate for most developer and server-side workflows.</w:t>
+        <w:t xml:space="preserve">for the Linux desktop, despite Linux’s wide use for development and server work.</w:t>
       </w:r>
     </w:p>
     <w:p>
@@ -1251,7 +1251,7 @@
         <w:pStyle w:val="FirstParagraph"/>
       </w:pPr>
       <w:r>
-        <w:t xml:space="preserve">Capability brings a risk the field has not addressed.  A system that turns a request into a shell command and runs it acts on the user’s own files, and a command generated from a misunderstood request, or one simply broader than intended, can delete or overwrite them with no way back.  Every surveyed system guards against this by</w:t>
+        <w:t xml:space="preserve">Capability brings a risk the field has not addressed.  A system that turns a request into a shell command and runs it acts on the user’s own files, and a command generated from a misunderstood request, or one simply broader than intended, can delete or overwrite them with no way back.  The surveyed systems guard against this in one of two ways, and neither looks at what a particular command will do.  Most guard by</w:t>
       </w:r>
       <w:r>
         <w:t xml:space="preserve"> </w:t>
@@ -1264,7 +1264,7 @@
         <w:t xml:space="preserve">permission</w:t>
       </w:r>
       <w:r>
-        <w:t xml:space="preserve">: the generated command is matched against a list of patterns judged dangerous and is then allowed, refused, or put to the user [11].  A list of this kind cannot see what a command will actually touch when its targets are hidden inside another command, such as</w:t>
+        <w:t xml:space="preserve">: the generated command is matched against a list of patterns judged dangerous and is then allowed, refused, or put to the user [12].  A few that ship add coarse recovery: Alibaba Cloud’s ANOLISA, a Linux distribution for AI agents, snapshots an agent’s workspace before key operations or after each round of conversation and can roll back to any snapshot [1], which restores everything since the snapshot rather than what one command destroyed.  A list cannot see what a command will actually touch when its targets are hidden inside another command, such as</w:t>
       </w:r>
       <w:r>
         <w:t xml:space="preserve"> </w:t>
@@ -1291,7 +1291,7 @@
         <w:t xml:space="preserve">xargs</w:t>
       </w:r>
       <w:r>
-        <w:t xml:space="preserve">, or are computed while it runs, and it cannot back up what it does not know will be lost.  Whether a generated command can be undone, and what must be saved beforehand so that it can be, is a question of program analysis rather than of interface design, and no surveyed system answers it.</w:t>
+        <w:t xml:space="preserve">, or are computed while it runs, and neither a list nor a snapshot can say, before a command runs, whether it will lose anything.  Whether a generated command can be undone, and what must be saved beforehand so that it can be, is a question of program analysis rather than of interface design, and no surveyed system answers it.</w:t>
       </w:r>
     </w:p>
     <w:p>
@@ -1315,15 +1315,15 @@
         <w:t xml:space="preserve"> </w:t>
       </w:r>
       <w:r>
-        <w:t xml:space="preserve">system places a conversational layer over the conventional desktop session as a whole.  The idea is no longer unclaimed — AgentOS [22] proposes a natural-language portal in place of the graphical desktop — but it is offered as a research direction, without a built system or an evaluation.  The systems that are built automate on top of the desktop rather than replacing it: UFO², for instance, positions itself as a “Desktop AgentOS” but operates as an automation layer atop the existing Windows shell, deliberately confining itself to a separate desktop so that agent and user do not interfere [50].  Third, the Linux work that exists serves servers and agents rather than the desktop session of an end user.  NaSh addresses Linux at the shell level as a design proposal without evaluation [11]; shipping natural-language shells such as Alibaba Cloud’s ANOLISA pair intent translation with approval gating and rollback, but scope themselves explicitly to server and DevOps workloads; and OSWorld includes Ubuntu as an evaluation platform rather than a deployment target [46].  Fourth, controlled comparison against the conventional graphical workflow exists only for narrow slices of the problem.  AXIS evaluates an API-first agent against manual operation within a single application, Microsoft Word, using a cloud-hosted frontier model [23], and the accessibility literature evaluates assistance for specific populations [30].  No study compares a conversational interface against the conventional workflow across operating-system-level tasks, on a Linux desktop, driven by a locally-hosted small model, under an explicit safety gate.  The first of these gaps is the one this study’s research addresses.  The other three describe the setting in which it arises, and they are why the analysis is deployed and validated in a conversational interface layer rather than studied on a corpus alone.</w:t>
-      </w:r>
-    </w:p>
-    <w:p>
-      <w:pPr>
-        <w:pStyle w:val="BodyText"/>
-      </w:pPr>
-      <w:r>
-        <w:t xml:space="preserve">Notably, the accessibility-focused thread of the field exhibits the inverse limitation.  Speech-to-GUI mapping research targets specific user populations — users with motor impairments, speech disorders, or cognitive disabilities — with specialized techniques such as speech-instructed GUI agents and resilient visual grounding [12, 31], but operates at the level of individual applications or interaction techniques rather than at the level of the session layer itself.  These approaches presuppose an underlying conversational system surface on which to run, yet no such surface exists.  This complementarity sharpens the opportunity: a general-purpose conversational interface layer would serve not only mainstream users but also provide the substrate that accessibility-specific configurations require.</w:t>
+        <w:t xml:space="preserve">system places a conversational layer over a desktop session as a whole, addressed to the person using the machine.  AgentOS [24] proposes a natural-language portal in place of the graphical desktop, but as a research direction, without a built system or an evaluation, and the systems that are built automate the desktop on the user’s behalf: UFO², for instance, positions itself as a “Desktop AgentOS” but runs as an automation layer beside the user’s own Windows session, deliberately confining itself to a separate desktop so that agent and user do not interfere [53].  Third, the Linux work that exists serves servers and agents rather than the desktop session of an end user.  NaSh addresses Linux at the shell level as a design proposal without evaluation [12]; shipping natural-language shells such as ANOLISA pair intent translation with approval gating and snapshot rollback, but are built to run AI agents on cloud servers [1]; and OSWorld includes Ubuntu as an evaluation platform rather than a deployment target [49].  Fourth, controlled comparison against the conventional graphical workflow exists only for narrow slices of the problem.  AXIS evaluates an API-first agent against manual operation within a single application, Microsoft Word, using a cloud-hosted frontier model [25], and the accessibility literature evaluates assistance for specific populations [32].  No study compares a conversational interface against the conventional workflow across operating-system-level tasks, on a Linux desktop, driven by a locally-hosted small model, under an explicit safety gate.  The first of these gaps is the one this study’s research addresses.  The other three describe the setting in which it arises, and they are why the analysis is deployed and validated in a conversational interface layer rather than studied on a corpus alone.</w:t>
+      </w:r>
+    </w:p>
+    <w:p>
+      <w:pPr>
+        <w:pStyle w:val="BodyText"/>
+      </w:pPr>
+      <w:r>
+        <w:t xml:space="preserve">Notably, the accessibility-focused thread of the field exhibits the inverse limitation.  Speech-to-GUI mapping research targets specific user populations — users with motor impairments, speech disorders, or cognitive disabilities — with specialized techniques such as speech-instructed GUI agents and resilient visual grounding [13, 33], but operates at the level of individual applications or interaction techniques rather than at the level of the session layer itself.  These approaches presuppose an underlying conversational surface on which to run.  A conversational interface layer over the whole session could provide one, which makes accessibility a possible later use of the platform built for this study, though it is outside the study’s scope.</w:t>
       </w:r>
     </w:p>
     <w:p>
@@ -1346,7 +1346,7 @@
         <w:t xml:space="preserve"> </w:t>
       </w:r>
       <w:r>
-        <w:t xml:space="preserve">sits over an unchanged kernel and core utilities: the desktop shell, window manager, and application launcher are left in place, as are the kernel, the core system utilities, and the existing application ecosystem, and a user retains every route to the machine they already had and gains a third.  It serves as the experimental platform on which the analysis is deployed, demonstrated, and validated in use, with people of differing technical fluency and with the conventional desktop workflow as the baseline.</w:t>
+        <w:t xml:space="preserve">sits over an unchanged kernel and core utilities: the desktop shell, window manager, and application launcher are left in place, as are the kernel, the core system utilities, and the existing application ecosystem, and a user retains every route to the machine they already had and gains a third.  It serves as the experimental platform on which the analysis is deployed, demonstrated, and validated in use, with people of differing technical fluency and with each participant’s own primary operating system as the baseline.</w:t>
       </w:r>
     </w:p>
     <w:bookmarkEnd w:id="29"/>
@@ -1364,7 +1364,7 @@
         <w:pStyle w:val="FirstParagraph"/>
       </w:pPr>
       <w:r>
-        <w:t xml:space="preserve">A system that turns a request in ordinary language into a shell command and runs it acts directly on the user’s own files and system state.  Language models have made such systems practical: a person who cannot write a shell command can now have one written for them, and conversational interfaces, coding assistants, and agentic tools increasingly execute what a model writes.  A generated command can be wrong, or broader than the request intended, and whether what it destroys can be restored depends entirely on what was saved before it ran.  The tools that execute generated commands today decide only whether to run them, by matching the command against a list of patterns judged dangerous; they cannot determine what a command will touch when its targets are hidden inside another command or computed while it runs, and they save nothing.  This study addresses that problem: determining, before a generated shell command runs, what it would change, whether the change can be undone, and the least that must be captured beforehand so that it can be.  It is a problem of program analysis rather than of interface design, and the surveyed systems leave it open.  It is studied in the setting where it is most acute — a conversational interface layer through which a person who does not read shell syntax operates a Linux desktop — but the analysis takes a command as a string and is independent of the interface and the model that produced it.</w:t>
+        <w:t xml:space="preserve">A system that turns a request in ordinary language into a shell command and runs it acts directly on the user’s own files and system state.  Language models have made such systems practical: a person who cannot write a shell command can now have one written for them, and conversational interfaces, coding assistants, and agentic tools increasingly execute what a model writes.  A generated command can be wrong, or broader than the request intended, and whether what it destroys can be restored depends entirely on what was saved before it ran.  The tools that execute generated commands today decide only whether to run them, by matching the command against a list of patterns judged dangerous; they cannot determine what a command will touch when its targets are hidden inside another command or computed while it runs, and those that offer recovery at all snapshot a workspace wholesale, without knowing what any one command will destroy [1].  This study addresses that problem: determining, before a generated shell command runs, what it would change, whether the change can be undone, and the least that must be captured beforehand so that it can be.  It is a problem of program analysis rather than of interface design, and the surveyed systems leave it open.  It is studied in the setting where it is most acute — a conversational interface layer through which a person who does not read shell syntax operates a Linux desktop — but the analysis takes a command as a string and is independent of the interface and the model that produced it.</w:t>
       </w:r>
     </w:p>
     <w:p>
@@ -1818,7 +1818,7 @@
               <w:jc w:val="left"/>
             </w:pPr>
             <w:r>
-              <w:t xml:space="preserve">Training a model is a different study; this one evaluates an interface built on an existing one</w:t>
+              <w:t xml:space="preserve">Training a model is a different study; the analysis this study contributes is independent of the model that produced the command</w:t>
             </w:r>
           </w:p>
         </w:tc>
@@ -2016,7 +2016,7 @@
         <w:t xml:space="preserve">effect semantics</w:t>
       </w:r>
       <w:r>
-        <w:t xml:space="preserve">: a command is represented not by its name but by the set of system effects its syntactic structure implies — which paths it would read, create, write, remove, or alter in metadata — resolved against a working directory and propagated through the operators that join commands into one line.  The recovery plan is a minimum-cost cover of that effect set, and the verdict a predicate over it.  This is the study’s principal technical contribution and the subject of RQ1.  It is distinguished from the permission models used by existing agentic tools, which decide whether a command is allowed by matching it against enumerated patterns, and which take no pre-images: a permission model can refuse a command, but it cannot restore what an approved command destroyed.  It is equally distinguished from privilege mechanisms such as</w:t>
+        <w:t xml:space="preserve">: a command is represented not by its name but by the set of system effects its syntactic structure implies — which paths it would read, create, write, remove, or alter in metadata — resolved against a working directory and propagated through the operators that join commands into one line.  The recovery plan is a minimum-cost cover of that effect set, and the verdict a predicate over it.  This is the study’s principal technical contribution and the subject of RQ1 through RQ5.  It is distinguished from the permission models used by existing agentic tools, which decide whether a command is allowed by matching it against enumerated patterns, and which take no pre-images: a permission model can refuse a command, but it cannot restore what an approved command destroyed.  It is equally distinguished from privilege mechanisms such as</w:t>
       </w:r>
       <w:r>
         <w:t xml:space="preserve"> </w:t>
@@ -2286,7 +2286,7 @@
         <w:t xml:space="preserve"> </w:t>
       </w:r>
       <w:r>
-        <w:t xml:space="preserve">The conventional graphical desktop imposes a steep learning curve rooted in its icon-and-menu paradigm.  A person who cannot read a shell command cannot judge one a model wrote for them, so letting a model act on their behalf is safe only if what it destroys can be restored; the recoverability analysis supplies that, and a conversational interface layer that accepts natural language intent lowers the threshold for productive computer use, particularly for users with limited prior computing experience, including elderly users encountering desktop computing late or infrequently.</w:t>
+        <w:t xml:space="preserve">Much of what a computer can do is reachable only through its command line, which most people do not read.  A person who cannot read a shell command cannot judge one a model wrote for them, so letting a model act on their behalf is safe only if what it destroys can be restored; the recoverability analysis supplies that, and a conversational interface layer that accepts natural language intent is expected to lower the threshold for productive computer use for users with limited prior computing experience, which the validation study examines.</w:t>
       </w:r>
     </w:p>
     <w:p>
@@ -2308,7 +2308,7 @@
         <w:t xml:space="preserve"> </w:t>
       </w:r>
       <w:r>
-        <w:t xml:space="preserve">A conversational interface layer reduces the cognitive load of recalling and composing shell commands by exposing system operations through a unified natural-language interface.</w:t>
+        <w:t xml:space="preserve">A conversational interface layer is expected to reduce the cognitive load of recalling and composing shell commands by exposing system operations through a unified natural-language interface, which the validation study measures through the NASA Task Load Index.</w:t>
       </w:r>
     </w:p>
     <w:p>
@@ -2330,7 +2330,7 @@
         <w:t xml:space="preserve"> </w:t>
       </w:r>
       <w:r>
-        <w:t xml:space="preserve">Although this population is scoped out of the initial evaluation for ethical and recruitment reasons, SynapseOS is positioned to serve as the session-level substrate on which accessibility-specific configurations can operate.  Prior work has established design guidelines for LLM-based speech interfaces for users with motor impairments [30] and has demonstrated specialized techniques — speech-instructed GUI agents and resilient visual grounding — at the application and interaction-technique level [12, 31].  These techniques presuppose a conversational system surface that does not yet exist at the session level; SynapseOS provides that surface, making accessibility-specific extensions a natural and well-grounded future direction rather than a speculative one.</w:t>
+        <w:t xml:space="preserve">Although this population is scoped out of the initial evaluation for ethical and recruitment reasons, SynapseOS could serve as a platform on which accessibility-specific configurations operate.  Prior work has established design guidelines for LLM-based speech interfaces for users with motor impairments [32] and has demonstrated specialized techniques — speech-instructed GUI agents and resilient visual grounding — at the application and interaction-technique level [13, 33].  These techniques presuppose a conversational surface over the whole session, which the platform built for this study provides, so accessibility-specific extensions are a possible future direction; they are outside the scope of this study.</w:t>
       </w:r>
     </w:p>
     <w:bookmarkEnd w:id="33"/>
@@ -2380,7 +2380,7 @@
         <w:t xml:space="preserve"> </w:t>
       </w:r>
       <w:r>
-        <w:t xml:space="preserve">names where that surface sits in the system: the software a user meets immediately after login.  The first is where this study’s algorithmic contribution is deployed and evaluated; the second is its architectural position, and the phrase “session layer” is used only when SynapseOS’s position relative to it is specifically at issue.  This study covers the design and evaluation of a recoverability analysis for generated shell commands, which is its research contribution, and the implementation of SynapseOS, the conversational interface layer for the Linux desktop</w:t>
+        <w:t xml:space="preserve">names where that surface sits in the system: the software a user meets immediately after login.  The first is where this study’s algorithmic contribution is deployed and validated in use; the second is its architectural position, and the phrase “session layer” is used only when SynapseOS’s position relative to it is specifically at issue.  This study covers the design and evaluation of a recoverability analysis for generated shell commands, which is its research contribution, and the implementation of SynapseOS, the conversational interface layer for the Linux desktop</w:t>
       </w:r>
       <w:hyperlink w:anchor="ch1-fn4">
         <w:r>
@@ -2403,7 +2403,7 @@
         <w:pStyle w:val="BodyText"/>
       </w:pPr>
       <w:r>
-        <w:t xml:space="preserve">The study examines cross-application desktop workflows on Linux, including shell operations, file management, and application-level tasks representable in the OSWorld benchmark task suite [46].  The validation study recruits novice computer users and power users for a controlled study on the platform.  The study is conducted in a Linux desktop environment and is bounded by the duration of the thesis project.  The recoverability analysis covers commands in the bash dialect on a Debian system: their effects on the filesystem, and the changes to package and service state they make through apt, dpkg, and systemd.  It is evaluated on a corpus of 777 commands drawn from NL2Bash, from templates covering each composition operator, and from tools whose effects lie outside the filesystem, and the contributions of composition and of runtime-target resolution are measured by ablation on the same corpus.</w:t>
+        <w:t xml:space="preserve">The study examines cross-application desktop workflows on Linux, including shell operations, file management, and application-level tasks representable in the OSWorld benchmark task suite [49].  The validation study recruits novice computer users and power users for a controlled study on the platform.  The study is conducted in a Linux desktop environment and is bounded by the duration of the thesis project.  The recoverability analysis covers commands in the bash dialect on a Debian system: their effects on the filesystem, and the changes to package and service state they make through apt, dpkg, and systemd.  It is evaluated on a corpus of 777 commands drawn from NL2Bash, from templates covering each composition operator, and from tools whose effects lie outside the filesystem, and the contributions of composition and of runtime-target resolution are measured by ablation on the same corpus.</w:t>
       </w:r>
     </w:p>
     <w:p>
@@ -2423,7 +2423,7 @@
         </w:r>
       </w:hyperlink>
       <w:r>
-        <w:t xml:space="preserve">; this tradeoff may affect the ceiling on intent parsing accuracy achievable within the study.  Second, users with motor accessibility needs — a highly relevant population — are excluded from the initial evaluation due to ethics-review and recruitment constraints; accessibility-specific configurations such as speech-instructed agent operation for atypical speech patterns [12] are likewise out of scope for the initial implementation but represent a natural extension of the SynapseOS substrate.  Third, SynapseOS targets the Linux desktop specifically, and the findings may not generalize directly to Windows or macOS desktop environments.  Fourth, the safety confirmation policy for irreversible system operations is defined in principle but requires empirical calibration during implementation.  Fifth, evaluation is bounded by the task coverage of the OSWorld benchmark and the custom task suite developed for this study; tasks outside this coverage are not evaluated.  Sixth, the recoverability analysis treats anything it cannot determine as unrecoverable, and so protects such commands only by asking first: code run by an interpreter, programs it does not model, and variables with no value are of this kind.  Its per-command rules are a hand-written enumeration, which its composition builds on rather than replaces, and it resolves a command’s targets shortly before the command runs, so a file changed by another process in the interval is captured as it was when resolved.</w:t>
+        <w:t xml:space="preserve">; this tradeoff may affect the ceiling on intent parsing accuracy achievable within the study.  Second, users with motor accessibility needs — a highly relevant population — are excluded from the initial evaluation due to ethics-review and recruitment constraints; accessibility-specific configurations such as speech-instructed agent operation for atypical speech patterns [13] are likewise out of scope for the initial implementation but represent a natural extension of the SynapseOS substrate.  Third, SynapseOS targets the Linux desktop specifically, and the findings may not generalize directly to Windows or macOS desktop environments.  Fourth, the platform offers two confirmation policies over the analysis’s verdict, a strict one that is the default and a capture-only one (Chapter 3, Section 2.1(e)); which serves users better is a question the validation study informs rather than settles.  Fifth, the analysis is evaluated on a corpus of 777 commands: human-written commands from NL2Bash, templates written by the same team that wrote the analysis’s rule table and the pattern-list baseline, and commands whose effects lie outside the filesystem.  Each label describes what a command did on the fixture it ran on, not on every possible filesystem; these threats and their mitigations are stated in Chapter 3, Section 3.1(e).  The validation study is separately bounded by the task coverage of the OSWorld benchmark and the custom task suite developed for this study.  Sixth, the recoverability analysis treats anything it cannot determine as unrecoverable, and so protects such commands only by asking first: code run by an interpreter, programs it does not model, and variables with no value are of this kind.  Its per-command rules are a hand-written enumeration, which its composition builds on rather than replaces, and it resolves a command’s targets shortly before the command runs, so a file changed by another process in the interval is captured as it was when resolved.  Of the 325 file-destroying commands in the corpus, 34 (10.5%) are protected only by asking, because the analysis could not determine them; on silent loss it is indistinguishable from a list that refuses every command it does not recognize, both at zero, so its advantage lies in what it restores; and undo restored 630 of the 631 commands executed in the recovery check, the one failure being reported in Chapter 3.  Seventh, the recovery plan is minimal relative to the capture mechanisms and cost model stated in Chapter 3, Section 2.1(c), not over every conceivable way of restoring a system.</w:t>
       </w:r>
     </w:p>
     <w:bookmarkEnd w:id="34"/>
@@ -2539,7 +2539,7 @@
         <w:pStyle w:val="FirstParagraph"/>
       </w:pPr>
       <w:r>
-        <w:t xml:space="preserve">This chapter reviews two bodies of research: the program-analysis and command-safety work on which the study’s recoverability analysis builds, and the work on conversational and language-model-mediated interfaces to personal computing in which SynapseOS, the platform where the analysis is deployed, is situated.  The review spans nearly four decades of work on natural-language interfaces to computing systems, from the symbolic-artificial-intelligence consultants developed for the Unix shell in the late 1980s [45] to the large language model (LLM) agents that now operate shells, graphical applications, browsers, and mobile devices.  Its purpose is threefold: to establish the conceptual vocabulary and technical foundations on which the present study builds, to characterize the current state of the field and its recurring limitations, and to locate precisely the gaps that the proposed recoverability analysis, and SynapseOS, the system in which it is deployed, are designed to fill.</w:t>
+        <w:t xml:space="preserve">This chapter reviews two bodies of research: the program-analysis and command-safety work on which the study’s recoverability analysis builds, and the work on conversational and language-model-mediated interfaces to personal computing in which SynapseOS, the platform where the analysis is deployed, is situated.  The review spans nearly four decades of work on natural-language interfaces to computing systems, from the symbolic-artificial-intelligence consultants developed for the Unix shell in the late 1980s [48] to the large language model (LLM) agents that now operate shells, graphical applications, browsers, and mobile devices.  Its purpose is threefold: to establish the conceptual vocabulary and technical foundations on which the present study builds, to characterize the current state of the field and its recurring limitations, and to locate precisely the gaps that the proposed recoverability analysis, and SynapseOS, the system in which it is deployed, are designed to fill.</w:t>
       </w:r>
     </w:p>
     <w:bookmarkEnd w:id="42"/>
@@ -2574,7 +2574,7 @@
         <w:pStyle w:val="FirstParagraph"/>
       </w:pPr>
       <w:r>
-        <w:t xml:space="preserve">The technique the study’s recoverability analysis relies on — determining what a piece of code will do without executing it — is not new; it has a decades-long history in programming-language theory under two related names, neither of which the natural-language shells and command guards surveyed in this chapter draw on.  Abstract interpretation, introduced by Cousot and Cousot [6], is the foundational technique for computing sound, conservative approximations of a program’s runtime behavior by evaluating it over an abstract domain rather than its concrete one.  Type-and-effect systems, developed by Jouvelot and Gifford [18] and given a full formal treatment by Talpin and Jouvelot [40], extend a program’s type judgment with an explicit account of the side effects an expression may produce, so that a compiler or static checker can reason about those effects instead of leaving them implicit in execution.  The recoverability algorithm this study contributes (Chapter 3, Section 2.1(a)–(c)) is an instance of this discipline applied to a domain neither tradition has targeted: a generated shell command is treated as an expression whose effect — on the filesystem, rather than on a type system’s abstract state — is derived from its syntax and composed across its operators, and it is that effect set, not the command’s name, that the recoverability verdict is computed over.  This connects the algorithm to an established formal lineage rather than presenting it as a bespoke heuristic, and it grounds the algorithm’s one-sided soundness property — over-approximating destructiveness under uncertainty rather than under-approximating it — in the same requirement abstract interpretation itself imposes: a sound abstraction may lose precision, but it may never assert a property the concrete execution does not actually have.</w:t>
+        <w:t xml:space="preserve">The technique the study’s recoverability analysis relies on — determining what a piece of code will do without executing it — is not new; it has a decades-long history in programming-language theory under two related names, neither of which the natural-language shells and command guards surveyed in this chapter draw on.  Abstract interpretation, introduced by Cousot and Cousot [7], is the foundational technique for computing sound, conservative approximations of a program’s runtime behavior by evaluating it over an abstract domain rather than its concrete one.  Type-and-effect systems, developed by Jouvelot and Gifford [19] and given a full formal treatment by Talpin and Jouvelot [43], extend a program’s type judgment with an explicit account of the side effects an expression may produce, so that a compiler or static checker can reason about those effects instead of leaving them implicit in execution.  The recoverability algorithm this study contributes (Chapter 3, Section 2.1(a)–(c)) is an instance of this discipline applied to a question neither tradition has addressed, whether the filesystem effects of a generated command can be undone and what must be captured beforehand so that they can be: a generated shell command is treated as an expression whose effect — on the filesystem, rather than on a type system’s abstract state — is derived from its syntax and composed across its operators, and it is that effect set, not the command’s name, that the recoverability verdict is computed over.  This connects the algorithm to an established formal lineage rather than presenting it as a bespoke heuristic, and it grounds the algorithm’s one-sided soundness property — over-approximating destructiveness under uncertainty rather than under-approximating it — in the same requirement abstract interpretation itself imposes: a sound abstraction may lose precision, but it may never assert a property the concrete execution does not actually have.</w:t>
       </w:r>
     </w:p>
     <w:p>
@@ -2655,7 +2655,7 @@
         <w:t xml:space="preserve"> </w:t>
       </w:r>
       <w:r>
-        <w:t xml:space="preserve">— Input, Reasoning, Action, and Operating-System Integration — as its framework for the interface literature.  The framework is adapted from the layered decomposition of large language model (LLM)-brained graphical user interface (GUI) agents proposed in the survey of Zhang and colleagues [49], generalized here from graphical agents specifically to language-mediated computing interfaces as a class.  Figure 2.1 depicts the pipeline and situates the layers relative to one another.</w:t>
+        <w:t xml:space="preserve">— Input, Reasoning, Action, and Operating-System Integration — as its framework for the interface literature.  The framework is adapted from the layered decomposition of large language model (LLM)-brained graphical user interface (GUI) agents proposed in the survey of Zhang and colleagues [52], generalized here from graphical agents specifically to language-mediated computing interfaces as a class.  Figure 2.1 depicts the pipeline and situates the layers relative to one another.</w:t>
       </w:r>
     </w:p>
     <w:p>
@@ -2665,14 +2665,14 @@
       <w:r>
         <w:drawing>
           <wp:inline>
-            <wp:extent cx="5334000" cy="1114567"/>
+            <wp:extent cx="5334000" cy="1121201"/>
             <wp:effectExtent b="0" l="0" r="0" t="0"/>
             <wp:docPr descr="" title="" id="45" name="Picture"/>
             <a:graphic>
               <a:graphicData uri="http://schemas.openxmlformats.org/drawingml/2006/picture">
                 <pic:pic>
                   <pic:nvPicPr>
-                    <pic:cNvPr descr="/tmp/claude-1000/-home-willard-projects-thesis/cb82e7af-8c35-489a-a7f7-ef49172efea2/scratchpad/docx/work5/fig0.png" id="46" name="Picture"/>
+                    <pic:cNvPr descr="/tmp/claude-1000/-home-willard-projects-thesis/cb82e7af-8c35-489a-a7f7-ef49172efea2/scratchpad/docx/work6/fig0.png" id="46" name="Picture"/>
                     <pic:cNvPicPr>
                       <a:picLocks noChangeArrowheads="1" noChangeAspect="1"/>
                     </pic:cNvPicPr>
@@ -2686,7 +2686,7 @@
                   <pic:spPr bwMode="auto">
                     <a:xfrm>
                       <a:off x="0" y="0"/>
-                      <a:ext cx="5334000" cy="1114567"/>
+                      <a:ext cx="5334000" cy="1121201"/>
                     </a:xfrm>
                     <a:prstGeom prst="rect">
                       <a:avLst/>
@@ -2720,7 +2720,7 @@
         <w:t xml:space="preserve"> </w:t>
       </w:r>
       <w:r>
-        <w:t xml:space="preserve">The four-layer interaction pipeline for language-mediated computing interfaces, adapted from the LLM-brained GUI-agent survey of Zhang and colleagues [49].  A user’s intent enters at the Input layer, is parsed and grounded at the Reasoning layer, executed at the Action layer, and takes effect within a scope defined at the Operating-System Integration layer.</w:t>
+        <w:t xml:space="preserve">The four-layer interaction pipeline for language-mediated computing interfaces, adapted from the LLM-brained GUI-agent survey of Zhang and colleagues [52].  A user’s intent enters at the Input layer, is parsed and grounded at the Reasoning layer, executed at the Action layer, and takes effect within a scope defined at the Operating-System Integration layer.</w:t>
       </w:r>
     </w:p>
     <w:p>
@@ -2877,15 +2877,15 @@
         <w:pStyle w:val="FirstParagraph"/>
       </w:pPr>
       <w:r>
-        <w:t xml:space="preserve">The aspiration to let users describe what they want in ordinary language and have a computer carry it out is not new.  The earliest serious system in this tradition, the Berkeley Unix Consultant of Wilensky and colleagues [45], was already operational by the late 1980s.  The Unix Consultant was an intelligent natural-language interface that allowed naive users to learn about the Unix operating system through conversation in ordinary English, addressing both the natural-language-frontend problem and the consultation problem, and thereby distinguishing itself from systems intended only as command translators.  It was built on the KODIAK knowledge representation and incorporated a user-modeling component that represented the user’s knowledge state and a teaching component through which users could extend its knowledge base in natural language.  The system demonstrated end-to-end natural-language consultation about Unix, successfully answering "how do I," definitional, and problem-solving questions.  Critically, its authors identified knowledge acquisition as the principal bottleneck: extending the system to a new domain required substantial hand-engineering — a concern that directly foreshadows the contemporary problem of LLM-based agents requiring per-application grounding data.</w:t>
-      </w:r>
-    </w:p>
-    <w:p>
-      <w:pPr>
-        <w:pStyle w:val="BodyText"/>
-      </w:pPr>
-      <w:r>
-        <w:t xml:space="preserve">The intervening decades saw natural-language interaction treated primarily as a supervised-learning problem.  Representative of this pre-LLM era, the work of Li and colleagues on mapping natural-language instructions to mobile user-interface action sequences [20] trained dedicated phrase-extraction and grounding transformers on hand-annotated action sequences, achieving 70.59% accuracy on predicting complete ground-truth action sequences on its benchmark but remaining bound to its purpose-built datasets and architectures.  The decisive shift came with the introduction of in-context reasoning patterns for LLMs.  ReAct, introduced by Yao and colleagues [47], collapsed the multi-stage supervised pipeline into a prompting strategy: the language model is prompted to alternate between free-text "Thought" steps that update its plan and "Action" steps that interact with an external environment, with observations fed back into subsequent reasoning.  Implemented purely as a prompting strategy without fine-tuning, ReAct nonetheless outperformed imitation-learning and reinforcement-learning baselines that required thousands of training trajectories.</w:t>
+        <w:t xml:space="preserve">The aspiration to let users describe what they want in ordinary language and have a computer carry it out is not new.  The earliest serious system in this tradition, the Berkeley Unix Consultant of Wilensky and colleagues [48], was already operational by the late 1980s.  The Unix Consultant was an intelligent natural-language interface that allowed naive users to learn about the Unix operating system through conversation in ordinary English, addressing both the natural-language-frontend problem and the consultation problem, and thereby distinguishing itself from systems intended only as command translators.  It was built on the KODIAK knowledge representation and incorporated a user-modeling component that represented the user’s knowledge state and a teaching component through which users could extend its knowledge base in natural language.  The system demonstrated end-to-end natural-language consultation about Unix, successfully answering "how do I," definitional, and problem-solving questions.  Critically, its authors identified knowledge acquisition as the principal bottleneck: extending the system to a new domain required substantial hand-engineering — a concern that directly foreshadows the contemporary problem of LLM-based agents requiring per-application grounding data.</w:t>
+      </w:r>
+    </w:p>
+    <w:p>
+      <w:pPr>
+        <w:pStyle w:val="BodyText"/>
+      </w:pPr>
+      <w:r>
+        <w:t xml:space="preserve">The intervening decades saw natural-language interaction treated primarily as a supervised-learning problem.  Representative of this pre-LLM era, the work of Li and colleagues on mapping natural-language instructions to mobile user-interface action sequences [22] trained dedicated phrase-extraction and grounding transformers on hand-annotated action sequences, achieving 70.59% accuracy on predicting complete ground-truth action sequences on its benchmark but remaining bound to its purpose-built datasets and architectures.  The decisive shift came with the introduction of in-context reasoning patterns for LLMs.  ReAct, introduced by Yao and colleagues [50], collapsed the multi-stage supervised pipeline into a prompting strategy: the language model is prompted to alternate between free-text "Thought" steps that update its plan and "Action" steps that interact with an external environment, with observations fed back into subsequent reasoning.  Implemented purely as a prompting strategy without fine-tuning, ReAct nonetheless outperformed imitation-learning and reinforcement-learning baselines that required thousands of training trajectories.</w:t>
       </w:r>
     </w:p>
     <w:p>
@@ -2910,15 +2910,15 @@
         <w:pStyle w:val="FirstParagraph"/>
       </w:pPr>
       <w:r>
-        <w:t xml:space="preserve">The aspiration to a natural-language interface has a long-standing critique that remains unanswered, and a review that omitted it would misrepresent the state of the question.  Shneiderman’s account of direct manipulation [37] holds that interfaces succeed when the objects of interest are continuously visible, when actions upon them are rapid, incremental, and reversible, and when their effects are immediately apparent — properties that let a user build and maintain an accurate model of system state.  Norman formalized what an interface does for a user as the bridging of two gulfs [28]: the gulf of execution, between an intention and the actions a system makes available, and the gulf of evaluation, between the system’s response and the user’s ability to interpret it.  Hutchins, Hollan, and Norman [16] argued that direct manipulation narrows both, by making an interface feel like the object of interest itself rather than a description of it.</w:t>
-      </w:r>
-    </w:p>
-    <w:p>
-      <w:pPr>
-        <w:pStyle w:val="BodyText"/>
-      </w:pPr>
-      <w:r>
-        <w:t xml:space="preserve">A language interface sits awkwardly against nearly every one of those properties.  An utterance is not continuously visible, not incremental, and not reversible by the same gesture that produced it; the set of available actions is not displayed, so the user must guess at the system’s capabilities rather than see them.  Shneiderman and Maes debated precisely this trade-off between direct manipulation and interface agents [39], and Shneiderman argued subsequently that speech and language interaction consume the same cognitive resources a user needs in order to hold a task in mind, where pointing does not [38].  Empirical work on modern conversational agents has largely borne the concern out: Luger and Sellen documented a persistent gulf between what users expected a conversational agent to understand and what it actually did [24], and Clark and colleagues found that the properties people value in human conversation transfer poorly to interaction with an agent [5].</w:t>
+        <w:t xml:space="preserve">The aspiration to a natural-language interface has a long-standing critique that remains unanswered, and a review that omitted it would misrepresent the state of the question.  Shneiderman’s account of direct manipulation [40] holds that interfaces succeed when the objects of interest are continuously visible, when actions upon them are rapid, incremental, and reversible, and when their effects are immediately apparent — properties that let a user build and maintain an accurate model of system state.  Norman formalized what an interface does for a user as the bridging of two gulfs [30]: the gulf of execution, between an intention and the actions a system makes available, and the gulf of evaluation, between the system’s response and the user’s ability to interpret it.  Hutchins, Hollan, and Norman [17] argued that direct manipulation narrows both, by making an interface feel like the object of interest itself rather than a description of it.</w:t>
+      </w:r>
+    </w:p>
+    <w:p>
+      <w:pPr>
+        <w:pStyle w:val="BodyText"/>
+      </w:pPr>
+      <w:r>
+        <w:t xml:space="preserve">A language interface sits awkwardly against nearly every one of those properties.  An utterance is not continuously visible, not incremental, and not reversible by the same gesture that produced it; the set of available actions is not displayed, so the user must guess at the system’s capabilities rather than see them.  Shneiderman and Maes debated precisely this trade-off between direct manipulation and interface agents [42], and Shneiderman argued subsequently that speech and language interaction consume the same cognitive resources a user needs in order to hold a task in mind, where pointing does not [41].  Empirical work on modern conversational agents has largely borne the concern out: Luger and Sellen documented a persistent gulf between what users expected a conversational agent to understand and what it actually did [26], and Clark and colleagues found that the properties people value in human conversation transfer poorly to interaction with an agent [6].</w:t>
       </w:r>
     </w:p>
     <w:p>
@@ -2934,7 +2934,7 @@
         <w:pStyle w:val="BodyText"/>
       </w:pPr>
       <w:r>
-        <w:t xml:space="preserve">The comparative question is older than the current literature and considerably less settled than it is often assumed to be.  It is widely held that the command line’s power is inaccessible to most people in practice.  But the best-known controlled comparison of command, menu, and iconic interfaces, conducted by Whiteside and colleagues across seventy-six users and seven systems [44], concluded that interface style itself did not predict either performance or preference: careful design did, and the system that served novices best also served experts best.  That finding is as much a caution for the present study as a motivation for it.  It warns against attributing to a conversational paradigm what may in fact belong to the quality of one particular implementation, and it is a principal reason this study measures a specific system against a specific baseline rather than claiming to measure one paradigm against another.</w:t>
+        <w:t xml:space="preserve">The comparative question is older than the current literature and considerably less settled than it is often assumed to be.  It is widely held that the command line’s power is inaccessible to most people in practice.  But the best-known controlled comparison of command, menu, and iconic interfaces, conducted by Whiteside and colleagues across seventy-six users and seven systems [47], concluded that interface style itself did not predict either performance or preference: careful design did, and the system that served novices best also served experts best.  That finding is as much a caution for the present study as a motivation for it.  It warns against attributing to a conversational paradigm what may in fact belong to the quality of one particular implementation, and it is a principal reason this study measures a specific system against a specific baseline rather than claiming to measure one paradigm against another.</w:t>
       </w:r>
     </w:p>
     <w:bookmarkEnd w:id="49"/>
@@ -2953,23 +2953,31 @@
         <w:pStyle w:val="FirstParagraph"/>
       </w:pPr>
       <w:r>
-        <w:t xml:space="preserve">The thread of the literature most directly related to the proposed system concerns the translation of natural language into shell commands.  Because SynapseOS grounds user intent into commands executed through the standard Linux command-line toolchain, the accuracy, safety, and context-awareness of natural-language-to-Bash translation are of central relevance to its design.</w:t>
-      </w:r>
-    </w:p>
-    <w:p>
-      <w:pPr>
-        <w:pStyle w:val="BodyText"/>
-      </w:pPr>
-      <w:r>
-        <w:t xml:space="preserve">Westenfelder and colleagues [43] address this translation problem directly.  Their work constructs a manually verified test set of 600 instruction–command pairs and a training set of 40,939 pairs, and introduces a functional-equivalence heuristic that reaches 95% confidence in determining whether two Bash commands produce the same effect — allowing automated evaluation to move beyond exact-string matching to a measure of whether a generated command actually accomplishes the intended task.  Their fine-tuned models substantially outperform zero-shot baselines, demonstrating that fine-tuning specifically on command-translation data is effective.  The authors identify two persistent limitations: ambiguity in user instructions, and the absence of system context — the contents of the current directory, the user’s command history, and environment variables — at translation time.  Integrating context-aware retrieval is identified as a direction, one that the persistent conversational session of SynapseOS is well positioned to supply.</w:t>
-      </w:r>
-    </w:p>
-    <w:p>
-      <w:pPr>
-        <w:pStyle w:val="BodyText"/>
-      </w:pPr>
-      <w:r>
-        <w:t xml:space="preserve">The feasibility of deploying such a system without reliance on a hosted frontier model is supported by the large-scale evaluation of Jacobs and colleagues [17], who assess a broad range of locally deployable open-source LLMs on Bash command generation.  Their work provides an empirical anchor for the viability of running natural-language-to-Bash translation on local, open-weights models of modest size — the deployment posture adopted by SynapseOS for reasons of privacy and offline operation.  Taken together, the shell-and-command-line thread establishes that natural-language-to-Bash translation is tractable, that safety and reversibility are central rather than incidental concerns, and that local deployment is feasible; yet no surveyed shell-level system has been evaluated with users against the conventional workflow it would supplement.  How such systems guard the commands they generate, and what static analysis of shell commands can establish, are taken up in §2.5.</w:t>
+        <w:t xml:space="preserve">The thread of the literature most directly related to the platform concerns the translation of natural language into shell commands.  Because SynapseOS grounds user intent into commands executed through the standard Linux command-line toolchain, the accuracy, safety, and context-awareness of natural-language-to-Bash translation are of central relevance to its design.</w:t>
+      </w:r>
+    </w:p>
+    <w:p>
+      <w:pPr>
+        <w:pStyle w:val="BodyText"/>
+      </w:pPr>
+      <w:r>
+        <w:t xml:space="preserve">The standard dataset for this task is NL2Bash, from Lin and colleagues [23]: over nine thousand English descriptions paired with Bash commands, collected from question-and-answer sites, tutorials, and course material.  It supplies the human-written commands of this study’s evaluation corpus (Chapter 3, Section 1.2(a)).  Its commands were collected for translation rather than for safety, so most of them are read-only, which is why that corpus is sized against the labels it must contain rather than drawn as the dataset comes.</w:t>
+      </w:r>
+    </w:p>
+    <w:p>
+      <w:pPr>
+        <w:pStyle w:val="BodyText"/>
+      </w:pPr>
+      <w:r>
+        <w:t xml:space="preserve">Westenfelder and colleagues [46] address this translation problem directly.  Their work constructs a manually verified test set of 600 instruction–command pairs and a training set of 40,939 pairs, and introduces a functional-equivalence heuristic that reaches 95% confidence in determining whether two Bash commands produce the same effect — allowing automated evaluation to move beyond exact-string matching to a measure of whether a generated command actually accomplishes the intended task.  Their fine-tuned models substantially outperform zero-shot baselines, demonstrating that fine-tuning specifically on command-translation data is effective.  The authors identify two persistent limitations: ambiguity in user instructions, and the absence of system context — the contents of the current directory, the user’s command history, and environment variables — at translation time.  Integrating context-aware retrieval is identified as a direction, one that the persistent conversational session of SynapseOS is well positioned to supply.</w:t>
+      </w:r>
+    </w:p>
+    <w:p>
+      <w:pPr>
+        <w:pStyle w:val="BodyText"/>
+      </w:pPr>
+      <w:r>
+        <w:t xml:space="preserve">The feasibility of deploying such a system without reliance on a hosted frontier model is supported by the large-scale evaluation of Jacobs and colleagues [18], who assess a broad range of locally deployable open-source LLMs on Bash command generation.  Their work provides an empirical anchor for the viability of running natural-language-to-Bash translation on local, open-weights models of modest size — the deployment posture adopted by SynapseOS for reasons of privacy and offline operation.  Taken together, the shell-and-command-line thread establishes that natural-language-to-Bash translation is tractable, that safety and reversibility are central rather than incidental concerns, and that local deployment is feasible; yet no surveyed shell-level system has been evaluated with users against the conventional workflow it would supplement.  How such systems guard the commands they generate, and what static analysis of shell commands can establish, are taken up in §2.5.</w:t>
       </w:r>
     </w:p>
     <w:bookmarkEnd w:id="51"/>
@@ -3043,15 +3051,15 @@
         <w:pStyle w:val="FirstParagraph"/>
       </w:pPr>
       <w:r>
-        <w:t xml:space="preserve">Where translation accuracy is the concern of Westenfelder and colleagues (§2.4), safety is the concern of Gyawali and colleagues, whose NaSh system [11] proposes guardrails for an LLM-powered natural-language shell for Linux.  Published under the operating-systems classification, NaSh interposes a guardrail layer between the user’s natural-language input and the LLM-generated command: the model proposes a candidate command, the guardrail layer evaluates it against safety, reversibility, and confirmation criteria, and the user receives a structured preview before execution.  The authors note that LLM outputs may be unintended or unexplainable, requiring guardrails for user error recovery, and they leave as open work both the design of recovery and rollback mechanisms for irreversible system operations and the empirical user evaluation of the approach.  The first of these open problems, recovery from an operation already approved, is the one the present study’s recoverability analysis addresses; the second is taken up by its validation in use.</w:t>
-      </w:r>
-    </w:p>
-    <w:p>
-      <w:pPr>
-        <w:pStyle w:val="BodyText"/>
-      </w:pPr>
-      <w:r>
-        <w:t xml:space="preserve">The same design is what ships.  Coding agents that execute generated commands guard them with lists of command patterns: the dangerous-command check of OpenAI’s Codex CLI [29] and cc-safety-net [19], a pre-execution guard used with several agentic coding tools, are representative open-source examples, and both are scored as baselines in Chapter 3, Section 3.1(a).  Both are designed for agents working inside a version-controlled project, where deleting project files is routine and version control, rather than the guard, is what makes a mistake recoverable.  A personal computer’s files have no such safeguard, which is the setting of this study.</w:t>
+        <w:t xml:space="preserve">Where translation accuracy is the concern of Westenfelder and colleagues (§2.4), safety is the concern of Gyawali and colleagues, whose NaSh system [12] proposes guardrails for an LLM-powered natural-language shell for Linux.  Published under the operating-systems classification, NaSh interposes a guardrail layer between the user’s natural-language input and the LLM-generated command: the model proposes a candidate command, the guardrail layer evaluates it against safety, reversibility, and confirmation criteria, and the user receives a structured preview before execution.  The authors note that LLM outputs may be unintended or unexplainable, requiring guardrails for user error recovery, and they leave as open work both the design of recovery and rollback mechanisms for irreversible system operations and the empirical user evaluation of the approach.  The first of these open problems, recovery from an operation already approved, is the one the present study’s recoverability analysis addresses; the second is taken up by its validation in use.</w:t>
+      </w:r>
+    </w:p>
+    <w:p>
+      <w:pPr>
+        <w:pStyle w:val="BodyText"/>
+      </w:pPr>
+      <w:r>
+        <w:t xml:space="preserve">The same design is what ships.  Coding agents that execute generated commands guard them with lists of command patterns: the dangerous-command check of OpenAI’s Codex CLI [31] and cc-safety-net [20], a pre-execution guard used with several agentic coding tools, are representative open-source examples, and both are scored as baselines in Chapter 3, Section 3.1(a).  Both are designed for agents working inside a version-controlled project, where deleting project files is routine and version control, rather than the guard, is what makes a mistake recoverable.  A personal computer’s files have no such safeguard, which is the setting of this study.</w:t>
       </w:r>
     </w:p>
     <w:p>
@@ -3072,7 +3080,7 @@
         <w:t xml:space="preserve">permission</w:t>
       </w:r>
       <w:r>
-        <w:t xml:space="preserve">: the command is matched against an enumerated set of patterns judged dangerous, and is then allowed, refused, or escalated to the user.  NaSh [11] proposes guardrails of this kind and, notably, identifies selective undo as a requirement while leaving its mechanism open; the shipped guards above operate the same way in practice, with allow-and-deny lists over command prefixes.  A permission model answers whether a command may run.  It does not answer whether, having run, the command can be undone — and those are different questions with different answers.  Refusing a command protects a user only until they approve it, which for any system that must let work proceed is most of the time.</w:t>
+        <w:t xml:space="preserve">: the command is matched against an enumerated set of patterns judged dangerous, and is then allowed, refused, or escalated to the user.  NaSh [12] proposes guardrails of this kind, together with summaries of what a command would affect and selective undo, but leaves the mechanisms for both open; the shipped guards above operate the same way in practice, with allow-and-deny lists over command prefixes.  A permission model answers whether a command may run.  It does not answer whether, having run, the command can be undone — and those are different questions with different answers.  Refusing a command protects a user only until they approve it, which for any system that must let work proceed is most of the time.</w:t>
       </w:r>
     </w:p>
     <w:p>
@@ -3093,6 +3101,14 @@
       </w:r>
       <w:r>
         <w:t xml:space="preserve">, with redirects and command substitution altering what each actually touches.  No enumeration of command prefixes expresses that, and extending the list does not converge: each newly named tool leaves the next one unnamed.  Determining recoverability over a composed command, and computing the minimal information needed to reverse it, is the open problem this study takes up (RQ1–RQ3), and it is what separates the present work from the guardrail designs surveyed above.  The comparison that matters is not only against an enumerated list of dangerous commands.  A list can be turned around so that it refuses every command it does not recognize, which removes the first weakness above at the cost of asking about everything unfamiliar; that fail-closed list is the strongest simple baseline, and the study therefore claims what the analysis adds to it — seeing through wrappers, resolving run-time targets, and capturing exactly what would be lost — and not the verdict alone.</w:t>
+      </w:r>
+    </w:p>
+    <w:p>
+      <w:pPr>
+        <w:pStyle w:val="BodyText"/>
+      </w:pPr>
+      <w:r>
+        <w:t xml:space="preserve">Risk in agents that execute tools has also been studied by evaluation rather than by guarding.  ToolEmu emulates tool execution with a language model so that the failures of language-model agents, including destructive actions, can be found before the agents are deployed [37].  It measures how risky an agent is across many cases; it does not protect a user from the particular command an agent is about to run.</w:t>
       </w:r>
     </w:p>
     <w:bookmarkEnd w:id="52"/>
@@ -3110,7 +3126,7 @@
         <w:pStyle w:val="FirstParagraph"/>
       </w:pPr>
       <w:r>
-        <w:t xml:space="preserve">Static analysis of shell scripts specifically is comparatively little studied, and the existing work targets properties adjacent to recoverability rather than recoverability itself.  ABash [25] performs abstract interpretation over bash’s variable-expansion semantics to catch common expansion bugs and includes taint tracking, but is not concerned with what a script’s commands would do to the filesystem if executed correctly.  Smoosh [10] gives the POSIX shell a mechanized, executable small-step operational semantics, validated against other shells' conformance test suites — exactly the kind of ground-truth semantics a static effect analysis would need to be checked against — but stops at defining that semantics rather than analyzing programs written in it.  Closest of the three is CoLiS [1], which applies symbolic execution to the more than twenty-seven thousand POSIX-shell maintainer scripts in the Debian package archive to verify</w:t>
+        <w:t xml:space="preserve">Static analysis of shell scripts specifically is comparatively little studied, and the existing work targets properties adjacent to recoverability rather than recoverability itself.  ABash [27] performs abstract interpretation over bash’s variable-expansion semantics to catch common expansion bugs and includes taint tracking, but is not concerned with what a script’s commands would do to the filesystem if executed correctly.  Smoosh [11] gives the POSIX shell a mechanized, executable small-step operational semantics, validated against other shells' conformance test suites — exactly the kind of ground-truth semantics a static effect analysis would need to be checked against — but stops at defining that semantics rather than analyzing programs written in it.  Closest of the three is CoLiS [2], which applies symbolic execution to the more than twenty-seven thousand POSIX-shell maintainer scripts in the Debian package archive to verify</w:t>
       </w:r>
       <w:r>
         <w:t xml:space="preserve"> </w:t>
@@ -3168,15 +3184,86 @@
         <w:pStyle w:val="BodyText"/>
       </w:pPr>
       <w:r>
-        <w:t xml:space="preserve">Filesystem snapshots are the most widely deployed.  A copy-on-write filesystem such as btrfs can snapshot a whole subvolume at little cost, because a snapshot shares its blocks with the live filesystem until they are modified [34], so snapshots can be taken on a schedule or before system updates.  A snapshot needs no knowledge of the command it protects against, which is both its strength and its limit.  Restoring one returns the whole subvolume to an earlier moment and discards every later change along with the unwanted one, and nothing about a snapshot can tell the user, before a command runs, whether that command will lose anything.  On a filesystem without copy-on-write, such as the ext4 on which this study is conducted, a snapshot must visit every file in the tree, a cost measured in Chapter 3, Section 3.1(a).  Versioning file systems instead keep old versions of individual files: the Elephant file system retains versions under per-file policies that decide when an old version may be forgotten [35].  Recovery is then per file and needs no foresight, but its storage cost is paid on every change, mistaken or not, and obtaining it means replacing the filesystem.</w:t>
-      </w:r>
-    </w:p>
-    <w:p>
-      <w:pPr>
-        <w:pStyle w:val="BodyText"/>
-      </w:pPr>
-      <w:r>
-        <w:t xml:space="preserve">Undo at the level of a service or the operating system makes recovery a property of the system’s design.  Operator Undo intercepts and logs the user interactions with an e-mail service before they reach it, so that an operator can rewind the service’s state, repair it, and replay what users did since [4].  Operating system transactions let a program group system calls so that their effects can be rolled back as a unit before they commit [32].  Intrusion recovery systems such as Taser log system activity so that the effects of an attack can be identified and reverted afterward while legitimate changes are kept [9].  Each restores more completely than any list can, but each requires something the setting of this study does not have: a service built to be undoable, a kernel and programs that use transactions, or continuous logging of all system activity.</w:t>
+        <w:t xml:space="preserve">Filesystem snapshots are the most widely deployed, and one shipped natural-language shell already relies on them: ANOLISA’s checkpoint tool snapshots an agent’s workspace at file level before key operations or after each round of conversation, and rolls back to any snapshot [1].  A copy-on-write filesystem such as btrfs can snapshot a whole subvolume at little cost, because a snapshot shares its blocks with the live filesystem until they are modified [36], so snapshots can be taken on a schedule or before system updates.  A snapshot needs no knowledge of the command it protects against, which is both its strength and its limit.  Restoring one returns the whole subvolume to an earlier moment and discards every later change along with the unwanted one, and nothing about a snapshot can tell the user, before a command runs, whether that command will lose anything.  On a filesystem without copy-on-write, such as the ext4 on which this study is conducted, a snapshot must visit every file in the tree, a cost measured in Chapter 3, Section 3.1(a).  Versioning file systems instead keep old versions of individual files: the Elephant file system retains versions under per-file policies that decide when an old version may be forgotten [38].  Recovery is then per file and needs no foresight, but its storage cost is paid on every change, mistaken or not, and obtaining it means replacing the filesystem.</w:t>
+      </w:r>
+    </w:p>
+    <w:p>
+      <w:pPr>
+        <w:pStyle w:val="BodyText"/>
+      </w:pPr>
+      <w:r>
+        <w:t xml:space="preserve">Undo at the level of a service or the operating system makes recovery a property of the system’s design.  Operator Undo intercepts and logs the user interactions with an e-mail service before they reach it, so that an operator can rewind the service’s state, repair it, and replay what users did since [5].  Operating system transactions let a program group system calls so that their effects can be rolled back as a unit before they commit [34].  Intrusion recovery systems such as Taser log system activity so that the effects of an attack can be identified and reverted afterward while legitimate changes are kept [10].  Each restores more completely than any list can, but each requires something the setting of this study does not have: a service built to be undoable, a kernel and programs that use transactions, or continuous logging of all system activity.</w:t>
+      </w:r>
+    </w:p>
+    <w:p>
+      <w:pPr>
+        <w:pStyle w:val="BodyText"/>
+      </w:pPr>
+      <w:r>
+        <w:t xml:space="preserve">A different route learns a command’s effects by running it where they can be contained.  The</w:t>
+      </w:r>
+      <w:r>
+        <w:t xml:space="preserve"> </w:t>
+      </w:r>
+      <w:r>
+        <w:rPr>
+          <w:i/>
+          <w:iCs/>
+        </w:rPr>
+        <w:t xml:space="preserve">try</w:t>
+      </w:r>
+      <w:r>
+        <w:t xml:space="preserve"> </w:t>
+      </w:r>
+      <w:r>
+        <w:t xml:space="preserve">utility runs a command in a</w:t>
+      </w:r>
+      <w:r>
+        <w:t xml:space="preserve"> </w:t>
+      </w:r>
+      <w:r>
+        <w:rPr>
+          <w:i/>
+          <w:iCs/>
+        </w:rPr>
+        <w:t xml:space="preserve">semisolate</w:t>
+      </w:r>
+      <w:r>
+        <w:t xml:space="preserve"> </w:t>
+      </w:r>
+      <w:r>
+        <w:t xml:space="preserve">over the current environment, built from Linux namespaces and a union filesystem, captures its effects on the filesystem, and lets the user inspect them and then apply, discard, or apply part of them [21].  Its authors motivate it with cases this study shares, a</w:t>
+      </w:r>
+      <w:r>
+        <w:t xml:space="preserve"> </w:t>
+      </w:r>
+      <w:r>
+        <w:rPr>
+          <w:rStyle w:val="VerbatimChar"/>
+        </w:rPr>
+        <w:t xml:space="preserve">find -exec</w:t>
+      </w:r>
+      <w:r>
+        <w:t xml:space="preserve"> </w:t>
+      </w:r>
+      <w:r>
+        <w:t xml:space="preserve">suggested by a language model that deletes a user’s files among them.  It is the closest prior work to the analysis’s dry runs, and the two differ in where the knowledge comes from:</w:t>
+      </w:r>
+      <w:r>
+        <w:t xml:space="preserve"> </w:t>
+      </w:r>
+      <w:r>
+        <w:rPr>
+          <w:i/>
+          <w:iCs/>
+        </w:rPr>
+        <w:t xml:space="preserve">try</w:t>
+      </w:r>
+      <w:r>
+        <w:t xml:space="preserve"> </w:t>
+      </w:r>
+      <w:r>
+        <w:t xml:space="preserve">executes the command itself and shows its effects to a user who must judge them, and it does not contain effects outside the filesystem, such as network calls; the present study runs only commands it has first proven read-only, decides from the command’s structure what it would destroy, and captures exactly that before the command runs.</w:t>
       </w:r>
     </w:p>
     <w:p>
@@ -3211,11 +3298,11 @@
         <w:tblLook w:firstRow="1" w:lastRow="0" w:firstColumn="0" w:lastColumn="0" w:noHBand="0" w:noVBand="0" w:val="0020"/>
       </w:tblPr>
       <w:tblGrid>
-        <w:gridCol w:w="2138"/>
-        <w:gridCol w:w="1346"/>
-        <w:gridCol w:w="1346"/>
-        <w:gridCol w:w="1663"/>
-        <w:gridCol w:w="1425"/>
+        <w:gridCol w:w="1980"/>
+        <w:gridCol w:w="1188"/>
+        <w:gridCol w:w="1584"/>
+        <w:gridCol w:w="1584"/>
+        <w:gridCol w:w="1584"/>
       </w:tblGrid>
       <w:tr>
         <w:trPr>
@@ -3291,7 +3378,7 @@
               <w:jc w:val="left"/>
             </w:pPr>
             <w:r>
-              <w:t xml:space="preserve">Pattern-list guards: NaSh, Codex CLI, cc-safety-net [11, 19, 29]</w:t>
+              <w:t xml:space="preserve">Pattern-list guards: NaSh, Codex CLI, cc-safety-net [12, 20, 31]</w:t>
             </w:r>
           </w:p>
         </w:tc>
@@ -3353,7 +3440,7 @@
               <w:jc w:val="left"/>
             </w:pPr>
             <w:r>
-              <w:t xml:space="preserve">Shell program analyses: ABash, Smoosh, CoLiS [1, 10, 25]</w:t>
+              <w:t xml:space="preserve">Shell program analyses: ABash, Smoosh, CoLiS [2, 11, 27]</w:t>
             </w:r>
           </w:p>
         </w:tc>
@@ -3377,7 +3464,7 @@
               <w:jc w:val="left"/>
             </w:pPr>
             <w:r>
-              <w:t xml:space="preserve">No: other properties</w:t>
+              <w:t xml:space="preserve">Partly: CoLiS, for idempotence</w:t>
             </w:r>
           </w:p>
         </w:tc>
@@ -3415,31 +3502,47 @@
               <w:jc w:val="left"/>
             </w:pPr>
             <w:r>
-              <w:t xml:space="preserve">Filesystem snapshots [34]</w:t>
-            </w:r>
-          </w:p>
-        </w:tc>
-        <w:tc>
-          <w:tcPr/>
-          <w:p>
-            <w:pPr>
-              <w:pStyle w:val="Compact"/>
-              <w:jc w:val="left"/>
-            </w:pPr>
-            <w:r>
-              <w:t xml:space="preserve">A whole subvolume</w:t>
-            </w:r>
-          </w:p>
-        </w:tc>
-        <w:tc>
-          <w:tcPr/>
-          <w:p>
-            <w:pPr>
-              <w:pStyle w:val="Compact"/>
-              <w:jc w:val="left"/>
-            </w:pPr>
-            <w:r>
-              <w:t xml:space="preserve">No</w:t>
+              <w:t xml:space="preserve">Running in a semisolate:</w:t>
+            </w:r>
+            <w:r>
+              <w:t xml:space="preserve"> </w:t>
+            </w:r>
+            <w:r>
+              <w:rPr>
+                <w:i/>
+                <w:iCs/>
+              </w:rPr>
+              <w:t xml:space="preserve">try</w:t>
+            </w:r>
+            <w:r>
+              <w:t xml:space="preserve"> </w:t>
+            </w:r>
+            <w:r>
+              <w:t xml:space="preserve">[21]</w:t>
+            </w:r>
+          </w:p>
+        </w:tc>
+        <w:tc>
+          <w:tcPr/>
+          <w:p>
+            <w:pPr>
+              <w:pStyle w:val="Compact"/>
+              <w:jc w:val="left"/>
+            </w:pPr>
+            <w:r>
+              <w:t xml:space="preserve">The command, run over a union filesystem</w:t>
+            </w:r>
+          </w:p>
+        </w:tc>
+        <w:tc>
+          <w:tcPr/>
+          <w:p>
+            <w:pPr>
+              <w:pStyle w:val="Compact"/>
+              <w:jc w:val="left"/>
+            </w:pPr>
+            <w:r>
+              <w:t xml:space="preserve">After running it</w:t>
             </w:r>
           </w:p>
         </w:tc>
@@ -3463,7 +3566,7 @@
               <w:jc w:val="left"/>
             </w:pPr>
             <w:r>
-              <w:t xml:space="preserve">Yes: all later changes, together</w:t>
+              <w:t xml:space="preserve">Yes: the user applies or discards</w:t>
             </w:r>
           </w:p>
         </w:tc>
@@ -3477,19 +3580,19 @@
               <w:jc w:val="left"/>
             </w:pPr>
             <w:r>
-              <w:t xml:space="preserve">Versioning file systems [35]</w:t>
-            </w:r>
-          </w:p>
-        </w:tc>
-        <w:tc>
-          <w:tcPr/>
-          <w:p>
-            <w:pPr>
-              <w:pStyle w:val="Compact"/>
-              <w:jc w:val="left"/>
-            </w:pPr>
-            <w:r>
-              <w:t xml:space="preserve">Every file, on every change</w:t>
+              <w:t xml:space="preserve">Agent workspace snapshots: ANOLISA [1]</w:t>
+            </w:r>
+          </w:p>
+        </w:tc>
+        <w:tc>
+          <w:tcPr/>
+          <w:p>
+            <w:pPr>
+              <w:pStyle w:val="Compact"/>
+              <w:jc w:val="left"/>
+            </w:pPr>
+            <w:r>
+              <w:t xml:space="preserve">An agent’s workspace</w:t>
             </w:r>
           </w:p>
         </w:tc>
@@ -3525,7 +3628,7 @@
               <w:jc w:val="left"/>
             </w:pPr>
             <w:r>
-              <w:t xml:space="preserve">Yes: per file</w:t>
+              <w:t xml:space="preserve">Yes: everything since the snapshot</w:t>
             </w:r>
           </w:p>
         </w:tc>
@@ -3539,7 +3642,131 @@
               <w:jc w:val="left"/>
             </w:pPr>
             <w:r>
-              <w:t xml:space="preserve">Service undo, OS transactions, intrusion recovery [4, 9, 32]</w:t>
+              <w:t xml:space="preserve">Filesystem snapshots [36]</w:t>
+            </w:r>
+          </w:p>
+        </w:tc>
+        <w:tc>
+          <w:tcPr/>
+          <w:p>
+            <w:pPr>
+              <w:pStyle w:val="Compact"/>
+              <w:jc w:val="left"/>
+            </w:pPr>
+            <w:r>
+              <w:t xml:space="preserve">A whole subvolume</w:t>
+            </w:r>
+          </w:p>
+        </w:tc>
+        <w:tc>
+          <w:tcPr/>
+          <w:p>
+            <w:pPr>
+              <w:pStyle w:val="Compact"/>
+              <w:jc w:val="left"/>
+            </w:pPr>
+            <w:r>
+              <w:t xml:space="preserve">No</w:t>
+            </w:r>
+          </w:p>
+        </w:tc>
+        <w:tc>
+          <w:tcPr/>
+          <w:p>
+            <w:pPr>
+              <w:pStyle w:val="Compact"/>
+              <w:jc w:val="left"/>
+            </w:pPr>
+            <w:r>
+              <w:t xml:space="preserve">Not needed</w:t>
+            </w:r>
+          </w:p>
+        </w:tc>
+        <w:tc>
+          <w:tcPr/>
+          <w:p>
+            <w:pPr>
+              <w:pStyle w:val="Compact"/>
+              <w:jc w:val="left"/>
+            </w:pPr>
+            <w:r>
+              <w:t xml:space="preserve">Yes: all later changes</w:t>
+            </w:r>
+          </w:p>
+        </w:tc>
+      </w:tr>
+      <w:tr>
+        <w:tc>
+          <w:tcPr/>
+          <w:p>
+            <w:pPr>
+              <w:pStyle w:val="Compact"/>
+              <w:jc w:val="left"/>
+            </w:pPr>
+            <w:r>
+              <w:t xml:space="preserve">Versioning file systems [38]</w:t>
+            </w:r>
+          </w:p>
+        </w:tc>
+        <w:tc>
+          <w:tcPr/>
+          <w:p>
+            <w:pPr>
+              <w:pStyle w:val="Compact"/>
+              <w:jc w:val="left"/>
+            </w:pPr>
+            <w:r>
+              <w:t xml:space="preserve">Every file</w:t>
+            </w:r>
+          </w:p>
+        </w:tc>
+        <w:tc>
+          <w:tcPr/>
+          <w:p>
+            <w:pPr>
+              <w:pStyle w:val="Compact"/>
+              <w:jc w:val="left"/>
+            </w:pPr>
+            <w:r>
+              <w:t xml:space="preserve">No</w:t>
+            </w:r>
+          </w:p>
+        </w:tc>
+        <w:tc>
+          <w:tcPr/>
+          <w:p>
+            <w:pPr>
+              <w:pStyle w:val="Compact"/>
+              <w:jc w:val="left"/>
+            </w:pPr>
+            <w:r>
+              <w:t xml:space="preserve">Not needed</w:t>
+            </w:r>
+          </w:p>
+        </w:tc>
+        <w:tc>
+          <w:tcPr/>
+          <w:p>
+            <w:pPr>
+              <w:pStyle w:val="Compact"/>
+              <w:jc w:val="left"/>
+            </w:pPr>
+            <w:r>
+              <w:t xml:space="preserve">Yes: per file</w:t>
+            </w:r>
+          </w:p>
+        </w:tc>
+      </w:tr>
+      <w:tr>
+        <w:tc>
+          <w:tcPr/>
+          <w:p>
+            <w:pPr>
+              <w:pStyle w:val="Compact"/>
+              <w:jc w:val="left"/>
+            </w:pPr>
+            <w:r>
+              <w:t xml:space="preserve">Service undo, OS transactions, intrusion recovery [5, 10, 34]</w:t>
             </w:r>
           </w:p>
         </w:tc>
@@ -3719,7 +3946,7 @@
         <w:pStyle w:val="FirstParagraph"/>
       </w:pPr>
       <w:r>
-        <w:t xml:space="preserve">The web has been the most heavily studied environment for language-guided agents.  Mind2Web, introduced by Deng and colleagues [8], is the first dataset for developing generalist web agents that follow language instructions across diverse real-world websites, comprising over two thousand open-ended tasks collected from 137 websites across 31 domains; its accompanying two-stage model uses a small language model to filter candidate elements from large documents before invoking a larger model to choose among them.  WebArena, introduced by Zhou and colleagues [53], provides a fully self-hosted, reproducible web environment of functional website clones and evaluates 812 long-horizon tasks for functional correctness rather than trajectory similarity, establishing a challenging benchmark on which contemporary models achieved completion rates far below human performance.  Zheng and colleagues [52], in their SeeAct framework, decouple visual understanding from action: the model observes a screenshot, generates a textual plan, and a separate step grounds that plan onto page elements.  Their central finding is diagnostic for the entire field — with oracle grounding provided, the model completes 51.1% of tasks on live websites, substantially outperforming a text-only baseline at 13.3%, but performance degrades sharply when grounding must itself be inferred, confirming visual grounding as the principal bottleneck.</w:t>
+        <w:t xml:space="preserve">The web has been the most heavily studied environment for language-guided agents.  Mind2Web, introduced by Deng and colleagues [9], is the first dataset for developing generalist web agents that follow language instructions across diverse real-world websites, comprising over two thousand open-ended tasks collected from 137 websites across 31 domains; its accompanying two-stage model uses a small language model to filter candidate elements from large documents before invoking a larger model to choose among them.  WebArena, introduced by Zhou and colleagues [56], provides a fully self-hosted, reproducible web environment of functional website clones and evaluates 812 long-horizon tasks for functional correctness rather than trajectory similarity, establishing a challenging benchmark on which contemporary models achieved completion rates far below human performance.  Zheng and colleagues [55], in their SeeAct framework, decouple visual understanding from action: the model observes a screenshot, generates a textual plan, and a separate step grounds that plan onto page elements.  Their central finding is diagnostic for the entire field — with oracle grounding provided, the model completes 51.1% of tasks on live websites, substantially outperforming a text-only baseline at 13.3%, but performance degrades sharply when grounding must itself be inferred, confirming visual grounding as the principal bottleneck.</w:t>
       </w:r>
     </w:p>
     <w:bookmarkEnd w:id="56"/>
@@ -3737,7 +3964,7 @@
         <w:pStyle w:val="FirstParagraph"/>
       </w:pPr>
       <w:r>
-        <w:t xml:space="preserve">Mobile-device control has produced large-scale datasets and progressively more autonomous agents.  The pre-LLM work of Li and colleagues [20], discussed in §2.3, established the grounding problem for mobile interfaces.  Android in the Wild, from Rawles and colleagues [33], contributes a dataset of 715,000 episodes spanning 30,000 unique instructions, in which actions are gestures at arbitrary screen coordinates rather than operations on indexed interface elements, exposing the challenge that actions must be inferred from visual appearance rather than from a structured model of the interface.  AppAgent, from Zhang and colleagues [51], operates Android applications through a simplified action space of taps and swipes and learns to use new applications through autonomous exploration or by observing human demonstrations, generating application-specific documentation that matched or exceeded human-written documentation.  Mobile-Agent, from Wang and colleagues [42], adopts a purely vision-centric approach that requires no system metadata, using optical-character-recognition and icon-detection modules to locate interface elements — achieving broad applicability across mobile environments at the cost of vision-grounding errors that require recovery mechanisms.</w:t>
+        <w:t xml:space="preserve">Mobile-device control has produced large-scale datasets and progressively more autonomous agents.  The pre-LLM work of Li and colleagues [22], discussed in §2.3, established the grounding problem for mobile interfaces.  Android in the Wild, from Rawles and colleagues [35], contributes a dataset of 715,000 episodes spanning 30,000 unique instructions, in which actions are gestures at arbitrary screen coordinates rather than operations on indexed interface elements, exposing the challenge that actions must be inferred from visual appearance rather than from a structured model of the interface.  AppAgent, from Zhang and colleagues [54], operates Android applications through a simplified action space of taps and swipes and learns to use new applications through autonomous exploration or by observing human demonstrations, generating application-specific documentation that matched or exceeded human-written documentation.  Mobile-Agent, from Wang and colleagues [45], adopts a purely vision-centric approach that requires no system metadata, using optical-character-recognition and icon-detection modules to locate interface elements — achieving broad applicability across mobile environments at the cost of vision-grounding errors that require recovery mechanisms.</w:t>
       </w:r>
     </w:p>
     <w:bookmarkEnd w:id="57"/>
@@ -3755,7 +3982,7 @@
         <w:pStyle w:val="FirstParagraph"/>
       </w:pPr>
       <w:r>
-        <w:t xml:space="preserve">Desktop agents are the most direct graphical analogue to the present work, and their limitations are the most instructive.  ScreenAgent, from Niu and colleagues [27], is a vision-language-model-driven agent for cross-application desktop control that operates in a plan–act–reflect cycle, specifying actions as coordinates and key sequences; its authors acknowledge that vision-only grounding is less reliable than approaches with API access.  WinClick, from Hui and colleagues [15], targets Windows-desktop grounding and observes that most existing GUI agents rely on structured data formats such as the document object model or HyperText Markup Language, which are unavailable across general desktop environments; it therefore performs visual grounding directly from screenshots.  UFO², the "Desktop AgentOS" of Zhang and colleagues [50], is the most ambitious desktop system surveyed: it fuses the native Windows accessibility framework with vision-based parsing in a hybrid action mechanism, dispatching subtasks from a coordinating agent to application-specialized agents.  Its authors argue that existing computer-using agents are hindered by shallow operating-system integration, fragile screenshot-based interaction, and disruptive execution, and they identify adaptation to other desktop platforms, such as Linux and macOS, as future work.  UFO² nonetheless operates as an automation layer dispatched atop the existing Windows shell rather than as a replacement for it, and its authors frame cross-platform deployment as groundwork for a unified ecosystem of desktop automation solutions — the trajectory from which the present study departs.</w:t>
+        <w:t xml:space="preserve">Desktop agents are the most direct graphical analogue to the present work, and their limitations are the most instructive.  ScreenAgent, from Niu and colleagues [29], is a vision-language-model-driven agent for cross-application desktop control that operates in a plan–act–reflect cycle, specifying actions as coordinates and key sequences; its authors acknowledge that vision-only grounding is less reliable than approaches with API access.  WinClick, from Hui and colleagues [16], targets Windows-desktop grounding and observes that most existing GUI agents rely on structured data formats such as the document object model or HyperText Markup Language, which are unavailable across general desktop environments; it therefore performs visual grounding directly from screenshots.  UFO², the "Desktop AgentOS" of Zhang and colleagues [53], is the most ambitious desktop system surveyed: it fuses the native Windows accessibility framework with vision-based parsing in a hybrid action mechanism, dispatching subtasks from a coordinating agent to application-specialized agents.  Its authors argue that existing computer-using agents are hindered by shallow operating-system integration, fragile screenshot-based interaction, and disruptive execution, and they identify adaptation to other desktop platforms, such as Linux and macOS, as future work.  UFO² acts on the user’s behalf, as an automation layer beside the user’s own Windows session, and its authors frame cross-platform deployment as groundwork for a unified ecosystem of desktop automation solutions; the platform built for this study is instead operated by a person, turn by turn.</w:t>
       </w:r>
     </w:p>
     <w:bookmarkEnd w:id="58"/>
@@ -3773,7 +4000,7 @@
         <w:pStyle w:val="FirstParagraph"/>
       </w:pPr>
       <w:r>
-        <w:t xml:space="preserve">The systems surveyed above are research artifacts.  A parallel commercial development is moving faster than the peer-reviewed literature and warrants explicit positioning; what follows reflects that landscape as of September 2026 and is dated deliberately, because it will continue to move.  Several products now describe themselves as agentic operating systems.  eva AG’s WarmWind, released in 2026, runs autonomous workers that operate applications through vision and simulated mouse and keyboard input, hosted in a managed cloud environment built on a Linux base and aimed at automating repetitive office work.  Alibaba’s ANOLISA ships an AI-native Linux terminal in which shell commands and ordinary language share a single prompt, with the agent requesting approval before risky operations and a checkpoint facility providing rollback.  Major platform vendors have each shipped or previewed some form of computer control, ranging from screenshot-driven graphical automation to structured application-intent dispatch.  Two properties separate all of them from the present work, and both are structural rather than incidental.  First, each routes inference through remote infrastructure, whereas the design constraint here is that the model runs on the user’s own hardware, with no network dependency.  Second, each is built to act on the user’s behalf, largely unattended, whereas the interface studied here is operated by a person turn by turn with every irreversible action gated on that person’s approval.  The distinction is not which approach is better but which question is being asked: these systems pursue autonomy, while this study asks whether conversation is a better interface for a human who is present and in control.</w:t>
+        <w:t xml:space="preserve">The systems surveyed above are research artifacts.  Shipping systems move faster than the peer-reviewed literature, and one is close enough to this study to warrant explicit positioning; what follows describes it as of October 2026.  Alibaba Cloud Linux 4 Agentic Edition, ANOLISA, is a Linux distribution for AI agents whose default shell accepts ordinary language alongside shell commands, forces confirmation before operations it treats as unrecoverable, such as restarting the machine, and ships a checkpoint tool that snapshots an agent’s workspace at file level and can roll back to any snapshot [1].  It is the nearest shipped system to the present work, and it differs in the respect that matters here: it recovers by snapshot, restoring everything since a checkpoint, rather than by determining what one command will destroy and capturing exactly that (§2.5).  It is also built to run AI agents on cloud servers, whereas the platform studied here runs a local model and is operated by a person turn by turn.  The question this study asks is not whether conversation is a better interface, but whether what a generated command destroys can be determined and captured before it runs; the platform’s interface is the setting in which the answer is validated.</w:t>
       </w:r>
     </w:p>
     <w:bookmarkEnd w:id="59"/>
@@ -3791,7 +4018,7 @@
         <w:pStyle w:val="FirstParagraph"/>
       </w:pPr>
       <w:r>
-        <w:t xml:space="preserve">Underlying many of these agents are vision-language models trained specifically for interface understanding.  CogAgent, from Hong and colleagues [14], is an eighteen-billion-parameter visual language model specialized for GUI understanding and navigation, using both low- and high-resolution image encoders to recognize the small icons and text typical of graphical interfaces.  It supports the position that pure-vision GUI agents are viable when the underlying model is trained appropriately — but at a compute cost, and with the cross-platform generalization limitations common to the entire graphical-agent literature.  Across web, mobile, and desktop, these systems demonstrate broad capability within a single platform class, while consistently identifying visual grounding as an unsolved bottleneck and trending toward hybrid execution that prefers structured access where available and falls back to vision.</w:t>
+        <w:t xml:space="preserve">Underlying many of these agents are vision-language models trained specifically for interface understanding.  CogAgent, from Hong and colleagues [15], is an eighteen-billion-parameter visual language model specialized for GUI understanding and navigation, using both low- and high-resolution image encoders to recognize the small icons and text typical of graphical interfaces.  It supports the position that pure-vision GUI agents are viable when the underlying model is trained appropriately — but at a compute cost, and with the cross-platform generalization limitations common to the entire graphical-agent literature.  Across web, mobile, and desktop, these systems demonstrate broad capability within a single platform class, while consistently identifying visual grounding as an unsolved bottleneck and trending toward hybrid execution that prefers structured access where available and falls back to vision.</w:t>
       </w:r>
     </w:p>
     <w:bookmarkEnd w:id="60"/>
@@ -3818,15 +4045,15 @@
         <w:pStyle w:val="BodyText"/>
       </w:pPr>
       <w:r>
-        <w:t xml:space="preserve">VoicePilot, from Padmanabha and colleagues [30], is a framework for using LLMs as speech interfaces to physically assistive robots for individuals with motor impairments.  Although its immediate target is robotic assistance rather than desktop computing, it is included here because it is the most rigorous human-centered evaluation in the LLM-speech-interface literature.  The authors derive five concrete design guidelines from a study with motor-impaired participants, among them the importance of execution speed approaching that of a caregiver and the necessity of preview-and-confirm workflows — a guideline that directly informs the reversibility-based confirmation design of the present study.  DexAssist, from Mehendale and Walishetti [26], targets web navigation by users with fine-motor impairments using two LLMs in tandem — one to interpret voice commands and a second to map the interpretation onto interface elements with fallback strategies — reducing the misinterpretation failures of single-model voice navigation on dense layouts.  The architecture of van Dam [41] proposes retrofitting LLM-based conversational interfaces onto existing single-application graphical interfaces, exposing an application’s navigation graph through a tool protocol and handling voice input through real-time speech recognition; its author observes that most production applications were never designed with speech in mind, making such retrofitting an ongoing challenge.</w:t>
-      </w:r>
-    </w:p>
-    <w:p>
-      <w:pPr>
-        <w:pStyle w:val="BodyText"/>
-      </w:pPr>
-      <w:r>
-        <w:t xml:space="preserve">More recent work continues to mature the components required for speech-driven interface control.  Han and colleagues, in GUIRoboTron-Speech [12], advance automated GUI agents driven directly by speech instructions, while Park and colleagues, in R-VLM [31], contribute region-aware visual grounding for more precise identification of on-screen elements.  What unites this thread is that it operates at the level of the individual application or interaction technique rather than at the level of the session itself.  These approaches presuppose an underlying conversational system surface on which to run, yet no such surface exists at the session level.  This complementarity is significant: a general-purpose conversational interface layer would serve not only mainstream users but also provide the substrate that accessibility-specific configurations require — positioning accessibility not as the immediate target of the present study, which scopes it out for recruitment and ethics reasons, but as a natural and well-grounded extension of its contribution.</w:t>
+        <w:t xml:space="preserve">VoicePilot, from Padmanabha and colleagues [32], is a framework for using LLMs as speech interfaces to physically assistive robots for individuals with motor impairments.  Although its immediate target is robotic assistance rather than desktop computing, it is included here because it is the most rigorous human-centered evaluation in the LLM-speech-interface literature.  The authors derive five concrete design guidelines from a study with motor-impaired participants, among them the importance of execution speed approaching that of a caregiver and the necessity of preview-and-confirm workflows — a guideline that directly informs the reversibility-based confirmation design of the present study.  DexAssist, from Mehendale and Walishetti [28], targets web navigation by users with fine-motor impairments using two LLMs in tandem — one to interpret voice commands and a second to map the interpretation onto interface elements with fallback strategies — reducing the misinterpretation failures of single-model voice navigation on dense layouts.  The architecture of van Dam [44] proposes retrofitting LLM-based conversational interfaces onto existing single-application graphical interfaces, exposing an application’s navigation graph through a tool protocol and handling voice input through real-time speech recognition; its author observes that most production applications were never designed with speech in mind, making such retrofitting an ongoing challenge.</w:t>
+      </w:r>
+    </w:p>
+    <w:p>
+      <w:pPr>
+        <w:pStyle w:val="BodyText"/>
+      </w:pPr>
+      <w:r>
+        <w:t xml:space="preserve">More recent work continues to mature the components required for speech-driven interface control.  Han and colleagues, in GUIRoboTron-Speech [13], advance automated GUI agents driven directly by speech instructions, while Park and colleagues, in R-VLM [33], contribute region-aware visual grounding for more precise identification of on-screen elements.  What unites this thread is that it operates at the level of the individual application or interaction technique rather than at the level of the session itself.  These approaches presuppose an underlying conversational surface on which to run.  A conversational interface layer over the whole session could provide one, which positions accessibility not as a target of the present study, which scopes it out for recruitment and ethics reasons, but as a possible later use of its platform.</w:t>
       </w:r>
     </w:p>
     <w:bookmarkEnd w:id="62"/>
@@ -3844,15 +4071,15 @@
         <w:pStyle w:val="FirstParagraph"/>
       </w:pPr>
       <w:r>
-        <w:t xml:space="preserve">The rapid proliferation of computer-using agents has been accompanied by increasingly rigorous evaluation environments, and these establish both the current ceiling of the field’s capability and the methods by which that capability is measured.  The most consequential is OSWorld, from Xie and colleagues [46], a benchmark of 369 real-world computer tasks in a real-computer environment spanning Ubuntu, Windows, and macOS.  At its 2024 release the margin it measured was stark: humans achieved 72.36% success where the best evaluated model reached 12.24%.  That particular margin has since closed, with leading agents now exceeding the original human baseline on the revised task set — but the closure reflects progress on short, self-contained tasks rather than on sustained computer work.  Its successor, OSWorld 2.0 [48], evaluates 108 long-horizon workflows whose median item requires roughly an hour and a half of skilled human operation; there the best frontier configuration completes only 20.6% of tasks outright.  The reported failures concentrate not in interface navigation but in tracking constraints across a long task, absorbing information that arrives mid-way, and verifying a result before declaring completion.  The field’s ceiling has moved substantially; it has not been reached.  OSWorld is also directly relevant to the present study as the source of a real-task suite against which benchmark comparability can be established.</w:t>
-      </w:r>
-    </w:p>
-    <w:p>
-      <w:pPr>
-        <w:pStyle w:val="BodyText"/>
-      </w:pPr>
-      <w:r>
-        <w:t xml:space="preserve">Complementing the benchmark literature, the survey of LLM-brained GUI agents by Zhang and colleagues [49] synthesizes the field through 2024, organizing it around the components of perception, planning, action, and memory, and providing the four-layer vocabulary adopted in §2.2 of this review.  It enumerates the field’s open challenges — accurate element localization, knowledge retrieval, long-horizon planning, and safety-aware execution control; notably, none of the challenges it enumerates concerns replacing the session layer itself: the survey takes the surrounding operating-system session as given, which is the assumption the present study sets out to test.  What the evaluation literature reveals, however, is a specific methodological limitation: rigorous as these benchmarks are, they measure the autonomous task completion of agents acting on a user’s behalf, not the comparative performance of a human user working through a conversational interface versus a conventional graphical one.  That distinction motivates the evaluation design reviewed in §2.10.</w:t>
+        <w:t xml:space="preserve">The rapid proliferation of computer-using agents has been accompanied by increasingly rigorous evaluation environments, and these establish both the current ceiling of the field’s capability and the methods by which that capability is measured.  The most consequential is OSWorld, from Xie and colleagues [49], a benchmark of 369 real-world computer tasks in a real-computer environment spanning Ubuntu, Windows, and macOS.  At its 2024 release the margin it measured was stark: humans achieved 72.36% success where the best evaluated model reached 12.24%.  That particular margin has since closed, with leading agents now exceeding the original human baseline on the revised task set — but the closure reflects progress on short, self-contained tasks rather than on sustained computer work.  Its successor, OSWorld 2.0 [51], evaluates 108 long-horizon workflows whose median item requires roughly an hour and a half of skilled human operation; there the best frontier configuration completes only 20.6% of tasks outright.  The reported failures concentrate not in interface navigation but in tracking constraints across a long task, absorbing information that arrives mid-way, and verifying a result before declaring completion.  The field’s ceiling has moved substantially; it has not been reached.  OSWorld is also directly relevant to the present study as the source of a real-task suite against which benchmark comparability can be established.</w:t>
+      </w:r>
+    </w:p>
+    <w:p>
+      <w:pPr>
+        <w:pStyle w:val="BodyText"/>
+      </w:pPr>
+      <w:r>
+        <w:t xml:space="preserve">Complementing the benchmark literature, the survey of LLM-brained GUI agents by Zhang and colleagues [52] synthesizes the field through 2024, organizing it around the components of perception, planning, action, and memory, and providing the four-layer vocabulary adopted in §2.2 of this review.  It enumerates the field’s open challenges — accurate element localization, knowledge retrieval, long-horizon planning, and safety-aware execution control; of these, safety-aware execution control is the one closest to the present study.  What the evaluation literature reveals, however, is a specific methodological limitation: rigorous as these benchmarks are, they measure the autonomous task completion of agents acting on a user’s behalf, not the comparative performance of a human user working through a conversational interface versus a conventional graphical one.  That distinction motivates the evaluation design reviewed in §2.10.</w:t>
       </w:r>
     </w:p>
     <w:bookmarkEnd w:id="63"/>
@@ -3997,7 +4224,7 @@
               <w:jc w:val="left"/>
             </w:pPr>
             <w:r>
-              <w:t xml:space="preserve">Wilensky et al. [45]</w:t>
+              <w:t xml:space="preserve">Wilensky et al. [48]</w:t>
             </w:r>
           </w:p>
         </w:tc>
@@ -4071,7 +4298,7 @@
               <w:jc w:val="left"/>
             </w:pPr>
             <w:r>
-              <w:t xml:space="preserve">Westenfelder et al. [43]</w:t>
+              <w:t xml:space="preserve">Westenfelder et al. [46]</w:t>
             </w:r>
           </w:p>
         </w:tc>
@@ -4145,7 +4372,7 @@
               <w:jc w:val="left"/>
             </w:pPr>
             <w:r>
-              <w:t xml:space="preserve">Gyawali et al. [11]</w:t>
+              <w:t xml:space="preserve">Gyawali et al. [12]</w:t>
             </w:r>
           </w:p>
         </w:tc>
@@ -4219,7 +4446,7 @@
               <w:jc w:val="left"/>
             </w:pPr>
             <w:r>
-              <w:t xml:space="preserve">van Dam [41]</w:t>
+              <w:t xml:space="preserve">van Dam [44]</w:t>
             </w:r>
           </w:p>
         </w:tc>
@@ -4293,7 +4520,7 @@
               <w:jc w:val="left"/>
             </w:pPr>
             <w:r>
-              <w:t xml:space="preserve">Padmanabha et al. [30]</w:t>
+              <w:t xml:space="preserve">Padmanabha et al. [32]</w:t>
             </w:r>
           </w:p>
         </w:tc>
@@ -4367,7 +4594,7 @@
               <w:jc w:val="left"/>
             </w:pPr>
             <w:r>
-              <w:t xml:space="preserve">Mehendale and Walishetti [26]</w:t>
+              <w:t xml:space="preserve">Mehendale and Walishetti [28]</w:t>
             </w:r>
           </w:p>
         </w:tc>
@@ -4441,7 +4668,7 @@
               <w:jc w:val="left"/>
             </w:pPr>
             <w:r>
-              <w:t xml:space="preserve">Deng et al. [8]</w:t>
+              <w:t xml:space="preserve">Deng et al. [9]</w:t>
             </w:r>
           </w:p>
         </w:tc>
@@ -4515,7 +4742,7 @@
               <w:jc w:val="left"/>
             </w:pPr>
             <w:r>
-              <w:t xml:space="preserve">Zhou et al. [53]</w:t>
+              <w:t xml:space="preserve">Zhou et al. [56]</w:t>
             </w:r>
           </w:p>
         </w:tc>
@@ -4589,7 +4816,7 @@
               <w:jc w:val="left"/>
             </w:pPr>
             <w:r>
-              <w:t xml:space="preserve">Zheng et al. [52]</w:t>
+              <w:t xml:space="preserve">Zheng et al. [55]</w:t>
             </w:r>
           </w:p>
         </w:tc>
@@ -4663,7 +4890,7 @@
               <w:jc w:val="left"/>
             </w:pPr>
             <w:r>
-              <w:t xml:space="preserve">Rawles et al. [33]</w:t>
+              <w:t xml:space="preserve">Rawles et al. [35]</w:t>
             </w:r>
           </w:p>
         </w:tc>
@@ -4737,7 +4964,7 @@
               <w:jc w:val="left"/>
             </w:pPr>
             <w:r>
-              <w:t xml:space="preserve">Zhang et al. [51]</w:t>
+              <w:t xml:space="preserve">Zhang et al. [54]</w:t>
             </w:r>
           </w:p>
         </w:tc>
@@ -4811,7 +5038,7 @@
               <w:jc w:val="left"/>
             </w:pPr>
             <w:r>
-              <w:t xml:space="preserve">Wang et al. [42]</w:t>
+              <w:t xml:space="preserve">Wang et al. [45]</w:t>
             </w:r>
           </w:p>
         </w:tc>
@@ -4885,7 +5112,7 @@
               <w:jc w:val="left"/>
             </w:pPr>
             <w:r>
-              <w:t xml:space="preserve">Hong et al. [14]</w:t>
+              <w:t xml:space="preserve">Hong et al. [15]</w:t>
             </w:r>
           </w:p>
         </w:tc>
@@ -4959,7 +5186,7 @@
               <w:jc w:val="left"/>
             </w:pPr>
             <w:r>
-              <w:t xml:space="preserve">Niu et al. [27]</w:t>
+              <w:t xml:space="preserve">Niu et al. [29]</w:t>
             </w:r>
           </w:p>
         </w:tc>
@@ -5033,7 +5260,7 @@
               <w:jc w:val="left"/>
             </w:pPr>
             <w:r>
-              <w:t xml:space="preserve">Hui et al. [15]</w:t>
+              <w:t xml:space="preserve">Hui et al. [16]</w:t>
             </w:r>
           </w:p>
         </w:tc>
@@ -5107,7 +5334,7 @@
               <w:jc w:val="left"/>
             </w:pPr>
             <w:r>
-              <w:t xml:space="preserve">Zhang et al. [50]</w:t>
+              <w:t xml:space="preserve">Zhang et al. [53]</w:t>
             </w:r>
           </w:p>
         </w:tc>
@@ -5181,7 +5408,7 @@
               <w:jc w:val="left"/>
             </w:pPr>
             <w:r>
-              <w:t xml:space="preserve">Xie et al. [46]</w:t>
+              <w:t xml:space="preserve">Xie et al. [49]</w:t>
             </w:r>
           </w:p>
         </w:tc>
@@ -5255,7 +5482,7 @@
               <w:jc w:val="left"/>
             </w:pPr>
             <w:r>
-              <w:t xml:space="preserve">Li et al. [20]</w:t>
+              <w:t xml:space="preserve">Li et al. [22]</w:t>
             </w:r>
           </w:p>
         </w:tc>
@@ -5329,7 +5556,7 @@
               <w:jc w:val="left"/>
             </w:pPr>
             <w:r>
-              <w:t xml:space="preserve">Yao et al. [47]</w:t>
+              <w:t xml:space="preserve">Yao et al. [50]</w:t>
             </w:r>
           </w:p>
         </w:tc>
@@ -5403,7 +5630,7 @@
               <w:jc w:val="left"/>
             </w:pPr>
             <w:r>
-              <w:t xml:space="preserve">Han et al. [12]</w:t>
+              <w:t xml:space="preserve">Han et al. [13]</w:t>
             </w:r>
           </w:p>
         </w:tc>
@@ -5477,7 +5704,7 @@
               <w:jc w:val="left"/>
             </w:pPr>
             <w:r>
-              <w:t xml:space="preserve">Park et al. [31]</w:t>
+              <w:t xml:space="preserve">Park et al. [33]</w:t>
             </w:r>
           </w:p>
         </w:tc>
@@ -5551,7 +5778,7 @@
               <w:jc w:val="left"/>
             </w:pPr>
             <w:r>
-              <w:t xml:space="preserve">Jacobs et al. [17]</w:t>
+              <w:t xml:space="preserve">Jacobs et al. [18]</w:t>
             </w:r>
           </w:p>
         </w:tc>
@@ -5639,7 +5866,7 @@
         <w:pStyle w:val="FirstParagraph"/>
       </w:pPr>
       <w:r>
-        <w:t xml:space="preserve">The field is bifurcated by coverage scope.  Shell-level work [11, 43] and single-application work [30, 41] sit at the narrow end; cross-application desktop, web, and mobile agents sit at the broad end but each within a single platform class.  No surveyed system implements a working conversational layer over the full graphical session that has been empirically validated against the conventional desktop workflow it would supplement.  The Unix Consultant [45] came closest in ambition four decades ago, but its pre-LLM foundation prevented it from scaling beyond demonstration.  The absence is structural rather than incidental.  Even UFO² [50], the most operationally advanced desktop-agent system surveyed, is by construction an automation layer dispatched atop the existing Windows shell, and its stated future direction is broader cross-platform automation rather than replacement of the session itself.  The substitution this study attempts is therefore unclaimed, not merely under-published.</w:t>
+        <w:t xml:space="preserve">The field is bifurcated by coverage scope.  Shell-level work [12, 46] and single-application work [32, 44] sit at the narrow end; cross-application desktop, web, and mobile agents sit at the broad end but each within a single platform class.  No system in the surveyed corpus implements a working conversational layer over the full graphical session that has been empirically validated against the conventional desktop workflow it would supplement.  The Unix Consultant [48] came closest in ambition four decades ago, but its pre-LLM foundation prevented it from scaling beyond demonstration.  AgentOS [24] proposes a natural-language portal in place of the graphical desktop, but as a research direction, without a built system or an evaluation, and UFO² [53], the most operationally advanced desktop-agent system surveyed, is by construction an automation layer that acts on the user’s behalf beside the user’s own Windows session.</w:t>
       </w:r>
     </w:p>
     <w:bookmarkEnd w:id="64"/>
@@ -5657,7 +5884,7 @@
         <w:pStyle w:val="FirstParagraph"/>
       </w:pPr>
       <w:r>
-        <w:t xml:space="preserve">A second pattern concerns the execution mechanism at the Action layer.  The literature divides among command translation, API binding, and GUI simulation, with a dominant trend toward hybrid execution [41, 50] that prefers structured access where available and falls back to vision.  Vision-only systems [27, 42] achieve broad applicability at the cost of grounding fragility, while structured-access systems achieve precision at the cost of per-environment integration.  Notably, the Unix Consultant operated purely at the consultation layer without executing actions — an approach that reflects an underappreciated design principle, that the agent that explains can be safer than the agent that acts, which the confirmation-gated design of the present study revisits.</w:t>
+        <w:t xml:space="preserve">A second pattern concerns the execution mechanism at the Action layer.  The literature divides among command translation, API binding, and GUI simulation, with a dominant trend toward hybrid execution [44, 53] that prefers structured access where available and falls back to vision.  Vision-only systems [29, 45] achieve broad applicability at the cost of grounding fragility, while structured-access systems achieve precision at the cost of per-environment integration.  Notably, the Unix Consultant operated purely at the consultation layer without executing actions — an approach that reflects an underappreciated design principle, that the agent that explains can be safer than the agent that acts, which the confirmation-gated design of the present study revisits.</w:t>
       </w:r>
     </w:p>
     <w:bookmarkEnd w:id="65"/>
@@ -5675,7 +5902,7 @@
         <w:pStyle w:val="FirstParagraph"/>
       </w:pPr>
       <w:r>
-        <w:t xml:space="preserve">A third pattern is that visual grounding is the field’s principal bottleneck, identified explicitly by both SeeAct [52] and the GUI-agents survey [49].  The 51.1% ceiling of GPT-4V with oracle grounding and its sharp degradation without are attributable in significant part to grounding failure.  This bottleneck is a property of the graphical-simulation approach specifically; a command-line approach that grounds intent into shell commands rather than into on-screen pixel regions sidesteps it, at the cost of being bounded by what is expressible on the command line.  Direct comparison qualifies that tradeoff usefully.  Across 440 matched desktop tasks, screen-only graphical agents pass 59.1% while command-line agents reach only 48.2% — the shell is not automatically the stronger substrate — but command-line agents augmented with result verification reach 69.3%, the highest of the three conditions [54].  Execution through the shell becomes advantageous when it is paired with a mechanism that checks what the command actually did, which is precisely the role a reversibility gate and an undo record play in the present design.</w:t>
+        <w:t xml:space="preserve">A third pattern is that visual grounding is the field’s principal bottleneck, identified explicitly by both SeeAct [55] and the GUI-agents survey [52].  The 51.1% ceiling of GPT-4V with oracle grounding and its sharp degradation without are attributable in significant part to grounding failure.  This bottleneck is a property of the graphical-simulation approach specifically; a command-line approach that grounds intent into shell commands rather than into on-screen pixel regions sidesteps it, at the cost of being bounded by what is expressible on the command line.  Direct comparison qualifies that tradeoff usefully.  Across 440 matched desktop tasks, screen-only graphical agents pass 59.1% while command-line agents reach only 48.2% — the shell is not automatically the stronger substrate — but command-line agents augmented with result verification reach 69.3%, the highest of the three conditions [57].  Execution through the shell becomes advantageous when it is paired with a mechanism that checks what the command actually did, which is precisely the role a reversibility gate and an undo record play in the present design.</w:t>
       </w:r>
     </w:p>
     <w:bookmarkEnd w:id="66"/>
@@ -5693,7 +5920,7 @@
         <w:pStyle w:val="FirstParagraph"/>
       </w:pPr>
       <w:r>
-        <w:t xml:space="preserve">A fourth pattern concerns evaluation method.  Most surveyed systems are evaluated either through architectural demonstration [11, 41] or through curated task benchmarks [8, 42, 46, 53].  User studies are rare, and the comparisons that do exist are narrow.  VoicePilot [30] conducts a substantive human-centered evaluation of LLM-based interaction, and AXIS [23] compares an API-first agent against unaided manual operation in a within-subjects design — but within a single application, on a single platform, with a cloud-hosted frontier model.  No surveyed work compares a conversational interface against the conventional graphical workflow across operating-system-level tasks on the same population.  This is the empirical gap best filled by a controlled study of conversational interfaces.</w:t>
+        <w:t xml:space="preserve">A fourth pattern concerns evaluation method.  Most surveyed systems are evaluated either through architectural demonstration [12, 44] or through curated task benchmarks [9, 45, 49, 56].  User studies are rare, and the comparisons that do exist are narrow.  VoicePilot [32] conducts a substantive human-centered evaluation of LLM-based interaction, and AXIS [25] compares an API-first agent against unaided manual operation in a within-subjects design — but within a single application, on a single platform, with a cloud-hosted frontier model.  No surveyed work compares a conversational interface against the conventional graphical workflow across operating-system-level tasks on the same population.  This is the empirical gap best filled by a controlled study of conversational interfaces.</w:t>
       </w:r>
     </w:p>
     <w:bookmarkEnd w:id="67"/>
@@ -5711,7 +5938,7 @@
         <w:pStyle w:val="FirstParagraph"/>
       </w:pPr>
       <w:r>
-        <w:t xml:space="preserve">A fifth pattern concerns the operating-system substrate.  Windows [15, 50], Android [33, 42, 51], and the web [8, 52, 53] are each heavily represented; the Linux work that exists is aimed elsewhere than the end user’s desktop session.  NaSh [11] addresses Linux at the shell level as a design proposal; Alibaba Cloud’s ANOLISA ships a natural-language Linux terminal with approval gating and rollback, but scoped to server and DevOps workloads; and OSWorld [46] includes Ubuntu as an evaluation platform rather than a deployment target.  No surveyed system implements a conversational session layer for the Linux desktop addressed to the person using the machine, despite Linux serving as the substrate for most developer and server-side workflows.</w:t>
+        <w:t xml:space="preserve">A fifth pattern concerns the operating-system substrate.  Windows [16, 53], Android [35, 45, 54], and the web [9, 55, 56] are each heavily represented; the Linux work that exists is aimed elsewhere than the end user’s desktop session.  NaSh [12] addresses Linux at the shell level as a design proposal; Alibaba Cloud’s ANOLISA ships a natural-language Linux terminal with approval gating and rollback, but scoped to server and DevOps workloads; and OSWorld [49] includes Ubuntu as an evaluation platform rather than a deployment target.  No surveyed system implements a conversational session layer for the Linux desktop addressed to the person using the machine, despite Linux’s wide use for development and server work.</w:t>
       </w:r>
     </w:p>
     <w:bookmarkEnd w:id="68"/>
@@ -5729,15 +5956,15 @@
         <w:pStyle w:val="FirstParagraph"/>
       </w:pPr>
       <w:r>
-        <w:t xml:space="preserve">A sixth pattern is the field’s shared intellectual lineage and its attendant fragility.  As established in §2.3, nearly every post-2023 system inherits the ReAct [47] convention of interleaving reasoning with action, which explains both the field’s rapid progress and the pervasiveness of LLM-reasoning failure modes across it — a fragility that makes safety and recoverability mechanisms, rather than raw capability alone, decisive for any deployable system.</w:t>
-      </w:r>
-    </w:p>
-    <w:p>
-      <w:pPr>
-        <w:pStyle w:val="BodyText"/>
-      </w:pPr>
-      <w:r>
-        <w:t xml:space="preserve">A related but distinct class of contemporary systems warrants explicit positioning here: AI-assisted coding agents such as Claude Code, Cursor, and Aider, which translate natural-language intent into shell commands and execute them under human oversight — the same basic mechanism the present study adopts.  These tools are excluded from Table 2.2 not on the grounds of being industry rather than academic work — a substantial share of the literature surveyed here is likewise unrefereed preprint — but because they occupy a different position on every axis that matters to this study.  They are built for software engineers operating within an existing code repository, are powered by large models hosted on remote infrastructure, and run as a tool installed atop an otherwise unmodified desktop session.  SynapseOS targets the inverse on each axis: any user of the machine regardless of command-line fluency, a locally-hosted small language model rather than a cloud dependency, and replacement of the session layer itself rather than an application running within it.  The mechanism is shared; the population, the model’s location, and the system’s place in the stack are not.</w:t>
+        <w:t xml:space="preserve">A sixth pattern is the field’s shared intellectual lineage and its attendant fragility.  As established in §2.3, nearly every post-2023 system inherits the ReAct [50] convention of interleaving reasoning with action, which explains both the field’s rapid progress and the pervasiveness of LLM-reasoning failure modes across it — a fragility that makes safety and recoverability mechanisms, rather than raw capability alone, decisive for any deployable system.</w:t>
+      </w:r>
+    </w:p>
+    <w:p>
+      <w:pPr>
+        <w:pStyle w:val="BodyText"/>
+      </w:pPr>
+      <w:r>
+        <w:t xml:space="preserve">A related but distinct class of contemporary systems warrants explicit positioning here: AI-assisted coding agents, which translate natural-language intent into shell commands and execute them under human oversight — the same basic mechanism the present study adopts.  These tools are excluded from Table 2.2 not on the grounds of being industry rather than academic work — a substantial share of the literature surveyed here is likewise unrefereed preprint — but because they occupy a different position on every axis that matters to this study.  They are built for software engineers operating within an existing code repository, are powered by large models hosted on remote infrastructure, and run as a tool installed atop an otherwise unmodified desktop session.  SynapseOS targets the inverse on each axis: any user of the machine regardless of command-line fluency, a locally-hosted small language model rather than a cloud dependency, and an interface layer over the whole desktop session rather than a tool used within one project.  The mechanism is shared; the population, the model’s location, and the system’s place in the stack are not.</w:t>
       </w:r>
     </w:p>
     <w:p>
@@ -5758,7 +5985,7 @@
         <w:t xml:space="preserve">First</w:t>
       </w:r>
       <w:r>
-        <w:t xml:space="preserve">, every surveyed system that guards a generated command does so by permission, matching it against an enumerated list of dangerous patterns, and none determines what the command would destroy or captures what is needed to undo it (§2.5); this is the gap the study’s algorithmic contribution addresses. </w:t>
+        <w:t xml:space="preserve">, the surveyed systems guard a generated command by permission, matching it against an enumerated list of dangerous patterns, or recover by snapshot, and none determines before a command runs what it would destroy and captures exactly that (§2.5); this is the gap the study’s algorithmic contribution addresses. </w:t>
       </w:r>
       <w:r>
         <w:t xml:space="preserve"> </w:t>
@@ -5771,7 +5998,7 @@
         <w:t xml:space="preserve">Second</w:t>
       </w:r>
       <w:r>
-        <w:t xml:space="preserve">, no system in the literature provides a conversational interface as a general route to operating a personal computer — one addressed to the person using the machine, spanning the operating system rather than a single application, and evaluated as an interface rather than as an autonomous agent.  Existing systems are automation utilities: they act on the user’s behalf, and they are measured by how often they complete a task unattended rather than by whether a person directs them more effectively than they direct the interfaces they already have. </w:t>
+        <w:t xml:space="preserve">, no system in the surveyed corpus provides a conversational interface as a general route to operating a personal computer — one addressed to the person using the machine, spanning the operating system rather than a single application, and evaluated as an interface rather than as an autonomous agent.  Existing systems are automation utilities: they act on the user’s behalf, and they are measured by how often they complete a task unattended rather than by whether a person directs them more effectively than they direct the interfaces they already have. </w:t>
       </w:r>
       <w:r>
         <w:t xml:space="preserve"> </w:t>
@@ -5784,7 +6011,7 @@
         <w:t xml:space="preserve">Third</w:t>
       </w:r>
       <w:r>
-        <w:t xml:space="preserve">, the work that exists on an open platform targets servers, agents, and benchmarks rather than the desktop session of an end user — and the platform constraint runs deeper than coverage.  An interface layer that observes and acts on a desktop session can only be built where the platform permits it; Windows and macOS are proprietary and do not.  Linux is therefore the condition of the experiment rather than its subject, and the absence of end-user desktop work there is what this study addresses. </w:t>
+        <w:t xml:space="preserve">, the work that exists on an open platform targets servers, agents, and benchmarks rather than the desktop session of an end user.  Linux is chosen because its desktop session, toolchain, and command line are open to inspection and modification, which makes it the condition of the experiment rather than its subject; the absence of end-user desktop work there is what the platform addresses. </w:t>
       </w:r>
       <w:r>
         <w:t xml:space="preserve"> </w:t>
@@ -5797,7 +6024,7 @@
         <w:t xml:space="preserve">Fourth</w:t>
       </w:r>
       <w:r>
-        <w:t xml:space="preserve">, controlled comparison against the conventional graphical workflow exists only within a single application, on a single platform, with a cloud-hosted frontier model [23]; no such comparison exists for operating-system-level tasks under a locally-hosted model and an explicit safety gate.  SynapseOS — a conversational interface layer for the Linux desktop that translates natural-language intent into shell commands under a reversibility-based confirmation gate, evaluated against each participant’s own operating system — is positioned precisely against these four gaps.  Its relationship to the closest prior work is worth stating directly.  NaSh [11] proposes guardrails for an LLM-powered natural language shell — generated code that remains analyzable, selective undo, summaries of what a command would affect — as a design position, and explicitly leaves implementation and empirical evaluation as open work.  The present study is an implementation of that position, substituting for the general principle a static recoverability analysis, which derives what a command would affect from its structure before it runs, and an undo journal with five mechanisms, and supplying the user evaluation NaSh defers.</w:t>
+        <w:t xml:space="preserve">, controlled comparison against the conventional graphical workflow exists only within a single application, on a single platform, with a cloud-hosted frontier model [25]; no such comparison was found in the surveyed corpus for operating-system-level tasks under a locally-hosted model and an explicit safety gate.  SynapseOS — a conversational interface layer for the Linux desktop that translates natural-language intent into shell commands under a confirmation gate driven by the analysis, evaluated against each participant’s own operating system — is positioned against the other three gaps, as the platform on which the analysis addressing the first is validated.  Its relationship to the closest prior work is worth stating directly.  NaSh [12] proposes guardrails for an LLM-powered natural language shell — generated code that remains analyzable, selective undo, summaries of what a command would affect — as a design position, and explicitly leaves their mechanisms and their evaluation as open work.  The present study contributes a mechanism for part of that position, which NaSh does not specify: an analysis that derives what a command would affect from its structure, through composition and the read-only resolution of run-time targets, and a plan that captures the least that undoing it requires, evaluated against observed ground truth.</w:t>
       </w:r>
     </w:p>
     <w:bookmarkEnd w:id="69"/>
@@ -5816,7 +6043,7 @@
         <w:pStyle w:val="FirstParagraph"/>
       </w:pPr>
       <w:r>
-        <w:t xml:space="preserve">The algorithm is evaluated against ground truth observed by sandboxed execution, with paired statistical tests, as Chapter 3, Section 3.1 describes.  The methodological literature reviewed here shapes the validation study, in which the analysis is deployed in an interface and exercised by people, and so concerns how a conversational interface should be evaluated.  The evaluation practices of the surveyed work fall into three categories, each with a characteristic limitation.  Architectural demonstrations [11, 41] establish feasibility but provide no performance evidence.  Curated task benchmarks [8, 46, 53] provide reproducible, quantitative measures but assess the autonomous task completion of agents acting on a user’s behalf rather than the performance of a human working through an interface.  Human-centered user studies, exemplified by VoicePilot [30] and AXIS [23], provide the most direct evidence of an interface’s value to real users but remain rare in this literature and, where present, are confined to a single application rather than the operating system as a whole.  The instruments this study adopts are drawn from established practice rather than constructed for it: the System Usability Scale [3] for perceived usability, with its interpretation grounded in subsequent large-sample analysis [36], and the NASA Task Load Index [13] for perceived workload.</w:t>
+        <w:t xml:space="preserve">The algorithm is evaluated against ground truth observed by sandboxed execution, with paired statistical tests, as Chapter 3, Section 3.1 describes.  The methodological literature reviewed here shapes the validation study, in which the analysis is deployed in an interface and exercised by people, and so concerns how a conversational interface should be evaluated.  The evaluation practices of the surveyed work fall into three categories, each with a characteristic limitation.  Architectural demonstrations [12, 44] establish feasibility but provide no performance evidence.  Curated task benchmarks [9, 49, 56] provide reproducible, quantitative measures but assess the autonomous task completion of agents acting on a user’s behalf rather than the performance of a human working through an interface.  Human-centered user studies, exemplified by VoicePilot [32] and AXIS [25], provide the most direct evidence of an interface’s value to real users but remain rare in this literature and, where present, are confined to a single application rather than the operating system as a whole.  The instruments this study adopts are drawn from established practice rather than constructed for it: the System Usability Scale [4] for perceived usability, with its interpretation grounded in subsequent large-sample analysis [39], and the NASA Task Load Index [14] for perceived workload.</w:t>
       </w:r>
     </w:p>
     <w:p>
@@ -5872,7 +6099,7 @@
         <w:t xml:space="preserve"> </w:t>
       </w:r>
       <w:r>
-        <w:t xml:space="preserve">structure in the sense set out by Creswell and Plano Clark [7], collecting both strands concurrently and integrating them at the interpretation stage; the qualitative data, gathered through retrospective think-aloud over the screen recording and a semi-structured interview, are analyzed using the thematic-analysis method of Braun and Clarke [2], a widely adopted six-phase approach for identifying and reporting patterns in qualitative data.  Design considerations surfaced by the reviewed systems inform the evaluation directly: the preview-and-confirm guideline of VoicePilot [30] and the reversibility-and-guardrail framing of NaSh [11] together motivate an explicit validation of the confirmation gate and undo mechanism as part of the study.</w:t>
+        <w:t xml:space="preserve">structure in the sense set out by Creswell and Plano Clark [8], collecting both strands concurrently and integrating them at the interpretation stage; the qualitative data, gathered through retrospective think-aloud over the screen recording and a semi-structured interview, are analyzed using the thematic-analysis method of Braun and Clarke [3], a widely adopted six-phase approach for identifying and reporting patterns in qualitative data.  Design considerations surfaced by the reviewed systems inform the evaluation directly: the preview-and-confirm guideline of VoicePilot [32] and the reversibility-and-guardrail framing of NaSh [12] together motivate an explicit validation of the confirmation gate and undo mechanism as part of the study.</w:t>
       </w:r>
     </w:p>
     <w:p>
@@ -5898,15 +6125,15 @@
         <w:pStyle w:val="FirstParagraph"/>
       </w:pPr>
       <w:r>
-        <w:t xml:space="preserve">This chapter reviewed two literatures.  The first, on which the study’s algorithm builds, is program analysis: abstract interpretation and type-and-effect systems [6, 18, 40] supply its formal basis, the command guards of natural-language shells and coding agents [11, 19, 29] decide by permission rather than by effect, the static analyses of shell programs [1, 10, 25] target properties adjacent to recoverability but not recoverability itself, and recovery mechanisms from snapshots to operating system transactions [4, 9, 32, 34, 35] restore after the fact, but wholesale or only on a system built for it.  The second, in which the platform is situated, is the literature on natural-language and LLM-mediated interfaces to personal computing across nearly four decades, organized along a four-layer pipeline of Input, Reasoning, Action, and Operating-System Integration.  The historical foundations established the long-standing aspiration to a natural-language interface to a real operating system [45] and the methodological shift, driven by in-context reasoning [47], that made the current generation of systems possible.  The shell-and-command-line thread most directly related to the proposed design demonstrated that natural-language-to-Bash translation is tractable [43], that safety and reversibility are central concerns [11], and that local deployment is feasible [17], while leaving the extension from shell to session, and empirical user evaluation, as open work.  The graphical-agent literature across web, mobile, and desktop [8, 14, 15, 27, 33, 42, 50–53] established the field’s architectural patterns and its recurring bottleneck of visual grounding, while the accessibility thread [12, 26, 30, 31, 41] revealed a complementary limitation that a general conversational interface layer would resolve.  The evaluation literature [46, 48, 49] traced a capability ceiling that has risen sharply on short tasks while remaining low on long-horizon work, and exposed a methodological gap: interfaces are seldom evaluated comparatively against the conventional workflow with real users, and never yet at the level of the operating system itself.</w:t>
-      </w:r>
-    </w:p>
-    <w:p>
-      <w:pPr>
-        <w:pStyle w:val="BodyText"/>
-      </w:pPr>
-      <w:r>
-        <w:t xml:space="preserve">Synthesized, the surveyed works reveal a fourfold gap: no analysis of what a generated command would destroy, every guard being a list of dangerous patterns; no conversational replacement for the graphical session layer; no coverage of the Linux desktop; and no controlled comparison of a conversational interface against the conventional workflow across user populations.  The first is the gap the present study’s research addresses, through a recoverability analysis of generated shell commands evaluated against ground truth obtained by sandboxed execution.  The other three describe the setting in which that gap arises, and SynapseOS, the conversational interface layer for the Linux desktop built as the analysis’s experimental platform, is where the analysis is deployed and validated in use, through a controlled, within-subjects comparison against each participant’s own operating system.  The methodology through which this evaluation is conducted is the subject of Chapter 3.</w:t>
+        <w:t xml:space="preserve">This chapter reviewed two literatures.  The first, on which the study’s algorithm builds, is program analysis: abstract interpretation and type-and-effect systems [7, 19, 43] supply its formal basis, the command guards of natural-language shells and coding agents [12, 20, 31] decide by permission rather than by effect, the static analyses of shell programs [2, 11, 27] target properties adjacent to recoverability but not recoverability itself, and recovery mechanisms from snapshots to operating system transactions [5, 10, 34, 36, 38] restore after the fact, but wholesale or only on a system built for it.  The second, in which the platform is situated, is the literature on natural-language and LLM-mediated interfaces to personal computing across nearly four decades, organized along a four-layer pipeline of Input, Reasoning, Action, and Operating-System Integration.  The historical foundations established the long-standing aspiration to a natural-language interface to a real operating system [48] and the methodological shift, driven by in-context reasoning [50], that made the current generation of systems possible.  The shell-and-command-line thread most directly related to the proposed design demonstrated that natural-language-to-Bash translation is tractable [46], that safety and reversibility are central concerns [12], and that local deployment is feasible [18], while leaving the extension from shell to session, and empirical user evaluation, as open work.  The graphical-agent literature across web, mobile, and desktop [9, 15, 16, 29, 35, 45, 53–56] established the field’s architectural patterns and its recurring bottleneck of visual grounding, while the accessibility thread [13, 28, 32, 33, 44] revealed a complementary limitation that a general conversational interface layer would resolve.  The evaluation literature [49, 51, 52] traced a capability ceiling that has risen sharply on short tasks while remaining low on long-horizon work, and exposed a methodological gap: interfaces are seldom evaluated comparatively against the conventional workflow with real users, and, in the surveyed corpus, not at the level of the operating system itself.</w:t>
+      </w:r>
+    </w:p>
+    <w:p>
+      <w:pPr>
+        <w:pStyle w:val="BodyText"/>
+      </w:pPr>
+      <w:r>
+        <w:t xml:space="preserve">Synthesized, the surveyed works reveal a fourfold gap: no analysis of what a generated command would destroy, every guard deciding by permission and every shipped recovery restoring by snapshot; no conversational interface over a whole desktop session addressed to the person using it; no coverage of the Linux desktop; and no controlled comparison of a conversational interface against the conventional workflow at the level of the operating system.  The first is the gap the present study’s research addresses, through a recoverability analysis of generated shell commands evaluated against ground truth obtained by sandboxed execution.  The other three describe the setting in which that gap arises, and SynapseOS, the conversational interface layer for the Linux desktop built as the analysis’s experimental platform, is where the analysis is deployed and validated in use, through a controlled, within-subjects comparison against each participant’s own operating system.  The methodology through which this evaluation is conducted is the subject of Chapter 3.</w:t>
       </w:r>
     </w:p>
     <w:bookmarkEnd w:id="72"/>
@@ -6080,7 +6307,7 @@
         <w:pStyle w:val="BodyText"/>
       </w:pPr>
       <w:r>
-        <w:t xml:space="preserve">The framework is evaluated in two parts of different standing.  The recoverability analyzer, the study’s research contribution, is evaluated on its own, on a corpus of commands whose ground truth is obtained by sandboxed execution (Sections 3.1 and 3.2).  The analyzer is then validated in use, deployed in the platform, through a controlled study in which participants complete a fixed set of tasks under two conditions: using SynapseOS as the interface, and using their own primary operating system — Windows, macOS, or Linux — as the baseline.  The study records the analyzer’s decision on every command participants cause, so its behaviour in use can be compared with its behaviour on the corpus, and its expert baseline design, which pits SynapseOS against the environment each participant already knows and uses daily, characterizes the platform through task completion time, error rate, and user satisfaction across the real-world OS landscape [46].</w:t>
+        <w:t xml:space="preserve">The framework is evaluated in two parts of different standing.  The recoverability analyzer, the study’s research contribution, is evaluated on its own, on a corpus of commands whose ground truth is obtained by sandboxed execution (Sections 3.1 and 3.2).  The analyzer is then validated in use, deployed in the platform, through a controlled study in which participants complete a fixed set of tasks under two conditions: using SynapseOS as the interface, and using their own primary operating system — Windows, macOS, or Linux — as the baseline.  The study records the analyzer’s decision on every command participants cause, so its behaviour in use can be compared with its behaviour on the corpus, and its expert baseline design, which pits SynapseOS against the environment each participant already knows and uses daily, characterizes the platform through task completion time, error rate, and user satisfaction across the real-world OS landscape [49].</w:t>
       </w:r>
     </w:p>
     <w:p>
@@ -6097,7 +6324,7 @@
               <a:graphicData uri="http://schemas.openxmlformats.org/drawingml/2006/picture">
                 <pic:pic>
                   <pic:nvPicPr>
-                    <pic:cNvPr descr="/tmp/claude-1000/-home-willard-projects-thesis/cb82e7af-8c35-489a-a7f7-ef49172efea2/scratchpad/docx/work5/fig1.png" id="79" name="Picture"/>
+                    <pic:cNvPr descr="/tmp/claude-1000/-home-willard-projects-thesis/cb82e7af-8c35-489a-a7f7-ef49172efea2/scratchpad/docx/work6/fig1.png" id="79" name="Picture"/>
                     <pic:cNvPicPr>
                       <a:picLocks noChangeArrowheads="1" noChangeAspect="1"/>
                     </pic:cNvPicPr>
@@ -6821,7 +7048,7 @@
         <w:pStyle w:val="FirstParagraph"/>
       </w:pPr>
       <w:r>
-        <w:t xml:space="preserve">The primary dataset is a corpus of shell commands.  Each command is paired with a fixture — the files and directories that exist when it runs — and with a ground-truth label observed by running it on that fixture in a sandbox: whether it loses nothing, loses something a captured pre-image could restore, or acts outside the filesystem.  The corpus is held as four partitions: human-written commands from NL2Bash [21], templates covering each shell composition operator, commands whose effect lies outside the filesystem, and commands the deployed model itself wrote.  For every command, each configuration compared in Section 3 records its decision: whether it would ask, and what it would capture.  The configurations are the analysis, its baselines, and its ablations.  For every command the analysis would let run, the command is also executed, undone, and the tree compared, which records whether the capture restored the prior state.</w:t>
+        <w:t xml:space="preserve">The primary dataset is a corpus of shell commands.  Each command is paired with a fixture — the files and directories that exist when it runs — and with a ground-truth label observed by running it on that fixture in a sandbox: whether it loses nothing, loses something a captured pre-image could restore, or acts outside the filesystem.  The corpus is held as four partitions: human-written commands from NL2Bash [23], templates covering each shell composition operator, commands whose effect lies outside the filesystem, and commands the deployed model itself wrote.  For every command, each configuration compared in Section 3 records its decision: whether it would ask, and what it would capture.  The configurations are the analysis, its baselines, and its ablations.  For every command the analysis would let run, the command is also executed, undone, and the tree compared, which records whether the capture restored the prior state.</w:t>
       </w:r>
     </w:p>
     <w:bookmarkEnd w:id="82"/>
@@ -6839,7 +7066,7 @@
         <w:pStyle w:val="FirstParagraph"/>
       </w:pPr>
       <w:r>
-        <w:t xml:space="preserve">The primary benchmark dataset is the OSWorld task suite [46], which provides standardized real-computer tasks across shell operations, file management, web browsing, and application-level interactions.  OSWorld is the only existing benchmark that evaluates computer-using agents in real operating system environments, making it the most appropriate external standard for SynapseOS evaluation.  Tasks are presented as natural language instructions; agents interact with a real virtual machine environment, and outcomes are evaluated by automated inspection of the resulting system state — whether the goal was actually achieved — rather than by comparing individual actions.  In addition to OSWorld tasks, a custom cross-platform task suite is developed for this study, covering file search and organization, system and process monitoring, application and package management, and text and data processing — each task defined as a human-level goal achievable via SynapseOS natural language commands and via native OS tools on the comparison machine.  Each task in both suites is documented with a description, expected outcome, task category, and difficulty level.</w:t>
+        <w:t xml:space="preserve">The OSWorld task suite [49] provides standardized real-computer tasks across shell operations, file management, web browsing, and application-level interactions, and is used as a secondary check on the platform: only its tasks that can be expressed as shell commands are adapted, since graphical-only tasks are outside SynapseOS’s scope (Section 2.1(e)).  OSWorld evaluates computer-using agents in real operating system environments, which lets the platform’s results be related to the existing literature.  Tasks are presented as natural language instructions; agents interact with a real virtual machine environment, and outcomes are evaluated by automated inspection of the resulting system state — whether the goal was actually achieved — rather than by comparing individual actions.  In addition to OSWorld tasks, a custom cross-platform task suite is developed for this study, covering file search and organization, system and process monitoring, application and package management, and text and data processing — each task defined as a human-level goal achievable via SynapseOS natural language commands and via native OS tools on the comparison machine.  Each task in both suites is documented with a description, expected outcome, task category, and difficulty level.</w:t>
       </w:r>
     </w:p>
     <w:bookmarkEnd w:id="83"/>
@@ -6923,7 +7150,7 @@
         <w:t xml:space="preserve"> </w:t>
       </w:r>
       <w:r>
-        <w:t xml:space="preserve">responses to the System Usability Scale (SUS) [3] and the NASA Task Load Index (NASA-TLX) [13], collected immediately after each condition; both are validated instruments for measuring perceived usability and cognitive workload respectively</w:t>
+        <w:t xml:space="preserve">responses to the System Usability Scale (SUS) [4] and the NASA Task Load Index (NASA-TLX) [14], collected immediately after each condition; both are validated instruments for measuring perceived usability and cognitive workload respectively</w:t>
       </w:r>
     </w:p>
     <w:p>
@@ -7063,7 +7290,7 @@
         <w:pStyle w:val="FirstParagraph"/>
       </w:pPr>
       <w:r>
-        <w:t xml:space="preserve">The corpus is generated by a program, not assembled by hand, and is held as four partitions reported separately rather than pooled.  The first is NL2Bash [21], which supplies human-written commands and is the generalization set: candidates are drawn at random from the dataset with a recorded seed, excluding any command used during development.  The second is a set of parameterized command templates covering each shell composition operator — sequencing, conditional execution, pipelines, redirects, command substitution, loops,</w:t>
+        <w:t xml:space="preserve">The corpus is generated by a program, not assembled by hand, and is held as four partitions reported separately rather than pooled.  The first is NL2Bash [23], which supplies human-written commands and is the generalization set: candidates are drawn at random from the dataset with a recorded seed, excluding any command used during development.  The second is a set of parameterized command templates covering each shell composition operator — sequencing, conditional execution, pipelines, redirects, command substitution, loops,</w:t>
       </w:r>
       <w:r>
         <w:t xml:space="preserve"> </w:t>
@@ -7296,7 +7523,7 @@
         <w:pStyle w:val="FirstParagraph"/>
       </w:pPr>
       <w:r>
-        <w:t xml:space="preserve">SynapseOS is deployed on the Debian 13 (Trixie) environment matching the OSWorld evaluation setup [46].  Each benchmark task is executed through the conversational interface, and results are captured programmatically through the built-in telemetry system.  Each task is supplied to SynapseOS as a natural language instruction, and the resulting system state is compared against the expected outcome defined in the benchmark.  Because SynapseOS gates every command classified irreversible on explicit confirmation, benchmark runs are facilitator-attended rather than unattended; the confirmation gate remains active throughout and every confirmation is logged as part of the run record.  OSWorld scores the resulting system state rather than a human operator’s performance, so it applies only to the SynapseOS condition.  Condition B, which a human participant operates directly, has no equivalent and is instead evaluated through the custom cross-platform task suite administered in the user study (Section 1.2(d)).</w:t>
+        <w:t xml:space="preserve">SynapseOS is deployed on Debian 13 (Trixie); OSWorld’s own environment is an Ubuntu virtual machine [49], so its shell-expressible tasks are adapted to the Debian evaluation machine.  Each benchmark task is executed through the conversational interface, and results are captured programmatically through the built-in telemetry system.  Each task is supplied to SynapseOS as a natural language instruction, and the resulting system state is compared against the expected outcome defined in the benchmark.  Because SynapseOS asks before every command its confirmation policy does not let through unasked (Section 2.1(e)), benchmark runs are facilitator-attended rather than unattended; the confirmation gate remains active throughout and every confirmation is logged as part of the run record.  OSWorld scores the resulting system state rather than a human operator’s performance, so it applies only to the SynapseOS condition.  Condition B, which a human participant operates directly, has no equivalent and is instead evaluated through the custom cross-platform task suite administered in the user study (Section 1.2(d)).</w:t>
       </w:r>
     </w:p>
     <w:bookmarkEnd w:id="89"/>
@@ -7417,7 +7644,7 @@
         <w:pStyle w:val="BodyText"/>
       </w:pPr>
       <w:r>
-        <w:t xml:space="preserve">The OSWorld benchmark is used as the primary evaluation standard because it is the only existing benchmark that evaluates computer-using agents in real operating system environments with real applications [46].  Its use allows SynapseOS results to be situated within the existing literature.</w:t>
+        <w:t xml:space="preserve">The OSWorld benchmark is used as a secondary check on the platform because it evaluates computer-using agents in real operating system environments with real applications [49], which allows the platform’s results to be situated within the existing literature; the analysis itself is evaluated on the command corpus, for the reasons given above.</w:t>
       </w:r>
     </w:p>
     <w:p>
@@ -7457,7 +7684,7 @@
         <w:pStyle w:val="BodyText"/>
       </w:pPr>
       <w:r>
-        <w:t xml:space="preserve">The dual-population design — novice and power users — directly addresses the gap identified in Chapter 1, where no prior work has evaluated a conversational interface across user populations with differing technical backgrounds [46].  The validation data serve two purposes.  The system performance data, including the analysis’s decision on every command participants cause, validate the analysis in use: they show whether its verdicts and captures hold on commands the corpus does not contain, and whether undo restores what participants’ commands changed.  The user study metrics and benchmark coverage characterize the platform on which it is deployed.  The research questions themselves are answered against the labeled command corpus described in Section 3.1.</w:t>
+        <w:t xml:space="preserve">The dual-population design — novice and power users — lets the validation study show whether the analysis’s decisions hold both for people who can read the commands it judges and for people who cannot, and characterizes the platform across both.  The validation data serve two purposes.  The system performance data, including the analysis’s decision on every command participants cause, validate the analysis in use: they show whether its verdicts and captures hold on commands the corpus does not contain, and whether undo restores what participants’ commands changed.  The user study metrics and benchmark coverage characterize the platform on which it is deployed.  The research questions themselves are answered against the labeled command corpus described in Section 3.1.</w:t>
       </w:r>
     </w:p>
     <w:bookmarkEnd w:id="92"/>
@@ -8028,7 +8255,20 @@
         <w:t xml:space="preserve">metadata</w:t>
       </w:r>
       <w:r>
-        <w:t xml:space="preserve">}; a target path, resolved against the working directory in which the command would execute; and the pre-image that would have to be captured for that effect to be reversed.  The effect set of a command is the union of the effects of every leaf command within it, taken over the whole of its operator structure.</w:t>
+        <w:t xml:space="preserve">}; a target path, resolved against the working directory in which the command would execute; and the pre-image that would have to be captured for that effect to be reversed.  A removal whose very bytes survive at another path, as in a rename, is marked as a</w:t>
+      </w:r>
+      <w:r>
+        <w:t xml:space="preserve"> </w:t>
+      </w:r>
+      <w:r>
+        <w:rPr>
+          <w:i/>
+          <w:iCs/>
+        </w:rPr>
+        <w:t xml:space="preserve">move</w:t>
+      </w:r>
+      <w:r>
+        <w:t xml:space="preserve">: undo moves the data back, so it needs no capture.  The effect set of a command is the union of the effects of every leaf command within it, taken over the whole of its operator structure.</w:t>
       </w:r>
     </w:p>
     <w:p>
@@ -8272,7 +8512,7 @@
         <w:t xml:space="preserve"> </w:t>
       </w:r>
       <w:r>
-        <w:t xml:space="preserve">— make later effects conditional on an earlier exit status, so the effect set is a union over the branches that may execute.  A pipeline connects standard output to standard input and contributes no filesystem effect of its own, but determines the exit status that gates whatever follows it.  Redirection introduces write or truncate effects that appear in no command in the pipeline.  Command substitution introduces effects whose targets are computable only at runtime, and</w:t>
+        <w:t xml:space="preserve">— make later effects conditional on an earlier exit status, so the effect set is a union over the branches that may execute.  A pipeline connects standard output to standard input and contributes no filesystem effect of its own, but determines the exit status that gates whatever follows it.  Redirection introduces write effects that appear in no command in the pipeline.  Command substitution introduces effects whose targets are computable only at runtime, and</w:t>
       </w:r>
       <w:r>
         <w:t xml:space="preserve"> </w:t>
@@ -8529,31 +8769,33 @@
         <w:pStyle w:val="BodyText"/>
       </w:pPr>
       <w:r>
-        <w:t xml:space="preserve">Parts (a) to (c) are stated formally together below, so that the analysis can be checked directly rather than reconstructed from prose.</w:t>
-      </w:r>
-    </w:p>
-    <w:p>
-      <w:pPr>
-        <w:pStyle w:val="BodyText"/>
-      </w:pPr>
-      <w:r>
-        <w:t xml:space="preserve">Algorithm 1 Effect analysis and capture planning for a generated shell command</w:t>
-      </w:r>
-      <w:r>
-        <w:t xml:space="preserve"> </w:t>
-      </w:r>
-      <w:r>
         <w:rPr>
           <w:b/>
           <w:bCs/>
         </w:rPr>
-        <w:t xml:space="preserve">Input:</w:t>
-      </w:r>
-      <w:r>
-        <w:t xml:space="preserve"> </w:t>
-      </w:r>
-      <w:r>
-        <w:t xml:space="preserve">command c, working directory wd, capture mechanisms M</w:t>
+        <w:t xml:space="preserve">Why the plan is minimal.</w:t>
+      </w:r>
+      <w:r>
+        <w:t xml:space="preserve"> </w:t>
+      </w:r>
+      <w:r>
+        <w:t xml:space="preserve">Cost is counted as the work and storage a capture needs before the command runs: a hardlink, a permission record, a commit identifier, and an inverse command each cost a constant, and a content copy costs the size of the file.  The capture a path needs is fixed by its effects: a removal alone is restored from a hardlink; an overwrite needs a copy of the bytes, because a hardlink shares the very data the write changes; and a change of mode or owner needs a record.  The choices for different paths are independent, except that a directory captured whole already covers every removal beneath it.  Choosing for each path the cheapest mechanism that suffices, and dropping the removals a captured directory covers, therefore gives the least total cost: the total is a sum of per-path costs, each at its minimum, and dropping a covered capture can only lower it.  The claim is minimality relative to these mechanisms and this cost model, not over every conceivable way of restoring a system; on a copy-on-write filesystem, for instance, a whole-directory snapshot could cost less than the plan’s copies.</w:t>
+      </w:r>
+    </w:p>
+    <w:p>
+      <w:pPr>
+        <w:pStyle w:val="BodyText"/>
+      </w:pPr>
+      <w:r>
+        <w:t xml:space="preserve">Parts (a) to (c) are stated formally together below, so that the analysis can be checked directly rather than reconstructed from prose.</w:t>
+      </w:r>
+    </w:p>
+    <w:p>
+      <w:pPr>
+        <w:pStyle w:val="BodyText"/>
+      </w:pPr>
+      <w:r>
+        <w:t xml:space="preserve">Algorithm 1 Effect analysis and capture planning for a generated shell command</w:t>
       </w:r>
       <w:r>
         <w:t xml:space="preserve"> </w:t>
@@ -8563,19 +8805,13 @@
           <w:b/>
           <w:bCs/>
         </w:rPr>
-        <w:t xml:space="preserve">Output:</w:t>
-      </w:r>
-      <w:r>
-        <w:t xml:space="preserve"> </w:t>
-      </w:r>
-      <w:r>
-        <w:t xml:space="preserve">verdict in {RECOVERABLE, RECOVERABLE_WITH_CAPTURE, UNRECOVERABLE}</w:t>
-      </w:r>
-      <w:r>
-        <w:t xml:space="preserve"> </w:t>
-      </w:r>
-      <w:r>
-        <w:t xml:space="preserve">plan, a set of (mechanism, target) pairs</w:t>
+        <w:t xml:space="preserve">Input:</w:t>
+      </w:r>
+      <w:r>
+        <w:t xml:space="preserve"> </w:t>
+      </w:r>
+      <w:r>
+        <w:t xml:space="preserve">command c, working directory wd, capture mechanisms M</w:t>
       </w:r>
       <w:r>
         <w:t xml:space="preserve"> </w:t>
@@ -8585,13 +8821,19 @@
           <w:b/>
           <w:bCs/>
         </w:rPr>
-        <w:t xml:space="preserve">State:</w:t>
-      </w:r>
-      <w:r>
-        <w:t xml:space="preserve"> </w:t>
-      </w:r>
-      <w:r>
-        <w:t xml:space="preserve">overlay V of paths created or removed by earlier parts of c</w:t>
+        <w:t xml:space="preserve">Output:</w:t>
+      </w:r>
+      <w:r>
+        <w:t xml:space="preserve"> </w:t>
+      </w:r>
+      <w:r>
+        <w:t xml:space="preserve">verdict in {RECOVERABLE, RECOVERABLE_WITH_CAPTURE, UNRECOVERABLE}</w:t>
+      </w:r>
+      <w:r>
+        <w:t xml:space="preserve"> </w:t>
+      </w:r>
+      <w:r>
+        <w:t xml:space="preserve">plan, a set of (mechanism, target) pairs</w:t>
       </w:r>
       <w:r>
         <w:t xml:space="preserve"> </w:t>
@@ -8601,13 +8843,13 @@
           <w:b/>
           <w:bCs/>
         </w:rPr>
-        <w:t xml:space="preserve">function</w:t>
-      </w:r>
-      <w:r>
-        <w:t xml:space="preserve"> </w:t>
-      </w:r>
-      <w:r>
-        <w:t xml:space="preserve">EFFECTS(node, wd, V)</w:t>
+        <w:t xml:space="preserve">State:</w:t>
+      </w:r>
+      <w:r>
+        <w:t xml:space="preserve"> </w:t>
+      </w:r>
+      <w:r>
+        <w:t xml:space="preserve">overlay V of paths created or removed by earlier parts of c</w:t>
       </w:r>
       <w:r>
         <w:t xml:space="preserve"> </w:t>
@@ -8617,13 +8859,13 @@
           <w:b/>
           <w:bCs/>
         </w:rPr>
-        <w:t xml:space="preserve">if</w:t>
-      </w:r>
-      <w:r>
-        <w:t xml:space="preserve"> </w:t>
-      </w:r>
-      <w:r>
-        <w:t xml:space="preserve">node is a leaf command</w:t>
+        <w:t xml:space="preserve">function</w:t>
+      </w:r>
+      <w:r>
+        <w:t xml:space="preserve"> </w:t>
+      </w:r>
+      <w:r>
+        <w:t xml:space="preserve">EFFECTS(node, wd, V)</w:t>
       </w:r>
       <w:r>
         <w:t xml:space="preserve"> </w:t>
@@ -8633,7 +8875,13 @@
           <w:b/>
           <w:bCs/>
         </w:rPr>
-        <w:t xml:space="preserve">then</w:t>
+        <w:t xml:space="preserve">if</w:t>
+      </w:r>
+      <w:r>
+        <w:t xml:space="preserve"> </w:t>
+      </w:r>
+      <w:r>
+        <w:t xml:space="preserve">node is a leaf command</w:t>
       </w:r>
       <w:r>
         <w:t xml:space="preserve"> </w:t>
@@ -8643,13 +8891,7 @@
           <w:b/>
           <w:bCs/>
         </w:rPr>
-        <w:t xml:space="preserve">return</w:t>
-      </w:r>
-      <w:r>
-        <w:t xml:space="preserve"> </w:t>
-      </w:r>
-      <w:r>
-        <w:t xml:space="preserve">RULE(name, args, wd, V) // argument-aware; no rule gives {UNKNOWN}</w:t>
+        <w:t xml:space="preserve">then</w:t>
       </w:r>
       <w:r>
         <w:t xml:space="preserve"> </w:t>
@@ -8659,13 +8901,13 @@
           <w:b/>
           <w:bCs/>
         </w:rPr>
-        <w:t xml:space="preserve">else if</w:t>
-      </w:r>
-      <w:r>
-        <w:t xml:space="preserve"> </w:t>
-      </w:r>
-      <w:r>
-        <w:t xml:space="preserve">node = (A ; B), (A &amp;&amp; B), (A || B), or (A | B)</w:t>
+        <w:t xml:space="preserve">return</w:t>
+      </w:r>
+      <w:r>
+        <w:t xml:space="preserve"> </w:t>
+      </w:r>
+      <w:r>
+        <w:t xml:space="preserve">RULE(name, args, wd, V) // argument-aware; no rule gives {UNKNOWN}</w:t>
       </w:r>
       <w:r>
         <w:t xml:space="preserve"> </w:t>
@@ -8675,7 +8917,13 @@
           <w:b/>
           <w:bCs/>
         </w:rPr>
-        <w:t xml:space="preserve">then</w:t>
+        <w:t xml:space="preserve">else if</w:t>
+      </w:r>
+      <w:r>
+        <w:t xml:space="preserve"> </w:t>
+      </w:r>
+      <w:r>
+        <w:t xml:space="preserve">node = (A ; B), (A &amp;&amp; B), (A || B), or (A | B)</w:t>
       </w:r>
       <w:r>
         <w:t xml:space="preserve"> </w:t>
@@ -8685,13 +8933,7 @@
           <w:b/>
           <w:bCs/>
         </w:rPr>
-        <w:t xml:space="preserve">return</w:t>
-      </w:r>
-      <w:r>
-        <w:t xml:space="preserve"> </w:t>
-      </w:r>
-      <w:r>
-        <w:t xml:space="preserve">EFFECTS(A, wd, V) ∪ EFFECTS(B, wd, V) // B sees what A did, through V</w:t>
+        <w:t xml:space="preserve">then</w:t>
       </w:r>
       <w:r>
         <w:t xml:space="preserve"> </w:t>
@@ -8701,13 +8943,13 @@
           <w:b/>
           <w:bCs/>
         </w:rPr>
-        <w:t xml:space="preserve">else if</w:t>
-      </w:r>
-      <w:r>
-        <w:t xml:space="preserve"> </w:t>
-      </w:r>
-      <w:r>
-        <w:t xml:space="preserve">node has a redirect target t</w:t>
+        <w:t xml:space="preserve">return</w:t>
+      </w:r>
+      <w:r>
+        <w:t xml:space="preserve"> </w:t>
+      </w:r>
+      <w:r>
+        <w:t xml:space="preserve">EFFECTS(A, wd, V) ∪ EFFECTS(B, wd, V) // B sees what A did, through V</w:t>
       </w:r>
       <w:r>
         <w:t xml:space="preserve"> </w:t>
@@ -8717,7 +8959,13 @@
           <w:b/>
           <w:bCs/>
         </w:rPr>
-        <w:t xml:space="preserve">then</w:t>
+        <w:t xml:space="preserve">else if</w:t>
+      </w:r>
+      <w:r>
+        <w:t xml:space="preserve"> </w:t>
+      </w:r>
+      <w:r>
+        <w:t xml:space="preserve">node has a redirect target t</w:t>
       </w:r>
       <w:r>
         <w:t xml:space="preserve"> </w:t>
@@ -8727,13 +8975,7 @@
           <w:b/>
           <w:bCs/>
         </w:rPr>
-        <w:t xml:space="preserve">return</w:t>
-      </w:r>
-      <w:r>
-        <w:t xml:space="preserve"> </w:t>
-      </w:r>
-      <w:r>
-        <w:t xml:space="preserve">EFFECTS(strip_redirect(node), wd, V) ∪ {write-or-create(t)}</w:t>
+        <w:t xml:space="preserve">then</w:t>
       </w:r>
       <w:r>
         <w:t xml:space="preserve"> </w:t>
@@ -8743,13 +8985,13 @@
           <w:b/>
           <w:bCs/>
         </w:rPr>
-        <w:t xml:space="preserve">else if</w:t>
-      </w:r>
-      <w:r>
-        <w:t xml:space="preserve"> </w:t>
-      </w:r>
-      <w:r>
-        <w:t xml:space="preserve">node = (for x in W; do body; done)</w:t>
+        <w:t xml:space="preserve">return</w:t>
+      </w:r>
+      <w:r>
+        <w:t xml:space="preserve"> </w:t>
+      </w:r>
+      <w:r>
+        <w:t xml:space="preserve">EFFECTS(strip_redirect(node), wd, V) ∪ {write-or-create(t)}</w:t>
       </w:r>
       <w:r>
         <w:t xml:space="preserve"> </w:t>
@@ -8759,7 +9001,13 @@
           <w:b/>
           <w:bCs/>
         </w:rPr>
-        <w:t xml:space="preserve">then</w:t>
+        <w:t xml:space="preserve">else if</w:t>
+      </w:r>
+      <w:r>
+        <w:t xml:space="preserve"> </w:t>
+      </w:r>
+      <w:r>
+        <w:t xml:space="preserve">node = (for x in W; do body; done)</w:t>
       </w:r>
       <w:r>
         <w:t xml:space="preserve"> </w:t>
@@ -8769,13 +9017,7 @@
           <w:b/>
           <w:bCs/>
         </w:rPr>
-        <w:t xml:space="preserve">return</w:t>
-      </w:r>
-      <w:r>
-        <w:t xml:space="preserve"> </w:t>
-      </w:r>
-      <w:r>
-        <w:t xml:space="preserve">∪ over w in EXPAND(W) of EFFECTS(body[x := w], wd, V)</w:t>
+        <w:t xml:space="preserve">then</w:t>
       </w:r>
       <w:r>
         <w:t xml:space="preserve"> </w:t>
@@ -8785,13 +9027,13 @@
           <w:b/>
           <w:bCs/>
         </w:rPr>
-        <w:t xml:space="preserve">else if</w:t>
-      </w:r>
-      <w:r>
-        <w:t xml:space="preserve"> </w:t>
-      </w:r>
-      <w:r>
-        <w:t xml:space="preserve">node is sh -c s, or a wrapper such as sudo or env</w:t>
+        <w:t xml:space="preserve">return</w:t>
+      </w:r>
+      <w:r>
+        <w:t xml:space="preserve"> </w:t>
+      </w:r>
+      <w:r>
+        <w:t xml:space="preserve">∪ over w in EXPAND(W) of EFFECTS(body[x := w], wd, V)</w:t>
       </w:r>
       <w:r>
         <w:t xml:space="preserve"> </w:t>
@@ -8801,7 +9043,13 @@
           <w:b/>
           <w:bCs/>
         </w:rPr>
-        <w:t xml:space="preserve">then</w:t>
+        <w:t xml:space="preserve">else if</w:t>
+      </w:r>
+      <w:r>
+        <w:t xml:space="preserve"> </w:t>
+      </w:r>
+      <w:r>
+        <w:t xml:space="preserve">node is sh -c s, or a wrapper such as sudo or env</w:t>
       </w:r>
       <w:r>
         <w:t xml:space="preserve"> </w:t>
@@ -8811,13 +9059,7 @@
           <w:b/>
           <w:bCs/>
         </w:rPr>
-        <w:t xml:space="preserve">return</w:t>
-      </w:r>
-      <w:r>
-        <w:t xml:space="preserve"> </w:t>
-      </w:r>
-      <w:r>
-        <w:t xml:space="preserve">EFFECTS(inner command, wd, V)</w:t>
+        <w:t xml:space="preserve">then</w:t>
       </w:r>
       <w:r>
         <w:t xml:space="preserve"> </w:t>
@@ -8827,13 +9069,13 @@
           <w:b/>
           <w:bCs/>
         </w:rPr>
-        <w:t xml:space="preserve">else if</w:t>
-      </w:r>
-      <w:r>
-        <w:t xml:space="preserve"> </w:t>
-      </w:r>
-      <w:r>
-        <w:t xml:space="preserve">node is find with -delete or -exec, or xargs</w:t>
+        <w:t xml:space="preserve">return</w:t>
+      </w:r>
+      <w:r>
+        <w:t xml:space="preserve"> </w:t>
+      </w:r>
+      <w:r>
+        <w:t xml:space="preserve">EFFECTS(inner command, wd, V)</w:t>
       </w:r>
       <w:r>
         <w:t xml:space="preserve"> </w:t>
@@ -8843,13 +9085,13 @@
           <w:b/>
           <w:bCs/>
         </w:rPr>
-        <w:t xml:space="preserve">then</w:t>
-      </w:r>
-      <w:r>
-        <w:t xml:space="preserve"> </w:t>
-      </w:r>
-      <w:r>
-        <w:t xml:space="preserve">T ← RESOLVE(node)</w:t>
+        <w:t xml:space="preserve">else if</w:t>
+      </w:r>
+      <w:r>
+        <w:t xml:space="preserve"> </w:t>
+      </w:r>
+      <w:r>
+        <w:t xml:space="preserve">node's targets are known only at run time</w:t>
       </w:r>
       <w:r>
         <w:t xml:space="preserve"> </w:t>
@@ -8859,13 +9101,25 @@
           <w:b/>
           <w:bCs/>
         </w:rPr>
-        <w:t xml:space="preserve">if</w:t>
-      </w:r>
-      <w:r>
-        <w:t xml:space="preserve"> </w:t>
-      </w:r>
-      <w:r>
-        <w:t xml:space="preserve">T = ⊥</w:t>
+        <w:t xml:space="preserve">then</w:t>
+      </w:r>
+      <w:r>
+        <w:t xml:space="preserve"> </w:t>
+      </w:r>
+      <w:r>
+        <w:t xml:space="preserve">// find -delete or -exec, xargs, $( ),</w:t>
+      </w:r>
+      <w:r>
+        <w:t xml:space="preserve"> </w:t>
+      </w:r>
+      <w:r>
+        <w:t xml:space="preserve">// tar -x, unzip, rsync, git clean</w:t>
+      </w:r>
+      <w:r>
+        <w:t xml:space="preserve"> </w:t>
+      </w:r>
+      <w:r>
+        <w:t xml:space="preserve">T ← RESOLVE(node)</w:t>
       </w:r>
       <w:r>
         <w:t xml:space="preserve"> </w:t>
@@ -8875,13 +9129,13 @@
           <w:b/>
           <w:bCs/>
         </w:rPr>
-        <w:t xml:space="preserve">then return</w:t>
-      </w:r>
-      <w:r>
-        <w:t xml:space="preserve"> </w:t>
-      </w:r>
-      <w:r>
-        <w:t xml:space="preserve">{UNRESOLVED}</w:t>
+        <w:t xml:space="preserve">if</w:t>
+      </w:r>
+      <w:r>
+        <w:t xml:space="preserve"> </w:t>
+      </w:r>
+      <w:r>
+        <w:t xml:space="preserve">T = ⊥</w:t>
       </w:r>
       <w:r>
         <w:t xml:space="preserve"> </w:t>
@@ -8891,13 +9145,13 @@
           <w:b/>
           <w:bCs/>
         </w:rPr>
-        <w:t xml:space="preserve">return</w:t>
-      </w:r>
-      <w:r>
-        <w:t xml:space="preserve"> </w:t>
-      </w:r>
-      <w:r>
-        <w:t xml:space="preserve">∪ over t in T of EFFECTS(action[{} := t], wd, V)</w:t>
+        <w:t xml:space="preserve">then return</w:t>
+      </w:r>
+      <w:r>
+        <w:t xml:space="preserve"> </w:t>
+      </w:r>
+      <w:r>
+        <w:t xml:space="preserve">{UNRESOLVED}</w:t>
       </w:r>
       <w:r>
         <w:t xml:space="preserve"> </w:t>
@@ -8907,7 +9161,13 @@
           <w:b/>
           <w:bCs/>
         </w:rPr>
-        <w:t xml:space="preserve">end if</w:t>
+        <w:t xml:space="preserve">return</w:t>
+      </w:r>
+      <w:r>
+        <w:t xml:space="preserve"> </w:t>
+      </w:r>
+      <w:r>
+        <w:t xml:space="preserve">EFFECTS(node with its run-time targets bound to T, wd, V)</w:t>
       </w:r>
       <w:r>
         <w:t xml:space="preserve"> </w:t>
@@ -8917,7 +9177,7 @@
           <w:b/>
           <w:bCs/>
         </w:rPr>
-        <w:t xml:space="preserve">end function</w:t>
+        <w:t xml:space="preserve">end if</w:t>
       </w:r>
       <w:r>
         <w:t xml:space="preserve"> </w:t>
@@ -8927,25 +9187,7 @@
           <w:b/>
           <w:bCs/>
         </w:rPr>
-        <w:t xml:space="preserve">function</w:t>
-      </w:r>
-      <w:r>
-        <w:t xml:space="preserve"> </w:t>
-      </w:r>
-      <w:r>
-        <w:t xml:space="preserve">RESOLVE(node) // learns run-time targets, changing nothing</w:t>
-      </w:r>
-      <w:r>
-        <w:t xml:space="preserve"> </w:t>
-      </w:r>
-      <w:r>
-        <w:t xml:space="preserve">d ← DRYRUN(node) // find with actions replaced by prints; xargs' producer;</w:t>
-      </w:r>
-      <w:r>
-        <w:t xml:space="preserve"> </w:t>
-      </w:r>
-      <w:r>
-        <w:t xml:space="preserve">// git clean -n, tar -t, rsync -n; command substitutions</w:t>
+        <w:t xml:space="preserve">end function</w:t>
       </w:r>
       <w:r>
         <w:t xml:space="preserve"> </w:t>
@@ -8955,13 +9197,25 @@
           <w:b/>
           <w:bCs/>
         </w:rPr>
-        <w:t xml:space="preserve">if</w:t>
-      </w:r>
-      <w:r>
-        <w:t xml:space="preserve"> </w:t>
-      </w:r>
-      <w:r>
-        <w:t xml:space="preserve">EFFECTS(d) ≠ ∅</w:t>
+        <w:t xml:space="preserve">function</w:t>
+      </w:r>
+      <w:r>
+        <w:t xml:space="preserve"> </w:t>
+      </w:r>
+      <w:r>
+        <w:t xml:space="preserve">RESOLVE(node) // learns run-time targets, changing nothing</w:t>
+      </w:r>
+      <w:r>
+        <w:t xml:space="preserve"> </w:t>
+      </w:r>
+      <w:r>
+        <w:t xml:space="preserve">d ← DRYRUN(node) // find with actions replaced by prints; xargs' producer;</w:t>
+      </w:r>
+      <w:r>
+        <w:t xml:space="preserve"> </w:t>
+      </w:r>
+      <w:r>
+        <w:t xml:space="preserve">// git clean -n, tar -t, rsync -n; command substitutions</w:t>
       </w:r>
       <w:r>
         <w:t xml:space="preserve"> </w:t>
@@ -8971,13 +9225,13 @@
           <w:b/>
           <w:bCs/>
         </w:rPr>
-        <w:t xml:space="preserve">or</w:t>
-      </w:r>
-      <w:r>
-        <w:t xml:space="preserve"> </w:t>
-      </w:r>
-      <w:r>
-        <w:t xml:space="preserve">d cannot run</w:t>
+        <w:t xml:space="preserve">if</w:t>
+      </w:r>
+      <w:r>
+        <w:t xml:space="preserve"> </w:t>
+      </w:r>
+      <w:r>
+        <w:t xml:space="preserve">EFFECTS(d) has an effect other than a read</w:t>
       </w:r>
       <w:r>
         <w:t xml:space="preserve"> </w:t>
@@ -8987,13 +9241,13 @@
           <w:b/>
           <w:bCs/>
         </w:rPr>
-        <w:t xml:space="preserve">then return</w:t>
-      </w:r>
-      <w:r>
-        <w:t xml:space="preserve"> </w:t>
-      </w:r>
-      <w:r>
-        <w:t xml:space="preserve">⊥ // only a proven read-only d is run</w:t>
+        <w:t xml:space="preserve">or</w:t>
+      </w:r>
+      <w:r>
+        <w:t xml:space="preserve"> </w:t>
+      </w:r>
+      <w:r>
+        <w:t xml:space="preserve">d cannot run</w:t>
       </w:r>
       <w:r>
         <w:t xml:space="preserve"> </w:t>
@@ -9003,13 +9257,13 @@
           <w:b/>
           <w:bCs/>
         </w:rPr>
-        <w:t xml:space="preserve">return</w:t>
-      </w:r>
-      <w:r>
-        <w:t xml:space="preserve"> </w:t>
-      </w:r>
-      <w:r>
-        <w:t xml:space="preserve">the targets d prints</w:t>
+        <w:t xml:space="preserve">then return</w:t>
+      </w:r>
+      <w:r>
+        <w:t xml:space="preserve"> </w:t>
+      </w:r>
+      <w:r>
+        <w:t xml:space="preserve">⊥ // only a proven read-only d is run</w:t>
       </w:r>
       <w:r>
         <w:t xml:space="preserve"> </w:t>
@@ -9019,7 +9273,13 @@
           <w:b/>
           <w:bCs/>
         </w:rPr>
-        <w:t xml:space="preserve">end function</w:t>
+        <w:t xml:space="preserve">return</w:t>
+      </w:r>
+      <w:r>
+        <w:t xml:space="preserve"> </w:t>
+      </w:r>
+      <w:r>
+        <w:t xml:space="preserve">the targets d prints</w:t>
       </w:r>
       <w:r>
         <w:t xml:space="preserve"> </w:t>
@@ -9029,13 +9289,7 @@
           <w:b/>
           <w:bCs/>
         </w:rPr>
-        <w:t xml:space="preserve">function</w:t>
-      </w:r>
-      <w:r>
-        <w:t xml:space="preserve"> </w:t>
-      </w:r>
-      <w:r>
-        <w:t xml:space="preserve">VERDICT(E)</w:t>
+        <w:t xml:space="preserve">end function</w:t>
       </w:r>
       <w:r>
         <w:t xml:space="preserve"> </w:t>
@@ -9045,13 +9299,13 @@
           <w:b/>
           <w:bCs/>
         </w:rPr>
-        <w:t xml:space="preserve">if</w:t>
-      </w:r>
-      <w:r>
-        <w:t xml:space="preserve"> </w:t>
-      </w:r>
-      <w:r>
-        <w:t xml:space="preserve">UNRESOLVED ∈ E</w:t>
+        <w:t xml:space="preserve">function</w:t>
+      </w:r>
+      <w:r>
+        <w:t xml:space="preserve"> </w:t>
+      </w:r>
+      <w:r>
+        <w:t xml:space="preserve">VERDICT(E)</w:t>
       </w:r>
       <w:r>
         <w:t xml:space="preserve"> </w:t>
@@ -9061,13 +9315,13 @@
           <w:b/>
           <w:bCs/>
         </w:rPr>
-        <w:t xml:space="preserve">or</w:t>
-      </w:r>
-      <w:r>
-        <w:t xml:space="preserve"> </w:t>
-      </w:r>
-      <w:r>
-        <w:t xml:space="preserve">UNKNOWN ∈ E</w:t>
+        <w:t xml:space="preserve">if</w:t>
+      </w:r>
+      <w:r>
+        <w:t xml:space="preserve"> </w:t>
+      </w:r>
+      <w:r>
+        <w:t xml:space="preserve">UNRESOLVED ∈ E</w:t>
       </w:r>
       <w:r>
         <w:t xml:space="preserve"> </w:t>
@@ -9083,7 +9337,7 @@
         <w:t xml:space="preserve"> </w:t>
       </w:r>
       <w:r>
-        <w:t xml:space="preserve">some effect has no capture</w:t>
+        <w:t xml:space="preserve">UNKNOWN ∈ E</w:t>
       </w:r>
       <w:r>
         <w:t xml:space="preserve"> </w:t>
@@ -9093,13 +9347,13 @@
           <w:b/>
           <w:bCs/>
         </w:rPr>
-        <w:t xml:space="preserve">then return</w:t>
-      </w:r>
-      <w:r>
-        <w:t xml:space="preserve"> </w:t>
-      </w:r>
-      <w:r>
-        <w:t xml:space="preserve">UNRECOVERABLE</w:t>
+        <w:t xml:space="preserve">or</w:t>
+      </w:r>
+      <w:r>
+        <w:t xml:space="preserve"> </w:t>
+      </w:r>
+      <w:r>
+        <w:t xml:space="preserve">some effect has no capture</w:t>
       </w:r>
       <w:r>
         <w:t xml:space="preserve"> </w:t>
@@ -9109,13 +9363,13 @@
           <w:b/>
           <w:bCs/>
         </w:rPr>
-        <w:t xml:space="preserve">if</w:t>
-      </w:r>
-      <w:r>
-        <w:t xml:space="preserve"> </w:t>
-      </w:r>
-      <w:r>
-        <w:t xml:space="preserve">every effect in E is a create or a move</w:t>
+        <w:t xml:space="preserve">then return</w:t>
+      </w:r>
+      <w:r>
+        <w:t xml:space="preserve"> </w:t>
+      </w:r>
+      <w:r>
+        <w:t xml:space="preserve">UNRECOVERABLE</w:t>
       </w:r>
       <w:r>
         <w:t xml:space="preserve"> </w:t>
@@ -9125,13 +9379,13 @@
           <w:b/>
           <w:bCs/>
         </w:rPr>
-        <w:t xml:space="preserve">then return</w:t>
-      </w:r>
-      <w:r>
-        <w:t xml:space="preserve"> </w:t>
-      </w:r>
-      <w:r>
-        <w:t xml:space="preserve">RECOVERABLE</w:t>
+        <w:t xml:space="preserve">if</w:t>
+      </w:r>
+      <w:r>
+        <w:t xml:space="preserve"> </w:t>
+      </w:r>
+      <w:r>
+        <w:t xml:space="preserve">every effect in E is a read, a create, or a move</w:t>
       </w:r>
       <w:r>
         <w:t xml:space="preserve"> </w:t>
@@ -9141,13 +9395,13 @@
           <w:b/>
           <w:bCs/>
         </w:rPr>
-        <w:t xml:space="preserve">return</w:t>
-      </w:r>
-      <w:r>
-        <w:t xml:space="preserve"> </w:t>
-      </w:r>
-      <w:r>
-        <w:t xml:space="preserve">RECOVERABLE_WITH_CAPTURE</w:t>
+        <w:t xml:space="preserve">then return</w:t>
+      </w:r>
+      <w:r>
+        <w:t xml:space="preserve"> </w:t>
+      </w:r>
+      <w:r>
+        <w:t xml:space="preserve">RECOVERABLE</w:t>
       </w:r>
       <w:r>
         <w:t xml:space="preserve"> </w:t>
@@ -9157,7 +9411,13 @@
           <w:b/>
           <w:bCs/>
         </w:rPr>
-        <w:t xml:space="preserve">end function</w:t>
+        <w:t xml:space="preserve">return</w:t>
+      </w:r>
+      <w:r>
+        <w:t xml:space="preserve"> </w:t>
+      </w:r>
+      <w:r>
+        <w:t xml:space="preserve">RECOVERABLE_WITH_CAPTURE</w:t>
       </w:r>
       <w:r>
         <w:t xml:space="preserve"> </w:t>
@@ -9167,19 +9427,7 @@
           <w:b/>
           <w:bCs/>
         </w:rPr>
-        <w:t xml:space="preserve">function</w:t>
-      </w:r>
-      <w:r>
-        <w:t xml:space="preserve"> </w:t>
-      </w:r>
-      <w:r>
-        <w:t xml:space="preserve">PLAN(E, M)</w:t>
-      </w:r>
-      <w:r>
-        <w:t xml:space="preserve"> </w:t>
-      </w:r>
-      <w:r>
-        <w:t xml:space="preserve">P ← ∅</w:t>
+        <w:t xml:space="preserve">end function</w:t>
       </w:r>
       <w:r>
         <w:t xml:space="preserve"> </w:t>
@@ -9189,13 +9437,19 @@
           <w:b/>
           <w:bCs/>
         </w:rPr>
-        <w:t xml:space="preserve">for each</w:t>
-      </w:r>
-      <w:r>
-        <w:t xml:space="preserve"> </w:t>
-      </w:r>
-      <w:r>
-        <w:t xml:space="preserve">path p with a remove, write, or metadata effect in E, in path order</w:t>
+        <w:t xml:space="preserve">function</w:t>
+      </w:r>
+      <w:r>
+        <w:t xml:space="preserve"> </w:t>
+      </w:r>
+      <w:r>
+        <w:t xml:space="preserve">PLAN(E, M)</w:t>
+      </w:r>
+      <w:r>
+        <w:t xml:space="preserve"> </w:t>
+      </w:r>
+      <w:r>
+        <w:t xml:space="preserve">P ← ∅</w:t>
       </w:r>
       <w:r>
         <w:t xml:space="preserve"> </w:t>
@@ -9205,7 +9459,13 @@
           <w:b/>
           <w:bCs/>
         </w:rPr>
-        <w:t xml:space="preserve">do</w:t>
+        <w:t xml:space="preserve">for each</w:t>
+      </w:r>
+      <w:r>
+        <w:t xml:space="preserve"> </w:t>
+      </w:r>
+      <w:r>
+        <w:t xml:space="preserve">path p with a write, a metadata change, or a removal that is not a move, in path order</w:t>
       </w:r>
       <w:r>
         <w:t xml:space="preserve"> </w:t>
@@ -9215,13 +9475,7 @@
           <w:b/>
           <w:bCs/>
         </w:rPr>
-        <w:t xml:space="preserve">if</w:t>
-      </w:r>
-      <w:r>
-        <w:t xml:space="preserve"> </w:t>
-      </w:r>
-      <w:r>
-        <w:t xml:space="preserve">p lies under a directory already hardlinked in P</w:t>
+        <w:t xml:space="preserve">do</w:t>
       </w:r>
       <w:r>
         <w:t xml:space="preserve"> </w:t>
@@ -9231,25 +9485,13 @@
           <w:b/>
           <w:bCs/>
         </w:rPr>
-        <w:t xml:space="preserve">then continue</w:t>
-      </w:r>
-      <w:r>
-        <w:t xml:space="preserve"> </w:t>
-      </w:r>
-      <w:r>
-        <w:t xml:space="preserve">m* ← the cheapest mechanism in M that restores p's effect // hardlink for a removal,</w:t>
-      </w:r>
-      <w:r>
-        <w:t xml:space="preserve"> </w:t>
-      </w:r>
-      <w:r>
-        <w:t xml:space="preserve">// copy for an overwrite, record for a mode</w:t>
-      </w:r>
-      <w:r>
-        <w:t xml:space="preserve"> </w:t>
-      </w:r>
-      <w:r>
-        <w:t xml:space="preserve">P ← P ∪ {(m*, p)}</w:t>
+        <w:t xml:space="preserve">if</w:t>
+      </w:r>
+      <w:r>
+        <w:t xml:space="preserve"> </w:t>
+      </w:r>
+      <w:r>
+        <w:t xml:space="preserve">p lies under a directory already hardlinked in P</w:t>
       </w:r>
       <w:r>
         <w:t xml:space="preserve"> </w:t>
@@ -9259,7 +9501,25 @@
           <w:b/>
           <w:bCs/>
         </w:rPr>
-        <w:t xml:space="preserve">end for</w:t>
+        <w:t xml:space="preserve">then continue</w:t>
+      </w:r>
+      <w:r>
+        <w:t xml:space="preserve"> </w:t>
+      </w:r>
+      <w:r>
+        <w:t xml:space="preserve">m* ← the cheapest mechanism in M that restores p's effect // hardlink for a removal,</w:t>
+      </w:r>
+      <w:r>
+        <w:t xml:space="preserve"> </w:t>
+      </w:r>
+      <w:r>
+        <w:t xml:space="preserve">// copy for an overwrite, record for a mode</w:t>
+      </w:r>
+      <w:r>
+        <w:t xml:space="preserve"> </w:t>
+      </w:r>
+      <w:r>
+        <w:t xml:space="preserve">P ← P ∪ {(m*, p)}</w:t>
       </w:r>
       <w:r>
         <w:t xml:space="preserve"> </w:t>
@@ -9269,13 +9529,7 @@
           <w:b/>
           <w:bCs/>
         </w:rPr>
-        <w:t xml:space="preserve">return</w:t>
-      </w:r>
-      <w:r>
-        <w:t xml:space="preserve"> </w:t>
-      </w:r>
-      <w:r>
-        <w:t xml:space="preserve">P</w:t>
+        <w:t xml:space="preserve">end for</w:t>
       </w:r>
       <w:r>
         <w:t xml:space="preserve"> </w:t>
@@ -9285,25 +9539,57 @@
           <w:b/>
           <w:bCs/>
         </w:rPr>
-        <w:t xml:space="preserve">end function</w:t>
-      </w:r>
-    </w:p>
-    <w:p>
-      <w:pPr>
-        <w:pStyle w:val="BodyText"/>
-      </w:pPr>
+        <w:t xml:space="preserve">return</w:t>
+      </w:r>
+      <w:r>
+        <w:t xml:space="preserve"> </w:t>
+      </w:r>
+      <w:r>
+        <w:t xml:space="preserve">P</w:t>
+      </w:r>
+      <w:r>
+        <w:t xml:space="preserve"> </w:t>
+      </w:r>
       <w:r>
         <w:rPr>
           <w:b/>
           <w:bCs/>
         </w:rPr>
+        <w:t xml:space="preserve">end function</w:t>
+      </w:r>
+    </w:p>
+    <w:p>
+      <w:pPr>
+        <w:pStyle w:val="BodyText"/>
+      </w:pPr>
+      <w:r>
+        <w:rPr>
+          <w:b/>
+          <w:bCs/>
+        </w:rPr>
         <w:t xml:space="preserve">Algorithm 1.</w:t>
       </w:r>
       <w:r>
         <w:t xml:space="preserve"> </w:t>
       </w:r>
       <w:r>
-        <w:t xml:space="preserve">EFFECTS derives and composes the effect set, applying rules to the leaves and resolving wrappers through RESOLVE; RESOLVE learns run-time targets by running only a form of the command proven to have no effects; VERDICT and PLAN decide and cover.  UNRESOLVED and UNKNOWN are the sentinels that give the analysis its one-sided soundness: they can only push the verdict toward UNRECOVERABLE.  A move (a removal whose data survives at another path) is the only removal PLAN does not capture.</w:t>
+        <w:t xml:space="preserve">EFFECTS derives and composes the effect set: it applies rules to the leaves, analyzes wrappers,</w:t>
+      </w:r>
+      <w:r>
+        <w:t xml:space="preserve"> </w:t>
+      </w:r>
+      <w:r>
+        <w:rPr>
+          <w:i/>
+          <w:iCs/>
+        </w:rPr>
+        <w:t xml:space="preserve">sh -c</w:t>
+      </w:r>
+      <w:r>
+        <w:t xml:space="preserve"> </w:t>
+      </w:r>
+      <w:r>
+        <w:t xml:space="preserve">strings, and loops as the commands they run, and calls RESOLVE for targets known only at run time; RESOLVE learns run-time targets by running only a form of the command proven to have no effects; VERDICT and PLAN decide and cover.  UNRESOLVED and UNKNOWN are the sentinels that give the analysis its one-sided soundness: they can only push the verdict toward UNRECOVERABLE.  A move (a removal whose data survives at another path) is the only removal PLAN does not capture.</w:t>
       </w:r>
     </w:p>
     <w:bookmarkEnd w:id="98"/>
@@ -9360,7 +9646,7 @@
         <w:t xml:space="preserve"> </w:t>
       </w:r>
       <w:r>
-        <w:t xml:space="preserve">code-specialized model that demonstrated the strongest natural language-to-bash translation accuracy among models below 7B parameters in controlled evaluation [43].  Among the models directly compared in that evaluation, its code-specialized pretraining produced a clear margin over general-purpose models of comparable or larger size — 58% NL2Bash accuracy with prompt engineering, versus 49% for Llama 3.2-3B and 37% for a LoRA-fine-tuned Llama 3.2-1B — attributable to Qwen2.5-Coder’s training corpus of 5.5 trillion code tokens against Llama 3.2's general-purpose pretraining.  At 4-bit quantization</w:t>
+        <w:t xml:space="preserve">code-specialized model that demonstrated the strongest natural language-to-bash translation accuracy among models below 7B parameters in controlled evaluation [46].  Among the models directly compared in that evaluation, its code-specialized pretraining produced a clear margin over general-purpose models of comparable or larger size — 58% NL2Bash accuracy with prompt engineering, versus 49% for Llama 3.2-3B and 37% for a LoRA-fine-tuned Llama 3.2-1B — attributable to Qwen2.5-Coder’s training corpus of 5.5 trillion code tokens against Llama 3.2's general-purpose pretraining.  At 4-bit quantization</w:t>
       </w:r>
       <w:hyperlink w:anchor="ch3-fn6">
         <w:r>
@@ -9372,7 +9658,7 @@
         </w:r>
       </w:hyperlink>
       <w:r>
-        <w:t xml:space="preserve">, the model requires approximately 1.8 GB of memory and runs on the target Debian 13 (Trixie) hardware without a dedicated GPU.  The model will be fine-tuned via Low-Rank Adaptation (LoRA)</w:t>
+        <w:t xml:space="preserve">, the model requires approximately 1.8 GB of memory and runs on the target Debian 13 (Trixie) hardware without a dedicated GPU.  The model may be fine-tuned via Low-Rank Adaptation (LoRA)</w:t>
       </w:r>
       <w:hyperlink w:anchor="ch3-fn7">
         <w:r>
@@ -9402,23 +9688,23 @@
         <w:t xml:space="preserve"> </w:t>
       </w:r>
       <w:r>
-        <w:t xml:space="preserve">and a custom SynapseOS task suite to maximize intent parsing accuracy.</w:t>
-      </w:r>
-    </w:p>
-    <w:p>
-      <w:pPr>
-        <w:pStyle w:val="BodyText"/>
-      </w:pPr>
-      <w:r>
-        <w:t xml:space="preserve">Accuracy is measured using an execution-based scoring methodology rather than syntax-level string matching, following Westenfelder et al. [43] — see Section 2.3 for the full evaluation procedure.</w:t>
-      </w:r>
-    </w:p>
-    <w:p>
-      <w:pPr>
-        <w:pStyle w:val="BodyText"/>
-      </w:pPr>
-      <w:r>
-        <w:t xml:space="preserve">This selection was reconfirmed against models released after the initial literature review, to guard against the fast-moving small-model landscape becoming stale before study execution; no smaller alternative offered comparable shell-generation evidence within the same CPU-only hardware budget [17].  Newer mixture-of-experts variants require all experts resident in memory regardless of active parameters per token, which is incompatible with this study’s memory budget, and newer general-purpose small models report reasoning benchmarks but no shell-command generation evidence.</w:t>
+        <w:t xml:space="preserve">and a custom SynapseOS task suite to improve intent parsing.  If it is, every NL2Bash item in the evaluation corpus, and every description used for the model-generated partition, is excluded from the fine-tuning data, and the model-generated partition is regenerated with the fine-tuned model, so that the analysis is never scored on commands the model was trained to reproduce.</w:t>
+      </w:r>
+    </w:p>
+    <w:p>
+      <w:pPr>
+        <w:pStyle w:val="BodyText"/>
+      </w:pPr>
+      <w:r>
+        <w:t xml:space="preserve">Accuracy is measured using an execution-based scoring methodology rather than syntax-level string matching, following Westenfelder et al. [46] — see Section 2.3 for the full evaluation procedure.</w:t>
+      </w:r>
+    </w:p>
+    <w:p>
+      <w:pPr>
+        <w:pStyle w:val="BodyText"/>
+      </w:pPr>
+      <w:r>
+        <w:t xml:space="preserve">This selection was reconfirmed against models released after the initial literature review, to guard against the fast-moving small-model landscape becoming stale before study execution; no smaller alternative offered comparable shell-generation evidence within the same CPU-only hardware budget [18].  Newer mixture-of-experts variants require all experts resident in memory regardless of active parameters per token, which is incompatible with this study’s memory budget, and newer general-purpose small models report reasoning benchmarks but no shell-command generation evidence.</w:t>
       </w:r>
     </w:p>
     <w:bookmarkEnd w:id="99"/>
@@ -9436,15 +9722,47 @@
         <w:pStyle w:val="FirstParagraph"/>
       </w:pPr>
       <w:r>
-        <w:t xml:space="preserve">Once the intent parser produces a shell command, SynapseOS passes it through a confirmation gate and an undo journal before execution, following the reversibility-and-guardrail framing established for LLM-powered natural language shells [11] and the preview-and-confirm design guideline validated with motor-impaired users of an LLM-mediated assistive-robotics interface [30].  The command is first classified by reversibility: operations that are irreversible — such as file deletion, system configuration changes, or destructive package operations — trigger a confirmation prompt requiring explicit user approval before execution proceeds.  Every executed command is recorded to a persistent undo journal before it runs.  Reversible operations are logged for replay-based reversal; a command classified irreversible and then approved is additionally captured by one of five mechanisms — full content backup, hardlink-based trash, git HEAD capture, permission-metadata capture, or, for package and service state, an inverse command — so that a command approved in error remains recoverable.  With the analysis enabled, the gate consumes the analysis’s verdict, and the captures taken are those its plan names, (a) to (c), rather than the list’s.  Rollback is invoked through a dedicated undo command rather than from within the conversation.  Once the gate has passed it, the command is dispatched to a bash subprocess.  Standard output and standard error are captured and rendered in the conversational surface as the system’s response to the original natural language input.</w:t>
-      </w:r>
-    </w:p>
-    <w:p>
-      <w:pPr>
-        <w:pStyle w:val="BodyText"/>
-      </w:pPr>
-      <w:r>
-        <w:t xml:space="preserve">SynapseOS executes only shell-expressible operations.  The system’s capability boundary is the Linux command-line toolchain: file management, process control, text processing, package management, network configuration, and any application that exposes a command-line interface.  GUI-only interactions — clicking buttons in graphical applications, navigating web page elements, or interacting with visual-only interfaces — are explicitly outside scope, in deliberate contrast to broader desktop agent frameworks that additionally orchestrate GUI automation atop the existing session [50].  This boundary is intentional: it constrains the research to a tractable, verifiable claim that the system can be built, evaluated, and defended within the thesis timeline.</w:t>
+        <w:t xml:space="preserve">Once the intent parser produces a shell command, SynapseOS passes it through a confirmation gate and an undo journal before execution, following the reversibility-and-guardrail framing established for LLM-powered natural language shells [12] and the preview-and-confirm design guideline validated with motor-impaired users of an LLM-mediated assistive-robotics interface [32].  The gate acts on the analysis’s verdict under one of two policies.  Under the</w:t>
+      </w:r>
+      <w:r>
+        <w:t xml:space="preserve"> </w:t>
+      </w:r>
+      <w:r>
+        <w:rPr>
+          <w:i/>
+          <w:iCs/>
+        </w:rPr>
+        <w:t xml:space="preserve">strict</w:t>
+      </w:r>
+      <w:r>
+        <w:t xml:space="preserve"> </w:t>
+      </w:r>
+      <w:r>
+        <w:t xml:space="preserve">policy, the default, it asks before every command whose verdict is not plainly recoverable, that is, before every command that is recoverable only with capture or unrecoverable, and on approval takes the captures the plan names before the command runs.  Under the</w:t>
+      </w:r>
+      <w:r>
+        <w:t xml:space="preserve"> </w:t>
+      </w:r>
+      <w:r>
+        <w:rPr>
+          <w:i/>
+          <w:iCs/>
+        </w:rPr>
+        <w:t xml:space="preserve">capture</w:t>
+      </w:r>
+      <w:r>
+        <w:t xml:space="preserve"> </w:t>
+      </w:r>
+      <w:r>
+        <w:t xml:space="preserve">policy it asks only before unrecoverable commands, and takes the plan’s captures for the rest without asking.  Under either policy the enumerated-pattern list is still consulted, and a command it flags also asks, so the list can add a confirmation but never remove one.  With the analysis disabled, the gate falls back to the list alone.  Captures use five mechanisms — full content backup, hardlink-based trash, git HEAD capture, permission-metadata capture, or, for package and service state, an inverse command — and are recorded to a persistent undo journal before the command runs, so that a command approved in error remains recoverable.  Rollback is invoked through a dedicated undo command rather than from within the conversation.  Once the gate has passed it, the command is dispatched to a bash subprocess.  Standard output and standard error are captured and rendered in the conversational surface as the system’s response to the original natural language input.</w:t>
+      </w:r>
+    </w:p>
+    <w:p>
+      <w:pPr>
+        <w:pStyle w:val="BodyText"/>
+      </w:pPr>
+      <w:r>
+        <w:t xml:space="preserve">SynapseOS executes only shell-expressible operations.  The system’s capability boundary is the Linux command-line toolchain: file management, process control, text processing, package management, network configuration, and any application that exposes a command-line interface.  GUI-only interactions — clicking buttons in graphical applications, navigating web page elements, or interacting with visual-only interfaces — are explicitly outside scope, in deliberate contrast to broader desktop agent frameworks that additionally orchestrate GUI automation atop the existing session [53].  This boundary is intentional: it constrains the research to a tractable, verifiable claim that the system can be built, evaluated, and defended within the thesis timeline.</w:t>
       </w:r>
     </w:p>
     <w:bookmarkEnd w:id="100"/>
@@ -9635,7 +9953,7 @@
         <w:t xml:space="preserve"> </w:t>
       </w:r>
       <w:r>
-        <w:t xml:space="preserve">evaluated using an execution-based scoring methodology [43] — each generated command is executed in a controlled environment and its resulting system state compared against a human-annotated expected outcome for each task utterance, rather than syntax-level string matching, with ambiguous cases resolved through LLM-assisted functional equivalence assessment at 95% confidence; accuracy is computed as the proportion of first-attempt matches</w:t>
+        <w:t xml:space="preserve">evaluated using an execution-based scoring methodology [46] — each generated command is executed in a controlled environment and its resulting system state compared against a human-annotated expected outcome for each task utterance, rather than syntax-level string matching, with ambiguous cases resolved through LLM-assisted functional equivalence assessment at 95% confidence; accuracy is computed as the proportion of first-attempt matches</w:t>
       </w:r>
     </w:p>
     <w:p>
@@ -9657,7 +9975,7 @@
         <w:t xml:space="preserve"> </w:t>
       </w:r>
       <w:r>
-        <w:t xml:space="preserve">evaluated by verifying that all irreversible operations in the task set trigger the confirmation prompt as designed, and that no irreversible operations execute without user approval</w:t>
+        <w:t xml:space="preserve">evaluated by verifying that every command in the task set that the analysis judges unrecoverable, and under the strict policy every command it judges recoverable only with capture, triggers the confirmation prompt, and that no such command executes without user approval</w:t>
       </w:r>
     </w:p>
     <w:p>
@@ -10155,7 +10473,7 @@
         <w:pStyle w:val="BodyText"/>
       </w:pPr>
       <w:r>
-        <w:t xml:space="preserve">Because the first baseline was written by the same team, it was checked against command-safety checks that others ship.  Two open-source checks were scored on the same held-out corpus and labels reported in (d) below: the dangerous-command check of OpenAI’s Codex CLI [29], ported from its source and verified against that source’s own unit tests, and cc-safety-net [19], a pre-execution guard used with several agentic coding tools, run unmodified under each of its three presets.  On the 325 commands that destroy files, they let between 73% and 97% run with no confirmation and no capture, against 31% for the enumerated-pattern classifier, and neither makes any provision for recovery.  Both are designed for coding agents working inside a version-controlled project, where deleting project files is routine and version control is the safeguard, so these figures describe how they would serve a person’s own files, not how well they serve their intended purpose.  The first baseline is therefore the strictest enumerated list tested, and comparisons against it understate rather than overstate the analysis’s advantage over lists in current use.  No shipping tool was found that determines a command’s effects before it runs in order to capture what it would destroy; on recovery there is no external counterpart, which is the gap identified in Chapter 2, Section 2.5.  The comparison is provided as supplementary material.</w:t>
+        <w:t xml:space="preserve">Because the first baseline was written by the same team, it was checked against command-safety checks that others ship.  Two open-source checks were scored on the same held-out corpus and labels reported in (d) below: the dangerous-command check of OpenAI’s Codex CLI [31], ported from its source and verified against that source’s own unit tests, and cc-safety-net [20], a pre-execution guard used with several agentic coding tools, run unmodified under each of its three presets.  On the 325 commands that destroy files, they let between 73% and 97% run with no confirmation and no capture, against 31% for the enumerated-pattern classifier, and neither makes any provision for recovery.  Both are designed for coding agents working inside a version-controlled project, where deleting project files is routine and version control is the safeguard, so these figures describe how they would serve a person’s own files, not how well they serve their intended purpose.  The first baseline is therefore the strictest enumerated list tested, and comparisons against it understate rather than overstate the analysis’s advantage over lists in current use.  No shipping tool was found that determines a command’s effects before it runs in order to capture what it would destroy; on recovery there is no external counterpart, which is the gap identified in Chapter 2, Section 2.5.  The comparison is provided as supplementary material.</w:t>
       </w:r>
     </w:p>
     <w:bookmarkEnd w:id="107"/>
@@ -10478,15 +10796,15 @@
         <w:pStyle w:val="FirstParagraph"/>
       </w:pPr>
       <w:r>
-        <w:t xml:space="preserve">The algorithm and the pattern-list baseline are both scored against the same labeled corpus, which makes this a paired rather than an independent-samples comparison: for every command, each method’s verdict is either correct or incorrect against the ground-truth label, and the two methods' correctness on that one command is not independent of each other.  Significance is therefore tested with McNemar’s exact test on the resulting 2×2 table of discordant pairs — commands the algorithm gets right and the baseline gets wrong, and the reverse — at α = 0.05, rather than with a two-sample test that would treat the corpus as though two different sets of commands had been drawn.</w:t>
-      </w:r>
-    </w:p>
-    <w:p>
-      <w:pPr>
-        <w:pStyle w:val="BodyText"/>
-      </w:pPr>
-      <w:r>
-        <w:t xml:space="preserve">Because false-negative rate is the safety metric (Table 3.3) and is reported on its own rather than folded into overall accuracy, it receives its own comparison: McNemar’s test restricted to the subset of the corpus that carries a loss (labeled recoverable-with-capture, or external), where a false negative is defined, plus a 95% Wilson confidence interval on each method’s false-negative rate individually.  The Wilson interval is used rather than the normal approximation because false-negative rate is expected to be low for both methods, and the normal approximation is unreliable near the boundary of a proportion — the exact regime this metric sits in.</w:t>
+        <w:t xml:space="preserve">The analysis and each baseline are scored against the same labeled corpus, which makes every comparison paired rather than independent: for each command, each system either lets it run silently or does not, and either covers a loss or does not, and two systems’ outcomes on that one command are not independent of each other.  Significance is therefore tested with McNemar’s exact test on the resulting 2×2 table of discordant pairs — commands one system handles correctly and the other does not — at α = 0.05, rather than with a two-sample test that would treat the corpus as though two different sets of commands had been drawn.</w:t>
+      </w:r>
+    </w:p>
+    <w:p>
+      <w:pPr>
+        <w:pStyle w:val="BodyText"/>
+      </w:pPr>
+      <w:r>
+        <w:t xml:space="preserve">Silent loss is the safety measure (Table 3.3) and is reported on its own rather than folded into an accuracy figure: it is tested over the 405 commands that lose something or act outside the filesystem, the only commands on which it is defined, with a 95% Wilson confidence interval on each system’s rate; capture coverage is tested over the 325 executable losses.  For the analysis, the false-negative rate of Table 3.3 coincides with silent loss, because a command it judges recoverable runs without being asked about.  The Wilson interval is used rather than the normal approximation because silent loss is expected to be low for the stronger systems, and the normal approximation is unreliable near the boundary of a proportion — the exact regime this metric sits in.</w:t>
       </w:r>
     </w:p>
     <w:p>
@@ -10507,7 +10825,7 @@
         <w:t xml:space="preserve">risk difference</w:t>
       </w:r>
       <w:r>
-        <w:t xml:space="preserve">: the algorithm’s accuracy minus the baseline’s, with a Newcombe-adjusted 95% confidence interval built for paired proportions, reported for overall verdict accuracy and again for the false-negative-rate comparison specifically.  The</w:t>
+        <w:t xml:space="preserve">: the algorithm’s accuracy minus the baseline’s, with a Newcombe-adjusted 95% confidence interval built for paired proportions, reported for silent loss and for capture coverage.  The</w:t>
       </w:r>
       <w:r>
         <w:t xml:space="preserve"> </w:t>
@@ -10531,7 +10849,7 @@
         <w:pStyle w:val="BodyText"/>
       </w:pPr>
       <w:r>
-        <w:t xml:space="preserve">With three baselines and two primary metrics, the comparisons that carry a claim are the analysis against each of the first two baselines on silent loss and on capture coverage.  Four tests share one family, so significance is judged with a Holm correction at a family-wise α = 0.05, and the uncorrected values are reported beside the corrected ones.  The full-snapshot baseline is a bound on cost and safety, not a comparison of accuracy, and is reported descriptively.</w:t>
+        <w:t xml:space="preserve">With three baselines and two primary metrics, the comparisons that carry a claim are the analysis against each of the first two baselines on silent loss and on capture coverage.  Four tests share one family, so significance is judged with a Holm correction at a family-wise α = 0.05, and the uncorrected values are reported beside the corrected ones.  The full-snapshot baseline is a bound on cost and safety, not a comparison of accuracy, and is reported descriptively.  The remaining metrics of Table 3.3 are reported where they arise: needless confirmation, the false-positive rate, in (d) and Section 3.2; recovery success as the share of executed commands the undo restored exactly, in (d); storage overhead from the recovery check, where the median capture over the 304 commands that captured anything was 0% of a full copy of the fixture, because most captures are hardlinks; time overhead against the snapshot baseline in (a); and composition coverage through the ablations in Section 3.2.</w:t>
       </w:r>
     </w:p>
     <w:bookmarkEnd w:id="109"/>
@@ -10549,7 +10867,7 @@
         <w:pStyle w:val="FirstParagraph"/>
       </w:pPr>
       <w:r>
-        <w:t xml:space="preserve">The procedure above has been run on the prototype, so that the proposal rests on a measurement and not only on a design.  Four corpora were generated from different seeds, each drawn after fixing what the recovery check on the one before it exposed: development (778 commands, seed 20260922), a round that drove the recovery check and led to fixing two undo defects (772 commands, seed 20260923), a round whose recovery check found five further undo defects — a hard link left in place after it should have been removed, the backup files</w:t>
+        <w:t xml:space="preserve">The procedure above has been run on the prototype, so that the proposal rests on a measurement and not only on a design.  Four corpora were generated from different seeds, numbered rounds 4 to 7 after the prototype’s earlier evaluation rounds, each drawn after fixing what the recovery check on the one before it exposed: development (round 4: 778 commands, seed 20260922), a round that drove the recovery check and led to fixing two undo defects (round 5: 772 commands, seed 20260923), a round whose recovery check found five further undo defects — a hard link left in place after it should have been removed, the backup files</w:t>
       </w:r>
       <w:r>
         <w:t xml:space="preserve"> </w:t>
@@ -10610,15 +10928,15 @@
         <w:t xml:space="preserve"> </w:t>
       </w:r>
       <w:r>
-        <w:t xml:space="preserve">that this was the first corpus to exercise — and fixing them (776 commands, seed 20260924), and the corpus reported below (777 commands, seed 20260925: 450 from NL2Bash, 247 from templates, 80 external; 325 executable losses), drawn after the analysis and the undo were both frozen, with the analyzer’s hash and the corpus’s hash recorded, and run once.  The figures below are from that corpus; the earlier three are development corpora.  Testing after this run, by rule-by-rule unit tests, a property test, and mutation testing, found four further defects in the analyzer, none of them exercised by any command in this corpus; they have been fixed, and re-running the corpus with the fixed analyzer changed none of its 3,885 decisions (777 commands under each of five configurations).</w:t>
-      </w:r>
-    </w:p>
-    <w:p>
-      <w:pPr>
-        <w:pStyle w:val="BodyText"/>
-      </w:pPr>
-      <w:r>
-        <w:t xml:space="preserve">On it the enumerated-pattern classifier let 167 of the 405 commands that lose something or act outside the filesystem run with no confirmation and no capture (41.2%, 95% Wilson interval 36.5–46.1%).  Neither the fail-closed list nor the effect analysis let any through (0.0%, interval 0.0–0.9%).  The fail-closed list asked on every one of the 325 executable losses and captured nothing for any of them, and asked on 101 of the 372 commands that lose nothing (27%).  The analysis asked on 45 of those 372 under the strict policy (12%) and 32 under the capture policy (9%); the pattern list asked on 30 (8%).</w:t>
+        <w:t xml:space="preserve">that this was the first corpus to exercise — and fixing them (round 6: 776 commands, seed 20260924), and the corpus reported below (round 7: 777 commands, seed 20260925: 450 from NL2Bash, 247 from templates, 80 external; 325 executable losses), drawn after the analysis and the undo were both frozen, with the analyzer’s hash and the corpus’s hash recorded, and run once.  The figures below are from that corpus; the earlier three are development corpora.  Testing after this run, by rule-by-rule unit tests, a property test, and two rounds of mutation testing, found five further defects in the analyzer, none of them exercised by any command in this corpus; they have been fixed, and re-running the corpus with the fixed analyzer changed none of its 3,885 decisions (777 commands under each of five configurations).</w:t>
+      </w:r>
+    </w:p>
+    <w:p>
+      <w:pPr>
+        <w:pStyle w:val="BodyText"/>
+      </w:pPr>
+      <w:r>
+        <w:t xml:space="preserve">On it the enumerated-pattern classifier let 167 of the 405 commands that lose something or act outside the filesystem run with no confirmation and no capture (41.2%, 95% Wilson interval 36.5–46.1%).  Neither the fail-closed list nor the effect analysis let any through (0.0%, interval 0.0–0.9%).  The fail-closed list asked on every one of the 325 executable losses and captured nothing for any of them, and asked on 101 of the 372 commands that lose nothing (27%).  The analysis asked on 45 of those 372 under the strict policy (12%) and 32 under the capture policy (9%); the pattern list asked on 30 (8%).  Capture coverage below is the same under both policies, which differ only in whether the user is asked; the ablations in Section 3.2 are read under the capture policy.</w:t>
       </w:r>
     </w:p>
     <w:p>
@@ -10649,6 +10967,14 @@
       </w:r>
       <w:r>
         <w:t xml:space="preserve">).</w:t>
+      </w:r>
+    </w:p>
+    <w:p>
+      <w:pPr>
+        <w:pStyle w:val="BodyText"/>
+      </w:pPr>
+      <w:r>
+        <w:t xml:space="preserve">The pooled figures hold within each partition.  On the 150 losses among the human-written NL2Bash commands the analysis let none through silently and covered 133 (88.7%); on the 175 among the templates, written by the same team as its rule table, it let none through and covered 158 (90.3%).  The pattern list let 40% of the NL2Bash losses, 23% of the template losses, and 84% of the 80 external commands run silently.  Under the capture policy the analysis asked needlessly on 8% of the harmless NL2Bash commands and 10% of the harmless templates.  The same figures for every system, and for each command shape, are provided as supplementary material.</w:t>
       </w:r>
     </w:p>
     <w:p>
@@ -11096,15 +11422,15 @@
         <w:pStyle w:val="BodyText"/>
       </w:pPr>
       <w:r>
-        <w:t xml:space="preserve">The pattern is the one the design predicted.  The analysis differs from the pattern list in silent loss and in capture, and differs from the fail-closed list only in capture: on silent loss the two are indistinguishable at zero, which is the finding that the verdict is not the contribution and that what the analysis adds is a capture that works.  It does this at a cost in friction, asking on 12% of harmless commands where the pattern list asked on 8%.</w:t>
-      </w:r>
-    </w:p>
-    <w:p>
-      <w:pPr>
-        <w:pStyle w:val="BodyText"/>
-      </w:pPr>
-      <w:r>
-        <w:t xml:space="preserve">On the model-generated partition the results have the same shape but rest on few losses, and on an earlier version of the analyser: this partition was generated against the analyser as it stood after round 6, one round before the five undo fixes above, and was not regenerated against the final one for this draft, so its numbers should be read as indicative rather than as part of the reported result.  The deployed 3B model was asked for a command for each of 350 randomly drawn NL2Bash descriptions.  Of the commands it returned, 165 ran cleanly and were labeled, 15 were external, and the rest were excluded because they exited non-zero, timed out, needed a program that is not installed, or wrote outside the fixture.  Only 19 of the 165 lost anything: the model’s commands are mostly read-only.  On those, and the 15 external ones (34 in all), the pattern list let 20 through silently (58.8%, interval 42.2–73.6%) and the fail-closed list and the analysis one each (2.9%, 0.5–14.9%), a listing this partition’s own external-partition rule mislabeled as device access, the same mistake noted for round 6.  The analysis planned a capture that the undo then restored exactly for 17 of the 19 losses (89.5%, 68.6–97.1%), against 10 for the pattern list (52.6%, 31.7–72.7%) and none for the fail-closed list; the undo restored all 149 executed commands.  With 19 losses the intervals are wide, and the comparison of coverage against the pattern list is not significant after correction (Holm-adjusted p = 0.13); the other three comparisons agree with the larger corpus (adjusted p = 1.5×10</w:t>
+        <w:t xml:space="preserve">The pattern is the one the design predicted.  The analysis differs from the pattern list in silent loss and in capture, and differs from the fail-closed list only in capture: on silent loss the two are indistinguishable at zero, which is the finding that the verdict is not the contribution and that what the analysis adds is a capture that works.  It does this at a cost in friction, asking on 12% of harmless commands under the strict policy and 9% under the capture policy, where the pattern list asked on 8% and the fail-closed list on 27%.</w:t>
+      </w:r>
+    </w:p>
+    <w:p>
+      <w:pPr>
+        <w:pStyle w:val="BodyText"/>
+      </w:pPr>
+      <w:r>
+        <w:t xml:space="preserve">On the model-generated partition the results have the same shape but rest on few losses, and on an earlier version of the analyser: this partition was generated against the analyser as it stood after round 6, the third corpus above, one round before the five undo fixes above, and was not regenerated against the final one for this draft, so its numbers should be read as indicative rather than as part of the reported result.  The deployed 3B model was asked for a command for each of 350 randomly drawn NL2Bash descriptions.  Of the commands it returned, 165 ran cleanly and were labeled, 15 were external, and the rest were excluded because they exited non-zero, timed out, needed a program that is not installed, or wrote outside the fixture.  Only 19 of the 165 lost anything: the model’s commands are mostly read-only.  On those, and the 15 external ones (34 in all), the pattern list let 20 through silently (58.8%, interval 42.2–73.6%) and the fail-closed list and the analysis one each (2.9%, 0.5–14.9%), a listing this partition’s own external-partition rule mislabeled as device access.  The analysis planned a capture that the undo then restored exactly for 17 of the 19 losses (89.5%, 68.6–97.1%), against 10 for the pattern list (52.6%, 31.7–72.7%) and none for the fail-closed list; the undo restored all 149 executed commands.  With 19 losses the intervals are wide, and the comparison of coverage against the pattern list is not significant after correction (Holm-adjusted p = 0.13); the other three comparisons agree with the larger corpus (adjusted p = 1.5×10</w:t>
       </w:r>
       <w:r>
         <w:rPr>
@@ -12170,7 +12496,7 @@
         <w:pStyle w:val="FirstParagraph"/>
       </w:pPr>
       <w:r>
-        <w:t xml:space="preserve">Sections 3.3 to 3.7 define the validation study, in which the analysis is deployed in SynapseOS and exercised by participants.  It exercises the platform on two task datasets: the OSWorld benchmark task suite [46] for direct comparison with results in the existing literature, and the custom cross-platform task suite described in Sections 1.1 and 1.5.  The user study evaluation involves 40 participants (20 novice, 20 power users); the baseline condition is each participant’s primary operating system — Windows 11, macOS, or Linux with GNOME desktop — on a dedicated baseline machine.</w:t>
+        <w:t xml:space="preserve">Sections 3.3 to 3.7 define the validation study, in which the analysis is deployed in SynapseOS and exercised by participants.  It exercises the platform on two task datasets: the OSWorld benchmark task suite [49] for direct comparison with results in the existing literature, and the custom cross-platform task suite described in Sections 1.1 and 1.5.  The user study evaluation involves 40 participants (20 novice, 20 power users); the baseline condition is each participant’s primary operating system — Windows 11, macOS, or Linux with GNOME desktop — on a dedicated baseline machine.</w:t>
       </w:r>
     </w:p>
     <w:bookmarkEnd w:id="114"/>
@@ -12309,15 +12635,15 @@
         <w:pStyle w:val="BodyText"/>
       </w:pPr>
       <w:r>
-        <w:t xml:space="preserve">Error Rate = (Failed Tasks + Incorrect Outcomes) / Total Task Attempts</w:t>
-      </w:r>
-    </w:p>
-    <w:p>
-      <w:pPr>
-        <w:pStyle w:val="BodyText"/>
-      </w:pPr>
-      <w:r>
-        <w:t xml:space="preserve">Error events are further categorized by type: intent parsing errors (incorrect bash command generated), execution errors (bash subprocess failure), and recovery failures (unsuccessful undo or retry).  The same paired statistical test is applied to error rate differences between conditions.</w:t>
+        <w:t xml:space="preserve">Error Rate = (Failed Tasks + Incorrect Outcomes) / Tasks Presented</w:t>
+      </w:r>
+    </w:p>
+    <w:p>
+      <w:pPr>
+        <w:pStyle w:val="BodyText"/>
+      </w:pPr>
+      <w:r>
+        <w:t xml:space="preserve">Error events are further categorized by type: intent parsing errors (incorrect bash command generated), execution errors (bash subprocess failure), and recovery failures (an undo that does not restore the prior state).  Retries are recorded separately as attempts and do not change the rate, whose denominator is the number of tasks presented, not attempted (Section 2.2).  The same paired statistical test is applied to error rate differences between conditions.</w:t>
       </w:r>
     </w:p>
     <w:bookmarkEnd w:id="117"/>
@@ -12335,7 +12661,7 @@
         <w:pStyle w:val="FirstParagraph"/>
       </w:pPr>
       <w:r>
-        <w:t xml:space="preserve">SUS scores are computed per the standard scoring procedure [3] to produce a score on a 0–100 scale; a score above 68 is conventionally treated as above-average usability, a benchmark drawn from scores across a large sample of studies [36].  NASA-TLX scores are computed as the unweighted mean of the six subscale ratings [13] to produce a composite workload score per participant per condition.  Because a conversational interface is meant to widen access rather than only to save time, workload and task success are weighted alongside completion time among the platform measures, not treated as secondary to it.</w:t>
+        <w:t xml:space="preserve">SUS scores are computed per the standard scoring procedure [4] to produce a score on a 0–100 scale; a score above 68 is conventionally treated as above-average usability, a benchmark drawn from scores across a large sample of studies [39].  NASA-TLX scores are computed as the unweighted mean of the six subscale ratings [14] to produce a composite workload score per participant per condition.  Because a conversational interface is meant to widen access rather than only to save time, workload and task success are weighted alongside completion time among the platform measures, not treated as secondary to it.</w:t>
       </w:r>
     </w:p>
     <w:p>
@@ -12535,15 +12861,15 @@
         <w:pStyle w:val="BodyText"/>
       </w:pPr>
       <w:r>
-        <w:t xml:space="preserve">Subgroup analysis is conducted separately for the novice and power user groups to determine whether the effect of the interface condition differs across populations.  The interaction between interface condition and user group is examined to assess whether SynapseOS produces differential effects depending on technical background.</w:t>
-      </w:r>
-    </w:p>
-    <w:p>
-      <w:pPr>
-        <w:pStyle w:val="BodyText"/>
-      </w:pPr>
-      <w:r>
-        <w:t xml:space="preserve">Qualitative data from post-study interviews is analyzed using reflexive thematic analysis following the six-phase procedure described by Braun and Clarke [2]: familiarization with the data, initial code generation, theme search, theme review, theme definition, and write-up.  In keeping with the reflexive approach, which treats the analyst’s interpretation as part of the method and does not compute inter-rater agreement, one member of the research team develops the codes and themes; the codebook and the excerpts that support each theme are retained so that the analysis can be audited.  Themes are reported alongside representative participant quotations.</w:t>
+        <w:t xml:space="preserve">Subgroup analysis is conducted separately for the novice and power user groups to determine whether the effect of the interface condition differs across populations.  The interaction between interface condition and user group is examined to assess whether SynapseOS produces differential effects depending on technical background.  Because condition order and task form are crossed between subjects (Section 1.2(d)), condition, group, and order are modeled together in a linear mixed-effects model with a random intercept for each participant, from which the condition × group and condition × order interactions are read; the paired tests above serve as the per-comparison checks.</w:t>
+      </w:r>
+    </w:p>
+    <w:p>
+      <w:pPr>
+        <w:pStyle w:val="BodyText"/>
+      </w:pPr>
+      <w:r>
+        <w:t xml:space="preserve">Qualitative data from post-study interviews is analyzed using reflexive thematic analysis following the six-phase procedure described by Braun and Clarke [3]: familiarization with the data, initial code generation, theme search, theme review, theme definition, and write-up.  In keeping with the reflexive approach, which treats the analyst’s interpretation as part of the method and does not compute inter-rater agreement, one member of the research team develops the codes and themes; the codebook and the excerpts that support each theme are retained so that the analysis can be audited.  Themes are reported alongside representative participant quotations.</w:t>
       </w:r>
     </w:p>
     <w:bookmarkEnd w:id="122"/>
@@ -13008,6 +13334,17 @@
         <w:t xml:space="preserve">[1]</w:t>
       </w:r>
       <w:r>
+        <w:t xml:space="preserve">Alibaba Cloud. 2026. Alibaba Cloud Linux 4 Agentic Edition (ANOLISA): Product overview. Product documentation. https://help.aliyun.com/en/alinux/agentic-os Accessed 12 October 2026.</w:t>
+      </w:r>
+    </w:p>
+    <w:p>
+      <w:pPr>
+        <w:pStyle w:val="BodyText"/>
+      </w:pPr>
+      <w:r>
+        <w:t xml:space="preserve">[2]</w:t>
+      </w:r>
+      <w:r>
         <w:t xml:space="preserve">B. Becker, N. Jeannerod, C. Marché, Y. Régis-Gianas, M. Sighireanu, and R. Treinen. 2022. The CoLiS platform for the analysis of maintainer scripts in Debian software packages.</w:t>
       </w:r>
       <w:r>
@@ -13032,7 +13369,7 @@
         <w:pStyle w:val="BodyText"/>
       </w:pPr>
       <w:r>
-        <w:t xml:space="preserve">[2]</w:t>
+        <w:t xml:space="preserve">[3]</w:t>
       </w:r>
       <w:r>
         <w:t xml:space="preserve">V. Braun and V. Clarke. 2006. Using thematic analysis in psychology.</w:t>
@@ -13059,7 +13396,7 @@
         <w:pStyle w:val="BodyText"/>
       </w:pPr>
       <w:r>
-        <w:t xml:space="preserve">[3]</w:t>
+        <w:t xml:space="preserve">[4]</w:t>
       </w:r>
       <w:r>
         <w:t xml:space="preserve">J. Brooke. 1996. SUS: A “quick and dirty” usability scale. In</w:t>
@@ -13083,7 +13420,7 @@
         <w:pStyle w:val="BodyText"/>
       </w:pPr>
       <w:r>
-        <w:t xml:space="preserve">[4]</w:t>
+        <w:t xml:space="preserve">[5]</w:t>
       </w:r>
       <w:r>
         <w:t xml:space="preserve">A. B. Brown and D. A. Patterson. 2003. Undo for operators: Building an undoable e-mail store. In</w:t>
@@ -13107,7 +13444,7 @@
         <w:pStyle w:val="BodyText"/>
       </w:pPr>
       <w:r>
-        <w:t xml:space="preserve">[5]</w:t>
+        <w:t xml:space="preserve">[6]</w:t>
       </w:r>
       <w:r>
         <w:t xml:space="preserve">L. Clark, N. Pantidi, O. Cooney, P. R. Doyle, D. Garaialde, J. Edwards, B. Spillane, E. Gilmartin, C. Murad, C. Munteanu, V. Wade, and B. R. Cowan. 2019. What makes a good conversation? Challenges in designing truly conversational agents. In</w:t>
@@ -13131,7 +13468,7 @@
         <w:pStyle w:val="BodyText"/>
       </w:pPr>
       <w:r>
-        <w:t xml:space="preserve">[6]</w:t>
+        <w:t xml:space="preserve">[7]</w:t>
       </w:r>
       <w:r>
         <w:t xml:space="preserve">P. Cousot and R. Cousot. 1977. Abstract interpretation: A unified lattice model for static analysis of programs by construction or approximation of fixpoints. In</w:t>
@@ -13155,7 +13492,7 @@
         <w:pStyle w:val="BodyText"/>
       </w:pPr>
       <w:r>
-        <w:t xml:space="preserve">[7]</w:t>
+        <w:t xml:space="preserve">[8]</w:t>
       </w:r>
       <w:r>
         <w:t xml:space="preserve">J. W. Creswell and V. L. Plano Clark. 2018.</w:t>
@@ -13182,7 +13519,7 @@
         <w:pStyle w:val="BodyText"/>
       </w:pPr>
       <w:r>
-        <w:t xml:space="preserve">[8]</w:t>
+        <w:t xml:space="preserve">[9]</w:t>
       </w:r>
       <w:r>
         <w:t xml:space="preserve">X. Deng, Y. Gu, B. Zheng, S. Chen, S. Stevens, B. Wang, H. Sun, and Y. Su. 2023. Mind2Web: Towards a Generalist Agent for the Web. In</w:t>
@@ -13206,7 +13543,7 @@
         <w:pStyle w:val="BodyText"/>
       </w:pPr>
       <w:r>
-        <w:t xml:space="preserve">[9]</w:t>
+        <w:t xml:space="preserve">[10]</w:t>
       </w:r>
       <w:r>
         <w:t xml:space="preserve">A. Goel, K. Po, K. Farhadi, Z. Li, and E. de Lara. 2005. The Taser intrusion recovery system. In</w:t>
@@ -13230,7 +13567,7 @@
         <w:pStyle w:val="BodyText"/>
       </w:pPr>
       <w:r>
-        <w:t xml:space="preserve">[10]</w:t>
+        <w:t xml:space="preserve">[11]</w:t>
       </w:r>
       <w:r>
         <w:t xml:space="preserve">M. Greenberg and A. J. Blatt. 2020. Executable formal semantics for the POSIX shell.</w:t>
@@ -13257,7 +13594,7 @@
         <w:pStyle w:val="BodyText"/>
       </w:pPr>
       <w:r>
-        <w:t xml:space="preserve">[11]</w:t>
+        <w:t xml:space="preserve">[12]</w:t>
       </w:r>
       <w:r>
         <w:t xml:space="preserve">B. R. Gyawali, S. Achalla, K. Kallas, and S. Kumar. 2025. NaSh: Guardrails for an LLM-Powered Natural Language Shell. arXiv:2506.13028</w:t>
@@ -13268,7 +13605,7 @@
         <w:pStyle w:val="BodyText"/>
       </w:pPr>
       <w:r>
-        <w:t xml:space="preserve">[12]</w:t>
+        <w:t xml:space="preserve">[13]</w:t>
       </w:r>
       <w:r>
         <w:t xml:space="preserve">W. Han, Z. Zeng, J. Huang, S. Jiang, et al. 2025. GUIRoboTron-Speech: Towards Automated GUI Agents Based on Speech Instructions. arXiv:2506.11127v1</w:t>
@@ -13279,7 +13616,7 @@
         <w:pStyle w:val="BodyText"/>
       </w:pPr>
       <w:r>
-        <w:t xml:space="preserve">[13]</w:t>
+        <w:t xml:space="preserve">[14]</w:t>
       </w:r>
       <w:r>
         <w:t xml:space="preserve">S. G. Hart and L. E. Staveland. 1988. Development of NASA-TLX (Task Load Index): Results of empirical and theoretical research. In</w:t>
@@ -13303,7 +13640,7 @@
         <w:pStyle w:val="BodyText"/>
       </w:pPr>
       <w:r>
-        <w:t xml:space="preserve">[14]</w:t>
+        <w:t xml:space="preserve">[15]</w:t>
       </w:r>
       <w:r>
         <w:t xml:space="preserve">W. Hong, W. Wang, Q. Lv, J. Xu, W. Yu, J. Ji, Y. Wang, Z. Wang, Y. Dong, M. Ding, and J. Tang. 2024. CogAgent: A Visual Language Model for GUI Agents. In</w:t>
@@ -13327,7 +13664,7 @@
         <w:pStyle w:val="BodyText"/>
       </w:pPr>
       <w:r>
-        <w:t xml:space="preserve">[15]</w:t>
+        <w:t xml:space="preserve">[16]</w:t>
       </w:r>
       <w:r>
         <w:t xml:space="preserve">Z. Hui, Y. Li, D. Zhao, T. Chen, C. Banbury, and K. Koishida. 2025. WinClick: GUI Grounding with Multimodal Large Language Models. arXiv:2503.04730</w:t>
@@ -13338,7 +13675,7 @@
         <w:pStyle w:val="BodyText"/>
       </w:pPr>
       <w:r>
-        <w:t xml:space="preserve">[16]</w:t>
+        <w:t xml:space="preserve">[17]</w:t>
       </w:r>
       <w:r>
         <w:t xml:space="preserve">E. L. Hutchins, J. D. Hollan, and D. A. Norman. 1985. Direct manipulation interfaces.</w:t>
@@ -13365,7 +13702,7 @@
         <w:pStyle w:val="BodyText"/>
       </w:pPr>
       <w:r>
-        <w:t xml:space="preserve">[17]</w:t>
+        <w:t xml:space="preserve">[18]</w:t>
       </w:r>
       <w:r>
         <w:t xml:space="preserve">J. Jacobs, J. Lapon, and V. Naessens. 2026. Local LLMs for NL2Bash: A Large-Scale Open-Source Model Evaluation for Bash Command Generation. In</w:t>
@@ -13389,7 +13726,7 @@
         <w:pStyle w:val="BodyText"/>
       </w:pPr>
       <w:r>
-        <w:t xml:space="preserve">[18]</w:t>
+        <w:t xml:space="preserve">[19]</w:t>
       </w:r>
       <w:r>
         <w:t xml:space="preserve">P. Jouvelot and D. K. Gifford. 1991. Algebraic reconstruction of types and effects. In</w:t>
@@ -13413,7 +13750,7 @@
         <w:pStyle w:val="BodyText"/>
       </w:pPr>
       <w:r>
-        <w:t xml:space="preserve">[19]</w:t>
+        <w:t xml:space="preserve">[20]</w:t>
       </w:r>
       <w:r>
         <w:t xml:space="preserve">kenryu42. 2026.</w:t>
@@ -13437,10 +13774,10 @@
         <w:pStyle w:val="BodyText"/>
       </w:pPr>
       <w:r>
-        <w:t xml:space="preserve">[20]</w:t>
-      </w:r>
-      <w:r>
-        <w:t xml:space="preserve">Y. Li, J. He, X. Zhou, Y. Zhang, and J. Baldridge. 2020. Mapping Natural Language Instructions to Mobile UI Action Sequences. In</w:t>
+        <w:t xml:space="preserve">[21]</w:t>
+      </w:r>
+      <w:r>
+        <w:t xml:space="preserve">E. Lamprou, T. Zhu, D. Jin, G. Ntousakis, G. Liargkovas, C. Eng, K. Kallas, M. Greenberg, and N. Vasilakis. 2026. Controlling opaque-component effects with semisolates and try. In</w:t>
       </w:r>
       <w:r>
         <w:t xml:space="preserve"> </w:t>
@@ -13450,21 +13787,21 @@
           <w:i/>
           <w:iCs/>
         </w:rPr>
-        <w:t xml:space="preserve">Proceedings of ACL 2020</w:t>
-      </w:r>
-      <w:r>
-        <w:t xml:space="preserve">. 8198–8210.</w:t>
-      </w:r>
-    </w:p>
-    <w:p>
-      <w:pPr>
-        <w:pStyle w:val="BodyText"/>
-      </w:pPr>
-      <w:r>
-        <w:t xml:space="preserve">[21]</w:t>
-      </w:r>
-      <w:r>
-        <w:t xml:space="preserve">X. V. Lin, C. Wang, L. Zettlemoyer, and M. D. Ernst. 2018. NL2Bash: A corpus and semantic parser for natural language interface to the Linux operating system. In</w:t>
+        <w:t xml:space="preserve">Proceedings of the 20th USENIX Symposium on Operating Systems Design and Implementation (OSDI ’26)</w:t>
+      </w:r>
+      <w:r>
+        <w:t xml:space="preserve">. USENIX Association. https://www.usenix.org/conference/osdi26/presentation/lamprou</w:t>
+      </w:r>
+    </w:p>
+    <w:p>
+      <w:pPr>
+        <w:pStyle w:val="BodyText"/>
+      </w:pPr>
+      <w:r>
+        <w:t xml:space="preserve">[22]</w:t>
+      </w:r>
+      <w:r>
+        <w:t xml:space="preserve">Y. Li, J. He, X. Zhou, Y. Zhang, and J. Baldridge. 2020. Mapping Natural Language Instructions to Mobile UI Action Sequences. In</w:t>
       </w:r>
       <w:r>
         <w:t xml:space="preserve"> </w:t>
@@ -13474,21 +13811,10 @@
           <w:i/>
           <w:iCs/>
         </w:rPr>
-        <w:t xml:space="preserve">Proceedings of the Eleventh International Conference on Language Resources and Evaluation (LREC 2018)</w:t>
-      </w:r>
-      <w:r>
-        <w:t xml:space="preserve">. European Language Resources Association.</w:t>
-      </w:r>
-    </w:p>
-    <w:p>
-      <w:pPr>
-        <w:pStyle w:val="BodyText"/>
-      </w:pPr>
-      <w:r>
-        <w:t xml:space="preserve">[22]</w:t>
-      </w:r>
-      <w:r>
-        <w:t xml:space="preserve">R. Liu, T. Zhe, D. Wang, Z. Yao, K. Liu, Y. Fu, H. Liu, and J. Pei. 2026. AgentOS: From Application Silos to a Natural Language-Driven Data Ecosystem. arXiv:2603.08938</w:t>
+        <w:t xml:space="preserve">Proceedings of ACL 2020</w:t>
+      </w:r>
+      <w:r>
+        <w:t xml:space="preserve">. 8198–8210.</w:t>
       </w:r>
     </w:p>
     <w:p>
@@ -13499,18 +13825,7 @@
         <w:t xml:space="preserve">[23]</w:t>
       </w:r>
       <w:r>
-        <w:t xml:space="preserve">J. Lu, Z. Zhang, F. Yang, J. Zhang, L. Wang, C. Du, Q. Lin, S. Rajmohan, D. Zhang, and Q. Zhang. 2024. AXIS: Efficient Human-Agent-Computer Interaction with API-First LLM-Based Agents. arXiv:2409.17140</w:t>
-      </w:r>
-    </w:p>
-    <w:p>
-      <w:pPr>
-        <w:pStyle w:val="BodyText"/>
-      </w:pPr>
-      <w:r>
-        <w:t xml:space="preserve">[24]</w:t>
-      </w:r>
-      <w:r>
-        <w:t xml:space="preserve">E. Luger and A. Sellen. 2016. “Like having a really bad PA”: The gulf between user expectation and experience of conversational agents. In</w:t>
+        <w:t xml:space="preserve">X. V. Lin, C. Wang, L. Zettlemoyer, and M. D. Ernst. 2018. NL2Bash: A corpus and semantic parser for natural language interface to the Linux operating system. In</w:t>
       </w:r>
       <w:r>
         <w:t xml:space="preserve"> </w:t>
@@ -13520,10 +13835,21 @@
           <w:i/>
           <w:iCs/>
         </w:rPr>
-        <w:t xml:space="preserve">Proceedings of the 2016 CHI Conference on Human Factors in Computing Systems (CHI ’16)</w:t>
-      </w:r>
-      <w:r>
-        <w:t xml:space="preserve">. ACM, 5286–5297.</w:t>
+        <w:t xml:space="preserve">Proceedings of the Eleventh International Conference on Language Resources and Evaluation (LREC 2018)</w:t>
+      </w:r>
+      <w:r>
+        <w:t xml:space="preserve">. European Language Resources Association.</w:t>
+      </w:r>
+    </w:p>
+    <w:p>
+      <w:pPr>
+        <w:pStyle w:val="BodyText"/>
+      </w:pPr>
+      <w:r>
+        <w:t xml:space="preserve">[24]</w:t>
+      </w:r>
+      <w:r>
+        <w:t xml:space="preserve">R. Liu, T. Zhe, D. Wang, Z. Yao, K. Liu, Y. Fu, H. Liu, and J. Pei. 2026. AgentOS: From Application Silos to a Natural Language-Driven Data Ecosystem. arXiv:2603.08938</w:t>
       </w:r>
     </w:p>
     <w:p>
@@ -13534,7 +13860,18 @@
         <w:t xml:space="preserve">[25]</w:t>
       </w:r>
       <w:r>
-        <w:t xml:space="preserve">K. Mazurak and S. Zdancewic. 2007. ABASH: Finding bugs in bash scripts. In</w:t>
+        <w:t xml:space="preserve">J. Lu, Z. Zhang, F. Yang, J. Zhang, L. Wang, C. Du, Q. Lin, S. Rajmohan, D. Zhang, and Q. Zhang. 2024. AXIS: Efficient Human-Agent-Computer Interaction with API-First LLM-Based Agents. arXiv:2409.17140</w:t>
+      </w:r>
+    </w:p>
+    <w:p>
+      <w:pPr>
+        <w:pStyle w:val="BodyText"/>
+      </w:pPr>
+      <w:r>
+        <w:t xml:space="preserve">[26]</w:t>
+      </w:r>
+      <w:r>
+        <w:t xml:space="preserve">E. Luger and A. Sellen. 2016. “Like having a really bad PA”: The gulf between user expectation and experience of conversational agents. In</w:t>
       </w:r>
       <w:r>
         <w:t xml:space="preserve"> </w:t>
@@ -13544,21 +13881,10 @@
           <w:i/>
           <w:iCs/>
         </w:rPr>
-        <w:t xml:space="preserve">Proceedings of the 2007 Workshop on Programming Languages and Analysis for Security (PLAS ’07)</w:t>
-      </w:r>
-      <w:r>
-        <w:t xml:space="preserve">. ACM.</w:t>
-      </w:r>
-    </w:p>
-    <w:p>
-      <w:pPr>
-        <w:pStyle w:val="BodyText"/>
-      </w:pPr>
-      <w:r>
-        <w:t xml:space="preserve">[26]</w:t>
-      </w:r>
-      <w:r>
-        <w:t xml:space="preserve">S. Mehendale and A. Walishetti. 2024. DexAssist: A Voice-Enabled Dual-LLM Framework for Accessible Web Navigation. arXiv:2411.12214</w:t>
+        <w:t xml:space="preserve">Proceedings of the 2016 CHI Conference on Human Factors in Computing Systems (CHI ’16)</w:t>
+      </w:r>
+      <w:r>
+        <w:t xml:space="preserve">. ACM, 5286–5297.</w:t>
       </w:r>
     </w:p>
     <w:p>
@@ -13569,18 +13895,7 @@
         <w:t xml:space="preserve">[27]</w:t>
       </w:r>
       <w:r>
-        <w:t xml:space="preserve">R. Niu, J. Li, S. Wang, Y. Fu, X. Hu, X. Leng, H. Kong, Y. Chang, and Q. Wang. 2024. ScreenAgent: A Vision Language Model-driven Computer Control Agent. arXiv:2402.07945</w:t>
-      </w:r>
-    </w:p>
-    <w:p>
-      <w:pPr>
-        <w:pStyle w:val="BodyText"/>
-      </w:pPr>
-      <w:r>
-        <w:t xml:space="preserve">[28]</w:t>
-      </w:r>
-      <w:r>
-        <w:t xml:space="preserve">D. A. Norman. 1986. Cognitive engineering. In</w:t>
+        <w:t xml:space="preserve">K. Mazurak and S. Zdancewic. 2007. ABASH: Finding bugs in bash scripts. In</w:t>
       </w:r>
       <w:r>
         <w:t xml:space="preserve"> </w:t>
@@ -13590,10 +13905,21 @@
           <w:i/>
           <w:iCs/>
         </w:rPr>
-        <w:t xml:space="preserve">User Centered System Design: New Perspectives on Human-Computer Interaction</w:t>
-      </w:r>
-      <w:r>
-        <w:t xml:space="preserve">, D. A. Norman and S. W. Draper (Eds.). Lawrence Erlbaum Associates, 31–61.</w:t>
+        <w:t xml:space="preserve">Proceedings of the 2007 Workshop on Programming Languages and Analysis for Security (PLAS ’07)</w:t>
+      </w:r>
+      <w:r>
+        <w:t xml:space="preserve">. ACM.</w:t>
+      </w:r>
+    </w:p>
+    <w:p>
+      <w:pPr>
+        <w:pStyle w:val="BodyText"/>
+      </w:pPr>
+      <w:r>
+        <w:t xml:space="preserve">[28]</w:t>
+      </w:r>
+      <w:r>
+        <w:t xml:space="preserve">S. Mehendale and A. Walishetti. 2024. DexAssist: A Voice-Enabled Dual-LLM Framework for Accessible Web Navigation. arXiv:2411.12214</w:t>
       </w:r>
     </w:p>
     <w:p>
@@ -13604,7 +13930,18 @@
         <w:t xml:space="preserve">[29]</w:t>
       </w:r>
       <w:r>
-        <w:t xml:space="preserve">OpenAI. 2026.</w:t>
+        <w:t xml:space="preserve">R. Niu, J. Li, S. Wang, Y. Fu, X. Hu, X. Leng, H. Kong, Y. Chang, and Q. Wang. 2024. ScreenAgent: A Vision Language Model-driven Computer Control Agent. arXiv:2402.07945</w:t>
+      </w:r>
+    </w:p>
+    <w:p>
+      <w:pPr>
+        <w:pStyle w:val="BodyText"/>
+      </w:pPr>
+      <w:r>
+        <w:t xml:space="preserve">[30]</w:t>
+      </w:r>
+      <w:r>
+        <w:t xml:space="preserve">D. A. Norman. 1986. Cognitive engineering. In</w:t>
       </w:r>
       <w:r>
         <w:t xml:space="preserve"> </w:t>
@@ -13614,21 +13951,21 @@
           <w:i/>
           <w:iCs/>
         </w:rPr>
-        <w:t xml:space="preserve">Codex CLI</w:t>
-      </w:r>
-      <w:r>
-        <w:t xml:space="preserve">. https://github.com/openai/codex Commit 1f4c473.</w:t>
-      </w:r>
-    </w:p>
-    <w:p>
-      <w:pPr>
-        <w:pStyle w:val="BodyText"/>
-      </w:pPr>
-      <w:r>
-        <w:t xml:space="preserve">[30]</w:t>
-      </w:r>
-      <w:r>
-        <w:t xml:space="preserve">A. Padmanabha, J. Yuan, J. Gupta, Z. Karachiwalla, C. Majidi, H. Admoni, and Z. Erickson. 2024. VoicePilot: Harnessing LLMs as Speech Interfaces for Physically Assistive Robots. In</w:t>
+        <w:t xml:space="preserve">User Centered System Design: New Perspectives on Human-Computer Interaction</w:t>
+      </w:r>
+      <w:r>
+        <w:t xml:space="preserve">, D. A. Norman and S. W. Draper (Eds.). Lawrence Erlbaum Associates, 31–61.</w:t>
+      </w:r>
+    </w:p>
+    <w:p>
+      <w:pPr>
+        <w:pStyle w:val="BodyText"/>
+      </w:pPr>
+      <w:r>
+        <w:t xml:space="preserve">[31]</w:t>
+      </w:r>
+      <w:r>
+        <w:t xml:space="preserve">OpenAI. 2026.</w:t>
       </w:r>
       <w:r>
         <w:t xml:space="preserve"> </w:t>
@@ -13638,21 +13975,21 @@
           <w:i/>
           <w:iCs/>
         </w:rPr>
-        <w:t xml:space="preserve">Proceedings of the 37th Annual ACM Symposium on User Interface Software and Technology (UIST ’24)</w:t>
-      </w:r>
-      <w:r>
-        <w:t xml:space="preserve">. ACM.</w:t>
-      </w:r>
-    </w:p>
-    <w:p>
-      <w:pPr>
-        <w:pStyle w:val="BodyText"/>
-      </w:pPr>
-      <w:r>
-        <w:t xml:space="preserve">[31]</w:t>
-      </w:r>
-      <w:r>
-        <w:t xml:space="preserve">J. Park, P. Tang, S. Das, S. Appalaraju, K. Y. Singh, R. Manmatha, and S. Ghadar. 2025. R-VLM: Region-aware Vision Language Model for Precise GUI Grounding. In</w:t>
+        <w:t xml:space="preserve">Codex CLI</w:t>
+      </w:r>
+      <w:r>
+        <w:t xml:space="preserve">. https://github.com/openai/codex Commit 1f4c473.</w:t>
+      </w:r>
+    </w:p>
+    <w:p>
+      <w:pPr>
+        <w:pStyle w:val="BodyText"/>
+      </w:pPr>
+      <w:r>
+        <w:t xml:space="preserve">[32]</w:t>
+      </w:r>
+      <w:r>
+        <w:t xml:space="preserve">A. Padmanabha, J. Yuan, J. Gupta, Z. Karachiwalla, C. Majidi, H. Admoni, and Z. Erickson. 2024. VoicePilot: Harnessing LLMs as Speech Interfaces for Physically Assistive Robots. In</w:t>
       </w:r>
       <w:r>
         <w:t xml:space="preserve"> </w:t>
@@ -13662,21 +13999,21 @@
           <w:i/>
           <w:iCs/>
         </w:rPr>
-        <w:t xml:space="preserve">Findings of the Association for Computational Linguistics: ACL 2025</w:t>
-      </w:r>
-      <w:r>
-        <w:t xml:space="preserve">. 9669–9685.</w:t>
-      </w:r>
-    </w:p>
-    <w:p>
-      <w:pPr>
-        <w:pStyle w:val="BodyText"/>
-      </w:pPr>
-      <w:r>
-        <w:t xml:space="preserve">[32]</w:t>
-      </w:r>
-      <w:r>
-        <w:t xml:space="preserve">D. E. Porter, O. S. Hofmann, C. J. Rossbach, A. Benn, and E. Witchel. 2009. Operating system transactions. In</w:t>
+        <w:t xml:space="preserve">Proceedings of the 37th Annual ACM Symposium on User Interface Software and Technology (UIST ’24)</w:t>
+      </w:r>
+      <w:r>
+        <w:t xml:space="preserve">. ACM.</w:t>
+      </w:r>
+    </w:p>
+    <w:p>
+      <w:pPr>
+        <w:pStyle w:val="BodyText"/>
+      </w:pPr>
+      <w:r>
+        <w:t xml:space="preserve">[33]</w:t>
+      </w:r>
+      <w:r>
+        <w:t xml:space="preserve">J. Park, P. Tang, S. Das, S. Appalaraju, K. Y. Singh, R. Manmatha, and S. Ghadar. 2025. R-VLM: Region-aware Vision Language Model for Precise GUI Grounding. In</w:t>
       </w:r>
       <w:r>
         <w:t xml:space="preserve"> </w:t>
@@ -13686,21 +14023,21 @@
           <w:i/>
           <w:iCs/>
         </w:rPr>
-        <w:t xml:space="preserve">Proceedings of the ACM SIGOPS 22nd Symposium on Operating Systems Principles (SOSP ’09)</w:t>
-      </w:r>
-      <w:r>
-        <w:t xml:space="preserve">. ACM, 161–176.</w:t>
-      </w:r>
-    </w:p>
-    <w:p>
-      <w:pPr>
-        <w:pStyle w:val="BodyText"/>
-      </w:pPr>
-      <w:r>
-        <w:t xml:space="preserve">[33]</w:t>
-      </w:r>
-      <w:r>
-        <w:t xml:space="preserve">C. Rawles, A. Li, D. Rodriguez, O. Riva, and T. Lillicrap. 2023. Android in the Wild: A Large-Scale Dataset for Android Device Control. In</w:t>
+        <w:t xml:space="preserve">Findings of the Association for Computational Linguistics: ACL 2025</w:t>
+      </w:r>
+      <w:r>
+        <w:t xml:space="preserve">. 9669–9685.</w:t>
+      </w:r>
+    </w:p>
+    <w:p>
+      <w:pPr>
+        <w:pStyle w:val="BodyText"/>
+      </w:pPr>
+      <w:r>
+        <w:t xml:space="preserve">[34]</w:t>
+      </w:r>
+      <w:r>
+        <w:t xml:space="preserve">D. E. Porter, O. S. Hofmann, C. J. Rossbach, A. Benn, and E. Witchel. 2009. Operating system transactions. In</w:t>
       </w:r>
       <w:r>
         <w:t xml:space="preserve"> </w:t>
@@ -13710,21 +14047,21 @@
           <w:i/>
           <w:iCs/>
         </w:rPr>
-        <w:t xml:space="preserve">Advances in Neural Information Processing Systems 36 (NeurIPS 2023)</w:t>
-      </w:r>
-      <w:r>
-        <w:t xml:space="preserve">.</w:t>
-      </w:r>
-    </w:p>
-    <w:p>
-      <w:pPr>
-        <w:pStyle w:val="BodyText"/>
-      </w:pPr>
-      <w:r>
-        <w:t xml:space="preserve">[34]</w:t>
-      </w:r>
-      <w:r>
-        <w:t xml:space="preserve">O. Rodeh, J. Bacik, and C. Mason. 2013. BTRFS: The Linux B-tree filesystem.</w:t>
+        <w:t xml:space="preserve">Proceedings of the ACM SIGOPS 22nd Symposium on Operating Systems Principles (SOSP ’09)</w:t>
+      </w:r>
+      <w:r>
+        <w:t xml:space="preserve">. ACM, 161–176.</w:t>
+      </w:r>
+    </w:p>
+    <w:p>
+      <w:pPr>
+        <w:pStyle w:val="BodyText"/>
+      </w:pPr>
+      <w:r>
+        <w:t xml:space="preserve">[35]</w:t>
+      </w:r>
+      <w:r>
+        <w:t xml:space="preserve">C. Rawles, A. Li, D. Rodriguez, O. Riva, and T. Lillicrap. 2023. Android in the Wild: A Large-Scale Dataset for Android Device Control. In</w:t>
       </w:r>
       <w:r>
         <w:t xml:space="preserve"> </w:t>
@@ -13734,24 +14071,21 @@
           <w:i/>
           <w:iCs/>
         </w:rPr>
-        <w:t xml:space="preserve">ACM Transactions on Storage</w:t>
-      </w:r>
-      <w:r>
-        <w:t xml:space="preserve"> </w:t>
-      </w:r>
-      <w:r>
-        <w:t xml:space="preserve">9, 3, Article 9 (2013), 32 pages.</w:t>
-      </w:r>
-    </w:p>
-    <w:p>
-      <w:pPr>
-        <w:pStyle w:val="BodyText"/>
-      </w:pPr>
-      <w:r>
-        <w:t xml:space="preserve">[35]</w:t>
-      </w:r>
-      <w:r>
-        <w:t xml:space="preserve">D. S. Santry, M. J. Feeley, N. C. Hutchinson, A. C. Veitch, R. W. Carton, and J. Ofir. 1999. Deciding when to forget in the Elephant file system. In</w:t>
+        <w:t xml:space="preserve">Advances in Neural Information Processing Systems 36 (NeurIPS 2023)</w:t>
+      </w:r>
+      <w:r>
+        <w:t xml:space="preserve">.</w:t>
+      </w:r>
+    </w:p>
+    <w:p>
+      <w:pPr>
+        <w:pStyle w:val="BodyText"/>
+      </w:pPr>
+      <w:r>
+        <w:t xml:space="preserve">[36]</w:t>
+      </w:r>
+      <w:r>
+        <w:t xml:space="preserve">O. Rodeh, J. Bacik, and C. Mason. 2013. BTRFS: The Linux B-tree filesystem.</w:t>
       </w:r>
       <w:r>
         <w:t xml:space="preserve"> </w:t>
@@ -13761,21 +14095,24 @@
           <w:i/>
           <w:iCs/>
         </w:rPr>
-        <w:t xml:space="preserve">Proceedings of the Seventeenth ACM Symposium on Operating Systems Principles (SOSP ’99)</w:t>
-      </w:r>
-      <w:r>
-        <w:t xml:space="preserve">. ACM, 110–123.</w:t>
-      </w:r>
-    </w:p>
-    <w:p>
-      <w:pPr>
-        <w:pStyle w:val="BodyText"/>
-      </w:pPr>
-      <w:r>
-        <w:t xml:space="preserve">[36]</w:t>
-      </w:r>
-      <w:r>
-        <w:t xml:space="preserve">J. Sauro and J. R. Lewis. 2016.</w:t>
+        <w:t xml:space="preserve">ACM Transactions on Storage</w:t>
+      </w:r>
+      <w:r>
+        <w:t xml:space="preserve"> </w:t>
+      </w:r>
+      <w:r>
+        <w:t xml:space="preserve">9, 3, Article 9 (2013), 32 pages.</w:t>
+      </w:r>
+    </w:p>
+    <w:p>
+      <w:pPr>
+        <w:pStyle w:val="BodyText"/>
+      </w:pPr>
+      <w:r>
+        <w:t xml:space="preserve">[37]</w:t>
+      </w:r>
+      <w:r>
+        <w:t xml:space="preserve">Y. Ruan, H. Dong, A. Wang, S. Pitis, Y. Zhou, J. Ba, Y. Dubois, C. J. Maddison, and T. Hashimoto. 2024. Identifying the risks of LM agents with an LM-emulated sandbox. In</w:t>
       </w:r>
       <w:r>
         <w:t xml:space="preserve"> </w:t>
@@ -13785,24 +14122,21 @@
           <w:i/>
           <w:iCs/>
         </w:rPr>
-        <w:t xml:space="preserve">Quantifying the User Experience: Practical Statistics for User Research</w:t>
-      </w:r>
-      <w:r>
-        <w:t xml:space="preserve"> </w:t>
-      </w:r>
-      <w:r>
-        <w:t xml:space="preserve">(2nd ed.). Morgan Kaufmann.</w:t>
-      </w:r>
-    </w:p>
-    <w:p>
-      <w:pPr>
-        <w:pStyle w:val="BodyText"/>
-      </w:pPr>
-      <w:r>
-        <w:t xml:space="preserve">[37]</w:t>
-      </w:r>
-      <w:r>
-        <w:t xml:space="preserve">B. Shneiderman. 1983. Direct manipulation: A step beyond programming languages.</w:t>
+        <w:t xml:space="preserve">Proceedings of ICLR 2024</w:t>
+      </w:r>
+      <w:r>
+        <w:t xml:space="preserve">.</w:t>
+      </w:r>
+    </w:p>
+    <w:p>
+      <w:pPr>
+        <w:pStyle w:val="BodyText"/>
+      </w:pPr>
+      <w:r>
+        <w:t xml:space="preserve">[38]</w:t>
+      </w:r>
+      <w:r>
+        <w:t xml:space="preserve">D. S. Santry, M. J. Feeley, N. C. Hutchinson, A. C. Veitch, R. W. Carton, and J. Ofir. 1999. Deciding when to forget in the Elephant file system. In</w:t>
       </w:r>
       <w:r>
         <w:t xml:space="preserve"> </w:t>
@@ -13812,24 +14146,21 @@
           <w:i/>
           <w:iCs/>
         </w:rPr>
-        <w:t xml:space="preserve">Computer</w:t>
-      </w:r>
-      <w:r>
-        <w:t xml:space="preserve"> </w:t>
-      </w:r>
-      <w:r>
-        <w:t xml:space="preserve">16, 8 (1983), 57–69.</w:t>
-      </w:r>
-    </w:p>
-    <w:p>
-      <w:pPr>
-        <w:pStyle w:val="BodyText"/>
-      </w:pPr>
-      <w:r>
-        <w:t xml:space="preserve">[38]</w:t>
-      </w:r>
-      <w:r>
-        <w:t xml:space="preserve">B. Shneiderman. 2000. The limits of speech recognition.</w:t>
+        <w:t xml:space="preserve">Proceedings of the Seventeenth ACM Symposium on Operating Systems Principles (SOSP ’99)</w:t>
+      </w:r>
+      <w:r>
+        <w:t xml:space="preserve">. ACM, 110–123.</w:t>
+      </w:r>
+    </w:p>
+    <w:p>
+      <w:pPr>
+        <w:pStyle w:val="BodyText"/>
+      </w:pPr>
+      <w:r>
+        <w:t xml:space="preserve">[39]</w:t>
+      </w:r>
+      <w:r>
+        <w:t xml:space="preserve">J. Sauro and J. R. Lewis. 2016.</w:t>
       </w:r>
       <w:r>
         <w:t xml:space="preserve"> </w:t>
@@ -13839,24 +14170,24 @@
           <w:i/>
           <w:iCs/>
         </w:rPr>
-        <w:t xml:space="preserve">Commun. ACM</w:t>
-      </w:r>
-      <w:r>
-        <w:t xml:space="preserve"> </w:t>
-      </w:r>
-      <w:r>
-        <w:t xml:space="preserve">43, 9 (2000), 63–65.</w:t>
-      </w:r>
-    </w:p>
-    <w:p>
-      <w:pPr>
-        <w:pStyle w:val="BodyText"/>
-      </w:pPr>
-      <w:r>
-        <w:t xml:space="preserve">[39]</w:t>
-      </w:r>
-      <w:r>
-        <w:t xml:space="preserve">B. Shneiderman and P. Maes. 1997. Direct manipulation vs. interface agents.</w:t>
+        <w:t xml:space="preserve">Quantifying the User Experience: Practical Statistics for User Research</w:t>
+      </w:r>
+      <w:r>
+        <w:t xml:space="preserve"> </w:t>
+      </w:r>
+      <w:r>
+        <w:t xml:space="preserve">(2nd ed.). Morgan Kaufmann.</w:t>
+      </w:r>
+    </w:p>
+    <w:p>
+      <w:pPr>
+        <w:pStyle w:val="BodyText"/>
+      </w:pPr>
+      <w:r>
+        <w:t xml:space="preserve">[40]</w:t>
+      </w:r>
+      <w:r>
+        <w:t xml:space="preserve">B. Shneiderman. 1983. Direct manipulation: A step beyond programming languages.</w:t>
       </w:r>
       <w:r>
         <w:t xml:space="preserve"> </w:t>
@@ -13866,24 +14197,24 @@
           <w:i/>
           <w:iCs/>
         </w:rPr>
-        <w:t xml:space="preserve">interactions</w:t>
-      </w:r>
-      <w:r>
-        <w:t xml:space="preserve"> </w:t>
-      </w:r>
-      <w:r>
-        <w:t xml:space="preserve">4, 6 (1997), 42–61.</w:t>
-      </w:r>
-    </w:p>
-    <w:p>
-      <w:pPr>
-        <w:pStyle w:val="BodyText"/>
-      </w:pPr>
-      <w:r>
-        <w:t xml:space="preserve">[40]</w:t>
-      </w:r>
-      <w:r>
-        <w:t xml:space="preserve">J.-P. Talpin and P. Jouvelot. 1994. The type and effect discipline.</w:t>
+        <w:t xml:space="preserve">Computer</w:t>
+      </w:r>
+      <w:r>
+        <w:t xml:space="preserve"> </w:t>
+      </w:r>
+      <w:r>
+        <w:t xml:space="preserve">16, 8 (1983), 57–69.</w:t>
+      </w:r>
+    </w:p>
+    <w:p>
+      <w:pPr>
+        <w:pStyle w:val="BodyText"/>
+      </w:pPr>
+      <w:r>
+        <w:t xml:space="preserve">[41]</w:t>
+      </w:r>
+      <w:r>
+        <w:t xml:space="preserve">B. Shneiderman. 2000. The limits of speech recognition.</w:t>
       </w:r>
       <w:r>
         <w:t xml:space="preserve"> </w:t>
@@ -13893,24 +14224,13 @@
           <w:i/>
           <w:iCs/>
         </w:rPr>
-        <w:t xml:space="preserve">Information and Computation</w:t>
-      </w:r>
-      <w:r>
-        <w:t xml:space="preserve"> </w:t>
-      </w:r>
-      <w:r>
-        <w:t xml:space="preserve">111, 2 (1994), 245–296.</w:t>
-      </w:r>
-    </w:p>
-    <w:p>
-      <w:pPr>
-        <w:pStyle w:val="BodyText"/>
-      </w:pPr>
-      <w:r>
-        <w:t xml:space="preserve">[41]</w:t>
-      </w:r>
-      <w:r>
-        <w:t xml:space="preserve">H. G. W. van Dam. 2025. A Multimodal GUI Architecture for Interfacing with LLM-Based Conversational Assistants. arXiv:2510.06223</w:t>
+        <w:t xml:space="preserve">Commun. ACM</w:t>
+      </w:r>
+      <w:r>
+        <w:t xml:space="preserve"> </w:t>
+      </w:r>
+      <w:r>
+        <w:t xml:space="preserve">43, 9 (2000), 63–65.</w:t>
       </w:r>
     </w:p>
     <w:p>
@@ -13921,29 +14241,7 @@
         <w:t xml:space="preserve">[42]</w:t>
       </w:r>
       <w:r>
-        <w:t xml:space="preserve">J. Wang, H. Xu, J. Ye, M. Yan, W. Shen, J. Zhang, F. Huang, and J. Sang. 2024. Mobile-Agent: Autonomous Multi-Modal Mobile Device Agent with Visual Perception. arXiv:2401.16158</w:t>
-      </w:r>
-    </w:p>
-    <w:p>
-      <w:pPr>
-        <w:pStyle w:val="BodyText"/>
-      </w:pPr>
-      <w:r>
-        <w:t xml:space="preserve">[43]</w:t>
-      </w:r>
-      <w:r>
-        <w:t xml:space="preserve">F. Westenfelder, E. Hemberg, M. Tulla, S. Moskal, U.-M. O’Reilly, and S. Chiricescu. 2025. LLM-Supported Natural Language to Bash Translation. arXiv:2502.06858</w:t>
-      </w:r>
-    </w:p>
-    <w:p>
-      <w:pPr>
-        <w:pStyle w:val="BodyText"/>
-      </w:pPr>
-      <w:r>
-        <w:t xml:space="preserve">[44]</w:t>
-      </w:r>
-      <w:r>
-        <w:t xml:space="preserve">J. Whiteside, S. Jones, P. S. Levy, and D. Wixon. 1985. User performance with command, menu, and iconic interfaces. In</w:t>
+        <w:t xml:space="preserve">B. Shneiderman and P. Maes. 1997. Direct manipulation vs. interface agents.</w:t>
       </w:r>
       <w:r>
         <w:t xml:space="preserve"> </w:t>
@@ -13953,21 +14251,24 @@
           <w:i/>
           <w:iCs/>
         </w:rPr>
-        <w:t xml:space="preserve">Proceedings of the SIGCHI Conference on Human Factors in Computing Systems (CHI ’85)</w:t>
-      </w:r>
-      <w:r>
-        <w:t xml:space="preserve">. ACM, 185–191.</w:t>
-      </w:r>
-    </w:p>
-    <w:p>
-      <w:pPr>
-        <w:pStyle w:val="BodyText"/>
-      </w:pPr>
-      <w:r>
-        <w:t xml:space="preserve">[45]</w:t>
-      </w:r>
-      <w:r>
-        <w:t xml:space="preserve">R. Wilensky, D. N. Chin, M. Luria, J. Martin, J. Mayfield, and D. Wu. 1988. The Berkeley Unix Consultant Project.</w:t>
+        <w:t xml:space="preserve">interactions</w:t>
+      </w:r>
+      <w:r>
+        <w:t xml:space="preserve"> </w:t>
+      </w:r>
+      <w:r>
+        <w:t xml:space="preserve">4, 6 (1997), 42–61.</w:t>
+      </w:r>
+    </w:p>
+    <w:p>
+      <w:pPr>
+        <w:pStyle w:val="BodyText"/>
+      </w:pPr>
+      <w:r>
+        <w:t xml:space="preserve">[43]</w:t>
+      </w:r>
+      <w:r>
+        <w:t xml:space="preserve">J.-P. Talpin and P. Jouvelot. 1994. The type and effect discipline.</w:t>
       </w:r>
       <w:r>
         <w:t xml:space="preserve"> </w:t>
@@ -13977,13 +14278,35 @@
           <w:i/>
           <w:iCs/>
         </w:rPr>
-        <w:t xml:space="preserve">Computational Linguistics</w:t>
-      </w:r>
-      <w:r>
-        <w:t xml:space="preserve"> </w:t>
-      </w:r>
-      <w:r>
-        <w:t xml:space="preserve">14, 4 (1988), 35–84.</w:t>
+        <w:t xml:space="preserve">Information and Computation</w:t>
+      </w:r>
+      <w:r>
+        <w:t xml:space="preserve"> </w:t>
+      </w:r>
+      <w:r>
+        <w:t xml:space="preserve">111, 2 (1994), 245–296.</w:t>
+      </w:r>
+    </w:p>
+    <w:p>
+      <w:pPr>
+        <w:pStyle w:val="BodyText"/>
+      </w:pPr>
+      <w:r>
+        <w:t xml:space="preserve">[44]</w:t>
+      </w:r>
+      <w:r>
+        <w:t xml:space="preserve">H. G. W. van Dam. 2025. A Multimodal GUI Architecture for Interfacing with LLM-Based Conversational Assistants. arXiv:2510.06223</w:t>
+      </w:r>
+    </w:p>
+    <w:p>
+      <w:pPr>
+        <w:pStyle w:val="BodyText"/>
+      </w:pPr>
+      <w:r>
+        <w:t xml:space="preserve">[45]</w:t>
+      </w:r>
+      <w:r>
+        <w:t xml:space="preserve">J. Wang, H. Xu, J. Ye, M. Yan, W. Shen, J. Zhang, F. Huang, and J. Sang. 2024. Mobile-Agent: Autonomous Multi-Modal Mobile Device Agent with Visual Perception. arXiv:2401.16158</w:t>
       </w:r>
     </w:p>
     <w:p>
@@ -13994,7 +14317,18 @@
         <w:t xml:space="preserve">[46]</w:t>
       </w:r>
       <w:r>
-        <w:t xml:space="preserve">T. Xie, D. Zhang, J. Chen, X. Li, S. Zhao, R. Cao, T. J. Hua, Z. Cheng, D. Shin, F. Lei, Y. Liu, Y. Xu, S. Zhou, S. Savarese, C. Xiong, V. Zhong, and T. Yu. 2024. OSWorld: Benchmarking Multimodal Agents for Open-Ended Tasks in Real Computer Environments. In</w:t>
+        <w:t xml:space="preserve">F. Westenfelder, E. Hemberg, M. Tulla, S. Moskal, U.-M. O’Reilly, and S. Chiricescu. 2025. LLM-Supported Natural Language to Bash Translation. arXiv:2502.06858</w:t>
+      </w:r>
+    </w:p>
+    <w:p>
+      <w:pPr>
+        <w:pStyle w:val="BodyText"/>
+      </w:pPr>
+      <w:r>
+        <w:t xml:space="preserve">[47]</w:t>
+      </w:r>
+      <w:r>
+        <w:t xml:space="preserve">J. Whiteside, S. Jones, P. S. Levy, and D. Wixon. 1985. User performance with command, menu, and iconic interfaces. In</w:t>
       </w:r>
       <w:r>
         <w:t xml:space="preserve"> </w:t>
@@ -14004,21 +14338,21 @@
           <w:i/>
           <w:iCs/>
         </w:rPr>
-        <w:t xml:space="preserve">Advances in Neural Information Processing Systems 37 (NeurIPS 2024)</w:t>
-      </w:r>
-      <w:r>
-        <w:t xml:space="preserve">.</w:t>
-      </w:r>
-    </w:p>
-    <w:p>
-      <w:pPr>
-        <w:pStyle w:val="BodyText"/>
-      </w:pPr>
-      <w:r>
-        <w:t xml:space="preserve">[47]</w:t>
-      </w:r>
-      <w:r>
-        <w:t xml:space="preserve">S. Yao, J. Zhao, D. Yu, N. Du, I. Shafran, K. Narasimhan, and Y. Cao. 2023. ReAct: Synergizing Reasoning and Acting in Language Models. In</w:t>
+        <w:t xml:space="preserve">Proceedings of the SIGCHI Conference on Human Factors in Computing Systems (CHI ’85)</w:t>
+      </w:r>
+      <w:r>
+        <w:t xml:space="preserve">. ACM, 185–191.</w:t>
+      </w:r>
+    </w:p>
+    <w:p>
+      <w:pPr>
+        <w:pStyle w:val="BodyText"/>
+      </w:pPr>
+      <w:r>
+        <w:t xml:space="preserve">[48]</w:t>
+      </w:r>
+      <w:r>
+        <w:t xml:space="preserve">R. Wilensky, D. N. Chin, M. Luria, J. Martin, J. Mayfield, and D. Wu. 1988. The Berkeley Unix Consultant Project.</w:t>
       </w:r>
       <w:r>
         <w:t xml:space="preserve"> </w:t>
@@ -14028,21 +14362,13 @@
           <w:i/>
           <w:iCs/>
         </w:rPr>
-        <w:t xml:space="preserve">Proceedings of ICLR 2023</w:t>
-      </w:r>
-      <w:r>
-        <w:t xml:space="preserve">.</w:t>
-      </w:r>
-    </w:p>
-    <w:p>
-      <w:pPr>
-        <w:pStyle w:val="BodyText"/>
-      </w:pPr>
-      <w:r>
-        <w:t xml:space="preserve">[48]</w:t>
-      </w:r>
-      <w:r>
-        <w:t xml:space="preserve">M. Yuan, Z. Zhou, X. Xiong, et al. 2026. OSWorld 2.0: Benchmarking Computer Use Agents on Long-Horizon Real-World Tasks. arXiv:2606.29537</w:t>
+        <w:t xml:space="preserve">Computational Linguistics</w:t>
+      </w:r>
+      <w:r>
+        <w:t xml:space="preserve"> </w:t>
+      </w:r>
+      <w:r>
+        <w:t xml:space="preserve">14, 4 (1988), 35–84.</w:t>
       </w:r>
     </w:p>
     <w:p>
@@ -14053,49 +14379,7 @@
         <w:t xml:space="preserve">[49]</w:t>
       </w:r>
       <w:r>
-        <w:t xml:space="preserve">C. Zhang, S. He, J. Qian, B. Li, L. Li, S. Qin, Y. Kang, M. Ma, G. Liu, Q. Lin, S. Rajmohan, D. Zhang, and Q. Zhang. 2024. Large Language Model-Brained GUI Agents: A Survey. arXiv:2411.18279</w:t>
-      </w:r>
-    </w:p>
-    <w:p>
-      <w:pPr>
-        <w:pStyle w:val="BodyText"/>
-      </w:pPr>
-      <w:r>
-        <w:t xml:space="preserve">[50]</w:t>
-      </w:r>
-      <w:r>
-        <w:t xml:space="preserve">C. Zhang, H. Huang, C. Ni, J. Mu, S. Qin, S. He, L. Wang, F. Yang, P. Zhao, C. Du, L. Li, Y. Kang, Z. Jiang, S. Zheng, R. Wang, J. Qian, M. Ma, J. Lou, Q. Lin, S. Rajmohan, and D. Zhang. 2025. UFO</w:t>
-      </w:r>
-      <w:r>
-        <w:rPr>
-          <w:vertAlign w:val="superscript"/>
-        </w:rPr>
-        <w:t xml:space="preserve">2</w:t>
-      </w:r>
-      <w:r>
-        <w:t xml:space="preserve">: The Desktop AgentOS. arXiv:2504.14603</w:t>
-      </w:r>
-    </w:p>
-    <w:p>
-      <w:pPr>
-        <w:pStyle w:val="BodyText"/>
-      </w:pPr>
-      <w:r>
-        <w:t xml:space="preserve">[51]</w:t>
-      </w:r>
-      <w:r>
-        <w:t xml:space="preserve">C. Zhang, Z. Yang, J. Liu, Y. Li, Y. Han, X. Chen, Z. Huang, B. Fu, and G. Yu. 2023. AppAgent: Multimodal Agents as Smartphone Users. arXiv:2312.13771</w:t>
-      </w:r>
-    </w:p>
-    <w:p>
-      <w:pPr>
-        <w:pStyle w:val="BodyText"/>
-      </w:pPr>
-      <w:r>
-        <w:t xml:space="preserve">[52]</w:t>
-      </w:r>
-      <w:r>
-        <w:t xml:space="preserve">B. Zheng, B. Gou, J. Kil, H. Sun, and Y. Su. 2024. GPT-4V(ision) is a Generalist Web Agent, if Grounded. In</w:t>
+        <w:t xml:space="preserve">T. Xie, D. Zhang, J. Chen, X. Li, S. Zhao, R. Cao, T. J. Hua, Z. Cheng, D. Shin, F. Lei, Y. Liu, Y. Xu, S. Zhou, S. Savarese, C. Xiong, V. Zhong, and T. Yu. 2024. OSWorld: Benchmarking Multimodal Agents for Open-Ended Tasks in Real Computer Environments. In</w:t>
       </w:r>
       <w:r>
         <w:t xml:space="preserve"> </w:t>
@@ -14105,7 +14389,7 @@
           <w:i/>
           <w:iCs/>
         </w:rPr>
-        <w:t xml:space="preserve">Proceedings of ICML 2024</w:t>
+        <w:t xml:space="preserve">Advances in Neural Information Processing Systems 37 (NeurIPS 2024)</w:t>
       </w:r>
       <w:r>
         <w:t xml:space="preserve">.</w:t>
@@ -14116,10 +14400,10 @@
         <w:pStyle w:val="BodyText"/>
       </w:pPr>
       <w:r>
-        <w:t xml:space="preserve">[53]</w:t>
-      </w:r>
-      <w:r>
-        <w:t xml:space="preserve">S. Zhou, F. F. Xu, H. Zhu, X. Zhou, R. Lo, A. Sridhar, X. Cheng, T. Ou, Y. Bisk, D. Fried, U. Alon, and G. Neubig. 2024. WebArena: A Realistic Web Environment for Building Autonomous Agents. In</w:t>
+        <w:t xml:space="preserve">[50]</w:t>
+      </w:r>
+      <w:r>
+        <w:t xml:space="preserve">S. Yao, J. Zhao, D. Yu, N. Du, I. Shafran, K. Narasimhan, and Y. Cao. 2023. ReAct: Synergizing Reasoning and Acting in Language Models. In</w:t>
       </w:r>
       <w:r>
         <w:t xml:space="preserve"> </w:t>
@@ -14129,6 +14413,107 @@
           <w:i/>
           <w:iCs/>
         </w:rPr>
+        <w:t xml:space="preserve">Proceedings of ICLR 2023</w:t>
+      </w:r>
+      <w:r>
+        <w:t xml:space="preserve">.</w:t>
+      </w:r>
+    </w:p>
+    <w:p>
+      <w:pPr>
+        <w:pStyle w:val="BodyText"/>
+      </w:pPr>
+      <w:r>
+        <w:t xml:space="preserve">[51]</w:t>
+      </w:r>
+      <w:r>
+        <w:t xml:space="preserve">M. Yuan, Z. Zhou, X. Xiong, et al. 2026. OSWorld 2.0: Benchmarking Computer Use Agents on Long-Horizon Real-World Tasks. arXiv:2606.29537</w:t>
+      </w:r>
+    </w:p>
+    <w:p>
+      <w:pPr>
+        <w:pStyle w:val="BodyText"/>
+      </w:pPr>
+      <w:r>
+        <w:t xml:space="preserve">[52]</w:t>
+      </w:r>
+      <w:r>
+        <w:t xml:space="preserve">C. Zhang, S. He, J. Qian, B. Li, L. Li, S. Qin, Y. Kang, M. Ma, G. Liu, Q. Lin, S. Rajmohan, D. Zhang, and Q. Zhang. 2024. Large Language Model-Brained GUI Agents: A Survey. arXiv:2411.18279</w:t>
+      </w:r>
+    </w:p>
+    <w:p>
+      <w:pPr>
+        <w:pStyle w:val="BodyText"/>
+      </w:pPr>
+      <w:r>
+        <w:t xml:space="preserve">[53]</w:t>
+      </w:r>
+      <w:r>
+        <w:t xml:space="preserve">C. Zhang, H. Huang, C. Ni, J. Mu, S. Qin, S. He, L. Wang, F. Yang, P. Zhao, C. Du, L. Li, Y. Kang, Z. Jiang, S. Zheng, R. Wang, J. Qian, M. Ma, J. Lou, Q. Lin, S. Rajmohan, and D. Zhang. 2025. UFO</w:t>
+      </w:r>
+      <w:r>
+        <w:rPr>
+          <w:vertAlign w:val="superscript"/>
+        </w:rPr>
+        <w:t xml:space="preserve">2</w:t>
+      </w:r>
+      <w:r>
+        <w:t xml:space="preserve">: The Desktop AgentOS. arXiv:2504.14603</w:t>
+      </w:r>
+    </w:p>
+    <w:p>
+      <w:pPr>
+        <w:pStyle w:val="BodyText"/>
+      </w:pPr>
+      <w:r>
+        <w:t xml:space="preserve">[54]</w:t>
+      </w:r>
+      <w:r>
+        <w:t xml:space="preserve">C. Zhang, Z. Yang, J. Liu, Y. Li, Y. Han, X. Chen, Z. Huang, B. Fu, and G. Yu. 2023. AppAgent: Multimodal Agents as Smartphone Users. arXiv:2312.13771</w:t>
+      </w:r>
+    </w:p>
+    <w:p>
+      <w:pPr>
+        <w:pStyle w:val="BodyText"/>
+      </w:pPr>
+      <w:r>
+        <w:t xml:space="preserve">[55]</w:t>
+      </w:r>
+      <w:r>
+        <w:t xml:space="preserve">B. Zheng, B. Gou, J. Kil, H. Sun, and Y. Su. 2024. GPT-4V(ision) is a Generalist Web Agent, if Grounded. In</w:t>
+      </w:r>
+      <w:r>
+        <w:t xml:space="preserve"> </w:t>
+      </w:r>
+      <w:r>
+        <w:rPr>
+          <w:i/>
+          <w:iCs/>
+        </w:rPr>
+        <w:t xml:space="preserve">Proceedings of ICML 2024</w:t>
+      </w:r>
+      <w:r>
+        <w:t xml:space="preserve">.</w:t>
+      </w:r>
+    </w:p>
+    <w:p>
+      <w:pPr>
+        <w:pStyle w:val="BodyText"/>
+      </w:pPr>
+      <w:r>
+        <w:t xml:space="preserve">[56]</w:t>
+      </w:r>
+      <w:r>
+        <w:t xml:space="preserve">S. Zhou, F. F. Xu, H. Zhu, X. Zhou, R. Lo, A. Sridhar, X. Cheng, T. Ou, Y. Bisk, D. Fried, U. Alon, and G. Neubig. 2024. WebArena: A Realistic Web Environment for Building Autonomous Agents. In</w:t>
+      </w:r>
+      <w:r>
+        <w:t xml:space="preserve"> </w:t>
+      </w:r>
+      <w:r>
+        <w:rPr>
+          <w:i/>
+          <w:iCs/>
+        </w:rPr>
         <w:t xml:space="preserve">Proceedings of ICLR 2024</w:t>
       </w:r>
       <w:r>
@@ -14140,7 +14525,7 @@
         <w:pStyle w:val="BodyText"/>
       </w:pPr>
       <w:r>
-        <w:t xml:space="preserve">[54]</w:t>
+        <w:t xml:space="preserve">[57]</w:t>
       </w:r>
       <w:r>
         <w:t xml:space="preserve">X. Zhou, S. Zhang, Y. Zhao, J. Wei, T. Song, A. Cohan, and C. Zhao. 2026. GUI vs. CLI: Execution Bottlenecks in Screen-Only and Skill-Mediated Computer-Use Agents. arXiv:2606.24551</w:t>
@@ -14186,7 +14571,7 @@
         <w:pStyle w:val="BodyText"/>
       </w:pPr>
       <w:r>
-        <w:t xml:space="preserve">Administered immediately after each condition, referring to the interface just used.  Items are the standard ten-item instrument of Brooke [3], with the word “system” replaced throughout by “interface” so that participants rate the interaction surface rather than the machine.  Each item is answered on a five-point scale from 1 (strongly disagree) to 5 (strongly agree).</w:t>
+        <w:t xml:space="preserve">Administered immediately after each condition, referring to the interface just used.  Items are the standard ten-item instrument of Brooke [4], with the word “system” replaced throughout by “interface” so that participants rate the interaction surface rather than the machine.  Each item is answered on a five-point scale from 1 (strongly disagree) to 5 (strongly agree).</w:t>
       </w:r>
     </w:p>
     <w:p>
@@ -15220,7 +15605,7 @@
         <w:t xml:space="preserve"> </w:t>
       </w:r>
       <w:r>
-        <w:t xml:space="preserve">For odd-numbered items, subtract 1 from the response.  For even-numbered items, subtract the response from 5.  Sum the ten adjusted scores and multiply by 2.5, giving a value from 0 to 100.  This value is not a percentage; interpretation follows Sauro and Lewis [36].</w:t>
+        <w:t xml:space="preserve">For odd-numbered items, subtract 1 from the response.  For even-numbered items, subtract the response from 5.  Sum the ten adjusted scores and multiply by 2.5, giving a value from 0 to 100.  This value is not a percentage; interpretation follows Sauro and Lewis [39].</w:t>
       </w:r>
     </w:p>
     <w:bookmarkStart w:id="136" w:name="appendix-b"/>
@@ -15246,7 +15631,7 @@
         <w:pStyle w:val="BodyText"/>
       </w:pPr>
       <w:r>
-        <w:t xml:space="preserve">Administered immediately after each condition, referring to the set of tasks just completed.  Six subscales are rated on a twenty-one-point scale presented as a line divided into equal intervals and scored 0 to 100 in steps of five.  This study uses the unweighted variant (Raw TLX): the pairwise weighting procedure of the original instrument [13] is omitted, and the composite workload score is the arithmetic mean of the six subscale ratings.  All six subscales, including Performance (anchored from Perfect to Failure), run from low to high workload, so no subscale is reverse-scored.</w:t>
+        <w:t xml:space="preserve">Administered immediately after each condition, referring to the set of tasks just completed.  Six subscales are rated on a twenty-one-point scale presented as a line divided into equal intervals and scored 0 to 100 in steps of five.  This study uses the unweighted variant (Raw TLX): the pairwise weighting procedure of the original instrument [14] is omitted, and the composite workload score is the arithmetic mean of the six subscale ratings.  All six subscales, including Performance (anchored from Perfect to Failure), run from low to high workload, so no subscale is reverse-scored.</w:t>
       </w:r>
     </w:p>
     <w:p>

</xml_diff>

<commit_message>
docs(thesis): make Chapter 1 algorithm-first and self-contained
§1.1 now moves from the risk of commands a person cannot read to the program-analysis problem on its first page; §1.2 states the guards, the scoped gap (NaSh proposes undo without a mechanism), the setting in two sentences, and defines effect, pre-image, capture, composition, resolution, verdict, fail-closed, and the two policies; §1.3 no longer repeats §1.1; RQ4 names the coding-agent checks; Contribution 1 reports the headline results with their denominators and defines capture coverage and the ablations; §1.6 merges the interface items into one; §1.7 puts the analysis's scope and limitations first. Two fresh re-reviews: numbers, citations, and references all check out.
</commit_message>
<xml_diff>
--- a/thesis 1/consolidated/SynapseOS_Proposal_Chapters_1_to_3.docx
+++ b/thesis 1/consolidated/SynapseOS_Proposal_Chapters_1_to_3.docx
@@ -344,7 +344,7 @@
         <w:tab/>
       </w:r>
       <w:r>
-        <w:t xml:space="preserve">3</w:t>
+        <w:t xml:space="preserve">2</w:t>
       </w:r>
     </w:p>
     <w:p>
@@ -365,7 +365,7 @@
         <w:tab/>
       </w:r>
       <w:r>
-        <w:t xml:space="preserve">5</w:t>
+        <w:t xml:space="preserve">4</w:t>
       </w:r>
     </w:p>
     <w:p>
@@ -386,7 +386,7 @@
         <w:tab/>
       </w:r>
       <w:r>
-        <w:t xml:space="preserve">7</w:t>
+        <w:t xml:space="preserve">5</w:t>
       </w:r>
     </w:p>
     <w:p>
@@ -407,7 +407,7 @@
         <w:tab/>
       </w:r>
       <w:r>
-        <w:t xml:space="preserve">8</w:t>
+        <w:t xml:space="preserve">6</w:t>
       </w:r>
     </w:p>
     <w:p>
@@ -428,7 +428,7 @@
         <w:tab/>
       </w:r>
       <w:r>
-        <w:t xml:space="preserve">11</w:t>
+        <w:t xml:space="preserve">9</w:t>
       </w:r>
     </w:p>
     <w:p>
@@ -449,7 +449,7 @@
         <w:tab/>
       </w:r>
       <w:r>
-        <w:t xml:space="preserve">13</w:t>
+        <w:t xml:space="preserve">10</w:t>
       </w:r>
     </w:p>
     <w:p>
@@ -469,7 +469,7 @@
         <w:tab/>
       </w:r>
       <w:r>
-        <w:t xml:space="preserve">17</w:t>
+        <w:t xml:space="preserve">14</w:t>
       </w:r>
     </w:p>
     <w:p>
@@ -490,7 +490,7 @@
         <w:tab/>
       </w:r>
       <w:r>
-        <w:t xml:space="preserve">17</w:t>
+        <w:t xml:space="preserve">14</w:t>
       </w:r>
     </w:p>
     <w:p>
@@ -511,7 +511,7 @@
         <w:tab/>
       </w:r>
       <w:r>
-        <w:t xml:space="preserve">17</w:t>
+        <w:t xml:space="preserve">14</w:t>
       </w:r>
     </w:p>
     <w:p>
@@ -532,7 +532,7 @@
         <w:tab/>
       </w:r>
       <w:r>
-        <w:t xml:space="preserve">22</w:t>
+        <w:t xml:space="preserve">19</w:t>
       </w:r>
     </w:p>
     <w:p>
@@ -553,7 +553,7 @@
         <w:tab/>
       </w:r>
       <w:r>
-        <w:t xml:space="preserve">25</w:t>
+        <w:t xml:space="preserve">22</w:t>
       </w:r>
     </w:p>
     <w:p>
@@ -574,7 +574,7 @@
         <w:tab/>
       </w:r>
       <w:r>
-        <w:t xml:space="preserve">27</w:t>
+        <w:t xml:space="preserve">24</w:t>
       </w:r>
     </w:p>
     <w:p>
@@ -595,7 +595,7 @@
         <w:tab/>
       </w:r>
       <w:r>
-        <w:t xml:space="preserve">34</w:t>
+        <w:t xml:space="preserve">31</w:t>
       </w:r>
     </w:p>
     <w:p>
@@ -616,7 +616,7 @@
         <w:tab/>
       </w:r>
       <w:r>
-        <w:t xml:space="preserve">37</w:t>
+        <w:t xml:space="preserve">34</w:t>
       </w:r>
     </w:p>
     <w:p>
@@ -637,7 +637,7 @@
         <w:tab/>
       </w:r>
       <w:r>
-        <w:t xml:space="preserve">39</w:t>
+        <w:t xml:space="preserve">36</w:t>
       </w:r>
     </w:p>
     <w:p>
@@ -658,7 +658,7 @@
         <w:tab/>
       </w:r>
       <w:r>
-        <w:t xml:space="preserve">40</w:t>
+        <w:t xml:space="preserve">37</w:t>
       </w:r>
     </w:p>
     <w:p>
@@ -679,7 +679,7 @@
         <w:tab/>
       </w:r>
       <w:r>
-        <w:t xml:space="preserve">47</w:t>
+        <w:t xml:space="preserve">44</w:t>
       </w:r>
     </w:p>
     <w:p>
@@ -700,7 +700,7 @@
         <w:tab/>
       </w:r>
       <w:r>
-        <w:t xml:space="preserve">48</w:t>
+        <w:t xml:space="preserve">45</w:t>
       </w:r>
     </w:p>
     <w:p>
@@ -720,7 +720,7 @@
         <w:tab/>
       </w:r>
       <w:r>
-        <w:t xml:space="preserve">51</w:t>
+        <w:t xml:space="preserve">48</w:t>
       </w:r>
     </w:p>
     <w:p>
@@ -740,7 +740,7 @@
         <w:tab/>
       </w:r>
       <w:r>
-        <w:t xml:space="preserve">52</w:t>
+        <w:t xml:space="preserve">49</w:t>
       </w:r>
     </w:p>
     <w:p>
@@ -760,7 +760,7 @@
         <w:tab/>
       </w:r>
       <w:r>
-        <w:t xml:space="preserve">55</w:t>
+        <w:t xml:space="preserve">52</w:t>
       </w:r>
     </w:p>
     <w:p>
@@ -780,7 +780,7 @@
         <w:tab/>
       </w:r>
       <w:r>
-        <w:t xml:space="preserve">57</w:t>
+        <w:t xml:space="preserve">54</w:t>
       </w:r>
     </w:p>
     <w:p>
@@ -800,7 +800,7 @@
         <w:tab/>
       </w:r>
       <w:r>
-        <w:t xml:space="preserve">70</w:t>
+        <w:t xml:space="preserve">67</w:t>
       </w:r>
     </w:p>
     <w:p>
@@ -820,7 +820,7 @@
         <w:tab/>
       </w:r>
       <w:r>
-        <w:t xml:space="preserve">86</w:t>
+        <w:t xml:space="preserve">83</w:t>
       </w:r>
     </w:p>
     <w:p>
@@ -840,7 +840,7 @@
         <w:tab/>
       </w:r>
       <w:r>
-        <w:t xml:space="preserve">106</w:t>
+        <w:t xml:space="preserve">103</w:t>
       </w:r>
     </w:p>
     <w:p>
@@ -860,7 +860,7 @@
         <w:tab/>
       </w:r>
       <w:r>
-        <w:t xml:space="preserve">113</w:t>
+        <w:t xml:space="preserve">110</w:t>
       </w:r>
     </w:p>
     <w:bookmarkStart w:id="24" w:name="list-of-tables"/>
@@ -889,7 +889,7 @@
         <w:tab/>
       </w:r>
       <w:r>
-        <w:t xml:space="preserve">8</w:t>
+        <w:t xml:space="preserve">6</w:t>
       </w:r>
     </w:p>
     <w:p>
@@ -909,7 +909,7 @@
         <w:tab/>
       </w:r>
       <w:r>
-        <w:t xml:space="preserve">33</w:t>
+        <w:t xml:space="preserve">30</w:t>
       </w:r>
     </w:p>
     <w:p>
@@ -929,7 +929,7 @@
         <w:tab/>
       </w:r>
       <w:r>
-        <w:t xml:space="preserve">40</w:t>
+        <w:t xml:space="preserve">37</w:t>
       </w:r>
     </w:p>
     <w:p>
@@ -949,7 +949,7 @@
         <w:tab/>
       </w:r>
       <w:r>
-        <w:t xml:space="preserve">55</w:t>
+        <w:t xml:space="preserve">52</w:t>
       </w:r>
     </w:p>
     <w:p>
@@ -969,7 +969,7 @@
         <w:tab/>
       </w:r>
       <w:r>
-        <w:t xml:space="preserve">55</w:t>
+        <w:t xml:space="preserve">52</w:t>
       </w:r>
     </w:p>
     <w:p>
@@ -989,7 +989,7 @@
         <w:tab/>
       </w:r>
       <w:r>
-        <w:t xml:space="preserve">88</w:t>
+        <w:t xml:space="preserve">85</w:t>
       </w:r>
     </w:p>
     <w:p>
@@ -1009,7 +1009,7 @@
         <w:tab/>
       </w:r>
       <w:r>
-        <w:t xml:space="preserve">92</w:t>
+        <w:t xml:space="preserve">89</w:t>
       </w:r>
     </w:p>
     <w:p>
@@ -1029,7 +1029,7 @@
         <w:tab/>
       </w:r>
       <w:r>
-        <w:t xml:space="preserve">97</w:t>
+        <w:t xml:space="preserve">94</w:t>
       </w:r>
     </w:p>
     <w:p>
@@ -1049,7 +1049,7 @@
         <w:tab/>
       </w:r>
       <w:r>
-        <w:t xml:space="preserve">116</w:t>
+        <w:t xml:space="preserve">113</w:t>
       </w:r>
     </w:p>
     <w:p>
@@ -1069,7 +1069,7 @@
         <w:tab/>
       </w:r>
       <w:r>
-        <w:t xml:space="preserve">118</w:t>
+        <w:t xml:space="preserve">115</w:t>
       </w:r>
     </w:p>
     <w:bookmarkEnd w:id="24"/>
@@ -1099,7 +1099,7 @@
         <w:tab/>
       </w:r>
       <w:r>
-        <w:t xml:space="preserve">19</w:t>
+        <w:t xml:space="preserve">16</w:t>
       </w:r>
     </w:p>
     <w:p>
@@ -1119,7 +1119,7 @@
         <w:tab/>
       </w:r>
       <w:r>
-        <w:t xml:space="preserve">53</w:t>
+        <w:t xml:space="preserve">50</w:t>
       </w:r>
     </w:p>
     <w:bookmarkEnd w:id="25"/>
@@ -1156,15 +1156,15 @@
         <w:pStyle w:val="FirstParagraph"/>
       </w:pPr>
       <w:r>
-        <w:t xml:space="preserve">Ask a person to gather every photo they took last June into a single folder and they will do it — opening a file browser, sorting by date, selecting, dragging.  Ask a computer the same thing, in those same words, and for fifty years it could not.  The instruction has always had to be translated first into the machine’s own vocabulary: a path, a menu, a sequence of clicks, or a command typed with exact syntax.  The graphical desktop made that translation visual rather than textual, but it did not remove it.  The person still adapts to the machine.  This study asks whether that is now optional.</w:t>
-      </w:r>
-    </w:p>
-    <w:p>
-      <w:pPr>
-        <w:pStyle w:val="BodyText"/>
-      </w:pPr>
-      <w:r>
-        <w:t xml:space="preserve">The dominant paradigm for personal computing has remained largely unchanged since the early 1980s, when the graphical desktop — icons, menus, and pointer-driven interaction — was established through the Xerox Star and Apple Lisa lineage.  Despite its longevity, a parallel research tradition has long explored whether users should instead be able to describe what they want in natural language and have the computer carry it out.  The earliest serious system in this tradition, the Berkeley UNIX Consultant, was already operational by the late 1980s [48].  Decades later, the rise of large language models (LLMs) and multimodal foundation models</w:t>
+        <w:t xml:space="preserve">Ask a person to gather every photo they took last June into a single folder and they will do it — opening a file browser, sorting by date, selecting, dragging.  Ask a computer the same thing, in those same words, and for most of the history of personal computing it could not.  The instruction has had to be translated first into the machine’s own vocabulary: a path, a menu, a sequence of clicks, or a command typed with exact syntax.  Language models now do that translation: they write the command for a person who could not.  That moves the risk.  The person no longer has to know the command, but neither can they check it, and when a command they did not write and cannot read is wrong, it is their files that are lost.</w:t>
+      </w:r>
+    </w:p>
+    <w:p>
+      <w:pPr>
+        <w:pStyle w:val="BodyText"/>
+      </w:pPr>
+      <w:r>
+        <w:t xml:space="preserve">The aspiration to instruct a computer in ordinary language is old; its earliest serious system, the Berkeley UNIX Consultant, was operational by the late 1980s [48].  Large language models (LLMs) and multimodal foundation models</w:t>
       </w:r>
       <w:hyperlink w:anchor="ch1-fn1">
         <w:r>
@@ -1179,15 +1179,7 @@
         <w:t xml:space="preserve"> </w:t>
       </w:r>
       <w:r>
-        <w:t xml:space="preserve">has reopened this thread with substantially greater technical capability.</w:t>
-      </w:r>
-    </w:p>
-    <w:p>
-      <w:pPr>
-        <w:pStyle w:val="BodyText"/>
-      </w:pPr>
-      <w:r>
-        <w:t xml:space="preserve">The field that has emerged sits at the intersection of human-computer interaction, operating systems, natural language processing, computer vision, and program analysis.  On the shell side, recent work has demonstrated that LLMs can translate natural language into Bash commands with usable accuracy and can be embedded as a Unix primitive with appropriate safety guardrails [12, 46].  On the graphical side, so-called computer-using agents</w:t>
+        <w:t xml:space="preserve">have reopened it with far greater capability.  They translate natural language into Bash commands with usable accuracy [12, 46], and computer-using agents</w:t>
       </w:r>
       <w:hyperlink w:anchor="ch1-fn2">
         <w:r>
@@ -1202,38 +1194,63 @@
         <w:t xml:space="preserve"> </w:t>
       </w:r>
       <w:r>
-        <w:t xml:space="preserve">now operate desktop and mobile applications by combining native APIs with vision-based grounding [52, 53].  On the web, language-guided agents complete tasks across realistic websites with measurable but limited reliability [55, 56].  A converging research thread approaches the same technical problem from an accessibility perspective: speech-driven GUI command mapping for users with motor and speech impairments has progressed from voice-to-text dictation toward voice-to-action agents, with recent work on speech-instructed GUI agents [13] and region-aware visual grounding [33] demonstrating that the underlying components are maturing rapidly.  Yet the gap between demonstration and deployable replacement remains substantial.  Capability on short, self-contained tasks has advanced quickly, but sustained computer work has not: on OSWorld 2.0, a benchmark of long-horizon tasks whose median item takes a skilled human roughly an hour and a half, the best frontier configuration completes only 20.6% of tasks outright [51].</w:t>
-      </w:r>
-    </w:p>
-    <w:p>
-      <w:pPr>
-        <w:pStyle w:val="BodyText"/>
-      </w:pPr>
-      <w:r>
-        <w:t xml:space="preserve">This rapid progress has been uneven across platforms.  Windows is heavily represented in the desktop agent literature [16, 53], Android in the mobile agent literature [35, 45, 54], and the browser in the web agent literature [9, 55, 56].  Linux desktop coverage, by contrast, is conspicuously absent: existing work either addresses Linux only at the shell level [12] or treats it as one of several evaluation platforms rather than a primary target [49].  No surveyed system implements a working conversational session layer</w:t>
-      </w:r>
-      <w:hyperlink w:anchor="ch1-fn3">
-        <w:r>
-          <w:rPr>
-            <w:rStyle w:val="Hyperlink"/>
-            <w:vertAlign w:val="superscript"/>
-          </w:rPr>
-          <w:t xml:space="preserve">3</w:t>
-        </w:r>
-      </w:hyperlink>
-      <w:r>
-        <w:t xml:space="preserve"> </w:t>
-      </w:r>
-      <w:r>
-        <w:t xml:space="preserve">for the Linux desktop, despite Linux’s wide use for development and server work.</w:t>
-      </w:r>
-    </w:p>
-    <w:p>
-      <w:pPr>
-        <w:pStyle w:val="BodyText"/>
-      </w:pPr>
-      <w:r>
-        <w:t xml:space="preserve">Capability raises a question of safety, and it is the question this study takes as its subject.  A system that writes a shell command from a request and runs it acts on the user’s own files, so the cost of a misunderstood or over-broad command is measured in lost data.  Shell commands are programs: their targets may be hidden inside other commands or computed only while they run, so what a command will change cannot be read from its name.  Determining that before it runs, and saving beforehand exactly what it would destroy so that it can be undone, is a problem of program analysis.  This study addresses it, and uses a conversational interface layer for the Linux desktop as the setting in which the analysis is deployed and validated.</w:t>
+        <w:t xml:space="preserve">built on them operate desktop, mobile, and web applications [52, 53, 55, 56].  More and more of these systems act by running commands on a real machine, and so on a person’s own files.</w:t>
+      </w:r>
+    </w:p>
+    <w:p>
+      <w:pPr>
+        <w:pStyle w:val="BodyText"/>
+      </w:pPr>
+      <w:r>
+        <w:t xml:space="preserve">A command can delete or overwrite files, and whether that can be undone depends on what was saved before it ran.  Shell commands are programs: their targets may be hidden inside other commands, as in</w:t>
+      </w:r>
+      <w:r>
+        <w:t xml:space="preserve"> </w:t>
+      </w:r>
+      <w:r>
+        <w:rPr>
+          <w:rStyle w:val="VerbatimChar"/>
+        </w:rPr>
+        <w:t xml:space="preserve">sudo rm</w:t>
+      </w:r>
+      <w:r>
+        <w:t xml:space="preserve">,</w:t>
+      </w:r>
+      <w:r>
+        <w:t xml:space="preserve"> </w:t>
+      </w:r>
+      <w:r>
+        <w:rPr>
+          <w:rStyle w:val="VerbatimChar"/>
+        </w:rPr>
+        <w:t xml:space="preserve">find -exec</w:t>
+      </w:r>
+      <w:r>
+        <w:t xml:space="preserve">, or</w:t>
+      </w:r>
+      <w:r>
+        <w:t xml:space="preserve"> </w:t>
+      </w:r>
+      <w:r>
+        <w:rPr>
+          <w:rStyle w:val="VerbatimChar"/>
+        </w:rPr>
+        <w:t xml:space="preserve">xargs</w:t>
+      </w:r>
+      <w:r>
+        <w:t xml:space="preserve">, or computed only while they run, as in</w:t>
+      </w:r>
+      <w:r>
+        <w:t xml:space="preserve"> </w:t>
+      </w:r>
+      <w:r>
+        <w:rPr>
+          <w:rStyle w:val="VerbatimChar"/>
+        </w:rPr>
+        <w:t xml:space="preserve">rm $(ls *.log)</w:t>
+      </w:r>
+      <w:r>
+        <w:t xml:space="preserve">, so what a command will change cannot be read from its name.  Determining that before it runs, and saving beforehand exactly what it would destroy, is a problem of program analysis rather than of interface design.  This study addresses it, and uses a conversational interface layer for the Linux desktop as the setting in which the analysis is deployed and validated.</w:t>
       </w:r>
     </w:p>
     <w:bookmarkEnd w:id="28"/>
@@ -1251,7 +1268,7 @@
         <w:pStyle w:val="FirstParagraph"/>
       </w:pPr>
       <w:r>
-        <w:t xml:space="preserve">Capability brings a risk the field has not addressed.  A system that turns a request into a shell command and runs it acts on the user’s own files, and a command generated from a misunderstood request, or one simply broader than intended, can delete or overwrite them with no way back.  The surveyed systems guard against this in one of two ways, and neither looks at what a particular command will do.  Most guard by</w:t>
+        <w:t xml:space="preserve">Systems that run generated commands do guard them, in one of two ways, and neither looks at what a particular command will do.  Most guard by</w:t>
       </w:r>
       <w:r>
         <w:t xml:space="preserve"> </w:t>
@@ -1264,42 +1281,23 @@
         <w:t xml:space="preserve">permission</w:t>
       </w:r>
       <w:r>
-        <w:t xml:space="preserve">: the generated command is matched against a list of patterns judged dangerous and is then allowed, refused, or put to the user [12].  A few that ship add coarse recovery: Alibaba Cloud’s ANOLISA, a Linux distribution for AI agents, snapshots an agent’s workspace before key operations or after each round of conversation and can roll back to any snapshot [1], which restores everything since the snapshot rather than what one command destroyed.  A list cannot see what a command will actually touch when its targets are hidden inside another command, such as</w:t>
-      </w:r>
-      <w:r>
-        <w:t xml:space="preserve"> </w:t>
-      </w:r>
-      <w:r>
-        <w:rPr>
-          <w:rStyle w:val="VerbatimChar"/>
-        </w:rPr>
-        <w:t xml:space="preserve">find -exec</w:t>
-      </w:r>
-      <w:r>
-        <w:t xml:space="preserve"> </w:t>
-      </w:r>
-      <w:r>
-        <w:t xml:space="preserve">or</w:t>
-      </w:r>
-      <w:r>
-        <w:t xml:space="preserve"> </w:t>
-      </w:r>
-      <w:r>
-        <w:rPr>
-          <w:rStyle w:val="VerbatimChar"/>
-        </w:rPr>
-        <w:t xml:space="preserve">xargs</w:t>
-      </w:r>
-      <w:r>
-        <w:t xml:space="preserve">, or are computed while it runs, and neither a list nor a snapshot can say, before a command runs, whether it will lose anything.  Whether a generated command can be undone, and what must be saved beforehand so that it can be, is a question of program analysis rather than of interface design, and no surveyed system answers it.</w:t>
-      </w:r>
-    </w:p>
-    <w:p>
-      <w:pPr>
-        <w:pStyle w:val="BodyText"/>
-      </w:pPr>
-      <w:r>
-        <w:t xml:space="preserve">Four compounding gaps in the existing literature therefore motivate the present research.  First, no surveyed system determines, before a generated command runs, what it would destroy, or captures exactly that so that the command can be undone; this is the gap the study’s algorithmic contribution addresses.  Second, no</w:t>
+        <w:t xml:space="preserve">: the command is matched against a list of patterns judged dangerous and is then allowed, refused, or put to the user [12], as in the dangerous-command check of OpenAI’s Codex CLI [31] and cc-safety-net, a guard used with several AI coding agents [20].  A few that ship add coarse recovery: Alibaba Cloud’s ANOLISA, a Linux distribution for AI agents, snapshots an agent’s workspace before key operations or after each round of conversation and can roll back to any snapshot [1], which restores everything since the snapshot rather than what one command destroyed.  A list judges a command by its name and arguments, so it misses what the command touches through another command or a target computed at run time, and neither a list nor a snapshot can say, before a command runs, whether it will lose anything.  NaSh, a design for a natural-language shell, proposes summaries of what a command would affect and selective undo, but leaves their mechanism open [12], and no implemented and evaluated system determines, before a generated command runs, what it would destroy, or captures exactly that so that the command can be undone.  That is the gap this study’s research addresses.</w:t>
+      </w:r>
+    </w:p>
+    <w:p>
+      <w:pPr>
+        <w:pStyle w:val="BodyText"/>
+      </w:pPr>
+      <w:r>
+        <w:t xml:space="preserve">The setting in which the gap arises has gaps of its own, surveyed in Chapter 2, Section 2.9: no implemented and evaluated system places a conversational layer over a whole desktop session for the person using the machine [24, 53], the Linux work that exists serves servers and agents rather than an end user’s desktop [1, 12], and controlled comparisons with the conventional graphical workflow cover narrow slices such as a single application [25].  They are not what this study contributes; they are why the analysis is deployed in a working interface and validated with people, rather than only evaluated on a corpus.</w:t>
+      </w:r>
+    </w:p>
+    <w:p>
+      <w:pPr>
+        <w:pStyle w:val="BodyText"/>
+      </w:pPr>
+      <w:r>
+        <w:t xml:space="preserve">The opportunity is algorithmic.  A command’s effect on a system can often be derived from the command itself, before it runs, and what that effect would destroy can be saved first; where it cannot be derived, the analysis can say so and ask.  This study builds that analysis, and its terms are used throughout.  An</w:t>
       </w:r>
       <w:r>
         <w:t xml:space="preserve"> </w:t>
@@ -1309,44 +1307,289 @@
           <w:i/>
           <w:iCs/>
         </w:rPr>
-        <w:t xml:space="preserve">implemented and empirically evaluated</w:t>
-      </w:r>
-      <w:r>
-        <w:t xml:space="preserve"> </w:t>
-      </w:r>
-      <w:r>
-        <w:t xml:space="preserve">system places a conversational layer over a desktop session as a whole, addressed to the person using the machine.  AgentOS [24] proposes a natural-language portal in place of the graphical desktop, but as a research direction, without a built system or an evaluation, and the systems that are built automate the desktop on the user’s behalf: UFO², for instance, positions itself as a “Desktop AgentOS” but runs as an automation layer beside the user’s own Windows session, deliberately confining itself to a separate desktop so that agent and user do not interfere [53].  Third, the Linux work that exists serves servers and agents rather than the desktop session of an end user.  NaSh addresses Linux at the shell level as a design proposal without evaluation [12]; shipping natural-language shells such as ANOLISA pair intent translation with approval gating and snapshot rollback, but are built to run AI agents on cloud servers [1]; and OSWorld includes Ubuntu as an evaluation platform rather than a deployment target [49].  Fourth, controlled comparison against the conventional graphical workflow exists only for narrow slices of the problem.  AXIS evaluates an API-first agent against manual operation within a single application, Microsoft Word, using a cloud-hosted frontier model [25], and the accessibility literature evaluates assistance for specific populations [32].  No study compares a conversational interface against the conventional workflow across operating-system-level tasks, on a Linux desktop, driven by a locally-hosted small model, under an explicit safety gate.  The first of these gaps is the one this study’s research addresses.  The other three describe the setting in which it arises, and they are why the analysis is deployed and validated in a conversational interface layer rather than studied on a corpus alone.</w:t>
-      </w:r>
-    </w:p>
-    <w:p>
-      <w:pPr>
-        <w:pStyle w:val="BodyText"/>
-      </w:pPr>
-      <w:r>
-        <w:t xml:space="preserve">Notably, the accessibility-focused thread of the field exhibits the inverse limitation.  Speech-to-GUI mapping research targets specific user populations — users with motor impairments, speech disorders, or cognitive disabilities — with specialized techniques such as speech-instructed GUI agents and resilient visual grounding [13, 33], but operates at the level of individual applications or interaction techniques rather than at the level of the session layer itself.  These approaches presuppose an underlying conversational surface on which to run.  A conversational interface layer over the whole session could provide one, which makes accessibility a possible later use of the platform built for this study, though it is outside the study’s scope.</w:t>
-      </w:r>
-    </w:p>
-    <w:p>
-      <w:pPr>
-        <w:pStyle w:val="BodyText"/>
-      </w:pPr>
-      <w:r>
-        <w:t xml:space="preserve">These gaps present an opportunity that is algorithmic first.  Whether a generated command can be undone, and what must be saved beforehand so that it can be, can be decided by analysing the command itself: deriving what it would change from its syntactic structure, resolving the targets it computes while it runs before it runs, and capturing exactly what it would destroy.  That analysis is independent of the interface and the model that produced the command, and it is this study’s research contribution.  It needs a setting in which generated commands act on a real user’s files, and the remaining gaps supply one.  SynapseOS, built for this study, adds a conversational interface layer to a Linux desktop that continues running underneath it, in the way a new interactive shell such as</w:t>
-      </w:r>
-      <w:r>
-        <w:t xml:space="preserve"> </w:t>
+        <w:t xml:space="preserve">effect</w:t>
+      </w:r>
+      <w:r>
+        <w:t xml:space="preserve"> </w:t>
+      </w:r>
+      <w:r>
+        <w:t xml:space="preserve">is one thing a command does to one path — reading, creating, writing, or removing it, or changing its permissions — or to the system’s installed packages and running services.  A</w:t>
+      </w:r>
+      <w:r>
+        <w:t xml:space="preserve"> </w:t>
+      </w:r>
+      <w:r>
+        <w:rPr>
+          <w:i/>
+          <w:iCs/>
+        </w:rPr>
+        <w:t xml:space="preserve">pre-image</w:t>
+      </w:r>
+      <w:r>
+        <w:t xml:space="preserve"> </w:t>
+      </w:r>
+      <w:r>
+        <w:t xml:space="preserve">is the data an effect would destroy, and</w:t>
+      </w:r>
+      <w:r>
+        <w:t xml:space="preserve"> </w:t>
+      </w:r>
+      <w:r>
+        <w:rPr>
+          <w:i/>
+          <w:iCs/>
+        </w:rPr>
+        <w:t xml:space="preserve">capturing</w:t>
+      </w:r>
+      <w:r>
+        <w:t xml:space="preserve"> </w:t>
+      </w:r>
+      <w:r>
+        <w:t xml:space="preserve">it means saving it before the command runs by the cheapest means that suffices — a hardlink, a copy, or a record — so that undo can restore it. </w:t>
+      </w:r>
+      <w:r>
+        <w:t xml:space="preserve"> </w:t>
+      </w:r>
+      <w:r>
+        <w:rPr>
+          <w:i/>
+          <w:iCs/>
+        </w:rPr>
+        <w:t xml:space="preserve">Composition</w:t>
+      </w:r>
+      <w:r>
+        <w:t xml:space="preserve"> </w:t>
+      </w:r>
+      <w:r>
+        <w:t xml:space="preserve">follows effects through the operators that join commands into one line (</w:t>
       </w:r>
       <w:r>
         <w:rPr>
           <w:rStyle w:val="VerbatimChar"/>
         </w:rPr>
-        <w:t xml:space="preserve">zsh</w:t>
-      </w:r>
-      <w:r>
-        <w:t xml:space="preserve"> </w:t>
-      </w:r>
-      <w:r>
-        <w:t xml:space="preserve">sits over an unchanged kernel and core utilities: the desktop shell, window manager, and application launcher are left in place, as are the kernel, the core system utilities, and the existing application ecosystem, and a user retains every route to the machine they already had and gains a third.  It serves as the experimental platform on which the analysis is deployed, demonstrated, and validated in use, with people of differing technical fluency and with each participant’s own primary operating system as the baseline.</w:t>
+        <w:t xml:space="preserve">;</w:t>
+      </w:r>
+      <w:r>
+        <w:t xml:space="preserve">,</w:t>
+      </w:r>
+      <w:r>
+        <w:t xml:space="preserve"> </w:t>
+      </w:r>
+      <w:r>
+        <w:rPr>
+          <w:rStyle w:val="VerbatimChar"/>
+        </w:rPr>
+        <w:t xml:space="preserve">&amp;&amp;</w:t>
+      </w:r>
+      <w:r>
+        <w:t xml:space="preserve">,</w:t>
+      </w:r>
+      <w:r>
+        <w:t xml:space="preserve"> </w:t>
+      </w:r>
+      <w:r>
+        <w:rPr>
+          <w:rStyle w:val="VerbatimChar"/>
+        </w:rPr>
+        <w:t xml:space="preserve">||</w:t>
+      </w:r>
+      <w:r>
+        <w:t xml:space="preserve">, pipes, and redirection) and through the commands that run other commands (wrappers such as</w:t>
+      </w:r>
+      <w:r>
+        <w:t xml:space="preserve"> </w:t>
+      </w:r>
+      <w:r>
+        <w:rPr>
+          <w:rStyle w:val="VerbatimChar"/>
+        </w:rPr>
+        <w:t xml:space="preserve">sudo</w:t>
+      </w:r>
+      <w:r>
+        <w:t xml:space="preserve">,</w:t>
+      </w:r>
+      <w:r>
+        <w:t xml:space="preserve"> </w:t>
+      </w:r>
+      <w:r>
+        <w:rPr>
+          <w:rStyle w:val="VerbatimChar"/>
+        </w:rPr>
+        <w:t xml:space="preserve">find -exec</w:t>
+      </w:r>
+      <w:r>
+        <w:t xml:space="preserve">,</w:t>
+      </w:r>
+      <w:r>
+        <w:t xml:space="preserve"> </w:t>
+      </w:r>
+      <w:r>
+        <w:rPr>
+          <w:rStyle w:val="VerbatimChar"/>
+        </w:rPr>
+        <w:t xml:space="preserve">xargs</w:t>
+      </w:r>
+      <w:r>
+        <w:t xml:space="preserve">,</w:t>
+      </w:r>
+      <w:r>
+        <w:t xml:space="preserve"> </w:t>
+      </w:r>
+      <w:r>
+        <w:rPr>
+          <w:rStyle w:val="VerbatimChar"/>
+        </w:rPr>
+        <w:t xml:space="preserve">sh -c</w:t>
+      </w:r>
+      <w:r>
+        <w:t xml:space="preserve"> </w:t>
+      </w:r>
+      <w:r>
+        <w:t xml:space="preserve">strings,</w:t>
+      </w:r>
+      <w:r>
+        <w:t xml:space="preserve"> </w:t>
+      </w:r>
+      <w:r>
+        <w:rPr>
+          <w:rStyle w:val="VerbatimChar"/>
+        </w:rPr>
+        <w:t xml:space="preserve">eval</w:t>
+      </w:r>
+      <w:r>
+        <w:t xml:space="preserve">, and loops), and</w:t>
+      </w:r>
+      <w:r>
+        <w:t xml:space="preserve"> </w:t>
+      </w:r>
+      <w:r>
+        <w:rPr>
+          <w:i/>
+          <w:iCs/>
+        </w:rPr>
+        <w:t xml:space="preserve">resolution</w:t>
+      </w:r>
+      <w:r>
+        <w:t xml:space="preserve"> </w:t>
+      </w:r>
+      <w:r>
+        <w:t xml:space="preserve">learns targets known only at run time by running a form of the command first proven to change nothing.  The analysis’s</w:t>
+      </w:r>
+      <w:r>
+        <w:t xml:space="preserve"> </w:t>
+      </w:r>
+      <w:r>
+        <w:rPr>
+          <w:i/>
+          <w:iCs/>
+        </w:rPr>
+        <w:t xml:space="preserve">verdict</w:t>
+      </w:r>
+      <w:r>
+        <w:t xml:space="preserve"> </w:t>
+      </w:r>
+      <w:r>
+        <w:t xml:space="preserve">on a command is one of three:</w:t>
+      </w:r>
+      <w:r>
+        <w:t xml:space="preserve"> </w:t>
+      </w:r>
+      <w:r>
+        <w:rPr>
+          <w:i/>
+          <w:iCs/>
+        </w:rPr>
+        <w:t xml:space="preserve">recoverable</w:t>
+      </w:r>
+      <w:r>
+        <w:t xml:space="preserve">, if undoing it needs nothing saved because it only creates or moves files;</w:t>
+      </w:r>
+      <w:r>
+        <w:t xml:space="preserve"> </w:t>
+      </w:r>
+      <w:r>
+        <w:rPr>
+          <w:i/>
+          <w:iCs/>
+        </w:rPr>
+        <w:t xml:space="preserve">recoverable with capture</w:t>
+      </w:r>
+      <w:r>
+        <w:t xml:space="preserve">, if undoing it needs pre-images saved first; and</w:t>
+      </w:r>
+      <w:r>
+        <w:t xml:space="preserve"> </w:t>
+      </w:r>
+      <w:r>
+        <w:rPr>
+          <w:i/>
+          <w:iCs/>
+        </w:rPr>
+        <w:t xml:space="preserve">unrecoverable</w:t>
+      </w:r>
+      <w:r>
+        <w:t xml:space="preserve">, if no capture would restore what it does, or the analysis cannot tell.  It</w:t>
+      </w:r>
+      <w:r>
+        <w:t xml:space="preserve"> </w:t>
+      </w:r>
+      <w:r>
+        <w:rPr>
+          <w:i/>
+          <w:iCs/>
+        </w:rPr>
+        <w:t xml:space="preserve">fails closed</w:t>
+      </w:r>
+      <w:r>
+        <w:t xml:space="preserve">: anything it cannot determine is unrecoverable, so the user is asked.  A confirmation</w:t>
+      </w:r>
+      <w:r>
+        <w:t xml:space="preserve"> </w:t>
+      </w:r>
+      <w:r>
+        <w:rPr>
+          <w:i/>
+          <w:iCs/>
+        </w:rPr>
+        <w:t xml:space="preserve">policy</w:t>
+      </w:r>
+      <w:r>
+        <w:t xml:space="preserve"> </w:t>
+      </w:r>
+      <w:r>
+        <w:t xml:space="preserve">decides which verdicts the user is asked about: the</w:t>
+      </w:r>
+      <w:r>
+        <w:t xml:space="preserve"> </w:t>
+      </w:r>
+      <w:r>
+        <w:rPr>
+          <w:i/>
+          <w:iCs/>
+        </w:rPr>
+        <w:t xml:space="preserve">strict</w:t>
+      </w:r>
+      <w:r>
+        <w:t xml:space="preserve"> </w:t>
+      </w:r>
+      <w:r>
+        <w:t xml:space="preserve">policy asks before every command that is not plainly recoverable, and the</w:t>
+      </w:r>
+      <w:r>
+        <w:t xml:space="preserve"> </w:t>
+      </w:r>
+      <w:r>
+        <w:rPr>
+          <w:i/>
+          <w:iCs/>
+        </w:rPr>
+        <w:t xml:space="preserve">capture</w:t>
+      </w:r>
+      <w:r>
+        <w:t xml:space="preserve"> </w:t>
+      </w:r>
+      <w:r>
+        <w:t xml:space="preserve">policy asks only before unrecoverable ones, capturing the rest silently.  The analysis takes a command as a string, so it is independent of the interface and of the model that wrote the command.  SynapseOS, a conversational interface layer built for this study over a Linux desktop that keeps running underneath it, is the experimental platform on which the analysis is deployed and validated with people, against each participant’s own primary operating system.</w:t>
       </w:r>
     </w:p>
     <w:bookmarkEnd w:id="29"/>
@@ -1364,7 +1607,7 @@
         <w:pStyle w:val="FirstParagraph"/>
       </w:pPr>
       <w:r>
-        <w:t xml:space="preserve">A system that turns a request in ordinary language into a shell command and runs it acts directly on the user’s own files and system state.  Language models have made such systems practical: a person who cannot write a shell command can now have one written for them, and conversational interfaces, coding assistants, and agentic tools increasingly execute what a model writes.  A generated command can be wrong, or broader than the request intended, and whether what it destroys can be restored depends entirely on what was saved before it ran.  The tools that execute generated commands today decide only whether to run them, by matching the command against a list of patterns judged dangerous; they cannot determine what a command will touch when its targets are hidden inside another command or computed while it runs, and those that offer recovery at all snapshot a workspace wholesale, without knowing what any one command will destroy [1].  This study addresses that problem: determining, before a generated shell command runs, what it would change, whether the change can be undone, and the least that must be captured beforehand so that it can be.  It is a problem of program analysis rather than of interface design, and the surveyed systems leave it open.  It is studied in the setting where it is most acute — a conversational interface layer through which a person who does not read shell syntax operates a Linux desktop — but the analysis takes a command as a string and is independent of the interface and the model that produced it.</w:t>
+        <w:t xml:space="preserve">Language models have made it practical to turn a request in ordinary language into a shell command and run it on the user’s own system, and conversational interfaces, coding assistants, and agentic tools increasingly execute what a model writes.  A generated command can be wrong, or broader than the request intended, and whether what it destroys can be restored depends on what was saved before it ran, which the tools that run such commands today do not determine (Section 1.2).  This study addresses that problem: determining, before a generated shell command runs, what it would change, whether the change can be undone, and the least that must be captured beforehand so that it can be.  It is studied where it is most acute, a person who does not read shell syntax operating a Linux desktop through conversation, but the analysis applies wherever generated bash commands run on a system like the one studied.</w:t>
       </w:r>
     </w:p>
     <w:p>
@@ -1396,7 +1639,7 @@
         </w:numPr>
       </w:pPr>
       <w:r>
-        <w:t xml:space="preserve">Can a command’s effects be derived from its syntactic structure before it runs — composed through the wrappers,</w:t>
+        <w:t xml:space="preserve">Can a command’s effects be derived from its syntactic structure before it runs — composed through the operators that join commands and the commands that run other commands, with targets known only at run time (command substitutions,</w:t>
       </w:r>
       <w:r>
         <w:t xml:space="preserve"> </w:t>
@@ -1405,10 +1648,13 @@
         <w:rPr>
           <w:rStyle w:val="VerbatimChar"/>
         </w:rPr>
-        <w:t xml:space="preserve">find -exec</w:t>
-      </w:r>
-      <w:r>
-        <w:t xml:space="preserve">,</w:t>
+        <w:t xml:space="preserve">find</w:t>
+      </w:r>
+      <w:r>
+        <w:t xml:space="preserve"> </w:t>
+      </w:r>
+      <w:r>
+        <w:t xml:space="preserve">matches,</w:t>
       </w:r>
       <w:r>
         <w:t xml:space="preserve"> </w:t>
@@ -1420,7 +1666,10 @@
         <w:t xml:space="preserve">xargs</w:t>
       </w:r>
       <w:r>
-        <w:t xml:space="preserve">, loops, and substitutions that hide its targets, with targets known only at run time resolved by commands first proven read-only — without executing anything that changes the system?</w:t>
+        <w:t xml:space="preserve"> </w:t>
+      </w:r>
+      <w:r>
+        <w:t xml:space="preserve">input, archive members) resolved by commands first proven read-only — without executing anything that changes the system?</w:t>
       </w:r>
     </w:p>
     <w:p>
@@ -1444,7 +1693,7 @@
         </w:numPr>
       </w:pPr>
       <w:r>
-        <w:t xml:space="preserve">Against an enumerated list of destructive patterns and a list that refuses every command it does not recognize, does the analysis lose less data silently, restore more of what is lost, and ask the user less often?</w:t>
+        <w:t xml:space="preserve">Against an enumerated list of destructive patterns, a list that refuses every command it does not recognize, and the command-safety checks of open-source AI coding agents, does the analysis lose less data silently, restore more of what is lost, and ask the user less often?</w:t>
       </w:r>
     </w:p>
     <w:p>
@@ -1464,7 +1713,7 @@
         <w:pStyle w:val="FirstParagraph"/>
       </w:pPr>
       <w:r>
-        <w:t xml:space="preserve">A further question is answered by validation rather than posed as a research question: whether the analysis’s decisions hold when it is deployed in a working interface and exercised by people, whose commands the evaluation corpus does not contain (Chapter 3, Section 3.3 onward).</w:t>
+        <w:t xml:space="preserve">A further question is answered by validation rather than posed as a research question: whether the analysis’s decisions hold when it is deployed in a working interface and exercised by people, whose commands the evaluation corpus does not contain (Chapter 3, Sections 3.3–3.7).</w:t>
       </w:r>
     </w:p>
     <w:bookmarkEnd w:id="30"/>
@@ -1482,7 +1731,7 @@
         <w:pStyle w:val="FirstParagraph"/>
       </w:pPr>
       <w:r>
-        <w:t xml:space="preserve">The general objective of this study is to design and evaluate a recoverability analysis for shell commands generated by a language model: an algorithm that determines, before a command runs, what it would change, and computes the minimum-cost set of pre-images that must be captured for the command to be undone.  The algorithm is deployed in SynapseOS, a conversational interface layer for the Linux desktop built for this study, which serves as the experimental platform on which the algorithm is demonstrated and validated in use.</w:t>
+        <w:t xml:space="preserve">The general objective of this study is to design and evaluate a recoverability analysis for shell commands generated by a language model: an algorithm that determines, before a command runs, what it would change, and computes the minimum-cost set of pre-images that must be captured for the command to be undone.  The algorithm is deployed in SynapseOS, the experimental platform on which it is demonstrated and validated in use.</w:t>
       </w:r>
     </w:p>
     <w:p>
@@ -1514,31 +1763,7 @@
         </w:numPr>
       </w:pPr>
       <w:r>
-        <w:t xml:space="preserve">To develop an effect-composition algorithm that derives a command’s effects from its syntactic structure rather than its name, composing them through wrappers,</w:t>
-      </w:r>
-      <w:r>
-        <w:t xml:space="preserve"> </w:t>
-      </w:r>
-      <w:r>
-        <w:rPr>
-          <w:rStyle w:val="VerbatimChar"/>
-        </w:rPr>
-        <w:t xml:space="preserve">find -exec</w:t>
-      </w:r>
-      <w:r>
-        <w:t xml:space="preserve">,</w:t>
-      </w:r>
-      <w:r>
-        <w:t xml:space="preserve"> </w:t>
-      </w:r>
-      <w:r>
-        <w:rPr>
-          <w:rStyle w:val="VerbatimChar"/>
-        </w:rPr>
-        <w:t xml:space="preserve">xargs</w:t>
-      </w:r>
-      <w:r>
-        <w:t xml:space="preserve">, loops, and substitutions, and resolving targets known only at run time through dry runs it first proves read-only (RQ2).</w:t>
+        <w:t xml:space="preserve">To develop an effect-composition algorithm that derives a command’s effects from its syntactic structure rather than its name, composing them through the commands that run other commands and resolving targets known only at run time through dry runs it first proves read-only (RQ2).</w:t>
       </w:r>
     </w:p>
     <w:p>
@@ -1562,7 +1787,7 @@
         </w:numPr>
       </w:pPr>
       <w:r>
-        <w:t xml:space="preserve">To evaluate the recoverability analysis against pattern-based and fail-closed baselines, and against the command-safety checks of open-source AI agents, on a held-out command corpus whose ground truth is obtained by sandboxed execution, measuring silent data loss, verified restoration, and needless confirmation, with statistical testing (RQ4).</w:t>
+        <w:t xml:space="preserve">To evaluate the recoverability analysis against pattern-based and fail-closed baselines and the command-safety checks of open-source AI coding agents, on a held-out command corpus whose ground truth is obtained by sandboxed execution, measuring silent data loss, verified restoration, and needless confirmation, with statistical testing (RQ4).</w:t>
       </w:r>
     </w:p>
     <w:p>
@@ -1582,7 +1807,7 @@
         <w:pStyle w:val="FirstParagraph"/>
       </w:pPr>
       <w:r>
-        <w:t xml:space="preserve">Each objective is algorithmic and measurable, and each would stand if the interface were removed, because the analysis takes a shell command as a string.  SynapseOS is the means by which the algorithm is deployed, demonstrated, and validated in use, not an objective in itself: the validation study (Chapter 3, Sections 3.3–3.7) measures how the analysis’s decisions hold on commands participants cause, and characterizes the platform through task success, time, error rate, and workload against each participant’s own primary operating system.</w:t>
+        <w:t xml:space="preserve">Each objective is algorithmic and measurable, and each would stand if the interface were removed, because the analysis takes a shell command as a string.  SynapseOS is the platform, not an objective in itself: the validation study (Chapter 3, Sections 3.3–3.7) measures how the analysis’s decisions hold on commands participants cause, and characterizes the platform through task success, time, error rate, and workload.</w:t>
       </w:r>
     </w:p>
     <w:bookmarkEnd w:id="31"/>
@@ -1600,7 +1825,7 @@
         <w:pStyle w:val="FirstParagraph"/>
       </w:pPr>
       <w:r>
-        <w:t xml:space="preserve">This study’s design principle is to adopt existing software wherever it will serve and to build only what cannot be adopted.  The principle is stated here because it is what makes the contribution identifiable: if everything that can be taken off the shelf is taken off the shelf, then whatever remains is the original work by construction rather than by assertion.  Table 1.1 states what is adopted, so that what follows it can be read against a complete account of what is not.</w:t>
+        <w:t xml:space="preserve">This study’s design principle is to adopt existing software wherever it will serve and to build only what cannot be adopted.  The principle is stated here because it locates the contribution: most of what is adopted, in Table 1.1, is the platform’s stack, and what is built is the analysis, whose novelty against prior work is argued in Chapter 2.</w:t>
       </w:r>
     </w:p>
     <w:p>
@@ -1894,7 +2119,7 @@
               <w:jc w:val="left"/>
             </w:pPr>
             <w:r>
-              <w:t xml:space="preserve">A captured commit identifier restores prior state more reliably and far more cheaply than any file-level copy</w:t>
+              <w:t xml:space="preserve">For files a repository tracks, one captured commit identifier restores their committed state, where copying each file would cost far more</w:t>
             </w:r>
           </w:p>
         </w:tc>
@@ -2003,7 +2228,7 @@
         <w:t xml:space="preserve"> </w:t>
       </w:r>
       <w:r>
-        <w:t xml:space="preserve">Given a command produced by a language model, the algorithm finds what it would change and, where that can be reversed only with preparation, computes the minimal set of pre-images sufficient to restore the prior state.  It makes two claims and no others: it sees through the wrappers a line hides its effects behind, and it resolves targets computed at run time before the command runs.  Deciding whether a command is dangerous is not among them: a list that refuses every command it does not recognize reaches the same verdict on the commands studied here, and the contribution is the capture that follows.  Its formal basis is an</w:t>
+        <w:t xml:space="preserve">Given a command, the algorithm derives its effects from its structure, through composition and the read-only resolution of run-time targets; decides whether the command can be undone; and computes the minimum-cost set of pre-images to capture before it runs.  Its formal basis is an</w:t>
       </w:r>
       <w:r>
         <w:t xml:space="preserve"> </w:t>
@@ -2016,7 +2241,10 @@
         <w:t xml:space="preserve">effect semantics</w:t>
       </w:r>
       <w:r>
-        <w:t xml:space="preserve">: a command is represented not by its name but by the set of system effects its syntactic structure implies — which paths it would read, create, write, remove, or alter in metadata — resolved against a working directory and propagated through the operators that join commands into one line.  The recovery plan is a minimum-cost cover of that effect set, and the verdict a predicate over it.  This is the study’s principal technical contribution and the subject of RQ1 through RQ5.  It is distinguished from the permission models used by existing agentic tools, which decide whether a command is allowed by matching it against enumerated patterns, and which take no pre-images: a permission model can refuse a command, but it cannot restore what an approved command destroyed.  It is equally distinguished from privilege mechanisms such as</w:t>
+        <w:t xml:space="preserve"> </w:t>
+      </w:r>
+      <w:r>
+        <w:t xml:space="preserve">in the tradition of abstract interpretation and type-and-effect systems [7, 19, 43]: a command is represented not by its name but by the set of effects its syntax implies, resolved against a working directory and propagated through the operators that join commands into one line, and the verdict is a predicate over that set.  Soundness is one-sided, because over-approximating what a command destroys costs a confirmation, whereas under-approximating it destroys data.  The analysis rests on a table of what each known command does, and a command absent from that table is unknown and asks; its claim is what it adds on top of a table, not that it has none.  It is distinguished from permission models, which can refuse a command but cannot restore what an approved one destroyed, and from privilege mechanisms such as</w:t>
       </w:r>
       <w:r>
         <w:t xml:space="preserve"> </w:t>
@@ -2045,7 +2273,7 @@
         <w:t xml:space="preserve">polkit</w:t>
       </w:r>
       <w:r>
-        <w:t xml:space="preserve">, which gate on who is acting rather than on what is about to happen.  The algorithmic difficulty lies in composition and in targets that exist only while the command runs — a single generated line may chain several operations through &amp;&amp;, pipelines, subshells, and redirects, and</w:t>
+        <w:t xml:space="preserve">, which gate on who is acting rather than on what is about to happen.  It was evaluated on a held-out corpus of 777 commands, drawn after the analysis was frozen, whose ground truth was observed by running each command in a sandbox.  Of the 405 that destroy data or act outside the filesystem, it let none run without asking, where an enumerated pattern list let 41.2% through.  Of the 325 that destroy files, the pattern list let 31% through and the checks of Codex CLI and cc-safety-net let 73% to 97% through.  Its</w:t>
       </w:r>
       <w:r>
         <w:t xml:space="preserve"> </w:t>
@@ -2055,13 +2283,10 @@
           <w:i/>
           <w:iCs/>
         </w:rPr>
-        <w:t xml:space="preserve">rm $(ls *.log)</w:t>
-      </w:r>
-      <w:r>
-        <w:t xml:space="preserve"> </w:t>
-      </w:r>
-      <w:r>
-        <w:t xml:space="preserve">or</w:t>
+        <w:t xml:space="preserve">capture coverage</w:t>
+      </w:r>
+      <w:r>
+        <w:t xml:space="preserve">, the share of those 325 it captured beforehand and that undo then restored exactly, was 89.5%, where a list that refuses every command it does not recognize restored none; and it asked about 9% to 12% of harmless commands, depending on the policy, against that list’s 27%.  On silent loss it ties the refusing list, both at zero, so its contribution is what it restores and how much less it asks, not the verdict itself. </w:t>
       </w:r>
       <w:r>
         <w:t xml:space="preserve"> </w:t>
@@ -2071,86 +2296,19 @@
           <w:i/>
           <w:iCs/>
         </w:rPr>
-        <w:t xml:space="preserve">find -delete</w:t>
-      </w:r>
-      <w:r>
-        <w:t xml:space="preserve"> </w:t>
-      </w:r>
-      <w:r>
-        <w:t xml:space="preserve">names nothing until it executes — which is what an enumerated pattern list cannot express.  Soundness is deliberately one-sided: anything the analysis cannot resolve is treated as unrecoverable, because over-approximating destructiveness costs a confirmation prompt whereas under-approximating it destroys data.  The analysis is not free of lists: it rests on a table of what each known command does, and a command absent from that table is unknown and asks.  Its claim is what it adds on top of a table, not that it has none.  That claim is measured directly in Chapter 3, Section 3.2, by ablations that leave the same per-command table in place.  Disabling composition — seeing through wrappers,</w:t>
-      </w:r>
-      <w:r>
-        <w:t xml:space="preserve"> </w:t>
-      </w:r>
-      <w:r>
-        <w:rPr>
-          <w:i/>
-          <w:iCs/>
-        </w:rPr>
-        <w:t xml:space="preserve">find -exec</w:t>
-      </w:r>
-      <w:r>
-        <w:t xml:space="preserve">,</w:t>
-      </w:r>
-      <w:r>
-        <w:t xml:space="preserve"> </w:t>
-      </w:r>
-      <w:r>
-        <w:rPr>
-          <w:i/>
-          <w:iCs/>
-        </w:rPr>
-        <w:t xml:space="preserve">xargs</w:t>
-      </w:r>
-      <w:r>
-        <w:t xml:space="preserve">,</w:t>
-      </w:r>
-      <w:r>
-        <w:t xml:space="preserve"> </w:t>
-      </w:r>
-      <w:r>
-        <w:rPr>
-          <w:i/>
-          <w:iCs/>
-        </w:rPr>
-        <w:t xml:space="preserve">eval</w:t>
-      </w:r>
-      <w:r>
-        <w:t xml:space="preserve">, shell</w:t>
-      </w:r>
-      <w:r>
-        <w:t xml:space="preserve"> </w:t>
-      </w:r>
-      <w:r>
-        <w:rPr>
-          <w:i/>
-          <w:iCs/>
-        </w:rPr>
-        <w:t xml:space="preserve">-c</w:t>
-      </w:r>
-      <w:r>
-        <w:t xml:space="preserve"> </w:t>
-      </w:r>
-      <w:r>
-        <w:t xml:space="preserve">strings, and loops — drops capture coverage on the held-out corpus from 89.5% to 35.4% (McNemar’s exact test, p = 2.1×10</w:t>
+        <w:t xml:space="preserve">Ablations</w:t>
+      </w:r>
+      <w:r>
+        <w:t xml:space="preserve">, which rerun the analysis with one part switched off and the same table kept, show where the result comes from: without composition, capture coverage falls to 35.4%; without resolution, to 45.5%; and without both, to 32.0%, each drop significant under McNemar’s exact test, which compares two systems on the same commands (each p &lt; 10</w:t>
       </w:r>
       <w:r>
         <w:rPr>
           <w:vertAlign w:val="superscript"/>
         </w:rPr>
-        <w:t xml:space="preserve">−53</w:t>
-      </w:r>
-      <w:r>
-        <w:t xml:space="preserve">); disabling runtime-target resolution drops it to 45.5% (p = 1.8×10</w:t>
-      </w:r>
-      <w:r>
-        <w:rPr>
-          <w:vertAlign w:val="superscript"/>
-        </w:rPr>
-        <w:t xml:space="preserve">−43</w:t>
-      </w:r>
-      <w:r>
-        <w:t xml:space="preserve">); and disabling both leaves the table alone at 32.0%.  Silent loss is 0% in every configuration, so what composition and resolution add is coverage, not safety.</w:t>
+        <w:t xml:space="preserve">−42</w:t>
+      </w:r>
+      <w:r>
+        <w:t xml:space="preserve">), with silent loss at zero throughout (Chapter 3, Sections 3.1–3.2).  This is the study’s principal technical contribution and the subject of RQ1 through RQ5.</w:t>
       </w:r>
     </w:p>
     <w:p>
@@ -2194,7 +2352,7 @@
         <w:t xml:space="preserve"> </w:t>
       </w:r>
       <w:r>
-        <w:t xml:space="preserve">A controlled study in which participants operate the platform on matched tasks, measuring how the analysis’s decisions hold on commands people cause — silent loss, verified restoration, and needless confirmation in live use — and, as characterizations of the platform, task success, time, error rate, and workload against each participant’s own primary operating system, with users fluent in neither existing interface and users fluent in both compared.</w:t>
+        <w:t xml:space="preserve">A controlled study in which participants operate the platform on matched tasks, measuring how the analysis’s decisions hold on commands people cause — silent loss, verified restoration, and needless confirmation in live use — and, as characterizations of the platform, task success, time, error rate, and workload against each participant’s own primary operating system, for users fluent in neither existing interface and users fluent in both.</w:t>
       </w:r>
     </w:p>
     <w:p>
@@ -2242,7 +2400,7 @@
         <w:t xml:space="preserve"> </w:t>
       </w:r>
       <w:r>
-        <w:t xml:space="preserve">Coding assistants and other agents that execute generated commands guard them with lists of dangerous patterns, which the evaluation in Section 3.1(a) of Chapter 3 shows let most file-destroying commands in its corpus run without confirmation.  The recoverability analysis is independent of the interface and of the language model, and can be placed in front of any system that executes generated shell commands.</w:t>
+        <w:t xml:space="preserve">Coding assistants and other agents that execute generated commands guard them with lists of dangerous patterns, which on this study’s corpus let most file-destroying commands run without asking (Section 1.5) [20, 31].  The recoverability analysis can be placed in front of any system that executes generated shell commands, and it adds what a list cannot: a capture, taken before the command runs, from which the command can be undone.</w:t>
       </w:r>
     </w:p>
     <w:p>
@@ -2264,7 +2422,7 @@
         <w:t xml:space="preserve"> </w:t>
       </w:r>
       <w:r>
-        <w:t xml:space="preserve">The study contributes a static analysis of shell commands for recoverability, a property that existing analyses of shell do not address (§2.5), together with an evaluation against ground truth obtained by sandboxed execution rather than by human labeling.  Its ablations separate what composition and runtime-target resolution each contribute from the rule table beneath them, and its validation study shows how such an analysis behaves when deployed in an interface people use.</w:t>
+        <w:t xml:space="preserve">The study contributes a static analysis of shell commands for recoverability, a property the surveyed analyses of shell programs do not address (Chapter 2, Section 2.5), together with an evaluation against ground truth observed by sandboxed execution rather than assigned by human labelers, and ablations that separate what composition and runtime-target resolution each contribute from the rule table beneath them.</w:t>
       </w:r>
     </w:p>
     <w:p>
@@ -2280,57 +2438,13 @@
           <w:b/>
           <w:bCs/>
         </w:rPr>
-        <w:t xml:space="preserve">Novice and non-technical computer users.</w:t>
-      </w:r>
-      <w:r>
-        <w:t xml:space="preserve"> </w:t>
-      </w:r>
-      <w:r>
-        <w:t xml:space="preserve">Much of what a computer can do is reachable only through its command line, which most people do not read.  A person who cannot read a shell command cannot judge one a model wrote for them, so letting a model act on their behalf is safe only if what it destroys can be restored; the recoverability analysis supplies that, and a conversational interface layer that accepts natural language intent is expected to lower the threshold for productive computer use for users with limited prior computing experience, which the validation study examines.</w:t>
-      </w:r>
-    </w:p>
-    <w:p>
-      <w:pPr>
-        <w:pStyle w:val="Compact"/>
-        <w:numPr>
-          <w:ilvl w:val="0"/>
-          <w:numId w:val="1004"/>
-        </w:numPr>
-      </w:pPr>
-      <w:r>
-        <w:rPr>
-          <w:b/>
-          <w:bCs/>
-        </w:rPr>
-        <w:t xml:space="preserve">Developers and power users on Linux.</w:t>
-      </w:r>
-      <w:r>
-        <w:t xml:space="preserve"> </w:t>
-      </w:r>
-      <w:r>
-        <w:t xml:space="preserve">A conversational interface layer is expected to reduce the cognitive load of recalling and composing shell commands by exposing system operations through a unified natural-language interface, which the validation study measures through the NASA Task Load Index.</w:t>
-      </w:r>
-    </w:p>
-    <w:p>
-      <w:pPr>
-        <w:pStyle w:val="Compact"/>
-        <w:numPr>
-          <w:ilvl w:val="0"/>
-          <w:numId w:val="1004"/>
-        </w:numPr>
-      </w:pPr>
-      <w:r>
-        <w:rPr>
-          <w:b/>
-          <w:bCs/>
-        </w:rPr>
-        <w:t xml:space="preserve">Users with motor accessibility needs.</w:t>
-      </w:r>
-      <w:r>
-        <w:t xml:space="preserve"> </w:t>
-      </w:r>
-      <w:r>
-        <w:t xml:space="preserve">Although this population is scoped out of the initial evaluation for ethical and recruitment reasons, SynapseOS could serve as a platform on which accessibility-specific configurations operate.  Prior work has established design guidelines for LLM-based speech interfaces for users with motor impairments [32] and has demonstrated specialized techniques — speech-instructed GUI agents and resilient visual grounding — at the application and interaction-technique level [13, 33].  These techniques presuppose a conversational surface over the whole session, which the platform built for this study provides, so accessibility-specific extensions are a possible future direction; they are outside the scope of this study.</w:t>
+        <w:t xml:space="preserve">People who direct a computer through conversation.</w:t>
+      </w:r>
+      <w:r>
+        <w:t xml:space="preserve"> </w:t>
+      </w:r>
+      <w:r>
+        <w:t xml:space="preserve">A person who cannot read a shell command cannot judge one a model wrote for them, so letting a model act on their behalf is safe only if what it destroys can be restored; the analysis supplies that for the commands it can determine, and asks first about the rest.  The validation study also characterizes the platform for novice and power users, and the platform could later host accessibility-specific configurations, such as speech-driven operation for users with motor impairments [13, 32, 33], which are outside the scope of this study.</w:t>
       </w:r>
     </w:p>
     <w:bookmarkEnd w:id="33"/>
@@ -2348,7 +2462,15 @@
         <w:pStyle w:val="FirstParagraph"/>
       </w:pPr>
       <w:r>
-        <w:t xml:space="preserve">Two terms are used deliberately throughout and are not interchangeable. </w:t>
+        <w:t xml:space="preserve">This study covers the design and evaluation of a recoverability analysis for generated shell commands, which is its research contribution.  The analysis covers commands in the bash dialect on a Debian system: their effects on the filesystem, and the changes to package and service state they make through apt, dpkg, and systemd.  It is evaluated on a corpus of 777 commands drawn from NL2Bash, from templates covering each composition operator, and from tools whose effects lie outside the filesystem, and the contributions of composition and of runtime-target resolution are measured by ablation on the same corpus.  The subject matter is program analysis applied to shell commands, drawing on natural language processing, LLM-based reasoning, Linux system integration, and human-computer interaction for the setting in which it is deployed.</w:t>
+      </w:r>
+    </w:p>
+    <w:p>
+      <w:pPr>
+        <w:pStyle w:val="BodyText"/>
+      </w:pPr>
+      <w:r>
+        <w:t xml:space="preserve">The study also covers the implementation of the platform in which the analysis is deployed.  SynapseOS is a</w:t>
       </w:r>
       <w:r>
         <w:t xml:space="preserve"> </w:t>
@@ -2358,13 +2480,10 @@
           <w:i/>
           <w:iCs/>
         </w:rPr>
-        <w:t xml:space="preserve">Conversational interface layer</w:t>
-      </w:r>
-      <w:r>
-        <w:t xml:space="preserve"> </w:t>
-      </w:r>
-      <w:r>
-        <w:t xml:space="preserve">names what the user experiences: the surface through which intent is expressed and results are returned. </w:t>
+        <w:t xml:space="preserve">conversational interface layer</w:t>
+      </w:r>
+      <w:r>
+        <w:t xml:space="preserve">, the surface through which intent is expressed and results are returned, and it sits above the</w:t>
       </w:r>
       <w:r>
         <w:t xml:space="preserve"> </w:t>
@@ -2374,13 +2493,22 @@
           <w:i/>
           <w:iCs/>
         </w:rPr>
-        <w:t xml:space="preserve">Session layer</w:t>
-      </w:r>
-      <w:r>
-        <w:t xml:space="preserve"> </w:t>
-      </w:r>
-      <w:r>
-        <w:t xml:space="preserve">names where that surface sits in the system: the software a user meets immediately after login.  The first is where this study’s algorithmic contribution is deployed and validated in use; the second is its architectural position, and the phrase “session layer” is used only when SynapseOS’s position relative to it is specifically at issue.  This study covers the design and evaluation of a recoverability analysis for generated shell commands, which is its research contribution, and the implementation of SynapseOS, the conversational interface layer for the Linux desktop</w:t>
+        <w:t xml:space="preserve">session layer</w:t>
+      </w:r>
+      <w:hyperlink w:anchor="ch1-fn3">
+        <w:r>
+          <w:rPr>
+            <w:rStyle w:val="Hyperlink"/>
+            <w:vertAlign w:val="superscript"/>
+          </w:rPr>
+          <w:t xml:space="preserve">3</w:t>
+        </w:r>
+      </w:hyperlink>
+      <w:r>
+        <w:t xml:space="preserve"> </w:t>
+      </w:r>
+      <w:r>
+        <w:t xml:space="preserve">of the Linux desktop</w:t>
       </w:r>
       <w:hyperlink w:anchor="ch1-fn4">
         <w:r>
@@ -2392,26 +2520,47 @@
         </w:r>
       </w:hyperlink>
       <w:r>
-        <w:t xml:space="preserve"> </w:t>
-      </w:r>
-      <w:r>
-        <w:t xml:space="preserve">in which the analysis is deployed and validated.  SynapseOS runs as an agentic layer over an ordinary desktop session rather than in place of one: the desktop shell, session manager, and application launcher continue to run and remain available to the user, as do the kernel and the core system utilities beneath them.  The Linux kernel, the core system utilities, and the existing ecosystem of Linux applications are not modified by this study; SynapseOS interacts with the system by translating natural language into shell commands executed through the standard command-line toolchain, rather than by rewriting applications or the utilities they depend on.  The subject matter spans program analysis, natural language processing, LLM-based reasoning, command-line automation, Linux system integration, and human-computer interaction.</w:t>
-      </w:r>
-    </w:p>
-    <w:p>
-      <w:pPr>
-        <w:pStyle w:val="BodyText"/>
-      </w:pPr>
-      <w:r>
-        <w:t xml:space="preserve">The study examines cross-application desktop workflows on Linux, including shell operations, file management, and application-level tasks representable in the OSWorld benchmark task suite [49].  The validation study recruits novice computer users and power users for a controlled study on the platform.  The study is conducted in a Linux desktop environment and is bounded by the duration of the thesis project.  The recoverability analysis covers commands in the bash dialect on a Debian system: their effects on the filesystem, and the changes to package and service state they make through apt, dpkg, and systemd.  It is evaluated on a corpus of 777 commands drawn from NL2Bash, from templates covering each composition operator, and from tools whose effects lie outside the filesystem, and the contributions of composition and of runtime-target resolution are measured by ablation on the same corpus.</w:t>
-      </w:r>
-    </w:p>
-    <w:p>
-      <w:pPr>
-        <w:pStyle w:val="BodyText"/>
-      </w:pPr>
-      <w:r>
-        <w:t xml:space="preserve">The following limitations are acknowledged.  First, SynapseOS commits to a locally-hosted, code-specialized small language model (Qwen2.5-Coder-3B-Instruct) rather than a hosted frontier model, prioritizing privacy and offline operation over the potentially higher capability of larger hosted alternatives</w:t>
+        <w:t xml:space="preserve">; it runs as an agentic layer over an ordinary desktop session rather than in place of one: the desktop shell, session manager, and application launcher continue to run and remain available to the user, as do the kernel and the core system utilities beneath them.  The Linux kernel, the core system utilities, and the existing ecosystem of Linux applications are not modified by this study; SynapseOS interacts with the system by translating natural language into shell commands executed through the standard command-line toolchain.  The validation study recruits novice computer users and power users for a controlled study on the platform, on cross-application desktop workflows that include shell operations, file management, and tasks representable in the OSWorld benchmark task suite [49], and it is bounded by the duration of the thesis project.</w:t>
+      </w:r>
+    </w:p>
+    <w:p>
+      <w:pPr>
+        <w:pStyle w:val="BodyText"/>
+      </w:pPr>
+      <w:r>
+        <w:t xml:space="preserve">The following limitations are acknowledged, those of the analysis first.  First, the recoverability analysis treats anything it cannot determine as unrecoverable, and so protects such commands only by asking first: code run by an interpreter, programs it does not model, and variables with no value are of this kind.  Of the 325 file-destroying commands in the corpus, 34 (10.5%) are protected only this way, and undo restored 630 of the 631 commands executed in the recovery check, the one failure being reported in Chapter 3.  Second, its per-command rules are a hand-written enumeration, which its composition builds on rather than replaces, and it resolves a command’s targets shortly before the command runs, so a file changed by another process in the interval is captured as it was when resolved.  Third, it is evaluated on a corpus of human-written commands from NL2Bash, templates written by the same team that wrote its rule table and the pattern-list baseline, and commands whose effects lie outside the filesystem; each label describes what a command did on the fixture it ran on, not on every possible filesystem.  These threats and their mitigations are stated in Chapter 3, Section 3.1(e).  Fourth, the recovery plan is minimum-cost relative to the capture mechanisms and cost model stated in Chapter 3, Section 2.1(c), not over every conceivable way of restoring a system.  Fifth, the platform offers two confirmation policies over the analysis’s verdict, a</w:t>
+      </w:r>
+      <w:r>
+        <w:t xml:space="preserve"> </w:t>
+      </w:r>
+      <w:r>
+        <w:rPr>
+          <w:i/>
+          <w:iCs/>
+        </w:rPr>
+        <w:t xml:space="preserve">strict</w:t>
+      </w:r>
+      <w:r>
+        <w:t xml:space="preserve"> </w:t>
+      </w:r>
+      <w:r>
+        <w:t xml:space="preserve">policy, the default, which asks before every command that needs a capture, and a</w:t>
+      </w:r>
+      <w:r>
+        <w:t xml:space="preserve"> </w:t>
+      </w:r>
+      <w:r>
+        <w:rPr>
+          <w:i/>
+          <w:iCs/>
+        </w:rPr>
+        <w:t xml:space="preserve">capture</w:t>
+      </w:r>
+      <w:r>
+        <w:t xml:space="preserve"> </w:t>
+      </w:r>
+      <w:r>
+        <w:t xml:space="preserve">policy, which asks only before unrecoverable commands (Chapter 3, Section 2.1(e)); which serves users better is a question the validation study informs rather than settles.  Sixth, the platform commits to a locally hosted, open-weights, code-specialized small language model (Qwen2.5-Coder-3B-Instruct) rather than a hosted frontier model, prioritizing privacy and offline operation over the potentially higher capability of larger hosted alternatives</w:t>
       </w:r>
       <w:hyperlink w:anchor="ch1-fn5">
         <w:r>
@@ -2423,7 +2572,7 @@
         </w:r>
       </w:hyperlink>
       <w:r>
-        <w:t xml:space="preserve">; this tradeoff may affect the ceiling on intent parsing accuracy achievable within the study.  Second, users with motor accessibility needs — a highly relevant population — are excluded from the initial evaluation due to ethics-review and recruitment constraints; accessibility-specific configurations such as speech-instructed agent operation for atypical speech patterns [13] are likewise out of scope for the initial implementation but represent a natural extension of the SynapseOS substrate.  Third, SynapseOS targets the Linux desktop specifically, and the findings may not generalize directly to Windows or macOS desktop environments.  Fourth, the platform offers two confirmation policies over the analysis’s verdict, a strict one that is the default and a capture-only one (Chapter 3, Section 2.1(e)); which serves users better is a question the validation study informs rather than settles.  Fifth, the analysis is evaluated on a corpus of 777 commands: human-written commands from NL2Bash, templates written by the same team that wrote the analysis’s rule table and the pattern-list baseline, and commands whose effects lie outside the filesystem.  Each label describes what a command did on the fixture it ran on, not on every possible filesystem; these threats and their mitigations are stated in Chapter 3, Section 3.1(e).  The validation study is separately bounded by the task coverage of the OSWorld benchmark and the custom task suite developed for this study.  Sixth, the recoverability analysis treats anything it cannot determine as unrecoverable, and so protects such commands only by asking first: code run by an interpreter, programs it does not model, and variables with no value are of this kind.  Its per-command rules are a hand-written enumeration, which its composition builds on rather than replaces, and it resolves a command’s targets shortly before the command runs, so a file changed by another process in the interval is captured as it was when resolved.  Of the 325 file-destroying commands in the corpus, 34 (10.5%) are protected only by asking, because the analysis could not determine them; on silent loss it is indistinguishable from a list that refuses every command it does not recognize, both at zero, so its advantage lies in what it restores; and undo restored 630 of the 631 commands executed in the recovery check, the one failure being reported in Chapter 3.  Seventh, the recovery plan is minimal relative to the capture mechanisms and cost model stated in Chapter 3, Section 2.1(c), not over every conceivable way of restoring a system.</w:t>
+        <w:t xml:space="preserve">; this may limit how often a request is translated correctly, which bounds the validation study but not the analysis, which takes whatever command it is given.  Seventh, the platform targets the Linux desktop, and the validation study’s findings may not generalize to Windows or macOS; it is bounded by the task coverage of the OSWorld benchmark and the custom task suite, and users with motor accessibility needs are excluded from it for ethics-review and recruitment reasons, so accessibility-specific configurations such as speech-instructed operation for atypical speech [13] are out of scope.</w:t>
       </w:r>
     </w:p>
     <w:bookmarkEnd w:id="34"/>
@@ -2672,7 +2821,7 @@
               <a:graphicData uri="http://schemas.openxmlformats.org/drawingml/2006/picture">
                 <pic:pic>
                   <pic:nvPicPr>
-                    <pic:cNvPr descr="/tmp/claude-1000/-home-willard-projects-thesis/cb82e7af-8c35-489a-a7f7-ef49172efea2/scratchpad/docx/work6/fig0.png" id="46" name="Picture"/>
+                    <pic:cNvPr descr="/tmp/claude-1000/-home-willard-projects-thesis/cb82e7af-8c35-489a-a7f7-ef49172efea2/scratchpad/docx/work7/fig0.png" id="46" name="Picture"/>
                     <pic:cNvPicPr>
                       <a:picLocks noChangeArrowheads="1" noChangeAspect="1"/>
                     </pic:cNvPicPr>
@@ -6324,7 +6473,7 @@
               <a:graphicData uri="http://schemas.openxmlformats.org/drawingml/2006/picture">
                 <pic:pic>
                   <pic:nvPicPr>
-                    <pic:cNvPr descr="/tmp/claude-1000/-home-willard-projects-thesis/cb82e7af-8c35-489a-a7f7-ef49172efea2/scratchpad/docx/work6/fig1.png" id="79" name="Picture"/>
+                    <pic:cNvPr descr="/tmp/claude-1000/-home-willard-projects-thesis/cb82e7af-8c35-489a-a7f7-ef49172efea2/scratchpad/docx/work7/fig1.png" id="79" name="Picture"/>
                     <pic:cNvPicPr>
                       <a:picLocks noChangeArrowheads="1" noChangeAspect="1"/>
                     </pic:cNvPicPr>

</xml_diff>

<commit_message>
docs(thesis): fix the fourth pass/fail check's medium findings
Chapter 1: the Unix Consultant as an early system, not the earliest; the guard sentence no longer cites NaSh for pattern matching; the 80 table-labeled external commands named as weaker evidence. Chapter 2: the algorithm's evaluation methods (dataset, observed ground truth, paired tests, ablation) reviewed first in 2.10; hybrid execution cited to UFO2 alone; NaSh set apart from the shipped permission guards. Chapter 3: counterbalancing described as distributing order effects, with the 2x2 crossing; the CLI-mode duplicate and the OSWorld repeat removed; a benchmark task-success measure and descriptive reporting for latency and turns.
</commit_message>
<xml_diff>
--- a/thesis 1/consolidated/SynapseOS_Proposal_Chapters_1_to_3.docx
+++ b/thesis 1/consolidated/SynapseOS_Proposal_Chapters_1_to_3.docx
@@ -700,7 +700,7 @@
         <w:tab/>
       </w:r>
       <w:r>
-        <w:t xml:space="preserve">44</w:t>
+        <w:t xml:space="preserve">45</w:t>
       </w:r>
     </w:p>
     <w:p>
@@ -720,7 +720,7 @@
         <w:tab/>
       </w:r>
       <w:r>
-        <w:t xml:space="preserve">47</w:t>
+        <w:t xml:space="preserve">48</w:t>
       </w:r>
     </w:p>
     <w:p>
@@ -740,7 +740,7 @@
         <w:tab/>
       </w:r>
       <w:r>
-        <w:t xml:space="preserve">48</w:t>
+        <w:t xml:space="preserve">49</w:t>
       </w:r>
     </w:p>
     <w:p>
@@ -760,7 +760,7 @@
         <w:tab/>
       </w:r>
       <w:r>
-        <w:t xml:space="preserve">50</w:t>
+        <w:t xml:space="preserve">51</w:t>
       </w:r>
     </w:p>
     <w:p>
@@ -780,7 +780,7 @@
         <w:tab/>
       </w:r>
       <w:r>
-        <w:t xml:space="preserve">53</w:t>
+        <w:t xml:space="preserve">54</w:t>
       </w:r>
     </w:p>
     <w:p>
@@ -820,7 +820,7 @@
         <w:tab/>
       </w:r>
       <w:r>
-        <w:t xml:space="preserve">81</w:t>
+        <w:t xml:space="preserve">82</w:t>
       </w:r>
     </w:p>
     <w:p>
@@ -840,7 +840,7 @@
         <w:tab/>
       </w:r>
       <w:r>
-        <w:t xml:space="preserve">102</w:t>
+        <w:t xml:space="preserve">104</w:t>
       </w:r>
     </w:p>
     <w:p>
@@ -860,7 +860,7 @@
         <w:tab/>
       </w:r>
       <w:r>
-        <w:t xml:space="preserve">109</w:t>
+        <w:t xml:space="preserve">111</w:t>
       </w:r>
     </w:p>
     <w:bookmarkStart w:id="24" w:name="list-of-tables"/>
@@ -949,7 +949,7 @@
         <w:tab/>
       </w:r>
       <w:r>
-        <w:t xml:space="preserve">51</w:t>
+        <w:t xml:space="preserve">52</w:t>
       </w:r>
     </w:p>
     <w:p>
@@ -969,7 +969,7 @@
         <w:tab/>
       </w:r>
       <w:r>
-        <w:t xml:space="preserve">51</w:t>
+        <w:t xml:space="preserve">52</w:t>
       </w:r>
     </w:p>
     <w:p>
@@ -989,7 +989,7 @@
         <w:tab/>
       </w:r>
       <w:r>
-        <w:t xml:space="preserve">83</w:t>
+        <w:t xml:space="preserve">84</w:t>
       </w:r>
     </w:p>
     <w:p>
@@ -1009,7 +1009,7 @@
         <w:tab/>
       </w:r>
       <w:r>
-        <w:t xml:space="preserve">88</w:t>
+        <w:t xml:space="preserve">89</w:t>
       </w:r>
     </w:p>
     <w:p>
@@ -1029,7 +1029,7 @@
         <w:tab/>
       </w:r>
       <w:r>
-        <w:t xml:space="preserve">93</w:t>
+        <w:t xml:space="preserve">94</w:t>
       </w:r>
     </w:p>
     <w:p>
@@ -1049,7 +1049,7 @@
         <w:tab/>
       </w:r>
       <w:r>
-        <w:t xml:space="preserve">112</w:t>
+        <w:t xml:space="preserve">114</w:t>
       </w:r>
     </w:p>
     <w:p>
@@ -1069,7 +1069,7 @@
         <w:tab/>
       </w:r>
       <w:r>
-        <w:t xml:space="preserve">114</w:t>
+        <w:t xml:space="preserve">116</w:t>
       </w:r>
     </w:p>
     <w:bookmarkEnd w:id="24"/>
@@ -1119,7 +1119,7 @@
         <w:tab/>
       </w:r>
       <w:r>
-        <w:t xml:space="preserve">49</w:t>
+        <w:t xml:space="preserve">50</w:t>
       </w:r>
     </w:p>
     <w:bookmarkEnd w:id="25"/>
@@ -1164,7 +1164,7 @@
         <w:pStyle w:val="BodyText"/>
       </w:pPr>
       <w:r>
-        <w:t xml:space="preserve">The aspiration to instruct a computer in ordinary language is old; its earliest serious system, the Berkeley UNIX Consultant, was operational by the late 1980s [48].  Large language models (LLMs) and multimodal foundation models</w:t>
+        <w:t xml:space="preserve">The aspiration to instruct a computer in ordinary language is old; an early system for conversing with an operating system, the Berkeley UNIX Consultant, was operational by the late 1980s [48].  Large language models (LLMs) and multimodal foundation models</w:t>
       </w:r>
       <w:hyperlink w:anchor="ch1-fn1">
         <w:r>
@@ -1281,7 +1281,7 @@
         <w:t xml:space="preserve">permission</w:t>
       </w:r>
       <w:r>
-        <w:t xml:space="preserve">: the command is matched against a list of patterns judged dangerous and is then allowed, refused, or put to the user [12], as in the dangerous-command check of OpenAI’s Codex CLI [31] and cc-safety-net, a guard used with several AI coding agents [20].  A few that ship add coarse recovery: Alibaba Cloud’s ANOLISA, a Linux distribution for AI agents, snapshots an agent’s workspace before key operations or after each round of conversation and can roll back to any snapshot [1], which restores everything since the snapshot rather than what one command destroyed.  A list judges a command by its name and arguments, so it misses what the command touches through another command or a target computed at run time, and neither a list nor a snapshot can say, before a command runs, whether it will lose anything.  NaSh, a design for a natural-language shell, proposes summaries of what a command would affect and selective undo, but leaves their mechanism open [12], and no system in the surveyed literature, nor any shipping tool examined, determines before a generated command runs what it would destroy, or captures exactly that so that the command can be undone.  That is the gap this study’s research addresses.</w:t>
+        <w:t xml:space="preserve">: the command is matched against a list of patterns judged dangerous and is then allowed, refused, or put to the user, as in the dangerous-command check of OpenAI’s Codex CLI [31] and cc-safety-net, a guard used with several AI coding agents [20].  A few that ship add coarse recovery: Alibaba Cloud’s ANOLISA, a Linux distribution for AI agents, snapshots an agent’s workspace before key operations or after each round of conversation and can roll back to any snapshot [1], which restores everything since the snapshot rather than what one command destroyed.  A list judges a command by its name and arguments, so it misses what the command touches through another command or a target computed at run time, and neither a list nor a snapshot can say, before a command runs, whether it will lose anything.  NaSh, a design for a natural-language shell, proposes summaries of what a command would affect and selective undo, but leaves their mechanism open [12], and no system in the surveyed literature, nor any shipping tool examined, determines before a generated command runs what it would destroy, or captures exactly that so that the command can be undone.  That is the gap this study’s research addresses.</w:t>
       </w:r>
     </w:p>
     <w:p>
@@ -2549,7 +2549,7 @@
         <w:t xml:space="preserve">fixture</w:t>
       </w:r>
       <w:r>
-        <w:t xml:space="preserve">, the files and directories prepared for it to run on, not on every possible filesystem.  Nor does it ask less often than the pattern list, which it does not significantly exceed (32 to 45 against 30 of 372), or than the coding-agent checks (1 to 15); and the deployed gate, which also consults the pattern list, asks about 58 to 67 (16% to 18%), still well below the fail-closed list’s 27%.  Its corpus was written by people, not by the model: a smaller partition of commands the deployed model wrote showed the same pattern, but rests on 19 losses and an earlier build of the analysis (Chapter 3, Section 3.1(d)).  These threats and their mitigations are stated in Chapter 3, Section 3.1(e).  Fourth, the recovery plan is minimum-cost relative to the capture mechanisms and cost model stated in Chapter 3, Section 2.1(c), not over every conceivable way of restoring a system.  Fifth, the platform offers two confirmation policies over the analysis’s verdict, a</w:t>
+        <w:t xml:space="preserve">, the files and directories prepared for it to run on, not on every possible filesystem, and the labels of the 80 external commands, a fifth of the 405 behind the silent-loss result, are assigned from a table rather than observed, so they are weaker evidence than the 697 observed in the sandbox.  Nor does it ask less often than the pattern list, which it does not significantly exceed (32 to 45 against 30 of 372), or than the coding-agent checks (1 to 15); and the deployed gate, which also consults the pattern list, asks about 58 to 67 (16% to 18%), still well below the fail-closed list’s 27%.  Its corpus was written by people, not by the model: a smaller partition of commands the deployed model wrote showed the same pattern, but rests on 19 losses and an earlier build of the analysis (Chapter 3, Section 3.1(d)).  These threats and their mitigations are stated in Chapter 3, Section 3.1(e).  Fourth, the recovery plan is minimum-cost relative to the capture mechanisms and cost model stated in Chapter 3, Section 2.1(c), not over every conceivable way of restoring a system.  Fifth, the platform offers two confirmation policies over the analysis’s verdict, a</w:t>
       </w:r>
       <w:r>
         <w:t xml:space="preserve"> </w:t>
@@ -2866,7 +2866,7 @@
               <a:graphicData uri="http://schemas.openxmlformats.org/drawingml/2006/picture">
                 <pic:pic>
                   <pic:nvPicPr>
-                    <pic:cNvPr descr="/tmp/claude-1000/-home-willard-projects-thesis/cb82e7af-8c35-489a-a7f7-ef49172efea2/scratchpad/docx/w10/fig0.png" id="46" name="Picture"/>
+                    <pic:cNvPr descr="/tmp/claude-1000/-home-willard-projects-thesis/cb82e7af-8c35-489a-a7f7-ef49172efea2/scratchpad/docx/w11/fig0.png" id="46" name="Picture"/>
                     <pic:cNvPicPr>
                       <a:picLocks noChangeArrowheads="1" noChangeAspect="1"/>
                     </pic:cNvPicPr>
@@ -3055,7 +3055,7 @@
         <w:pStyle w:val="FirstParagraph"/>
       </w:pPr>
       <w:r>
-        <w:t xml:space="preserve">The aspiration to let users describe what they want in ordinary language and have a computer carry it out is not new.  The earliest serious system in this tradition, the Berkeley Unix Consultant of Wilensky and colleagues [48], was already operational by the late 1980s.  The Unix Consultant was an intelligent natural-language interface that allowed naive users to learn about the Unix operating system through conversation in ordinary English, addressing both the natural-language-frontend problem and the consultation problem, and thereby distinguishing itself from systems intended only as command translators.  It was built on the KODIAK knowledge representation and incorporated a user-modeling component that represented the user’s knowledge state and a teaching component through which users could extend its knowledge base in natural language.  The system demonstrated end-to-end natural-language consultation about Unix, successfully answering "how do I," definitional, and problem-solving questions.  Critically, its authors identified knowledge acquisition as the principal bottleneck: extending the system to a new domain required substantial hand-engineering — a concern that directly foreshadows the contemporary problem of LLM-based agents requiring per-application grounding data.</w:t>
+        <w:t xml:space="preserve">The aspiration to let users describe what they want in ordinary language and have a computer carry it out is not new.  An early system of this kind for an operating system, the Berkeley Unix Consultant of Wilensky and colleagues [48], was already operational by the late 1980s.  The Unix Consultant was an intelligent natural-language interface that allowed naive users to learn about the Unix operating system through conversation in ordinary English, addressing both the natural-language-frontend problem and the consultation problem, and thereby distinguishing itself from systems intended only as command translators.  It was built on the KODIAK knowledge representation and incorporated a user-modeling component that represented the user’s knowledge state and a teaching component through which users could extend its knowledge base in natural language.  The system demonstrated end-to-end natural-language consultation about Unix, successfully answering "how do I," definitional, and problem-solving questions.  Critically, its authors identified knowledge acquisition as the principal bottleneck: extending the system to a new domain required substantial hand-engineering — a concern that directly foreshadows the contemporary problem of LLM-based agents requiring per-application grounding data.</w:t>
       </w:r>
     </w:p>
     <w:p>
@@ -3245,7 +3245,7 @@
         <w:pStyle w:val="BodyText"/>
       </w:pPr>
       <w:r>
-        <w:t xml:space="preserve">The gap these guards share is the one this study’s algorithmic contribution addresses.  Every surveyed system that guards a generated command does so by</w:t>
+        <w:t xml:space="preserve">The gap these guards share is the one this study’s algorithmic contribution addresses.  Every shipped guard surveyed decides by</w:t>
       </w:r>
       <w:r>
         <w:t xml:space="preserve"> </w:t>
@@ -3258,7 +3258,7 @@
         <w:t xml:space="preserve">permission</w:t>
       </w:r>
       <w:r>
-        <w:t xml:space="preserve">: the command is matched against an enumerated set of patterns judged dangerous, and is then allowed, refused, or escalated to the user.  NaSh [12] proposes guardrails of this kind, together with summaries of what a command would affect and selective undo, but leaves the mechanisms for both open; the shipped guards above operate the same way in practice, with allow-and-deny lists over command prefixes.  A permission model answers whether a command may run.  It does not answer whether, having run, the command can be undone — and those are different questions with different answers.  Refusing a command protects a user only until they approve it, which for any system that must let work proceed is most of the time.</w:t>
+        <w:t xml:space="preserve">: the command is matched against an enumerated set of patterns judged dangerous, and is then allowed, refused, or escalated to the user, through allow-and-deny lists over command prefixes.  NaSh [12] goes further as a proposal, adding summaries of what a command would affect and selective undo to its guardrails, but leaves the mechanisms for both open.  A permission model answers whether a command may run.  It does not answer whether, having run, the command can be undone — and those are different questions with different answers.  Refusing a command protects a user only until they approve it, which for any system that must let work proceed is most of the time.</w:t>
       </w:r>
     </w:p>
     <w:p>
@@ -6140,7 +6140,7 @@
         <w:pStyle w:val="FirstParagraph"/>
       </w:pPr>
       <w:r>
-        <w:t xml:space="preserve">A second pattern concerns the execution mechanism at the Action layer.  The literature divides among command translation, API binding, and GUI simulation, with a dominant trend toward hybrid execution [44, 53] that prefers structured access where available and falls back to vision.  Vision-only systems [29, 45] achieve broad applicability at the cost of grounding fragility, while structured-access systems achieve precision at the cost of per-environment integration.  Notably, the Unix Consultant operated purely at the consultation layer without executing actions — an approach that reflects an underappreciated design principle, that the agent that explains can be safer than the agent that acts, which the confirmation-gated design of the present study revisits.</w:t>
+        <w:t xml:space="preserve">A second pattern concerns the execution mechanism at the Action layer.  The literature divides among command translation, API binding, and GUI simulation, with a trend toward hybrid execution [53] that prefers structured access where available and falls back to vision.  Vision-only systems [29, 45] achieve broad applicability at the cost of grounding fragility, while structured-access systems achieve precision at the cost of per-environment integration.  Notably, the Unix Consultant operated purely at the consultation layer without executing actions — an approach that reflects an underappreciated design principle, that the agent that explains can be safer than the agent that acts, which the confirmation-gated design of the present study revisits.</w:t>
       </w:r>
     </w:p>
     <w:bookmarkEnd w:id="65"/>
@@ -6297,6 +6297,14 @@
     <w:p>
       <w:pPr>
         <w:pStyle w:val="FirstParagraph"/>
+      </w:pPr>
+      <w:r>
+        <w:t xml:space="preserve">The evaluation of the algorithm, which is the study’s primary evidence, follows from what the algorithm claims, and its methods are stated first.  Its corpus is drawn from a public dataset of natural-language descriptions paired with Bash commands, NL2Bash [23], so that it is not written by the people who wrote the analysis, and is stratified by the label each command must carry so that the rare destructive commands are present in number.  Its ground truth is observed rather than judged, by executing each command in a sandbox and comparing the filesystem before and after, in the way that executable semantics of the shell are validated against what shells actually do [11].  Its comparisons are paired, because every system is scored on the same commands, and use the standard tests for paired proportions: McNemar’s exact test on the commands two systems handle differently, Wilson intervals for each proportion and Newcombe intervals for each difference, and Holm’s correction across each family of tests.  And its claim that composition and resolution, rather than the rule table, produce the result is tested by ablation: the analysis is rerun with each part switched off and the table kept.  Chapter 3, Section 3.1 gives the details.</w:t>
+      </w:r>
+    </w:p>
+    <w:p>
+      <w:pPr>
+        <w:pStyle w:val="BodyText"/>
       </w:pPr>
       <w:r>
         <w:t xml:space="preserve">The algorithm is evaluated against ground truth observed by executing each command that acts on files, with the 80 that act outside the filesystem labeled from a fixed table of state-changing tools; execution is the basis Westenfelder and colleagues also use for judging whether a generated Bash command does what was intended [46], and each comparison with a baseline is paired, because both systems are scored on the same commands (Chapter 3, Section 3.1).  The methodological literature reviewed here shapes the validation study, in which the analysis is deployed in an interface and exercised by people, and so concerns how a conversational interface should be evaluated.  The evaluation practices of the surveyed work fall into three categories, each with a characteristic limitation.  Architectural demonstrations [12, 44] establish feasibility but provide no performance evidence.  Curated task benchmarks [9, 49, 56] provide reproducible, quantitative measures but assess the autonomous task completion of agents acting on a user’s behalf rather than the performance of a human working through an interface.  Human-centered user studies, exemplified by VoicePilot [32] and AXIS [25], provide the most direct evidence of an interface’s value to real users but remain rare in this literature and, where present, are confined to a single application rather than the operating system as a whole.  The instruments this study adopts are drawn from established practice rather than constructed for it: the System Usability Scale [4] for perceived usability, with its interpretation grounded in subsequent large-sample analysis [39], and the NASA Task Load Index [14] for perceived workload.</w:t>
@@ -6596,7 +6604,7 @@
               <a:graphicData uri="http://schemas.openxmlformats.org/drawingml/2006/picture">
                 <pic:pic>
                   <pic:nvPicPr>
-                    <pic:cNvPr descr="/tmp/claude-1000/-home-willard-projects-thesis/cb82e7af-8c35-489a-a7f7-ef49172efea2/scratchpad/docx/w10/fig1.png" id="79" name="Picture"/>
+                    <pic:cNvPr descr="/tmp/claude-1000/-home-willard-projects-thesis/cb82e7af-8c35-489a-a7f7-ef49172efea2/scratchpad/docx/w11/fig1.png" id="79" name="Picture"/>
                     <pic:cNvPicPr>
                       <a:picLocks noChangeArrowheads="1" noChangeAspect="1"/>
                     </pic:cNvPicPr>
@@ -7276,7 +7284,7 @@
         <w:t xml:space="preserve"> </w:t>
       </w:r>
       <w:r>
-        <w:t xml:space="preserve">— a single non-interactive invocation, with no session persisting between separate calls, that runs a bounded loop toward one natural-language request: propose a command, pass it through the same reversibility-based confirmation gate described in the Execution Pipeline (Section 2.1(e)) — executing immediately if reversible, blocking pending explicit confirmation if not — then feed the result back so the model can propose the next step or signal completion, up to a fixed step limit, before the invocation exits, sharing TUI mode’s minimal hardware footprint but intended for scripting and automation rather than an interactive session.  Neither CLI nor TUI mode is evaluated in the user study.</w:t>
+        <w:t xml:space="preserve">for scripting and automation, which passes each command through the same confirmation gate (Section 2.1(e)).  Neither CLI nor TUI mode is evaluated in the user study.</w:t>
       </w:r>
     </w:p>
     <w:bookmarkEnd w:id="81"/>
@@ -7916,7 +7924,7 @@
         <w:pStyle w:val="BodyText"/>
       </w:pPr>
       <w:r>
-        <w:t xml:space="preserve">The OSWorld benchmark is used as a secondary check on the platform because it evaluates computer-using agents in real operating system environments with real applications [49], which allows the platform’s results to be situated within the existing literature; the analysis itself is evaluated on the command corpus, for the reasons given above.</w:t>
+        <w:t xml:space="preserve">The OSWorld benchmark is used as a secondary check on the platform for the reason given in (b) above, its relation to the existing literature; the analysis itself is evaluated on the command corpus, for the reasons given above.</w:t>
       </w:r>
     </w:p>
     <w:p>
@@ -7940,7 +7948,7 @@
         <w:pStyle w:val="BodyText"/>
       </w:pPr>
       <w:r>
-        <w:t xml:space="preserve">The within-subjects design is chosen because it allows each participant to serve as their own control, producing a direct comparison between conditions while requiring a smaller participant pool than a between-subjects design.  Counterbalancing controls for the primary threat to internal validity: the learning effect, wherein participants may perform better in the second condition simply due to familiarity with the tasks.</w:t>
+        <w:t xml:space="preserve">The within-subjects design is chosen because it allows each participant to serve as their own control, producing a direct comparison between conditions while requiring a smaller participant pool than a between-subjects design.  Counterbalancing addresses the primary threat to internal validity, the learning effect, by distributing it across conditions; it does not remove asymmetric transfer, which is tested rather than assumed absent (Section 3.7).</w:t>
       </w:r>
     </w:p>
     <w:p>
@@ -11048,7 +11056,7 @@
     </w:p>
     <w:bookmarkEnd w:id="105"/>
     <w:bookmarkEnd w:id="106"/>
-    <w:bookmarkStart w:id="124" w:name="sec3"/>
+    <w:bookmarkStart w:id="125" w:name="sec3"/>
     <w:p>
       <w:pPr>
         <w:pStyle w:val="Heading2"/>
@@ -13275,7 +13283,7 @@
         <w:pStyle w:val="FirstParagraph"/>
       </w:pPr>
       <w:r>
-        <w:t xml:space="preserve">All 40 participants complete both conditions.  Condition order is counterbalanced: 20 participants complete Condition A first, and 20 participants complete Condition B first.  This counterbalancing controls for order effects and task familiarity.</w:t>
+        <w:t xml:space="preserve">All 40 participants complete both conditions.  Condition order is counterbalanced: 20 participants complete Condition A first, and 20 participants complete Condition B first.  Condition order is crossed with the two task forms in a 2×2 design, four groups of ten (Section 1.2(d)).  This distributes order effects across conditions; residual asymmetric transfer is tested through the condition × order term of the model in Section 3.6 and discussed in Section 3.7.</w:t>
       </w:r>
     </w:p>
     <w:p>
@@ -13287,7 +13295,7 @@
       </w:r>
     </w:p>
     <w:bookmarkEnd w:id="115"/>
-    <w:bookmarkStart w:id="121" w:name="ch3-sec3-4"/>
+    <w:bookmarkStart w:id="122" w:name="ch3-sec3-4"/>
     <w:p>
       <w:pPr>
         <w:pStyle w:val="Heading3"/>
@@ -13531,8 +13539,26 @@
       </w:r>
     </w:p>
     <w:bookmarkEnd w:id="120"/>
+    <w:bookmarkStart w:id="121" w:name="f-benchmark-task-success"/>
+    <w:p>
+      <w:pPr>
+        <w:pStyle w:val="Heading4"/>
+      </w:pPr>
+      <w:r>
+        <w:t xml:space="preserve">f) Benchmark Task Success</w:t>
+      </w:r>
+    </w:p>
+    <w:p>
+      <w:pPr>
+        <w:pStyle w:val="FirstParagraph"/>
+      </w:pPr>
+      <w:r>
+        <w:t xml:space="preserve">For the adapted OSWorld tasks, the platform’s task success rate is the proportion of tasks whose resulting system state matches the benchmark’s expected outcome, of the tasks attempted.  The adapted subset, the OSWorld tasks expressible as shell commands, is fixed before data collection and its size reported with the result.</w:t>
+      </w:r>
+    </w:p>
     <w:bookmarkEnd w:id="121"/>
-    <w:bookmarkStart w:id="122" w:name="ch3-sec3-5"/>
+    <w:bookmarkEnd w:id="122"/>
+    <w:bookmarkStart w:id="123" w:name="ch3-sec3-5"/>
     <w:p>
       <w:pPr>
         <w:pStyle w:val="Heading3"/>
@@ -13578,11 +13604,19 @@
         <w:pStyle w:val="BodyText"/>
       </w:pPr>
       <w:r>
+        <w:t xml:space="preserve">The benchmark task success rate of Section 3.5(f) is reported descriptively, as a proportion with its Wilson interval, as are the telemetry measures of Section 1.1(d) that are not otherwise analyzed (command latency and conversational turns per task), as means with confidence intervals per participant group.</w:t>
+      </w:r>
+    </w:p>
+    <w:p>
+      <w:pPr>
+        <w:pStyle w:val="BodyText"/>
+      </w:pPr>
+      <w:r>
         <w:t xml:space="preserve">Qualitative data from post-study interviews is analyzed using reflexive thematic analysis following the six-phase procedure described by Braun and Clarke [3]: familiarization with the data, initial code generation, theme search, theme review, theme definition, and write-up.  In keeping with the reflexive approach, which treats the analyst’s interpretation as part of the method and does not compute inter-rater agreement, one member of the research team develops the codes and themes; the codebook and the excerpts that support each theme are retained so that the analysis can be audited.  Themes are reported alongside representative participant quotations.</w:t>
       </w:r>
     </w:p>
-    <w:bookmarkEnd w:id="122"/>
-    <w:bookmarkStart w:id="123" w:name="ch3-sec3-6"/>
+    <w:bookmarkEnd w:id="123"/>
+    <w:bookmarkStart w:id="124" w:name="ch3-sec3-6"/>
     <w:p>
       <w:pPr>
         <w:pStyle w:val="Heading3"/>
@@ -13939,9 +13973,9 @@
         <w:t xml:space="preserve">SynapseOS is evaluated on a single hardware and software configuration — a dedicated machine running SynapseOS in GUI mode (XFCE desktop environment, X11 session) on a Debian 13 (Trixie) base.  Performance characteristics on different hardware, display configurations, or Linux distributions may differ from the reported results.</w:t>
       </w:r>
     </w:p>
-    <w:bookmarkEnd w:id="123"/>
     <w:bookmarkEnd w:id="124"/>
-    <w:bookmarkStart w:id="133" w:name="ch3-notes"/>
+    <w:bookmarkEnd w:id="125"/>
+    <w:bookmarkStart w:id="134" w:name="ch3-notes"/>
     <w:p>
       <w:pPr>
         <w:pStyle w:val="Heading2"/>
@@ -13958,11 +13992,11 @@
           <w:numId w:val="1020"/>
         </w:numPr>
       </w:pPr>
-      <w:bookmarkStart w:id="125" w:name="ch3-fn1"/>
+      <w:bookmarkStart w:id="126" w:name="ch3-fn1"/>
       <w:r>
         <w:t xml:space="preserve">Command-Line Interface mode: a single non-interactive invocation, with no session persisting between separate calls, that runs a bounded multi-step loop toward one natural-language request — each step proposed, classified for reversibility, executed (immediately if reversible, after confirmation if not) through the same gate as the other interface modes, and its result fed back so the model can propose the next step or signal completion — up to a fixed step limit, before the invocation exits.  Distinct from TUI mode’s persistent interactive chat session; intended for scripting, automation, and one-off remote commands.</w:t>
       </w:r>
-      <w:bookmarkEnd w:id="125"/>
+      <w:bookmarkEnd w:id="126"/>
     </w:p>
     <w:p>
       <w:pPr>
@@ -13972,11 +14006,11 @@
           <w:numId w:val="1020"/>
         </w:numPr>
       </w:pPr>
-      <w:bookmarkStart w:id="126" w:name="ch3-fn2"/>
+      <w:bookmarkStart w:id="127" w:name="ch3-fn2"/>
       <w:r>
         <w:t xml:space="preserve">Terminal User Interface: a text-based interactive interface that runs in a command-line terminal.  TUI mode requires no graphical display server or desktop environment and can be accessed remotely over SSH.</w:t>
       </w:r>
-      <w:bookmarkEnd w:id="126"/>
+      <w:bookmarkEnd w:id="127"/>
     </w:p>
     <w:p>
       <w:pPr>
@@ -13986,11 +14020,11 @@
           <w:numId w:val="1020"/>
         </w:numPr>
       </w:pPr>
-      <w:bookmarkStart w:id="127" w:name="ch3-fn3"/>
+      <w:bookmarkStart w:id="128" w:name="ch3-fn3"/>
       <w:r>
         <w:t xml:space="preserve">The SynapseOS prototype uses Qwen2.5-Coder-3B-Instruct, a code-specialized open-weights model selected for its NL2Bash accuracy.  See Section 2.1(d) for selection rationale and benchmark evidence.</w:t>
       </w:r>
-      <w:bookmarkEnd w:id="127"/>
+      <w:bookmarkEnd w:id="128"/>
     </w:p>
     <w:p>
       <w:pPr>
@@ -14000,11 +14034,11 @@
           <w:numId w:val="1020"/>
         </w:numPr>
       </w:pPr>
-      <w:bookmarkStart w:id="128" w:name="ch3-fn4"/>
+      <w:bookmarkStart w:id="129" w:name="ch3-fn4"/>
       <w:r>
         <w:t xml:space="preserve">An inference server loads a language model into memory and processes query requests from the application layer.  Ollama is an open-source tool for running language models locally on consumer hardware without cloud connectivity.</w:t>
       </w:r>
-      <w:bookmarkEnd w:id="128"/>
+      <w:bookmarkEnd w:id="129"/>
     </w:p>
     <w:p>
       <w:pPr>
@@ -14014,11 +14048,11 @@
           <w:numId w:val="1020"/>
         </w:numPr>
       </w:pPr>
-      <w:bookmarkStart w:id="129" w:name="ch3-fn5"/>
+      <w:bookmarkStart w:id="130" w:name="ch3-fn5"/>
       <w:r>
         <w:t xml:space="preserve">Open-weights models make their trained parameters publicly available for local download and use; users run inference on their own hardware without routing queries to an external service provider.</w:t>
       </w:r>
-      <w:bookmarkEnd w:id="129"/>
+      <w:bookmarkEnd w:id="130"/>
     </w:p>
     <w:p>
       <w:pPr>
@@ -14028,11 +14062,11 @@
           <w:numId w:val="1020"/>
         </w:numPr>
       </w:pPr>
-      <w:bookmarkStart w:id="130" w:name="ch3-fn6"/>
+      <w:bookmarkStart w:id="131" w:name="ch3-fn6"/>
       <w:r>
         <w:t xml:space="preserve">Quantization reduces the numerical precision of model weights to lower memory requirements.  At 4-bit precision, a model that would otherwise require dedicated GPU memory can run on a standard CPU with modest RAM.</w:t>
       </w:r>
-      <w:bookmarkEnd w:id="130"/>
+      <w:bookmarkEnd w:id="131"/>
     </w:p>
     <w:p>
       <w:pPr>
@@ -14042,11 +14076,11 @@
           <w:numId w:val="1020"/>
         </w:numPr>
       </w:pPr>
-      <w:bookmarkStart w:id="131" w:name="ch3-fn7"/>
+      <w:bookmarkStart w:id="132" w:name="ch3-fn7"/>
       <w:r>
         <w:t xml:space="preserve">Low-Rank Adaptation (LoRA) is a parameter-efficient fine-tuning method that introduces a small number of trainable weight matrices while keeping the base model frozen, enabling task-specific adaptation on consumer hardware without full retraining.</w:t>
       </w:r>
-      <w:bookmarkEnd w:id="131"/>
+      <w:bookmarkEnd w:id="132"/>
     </w:p>
     <w:p>
       <w:pPr>
@@ -14056,14 +14090,14 @@
           <w:numId w:val="1020"/>
         </w:numPr>
       </w:pPr>
-      <w:bookmarkStart w:id="132" w:name="ch3-fn8"/>
+      <w:bookmarkStart w:id="133" w:name="ch3-fn8"/>
       <w:r>
         <w:t xml:space="preserve">NL2Bash is a benchmark dataset pairing natural language command descriptions with their corresponding bash shell commands, used to evaluate a model’s accuracy in translating natural language into executable commands.</w:t>
       </w:r>
-      <w:bookmarkEnd w:id="132"/>
-    </w:p>
-    <w:bookmarkEnd w:id="133"/>
-    <w:bookmarkStart w:id="134" w:name="sec-master-references"/>
+      <w:bookmarkEnd w:id="133"/>
+    </w:p>
+    <w:bookmarkEnd w:id="134"/>
+    <w:bookmarkStart w:id="135" w:name="sec-master-references"/>
     <w:p>
       <w:pPr>
         <w:pStyle w:val="FirstParagraph"/>
@@ -14072,7 +14106,7 @@
         <w:t xml:space="preserve">REFERENCES</w:t>
       </w:r>
     </w:p>
-    <w:bookmarkEnd w:id="134"/>
+    <w:bookmarkEnd w:id="135"/>
     <w:p>
       <w:pPr>
         <w:pStyle w:val="BodyText"/>
@@ -15278,7 +15312,7 @@
         <w:t xml:space="preserve">X. Zhou, S. Zhang, Y. Zhao, J. Wei, T. Song, A. Cohan, and C. Zhao. 2026. GUI vs. CLI: Execution Bottlenecks in Screen-Only and Skill-Mediated Computer-Use Agents. arXiv:2606.24551</w:t>
       </w:r>
     </w:p>
-    <w:bookmarkStart w:id="142" w:name="sec-appendices"/>
+    <w:bookmarkStart w:id="143" w:name="sec-appendices"/>
     <w:p>
       <w:pPr>
         <w:pStyle w:val="Heading2"/>
@@ -15295,7 +15329,7 @@
         <w:t xml:space="preserve">This section contains the study instruments administered to participants and the procedure governing their administration.  Wording, difficulty calibration, and task-form equivalence are validated during the pilot study described in Section 2.3 and revised before the main study begins; the instruments are reproduced here in the form submitted for ethics review.</w:t>
       </w:r>
     </w:p>
-    <w:bookmarkStart w:id="135" w:name="appendix-a"/>
+    <w:bookmarkStart w:id="136" w:name="appendix-a"/>
     <w:p>
       <w:pPr>
         <w:pStyle w:val="BodyText"/>
@@ -15312,7 +15346,7 @@
         <w:t xml:space="preserve">System Usability Scale (SUS)</w:t>
       </w:r>
     </w:p>
-    <w:bookmarkEnd w:id="135"/>
+    <w:bookmarkEnd w:id="136"/>
     <w:p>
       <w:pPr>
         <w:pStyle w:val="BodyText"/>
@@ -16355,7 +16389,7 @@
         <w:t xml:space="preserve">For odd-numbered items, subtract 1 from the response.  For even-numbered items, subtract the response from 5.  Sum the ten adjusted scores and multiply by 2.5, giving a value from 0 to 100.  This value is not a percentage; interpretation follows Sauro and Lewis [39].</w:t>
       </w:r>
     </w:p>
-    <w:bookmarkStart w:id="136" w:name="appendix-b"/>
+    <w:bookmarkStart w:id="137" w:name="appendix-b"/>
     <w:p>
       <w:pPr>
         <w:pStyle w:val="BodyText"/>
@@ -16372,7 +16406,7 @@
         <w:t xml:space="preserve">NASA Task Load Index (NASA-TLX)</w:t>
       </w:r>
     </w:p>
-    <w:bookmarkEnd w:id="136"/>
+    <w:bookmarkEnd w:id="137"/>
     <w:p>
       <w:pPr>
         <w:pStyle w:val="BodyText"/>
@@ -16883,7 +16917,7 @@
         </w:tc>
       </w:tr>
     </w:tbl>
-    <w:bookmarkStart w:id="137" w:name="appendix-c"/>
+    <w:bookmarkStart w:id="138" w:name="appendix-c"/>
     <w:p>
       <w:pPr>
         <w:pStyle w:val="BodyText"/>
@@ -16900,7 +16934,7 @@
         <w:t xml:space="preserve">Custom Cross-Platform Task Suite</w:t>
       </w:r>
     </w:p>
-    <w:bookmarkEnd w:id="137"/>
+    <w:bookmarkEnd w:id="138"/>
     <w:p>
       <w:pPr>
         <w:pStyle w:val="BodyText"/>
@@ -18574,7 +18608,7 @@
         </w:tc>
       </w:tr>
     </w:tbl>
-    <w:bookmarkStart w:id="138" w:name="appendix-d"/>
+    <w:bookmarkStart w:id="139" w:name="appendix-d"/>
     <w:p>
       <w:pPr>
         <w:pStyle w:val="BodyText"/>
@@ -18591,7 +18625,7 @@
         <w:t xml:space="preserve">Pre-Study Screening Questionnaire</w:t>
       </w:r>
     </w:p>
-    <w:bookmarkEnd w:id="138"/>
+    <w:bookmarkEnd w:id="139"/>
     <w:p>
       <w:pPr>
         <w:pStyle w:val="BodyText"/>
@@ -19148,7 +19182,7 @@
         <w:t xml:space="preserve">□ SynapseOS first   □ Own OS first</w:t>
       </w:r>
     </w:p>
-    <w:bookmarkStart w:id="139" w:name="appendix-e"/>
+    <w:bookmarkStart w:id="140" w:name="appendix-e"/>
     <w:p>
       <w:pPr>
         <w:pStyle w:val="BodyText"/>
@@ -19165,7 +19199,7 @@
         <w:t xml:space="preserve">Participant Information Sheet</w:t>
       </w:r>
     </w:p>
-    <w:bookmarkEnd w:id="139"/>
+    <w:bookmarkEnd w:id="140"/>
     <w:p>
       <w:pPr>
         <w:pStyle w:val="BodyText"/>
@@ -19364,7 +19398,7 @@
         <w:t xml:space="preserve">For questions about the study, contact the research team at [research team contact address].  For concerns about how the study is being conducted, or about your rights as a participant, contact the Institutional Review Board of Mapúa University – Makati at [ethics committee contact address], independently of the research team.</w:t>
       </w:r>
     </w:p>
-    <w:bookmarkStart w:id="140" w:name="appendix-f"/>
+    <w:bookmarkStart w:id="141" w:name="appendix-f"/>
     <w:p>
       <w:pPr>
         <w:pStyle w:val="BodyText"/>
@@ -19381,7 +19415,7 @@
         <w:t xml:space="preserve">Informed Consent Form</w:t>
       </w:r>
     </w:p>
-    <w:bookmarkEnd w:id="140"/>
+    <w:bookmarkEnd w:id="141"/>
     <w:p>
       <w:pPr>
         <w:pStyle w:val="BodyText"/>
@@ -19796,7 +19830,7 @@
         <w:t xml:space="preserve">Filing note: this is the only study document bearing the participant’s name.  It is stored separately from all study data, and the code-to-name list derived from it is destroyed on the schedule stated in Section 2.5.</w:t>
       </w:r>
     </w:p>
-    <w:bookmarkStart w:id="141" w:name="appendix-g"/>
+    <w:bookmarkStart w:id="142" w:name="appendix-g"/>
     <w:p>
       <w:pPr>
         <w:pStyle w:val="BodyText"/>
@@ -19813,7 +19847,7 @@
         <w:t xml:space="preserve">Session Facilitator Checklist</w:t>
       </w:r>
     </w:p>
-    <w:bookmarkEnd w:id="141"/>
+    <w:bookmarkEnd w:id="142"/>
     <w:p>
       <w:pPr>
         <w:pStyle w:val="BodyText"/>
@@ -20142,7 +20176,7 @@
         <w:t xml:space="preserve">Diarise the participant’s fourteen-day withdrawal deadline.</w:t>
       </w:r>
     </w:p>
-    <w:bookmarkEnd w:id="142"/>
+    <w:bookmarkEnd w:id="143"/>
     <w:sectPr/>
   </w:body>
 </w:document>

</xml_diff>

<commit_message>
docs(thesis): fix the sixth pass/fail check's high and medium findings
Chapter 1: 'none without asking' corrected to 'without either asking or capturing first', the pattern-list figure stated as neither a confirmation nor a capture, and where the analysis can be placed scoped to Bash on a Debian-like system.
Chapter 2: [58]'s 69.3% is skill augmentation guided by verifiers, not result checking (checked against the abstract), and the analogy built on it is dropped; one-sided soundness scoped to the rule table and resolution time; only the 450 NL2Bash commands are not written by the study's authors.
Chapter 3: Algorithm 1's branch arm returns its effects and doubts V, doubt(V) covers creations over removed paths (PR #88), and | keeps S; defects 'not triggered' rather than 'not exercised'; the habituation claim cited (Bravo-Lillo et al., SOUPS 2014, open access), which adds reference [4].
</commit_message>
<xml_diff>
--- a/thesis 1/consolidated/SynapseOS_Proposal_Chapters_1_to_3.docx
+++ b/thesis 1/consolidated/SynapseOS_Proposal_Chapters_1_to_3.docx
@@ -532,7 +532,7 @@
         <w:tab/>
       </w:r>
       <w:r>
-        <w:t xml:space="preserve">19</w:t>
+        <w:t xml:space="preserve">20</w:t>
       </w:r>
     </w:p>
     <w:p>
@@ -553,7 +553,7 @@
         <w:tab/>
       </w:r>
       <w:r>
-        <w:t xml:space="preserve">22</w:t>
+        <w:t xml:space="preserve">23</w:t>
       </w:r>
     </w:p>
     <w:p>
@@ -1164,7 +1164,7 @@
         <w:pStyle w:val="BodyText"/>
       </w:pPr>
       <w:r>
-        <w:t xml:space="preserve">The aspiration to instruct a computer in ordinary language is old; an early system for conversing with an operating system, the Berkeley UNIX Consultant, was operational by the late 1980s [48].  Large language models (LLMs) and multimodal foundation models</w:t>
+        <w:t xml:space="preserve">The aspiration to instruct a computer in ordinary language is old; an early system for conversing with an operating system, the Berkeley UNIX Consultant, was operational by the late 1980s [49].  Large language models (LLMs) and multimodal foundation models</w:t>
       </w:r>
       <w:hyperlink w:anchor="ch1-fn1">
         <w:r>
@@ -1179,7 +1179,7 @@
         <w:t xml:space="preserve"> </w:t>
       </w:r>
       <w:r>
-        <w:t xml:space="preserve">have reopened it with far greater capability.  They translate natural language into Bash commands with usable accuracy [12, 46], and computer-using agents</w:t>
+        <w:t xml:space="preserve">have reopened it with far greater capability.  They translate natural language into Bash commands with usable accuracy [13, 47], and computer-using agents</w:t>
       </w:r>
       <w:hyperlink w:anchor="ch1-fn2">
         <w:r>
@@ -1194,7 +1194,7 @@
         <w:t xml:space="preserve"> </w:t>
       </w:r>
       <w:r>
-        <w:t xml:space="preserve">built on them operate desktop, mobile, and web applications [52, 53, 55, 56].  More and more of these systems act by running commands on a real machine, and so on a person’s own files.</w:t>
+        <w:t xml:space="preserve">built on them operate desktop, mobile, and web applications [53, 54, 56, 57].  More and more of these systems act by running commands on a real machine, and so on a person’s own files.</w:t>
       </w:r>
     </w:p>
     <w:p>
@@ -1281,15 +1281,15 @@
         <w:t xml:space="preserve">permission</w:t>
       </w:r>
       <w:r>
-        <w:t xml:space="preserve">: the command is matched against a list of patterns judged dangerous and is then allowed, refused, or put to the user, as in the dangerous-command check of OpenAI’s Codex CLI [31] and cc-safety-net, a guard used with several AI coding agents [20].  A few that ship add coarse recovery: Alibaba Cloud’s ANOLISA, a Linux distribution for AI agents, snapshots an agent’s workspace before key operations or after each round of conversation and can roll back to any snapshot [1], which restores everything since the snapshot rather than what one command destroyed.  A list judges a command by its name and arguments, so it misses what the command touches through another command or a target computed at run time, and neither a list nor a snapshot can say, before a command runs, whether it will lose anything.  NaSh, a design for a natural-language shell, proposes summaries of what a command would affect and selective undo, but leaves their mechanism open [12], and no system in the surveyed literature, nor any shipping tool examined, determines before a generated command runs what it would destroy, or captures exactly that so that the command can be undone.  That is the gap this study’s research addresses.</w:t>
-      </w:r>
-    </w:p>
-    <w:p>
-      <w:pPr>
-        <w:pStyle w:val="BodyText"/>
-      </w:pPr>
-      <w:r>
-        <w:t xml:space="preserve">The setting in which the gap arises has gaps of its own, surveyed in Chapter 2, Section 2.9: no surveyed system, implemented and evaluated, places a conversational layer over a whole desktop session for the person using the machine [24, 53], the Linux work that exists serves servers and agents rather than an end user’s desktop [1, 12], and controlled comparisons with the conventional graphical workflow cover narrow slices such as a single application [25].  They are not what this study contributes; they are why the analysis is deployed in a working interface and validated with people, rather than only evaluated on a corpus.</w:t>
+        <w:t xml:space="preserve">: the command is matched against a list of patterns judged dangerous and is then allowed, refused, or put to the user, as in the dangerous-command check of OpenAI’s Codex CLI [32] and cc-safety-net, a guard used with several AI coding agents [21].  A few that ship add coarse recovery: Alibaba Cloud’s ANOLISA, a Linux distribution for AI agents, snapshots an agent’s workspace before key operations or after each round of conversation and can roll back to any snapshot [1], which restores everything since the snapshot rather than what one command destroyed.  A list judges a command by its name and arguments, so it misses what the command touches through another command or a target computed at run time, and neither a list nor a snapshot can say, before a command runs, whether it will lose anything.  NaSh, a design for a natural-language shell, proposes summaries of what a command would affect and selective undo, but leaves their mechanism open [13], and no system in the surveyed literature, nor any shipping tool examined, determines before a generated command runs what it would destroy, or captures exactly that so that the command can be undone.  That is the gap this study’s research addresses.</w:t>
+      </w:r>
+    </w:p>
+    <w:p>
+      <w:pPr>
+        <w:pStyle w:val="BodyText"/>
+      </w:pPr>
+      <w:r>
+        <w:t xml:space="preserve">The setting in which the gap arises has gaps of its own, surveyed in Chapter 2, Section 2.9: no surveyed system, implemented and evaluated, places a conversational layer over a whole desktop session for the person using the machine [25, 54], the Linux work that exists serves servers and agents rather than an end user’s desktop [1, 13], and controlled comparisons with the conventional graphical workflow cover narrow slices such as a single application [26].  They are not what this study contributes; they are why the analysis is deployed in a working interface and validated with people, rather than only evaluated on a corpus.</w:t>
       </w:r>
     </w:p>
     <w:p>
@@ -2244,7 +2244,7 @@
         <w:t xml:space="preserve"> </w:t>
       </w:r>
       <w:r>
-        <w:t xml:space="preserve">in the tradition of abstract interpretation, which reasons soundly about what a program could do without running it, and type-and-effect systems, which track what a program changes and not only what it computes [7, 19, 43]: a command is represented not by its name but by the set of effects its syntax implies, resolved against a working directory and propagated through the operators that join commands into one line, and the verdict is a predicate over that set.  Soundness is one-sided, because over-approximating what a command destroys costs a confirmation, whereas under-approximating it destroys data.  The analysis rests on a table of what each known command does, and a command absent from that table is unknown and asks; its claim is what it adds on top of a table, not that it has none.  It is distinguished from permission models, which can refuse a command but cannot restore what an approved one destroyed, and from privilege mechanisms such as</w:t>
+        <w:t xml:space="preserve">in the tradition of abstract interpretation, which reasons soundly about what a program could do without running it, and type-and-effect systems, which track what a program changes and not only what it computes [8, 20, 44]: a command is represented not by its name but by the set of effects its syntax implies, resolved against a working directory and propagated through the operators that join commands into one line, and the verdict is a predicate over that set.  Soundness is one-sided, because over-approximating what a command destroys costs a confirmation, whereas under-approximating it destroys data.  The analysis rests on a table of what each known command does, and a command absent from that table is unknown and asks; its claim is what it adds on top of a table, not that it has none.  It is distinguished from permission models, which can refuse a command but cannot restore what an approved one destroyed, and from privilege mechanisms such as</w:t>
       </w:r>
       <w:r>
         <w:t xml:space="preserve"> </w:t>
@@ -2273,7 +2273,7 @@
         <w:t xml:space="preserve">polkit</w:t>
       </w:r>
       <w:r>
-        <w:t xml:space="preserve">, which gate on who is acting rather than on what is about to happen.  It was evaluated on a held-out corpus of 777 commands, drawn after the analysis was frozen from NL2Bash, a public dataset of English descriptions paired with Bash commands, and from templates and commands written for the purpose.  For the 697 commands that act on files, the ground truth was observed by running each in a sandbox; the 80 whose effects lie outside the filesystem, such as on another machine, were labeled from a fixed table of state-changing tools.  Of the 405 that destroy data or act outside the filesystem, it let none run without asking, where an enumerated pattern list let 41.2% through.  Of the 325 that destroy files, the pattern list let 31% through and the checks of Codex CLI and cc-safety-net let 73% to 97% through, though those checks ask about fewer harmless commands than the analysis does (1 to 15 of the 372 that lose nothing).  Its</w:t>
+        <w:t xml:space="preserve">, which gate on who is acting rather than on what is about to happen.  It was evaluated on a held-out corpus of 777 commands, drawn after the analysis was frozen from NL2Bash, a public dataset of English descriptions paired with Bash commands, and from templates and commands written for the purpose.  For the 697 commands that act on files, the ground truth was observed by running each in a sandbox; the 80 whose effects lie outside the filesystem, such as on another machine, were labeled from a fixed table of state-changing tools.  Of the 405 that destroy data or act outside the filesystem, it let none run without either asking or capturing first, where an enumerated pattern list let 41.2% through.  Of the 325 that destroy files, the pattern list let 31% through and the checks of Codex CLI and cc-safety-net let 73% to 97% through, though those checks ask about fewer harmless commands than the analysis does (1 to 15 of the 372 that lose nothing).  Its</w:t>
       </w:r>
       <w:r>
         <w:t xml:space="preserve"> </w:t>
@@ -2408,7 +2408,7 @@
         <w:t xml:space="preserve"> </w:t>
       </w:r>
       <w:r>
-        <w:t xml:space="preserve">Coding assistants and other agents that execute generated commands guard them with lists of dangerous patterns, which on this study’s corpus let 31% of the file-destroying commands run without asking, and the checks of Codex CLI and cc-safety-net 73% to 97% (Section 1.5) [20, 31].  The recoverability analysis can be placed in front of any system that executes generated shell commands, and it adds what a list cannot: a capture, taken before the command runs, from which the command can be undone.</w:t>
+        <w:t xml:space="preserve">Coding assistants and other agents that execute generated commands guard them with lists of dangerous patterns, which on this study’s corpus let 31% of the file-destroying commands run with neither a confirmation nor a capture, and the checks of Codex CLI and cc-safety-net 73% to 97% across their presets (Section 1.5) [21, 32].  The recoverability analysis can be placed in front of any system that runs generated Bash commands on a Debian-like Linux system, the setting studied here (Section 1.7), and it adds what a list cannot: a capture, taken before the command runs, from which the command can be undone.</w:t>
       </w:r>
     </w:p>
     <w:p>
@@ -2452,7 +2452,7 @@
         <w:t xml:space="preserve"> </w:t>
       </w:r>
       <w:r>
-        <w:t xml:space="preserve">A person who cannot read a shell command cannot judge one a model wrote for them, so letting a model act on their behalf is safe only if what it destroys can be restored; the analysis supplies that for the commands it can determine, and asks first about the rest.  The validation study also characterizes the platform for novice and power users, and the platform could later host accessibility-specific configurations, such as speech-driven operation for users with motor impairments [13, 32, 33], which are outside the scope of this study.</w:t>
+        <w:t xml:space="preserve">A person who cannot read a shell command cannot judge one a model wrote for them, so letting a model act on their behalf is safe only if what it destroys can be restored; the analysis supplies that for the commands it can determine, and asks first about the rest.  The validation study also characterizes the platform for novice and power users, and the platform could later host accessibility-specific configurations, such as speech-driven operation for users with motor impairments [14, 33, 34], which are outside the scope of this study.</w:t>
       </w:r>
     </w:p>
     <w:bookmarkEnd w:id="33"/>
@@ -2528,7 +2528,7 @@
         </w:r>
       </w:hyperlink>
       <w:r>
-        <w:t xml:space="preserve">; it runs as an agentic layer over an ordinary desktop session rather than in place of one: the desktop shell, session manager, and application launcher continue to run and remain available to the user, as do the kernel and the core system utilities beneath them.  The Linux kernel, the core system utilities, and the existing ecosystem of Linux applications are not modified by this study; SynapseOS interacts with the system by translating natural language into shell commands executed through the standard command-line toolchain.  The validation study recruits novice computer users and power users for a controlled study on the platform, on cross-application desktop workflows that include shell operations, file management, and tasks representable in the OSWorld benchmark task suite [49], and it is bounded by the duration of the thesis project.</w:t>
+        <w:t xml:space="preserve">; it runs as an agentic layer over an ordinary desktop session rather than in place of one: the desktop shell, session manager, and application launcher continue to run and remain available to the user, as do the kernel and the core system utilities beneath them.  The Linux kernel, the core system utilities, and the existing ecosystem of Linux applications are not modified by this study; SynapseOS interacts with the system by translating natural language into shell commands executed through the standard command-line toolchain.  The validation study recruits novice computer users and power users for a controlled study on the platform, on cross-application desktop workflows that include shell operations, file management, and tasks representable in the OSWorld benchmark task suite [50], and it is bounded by the duration of the thesis project.</w:t>
       </w:r>
     </w:p>
     <w:p>
@@ -2593,7 +2593,7 @@
         </w:r>
       </w:hyperlink>
       <w:r>
-        <w:t xml:space="preserve">; this may limit how often a request is translated correctly, which bounds the validation study but not the analysis, which takes whatever command it is given.  Seventh, the platform targets the Linux desktop, and the validation study’s findings may not generalize to Windows or macOS; it is bounded by the task coverage of the OSWorld benchmark and the custom task suite, and users with motor accessibility needs are excluded from it for ethics-review and recruitment reasons, so accessibility-specific configurations such as speech-instructed operation for atypical speech [13] are out of scope.</w:t>
+        <w:t xml:space="preserve">; this may limit how often a request is translated correctly, which bounds the validation study but not the analysis, which takes whatever command it is given.  Seventh, the platform targets the Linux desktop, and the validation study’s findings may not generalize to Windows or macOS; it is bounded by the task coverage of the OSWorld benchmark and the custom task suite, and users with motor accessibility needs are excluded from it for ethics-review and recruitment reasons, so accessibility-specific configurations such as speech-instructed operation for atypical speech [14] are out of scope.</w:t>
       </w:r>
     </w:p>
     <w:bookmarkEnd w:id="34"/>
@@ -2709,7 +2709,7 @@
         <w:pStyle w:val="FirstParagraph"/>
       </w:pPr>
       <w:r>
-        <w:t xml:space="preserve">This chapter reviews two bodies of research: the program-analysis and command-safety work on which the study’s recoverability analysis builds, and the work on conversational and language-model-mediated interfaces to personal computing in which SynapseOS, the platform where the analysis is deployed, is situated.  The review spans nearly four decades of work on natural-language interfaces to computing systems, from the symbolic-artificial-intelligence consultants developed for the Unix shell in the late 1980s [48] to the large language model (LLM) agents that now operate shells, graphical applications, browsers, and mobile devices.  Its purpose is threefold: to establish the conceptual vocabulary and technical foundations on which the present study builds, to characterize the current state of the field and its recurring limitations, and to locate precisely the gaps that the proposed recoverability analysis, and SynapseOS, the system in which it is deployed, are designed to fill.</w:t>
+        <w:t xml:space="preserve">This chapter reviews two bodies of research: the program-analysis and command-safety work on which the study’s recoverability analysis builds, and the work on conversational and language-model-mediated interfaces to personal computing in which SynapseOS, the platform where the analysis is deployed, is situated.  The review spans nearly four decades of work on natural-language interfaces to computing systems, from the symbolic-artificial-intelligence consultants developed for the Unix shell in the late 1980s [49] to the large language model (LLM) agents that now operate shells, graphical applications, browsers, and mobile devices.  Its purpose is threefold: to establish the conceptual vocabulary and technical foundations on which the present study builds, to characterize the current state of the field and its recurring limitations, and to locate precisely the gaps that the proposed recoverability analysis, and SynapseOS, the system in which it is deployed, are designed to fill.</w:t>
       </w:r>
     </w:p>
     <w:p>
@@ -2760,7 +2760,7 @@
         <w:pStyle w:val="FirstParagraph"/>
       </w:pPr>
       <w:r>
-        <w:t xml:space="preserve">The technique the study’s recoverability analysis relies on — determining what a piece of code will do without executing it — is not new; it has a decades-long history in programming-language theory under two related names, neither of which the natural-language shells and command guards surveyed in this chapter draw on.  Abstract interpretation, introduced by Cousot and Cousot [7], is the foundational technique for computing sound, conservative approximations of a program’s runtime behavior by evaluating it over an abstract domain rather than its concrete one.  Type-and-effect systems, whose types and effects can be inferred by the algebraic reconstruction of Jouvelot and Gifford [19] and are given a full formal treatment by Talpin and Jouvelot [43], extend a program’s type judgment with an explicit account of the side effects an expression may produce, so that a compiler or static checker can reason about those effects instead of leaving them implicit in execution.  The recoverability algorithm this study contributes (Chapter 3, Section 2.1(a)–(c)) is an instance of this discipline applied to a question that no work in the surveyed corpus applies either tradition to: whether the effects of a generated command can be undone, and what must be captured beforehand so that they can be.  A generated shell command is treated as an expression whose effect — on the filesystem and on the system’s installed packages and running services, rather than on a type system’s abstract state — is derived from its syntax and composed across its operators, and it is that effect set, not the command’s name, that the recoverability verdict is computed over.  This connects the algorithm to an established formal lineage rather than presenting it as a bespoke heuristic, and it grounds the algorithm’s one-sided soundness property — over-approximating destructiveness under uncertainty rather than under-approximating it — in the same requirement abstract interpretation itself imposes: a sound abstraction may lose precision, but it may never assert a property the concrete execution does not actually have.</w:t>
+        <w:t xml:space="preserve">The technique the study’s recoverability analysis relies on — determining what a piece of code will do without executing it — is not new; it has a decades-long history in programming-language theory under two related names, neither of which the natural-language shells and command guards surveyed in this chapter draw on.  Abstract interpretation, introduced by Cousot and Cousot [8], is the foundational technique for computing sound, conservative approximations of a program’s runtime behavior by evaluating it over an abstract domain rather than its concrete one.  Type-and-effect systems, whose types and effects can be inferred by the algebraic reconstruction of Jouvelot and Gifford [20] and are given a full formal treatment by Talpin and Jouvelot [44], extend a program’s type judgment with an explicit account of the side effects an expression may produce, so that a compiler or static checker can reason about those effects instead of leaving them implicit in execution.  The recoverability algorithm this study contributes (Chapter 3, Section 2.1(a)–(c)) is an instance of this discipline applied to a question that no work in the surveyed corpus applies either tradition to: whether the effects of a generated command can be undone, and what must be captured beforehand so that they can be.  A generated shell command is treated as an expression whose effect — on the filesystem and on the system’s installed packages and running services, rather than on a type system’s abstract state — is derived from its syntax and composed across its operators, and it is that effect set, not the command’s name, that the recoverability verdict is computed over.  This connects the algorithm to an established formal lineage rather than presenting it as a bespoke heuristic, and it grounds the algorithm’s one-sided soundness property — over-approximating destructiveness under uncertainty rather than under-approximating it — in the same requirement abstract interpretation itself imposes: a sound abstraction may lose precision, but it may never assert a property the concrete execution does not actually have.</w:t>
       </w:r>
     </w:p>
     <w:p>
@@ -2815,7 +2815,7 @@
         <w:t xml:space="preserve">one-sided</w:t>
       </w:r>
       <w:r>
-        <w:t xml:space="preserve">: whatever cannot be determined is treated as unrecoverable, so that the analysis may ask more often than necessary but may never declare a destructive command safe.</w:t>
+        <w:t xml:space="preserve">: whatever cannot be determined is treated as unrecoverable, so that the analysis may ask more often than necessary but may never declare a destructive command safe.  That guarantee is relative to the per-command rule table and to the filesystem as it is when targets are resolved, shortly before the command runs (Chapter 3, Section 2.1(a)).</w:t>
       </w:r>
     </w:p>
     <w:bookmarkEnd w:id="43"/>
@@ -2849,7 +2849,7 @@
         <w:t xml:space="preserve"> </w:t>
       </w:r>
       <w:r>
-        <w:t xml:space="preserve">— Input, Reasoning, Action, and Operating-System Integration — as its framework for the interface literature.  The framework is informed by the component view of large language model (LLM)-brained graphical user interface (GUI) agents in the survey of Zhang and colleagues [52], whose perception, planning, and action components are recast here, with an added layer for the scope of an interface’s effect, as four layers for language-mediated computing interfaces as a class.  Figure 2.1 depicts the pipeline and situates the layers relative to one another.</w:t>
+        <w:t xml:space="preserve">— Input, Reasoning, Action, and Operating-System Integration — as its framework for the interface literature.  The framework is informed by the component view of large language model (LLM)-brained graphical user interface (GUI) agents in the survey of Zhang and colleagues [53], whose perception, planning, and action components are recast here, with an added layer for the scope of an interface’s effect, as four layers for language-mediated computing interfaces as a class.  Figure 2.1 depicts the pipeline and situates the layers relative to one another.</w:t>
       </w:r>
     </w:p>
     <w:p>
@@ -2866,7 +2866,7 @@
               <a:graphicData uri="http://schemas.openxmlformats.org/drawingml/2006/picture">
                 <pic:pic>
                   <pic:nvPicPr>
-                    <pic:cNvPr descr="/tmp/claude-1000/-home-willard-projects-thesis/cb82e7af-8c35-489a-a7f7-ef49172efea2/scratchpad/docx/w12/fig0.png" id="46" name="Picture"/>
+                    <pic:cNvPr descr="/tmp/claude-1000/-home-willard-projects-thesis/cb82e7af-8c35-489a-a7f7-ef49172efea2/scratchpad/docx/w13/fig0.png" id="46" name="Picture"/>
                     <pic:cNvPicPr>
                       <a:picLocks noChangeArrowheads="1" noChangeAspect="1"/>
                     </pic:cNvPicPr>
@@ -2914,7 +2914,7 @@
         <w:t xml:space="preserve"> </w:t>
       </w:r>
       <w:r>
-        <w:t xml:space="preserve">The four-layer interaction pipeline for language-mediated computing interfaces, adapted from the LLM-brained GUI-agent survey of Zhang and colleagues [52].  A user’s intent enters at the Input layer, is parsed and grounded at the Reasoning layer, executed at the Action layer, and takes effect within a scope defined at the Operating-System Integration layer.</w:t>
+        <w:t xml:space="preserve">The four-layer interaction pipeline for language-mediated computing interfaces, adapted from the LLM-brained GUI-agent survey of Zhang and colleagues [53].  A user’s intent enters at the Input layer, is parsed and grounded at the Reasoning layer, executed at the Action layer, and takes effect within a scope defined at the Operating-System Integration layer.</w:t>
       </w:r>
     </w:p>
     <w:p>
@@ -3055,15 +3055,15 @@
         <w:pStyle w:val="FirstParagraph"/>
       </w:pPr>
       <w:r>
-        <w:t xml:space="preserve">The aspiration to let users describe what they want in ordinary language and have a computer carry it out is not new.  An early system of this kind for an operating system, the Berkeley Unix Consultant of Wilensky and colleagues [48], was already operational by the late 1980s.  The Unix Consultant was an intelligent natural-language interface that allowed naive users to learn about the Unix operating system through conversation in ordinary English, addressing both the natural-language-frontend problem and the consultation problem, and thereby distinguishing itself from systems intended only as command translators.  It was built on the KODIAK knowledge representation and incorporated a user-modeling component that represented the user’s knowledge state and a teaching component through which users could extend its knowledge base in natural language.  The system demonstrated end-to-end natural-language consultation about Unix, successfully answering "how do I," definitional, and problem-solving questions.  Critically, its authors identified knowledge acquisition as the principal bottleneck: extending the system to a new domain required substantial hand-engineering — a concern that directly foreshadows the contemporary problem of LLM-based agents requiring per-application grounding data.</w:t>
-      </w:r>
-    </w:p>
-    <w:p>
-      <w:pPr>
-        <w:pStyle w:val="BodyText"/>
-      </w:pPr>
-      <w:r>
-        <w:t xml:space="preserve">The intervening decades saw natural-language interaction treated primarily as a supervised-learning problem.  Representative of this pre-LLM era, the work of Li and colleagues on mapping natural-language instructions to mobile user-interface action sequences [22] trained dedicated phrase-extraction and grounding transformers on hand-annotated action sequences, achieving 70.59% accuracy on predicting complete ground-truth action sequences on its benchmark but remaining bound to its purpose-built datasets and architectures.  The decisive shift came with the introduction of in-context reasoning patterns for LLMs.  ReAct, introduced by Yao and colleagues [50], collapsed the multi-stage supervised pipeline into a prompting strategy: the language model is prompted to alternate between free-text "Thought" steps that update its plan and "Action" steps that interact with an external environment, with observations fed back into subsequent reasoning.  Implemented purely as a prompting strategy without fine-tuning, ReAct nonetheless outperformed imitation-learning and reinforcement-learning baselines that required thousands of training trajectories.</w:t>
+        <w:t xml:space="preserve">The aspiration to let users describe what they want in ordinary language and have a computer carry it out is not new.  An early system of this kind for an operating system, the Berkeley Unix Consultant of Wilensky and colleagues [49], was already operational by the late 1980s.  The Unix Consultant was an intelligent natural-language interface that allowed naive users to learn about the Unix operating system through conversation in ordinary English, addressing both the natural-language-frontend problem and the consultation problem, and thereby distinguishing itself from systems intended only as command translators.  It was built on the KODIAK knowledge representation and incorporated a user-modeling component that represented the user’s knowledge state and a teaching component through which users could extend its knowledge base in natural language.  The system demonstrated end-to-end natural-language consultation about Unix, successfully answering "how do I," definitional, and problem-solving questions.  Critically, its authors identified knowledge acquisition as the principal bottleneck: extending the system to a new domain required substantial hand-engineering — a concern that directly foreshadows the contemporary problem of LLM-based agents requiring per-application grounding data.</w:t>
+      </w:r>
+    </w:p>
+    <w:p>
+      <w:pPr>
+        <w:pStyle w:val="BodyText"/>
+      </w:pPr>
+      <w:r>
+        <w:t xml:space="preserve">The intervening decades saw natural-language interaction treated primarily as a supervised-learning problem.  Representative of this pre-LLM era, the work of Li and colleagues on mapping natural-language instructions to mobile user-interface action sequences [23] trained dedicated phrase-extraction and grounding transformers on hand-annotated action sequences, achieving 70.59% accuracy on predicting complete ground-truth action sequences on its benchmark but remaining bound to its purpose-built datasets and architectures.  The decisive shift came with the introduction of in-context reasoning patterns for LLMs.  ReAct, introduced by Yao and colleagues [51], collapsed the multi-stage supervised pipeline into a prompting strategy: the language model is prompted to alternate between free-text "Thought" steps that update its plan and "Action" steps that interact with an external environment, with observations fed back into subsequent reasoning.  Implemented purely as a prompting strategy without fine-tuning, ReAct nonetheless outperformed imitation-learning and reinforcement-learning baselines that required thousands of training trajectories.</w:t>
       </w:r>
     </w:p>
     <w:p>
@@ -3088,15 +3088,15 @@
         <w:pStyle w:val="FirstParagraph"/>
       </w:pPr>
       <w:r>
-        <w:t xml:space="preserve">The aspiration to a natural-language interface has a long-standing critique that remains unanswered, and a review that omitted it would misrepresent the state of the question.  Shneiderman’s account of direct manipulation [40] holds that interfaces succeed when the objects of interest are continuously visible, when actions upon them are rapid, incremental, and reversible, and when their effects are immediately apparent — properties that let a user build and maintain an accurate model of system state.  Norman formalized what an interface does for a user as the bridging of two gulfs [30]: the gulf of execution, between an intention and the actions a system makes available, and the gulf of evaluation, between the system’s response and the user’s ability to interpret it.  Hutchins, Hollan, and Norman [17] argued that direct manipulation narrows both, by making an interface feel like the object of interest itself rather than a description of it.</w:t>
-      </w:r>
-    </w:p>
-    <w:p>
-      <w:pPr>
-        <w:pStyle w:val="BodyText"/>
-      </w:pPr>
-      <w:r>
-        <w:t xml:space="preserve">A language interface sits awkwardly against nearly every one of those properties.  An utterance is not continuously visible, not incremental, and not reversible by the same gesture that produced it; the set of available actions is not displayed, so the user must guess at the system’s capabilities rather than see them.  Shneiderman and Maes debated precisely this trade-off between direct manipulation and interface agents [42], and Shneiderman argued subsequently that speech and language interaction consume the same cognitive resources a user needs in order to hold a task in mind, where pointing does not [41].  Empirical work on modern conversational agents has largely borne the concern out: Luger and Sellen documented a persistent gulf between what users expected a conversational agent to understand and what it actually did [26], and Clark and colleagues found that the properties people value in human conversation transfer poorly to interaction with an agent [6].</w:t>
+        <w:t xml:space="preserve">The aspiration to a natural-language interface has a long-standing critique that remains unanswered, and a review that omitted it would misrepresent the state of the question.  Shneiderman’s account of direct manipulation [41] holds that interfaces succeed when the objects of interest are continuously visible, when actions upon them are rapid, incremental, and reversible, and when their effects are immediately apparent — properties that let a user build and maintain an accurate model of system state.  Norman formalized what an interface does for a user as the bridging of two gulfs [31]: the gulf of execution, between an intention and the actions a system makes available, and the gulf of evaluation, between the system’s response and the user’s ability to interpret it.  Hutchins, Hollan, and Norman [18] argued that direct manipulation narrows both, by making an interface feel like the object of interest itself rather than a description of it.</w:t>
+      </w:r>
+    </w:p>
+    <w:p>
+      <w:pPr>
+        <w:pStyle w:val="BodyText"/>
+      </w:pPr>
+      <w:r>
+        <w:t xml:space="preserve">A language interface sits awkwardly against nearly every one of those properties.  An utterance is not continuously visible, not incremental, and not reversible by the same gesture that produced it; the set of available actions is not displayed, so the user must guess at the system’s capabilities rather than see them.  Shneiderman and Maes debated precisely this trade-off between direct manipulation and interface agents [43], and Shneiderman argued subsequently that speech and language interaction consume the same cognitive resources a user needs in order to hold a task in mind, where pointing does not [42].  Empirical work on modern conversational agents has largely borne the concern out: Luger and Sellen documented a persistent gulf between what users expected a conversational agent to understand and what it actually did [27], and Clark and colleagues found that the properties people value in human conversation transfer poorly to interaction with an agent [7].</w:t>
       </w:r>
     </w:p>
     <w:p>
@@ -3112,7 +3112,7 @@
         <w:pStyle w:val="BodyText"/>
       </w:pPr>
       <w:r>
-        <w:t xml:space="preserve">The comparative question is older than the current literature and considerably less settled than it is often assumed to be.  It is widely held that the command line’s power is inaccessible to most people in practice.  But the best-known controlled comparison of command, menu, and iconic interfaces, conducted by Whiteside and colleagues across seventy-six users and seven systems [47], concluded that interface style itself did not predict either performance or preference: careful design did, and the system that served novices best also served experts best.  That finding is as much a caution for the present study as a motivation for it.  It warns against attributing to a conversational paradigm what may in fact belong to the quality of one particular implementation, and it is a principal reason this study measures a specific system against a specific baseline rather than claiming to measure one paradigm against another.</w:t>
+        <w:t xml:space="preserve">The comparative question is older than the current literature and considerably less settled than it is often assumed to be.  It is widely held that the command line’s power is inaccessible to most people in practice.  But the best-known controlled comparison of command, menu, and iconic interfaces, conducted by Whiteside and colleagues across seventy-six users and seven systems [48], concluded that interface style itself did not predict either performance or preference: careful design did, and the system that served novices best also served experts best.  That finding is as much a caution for the present study as a motivation for it.  It warns against attributing to a conversational paradigm what may in fact belong to the quality of one particular implementation, and it is a principal reason this study measures a specific system against a specific baseline rather than claiming to measure one paradigm against another.</w:t>
       </w:r>
     </w:p>
     <w:bookmarkEnd w:id="49"/>
@@ -3139,23 +3139,23 @@
         <w:pStyle w:val="BodyText"/>
       </w:pPr>
       <w:r>
-        <w:t xml:space="preserve">The standard dataset for this task is NL2Bash, from Lin and colleagues [23]: over nine thousand English descriptions paired with Bash commands, collected from question-and-answer sites, tutorials, and course material.  It supplies the human-written commands of this study’s evaluation corpus (Chapter 3, Section 1.2(a)).  Its commands were collected for translation rather than for safety, so most of them are read-only, which is why that corpus is sized against the labels it must contain rather than drawn as the dataset comes.</w:t>
-      </w:r>
-    </w:p>
-    <w:p>
-      <w:pPr>
-        <w:pStyle w:val="BodyText"/>
-      </w:pPr>
-      <w:r>
-        <w:t xml:space="preserve">Westenfelder and colleagues [46] address this translation problem directly.  Their work constructs a manually verified test set of 600 instruction–command pairs and a training set of 40,939 pairs, and introduces a functional-equivalence heuristic that reaches 95% confidence in determining whether two Bash commands produce the same effect — allowing automated evaluation to move beyond exact-string matching to a measure of whether a generated command actually accomplishes the intended task.  Their fine-tuned models substantially outperform zero-shot baselines, demonstrating that fine-tuning specifically on command-translation data is effective.  The authors identify two persistent limitations: ambiguity in user instructions, and the absence of system context — the contents of the current directory, the user’s command history, and environment variables — at translation time.  Integrating context-aware retrieval is identified as a direction, one that the persistent conversational session of SynapseOS is well positioned to supply.</w:t>
-      </w:r>
-    </w:p>
-    <w:p>
-      <w:pPr>
-        <w:pStyle w:val="BodyText"/>
-      </w:pPr>
-      <w:r>
-        <w:t xml:space="preserve">The feasibility of deploying such a system without reliance on a hosted frontier model is supported by the large-scale evaluation of Jacobs and colleagues [18], who assess a broad range of locally deployable open-source LLMs on Bash command generation.  Their work provides an empirical anchor for the viability of running natural-language-to-Bash translation on local, open-weights models of modest size — the deployment posture adopted by SynapseOS for reasons of privacy and offline operation.  Taken together, the shell-and-command-line thread establishes that natural-language-to-Bash translation is tractable, that safety and reversibility are central rather than incidental concerns, and that local deployment is feasible; yet no surveyed shell-level system has been evaluated with users against the conventional workflow it would supplement.  How such systems guard the commands they generate, and what static analysis of shell commands can establish, are taken up in §2.5.</w:t>
+        <w:t xml:space="preserve">The standard dataset for this task is NL2Bash, from Lin and colleagues [24]: over nine thousand English descriptions paired with Bash commands, collected from question-and-answer sites, tutorials, and course material.  It supplies the human-written commands of this study’s evaluation corpus (Chapter 3, Section 1.2(a)).  Its commands were collected for translation rather than for safety, so most of them are read-only, which is why that corpus is sized against the labels it must contain rather than drawn as the dataset comes.</w:t>
+      </w:r>
+    </w:p>
+    <w:p>
+      <w:pPr>
+        <w:pStyle w:val="BodyText"/>
+      </w:pPr>
+      <w:r>
+        <w:t xml:space="preserve">Westenfelder and colleagues [47] address this translation problem directly.  Their work constructs a manually verified test set of 600 instruction–command pairs and a training set of 40,939 pairs, and introduces a functional-equivalence heuristic that reaches 95% confidence in determining whether two Bash commands produce the same effect — allowing automated evaluation to move beyond exact-string matching to a measure of whether a generated command actually accomplishes the intended task.  Their fine-tuned models substantially outperform zero-shot baselines, demonstrating that fine-tuning specifically on command-translation data is effective.  The authors identify two persistent limitations: ambiguity in user instructions, and the absence of system context — the contents of the current directory, the user’s command history, and environment variables — at translation time.  Integrating context-aware retrieval is identified as a direction, one that the persistent conversational session of SynapseOS is well positioned to supply.</w:t>
+      </w:r>
+    </w:p>
+    <w:p>
+      <w:pPr>
+        <w:pStyle w:val="BodyText"/>
+      </w:pPr>
+      <w:r>
+        <w:t xml:space="preserve">The feasibility of deploying such a system without reliance on a hosted frontier model is supported by the large-scale evaluation of Jacobs and colleagues [19], who assess a broad range of locally deployable open-source LLMs on Bash command generation.  Their work provides an empirical anchor for the viability of running natural-language-to-Bash translation on local, open-weights models of modest size — the deployment posture adopted by SynapseOS for reasons of privacy and offline operation.  Taken together, the shell-and-command-line thread establishes that natural-language-to-Bash translation is tractable, that safety and reversibility are central rather than incidental concerns, and that local deployment is feasible; yet no surveyed shell-level system has been evaluated with users against the conventional workflow it would supplement.  How such systems guard the commands they generate, and what static analysis of shell commands can establish, are taken up in §2.5.</w:t>
       </w:r>
     </w:p>
     <w:bookmarkEnd w:id="51"/>
@@ -3229,15 +3229,15 @@
         <w:pStyle w:val="FirstParagraph"/>
       </w:pPr>
       <w:r>
-        <w:t xml:space="preserve">Where translation accuracy is the concern of Westenfelder and colleagues (§2.4), safety is the concern of Gyawali and colleagues, whose NaSh system [12] proposes guardrails for an LLM-powered natural-language shell for Linux.  Published under the operating-systems classification, NaSh interposes a guardrail layer between the user’s natural-language input and the LLM-generated command: the model proposes a candidate command, the guardrail layer evaluates it against safety, reversibility, and confirmation criteria, and the user receives a structured preview before execution.  The authors note that LLM outputs may be unintended or unexplainable, requiring guardrails for user error recovery, and they leave as open work both the design of recovery and rollback mechanisms for irreversible system operations and the empirical user evaluation of the approach.  The first of these open problems, recovery from an operation already approved, is the one the present study’s recoverability analysis addresses; the second is taken up by its validation in use.</w:t>
-      </w:r>
-    </w:p>
-    <w:p>
-      <w:pPr>
-        <w:pStyle w:val="BodyText"/>
-      </w:pPr>
-      <w:r>
-        <w:t xml:space="preserve">The same design is what ships.  Coding agents that execute generated commands guard them with lists of command patterns: the dangerous-command check of OpenAI’s Codex CLI [31] and cc-safety-net [20], a pre-execution guard used with several agentic coding tools, are representative open-source examples, and both are scored as baselines in Chapter 3, Section 3.1(a).  Both are designed for agents working inside a version-controlled project, where deleting project files is routine and version control, rather than the guard, is what makes a mistake recoverable.  A personal computer’s files have no such safeguard, which is the setting of this study.</w:t>
+        <w:t xml:space="preserve">Where translation accuracy is the concern of Westenfelder and colleagues (§2.4), safety is the concern of Gyawali and colleagues, whose NaSh system [13] proposes guardrails for an LLM-powered natural-language shell for Linux.  Published under the operating-systems classification, NaSh interposes a guardrail layer between the user’s natural-language input and the LLM-generated command: the model proposes a candidate command, the guardrail layer evaluates it against safety, reversibility, and confirmation criteria, and the user receives a structured preview before execution.  The authors note that LLM outputs may be unintended or unexplainable, requiring guardrails for user error recovery, and they leave as open work both the design of recovery and rollback mechanisms for irreversible system operations and the empirical user evaluation of the approach.  The first of these open problems, recovery from an operation already approved, is the one the present study’s recoverability analysis addresses; the second is taken up by its validation in use.</w:t>
+      </w:r>
+    </w:p>
+    <w:p>
+      <w:pPr>
+        <w:pStyle w:val="BodyText"/>
+      </w:pPr>
+      <w:r>
+        <w:t xml:space="preserve">The same design is what ships.  Coding agents that execute generated commands guard them with lists of command patterns: the dangerous-command check of OpenAI’s Codex CLI [32] and cc-safety-net [21], a pre-execution guard used with several agentic coding tools, are representative open-source examples, and both are scored as baselines in Chapter 3, Section 3.1(a).  Both are designed for agents working inside a version-controlled project, where deleting project files is routine and version control, rather than the guard, is what makes a mistake recoverable.  A personal computer’s files have no such safeguard, which is the setting of this study.</w:t>
       </w:r>
     </w:p>
     <w:p>
@@ -3258,7 +3258,7 @@
         <w:t xml:space="preserve">permission</w:t>
       </w:r>
       <w:r>
-        <w:t xml:space="preserve">: the command is matched against an enumerated set of patterns judged dangerous, and is then allowed, refused, or escalated to the user, through allow-and-deny lists over command prefixes.  NaSh [12] goes further as a proposal, adding summaries of what a command would affect and selective undo to its guardrails, but leaves the mechanisms for both open.  A permission model answers whether a command may run.  It does not answer whether, having run, the command can be undone — and those are different questions with different answers.  Refusing a command protects a user only until they approve it, which for any system that must let work proceed is most of the time.</w:t>
+        <w:t xml:space="preserve">: the command is matched against an enumerated set of patterns judged dangerous, and is then allowed, refused, or escalated to the user, through allow-and-deny lists over command prefixes.  NaSh [13] goes further as a proposal, adding summaries of what a command would affect and selective undo to its guardrails, but leaves the mechanisms for both open.  A permission model answers whether a command may run.  It does not answer whether, having run, the command can be undone — and those are different questions with different answers.  Refusing a command protects a user only until they approve it, which for any system that must let work proceed is most of the time.</w:t>
       </w:r>
     </w:p>
     <w:p>
@@ -3286,7 +3286,7 @@
         <w:pStyle w:val="BodyText"/>
       </w:pPr>
       <w:r>
-        <w:t xml:space="preserve">Risk in agents that execute tools has also been studied by evaluation rather than by guarding.  ToolEmu emulates tool execution with a language model so that the failures of language-model agents, including destructive actions, can be found before the agents are deployed [37].  It measures how risky an agent is across many cases; it does not protect a user from the particular command an agent is about to run.</w:t>
+        <w:t xml:space="preserve">Risk in agents that execute tools has also been studied by evaluation rather than by guarding.  ToolEmu emulates tool execution with a language model so that the failures of language-model agents, including destructive actions, can be found before the agents are deployed [38].  It measures how risky an agent is across many cases; it does not protect a user from the particular command an agent is about to run.</w:t>
       </w:r>
     </w:p>
     <w:bookmarkEnd w:id="52"/>
@@ -3304,7 +3304,7 @@
         <w:pStyle w:val="FirstParagraph"/>
       </w:pPr>
       <w:r>
-        <w:t xml:space="preserve">Static analysis of shell scripts specifically is comparatively little studied, and the existing work targets properties adjacent to recoverability rather than recoverability itself.  ABash [27] performs abstract interpretation over bash’s variable-expansion semantics to catch common expansion bugs and includes taint tracking, but is not concerned with what a script’s commands would do to the filesystem if executed correctly.  Smoosh [11] gives the POSIX shell a mechanized, executable small-step operational semantics, validated against other shells' conformance test suites — exactly the kind of ground-truth semantics a static effect analysis would need to be checked against — but stops at defining that semantics rather than analyzing programs written in it.  Closest of the three is CoLiS [2], which applies symbolic execution to the more than twenty-seven thousand POSIX-shell maintainer scripts in the Debian package archive to verify</w:t>
+        <w:t xml:space="preserve">Static analysis of shell scripts specifically is comparatively little studied, and the existing work targets properties adjacent to recoverability rather than recoverability itself.  ABash [28] performs abstract interpretation over bash’s variable-expansion semantics to catch common expansion bugs and includes taint tracking, but is not concerned with what a script’s commands would do to the filesystem if executed correctly.  Smoosh [12] gives the POSIX shell a mechanized, executable small-step operational semantics, validated against other shells' conformance test suites — exactly the kind of ground-truth semantics a static effect analysis would need to be checked against — but stops at defining that semantics rather than analyzing programs written in it.  Closest of the three is CoLiS [2], which applies symbolic execution to the more than twenty-seven thousand POSIX-shell maintainer scripts in the Debian package archive to verify</w:t>
       </w:r>
       <w:r>
         <w:t xml:space="preserve"> </w:t>
@@ -3362,15 +3362,15 @@
         <w:pStyle w:val="BodyText"/>
       </w:pPr>
       <w:r>
-        <w:t xml:space="preserve">Filesystem snapshots are the most widely deployed, and one shipped natural-language shell already relies on them: ANOLISA’s checkpoint tool snapshots an agent’s workspace at file level before key operations or after each round of conversation, and rolls back to any snapshot [1].  A copy-on-write filesystem such as btrfs can snapshot a whole subvolume at little cost, because a snapshot shares its blocks with the live filesystem until they are modified [36], so snapshots can be taken on a schedule or before system updates.  A snapshot needs no knowledge of the command it protects against, which is both its strength and its limit.  Restoring one returns the whole subvolume to an earlier moment and discards every later change along with the unwanted one, and nothing about a snapshot can tell the user, before a command runs, whether that command will lose anything.  On a filesystem without copy-on-write, such as the ext4 on which this study is conducted, a snapshot must visit every file in the tree, a cost measured in Chapter 3, Section 3.1(a).  Versioning file systems instead keep old versions of individual files: the Elephant file system retains versions under per-file policies that decide when an old version may be forgotten [38].  Recovery is then per file and needs no foresight, but its storage cost is paid on every change, mistaken or not, and obtaining it means replacing the filesystem.</w:t>
-      </w:r>
-    </w:p>
-    <w:p>
-      <w:pPr>
-        <w:pStyle w:val="BodyText"/>
-      </w:pPr>
-      <w:r>
-        <w:t xml:space="preserve">Undo at the level of a service or the operating system makes recovery a property of the system’s design.  Operator Undo intercepts and logs the user interactions with an e-mail service before they reach it, so that an operator can rewind the service’s state, repair it, and replay what users did since [5].  Operating system transactions let a program group system calls so that their effects can be rolled back as a unit before they commit [34].  Intrusion recovery systems such as Taser log system activity so that the effects of an attack can be identified and reverted afterward while legitimate changes are kept [10].  Each restores more completely than any list can, but each requires something the setting of this study does not have: a service built to be undoable, a kernel and programs that use transactions, or continuous logging of all system activity.</w:t>
+        <w:t xml:space="preserve">Filesystem snapshots are the most widely deployed, and one shipped natural-language shell already relies on them: ANOLISA’s checkpoint tool snapshots an agent’s workspace at file level before key operations or after each round of conversation, and rolls back to any snapshot [1].  A copy-on-write filesystem such as btrfs can snapshot a whole subvolume at little cost, because a snapshot shares its blocks with the live filesystem until they are modified [37], so snapshots can be taken on a schedule or before system updates.  A snapshot needs no knowledge of the command it protects against, which is both its strength and its limit.  Restoring one returns the whole subvolume to an earlier moment and discards every later change along with the unwanted one, and nothing about a snapshot can tell the user, before a command runs, whether that command will lose anything.  On a filesystem without copy-on-write, such as the ext4 on which this study is conducted, a snapshot must visit every file in the tree, a cost measured in Chapter 3, Section 3.1(a).  Versioning file systems instead keep old versions of individual files: the Elephant file system retains versions under per-file policies that decide when an old version may be forgotten [39].  Recovery is then per file and needs no foresight, but its storage cost is paid on every change, mistaken or not, and obtaining it means replacing the filesystem.</w:t>
+      </w:r>
+    </w:p>
+    <w:p>
+      <w:pPr>
+        <w:pStyle w:val="BodyText"/>
+      </w:pPr>
+      <w:r>
+        <w:t xml:space="preserve">Undo at the level of a service or the operating system makes recovery a property of the system’s design.  Operator Undo intercepts and logs the user interactions with an e-mail service before they reach it, so that an operator can rewind the service’s state, repair it, and replay what users did since [6].  Operating system transactions let a program group system calls so that their effects can be rolled back as a unit before they commit [35].  Intrusion recovery systems such as Taser log system activity so that the effects of an attack can be identified and reverted afterward while legitimate changes are kept [11].  Each restores more completely than any list can, but each requires something the setting of this study does not have: a service built to be undoable, a kernel and programs that use transactions, or continuous logging of all system activity.</w:t>
       </w:r>
     </w:p>
     <w:p>
@@ -3410,7 +3410,7 @@
         <w:t xml:space="preserve"> </w:t>
       </w:r>
       <w:r>
-        <w:t xml:space="preserve">over the current environment, built from Linux namespaces and a union filesystem, captures its effects on the filesystem, and lets the user inspect them and then apply, discard, or apply part of them [21].  Its authors motivate it with cases this study shares, a</w:t>
+        <w:t xml:space="preserve">over the current environment, built from Linux namespaces and a union filesystem, captures its effects on the filesystem, and lets the user inspect them and then apply, discard, or apply part of them [22].  Its authors motivate it with cases this study shares, a</w:t>
       </w:r>
       <w:r>
         <w:t xml:space="preserve"> </w:t>
@@ -3572,7 +3572,7 @@
               <w:jc w:val="left"/>
             </w:pPr>
             <w:r>
-              <w:t xml:space="preserve">Pattern-list guards: Codex CLI, cc-safety-net [20, 31]</w:t>
+              <w:t xml:space="preserve">Pattern-list guards: Codex CLI, cc-safety-net [21, 32]</w:t>
             </w:r>
           </w:p>
         </w:tc>
@@ -3634,7 +3634,7 @@
               <w:jc w:val="left"/>
             </w:pPr>
             <w:r>
-              <w:t xml:space="preserve">Design proposal: NaSh [12]</w:t>
+              <w:t xml:space="preserve">Design proposal: NaSh [13]</w:t>
             </w:r>
           </w:p>
         </w:tc>
@@ -3696,7 +3696,7 @@
               <w:jc w:val="left"/>
             </w:pPr>
             <w:r>
-              <w:t xml:space="preserve">Shell program analyses: ABash, Smoosh, CoLiS [2, 11, 27]</w:t>
+              <w:t xml:space="preserve">Shell program analyses: ABash, Smoosh, CoLiS [2, 12, 28]</w:t>
             </w:r>
           </w:p>
         </w:tc>
@@ -3774,7 +3774,7 @@
               <w:t xml:space="preserve"> </w:t>
             </w:r>
             <w:r>
-              <w:t xml:space="preserve">[21]</w:t>
+              <w:t xml:space="preserve">[22]</w:t>
             </w:r>
           </w:p>
         </w:tc>
@@ -3898,7 +3898,7 @@
               <w:jc w:val="left"/>
             </w:pPr>
             <w:r>
-              <w:t xml:space="preserve">Filesystem snapshots [36]</w:t>
+              <w:t xml:space="preserve">Filesystem snapshots [37]</w:t>
             </w:r>
           </w:p>
         </w:tc>
@@ -3960,7 +3960,7 @@
               <w:jc w:val="left"/>
             </w:pPr>
             <w:r>
-              <w:t xml:space="preserve">Versioning file systems [38]</w:t>
+              <w:t xml:space="preserve">Versioning file systems [39]</w:t>
             </w:r>
           </w:p>
         </w:tc>
@@ -4022,7 +4022,7 @@
               <w:jc w:val="left"/>
             </w:pPr>
             <w:r>
-              <w:t xml:space="preserve">Service undo, OS transactions, intrusion recovery [5, 10, 34]</w:t>
+              <w:t xml:space="preserve">Service undo, OS transactions, intrusion recovery [6, 11, 35]</w:t>
             </w:r>
           </w:p>
         </w:tc>
@@ -4202,7 +4202,7 @@
         <w:pStyle w:val="FirstParagraph"/>
       </w:pPr>
       <w:r>
-        <w:t xml:space="preserve">The web has been the most heavily studied environment for language-guided agents.  Mind2Web, introduced by Deng and colleagues [9], is the first dataset for developing generalist web agents that follow language instructions across diverse real-world websites, comprising over two thousand open-ended tasks collected from 137 websites across 31 domains; its accompanying two-stage model uses a small language model to filter candidate elements from large documents before invoking a larger model to choose among them.  WebArena, introduced by Zhou and colleagues [56], provides a fully self-hosted, reproducible web environment of functional website clones and evaluates 812 long-horizon tasks for functional correctness rather than trajectory similarity, establishing a challenging benchmark on which contemporary models achieved completion rates far below human performance.  Zheng and colleagues [55], in their SeeAct framework, decouple visual understanding from action: the model observes a screenshot, generates a textual plan, and a separate step grounds that plan onto page elements.  Their central finding is diagnostic for the entire field — with oracle grounding provided, the model completes 51.1% of tasks on live websites, substantially outperforming a text-only baseline at 13.3%, but performance degrades sharply when grounding must itself be inferred, confirming visual grounding as the principal bottleneck.</w:t>
+        <w:t xml:space="preserve">The web has been the most heavily studied environment for language-guided agents.  Mind2Web, introduced by Deng and colleagues [10], is the first dataset for developing generalist web agents that follow language instructions across diverse real-world websites, comprising over two thousand open-ended tasks collected from 137 websites across 31 domains; its accompanying two-stage model uses a small language model to filter candidate elements from large documents before invoking a larger model to choose among them.  WebArena, introduced by Zhou and colleagues [57], provides a fully self-hosted, reproducible web environment of functional website clones and evaluates 812 long-horizon tasks for functional correctness rather than trajectory similarity, establishing a challenging benchmark on which contemporary models achieved completion rates far below human performance.  Zheng and colleagues [56], in their SeeAct framework, decouple visual understanding from action: the model observes a screenshot, generates a textual plan, and a separate step grounds that plan onto page elements.  Their central finding is diagnostic for the entire field — with oracle grounding provided, the model completes 51.1% of tasks on live websites, substantially outperforming a text-only baseline at 13.3%, but performance degrades sharply when grounding must itself be inferred, confirming visual grounding as the principal bottleneck.</w:t>
       </w:r>
     </w:p>
     <w:bookmarkEnd w:id="56"/>
@@ -4220,7 +4220,7 @@
         <w:pStyle w:val="FirstParagraph"/>
       </w:pPr>
       <w:r>
-        <w:t xml:space="preserve">Mobile-device control has produced large-scale datasets and progressively more autonomous agents.  The pre-LLM work of Li and colleagues [22], discussed in §2.3, established the grounding problem for mobile interfaces.  Android in the Wild, from Rawles and colleagues [35], contributes a dataset of 715,000 episodes spanning 30,000 unique instructions, in which actions are gestures at arbitrary screen coordinates rather than operations on indexed interface elements, exposing the challenge that actions must be inferred from visual appearance rather than from a structured model of the interface.  AppAgent, from Zhang and colleagues [54], operates Android applications through a simplified action space of taps and swipes and learns to use new applications through autonomous exploration or by observing human demonstrations, generating application-specific documentation that matched or exceeded human-written documentation.  Mobile-Agent, from Wang and colleagues [45], adopts a purely vision-centric approach that requires no system metadata, using optical-character-recognition and icon-detection modules to locate interface elements — achieving broad applicability across mobile environments at the cost of vision-grounding errors that require recovery mechanisms.</w:t>
+        <w:t xml:space="preserve">Mobile-device control has produced large-scale datasets and progressively more autonomous agents.  The pre-LLM work of Li and colleagues [23], discussed in §2.3, established the grounding problem for mobile interfaces.  Android in the Wild, from Rawles and colleagues [36], contributes a dataset of 715,000 episodes spanning 30,000 unique instructions, in which actions are gestures at arbitrary screen coordinates rather than operations on indexed interface elements, exposing the challenge that actions must be inferred from visual appearance rather than from a structured model of the interface.  AppAgent, from Zhang and colleagues [55], operates Android applications through a simplified action space of taps and swipes and learns to use new applications through autonomous exploration or by observing human demonstrations, generating application-specific documentation that matched or exceeded human-written documentation.  Mobile-Agent, from Wang and colleagues [46], adopts a purely vision-centric approach that requires no system metadata, using optical-character-recognition and icon-detection modules to locate interface elements — achieving broad applicability across mobile environments at the cost of vision-grounding errors that require recovery mechanisms.</w:t>
       </w:r>
     </w:p>
     <w:bookmarkEnd w:id="57"/>
@@ -4238,7 +4238,7 @@
         <w:pStyle w:val="FirstParagraph"/>
       </w:pPr>
       <w:r>
-        <w:t xml:space="preserve">Desktop agents are the most direct graphical analogue to the present work, and their limitations are the most instructive.  ScreenAgent, from Niu and colleagues [29], is a vision-language-model-driven agent for cross-application desktop control that operates in a plan–act–reflect cycle, specifying actions as coordinates and key sequences; its authors acknowledge that vision-only grounding is less reliable than approaches with API access.  WinClick, from Hui and colleagues [16], targets Windows-desktop grounding and observes that most existing GUI agents rely on structured data formats such as the document object model or HyperText Markup Language, which are unavailable across general desktop environments; it therefore performs visual grounding directly from screenshots.  UFO², the "Desktop AgentOS" of Zhang and colleagues [53], is the most ambitious desktop system surveyed: it fuses the native Windows accessibility framework with vision-based parsing in a hybrid action mechanism, dispatching subtasks from a coordinating agent to application-specialized agents.  Its authors argue that existing computer-using agents are hindered by shallow operating-system integration, fragile screenshot-based interaction, and disruptive execution, and they identify adaptation to other desktop platforms, such as Linux and macOS, as future work.  UFO² acts on the user’s behalf, as an automation layer beside the user’s own Windows session, and its authors frame cross-platform deployment as groundwork for a unified ecosystem of desktop automation solutions; the platform built for this study is instead operated by a person, turn by turn.  AgentOS, from Liu and colleagues [24], goes further in ambition, proposing that a natural-language portal replace application silos as the way a person uses the operating system, but it is offered as a research direction, without a built system or an evaluation.</w:t>
+        <w:t xml:space="preserve">Desktop agents are the most direct graphical analogue to the present work, and their limitations are the most instructive.  ScreenAgent, from Niu and colleagues [30], is a vision-language-model-driven agent for cross-application desktop control that operates in a plan–act–reflect cycle, specifying actions as coordinates and key sequences; its authors acknowledge that vision-only grounding is less reliable than approaches with API access.  WinClick, from Hui and colleagues [17], targets Windows-desktop grounding and observes that most existing GUI agents rely on structured data formats such as the document object model or HyperText Markup Language, which are unavailable across general desktop environments; it therefore performs visual grounding directly from screenshots.  UFO², the "Desktop AgentOS" of Zhang and colleagues [54], is the most ambitious desktop system surveyed: it fuses the native Windows accessibility framework with vision-based parsing in a hybrid action mechanism, dispatching subtasks from a coordinating agent to application-specialized agents.  Its authors argue that existing computer-using agents are hindered by shallow operating-system integration, fragile screenshot-based interaction, and disruptive execution, and they identify adaptation to other desktop platforms, such as Linux and macOS, as future work.  UFO² acts on the user’s behalf, as an automation layer beside the user’s own Windows session, and its authors frame cross-platform deployment as groundwork for a unified ecosystem of desktop automation solutions; the platform built for this study is instead operated by a person, turn by turn.  AgentOS, from Liu and colleagues [25], goes further in ambition, proposing that a natural-language portal replace application silos as the way a person uses the operating system, but it is offered as a research direction, without a built system or an evaluation.</w:t>
       </w:r>
     </w:p>
     <w:bookmarkEnd w:id="58"/>
@@ -4274,7 +4274,7 @@
         <w:pStyle w:val="FirstParagraph"/>
       </w:pPr>
       <w:r>
-        <w:t xml:space="preserve">Underlying many of these agents are vision-language models trained specifically for interface understanding.  CogAgent, from Hong and colleagues [15], is an eighteen-billion-parameter visual language model specialized for GUI understanding and navigation, using both low- and high-resolution image encoders to recognize the small icons and text typical of graphical interfaces.  It supports the position that pure-vision GUI agents are viable when the underlying model is trained appropriately — but at a compute cost, and with the cross-platform generalization limitations common to the entire graphical-agent literature.  Across web, mobile, and desktop, these systems demonstrate broad capability within a single platform class, while consistently identifying visual grounding as an unsolved bottleneck.</w:t>
+        <w:t xml:space="preserve">Underlying many of these agents are vision-language models trained specifically for interface understanding.  CogAgent, from Hong and colleagues [16], is an eighteen-billion-parameter visual language model specialized for GUI understanding and navigation, using both low- and high-resolution image encoders to recognize the small icons and text typical of graphical interfaces.  It supports the position that pure-vision GUI agents are viable when the underlying model is trained appropriately — but at a compute cost, and with the cross-platform generalization limitations common to the entire graphical-agent literature.  Across web, mobile, and desktop, these systems demonstrate broad capability within a single platform class, while consistently identifying visual grounding as an unsolved bottleneck.</w:t>
       </w:r>
     </w:p>
     <w:bookmarkEnd w:id="60"/>
@@ -4301,15 +4301,15 @@
         <w:pStyle w:val="BodyText"/>
       </w:pPr>
       <w:r>
-        <w:t xml:space="preserve">VoicePilot, from Padmanabha and colleagues [32], is a framework for using LLMs as speech interfaces to physically assistive robots for individuals with motor impairments.  Although its immediate target is robotic assistance rather than desktop computing, it is included here because it is the most rigorous human-centered evaluation in the LLM-speech-interface literature.  The authors derive five design guidelines from an iterative evaluation that ended in a study with 11 older adults at an independent living facility, among them that a command should execute in about the time a caregiver would take, a cost the present study’s confirmation step adds to whenever it asks, and a reason it asks only where a command is not shown to be recoverable.  DexAssist, from Mehendale and Walishetti [28], targets web navigation by users with fine-motor impairments using two LLMs in tandem — one to interpret voice commands and a second to map the interpretation onto interface elements with fallback strategies — reducing the misinterpretation failures of single-model voice navigation on dense layouts.  The architecture of van Dam [44] proposes retrofitting LLM-based conversational interfaces onto existing single-application graphical interfaces, exposing an application’s navigation graph through a tool protocol and handling voice input through real-time speech recognition; its author observes that most production applications were never designed with speech in mind, making such retrofitting an ongoing challenge.</w:t>
-      </w:r>
-    </w:p>
-    <w:p>
-      <w:pPr>
-        <w:pStyle w:val="BodyText"/>
-      </w:pPr>
-      <w:r>
-        <w:t xml:space="preserve">More recent work continues to mature the components required for speech-driven interface control.  Han and colleagues, in GUIRoboTron-Speech [13], advance automated GUI agents driven directly by speech instructions, while Park and colleagues, in R-VLM [33], contribute region-aware visual grounding for more precise identification of on-screen elements.  What unites this thread is that it operates at the level of the individual application or interaction technique rather than at the level of the session itself.  These approaches presuppose an underlying conversational surface on which to run.  A conversational interface layer over the whole session could provide one, which positions accessibility not as a target of the present study, which scopes it out for recruitment and ethics reasons, but as a possible later use of its platform.</w:t>
+        <w:t xml:space="preserve">VoicePilot, from Padmanabha and colleagues [33], is a framework for using LLMs as speech interfaces to physically assistive robots for individuals with motor impairments.  Although its immediate target is robotic assistance rather than desktop computing, it is included here because it is the most rigorous human-centered evaluation in the LLM-speech-interface literature.  The authors derive five design guidelines from an iterative evaluation that ended in a study with 11 older adults at an independent living facility, among them that a command should execute in about the time a caregiver would take, a cost the present study’s confirmation step adds to whenever it asks, and a reason it asks only where a command is not shown to be recoverable.  DexAssist, from Mehendale and Walishetti [29], targets web navigation by users with fine-motor impairments using two LLMs in tandem — one to interpret voice commands and a second to map the interpretation onto interface elements with fallback strategies — reducing the misinterpretation failures of single-model voice navigation on dense layouts.  The architecture of van Dam [45] proposes retrofitting LLM-based conversational interfaces onto existing single-application graphical interfaces, exposing an application’s navigation graph through a tool protocol and handling voice input through real-time speech recognition; its author observes that most production applications were never designed with speech in mind, making such retrofitting an ongoing challenge.</w:t>
+      </w:r>
+    </w:p>
+    <w:p>
+      <w:pPr>
+        <w:pStyle w:val="BodyText"/>
+      </w:pPr>
+      <w:r>
+        <w:t xml:space="preserve">More recent work continues to mature the components required for speech-driven interface control.  Han and colleagues, in GUIRoboTron-Speech [14], advance automated GUI agents driven directly by speech instructions, while Park and colleagues, in R-VLM [34], contribute region-aware visual grounding for more precise identification of on-screen elements.  What unites this thread is that it operates at the level of the individual application or interaction technique rather than at the level of the session itself.  These approaches presuppose an underlying conversational surface on which to run.  A conversational interface layer over the whole session could provide one, which positions accessibility not as a target of the present study, which scopes it out for recruitment and ethics reasons, but as a possible later use of its platform.</w:t>
       </w:r>
     </w:p>
     <w:bookmarkEnd w:id="62"/>
@@ -4327,15 +4327,15 @@
         <w:pStyle w:val="FirstParagraph"/>
       </w:pPr>
       <w:r>
-        <w:t xml:space="preserve">The rapid proliferation of computer-using agents has been accompanied by increasingly rigorous evaluation environments, and these establish both the current ceiling of the field’s capability and the methods by which that capability is measured.  The most consequential is OSWorld, from Xie and colleagues [49], a benchmark of 369 real-world computer tasks in a real-computer environment spanning Ubuntu, Windows, and macOS.  At its 2024 release the margin it measured was stark: humans achieved 72.36% success where the best evaluated model reached 12.24%.  Its successor, OSWorld 2.0 [51], evaluates 108 long-horizon workflows whose median item requires roughly an hour and a half of skilled human operation; there the best frontier configuration completes only 20.6% of tasks outright.  The reported failures concentrate not in interface navigation but in tracking constraints across a long task, absorbing information that arrives mid-way, and verifying a result before declaring completion.  The field’s ceiling has moved substantially; it has not been reached.  OSWorld is also directly relevant to the present study as the source of a real-task suite against which benchmark comparability can be established.  Direct comparisons between interfaces are rarer.  AXIS, from Lu and colleagues [25], compares an API-first agent with unaided manual operation by people in Microsoft Word, in a within-subjects design with a cloud-hosted frontier model, and Zhou and colleagues compare screen-only graphical agents with command-line agents across 440 matched desktop tasks [57].</w:t>
-      </w:r>
-    </w:p>
-    <w:p>
-      <w:pPr>
-        <w:pStyle w:val="BodyText"/>
-      </w:pPr>
-      <w:r>
-        <w:t xml:space="preserve">Complementing the benchmark literature, the survey of LLM-brained GUI agents by Zhang and colleagues [52] synthesizes the field through 2024, organizing it around the components of perception, planning, action, and memory, and informing the four-layer view adopted in §2.2 of this review.  It enumerates the field’s open challenges — accurate element localization, knowledge retrieval, long-horizon planning, and safety-aware execution control; of these, safety-aware execution control is the one closest to the present study.  What the evaluation literature reveals, however, is a specific methodological limitation: rigorous as these benchmarks are, they measure the autonomous task completion of agents acting on a user’s behalf, not the comparative performance of a human user working through a conversational interface versus a conventional graphical one.  That distinction motivates the evaluation design reviewed in §2.10.</w:t>
+        <w:t xml:space="preserve">The rapid proliferation of computer-using agents has been accompanied by increasingly rigorous evaluation environments, and these establish both the current ceiling of the field’s capability and the methods by which that capability is measured.  The most consequential is OSWorld, from Xie and colleagues [50], a benchmark of 369 real-world computer tasks in a real-computer environment spanning Ubuntu, Windows, and macOS.  At its 2024 release the margin it measured was stark: humans achieved 72.36% success where the best evaluated model reached 12.24%.  Its successor, OSWorld 2.0 [52], evaluates 108 long-horizon workflows whose median item requires roughly an hour and a half of skilled human operation; there the best frontier configuration completes only 20.6% of tasks outright.  The reported failures concentrate not in interface navigation but in tracking constraints across a long task, absorbing information that arrives mid-way, and verifying a result before declaring completion.  The field’s ceiling has moved substantially; it has not been reached.  OSWorld is also directly relevant to the present study as the source of a real-task suite against which benchmark comparability can be established.  Direct comparisons between interfaces are rarer.  AXIS, from Lu and colleagues [26], compares an API-first agent with unaided manual operation by people in Microsoft Word, in a within-subjects design with a cloud-hosted frontier model, and Zhou and colleagues compare screen-only graphical agents with command-line agents across 440 matched desktop tasks [58].</w:t>
+      </w:r>
+    </w:p>
+    <w:p>
+      <w:pPr>
+        <w:pStyle w:val="BodyText"/>
+      </w:pPr>
+      <w:r>
+        <w:t xml:space="preserve">Complementing the benchmark literature, the survey of LLM-brained GUI agents by Zhang and colleagues [53] synthesizes the field through 2024, organizing it around the components of perception, planning, action, and memory, and informing the four-layer view adopted in §2.2 of this review.  It enumerates the field’s open challenges — accurate element localization, knowledge retrieval, long-horizon planning, and safety-aware execution control; of these, safety-aware execution control is the one closest to the present study.  What the evaluation literature reveals, however, is a specific methodological limitation: rigorous as these benchmarks are, they measure the autonomous task completion of agents acting on a user’s behalf, not the comparative performance of a human user working through a conversational interface versus a conventional graphical one.  That distinction motivates the evaluation design reviewed in §2.10.</w:t>
       </w:r>
     </w:p>
     <w:bookmarkEnd w:id="63"/>
@@ -4353,7 +4353,7 @@
         <w:pStyle w:val="FirstParagraph"/>
       </w:pPr>
       <w:r>
-        <w:t xml:space="preserve">The synthesis has two parts.  The first concerns the study’s algorithm and is stated briefly because §2.5 has established it: every guard surveyed decides whether a command may run by matching it against a list of patterns or, like ToolEmu [37], measures risk across many runs; every analysis of shell programs targets a property other than recoverability; every recovery mechanism either restores wholesale, as ANOLISA’s snapshots do [1], or needs a system built for it;</w:t>
+        <w:t xml:space="preserve">The synthesis has two parts.  The first concerns the study’s algorithm and is stated briefly because §2.5 has established it: every guard surveyed decides whether a command may run by matching it against a list of patterns or, like ToolEmu [38], measures risk across many runs; every analysis of shell programs targets a property other than recoverability; every recovery mechanism either restores wholesale, as ANOLISA’s snapshots do [1], or needs a system built for it;</w:t>
       </w:r>
       <w:r>
         <w:t xml:space="preserve"> </w:t>
@@ -4369,7 +4369,7 @@
         <w:t xml:space="preserve"> </w:t>
       </w:r>
       <w:r>
-        <w:t xml:space="preserve">[21] previews a command only by running it and leaving its effects for the user to judge; and none derives from a command’s structure what it would destroy or captures what is needed to undo it.  That is the research gap.  The second part concerns the setting in which the gap arises.</w:t>
+        <w:t xml:space="preserve">[22] previews a command only by running it and leaving its effects for the user to judge; and none derives from a command’s structure what it would destroy or captures what is needed to undo it.  That is the research gap.  The second part concerns the setting in which the gap arises.</w:t>
       </w:r>
     </w:p>
     <w:p>
@@ -4496,7 +4496,7 @@
               <w:jc w:val="left"/>
             </w:pPr>
             <w:r>
-              <w:t xml:space="preserve">Wilensky et al. [48]</w:t>
+              <w:t xml:space="preserve">Wilensky et al. [49]</w:t>
             </w:r>
           </w:p>
         </w:tc>
@@ -4570,7 +4570,7 @@
               <w:jc w:val="left"/>
             </w:pPr>
             <w:r>
-              <w:t xml:space="preserve">Westenfelder et al. [46]</w:t>
+              <w:t xml:space="preserve">Westenfelder et al. [47]</w:t>
             </w:r>
           </w:p>
         </w:tc>
@@ -4644,7 +4644,7 @@
               <w:jc w:val="left"/>
             </w:pPr>
             <w:r>
-              <w:t xml:space="preserve">Gyawali et al. [12]</w:t>
+              <w:t xml:space="preserve">Gyawali et al. [13]</w:t>
             </w:r>
           </w:p>
         </w:tc>
@@ -4718,7 +4718,7 @@
               <w:jc w:val="left"/>
             </w:pPr>
             <w:r>
-              <w:t xml:space="preserve">van Dam [44]</w:t>
+              <w:t xml:space="preserve">van Dam [45]</w:t>
             </w:r>
           </w:p>
         </w:tc>
@@ -4792,7 +4792,7 @@
               <w:jc w:val="left"/>
             </w:pPr>
             <w:r>
-              <w:t xml:space="preserve">Padmanabha et al. [32]</w:t>
+              <w:t xml:space="preserve">Padmanabha et al. [33]</w:t>
             </w:r>
           </w:p>
         </w:tc>
@@ -4866,7 +4866,7 @@
               <w:jc w:val="left"/>
             </w:pPr>
             <w:r>
-              <w:t xml:space="preserve">Mehendale and Walishetti [28]</w:t>
+              <w:t xml:space="preserve">Mehendale and Walishetti [29]</w:t>
             </w:r>
           </w:p>
         </w:tc>
@@ -4940,7 +4940,7 @@
               <w:jc w:val="left"/>
             </w:pPr>
             <w:r>
-              <w:t xml:space="preserve">Deng et al. [9]</w:t>
+              <w:t xml:space="preserve">Deng et al. [10]</w:t>
             </w:r>
           </w:p>
         </w:tc>
@@ -5014,7 +5014,7 @@
               <w:jc w:val="left"/>
             </w:pPr>
             <w:r>
-              <w:t xml:space="preserve">Zhou et al. [56]</w:t>
+              <w:t xml:space="preserve">Zhou et al. [57]</w:t>
             </w:r>
           </w:p>
         </w:tc>
@@ -5088,7 +5088,7 @@
               <w:jc w:val="left"/>
             </w:pPr>
             <w:r>
-              <w:t xml:space="preserve">Zheng et al. [55]</w:t>
+              <w:t xml:space="preserve">Zheng et al. [56]</w:t>
             </w:r>
           </w:p>
         </w:tc>
@@ -5162,7 +5162,7 @@
               <w:jc w:val="left"/>
             </w:pPr>
             <w:r>
-              <w:t xml:space="preserve">Rawles et al. [35]</w:t>
+              <w:t xml:space="preserve">Rawles et al. [36]</w:t>
             </w:r>
           </w:p>
         </w:tc>
@@ -5236,7 +5236,7 @@
               <w:jc w:val="left"/>
             </w:pPr>
             <w:r>
-              <w:t xml:space="preserve">Zhang et al. [54]</w:t>
+              <w:t xml:space="preserve">Zhang et al. [55]</w:t>
             </w:r>
           </w:p>
         </w:tc>
@@ -5310,7 +5310,7 @@
               <w:jc w:val="left"/>
             </w:pPr>
             <w:r>
-              <w:t xml:space="preserve">Wang et al. [45]</w:t>
+              <w:t xml:space="preserve">Wang et al. [46]</w:t>
             </w:r>
           </w:p>
         </w:tc>
@@ -5384,7 +5384,7 @@
               <w:jc w:val="left"/>
             </w:pPr>
             <w:r>
-              <w:t xml:space="preserve">Hong et al. [15]</w:t>
+              <w:t xml:space="preserve">Hong et al. [16]</w:t>
             </w:r>
           </w:p>
         </w:tc>
@@ -5458,7 +5458,7 @@
               <w:jc w:val="left"/>
             </w:pPr>
             <w:r>
-              <w:t xml:space="preserve">Niu et al. [29]</w:t>
+              <w:t xml:space="preserve">Niu et al. [30]</w:t>
             </w:r>
           </w:p>
         </w:tc>
@@ -5532,7 +5532,7 @@
               <w:jc w:val="left"/>
             </w:pPr>
             <w:r>
-              <w:t xml:space="preserve">Hui et al. [16]</w:t>
+              <w:t xml:space="preserve">Hui et al. [17]</w:t>
             </w:r>
           </w:p>
         </w:tc>
@@ -5606,7 +5606,7 @@
               <w:jc w:val="left"/>
             </w:pPr>
             <w:r>
-              <w:t xml:space="preserve">Zhang et al. [53]</w:t>
+              <w:t xml:space="preserve">Zhang et al. [54]</w:t>
             </w:r>
           </w:p>
         </w:tc>
@@ -5680,7 +5680,7 @@
               <w:jc w:val="left"/>
             </w:pPr>
             <w:r>
-              <w:t xml:space="preserve">Xie et al. [49]</w:t>
+              <w:t xml:space="preserve">Xie et al. [50]</w:t>
             </w:r>
           </w:p>
         </w:tc>
@@ -5754,7 +5754,7 @@
               <w:jc w:val="left"/>
             </w:pPr>
             <w:r>
-              <w:t xml:space="preserve">Li et al. [22]</w:t>
+              <w:t xml:space="preserve">Li et al. [23]</w:t>
             </w:r>
           </w:p>
         </w:tc>
@@ -5828,7 +5828,7 @@
               <w:jc w:val="left"/>
             </w:pPr>
             <w:r>
-              <w:t xml:space="preserve">Yao et al. [50]</w:t>
+              <w:t xml:space="preserve">Yao et al. [51]</w:t>
             </w:r>
           </w:p>
         </w:tc>
@@ -5902,7 +5902,7 @@
               <w:jc w:val="left"/>
             </w:pPr>
             <w:r>
-              <w:t xml:space="preserve">Han et al. [13]</w:t>
+              <w:t xml:space="preserve">Han et al. [14]</w:t>
             </w:r>
           </w:p>
         </w:tc>
@@ -5976,7 +5976,7 @@
               <w:jc w:val="left"/>
             </w:pPr>
             <w:r>
-              <w:t xml:space="preserve">Park et al. [33]</w:t>
+              <w:t xml:space="preserve">Park et al. [34]</w:t>
             </w:r>
           </w:p>
         </w:tc>
@@ -6050,7 +6050,7 @@
               <w:jc w:val="left"/>
             </w:pPr>
             <w:r>
-              <w:t xml:space="preserve">Jacobs et al. [18]</w:t>
+              <w:t xml:space="preserve">Jacobs et al. [19]</w:t>
             </w:r>
           </w:p>
         </w:tc>
@@ -6138,7 +6138,7 @@
         <w:pStyle w:val="FirstParagraph"/>
       </w:pPr>
       <w:r>
-        <w:t xml:space="preserve">The field is bifurcated by coverage scope.  Shell-level work [12, 46] and single-application work [32, 44] sit at the narrow end; cross-application desktop, web, and mobile agents sit at the broad end but each within a single platform class.  No system in the surveyed corpus implements a working conversational layer over the full graphical session that has been empirically validated against the conventional desktop workflow it would supplement.  The Unix Consultant [48] came closest in ambition four decades ago, but its pre-LLM foundation prevented it from scaling beyond demonstration.  Neither AgentOS [24], a research direction without a built system, nor UFO² [53], an automation layer that acts on the user’s behalf (§2.6), fills it.</w:t>
+        <w:t xml:space="preserve">The field is bifurcated by coverage scope.  Shell-level work [13, 47] and single-application work [33, 45] sit at the narrow end; cross-application desktop, web, and mobile agents sit at the broad end but each within a single platform class.  No system in the surveyed corpus implements a working conversational layer over the full graphical session that has been empirically validated against the conventional desktop workflow it would supplement.  The Unix Consultant [49] came closest in ambition four decades ago, but its pre-LLM foundation prevented it from scaling beyond demonstration.  Neither AgentOS [25], a research direction without a built system, nor UFO² [54], an automation layer that acts on the user’s behalf (§2.6), fills it.</w:t>
       </w:r>
     </w:p>
     <w:bookmarkEnd w:id="64"/>
@@ -6156,7 +6156,7 @@
         <w:pStyle w:val="FirstParagraph"/>
       </w:pPr>
       <w:r>
-        <w:t xml:space="preserve">A second pattern concerns the execution mechanism at the Action layer.  The literature divides among command translation, API binding, and GUI simulation, with a trend toward hybrid execution [53] that prefers structured access where available and falls back to vision.  Vision-only systems [29, 45] achieve broad applicability at the cost of grounding fragility, while structured-access systems achieve precision at the cost of per-environment integration.  Notably, the Unix Consultant operated purely at the consultation layer without executing actions — an approach that reflects an underappreciated design principle, that the agent that explains can be safer than the agent that acts, which the confirmation-gated design of the present study revisits.</w:t>
+        <w:t xml:space="preserve">A second pattern concerns the execution mechanism at the Action layer.  The literature divides among command translation, API binding, and GUI simulation, with a trend toward hybrid execution [54] that prefers structured access where available and falls back to vision.  Vision-only systems [30, 46] achieve broad applicability at the cost of grounding fragility, while structured-access systems achieve precision at the cost of per-environment integration.  Notably, the Unix Consultant operated purely at the consultation layer without executing actions — an approach that reflects an underappreciated design principle, that the agent that explains can be safer than the agent that acts, which the confirmation-gated design of the present study revisits.</w:t>
       </w:r>
     </w:p>
     <w:bookmarkEnd w:id="65"/>
@@ -6174,7 +6174,7 @@
         <w:pStyle w:val="FirstParagraph"/>
       </w:pPr>
       <w:r>
-        <w:t xml:space="preserve">A third pattern is that visual grounding is the field’s principal bottleneck, identified explicitly by both SeeAct [55] and the GUI-agents survey [52].  The 51.1% ceiling of GPT-4V with oracle grounding and its sharp degradation without are attributable in significant part to grounding failure.  This bottleneck is a property of the graphical-simulation approach specifically; a command-line approach that grounds intent into shell commands rather than into on-screen pixel regions sidesteps it, at the cost of being bounded by what is expressible on the command line.  Direct comparison qualifies that tradeoff usefully.  Across 440 matched desktop tasks, screen-only graphical agents pass 59.1% while command-line agents reach only 48.2% — the shell is not automatically the stronger substrate — but command-line agents augmented with result verification reach 69.3%, the highest of the three conditions [57].  Execution through the shell becomes advantageous when it is paired with a mechanism that checks what the command actually did, a role analogous to the one the analysis and its undo record play in the present design.</w:t>
+        <w:t xml:space="preserve">A third pattern is that visual grounding is the field’s principal bottleneck, identified explicitly by both SeeAct [56] and the GUI-agents survey [53].  The 51.1% ceiling of GPT-4V with oracle grounding and its sharp degradation without are attributable in significant part to grounding failure.  This bottleneck is a property of the graphical-simulation approach specifically; a command-line approach that grounds intent into shell commands rather than into on-screen pixel regions sidesteps it, at the cost of being bounded by what is expressible on the command line.  Direct comparison qualifies that tradeoff usefully.  Across 440 matched desktop tasks, screen-only graphical agents pass 59.1% while command-line agents reach only 48.2% — the shell is not automatically the stronger substrate — but command-line agents whose skills are augmented under the guidance of verifiers reach 69.3%, the highest of the three conditions, and the authors attribute most of the command-line deficit to incomplete skill coverage rather than to model capability [58].  The shell is bounded, then, by what its tools cover, which is the platform’s concern; the analysis is concerned with what happens once a command is produced.</w:t>
       </w:r>
     </w:p>
     <w:bookmarkEnd w:id="66"/>
@@ -6192,7 +6192,7 @@
         <w:pStyle w:val="FirstParagraph"/>
       </w:pPr>
       <w:r>
-        <w:t xml:space="preserve">A fourth pattern concerns evaluation method.  Most surveyed systems are evaluated either through architectural demonstration [12, 44] or through curated task benchmarks [9, 45, 49, 56].  User studies are rare, and the comparisons that do exist are narrow.  VoicePilot [32] conducts a substantive human-centered evaluation of LLM-based interaction, and AXIS [25] compares an API-first agent against unaided manual operation in a within-subjects design — but within a single application, on a single platform, with a cloud-hosted frontier model.  No surveyed work compares a conversational interface against the conventional graphical workflow across operating-system-level tasks on the same population.  That gap belongs to the setting of this study, and the validation study addresses it in passing rather than as a research question.</w:t>
+        <w:t xml:space="preserve">A fourth pattern concerns evaluation method.  Most surveyed systems are evaluated either through architectural demonstration [13, 45] or through curated task benchmarks [10, 46, 50, 57].  User studies are rare, and the comparisons that do exist are narrow.  VoicePilot [33] conducts a substantive human-centered evaluation of LLM-based interaction, and AXIS [26] compares an API-first agent against unaided manual operation in a within-subjects design — but within a single application, on a single platform, with a cloud-hosted frontier model.  No surveyed work compares a conversational interface against the conventional graphical workflow across operating-system-level tasks on the same population.  That gap belongs to the setting of this study, and the validation study addresses it in passing rather than as a research question.</w:t>
       </w:r>
     </w:p>
     <w:bookmarkEnd w:id="67"/>
@@ -6210,7 +6210,7 @@
         <w:pStyle w:val="FirstParagraph"/>
       </w:pPr>
       <w:r>
-        <w:t xml:space="preserve">A fifth pattern concerns the operating-system substrate.  Windows [16, 53], Android [35, 45, 54], and the web [9, 55, 56] are each heavily represented; the Linux work that exists is aimed elsewhere than the end user’s desktop session.  NaSh [12] addresses Linux at the shell level as a design proposal; Alibaba Cloud’s ANOLISA ships a natural-language Linux terminal with approval gating and rollback, but scoped to server and DevOps workloads; and OSWorld [49] includes Ubuntu as an evaluation platform rather than a deployment target.  No surveyed system implements a conversational session layer for the Linux desktop addressed to the person using the machine, despite Linux’s wide use for development and server work.</w:t>
+        <w:t xml:space="preserve">A fifth pattern concerns the operating-system substrate.  Windows [17, 54], Android [36, 46, 55], and the web [10, 56, 57] are each heavily represented; the Linux work that exists is aimed elsewhere than the end user’s desktop session.  NaSh [13] addresses Linux at the shell level as a design proposal; Alibaba Cloud’s ANOLISA ships a natural-language Linux terminal with approval gating and rollback, but scoped to server and DevOps workloads; and OSWorld [50] includes Ubuntu as an evaluation platform rather than a deployment target.  No surveyed system implements a conversational session layer for the Linux desktop addressed to the person using the machine, despite Linux’s wide use for development and server work.</w:t>
       </w:r>
     </w:p>
     <w:bookmarkEnd w:id="68"/>
@@ -6228,7 +6228,7 @@
         <w:pStyle w:val="FirstParagraph"/>
       </w:pPr>
       <w:r>
-        <w:t xml:space="preserve">A sixth pattern is the field’s shared intellectual lineage and its attendant fragility.  As established in §2.3, nearly every post-2023 system inherits the ReAct [50] convention of interleaving reasoning with action, which explains both the field’s rapid progress and the pervasiveness of LLM-reasoning failure modes across it — a fragility that makes safety and recoverability mechanisms, rather than raw capability alone, decisive for any deployable system.</w:t>
+        <w:t xml:space="preserve">A sixth pattern is the field’s shared intellectual lineage and its attendant fragility.  As established in §2.3, nearly every post-2023 system inherits the ReAct [51] convention of interleaving reasoning with action, which explains both the field’s rapid progress and the pervasiveness of LLM-reasoning failure modes across it — a fragility that makes safety and recoverability mechanisms, rather than raw capability alone, decisive for any deployable system.</w:t>
       </w:r>
     </w:p>
     <w:p>
@@ -6296,7 +6296,7 @@
         <w:t xml:space="preserve">Fourth</w:t>
       </w:r>
       <w:r>
-        <w:t xml:space="preserve">, controlled comparison of a language-model-mediated interface with the conventional graphical workflow, with people, exists only within a single application, on a single platform, with a cloud-hosted frontier model [25]; no such comparison was found in the surveyed corpus for operating-system-level tasks under a locally-hosted model and an explicit safety gate.  SynapseOS — a conversational interface layer for the Linux desktop that translates natural-language intent into shell commands under a confirmation gate driven by the analysis, evaluated against each participant’s own operating system — is positioned against the other three gaps, as the platform on which the analysis addressing the first is validated.  Its relationship to the closest prior work is worth stating directly.  NaSh [12] proposes guardrails for an LLM-powered natural language shell — generated code that remains analyzable, selective undo, summaries of what a command would affect — as a design position, and explicitly leaves their mechanisms and their evaluation as open work.  The present study contributes a mechanism for part of that position, which NaSh does not specify: an analysis that derives what a command would affect from its structure, through composition and the read-only resolution of run-time targets, and a plan that captures the least that undoing it requires, evaluated against observed ground truth.</w:t>
+        <w:t xml:space="preserve">, controlled comparison of a language-model-mediated interface with the conventional graphical workflow, with people, exists only within a single application, on a single platform, with a cloud-hosted frontier model [26]; no such comparison was found in the surveyed corpus for operating-system-level tasks under a locally-hosted model and an explicit safety gate.  SynapseOS — a conversational interface layer for the Linux desktop that translates natural-language intent into shell commands under a confirmation gate driven by the analysis, evaluated against each participant’s own operating system — is positioned against the other three gaps, as the platform on which the analysis addressing the first is validated.  Its relationship to the closest prior work is worth stating directly.  NaSh [13] proposes guardrails for an LLM-powered natural language shell — generated code that remains analyzable, selective undo, summaries of what a command would affect — as a design position, and explicitly leaves their mechanisms and their evaluation as open work.  The present study contributes a mechanism for part of that position, which NaSh does not specify: an analysis that derives what a command would affect from its structure, through composition and the read-only resolution of run-time targets, and a plan that captures the least that undoing it requires, evaluated against observed ground truth.</w:t>
       </w:r>
     </w:p>
     <w:bookmarkEnd w:id="69"/>
@@ -6315,15 +6315,15 @@
         <w:pStyle w:val="FirstParagraph"/>
       </w:pPr>
       <w:r>
-        <w:t xml:space="preserve">The evaluation of the algorithm, which is the study’s primary evidence, follows from what the algorithm claims, and its methods are stated first.  Its corpus is drawn from a public dataset of natural-language descriptions paired with Bash commands, NL2Bash [23], so that it is not written by the people who wrote the analysis, and is stratified by the label each command must carry so that the rare destructive commands are present in number.  Of its 777 commands, the 697 that act on files have ground truth observed rather than judged, by executing each in a sandbox and comparing the filesystem before and after, in the way that executable semantics of the shell are validated against what shells actually do [11] and that Westenfelder and colleagues judge whether a generated Bash command does what was intended [46]; the 80 that act outside the filesystem are labeled from a fixed table of state-changing tools.  Its comparisons are paired, because every system is scored on the same commands, and use the standard tests for paired proportions: McNemar’s exact test on the commands two systems handle differently, Wilson intervals for each proportion and Newcombe intervals for each difference, and Holm’s correction across each family of tests.  And its claim that composition and resolution, rather than the rule table, produce the result is tested by ablation: the analysis is rerun with each part switched off and the table kept.  Chapter 3, Sections 3.1 and 3.2 give the details.</w:t>
-      </w:r>
-    </w:p>
-    <w:p>
-      <w:pPr>
-        <w:pStyle w:val="BodyText"/>
-      </w:pPr>
-      <w:r>
-        <w:t xml:space="preserve">The methodological literature reviewed here shapes the validation study, in which the analysis is deployed in an interface and exercised by people, and so concerns how a conversational interface should be evaluated.  The evaluation practices of the surveyed work fall into three categories, each with a characteristic limitation.  Architectural demonstrations [12, 44] establish feasibility but provide no performance evidence.  Curated task benchmarks [9, 49, 56] provide reproducible, quantitative measures but assess the autonomous task completion of agents acting on a user’s behalf rather than the performance of a human working through an interface.  Human-centered user studies, exemplified by VoicePilot [32] and AXIS [25], provide the most direct evidence of an interface’s value to real users but remain rare in this literature and, where present, are confined to a single application rather than the operating system as a whole.  The instruments this study adopts are drawn from established practice rather than constructed for it: the System Usability Scale [4] for perceived usability, with its interpretation grounded in subsequent large-sample analysis [39], and the NASA Task Load Index [14] for perceived workload.</w:t>
+        <w:t xml:space="preserve">The evaluation of the algorithm, which is the study’s primary evidence, follows from what the algorithm claims, and its methods are stated first.  Its 450 human-written commands are drawn from a public dataset of natural-language descriptions paired with Bash commands, NL2Bash [24], so that part of it is not written by the people who wrote the analysis; the rest are templates written for the study and commands that act outside the filesystem (Chapter 3, Section 1.2(a)); and it is stratified by the label each command must carry so that the rare destructive commands are present in number.  Of its 777 commands, the 697 that act on files have ground truth observed rather than judged, by executing each in a sandbox and comparing the filesystem before and after, in the way that executable semantics of the shell are validated against what shells actually do [12] and that Westenfelder and colleagues judge whether a generated Bash command does what was intended [47]; the 80 that act outside the filesystem are labeled from a fixed table of state-changing tools.  Its comparisons are paired, because every system is scored on the same commands, and use the standard tests for paired proportions: McNemar’s exact test on the commands two systems handle differently, Wilson intervals for each proportion and Newcombe intervals for each difference, and Holm’s correction across each family of tests.  And its claim that composition and resolution, rather than the rule table, produce the result is tested by ablation: the analysis is rerun with each part switched off and the table kept.  Chapter 3, Sections 3.1 and 3.2 give the details.</w:t>
+      </w:r>
+    </w:p>
+    <w:p>
+      <w:pPr>
+        <w:pStyle w:val="BodyText"/>
+      </w:pPr>
+      <w:r>
+        <w:t xml:space="preserve">The methodological literature reviewed here shapes the validation study, in which the analysis is deployed in an interface and exercised by people, and so concerns how a conversational interface should be evaluated.  The evaluation practices of the surveyed work fall into three categories, each with a characteristic limitation.  Architectural demonstrations [13, 45] establish feasibility but provide no performance evidence.  Curated task benchmarks [10, 50, 57] provide reproducible, quantitative measures but assess the autonomous task completion of agents acting on a user’s behalf rather than the performance of a human working through an interface.  Human-centered user studies, exemplified by VoicePilot [33] and AXIS [26], provide the most direct evidence of an interface’s value to real users but remain rare in this literature and, where present, are confined to a single application rather than the operating system as a whole.  The instruments this study adopts are drawn from established practice rather than constructed for it: the System Usability Scale [5] for perceived usability, with its interpretation grounded in subsequent large-sample analysis [40], and the NASA Task Load Index [15] for perceived workload.</w:t>
       </w:r>
     </w:p>
     <w:p>
@@ -6379,7 +6379,7 @@
         <w:t xml:space="preserve"> </w:t>
       </w:r>
       <w:r>
-        <w:t xml:space="preserve">structure in the sense set out by Creswell and Plano Clark [8], collecting both strands concurrently and integrating them at the interpretation stage; the qualitative data, gathered through retrospective think-aloud over the screen recording and a semi-structured interview, are analyzed using the thematic-analysis method of Braun and Clarke [3], a widely adopted six-phase approach for identifying and reporting patterns in qualitative data.  Design considerations surfaced by the reviewed systems inform the evaluation directly: the reversibility-and-guardrail framing of NaSh [12], and VoicePilot’s guideline that a command should take no longer than a caregiver would [32], together motivate measuring both what the confirmation gate and undo protect and what they cost the participant.</w:t>
+        <w:t xml:space="preserve">structure in the sense set out by Creswell and Plano Clark [9], collecting both strands concurrently and integrating them at the interpretation stage; the qualitative data, gathered through retrospective think-aloud over the screen recording and a semi-structured interview, are analyzed using the thematic-analysis method of Braun and Clarke [3], a widely adopted six-phase approach for identifying and reporting patterns in qualitative data.  Design considerations surfaced by the reviewed systems inform the evaluation directly: the reversibility-and-guardrail framing of NaSh [13], and VoicePilot’s guideline that a command should take no longer than a caregiver would [33], together motivate measuring both what the confirmation gate and undo protect and what they cost the participant.</w:t>
       </w:r>
     </w:p>
     <w:p>
@@ -6405,7 +6405,7 @@
         <w:pStyle w:val="FirstParagraph"/>
       </w:pPr>
       <w:r>
-        <w:t xml:space="preserve">This chapter reviewed two literatures.  The first, on which the study’s algorithm builds, is program analysis: abstract interpretation and type-and-effect systems [7, 19, 43] supply its formal basis, the command guards of natural-language shells and coding agents [12, 20, 31] decide by permission rather than by effect, the static analyses of shell programs [2, 11, 27] target properties adjacent to recoverability but not recoverability itself, recovery mechanisms from snapshots, including ANOLISA’s [1], to operating system transactions [5, 10, 34, 36, 38] restore after the fact, but wholesale or only on a system built for it,</w:t>
+        <w:t xml:space="preserve">This chapter reviewed two literatures.  The first, on which the study’s algorithm builds, is program analysis: abstract interpretation and type-and-effect systems [8, 20, 44] supply its formal basis, the command guards of natural-language shells and coding agents [13, 21, 32] decide by permission rather than by effect, the static analyses of shell programs [2, 12, 28] target properties adjacent to recoverability but not recoverability itself, recovery mechanisms from snapshots, including ANOLISA’s [1], to operating system transactions [6, 11, 35, 37, 39] restore after the fact, but wholesale or only on a system built for it,</w:t>
       </w:r>
       <w:r>
         <w:t xml:space="preserve"> </w:t>
@@ -6421,7 +6421,7 @@
         <w:t xml:space="preserve"> </w:t>
       </w:r>
       <w:r>
-        <w:t xml:space="preserve">[21] previews a command by running it, and ToolEmu [37] measures the risks of agents rather than guarding a given command.  The second, in which the platform is situated, is the literature on natural-language and LLM-mediated interfaces to personal computing across nearly four decades, organized along a four-layer pipeline of Input, Reasoning, Action, and Operating-System Integration.  The historical foundations established the long-standing aspiration to a natural-language interface to a real operating system [48] and the methodological shift, driven by in-context reasoning [50], that made the current generation of systems possible, and the critique of natural-language interaction from direct manipulation [6, 17, 26, 30, 40–42], together with the controlled comparison of Whiteside and colleagues [47], cautions that a conversational interface must earn its place, which shapes the platform’s design.  The shell-and-command-line thread most directly related to the proposed design demonstrated that natural-language-to-Bash translation is tractable [46], that safety and reversibility are central concerns [12], and that local deployment is feasible [18], while leaving the extension from shell to session, and empirical user evaluation, as open work.  The graphical-agent literature across web, mobile, and desktop [9, 15, 16, 29, 35, 45, 53–56] established the field’s architectural patterns and its recurring bottleneck of visual grounding, while the accessibility thread [13, 28, 32, 33, 44] revealed a complementary limitation that a general conversational interface layer could address.  The evaluation literature [49, 51, 52] traced a capability ceiling that remains low on long-horizon work, and exposed a methodological gap: interfaces are seldom evaluated comparatively against the conventional workflow with real users, and, in the surveyed corpus, not at the level of the operating system itself.</w:t>
+        <w:t xml:space="preserve">[22] previews a command by running it, and ToolEmu [38] measures the risks of agents rather than guarding a given command.  The second, in which the platform is situated, is the literature on natural-language and LLM-mediated interfaces to personal computing across nearly four decades, organized along a four-layer pipeline of Input, Reasoning, Action, and Operating-System Integration.  The historical foundations established the long-standing aspiration to a natural-language interface to a real operating system [49] and the methodological shift, driven by in-context reasoning [51], that made the current generation of systems possible, and the critique of natural-language interaction from direct manipulation [7, 18, 27, 31, 41–43], together with the controlled comparison of Whiteside and colleagues [48], cautions that a conversational interface must earn its place, which shapes the platform’s design.  The shell-and-command-line thread most directly related to the proposed design demonstrated that natural-language-to-Bash translation is tractable [47], that safety and reversibility are central concerns [13], and that local deployment is feasible [19], while leaving the extension from shell to session, and empirical user evaluation, as open work.  The graphical-agent literature across web, mobile, and desktop [10, 16, 17, 30, 36, 46, 54–57] established the field’s architectural patterns and its recurring bottleneck of visual grounding, while the accessibility thread [14, 29, 33, 34, 45] revealed a complementary limitation that a general conversational interface layer could address.  The evaluation literature [50, 52, 53] traced a capability ceiling that remains low on long-horizon work, and exposed a methodological gap: interfaces are seldom evaluated comparatively against the conventional workflow with real users, and, in the surveyed corpus, not at the level of the operating system itself.</w:t>
       </w:r>
     </w:p>
     <w:p>
@@ -6445,7 +6445,7 @@
         <w:t xml:space="preserve"> </w:t>
       </w:r>
       <w:r>
-        <w:t xml:space="preserve">[21] instead leaving the judgment of a contained run to the user; no conversational interface over a whole desktop session addressed to the person using it; no coverage of the Linux desktop; and no controlled comparison of a conversational interface against the conventional workflow at the level of the operating system.  The first is the gap the present study’s research addresses, through a recoverability analysis of generated shell commands evaluated against ground truth obtained by sandboxed execution wherever a command acts on files.  The other three describe the setting in which that gap arises, and SynapseOS, the conversational interface layer for the Linux desktop built as the analysis’s experimental platform, is where the analysis is deployed and validated in use, through a controlled, within-subjects comparison against each participant’s own operating system.  The methodology through which this evaluation is conducted is the subject of Chapter 3.</w:t>
+        <w:t xml:space="preserve">[22] instead leaving the judgment of a contained run to the user; no conversational interface over a whole desktop session addressed to the person using it; no coverage of the Linux desktop; and no controlled comparison of a conversational interface against the conventional workflow at the level of the operating system.  The first is the gap the present study’s research addresses, through a recoverability analysis of generated shell commands evaluated against ground truth obtained by sandboxed execution wherever a command acts on files.  The other three describe the setting in which that gap arises, and SynapseOS, the conversational interface layer for the Linux desktop built as the analysis’s experimental platform, is where the analysis is deployed and validated in use, through a controlled, within-subjects comparison against each participant’s own operating system.  The methodology through which this evaluation is conducted is the subject of Chapter 3.</w:t>
       </w:r>
     </w:p>
     <w:bookmarkEnd w:id="72"/>
@@ -6619,7 +6619,7 @@
         <w:pStyle w:val="BodyText"/>
       </w:pPr>
       <w:r>
-        <w:t xml:space="preserve">The framework is evaluated in two parts of different standing.  The recoverability analyzer, the study’s research contribution, is evaluated on its own, on a corpus of commands whose ground truth is obtained by sandboxed execution (Sections 3.1 and 3.2).  The analyzer is then validated in use, deployed in the platform, through a controlled study in which participants complete a fixed set of tasks under two conditions: using SynapseOS as the interface, and using their own primary operating system — Windows, macOS, or Linux — as the baseline.  The study records the analyzer’s decision on every command participants cause, so its behaviour in use can be compared with its behaviour on the corpus, and its expert baseline design, which pits SynapseOS against the environment each participant already knows and uses daily, characterizes the platform through task completion time, error rate, and user satisfaction across the real-world OS landscape [49].</w:t>
+        <w:t xml:space="preserve">The framework is evaluated in two parts of different standing.  The recoverability analyzer, the study’s research contribution, is evaluated on its own, on a corpus of commands whose ground truth is obtained by sandboxed execution (Sections 3.1 and 3.2).  The analyzer is then validated in use, deployed in the platform, through a controlled study in which participants complete a fixed set of tasks under two conditions: using SynapseOS as the interface, and using their own primary operating system — Windows, macOS, or Linux — as the baseline.  The study records the analyzer’s decision on every command participants cause, so its behaviour in use can be compared with its behaviour on the corpus, and its expert baseline design, which pits SynapseOS against the environment each participant already knows and uses daily, characterizes the platform through task completion time, error rate, and user satisfaction across the real-world OS landscape [50].</w:t>
       </w:r>
     </w:p>
     <w:p>
@@ -6636,7 +6636,7 @@
               <a:graphicData uri="http://schemas.openxmlformats.org/drawingml/2006/picture">
                 <pic:pic>
                   <pic:nvPicPr>
-                    <pic:cNvPr descr="/tmp/claude-1000/-home-willard-projects-thesis/cb82e7af-8c35-489a-a7f7-ef49172efea2/scratchpad/docx/w12/fig1.png" id="79" name="Picture"/>
+                    <pic:cNvPr descr="/tmp/claude-1000/-home-willard-projects-thesis/cb82e7af-8c35-489a-a7f7-ef49172efea2/scratchpad/docx/w13/fig1.png" id="79" name="Picture"/>
                     <pic:cNvPicPr>
                       <a:picLocks noChangeArrowheads="1" noChangeAspect="1"/>
                     </pic:cNvPicPr>
@@ -7360,7 +7360,7 @@
         <w:pStyle w:val="FirstParagraph"/>
       </w:pPr>
       <w:r>
-        <w:t xml:space="preserve">The primary dataset is a corpus of shell commands.  Each command is paired with a fixture — the files and directories that exist when it runs — and with a ground-truth label observed by running it on that fixture in a sandbox: whether it loses nothing, loses something a captured pre-image could restore, or acts outside the filesystem.  The corpus is held as four partitions: human-written commands from NL2Bash [23], templates covering each shell composition operator, commands whose effect lies outside the filesystem, and commands the deployed model itself wrote.  For every command, each configuration compared in Section 3 records its decision: whether it would ask, and what it would capture.  The configurations are the analysis, its baselines, and its ablations.  For every command the analysis would let run, the command is also executed, undone, and the tree compared, which records whether the capture restored the prior state.</w:t>
+        <w:t xml:space="preserve">The primary dataset is a corpus of shell commands.  Each command is paired with a fixture — the files and directories that exist when it runs — and with a ground-truth label observed by running it on that fixture in a sandbox: whether it loses nothing, loses something a captured pre-image could restore, or acts outside the filesystem.  The corpus is held as four partitions: human-written commands from NL2Bash [24], templates covering each shell composition operator, commands whose effect lies outside the filesystem, and commands the deployed model itself wrote.  For every command, each configuration compared in Section 3 records its decision: whether it would ask, and what it would capture.  The configurations are the analysis, its baselines, and its ablations.  For every command the analysis would let run, the command is also executed, undone, and the tree compared, which records whether the capture restored the prior state.</w:t>
       </w:r>
     </w:p>
     <w:bookmarkEnd w:id="82"/>
@@ -7378,7 +7378,7 @@
         <w:pStyle w:val="FirstParagraph"/>
       </w:pPr>
       <w:r>
-        <w:t xml:space="preserve">The OSWorld task suite [49] provides standardized real-computer tasks across shell operations, file management, web browsing, and application-level interactions, and is used as a secondary check on the platform: only its tasks that can be expressed as shell commands are adapted, since graphical-only tasks are outside SynapseOS’s scope (Section 2.1(e)).  OSWorld evaluates computer-using agents in real operating system environments, which lets the platform’s results be related to the existing literature.  Tasks are presented as natural language instructions; agents interact with a real virtual machine environment, and outcomes are evaluated by automated inspection of the resulting system state — whether the goal was actually achieved — rather than by comparing individual actions.  In addition to OSWorld tasks, a custom cross-platform task suite is developed for this study, covering file search and organization, system and process monitoring, application and package management, and text and data processing — each task defined as a human-level goal achievable via SynapseOS natural language commands and via native OS tools on the comparison machine.  Each task in both suites is documented with a description, expected outcome, task category, and difficulty level.</w:t>
+        <w:t xml:space="preserve">The OSWorld task suite [50] provides standardized real-computer tasks across shell operations, file management, web browsing, and application-level interactions, and is used as a secondary check on the platform: only its tasks that can be expressed as shell commands are adapted, since graphical-only tasks are outside SynapseOS’s scope (Section 2.1(e)).  OSWorld evaluates computer-using agents in real operating system environments, which lets the platform’s results be related to the existing literature.  Tasks are presented as natural language instructions; agents interact with a real virtual machine environment, and outcomes are evaluated by automated inspection of the resulting system state — whether the goal was actually achieved — rather than by comparing individual actions.  In addition to OSWorld tasks, a custom cross-platform task suite is developed for this study, covering file search and organization, system and process monitoring, application and package management, and text and data processing — each task defined as a human-level goal achievable via SynapseOS natural language commands and via native OS tools on the comparison machine.  Each task in both suites is documented with a description, expected outcome, task category, and difficulty level.</w:t>
       </w:r>
     </w:p>
     <w:bookmarkEnd w:id="83"/>
@@ -7462,7 +7462,7 @@
         <w:t xml:space="preserve"> </w:t>
       </w:r>
       <w:r>
-        <w:t xml:space="preserve">responses to the System Usability Scale (SUS) [4] and the NASA Task Load Index (NASA-TLX) [14], collected immediately after each condition; both are validated instruments for measuring perceived usability and cognitive workload respectively</w:t>
+        <w:t xml:space="preserve">responses to the System Usability Scale (SUS) [5] and the NASA Task Load Index (NASA-TLX) [15], collected immediately after each condition; both are validated instruments for measuring perceived usability and cognitive workload respectively</w:t>
       </w:r>
     </w:p>
     <w:p>
@@ -7602,7 +7602,7 @@
         <w:pStyle w:val="FirstParagraph"/>
       </w:pPr>
       <w:r>
-        <w:t xml:space="preserve">The corpus is generated by a program, not assembled by hand, and is held as four partitions reported separately rather than pooled.  The first is NL2Bash [23], which supplies human-written commands and is the generalization set: candidates are drawn at random from the dataset with a recorded seed, excluding any command used during development.  The second is a set of parameterized command templates covering each shell composition operator — sequencing, conditional execution, pipelines, redirects, command substitution, loops,</w:t>
+        <w:t xml:space="preserve">The corpus is generated by a program, not assembled by hand, and is held as four partitions reported separately rather than pooled.  The first is NL2Bash [24], which supplies human-written commands and is the generalization set: candidates are drawn at random from the dataset with a recorded seed, excluding any command used during development.  The second is a set of parameterized command templates covering each shell composition operator — sequencing, conditional execution, pipelines, redirects, command substitution, loops,</w:t>
       </w:r>
       <w:r>
         <w:t xml:space="preserve"> </w:t>
@@ -7835,7 +7835,7 @@
         <w:pStyle w:val="FirstParagraph"/>
       </w:pPr>
       <w:r>
-        <w:t xml:space="preserve">SynapseOS is deployed on Debian 13 (Trixie); OSWorld’s own environment is an Ubuntu virtual machine [49], so its shell-expressible tasks are adapted to the Debian evaluation machine.  Each benchmark task is executed through the conversational interface, and results are captured programmatically through the built-in telemetry system.  Each task is supplied to SynapseOS as a natural language instruction, and the resulting system state is compared against the expected outcome defined in the benchmark.  Because SynapseOS asks before every command its confirmation policy does not let through unasked (Section 2.1(e)), benchmark runs are facilitator-attended rather than unattended; the confirmation gate remains active throughout and every confirmation is logged as part of the run record.  OSWorld scores the resulting system state rather than a human operator’s performance, so it applies only to the SynapseOS condition.  Condition B, which a human participant operates directly, has no equivalent and is instead evaluated through the custom cross-platform task suite administered in the user study (Section 1.2(d)).</w:t>
+        <w:t xml:space="preserve">SynapseOS is deployed on Debian 13 (Trixie); OSWorld’s own environment is an Ubuntu virtual machine [50], so its shell-expressible tasks are adapted to the Debian evaluation machine.  Each benchmark task is executed through the conversational interface, and results are captured programmatically through the built-in telemetry system.  Each task is supplied to SynapseOS as a natural language instruction, and the resulting system state is compared against the expected outcome defined in the benchmark.  Because SynapseOS asks before every command its confirmation policy does not let through unasked (Section 2.1(e)), benchmark runs are facilitator-attended rather than unattended; the confirmation gate remains active throughout and every confirmation is logged as part of the run record.  OSWorld scores the resulting system state rather than a human operator’s performance, so it applies only to the SynapseOS condition.  Condition B, which a human participant operates directly, has no equivalent and is instead evaluated through the custom cross-platform task suite administered in the user study (Section 1.2(d)).</w:t>
       </w:r>
     </w:p>
     <w:bookmarkEnd w:id="89"/>
@@ -8824,7 +8824,7 @@
         <w:t xml:space="preserve"> </w:t>
       </w:r>
       <w:r>
-        <w:t xml:space="preserve">accumulates effects unconditionally.  Conjunction and disjunction —</w:t>
+        <w:t xml:space="preserve">accumulates effects whether or not the earlier part succeeded.  Conjunction and disjunction —</w:t>
       </w:r>
       <w:r>
         <w:t xml:space="preserve"> </w:t>
@@ -9373,13 +9373,13 @@
         <w:t xml:space="preserve"> </w:t>
       </w:r>
       <w:r>
-        <w:t xml:space="preserve">doubt(V) keeps V's creations but makes its removals possible</w:t>
-      </w:r>
-      <w:r>
-        <w:t xml:space="preserve"> </w:t>
-      </w:r>
-      <w:r>
-        <w:t xml:space="preserve">only, so a later write to such a path is still captured</w:t>
+        <w:t xml:space="preserve">doubt(V) makes V's removals, and its creations over removed</w:t>
+      </w:r>
+      <w:r>
+        <w:t xml:space="preserve"> </w:t>
+      </w:r>
+      <w:r>
+        <w:t xml:space="preserve">paths, possible only, so a later write there is still captured</w:t>
       </w:r>
       <w:r>
         <w:t xml:space="preserve"> </w:t>
@@ -9554,7 +9554,7 @@
         <w:t xml:space="preserve"> </w:t>
       </w:r>
       <w:r>
-        <w:t xml:space="preserve">S′ ← S after A, its directory unknown if A ran cd</w:t>
+        <w:t xml:space="preserve">S′ ← S after A (for |, S), its directory unknown if A ran cd</w:t>
       </w:r>
       <w:r>
         <w:t xml:space="preserve"> </w:t>
@@ -9623,13 +9623,41 @@
         <w:t xml:space="preserve"> </w:t>
       </w:r>
       <w:r>
-        <w:t xml:space="preserve">analyze each branch or body from S; afterwards a variable or</w:t>
-      </w:r>
-      <w:r>
-        <w:t xml:space="preserve"> </w:t>
-      </w:r>
-      <w:r>
-        <w:t xml:space="preserve">directory on which the paths that may have run disagree is unknown</w:t>
+        <w:t xml:space="preserve">E ← the condition's effects ∪ every branch's or body's effects,</w:t>
+      </w:r>
+      <w:r>
+        <w:t xml:space="preserve"> </w:t>
+      </w:r>
+      <w:r>
+        <w:t xml:space="preserve">each analyzed from S</w:t>
+      </w:r>
+      <w:r>
+        <w:t xml:space="preserve"> </w:t>
+      </w:r>
+      <w:r>
+        <w:t xml:space="preserve">S ← S with a variable or directory on which the paths that may</w:t>
+      </w:r>
+      <w:r>
+        <w:t xml:space="preserve"> </w:t>
+      </w:r>
+      <w:r>
+        <w:t xml:space="preserve">have run disagree made unknown; V ← doubt(V ⊕ E)</w:t>
+      </w:r>
+      <w:r>
+        <w:t xml:space="preserve"> </w:t>
+      </w:r>
+      <w:r>
+        <w:rPr>
+          <w:b/>
+          <w:bCs/>
+        </w:rPr>
+        <w:t xml:space="preserve">return</w:t>
+      </w:r>
+      <w:r>
+        <w:t xml:space="preserve"> </w:t>
+      </w:r>
+      <w:r>
+        <w:t xml:space="preserve">E // a branch may not have run</w:t>
       </w:r>
       <w:r>
         <w:t xml:space="preserve"> </w:t>
@@ -10694,7 +10722,7 @@
         <w:t xml:space="preserve"> </w:t>
       </w:r>
       <w:r>
-        <w:t xml:space="preserve">code-specialized model that demonstrated the strongest natural language-to-bash translation accuracy among models below 7B parameters in controlled evaluation [46].  Among the models directly compared in that evaluation, its code-specialized pretraining produced a clear margin over general-purpose models of comparable or larger size — 58% NL2Bash accuracy with prompt engineering, versus 49% for Llama 3.2-3B and 37% for a LoRA-fine-tuned Llama 3.2-1B — attributable to Qwen2.5-Coder’s training corpus of 5.5 trillion code tokens against Llama 3.2's general-purpose pretraining.  At 4-bit quantization</w:t>
+        <w:t xml:space="preserve">code-specialized model that demonstrated the strongest natural language-to-bash translation accuracy among models below 7B parameters in controlled evaluation [47].  Among the models directly compared in that evaluation, its code-specialized pretraining produced a clear margin over general-purpose models of comparable or larger size — 58% NL2Bash accuracy with prompt engineering, versus 49% for Llama 3.2-3B and 37% for a LoRA-fine-tuned Llama 3.2-1B — attributable to Qwen2.5-Coder’s training corpus of 5.5 trillion code tokens against Llama 3.2's general-purpose pretraining.  At 4-bit quantization</w:t>
       </w:r>
       <w:hyperlink w:anchor="ch3-fn6">
         <w:r>
@@ -10744,15 +10772,15 @@
         <w:pStyle w:val="BodyText"/>
       </w:pPr>
       <w:r>
-        <w:t xml:space="preserve">Accuracy is measured using an execution-based scoring methodology rather than syntax-level string matching, following Westenfelder et al. [46] — see Section 2.3 for the full evaluation procedure.</w:t>
-      </w:r>
-    </w:p>
-    <w:p>
-      <w:pPr>
-        <w:pStyle w:val="BodyText"/>
-      </w:pPr>
-      <w:r>
-        <w:t xml:space="preserve">This selection was reconfirmed against models released after the initial literature review, to guard against the fast-moving small-model landscape becoming stale before study execution; no smaller alternative offered comparable shell-generation evidence within the same CPU-only hardware budget [18].  Newer mixture-of-experts variants require all experts resident in memory regardless of active parameters per token, which is incompatible with this study’s memory budget, and newer general-purpose small models report reasoning benchmarks but no shell-command generation evidence.</w:t>
+        <w:t xml:space="preserve">Accuracy is measured using an execution-based scoring methodology rather than syntax-level string matching, following Westenfelder et al. [47] — see Section 2.3 for the full evaluation procedure.</w:t>
+      </w:r>
+    </w:p>
+    <w:p>
+      <w:pPr>
+        <w:pStyle w:val="BodyText"/>
+      </w:pPr>
+      <w:r>
+        <w:t xml:space="preserve">This selection was reconfirmed against models released after the initial literature review, to guard against the fast-moving small-model landscape becoming stale before study execution; no smaller alternative offered comparable shell-generation evidence within the same CPU-only hardware budget [19].  Newer mixture-of-experts variants require all experts resident in memory regardless of active parameters per token, which is incompatible with this study’s memory budget, and newer general-purpose small models report reasoning benchmarks but no shell-command generation evidence.</w:t>
       </w:r>
     </w:p>
     <w:bookmarkEnd w:id="99"/>
@@ -10770,7 +10798,7 @@
         <w:pStyle w:val="FirstParagraph"/>
       </w:pPr>
       <w:r>
-        <w:t xml:space="preserve">Once the intent parser produces a shell command, SynapseOS passes it through a confirmation gate and an undo journal before execution, following the reversibility-and-guardrail framing proposed for LLM-powered natural language shells [12] and asks only where it must, since a command that takes longer than a caregiver would is among the costs VoicePilot’s guidelines for LLM speech interfaces warn against [32].  The gate acts on the analysis’s verdict under one of two policies.  Under the</w:t>
+        <w:t xml:space="preserve">Once the intent parser produces a shell command, SynapseOS passes it through a confirmation gate and an undo journal before execution, following the reversibility-and-guardrail framing proposed for LLM-powered natural language shells [13] and asks only where it must, since a command that takes longer than a caregiver would is among the costs VoicePilot’s guidelines for LLM speech interfaces warn against [33].  The gate acts on the analysis’s verdict under one of two policies.  Under the</w:t>
       </w:r>
       <w:r>
         <w:t xml:space="preserve"> </w:t>
@@ -10810,7 +10838,7 @@
         <w:pStyle w:val="BodyText"/>
       </w:pPr>
       <w:r>
-        <w:t xml:space="preserve">SynapseOS executes only shell-expressible operations.  The system’s capability boundary is the Linux command-line toolchain: file management, process control, text processing, package management, network configuration, and any application that exposes a command-line interface.  GUI-only interactions — clicking buttons in graphical applications, navigating web page elements, or interacting with visual-only interfaces — are explicitly outside scope, in deliberate contrast to broader desktop agent frameworks that additionally orchestrate GUI automation atop the existing session [53].  This boundary is intentional: it constrains the research to a tractable, verifiable claim that the system can be built, evaluated, and defended within the thesis timeline.</w:t>
+        <w:t xml:space="preserve">SynapseOS executes only shell-expressible operations.  The system’s capability boundary is the Linux command-line toolchain: file management, process control, text processing, package management, network configuration, and any application that exposes a command-line interface.  GUI-only interactions — clicking buttons in graphical applications, navigating web page elements, or interacting with visual-only interfaces — are explicitly outside scope, in deliberate contrast to broader desktop agent frameworks that additionally orchestrate GUI automation atop the existing session [54].  This boundary is intentional: it constrains the research to a tractable, verifiable claim that the system can be built, evaluated, and defended within the thesis timeline.</w:t>
       </w:r>
     </w:p>
     <w:bookmarkEnd w:id="100"/>
@@ -11001,7 +11029,7 @@
         <w:t xml:space="preserve"> </w:t>
       </w:r>
       <w:r>
-        <w:t xml:space="preserve">evaluated using an execution-based scoring methodology [46] — each generated command is executed in a controlled environment and its resulting system state compared against a human-annotated expected outcome for each task utterance, rather than syntax-level string matching, with ambiguous cases resolved through LLM-assisted functional equivalence assessment at 95% confidence; accuracy is computed as the proportion of first-attempt matches</w:t>
+        <w:t xml:space="preserve">evaluated using an execution-based scoring methodology [47] — each generated command is executed in a controlled environment and its resulting system state compared against a human-annotated expected outcome for each task utterance, rather than syntax-level string matching, with ambiguous cases resolved through LLM-assisted functional equivalence assessment at 95% confidence; accuracy is computed as the proportion of first-attempt matches</w:t>
       </w:r>
     </w:p>
     <w:p>
@@ -11521,7 +11549,7 @@
         <w:pStyle w:val="BodyText"/>
       </w:pPr>
       <w:r>
-        <w:t xml:space="preserve">Because the first baseline was written by the same team, it was checked against command-safety checks that others ship.  Two open-source checks were scored on the same held-out corpus and labels reported in (d) below: the dangerous-command check of OpenAI’s Codex CLI [31], ported from its source and verified against that source’s own unit tests, and cc-safety-net [20], a pre-execution guard used with several agentic coding tools, run unmodified under each of its three presets, all three reported in (d).  On the 325 commands that destroy files, they let between 73% and 97% run with no confirmation and no capture, against 31% for the enumerated-pattern classifier, and neither makes any provision for recovery.  Both are designed for coding agents working inside a version-controlled project, where deleting project files is routine and version control is the safeguard, so these figures describe how they would serve a person’s own files, not how well they serve their intended purpose.  The first baseline is therefore the strictest enumerated list tested, and comparisons against it understate rather than overstate the analysis’s advantage over lists in current use.  No shipping tool was found that determines a command’s effects before it runs in order to capture what it would destroy; on recovery there is no external counterpart, which is the gap identified in Chapter 2, Section 2.5.  Their results are reported in (d) beside the others.</w:t>
+        <w:t xml:space="preserve">Because the first baseline was written by the same team, it was checked against command-safety checks that others ship.  Two open-source checks were scored on the same held-out corpus and labels reported in (d) below: the dangerous-command check of OpenAI’s Codex CLI [32], ported from its source and verified against that source’s own unit tests, and cc-safety-net [21], a pre-execution guard used with several agentic coding tools, run unmodified under each of its three presets, all three reported in (d).  On the 325 commands that destroy files, they let between 73% and 97% run with no confirmation and no capture, against 31% for the enumerated-pattern classifier, and neither makes any provision for recovery.  Both are designed for coding agents working inside a version-controlled project, where deleting project files is routine and version control is the safeguard, so these figures describe how they would serve a person’s own files, not how well they serve their intended purpose.  The first baseline is therefore the strictest enumerated list tested, and comparisons against it understate rather than overstate the analysis’s advantage over lists in current use.  No shipping tool was found that determines a command’s effects before it runs in order to capture what it would destroy; on recovery there is no external counterpart, which is the gap identified in Chapter 2, Section 2.5.  Their results are reported in (d) beside the others.</w:t>
       </w:r>
     </w:p>
     <w:bookmarkEnd w:id="107"/>
@@ -11745,7 +11773,7 @@
               <w:jc w:val="left"/>
             </w:pPr>
             <w:r>
-              <w:t xml:space="preserve">Of the commands that lose nothing, the share on which the user is asked: under the capture policy, those the analysis judges unrecoverable; under the strict policy, also those it judges recoverable only with capture.  The cost is unnecessary friction, which matters because habituation to unnecessary confirmations is a documented failure mode of gate designs</w:t>
+              <w:t xml:space="preserve">Of the commands that lose nothing, the share on which the user is asked: under the capture policy, those the analysis judges unrecoverable; under the strict policy, also those it judges recoverable only with capture.  The cost is unnecessary friction, which matters because habituation to repeated confirmations makes people stop reading them [4]</w:t>
             </w:r>
           </w:p>
         </w:tc>
@@ -12005,7 +12033,7 @@
         <w:t xml:space="preserve">||</w:t>
       </w:r>
       <w:r>
-        <w:t xml:space="preserve">, was analyzed as if it had not.  None was exercised by any command in this corpus; all have been fixed, and re-running the corpus with the fixed analyzer changed none of its decisions under any configuration compared.</w:t>
+        <w:t xml:space="preserve">, was analyzed as if it had not.  No command in this corpus met the conditions that trigger them; all have been fixed, and re-running the corpus with the fixed analyzer changed none of its decisions under any configuration compared.</w:t>
       </w:r>
     </w:p>
     <w:p>
@@ -13714,7 +13742,7 @@
         <w:pStyle w:val="FirstParagraph"/>
       </w:pPr>
       <w:r>
-        <w:t xml:space="preserve">Sections 3.3 to 3.7 define the validation study, in which the analysis is deployed in SynapseOS and exercised by participants.  It exercises the platform on two task datasets: the OSWorld benchmark task suite [49] for direct comparison with results in the existing literature, and the custom cross-platform task suite described in Sections 1.1 and 1.5.  The user study evaluation involves 40 participants (20 novice, 20 power users); the baseline condition is each participant’s primary operating system — Windows 11, macOS, or Linux with GNOME desktop — on a dedicated baseline machine.</w:t>
+        <w:t xml:space="preserve">Sections 3.3 to 3.7 define the validation study, in which the analysis is deployed in SynapseOS and exercised by participants.  It exercises the platform on two task datasets: the OSWorld benchmark task suite [50] for direct comparison with results in the existing literature, and the custom cross-platform task suite described in Sections 1.1 and 1.5.  The user study evaluation involves 40 participants (20 novice, 20 power users); the baseline condition is each participant’s primary operating system — Windows 11, macOS, or Linux with GNOME desktop — on a dedicated baseline machine.</w:t>
       </w:r>
     </w:p>
     <w:bookmarkEnd w:id="114"/>
@@ -13879,7 +13907,7 @@
         <w:pStyle w:val="FirstParagraph"/>
       </w:pPr>
       <w:r>
-        <w:t xml:space="preserve">SUS scores are computed per the standard scoring procedure [4] to produce a score on a 0–100 scale; a score above 68 is conventionally treated as above-average usability, a benchmark drawn from scores across a large sample of studies [39].  NASA-TLX scores are computed as the unweighted mean of the six subscale ratings [14] to produce a composite workload score per participant per condition.  Because a conversational interface is meant to widen access rather than only to save time, workload and task success are weighted alongside completion time among the platform measures, not treated as secondary to it.</w:t>
+        <w:t xml:space="preserve">SUS scores are computed per the standard scoring procedure [5] to produce a score on a 0–100 scale; a score above 68 is conventionally treated as above-average usability, a benchmark drawn from scores across a large sample of studies [40].  NASA-TLX scores are computed as the unweighted mean of the six subscale ratings [15] to produce a composite workload score per participant per condition.  Because a conversational interface is meant to widen access rather than only to save time, workload and task success are weighted alongside completion time among the platform measures, not treated as secondary to it.</w:t>
       </w:r>
     </w:p>
     <w:p>
@@ -14681,6 +14709,30 @@
         <w:t xml:space="preserve">[4]</w:t>
       </w:r>
       <w:r>
+        <w:t xml:space="preserve">C. Bravo-Lillo, L. Cranor, S. Komanduri, S. Schechter, and M. Sleeper. 2014. Harder to Ignore? Revisiting Pop-Up Fatigue and Approaches to Prevent It. In</w:t>
+      </w:r>
+      <w:r>
+        <w:t xml:space="preserve"> </w:t>
+      </w:r>
+      <w:r>
+        <w:rPr>
+          <w:i/>
+          <w:iCs/>
+        </w:rPr>
+        <w:t xml:space="preserve">Proceedings of the Tenth Symposium on Usable Privacy and Security (SOUPS 2014)</w:t>
+      </w:r>
+      <w:r>
+        <w:t xml:space="preserve">. USENIX Association, 105–111. https://www.usenix.org/conference/soups2014/proceedings/presentation/bravo-lillo</w:t>
+      </w:r>
+    </w:p>
+    <w:p>
+      <w:pPr>
+        <w:pStyle w:val="BodyText"/>
+      </w:pPr>
+      <w:r>
+        <w:t xml:space="preserve">[5]</w:t>
+      </w:r>
+      <w:r>
         <w:t xml:space="preserve">J. Brooke. 1996. SUS: A “quick and dirty” usability scale. In</w:t>
       </w:r>
       <w:r>
@@ -14702,7 +14754,7 @@
         <w:pStyle w:val="BodyText"/>
       </w:pPr>
       <w:r>
-        <w:t xml:space="preserve">[5]</w:t>
+        <w:t xml:space="preserve">[6]</w:t>
       </w:r>
       <w:r>
         <w:t xml:space="preserve">A. B. Brown and D. A. Patterson. 2003. Undo for operators: Building an undoable e-mail store. In</w:t>
@@ -14726,7 +14778,7 @@
         <w:pStyle w:val="BodyText"/>
       </w:pPr>
       <w:r>
-        <w:t xml:space="preserve">[6]</w:t>
+        <w:t xml:space="preserve">[7]</w:t>
       </w:r>
       <w:r>
         <w:t xml:space="preserve">L. Clark, N. Pantidi, O. Cooney, P. R. Doyle, D. Garaialde, J. Edwards, B. Spillane, E. Gilmartin, C. Murad, C. Munteanu, V. Wade, and B. R. Cowan. 2019. What makes a good conversation? Challenges in designing truly conversational agents. In</w:t>
@@ -14750,7 +14802,7 @@
         <w:pStyle w:val="BodyText"/>
       </w:pPr>
       <w:r>
-        <w:t xml:space="preserve">[7]</w:t>
+        <w:t xml:space="preserve">[8]</w:t>
       </w:r>
       <w:r>
         <w:t xml:space="preserve">P. Cousot and R. Cousot. 1977. Abstract interpretation: A unified lattice model for static analysis of programs by construction or approximation of fixpoints. In</w:t>
@@ -14774,7 +14826,7 @@
         <w:pStyle w:val="BodyText"/>
       </w:pPr>
       <w:r>
-        <w:t xml:space="preserve">[8]</w:t>
+        <w:t xml:space="preserve">[9]</w:t>
       </w:r>
       <w:r>
         <w:t xml:space="preserve">J. W. Creswell and V. L. Plano Clark. 2018.</w:t>
@@ -14801,7 +14853,7 @@
         <w:pStyle w:val="BodyText"/>
       </w:pPr>
       <w:r>
-        <w:t xml:space="preserve">[9]</w:t>
+        <w:t xml:space="preserve">[10]</w:t>
       </w:r>
       <w:r>
         <w:t xml:space="preserve">X. Deng, Y. Gu, B. Zheng, S. Chen, S. Stevens, B. Wang, H. Sun, and Y. Su. 2023. Mind2Web: Towards a Generalist Agent for the Web. In</w:t>
@@ -14825,7 +14877,7 @@
         <w:pStyle w:val="BodyText"/>
       </w:pPr>
       <w:r>
-        <w:t xml:space="preserve">[10]</w:t>
+        <w:t xml:space="preserve">[11]</w:t>
       </w:r>
       <w:r>
         <w:t xml:space="preserve">A. Goel, K. Po, K. Farhadi, Z. Li, and E. de Lara. 2005. The Taser intrusion recovery system. In</w:t>
@@ -14849,7 +14901,7 @@
         <w:pStyle w:val="BodyText"/>
       </w:pPr>
       <w:r>
-        <w:t xml:space="preserve">[11]</w:t>
+        <w:t xml:space="preserve">[12]</w:t>
       </w:r>
       <w:r>
         <w:t xml:space="preserve">M. Greenberg and A. J. Blatt. 2020. Executable formal semantics for the POSIX shell.</w:t>
@@ -14876,7 +14928,7 @@
         <w:pStyle w:val="BodyText"/>
       </w:pPr>
       <w:r>
-        <w:t xml:space="preserve">[12]</w:t>
+        <w:t xml:space="preserve">[13]</w:t>
       </w:r>
       <w:r>
         <w:t xml:space="preserve">B. R. Gyawali, S. Achalla, K. Kallas, and S. Kumar. 2025. NaSh: Guardrails for an LLM-Powered Natural Language Shell. arXiv:2506.13028</w:t>
@@ -14887,7 +14939,7 @@
         <w:pStyle w:val="BodyText"/>
       </w:pPr>
       <w:r>
-        <w:t xml:space="preserve">[13]</w:t>
+        <w:t xml:space="preserve">[14]</w:t>
       </w:r>
       <w:r>
         <w:t xml:space="preserve">W. Han, Z. Zeng, J. Huang, S. Jiang, et al. 2025. GUIRoboTron-Speech: Towards Automated GUI Agents Based on Speech Instructions. arXiv:2506.11127v1</w:t>
@@ -14898,7 +14950,7 @@
         <w:pStyle w:val="BodyText"/>
       </w:pPr>
       <w:r>
-        <w:t xml:space="preserve">[14]</w:t>
+        <w:t xml:space="preserve">[15]</w:t>
       </w:r>
       <w:r>
         <w:t xml:space="preserve">S. G. Hart and L. E. Staveland. 1988. Development of NASA-TLX (Task Load Index): Results of empirical and theoretical research. In</w:t>
@@ -14922,7 +14974,7 @@
         <w:pStyle w:val="BodyText"/>
       </w:pPr>
       <w:r>
-        <w:t xml:space="preserve">[15]</w:t>
+        <w:t xml:space="preserve">[16]</w:t>
       </w:r>
       <w:r>
         <w:t xml:space="preserve">W. Hong, W. Wang, Q. Lv, J. Xu, W. Yu, J. Ji, Y. Wang, Z. Wang, Y. Dong, M. Ding, and J. Tang. 2024. CogAgent: A Visual Language Model for GUI Agents. In</w:t>
@@ -14946,7 +14998,7 @@
         <w:pStyle w:val="BodyText"/>
       </w:pPr>
       <w:r>
-        <w:t xml:space="preserve">[16]</w:t>
+        <w:t xml:space="preserve">[17]</w:t>
       </w:r>
       <w:r>
         <w:t xml:space="preserve">Z. Hui, Y. Li, D. Zhao, T. Chen, C. Banbury, and K. Koishida. 2025. WinClick: GUI Grounding with Multimodal Large Language Models. arXiv:2503.04730</w:t>
@@ -14957,7 +15009,7 @@
         <w:pStyle w:val="BodyText"/>
       </w:pPr>
       <w:r>
-        <w:t xml:space="preserve">[17]</w:t>
+        <w:t xml:space="preserve">[18]</w:t>
       </w:r>
       <w:r>
         <w:t xml:space="preserve">E. L. Hutchins, J. D. Hollan, and D. A. Norman. 1985. Direct manipulation interfaces.</w:t>
@@ -14984,7 +15036,7 @@
         <w:pStyle w:val="BodyText"/>
       </w:pPr>
       <w:r>
-        <w:t xml:space="preserve">[18]</w:t>
+        <w:t xml:space="preserve">[19]</w:t>
       </w:r>
       <w:r>
         <w:t xml:space="preserve">J. Jacobs, J. Lapon, and V. Naessens. 2026. Local LLMs for NL2Bash: A Large-Scale Open-Source Model Evaluation for Bash Command Generation. In</w:t>
@@ -15008,7 +15060,7 @@
         <w:pStyle w:val="BodyText"/>
       </w:pPr>
       <w:r>
-        <w:t xml:space="preserve">[19]</w:t>
+        <w:t xml:space="preserve">[20]</w:t>
       </w:r>
       <w:r>
         <w:t xml:space="preserve">P. Jouvelot and D. K. Gifford. 1991. Algebraic reconstruction of types and effects. In</w:t>
@@ -15032,7 +15084,7 @@
         <w:pStyle w:val="BodyText"/>
       </w:pPr>
       <w:r>
-        <w:t xml:space="preserve">[20]</w:t>
+        <w:t xml:space="preserve">[21]</w:t>
       </w:r>
       <w:r>
         <w:t xml:space="preserve">kenryu42. 2026.</w:t>
@@ -15056,7 +15108,7 @@
         <w:pStyle w:val="BodyText"/>
       </w:pPr>
       <w:r>
-        <w:t xml:space="preserve">[21]</w:t>
+        <w:t xml:space="preserve">[22]</w:t>
       </w:r>
       <w:r>
         <w:t xml:space="preserve">E. Lamprou, T. Zhu, D. Jin, G. Ntousakis, G. Liargkovas, C. Eng, K. Kallas, M. Greenberg, and N. Vasilakis. 2026. Controlling opaque-component effects with semisolates and try. In</w:t>
@@ -15080,7 +15132,7 @@
         <w:pStyle w:val="BodyText"/>
       </w:pPr>
       <w:r>
-        <w:t xml:space="preserve">[22]</w:t>
+        <w:t xml:space="preserve">[23]</w:t>
       </w:r>
       <w:r>
         <w:t xml:space="preserve">Y. Li, J. He, X. Zhou, Y. Zhang, and J. Baldridge. 2020. Mapping Natural Language Instructions to Mobile UI Action Sequences. In</w:t>
@@ -15104,7 +15156,7 @@
         <w:pStyle w:val="BodyText"/>
       </w:pPr>
       <w:r>
-        <w:t xml:space="preserve">[23]</w:t>
+        <w:t xml:space="preserve">[24]</w:t>
       </w:r>
       <w:r>
         <w:t xml:space="preserve">X. V. Lin, C. Wang, L. Zettlemoyer, and M. D. Ernst. 2018. NL2Bash: A corpus and semantic parser for natural language interface to the Linux operating system. In</w:t>
@@ -15128,7 +15180,7 @@
         <w:pStyle w:val="BodyText"/>
       </w:pPr>
       <w:r>
-        <w:t xml:space="preserve">[24]</w:t>
+        <w:t xml:space="preserve">[25]</w:t>
       </w:r>
       <w:r>
         <w:t xml:space="preserve">R. Liu, T. Zhe, D. Wang, Z. Yao, K. Liu, Y. Fu, H. Liu, and J. Pei. 2026. AgentOS: From Application Silos to a Natural Language-Driven Data Ecosystem. arXiv:2603.08938</w:t>
@@ -15139,7 +15191,7 @@
         <w:pStyle w:val="BodyText"/>
       </w:pPr>
       <w:r>
-        <w:t xml:space="preserve">[25]</w:t>
+        <w:t xml:space="preserve">[26]</w:t>
       </w:r>
       <w:r>
         <w:t xml:space="preserve">J. Lu, Z. Zhang, F. Yang, J. Zhang, L. Wang, C. Du, Q. Lin, S. Rajmohan, D. Zhang, and Q. Zhang. 2024. AXIS: Efficient Human-Agent-Computer Interaction with API-First LLM-Based Agents. arXiv:2409.17140</w:t>
@@ -15150,7 +15202,7 @@
         <w:pStyle w:val="BodyText"/>
       </w:pPr>
       <w:r>
-        <w:t xml:space="preserve">[26]</w:t>
+        <w:t xml:space="preserve">[27]</w:t>
       </w:r>
       <w:r>
         <w:t xml:space="preserve">E. Luger and A. Sellen. 2016. “Like having a really bad PA”: The gulf between user expectation and experience of conversational agents. In</w:t>
@@ -15174,7 +15226,7 @@
         <w:pStyle w:val="BodyText"/>
       </w:pPr>
       <w:r>
-        <w:t xml:space="preserve">[27]</w:t>
+        <w:t xml:space="preserve">[28]</w:t>
       </w:r>
       <w:r>
         <w:t xml:space="preserve">K. Mazurak and S. Zdancewic. 2007. ABASH: Finding bugs in bash scripts. In</w:t>
@@ -15198,7 +15250,7 @@
         <w:pStyle w:val="BodyText"/>
       </w:pPr>
       <w:r>
-        <w:t xml:space="preserve">[28]</w:t>
+        <w:t xml:space="preserve">[29]</w:t>
       </w:r>
       <w:r>
         <w:t xml:space="preserve">S. Mehendale and A. Walishetti. 2024. DexAssist: A Voice-Enabled Dual-LLM Framework for Accessible Web Navigation. arXiv:2411.12214</w:t>
@@ -15209,7 +15261,7 @@
         <w:pStyle w:val="BodyText"/>
       </w:pPr>
       <w:r>
-        <w:t xml:space="preserve">[29]</w:t>
+        <w:t xml:space="preserve">[30]</w:t>
       </w:r>
       <w:r>
         <w:t xml:space="preserve">R. Niu, J. Li, S. Wang, Y. Fu, X. Hu, X. Leng, H. Kong, Y. Chang, and Q. Wang. 2024. ScreenAgent: A Vision Language Model-driven Computer Control Agent. arXiv:2402.07945</w:t>
@@ -15220,7 +15272,7 @@
         <w:pStyle w:val="BodyText"/>
       </w:pPr>
       <w:r>
-        <w:t xml:space="preserve">[30]</w:t>
+        <w:t xml:space="preserve">[31]</w:t>
       </w:r>
       <w:r>
         <w:t xml:space="preserve">D. A. Norman. 1986. Cognitive engineering. In</w:t>
@@ -15244,7 +15296,7 @@
         <w:pStyle w:val="BodyText"/>
       </w:pPr>
       <w:r>
-        <w:t xml:space="preserve">[31]</w:t>
+        <w:t xml:space="preserve">[32]</w:t>
       </w:r>
       <w:r>
         <w:t xml:space="preserve">OpenAI. 2026.</w:t>
@@ -15268,7 +15320,7 @@
         <w:pStyle w:val="BodyText"/>
       </w:pPr>
       <w:r>
-        <w:t xml:space="preserve">[32]</w:t>
+        <w:t xml:space="preserve">[33]</w:t>
       </w:r>
       <w:r>
         <w:t xml:space="preserve">A. Padmanabha, J. Yuan, J. Gupta, Z. Karachiwalla, C. Majidi, H. Admoni, and Z. Erickson. 2024. VoicePilot: Harnessing LLMs as Speech Interfaces for Physically Assistive Robots. In</w:t>
@@ -15292,7 +15344,7 @@
         <w:pStyle w:val="BodyText"/>
       </w:pPr>
       <w:r>
-        <w:t xml:space="preserve">[33]</w:t>
+        <w:t xml:space="preserve">[34]</w:t>
       </w:r>
       <w:r>
         <w:t xml:space="preserve">J. Park, P. Tang, S. Das, S. Appalaraju, K. Y. Singh, R. Manmatha, and S. Ghadar. 2025. R-VLM: Region-aware Vision Language Model for Precise GUI Grounding. In</w:t>
@@ -15316,7 +15368,7 @@
         <w:pStyle w:val="BodyText"/>
       </w:pPr>
       <w:r>
-        <w:t xml:space="preserve">[34]</w:t>
+        <w:t xml:space="preserve">[35]</w:t>
       </w:r>
       <w:r>
         <w:t xml:space="preserve">D. E. Porter, O. S. Hofmann, C. J. Rossbach, A. Benn, and E. Witchel. 2009. Operating system transactions. In</w:t>
@@ -15340,7 +15392,7 @@
         <w:pStyle w:val="BodyText"/>
       </w:pPr>
       <w:r>
-        <w:t xml:space="preserve">[35]</w:t>
+        <w:t xml:space="preserve">[36]</w:t>
       </w:r>
       <w:r>
         <w:t xml:space="preserve">C. Rawles, A. Li, D. Rodriguez, O. Riva, and T. Lillicrap. 2023. Android in the Wild: A Large-Scale Dataset for Android Device Control. In</w:t>
@@ -15364,7 +15416,7 @@
         <w:pStyle w:val="BodyText"/>
       </w:pPr>
       <w:r>
-        <w:t xml:space="preserve">[36]</w:t>
+        <w:t xml:space="preserve">[37]</w:t>
       </w:r>
       <w:r>
         <w:t xml:space="preserve">O. Rodeh, J. Bacik, and C. Mason. 2013. BTRFS: The Linux B-tree filesystem.</w:t>
@@ -15391,7 +15443,7 @@
         <w:pStyle w:val="BodyText"/>
       </w:pPr>
       <w:r>
-        <w:t xml:space="preserve">[37]</w:t>
+        <w:t xml:space="preserve">[38]</w:t>
       </w:r>
       <w:r>
         <w:t xml:space="preserve">Y. Ruan, H. Dong, A. Wang, S. Pitis, Y. Zhou, J. Ba, Y. Dubois, C. J. Maddison, and T. Hashimoto. 2024. Identifying the risks of LM agents with an LM-emulated sandbox. In</w:t>
@@ -15415,7 +15467,7 @@
         <w:pStyle w:val="BodyText"/>
       </w:pPr>
       <w:r>
-        <w:t xml:space="preserve">[38]</w:t>
+        <w:t xml:space="preserve">[39]</w:t>
       </w:r>
       <w:r>
         <w:t xml:space="preserve">D. S. Santry, M. J. Feeley, N. C. Hutchinson, A. C. Veitch, R. W. Carton, and J. Ofir. 1999. Deciding when to forget in the Elephant file system. In</w:t>
@@ -15439,7 +15491,7 @@
         <w:pStyle w:val="BodyText"/>
       </w:pPr>
       <w:r>
-        <w:t xml:space="preserve">[39]</w:t>
+        <w:t xml:space="preserve">[40]</w:t>
       </w:r>
       <w:r>
         <w:t xml:space="preserve">J. Sauro and J. R. Lewis. 2016.</w:t>
@@ -15466,7 +15518,7 @@
         <w:pStyle w:val="BodyText"/>
       </w:pPr>
       <w:r>
-        <w:t xml:space="preserve">[40]</w:t>
+        <w:t xml:space="preserve">[41]</w:t>
       </w:r>
       <w:r>
         <w:t xml:space="preserve">B. Shneiderman. 1983. Direct manipulation: A step beyond programming languages.</w:t>
@@ -15493,7 +15545,7 @@
         <w:pStyle w:val="BodyText"/>
       </w:pPr>
       <w:r>
-        <w:t xml:space="preserve">[41]</w:t>
+        <w:t xml:space="preserve">[42]</w:t>
       </w:r>
       <w:r>
         <w:t xml:space="preserve">B. Shneiderman. 2000. The limits of speech recognition.</w:t>
@@ -15520,7 +15572,7 @@
         <w:pStyle w:val="BodyText"/>
       </w:pPr>
       <w:r>
-        <w:t xml:space="preserve">[42]</w:t>
+        <w:t xml:space="preserve">[43]</w:t>
       </w:r>
       <w:r>
         <w:t xml:space="preserve">B. Shneiderman and P. Maes. 1997. Direct manipulation vs. interface agents.</w:t>
@@ -15547,7 +15599,7 @@
         <w:pStyle w:val="BodyText"/>
       </w:pPr>
       <w:r>
-        <w:t xml:space="preserve">[43]</w:t>
+        <w:t xml:space="preserve">[44]</w:t>
       </w:r>
       <w:r>
         <w:t xml:space="preserve">J.-P. Talpin and P. Jouvelot. 1994. The type and effect discipline.</w:t>
@@ -15574,7 +15626,7 @@
         <w:pStyle w:val="BodyText"/>
       </w:pPr>
       <w:r>
-        <w:t xml:space="preserve">[44]</w:t>
+        <w:t xml:space="preserve">[45]</w:t>
       </w:r>
       <w:r>
         <w:t xml:space="preserve">H. G. W. van Dam. 2025. A Multimodal GUI Architecture for Interfacing with LLM-Based Conversational Assistants. arXiv:2510.06223</w:t>
@@ -15585,7 +15637,7 @@
         <w:pStyle w:val="BodyText"/>
       </w:pPr>
       <w:r>
-        <w:t xml:space="preserve">[45]</w:t>
+        <w:t xml:space="preserve">[46]</w:t>
       </w:r>
       <w:r>
         <w:t xml:space="preserve">J. Wang, H. Xu, J. Ye, M. Yan, W. Shen, J. Zhang, F. Huang, and J. Sang. 2024. Mobile-Agent: Autonomous Multi-Modal Mobile Device Agent with Visual Perception. arXiv:2401.16158</w:t>
@@ -15596,7 +15648,7 @@
         <w:pStyle w:val="BodyText"/>
       </w:pPr>
       <w:r>
-        <w:t xml:space="preserve">[46]</w:t>
+        <w:t xml:space="preserve">[47]</w:t>
       </w:r>
       <w:r>
         <w:t xml:space="preserve">F. Westenfelder, E. Hemberg, M. Tulla, S. Moskal, U.-M. O’Reilly, and S. Chiricescu. 2025. LLM-Supported Natural Language to Bash Translation. arXiv:2502.06858</w:t>
@@ -15607,7 +15659,7 @@
         <w:pStyle w:val="BodyText"/>
       </w:pPr>
       <w:r>
-        <w:t xml:space="preserve">[47]</w:t>
+        <w:t xml:space="preserve">[48]</w:t>
       </w:r>
       <w:r>
         <w:t xml:space="preserve">J. Whiteside, S. Jones, P. S. Levy, and D. Wixon. 1985. User performance with command, menu, and iconic interfaces. In</w:t>
@@ -15631,7 +15683,7 @@
         <w:pStyle w:val="BodyText"/>
       </w:pPr>
       <w:r>
-        <w:t xml:space="preserve">[48]</w:t>
+        <w:t xml:space="preserve">[49]</w:t>
       </w:r>
       <w:r>
         <w:t xml:space="preserve">R. Wilensky, D. N. Chin, M. Luria, J. Martin, J. Mayfield, and D. Wu. 1988. The Berkeley Unix Consultant Project.</w:t>
@@ -15658,7 +15710,7 @@
         <w:pStyle w:val="BodyText"/>
       </w:pPr>
       <w:r>
-        <w:t xml:space="preserve">[49]</w:t>
+        <w:t xml:space="preserve">[50]</w:t>
       </w:r>
       <w:r>
         <w:t xml:space="preserve">T. Xie, D. Zhang, J. Chen, X. Li, S. Zhao, R. Cao, T. J. Hua, Z. Cheng, D. Shin, F. Lei, Y. Liu, Y. Xu, S. Zhou, S. Savarese, C. Xiong, V. Zhong, and T. Yu. 2024. OSWorld: Benchmarking Multimodal Agents for Open-Ended Tasks in Real Computer Environments. In</w:t>
@@ -15682,7 +15734,7 @@
         <w:pStyle w:val="BodyText"/>
       </w:pPr>
       <w:r>
-        <w:t xml:space="preserve">[50]</w:t>
+        <w:t xml:space="preserve">[51]</w:t>
       </w:r>
       <w:r>
         <w:t xml:space="preserve">S. Yao, J. Zhao, D. Yu, N. Du, I. Shafran, K. Narasimhan, and Y. Cao. 2023. ReAct: Synergizing Reasoning and Acting in Language Models. In</w:t>
@@ -15706,7 +15758,7 @@
         <w:pStyle w:val="BodyText"/>
       </w:pPr>
       <w:r>
-        <w:t xml:space="preserve">[51]</w:t>
+        <w:t xml:space="preserve">[52]</w:t>
       </w:r>
       <w:r>
         <w:t xml:space="preserve">M. Yuan, Z. Zhou, X. Xiong, et al. 2026. OSWorld 2.0: Benchmarking Computer Use Agents on Long-Horizon Real-World Tasks. arXiv:2606.29537</w:t>
@@ -15717,7 +15769,7 @@
         <w:pStyle w:val="BodyText"/>
       </w:pPr>
       <w:r>
-        <w:t xml:space="preserve">[52]</w:t>
+        <w:t xml:space="preserve">[53]</w:t>
       </w:r>
       <w:r>
         <w:t xml:space="preserve">C. Zhang, S. He, J. Qian, B. Li, L. Li, S. Qin, Y. Kang, M. Ma, G. Liu, Q. Lin, S. Rajmohan, D. Zhang, and Q. Zhang. 2024. Large Language Model-Brained GUI Agents: A Survey. arXiv:2411.18279</w:t>
@@ -15728,7 +15780,7 @@
         <w:pStyle w:val="BodyText"/>
       </w:pPr>
       <w:r>
-        <w:t xml:space="preserve">[53]</w:t>
+        <w:t xml:space="preserve">[54]</w:t>
       </w:r>
       <w:r>
         <w:t xml:space="preserve">C. Zhang, H. Huang, C. Ni, J. Mu, S. Qin, S. He, L. Wang, F. Yang, P. Zhao, C. Du, L. Li, Y. Kang, Z. Jiang, S. Zheng, R. Wang, J. Qian, M. Ma, J. Lou, Q. Lin, S. Rajmohan, and D. Zhang. 2025. UFO</w:t>
@@ -15748,7 +15800,7 @@
         <w:pStyle w:val="BodyText"/>
       </w:pPr>
       <w:r>
-        <w:t xml:space="preserve">[54]</w:t>
+        <w:t xml:space="preserve">[55]</w:t>
       </w:r>
       <w:r>
         <w:t xml:space="preserve">C. Zhang, Z. Yang, J. Liu, Y. Li, Y. Han, X. Chen, Z. Huang, B. Fu, and G. Yu. 2023. AppAgent: Multimodal Agents as Smartphone Users. arXiv:2312.13771</w:t>
@@ -15759,7 +15811,7 @@
         <w:pStyle w:val="BodyText"/>
       </w:pPr>
       <w:r>
-        <w:t xml:space="preserve">[55]</w:t>
+        <w:t xml:space="preserve">[56]</w:t>
       </w:r>
       <w:r>
         <w:t xml:space="preserve">B. Zheng, B. Gou, J. Kil, H. Sun, and Y. Su. 2024. GPT-4V(ision) is a Generalist Web Agent, if Grounded. In</w:t>
@@ -15783,7 +15835,7 @@
         <w:pStyle w:val="BodyText"/>
       </w:pPr>
       <w:r>
-        <w:t xml:space="preserve">[56]</w:t>
+        <w:t xml:space="preserve">[57]</w:t>
       </w:r>
       <w:r>
         <w:t xml:space="preserve">S. Zhou, F. F. Xu, H. Zhu, X. Zhou, R. Lo, A. Sridhar, X. Cheng, T. Ou, Y. Bisk, D. Fried, U. Alon, and G. Neubig. 2024. WebArena: A Realistic Web Environment for Building Autonomous Agents. In</w:t>
@@ -15807,7 +15859,7 @@
         <w:pStyle w:val="BodyText"/>
       </w:pPr>
       <w:r>
-        <w:t xml:space="preserve">[57]</w:t>
+        <w:t xml:space="preserve">[58]</w:t>
       </w:r>
       <w:r>
         <w:t xml:space="preserve">X. Zhou, S. Zhang, Y. Zhao, J. Wei, T. Song, A. Cohan, and C. Zhao. 2026. GUI vs. CLI: Execution Bottlenecks in Screen-Only and Skill-Mediated Computer-Use Agents. arXiv:2606.24551</w:t>
@@ -15853,7 +15905,7 @@
         <w:pStyle w:val="BodyText"/>
       </w:pPr>
       <w:r>
-        <w:t xml:space="preserve">Administered immediately after each condition, referring to the interface just used.  Items are the standard ten-item instrument of Brooke [4], with the word “system” replaced throughout by “interface” so that participants rate the interaction surface rather than the machine.  Each item is answered on a five-point scale from 1 (strongly disagree) to 5 (strongly agree).</w:t>
+        <w:t xml:space="preserve">Administered immediately after each condition, referring to the interface just used.  Items are the standard ten-item instrument of Brooke [5], with the word “system” replaced throughout by “interface” so that participants rate the interaction surface rather than the machine.  Each item is answered on a five-point scale from 1 (strongly disagree) to 5 (strongly agree).</w:t>
       </w:r>
     </w:p>
     <w:p>
@@ -16887,7 +16939,7 @@
         <w:t xml:space="preserve"> </w:t>
       </w:r>
       <w:r>
-        <w:t xml:space="preserve">For odd-numbered items, subtract 1 from the response.  For even-numbered items, subtract the response from 5.  Sum the ten adjusted scores and multiply by 2.5, giving a value from 0 to 100.  This value is not a percentage; interpretation follows Sauro and Lewis [39].</w:t>
+        <w:t xml:space="preserve">For odd-numbered items, subtract 1 from the response.  For even-numbered items, subtract the response from 5.  Sum the ten adjusted scores and multiply by 2.5, giving a value from 0 to 100.  This value is not a percentage; interpretation follows Sauro and Lewis [40].</w:t>
       </w:r>
     </w:p>
     <w:bookmarkStart w:id="137" w:name="appendix-b"/>
@@ -16913,7 +16965,7 @@
         <w:pStyle w:val="BodyText"/>
       </w:pPr>
       <w:r>
-        <w:t xml:space="preserve">Administered immediately after each condition, referring to the set of tasks just completed.  Six subscales are rated on a twenty-one-point scale presented as a line divided into equal intervals and scored 0 to 100 in steps of five.  This study uses the unweighted variant (Raw TLX): the pairwise weighting procedure of the original instrument [14] is omitted, and the composite workload score is the arithmetic mean of the six subscale ratings.  All six subscales, including Performance (anchored from Perfect to Failure), run from low to high workload, so no subscale is reverse-scored.</w:t>
+        <w:t xml:space="preserve">Administered immediately after each condition, referring to the set of tasks just completed.  Six subscales are rated on a twenty-one-point scale presented as a line divided into equal intervals and scored 0 to 100 in steps of five.  This study uses the unweighted variant (Raw TLX): the pairwise weighting procedure of the original instrument [15] is omitted, and the composite workload score is the arithmetic mean of the six subscale ratings.  All six subscales, including Performance (anchored from Perfect to Failure), run from low to high workload, so no subscale is reverse-scored.</w:t>
       </w:r>
     </w:p>
     <w:p>

</xml_diff>

<commit_message>
docs(thesis): fix the seventh pass/fail check's high and medium findings
Chapter 1: the 31% is the study's own pattern-list baseline, set apart from the shipped checks' 73% to 97%; the seven analyzer defects found after the evaluation disclosed in the limitations; the model-generated partition no longer called an earlier build.
Chapter 2: CoLiS checks Debian-policy properties, idempotence among them (checked against the HAL abstract); the search of vendor documentation and repositories for shipped guards stated.
Chapter 3: error rate's denominator is tasks presented; RQ2's evidence named by defined metrics; per-shape silent loss and uncovered losses reported from round 7; the model-generated partition re-scored with the final analyzer and undo (0 of 720 decisions changed; PR #88).
</commit_message>
<xml_diff>
--- a/thesis 1/consolidated/SynapseOS_Proposal_Chapters_1_to_3.docx
+++ b/thesis 1/consolidated/SynapseOS_Proposal_Chapters_1_to_3.docx
@@ -2408,7 +2408,7 @@
         <w:t xml:space="preserve"> </w:t>
       </w:r>
       <w:r>
-        <w:t xml:space="preserve">Coding assistants and other agents that execute generated commands guard them with lists of dangerous patterns, which on this study’s corpus let 31% of the file-destroying commands run with neither a confirmation nor a capture, and the checks of Codex CLI and cc-safety-net 73% to 97% across their presets (Section 1.5) [21, 32].  The recoverability analysis can be placed in front of any system that runs generated Bash commands on a Debian-like Linux system, the setting studied here (Section 1.7), and it adds what a list cannot: a capture, taken before the command runs, from which the command can be undone.</w:t>
+        <w:t xml:space="preserve">Coding assistants and other agents that execute generated commands guard them with lists of dangerous patterns: on this study’s corpus the shipped checks of Codex CLI and cc-safety-net let 73% to 97% of the file-destroying commands run with neither a confirmation nor a capture, across their presets, and even a pattern list built for this study as a baseline let 31% through (Section 1.5) [21, 32].  The recoverability analysis can be placed in front of any system that runs generated Bash commands on a Debian-like Linux system, the setting studied here (Section 1.7), and it adds what a list cannot: a capture, taken before the command runs, from which the command can be undone.</w:t>
       </w:r>
     </w:p>
     <w:p>
@@ -2536,7 +2536,7 @@
         <w:pStyle w:val="BodyText"/>
       </w:pPr>
       <w:r>
-        <w:t xml:space="preserve">The following limitations are acknowledged, those of the analysis first.  First, the recoverability analysis treats anything it cannot determine as unrecoverable, and so protects such commands only by asking first: code run by an interpreter, programs it does not model, and variables with no value are of this kind.  Of the 325 file-destroying commands in the corpus, 34 (10.5%) are protected only this way (Chapter 3, Section 3.1(d), lists them by cause), and undo restored 630 of the 631 commands executed in the recovery check, the one failure being reported in Chapter 3.  Second, its per-command rules are a hand-written enumeration, which its composition builds on rather than replaces, and it resolves a command’s targets shortly before the command runs, so a file changed by another process in the interval is captured as it was when resolved.  Third, it is evaluated on a corpus of human-written commands from NL2Bash, templates written by the same team that wrote its rule table and the pattern-list baseline, and commands whose effects lie outside the filesystem; each label describes what a command did on its</w:t>
+        <w:t xml:space="preserve">The following limitations are acknowledged, those of the analysis first.  First, the recoverability analysis treats anything it cannot determine as unrecoverable, and so protects such commands only by asking first: code run by an interpreter, programs it does not model, and variables with no value are of this kind.  Of the 325 file-destroying commands in the corpus, 34 (10.5%) are protected only this way (Chapter 3, Section 3.1(d), lists them by cause), and undo restored 630 of the 631 commands executed in the recovery check, the one failure being reported in Chapter 3.  Second, its per-command rules are a hand-written enumeration, which its composition builds on rather than replaces, and it resolves a command’s targets shortly before the command runs, so a file changed by another process in the interval is captured as it was when resolved; and testing after the evaluation found seven defects in the analysis, all fixed, none triggered by any command in the corpus, so that re-running it changed no decision (Chapter 3, Section 3.1(d)).  Third, it is evaluated on a corpus of human-written commands from NL2Bash, templates written by the same team that wrote its rule table and the pattern-list baseline, and commands whose effects lie outside the filesystem; each label describes what a command did on its</w:t>
       </w:r>
       <w:r>
         <w:t xml:space="preserve"> </w:t>
@@ -2549,7 +2549,7 @@
         <w:t xml:space="preserve">fixture</w:t>
       </w:r>
       <w:r>
-        <w:t xml:space="preserve">, the files and directories prepared for it to run on, not on every possible filesystem, and the labels of the 80 external commands, a fifth of the 405 behind the silent-loss result, are assigned from a table rather than observed, so they are weaker evidence than the 697 observed in the sandbox.  Nor does it ask less often than the pattern list, which it does not significantly exceed (32 to 45 against 30 of 372), or than the coding-agent checks (1 to 15); and the deployed gate, which also consults the pattern list, asks about 58 to 67 (16% to 18%), still well below the fail-closed list’s 27%.  Its corpus was written by people, not by the model: a smaller partition of commands the deployed model wrote pointed the same way, but there the analysis let one loss through, on a command that partition’s own labeling rule mislabeled, and its advantage in capture coverage over the pattern list was not significant; it rests on 19 losses and an earlier build of the analysis (Chapter 3, Section 3.1(d)).  These threats and their mitigations are stated in Chapter 3, Section 3.1(e).  Fourth, the recovery plan is minimum-cost relative to the capture mechanisms and cost model stated in Chapter 3, Section 2.1(c), not over every conceivable way of restoring a system.  Fifth, the platform offers two confirmation policies over the analysis’s verdict, a</w:t>
+        <w:t xml:space="preserve">, the files and directories prepared for it to run on, not on every possible filesystem, and the labels of the 80 external commands, a fifth of the 405 behind the silent-loss result, are assigned from a table rather than observed, so they are weaker evidence than the 697 observed in the sandbox.  Nor does it ask less often than the pattern list, which it does not significantly exceed (32 to 45 against 30 of 372), or than the coding-agent checks (1 to 15); and the deployed gate, which also consults the pattern list, asks about 58 to 67 (16% to 18%), still well below the fail-closed list’s 27%.  Its corpus was written by people, not by the model: a smaller partition of commands the deployed model wrote pointed the same way, but there the analysis let one loss through, on a command that partition’s own labeling rule mislabeled, and its advantage in capture coverage over the pattern list was not significant; it rests on 19 losses (Chapter 3, Section 3.1(d)).  These threats and their mitigations are stated in Chapter 3, Section 3.1(e).  Fourth, the recovery plan is minimum-cost relative to the capture mechanisms and cost model stated in Chapter 3, Section 2.1(c), not over every conceivable way of restoring a system.  Fifth, the platform offers two confirmation policies over the analysis’s verdict, a</w:t>
       </w:r>
       <w:r>
         <w:t xml:space="preserve"> </w:t>
@@ -2725,7 +2725,7 @@
         <w:pStyle w:val="BodyText"/>
       </w:pPr>
       <w:r>
-        <w:t xml:space="preserve">Candidate works were identified through language-model-assisted search across arXiv, the ACM Digital Library, IEEE Xplore, and the ACL Anthology, extended by backward and forward citation chaining from each work that met the criteria above.  This review is therefore a narrative review rather than a systematic one, and the search is not claimed to be exhaustive.  Because assisted search can surface plausible but non-existent references, and can attribute to a source a claim that source does not make, every work cited in this chapter was subsequently verified by hand against its primary record — author list, venue, and year — and, where a specific claim is attributed to a work, against the presence of that claim in the work’s own text.  That verification pass corrected errors of both attribution and currency introduced by the initial search, and it is reported here because the reliability of this chapter rests on it rather than on the discovery method.  The limitation this leaves is one of recall rather than accuracy: assisted search favors well-indexed and heavily cited work, so the corpus may under-represent less visible literature.  The absence claims in §2.9 are accordingly scoped to the surveyed corpus and stated as such, rather than as claims about the literature as a whole.  The chapter first sets out the theoretical frameworks (§2.2), then proceeds thematically — historical foundations and the case against natural-language interaction (§2.3), natural-language-to-shell translation (§2.4), command safety, static analysis of shell commands, and recovery mechanisms, the literature closest to the study’s algorithm (§2.5), graphical and computer-using agents (§2.6), accessibility and speech-driven interaction (§2.7), and evaluation environments (§2.8) — before synthesizing the surveyed works into a statement of the research gap and a comparative analysis (§2.9).  It closes with a review of the methodological literature that informs the validation study (§2.10) and a summary that motivates the methodology detailed in Chapter 3 (§2.11).</w:t>
+        <w:t xml:space="preserve">Candidate works were identified through language-model-assisted search across arXiv, the ACM Digital Library, IEEE Xplore, and the ACL Anthology, extended by backward and forward citation chaining from each work that met the criteria above.  Shipped systems that guard or recover from agents’ commands are documented outside those databases, so vendor documentation and open-source repositories were also searched directly for command guards and recovery mechanisms, as of October 2026; ANOLISA, Codex CLI, and cc-safety-net were found this way.  This review is therefore a narrative review rather than a systematic one, and the search is not claimed to be exhaustive.  Because assisted search can surface plausible but non-existent references, and can attribute to a source a claim that source does not make, every work cited in this chapter was subsequently verified by hand against its primary record — author list, venue, and year — and, where a specific claim is attributed to a work, against the presence of that claim in the work’s own text.  That verification pass corrected errors of both attribution and currency introduced by the initial search, and it is reported here because the reliability of this chapter rests on it rather than on the discovery method.  The limitation this leaves is one of recall rather than accuracy: assisted search favors well-indexed and heavily cited work, so the corpus may under-represent less visible literature.  The absence claims in §2.9 are accordingly scoped to the surveyed corpus and stated as such, rather than as claims about the literature as a whole.  The chapter first sets out the theoretical frameworks (§2.2), then proceeds thematically — historical foundations and the case against natural-language interaction (§2.3), natural-language-to-shell translation (§2.4), command safety, static analysis of shell commands, and recovery mechanisms, the literature closest to the study’s algorithm (§2.5), graphical and computer-using agents (§2.6), accessibility and speech-driven interaction (§2.7), and evaluation environments (§2.8) — before synthesizing the surveyed works into a statement of the research gap and a comparative analysis (§2.9).  It closes with a review of the methodological literature that informs the validation study (§2.10) and a summary that motivates the methodology detailed in Chapter 3 (§2.11).</w:t>
       </w:r>
     </w:p>
     <w:bookmarkEnd w:id="42"/>
@@ -2866,7 +2866,7 @@
               <a:graphicData uri="http://schemas.openxmlformats.org/drawingml/2006/picture">
                 <pic:pic>
                   <pic:nvPicPr>
-                    <pic:cNvPr descr="/tmp/claude-1000/-home-willard-projects-thesis/cb82e7af-8c35-489a-a7f7-ef49172efea2/scratchpad/docx/w13/fig0.png" id="46" name="Picture"/>
+                    <pic:cNvPr descr="/tmp/claude-1000/-home-willard-projects-thesis/cb82e7af-8c35-489a-a7f7-ef49172efea2/scratchpad/docx/w14/fig0.png" id="46" name="Picture"/>
                     <pic:cNvPicPr>
                       <a:picLocks noChangeArrowheads="1" noChangeAspect="1"/>
                     </pic:cNvPicPr>
@@ -3304,7 +3304,7 @@
         <w:pStyle w:val="FirstParagraph"/>
       </w:pPr>
       <w:r>
-        <w:t xml:space="preserve">Static analysis of shell scripts specifically is comparatively little studied, and the existing work targets properties adjacent to recoverability rather than recoverability itself.  ABash [28] performs abstract interpretation over bash’s variable-expansion semantics to catch common expansion bugs and includes taint tracking, but is not concerned with what a script’s commands would do to the filesystem if executed correctly.  Smoosh [12] gives the POSIX shell a mechanized, executable small-step operational semantics, validated against other shells' conformance test suites — exactly the kind of ground-truth semantics a static effect analysis would need to be checked against — but stops at defining that semantics rather than analyzing programs written in it.  Closest of the three is CoLiS [2], which applies symbolic execution to the more than twenty-seven thousand POSIX-shell maintainer scripts in the Debian package archive to verify</w:t>
+        <w:t xml:space="preserve">Static analysis of shell scripts specifically is comparatively little studied, and the existing work targets properties adjacent to recoverability rather than recoverability itself.  ABash [28] performs abstract interpretation over bash’s variable-expansion semantics to catch common expansion bugs and includes taint tracking, but is not concerned with what a script’s commands would do to the filesystem if executed correctly.  Smoosh [12] gives the POSIX shell a mechanized, executable small-step operational semantics, validated against other shells' conformance test suites — exactly the kind of ground-truth semantics a static effect analysis would need to be checked against — but stops at defining that semantics rather than analyzing programs written in it.  Closest of the three is CoLiS [2], which applies symbolic execution to the more than twenty-seven thousand POSIX-shell maintainer scripts in the Debian package archive to find violations of the properties Debian policy requires of these scripts, which run with root privileges during install, upgrade, and removal; among those properties is</w:t>
       </w:r>
       <w:r>
         <w:t xml:space="preserve"> </w:t>
@@ -3317,10 +3317,7 @@
         <w:t xml:space="preserve">idempotence</w:t>
       </w:r>
       <w:r>
-        <w:t xml:space="preserve"> </w:t>
-      </w:r>
-      <w:r>
-        <w:t xml:space="preserve">— that running a script a second time causes no further harm — a property Debian policy requires of these scripts because they run with root privileges during install, upgrade, and removal.  Idempotence and recoverability are related but distinct: a script can be idempotent while still being destructive on its first run —</w:t>
+        <w:t xml:space="preserve">, that running a script a second time causes no further harm.  Idempotence and recoverability are related but distinct: a script can be idempotent while still being destructive on its first run —</w:t>
       </w:r>
       <w:r>
         <w:t xml:space="preserve"> </w:t>
@@ -3720,7 +3717,7 @@
               <w:jc w:val="left"/>
             </w:pPr>
             <w:r>
-              <w:t xml:space="preserve">Partly: CoLiS, for idempotence</w:t>
+              <w:t xml:space="preserve">Partly: CoLiS, for policy properties such as idempotence</w:t>
             </w:r>
           </w:p>
         </w:tc>
@@ -6636,7 +6633,7 @@
               <a:graphicData uri="http://schemas.openxmlformats.org/drawingml/2006/picture">
                 <pic:pic>
                   <pic:nvPicPr>
-                    <pic:cNvPr descr="/tmp/claude-1000/-home-willard-projects-thesis/cb82e7af-8c35-489a-a7f7-ef49172efea2/scratchpad/docx/w13/fig1.png" id="79" name="Picture"/>
+                    <pic:cNvPr descr="/tmp/claude-1000/-home-willard-projects-thesis/cb82e7af-8c35-489a-a7f7-ef49172efea2/scratchpad/docx/w14/fig1.png" id="79" name="Picture"/>
                     <pic:cNvPicPr>
                       <a:picLocks noChangeArrowheads="1" noChangeAspect="1"/>
                     </pic:cNvPicPr>
@@ -11503,7 +11500,7 @@
         <w:pStyle w:val="FirstParagraph"/>
       </w:pPr>
       <w:r>
-        <w:t xml:space="preserve">The analysis is evaluated on the command corpus of Section 1.1(a) and 1.2(a)–(b), against the baselines in (a), by the metrics in (b) and the statistics in (c); (d) reports the results, and (e) the threats specific to this evaluation.  The evaluation answers RQ4 directly, and it supplies the evidence for RQ2 and RQ3: whether a command’s effects can be derived before it runs shows in silent loss and composition coverage, and whether the plan restores, in capture coverage verified by sandboxed undo.</w:t>
+        <w:t xml:space="preserve">The analysis is evaluated on the command corpus of Section 1.1(a) and 1.2(a)–(b), against the baselines in (a), by the metrics in (b) and the statistics in (c); (d) reports the results, and (e) the threats specific to this evaluation.  The evaluation answers RQ4 directly, and it supplies the evidence for RQ2 and RQ3: whether a command’s effects can be derived before it runs shows in silent loss and capture coverage, overall and for each command shape, and whether the plan restores, in capture coverage verified by sandboxed undo.</w:t>
       </w:r>
     </w:p>
     <w:bookmarkStart w:id="107" w:name="a-baselines"/>
@@ -12220,7 +12217,7 @@
         <w:pStyle w:val="BodyText"/>
       </w:pPr>
       <w:r>
-        <w:t xml:space="preserve">The pooled figures hold within each partition.  On the 150 losses among the human-written NL2Bash commands the analysis let none through silently and covered 133 (88.7%); on the 175 among the templates, written by the same team as its rule table, it let none through and covered 158 (90.3%).  The pattern list let 40% of the NL2Bash losses, 23% of the template losses, and 84% of the 80 external commands run silently.  Under the capture policy the analysis asked needlessly on 8% of the harmless NL2Bash commands and 10% of the harmless templates.  The same figures for every system, and for each command shape, are provided as supplementary material.</w:t>
+        <w:t xml:space="preserve">The pooled figures hold within each partition.  On the 150 losses among the human-written NL2Bash commands the analysis let none through silently and covered 133 (88.7%); on the 175 among the templates, written by the same team as its rule table, it let none through and covered 158 (90.3%).  The pattern list let 40% of the NL2Bash losses, 23% of the template losses, and 84% of the 80 external commands run silently.  Under the capture policy the analysis asked needlessly on 8% of the harmless NL2Bash commands and 10% of the harmless templates.  By command shape, of the 405 commands that lose something or act outside the filesystem, the pattern list let through silently 4 of the 34 compound lines, 5 of the 29 hidden effects, 53 of the 164 commands with run-time targets, 37 of the 85 plain commands, 1 of the 13 redirections, and 67 of the 80 external commands; the analysis let none through in any shape, and the 34 file-destroying commands it asked about without a capture are 6 compound lines, 8 hidden effects, 15 with run-time targets, and 5 plain commands.  The same figures for every system are provided as supplementary material.</w:t>
       </w:r>
     </w:p>
     <w:p>
@@ -12676,7 +12673,7 @@
         <w:pStyle w:val="BodyText"/>
       </w:pPr>
       <w:r>
-        <w:t xml:space="preserve">On the model-generated partition the results have the same shape but rest on few losses, and on an earlier version of the analyser: this partition was generated with the analyzer and undo of round 6, the third corpus above, before that round’s recovery check led to its five undo fixes and before the seven analyzer defects found after round 7 were fixed, and it was not regenerated with the final build for this draft, so its numbers should be read as indicative rather than as part of the reported result.  The deployed 3B model was asked for a command for each of 350 randomly drawn NL2Bash descriptions.  Of the commands it returned, 165 ran cleanly and were labeled, 15 were external, and the rest were excluded because they exited non-zero, timed out, needed a program that is not installed, or wrote outside the fixture.  Only 19 of the 165 lost anything: the model’s commands are mostly read-only.  On those, and the 15 external ones (34 in all), the pattern list let 20 through silently (58.8%, interval 42.2–73.6%) and the fail-closed list and the analysis one each (2.9%, 0.5–14.9%), a listing this partition’s own external-partition rule mislabeled as device access.  The analysis planned a capture that the undo then restored exactly for 17 of the 19 losses (89.5%, 68.6–97.1%), against 10 for the pattern list (52.6%, 31.7–72.7%) and none for the fail-closed list; the undo restored all 149 executed commands.  With 19 losses the intervals are wide, and the comparison of coverage against the pattern list is not significant after correction (Holm-adjusted p = 0.13); the other three comparisons agree with the larger corpus (adjusted p = 1.5×10</w:t>
+        <w:t xml:space="preserve">On the model-generated partition the results have the same shape but rest on few losses.  Its commands were generated during round 6, the third corpus above; they were scored then with that round’s analyzer and undo, and scored again with the final analyzer, after the seven defects found after round 7 were fixed, and its undo, which changed none of its 720 decisions (180 commands under each of the four systems scored) and none of the figures below.  The deployed 3B model was asked for a command for each of 350 randomly drawn NL2Bash descriptions.  Of the commands it returned, 165 ran cleanly and were labeled, 15 were external, and the rest were excluded because they exited non-zero, timed out, needed a program that is not installed, or wrote outside the fixture.  Only 19 of the 165 lost anything: the model’s commands are mostly read-only.  On those, and the 15 external ones (34 in all), the pattern list let 20 through silently (58.8%, interval 42.2–73.6%) and the fail-closed list and the analysis one each (2.9%, 0.5–14.9%), a listing this partition’s own external-partition rule mislabeled as device access.  The analysis planned a capture that the undo then restored exactly for 17 of the 19 losses (89.5%, 68.6–97.1%), against 10 for the pattern list (52.6%, 31.7–72.7%) and none for the fail-closed list; the undo restored all 149 executed commands.  With 19 losses the intervals are wide, and the comparison of coverage against the pattern list is not significant after correction (Holm-adjusted p = 0.13); the other three comparisons agree with the larger corpus (adjusted p = 1.5×10</w:t>
       </w:r>
       <w:r>
         <w:rPr>
@@ -13873,7 +13870,7 @@
         <w:pStyle w:val="FirstParagraph"/>
       </w:pPr>
       <w:r>
-        <w:t xml:space="preserve">Error rate is computed as the proportion of task attempts resulting in failure or incorrect outcome:</w:t>
+        <w:t xml:space="preserve">Error rate is computed as the proportion of tasks presented that end in failure or an incorrect outcome:</w:t>
       </w:r>
     </w:p>
     <w:p>

</xml_diff>

<commit_message>
docs(thesis): fix the eighth pass/fail check's high and medium findings
Chapter 2: Table 2.2 gains AXIS and the GUI-vs-CLI comparison, on which the fourth gap rests.
Chapter 3: the stale 'earlier build' limit replaced by what is true after the re-score (generated before the freeze, re-scored with no change); each platform measure's confirmatory test is its mixed model's condition term, the paired tests are sensitivity checks, and the paired-t power figure approximates it.
</commit_message>
<xml_diff>
--- a/thesis 1/consolidated/SynapseOS_Proposal_Chapters_1_to_3.docx
+++ b/thesis 1/consolidated/SynapseOS_Proposal_Chapters_1_to_3.docx
@@ -2866,7 +2866,7 @@
               <a:graphicData uri="http://schemas.openxmlformats.org/drawingml/2006/picture">
                 <pic:pic>
                   <pic:nvPicPr>
-                    <pic:cNvPr descr="/tmp/claude-1000/-home-willard-projects-thesis/cb82e7af-8c35-489a-a7f7-ef49172efea2/scratchpad/docx/w14/fig0.png" id="46" name="Picture"/>
+                    <pic:cNvPr descr="/tmp/claude-1000/-home-willard-projects-thesis/cb82e7af-8c35-489a-a7f7-ef49172efea2/scratchpad/docx/w15/fig0.png" id="46" name="Picture"/>
                     <pic:cNvPicPr>
                       <a:picLocks noChangeArrowheads="1" noChangeAspect="1"/>
                     </pic:cNvPicPr>
@@ -6112,6 +6112,154 @@
           </w:p>
         </w:tc>
       </w:tr>
+      <w:tr>
+        <w:tc>
+          <w:tcPr/>
+          <w:p>
+            <w:pPr>
+              <w:pStyle w:val="Compact"/>
+              <w:jc w:val="left"/>
+            </w:pPr>
+            <w:r>
+              <w:t xml:space="preserve">Lu et al. [26]</w:t>
+            </w:r>
+          </w:p>
+        </w:tc>
+        <w:tc>
+          <w:tcPr/>
+          <w:p>
+            <w:pPr>
+              <w:pStyle w:val="Compact"/>
+              <w:jc w:val="left"/>
+            </w:pPr>
+            <w:r>
+              <w:t xml:space="preserve">AXIS</w:t>
+            </w:r>
+          </w:p>
+        </w:tc>
+        <w:tc>
+          <w:tcPr/>
+          <w:p>
+            <w:pPr>
+              <w:pStyle w:val="Compact"/>
+              <w:jc w:val="left"/>
+            </w:pPr>
+            <w:r>
+              <w:t xml:space="preserve">Single application (Microsoft Word)</w:t>
+            </w:r>
+          </w:p>
+        </w:tc>
+        <w:tc>
+          <w:tcPr/>
+          <w:p>
+            <w:pPr>
+              <w:pStyle w:val="Compact"/>
+              <w:jc w:val="left"/>
+            </w:pPr>
+            <w:r>
+              <w:t xml:space="preserve">API-first agent, cloud-hosted frontier model</w:t>
+            </w:r>
+          </w:p>
+        </w:tc>
+        <w:tc>
+          <w:tcPr/>
+          <w:p>
+            <w:pPr>
+              <w:pStyle w:val="Compact"/>
+              <w:jc w:val="left"/>
+            </w:pPr>
+            <w:r>
+              <w:t xml:space="preserve">Within-subjects user study against manual operation</w:t>
+            </w:r>
+          </w:p>
+        </w:tc>
+        <w:tc>
+          <w:tcPr/>
+          <w:p>
+            <w:pPr>
+              <w:pStyle w:val="Compact"/>
+              <w:jc w:val="left"/>
+            </w:pPr>
+            <w:r>
+              <w:t xml:space="preserve">One application, one platform</w:t>
+            </w:r>
+          </w:p>
+        </w:tc>
+      </w:tr>
+      <w:tr>
+        <w:tc>
+          <w:tcPr/>
+          <w:p>
+            <w:pPr>
+              <w:pStyle w:val="Compact"/>
+              <w:jc w:val="left"/>
+            </w:pPr>
+            <w:r>
+              <w:t xml:space="preserve">Zhou et al. [58]</w:t>
+            </w:r>
+          </w:p>
+        </w:tc>
+        <w:tc>
+          <w:tcPr/>
+          <w:p>
+            <w:pPr>
+              <w:pStyle w:val="Compact"/>
+              <w:jc w:val="left"/>
+            </w:pPr>
+            <w:r>
+              <w:t xml:space="preserve">GUI vs. CLI agents</w:t>
+            </w:r>
+          </w:p>
+        </w:tc>
+        <w:tc>
+          <w:tcPr/>
+          <w:p>
+            <w:pPr>
+              <w:pStyle w:val="Compact"/>
+              <w:jc w:val="left"/>
+            </w:pPr>
+            <w:r>
+              <w:t xml:space="preserve">Desktop (440 matched tasks)</w:t>
+            </w:r>
+          </w:p>
+        </w:tc>
+        <w:tc>
+          <w:tcPr/>
+          <w:p>
+            <w:pPr>
+              <w:pStyle w:val="Compact"/>
+              <w:jc w:val="left"/>
+            </w:pPr>
+            <w:r>
+              <w:t xml:space="preserve">Screen-only GUI agents; CLI agents with and without verifier-guided skill augmentation</w:t>
+            </w:r>
+          </w:p>
+        </w:tc>
+        <w:tc>
+          <w:tcPr/>
+          <w:p>
+            <w:pPr>
+              <w:pStyle w:val="Compact"/>
+              <w:jc w:val="left"/>
+            </w:pPr>
+            <w:r>
+              <w:t xml:space="preserve">Agent benchmark</w:t>
+            </w:r>
+          </w:p>
+        </w:tc>
+        <w:tc>
+          <w:tcPr/>
+          <w:p>
+            <w:pPr>
+              <w:pStyle w:val="Compact"/>
+              <w:jc w:val="left"/>
+            </w:pPr>
+            <w:r>
+              <w:t xml:space="preserve">Agents, not people using an interface</w:t>
+            </w:r>
+          </w:p>
+        </w:tc>
+      </w:tr>
     </w:tbl>
     <w:p>
       <w:pPr>
@@ -6633,7 +6781,7 @@
               <a:graphicData uri="http://schemas.openxmlformats.org/drawingml/2006/picture">
                 <pic:pic>
                   <pic:nvPicPr>
-                    <pic:cNvPr descr="/tmp/claude-1000/-home-willard-projects-thesis/cb82e7af-8c35-489a-a7f7-ef49172efea2/scratchpad/docx/w14/fig1.png" id="79" name="Picture"/>
+                    <pic:cNvPr descr="/tmp/claude-1000/-home-willard-projects-thesis/cb82e7af-8c35-489a-a7f7-ef49172efea2/scratchpad/docx/w15/fig1.png" id="79" name="Picture"/>
                     <pic:cNvPicPr>
                       <a:picLocks noChangeArrowheads="1" noChangeAspect="1"/>
                     </pic:cNvPicPr>
@@ -12721,7 +12869,7 @@
         <w:t xml:space="preserve"> </w:t>
       </w:r>
       <w:r>
-        <w:t xml:space="preserve">— and it asks on these by construction.  A large share of NL2Bash candidates are excluded because they name paths or programs the fixture cannot supply, which biases that partition toward commands that run on a small tree.  The external partition is assigned by a table of state-changing tools and not observed, so its labels are only as good as the table, as the model-generated partition’s one error shows.  And the model-generated partition above was scored against an earlier build of the analyser, not the one the primary result was frozen against.</w:t>
+        <w:t xml:space="preserve">— and it asks on these by construction.  A large share of NL2Bash candidates are excluded because they name paths or programs the fixture cannot supply, which biases that partition toward commands that run on a small tree.  The external partition is assigned by a table of state-changing tools and not observed, so its labels are only as good as the table, as the model-generated partition’s one error shows.  And the model-generated partition’s commands were generated in round 6, before the analyzer was frozen; re-scoring them with the final analyzer changed no decision, but they were not drawn after the freeze.</w:t>
       </w:r>
     </w:p>
     <w:bookmarkEnd w:id="110"/>
@@ -13886,7 +14034,7 @@
         <w:pStyle w:val="BodyText"/>
       </w:pPr>
       <w:r>
-        <w:t xml:space="preserve">Error events are further categorized by type: intent parsing errors (incorrect bash command generated), execution errors (bash subprocess failure), and recovery failures (an undo that does not restore the prior state).  Retries are recorded separately as attempts and do not change the rate, whose denominator is the number of tasks presented, not attempted (Section 2.2).  The same paired statistical test is applied to error rate differences between conditions.</w:t>
+        <w:t xml:space="preserve">Error events are further categorized by type: intent parsing errors (incorrect bash command generated), execution errors (bash subprocess failure), and recovery failures (an undo that does not restore the prior state).  Retries are recorded separately as attempts and do not change the rate, whose denominator is the number of tasks presented, not attempted (Section 2.2).  Its difference between conditions is tested by the logistic mixed model of Section 3.6.</w:t>
       </w:r>
     </w:p>
     <w:bookmarkEnd w:id="117"/>
@@ -14122,7 +14270,20 @@
         <w:pStyle w:val="BodyText"/>
       </w:pPr>
       <w:r>
-        <w:t xml:space="preserve">Subgroup analysis is conducted separately for the novice and power user groups to determine whether the effect of the interface condition differs across populations.  The interaction between interface condition and user group is examined to assess whether SynapseOS produces differential effects depending on technical background.  Because condition order and task form are crossed between subjects (Section 1.2(d)), each platform measure is modeled with condition, group, order, and task form as fixed effects and crossed random intercepts for participant and task: error, which is binary per task, by a logistic mixed model; completion time by a linear mixed model on its logarithm; and the SUS and NASA-TLX scores, which are taken once per condition, by a linear mixed model with a random intercept for participant, from which the condition × group and condition × order interactions are read; the paired tests above serve as the per-comparison checks.</w:t>
+        <w:t xml:space="preserve">Subgroup analysis is conducted separately for the novice and power user groups to determine whether the effect of the interface condition differs across populations.  The interaction between interface condition and user group is examined to assess whether SynapseOS produces differential effects depending on technical background.  Because condition order and task form are crossed between subjects (Section 1.2(d)), each platform measure is modeled with condition, group, order, and task form as fixed effects and crossed random intercepts for participant and task: error, which is binary per task, by a logistic mixed model; completion time by a linear mixed model on its logarithm; and the SUS and NASA-TLX scores, which are taken once per condition, by a linear mixed model with a random intercept for participant, from which the condition × group and condition × order interactions are read.  The condition term of each of these models is the confirmatory test for its measure; the paired tests above are sensitivity checks, and the power analysis, computed for a paired</w:t>
+      </w:r>
+      <w:r>
+        <w:t xml:space="preserve"> </w:t>
+      </w:r>
+      <w:r>
+        <w:rPr>
+          <w:i/>
+          <w:iCs/>
+        </w:rPr>
+        <w:t xml:space="preserve">t</w:t>
+      </w:r>
+      <w:r>
+        <w:t xml:space="preserve">-test, approximates the power of the condition term.</w:t>
       </w:r>
     </w:p>
     <w:p>

</xml_diff>

<commit_message>
docs(thesis): fix the ninth pass/fail check's medium findings
Chapter 2: the rm -rf example called destructive, not unrecoverable, in the study's own vocabulary; what the analysis adds over the fail-closed list stated as Chapters 1 and 3 state it.
Chapter 3: Algorithm 1's EFFECTS returns (effects, scope, overlay) and every caller threads them, with JOIN defined and RESOLVE refusing without a sandbox; the hidden shape defined as the generator assigns it, with the shape precedence and why cause and shape count the 34 differently; Holm across the four confirmatory condition terms; the LLM equivalence judgment replaced by a fixed rubric applied by two people.
</commit_message>
<xml_diff>
--- a/thesis 1/consolidated/SynapseOS_Proposal_Chapters_1_to_3.docx
+++ b/thesis 1/consolidated/SynapseOS_Proposal_Chapters_1_to_3.docx
@@ -800,7 +800,7 @@
         <w:tab/>
       </w:r>
       <w:r>
-        <w:t xml:space="preserve">65</w:t>
+        <w:t xml:space="preserve">66</w:t>
       </w:r>
     </w:p>
     <w:p>
@@ -820,7 +820,7 @@
         <w:tab/>
       </w:r>
       <w:r>
-        <w:t xml:space="preserve">82</w:t>
+        <w:t xml:space="preserve">83</w:t>
       </w:r>
     </w:p>
     <w:p>
@@ -840,7 +840,7 @@
         <w:tab/>
       </w:r>
       <w:r>
-        <w:t xml:space="preserve">104</w:t>
+        <w:t xml:space="preserve">105</w:t>
       </w:r>
     </w:p>
     <w:p>
@@ -860,7 +860,7 @@
         <w:tab/>
       </w:r>
       <w:r>
-        <w:t xml:space="preserve">111</w:t>
+        <w:t xml:space="preserve">112</w:t>
       </w:r>
     </w:p>
     <w:bookmarkStart w:id="24" w:name="list-of-tables"/>
@@ -989,7 +989,7 @@
         <w:tab/>
       </w:r>
       <w:r>
-        <w:t xml:space="preserve">84</w:t>
+        <w:t xml:space="preserve">85</w:t>
       </w:r>
     </w:p>
     <w:p>
@@ -1009,7 +1009,7 @@
         <w:tab/>
       </w:r>
       <w:r>
-        <w:t xml:space="preserve">89</w:t>
+        <w:t xml:space="preserve">90</w:t>
       </w:r>
     </w:p>
     <w:p>
@@ -1029,7 +1029,7 @@
         <w:tab/>
       </w:r>
       <w:r>
-        <w:t xml:space="preserve">94</w:t>
+        <w:t xml:space="preserve">95</w:t>
       </w:r>
     </w:p>
     <w:p>
@@ -1049,7 +1049,7 @@
         <w:tab/>
       </w:r>
       <w:r>
-        <w:t xml:space="preserve">114</w:t>
+        <w:t xml:space="preserve">115</w:t>
       </w:r>
     </w:p>
     <w:p>
@@ -1069,7 +1069,7 @@
         <w:tab/>
       </w:r>
       <w:r>
-        <w:t xml:space="preserve">116</w:t>
+        <w:t xml:space="preserve">117</w:t>
       </w:r>
     </w:p>
     <w:bookmarkEnd w:id="24"/>
@@ -2866,7 +2866,7 @@
               <a:graphicData uri="http://schemas.openxmlformats.org/drawingml/2006/picture">
                 <pic:pic>
                   <pic:nvPicPr>
-                    <pic:cNvPr descr="/tmp/claude-1000/-home-willard-projects-thesis/cb82e7af-8c35-489a-a7f7-ef49172efea2/scratchpad/docx/w15/fig0.png" id="46" name="Picture"/>
+                    <pic:cNvPr descr="/tmp/claude-1000/-home-willard-projects-thesis/cb82e7af-8c35-489a-a7f7-ef49172efea2/scratchpad/docx/w16/fig0.png" id="46" name="Picture"/>
                     <pic:cNvPicPr>
                       <a:picLocks noChangeArrowheads="1" noChangeAspect="1"/>
                     </pic:cNvPicPr>
@@ -3278,7 +3278,7 @@
         <w:t xml:space="preserve">&amp;&amp;</w:t>
       </w:r>
       <w:r>
-        <w:t xml:space="preserve">, with redirects and command substitution altering what each actually touches.  No enumeration of command prefixes expresses that, and extending the list does not converge: each newly named tool leaves the next one unnamed.  Determining recoverability over a composed command, and computing the minimal information needed to reverse it, is the open problem this study takes up (RQ1–RQ3), and it is what separates the present work from the guardrail designs surveyed above.  The comparison that matters is not only against an enumerated list of dangerous commands.  A list can be turned around so that it asks before every command it does not recognize as read-only, which removes the first weakness above at the cost of asking about everything unfamiliar; that fail-closed list is the strongest simple baseline, and the study therefore claims what the analysis adds to it — seeing through wrappers, resolving run-time targets, and capturing exactly what would be lost — and not the verdict alone.</w:t>
+        <w:t xml:space="preserve">, with redirects and command substitution altering what each actually touches.  No enumeration of command prefixes expresses that, and extending the list does not converge: each newly named tool leaves the next one unnamed.  Determining recoverability over a composed command, and computing the minimal information needed to reverse it, is the open problem this study takes up (RQ1–RQ3), and it is what separates the present work from the guardrail designs surveyed above.  The comparison that matters is not only against an enumerated list of dangerous commands.  A list can be turned around so that it asks before every command it does not recognize as read-only, which removes the first weakness above at the cost of asking about everything unfamiliar; that fail-closed list is the strongest simple baseline, and the study therefore claims what the analysis adds to it — capturing what would be lost so that undo restores it, and asking far less often, both of which composition and resolution make possible — and not the verdict alone.</w:t>
       </w:r>
     </w:p>
     <w:p>
@@ -3333,7 +3333,7 @@
         <w:t xml:space="preserve"> </w:t>
       </w:r>
       <w:r>
-        <w:t xml:space="preserve">is idempotent, since running it twice does no more damage than once, and unrecoverable, since the first run already destroyed what a recovery would need — and a command can be recoverable without being idempotent, if each run produces a new, independently-reversible effect.  CoLiS is therefore the nearest prior application of static effect reasoning to shell scripts specifically, and it stops short of the present study’s question for exactly this reason: verifying that re-execution is safe does not determine whether the first execution can be undone.  No work identified in this review derives a recoverability verdict for a shell command from its statically-computed effects; that is the specific gap the present study’s algorithmic contribution fills.</w:t>
+        <w:t xml:space="preserve">is idempotent, since running it twice does no more damage than once, and destructive: nothing restores it unless what it removes was captured before the first run — and a command can be recoverable without being idempotent, if each run produces a new, independently-reversible effect.  CoLiS is therefore the nearest prior application of static effect reasoning to shell scripts specifically, and it stops short of the present study’s question for exactly this reason: verifying that re-execution is safe does not determine whether the first execution can be undone.  No work identified in this review derives a recoverability verdict for a shell command from its statically-computed effects; that is the specific gap the present study’s algorithmic contribution fills.</w:t>
       </w:r>
     </w:p>
     <w:bookmarkEnd w:id="53"/>
@@ -6781,7 +6781,7 @@
               <a:graphicData uri="http://schemas.openxmlformats.org/drawingml/2006/picture">
                 <pic:pic>
                   <pic:nvPicPr>
-                    <pic:cNvPr descr="/tmp/claude-1000/-home-willard-projects-thesis/cb82e7af-8c35-489a-a7f7-ef49172efea2/scratchpad/docx/w15/fig1.png" id="79" name="Picture"/>
+                    <pic:cNvPr descr="/tmp/claude-1000/-home-willard-projects-thesis/cb82e7af-8c35-489a-a7f7-ef49172efea2/scratchpad/docx/w16/fig1.png" id="79" name="Picture"/>
                     <pic:cNvPicPr>
                       <a:picLocks noChangeArrowheads="1" noChangeAspect="1"/>
                     </pic:cNvPicPr>
@@ -7824,7 +7824,46 @@
         <w:pStyle w:val="BodyText"/>
       </w:pPr>
       <w:r>
-        <w:t xml:space="preserve">A second stratification is by the shape of the command, assigned by the generator from the command’s syntax: a single named command; a chain; one whose targets are computed while it runs; a redirect; one whose effect hides inside an interpreter or a tool the rule table does not name; and one whose effect lies outside the filesystem.  The claims under test concern the composed, run-time, and hidden shapes, and a corpus dominated by plain named commands would measure the strength of a list and not the contribution of the analysis, so results are reported per shape as well as in aggregate.</w:t>
+        <w:t xml:space="preserve">A second stratification is by the shape of the command, assigned by the generator from the command’s syntax: a single named command; a chain; one whose targets are computed while it runs; a redirect; one whose effect hides inside a shell, interpreter, or wrapper it names, such as</w:t>
+      </w:r>
+      <w:r>
+        <w:t xml:space="preserve"> </w:t>
+      </w:r>
+      <w:r>
+        <w:rPr>
+          <w:i/>
+          <w:iCs/>
+        </w:rPr>
+        <w:t xml:space="preserve">sh -c</w:t>
+      </w:r>
+      <w:r>
+        <w:t xml:space="preserve">,</w:t>
+      </w:r>
+      <w:r>
+        <w:t xml:space="preserve"> </w:t>
+      </w:r>
+      <w:r>
+        <w:rPr>
+          <w:i/>
+          <w:iCs/>
+        </w:rPr>
+        <w:t xml:space="preserve">awk</w:t>
+      </w:r>
+      <w:r>
+        <w:t xml:space="preserve">, or</w:t>
+      </w:r>
+      <w:r>
+        <w:t xml:space="preserve"> </w:t>
+      </w:r>
+      <w:r>
+        <w:rPr>
+          <w:i/>
+          <w:iCs/>
+        </w:rPr>
+        <w:t xml:space="preserve">env</w:t>
+      </w:r>
+      <w:r>
+        <w:t xml:space="preserve">; and one whose effect lies outside the filesystem.  A command that fits several is given the first that applies, in the order hidden, run-time, chain, redirect, single; and the shape follows the syntax alone, so a program the rule table does not model is classed by how it is written, not by why the analysis asks about it, which is why the 34 losses the analysis asked about are counted differently by cause and by shape in Section 3.1(d).  The claims under test concern the composed, run-time, and hidden shapes, and a corpus dominated by plain named commands would measure the strength of a list and not the contribution of the analysis, so results are reported per shape as well as in aggregate.</w:t>
       </w:r>
     </w:p>
     <w:bookmarkEnd w:id="87"/>
@@ -9524,7 +9563,13 @@
         <w:t xml:space="preserve"> </w:t>
       </w:r>
       <w:r>
-        <w:t xml:space="preserve">paths, possible only, so a later write there is still captured</w:t>
+        <w:t xml:space="preserve">paths, possible only, so a later write there is still captured;</w:t>
+      </w:r>
+      <w:r>
+        <w:t xml:space="preserve"> </w:t>
+      </w:r>
+      <w:r>
+        <w:t xml:space="preserve">JOIN(S₁, …) makes unknown what the scopes disagree on</w:t>
       </w:r>
       <w:r>
         <w:t xml:space="preserve"> </w:t>
@@ -9534,19 +9579,19 @@
           <w:b/>
           <w:bCs/>
         </w:rPr>
-        <w:t xml:space="preserve">Marks:</w:t>
-      </w:r>
-      <w:r>
-        <w:t xml:space="preserve"> </w:t>
-      </w:r>
-      <w:r>
-        <w:t xml:space="preserve">[C] is off in the composition ablation, which returns {UNKNOWN};</w:t>
-      </w:r>
-      <w:r>
-        <w:t xml:space="preserve"> </w:t>
-      </w:r>
-      <w:r>
-        <w:t xml:space="preserve">[R] is off in the resolution ablation, where RESOLVE returns ⊥</w:t>
+        <w:t xml:space="preserve">Returns:</w:t>
+      </w:r>
+      <w:r>
+        <w:t xml:space="preserve"> </w:t>
+      </w:r>
+      <w:r>
+        <w:t xml:space="preserve">EFFECTS gives (E, S′, V′): the effects, then the scope and</w:t>
+      </w:r>
+      <w:r>
+        <w:t xml:space="preserve"> </w:t>
+      </w:r>
+      <w:r>
+        <w:t xml:space="preserve">overlay after node; a line giving only E means (E, S, V ⊕ E)</w:t>
       </w:r>
       <w:r>
         <w:t xml:space="preserve"> </w:t>
@@ -9556,13 +9601,19 @@
           <w:b/>
           <w:bCs/>
         </w:rPr>
-        <w:t xml:space="preserve">function</w:t>
-      </w:r>
-      <w:r>
-        <w:t xml:space="preserve"> </w:t>
-      </w:r>
-      <w:r>
-        <w:t xml:space="preserve">EFFECTS(node, S, V)</w:t>
+        <w:t xml:space="preserve">Marks:</w:t>
+      </w:r>
+      <w:r>
+        <w:t xml:space="preserve"> </w:t>
+      </w:r>
+      <w:r>
+        <w:t xml:space="preserve">[C] is off in the composition ablation, which returns {UNKNOWN};</w:t>
+      </w:r>
+      <w:r>
+        <w:t xml:space="preserve"> </w:t>
+      </w:r>
+      <w:r>
+        <w:t xml:space="preserve">[R] is off in the resolution ablation, where RESOLVE returns ⊥</w:t>
       </w:r>
       <w:r>
         <w:t xml:space="preserve"> </w:t>
@@ -9572,13 +9623,13 @@
           <w:b/>
           <w:bCs/>
         </w:rPr>
-        <w:t xml:space="preserve">if</w:t>
-      </w:r>
-      <w:r>
-        <w:t xml:space="preserve"> </w:t>
-      </w:r>
-      <w:r>
-        <w:t xml:space="preserve">node = (A &amp;&amp; B)</w:t>
+        <w:t xml:space="preserve">function</w:t>
+      </w:r>
+      <w:r>
+        <w:t xml:space="preserve"> </w:t>
+      </w:r>
+      <w:r>
+        <w:t xml:space="preserve">EFFECTS(node, S, V)</w:t>
       </w:r>
       <w:r>
         <w:t xml:space="preserve"> </w:t>
@@ -9588,31 +9639,13 @@
           <w:b/>
           <w:bCs/>
         </w:rPr>
-        <w:t xml:space="preserve">then</w:t>
-      </w:r>
-      <w:r>
-        <w:t xml:space="preserve"> </w:t>
-      </w:r>
-      <w:r>
-        <w:t xml:space="preserve">// B runs only if A did</w:t>
-      </w:r>
-      <w:r>
-        <w:t xml:space="preserve"> </w:t>
-      </w:r>
-      <w:r>
-        <w:t xml:space="preserve">E</w:t>
-      </w:r>
-      <w:r>
-        <w:rPr>
-          <w:vertAlign w:val="subscript"/>
-        </w:rPr>
-        <w:t xml:space="preserve">A</w:t>
-      </w:r>
-      <w:r>
-        <w:t xml:space="preserve"> </w:t>
-      </w:r>
-      <w:r>
-        <w:t xml:space="preserve">← EFFECTS(A, S, V)</w:t>
+        <w:t xml:space="preserve">if</w:t>
+      </w:r>
+      <w:r>
+        <w:t xml:space="preserve"> </w:t>
+      </w:r>
+      <w:r>
+        <w:t xml:space="preserve">node = (A &amp;&amp; B)</w:t>
       </w:r>
       <w:r>
         <w:t xml:space="preserve"> </w:t>
@@ -9622,13 +9655,19 @@
           <w:b/>
           <w:bCs/>
         </w:rPr>
-        <w:t xml:space="preserve">return</w:t>
-      </w:r>
-      <w:r>
-        <w:t xml:space="preserve"> </w:t>
-      </w:r>
-      <w:r>
-        <w:t xml:space="preserve">E</w:t>
+        <w:t xml:space="preserve">then</w:t>
+      </w:r>
+      <w:r>
+        <w:t xml:space="preserve"> </w:t>
+      </w:r>
+      <w:r>
+        <w:t xml:space="preserve">// B runs only if A did</w:t>
+      </w:r>
+      <w:r>
+        <w:t xml:space="preserve"> </w:t>
+      </w:r>
+      <w:r>
+        <w:t xml:space="preserve">(E</w:t>
       </w:r>
       <w:r>
         <w:rPr>
@@ -9637,10 +9676,67 @@
         <w:t xml:space="preserve">A</w:t>
       </w:r>
       <w:r>
-        <w:t xml:space="preserve"> </w:t>
-      </w:r>
-      <w:r>
-        <w:t xml:space="preserve">∪ EFFECTS(B, S after A, V ⊕ E</w:t>
+        <w:t xml:space="preserve">, S</w:t>
+      </w:r>
+      <w:r>
+        <w:rPr>
+          <w:vertAlign w:val="subscript"/>
+        </w:rPr>
+        <w:t xml:space="preserve">A</w:t>
+      </w:r>
+      <w:r>
+        <w:t xml:space="preserve">, V</w:t>
+      </w:r>
+      <w:r>
+        <w:rPr>
+          <w:vertAlign w:val="subscript"/>
+        </w:rPr>
+        <w:t xml:space="preserve">A</w:t>
+      </w:r>
+      <w:r>
+        <w:t xml:space="preserve">) ← EFFECTS(A, S, V)</w:t>
+      </w:r>
+      <w:r>
+        <w:t xml:space="preserve"> </w:t>
+      </w:r>
+      <w:r>
+        <w:t xml:space="preserve">(E</w:t>
+      </w:r>
+      <w:r>
+        <w:rPr>
+          <w:vertAlign w:val="subscript"/>
+        </w:rPr>
+        <w:t xml:space="preserve">B</w:t>
+      </w:r>
+      <w:r>
+        <w:t xml:space="preserve">, S</w:t>
+      </w:r>
+      <w:r>
+        <w:rPr>
+          <w:vertAlign w:val="subscript"/>
+        </w:rPr>
+        <w:t xml:space="preserve">B</w:t>
+      </w:r>
+      <w:r>
+        <w:t xml:space="preserve">, V</w:t>
+      </w:r>
+      <w:r>
+        <w:rPr>
+          <w:vertAlign w:val="subscript"/>
+        </w:rPr>
+        <w:t xml:space="preserve">B</w:t>
+      </w:r>
+      <w:r>
+        <w:t xml:space="preserve">) ← EFFECTS(B, S</w:t>
+      </w:r>
+      <w:r>
+        <w:rPr>
+          <w:vertAlign w:val="subscript"/>
+        </w:rPr>
+        <w:t xml:space="preserve">A</w:t>
+      </w:r>
+      <w:r>
+        <w:t xml:space="preserve">, V</w:t>
       </w:r>
       <w:r>
         <w:rPr>
@@ -9659,13 +9755,61 @@
           <w:b/>
           <w:bCs/>
         </w:rPr>
-        <w:t xml:space="preserve">else if</w:t>
-      </w:r>
-      <w:r>
-        <w:t xml:space="preserve"> </w:t>
-      </w:r>
-      <w:r>
-        <w:t xml:space="preserve">node = (A ; B), (A || B), or (A | B)</w:t>
+        <w:t xml:space="preserve">return</w:t>
+      </w:r>
+      <w:r>
+        <w:t xml:space="preserve"> </w:t>
+      </w:r>
+      <w:r>
+        <w:t xml:space="preserve">(E</w:t>
+      </w:r>
+      <w:r>
+        <w:rPr>
+          <w:vertAlign w:val="subscript"/>
+        </w:rPr>
+        <w:t xml:space="preserve">A</w:t>
+      </w:r>
+      <w:r>
+        <w:t xml:space="preserve"> </w:t>
+      </w:r>
+      <w:r>
+        <w:t xml:space="preserve">∪ E</w:t>
+      </w:r>
+      <w:r>
+        <w:rPr>
+          <w:vertAlign w:val="subscript"/>
+        </w:rPr>
+        <w:t xml:space="preserve">B</w:t>
+      </w:r>
+      <w:r>
+        <w:t xml:space="preserve">, JOIN(S</w:t>
+      </w:r>
+      <w:r>
+        <w:rPr>
+          <w:vertAlign w:val="subscript"/>
+        </w:rPr>
+        <w:t xml:space="preserve">A</w:t>
+      </w:r>
+      <w:r>
+        <w:t xml:space="preserve">, S</w:t>
+      </w:r>
+      <w:r>
+        <w:rPr>
+          <w:vertAlign w:val="subscript"/>
+        </w:rPr>
+        <w:t xml:space="preserve">B</w:t>
+      </w:r>
+      <w:r>
+        <w:t xml:space="preserve">), V</w:t>
+      </w:r>
+      <w:r>
+        <w:rPr>
+          <w:vertAlign w:val="subscript"/>
+        </w:rPr>
+        <w:t xml:space="preserve">B</w:t>
+      </w:r>
+      <w:r>
+        <w:t xml:space="preserve">)</w:t>
       </w:r>
       <w:r>
         <w:t xml:space="preserve"> </w:t>
@@ -9675,31 +9819,13 @@
           <w:b/>
           <w:bCs/>
         </w:rPr>
-        <w:t xml:space="preserve">then</w:t>
-      </w:r>
-      <w:r>
-        <w:t xml:space="preserve"> </w:t>
-      </w:r>
-      <w:r>
-        <w:t xml:space="preserve">E</w:t>
-      </w:r>
-      <w:r>
-        <w:rPr>
-          <w:vertAlign w:val="subscript"/>
-        </w:rPr>
-        <w:t xml:space="preserve">A</w:t>
-      </w:r>
-      <w:r>
-        <w:t xml:space="preserve"> </w:t>
-      </w:r>
-      <w:r>
-        <w:t xml:space="preserve">← EFFECTS(A, S, V) // B may run although A failed</w:t>
-      </w:r>
-      <w:r>
-        <w:t xml:space="preserve"> </w:t>
-      </w:r>
-      <w:r>
-        <w:t xml:space="preserve">S′ ← S after A (for |, S), its directory unknown if A ran cd</w:t>
+        <w:t xml:space="preserve">else if</w:t>
+      </w:r>
+      <w:r>
+        <w:t xml:space="preserve"> </w:t>
+      </w:r>
+      <w:r>
+        <w:t xml:space="preserve">node = (A ; B), (A || B), or (A | B)</w:t>
       </w:r>
       <w:r>
         <w:t xml:space="preserve"> </w:t>
@@ -9709,13 +9835,13 @@
           <w:b/>
           <w:bCs/>
         </w:rPr>
-        <w:t xml:space="preserve">return</w:t>
-      </w:r>
-      <w:r>
-        <w:t xml:space="preserve"> </w:t>
-      </w:r>
-      <w:r>
-        <w:t xml:space="preserve">E</w:t>
+        <w:t xml:space="preserve">then</w:t>
+      </w:r>
+      <w:r>
+        <w:t xml:space="preserve"> </w:t>
+      </w:r>
+      <w:r>
+        <w:t xml:space="preserve">(E</w:t>
       </w:r>
       <w:r>
         <w:rPr>
@@ -9724,10 +9850,76 @@
         <w:t xml:space="preserve">A</w:t>
       </w:r>
       <w:r>
-        <w:t xml:space="preserve"> </w:t>
-      </w:r>
-      <w:r>
-        <w:t xml:space="preserve">∪ EFFECTS(B, S′, doubt(V ⊕ E</w:t>
+        <w:t xml:space="preserve">, S</w:t>
+      </w:r>
+      <w:r>
+        <w:rPr>
+          <w:vertAlign w:val="subscript"/>
+        </w:rPr>
+        <w:t xml:space="preserve">A</w:t>
+      </w:r>
+      <w:r>
+        <w:t xml:space="preserve">, V</w:t>
+      </w:r>
+      <w:r>
+        <w:rPr>
+          <w:vertAlign w:val="subscript"/>
+        </w:rPr>
+        <w:t xml:space="preserve">A</w:t>
+      </w:r>
+      <w:r>
+        <w:t xml:space="preserve">) ← EFFECTS(A, S, V) // B may run although A failed</w:t>
+      </w:r>
+      <w:r>
+        <w:t xml:space="preserve"> </w:t>
+      </w:r>
+      <w:r>
+        <w:t xml:space="preserve">S′ ← S</w:t>
+      </w:r>
+      <w:r>
+        <w:rPr>
+          <w:vertAlign w:val="subscript"/>
+        </w:rPr>
+        <w:t xml:space="preserve">A</w:t>
+      </w:r>
+      <w:r>
+        <w:t xml:space="preserve"> </w:t>
+      </w:r>
+      <w:r>
+        <w:t xml:space="preserve">(for |, S), its directory unknown if A ran cd</w:t>
+      </w:r>
+      <w:r>
+        <w:t xml:space="preserve"> </w:t>
+      </w:r>
+      <w:r>
+        <w:t xml:space="preserve">(E</w:t>
+      </w:r>
+      <w:r>
+        <w:rPr>
+          <w:vertAlign w:val="subscript"/>
+        </w:rPr>
+        <w:t xml:space="preserve">B</w:t>
+      </w:r>
+      <w:r>
+        <w:t xml:space="preserve">, S</w:t>
+      </w:r>
+      <w:r>
+        <w:rPr>
+          <w:vertAlign w:val="subscript"/>
+        </w:rPr>
+        <w:t xml:space="preserve">B</w:t>
+      </w:r>
+      <w:r>
+        <w:t xml:space="preserve">, V</w:t>
+      </w:r>
+      <w:r>
+        <w:rPr>
+          <w:vertAlign w:val="subscript"/>
+        </w:rPr>
+        <w:t xml:space="preserve">B</w:t>
+      </w:r>
+      <w:r>
+        <w:t xml:space="preserve">) ← EFFECTS(B, S′, doubt(V</w:t>
       </w:r>
       <w:r>
         <w:rPr>
@@ -9746,13 +9938,73 @@
           <w:b/>
           <w:bCs/>
         </w:rPr>
-        <w:t xml:space="preserve">else if</w:t>
-      </w:r>
-      <w:r>
-        <w:t xml:space="preserve"> </w:t>
-      </w:r>
-      <w:r>
-        <w:t xml:space="preserve">node = if, case, or while</w:t>
+        <w:t xml:space="preserve">return</w:t>
+      </w:r>
+      <w:r>
+        <w:t xml:space="preserve"> </w:t>
+      </w:r>
+      <w:r>
+        <w:t xml:space="preserve">(E</w:t>
+      </w:r>
+      <w:r>
+        <w:rPr>
+          <w:vertAlign w:val="subscript"/>
+        </w:rPr>
+        <w:t xml:space="preserve">A</w:t>
+      </w:r>
+      <w:r>
+        <w:t xml:space="preserve"> </w:t>
+      </w:r>
+      <w:r>
+        <w:t xml:space="preserve">∪ E</w:t>
+      </w:r>
+      <w:r>
+        <w:rPr>
+          <w:vertAlign w:val="subscript"/>
+        </w:rPr>
+        <w:t xml:space="preserve">B</w:t>
+      </w:r>
+      <w:r>
+        <w:t xml:space="preserve">, S</w:t>
+      </w:r>
+      <w:r>
+        <w:rPr>
+          <w:vertAlign w:val="subscript"/>
+        </w:rPr>
+        <w:t xml:space="preserve">B</w:t>
+      </w:r>
+      <w:r>
+        <w:t xml:space="preserve"> </w:t>
+      </w:r>
+      <w:r>
+        <w:t xml:space="preserve">(for ||, JOIN(S</w:t>
+      </w:r>
+      <w:r>
+        <w:rPr>
+          <w:vertAlign w:val="subscript"/>
+        </w:rPr>
+        <w:t xml:space="preserve">A</w:t>
+      </w:r>
+      <w:r>
+        <w:t xml:space="preserve">, S</w:t>
+      </w:r>
+      <w:r>
+        <w:rPr>
+          <w:vertAlign w:val="subscript"/>
+        </w:rPr>
+        <w:t xml:space="preserve">B</w:t>
+      </w:r>
+      <w:r>
+        <w:t xml:space="preserve">); for |, S), doubt(V</w:t>
+      </w:r>
+      <w:r>
+        <w:rPr>
+          <w:vertAlign w:val="subscript"/>
+        </w:rPr>
+        <w:t xml:space="preserve">B</w:t>
+      </w:r>
+      <w:r>
+        <w:t xml:space="preserve">))</w:t>
       </w:r>
       <w:r>
         <w:t xml:space="preserve"> </w:t>
@@ -9762,31 +10014,13 @@
           <w:b/>
           <w:bCs/>
         </w:rPr>
-        <w:t xml:space="preserve">then</w:t>
-      </w:r>
-      <w:r>
-        <w:t xml:space="preserve"> </w:t>
-      </w:r>
-      <w:r>
-        <w:t xml:space="preserve">E ← the condition's effects ∪ every branch's or body's effects,</w:t>
-      </w:r>
-      <w:r>
-        <w:t xml:space="preserve"> </w:t>
-      </w:r>
-      <w:r>
-        <w:t xml:space="preserve">each analyzed from S</w:t>
-      </w:r>
-      <w:r>
-        <w:t xml:space="preserve"> </w:t>
-      </w:r>
-      <w:r>
-        <w:t xml:space="preserve">S ← S with a variable or directory on which the paths that may</w:t>
-      </w:r>
-      <w:r>
-        <w:t xml:space="preserve"> </w:t>
-      </w:r>
-      <w:r>
-        <w:t xml:space="preserve">have run disagree made unknown; V ← doubt(V ⊕ E)</w:t>
+        <w:t xml:space="preserve">else if</w:t>
+      </w:r>
+      <w:r>
+        <w:t xml:space="preserve"> </w:t>
+      </w:r>
+      <w:r>
+        <w:t xml:space="preserve">node = if, case, or while</w:t>
       </w:r>
       <w:r>
         <w:t xml:space="preserve"> </w:t>
@@ -9796,13 +10030,19 @@
           <w:b/>
           <w:bCs/>
         </w:rPr>
-        <w:t xml:space="preserve">return</w:t>
-      </w:r>
-      <w:r>
-        <w:t xml:space="preserve"> </w:t>
-      </w:r>
-      <w:r>
-        <w:t xml:space="preserve">E // a branch may not have run</w:t>
+        <w:t xml:space="preserve">then</w:t>
+      </w:r>
+      <w:r>
+        <w:t xml:space="preserve"> </w:t>
+      </w:r>
+      <w:r>
+        <w:t xml:space="preserve">analyze the condition from (S, V), then each branch or body from</w:t>
+      </w:r>
+      <w:r>
+        <w:t xml:space="preserve"> </w:t>
+      </w:r>
+      <w:r>
+        <w:t xml:space="preserve">the state the condition leaves, a while body once under doubt</w:t>
       </w:r>
       <w:r>
         <w:t xml:space="preserve"> </w:t>
@@ -9812,13 +10052,19 @@
           <w:b/>
           <w:bCs/>
         </w:rPr>
-        <w:t xml:space="preserve">else if</w:t>
-      </w:r>
-      <w:r>
-        <w:t xml:space="preserve"> </w:t>
-      </w:r>
-      <w:r>
-        <w:t xml:space="preserve">node has a redirect target t</w:t>
+        <w:t xml:space="preserve">return</w:t>
+      </w:r>
+      <w:r>
+        <w:t xml:space="preserve"> </w:t>
+      </w:r>
+      <w:r>
+        <w:t xml:space="preserve">(the union of their effects E, JOIN of their scopes and</w:t>
+      </w:r>
+      <w:r>
+        <w:t xml:space="preserve"> </w:t>
+      </w:r>
+      <w:r>
+        <w:t xml:space="preserve">S, doubt(V ⊕ E)) // a branch may not have run</w:t>
       </w:r>
       <w:r>
         <w:t xml:space="preserve"> </w:t>
@@ -9828,7 +10074,13 @@
           <w:b/>
           <w:bCs/>
         </w:rPr>
-        <w:t xml:space="preserve">then</w:t>
+        <w:t xml:space="preserve">else if</w:t>
+      </w:r>
+      <w:r>
+        <w:t xml:space="preserve"> </w:t>
+      </w:r>
+      <w:r>
+        <w:t xml:space="preserve">node has a redirect target t</w:t>
       </w:r>
       <w:r>
         <w:t xml:space="preserve"> </w:t>
@@ -9838,13 +10090,13 @@
           <w:b/>
           <w:bCs/>
         </w:rPr>
-        <w:t xml:space="preserve">return</w:t>
-      </w:r>
-      <w:r>
-        <w:t xml:space="preserve"> </w:t>
-      </w:r>
-      <w:r>
-        <w:t xml:space="preserve">EFFECTS(strip_redirect(node), S, V) ∪ {write-or-create(t)}</w:t>
+        <w:t xml:space="preserve">then</w:t>
+      </w:r>
+      <w:r>
+        <w:t xml:space="preserve"> </w:t>
+      </w:r>
+      <w:r>
+        <w:t xml:space="preserve">(E, S′, V′) ← EFFECTS(strip_redirect(node), S, V)</w:t>
       </w:r>
       <w:r>
         <w:t xml:space="preserve"> </w:t>
@@ -9854,13 +10106,13 @@
           <w:b/>
           <w:bCs/>
         </w:rPr>
-        <w:t xml:space="preserve">else if</w:t>
-      </w:r>
-      <w:r>
-        <w:t xml:space="preserve"> </w:t>
-      </w:r>
-      <w:r>
-        <w:t xml:space="preserve">node = (for x in W; do body; done)</w:t>
+        <w:t xml:space="preserve">return</w:t>
+      </w:r>
+      <w:r>
+        <w:t xml:space="preserve"> </w:t>
+      </w:r>
+      <w:r>
+        <w:t xml:space="preserve">(E ∪ {write-or-create(t)}, S′, V′ ⊕ {write-or-create(t)})</w:t>
       </w:r>
       <w:r>
         <w:t xml:space="preserve"> </w:t>
@@ -9870,13 +10122,13 @@
           <w:b/>
           <w:bCs/>
         </w:rPr>
-        <w:t xml:space="preserve">then</w:t>
-      </w:r>
-      <w:r>
-        <w:t xml:space="preserve"> </w:t>
-      </w:r>
-      <w:r>
-        <w:t xml:space="preserve">// [C]</w:t>
+        <w:t xml:space="preserve">else if</w:t>
+      </w:r>
+      <w:r>
+        <w:t xml:space="preserve"> </w:t>
+      </w:r>
+      <w:r>
+        <w:t xml:space="preserve">node = (for x in W; do body; done)</w:t>
       </w:r>
       <w:r>
         <w:t xml:space="preserve"> </w:t>
@@ -9886,19 +10138,19 @@
           <w:b/>
           <w:bCs/>
         </w:rPr>
-        <w:t xml:space="preserve">return</w:t>
-      </w:r>
-      <w:r>
-        <w:t xml:space="preserve"> </w:t>
-      </w:r>
-      <w:r>
-        <w:t xml:space="preserve">the union, over w in EXPAND(W) in order, of</w:t>
-      </w:r>
-      <w:r>
-        <w:t xml:space="preserve"> </w:t>
-      </w:r>
-      <w:r>
-        <w:t xml:space="preserve">EFFECTS(body, S[x := w], V), S and V carried between items</w:t>
+        <w:t xml:space="preserve">then</w:t>
+      </w:r>
+      <w:r>
+        <w:t xml:space="preserve"> </w:t>
+      </w:r>
+      <w:r>
+        <w:t xml:space="preserve">// [C]</w:t>
+      </w:r>
+      <w:r>
+        <w:t xml:space="preserve"> </w:t>
+      </w:r>
+      <w:r>
+        <w:t xml:space="preserve">E ← ∅</w:t>
       </w:r>
       <w:r>
         <w:t xml:space="preserve"> </w:t>
@@ -9908,19 +10160,13 @@
           <w:b/>
           <w:bCs/>
         </w:rPr>
-        <w:t xml:space="preserve">else if</w:t>
-      </w:r>
-      <w:r>
-        <w:t xml:space="preserve"> </w:t>
-      </w:r>
-      <w:r>
-        <w:t xml:space="preserve">node runs another command: sh -c s, eval, a wrapper</w:t>
-      </w:r>
-      <w:r>
-        <w:t xml:space="preserve"> </w:t>
-      </w:r>
-      <w:r>
-        <w:t xml:space="preserve">such as sudo, find, or xargs</w:t>
+        <w:t xml:space="preserve">for each</w:t>
+      </w:r>
+      <w:r>
+        <w:t xml:space="preserve"> </w:t>
+      </w:r>
+      <w:r>
+        <w:t xml:space="preserve">w in EXPAND(W), in order</w:t>
       </w:r>
       <w:r>
         <w:t xml:space="preserve"> </w:t>
@@ -9930,13 +10176,43 @@
           <w:b/>
           <w:bCs/>
         </w:rPr>
-        <w:t xml:space="preserve">then</w:t>
-      </w:r>
-      <w:r>
-        <w:t xml:space="preserve"> </w:t>
-      </w:r>
-      <w:r>
-        <w:t xml:space="preserve">// [C]</w:t>
+        <w:t xml:space="preserve">do</w:t>
+      </w:r>
+      <w:r>
+        <w:t xml:space="preserve"> </w:t>
+      </w:r>
+      <w:r>
+        <w:t xml:space="preserve">// passes share the state</w:t>
+      </w:r>
+      <w:r>
+        <w:t xml:space="preserve"> </w:t>
+      </w:r>
+      <w:r>
+        <w:t xml:space="preserve">(E</w:t>
+      </w:r>
+      <w:r>
+        <w:rPr>
+          <w:vertAlign w:val="subscript"/>
+        </w:rPr>
+        <w:t xml:space="preserve">w</w:t>
+      </w:r>
+      <w:r>
+        <w:t xml:space="preserve">, S, V) ← EFFECTS(body, S[x := w], V)</w:t>
+      </w:r>
+      <w:r>
+        <w:t xml:space="preserve"> </w:t>
+      </w:r>
+      <w:r>
+        <w:t xml:space="preserve">E ← E ∪ E</w:t>
+      </w:r>
+      <w:r>
+        <w:rPr>
+          <w:vertAlign w:val="subscript"/>
+        </w:rPr>
+        <w:t xml:space="preserve">w</w:t>
+      </w:r>
+      <w:r>
+        <w:t xml:space="preserve">; V ← doubt(V) // a pass may fail part-way</w:t>
       </w:r>
       <w:r>
         <w:t xml:space="preserve"> </w:t>
@@ -9946,13 +10222,13 @@
           <w:b/>
           <w:bCs/>
         </w:rPr>
-        <w:t xml:space="preserve">if</w:t>
-      </w:r>
-      <w:r>
-        <w:t xml:space="preserve"> </w:t>
-      </w:r>
-      <w:r>
-        <w:t xml:space="preserve">its targets are known only at run time</w:t>
+        <w:t xml:space="preserve">return</w:t>
+      </w:r>
+      <w:r>
+        <w:t xml:space="preserve"> </w:t>
+      </w:r>
+      <w:r>
+        <w:t xml:space="preserve">(E, S, V)</w:t>
       </w:r>
       <w:r>
         <w:t xml:space="preserve"> </w:t>
@@ -9962,13 +10238,19 @@
           <w:b/>
           <w:bCs/>
         </w:rPr>
-        <w:t xml:space="preserve">then</w:t>
-      </w:r>
-      <w:r>
-        <w:t xml:space="preserve"> </w:t>
-      </w:r>
-      <w:r>
-        <w:t xml:space="preserve">T ← RESOLVE(node, S, V) // [R]</w:t>
+        <w:t xml:space="preserve">else if</w:t>
+      </w:r>
+      <w:r>
+        <w:t xml:space="preserve"> </w:t>
+      </w:r>
+      <w:r>
+        <w:t xml:space="preserve">node runs another command: sh -c s, eval, a wrapper</w:t>
+      </w:r>
+      <w:r>
+        <w:t xml:space="preserve"> </w:t>
+      </w:r>
+      <w:r>
+        <w:t xml:space="preserve">such as sudo, find, or xargs</w:t>
       </w:r>
       <w:r>
         <w:t xml:space="preserve"> </w:t>
@@ -9978,13 +10260,13 @@
           <w:b/>
           <w:bCs/>
         </w:rPr>
-        <w:t xml:space="preserve">if</w:t>
-      </w:r>
-      <w:r>
-        <w:t xml:space="preserve"> </w:t>
-      </w:r>
-      <w:r>
-        <w:t xml:space="preserve">T = ⊥</w:t>
+        <w:t xml:space="preserve">then</w:t>
+      </w:r>
+      <w:r>
+        <w:t xml:space="preserve"> </w:t>
+      </w:r>
+      <w:r>
+        <w:t xml:space="preserve">// [C]</w:t>
       </w:r>
       <w:r>
         <w:t xml:space="preserve"> </w:t>
@@ -9994,13 +10276,13 @@
           <w:b/>
           <w:bCs/>
         </w:rPr>
-        <w:t xml:space="preserve">then return</w:t>
-      </w:r>
-      <w:r>
-        <w:t xml:space="preserve"> </w:t>
-      </w:r>
-      <w:r>
-        <w:t xml:space="preserve">{UNRESOLVED}</w:t>
+        <w:t xml:space="preserve">if</w:t>
+      </w:r>
+      <w:r>
+        <w:t xml:space="preserve"> </w:t>
+      </w:r>
+      <w:r>
+        <w:t xml:space="preserve">its targets are known only at run time</w:t>
       </w:r>
       <w:r>
         <w:t xml:space="preserve"> </w:t>
@@ -10010,13 +10292,13 @@
           <w:b/>
           <w:bCs/>
         </w:rPr>
-        <w:t xml:space="preserve">return</w:t>
-      </w:r>
-      <w:r>
-        <w:t xml:space="preserve"> </w:t>
-      </w:r>
-      <w:r>
-        <w:t xml:space="preserve">EFFECTS(inner command, bound to T if resolved, S, V)</w:t>
+        <w:t xml:space="preserve">then</w:t>
+      </w:r>
+      <w:r>
+        <w:t xml:space="preserve"> </w:t>
+      </w:r>
+      <w:r>
+        <w:t xml:space="preserve">T ← RESOLVE(node, S, V) // [R]</w:t>
       </w:r>
       <w:r>
         <w:t xml:space="preserve"> </w:t>
@@ -10026,13 +10308,13 @@
           <w:b/>
           <w:bCs/>
         </w:rPr>
-        <w:t xml:space="preserve">else if</w:t>
-      </w:r>
-      <w:r>
-        <w:t xml:space="preserve"> </w:t>
-      </w:r>
-      <w:r>
-        <w:t xml:space="preserve">node's targets are known only at run time</w:t>
+        <w:t xml:space="preserve">if</w:t>
+      </w:r>
+      <w:r>
+        <w:t xml:space="preserve"> </w:t>
+      </w:r>
+      <w:r>
+        <w:t xml:space="preserve">T = ⊥</w:t>
       </w:r>
       <w:r>
         <w:t xml:space="preserve"> </w:t>
@@ -10042,19 +10324,13 @@
           <w:b/>
           <w:bCs/>
         </w:rPr>
-        <w:t xml:space="preserve">then</w:t>
-      </w:r>
-      <w:r>
-        <w:t xml:space="preserve"> </w:t>
-      </w:r>
-      <w:r>
-        <w:t xml:space="preserve">// $( ), tar -x, unzip, rsync, git clean</w:t>
-      </w:r>
-      <w:r>
-        <w:t xml:space="preserve"> </w:t>
-      </w:r>
-      <w:r>
-        <w:t xml:space="preserve">T ← RESOLVE(node, S, V) // [R]</w:t>
+        <w:t xml:space="preserve">then return</w:t>
+      </w:r>
+      <w:r>
+        <w:t xml:space="preserve"> </w:t>
+      </w:r>
+      <w:r>
+        <w:t xml:space="preserve">{UNRESOLVED}</w:t>
       </w:r>
       <w:r>
         <w:t xml:space="preserve"> </w:t>
@@ -10064,13 +10340,13 @@
           <w:b/>
           <w:bCs/>
         </w:rPr>
-        <w:t xml:space="preserve">if</w:t>
-      </w:r>
-      <w:r>
-        <w:t xml:space="preserve"> </w:t>
-      </w:r>
-      <w:r>
-        <w:t xml:space="preserve">T = ⊥</w:t>
+        <w:t xml:space="preserve">return</w:t>
+      </w:r>
+      <w:r>
+        <w:t xml:space="preserve"> </w:t>
+      </w:r>
+      <w:r>
+        <w:t xml:space="preserve">EFFECTS(inner command, bound to T if resolved, S, V)</w:t>
       </w:r>
       <w:r>
         <w:t xml:space="preserve"> </w:t>
@@ -10080,13 +10356,13 @@
           <w:b/>
           <w:bCs/>
         </w:rPr>
-        <w:t xml:space="preserve">then return</w:t>
-      </w:r>
-      <w:r>
-        <w:t xml:space="preserve"> </w:t>
-      </w:r>
-      <w:r>
-        <w:t xml:space="preserve">{UNRESOLVED}</w:t>
+        <w:t xml:space="preserve">else if</w:t>
+      </w:r>
+      <w:r>
+        <w:t xml:space="preserve"> </w:t>
+      </w:r>
+      <w:r>
+        <w:t xml:space="preserve">node's targets are known only at run time</w:t>
       </w:r>
       <w:r>
         <w:t xml:space="preserve"> </w:t>
@@ -10096,13 +10372,19 @@
           <w:b/>
           <w:bCs/>
         </w:rPr>
-        <w:t xml:space="preserve">return</w:t>
-      </w:r>
-      <w:r>
-        <w:t xml:space="preserve"> </w:t>
-      </w:r>
-      <w:r>
-        <w:t xml:space="preserve">EFFECTS(node with its run-time targets bound to T, S, V)</w:t>
+        <w:t xml:space="preserve">then</w:t>
+      </w:r>
+      <w:r>
+        <w:t xml:space="preserve"> </w:t>
+      </w:r>
+      <w:r>
+        <w:t xml:space="preserve">// $( ), tar -x, unzip, rsync, git clean</w:t>
+      </w:r>
+      <w:r>
+        <w:t xml:space="preserve"> </w:t>
+      </w:r>
+      <w:r>
+        <w:t xml:space="preserve">T ← RESOLVE(node, S, V) // [R]</w:t>
       </w:r>
       <w:r>
         <w:t xml:space="preserve"> </w:t>
@@ -10112,13 +10394,13 @@
           <w:b/>
           <w:bCs/>
         </w:rPr>
-        <w:t xml:space="preserve">else</w:t>
-      </w:r>
-      <w:r>
-        <w:t xml:space="preserve"> </w:t>
-      </w:r>
-      <w:r>
-        <w:t xml:space="preserve">// a simple command; argument-aware; no rule gives {UNKNOWN}</w:t>
+        <w:t xml:space="preserve">if</w:t>
+      </w:r>
+      <w:r>
+        <w:t xml:space="preserve"> </w:t>
+      </w:r>
+      <w:r>
+        <w:t xml:space="preserve">T = ⊥</w:t>
       </w:r>
       <w:r>
         <w:t xml:space="preserve"> </w:t>
@@ -10128,13 +10410,13 @@
           <w:b/>
           <w:bCs/>
         </w:rPr>
-        <w:t xml:space="preserve">if</w:t>
-      </w:r>
-      <w:r>
-        <w:t xml:space="preserve"> </w:t>
-      </w:r>
-      <w:r>
-        <w:t xml:space="preserve">S's directory is unknown</w:t>
+        <w:t xml:space="preserve">then return</w:t>
+      </w:r>
+      <w:r>
+        <w:t xml:space="preserve"> </w:t>
+      </w:r>
+      <w:r>
+        <w:t xml:space="preserve">{UNRESOLVED}</w:t>
       </w:r>
       <w:r>
         <w:t xml:space="preserve"> </w:t>
@@ -10144,13 +10426,13 @@
           <w:b/>
           <w:bCs/>
         </w:rPr>
-        <w:t xml:space="preserve">then return</w:t>
-      </w:r>
-      <w:r>
-        <w:t xml:space="preserve"> </w:t>
-      </w:r>
-      <w:r>
-        <w:t xml:space="preserve">{UNRESOLVED}</w:t>
+        <w:t xml:space="preserve">return</w:t>
+      </w:r>
+      <w:r>
+        <w:t xml:space="preserve"> </w:t>
+      </w:r>
+      <w:r>
+        <w:t xml:space="preserve">EFFECTS(node with its run-time targets bound to T, S, V)</w:t>
       </w:r>
       <w:r>
         <w:t xml:space="preserve"> </w:t>
@@ -10160,13 +10442,13 @@
           <w:b/>
           <w:bCs/>
         </w:rPr>
-        <w:t xml:space="preserve">return</w:t>
-      </w:r>
-      <w:r>
-        <w:t xml:space="preserve"> </w:t>
-      </w:r>
-      <w:r>
-        <w:t xml:space="preserve">RULE(name, args, S, V)</w:t>
+        <w:t xml:space="preserve">else</w:t>
+      </w:r>
+      <w:r>
+        <w:t xml:space="preserve"> </w:t>
+      </w:r>
+      <w:r>
+        <w:t xml:space="preserve">// a simple command; argument-aware; no rule gives {UNKNOWN}</w:t>
       </w:r>
       <w:r>
         <w:t xml:space="preserve"> </w:t>
@@ -10176,7 +10458,13 @@
           <w:b/>
           <w:bCs/>
         </w:rPr>
-        <w:t xml:space="preserve">end if</w:t>
+        <w:t xml:space="preserve">if</w:t>
+      </w:r>
+      <w:r>
+        <w:t xml:space="preserve"> </w:t>
+      </w:r>
+      <w:r>
+        <w:t xml:space="preserve">S's directory is unknown</w:t>
       </w:r>
       <w:r>
         <w:t xml:space="preserve"> </w:t>
@@ -10186,7 +10474,13 @@
           <w:b/>
           <w:bCs/>
         </w:rPr>
-        <w:t xml:space="preserve">end function</w:t>
+        <w:t xml:space="preserve">then return</w:t>
+      </w:r>
+      <w:r>
+        <w:t xml:space="preserve"> </w:t>
+      </w:r>
+      <w:r>
+        <w:t xml:space="preserve">{UNRESOLVED}</w:t>
       </w:r>
       <w:r>
         <w:t xml:space="preserve"> </w:t>
@@ -10196,6 +10490,42 @@
           <w:b/>
           <w:bCs/>
         </w:rPr>
+        <w:t xml:space="preserve">return</w:t>
+      </w:r>
+      <w:r>
+        <w:t xml:space="preserve"> </w:t>
+      </w:r>
+      <w:r>
+        <w:t xml:space="preserve">RULE(name, args, S, V) // cd, assignments update S</w:t>
+      </w:r>
+      <w:r>
+        <w:t xml:space="preserve"> </w:t>
+      </w:r>
+      <w:r>
+        <w:rPr>
+          <w:b/>
+          <w:bCs/>
+        </w:rPr>
+        <w:t xml:space="preserve">end if</w:t>
+      </w:r>
+      <w:r>
+        <w:t xml:space="preserve"> </w:t>
+      </w:r>
+      <w:r>
+        <w:rPr>
+          <w:b/>
+          <w:bCs/>
+        </w:rPr>
+        <w:t xml:space="preserve">end function</w:t>
+      </w:r>
+      <w:r>
+        <w:t xml:space="preserve"> </w:t>
+      </w:r>
+      <w:r>
+        <w:rPr>
+          <w:b/>
+          <w:bCs/>
+        </w:rPr>
         <w:t xml:space="preserve">function</w:t>
       </w:r>
       <w:r>
@@ -10209,6 +10539,38 @@
       </w:r>
       <w:r>
         <w:t xml:space="preserve">// learns run-time targets, changing nothing</w:t>
+      </w:r>
+      <w:r>
+        <w:t xml:space="preserve"> </w:t>
+      </w:r>
+      <w:r>
+        <w:rPr>
+          <w:b/>
+          <w:bCs/>
+        </w:rPr>
+        <w:t xml:space="preserve">if</w:t>
+      </w:r>
+      <w:r>
+        <w:t xml:space="preserve"> </w:t>
+      </w:r>
+      <w:r>
+        <w:t xml:space="preserve">no read-only sandbox is available</w:t>
+      </w:r>
+      <w:r>
+        <w:t xml:space="preserve"> </w:t>
+      </w:r>
+      <w:r>
+        <w:rPr>
+          <w:b/>
+          <w:bCs/>
+        </w:rPr>
+        <w:t xml:space="preserve">then return</w:t>
+      </w:r>
+      <w:r>
+        <w:t xml:space="preserve"> </w:t>
+      </w:r>
+      <w:r>
+        <w:t xml:space="preserve">⊥</w:t>
       </w:r>
       <w:r>
         <w:t xml:space="preserve"> </w:t>
@@ -11174,7 +11536,7 @@
         <w:t xml:space="preserve"> </w:t>
       </w:r>
       <w:r>
-        <w:t xml:space="preserve">evaluated using an execution-based scoring methodology [47] — each generated command is executed in a controlled environment and its resulting system state compared against a human-annotated expected outcome for each task utterance, rather than syntax-level string matching, with ambiguous cases resolved through LLM-assisted functional equivalence assessment at 95% confidence; accuracy is computed as the proportion of first-attempt matches</w:t>
+        <w:t xml:space="preserve">evaluated using an execution-based scoring methodology [47] — each generated command is executed in a controlled environment and its resulting system state compared against a human-annotated expected outcome for each task utterance, rather than syntax-level string matching, with ambiguous cases, where the resulting state differs from the expected one only in ways the task did not ask about, decided by a written equivalence rubric fixed before data collection and applied by two members of the team independently, disagreements settled by discussion and the number of cases decided this way reported; accuracy is computed as the proportion of first-attempt matches</w:t>
       </w:r>
     </w:p>
     <w:p>
@@ -14270,7 +14632,7 @@
         <w:pStyle w:val="BodyText"/>
       </w:pPr>
       <w:r>
-        <w:t xml:space="preserve">Subgroup analysis is conducted separately for the novice and power user groups to determine whether the effect of the interface condition differs across populations.  The interaction between interface condition and user group is examined to assess whether SynapseOS produces differential effects depending on technical background.  Because condition order and task form are crossed between subjects (Section 1.2(d)), each platform measure is modeled with condition, group, order, and task form as fixed effects and crossed random intercepts for participant and task: error, which is binary per task, by a logistic mixed model; completion time by a linear mixed model on its logarithm; and the SUS and NASA-TLX scores, which are taken once per condition, by a linear mixed model with a random intercept for participant, from which the condition × group and condition × order interactions are read.  The condition term of each of these models is the confirmatory test for its measure; the paired tests above are sensitivity checks, and the power analysis, computed for a paired</w:t>
+        <w:t xml:space="preserve">Subgroup analysis is conducted separately for the novice and power user groups to determine whether the effect of the interface condition differs across populations.  The interaction between interface condition and user group is examined to assess whether SynapseOS produces differential effects depending on technical background.  Because condition order and task form are crossed between subjects (Section 1.2(d)), each platform measure is modeled with condition, group, order, and task form as fixed effects and crossed random intercepts for participant and task: error, which is binary per task, by a logistic mixed model; completion time by a linear mixed model on its logarithm; and the SUS and NASA-TLX scores, which are taken once per condition, by a linear mixed model with a random intercept for participant, from which the condition × group and condition × order interactions are read.  The condition term of each of these models is the confirmatory test for its measure, with Holm’s correction across the four; the paired tests above are sensitivity checks, and the power analysis, computed for a paired</w:t>
       </w:r>
       <w:r>
         <w:t xml:space="preserve"> </w:t>

</xml_diff>

<commit_message>
docs(thesis): fix the tenth pass/fail check's medium findings
Chapter 2: 2.10 now reviews how a sound analysis is evaluated (false negatives first [Cousot], execution ground truth, ablation) and points to Chapter 3 for the design; the analysis is said to rest on an enumeration too, asking where it ends as the fail-closed list does.
Chapter 3: power recomputed at Holm's first-step level alpha/4 = 0.0125 (80% power for d >= 0.55 with 40; 70% at d = 0.5, for which 48 would be needed; d >= 0.82 per subgroup); OSWorld a secondary check, not comparable with published scores; commands that exit non-zero kept in the validation study and their exclusion from the corpus stated as a threat.
</commit_message>
<xml_diff>
--- a/thesis 1/consolidated/SynapseOS_Proposal_Chapters_1_to_3.docx
+++ b/thesis 1/consolidated/SynapseOS_Proposal_Chapters_1_to_3.docx
@@ -2789,7 +2789,7 @@
         <w:t xml:space="preserve">effect set</w:t>
       </w:r>
       <w:r>
-        <w:t xml:space="preserve">: what a command would read, create, write, remove, or alter in metadata, or change in the system’s installed packages and running services, rather than the command’s name.  Its semantics is</w:t>
+        <w:t xml:space="preserve">: what a command would read, create, write, remove, or alter in metadata, or change in the system’s installed packages and running services, not the command’s name alone.  Its semantics is</w:t>
       </w:r>
       <w:r>
         <w:t xml:space="preserve"> </w:t>
@@ -2866,7 +2866,7 @@
               <a:graphicData uri="http://schemas.openxmlformats.org/drawingml/2006/picture">
                 <pic:pic>
                   <pic:nvPicPr>
-                    <pic:cNvPr descr="/tmp/claude-1000/-home-willard-projects-thesis/cb82e7af-8c35-489a-a7f7-ef49172efea2/scratchpad/docx/w16/fig0.png" id="46" name="Picture"/>
+                    <pic:cNvPr descr="/tmp/claude-1000/-home-willard-projects-thesis/cb82e7af-8c35-489a-a7f7-ef49172efea2/scratchpad/docx/w17/fig0.png" id="46" name="Picture"/>
                     <pic:cNvPicPr>
                       <a:picLocks noChangeArrowheads="1" noChangeAspect="1"/>
                     </pic:cNvPicPr>
@@ -3278,7 +3278,7 @@
         <w:t xml:space="preserve">&amp;&amp;</w:t>
       </w:r>
       <w:r>
-        <w:t xml:space="preserve">, with redirects and command substitution altering what each actually touches.  No enumeration of command prefixes expresses that, and extending the list does not converge: each newly named tool leaves the next one unnamed.  Determining recoverability over a composed command, and computing the minimal information needed to reverse it, is the open problem this study takes up (RQ1–RQ3), and it is what separates the present work from the guardrail designs surveyed above.  The comparison that matters is not only against an enumerated list of dangerous commands.  A list can be turned around so that it asks before every command it does not recognize as read-only, which removes the first weakness above at the cost of asking about everything unfamiliar; that fail-closed list is the strongest simple baseline, and the study therefore claims what the analysis adds to it — capturing what would be lost so that undo restores it, and asking far less often, both of which composition and resolution make possible — and not the verdict alone.</w:t>
+        <w:t xml:space="preserve">, with redirects and command substitution altering what each actually touches.  No enumeration of command prefixes expresses that, and extending the list does not converge: each newly named tool leaves the next one unnamed.  The analysis does not escape enumeration either: its effects come from a table of what each known command does, and a command the table does not name is treated exactly as the fail-closed list treats it, by asking.  What it adds is composition over the table, read-only resolution of run-time targets, and the capture that lets a command run and still be undone.  Determining recoverability over a composed command, and computing the minimal information needed to reverse it, is the open problem this study takes up (RQ1–RQ3), and it is what separates the present work from the guardrail designs surveyed above.  The comparison that matters is not only against an enumerated list of dangerous commands.  A list can be turned around so that it asks before every command it does not recognize as read-only, which removes the first weakness above at the cost of asking about everything unfamiliar; that fail-closed list is the strongest simple baseline, and the study therefore claims what the analysis adds to it — capturing what would be lost so that undo restores it, and asking far less often, both of which composition and resolution make possible — and not the verdict alone.</w:t>
       </w:r>
     </w:p>
     <w:p>
@@ -6460,7 +6460,7 @@
         <w:pStyle w:val="FirstParagraph"/>
       </w:pPr>
       <w:r>
-        <w:t xml:space="preserve">The evaluation of the algorithm, which is the study’s primary evidence, follows from what the algorithm claims, and its methods are stated first.  Its 450 human-written commands are drawn from a public dataset of natural-language descriptions paired with Bash commands, NL2Bash [24], so that part of it is not written by the people who wrote the analysis; the rest are templates written for the study and commands that act outside the filesystem (Chapter 3, Section 1.2(a)); and it is stratified by the label each command must carry so that the rare destructive commands are present in number.  Of its 777 commands, the 697 that act on files have ground truth observed rather than judged, by executing each in a sandbox and comparing the filesystem before and after, in the way that executable semantics of the shell are validated against what shells actually do [12] and that Westenfelder and colleagues judge whether a generated Bash command does what was intended [47]; the 80 that act outside the filesystem are labeled from a fixed table of state-changing tools.  Its comparisons are paired, because every system is scored on the same commands, and use the standard tests for paired proportions: McNemar’s exact test on the commands two systems handle differently, Wilson intervals for each proportion and Newcombe intervals for each difference, and Holm’s correction across each family of tests.  And its claim that composition and resolution, rather than the rule table, produce the result is tested by ablation: the analysis is rerun with each part switched off and the table kept.  Chapter 3, Sections 3.1 and 3.2 give the details.</w:t>
+        <w:t xml:space="preserve">The evaluation of the algorithm, which is the study’s primary evidence, follows established practice for judging a program analysis, and its methods are stated first.  A sound analysis is judged first by what it misses, its false negatives, and only then by what its false alarms cost, since soundness is the property it claims [8]; hence silent loss is the primary measure and needless confirmation the cost.  Its ground truth is observed by execution rather than assigned by judges, the standard by which executable semantics of the shell are validated against what shells actually do [12] and by which generated Bash commands are judged against what was intended [47].  Part of its corpus comes from a public dataset, NL2Bash [24], so that the evaluation does not rest only on commands written by the people who wrote the analysis.  The claim that particular components produce the result is tested by ablation, rerunning the analysis with each switched off; and comparisons in which every system is scored on the same commands use the standard tests for paired proportions: McNemar’s exact test on the commands two systems handle differently, Wilson intervals for each proportion and Newcombe intervals for each difference, and Holm’s correction across each family of tests.  Chapter 3, Sections 1.2, 3.1, and 3.2 give the design.</w:t>
       </w:r>
     </w:p>
     <w:p>
@@ -6781,7 +6781,7 @@
               <a:graphicData uri="http://schemas.openxmlformats.org/drawingml/2006/picture">
                 <pic:pic>
                   <pic:nvPicPr>
-                    <pic:cNvPr descr="/tmp/claude-1000/-home-willard-projects-thesis/cb82e7af-8c35-489a-a7f7-ef49172efea2/scratchpad/docx/w16/fig1.png" id="79" name="Picture"/>
+                    <pic:cNvPr descr="/tmp/claude-1000/-home-willard-projects-thesis/cb82e7af-8c35-489a-a7f7-ef49172efea2/scratchpad/docx/w17/fig1.png" id="79" name="Picture"/>
                     <pic:cNvPicPr>
                       <a:picLocks noChangeArrowheads="1" noChangeAspect="1"/>
                     </pic:cNvPicPr>
@@ -13249,7 +13249,7 @@
         <w:pStyle w:val="FirstParagraph"/>
       </w:pPr>
       <w:r>
-        <w:t xml:space="preserve">Four are anticipated.  First, corpus bias is addressed by partitioning, as described in Section 1.2(a).  Second, oracle validity replaces label subjectivity: the labels are observed, so they cannot be argued with, but they are facts about one command on one small fixture, run for a few seconds, seeing the working tree and not repository internals.  A loss that appears only on a differently shaped tree, or after the time limit, is labeled by what happened here.  The oracle’s own behavior is pinned by unit tests over commands whose outcome is known, its exclusions are reported, and the bias they introduce — toward commands that run on a small fixture, which excludes most NL2Bash candidates that name paths or hosts the fixture cannot supply — is stated and not corrected.  Third, the algorithm and the labels are produced by the same research team, which creates a risk that the labels reflect the algorithm’s assumptions; the generator is independent of the analysis by construction, and the corpus is fixed by a recorded seed and hash before the analysis is run on it.  A fourth threat follows from the same fact: the analysis rests on a table of what each known command does, written by the same team, and a table written with the corpus in view measures the cases its author anticipated.  The corpus is therefore generated from several seeds.  Earlier ones are used to correct the analysis and the undo; the primary result is reported on one drawn after both are frozen, with the analyzer’s hash recorded beside the result.  That result is a single draw, so variation from one corpus draw to another is not estimated; the development rounds, drawn from different seeds before the design was frozen, showed the same pattern (zero silent loss for the analysis and capture coverage near 90%), but they were not independent of the design and are not offered as replication.  Nor does the corpus verify the package and service part of the model: the oracle can write only inside a fixture, so no command in the corpus changes installed packages or running services under observation, and the inverse plans for such changes are checked by the prototype’s unit tests rather than by execution.</w:t>
+        <w:t xml:space="preserve">The following are anticipated.  First, corpus bias is addressed by partitioning, as described in Section 1.2(a).  Second, oracle validity replaces label subjectivity: the labels are observed, so they cannot be argued with, but they are facts about one command on one small fixture, run for a few seconds, seeing the working tree and not repository internals.  A loss that appears only on a differently shaped tree, or after the time limit, is labeled by what happened here.  The oracle’s own behavior is pinned by unit tests over commands whose outcome is known, its exclusions are reported, and the bias they introduce — toward commands that run on a small fixture, which excludes most NL2Bash candidates that name paths or hosts the fixture cannot supply — is stated and not corrected.  Third, the algorithm and the labels are produced by the same research team, which creates a risk that the labels reflect the algorithm’s assumptions; the generator is independent of the analysis by construction, and the corpus is fixed by a recorded seed and hash before the analysis is run on it.  A fourth threat follows from the same fact: the analysis rests on a table of what each known command does, written by the same team, and a table written with the corpus in view measures the cases its author anticipated.  The corpus is therefore generated from several seeds.  Earlier ones are used to correct the analysis and the undo; the primary result is reported on one drawn after both are frozen, with the analyzer’s hash recorded beside the result.  That result is a single draw, so variation from one corpus draw to another is not estimated; the development rounds, drawn from different seeds before the design was frozen, showed the same pattern (zero silent loss for the analysis and capture coverage near 90%), but they were not independent of the design and are not offered as replication.  Nor does the corpus verify the package and service part of the model: the oracle can write only inside a fixture, so no command in the corpus changes installed packages or running services under observation, and the inverse plans for such changes are checked by the prototype’s unit tests rather than by execution.  Last, a command that exits non-zero is excluded from the corpus (Section 1.2(b)), so a command that destroys part of a tree and then fails is under-represented, and with it the paths on which a later part of a line runs after an earlier part failed, where the seventh analyzer defect lay; the analysis’s handling of those paths rests on its unit tests, and the validation study keeps such commands (Section 3.5(e)).</w:t>
       </w:r>
     </w:p>
     <w:bookmarkEnd w:id="111"/>
@@ -14249,7 +14249,7 @@
         <w:pStyle w:val="FirstParagraph"/>
       </w:pPr>
       <w:r>
-        <w:t xml:space="preserve">Sections 3.3 to 3.7 define the validation study, in which the analysis is deployed in SynapseOS and exercised by participants.  It exercises the platform on two task datasets: the OSWorld benchmark task suite [50] for direct comparison with results in the existing literature, and the custom cross-platform task suite described in Sections 1.1 and 1.5.  The user study evaluation involves 40 participants (20 novice, 20 power users); the baseline condition is each participant’s primary operating system — Windows 11, macOS, or Linux with GNOME desktop — on a dedicated baseline machine.</w:t>
+        <w:t xml:space="preserve">Sections 3.3 to 3.7 define the validation study, in which the analysis is deployed in SynapseOS and exercised by participants.  It exercises the platform on two task datasets: the OSWorld benchmark task suite [50], as a secondary check related to, but not comparable with, published agent scores, since its tasks are adapted, attended, and gated, and the custom cross-platform task suite described in Sections 1.1 and 1.5.  The user study evaluation involves 40 participants (20 novice, 20 power users); the baseline condition is each participant’s primary operating system — Windows 11, macOS, or Linux with GNOME desktop — on a dedicated baseline machine.</w:t>
       </w:r>
     </w:p>
     <w:bookmarkEnd w:id="114"/>
@@ -14440,7 +14440,7 @@
         <w:pStyle w:val="FirstParagraph"/>
       </w:pPr>
       <w:r>
-        <w:t xml:space="preserve">All platform comparisons between conditions are tested at α = 0.05.  Effect size is reported using Cohen’s</w:t>
+        <w:t xml:space="preserve">All platform comparisons between conditions are tested at a familywise α = 0.05, Holm-corrected across the four measures.  Effect size is reported using Cohen’s</w:t>
       </w:r>
       <w:r>
         <w:t xml:space="preserve"> </w:t>
@@ -14453,7 +14453,7 @@
         <w:t xml:space="preserve">d</w:t>
       </w:r>
       <w:r>
-        <w:t xml:space="preserve">, with thresholds of 0.2 (small), 0.5 (medium), and 0.8 (large).  Sample size is justified by an a priori power analysis for a paired-samples comparison at α = 0.05, two-tailed, computed against the noncentral</w:t>
+        <w:t xml:space="preserve">, with thresholds of 0.2 (small), 0.5 (medium), and 0.8 (large).  Sample size is justified by an a priori power analysis for a paired-samples comparison, two-tailed, computed against the noncentral</w:t>
       </w:r>
       <w:r>
         <w:t xml:space="preserve"> </w:t>
@@ -14469,7 +14469,10 @@
         <w:t xml:space="preserve"> </w:t>
       </w:r>
       <w:r>
-        <w:t xml:space="preserve">distribution.  Detecting a medium effect (</w:t>
+        <w:t xml:space="preserve">distribution at the level Holm’s procedure uses for its first test across the four measures, α/4 = 0.0125.  At that level the 40-participant sample has 80% power for effects of</w:t>
+      </w:r>
+      <w:r>
+        <w:t xml:space="preserve"> </w:t>
       </w:r>
       <w:r>
         <w:rPr>
@@ -14482,10 +14485,7 @@
         <w:t xml:space="preserve"> </w:t>
       </w:r>
       <w:r>
-        <w:t xml:space="preserve">= 0.5) at 80% power requires 34 participants; the 40-participant sample provides approximately 87% power at that effect size and detects effects down to</w:t>
-      </w:r>
-      <w:r>
-        <w:t xml:space="preserve"> </w:t>
+        <w:t xml:space="preserve">= 0.55 or larger and about 70% power at a medium effect (</w:t>
       </w:r>
       <w:r>
         <w:rPr>
@@ -14498,7 +14498,7 @@
         <w:t xml:space="preserve"> </w:t>
       </w:r>
       <w:r>
-        <w:t xml:space="preserve">= 0.45, giving margin for attrition and for exclusions arising from the screening rule in Section 1.4.  Analyzed alone, each 20-participant subgroup detects effects of</w:t>
+        <w:t xml:space="preserve">= 0.5), for which 48 participants would be needed; each 20-participant subgroup, analyzed alone, detects effects of</w:t>
       </w:r>
       <w:r>
         <w:t xml:space="preserve"> </w:t>
@@ -14514,7 +14514,7 @@
         <w:t xml:space="preserve"> </w:t>
       </w:r>
       <w:r>
-        <w:t xml:space="preserve">= 0.66 or larger.  The condition × group interaction, which characterizes whether the platform serves the two groups differently, remains the least-powered comparison in the design, since an interaction of a given size requires substantially more participants than a main effect of the same size; it is therefore reported with effect sizes and confidence intervals as the main descriptive finding for the platform, and is not treated as a confirmatory significance test.  The sample size is set by these platform comparisons; the analysis-in-use measures of (e) are descriptive and need no power analysis.</w:t>
+        <w:t xml:space="preserve">= 0.82 or larger.  The measures Holm tests later in the sequence are tested at a higher level, so these figures are the conservative bound.  The condition × group interaction, which characterizes whether the platform serves the two groups differently, remains the least-powered comparison in the design, since an interaction of a given size requires substantially more participants than a main effect of the same size; it is therefore reported with effect sizes and confidence intervals as the main descriptive finding for the platform, and is not treated as a confirmatory significance test.  The sample size is set by these platform comparisons; the analysis-in-use measures of (e) are descriptive and need no power analysis.</w:t>
       </w:r>
     </w:p>
     <w:bookmarkEnd w:id="119"/>
@@ -14532,7 +14532,7 @@
         <w:pStyle w:val="FirstParagraph"/>
       </w:pPr>
       <w:r>
-        <w:t xml:space="preserve">Every command executed during the SynapseOS condition is logged with the analysis’s verdict and capture plan and with a snapshot of the task directory taken immediately before it ran (Section 1.1(d)), replayed on a copy of that snapshot in the sandbox, and labeled exactly as the corpus is (Section 1.2(b)).  It is then scored with the corpus measures:</w:t>
+        <w:t xml:space="preserve">Every command executed during the SynapseOS condition is logged with the analysis’s verdict and capture plan and with a snapshot of the task directory taken immediately before it ran (Section 1.1(d)), replayed on a copy of that snapshot in the sandbox, and labeled as the corpus is (Section 1.2(b)), with one difference: a command that exits non-zero is kept, not excluded, and labeled from its before-and-after difference, since in use a failed command’s partial effects are real.  It is then scored with the corpus measures:</w:t>
       </w:r>
       <w:r>
         <w:t xml:space="preserve"> </w:t>

</xml_diff>

<commit_message>
docs(thesis): fix the eleventh pass/fail check's medium findings
Chapter 2: 'not assigned by judges' kept for executable shell semantics only; [47] cited for execution-based scoring.
Chapter 3: the ablation's conclusion split: coverage is owed to composition and resolution, zero silent loss to the table and the fail-closed default.
</commit_message>
<xml_diff>
--- a/thesis 1/consolidated/SynapseOS_Proposal_Chapters_1_to_3.docx
+++ b/thesis 1/consolidated/SynapseOS_Proposal_Chapters_1_to_3.docx
@@ -2866,7 +2866,7 @@
               <a:graphicData uri="http://schemas.openxmlformats.org/drawingml/2006/picture">
                 <pic:pic>
                   <pic:nvPicPr>
-                    <pic:cNvPr descr="/tmp/claude-1000/-home-willard-projects-thesis/cb82e7af-8c35-489a-a7f7-ef49172efea2/scratchpad/docx/w17/fig0.png" id="46" name="Picture"/>
+                    <pic:cNvPr descr="/tmp/claude-1000/-home-willard-projects-thesis/cb82e7af-8c35-489a-a7f7-ef49172efea2/scratchpad/docx/w18/fig0.png" id="46" name="Picture"/>
                     <pic:cNvPicPr>
                       <a:picLocks noChangeArrowheads="1" noChangeAspect="1"/>
                     </pic:cNvPicPr>
@@ -6460,7 +6460,7 @@
         <w:pStyle w:val="FirstParagraph"/>
       </w:pPr>
       <w:r>
-        <w:t xml:space="preserve">The evaluation of the algorithm, which is the study’s primary evidence, follows established practice for judging a program analysis, and its methods are stated first.  A sound analysis is judged first by what it misses, its false negatives, and only then by what its false alarms cost, since soundness is the property it claims [8]; hence silent loss is the primary measure and needless confirmation the cost.  Its ground truth is observed by execution rather than assigned by judges, the standard by which executable semantics of the shell are validated against what shells actually do [12] and by which generated Bash commands are judged against what was intended [47].  Part of its corpus comes from a public dataset, NL2Bash [24], so that the evaluation does not rest only on commands written by the people who wrote the analysis.  The claim that particular components produce the result is tested by ablation, rerunning the analysis with each switched off; and comparisons in which every system is scored on the same commands use the standard tests for paired proportions: McNemar’s exact test on the commands two systems handle differently, Wilson intervals for each proportion and Newcombe intervals for each difference, and Holm’s correction across each family of tests.  Chapter 3, Sections 1.2, 3.1, and 3.2 give the design.</w:t>
+        <w:t xml:space="preserve">The evaluation of the algorithm, which is the study’s primary evidence, follows established practice for judging a program analysis, and its methods are stated first.  A sound analysis is judged first by what it misses, its false negatives, and only then by what its false alarms cost, since soundness is the property it claims [8]; hence silent loss is the primary measure and needless confirmation the cost.  Its ground truth is observed by execution rather than assigned by judges, the standard by which executable semantics of the shell are validated against what shells actually do [12]; execution also underlies the scoring of generated Bash commands against what was intended [47].  Part of its corpus comes from a public dataset, NL2Bash [24], so that the evaluation does not rest only on commands written by the people who wrote the analysis.  The claim that particular components produce the result is tested by ablation, rerunning the analysis with each switched off; and comparisons in which every system is scored on the same commands use the standard tests for paired proportions: McNemar’s exact test on the commands two systems handle differently, Wilson intervals for each proportion and Newcombe intervals for each difference, and Holm’s correction across each family of tests.  Chapter 3, Sections 1.2, 3.1, and 3.2 give the design.</w:t>
       </w:r>
     </w:p>
     <w:p>
@@ -6781,7 +6781,7 @@
               <a:graphicData uri="http://schemas.openxmlformats.org/drawingml/2006/picture">
                 <pic:pic>
                   <pic:nvPicPr>
-                    <pic:cNvPr descr="/tmp/claude-1000/-home-willard-projects-thesis/cb82e7af-8c35-489a-a7f7-ef49172efea2/scratchpad/docx/w17/fig1.png" id="79" name="Picture"/>
+                    <pic:cNvPr descr="/tmp/claude-1000/-home-willard-projects-thesis/cb82e7af-8c35-489a-a7f7-ef49172efea2/scratchpad/docx/w18/fig1.png" id="79" name="Picture"/>
                     <pic:cNvPicPr>
                       <a:picLocks noChangeArrowheads="1" noChangeAspect="1"/>
                     </pic:cNvPicPr>
@@ -14231,7 +14231,7 @@
         <w:t xml:space="preserve"> </w:t>
       </w:r>
       <w:r>
-        <w:t xml:space="preserve">— cost the ablated configurations little or nothing, because the table already covers them.  The reported result in Section 3.1(c) and (d) is therefore attributable to composition and resolution together, and not to the table they are sometimes mistaken for.</w:t>
+        <w:t xml:space="preserve">— cost the ablated configurations little or nothing, because the table already covers them.  The capture-coverage result in Section 3.1(d) is therefore attributable to composition and resolution together, and not to the table they are sometimes mistaken for; the zero silent loss of Section 3.1(c) is owed to the table and the fail-closed default beneath it.</w:t>
       </w:r>
     </w:p>
     <w:bookmarkEnd w:id="113"/>

</xml_diff>

<commit_message>
docs(thesis): fix the twelfth pass/fail check's medium findings
Chapter 2: SeeAct's 51.1% is the oracle-grounding ceiling and only the drop from it is put down to grounding; 'asks only where not shown recoverab